<commit_message>
docs: vul bronregister aan met historische kandidaten
</commit_message>
<xml_diff>
--- a/docs/MEIJENDEL_BRONREGISTER.docx
+++ b/docs/MEIJENDEL_BRONREGISTER.docx
@@ -4073,17 +4073,13 @@
             </w:tcMar>
           </w:tcPr>
           <w:p>
-            <w:pPr>
-              <w:spacing w:after="0" w:line="247" w:lineRule="auto"/>
-              <w:jc w:val="left"/>
-            </w:pPr>
+            <w:pPr/>
             <w:r>
               <w:rPr>
                 <w:rFonts w:ascii="Arial" w:hAnsi="Arial"/>
-                <w:color w:val="000000"/>
-                <w:sz w:val="18"/>
+                <w:sz w:val="17"/>
               </w:rPr>
-              <w:t>488 opnamen, 101.504 bedekkingsregels en 855 bodemmetingen; 2001, 2008 en 2018</w:t>
+              <w:t>488 opnamen en 101.504 bedekkingsregels; 2001, 2008 en 2018. Van de 186 vaste Site-codes zijn er 116 driemaal en 70 tweemaal onderzocht. Negen bodemvariabelen zijn voor 45 plots in 2001 en 2018 beschikbaar; bodemvocht alleen voor deze 45 plots in 2018.</w:t>
             </w:r>
           </w:p>
         </w:tc>
@@ -4099,17 +4095,13 @@
             </w:tcMar>
           </w:tcPr>
           <w:p>
-            <w:pPr>
-              <w:spacing w:after="0" w:line="247" w:lineRule="auto"/>
-              <w:jc w:val="left"/>
-            </w:pPr>
+            <w:pPr/>
             <w:r>
               <w:rPr>
                 <w:rFonts w:ascii="Arial" w:hAnsi="Arial"/>
-                <w:color w:val="000000"/>
-                <w:sz w:val="18"/>
+                <w:sz w:val="17"/>
               </w:rPr>
-              <w:t>De volledige soortenmatrix en echte nullen maken vergelijking tussen de drie jaren mogelijk. De 186 locatiecodes zijn nog niet betrouwbaar aan geometrieën gekoppeld; daarom alleen context voor Meijendel als geheel.</w:t>
+              <w:t>De volledige matrix van 208 taxa bevat echte nullen en maakt vergelijking tussen de drie jaren mogelijk. De locatiecodes zijn nog niet betrouwbaar aan geometrieën gekoppeld. Opname 18I01 blijft uitgesloten: daarin zijn 159 taxa geregistreerd, tegenover maximaal 40 in alle overige opnamen. Deze reeks blijft afzonderlijk van de provinciale PQ-reeks.</w:t>
             </w:r>
           </w:p>
         </w:tc>
@@ -4295,17 +4287,13 @@
             </w:tcMar>
           </w:tcPr>
           <w:p>
-            <w:pPr>
-              <w:spacing w:after="0" w:line="247" w:lineRule="auto"/>
-              <w:jc w:val="left"/>
-            </w:pPr>
+            <w:pPr/>
             <w:r>
               <w:rPr>
                 <w:rFonts w:ascii="Arial" w:hAnsi="Arial"/>
-                <w:color w:val="000000"/>
-                <w:sz w:val="18"/>
+                <w:sz w:val="17"/>
               </w:rPr>
-              <w:t>3.337 exemplaren, 12 soorten en 28 locaties; 1969–1970</w:t>
+              <w:t>3.337 exemplaren, 12 soorten, 28 locaties en zes milieuvariabelen; 1969–1970</w:t>
             </w:r>
           </w:p>
         </w:tc>
@@ -4321,17 +4309,13 @@
             </w:tcMar>
           </w:tcPr>
           <w:p>
-            <w:pPr>
-              <w:spacing w:after="0" w:line="247" w:lineRule="auto"/>
-              <w:jc w:val="left"/>
-            </w:pPr>
+            <w:pPr/>
             <w:r>
               <w:rPr>
                 <w:rFonts w:ascii="Arial" w:hAnsi="Arial"/>
-                <w:color w:val="000000"/>
-                <w:sz w:val="18"/>
+                <w:sz w:val="17"/>
               </w:rPr>
-              <w:t>De vangstmatrix kan inhoudelijk worden onderzocht. De 28 locatienummers zijn nog niet naar werkelijke plaatsen te vertalen en mogen daarom niet als Meijendelwaarnemingen worden geanalyseerd.</w:t>
+              <w:t>De samengevoegde vangstmatrix ondersteunt een soorten-milieuanalyse, maar geen ontwikkeling door de tijd. Datums en vangrondes ontbreken. De 28 locatienummers zijn bovendien nog niet naar werkelijke plaatsen te vertalen en mogen daarom niet als Meijendelwaarnemingen worden geanalyseerd.</w:t>
             </w:r>
           </w:p>
         </w:tc>
@@ -5370,6 +5354,351 @@
           </w:p>
         </w:tc>
       </w:tr>
+      <w:tr>
+        <w:trPr>
+          <w:cantSplit/>
+        </w:trPr>
+        <w:tc>
+          <w:tcPr>
+            <w:tcW w:type="dxa" w:w="1800"/>
+            <w:vAlign w:val="center"/>
+            <w:tcMar>
+              <w:top w:w="90" w:type="dxa"/>
+              <w:start w:w="100" w:type="dxa"/>
+              <w:bottom w:w="90" w:type="dxa"/>
+              <w:end w:w="100" w:type="dxa"/>
+            </w:tcMar>
+          </w:tcPr>
+          <w:p>
+            <w:pPr/>
+            <w:r>
+              <w:rPr>
+                <w:rFonts w:ascii="Arial" w:hAnsi="Arial"/>
+                <w:sz w:val="17"/>
+              </w:rPr>
+              <w:t>Aquatische macrofauna</w:t>
+            </w:r>
+          </w:p>
+        </w:tc>
+        <w:tc>
+          <w:tcPr>
+            <w:tcW w:type="dxa" w:w="1699"/>
+            <w:vAlign w:val="center"/>
+            <w:tcMar>
+              <w:top w:w="90" w:type="dxa"/>
+              <w:start w:w="100" w:type="dxa"/>
+              <w:bottom w:w="90" w:type="dxa"/>
+              <w:end w:w="100" w:type="dxa"/>
+            </w:tcMar>
+          </w:tcPr>
+          <w:p>
+            <w:pPr/>
+            <w:r>
+              <w:rPr>
+                <w:rFonts w:ascii="Arial" w:hAnsi="Arial"/>
+                <w:sz w:val="17"/>
+              </w:rPr>
+              <w:t>Rijksuniversiteit Leiden; publicatie via Naturalis</w:t>
+            </w:r>
+          </w:p>
+        </w:tc>
+        <w:tc>
+          <w:tcPr>
+            <w:tcW w:type="dxa" w:w="2045"/>
+            <w:vAlign w:val="center"/>
+            <w:tcMar>
+              <w:top w:w="90" w:type="dxa"/>
+              <w:start w:w="100" w:type="dxa"/>
+              <w:bottom w:w="90" w:type="dxa"/>
+              <w:end w:w="100" w:type="dxa"/>
+            </w:tcMar>
+          </w:tcPr>
+          <w:p>
+            <w:pPr/>
+            <w:r>
+              <w:rPr>
+                <w:rFonts w:ascii="Arial" w:hAnsi="Arial"/>
+                <w:sz w:val="17"/>
+              </w:rPr>
+              <w:t>Zeven vaste monsterpunten, vrijwel maandelijks onderzocht van juni 1974 tot juli 1975; de publicaties behandelen onderzoek uit 1970–1977</w:t>
+            </w:r>
+          </w:p>
+        </w:tc>
+        <w:tc>
+          <w:tcPr>
+            <w:tcW w:type="dxa" w:w="2333"/>
+            <w:vAlign w:val="center"/>
+            <w:tcMar>
+              <w:top w:w="90" w:type="dxa"/>
+              <w:start w:w="100" w:type="dxa"/>
+              <w:bottom w:w="90" w:type="dxa"/>
+              <w:end w:w="100" w:type="dxa"/>
+            </w:tcMar>
+          </w:tcPr>
+          <w:p>
+            <w:pPr/>
+            <w:r>
+              <w:rPr>
+                <w:rFonts w:ascii="Arial" w:hAnsi="Arial"/>
+                <w:sz w:val="17"/>
+              </w:rPr>
+              <w:t>Historische reeks van waterorganismen, vegetatie en fysisch-chemische waterkenmerken</w:t>
+            </w:r>
+          </w:p>
+        </w:tc>
+        <w:tc>
+          <w:tcPr>
+            <w:tcW w:type="dxa" w:w="2491"/>
+            <w:vAlign w:val="center"/>
+            <w:tcMar>
+              <w:top w:w="90" w:type="dxa"/>
+              <w:start w:w="100" w:type="dxa"/>
+              <w:bottom w:w="90" w:type="dxa"/>
+              <w:end w:w="100" w:type="dxa"/>
+            </w:tcMar>
+          </w:tcPr>
+          <w:p>
+            <w:pPr/>
+            <w:r>
+              <w:rPr>
+                <w:rFonts w:ascii="Arial" w:hAnsi="Arial"/>
+                <w:sz w:val="17"/>
+              </w:rPr>
+              <w:t>De tabellen en grafieken uit 175 gescande pagina's digitaliseren; daarna locatiecodes, complete bemonsteringen en eventuele lege monsters vaststellen</w:t>
+            </w:r>
+          </w:p>
+        </w:tc>
+      </w:tr>
+      <w:tr>
+        <w:trPr>
+          <w:cantSplit/>
+        </w:trPr>
+        <w:tc>
+          <w:tcPr>
+            <w:tcW w:type="dxa" w:w="1800"/>
+            <w:vAlign w:val="center"/>
+            <w:tcMar>
+              <w:top w:w="90" w:type="dxa"/>
+              <w:start w:w="100" w:type="dxa"/>
+              <w:bottom w:w="90" w:type="dxa"/>
+              <w:end w:w="100" w:type="dxa"/>
+            </w:tcMar>
+          </w:tcPr>
+          <w:p>
+            <w:pPr/>
+            <w:r>
+              <w:rPr>
+                <w:rFonts w:ascii="Arial" w:hAnsi="Arial"/>
+                <w:sz w:val="17"/>
+              </w:rPr>
+              <w:t>Erosiepinnen in een stuifkuilcomplex</w:t>
+            </w:r>
+          </w:p>
+        </w:tc>
+        <w:tc>
+          <w:tcPr>
+            <w:tcW w:type="dxa" w:w="1699"/>
+            <w:vAlign w:val="center"/>
+            <w:tcMar>
+              <w:top w:w="90" w:type="dxa"/>
+              <w:start w:w="100" w:type="dxa"/>
+              <w:bottom w:w="90" w:type="dxa"/>
+              <w:end w:w="100" w:type="dxa"/>
+            </w:tcMar>
+          </w:tcPr>
+          <w:p>
+            <w:pPr/>
+            <w:r>
+              <w:rPr>
+                <w:rFonts w:ascii="Arial" w:hAnsi="Arial"/>
+                <w:sz w:val="17"/>
+              </w:rPr>
+              <w:t>Jungerius en Van der Meulen</w:t>
+            </w:r>
+          </w:p>
+        </w:tc>
+        <w:tc>
+          <w:tcPr>
+            <w:tcW w:type="dxa" w:w="2045"/>
+            <w:vAlign w:val="center"/>
+            <w:tcMar>
+              <w:top w:w="90" w:type="dxa"/>
+              <w:start w:w="100" w:type="dxa"/>
+              <w:bottom w:w="90" w:type="dxa"/>
+              <w:end w:w="100" w:type="dxa"/>
+            </w:tcMar>
+          </w:tcPr>
+          <w:p>
+            <w:pPr/>
+            <w:r>
+              <w:rPr>
+                <w:rFonts w:ascii="Arial" w:hAnsi="Arial"/>
+                <w:sz w:val="17"/>
+              </w:rPr>
+              <w:t>48 erosiepinnen in 12 eenheden, vrijwel wekelijks gemeten gedurende één jaar</w:t>
+            </w:r>
+          </w:p>
+        </w:tc>
+        <w:tc>
+          <w:tcPr>
+            <w:tcW w:type="dxa" w:w="2333"/>
+            <w:vAlign w:val="center"/>
+            <w:tcMar>
+              <w:top w:w="90" w:type="dxa"/>
+              <w:start w:w="100" w:type="dxa"/>
+              <w:bottom w:w="90" w:type="dxa"/>
+              <w:end w:w="100" w:type="dxa"/>
+            </w:tcMar>
+          </w:tcPr>
+          <w:p>
+            <w:pPr/>
+            <w:r>
+              <w:rPr>
+                <w:rFonts w:ascii="Arial" w:hAnsi="Arial"/>
+                <w:sz w:val="17"/>
+              </w:rPr>
+              <w:t>Gedetailleerde processtudie van erosie, sedimentatie en vegetatie, maar geen langjarige trend</w:t>
+            </w:r>
+          </w:p>
+        </w:tc>
+        <w:tc>
+          <w:tcPr>
+            <w:tcW w:type="dxa" w:w="2491"/>
+            <w:vAlign w:val="center"/>
+            <w:tcMar>
+              <w:top w:w="90" w:type="dxa"/>
+              <w:start w:w="100" w:type="dxa"/>
+              <w:bottom w:w="90" w:type="dxa"/>
+              <w:end w:w="100" w:type="dxa"/>
+            </w:tcMar>
+          </w:tcPr>
+          <w:p>
+            <w:pPr/>
+            <w:r>
+              <w:rPr>
+                <w:rFonts w:ascii="Arial" w:hAnsi="Arial"/>
+                <w:sz w:val="17"/>
+              </w:rPr>
+              <w:t>Oorspronkelijke metingen en pinlocaties vinden en op waarnemingsniveau aan Meijendel koppelen</w:t>
+            </w:r>
+          </w:p>
+        </w:tc>
+      </w:tr>
+      <w:tr>
+        <w:trPr>
+          <w:cantSplit/>
+        </w:trPr>
+        <w:tc>
+          <w:tcPr>
+            <w:tcW w:type="dxa" w:w="1800"/>
+            <w:vAlign w:val="center"/>
+            <w:tcMar>
+              <w:top w:w="90" w:type="dxa"/>
+              <w:start w:w="100" w:type="dxa"/>
+              <w:bottom w:w="90" w:type="dxa"/>
+              <w:end w:w="100" w:type="dxa"/>
+            </w:tcMar>
+          </w:tcPr>
+          <w:p>
+            <w:pPr/>
+            <w:r>
+              <w:rPr>
+                <w:rFonts w:ascii="Arial" w:hAnsi="Arial"/>
+                <w:sz w:val="17"/>
+              </w:rPr>
+              <w:t>Langjarige droge-duinvegetatieplots</w:t>
+            </w:r>
+          </w:p>
+        </w:tc>
+        <w:tc>
+          <w:tcPr>
+            <w:tcW w:type="dxa" w:w="1699"/>
+            <w:vAlign w:val="center"/>
+            <w:tcMar>
+              <w:top w:w="90" w:type="dxa"/>
+              <w:start w:w="100" w:type="dxa"/>
+              <w:bottom w:w="90" w:type="dxa"/>
+              <w:end w:w="100" w:type="dxa"/>
+            </w:tcMar>
+          </w:tcPr>
+          <w:p>
+            <w:pPr/>
+            <w:r>
+              <w:rPr>
+                <w:rFonts w:ascii="Arial" w:hAnsi="Arial"/>
+                <w:sz w:val="17"/>
+              </w:rPr>
+              <w:t>Historische Meijendel-onderzoekers; later ontsloten via Wageningen University &amp; Research</w:t>
+            </w:r>
+          </w:p>
+        </w:tc>
+        <w:tc>
+          <w:tcPr>
+            <w:tcW w:type="dxa" w:w="2045"/>
+            <w:vAlign w:val="center"/>
+            <w:tcMar>
+              <w:top w:w="90" w:type="dxa"/>
+              <w:start w:w="100" w:type="dxa"/>
+              <w:bottom w:w="90" w:type="dxa"/>
+              <w:end w:w="100" w:type="dxa"/>
+            </w:tcMar>
+          </w:tcPr>
+          <w:p>
+            <w:pPr/>
+            <w:r>
+              <w:rPr>
+                <w:rFonts w:ascii="Arial" w:hAnsi="Arial"/>
+                <w:sz w:val="17"/>
+              </w:rPr>
+              <w:t>41 vaste vegetatieplots, aangelegd in 1952–1953 en gemiddeld ongeveer iedere vier jaar herhaald</w:t>
+            </w:r>
+          </w:p>
+        </w:tc>
+        <w:tc>
+          <w:tcPr>
+            <w:tcW w:type="dxa" w:w="2333"/>
+            <w:vAlign w:val="center"/>
+            <w:tcMar>
+              <w:top w:w="90" w:type="dxa"/>
+              <w:start w:w="100" w:type="dxa"/>
+              <w:bottom w:w="90" w:type="dxa"/>
+              <w:end w:w="100" w:type="dxa"/>
+            </w:tcMar>
+          </w:tcPr>
+          <w:p>
+            <w:pPr/>
+            <w:r>
+              <w:rPr>
+                <w:rFonts w:ascii="Arial" w:hAnsi="Arial"/>
+                <w:sz w:val="17"/>
+              </w:rPr>
+              <w:t>Potentieel zeer waardevolle langjarige vegetatiereeks voor successie, begrazing en verandering van grijs duin</w:t>
+            </w:r>
+          </w:p>
+        </w:tc>
+        <w:tc>
+          <w:tcPr>
+            <w:tcW w:type="dxa" w:w="2491"/>
+            <w:vAlign w:val="center"/>
+            <w:tcMar>
+              <w:top w:w="90" w:type="dxa"/>
+              <w:start w:w="100" w:type="dxa"/>
+              <w:bottom w:w="90" w:type="dxa"/>
+              <w:end w:w="100" w:type="dxa"/>
+            </w:tcMar>
+          </w:tcPr>
+          <w:p>
+            <w:pPr/>
+            <w:r>
+              <w:rPr>
+                <w:rFonts w:ascii="Arial" w:hAnsi="Arial"/>
+                <w:sz w:val="17"/>
+              </w:rPr>
+              <w:t>Oorspronkelijke plotcodes, opnamen en locaties vinden; overlap met provinciale PQ, NDFF en de Landelijke Vegetatie Databank vaststellen</w:t>
+            </w:r>
+          </w:p>
+        </w:tc>
+      </w:tr>
     </w:tbl>
     <w:p>
       <w:pPr>
@@ -5911,17 +6240,13 @@
             <w:shd w:fill="EAF2F8"/>
           </w:tcPr>
           <w:p>
-            <w:pPr>
-              <w:spacing w:after="0" w:line="247" w:lineRule="auto"/>
-              <w:jc w:val="left"/>
-            </w:pPr>
+            <w:pPr/>
             <w:r>
               <w:rPr>
                 <w:rFonts w:ascii="Arial" w:hAnsi="Arial"/>
-                <w:color w:val="000000"/>
-                <w:sz w:val="18"/>
+                <w:sz w:val="17"/>
               </w:rPr>
-              <w:t>Bodemvocht en weer</w:t>
+              <w:t>Plantengroei, bodemvocht en weer</w:t>
             </w:r>
           </w:p>
         </w:tc>
@@ -5976,17 +6301,13 @@
             <w:shd w:fill="EAF2F8"/>
           </w:tcPr>
           <w:p>
-            <w:pPr>
-              <w:spacing w:after="0" w:line="247" w:lineRule="auto"/>
-              <w:jc w:val="left"/>
-            </w:pPr>
+            <w:pPr/>
             <w:r>
               <w:rPr>
                 <w:rFonts w:ascii="Arial" w:hAnsi="Arial"/>
-                <w:color w:val="000000"/>
-                <w:sz w:val="18"/>
+                <w:sz w:val="17"/>
               </w:rPr>
-              <w:t>10 bodemvochtloggers en één weerstation; metingen per vijf minuten van juli tot december 2020</w:t>
+              <w:t>10 bodemvochtloggers op vier diepten en één weerstation, metingen per vijf minuten van juli tot december 2020; daarnaast groei- en biomassametingen aan duinvormende grassen</w:t>
             </w:r>
           </w:p>
         </w:tc>
@@ -6003,17 +6324,13 @@
             <w:shd w:fill="EAF2F8"/>
           </w:tcPr>
           <w:p>
-            <w:pPr>
-              <w:spacing w:after="0" w:line="247" w:lineRule="auto"/>
-              <w:jc w:val="left"/>
-            </w:pPr>
+            <w:pPr/>
             <w:r>
               <w:rPr>
                 <w:rFonts w:ascii="Arial" w:hAnsi="Arial"/>
-                <w:color w:val="000000"/>
-                <w:sz w:val="18"/>
+                <w:sz w:val="17"/>
               </w:rPr>
-              <w:t>Gedetailleerde korte tijdreeks voor hydrologische processen. Eerst locaties en meetkwaliteit controleren; één halfjaar geeft geen langjarige ontwikkeling.</w:t>
+              <w:t>Gedetailleerde processtudie van de reactie van duingrassen op neerslag en droogte. Eerst locaties en meetkwaliteit controleren; één halfjaar geeft geen langjarige ontwikkeling.</w:t>
             </w:r>
           </w:p>
         </w:tc>
@@ -6396,6 +6713,19 @@
           <w:color w:val="000000"/>
         </w:rPr>
         <w:t>hydrologische gegevens. Een afzonderlijke digitale gegevenslevering is nog niet gevonden.</w:t>
+      </w:r>
+    </w:p>
+    <w:p>
+      <w:pPr>
+        <w:pStyle w:val="ListBullet"/>
+        <w:widowControl/>
+      </w:pPr>
+      <w:r>
+        <w:rPr>
+          <w:rFonts w:ascii="Arial" w:hAnsi="Arial"/>
+          <w:sz w:val="20"/>
+        </w:rPr>
+        <w:t>Langjarige stuifkuil- en vegetatiemetingen: publicaties noemen 32–35 stuifkuilen die vanaf 1983 tweemaal per jaar zijn gemeten, 19 permanente vegetatieplots en vergelijkingen van luchtfoto's en orthofoto's. De oorspronkelijke tabellen, plot-ID's en digitale kaartlagen zijn nog niet voldoende geïdentificeerd om deze als afzonderlijke gegevensbron toe te laten.</w:t>
       </w:r>
     </w:p>
     <w:p>

</xml_diff>

<commit_message>
Voer fase 1 en 2 van bronregister uit
</commit_message>
<xml_diff>
--- a/docs/MEIJENDEL_BRONREGISTER.docx
+++ b/docs/MEIJENDEL_BRONREGISTER.docx
@@ -2,7 +2,7 @@
 <file path=word/document.xml><?xml version="1.0" encoding="utf-8"?>
 <w:document xmlns:w="http://schemas.openxmlformats.org/wordprocessingml/2006/main" xmlns:m="http://schemas.openxmlformats.org/officeDocument/2006/math" xmlns:r="http://schemas.openxmlformats.org/officeDocument/2006/relationships" xmlns:o="urn:schemas-microsoft-com:office:office" xmlns:v="urn:schemas-microsoft-com:vml" xmlns:w10="urn:schemas-microsoft-com:office:word" xmlns:a="http://schemas.openxmlformats.org/drawingml/2006/main" xmlns:pic="http://schemas.openxmlformats.org/drawingml/2006/picture" xmlns:wp="http://schemas.openxmlformats.org/drawingml/2006/wordprocessingDrawing">
   <w:body>
-    <w:bookmarkStart w:id="99" w:name="Xdea145a7474320bcc321aebaf5687f9ab4d02fb"/>
+    <w:bookmarkStart w:id="95" w:name="Xdea145a7474320bcc321aebaf5687f9ab4d02fb"/>
     <w:p>
       <w:pPr>
         <w:pStyle w:val="Heading1"/>
@@ -72,7 +72,7 @@
         </w:numPr>
       </w:pPr>
       <w:r>
-        <w:t xml:space="preserve">waarvoor de gegevens statistisch al dan niet kunnen worden.</w:t>
+        <w:t xml:space="preserve">waarvoor de gegevens statistisch al dan niet kunnen worden gebruikt.</w:t>
       </w:r>
     </w:p>
     <w:p>
@@ -202,7 +202,7 @@
         </w:numPr>
       </w:pPr>
       <w:r>
-        <w:t xml:space="preserve">op de VPS staan in het Analysecentrum drie contextdatasets en 522 literatuurverwijzingen die niet ongemerkt in analyses terecht mogen komen;</w:t>
+        <w:t xml:space="preserve">op de VPS staan in het Analysecentrum drie contextdatasets en 522 literatuurverwijzingen die niet ongemerkt in analyses terecht mogen komen; de hieronder beschreven nieuwe fase-2-context staat vooralsnog alleen in de lokale canonieke database;</w:t>
       </w:r>
     </w:p>
     <w:p>
@@ -213,7 +213,22 @@
         </w:numPr>
       </w:pPr>
       <w:r>
-        <w:t xml:space="preserve">de gevonden externe datasets zijn nog kandidaten en worden pas na een afzonderlijke toelatingscontrole geïmporteerd.</w:t>
+        <w:t xml:space="preserve">zes openbare externe bronnen zijn na ruimtelijke toelatings- en overlapcontrole in</w:t>
+      </w:r>
+      <w:r>
+        <w:t xml:space="preserve"> </w:t>
+      </w:r>
+      <w:r>
+        <w:rPr>
+          <w:rStyle w:val="VerbatimChar"/>
+        </w:rPr>
+        <w:t xml:space="preserve">Meijendel</w:t>
+      </w:r>
+      <w:r>
+        <w:t xml:space="preserve"> </w:t>
+      </w:r>
+      <w:r>
+        <w:t xml:space="preserve">opgenomen; hun verschillende analysemogelijkheden blijven per record zichtbaar.</w:t>
       </w:r>
     </w:p>
     <w:p>
@@ -259,7 +274,7 @@
       </w:r>
     </w:p>
     <w:bookmarkEnd w:id="10"/>
-    <w:bookmarkStart w:id="41" w:name="Xc07dfd40f027bce65d2d0499dc5da8ab7f6fd0f"/>
+    <w:bookmarkStart w:id="49" w:name="bronnen-in-mysql-database-meijendel"/>
     <w:p>
       <w:pPr>
         <w:pStyle w:val="Heading2"/>
@@ -277,7 +292,7 @@
         <w:t xml:space="preserve">Meijendel</w:t>
       </w:r>
     </w:p>
-    <w:bookmarkStart w:id="11" w:name="X32ab8fbd5be08d3f325e2553cd15813ff7e9c1f"/>
+    <w:bookmarkStart w:id="11" w:name="Xccd8cb4345e3f59364194a2576f706cc2c0a66e"/>
     <w:p>
       <w:pPr>
         <w:pStyle w:val="Heading3"/>
@@ -359,7 +374,7 @@
       </w:r>
     </w:p>
     <w:bookmarkEnd w:id="11"/>
-    <w:bookmarkStart w:id="12" w:name="X9645acbfea6b379f23d12aeedc36c987000825a"/>
+    <w:bookmarkStart w:id="12" w:name="provinciale-permanente-kwadraten"/>
     <w:p>
       <w:pPr>
         <w:pStyle w:val="Heading3"/>
@@ -441,7 +456,7 @@
       </w:r>
     </w:p>
     <w:bookmarkEnd w:id="12"/>
-    <w:bookmarkStart w:id="13" w:name="X58edaa7a0159e378417d8d9e2f3abf27d746f4f"/>
+    <w:bookmarkStart w:id="13" w:name="Xded6c184b9a569c146345b6e935b052f391caf7"/>
     <w:p>
       <w:pPr>
         <w:pStyle w:val="Heading3"/>
@@ -523,7 +538,7 @@
       </w:r>
     </w:p>
     <w:bookmarkEnd w:id="13"/>
-    <w:bookmarkStart w:id="15" w:name="Xd3fb9a25da94fa35cd3895c324ae264efa6b6ce"/>
+    <w:bookmarkStart w:id="15" w:name="historisch-vangblikonderzoek"/>
     <w:p>
       <w:pPr>
         <w:pStyle w:val="Heading3"/>
@@ -635,7 +650,7 @@
       </w:r>
     </w:p>
     <w:bookmarkEnd w:id="15"/>
-    <w:bookmarkStart w:id="33" w:name="X05a7f9ed9696b113895f0c60145ad70b98b3ccf"/>
+    <w:bookmarkStart w:id="33" w:name="X003d1b4454050d8b2300662d18ee0e6097f4328"/>
     <w:p>
       <w:pPr>
         <w:pStyle w:val="Heading3"/>
@@ -716,7 +731,7 @@
         <w:t xml:space="preserve">Voorwaardelijk bruikbaar. De bronorganisaties zijn aangeschreven met het verzoek de aanvullende metadata te leveren.</w:t>
       </w:r>
     </w:p>
-    <w:bookmarkStart w:id="16" w:name="Xf2f5e1637d9b0d825d88db49318fbe09fe4562d"/>
+    <w:bookmarkStart w:id="16" w:name="dagvlinders"/>
     <w:p>
       <w:pPr>
         <w:pStyle w:val="Heading4"/>
@@ -780,7 +795,7 @@
       </w:r>
     </w:p>
     <w:bookmarkEnd w:id="16"/>
-    <w:bookmarkStart w:id="17" w:name="Xab588a339567fbeba82f7ca9f0ef20022ceaf38"/>
+    <w:bookmarkStart w:id="17" w:name="hommels"/>
     <w:p>
       <w:pPr>
         <w:pStyle w:val="Heading4"/>
@@ -844,7 +859,7 @@
       </w:r>
     </w:p>
     <w:bookmarkEnd w:id="17"/>
-    <w:bookmarkStart w:id="18" w:name="X5eeebc0b3ea39369efcb9361b685b51ab379390"/>
+    <w:bookmarkStart w:id="18" w:name="libellen"/>
     <w:p>
       <w:pPr>
         <w:pStyle w:val="Heading4"/>
@@ -908,7 +923,7 @@
       </w:r>
     </w:p>
     <w:bookmarkEnd w:id="18"/>
-    <w:bookmarkStart w:id="19" w:name="Xf7f75bff85528639d3a54437d815ffc982ac078"/>
+    <w:bookmarkStart w:id="19" w:name="nachtvlinders"/>
     <w:p>
       <w:pPr>
         <w:pStyle w:val="Heading4"/>
@@ -972,7 +987,7 @@
       </w:r>
     </w:p>
     <w:bookmarkEnd w:id="19"/>
-    <w:bookmarkStart w:id="20" w:name="X5952ec78f96e716985cfd2bef0c6dea751da098"/>
+    <w:bookmarkStart w:id="20" w:name="amfibieën"/>
     <w:p>
       <w:pPr>
         <w:pStyle w:val="Heading4"/>
@@ -1036,7 +1051,7 @@
       </w:r>
     </w:p>
     <w:bookmarkEnd w:id="20"/>
-    <w:bookmarkStart w:id="21" w:name="Xf98973ac0b4b22a8147264cf6fda7ae2d1f2584"/>
+    <w:bookmarkStart w:id="21" w:name="reptielen"/>
     <w:p>
       <w:pPr>
         <w:pStyle w:val="Heading4"/>
@@ -1100,7 +1115,7 @@
       </w:r>
     </w:p>
     <w:bookmarkEnd w:id="21"/>
-    <w:bookmarkStart w:id="22" w:name="X9ffbbed58a474302bc88f9b6483937563542adc"/>
+    <w:bookmarkStart w:id="22" w:name="vissen"/>
     <w:p>
       <w:pPr>
         <w:pStyle w:val="Heading4"/>
@@ -1164,7 +1179,7 @@
       </w:r>
     </w:p>
     <w:bookmarkEnd w:id="22"/>
-    <w:bookmarkStart w:id="23" w:name="X90b1412457ba2ad39675de54e16fb4052a9af96"/>
+    <w:bookmarkStart w:id="23" w:name="vleermuistransecten"/>
     <w:p>
       <w:pPr>
         <w:pStyle w:val="Heading4"/>
@@ -1228,7 +1243,7 @@
       </w:r>
     </w:p>
     <w:bookmarkEnd w:id="23"/>
-    <w:bookmarkStart w:id="24" w:name="X0bf7c6d2026ffa63b6182a76ed7ab201ef2ca1a"/>
+    <w:bookmarkStart w:id="24" w:name="konijnentellingen-in-de-duinen"/>
     <w:p>
       <w:pPr>
         <w:pStyle w:val="Heading4"/>
@@ -1292,7 +1307,7 @@
       </w:r>
     </w:p>
     <w:bookmarkEnd w:id="24"/>
-    <w:bookmarkStart w:id="25" w:name="Xd64910a2091f56dedd2aaa5a75994d38ec4c969"/>
+    <w:bookmarkStart w:id="25" w:name="wintertellingen-vleermuizen"/>
     <w:p>
       <w:pPr>
         <w:pStyle w:val="Heading4"/>
@@ -1356,7 +1371,7 @@
       </w:r>
     </w:p>
     <w:bookmarkEnd w:id="25"/>
-    <w:bookmarkStart w:id="26" w:name="X9cec44656db08bd57f600992eaa74a526d260b3"/>
+    <w:bookmarkStart w:id="26" w:name="het-nieuwe-strepen"/>
     <w:p>
       <w:pPr>
         <w:pStyle w:val="Heading4"/>
@@ -1420,7 +1435,7 @@
       </w:r>
     </w:p>
     <w:bookmarkEnd w:id="26"/>
-    <w:bookmarkStart w:id="27" w:name="Xc056d2025de29c95bc511421c5f5e41469354eb"/>
+    <w:bookmarkStart w:id="27" w:name="Xadd682eaf9770b54759a1b54720dedd522bc07f"/>
     <w:p>
       <w:pPr>
         <w:pStyle w:val="Heading4"/>
@@ -1484,7 +1499,7 @@
       </w:r>
     </w:p>
     <w:bookmarkEnd w:id="27"/>
-    <w:bookmarkStart w:id="28" w:name="Xb2fbeb28e0a334b9e6cb93232c4d845faf48221"/>
+    <w:bookmarkStart w:id="28" w:name="lmf-aandachtssoorten"/>
     <w:p>
       <w:pPr>
         <w:pStyle w:val="Heading4"/>
@@ -1548,7 +1563,7 @@
       </w:r>
     </w:p>
     <w:bookmarkEnd w:id="28"/>
-    <w:bookmarkStart w:id="29" w:name="X0ce2ec4e8b5503e251897e5490450ca2d9e0742"/>
+    <w:bookmarkStart w:id="29" w:name="mossen-en-korstmossen"/>
     <w:p>
       <w:pPr>
         <w:pStyle w:val="Heading4"/>
@@ -1612,7 +1627,7 @@
       </w:r>
     </w:p>
     <w:bookmarkEnd w:id="29"/>
-    <w:bookmarkStart w:id="30" w:name="X339fafe251367982d6218746f16721a93fa7f70"/>
+    <w:bookmarkStart w:id="30" w:name="bos--en-zeereeppaddenstoelen"/>
     <w:p>
       <w:pPr>
         <w:pStyle w:val="Heading4"/>
@@ -1676,7 +1691,7 @@
       </w:r>
     </w:p>
     <w:bookmarkEnd w:id="30"/>
-    <w:bookmarkStart w:id="31" w:name="X342bae7ae5afae546f17223888206446d449411"/>
+    <w:bookmarkStart w:id="31" w:name="weekdieren"/>
     <w:p>
       <w:pPr>
         <w:pStyle w:val="Heading4"/>
@@ -1740,7 +1755,7 @@
       </w:r>
     </w:p>
     <w:bookmarkEnd w:id="31"/>
-    <w:bookmarkStart w:id="32" w:name="Xcc11e4dda0fa9b87cf2613be17ff277804bdc91"/>
+    <w:bookmarkStart w:id="32" w:name="snl-gebiedsmonitoring"/>
     <w:p>
       <w:pPr>
         <w:pStyle w:val="Heading4"/>
@@ -1813,21 +1828,43 @@
     </w:p>
     <w:bookmarkEnd w:id="32"/>
     <w:bookmarkEnd w:id="33"/>
-    <w:bookmarkStart w:id="34" w:name="X92644ae07a6fc56c58f02b804b4a0e4616ccc51"/>
+    <w:bookmarkStart w:id="41" w:name="openbare-externe-ecologiebronnen"/>
     <w:p>
       <w:pPr>
         <w:pStyle w:val="Heading3"/>
       </w:pPr>
       <w:r>
-        <w:t xml:space="preserve">1.6. Openstaande ruimtelijke toelatingscontrole</w:t>
-      </w:r>
-    </w:p>
-    <w:p>
-      <w:pPr>
-        <w:pStyle w:val="FirstParagraph"/>
-      </w:pPr>
-      <w:r>
-        <w:t xml:space="preserve">De bronregistraties staan wel in</w:t>
+        <w:t xml:space="preserve">1.6. Openbare externe ecologiebronnen</w:t>
+      </w:r>
+    </w:p>
+    <w:p>
+      <w:pPr>
+        <w:pStyle w:val="FirstParagraph"/>
+      </w:pPr>
+      <w:r>
+        <w:t xml:space="preserve">Op 26 september 2026 zijn zes openbare bronnen reproduceerbaar geselecteerd en in drie generieke tabellen opgenomen: dataset, meet- of collectie-event en resultaat. De oorspronkelijke bron-ID, bronnaam, datum of datuminterval, coördinaten, locatie-onzekerheid, protocol, hoeveelheid, licentie en volledige bronmetadata blijven behouden. Een afzonderlijke overlaptabel voorkomt dat bekende dubbelen ongemerkt als zelfstandige waarnemingen worden gebruikt.</w:t>
+      </w:r>
+    </w:p>
+    <w:p>
+      <w:pPr>
+        <w:pStyle w:val="BodyText"/>
+      </w:pPr>
+      <w:r>
+        <w:t xml:space="preserve">De import is tweemaal uitgevoerd en leverde beide keren exact 10.994 events en 98.916 resultaten op. De hashes, bronselecties, totalen en overlapuitkomsten staan in het</w:t>
+      </w:r>
+      <w:r>
+        <w:t xml:space="preserve"> </w:t>
+      </w:r>
+      <w:hyperlink r:id="rId34">
+        <w:r>
+          <w:rPr>
+            <w:rStyle w:val="Hyperlink"/>
+          </w:rPr>
+          <w:t xml:space="preserve">auditmanifest fase 1 en 2</w:t>
+        </w:r>
+      </w:hyperlink>
+      <w:r>
+        <w:t xml:space="preserve">. De onveranderde bronbestanden en hun</w:t>
       </w:r>
       <w:r>
         <w:t xml:space="preserve"> </w:t>
@@ -1836,361 +1873,814 @@
         <w:rPr>
           <w:rStyle w:val="VerbatimChar"/>
         </w:rPr>
-        <w:t xml:space="preserve">Meijendel</w:t>
-      </w:r>
-      <w:r>
-        <w:t xml:space="preserve">, maar een deel mag nog niet als waarneming binnen Meijendel worden gebruikt. De audit met de actuele projectgrens vond 70.427 openbare NDFF-records uit de downloadselectie 1950–2025, 968 BMP-dagwaarnemingen uit 2009–2025, 644 provinciale PQ-opnamen uit 1981–2025 en 14 primaire SOVON-bijvangsten uit 2009–2024 die buiten het basisgebied liggen. Sommige NDFF-records hebben een breed broninterval dat al vóór 1950 begint; dat maakt hen geen waarneming uit dat eerdere jaar. Daarnaast raken 146.466 NDFF-polygonen alleen de grens. Bij die polygonen staat niet vast dat de waarneming binnen Meijendel is gedaan.</w:t>
-      </w:r>
-    </w:p>
-    <w:p>
-      <w:pPr>
-        <w:pStyle w:val="BodyText"/>
-      </w:pPr>
-      <w:r>
-        <w:t xml:space="preserve">Deze records blijven herkenbaar als bronmateriaal, maar worden niet zonder een afzonderlijk ruimtelijk besluit in Meijendelanalyses gebruikt. Alle 37.770 vangblikevents en alle territoriumplots liggen binnen het basisgebied.</w:t>
-      </w:r>
-    </w:p>
-    <w:bookmarkEnd w:id="34"/>
-    <w:bookmarkStart w:id="40" w:name="Xfebc52f59ff868acafd337a471440060af3e54a"/>
-    <w:p>
-      <w:pPr>
-        <w:pStyle w:val="Heading3"/>
-      </w:pPr>
-      <w:r>
-        <w:t xml:space="preserve">1.7. Verklarende omgevingslagen</w:t>
-      </w:r>
-    </w:p>
-    <w:p>
-      <w:pPr>
-        <w:pStyle w:val="FirstParagraph"/>
-      </w:pPr>
-      <w:r>
-        <w:t xml:space="preserve">Deze gegevens zijn geen soortenwaarnemingen. Zij kunnen wel helpen om ecologische veranderingen te beschrijven of als mogelijke verklaring te toetsen.</w:t>
-      </w:r>
-    </w:p>
-    <w:bookmarkStart w:id="35" w:name="X3eb1e0499b27f7181e9c714d04bfda4b548e3f4"/>
+        <w:t xml:space="preserve">SHA256SUMS.txt</w:t>
+      </w:r>
+      <w:r>
+        <w:t xml:space="preserve"> </w:t>
+      </w:r>
+      <w:r>
+        <w:t xml:space="preserve">worden duurzaam bewaard op de T7 onder</w:t>
+      </w:r>
+      <w:r>
+        <w:t xml:space="preserve"> </w:t>
+      </w:r>
+      <w:r>
+        <w:rPr>
+          <w:rStyle w:val="VerbatimChar"/>
+        </w:rPr>
+        <w:t xml:space="preserve">Meijendel data/Externe ecologiebronnen/fase_1_2_2026-09-26</w:t>
+      </w:r>
+      <w:r>
+        <w:t xml:space="preserve">.</w:t>
+      </w:r>
+    </w:p>
+    <w:bookmarkStart w:id="35" w:name="stowa-limnodata"/>
     <w:p>
       <w:pPr>
         <w:pStyle w:val="Heading4"/>
       </w:pPr>
       <w:r>
-        <w:t xml:space="preserve">1.7.1. Dagelijks weer</w:t>
-      </w:r>
-    </w:p>
-    <w:p>
-      <w:pPr>
-        <w:pStyle w:val="FirstParagraph"/>
-      </w:pPr>
-      <w:r>
-        <w:rPr>
-          <w:b/>
-          <w:bCs/>
-        </w:rPr>
-        <w:t xml:space="preserve">Eigenaar.</w:t>
-      </w:r>
-      <w:r>
-        <w:t xml:space="preserve"> </w:t>
-      </w:r>
-      <w:r>
-        <w:t xml:space="preserve">KNMI, stations Valkenburg en Voorschoten</w:t>
-      </w:r>
-    </w:p>
-    <w:p>
-      <w:pPr>
-        <w:pStyle w:val="BodyText"/>
-      </w:pPr>
-      <w:r>
-        <w:rPr>
-          <w:b/>
-          <w:bCs/>
-        </w:rPr>
-        <w:t xml:space="preserve">Omvang en periode in de huidige SQL-dump.</w:t>
-      </w:r>
-      <w:r>
-        <w:t xml:space="preserve"> </w:t>
-      </w:r>
-      <w:r>
-        <w:t xml:space="preserve">24.837 dagregels, 1953–2026</w:t>
-      </w:r>
-    </w:p>
-    <w:p>
-      <w:pPr>
-        <w:pStyle w:val="BodyText"/>
-      </w:pPr>
-      <w:r>
-        <w:rPr>
-          <w:b/>
-          <w:bCs/>
-        </w:rPr>
-        <w:t xml:space="preserve">Gebruik en grens.</w:t>
-      </w:r>
-      <w:r>
-        <w:t xml:space="preserve"> </w:t>
-      </w:r>
-      <w:r>
-        <w:t xml:space="preserve">Temperatuur, neerslag, wind, zon en luchtdruk kunnen als covariaten worden gebruikt. Alleen de genormaliseerde analyseview is geldig; 2026 is nog niet compleet.</w:t>
+        <w:t xml:space="preserve">1.6.1. STOWA Limnodata</w:t>
+      </w:r>
+    </w:p>
+    <w:p>
+      <w:pPr>
+        <w:pStyle w:val="FirstParagraph"/>
+      </w:pPr>
+      <w:r>
+        <w:rPr>
+          <w:b/>
+          <w:bCs/>
+        </w:rPr>
+        <w:t xml:space="preserve">Beheerder.</w:t>
+      </w:r>
+      <w:r>
+        <w:t xml:space="preserve"> </w:t>
+      </w:r>
+      <w:r>
+        <w:t xml:space="preserve">STOWA; gegevens van Hoogheemraadschap van Delfland en Rijnland</w:t>
+      </w:r>
+    </w:p>
+    <w:p>
+      <w:pPr>
+        <w:pStyle w:val="BodyText"/>
+      </w:pPr>
+      <w:r>
+        <w:rPr>
+          <w:b/>
+          <w:bCs/>
+        </w:rPr>
+        <w:t xml:space="preserve">Omvang en periode.</w:t>
+      </w:r>
+      <w:r>
+        <w:t xml:space="preserve"> </w:t>
+      </w:r>
+      <w:r>
+        <w:t xml:space="preserve">44 bemonsteringen op zeven stationcodes en zes locaties, met 1.036 positieve taxonresultaten van 439 taxa uit 1992–2010.</w:t>
+      </w:r>
+    </w:p>
+    <w:p>
+      <w:pPr>
+        <w:pStyle w:val="BodyText"/>
+      </w:pPr>
+      <w:r>
+        <w:rPr>
+          <w:b/>
+          <w:bCs/>
+        </w:rPr>
+        <w:t xml:space="preserve">Gebruik.</w:t>
+      </w:r>
+      <w:r>
+        <w:t xml:space="preserve"> </w:t>
+      </w:r>
+      <w:r>
+        <w:t xml:space="preserve">Herhaalde metingen van aquatische flora en fauna kunnen per locatie, datum, methode en meeteenheid worden onderzocht. De gebruikte eenheden blijven gescheiden: 426 resultaten zijn uitgedrukt als</w:t>
+      </w:r>
+      <w:r>
+        <w:t xml:space="preserve"> </w:t>
+      </w:r>
+      <w:r>
+        <w:rPr>
+          <w:rStyle w:val="VerbatimChar"/>
+        </w:rPr>
+        <w:t xml:space="preserve">aantal/ml</w:t>
+      </w:r>
+      <w:r>
+        <w:t xml:space="preserve">, 358 als</w:t>
+      </w:r>
+      <w:r>
+        <w:t xml:space="preserve"> </w:t>
+      </w:r>
+      <w:r>
+        <w:rPr>
+          <w:rStyle w:val="VerbatimChar"/>
+        </w:rPr>
+        <w:t xml:space="preserve">aantal/5m</w:t>
+      </w:r>
+      <w:r>
+        <w:t xml:space="preserve">, 196 als Braun-Blanquetklasse en 56 zonder eenheid. Niet gemelde soorten zijn geen nulwaarneming.</w:t>
       </w:r>
     </w:p>
     <w:bookmarkEnd w:id="35"/>
-    <w:bookmarkStart w:id="36" w:name="X16e43c6193c5d1c847597e17ba8ce6567d98643"/>
+    <w:bookmarkStart w:id="36" w:name="endure-helmduinfauna"/>
     <w:p>
       <w:pPr>
         <w:pStyle w:val="Heading4"/>
       </w:pPr>
       <w:r>
-        <w:t xml:space="preserve">1.7.2. Hoogte</w:t>
-      </w:r>
-    </w:p>
-    <w:p>
-      <w:pPr>
-        <w:pStyle w:val="FirstParagraph"/>
-      </w:pPr>
-      <w:r>
-        <w:rPr>
-          <w:b/>
-          <w:bCs/>
-        </w:rPr>
-        <w:t xml:space="preserve">Eigenaar.</w:t>
-      </w:r>
-      <w:r>
-        <w:t xml:space="preserve"> </w:t>
-      </w:r>
-      <w:r>
-        <w:t xml:space="preserve">Actueel Hoogtebestand Nederland via PDOK</w:t>
-      </w:r>
-    </w:p>
-    <w:p>
-      <w:pPr>
-        <w:pStyle w:val="BodyText"/>
-      </w:pPr>
-      <w:r>
-        <w:rPr>
-          <w:b/>
-          <w:bCs/>
-        </w:rPr>
-        <w:t xml:space="preserve">Omvang en periode in de huidige SQL-dump.</w:t>
-      </w:r>
-      <w:r>
-        <w:t xml:space="preserve"> </w:t>
-      </w:r>
-      <w:r>
-        <w:t xml:space="preserve">55 plots, peiljaar 2025</w:t>
-      </w:r>
-    </w:p>
-    <w:p>
-      <w:pPr>
-        <w:pStyle w:val="BodyText"/>
-      </w:pPr>
-      <w:r>
-        <w:rPr>
-          <w:b/>
-          <w:bCs/>
-        </w:rPr>
-        <w:t xml:space="preserve">Gebruik en grens.</w:t>
-      </w:r>
-      <w:r>
-        <w:t xml:space="preserve"> </w:t>
-      </w:r>
-      <w:r>
-        <w:t xml:space="preserve">Beschrijft hoogte en hoogtevariatie per plot. Eén peiljaar geeft geen ontwikkeling door de tijd.</w:t>
+        <w:t xml:space="preserve">1.6.2. ENDURE helmduinfauna</w:t>
+      </w:r>
+    </w:p>
+    <w:p>
+      <w:pPr>
+        <w:pStyle w:val="FirstParagraph"/>
+      </w:pPr>
+      <w:r>
+        <w:rPr>
+          <w:b/>
+          <w:bCs/>
+        </w:rPr>
+        <w:t xml:space="preserve">Beheerder.</w:t>
+      </w:r>
+      <w:r>
+        <w:t xml:space="preserve"> </w:t>
+      </w:r>
+      <w:r>
+        <w:t xml:space="preserve">Universiteit Gent en ENDURE</w:t>
+      </w:r>
+    </w:p>
+    <w:p>
+      <w:pPr>
+        <w:pStyle w:val="BodyText"/>
+      </w:pPr>
+      <w:r>
+        <w:rPr>
+          <w:b/>
+          <w:bCs/>
+        </w:rPr>
+        <w:t xml:space="preserve">Omvang en periode.</w:t>
+      </w:r>
+      <w:r>
+        <w:t xml:space="preserve"> </w:t>
+      </w:r>
+      <w:r>
+        <w:t xml:space="preserve">Vijftien meetpunten op 19 september 2018. Veertien meetpunten hebben een complete matrix met 71 aanwezigheden en 9.001 expliciete afwezigheden voor 626 taxa; bij één meetpunt ontbreekt de resultatenmatrix.</w:t>
+      </w:r>
+    </w:p>
+    <w:p>
+      <w:pPr>
+        <w:pStyle w:val="BodyText"/>
+      </w:pPr>
+      <w:r>
+        <w:rPr>
+          <w:b/>
+          <w:bCs/>
+        </w:rPr>
+        <w:t xml:space="preserve">Gebruik.</w:t>
+      </w:r>
+      <w:r>
+        <w:t xml:space="preserve"> </w:t>
+      </w:r>
+      <w:r>
+        <w:t xml:space="preserve">Dit is een gestandaardiseerde en herhaalbare referentiemeting voor ongewervelden in witte duinen. De expliciete afwezigheden zijn bruikbaar binnen de veertien complete matrices. Eén meetjaar levert geen ontwikkeling door de tijd op.</w:t>
       </w:r>
     </w:p>
     <w:bookmarkEnd w:id="36"/>
-    <w:bookmarkStart w:id="37" w:name="X985cc08a223871338e44c77746a9368ab7933d9"/>
+    <w:bookmarkStart w:id="37" w:name="landelijke-vegetatie-databank"/>
     <w:p>
       <w:pPr>
         <w:pStyle w:val="Heading4"/>
       </w:pPr>
       <w:r>
-        <w:t xml:space="preserve">1.7.3. Stikstofdepositie</w:t>
-      </w:r>
-    </w:p>
-    <w:p>
-      <w:pPr>
-        <w:pStyle w:val="FirstParagraph"/>
-      </w:pPr>
-      <w:r>
-        <w:rPr>
-          <w:b/>
-          <w:bCs/>
-        </w:rPr>
-        <w:t xml:space="preserve">Eigenaar.</w:t>
-      </w:r>
-      <w:r>
-        <w:t xml:space="preserve"> </w:t>
-      </w:r>
-      <w:r>
-        <w:t xml:space="preserve">RIVM</w:t>
-      </w:r>
-    </w:p>
-    <w:p>
-      <w:pPr>
-        <w:pStyle w:val="BodyText"/>
-      </w:pPr>
-      <w:r>
-        <w:rPr>
-          <w:b/>
-          <w:bCs/>
-        </w:rPr>
-        <w:t xml:space="preserve">Omvang en periode in de huidige SQL-dump.</w:t>
-      </w:r>
-      <w:r>
-        <w:t xml:space="preserve"> </w:t>
-      </w:r>
-      <w:r>
-        <w:t xml:space="preserve">1.027 plot-jaarregels, 2005–2023</w:t>
-      </w:r>
-    </w:p>
-    <w:p>
-      <w:pPr>
-        <w:pStyle w:val="BodyText"/>
-      </w:pPr>
-      <w:r>
-        <w:rPr>
-          <w:b/>
-          <w:bCs/>
-        </w:rPr>
-        <w:t xml:space="preserve">Gebruik en grens.</w:t>
-      </w:r>
-      <w:r>
-        <w:t xml:space="preserve"> </w:t>
-      </w:r>
-      <w:r>
-        <w:t xml:space="preserve">Geschikt als mogelijke verklarende factor naast soorten- en vegetatiereeksen. Een samenhang bewijst niet dat stikstof de enige oorzaak is.</w:t>
+        <w:t xml:space="preserve">1.6.3. Landelijke Vegetatie Databank</w:t>
+      </w:r>
+    </w:p>
+    <w:p>
+      <w:pPr>
+        <w:pStyle w:val="FirstParagraph"/>
+      </w:pPr>
+      <w:r>
+        <w:rPr>
+          <w:b/>
+          <w:bCs/>
+        </w:rPr>
+        <w:t xml:space="preserve">Beheerder.</w:t>
+      </w:r>
+      <w:r>
+        <w:t xml:space="preserve"> </w:t>
+      </w:r>
+      <w:r>
+        <w:t xml:space="preserve">Wageningen Environmental Research</w:t>
+      </w:r>
+    </w:p>
+    <w:p>
+      <w:pPr>
+        <w:pStyle w:val="BodyText"/>
+      </w:pPr>
+      <w:r>
+        <w:rPr>
+          <w:b/>
+          <w:bCs/>
+        </w:rPr>
+        <w:t xml:space="preserve">Omvang en periode.</w:t>
+      </w:r>
+      <w:r>
+        <w:t xml:space="preserve"> </w:t>
+      </w:r>
+      <w:r>
+        <w:t xml:space="preserve">De gepubliceerde bronversie 1.6 bevat binnen het basisgebied 5.195 opnamen en 119.006 taxonregels uit 1930–2015. Toegelaten zijn 3.437 opnamen met een gepubliceerde locatie-onzekerheid van maximaal 50 meter en 81.310 taxonresultaten uit 1959–2015. De overige 1.758 opnamen blijven buiten de analytische selectie vanwege een onzekerheid van 100, 1.000 of 5.000 meter.</w:t>
+      </w:r>
+    </w:p>
+    <w:p>
+      <w:pPr>
+        <w:pStyle w:val="BodyText"/>
+      </w:pPr>
+      <w:r>
+        <w:rPr>
+          <w:b/>
+          <w:bCs/>
+        </w:rPr>
+        <w:t xml:space="preserve">Overlap en gebruik.</w:t>
+      </w:r>
+      <w:r>
+        <w:t xml:space="preserve"> </w:t>
+      </w:r>
+      <w:r>
+        <w:t xml:space="preserve">De controle op datum, taxon en afstand markeert 8.006 resultaten als exacte en 5.163 als waarschijnlijke overlap met de primaire provinciale PQ-reeks. Deze 13.169 resultaten tellen niet als onafhankelijke tweede waarneming. Daarnaast hebben 51.078 LVD-resultaten een mogelijke overeenkomst met een NDFF-regel op taxon, datum en onzekerheidspolygoon. Omdat NDFF geen gedeelde bron-ID levert en de polygonen ruimtelijke onzekerheid weergeven, wordt die mogelijke overlap niet automatisch als dubbel verwijderd. De resterende opnamecontext is bruikbaar voor historische vegetatiesamenstelling en verspreiding; vergelijking door de tijd vereist controle van opnametype, oppervlak en herhaling.</w:t>
       </w:r>
     </w:p>
     <w:bookmarkEnd w:id="37"/>
-    <w:bookmarkStart w:id="38" w:name="Xc07cffd6554357998b0536696cf1beaabb67c8a"/>
+    <w:bookmarkStart w:id="38" w:name="historische-vlinder--en-motcollectie"/>
     <w:p>
       <w:pPr>
         <w:pStyle w:val="Heading4"/>
       </w:pPr>
       <w:r>
-        <w:t xml:space="preserve">1.7.4. Bodemgebruik</w:t>
-      </w:r>
-    </w:p>
-    <w:p>
-      <w:pPr>
-        <w:pStyle w:val="FirstParagraph"/>
-      </w:pPr>
-      <w:r>
-        <w:rPr>
-          <w:b/>
-          <w:bCs/>
-        </w:rPr>
-        <w:t xml:space="preserve">Eigenaar.</w:t>
-      </w:r>
-      <w:r>
-        <w:t xml:space="preserve"> </w:t>
-      </w:r>
-      <w:r>
-        <w:t xml:space="preserve">CBS Bestand Bodemgebruik</w:t>
-      </w:r>
-    </w:p>
-    <w:p>
-      <w:pPr>
-        <w:pStyle w:val="BodyText"/>
-      </w:pPr>
-      <w:r>
-        <w:rPr>
-          <w:b/>
-          <w:bCs/>
-        </w:rPr>
-        <w:t xml:space="preserve">Omvang en periode in de huidige SQL-dump.</w:t>
-      </w:r>
-      <w:r>
-        <w:t xml:space="preserve"> </w:t>
-      </w:r>
-      <w:r>
-        <w:t xml:space="preserve">918 plot-jaar-klasseregels, 1996–2022</w:t>
-      </w:r>
-    </w:p>
-    <w:p>
-      <w:pPr>
-        <w:pStyle w:val="BodyText"/>
-      </w:pPr>
-      <w:r>
-        <w:rPr>
-          <w:b/>
-          <w:bCs/>
-        </w:rPr>
-        <w:t xml:space="preserve">Gebruik en grens.</w:t>
-      </w:r>
-      <w:r>
-        <w:t xml:space="preserve"> </w:t>
-      </w:r>
-      <w:r>
-        <w:t xml:space="preserve">Laat veranderingen in de ruimtelijke omgeving van plots zien. De meetjaren zijn niet jaarlijks beschikbaar.</w:t>
+        <w:t xml:space="preserve">1.6.4. Historische vlinder- en motcollectie</w:t>
+      </w:r>
+    </w:p>
+    <w:p>
+      <w:pPr>
+        <w:pStyle w:val="FirstParagraph"/>
+      </w:pPr>
+      <w:r>
+        <w:rPr>
+          <w:b/>
+          <w:bCs/>
+        </w:rPr>
+        <w:t xml:space="preserve">Beheerder.</w:t>
+      </w:r>
+      <w:r>
+        <w:t xml:space="preserve"> </w:t>
+      </w:r>
+      <w:r>
+        <w:t xml:space="preserve">Natuurhistorisch Museum Rotterdam</w:t>
+      </w:r>
+    </w:p>
+    <w:p>
+      <w:pPr>
+        <w:pStyle w:val="BodyText"/>
+      </w:pPr>
+      <w:r>
+        <w:rPr>
+          <w:b/>
+          <w:bCs/>
+        </w:rPr>
+        <w:t xml:space="preserve">Omvang en periode.</w:t>
+      </w:r>
+      <w:r>
+        <w:t xml:space="preserve"> </w:t>
+      </w:r>
+      <w:r>
+        <w:t xml:space="preserve">Van 5.219 ruimtelijke treffers binnen de projectgrens zijn 4.748 gedateerde, unieke collectierecords met een expliciete etiketplaats Meijendel of Bierlap toegelaten; 247 taxa uit 1955–2015. Van deze resultaten hebben 4.646 een mogelijke overeenkomst met NDFF op taxon, datum en onzekerheidspolygoon.</w:t>
+      </w:r>
+    </w:p>
+    <w:p>
+      <w:pPr>
+        <w:pStyle w:val="BodyText"/>
+      </w:pPr>
+      <w:r>
+        <w:rPr>
+          <w:b/>
+          <w:bCs/>
+        </w:rPr>
+        <w:t xml:space="preserve">Gebruik.</w:t>
+      </w:r>
+      <w:r>
+        <w:t xml:space="preserve"> </w:t>
+      </w:r>
+      <w:r>
+        <w:t xml:space="preserve">De collectie geeft controleerbare historische aanwezigheid, vooral door de intensieve vangsten van J.A.W. Lucas in 1955–1956. Zonder vanginspanning en lege vangnachten is dit geen populatietrend. De mogelijke NDFF-overlap blijft gemarkeerd en wordt niet automatisch samengevoegd.</w:t>
       </w:r>
     </w:p>
     <w:bookmarkEnd w:id="38"/>
-    <w:bookmarkStart w:id="39" w:name="X33e7f6888c5c8ab3fea51b1d946ffea85e3d743"/>
+    <w:bookmarkStart w:id="39" w:name="naturalis-botany"/>
     <w:p>
       <w:pPr>
         <w:pStyle w:val="Heading4"/>
       </w:pPr>
       <w:r>
-        <w:t xml:space="preserve">1.7.5. Natura 2000-habitat</w:t>
-      </w:r>
-    </w:p>
-    <w:p>
-      <w:pPr>
-        <w:pStyle w:val="FirstParagraph"/>
-      </w:pPr>
-      <w:r>
-        <w:rPr>
-          <w:b/>
-          <w:bCs/>
-        </w:rPr>
-        <w:t xml:space="preserve">Eigenaar.</w:t>
-      </w:r>
-      <w:r>
-        <w:t xml:space="preserve"> </w:t>
-      </w:r>
-      <w:r>
-        <w:t xml:space="preserve">Habitatkartering 2014; bronhouderschap nog in de metadata te bevestigen</w:t>
-      </w:r>
-    </w:p>
-    <w:p>
-      <w:pPr>
-        <w:pStyle w:val="BodyText"/>
-      </w:pPr>
-      <w:r>
-        <w:rPr>
-          <w:b/>
-          <w:bCs/>
-        </w:rPr>
-        <w:t xml:space="preserve">Omvang en periode in de huidige SQL-dump.</w:t>
-      </w:r>
-      <w:r>
-        <w:t xml:space="preserve"> </w:t>
-      </w:r>
-      <w:r>
-        <w:t xml:space="preserve">384 plot-habitatregels uit 2014</w:t>
-      </w:r>
-    </w:p>
-    <w:p>
-      <w:pPr>
-        <w:pStyle w:val="BodyText"/>
-      </w:pPr>
-      <w:r>
-        <w:rPr>
-          <w:b/>
-          <w:bCs/>
-        </w:rPr>
-        <w:t xml:space="preserve">Gebruik en grens.</w:t>
-      </w:r>
-      <w:r>
-        <w:t xml:space="preserve"> </w:t>
-      </w:r>
-      <w:r>
-        <w:t xml:space="preserve">Geeft de verdeling van habitattypen binnen plots. Dit is één kaartjaar; de aangekondigde T1-kaart is nodig voor een directe vergelijking door de tijd.</w:t>
+        <w:t xml:space="preserve">1.6.5. Naturalis Botany</w:t>
+      </w:r>
+    </w:p>
+    <w:p>
+      <w:pPr>
+        <w:pStyle w:val="FirstParagraph"/>
+      </w:pPr>
+      <w:r>
+        <w:rPr>
+          <w:b/>
+          <w:bCs/>
+        </w:rPr>
+        <w:t xml:space="preserve">Beheerder.</w:t>
+      </w:r>
+      <w:r>
+        <w:t xml:space="preserve"> </w:t>
+      </w:r>
+      <w:r>
+        <w:t xml:space="preserve">Naturalis Biodiversity Center</w:t>
+      </w:r>
+    </w:p>
+    <w:p>
+      <w:pPr>
+        <w:pStyle w:val="BodyText"/>
+      </w:pPr>
+      <w:r>
+        <w:rPr>
+          <w:b/>
+          <w:bCs/>
+        </w:rPr>
+        <w:t xml:space="preserve">Omvang en periode.</w:t>
+      </w:r>
+      <w:r>
+        <w:t xml:space="preserve"> </w:t>
+      </w:r>
+      <w:r>
+        <w:t xml:space="preserve">Van 7.585 ruimtelijke treffers binnen de projectgrens zijn 1.881 gedateerde, unieke specimens met een expliciete Meijendel-etiketplaats toegelaten; 785 taxa uit 1875–2025. Daarvan hebben 641 specimens een mogelijke overeenkomst met NDFF. Nog 33 expliciet als Meijendel beschreven specimens zonder bruikbare datum blijven buiten de analytische selectie.</w:t>
+      </w:r>
+    </w:p>
+    <w:p>
+      <w:pPr>
+        <w:pStyle w:val="BodyText"/>
+      </w:pPr>
+      <w:r>
+        <w:rPr>
+          <w:b/>
+          <w:bCs/>
+        </w:rPr>
+        <w:t xml:space="preserve">Gebruik.</w:t>
+      </w:r>
+      <w:r>
+        <w:t xml:space="preserve"> </w:t>
+      </w:r>
+      <w:r>
+        <w:t xml:space="preserve">Gedateerde historische plantenvondsten met bewaard bewijsmateriaal. De records tonen aanwezigheid, geen gestandaardiseerde telinspanning of afwezigheid.</w:t>
       </w:r>
     </w:p>
     <w:bookmarkEnd w:id="39"/>
+    <w:bookmarkStart w:id="40" w:name="naturalis-coleoptera"/>
+    <w:p>
+      <w:pPr>
+        <w:pStyle w:val="Heading4"/>
+      </w:pPr>
+      <w:r>
+        <w:t xml:space="preserve">1.6.6. Naturalis Coleoptera</w:t>
+      </w:r>
+    </w:p>
+    <w:p>
+      <w:pPr>
+        <w:pStyle w:val="FirstParagraph"/>
+      </w:pPr>
+      <w:r>
+        <w:rPr>
+          <w:b/>
+          <w:bCs/>
+        </w:rPr>
+        <w:t xml:space="preserve">Beheerder.</w:t>
+      </w:r>
+      <w:r>
+        <w:t xml:space="preserve"> </w:t>
+      </w:r>
+      <w:r>
+        <w:t xml:space="preserve">Naturalis Biodiversity Center</w:t>
+      </w:r>
+    </w:p>
+    <w:p>
+      <w:pPr>
+        <w:pStyle w:val="BodyText"/>
+      </w:pPr>
+      <w:r>
+        <w:rPr>
+          <w:b/>
+          <w:bCs/>
+        </w:rPr>
+        <w:t xml:space="preserve">Omvang en periode.</w:t>
+      </w:r>
+      <w:r>
+        <w:t xml:space="preserve"> </w:t>
+      </w:r>
+      <w:r>
+        <w:t xml:space="preserve">Van 2.372 ruimtelijke treffers binnen de projectgrens zijn 869 gedateerde, unieke specimens met een expliciete Meijendel-etiketplaats toegelaten; 78 taxa uit 1906–2023. Nog 210 expliciete Meijendel-specimens zonder bruikbare datum blijven buiten de analytische selectie.</w:t>
+      </w:r>
+    </w:p>
+    <w:p>
+      <w:pPr>
+        <w:pStyle w:val="BodyText"/>
+      </w:pPr>
+      <w:r>
+        <w:rPr>
+          <w:b/>
+          <w:bCs/>
+        </w:rPr>
+        <w:t xml:space="preserve">Gebruik.</w:t>
+      </w:r>
+      <w:r>
+        <w:t xml:space="preserve"> </w:t>
+      </w:r>
+      <w:r>
+        <w:t xml:space="preserve">Historische aanwezigheid van kevers met bewaard collectiemateriaal. De bron ondersteunt geen populatietrend zonder gestandaardiseerde vanginspanning. De oorspronkelijke etiketplaats en de gepubliceerde locatie-onzekerheid blijven per specimen beschikbaar.</w:t>
+      </w:r>
+    </w:p>
     <w:bookmarkEnd w:id="40"/>
     <w:bookmarkEnd w:id="41"/>
-    <w:bookmarkStart w:id="47" w:name="X692b0a71312b2a939db271d079fb23757bfc15a"/>
+    <w:bookmarkStart w:id="42" w:name="X5d611a31ac68a696fd179c2c85c282500afefc7"/>
+    <w:p>
+      <w:pPr>
+        <w:pStyle w:val="Heading3"/>
+      </w:pPr>
+      <w:r>
+        <w:t xml:space="preserve">1.7. Openstaande ruimtelijke toelatingscontrole</w:t>
+      </w:r>
+    </w:p>
+    <w:p>
+      <w:pPr>
+        <w:pStyle w:val="FirstParagraph"/>
+      </w:pPr>
+      <w:r>
+        <w:t xml:space="preserve">De bronregistraties staan wel in</w:t>
+      </w:r>
+      <w:r>
+        <w:t xml:space="preserve"> </w:t>
+      </w:r>
+      <w:r>
+        <w:rPr>
+          <w:rStyle w:val="VerbatimChar"/>
+        </w:rPr>
+        <w:t xml:space="preserve">Meijendel</w:t>
+      </w:r>
+      <w:r>
+        <w:t xml:space="preserve">, maar een deel mag nog niet als waarneming binnen Meijendel worden gebruikt. De audit met de actuele projectgrens vond 70.427 openbare NDFF-records uit de downloadselectie 1950–2025, 968 BMP-dagwaarnemingen uit 2009–2025, 644 provinciale PQ-opnamen uit 1981–2025 en 14 primaire SOVON-bijvangsten uit 2009–2024 die buiten het basisgebied liggen. Sommige NDFF-records hebben een breed broninterval dat al vóór 1950 begint; dat maakt hen geen waarneming uit dat eerdere jaar. Daarnaast raken 146.466 NDFF-polygonen alleen de grens. Bij die polygonen staat niet vast dat de waarneming binnen Meijendel is gedaan.</w:t>
+      </w:r>
+    </w:p>
+    <w:p>
+      <w:pPr>
+        <w:pStyle w:val="BodyText"/>
+      </w:pPr>
+      <w:r>
+        <w:t xml:space="preserve">Deze records blijven herkenbaar als bronmateriaal, maar worden niet zonder een afzonderlijk ruimtelijk besluit in Meijendelanalyses gebruikt. Alle 37.770 vangblikevents en alle territoriumplots liggen binnen het basisgebied.</w:t>
+      </w:r>
+    </w:p>
+    <w:bookmarkEnd w:id="42"/>
+    <w:bookmarkStart w:id="48" w:name="verklarende-omgevingslagen"/>
+    <w:p>
+      <w:pPr>
+        <w:pStyle w:val="Heading3"/>
+      </w:pPr>
+      <w:r>
+        <w:t xml:space="preserve">1.8. Verklarende omgevingslagen</w:t>
+      </w:r>
+    </w:p>
+    <w:p>
+      <w:pPr>
+        <w:pStyle w:val="FirstParagraph"/>
+      </w:pPr>
+      <w:r>
+        <w:t xml:space="preserve">Deze gegevens zijn geen soortenwaarnemingen. Zij kunnen wel helpen om ecologische veranderingen te beschrijven of als mogelijke verklaring te toetsen.</w:t>
+      </w:r>
+    </w:p>
+    <w:bookmarkStart w:id="43" w:name="dagelijks-weer"/>
+    <w:p>
+      <w:pPr>
+        <w:pStyle w:val="Heading4"/>
+      </w:pPr>
+      <w:r>
+        <w:t xml:space="preserve">1.8.1. Dagelijks weer</w:t>
+      </w:r>
+    </w:p>
+    <w:p>
+      <w:pPr>
+        <w:pStyle w:val="FirstParagraph"/>
+      </w:pPr>
+      <w:r>
+        <w:rPr>
+          <w:b/>
+          <w:bCs/>
+        </w:rPr>
+        <w:t xml:space="preserve">Eigenaar.</w:t>
+      </w:r>
+      <w:r>
+        <w:t xml:space="preserve"> </w:t>
+      </w:r>
+      <w:r>
+        <w:t xml:space="preserve">KNMI, stations Valkenburg en Voorschoten</w:t>
+      </w:r>
+    </w:p>
+    <w:p>
+      <w:pPr>
+        <w:pStyle w:val="BodyText"/>
+      </w:pPr>
+      <w:r>
+        <w:rPr>
+          <w:b/>
+          <w:bCs/>
+        </w:rPr>
+        <w:t xml:space="preserve">Omvang en periode in de huidige SQL-dump.</w:t>
+      </w:r>
+      <w:r>
+        <w:t xml:space="preserve"> </w:t>
+      </w:r>
+      <w:r>
+        <w:t xml:space="preserve">24.837 dagregels, 1953–2026</w:t>
+      </w:r>
+    </w:p>
+    <w:p>
+      <w:pPr>
+        <w:pStyle w:val="BodyText"/>
+      </w:pPr>
+      <w:r>
+        <w:rPr>
+          <w:b/>
+          <w:bCs/>
+        </w:rPr>
+        <w:t xml:space="preserve">Gebruik en grens.</w:t>
+      </w:r>
+      <w:r>
+        <w:t xml:space="preserve"> </w:t>
+      </w:r>
+      <w:r>
+        <w:t xml:space="preserve">Temperatuur, neerslag, wind, zon en luchtdruk kunnen als covariaten worden gebruikt. Alleen de genormaliseerde analyseview is geldig; 2026 is nog niet compleet.</w:t>
+      </w:r>
+    </w:p>
+    <w:bookmarkEnd w:id="43"/>
+    <w:bookmarkStart w:id="44" w:name="hoogte"/>
+    <w:p>
+      <w:pPr>
+        <w:pStyle w:val="Heading4"/>
+      </w:pPr>
+      <w:r>
+        <w:t xml:space="preserve">1.8.2. Hoogte</w:t>
+      </w:r>
+    </w:p>
+    <w:p>
+      <w:pPr>
+        <w:pStyle w:val="FirstParagraph"/>
+      </w:pPr>
+      <w:r>
+        <w:rPr>
+          <w:b/>
+          <w:bCs/>
+        </w:rPr>
+        <w:t xml:space="preserve">Eigenaar.</w:t>
+      </w:r>
+      <w:r>
+        <w:t xml:space="preserve"> </w:t>
+      </w:r>
+      <w:r>
+        <w:t xml:space="preserve">Actueel Hoogtebestand Nederland via PDOK</w:t>
+      </w:r>
+    </w:p>
+    <w:p>
+      <w:pPr>
+        <w:pStyle w:val="BodyText"/>
+      </w:pPr>
+      <w:r>
+        <w:rPr>
+          <w:b/>
+          <w:bCs/>
+        </w:rPr>
+        <w:t xml:space="preserve">Omvang en periode in de huidige SQL-dump.</w:t>
+      </w:r>
+      <w:r>
+        <w:t xml:space="preserve"> </w:t>
+      </w:r>
+      <w:r>
+        <w:t xml:space="preserve">55 plots, peiljaar 2025</w:t>
+      </w:r>
+    </w:p>
+    <w:p>
+      <w:pPr>
+        <w:pStyle w:val="BodyText"/>
+      </w:pPr>
+      <w:r>
+        <w:rPr>
+          <w:b/>
+          <w:bCs/>
+        </w:rPr>
+        <w:t xml:space="preserve">Gebruik en grens.</w:t>
+      </w:r>
+      <w:r>
+        <w:t xml:space="preserve"> </w:t>
+      </w:r>
+      <w:r>
+        <w:t xml:space="preserve">Beschrijft hoogte en hoogtevariatie per plot. Eén peiljaar geeft geen ontwikkeling door de tijd.</w:t>
+      </w:r>
+    </w:p>
+    <w:bookmarkEnd w:id="44"/>
+    <w:bookmarkStart w:id="45" w:name="stikstofdepositie"/>
+    <w:p>
+      <w:pPr>
+        <w:pStyle w:val="Heading4"/>
+      </w:pPr>
+      <w:r>
+        <w:t xml:space="preserve">1.8.3. Stikstofdepositie</w:t>
+      </w:r>
+    </w:p>
+    <w:p>
+      <w:pPr>
+        <w:pStyle w:val="FirstParagraph"/>
+      </w:pPr>
+      <w:r>
+        <w:rPr>
+          <w:b/>
+          <w:bCs/>
+        </w:rPr>
+        <w:t xml:space="preserve">Eigenaar.</w:t>
+      </w:r>
+      <w:r>
+        <w:t xml:space="preserve"> </w:t>
+      </w:r>
+      <w:r>
+        <w:t xml:space="preserve">RIVM</w:t>
+      </w:r>
+    </w:p>
+    <w:p>
+      <w:pPr>
+        <w:pStyle w:val="BodyText"/>
+      </w:pPr>
+      <w:r>
+        <w:rPr>
+          <w:b/>
+          <w:bCs/>
+        </w:rPr>
+        <w:t xml:space="preserve">Omvang en periode in de huidige SQL-dump.</w:t>
+      </w:r>
+      <w:r>
+        <w:t xml:space="preserve"> </w:t>
+      </w:r>
+      <w:r>
+        <w:t xml:space="preserve">1.027 plot-jaarregels, 2005–2023</w:t>
+      </w:r>
+    </w:p>
+    <w:p>
+      <w:pPr>
+        <w:pStyle w:val="BodyText"/>
+      </w:pPr>
+      <w:r>
+        <w:rPr>
+          <w:b/>
+          <w:bCs/>
+        </w:rPr>
+        <w:t xml:space="preserve">Gebruik en grens.</w:t>
+      </w:r>
+      <w:r>
+        <w:t xml:space="preserve"> </w:t>
+      </w:r>
+      <w:r>
+        <w:t xml:space="preserve">Geschikt als mogelijke verklarende factor naast soorten- en vegetatiereeksen. Een samenhang bewijst niet dat stikstof de enige oorzaak is.</w:t>
+      </w:r>
+    </w:p>
+    <w:bookmarkEnd w:id="45"/>
+    <w:bookmarkStart w:id="46" w:name="bodemgebruik"/>
+    <w:p>
+      <w:pPr>
+        <w:pStyle w:val="Heading4"/>
+      </w:pPr>
+      <w:r>
+        <w:t xml:space="preserve">1.8.4. Bodemgebruik</w:t>
+      </w:r>
+    </w:p>
+    <w:p>
+      <w:pPr>
+        <w:pStyle w:val="FirstParagraph"/>
+      </w:pPr>
+      <w:r>
+        <w:rPr>
+          <w:b/>
+          <w:bCs/>
+        </w:rPr>
+        <w:t xml:space="preserve">Eigenaar.</w:t>
+      </w:r>
+      <w:r>
+        <w:t xml:space="preserve"> </w:t>
+      </w:r>
+      <w:r>
+        <w:t xml:space="preserve">CBS Bestand Bodemgebruik</w:t>
+      </w:r>
+    </w:p>
+    <w:p>
+      <w:pPr>
+        <w:pStyle w:val="BodyText"/>
+      </w:pPr>
+      <w:r>
+        <w:rPr>
+          <w:b/>
+          <w:bCs/>
+        </w:rPr>
+        <w:t xml:space="preserve">Omvang en periode in de huidige SQL-dump.</w:t>
+      </w:r>
+      <w:r>
+        <w:t xml:space="preserve"> </w:t>
+      </w:r>
+      <w:r>
+        <w:t xml:space="preserve">918 plot-jaar-klasseregels, 1996–2022</w:t>
+      </w:r>
+    </w:p>
+    <w:p>
+      <w:pPr>
+        <w:pStyle w:val="BodyText"/>
+      </w:pPr>
+      <w:r>
+        <w:rPr>
+          <w:b/>
+          <w:bCs/>
+        </w:rPr>
+        <w:t xml:space="preserve">Gebruik en grens.</w:t>
+      </w:r>
+      <w:r>
+        <w:t xml:space="preserve"> </w:t>
+      </w:r>
+      <w:r>
+        <w:t xml:space="preserve">Laat veranderingen in de ruimtelijke omgeving van plots zien. De meetjaren zijn niet jaarlijks beschikbaar.</w:t>
+      </w:r>
+    </w:p>
+    <w:bookmarkEnd w:id="46"/>
+    <w:bookmarkStart w:id="47" w:name="natura-2000-habitat"/>
+    <w:p>
+      <w:pPr>
+        <w:pStyle w:val="Heading4"/>
+      </w:pPr>
+      <w:r>
+        <w:t xml:space="preserve">1.8.5. Natura 2000-habitat</w:t>
+      </w:r>
+    </w:p>
+    <w:p>
+      <w:pPr>
+        <w:pStyle w:val="FirstParagraph"/>
+      </w:pPr>
+      <w:r>
+        <w:rPr>
+          <w:b/>
+          <w:bCs/>
+        </w:rPr>
+        <w:t xml:space="preserve">Eigenaar.</w:t>
+      </w:r>
+      <w:r>
+        <w:t xml:space="preserve"> </w:t>
+      </w:r>
+      <w:r>
+        <w:t xml:space="preserve">Habitatkartering 2014; bronhouderschap nog in de metadata te bevestigen</w:t>
+      </w:r>
+    </w:p>
+    <w:p>
+      <w:pPr>
+        <w:pStyle w:val="BodyText"/>
+      </w:pPr>
+      <w:r>
+        <w:rPr>
+          <w:b/>
+          <w:bCs/>
+        </w:rPr>
+        <w:t xml:space="preserve">Omvang en periode in de huidige SQL-dump.</w:t>
+      </w:r>
+      <w:r>
+        <w:t xml:space="preserve"> </w:t>
+      </w:r>
+      <w:r>
+        <w:t xml:space="preserve">384 plot-habitatregels uit 2014</w:t>
+      </w:r>
+    </w:p>
+    <w:p>
+      <w:pPr>
+        <w:pStyle w:val="BodyText"/>
+      </w:pPr>
+      <w:r>
+        <w:rPr>
+          <w:b/>
+          <w:bCs/>
+        </w:rPr>
+        <w:t xml:space="preserve">Gebruik en grens.</w:t>
+      </w:r>
+      <w:r>
+        <w:t xml:space="preserve"> </w:t>
+      </w:r>
+      <w:r>
+        <w:t xml:space="preserve">Geeft de verdeling van habitattypen binnen plots. Dit is één kaartjaar; de aangekondigde T1-kaart is nodig voor een directe vergelijking door de tijd.</w:t>
+      </w:r>
+    </w:p>
+    <w:bookmarkEnd w:id="47"/>
+    <w:bookmarkEnd w:id="48"/>
+    <w:bookmarkEnd w:id="49"/>
+    <w:bookmarkStart w:id="57" w:name="X3b532014da7425692b0b753bfd67f02e729afe2"/>
     <w:p>
       <w:pPr>
         <w:pStyle w:val="Heading2"/>
@@ -2213,7 +2703,7 @@
         <w:pStyle w:val="FirstParagraph"/>
       </w:pPr>
       <w:r>
-        <w:t xml:space="preserve">Deze database bevat informatie die niet aan de ruimtelijke toelatingsregel van de analytische database voldoet. Zij is in het Analysecentrum raadpleegbaar, maar wordt niet automatisch in modellen of kaarten uit</w:t>
+        <w:t xml:space="preserve">Deze database bevat informatie die niet aan de ruimtelijke toelatingsregel van de analytische database voldoet. De reeds gepubliceerde versie is in het Analysecentrum raadpleegbaar, maar wordt niet automatisch in modellen of kaarten uit</w:t>
       </w:r>
       <w:r>
         <w:t xml:space="preserve"> </w:t>
@@ -2228,10 +2718,10 @@
         <w:t xml:space="preserve"> </w:t>
       </w:r>
       <w:r>
-        <w:t xml:space="preserve">gebruikt.</w:t>
-      </w:r>
-    </w:p>
-    <w:bookmarkStart w:id="43" w:name="X7ae3f60e8dd3c65bdde3d5f608a55d96632a876"/>
+        <w:t xml:space="preserve">gebruikt. De nieuwe bijen- en aquatische context uit fase 2 staat op 26 september 2026 alleen in de lokale canonieke database en is nog niet naar de VPS gepubliceerd.</w:t>
+      </w:r>
+    </w:p>
+    <w:bookmarkStart w:id="51" w:name="duinvalleivegetatie"/>
     <w:p>
       <w:pPr>
         <w:pStyle w:val="Heading3"/>
@@ -2260,7 +2750,7 @@
       <w:r>
         <w:t xml:space="preserve"> </w:t>
       </w:r>
-      <w:hyperlink r:id="rId42">
+      <w:hyperlink r:id="rId50">
         <w:r>
           <w:rPr>
             <w:rStyle w:val="Hyperlink"/>
@@ -2305,8 +2795,8 @@
         <w:t xml:space="preserve">De volledige matrix van 208 taxa bevat echte nullen en maakt vergelijking tussen de drie jaren mogelijk. De locatiecodes zijn nog niet betrouwbaar aan geometrieën gekoppeld. Opname 18I01 blijft uitgesloten: daarin zijn 159 taxa geregistreerd, tegenover maximaal 40 in alle overige opnamen. Deze reeks blijft afzonderlijk van de provinciale PQ-reeks.</w:t>
       </w:r>
     </w:p>
-    <w:bookmarkEnd w:id="43"/>
-    <w:bookmarkStart w:id="44" w:name="X6cd5cd3671e295c222d5bd4a47757f0a76f0a19"/>
+    <w:bookmarkEnd w:id="51"/>
+    <w:bookmarkStart w:id="52" w:name="vogelstand-1924"/>
     <w:p>
       <w:pPr>
         <w:pStyle w:val="Heading3"/>
@@ -2369,8 +2859,8 @@
         <w:t xml:space="preserve">Historische vogelcontext. Zonder locatie per regel geen kavel- of ruimtelijke analyse.</w:t>
       </w:r>
     </w:p>
-    <w:bookmarkEnd w:id="44"/>
-    <w:bookmarkStart w:id="45" w:name="Xb3fdc40884db1bbf06132e666e117a731445140"/>
+    <w:bookmarkEnd w:id="52"/>
+    <w:bookmarkStart w:id="53" w:name="jachtspinnen"/>
     <w:p>
       <w:pPr>
         <w:pStyle w:val="Heading3"/>
@@ -2433,8 +2923,8 @@
         <w:t xml:space="preserve">De samengevoegde vangstmatrix ondersteunt een soorten-milieuanalyse, maar geen ontwikkeling door de tijd. Datums en vangrondes ontbreken. De 28 locatienummers zijn bovendien nog niet naar werkelijke plaatsen te vertalen en mogen daarom niet als Meijendelwaarnemingen worden geanalyseerd.</w:t>
       </w:r>
     </w:p>
-    <w:bookmarkEnd w:id="45"/>
-    <w:bookmarkStart w:id="46" w:name="X7c2c13aacf0ea926ee35ca97ab69391a3624a6f"/>
+    <w:bookmarkEnd w:id="53"/>
+    <w:bookmarkStart w:id="54" w:name="literatuuroverzicht"/>
     <w:p>
       <w:pPr>
         <w:pStyle w:val="Heading3"/>
@@ -2497,9 +2987,164 @@
         <w:t xml:space="preserve">Zoekingang naar onderzoek en historische context. Dit zijn verwijzingen, geen waarnemingsregels; volledige teksten blijven in Zotero en worden niet op de VPS gekopieerd.</w:t>
       </w:r>
     </w:p>
-    <w:bookmarkEnd w:id="46"/>
-    <w:bookmarkEnd w:id="47"/>
-    <w:bookmarkStart w:id="81" w:name="X2b62b82ef201b4c91783bce15da2b1d0258c34c"/>
+    <w:bookmarkEnd w:id="54"/>
+    <w:bookmarkStart w:id="55" w:name="bijenmonitoring-in-vier-beheergebieden"/>
+    <w:p>
+      <w:pPr>
+        <w:pStyle w:val="Heading3"/>
+      </w:pPr>
+      <w:r>
+        <w:t xml:space="preserve">2.5. Bijenmonitoring in vier beheergebieden</w:t>
+      </w:r>
+    </w:p>
+    <w:p>
+      <w:pPr>
+        <w:pStyle w:val="FirstParagraph"/>
+      </w:pPr>
+      <w:r>
+        <w:rPr>
+          <w:b/>
+          <w:bCs/>
+        </w:rPr>
+        <w:t xml:space="preserve">Beheerder.</w:t>
+      </w:r>
+      <w:r>
+        <w:t xml:space="preserve"> </w:t>
+      </w:r>
+      <w:r>
+        <w:t xml:space="preserve">EIS Kenniscentrum Insecten</w:t>
+      </w:r>
+    </w:p>
+    <w:p>
+      <w:pPr>
+        <w:pStyle w:val="BodyText"/>
+      </w:pPr>
+      <w:r>
+        <w:rPr>
+          <w:b/>
+          <w:bCs/>
+        </w:rPr>
+        <w:t xml:space="preserve">Omvang en periode.</w:t>
+      </w:r>
+      <w:r>
+        <w:t xml:space="preserve"> </w:t>
+      </w:r>
+      <w:r>
+        <w:t xml:space="preserve">Achttien vaste proefvlakken van één hectare, verdeeld over Vallei Meijendel, De Loopert, Buitenduinen en Binnenduinen. Uit de officiële rapporten zijn alle 162 bezoeken gereconstrueerd: drie bezoeken per proefvlak in 2019, 2021 en 2023, telkens 45 minuten.</w:t>
+      </w:r>
+    </w:p>
+    <w:p>
+      <w:pPr>
+        <w:pStyle w:val="BodyText"/>
+      </w:pPr>
+      <w:r>
+        <w:rPr>
+          <w:b/>
+          <w:bCs/>
+        </w:rPr>
+        <w:t xml:space="preserve">Waarde en beperking.</w:t>
+      </w:r>
+      <w:r>
+        <w:t xml:space="preserve"> </w:t>
+      </w:r>
+      <w:r>
+        <w:t xml:space="preserve">De vaste opzet ondersteunt in beginsel vergelijking van bijengemeenschappen tussen proefvlakken en onderzoeksjaren. De rapporten tonen de proefvlakgrenzen alleen als kaartfiguren. Zolang deze grenzen niet betrouwbaar digitaal zijn vastgelegd en de soortenmatrices niet gecontroleerd zijn gedigitaliseerd, blijven de proefvlak- en bezoekgegevens context in</w:t>
+      </w:r>
+      <w:r>
+        <w:t xml:space="preserve"> </w:t>
+      </w:r>
+      <w:r>
+        <w:rPr>
+          <w:rStyle w:val="VerbatimChar"/>
+        </w:rPr>
+        <w:t xml:space="preserve">Meijendel_bronnen</w:t>
+      </w:r>
+      <w:r>
+        <w:t xml:space="preserve">. Drie onderzoeksjaren zijn bovendien een reeks van gestandaardiseerde herhalingen, geen robuuste langjarige trend.</w:t>
+      </w:r>
+    </w:p>
+    <w:bookmarkEnd w:id="55"/>
+    <w:bookmarkStart w:id="56" w:name="aquatische-macrofauna-19741975"/>
+    <w:p>
+      <w:pPr>
+        <w:pStyle w:val="Heading3"/>
+      </w:pPr>
+      <w:r>
+        <w:t xml:space="preserve">2.6. Aquatische macrofauna 1974–1975</w:t>
+      </w:r>
+    </w:p>
+    <w:p>
+      <w:pPr>
+        <w:pStyle w:val="FirstParagraph"/>
+      </w:pPr>
+      <w:r>
+        <w:rPr>
+          <w:b/>
+          <w:bCs/>
+        </w:rPr>
+        <w:t xml:space="preserve">Beheerder.</w:t>
+      </w:r>
+      <w:r>
+        <w:t xml:space="preserve"> </w:t>
+      </w:r>
+      <w:r>
+        <w:t xml:space="preserve">Rijksuniversiteit Leiden; ontsloten via Naturalis</w:t>
+      </w:r>
+    </w:p>
+    <w:p>
+      <w:pPr>
+        <w:pStyle w:val="BodyText"/>
+      </w:pPr>
+      <w:r>
+        <w:rPr>
+          <w:b/>
+          <w:bCs/>
+        </w:rPr>
+        <w:t xml:space="preserve">Omvang en periode.</w:t>
+      </w:r>
+      <w:r>
+        <w:t xml:space="preserve"> </w:t>
+      </w:r>
+      <w:r>
+        <w:t xml:space="preserve">Zeven vaste monsterpunten in Pan 17.1, Pan 26.1.1, Kwelplas K10, G15 en G21, vrijwel maandelijks onderzocht van juni 1974 tot juli 1975. De database legt de zeven watercodes en negentien methodeperioden of afwijkingen vast. Vanaf augustus 1974 werd doorgaans 2,5 meter oever en 0,75 m² bemonsterd; voor punt 7 was dit 2 meter en 0,60 m². De pilot in juni 1974, de kortere bemonstering van punt 2 in november 1974 en de gedeeltelijke ronde van juli 1975 blijven afzonderlijk herkenbaar.</w:t>
+      </w:r>
+    </w:p>
+    <w:p>
+      <w:pPr>
+        <w:pStyle w:val="BodyText"/>
+      </w:pPr>
+      <w:r>
+        <w:rPr>
+          <w:b/>
+          <w:bCs/>
+        </w:rPr>
+        <w:t xml:space="preserve">Waarde en beperking.</w:t>
+      </w:r>
+      <w:r>
+        <w:t xml:space="preserve"> </w:t>
+      </w:r>
+      <w:r>
+        <w:t xml:space="preserve">De reeks is waardevolle historische context voor waterorganismen en watermilieu. De watercodes zijn bekend, maar betrouwbare digitale grenzen of punten en een foutgecontroleerde volledige soortenmatrix ontbreken nog. Daarom zijn nog geen waarnemingsregels naar</w:t>
+      </w:r>
+      <w:r>
+        <w:t xml:space="preserve"> </w:t>
+      </w:r>
+      <w:r>
+        <w:rPr>
+          <w:rStyle w:val="VerbatimChar"/>
+        </w:rPr>
+        <w:t xml:space="preserve">Meijendel</w:t>
+      </w:r>
+      <w:r>
+        <w:t xml:space="preserve"> </w:t>
+      </w:r>
+      <w:r>
+        <w:t xml:space="preserve">overgebracht.</w:t>
+      </w:r>
+    </w:p>
+    <w:bookmarkEnd w:id="56"/>
+    <w:bookmarkEnd w:id="57"/>
+    <w:bookmarkStart w:id="77" w:name="Xae67a70ad36e2d1d11a7d910c2e5a6d669a3a5f"/>
     <w:p>
       <w:pPr>
         <w:pStyle w:val="Heading2"/>
@@ -2516,7 +3161,7 @@
         <w:t xml:space="preserve">Deze bronnen zijn gevonden, maar nog niet toegelaten. De genoemde aantallen hebben betrekking op de al gemaakte Meijendelselectie of op de beschreven onderzoeksopzet. Voor iedere import volgt eerst controle van locatie per waarneming, overlap met bestaande bronnen, rechten en statistische betekenis.</w:t>
       </w:r>
     </w:p>
-    <w:bookmarkStart w:id="78" w:name="Xd53aceb4d9e4863cdbb6367737be5e291cdac65"/>
+    <w:bookmarkStart w:id="74" w:name="Xd53aceb4d9e4863cdbb6367737be5e291cdac65"/>
     <w:p>
       <w:pPr>
         <w:pStyle w:val="Heading3"/>
@@ -2525,25 +3170,14 @@
         <w:t xml:space="preserve">Kandidaten met de grootste verwachte aanvulling</w:t>
       </w:r>
     </w:p>
-    <w:bookmarkStart w:id="49" w:name="X083769ba592d6ab27dc1aae9780a49837ad56c7"/>
+    <w:bookmarkStart w:id="58" w:name="historische-en-actuele-ringgegevens"/>
     <w:p>
       <w:pPr>
         <w:pStyle w:val="Heading4"/>
       </w:pPr>
       <w:r>
-        <w:t xml:space="preserve">3.1.</w:t>
-      </w:r>
-      <w:r>
-        <w:t xml:space="preserve"> </w:t>
-      </w:r>
-      <w:hyperlink r:id="rId48">
-        <w:r>
-          <w:rPr>
-            <w:rStyle w:val="Hyperlink"/>
-          </w:rPr>
-          <w:t xml:space="preserve">Dutch Vegetation Database</w:t>
-        </w:r>
-      </w:hyperlink>
+        <w:t xml:space="preserve">3.1. Historische en actuele ringgegevens</w:t>
+      </w:r>
     </w:p>
     <w:p>
       <w:pPr>
@@ -2560,7 +3194,7 @@
         <w:t xml:space="preserve"> </w:t>
       </w:r>
       <w:r>
-        <w:t xml:space="preserve">Wageningen Environmental Research</w:t>
+        <w:t xml:space="preserve">Vogeltrekstation/NIOO-KNAW</w:t>
       </w:r>
     </w:p>
     <w:p>
@@ -2578,7 +3212,7 @@
         <w:t xml:space="preserve"> </w:t>
       </w:r>
       <w:r>
-        <w:t xml:space="preserve">Meijendelselectie: 5.195 opnamen, 119.006 taxonregels en 1.132 taxa; 1930–2015</w:t>
+        <w:t xml:space="preserve">De ruimtelijke selectie uit de biometrische GBIF-bron bevat 100.417 records van 163 soorten uit 1963–2023. Historische nestjongen omvatten daarnaast 668 records van 38 soorten uit 1928–1957.</w:t>
       </w:r>
     </w:p>
     <w:p>
@@ -2596,7 +3230,7 @@
         <w:t xml:space="preserve"> </w:t>
       </w:r>
       <w:r>
-        <w:t xml:space="preserve">Rijke historische vegetatieopnamen met opnameoppervlak, bedekking en protocol</w:t>
+        <w:t xml:space="preserve">Trektijd, conditie, biometrie en vroeg-historische vogelcontext</w:t>
       </w:r>
     </w:p>
     <w:p>
@@ -2614,17 +3248,32 @@
         <w:t xml:space="preserve"> </w:t>
       </w:r>
       <w:r>
-        <w:t xml:space="preserve">Overlap met provinciale PQ en NDFF verwijderen; 1.758 opnamen hebben een locatie-onzekerheid groter dan 50 meter</w:t>
-      </w:r>
-    </w:p>
-    <w:bookmarkEnd w:id="49"/>
-    <w:bookmarkStart w:id="50" w:name="Xa60e85b3787c1274ea18a16325fc61b95ef4694"/>
+        <w:t xml:space="preserve">De code</w:t>
+      </w:r>
+      <w:r>
+        <w:t xml:space="preserve"> </w:t>
+      </w:r>
+      <w:r>
+        <w:rPr>
+          <w:rStyle w:val="VerbatimChar"/>
+        </w:rPr>
+        <w:t xml:space="preserve">NL19</w:t>
+      </w:r>
+      <w:r>
+        <w:t xml:space="preserve"> </w:t>
+      </w:r>
+      <w:r>
+        <w:t xml:space="preserve">blijkt in de officiële EURING-codebeschrijving de provincie Zuid-Holland aan te duiden en niet VRS Meijendel. Trektellen-site 403 is wel VRS Meijendel en bevat inspanningsinformatie, maar er is nog geen recordsleutel tussen beide bronnen gevonden. De 100.417 ruimtelijke treffers zijn daarom niet als VRS-Meijendelvangsten geïmporteerd.</w:t>
+      </w:r>
+    </w:p>
+    <w:bookmarkEnd w:id="58"/>
+    <w:bookmarkStart w:id="59" w:name="erosiepinnen-in-een-stuifkuilcomplex"/>
     <w:p>
       <w:pPr>
         <w:pStyle w:val="Heading4"/>
       </w:pPr>
       <w:r>
-        <w:t xml:space="preserve">3.2. STOWA Limnodata</w:t>
+        <w:t xml:space="preserve">3.2. Erosiepinnen in een stuifkuilcomplex</w:t>
       </w:r>
     </w:p>
     <w:p>
@@ -2642,7 +3291,7 @@
         <w:t xml:space="preserve"> </w:t>
       </w:r>
       <w:r>
-        <w:t xml:space="preserve">STOWA; gegevens van Hoogheemraadschap van Delfland en Rijnland</w:t>
+        <w:t xml:space="preserve">Jungerius en Van der Meulen</w:t>
       </w:r>
     </w:p>
     <w:p>
@@ -2660,7 +3309,7 @@
         <w:t xml:space="preserve"> </w:t>
       </w:r>
       <w:r>
-        <w:t xml:space="preserve">1.036 taxonregels, 44 bemonsteringen en 7 stationcodes op 6 locaties; 1992–2010</w:t>
+        <w:t xml:space="preserve">48 erosiepinnen in 12 eenheden, vrijwel wekelijks gemeten gedurende één jaar</w:t>
       </w:r>
     </w:p>
     <w:p>
@@ -2678,7 +3327,7 @@
         <w:t xml:space="preserve"> </w:t>
       </w:r>
       <w:r>
-        <w:t xml:space="preserve">Aquatische flora en fauna op herhaalde locaties</w:t>
+        <w:t xml:space="preserve">Gedetailleerde processtudie van erosie, sedimentatie en vegetatie, maar geen langjarige trend</w:t>
       </w:r>
     </w:p>
     <w:p>
@@ -2696,29 +3345,18 @@
         <w:t xml:space="preserve"> </w:t>
       </w:r>
       <w:r>
-        <w:t xml:space="preserve">Eenheden en methoden per reeks scheiden; de levering bevat alleen positieve regels en geen bewezen nullen</w:t>
-      </w:r>
-    </w:p>
-    <w:bookmarkEnd w:id="50"/>
-    <w:bookmarkStart w:id="52" w:name="X1e5f9c6d74d053817190bc64c9311f58532d54f"/>
+        <w:t xml:space="preserve">Oorspronkelijke metingen en pinlocaties vinden en op waarnemingsniveau aan Meijendel koppelen</w:t>
+      </w:r>
+    </w:p>
+    <w:bookmarkEnd w:id="59"/>
+    <w:bookmarkStart w:id="60" w:name="langjarige-droge-duinvegetatieplots"/>
     <w:p>
       <w:pPr>
         <w:pStyle w:val="Heading4"/>
       </w:pPr>
       <w:r>
-        <w:t xml:space="preserve">3.3.</w:t>
-      </w:r>
-      <w:r>
-        <w:t xml:space="preserve"> </w:t>
-      </w:r>
-      <w:hyperlink r:id="rId51">
-        <w:r>
-          <w:rPr>
-            <w:rStyle w:val="Hyperlink"/>
-          </w:rPr>
-          <w:t xml:space="preserve">ENDURE helmduinfauna</w:t>
-        </w:r>
-      </w:hyperlink>
+        <w:t xml:space="preserve">3.3. Langjarige droge-duinvegetatieplots</w:t>
+      </w:r>
     </w:p>
     <w:p>
       <w:pPr>
@@ -2735,7 +3373,7 @@
         <w:t xml:space="preserve"> </w:t>
       </w:r>
       <w:r>
-        <w:t xml:space="preserve">Universiteit Gent en ENDURE</w:t>
+        <w:t xml:space="preserve">Historische Meijendel-onderzoekers; later ontsloten via Wageningen University &amp; Research</w:t>
       </w:r>
     </w:p>
     <w:p>
@@ -2753,7 +3391,7 @@
         <w:t xml:space="preserve"> </w:t>
       </w:r>
       <w:r>
-        <w:t xml:space="preserve">15 exacte meetpunten in 2018; 14 complete matrices, 71 positieve en 9.001 negatieve taxonuitkomsten</w:t>
+        <w:t xml:space="preserve">41 vaste vegetatieplots, aangelegd in 1952–1953 en gemiddeld ongeveer iedere vier jaar herhaald</w:t>
       </w:r>
     </w:p>
     <w:p>
@@ -2771,7 +3409,7 @@
         <w:t xml:space="preserve"> </w:t>
       </w:r>
       <w:r>
-        <w:t xml:space="preserve">Gestandaardiseerde momentopname van ongewervelden in witte duinen en een herhaalbare nulmeting</w:t>
+        <w:t xml:space="preserve">Potentieel zeer waardevolle langjarige vegetatiereeks voor successie, begrazing en verandering van grijs duin</w:t>
       </w:r>
     </w:p>
     <w:p>
@@ -2789,722 +3427,22 @@
         <w:t xml:space="preserve"> </w:t>
       </w:r>
       <w:r>
-        <w:t xml:space="preserve">Eén event zonder soortenmatrix apart houden; geen tijdtrend afleiden uit één meetjaar</w:t>
-      </w:r>
-    </w:p>
-    <w:bookmarkEnd w:id="52"/>
-    <w:bookmarkStart w:id="53" w:name="X7d53b3eded5724a4b5578839c37a11a6ebcb3c2"/>
+        <w:t xml:space="preserve">De publicatiekaart toont de 41 punten in Helmduinen, Kijfhoek en Bierlap, maar zonder koppelbare plotcodes. De toegelaten LVD-opnamen leverden geen betrouwbare vertaling op naar deze 41 plots. Oorspronkelijke plotcodes, opnamen en locaties blijven daarom noodzakelijk.</w:t>
+      </w:r>
+    </w:p>
+    <w:bookmarkEnd w:id="60"/>
+    <w:bookmarkStart w:id="62" w:name="neuropteren-van-meijendel"/>
     <w:p>
       <w:pPr>
         <w:pStyle w:val="Heading4"/>
       </w:pPr>
       <w:r>
-        <w:t xml:space="preserve">3.4. Historische en actuele ringgegevens</w:t>
-      </w:r>
-    </w:p>
-    <w:p>
-      <w:pPr>
-        <w:pStyle w:val="FirstParagraph"/>
-      </w:pPr>
-      <w:r>
-        <w:rPr>
-          <w:b/>
-          <w:bCs/>
-        </w:rPr>
-        <w:t xml:space="preserve">Eigenaar of uitgever.</w:t>
-      </w:r>
-      <w:r>
-        <w:t xml:space="preserve"> </w:t>
-      </w:r>
-      <w:r>
-        <w:t xml:space="preserve">Vogeltrekstation/NIOO-KNAW</w:t>
-      </w:r>
-    </w:p>
-    <w:p>
-      <w:pPr>
-        <w:pStyle w:val="BodyText"/>
-      </w:pPr>
-      <w:r>
-        <w:rPr>
-          <w:b/>
-          <w:bCs/>
-        </w:rPr>
-        <w:t xml:space="preserve">Omvang en periode.</w:t>
-      </w:r>
-      <w:r>
-        <w:t xml:space="preserve"> </w:t>
-      </w:r>
-      <w:r>
-        <w:t xml:space="preserve">Biometrie: 100.417 records van 163 soorten, 1963–2023; historische nestjongen: 668 records van 38 soorten, 1928–1957</w:t>
-      </w:r>
-    </w:p>
-    <w:p>
-      <w:pPr>
-        <w:pStyle w:val="BodyText"/>
-      </w:pPr>
-      <w:r>
-        <w:rPr>
-          <w:b/>
-          <w:bCs/>
-        </w:rPr>
-        <w:t xml:space="preserve">Mogelijke meerwaarde.</w:t>
-      </w:r>
-      <w:r>
-        <w:t xml:space="preserve"> </w:t>
-      </w:r>
-      <w:r>
-        <w:t xml:space="preserve">Trektijd, conditie, biometrie en vroeg-historische vogelcontext</w:t>
-      </w:r>
-    </w:p>
-    <w:p>
-      <w:pPr>
-        <w:pStyle w:val="BodyText"/>
-      </w:pPr>
-      <w:r>
-        <w:rPr>
-          <w:b/>
-          <w:bCs/>
-        </w:rPr>
-        <w:t xml:space="preserve">Belangrijkste controle vóór opname.</w:t>
-      </w:r>
-      <w:r>
-        <w:t xml:space="preserve"> </w:t>
-      </w:r>
-      <w:r>
-        <w:t xml:space="preserve">Vangplaatscodes, locatie-onzekerheid, inspanning en overlap met bestaande vogelgegevens controleren</w:t>
-      </w:r>
-    </w:p>
-    <w:bookmarkEnd w:id="53"/>
-    <w:bookmarkStart w:id="54" w:name="X48dbf2dd0074b440b80fd072b91c48b7b659ffb"/>
-    <w:p>
-      <w:pPr>
-        <w:pStyle w:val="Heading4"/>
-      </w:pPr>
-      <w:r>
-        <w:t xml:space="preserve">3.5. Bijenmonitoring in vier beheergebieden</w:t>
-      </w:r>
-    </w:p>
-    <w:p>
-      <w:pPr>
-        <w:pStyle w:val="FirstParagraph"/>
-      </w:pPr>
-      <w:r>
-        <w:rPr>
-          <w:b/>
-          <w:bCs/>
-        </w:rPr>
-        <w:t xml:space="preserve">Eigenaar of uitgever.</w:t>
-      </w:r>
-      <w:r>
-        <w:t xml:space="preserve"> </w:t>
-      </w:r>
-      <w:r>
-        <w:t xml:space="preserve">EIS Kenniscentrum Insecten</w:t>
-      </w:r>
-    </w:p>
-    <w:p>
-      <w:pPr>
-        <w:pStyle w:val="BodyText"/>
-      </w:pPr>
-      <w:r>
-        <w:rPr>
-          <w:b/>
-          <w:bCs/>
-        </w:rPr>
-        <w:t xml:space="preserve">Omvang en periode.</w:t>
-      </w:r>
-      <w:r>
-        <w:t xml:space="preserve"> </w:t>
-      </w:r>
-      <w:r>
-        <w:t xml:space="preserve">18 proefvlakken, drie bezoeken per onderzoeksjaar; 162 bezoeken in 2019, 2021 en 2023</w:t>
-      </w:r>
-    </w:p>
-    <w:p>
-      <w:pPr>
-        <w:pStyle w:val="BodyText"/>
-      </w:pPr>
-      <w:r>
-        <w:rPr>
-          <w:b/>
-          <w:bCs/>
-        </w:rPr>
-        <w:t xml:space="preserve">Mogelijke meerwaarde.</w:t>
-      </w:r>
-      <w:r>
-        <w:t xml:space="preserve"> </w:t>
-      </w:r>
-      <w:r>
-        <w:t xml:space="preserve">Vergelijking van bijengemeenschappen tussen gebieden en jaren</w:t>
-      </w:r>
-    </w:p>
-    <w:p>
-      <w:pPr>
-        <w:pStyle w:val="BodyText"/>
-      </w:pPr>
-      <w:r>
-        <w:rPr>
-          <w:b/>
-          <w:bCs/>
-        </w:rPr>
-        <w:t xml:space="preserve">Belangrijkste controle vóór opname.</w:t>
-      </w:r>
-      <w:r>
-        <w:t xml:space="preserve"> </w:t>
-      </w:r>
-      <w:r>
-        <w:t xml:space="preserve">Tabellen uit rapporten digitaliseren, proefvlakken georefereren en nagaan of 2025 beschikbaar is</w:t>
-      </w:r>
-    </w:p>
-    <w:bookmarkEnd w:id="54"/>
-    <w:bookmarkStart w:id="56" w:name="Xf15126137192a00ade66dd1f48a28b1af85f710"/>
-    <w:p>
-      <w:pPr>
-        <w:pStyle w:val="Heading4"/>
-      </w:pPr>
-      <w:r>
-        <w:t xml:space="preserve">3.6.</w:t>
-      </w:r>
-      <w:r>
-        <w:t xml:space="preserve"> </w:t>
-      </w:r>
-      <w:hyperlink r:id="rId55">
-        <w:r>
-          <w:rPr>
-            <w:rStyle w:val="Hyperlink"/>
-          </w:rPr>
-          <w:t xml:space="preserve">Aquatische macrofauna</w:t>
-        </w:r>
-      </w:hyperlink>
-    </w:p>
-    <w:p>
-      <w:pPr>
-        <w:pStyle w:val="FirstParagraph"/>
-      </w:pPr>
-      <w:r>
-        <w:rPr>
-          <w:b/>
-          <w:bCs/>
-        </w:rPr>
-        <w:t xml:space="preserve">Eigenaar of uitgever.</w:t>
-      </w:r>
-      <w:r>
-        <w:t xml:space="preserve"> </w:t>
-      </w:r>
-      <w:r>
-        <w:t xml:space="preserve">Rijksuniversiteit Leiden; publicaties en collecties via Naturalis</w:t>
-      </w:r>
-    </w:p>
-    <w:p>
-      <w:pPr>
-        <w:pStyle w:val="BodyText"/>
-      </w:pPr>
-      <w:r>
-        <w:rPr>
-          <w:b/>
-          <w:bCs/>
-        </w:rPr>
-        <w:t xml:space="preserve">Omvang en periode.</w:t>
-      </w:r>
-      <w:r>
-        <w:t xml:space="preserve"> </w:t>
-      </w:r>
-      <w:r>
-        <w:t xml:space="preserve">Zeven vaste monsterpunten, vrijwel maandelijks onderzocht van juni 1974 tot juli 1975. Aanvullende publicaties bevatten gedateerde waarnemingen van waterwantsen uit 1920–1930, 1953–1961 en 1970–1977, waterkevers uit 1969–1977 en libellen uit 1849–1976, deels gekoppeld aan benoemde of gecodeerde wateren.</w:t>
-      </w:r>
-    </w:p>
-    <w:p>
-      <w:pPr>
-        <w:pStyle w:val="BodyText"/>
-      </w:pPr>
-      <w:r>
-        <w:rPr>
-          <w:b/>
-          <w:bCs/>
-        </w:rPr>
-        <w:t xml:space="preserve">Mogelijke meerwaarde.</w:t>
-      </w:r>
-      <w:r>
-        <w:t xml:space="preserve"> </w:t>
-      </w:r>
-      <w:r>
-        <w:t xml:space="preserve">Historische reeks van waterorganismen, vegetatie en fysisch-chemische waterkenmerken</w:t>
-      </w:r>
-    </w:p>
-    <w:p>
-      <w:pPr>
-        <w:pStyle w:val="BodyText"/>
-      </w:pPr>
-      <w:r>
-        <w:rPr>
-          <w:b/>
-          <w:bCs/>
-        </w:rPr>
-        <w:t xml:space="preserve">Belangrijkste controle vóór opname.</w:t>
-      </w:r>
-      <w:r>
-        <w:t xml:space="preserve"> </w:t>
-      </w:r>
-      <w:r>
-        <w:t xml:space="preserve">Eerst de tabellen, watercodes en collectieregistraties samenbrengen. Daarna per monster vaststellen welke locatie, datum, methode en volledige soortenlijst beschikbaar zijn en overlap met NDFF verwijderen.</w:t>
-      </w:r>
-    </w:p>
-    <w:bookmarkEnd w:id="56"/>
-    <w:bookmarkStart w:id="57" w:name="X48f08ffda2c86cd2cfd6f1beea828114ef6323a"/>
-    <w:p>
-      <w:pPr>
-        <w:pStyle w:val="Heading4"/>
-      </w:pPr>
-      <w:r>
-        <w:t xml:space="preserve">3.7. Erosiepinnen in een stuifkuilcomplex</w:t>
-      </w:r>
-    </w:p>
-    <w:p>
-      <w:pPr>
-        <w:pStyle w:val="FirstParagraph"/>
-      </w:pPr>
-      <w:r>
-        <w:rPr>
-          <w:b/>
-          <w:bCs/>
-        </w:rPr>
-        <w:t xml:space="preserve">Eigenaar of uitgever.</w:t>
-      </w:r>
-      <w:r>
-        <w:t xml:space="preserve"> </w:t>
-      </w:r>
-      <w:r>
-        <w:t xml:space="preserve">Jungerius en Van der Meulen</w:t>
-      </w:r>
-    </w:p>
-    <w:p>
-      <w:pPr>
-        <w:pStyle w:val="BodyText"/>
-      </w:pPr>
-      <w:r>
-        <w:rPr>
-          <w:b/>
-          <w:bCs/>
-        </w:rPr>
-        <w:t xml:space="preserve">Omvang en periode.</w:t>
-      </w:r>
-      <w:r>
-        <w:t xml:space="preserve"> </w:t>
-      </w:r>
-      <w:r>
-        <w:t xml:space="preserve">48 erosiepinnen in 12 eenheden, vrijwel wekelijks gemeten gedurende één jaar</w:t>
-      </w:r>
-    </w:p>
-    <w:p>
-      <w:pPr>
-        <w:pStyle w:val="BodyText"/>
-      </w:pPr>
-      <w:r>
-        <w:rPr>
-          <w:b/>
-          <w:bCs/>
-        </w:rPr>
-        <w:t xml:space="preserve">Mogelijke meerwaarde.</w:t>
-      </w:r>
-      <w:r>
-        <w:t xml:space="preserve"> </w:t>
-      </w:r>
-      <w:r>
-        <w:t xml:space="preserve">Gedetailleerde processtudie van erosie, sedimentatie en vegetatie, maar geen langjarige trend</w:t>
-      </w:r>
-    </w:p>
-    <w:p>
-      <w:pPr>
-        <w:pStyle w:val="BodyText"/>
-      </w:pPr>
-      <w:r>
-        <w:rPr>
-          <w:b/>
-          <w:bCs/>
-        </w:rPr>
-        <w:t xml:space="preserve">Belangrijkste controle vóór opname.</w:t>
-      </w:r>
-      <w:r>
-        <w:t xml:space="preserve"> </w:t>
-      </w:r>
-      <w:r>
-        <w:t xml:space="preserve">Oorspronkelijke metingen en pinlocaties vinden en op waarnemingsniveau aan Meijendel koppelen</w:t>
-      </w:r>
-    </w:p>
-    <w:bookmarkEnd w:id="57"/>
-    <w:bookmarkStart w:id="58" w:name="X7abf3eef10daf4b57cea8790ce8b866dfd91a08"/>
-    <w:p>
-      <w:pPr>
-        <w:pStyle w:val="Heading4"/>
-      </w:pPr>
-      <w:r>
-        <w:t xml:space="preserve">3.8. Langjarige droge-duinvegetatieplots</w:t>
-      </w:r>
-    </w:p>
-    <w:p>
-      <w:pPr>
-        <w:pStyle w:val="FirstParagraph"/>
-      </w:pPr>
-      <w:r>
-        <w:rPr>
-          <w:b/>
-          <w:bCs/>
-        </w:rPr>
-        <w:t xml:space="preserve">Eigenaar of uitgever.</w:t>
-      </w:r>
-      <w:r>
-        <w:t xml:space="preserve"> </w:t>
-      </w:r>
-      <w:r>
-        <w:t xml:space="preserve">Historische Meijendel-onderzoekers; later ontsloten via Wageningen University &amp; Research</w:t>
-      </w:r>
-    </w:p>
-    <w:p>
-      <w:pPr>
-        <w:pStyle w:val="BodyText"/>
-      </w:pPr>
-      <w:r>
-        <w:rPr>
-          <w:b/>
-          <w:bCs/>
-        </w:rPr>
-        <w:t xml:space="preserve">Omvang en periode.</w:t>
-      </w:r>
-      <w:r>
-        <w:t xml:space="preserve"> </w:t>
-      </w:r>
-      <w:r>
-        <w:t xml:space="preserve">41 vaste vegetatieplots, aangelegd in 1952–1953 en gemiddeld ongeveer iedere vier jaar herhaald</w:t>
-      </w:r>
-    </w:p>
-    <w:p>
-      <w:pPr>
-        <w:pStyle w:val="BodyText"/>
-      </w:pPr>
-      <w:r>
-        <w:rPr>
-          <w:b/>
-          <w:bCs/>
-        </w:rPr>
-        <w:t xml:space="preserve">Mogelijke meerwaarde.</w:t>
-      </w:r>
-      <w:r>
-        <w:t xml:space="preserve"> </w:t>
-      </w:r>
-      <w:r>
-        <w:t xml:space="preserve">Potentieel zeer waardevolle langjarige vegetatiereeks voor successie, begrazing en verandering van grijs duin</w:t>
-      </w:r>
-    </w:p>
-    <w:p>
-      <w:pPr>
-        <w:pStyle w:val="BodyText"/>
-      </w:pPr>
-      <w:r>
-        <w:rPr>
-          <w:b/>
-          <w:bCs/>
-        </w:rPr>
-        <w:t xml:space="preserve">Belangrijkste controle vóór opname.</w:t>
-      </w:r>
-      <w:r>
-        <w:t xml:space="preserve"> </w:t>
-      </w:r>
-      <w:r>
-        <w:t xml:space="preserve">Oorspronkelijke plotcodes, opnamen en locaties vinden; overlap met provinciale PQ, NDFF en de Landelijke Vegetatie Databank vaststellen</w:t>
-      </w:r>
-    </w:p>
-    <w:bookmarkEnd w:id="58"/>
-    <w:bookmarkStart w:id="60" w:name="Xa9ba6a4a1e26c163033a3bc8e62b0c168cc4ed5"/>
-    <w:p>
-      <w:pPr>
-        <w:pStyle w:val="Heading4"/>
-      </w:pPr>
-      <w:r>
-        <w:t xml:space="preserve">3.9.</w:t>
-      </w:r>
-      <w:r>
-        <w:t xml:space="preserve"> </w:t>
-      </w:r>
-      <w:hyperlink r:id="rId59">
-        <w:r>
-          <w:rPr>
-            <w:rStyle w:val="Hyperlink"/>
-          </w:rPr>
-          <w:t xml:space="preserve">Historische vlinder- en motwaarnemingen</w:t>
-        </w:r>
-      </w:hyperlink>
-    </w:p>
-    <w:p>
-      <w:pPr>
-        <w:pStyle w:val="FirstParagraph"/>
-      </w:pPr>
-      <w:r>
-        <w:rPr>
-          <w:b/>
-          <w:bCs/>
-        </w:rPr>
-        <w:t xml:space="preserve">Eigenaar of uitgever.</w:t>
-      </w:r>
-      <w:r>
-        <w:t xml:space="preserve"> </w:t>
-      </w:r>
-      <w:r>
-        <w:t xml:space="preserve">Natuurhistorisch Museum Rotterdam</w:t>
-      </w:r>
-    </w:p>
-    <w:p>
-      <w:pPr>
-        <w:pStyle w:val="BodyText"/>
-      </w:pPr>
-      <w:r>
-        <w:rPr>
-          <w:b/>
-          <w:bCs/>
-        </w:rPr>
-        <w:t xml:space="preserve">Omvang en periode.</w:t>
-      </w:r>
-      <w:r>
-        <w:t xml:space="preserve"> </w:t>
-      </w:r>
-      <w:r>
-        <w:t xml:space="preserve">5.219 GBIF-records binnen de projectgrens; 1955–2019. Ten minste 4.744 records betreffen de intensieve vangsten van J.A.W. Lucas uit 1955–1956 bij de Bierlap.</w:t>
-      </w:r>
-    </w:p>
-    <w:p>
-      <w:pPr>
-        <w:pStyle w:val="BodyText"/>
-      </w:pPr>
-      <w:r>
-        <w:rPr>
-          <w:b/>
-          <w:bCs/>
-        </w:rPr>
-        <w:t xml:space="preserve">Mogelijke meerwaarde.</w:t>
-      </w:r>
-      <w:r>
-        <w:t xml:space="preserve"> </w:t>
-      </w:r>
-      <w:r>
-        <w:t xml:space="preserve">Een vrijwel onbenutte historische referentie voor vlinders en nachtvlinders, ruim vóór de huidige meetnetten</w:t>
-      </w:r>
-    </w:p>
-    <w:p>
-      <w:pPr>
-        <w:pStyle w:val="BodyText"/>
-      </w:pPr>
-      <w:r>
-        <w:rPr>
-          <w:b/>
-          <w:bCs/>
-        </w:rPr>
-        <w:t xml:space="preserve">Belangrijkste controle vóór opname.</w:t>
-      </w:r>
-      <w:r>
-        <w:t xml:space="preserve"> </w:t>
-      </w:r>
-      <w:r>
-        <w:t xml:space="preserve">Vangnachten en vangmethode reconstrueren, locaties en onzekerheid toetsen en ontdubbelen tegen NDFF en museumobjecten. Zonder inspanningsgegevens zijn dit aanwezigheidsgegevens, geen populatietrend.</w:t>
-      </w:r>
-    </w:p>
-    <w:bookmarkEnd w:id="60"/>
-    <w:bookmarkStart w:id="62" w:name="Xf94d6d521e270fa1f852a0efddbd6b704718020"/>
-    <w:p>
-      <w:pPr>
-        <w:pStyle w:val="Heading4"/>
-      </w:pPr>
-      <w:r>
-        <w:t xml:space="preserve">3.10.</w:t>
+        <w:t xml:space="preserve">3.4.</w:t>
       </w:r>
       <w:r>
         <w:t xml:space="preserve"> </w:t>
       </w:r>
       <w:hyperlink r:id="rId61">
-        <w:r>
-          <w:rPr>
-            <w:rStyle w:val="Hyperlink"/>
-          </w:rPr>
-          <w:t xml:space="preserve">Naturalis Botany</w:t>
-        </w:r>
-      </w:hyperlink>
-    </w:p>
-    <w:p>
-      <w:pPr>
-        <w:pStyle w:val="FirstParagraph"/>
-      </w:pPr>
-      <w:r>
-        <w:rPr>
-          <w:b/>
-          <w:bCs/>
-        </w:rPr>
-        <w:t xml:space="preserve">Eigenaar of uitgever.</w:t>
-      </w:r>
-      <w:r>
-        <w:t xml:space="preserve"> </w:t>
-      </w:r>
-      <w:r>
-        <w:t xml:space="preserve">Naturalis Biodiversity Center</w:t>
-      </w:r>
-    </w:p>
-    <w:p>
-      <w:pPr>
-        <w:pStyle w:val="BodyText"/>
-      </w:pPr>
-      <w:r>
-        <w:rPr>
-          <w:b/>
-          <w:bCs/>
-        </w:rPr>
-        <w:t xml:space="preserve">Omvang en periode.</w:t>
-      </w:r>
-      <w:r>
-        <w:t xml:space="preserve"> </w:t>
-      </w:r>
-      <w:r>
-        <w:t xml:space="preserve">6.227 ruimtelijke GBIF-treffers binnen de projectgrens. De expliciet als Meijendel beschreven deelverzameling bevat 138 herbariumspecimens uit 1919–1998.</w:t>
-      </w:r>
-    </w:p>
-    <w:p>
-      <w:pPr>
-        <w:pStyle w:val="BodyText"/>
-      </w:pPr>
-      <w:r>
-        <w:rPr>
-          <w:b/>
-          <w:bCs/>
-        </w:rPr>
-        <w:t xml:space="preserve">Mogelijke meerwaarde.</w:t>
-      </w:r>
-      <w:r>
-        <w:t xml:space="preserve"> </w:t>
-      </w:r>
-      <w:r>
-        <w:t xml:space="preserve">Gedateerde historische plantenvondsten en controleerbaar collectiemateriaal</w:t>
-      </w:r>
-    </w:p>
-    <w:p>
-      <w:pPr>
-        <w:pStyle w:val="BodyText"/>
-      </w:pPr>
-      <w:r>
-        <w:rPr>
-          <w:b/>
-          <w:bCs/>
-        </w:rPr>
-        <w:t xml:space="preserve">Belangrijkste controle vóór opname.</w:t>
-      </w:r>
-      <w:r>
-        <w:t xml:space="preserve"> </w:t>
-      </w:r>
-      <w:r>
-        <w:t xml:space="preserve">Etiketplaats, oorspronkelijke datum en coördinaatonzekerheid per specimen controleren. Veel punten kunnen een later toegekende gebiedscoördinaat zijn; overlap met LVD, NDFF en provinciale PQ verwijderen.</w:t>
-      </w:r>
-    </w:p>
-    <w:bookmarkEnd w:id="62"/>
-    <w:bookmarkStart w:id="64" w:name="Xd32afbd9ed57f2b56feacf1f15ad0c08262245a"/>
-    <w:p>
-      <w:pPr>
-        <w:pStyle w:val="Heading4"/>
-      </w:pPr>
-      <w:r>
-        <w:t xml:space="preserve">3.11.</w:t>
-      </w:r>
-      <w:r>
-        <w:t xml:space="preserve"> </w:t>
-      </w:r>
-      <w:hyperlink r:id="rId63">
-        <w:r>
-          <w:rPr>
-            <w:rStyle w:val="Hyperlink"/>
-          </w:rPr>
-          <w:t xml:space="preserve">Naturalis Coleoptera</w:t>
-        </w:r>
-      </w:hyperlink>
-    </w:p>
-    <w:p>
-      <w:pPr>
-        <w:pStyle w:val="FirstParagraph"/>
-      </w:pPr>
-      <w:r>
-        <w:rPr>
-          <w:b/>
-          <w:bCs/>
-        </w:rPr>
-        <w:t xml:space="preserve">Eigenaar of uitgever.</w:t>
-      </w:r>
-      <w:r>
-        <w:t xml:space="preserve"> </w:t>
-      </w:r>
-      <w:r>
-        <w:t xml:space="preserve">Naturalis Biodiversity Center</w:t>
-      </w:r>
-    </w:p>
-    <w:p>
-      <w:pPr>
-        <w:pStyle w:val="BodyText"/>
-      </w:pPr>
-      <w:r>
-        <w:rPr>
-          <w:b/>
-          <w:bCs/>
-        </w:rPr>
-        <w:t xml:space="preserve">Omvang en periode.</w:t>
-      </w:r>
-      <w:r>
-        <w:t xml:space="preserve"> </w:t>
-      </w:r>
-      <w:r>
-        <w:t xml:space="preserve">1.905 ruimtelijke GBIF-treffers binnen de projectgrens. Daarvan zijn 995 exemplaren uit 1859–1983 expliciet als Meijendel beschreven.</w:t>
-      </w:r>
-    </w:p>
-    <w:p>
-      <w:pPr>
-        <w:pStyle w:val="BodyText"/>
-      </w:pPr>
-      <w:r>
-        <w:rPr>
-          <w:b/>
-          <w:bCs/>
-        </w:rPr>
-        <w:t xml:space="preserve">Mogelijke meerwaarde.</w:t>
-      </w:r>
-      <w:r>
-        <w:t xml:space="preserve"> </w:t>
-      </w:r>
-      <w:r>
-        <w:t xml:space="preserve">Lange historische context voor kevers, met bewaard bewijsmateriaal</w:t>
-      </w:r>
-    </w:p>
-    <w:p>
-      <w:pPr>
-        <w:pStyle w:val="BodyText"/>
-      </w:pPr>
-      <w:r>
-        <w:rPr>
-          <w:b/>
-          <w:bCs/>
-        </w:rPr>
-        <w:t xml:space="preserve">Belangrijkste controle vóór opname.</w:t>
-      </w:r>
-      <w:r>
-        <w:t xml:space="preserve"> </w:t>
-      </w:r>
-      <w:r>
-        <w:t xml:space="preserve">De collectie waarschuwt zelf voor nog niet volledig opgeschoonde datums en locaties. Daarom de oorspronkelijke etiketvelden gebruiken, onzekerheid toetsen en dubbelen met NDFF en andere collecties verwijderen.</w:t>
-      </w:r>
-    </w:p>
-    <w:bookmarkEnd w:id="64"/>
-    <w:bookmarkStart w:id="66" w:name="Xb74a3e06662fef53df189d5a126a20489a19f2f"/>
-    <w:p>
-      <w:pPr>
-        <w:pStyle w:val="Heading4"/>
-      </w:pPr>
-      <w:r>
-        <w:t xml:space="preserve">3.12.</w:t>
-      </w:r>
-      <w:r>
-        <w:t xml:space="preserve"> </w:t>
-      </w:r>
-      <w:hyperlink r:id="rId65">
         <w:r>
           <w:rPr>
             <w:rStyle w:val="Hyperlink"/>
@@ -3585,19 +3523,19 @@
         <w:t xml:space="preserve">De specimen- en soortenlijsten uit de publicatie digitaliseren, datum en plaats per record vaststellen en vergelijken met Naturalis-collecties en NDFF.</w:t>
       </w:r>
     </w:p>
-    <w:bookmarkEnd w:id="66"/>
-    <w:bookmarkStart w:id="68" w:name="X2725af81d9b6426d3bf6fa7c8d8711a6b25cfcf"/>
+    <w:bookmarkEnd w:id="62"/>
+    <w:bookmarkStart w:id="64" w:name="zweefvliegen-van-meijendel"/>
     <w:p>
       <w:pPr>
         <w:pStyle w:val="Heading4"/>
       </w:pPr>
       <w:r>
-        <w:t xml:space="preserve">3.13.</w:t>
-      </w:r>
-      <w:r>
-        <w:t xml:space="preserve"> </w:t>
-      </w:r>
-      <w:hyperlink r:id="rId67">
+        <w:t xml:space="preserve">3.5.</w:t>
+      </w:r>
+      <w:r>
+        <w:t xml:space="preserve"> </w:t>
+      </w:r>
+      <w:hyperlink r:id="rId63">
         <w:r>
           <w:rPr>
             <w:rStyle w:val="Hyperlink"/>
@@ -3678,14 +3616,14 @@
         <w:t xml:space="preserve">De volledige specimenlijst digitaliseren en per exemplaar datum en locatie vastleggen; daarna ontdubbelen tegen museumcollecties en NDFF.</w:t>
       </w:r>
     </w:p>
-    <w:bookmarkEnd w:id="68"/>
-    <w:bookmarkStart w:id="70" w:name="Xc8d2783cfdc243283b2869847e30f1176de7122"/>
+    <w:bookmarkEnd w:id="64"/>
+    <w:bookmarkStart w:id="66" w:name="terra-dunes-plant--en-bodemmicrobiomen"/>
     <w:p>
       <w:pPr>
         <w:pStyle w:val="Heading4"/>
       </w:pPr>
       <w:r>
-        <w:t xml:space="preserve">3.14. TERRA-Dunes plant- en bodemmicrobiomen</w:t>
+        <w:t xml:space="preserve">3.6. TERRA-Dunes plant- en bodemmicrobiomen</w:t>
       </w:r>
     </w:p>
     <w:p>
@@ -3708,7 +3646,7 @@
       <w:r>
         <w:t xml:space="preserve"> </w:t>
       </w:r>
-      <w:hyperlink r:id="rId69">
+      <w:hyperlink r:id="rId65">
         <w:r>
           <w:rPr>
             <w:rStyle w:val="Hyperlink"/>
@@ -3753,14 +3691,14 @@
         <w:t xml:space="preserve">Geschikt voor samenhang tussen vegetatie en microbiomen. Niet toelaten voordat de proefvlakken geografisch zijn gereconstrueerd.</w:t>
       </w:r>
     </w:p>
-    <w:bookmarkEnd w:id="70"/>
-    <w:bookmarkStart w:id="72" w:name="X28b656518582d2b5e139a409a36fb11a907df64"/>
+    <w:bookmarkEnd w:id="66"/>
+    <w:bookmarkStart w:id="68" w:name="rups--en-bodemmicrobiomen"/>
     <w:p>
       <w:pPr>
         <w:pStyle w:val="Heading4"/>
       </w:pPr>
       <w:r>
-        <w:t xml:space="preserve">3.15. Rups- en bodemmicrobiomen</w:t>
+        <w:t xml:space="preserve">3.7. Rups- en bodemmicrobiomen</w:t>
       </w:r>
     </w:p>
     <w:p>
@@ -3783,7 +3721,7 @@
       <w:r>
         <w:t xml:space="preserve"> </w:t>
       </w:r>
-      <w:hyperlink r:id="rId71">
+      <w:hyperlink r:id="rId67">
         <w:r>
           <w:rPr>
             <w:rStyle w:val="Hyperlink"/>
@@ -3828,14 +3766,14 @@
         <w:t xml:space="preserve">Eenmalige genetische en microbiële momentopname. Geen populatietrend, wel lokale ecologische vergelijking na controle van alle monsterlocaties.</w:t>
       </w:r>
     </w:p>
-    <w:bookmarkEnd w:id="72"/>
-    <w:bookmarkStart w:id="74" w:name="Xd63842fb977a70ea4bf3a93ad01da7c87664ba5"/>
+    <w:bookmarkEnd w:id="68"/>
+    <w:bookmarkStart w:id="70" w:name="schimmels-bij-kruipwilg"/>
     <w:p>
       <w:pPr>
         <w:pStyle w:val="Heading4"/>
       </w:pPr>
       <w:r>
-        <w:t xml:space="preserve">3.16. Schimmels bij kruipwilg</w:t>
+        <w:t xml:space="preserve">3.8. Schimmels bij kruipwilg</w:t>
       </w:r>
     </w:p>
     <w:p>
@@ -3858,7 +3796,7 @@
       <w:r>
         <w:t xml:space="preserve"> </w:t>
       </w:r>
-      <w:hyperlink r:id="rId73">
+      <w:hyperlink r:id="rId69">
         <w:r>
           <w:rPr>
             <w:rStyle w:val="Hyperlink"/>
@@ -3903,14 +3841,14 @@
         <w:t xml:space="preserve">Bruikbaar als lokale microbiële referentie, niet als tijdreeks of gebiedsdekkende inventarisatie.</w:t>
       </w:r>
     </w:p>
-    <w:bookmarkEnd w:id="74"/>
-    <w:bookmarkStart w:id="76" w:name="Xe12de20264f7defbbb427fadf305f9349955815"/>
+    <w:bookmarkEnd w:id="70"/>
+    <w:bookmarkStart w:id="72" w:name="plantengroei-bodemvocht-en-weer"/>
     <w:p>
       <w:pPr>
         <w:pStyle w:val="Heading4"/>
       </w:pPr>
       <w:r>
-        <w:t xml:space="preserve">3.17. Plantengroei, bodemvocht en weer</w:t>
+        <w:t xml:space="preserve">3.9. Plantengroei, bodemvocht en weer</w:t>
       </w:r>
     </w:p>
     <w:p>
@@ -3933,7 +3871,7 @@
       <w:r>
         <w:t xml:space="preserve"> </w:t>
       </w:r>
-      <w:hyperlink r:id="rId75">
+      <w:hyperlink r:id="rId71">
         <w:r>
           <w:rPr>
             <w:rStyle w:val="Hyperlink"/>
@@ -3978,14 +3916,14 @@
         <w:t xml:space="preserve">Gedetailleerde processtudie van de reactie van duingrassen op neerslag en droogte. Eerst locaties en meetkwaliteit controleren; één halfjaar geeft geen langjarige ontwikkeling.</w:t>
       </w:r>
     </w:p>
-    <w:bookmarkEnd w:id="76"/>
-    <w:bookmarkStart w:id="77" w:name="Xd79b552d677e790dd12d2af988feb0d0fcca4d2"/>
+    <w:bookmarkEnd w:id="72"/>
+    <w:bookmarkStart w:id="73" w:name="genetische-datasets-amfibieën"/>
     <w:p>
       <w:pPr>
         <w:pStyle w:val="Heading4"/>
       </w:pPr>
       <w:r>
-        <w:t xml:space="preserve">3.18. Genetische datasets amfibieën</w:t>
+        <w:t xml:space="preserve">3.10. Genetische datasets amfibieën</w:t>
       </w:r>
     </w:p>
     <w:p>
@@ -4042,15 +3980,15 @@
         <w:t xml:space="preserve">Bruikbaar voor populatiegenetische context. Jaar, locatie en relatie met bestaande RAVON-waarnemingen moeten eerst worden vastgesteld.</w:t>
       </w:r>
     </w:p>
-    <w:bookmarkEnd w:id="77"/>
-    <w:bookmarkEnd w:id="78"/>
-    <w:bookmarkStart w:id="80" w:name="X17f303122dee93209cb05941d224f63cc3730e7"/>
+    <w:bookmarkEnd w:id="73"/>
+    <w:bookmarkEnd w:id="74"/>
+    <w:bookmarkStart w:id="76" w:name="X8c2748f02893018608c8a38a1054acf3030739d"/>
     <w:p>
       <w:pPr>
         <w:pStyle w:val="Heading3"/>
       </w:pPr>
       <w:r>
-        <w:t xml:space="preserve">3.19. Alleen context of nog een onderzoeksaanwijzing</w:t>
+        <w:t xml:space="preserve">3.11. Alleen context of nog een onderzoeksaanwijzing</w:t>
       </w:r>
     </w:p>
     <w:p>
@@ -4197,7 +4135,7 @@
       <w:pPr>
         <w:pStyle w:val="BodyText"/>
       </w:pPr>
-      <w:hyperlink r:id="rId79">
+      <w:hyperlink r:id="rId75">
         <w:r>
           <w:rPr>
             <w:rStyle w:val="Hyperlink"/>
@@ -4257,538 +4195,586 @@
         <w:t xml:space="preserve">publicaties noemen 32–35 stuifkuilen die vanaf 1983 tweemaal per jaar zijn gemeten, 19 permanente vegetatieplots en vergelijkingen van luchtfoto’s en orthofoto’s. De oorspronkelijke tabellen, plot-ID’s en digitale kaartlagen zijn nog niet voldoende geïdentificeerd om deze als afzonderlijke gegevensbron toe te laten.</w:t>
       </w:r>
     </w:p>
+    <w:bookmarkEnd w:id="76"/>
+    <w:bookmarkEnd w:id="77"/>
+    <w:bookmarkStart w:id="78" w:name="verwachte-aanvullingen"/>
+    <w:p>
+      <w:pPr>
+        <w:pStyle w:val="Heading2"/>
+      </w:pPr>
+      <w:r>
+        <w:t xml:space="preserve">4. Verwachte aanvullingen</w:t>
+      </w:r>
+    </w:p>
+    <w:p>
+      <w:pPr>
+        <w:pStyle w:val="FirstParagraph"/>
+      </w:pPr>
+      <w:r>
+        <w:rPr>
+          <w:b/>
+          <w:bCs/>
+        </w:rPr>
+        <w:t xml:space="preserve">Vlindergegevens:</w:t>
+      </w:r>
+      <w:r>
+        <w:t xml:space="preserve"> </w:t>
+      </w:r>
+      <w:r>
+        <w:t xml:space="preserve">De Vlinderstichting verwacht in de week van 28 september 2026 aanvullende meetstructuur te kunnen leveren. Die levering wordt eerst vergeleken met de 82.217 NDFF-dagvlinderrecords en de bestaande routeconstructie.</w:t>
+      </w:r>
+    </w:p>
+    <w:p>
+      <w:pPr>
+        <w:pStyle w:val="BodyText"/>
+      </w:pPr>
+      <w:r>
+        <w:rPr>
+          <w:b/>
+          <w:bCs/>
+        </w:rPr>
+        <w:t xml:space="preserve">Overige meetnetten:</w:t>
+      </w:r>
+      <w:r>
+        <w:t xml:space="preserve"> </w:t>
+      </w:r>
+      <w:r>
+        <w:t xml:space="preserve">de overige aangeschreven bronorganisaties hebben op 25 september 2026 nog niet inhoudelijk gereageerd. Nieuwe leveringen worden niet automatisch geïmporteerd, maar eerst gecontroleerd op dekking, sleutels, nullen, inspanning en overlap.</w:t>
+      </w:r>
+    </w:p>
+    <w:p>
+      <w:pPr>
+        <w:pStyle w:val="BodyText"/>
+      </w:pPr>
+      <w:r>
+        <w:rPr>
+          <w:b/>
+          <w:bCs/>
+        </w:rPr>
+        <w:t xml:space="preserve">Habitatkaart T1:</w:t>
+      </w:r>
+      <w:r>
+        <w:t xml:space="preserve"> </w:t>
+      </w:r>
+      <w:r>
+        <w:t xml:space="preserve">Provincie Zuid-Holland heeft toegezegd de kaart te delen zodra zij later in 2026 beschikbaar komt. De kaart kan veranderingen in habitat helpen verklaren, maar is zelf geen soortenwaarneming.</w:t>
+      </w:r>
+    </w:p>
+    <w:bookmarkEnd w:id="78"/>
+    <w:bookmarkStart w:id="79" w:name="Xbd1d36805349ef5ec39b6efd044fd20b47e23f4"/>
+    <w:p>
+      <w:pPr>
+        <w:pStyle w:val="Heading2"/>
+      </w:pPr>
+      <w:r>
+        <w:t xml:space="preserve">5. Bronnen die niet verder worden uitgewerkt</w:t>
+      </w:r>
+    </w:p>
+    <w:p>
+      <w:pPr>
+        <w:pStyle w:val="FirstParagraph"/>
+      </w:pPr>
+      <w:r>
+        <w:t xml:space="preserve">Drie eerder gevonden publicaties bleken bij controle geen Meijendelgegevens te bevatten: een macrofaunastudie uit de Drentsche Aa, een voedselwebstudie aan Amerikaanse vogelkers in Zuid-Kennemerland en een studie naar vliegtuiggeluid bij Tjiftjaf. De voedselwebstudie noemt toestemming voor veldwerk in Meijendel, maar de gepubliceerde waarnemingstabel betreft uitsluitend Nationaal Park Zuid-Kennemerland. Zij worden daarom niet als kandidaatbron beschouwd.</w:t>
+      </w:r>
+    </w:p>
+    <w:p>
+      <w:pPr>
+        <w:pStyle w:val="BodyText"/>
+      </w:pPr>
+      <w:r>
+        <w:t xml:space="preserve">Een openbare GBIF-dataset met mondiale bodemorganismen gaf 1.995 ruimtelijke treffers binnen de projectgrens. De oorspronkelijke plaatsaanduiding van al deze monsters is echter Terschelling. Dit is een georeferentiefout en geen Meijendelbron.</w:t>
+      </w:r>
+    </w:p>
+    <w:p>
+      <w:pPr>
+        <w:pStyle w:val="BodyText"/>
+      </w:pPr>
+      <w:r>
+        <w:t xml:space="preserve">Algemene verzamelbronnen zoals Observation.org, iNaturalist en eBird worden ook niet opnieuw als zelfstandige Meijendelbron ingevoerd zolang niet is aangetoond dat zij waarnemingen bevatten die ontbreken in NDFF of in de primaire VWG/SOVON-reeksen. Anders zou dezelfde waarneming vooral nogmaals worden opgeslagen.</w:t>
+      </w:r>
+    </w:p>
+    <w:bookmarkEnd w:id="79"/>
+    <w:bookmarkStart w:id="80" w:name="gebruik-van-dit-register"/>
+    <w:p>
+      <w:pPr>
+        <w:pStyle w:val="Heading2"/>
+      </w:pPr>
+      <w:r>
+        <w:t xml:space="preserve">6. Gebruik van dit register</w:t>
+      </w:r>
+    </w:p>
+    <w:p>
+      <w:pPr>
+        <w:pStyle w:val="FirstParagraph"/>
+      </w:pPr>
+      <w:r>
+        <w:t xml:space="preserve">Dit document is het beslisoverzicht. Een bron gaat pas naar</w:t>
+      </w:r>
+      <w:r>
+        <w:t xml:space="preserve"> </w:t>
+      </w:r>
+      <w:r>
+        <w:rPr>
+          <w:rStyle w:val="VerbatimChar"/>
+        </w:rPr>
+        <w:t xml:space="preserve">Meijendel</w:t>
+      </w:r>
+      <w:r>
+        <w:t xml:space="preserve"> </w:t>
+      </w:r>
+      <w:r>
+        <w:t xml:space="preserve">wanneer per waarneming vaststaat dat zij in Meijendel is gedaan en de locatie bekend of betrouwbaar herleidbaar is. Is dat niet zo, dan blijft zij kandidaat of context in Meijendel_bronnen.</w:t>
+      </w:r>
+    </w:p>
+    <w:p>
+      <w:pPr>
+        <w:pStyle w:val="BodyText"/>
+      </w:pPr>
+      <w:r>
+        <w:t xml:space="preserve">Bij iedere nieuwe levering worden achtereenvolgens gecontroleerd:</w:t>
+      </w:r>
+    </w:p>
+    <w:p>
+      <w:pPr>
+        <w:pStyle w:val="BodyText"/>
+      </w:pPr>
+      <w:r>
+        <w:t xml:space="preserve">welke waarnemingen en perioden werkelijk nieuw zijn;</w:t>
+      </w:r>
+    </w:p>
+    <w:p>
+      <w:pPr>
+        <w:pStyle w:val="BodyText"/>
+      </w:pPr>
+      <w:r>
+        <w:t xml:space="preserve">of locaties en oorspronkelijke sleutels bruikbaar zijn;</w:t>
+      </w:r>
+    </w:p>
+    <w:p>
+      <w:pPr>
+        <w:pStyle w:val="BodyText"/>
+      </w:pPr>
+      <w:r>
+        <w:t xml:space="preserve">of bezoeken, soortenlijsten en echte nullen aanwezig zijn;</w:t>
+      </w:r>
+    </w:p>
+    <w:p>
+      <w:pPr>
+        <w:pStyle w:val="BodyText"/>
+      </w:pPr>
+      <w:r>
+        <w:t xml:space="preserve">of de bron een bestaande primaire reeks overlapt;</w:t>
+      </w:r>
+    </w:p>
+    <w:p>
+      <w:pPr>
+        <w:pStyle w:val="BodyText"/>
+      </w:pPr>
+      <w:r>
+        <w:t xml:space="preserve">welke analyses daardoor verantwoord mogelijk worden.</w:t>
+      </w:r>
+    </w:p>
+    <w:p>
+      <w:pPr>
+        <w:pStyle w:val="BodyText"/>
+      </w:pPr>
+      <w:r>
+        <w:t xml:space="preserve">Pas daarna volgt een afzonderlijk importbesluit.</w:t>
+      </w:r>
+    </w:p>
     <w:bookmarkEnd w:id="80"/>
+    <w:bookmarkStart w:id="86" w:name="actieplan"/>
+    <w:p>
+      <w:pPr>
+        <w:pStyle w:val="Heading2"/>
+      </w:pPr>
+      <w:r>
+        <w:t xml:space="preserve">7. Actieplan</w:t>
+      </w:r>
+    </w:p>
+    <w:p>
+      <w:pPr>
+        <w:pStyle w:val="FirstParagraph"/>
+      </w:pPr>
+      <w:r>
+        <w:t xml:space="preserve">Het doel is niet zoveel mogelijk regels importeren, maar per bron de kortste route naar betrouwbare, niet-dubbele en geografisch toegelaten gegevens te volgen. De ruwe bestanden blijven onveranderd bewaard;</w:t>
+      </w:r>
+      <w:r>
+        <w:t xml:space="preserve"> </w:t>
+      </w:r>
+      <w:r>
+        <w:rPr>
+          <w:rStyle w:val="VerbatimChar"/>
+        </w:rPr>
+        <w:t xml:space="preserve">Meijendel</w:t>
+      </w:r>
+      <w:r>
+        <w:t xml:space="preserve"> </w:t>
+      </w:r>
+      <w:r>
+        <w:t xml:space="preserve">bevat alleen waarnemingen die aan de ruimtelijke toelatingsregel voldoen.</w:t>
+      </w:r>
+    </w:p>
+    <w:bookmarkStart w:id="81" w:name="fase-1-openbare-direct-toetsbare-bronnen"/>
+    <w:p>
+      <w:pPr>
+        <w:pStyle w:val="Heading3"/>
+      </w:pPr>
+      <w:r>
+        <w:t xml:space="preserve">Fase 1 — openbare, direct toetsbare bronnen</w:t>
+      </w:r>
+    </w:p>
+    <w:p>
+      <w:pPr>
+        <w:pStyle w:val="FirstParagraph"/>
+      </w:pPr>
+      <w:r>
+        <w:rPr>
+          <w:b/>
+          <w:bCs/>
+        </w:rPr>
+        <w:t xml:space="preserve">Status: uitgevoerd op 26 september 2026.</w:t>
+      </w:r>
+      <w:r>
+        <w:t xml:space="preserve"> </w:t>
+      </w:r>
+      <w:r>
+        <w:t xml:space="preserve">STOWA en ENDURE zijn na locatie-, sleutel-, rechten- en eenheidscontrole opgenomen. ENDURE bevat veertien complete aanwezigheids-afwezigheidsmatrices en één event zonder resultatenmatrix. STOWA bevat uitsluitend positieve resultaten; de vier typen meeteenheid worden niet samengevoegd.</w:t>
+      </w:r>
+    </w:p>
+    <w:p>
+      <w:pPr>
+        <w:pStyle w:val="BodyText"/>
+      </w:pPr>
+      <w:r>
+        <w:rPr>
+          <w:b/>
+          <w:bCs/>
+        </w:rPr>
+        <w:t xml:space="preserve">Museumreeksen: uitgevoerd.</w:t>
+      </w:r>
+      <w:r>
+        <w:t xml:space="preserve"> </w:t>
+      </w:r>
+      <w:r>
+        <w:t xml:space="preserve">De volledige openbare Darwin Core-archieven zijn geprofileerd. Alleen gedateerde, unieke records binnen het basisgebied én met een expliciete Meijendel- of deelgebiednaam op het etiket zijn opgenomen: 4.748 NMR-vlinders en -motten, 1.881 Naturalis Botany-specimens en 869 Naturalis-kevers.</w:t>
+      </w:r>
+      <w:r>
+        <w:t xml:space="preserve"> </w:t>
+      </w:r>
+      <w:r>
+        <w:rPr>
+          <w:rStyle w:val="VerbatimChar"/>
+        </w:rPr>
+        <w:t xml:space="preserve">occurrenceID</w:t>
+      </w:r>
+      <w:r>
+        <w:t xml:space="preserve">, etiketplaats, oorspronkelijke en voor analyse genormaliseerde taxonnaam, datum of datuminterval, coördinaten, onzekerheid, licentie, DOI en bronmetadata zijn behouden. Ruimtelijke treffers zonder expliciet Meijendel-etiket en expliciete Meijendel-records zonder datum zijn niet toegelaten.</w:t>
+      </w:r>
+    </w:p>
+    <w:p>
+      <w:pPr>
+        <w:pStyle w:val="BodyText"/>
+      </w:pPr>
+      <w:r>
+        <w:rPr>
+          <w:b/>
+          <w:bCs/>
+        </w:rPr>
+        <w:t xml:space="preserve">Landelijke Vegetatie Databank: uitgevoerd voor de reproduceerbare bronversie 1.6.</w:t>
+      </w:r>
+      <w:r>
+        <w:t xml:space="preserve"> </w:t>
+      </w:r>
+      <w:r>
+        <w:t xml:space="preserve">Van 5.195 opnamen en 119.006 taxonregels zijn 3.437 opnamen en 81.310 taxonresultaten met maximaal 50 meter locatie-onzekerheid toegelaten. De overlapaudit markeert 13.169 resultaten als exact of waarschijnlijk reeds aanwezig in de provinciale PQ-reeks. Mogelijke NDFF-overlap blijft zichtbaar, maar wordt vanwege de NDFF-onzekerheidspolygonen niet automatisch als dubbel verwijderd. De duinvalleireeks kan zonder georeferentie niet op opnameniveau worden gekoppeld en blijft afzonderlijk in</w:t>
+      </w:r>
+      <w:r>
+        <w:t xml:space="preserve"> </w:t>
+      </w:r>
+      <w:r>
+        <w:rPr>
+          <w:rStyle w:val="VerbatimChar"/>
+        </w:rPr>
+        <w:t xml:space="preserve">Meijendel_bronnen</w:t>
+      </w:r>
+      <w:r>
+        <w:t xml:space="preserve">.</w:t>
+      </w:r>
+    </w:p>
     <w:bookmarkEnd w:id="81"/>
-    <w:bookmarkStart w:id="82" w:name="Xc540a83ee65aaec11aa446aec0815d16fd21e21"/>
-    <w:p>
-      <w:pPr>
-        <w:pStyle w:val="Heading2"/>
-      </w:pPr>
-      <w:r>
-        <w:t xml:space="preserve">4. Verwachte aanvullingen</w:t>
-      </w:r>
-    </w:p>
-    <w:p>
-      <w:pPr>
-        <w:pStyle w:val="FirstParagraph"/>
-      </w:pPr>
-      <w:r>
-        <w:rPr>
-          <w:b/>
-          <w:bCs/>
-        </w:rPr>
-        <w:t xml:space="preserve">Vlindergegevens:</w:t>
-      </w:r>
-      <w:r>
-        <w:t xml:space="preserve"> </w:t>
-      </w:r>
-      <w:r>
-        <w:t xml:space="preserve">De Vlinderstichting verwacht in de week van 28 september 2026 aanvullende meetstructuur te kunnen leveren. Die levering wordt eerst vergeleken met de 82.217 NDFF-dagvlinderrecords en de bestaande routeconstructie.</w:t>
-      </w:r>
-    </w:p>
-    <w:p>
-      <w:pPr>
-        <w:pStyle w:val="BodyText"/>
-      </w:pPr>
-      <w:r>
-        <w:rPr>
-          <w:b/>
-          <w:bCs/>
-        </w:rPr>
-        <w:t xml:space="preserve">Overige meetnetten:</w:t>
-      </w:r>
-      <w:r>
-        <w:t xml:space="preserve"> </w:t>
-      </w:r>
-      <w:r>
-        <w:t xml:space="preserve">de overige aangeschreven bronorganisaties hebben op 25 september 2026 nog niet inhoudelijk gereageerd. Nieuwe leveringen worden niet automatisch geïmporteerd, maar eerst gecontroleerd op dekking, sleutels, nullen, inspanning en overlap.</w:t>
-      </w:r>
-    </w:p>
-    <w:p>
-      <w:pPr>
-        <w:pStyle w:val="BodyText"/>
-      </w:pPr>
-      <w:r>
-        <w:rPr>
-          <w:b/>
-          <w:bCs/>
-        </w:rPr>
-        <w:t xml:space="preserve">Habitatkaart T1:</w:t>
-      </w:r>
-      <w:r>
-        <w:t xml:space="preserve"> </w:t>
-      </w:r>
-      <w:r>
-        <w:t xml:space="preserve">Provincie Zuid-Holland heeft toegezegd de kaart te delen zodra zij later in 2026 beschikbaar komt. De kaart kan veranderingen in habitat helpen verklaren, maar is zelf geen soortenwaarneming.</w:t>
+    <w:bookmarkStart w:id="82" w:name="X1e65d730f223a62ff579853fd3c77c9308748df"/>
+    <w:p>
+      <w:pPr>
+        <w:pStyle w:val="Heading3"/>
+      </w:pPr>
+      <w:r>
+        <w:t xml:space="preserve">Fase 2 — reeksen met grote historische of trendwaarde</w:t>
+      </w:r>
+    </w:p>
+    <w:p>
+      <w:pPr>
+        <w:pStyle w:val="FirstParagraph"/>
+      </w:pPr>
+      <w:r>
+        <w:rPr>
+          <w:b/>
+          <w:bCs/>
+        </w:rPr>
+        <w:t xml:space="preserve">Ringgegevens: onderzocht, niet toegelaten.</w:t>
+      </w:r>
+      <w:r>
+        <w:t xml:space="preserve"> </w:t>
+      </w:r>
+      <w:r>
+        <w:t xml:space="preserve">De locatiecode</w:t>
+      </w:r>
+      <w:r>
+        <w:t xml:space="preserve"> </w:t>
+      </w:r>
+      <w:r>
+        <w:rPr>
+          <w:rStyle w:val="VerbatimChar"/>
+        </w:rPr>
+        <w:t xml:space="preserve">NL19</w:t>
+      </w:r>
+      <w:r>
+        <w:t xml:space="preserve"> </w:t>
+      </w:r>
+      <w:r>
+        <w:t xml:space="preserve">in de GBIF-biometrie betekent provincie Zuid-Holland en niet VRS Meijendel. Trektellen-site 403 bevat wel VRS-Meijendelrapporten en inspanning, maar er is geen recordsleutel naar de 100.417 ruimtelijke GBIF-treffers. Zij blijven kandidaat en worden niet met de vogelreeks vermengd.</w:t>
+      </w:r>
+    </w:p>
+    <w:p>
+      <w:pPr>
+        <w:pStyle w:val="BodyText"/>
+      </w:pPr>
+      <w:r>
+        <w:rPr>
+          <w:b/>
+          <w:bCs/>
+        </w:rPr>
+        <w:t xml:space="preserve">Bijenmonitoring: bezoekstructuur gereconstrueerd.</w:t>
+      </w:r>
+      <w:r>
+        <w:t xml:space="preserve"> </w:t>
+      </w:r>
+      <w:r>
+        <w:t xml:space="preserve">Alle achttien proefvlakcodes, vier deelgebieden en 162 bezoeken uit 2019, 2021 en 2023 zijn in</w:t>
+      </w:r>
+      <w:r>
+        <w:t xml:space="preserve"> </w:t>
+      </w:r>
+      <w:r>
+        <w:rPr>
+          <w:rStyle w:val="VerbatimChar"/>
+        </w:rPr>
+        <w:t xml:space="preserve">Meijendel_bronnen</w:t>
+      </w:r>
+      <w:r>
+        <w:t xml:space="preserve"> </w:t>
+      </w:r>
+      <w:r>
+        <w:t xml:space="preserve">vastgelegd. De rapporten tonen de grenzen alleen als figuur. De reeks verhuist pas naar</w:t>
+      </w:r>
+      <w:r>
+        <w:t xml:space="preserve"> </w:t>
+      </w:r>
+      <w:r>
+        <w:rPr>
+          <w:rStyle w:val="VerbatimChar"/>
+        </w:rPr>
+        <w:t xml:space="preserve">Meijendel</w:t>
+      </w:r>
+      <w:r>
+        <w:t xml:space="preserve"> </w:t>
+      </w:r>
+      <w:r>
+        <w:t xml:space="preserve">nadat die grenzen betrouwbaar zijn gegeorefereerd en de soortenmatrices foutgecontroleerd zijn gedigitaliseerd.</w:t>
+      </w:r>
+    </w:p>
+    <w:p>
+      <w:pPr>
+        <w:pStyle w:val="BodyText"/>
+      </w:pPr>
+      <w:r>
+        <w:rPr>
+          <w:b/>
+          <w:bCs/>
+        </w:rPr>
+        <w:t xml:space="preserve">Aquatische reeks: methode en locatiestructuur gereconstrueerd.</w:t>
+      </w:r>
+      <w:r>
+        <w:t xml:space="preserve"> </w:t>
+      </w:r>
+      <w:r>
+        <w:t xml:space="preserve">De zeven monsterpuntcodes, vijf benoemde wateren en negentien standaard- of afwijkende methodeperioden uit 1974–1975 staan in</w:t>
+      </w:r>
+      <w:r>
+        <w:t xml:space="preserve"> </w:t>
+      </w:r>
+      <w:r>
+        <w:rPr>
+          <w:rStyle w:val="VerbatimChar"/>
+        </w:rPr>
+        <w:t xml:space="preserve">Meijendel_bronnen</w:t>
+      </w:r>
+      <w:r>
+        <w:t xml:space="preserve">. Een betrouwbare digitale watercodekaart en een gecontroleerde soortenmatrix ontbreken nog. Daarom zijn geen waarnemingsregels naar</w:t>
+      </w:r>
+      <w:r>
+        <w:t xml:space="preserve"> </w:t>
+      </w:r>
+      <w:r>
+        <w:rPr>
+          <w:rStyle w:val="VerbatimChar"/>
+        </w:rPr>
+        <w:t xml:space="preserve">Meijendel</w:t>
+      </w:r>
+      <w:r>
+        <w:t xml:space="preserve"> </w:t>
+      </w:r>
+      <w:r>
+        <w:t xml:space="preserve">gepromoveerd. De aanvullende waterwantsen, waterkevers, libellen, neuropteren en zweefvliegen blijven kandidaat totdat datum en locatie per waarneming vaststaan.</w:t>
+      </w:r>
+    </w:p>
+    <w:p>
+      <w:pPr>
+        <w:pStyle w:val="BodyText"/>
+      </w:pPr>
+      <w:r>
+        <w:rPr>
+          <w:b/>
+          <w:bCs/>
+        </w:rPr>
+        <w:t xml:space="preserve">Droge-duinvegetatieplots: onderzocht, nog niet lokaliseerbaar per plot.</w:t>
+      </w:r>
+      <w:r>
+        <w:t xml:space="preserve"> </w:t>
+      </w:r>
+      <w:r>
+        <w:t xml:space="preserve">De kaart in het proefschrift is visueel gecontroleerd en toont 41 punten in Helmduinen, Kijfhoek en Bierlap, maar geen koppelbare plotcodes. Ook de LVD-selectie levert geen betrouwbare vertaling. De reeks blijft kandidaat totdat de oorspronkelijke plotkaart en opnametabellen zijn gevonden.</w:t>
       </w:r>
     </w:p>
     <w:bookmarkEnd w:id="82"/>
-    <w:bookmarkStart w:id="83" w:name="X422e6271160c2b04a3b59fb5b59cfcc2e3afc55"/>
-    <w:p>
-      <w:pPr>
-        <w:pStyle w:val="Heading2"/>
-      </w:pPr>
-      <w:r>
-        <w:t xml:space="preserve">5. Bronnen die niet verder worden uitgewerkt</w:t>
-      </w:r>
-    </w:p>
-    <w:p>
-      <w:pPr>
-        <w:pStyle w:val="FirstParagraph"/>
-      </w:pPr>
-      <w:r>
-        <w:t xml:space="preserve">Drie eerder gevonden publicaties bleken bij controle geen Meijendelgegevens te bevatten: een macrofaunastudie uit de Drentsche Aa, een voedselwebstudie aan Amerikaanse vogelkers in Zuid-Kennemerland en een studie naar vliegtuiggeluid bij Tjiftjaf. De voedselwebstudie noemt toestemming voor veldwerk in Meijendel, maar de gepubliceerde waarnemingstabel betreft uitsluitend Nationaal Park Zuid-Kennemerland. Zij worden daarom niet als kandidaatbron beschouwd.</w:t>
-      </w:r>
-    </w:p>
-    <w:p>
-      <w:pPr>
-        <w:pStyle w:val="BodyText"/>
-      </w:pPr>
-      <w:r>
-        <w:t xml:space="preserve">Een openbare GBIF-dataset met mondiale bodemorganismen gaf 1.995 ruimtelijke treffers binnen de projectgrens. De oorspronkelijke plaatsaanduiding van al deze monsters is echter Terschelling. Dit is een georeferentiefout en geen Meijendelbron.</w:t>
-      </w:r>
-    </w:p>
-    <w:p>
-      <w:pPr>
-        <w:pStyle w:val="BodyText"/>
-      </w:pPr>
-      <w:r>
-        <w:t xml:space="preserve">Algemene verzamelbronnen zoals Observation.org, iNaturalist en eBird worden ook niet opnieuw als zelfstandige Meijendelbron ingevoerd zolang niet is aangetoond dat zij waarnemingen bevatten die ontbreken in NDFF of in de primaire VWG/SOVON-reeksen. Anders zou dezelfde waarneming vooral nogmaals worden opgeslagen.</w:t>
+    <w:bookmarkStart w:id="83" w:name="X6b9d0c88ffcb5584e67daa74c9524b522af67c0"/>
+    <w:p>
+      <w:pPr>
+        <w:pStyle w:val="Heading3"/>
+      </w:pPr>
+      <w:r>
+        <w:t xml:space="preserve">Fase 3 — reeds bekende bronhouders en contextdatasets</w:t>
+      </w:r>
+    </w:p>
+    <w:p>
+      <w:pPr>
+        <w:pStyle w:val="FirstParagraph"/>
+      </w:pPr>
+      <w:r>
+        <w:rPr>
+          <w:b/>
+          <w:bCs/>
+        </w:rPr>
+        <w:t xml:space="preserve">Ontvangen meetnetleveringen vergelijken, niet blind importeren.</w:t>
+      </w:r>
+      <w:r>
+        <w:t xml:space="preserve"> </w:t>
+      </w:r>
+      <w:r>
+        <w:t xml:space="preserve">De verwachte gegevens van De Vlinderstichting en eventuele latere leveringen worden eerst vergeleken met NDFF op populatie, bezoeken, sleutels, nullen en overlap. Alleen aantoonbare aanvullingen of betere primaire versies vervangen de voorlopige reconstructies.</w:t>
+      </w:r>
+    </w:p>
+    <w:p>
+      <w:pPr>
+        <w:pStyle w:val="BodyText"/>
+      </w:pPr>
+      <w:r>
+        <w:rPr>
+          <w:b/>
+          <w:bCs/>
+        </w:rPr>
+        <w:t xml:space="preserve">Contextdatasets alleen promoveren na georeferentie.</w:t>
+      </w:r>
+      <w:r>
+        <w:t xml:space="preserve"> </w:t>
+      </w:r>
+      <w:r>
+        <w:t xml:space="preserve">Duinvalleiplots, jachtspinnen, TERRA-Dunes en andere genummerde locaties blijven in</w:t>
+      </w:r>
+      <w:r>
+        <w:t xml:space="preserve"> </w:t>
+      </w:r>
+      <w:r>
+        <w:rPr>
+          <w:rStyle w:val="VerbatimChar"/>
+        </w:rPr>
+        <w:t xml:space="preserve">Meijendel_bronnen</w:t>
+      </w:r>
+      <w:r>
+        <w:t xml:space="preserve"> </w:t>
+      </w:r>
+      <w:r>
+        <w:t xml:space="preserve">totdat per waarneming een betrouwbare ligging in Meijendel is vastgesteld.</w:t>
+      </w:r>
+    </w:p>
+    <w:p>
+      <w:pPr>
+        <w:pStyle w:val="BodyText"/>
+      </w:pPr>
+      <w:r>
+        <w:rPr>
+          <w:b/>
+          <w:bCs/>
+        </w:rPr>
+        <w:t xml:space="preserve">Verklarende lagen afzonderlijk opbouwen.</w:t>
+      </w:r>
+      <w:r>
+        <w:t xml:space="preserve"> </w:t>
+      </w:r>
+      <w:r>
+        <w:t xml:space="preserve">Voeg de Habitatkaart T1, de landbedekking van 2001 en 2022 en eventueel gevonden remote-sensingrasters toe als omgevingslagen. Zij mogen ecologische veranderingen helpen verklaren, maar worden niet als soortenwaarnemingen behandeld.</w:t>
       </w:r>
     </w:p>
     <w:bookmarkEnd w:id="83"/>
-    <w:bookmarkStart w:id="84" w:name="Xb05dec49988a12f7955d21ff17f1c91e4d061eb"/>
-    <w:p>
-      <w:pPr>
-        <w:pStyle w:val="Heading2"/>
-      </w:pPr>
-      <w:r>
-        <w:t xml:space="preserve">6. Gebruik van dit register</w:t>
-      </w:r>
-    </w:p>
-    <w:p>
-      <w:pPr>
-        <w:pStyle w:val="FirstParagraph"/>
-      </w:pPr>
-      <w:r>
-        <w:t xml:space="preserve">Dit document is het beslisoverzicht. Een bron gaat pas naar</w:t>
-      </w:r>
-      <w:r>
-        <w:t xml:space="preserve"> </w:t>
-      </w:r>
-      <w:r>
-        <w:rPr>
-          <w:rStyle w:val="VerbatimChar"/>
-        </w:rPr>
-        <w:t xml:space="preserve">Meijendel</w:t>
-      </w:r>
-      <w:r>
-        <w:t xml:space="preserve"> </w:t>
-      </w:r>
-      <w:r>
-        <w:t xml:space="preserve">wanneer per waarneming vaststaat dat zij in Meijendel is gedaan en de locatie bekend of betrouwbaar herleidbaar is. Is dat niet zo, dan blijft zij kandidaat of context in Meijendel_bronnen.</w:t>
-      </w:r>
-    </w:p>
-    <w:p>
-      <w:pPr>
-        <w:pStyle w:val="BodyText"/>
-      </w:pPr>
-      <w:r>
-        <w:t xml:space="preserve">Bij iedere nieuwe levering worden achtereenvolgens gecontroleerd:</w:t>
-      </w:r>
-    </w:p>
-    <w:p>
-      <w:pPr>
-        <w:pStyle w:val="BodyText"/>
-      </w:pPr>
-      <w:r>
-        <w:t xml:space="preserve">welke waarnemingen en perioden werkelijk nieuw zijn;</w:t>
-      </w:r>
-    </w:p>
-    <w:p>
-      <w:pPr>
-        <w:pStyle w:val="BodyText"/>
-      </w:pPr>
-      <w:r>
-        <w:t xml:space="preserve">of locaties en oorspronkelijke sleutels bruikbaar zijn;</w:t>
-      </w:r>
-    </w:p>
-    <w:p>
-      <w:pPr>
-        <w:pStyle w:val="BodyText"/>
-      </w:pPr>
-      <w:r>
-        <w:t xml:space="preserve">of bezoeken, soortenlijsten en echte nullen aanwezig zijn;</w:t>
-      </w:r>
-    </w:p>
-    <w:p>
-      <w:pPr>
-        <w:pStyle w:val="BodyText"/>
-      </w:pPr>
-      <w:r>
-        <w:t xml:space="preserve">of de bron een bestaande primaire reeks overlapt;</w:t>
-      </w:r>
-    </w:p>
-    <w:p>
-      <w:pPr>
-        <w:pStyle w:val="BodyText"/>
-      </w:pPr>
-      <w:r>
-        <w:t xml:space="preserve">welke analyses daardoor verantwoord mogelijk worden.</w:t>
-      </w:r>
-    </w:p>
-    <w:p>
-      <w:pPr>
-        <w:pStyle w:val="BodyText"/>
-      </w:pPr>
-      <w:r>
-        <w:t xml:space="preserve">Pas daarna volgt een afzonderlijk importbesluit.</w:t>
+    <w:bookmarkStart w:id="84" w:name="vaste-werkwijze-per-bron"/>
+    <w:p>
+      <w:pPr>
+        <w:pStyle w:val="Heading3"/>
+      </w:pPr>
+      <w:r>
+        <w:t xml:space="preserve">Vaste werkwijze per bron</w:t>
+      </w:r>
+    </w:p>
+    <w:p>
+      <w:pPr>
+        <w:pStyle w:val="FirstParagraph"/>
+      </w:pPr>
+      <w:r>
+        <w:t xml:space="preserve">Iedere bron doorloopt dezelfde vijf stappen: een onveranderde bronkopie met checksum bewaren; gegevenswoordenboek en rechten vastleggen; locaties en analyseeenheid controleren; overlap en dubbelen bepalen; pas daarna een reproduceerbare import en analyseview maken. Na iedere statuswijziging worden dit register en de Wordversie meteen bijgewerkt.</w:t>
       </w:r>
     </w:p>
     <w:bookmarkEnd w:id="84"/>
-    <w:bookmarkStart w:id="90" w:name="X67781990bcb7d7d43cc312a7ef48f37a1f83265"/>
-    <w:p>
-      <w:pPr>
-        <w:pStyle w:val="Heading2"/>
-      </w:pPr>
-      <w:r>
-        <w:t xml:space="preserve">7. Actieplan</w:t>
-      </w:r>
-    </w:p>
-    <w:p>
-      <w:pPr>
-        <w:pStyle w:val="FirstParagraph"/>
-      </w:pPr>
-      <w:r>
-        <w:t xml:space="preserve">Het doel is niet zoveel mogelijk regels importeren, maar per bron de kortste route naar betrouwbare, niet-dubbele en geografisch toegelaten gegevens te volgen. De ruwe bestanden blijven onveranderd bewaard;</w:t>
-      </w:r>
-      <w:r>
-        <w:t xml:space="preserve"> </w:t>
-      </w:r>
-      <w:r>
-        <w:rPr>
-          <w:rStyle w:val="VerbatimChar"/>
-        </w:rPr>
-        <w:t xml:space="preserve">Meijendel</w:t>
-      </w:r>
-      <w:r>
-        <w:t xml:space="preserve"> </w:t>
-      </w:r>
-      <w:r>
-        <w:t xml:space="preserve">bevat alleen waarnemingen die aan de ruimtelijke toelatingsregel voldoen.</w:t>
-      </w:r>
-    </w:p>
-    <w:bookmarkStart w:id="85" w:name="Xd7f889e2150e602eaeb242f489896c9b52af547"/>
+    <w:bookmarkStart w:id="85" w:name="dekking-van-de-internetcontrole"/>
     <w:p>
       <w:pPr>
         <w:pStyle w:val="Heading3"/>
       </w:pPr>
       <w:r>
-        <w:t xml:space="preserve">Fase 1 — openbare, direct toetsbare bronnen</w:t>
-      </w:r>
-    </w:p>
-    <w:p>
-      <w:pPr>
-        <w:pStyle w:val="FirstParagraph"/>
-      </w:pPr>
-      <w:r>
-        <w:rPr>
-          <w:b/>
-          <w:bCs/>
-        </w:rPr>
-        <w:t xml:space="preserve">STOWA Limnodata en ENDURE volledig beoordelen.</w:t>
-      </w:r>
-      <w:r>
-        <w:t xml:space="preserve"> </w:t>
-      </w:r>
-      <w:r>
-        <w:t xml:space="preserve">Controleer locaties, sleutels, rechten, overlap en analyseeenheid. ENDURE kan na deze controle als gestandaardiseerde referentiemeting naar</w:t>
-      </w:r>
-      <w:r>
-        <w:t xml:space="preserve"> </w:t>
-      </w:r>
-      <w:r>
-        <w:rPr>
-          <w:rStyle w:val="VerbatimChar"/>
-        </w:rPr>
-        <w:t xml:space="preserve">Meijendel</w:t>
-      </w:r>
-      <w:r>
-        <w:t xml:space="preserve">; STOWA alleen per bemonstering en eenheid, zonder niet-gemelde soorten als nul te behandelen.</w:t>
-      </w:r>
-    </w:p>
-    <w:p>
-      <w:pPr>
-        <w:pStyle w:val="BodyText"/>
-      </w:pPr>
-      <w:r>
-        <w:rPr>
-          <w:b/>
-          <w:bCs/>
-        </w:rPr>
-        <w:t xml:space="preserve">De historische museumreeksen downloaden en vastzetten.</w:t>
-      </w:r>
-      <w:r>
-        <w:t xml:space="preserve"> </w:t>
-      </w:r>
-      <w:r>
-        <w:t xml:space="preserve">Maak afzonderlijke bronselecties voor de 5.219 NMR-waarnemingen, 6.227 Naturalis-plantenrecords en 1.905 Naturalis-keverrecords. Bewaar</w:t>
-      </w:r>
-      <w:r>
-        <w:t xml:space="preserve"> </w:t>
-      </w:r>
-      <w:r>
-        <w:rPr>
-          <w:rStyle w:val="VerbatimChar"/>
-        </w:rPr>
-        <w:t xml:space="preserve">occurrenceID</w:t>
-      </w:r>
-      <w:r>
-        <w:t xml:space="preserve">, oorspronkelijke etiketplaats, datum, coördinaten, onzekerheid, licentie en download-DOI. Alleen geografisch bevestigde, unieke records gaan naar</w:t>
-      </w:r>
-      <w:r>
-        <w:t xml:space="preserve"> </w:t>
-      </w:r>
-      <w:r>
-        <w:rPr>
-          <w:rStyle w:val="VerbatimChar"/>
-        </w:rPr>
-        <w:t xml:space="preserve">Meijendel</w:t>
-      </w:r>
-      <w:r>
-        <w:t xml:space="preserve">; overige records blijven kandidaat of gaan als context naar</w:t>
-      </w:r>
-      <w:r>
-        <w:t xml:space="preserve"> </w:t>
-      </w:r>
-      <w:r>
-        <w:rPr>
-          <w:rStyle w:val="VerbatimChar"/>
-        </w:rPr>
-        <w:t xml:space="preserve">Meijendel_bronnen</w:t>
-      </w:r>
-      <w:r>
-        <w:t xml:space="preserve">.</w:t>
-      </w:r>
-    </w:p>
-    <w:p>
-      <w:pPr>
-        <w:pStyle w:val="BodyText"/>
-      </w:pPr>
-      <w:r>
-        <w:rPr>
-          <w:b/>
-          <w:bCs/>
-        </w:rPr>
-        <w:t xml:space="preserve">De Landelijke Vegetatie Databank opnieuw selecteren.</w:t>
-      </w:r>
-      <w:r>
-        <w:t xml:space="preserve"> </w:t>
-      </w:r>
-      <w:r>
-        <w:t xml:space="preserve">De huidige openbare bron geeft meer ruimtelijke treffers dan de eerder vastgelegde selectie van 119.006 taxonregels. Leg daarom eerst bronversie, selectiegrens en verschil tussen opname- en taxonregels vast. Ontdubbel daarna tegen provinciale PQ, NDFF en duinvalleivegetatie.</w:t>
+        <w:t xml:space="preserve">Dekking van de internetcontrole</w:t>
+      </w:r>
+    </w:p>
+    <w:p>
+      <w:pPr>
+        <w:pStyle w:val="FirstParagraph"/>
+      </w:pPr>
+      <w:r>
+        <w:t xml:space="preserve">De controle van 26 september 2026 omvatte GBIF, DataCite, Zenodo, Dryad, Figshare, Europe PMC, Naturalis Repository, Wageningen Research e-depot en de repositories van Universiteit Leiden en TU Delft. Algemene aggregators zijn niet als zelfstandige bron opgenomen wanneer zij waarschijnlijk dezelfde waarnemingen als NDFF of primaire collecties bevatten. Een openbare zoekronde kan nooit bewijzen dat geen ongepubliceerde of slecht geïndexeerde bron bestaat; dit register legt daarom ook de zoekdatum en toelatingsreden vast.</w:t>
       </w:r>
     </w:p>
     <w:bookmarkEnd w:id="85"/>
-    <w:bookmarkStart w:id="86" w:name="Xa67120beb48c3916f8a53c623f303ce8b8a6005"/>
-    <w:p>
-      <w:pPr>
-        <w:pStyle w:val="Heading3"/>
-      </w:pPr>
-      <w:r>
-        <w:t xml:space="preserve">Fase 2 — reeksen met grote historische of trendwaarde</w:t>
-      </w:r>
-    </w:p>
-    <w:p>
-      <w:pPr>
-        <w:pStyle w:val="FirstParagraph"/>
-      </w:pPr>
-      <w:r>
-        <w:rPr>
-          <w:b/>
-          <w:bCs/>
-        </w:rPr>
-        <w:t xml:space="preserve">Ringgegevens koppelen aan vangplaats en inspanning.</w:t>
-      </w:r>
-      <w:r>
-        <w:t xml:space="preserve"> </w:t>
-      </w:r>
-      <w:r>
-        <w:t xml:space="preserve">Bevestig welke locatiecodes VRS Meijendel betreffen en welke vanguren, netten en bezoeken beschikbaar zijn. Pas daarna kunnen fenologie en biometrie worden geanalyseerd; overeenkomstige vogelrecords worden niet dubbel ingevoerd.</w:t>
-      </w:r>
-    </w:p>
-    <w:p>
-      <w:pPr>
-        <w:pStyle w:val="BodyText"/>
-      </w:pPr>
-      <w:r>
-        <w:rPr>
-          <w:b/>
-          <w:bCs/>
-        </w:rPr>
-        <w:t xml:space="preserve">Bijenmonitoring reconstrueren.</w:t>
-      </w:r>
-      <w:r>
-        <w:t xml:space="preserve"> </w:t>
-      </w:r>
-      <w:r>
-        <w:t xml:space="preserve">Digitaliseer de 18 proefvlakken en 162 bezoeken uit 2019, 2021 en 2023. Alleen complete bezoeken en betrouwbare proefvlaklocaties maken vergelijking tussen gebieden en jaren mogelijk.</w:t>
-      </w:r>
-    </w:p>
-    <w:p>
-      <w:pPr>
-        <w:pStyle w:val="BodyText"/>
-      </w:pPr>
-      <w:r>
-        <w:rPr>
-          <w:b/>
-          <w:bCs/>
-        </w:rPr>
-        <w:t xml:space="preserve">Aquatische en historische insectenreeksen digitaliseren.</w:t>
-      </w:r>
-      <w:r>
-        <w:t xml:space="preserve"> </w:t>
-      </w:r>
-      <w:r>
-        <w:t xml:space="preserve">Begin met de zeven waterpunten uit 1974–1975 en de bijbehorende watercodekaart. Voeg daarna waterwantsen, waterkevers, libellen, neuropteren en zweefvliegen toe, maar alleen wanneer datum en locatie per waarneming zijn vastgesteld.</w:t>
-      </w:r>
-    </w:p>
-    <w:p>
-      <w:pPr>
-        <w:pStyle w:val="BodyText"/>
-      </w:pPr>
-      <w:r>
-        <w:rPr>
-          <w:b/>
-          <w:bCs/>
-        </w:rPr>
-        <w:t xml:space="preserve">De 41 droge-duinvegetatieplots lokaliseren.</w:t>
-      </w:r>
-      <w:r>
-        <w:t xml:space="preserve"> </w:t>
-      </w:r>
-      <w:r>
-        <w:t xml:space="preserve">Zoek eerst de oorspronkelijke plotkaart en tabellen. Zonder die koppeling blijft de reeks kandidaat; met vaste locaties en herhaalde opnamen kan zij een belangrijke historische vegetatiereeks worden.</w:t>
-      </w:r>
-    </w:p>
     <w:bookmarkEnd w:id="86"/>
-    <w:bookmarkStart w:id="87" w:name="Xc96f79f2027e81b7ab280f9bf69df5af8bdf464"/>
-    <w:p>
-      <w:pPr>
-        <w:pStyle w:val="Heading3"/>
-      </w:pPr>
-      <w:r>
-        <w:t xml:space="preserve">Fase 3 — reeds bekende bronhouders en contextdatasets</w:t>
-      </w:r>
-    </w:p>
-    <w:p>
-      <w:pPr>
-        <w:pStyle w:val="FirstParagraph"/>
-      </w:pPr>
-      <w:r>
-        <w:rPr>
-          <w:b/>
-          <w:bCs/>
-        </w:rPr>
-        <w:t xml:space="preserve">Ontvangen meetnetleveringen vergelijken, niet blind importeren.</w:t>
-      </w:r>
-      <w:r>
-        <w:t xml:space="preserve"> </w:t>
-      </w:r>
-      <w:r>
-        <w:t xml:space="preserve">De verwachte gegevens van De Vlinderstichting en eventuele latere leveringen worden eerst vergeleken met NDFF op populatie, bezoeken, sleutels, nullen en overlap. Alleen aantoonbare aanvullingen of betere primaire versies vervangen de voorlopige reconstructies.</w:t>
-      </w:r>
-    </w:p>
-    <w:p>
-      <w:pPr>
-        <w:pStyle w:val="BodyText"/>
-      </w:pPr>
-      <w:r>
-        <w:rPr>
-          <w:b/>
-          <w:bCs/>
-        </w:rPr>
-        <w:t xml:space="preserve">Contextdatasets alleen promoveren na georeferentie.</w:t>
-      </w:r>
-      <w:r>
-        <w:t xml:space="preserve"> </w:t>
-      </w:r>
-      <w:r>
-        <w:t xml:space="preserve">Duinvalleiplots, jachtspinnen, TERRA-Dunes en andere genummerde locaties blijven in</w:t>
-      </w:r>
-      <w:r>
-        <w:t xml:space="preserve"> </w:t>
-      </w:r>
-      <w:r>
-        <w:rPr>
-          <w:rStyle w:val="VerbatimChar"/>
-        </w:rPr>
-        <w:t xml:space="preserve">Meijendel_bronnen</w:t>
-      </w:r>
-      <w:r>
-        <w:t xml:space="preserve"> </w:t>
-      </w:r>
-      <w:r>
-        <w:t xml:space="preserve">totdat per waarneming een betrouwbare ligging in Meijendel is vastgesteld.</w:t>
-      </w:r>
-    </w:p>
-    <w:p>
-      <w:pPr>
-        <w:pStyle w:val="BodyText"/>
-      </w:pPr>
-      <w:r>
-        <w:rPr>
-          <w:b/>
-          <w:bCs/>
-        </w:rPr>
-        <w:t xml:space="preserve">Verklarende lagen afzonderlijk opbouwen.</w:t>
-      </w:r>
-      <w:r>
-        <w:t xml:space="preserve"> </w:t>
-      </w:r>
-      <w:r>
-        <w:t xml:space="preserve">Voeg de Habitatkaart T1, de landbedekking van 2001 en 2022 en eventueel gevonden remote-sensingrasters toe als omgevingslagen. Zij mogen ecologische veranderingen helpen verklaren, maar worden niet als soortenwaarnemingen behandeld.</w:t>
-      </w:r>
-    </w:p>
-    <w:bookmarkEnd w:id="87"/>
-    <w:bookmarkStart w:id="88" w:name="vaste-werkwijze-per-bron"/>
-    <w:p>
-      <w:pPr>
-        <w:pStyle w:val="Heading3"/>
-      </w:pPr>
-      <w:r>
-        <w:t xml:space="preserve">Vaste werkwijze per bron</w:t>
-      </w:r>
-    </w:p>
-    <w:p>
-      <w:pPr>
-        <w:pStyle w:val="FirstParagraph"/>
-      </w:pPr>
-      <w:r>
-        <w:t xml:space="preserve">Iedere bron doorloopt dezelfde vijf stappen: een onveranderde bronkopie met checksum bewaren; gegevenswoordenboek en rechten vastleggen; locaties en analyseeenheid controleren; overlap en dubbelen bepalen; pas daarna een reproduceerbare import en analyseview maken. Na iedere statuswijziging worden dit register en de Wordversie meteen bijgewerkt.</w:t>
-      </w:r>
-    </w:p>
-    <w:bookmarkEnd w:id="88"/>
-    <w:bookmarkStart w:id="89" w:name="dekking-van-de-internetcontrole"/>
-    <w:p>
-      <w:pPr>
-        <w:pStyle w:val="Heading3"/>
-      </w:pPr>
-      <w:r>
-        <w:t xml:space="preserve">Dekking van de internetcontrole</w:t>
-      </w:r>
-    </w:p>
-    <w:p>
-      <w:pPr>
-        <w:pStyle w:val="FirstParagraph"/>
-      </w:pPr>
-      <w:r>
-        <w:t xml:space="preserve">De controle van 26 september 2026 omvatte GBIF, DataCite, Zenodo, Dryad, Figshare, Europe PMC, Naturalis Repository, Wageningen Research e-depot en de repositories van Universiteit Leiden en TU Delft. Algemene aggregators zijn niet als zelfstandige bron opgenomen wanneer zij waarschijnlijk dezelfde waarnemingen als NDFF of primaire collecties bevatten. Een openbare zoekronde kan nooit bewijzen dat geen ongepubliceerde of slecht geïndexeerde bron bestaat; dit register legt daarom ook de zoekdatum en toelatingsreden vast.</w:t>
-      </w:r>
-    </w:p>
-    <w:bookmarkEnd w:id="89"/>
-    <w:bookmarkEnd w:id="90"/>
-    <w:bookmarkStart w:id="98" w:name="achterliggende-verantwoording"/>
+    <w:bookmarkStart w:id="94" w:name="achterliggende-verantwoording"/>
     <w:p>
       <w:pPr>
         <w:pStyle w:val="Heading2"/>
@@ -4805,7 +4791,7 @@
           <w:numId w:val="1004"/>
         </w:numPr>
       </w:pPr>
-      <w:hyperlink r:id="rId91">
+      <w:hyperlink r:id="rId87">
         <w:r>
           <w:rPr>
             <w:rStyle w:val="Hyperlink"/>
@@ -4822,7 +4808,7 @@
           <w:numId w:val="1004"/>
         </w:numPr>
       </w:pPr>
-      <w:hyperlink r:id="rId92">
+      <w:hyperlink r:id="rId88">
         <w:r>
           <w:rPr>
             <w:rStyle w:val="Hyperlink"/>
@@ -4839,7 +4825,7 @@
           <w:numId w:val="1004"/>
         </w:numPr>
       </w:pPr>
-      <w:hyperlink r:id="rId93">
+      <w:hyperlink r:id="rId89">
         <w:r>
           <w:rPr>
             <w:rStyle w:val="Hyperlink"/>
@@ -4856,7 +4842,7 @@
           <w:numId w:val="1004"/>
         </w:numPr>
       </w:pPr>
-      <w:hyperlink r:id="rId94">
+      <w:hyperlink r:id="rId90">
         <w:r>
           <w:rPr>
             <w:rStyle w:val="Hyperlink"/>
@@ -4873,7 +4859,7 @@
           <w:numId w:val="1004"/>
         </w:numPr>
       </w:pPr>
-      <w:hyperlink r:id="rId95">
+      <w:hyperlink r:id="rId91">
         <w:r>
           <w:rPr>
             <w:rStyle w:val="Hyperlink"/>
@@ -4890,7 +4876,7 @@
           <w:numId w:val="1004"/>
         </w:numPr>
       </w:pPr>
-      <w:hyperlink r:id="rId96">
+      <w:hyperlink r:id="rId92">
         <w:r>
           <w:rPr>
             <w:rStyle w:val="Hyperlink"/>
@@ -4907,7 +4893,7 @@
           <w:numId w:val="1004"/>
         </w:numPr>
       </w:pPr>
-      <w:hyperlink r:id="rId97">
+      <w:hyperlink r:id="rId93">
         <w:r>
           <w:rPr>
             <w:rStyle w:val="Hyperlink"/>
@@ -4916,8 +4902,8 @@
         </w:r>
       </w:hyperlink>
     </w:p>
-    <w:bookmarkEnd w:id="98"/>
-    <w:bookmarkEnd w:id="99"/>
+    <w:bookmarkEnd w:id="94"/>
+    <w:bookmarkEnd w:id="95"/>
     <w:sectPr>
       <w:footnotePr>
         <w:numRestart w:val="eachSect"/>

</xml_diff>

<commit_message>
Voeg bronoverstijgende analysegeschiktheid toe
</commit_message>
<xml_diff>
--- a/docs/MEIJENDEL_BRONREGISTER.docx
+++ b/docs/MEIJENDEL_BRONREGISTER.docx
@@ -2,7 +2,7 @@
 <file path=word/document.xml><?xml version="1.0" encoding="utf-8"?>
 <w:document xmlns:w="http://schemas.openxmlformats.org/wordprocessingml/2006/main" xmlns:m="http://schemas.openxmlformats.org/officeDocument/2006/math" xmlns:r="http://schemas.openxmlformats.org/officeDocument/2006/relationships" xmlns:o="urn:schemas-microsoft-com:office:office" xmlns:v="urn:schemas-microsoft-com:vml" xmlns:w10="urn:schemas-microsoft-com:office:word" xmlns:a="http://schemas.openxmlformats.org/drawingml/2006/main" xmlns:pic="http://schemas.openxmlformats.org/drawingml/2006/picture" xmlns:wp="http://schemas.openxmlformats.org/drawingml/2006/wordprocessingDrawing">
   <w:body>
-    <w:bookmarkStart w:id="95" w:name="Xdea145a7474320bcc321aebaf5687f9ab4d02fb"/>
+    <w:bookmarkStart w:id="96" w:name="Xdea145a7474320bcc321aebaf5687f9ab4d02fb"/>
     <w:p>
       <w:pPr>
         <w:pStyle w:val="Heading1"/>
@@ -231,9 +231,341 @@
         <w:t xml:space="preserve">opgenomen; hun verschillende analysemogelijkheden blijven per record zichtbaar.</w:t>
       </w:r>
     </w:p>
-    <w:p>
-      <w:pPr>
-        <w:pStyle w:val="FirstParagraph"/>
+    <w:bookmarkEnd w:id="9"/>
+    <w:bookmarkStart w:id="10" w:name="overkoepelende-analysegeschiktheid"/>
+    <w:p>
+      <w:pPr>
+        <w:pStyle w:val="Heading2"/>
+      </w:pPr>
+      <w:r>
+        <w:t xml:space="preserve">Overkoepelende analysegeschiktheid</w:t>
+      </w:r>
+    </w:p>
+    <w:p>
+      <w:pPr>
+        <w:pStyle w:val="FirstParagraph"/>
+      </w:pPr>
+      <w:r>
+        <w:t xml:space="preserve">De database bevat vanaf 26 september 2026 één bronoverstijgende</w:t>
+      </w:r>
+      <w:r>
+        <w:t xml:space="preserve"> </w:t>
+      </w:r>
+      <w:r>
+        <w:t xml:space="preserve">beoordelingslaag. Deze laag kopieert geen waarnemingen. Zij verwijst naar de</w:t>
+      </w:r>
+      <w:r>
+        <w:t xml:space="preserve"> </w:t>
+      </w:r>
+      <w:r>
+        <w:t xml:space="preserve">bestaande brontabellen en legt per gegevensreeks vast welke analyses zijn</w:t>
+      </w:r>
+      <w:r>
+        <w:t xml:space="preserve"> </w:t>
+      </w:r>
+      <w:r>
+        <w:t xml:space="preserve">toegestaan en onder welke voorwaarden.</w:t>
+      </w:r>
+    </w:p>
+    <w:p>
+      <w:pPr>
+        <w:pStyle w:val="BodyText"/>
+      </w:pPr>
+      <w:r>
+        <w:t xml:space="preserve">De vijf vaste analysetypen zijn:</w:t>
+      </w:r>
+    </w:p>
+    <w:p>
+      <w:pPr>
+        <w:pStyle w:val="Compact"/>
+        <w:numPr>
+          <w:ilvl w:val="0"/>
+          <w:numId w:val="1004"/>
+        </w:numPr>
+      </w:pPr>
+      <w:r>
+        <w:rPr>
+          <w:b/>
+          <w:bCs/>
+        </w:rPr>
+        <w:t xml:space="preserve">V</w:t>
+      </w:r>
+      <w:r>
+        <w:t xml:space="preserve">: voorkomen en verspreiding;</w:t>
+      </w:r>
+    </w:p>
+    <w:p>
+      <w:pPr>
+        <w:pStyle w:val="Compact"/>
+        <w:numPr>
+          <w:ilvl w:val="0"/>
+          <w:numId w:val="1004"/>
+        </w:numPr>
+      </w:pPr>
+      <w:r>
+        <w:rPr>
+          <w:b/>
+          <w:bCs/>
+        </w:rPr>
+        <w:t xml:space="preserve">I</w:t>
+      </w:r>
+      <w:r>
+        <w:t xml:space="preserve">: inventarisatie binnen een aantoonbaar onderzocht bezoek, monster of gebied;</w:t>
+      </w:r>
+    </w:p>
+    <w:p>
+      <w:pPr>
+        <w:pStyle w:val="Compact"/>
+        <w:numPr>
+          <w:ilvl w:val="0"/>
+          <w:numId w:val="1004"/>
+        </w:numPr>
+      </w:pPr>
+      <w:r>
+        <w:rPr>
+          <w:b/>
+          <w:bCs/>
+        </w:rPr>
+        <w:t xml:space="preserve">TV</w:t>
+      </w:r>
+      <w:r>
+        <w:t xml:space="preserve">: verandering in verspreiding of bezetting;</w:t>
+      </w:r>
+    </w:p>
+    <w:p>
+      <w:pPr>
+        <w:pStyle w:val="Compact"/>
+        <w:numPr>
+          <w:ilvl w:val="0"/>
+          <w:numId w:val="1004"/>
+        </w:numPr>
+      </w:pPr>
+      <w:r>
+        <w:rPr>
+          <w:b/>
+          <w:bCs/>
+        </w:rPr>
+        <w:t xml:space="preserve">TA</w:t>
+      </w:r>
+      <w:r>
+        <w:t xml:space="preserve">: verandering in aantallen, dichtheid of een aantalsindex; en</w:t>
+      </w:r>
+    </w:p>
+    <w:p>
+      <w:pPr>
+        <w:pStyle w:val="Compact"/>
+        <w:numPr>
+          <w:ilvl w:val="0"/>
+          <w:numId w:val="1004"/>
+        </w:numPr>
+      </w:pPr>
+      <w:r>
+        <w:rPr>
+          <w:b/>
+          <w:bCs/>
+        </w:rPr>
+        <w:t xml:space="preserve">TK</w:t>
+      </w:r>
+      <w:r>
+        <w:t xml:space="preserve">: verandering in een vooraf gedefinieerde ecologische kwaliteitsmaat.</w:t>
+      </w:r>
+    </w:p>
+    <w:p>
+      <w:pPr>
+        <w:pStyle w:val="FirstParagraph"/>
+      </w:pPr>
+      <w:r>
+        <w:t xml:space="preserve">De letter zegt alleen welk soort analyse wordt bedoeld. Zij is geen algemeen</w:t>
+      </w:r>
+      <w:r>
+        <w:t xml:space="preserve"> </w:t>
+      </w:r>
+      <w:r>
+        <w:t xml:space="preserve">kwaliteitsoordeel. Daarom bewaart de catalogus daarnaast afzonderlijk de</w:t>
+      </w:r>
+      <w:r>
+        <w:t xml:space="preserve"> </w:t>
+      </w:r>
+      <w:r>
+        <w:t xml:space="preserve">ruimtelijke kwaliteit, bezoekstructuur, beschikbaarheid van nulwaarnemingen,</w:t>
+      </w:r>
+      <w:r>
+        <w:t xml:space="preserve"> </w:t>
+      </w:r>
+      <w:r>
+        <w:t xml:space="preserve">methode-informatie, validatiestatus en beveiliging. Per analysetype luidt het</w:t>
+      </w:r>
+      <w:r>
+        <w:t xml:space="preserve"> </w:t>
+      </w:r>
+      <w:r>
+        <w:t xml:space="preserve">besluit</w:t>
+      </w:r>
+      <w:r>
+        <w:t xml:space="preserve"> </w:t>
+      </w:r>
+      <w:r>
+        <w:rPr>
+          <w:rStyle w:val="VerbatimChar"/>
+        </w:rPr>
+        <w:t xml:space="preserve">toegelaten</w:t>
+      </w:r>
+      <w:r>
+        <w:t xml:space="preserve">,</w:t>
+      </w:r>
+      <w:r>
+        <w:t xml:space="preserve"> </w:t>
+      </w:r>
+      <w:r>
+        <w:rPr>
+          <w:rStyle w:val="VerbatimChar"/>
+        </w:rPr>
+        <w:t xml:space="preserve">voorlopig_toegelaten</w:t>
+      </w:r>
+      <w:r>
+        <w:t xml:space="preserve">,</w:t>
+      </w:r>
+      <w:r>
+        <w:t xml:space="preserve"> </w:t>
+      </w:r>
+      <w:r>
+        <w:rPr>
+          <w:rStyle w:val="VerbatimChar"/>
+        </w:rPr>
+        <w:t xml:space="preserve">alleen_context</w:t>
+      </w:r>
+      <w:r>
+        <w:t xml:space="preserve"> </w:t>
+      </w:r>
+      <w:r>
+        <w:t xml:space="preserve">of</w:t>
+      </w:r>
+      <w:r>
+        <w:t xml:space="preserve"> </w:t>
+      </w:r>
+      <w:r>
+        <w:rPr>
+          <w:rStyle w:val="VerbatimChar"/>
+        </w:rPr>
+        <w:t xml:space="preserve">niet_toegelaten</w:t>
+      </w:r>
+      <w:r>
+        <w:t xml:space="preserve">, steeds met een concrete voorwaarde en kwaliteitsmelding.</w:t>
+      </w:r>
+    </w:p>
+    <w:p>
+      <w:pPr>
+        <w:pStyle w:val="BodyText"/>
+      </w:pPr>
+      <w:r>
+        <w:t xml:space="preserve">De tabellen</w:t>
+      </w:r>
+      <w:r>
+        <w:t xml:space="preserve"> </w:t>
+      </w:r>
+      <w:r>
+        <w:rPr>
+          <w:rStyle w:val="VerbatimChar"/>
+        </w:rPr>
+        <w:t xml:space="preserve">analyse_datareeks</w:t>
+      </w:r>
+      <w:r>
+        <w:t xml:space="preserve"> </w:t>
+      </w:r>
+      <w:r>
+        <w:t xml:space="preserve">en</w:t>
+      </w:r>
+      <w:r>
+        <w:t xml:space="preserve"> </w:t>
+      </w:r>
+      <w:r>
+        <w:rPr>
+          <w:rStyle w:val="VerbatimChar"/>
+        </w:rPr>
+        <w:t xml:space="preserve">analyse_datareeks_geschiktheid</w:t>
+      </w:r>
+      <w:r>
+        <w:t xml:space="preserve"> </w:t>
+      </w:r>
+      <w:r>
+        <w:t xml:space="preserve">bevatten de</w:t>
+      </w:r>
+      <w:r>
+        <w:t xml:space="preserve"> </w:t>
+      </w:r>
+      <w:r>
+        <w:t xml:space="preserve">beoordeling op reeksniveau. Alleen records die daarvan afwijken komen in</w:t>
+      </w:r>
+      <w:r>
+        <w:t xml:space="preserve"> </w:t>
+      </w:r>
+      <w:r>
+        <w:rPr>
+          <w:rStyle w:val="VerbatimChar"/>
+        </w:rPr>
+        <w:t xml:space="preserve">analyse_recorduitzondering</w:t>
+      </w:r>
+      <w:r>
+        <w:t xml:space="preserve">. De view</w:t>
+      </w:r>
+      <w:r>
+        <w:t xml:space="preserve"> </w:t>
+      </w:r>
+      <w:r>
+        <w:rPr>
+          <w:rStyle w:val="VerbatimChar"/>
+        </w:rPr>
+        <w:t xml:space="preserve">v_analyse_catalogus</w:t>
+      </w:r>
+      <w:r>
+        <w:t xml:space="preserve"> </w:t>
+      </w:r>
+      <w:r>
+        <w:t xml:space="preserve">is de volledige</w:t>
+      </w:r>
+      <w:r>
+        <w:t xml:space="preserve"> </w:t>
+      </w:r>
+      <w:r>
+        <w:t xml:space="preserve">ingang;</w:t>
+      </w:r>
+      <w:r>
+        <w:t xml:space="preserve"> </w:t>
+      </w:r>
+      <w:r>
+        <w:rPr>
+          <w:rStyle w:val="VerbatimChar"/>
+        </w:rPr>
+        <w:t xml:space="preserve">v_analyse_selectieadvies</w:t>
+      </w:r>
+      <w:r>
+        <w:t xml:space="preserve"> </w:t>
+      </w:r>
+      <w:r>
+        <w:t xml:space="preserve">geeft het compacte overzicht per reeks en</w:t>
+      </w:r>
+      <w:r>
+        <w:t xml:space="preserve"> </w:t>
+      </w:r>
+      <w:r>
+        <w:t xml:space="preserve">analysetype. Voor NDFF wordt de bestaande actuele v4-classificatie rechtstreeks</w:t>
+      </w:r>
+      <w:r>
+        <w:t xml:space="preserve"> </w:t>
+      </w:r>
+      <w:r>
+        <w:t xml:space="preserve">in deze view getoond. De 1.040 NDFF-protocolbesluiten worden dus niet opnieuw</w:t>
+      </w:r>
+      <w:r>
+        <w:t xml:space="preserve"> </w:t>
+      </w:r>
+      <w:r>
+        <w:t xml:space="preserve">opgeslagen.</w:t>
+      </w:r>
+    </w:p>
+    <w:p>
+      <w:pPr>
+        <w:pStyle w:val="BodyText"/>
       </w:pPr>
       <w:r>
         <w:t xml:space="preserve">Met</w:t>
@@ -255,8 +587,8 @@
         <w:t xml:space="preserve">wordt hieronder de primaire bronorganisatie of uitgever bedoeld voor zover die nu bekend is. Het is geen afzonderlijke uitspraak over juridisch eigendom of auteursrecht.</w:t>
       </w:r>
     </w:p>
-    <w:bookmarkEnd w:id="9"/>
-    <w:bookmarkStart w:id="10" w:name="beheerregel"/>
+    <w:bookmarkEnd w:id="10"/>
+    <w:bookmarkStart w:id="11" w:name="beheerregel"/>
     <w:p>
       <w:pPr>
         <w:pStyle w:val="Heading2"/>
@@ -273,8 +605,8 @@
         <w:t xml:space="preserve">Iedere ontdekking, levering, import, verplaatsing, uitsluiting of nieuwe beoordeling van een Meijendel-gegevensbron wordt in dit document verwerkt. Dat geldt ook wanneer eigenaar, omvang, periode, locatiekwaliteit, rechten, overlap, validatiestatus of statistische bruikbaarheid verandert. Daarbij worden steeds de analytische database MySQL Meijendel, de MySQL contextdatabase Meijendel_bronnen en de kandidaatbronnen gezamenlijk gecontroleerd. De Markdown-versie is leidend; de Wordversie wordt in dezelfde wijziging inhoudelijk gelijkgetrokken, gerenderd en gecontroleerd.</w:t>
       </w:r>
     </w:p>
-    <w:bookmarkEnd w:id="10"/>
-    <w:bookmarkStart w:id="49" w:name="bronnen-in-mysql-database-meijendel"/>
+    <w:bookmarkEnd w:id="11"/>
+    <w:bookmarkStart w:id="50" w:name="Xc07dfd40f027bce65d2d0499dc5da8ab7f6fd0f"/>
     <w:p>
       <w:pPr>
         <w:pStyle w:val="Heading2"/>
@@ -292,7 +624,7 @@
         <w:t xml:space="preserve">Meijendel</w:t>
       </w:r>
     </w:p>
-    <w:bookmarkStart w:id="11" w:name="Xccd8cb4345e3f59364194a2576f706cc2c0a66e"/>
+    <w:bookmarkStart w:id="12" w:name="X32ab8fbd5be08d3f325e2553cd15813ff7e9c1f"/>
     <w:p>
       <w:pPr>
         <w:pStyle w:val="Heading3"/>
@@ -373,8 +705,8 @@
         <w:t xml:space="preserve">Analyseklaar en primaire bron.</w:t>
       </w:r>
     </w:p>
-    <w:bookmarkEnd w:id="11"/>
-    <w:bookmarkStart w:id="12" w:name="provinciale-permanente-kwadraten"/>
+    <w:bookmarkEnd w:id="12"/>
+    <w:bookmarkStart w:id="13" w:name="X9645acbfea6b379f23d12aeedc36c987000825a"/>
     <w:p>
       <w:pPr>
         <w:pStyle w:val="Heading3"/>
@@ -455,8 +787,8 @@
         <w:t xml:space="preserve">Analyseklaar en primaire bron.</w:t>
       </w:r>
     </w:p>
-    <w:bookmarkEnd w:id="12"/>
-    <w:bookmarkStart w:id="13" w:name="Xded6c184b9a569c146345b6e935b052f391caf7"/>
+    <w:bookmarkEnd w:id="13"/>
+    <w:bookmarkStart w:id="14" w:name="X58edaa7a0159e378417d8d9e2f3abf27d746f4f"/>
     <w:p>
       <w:pPr>
         <w:pStyle w:val="Heading3"/>
@@ -537,8 +869,8 @@
         <w:t xml:space="preserve">Analyseklaar binnen deze afbakening; de primaire SOVON-bron gaat voor eventuele overeenkomstige NDFF-regels.</w:t>
       </w:r>
     </w:p>
-    <w:bookmarkEnd w:id="13"/>
-    <w:bookmarkStart w:id="15" w:name="historisch-vangblikonderzoek"/>
+    <w:bookmarkEnd w:id="14"/>
+    <w:bookmarkStart w:id="16" w:name="Xd3fb9a25da94fa35cd3895c324ae264efa6b6ce"/>
     <w:p>
       <w:pPr>
         <w:pStyle w:val="Heading3"/>
@@ -601,7 +933,7 @@
       <w:r>
         <w:t xml:space="preserve"> </w:t>
       </w:r>
-      <w:hyperlink r:id="rId14">
+      <w:hyperlink r:id="rId15">
         <w:r>
           <w:rPr>
             <w:rStyle w:val="Hyperlink"/>
@@ -649,8 +981,8 @@
         <w:t xml:space="preserve">Analyseklaar binnen de historische onderzoeksopzet.</w:t>
       </w:r>
     </w:p>
-    <w:bookmarkEnd w:id="15"/>
-    <w:bookmarkStart w:id="33" w:name="X003d1b4454050d8b2300662d18ee0e6097f4328"/>
+    <w:bookmarkEnd w:id="16"/>
+    <w:bookmarkStart w:id="34" w:name="X05a7f9ed9696b113895f0c60145ad70b98b3ccf"/>
     <w:p>
       <w:pPr>
         <w:pStyle w:val="Heading3"/>
@@ -731,7 +1063,7 @@
         <w:t xml:space="preserve">Voorwaardelijk bruikbaar. De bronorganisaties zijn aangeschreven met het verzoek de aanvullende metadata te leveren.</w:t>
       </w:r>
     </w:p>
-    <w:bookmarkStart w:id="16" w:name="dagvlinders"/>
+    <w:bookmarkStart w:id="17" w:name="Xf2f5e1637d9b0d825d88db49318fbe09fe4562d"/>
     <w:p>
       <w:pPr>
         <w:pStyle w:val="Heading4"/>
@@ -794,8 +1126,8 @@
         <w:t xml:space="preserve">Oorspronkelijke route- en bezoekcodes, complete bezoeken, gevolgde modules en tellingen zonder waarneming</w:t>
       </w:r>
     </w:p>
-    <w:bookmarkEnd w:id="16"/>
-    <w:bookmarkStart w:id="17" w:name="hommels"/>
+    <w:bookmarkEnd w:id="17"/>
+    <w:bookmarkStart w:id="18" w:name="Xab588a339567fbeba82f7ca9f0ef20022ceaf38"/>
     <w:p>
       <w:pPr>
         <w:pStyle w:val="Heading4"/>
@@ -858,8 +1190,8 @@
         <w:t xml:space="preserve">Bevestiging dat hommels systematisch zijn geteld en op welk determinatieniveau</w:t>
       </w:r>
     </w:p>
-    <w:bookmarkEnd w:id="17"/>
-    <w:bookmarkStart w:id="18" w:name="libellen"/>
+    <w:bookmarkEnd w:id="18"/>
+    <w:bookmarkStart w:id="19" w:name="X5eeebc0b3ea39369efcb9361b685b51ab379390"/>
     <w:p>
       <w:pPr>
         <w:pStyle w:val="Heading4"/>
@@ -922,8 +1254,8 @@
         <w:t xml:space="preserve">Oorspronkelijke route- en bezoekstructuur en volledige doelsoortenlijst</w:t>
       </w:r>
     </w:p>
-    <w:bookmarkEnd w:id="18"/>
-    <w:bookmarkStart w:id="19" w:name="nachtvlinders"/>
+    <w:bookmarkEnd w:id="19"/>
+    <w:bookmarkStart w:id="20" w:name="Xf7f75bff85528639d3a54437d815ffc982ac078"/>
     <w:p>
       <w:pPr>
         <w:pStyle w:val="Heading4"/>
@@ -986,8 +1318,8 @@
         <w:t xml:space="preserve">Afzonderlijke vangnachten, telpunt, val, lamp, brandduur en lege vangnachten</w:t>
       </w:r>
     </w:p>
-    <w:bookmarkEnd w:id="19"/>
-    <w:bookmarkStart w:id="20" w:name="amfibieën"/>
+    <w:bookmarkEnd w:id="20"/>
+    <w:bookmarkStart w:id="21" w:name="X5952ec78f96e716985cfd2bef0c6dea751da098"/>
     <w:p>
       <w:pPr>
         <w:pStyle w:val="Heading4"/>
@@ -1050,8 +1382,8 @@
         <w:t xml:space="preserve">Oorspronkelijke water- en bezoekcodes, zoekmethode en volledige-lijststatus</w:t>
       </w:r>
     </w:p>
-    <w:bookmarkEnd w:id="20"/>
-    <w:bookmarkStart w:id="21" w:name="reptielen"/>
+    <w:bookmarkEnd w:id="21"/>
+    <w:bookmarkStart w:id="22" w:name="Xf98973ac0b4b22a8147264cf6fda7ae2d1f2584"/>
     <w:p>
       <w:pPr>
         <w:pStyle w:val="Heading4"/>
@@ -1114,8 +1446,8 @@
         <w:t xml:space="preserve">Ontbrekende bezoeken en volledige routeadministratie</w:t>
       </w:r>
     </w:p>
-    <w:bookmarkEnd w:id="21"/>
-    <w:bookmarkStart w:id="22" w:name="vissen"/>
+    <w:bookmarkEnd w:id="22"/>
+    <w:bookmarkStart w:id="23" w:name="X9ffbbed58a474302bc88f9b6483937563542adc"/>
     <w:p>
       <w:pPr>
         <w:pStyle w:val="Heading4"/>
@@ -1178,8 +1510,8 @@
         <w:t xml:space="preserve">Te weinig bezoeken en geen volledige meetstructuur voor een lokale trend</w:t>
       </w:r>
     </w:p>
-    <w:bookmarkEnd w:id="22"/>
-    <w:bookmarkStart w:id="23" w:name="vleermuistransecten"/>
+    <w:bookmarkEnd w:id="23"/>
+    <w:bookmarkStart w:id="24" w:name="X90b1412457ba2ad39675de54e16fb4052a9af96"/>
     <w:p>
       <w:pPr>
         <w:pStyle w:val="Heading4"/>
@@ -1242,8 +1574,8 @@
         <w:t xml:space="preserve">Oorspronkelijke routes, secties, bezoeken en volledige resultaten</w:t>
       </w:r>
     </w:p>
-    <w:bookmarkEnd w:id="23"/>
-    <w:bookmarkStart w:id="24" w:name="konijnentellingen-in-de-duinen"/>
+    <w:bookmarkEnd w:id="24"/>
+    <w:bookmarkStart w:id="25" w:name="X0bf7c6d2026ffa63b6182a76ed7ab201ef2ca1a"/>
     <w:p>
       <w:pPr>
         <w:pStyle w:val="Heading4"/>
@@ -1306,8 +1638,8 @@
         <w:t xml:space="preserve">Eerst overlap met de primaire SOVON- en VWG-reeks oplossen</w:t>
       </w:r>
     </w:p>
-    <w:bookmarkEnd w:id="24"/>
-    <w:bookmarkStart w:id="25" w:name="wintertellingen-vleermuizen"/>
+    <w:bookmarkEnd w:id="25"/>
+    <w:bookmarkStart w:id="26" w:name="Xd64910a2091f56dedd2aaa5a75994d38ec4c969"/>
     <w:p>
       <w:pPr>
         <w:pStyle w:val="Heading4"/>
@@ -1370,8 +1702,8 @@
         <w:t xml:space="preserve">Vaste object- en bezoekcodes en volledige tellingen</w:t>
       </w:r>
     </w:p>
-    <w:bookmarkEnd w:id="25"/>
-    <w:bookmarkStart w:id="26" w:name="het-nieuwe-strepen"/>
+    <w:bookmarkEnd w:id="26"/>
+    <w:bookmarkStart w:id="27" w:name="X9cec44656db08bd57f600992eaa74a526d260b3"/>
     <w:p>
       <w:pPr>
         <w:pStyle w:val="Heading4"/>
@@ -1434,8 +1766,8 @@
         <w:t xml:space="preserve">Oorspronkelijke lijstcodes en bevestiging welke tellingen onafhankelijk zijn</w:t>
       </w:r>
     </w:p>
-    <w:bookmarkEnd w:id="26"/>
-    <w:bookmarkStart w:id="27" w:name="Xadd682eaf9770b54759a1b54720dedd522bc07f"/>
+    <w:bookmarkEnd w:id="27"/>
+    <w:bookmarkStart w:id="28" w:name="Xc056d2025de29c95bc511421c5f5e41469354eb"/>
     <w:p>
       <w:pPr>
         <w:pStyle w:val="Heading4"/>
@@ -1498,8 +1830,8 @@
         <w:t xml:space="preserve">Oorspronkelijke lijsten, onderzochte gebieden en volledige bezoekstructuur</w:t>
       </w:r>
     </w:p>
-    <w:bookmarkEnd w:id="27"/>
-    <w:bookmarkStart w:id="28" w:name="lmf-aandachtssoorten"/>
+    <w:bookmarkEnd w:id="28"/>
+    <w:bookmarkStart w:id="29" w:name="Xb2fbeb28e0a334b9e6cb93232c4d845faf48221"/>
     <w:p>
       <w:pPr>
         <w:pStyle w:val="Heading4"/>
@@ -1562,8 +1894,8 @@
         <w:t xml:space="preserve">Oorspronkelijke routes, bezoeken en gevolgde soortenlijst</w:t>
       </w:r>
     </w:p>
-    <w:bookmarkEnd w:id="28"/>
-    <w:bookmarkStart w:id="29" w:name="mossen-en-korstmossen"/>
+    <w:bookmarkEnd w:id="29"/>
+    <w:bookmarkStart w:id="30" w:name="X0ce2ec4e8b5503e251897e5490450ca2d9e0742"/>
     <w:p>
       <w:pPr>
         <w:pStyle w:val="Heading4"/>
@@ -1626,8 +1958,8 @@
         <w:t xml:space="preserve">Oorspronkelijke proefvlak-, lijst- en waarnemersgegevens</w:t>
       </w:r>
     </w:p>
-    <w:bookmarkEnd w:id="29"/>
-    <w:bookmarkStart w:id="30" w:name="bos--en-zeereeppaddenstoelen"/>
+    <w:bookmarkEnd w:id="30"/>
+    <w:bookmarkStart w:id="31" w:name="X339fafe251367982d6218746f16721a93fa7f70"/>
     <w:p>
       <w:pPr>
         <w:pStyle w:val="Heading4"/>
@@ -1690,8 +2022,8 @@
         <w:t xml:space="preserve">Volledige bezoeken en het per teller gevolgde soortenbereik; geen vruchtlichaam is bovendien niet hetzelfde als geen mycelium</w:t>
       </w:r>
     </w:p>
-    <w:bookmarkEnd w:id="30"/>
-    <w:bookmarkStart w:id="31" w:name="weekdieren"/>
+    <w:bookmarkEnd w:id="31"/>
+    <w:bookmarkStart w:id="32" w:name="X342bae7ae5afae546f17223888206446d449411"/>
     <w:p>
       <w:pPr>
         <w:pStyle w:val="Heading4"/>
@@ -1754,8 +2086,8 @@
         <w:t xml:space="preserve">Locatie-, monster- en bezoekcodes om systematische tellingen van losse meldingen te scheiden</w:t>
       </w:r>
     </w:p>
-    <w:bookmarkEnd w:id="31"/>
-    <w:bookmarkStart w:id="32" w:name="snl-gebiedsmonitoring"/>
+    <w:bookmarkEnd w:id="32"/>
+    <w:bookmarkStart w:id="33" w:name="Xcc11e4dda0fa9b87cf2613be17ff277804bdc91"/>
     <w:p>
       <w:pPr>
         <w:pStyle w:val="Heading4"/>
@@ -1826,9 +2158,9 @@
         <w:t xml:space="preserve">De overige NDFF-regels zijn losse of uitsluitend positieve registraties. Zij blijven nuttig voor verspreiding, maar ontbreken mag daar nooit als afwezigheid worden uitgelegd.</w:t>
       </w:r>
     </w:p>
-    <w:bookmarkEnd w:id="32"/>
     <w:bookmarkEnd w:id="33"/>
-    <w:bookmarkStart w:id="41" w:name="openbare-externe-ecologiebronnen"/>
+    <w:bookmarkEnd w:id="34"/>
+    <w:bookmarkStart w:id="42" w:name="X77733873953f7250a44afc39ac6f33e9c0fface"/>
     <w:p>
       <w:pPr>
         <w:pStyle w:val="Heading3"/>
@@ -1855,7 +2187,7 @@
       <w:r>
         <w:t xml:space="preserve"> </w:t>
       </w:r>
-      <w:hyperlink r:id="rId34">
+      <w:hyperlink r:id="rId35">
         <w:r>
           <w:rPr>
             <w:rStyle w:val="Hyperlink"/>
@@ -1894,7 +2226,7 @@
         <w:t xml:space="preserve">.</w:t>
       </w:r>
     </w:p>
-    <w:bookmarkStart w:id="35" w:name="stowa-limnodata"/>
+    <w:bookmarkStart w:id="36" w:name="Xaa03dabe850e534118471d9a4587f103d7cc6d0"/>
     <w:p>
       <w:pPr>
         <w:pStyle w:val="Heading4"/>
@@ -1981,8 +2313,8 @@
         <w:t xml:space="preserve">, 196 als Braun-Blanquetklasse en 56 zonder eenheid. Niet gemelde soorten zijn geen nulwaarneming.</w:t>
       </w:r>
     </w:p>
-    <w:bookmarkEnd w:id="35"/>
-    <w:bookmarkStart w:id="36" w:name="endure-helmduinfauna"/>
+    <w:bookmarkEnd w:id="36"/>
+    <w:bookmarkStart w:id="37" w:name="Xe9b446960bca12075cdde30af1cbaf73f645a87"/>
     <w:p>
       <w:pPr>
         <w:pStyle w:val="Heading4"/>
@@ -2045,8 +2377,8 @@
         <w:t xml:space="preserve">Dit is een gestandaardiseerde en herhaalbare referentiemeting voor ongewervelden in witte duinen. De expliciete afwezigheden zijn bruikbaar binnen de veertien complete matrices. Eén meetjaar levert geen ontwikkeling door de tijd op.</w:t>
       </w:r>
     </w:p>
-    <w:bookmarkEnd w:id="36"/>
-    <w:bookmarkStart w:id="37" w:name="landelijke-vegetatie-databank"/>
+    <w:bookmarkEnd w:id="37"/>
+    <w:bookmarkStart w:id="38" w:name="X0079604d46da30ac9b5828c2b6c106eff7cd8f8"/>
     <w:p>
       <w:pPr>
         <w:pStyle w:val="Heading4"/>
@@ -2109,8 +2441,8 @@
         <w:t xml:space="preserve">De controle op datum, taxon en afstand markeert 8.006 resultaten als exacte en 5.163 als waarschijnlijke overlap met de primaire provinciale PQ-reeks. Deze 13.169 resultaten tellen niet als onafhankelijke tweede waarneming. Daarnaast hebben 51.078 LVD-resultaten een mogelijke overeenkomst met een NDFF-regel op taxon, datum en onzekerheidspolygoon. Omdat NDFF geen gedeelde bron-ID levert en de polygonen ruimtelijke onzekerheid weergeven, wordt die mogelijke overlap niet automatisch als dubbel verwijderd. De resterende opnamecontext is bruikbaar voor historische vegetatiesamenstelling en verspreiding; vergelijking door de tijd vereist controle van opnametype, oppervlak en herhaling.</w:t>
       </w:r>
     </w:p>
-    <w:bookmarkEnd w:id="37"/>
-    <w:bookmarkStart w:id="38" w:name="historische-vlinder--en-motcollectie"/>
+    <w:bookmarkEnd w:id="38"/>
+    <w:bookmarkStart w:id="39" w:name="Xa66e2be297c2cf82b37e3e4b59e101c55a2b789"/>
     <w:p>
       <w:pPr>
         <w:pStyle w:val="Heading4"/>
@@ -2173,8 +2505,8 @@
         <w:t xml:space="preserve">De collectie geeft controleerbare historische aanwezigheid, vooral door de intensieve vangsten van J.A.W. Lucas in 1955–1956. Zonder vanginspanning en lege vangnachten is dit geen populatietrend. De mogelijke NDFF-overlap blijft gemarkeerd en wordt niet automatisch samengevoegd.</w:t>
       </w:r>
     </w:p>
-    <w:bookmarkEnd w:id="38"/>
-    <w:bookmarkStart w:id="39" w:name="naturalis-botany"/>
+    <w:bookmarkEnd w:id="39"/>
+    <w:bookmarkStart w:id="40" w:name="X0623f0a4d9ecb153e84d6aa679ad58f6c310383"/>
     <w:p>
       <w:pPr>
         <w:pStyle w:val="Heading4"/>
@@ -2237,8 +2569,8 @@
         <w:t xml:space="preserve">Gedateerde historische plantenvondsten met bewaard bewijsmateriaal. De records tonen aanwezigheid, geen gestandaardiseerde telinspanning of afwezigheid.</w:t>
       </w:r>
     </w:p>
-    <w:bookmarkEnd w:id="39"/>
-    <w:bookmarkStart w:id="40" w:name="naturalis-coleoptera"/>
+    <w:bookmarkEnd w:id="40"/>
+    <w:bookmarkStart w:id="41" w:name="Xdd278617f9613de433492781e9679e24605d2f3"/>
     <w:p>
       <w:pPr>
         <w:pStyle w:val="Heading4"/>
@@ -2301,9 +2633,9 @@
         <w:t xml:space="preserve">Historische aanwezigheid van kevers met bewaard collectiemateriaal. De bron ondersteunt geen populatietrend zonder gestandaardiseerde vanginspanning. De oorspronkelijke etiketplaats en de gepubliceerde locatie-onzekerheid blijven per specimen beschikbaar.</w:t>
       </w:r>
     </w:p>
-    <w:bookmarkEnd w:id="40"/>
     <w:bookmarkEnd w:id="41"/>
-    <w:bookmarkStart w:id="42" w:name="X5d611a31ac68a696fd179c2c85c282500afefc7"/>
+    <w:bookmarkEnd w:id="42"/>
+    <w:bookmarkStart w:id="43" w:name="X4dcded00268e6461b0ddc34253d4faf52bf1dd1"/>
     <w:p>
       <w:pPr>
         <w:pStyle w:val="Heading3"/>
@@ -2340,8 +2672,8 @@
         <w:t xml:space="preserve">Deze records blijven herkenbaar als bronmateriaal, maar worden niet zonder een afzonderlijk ruimtelijk besluit in Meijendelanalyses gebruikt. Alle 37.770 vangblikevents en alle territoriumplots liggen binnen het basisgebied.</w:t>
       </w:r>
     </w:p>
-    <w:bookmarkEnd w:id="42"/>
-    <w:bookmarkStart w:id="48" w:name="verklarende-omgevingslagen"/>
+    <w:bookmarkEnd w:id="43"/>
+    <w:bookmarkStart w:id="49" w:name="X14c58f11b78e283997281ebde92c6b31ebc0c80"/>
     <w:p>
       <w:pPr>
         <w:pStyle w:val="Heading3"/>
@@ -2358,7 +2690,7 @@
         <w:t xml:space="preserve">Deze gegevens zijn geen soortenwaarnemingen. Zij kunnen wel helpen om ecologische veranderingen te beschrijven of als mogelijke verklaring te toetsen.</w:t>
       </w:r>
     </w:p>
-    <w:bookmarkStart w:id="43" w:name="dagelijks-weer"/>
+    <w:bookmarkStart w:id="44" w:name="X97e37a83ef92e6db79e0a815abf4c3d8d6d1754"/>
     <w:p>
       <w:pPr>
         <w:pStyle w:val="Heading4"/>
@@ -2421,8 +2753,8 @@
         <w:t xml:space="preserve">Temperatuur, neerslag, wind, zon en luchtdruk kunnen als covariaten worden gebruikt. Alleen de genormaliseerde analyseview is geldig; 2026 is nog niet compleet.</w:t>
       </w:r>
     </w:p>
-    <w:bookmarkEnd w:id="43"/>
-    <w:bookmarkStart w:id="44" w:name="hoogte"/>
+    <w:bookmarkEnd w:id="44"/>
+    <w:bookmarkStart w:id="45" w:name="X625608f018b59d28869e33232003bd07c2f07d5"/>
     <w:p>
       <w:pPr>
         <w:pStyle w:val="Heading4"/>
@@ -2485,8 +2817,8 @@
         <w:t xml:space="preserve">Beschrijft hoogte en hoogtevariatie per plot. Eén peiljaar geeft geen ontwikkeling door de tijd.</w:t>
       </w:r>
     </w:p>
-    <w:bookmarkEnd w:id="44"/>
-    <w:bookmarkStart w:id="45" w:name="stikstofdepositie"/>
+    <w:bookmarkEnd w:id="45"/>
+    <w:bookmarkStart w:id="46" w:name="X8ebc62c1d17a2d7a08504bddffeeb5916a0bcb3"/>
     <w:p>
       <w:pPr>
         <w:pStyle w:val="Heading4"/>
@@ -2549,8 +2881,8 @@
         <w:t xml:space="preserve">Geschikt als mogelijke verklarende factor naast soorten- en vegetatiereeksen. Een samenhang bewijst niet dat stikstof de enige oorzaak is.</w:t>
       </w:r>
     </w:p>
-    <w:bookmarkEnd w:id="45"/>
-    <w:bookmarkStart w:id="46" w:name="bodemgebruik"/>
+    <w:bookmarkEnd w:id="46"/>
+    <w:bookmarkStart w:id="47" w:name="X972156668716d33d6f7bf93cdaf573c7928edca"/>
     <w:p>
       <w:pPr>
         <w:pStyle w:val="Heading4"/>
@@ -2613,8 +2945,8 @@
         <w:t xml:space="preserve">Laat veranderingen in de ruimtelijke omgeving van plots zien. De meetjaren zijn niet jaarlijks beschikbaar.</w:t>
       </w:r>
     </w:p>
-    <w:bookmarkEnd w:id="46"/>
-    <w:bookmarkStart w:id="47" w:name="natura-2000-habitat"/>
+    <w:bookmarkEnd w:id="47"/>
+    <w:bookmarkStart w:id="48" w:name="X92770fc640c1bb2fd0ffeda71d68ce2650b46be"/>
     <w:p>
       <w:pPr>
         <w:pStyle w:val="Heading4"/>
@@ -2677,10 +3009,10 @@
         <w:t xml:space="preserve">Geeft de verdeling van habitattypen binnen plots. Dit is één kaartjaar; de aangekondigde T1-kaart is nodig voor een directe vergelijking door de tijd.</w:t>
       </w:r>
     </w:p>
-    <w:bookmarkEnd w:id="47"/>
     <w:bookmarkEnd w:id="48"/>
     <w:bookmarkEnd w:id="49"/>
-    <w:bookmarkStart w:id="57" w:name="X3b532014da7425692b0b753bfd67f02e729afe2"/>
+    <w:bookmarkEnd w:id="50"/>
+    <w:bookmarkStart w:id="58" w:name="X692b0a71312b2a939db271d079fb23757bfc15a"/>
     <w:p>
       <w:pPr>
         <w:pStyle w:val="Heading2"/>
@@ -2721,7 +3053,7 @@
         <w:t xml:space="preserve">gebruikt. De nieuwe bijen- en aquatische context uit fase 2 staat op 26 september 2026 alleen in de lokale canonieke database en is nog niet naar de VPS gepubliceerd.</w:t>
       </w:r>
     </w:p>
-    <w:bookmarkStart w:id="51" w:name="duinvalleivegetatie"/>
+    <w:bookmarkStart w:id="52" w:name="X7ae3f60e8dd3c65bdde3d5f608a55d96632a876"/>
     <w:p>
       <w:pPr>
         <w:pStyle w:val="Heading3"/>
@@ -2750,7 +3082,7 @@
       <w:r>
         <w:t xml:space="preserve"> </w:t>
       </w:r>
-      <w:hyperlink r:id="rId50">
+      <w:hyperlink r:id="rId51">
         <w:r>
           <w:rPr>
             <w:rStyle w:val="Hyperlink"/>
@@ -2795,8 +3127,8 @@
         <w:t xml:space="preserve">De volledige matrix van 208 taxa bevat echte nullen en maakt vergelijking tussen de drie jaren mogelijk. De locatiecodes zijn nog niet betrouwbaar aan geometrieën gekoppeld. Opname 18I01 blijft uitgesloten: daarin zijn 159 taxa geregistreerd, tegenover maximaal 40 in alle overige opnamen. Deze reeks blijft afzonderlijk van de provinciale PQ-reeks.</w:t>
       </w:r>
     </w:p>
-    <w:bookmarkEnd w:id="51"/>
-    <w:bookmarkStart w:id="52" w:name="vogelstand-1924"/>
+    <w:bookmarkEnd w:id="52"/>
+    <w:bookmarkStart w:id="53" w:name="X6cd5cd3671e295c222d5bd4a47757f0a76f0a19"/>
     <w:p>
       <w:pPr>
         <w:pStyle w:val="Heading3"/>
@@ -2859,8 +3191,8 @@
         <w:t xml:space="preserve">Historische vogelcontext. Zonder locatie per regel geen kavel- of ruimtelijke analyse.</w:t>
       </w:r>
     </w:p>
-    <w:bookmarkEnd w:id="52"/>
-    <w:bookmarkStart w:id="53" w:name="jachtspinnen"/>
+    <w:bookmarkEnd w:id="53"/>
+    <w:bookmarkStart w:id="54" w:name="Xb3fdc40884db1bbf06132e666e117a731445140"/>
     <w:p>
       <w:pPr>
         <w:pStyle w:val="Heading3"/>
@@ -2923,8 +3255,8 @@
         <w:t xml:space="preserve">De samengevoegde vangstmatrix ondersteunt een soorten-milieuanalyse, maar geen ontwikkeling door de tijd. Datums en vangrondes ontbreken. De 28 locatienummers zijn bovendien nog niet naar werkelijke plaatsen te vertalen en mogen daarom niet als Meijendelwaarnemingen worden geanalyseerd.</w:t>
       </w:r>
     </w:p>
-    <w:bookmarkEnd w:id="53"/>
-    <w:bookmarkStart w:id="54" w:name="literatuuroverzicht"/>
+    <w:bookmarkEnd w:id="54"/>
+    <w:bookmarkStart w:id="55" w:name="X7c2c13aacf0ea926ee35ca97ab69391a3624a6f"/>
     <w:p>
       <w:pPr>
         <w:pStyle w:val="Heading3"/>
@@ -2987,8 +3319,8 @@
         <w:t xml:space="preserve">Zoekingang naar onderzoek en historische context. Dit zijn verwijzingen, geen waarnemingsregels; volledige teksten blijven in Zotero en worden niet op de VPS gekopieerd.</w:t>
       </w:r>
     </w:p>
-    <w:bookmarkEnd w:id="54"/>
-    <w:bookmarkStart w:id="55" w:name="bijenmonitoring-in-vier-beheergebieden"/>
+    <w:bookmarkEnd w:id="55"/>
+    <w:bookmarkStart w:id="56" w:name="X4a1f2475629c7656191227e4ca81566bef187e2"/>
     <w:p>
       <w:pPr>
         <w:pStyle w:val="Heading3"/>
@@ -3063,8 +3395,8 @@
         <w:t xml:space="preserve">. Drie onderzoeksjaren zijn bovendien een reeks van gestandaardiseerde herhalingen, geen robuuste langjarige trend.</w:t>
       </w:r>
     </w:p>
-    <w:bookmarkEnd w:id="55"/>
-    <w:bookmarkStart w:id="56" w:name="aquatische-macrofauna-19741975"/>
+    <w:bookmarkEnd w:id="56"/>
+    <w:bookmarkStart w:id="57" w:name="Xbef92f685785a24a45e5325384551ba55c57cc1"/>
     <w:p>
       <w:pPr>
         <w:pStyle w:val="Heading3"/>
@@ -3142,9 +3474,9 @@
         <w:t xml:space="preserve">overgebracht.</w:t>
       </w:r>
     </w:p>
-    <w:bookmarkEnd w:id="56"/>
     <w:bookmarkEnd w:id="57"/>
-    <w:bookmarkStart w:id="77" w:name="Xae67a70ad36e2d1d11a7d910c2e5a6d669a3a5f"/>
+    <w:bookmarkEnd w:id="58"/>
+    <w:bookmarkStart w:id="78" w:name="X2b62b82ef201b4c91783bce15da2b1d0258c34c"/>
     <w:p>
       <w:pPr>
         <w:pStyle w:val="Heading2"/>
@@ -3161,7 +3493,7 @@
         <w:t xml:space="preserve">Deze bronnen zijn gevonden, maar nog niet toegelaten. De genoemde aantallen hebben betrekking op de al gemaakte Meijendelselectie of op de beschreven onderzoeksopzet. Voor iedere import volgt eerst controle van locatie per waarneming, overlap met bestaande bronnen, rechten en statistische betekenis.</w:t>
       </w:r>
     </w:p>
-    <w:bookmarkStart w:id="74" w:name="Xd53aceb4d9e4863cdbb6367737be5e291cdac65"/>
+    <w:bookmarkStart w:id="75" w:name="Xd53aceb4d9e4863cdbb6367737be5e291cdac65"/>
     <w:p>
       <w:pPr>
         <w:pStyle w:val="Heading3"/>
@@ -3170,7 +3502,7 @@
         <w:t xml:space="preserve">Kandidaten met de grootste verwachte aanvulling</w:t>
       </w:r>
     </w:p>
-    <w:bookmarkStart w:id="58" w:name="historische-en-actuele-ringgegevens"/>
+    <w:bookmarkStart w:id="59" w:name="Xbddce02f5cb2b082bf32fac381c8bc0ea5284d3"/>
     <w:p>
       <w:pPr>
         <w:pStyle w:val="Heading4"/>
@@ -3266,8 +3598,8 @@
         <w:t xml:space="preserve">blijkt in de officiële EURING-codebeschrijving de provincie Zuid-Holland aan te duiden en niet VRS Meijendel. Trektellen-site 403 is wel VRS Meijendel en bevat inspanningsinformatie, maar er is nog geen recordsleutel tussen beide bronnen gevonden. De 100.417 ruimtelijke treffers zijn daarom niet als VRS-Meijendelvangsten geïmporteerd.</w:t>
       </w:r>
     </w:p>
-    <w:bookmarkEnd w:id="58"/>
-    <w:bookmarkStart w:id="59" w:name="erosiepinnen-in-een-stuifkuilcomplex"/>
+    <w:bookmarkEnd w:id="59"/>
+    <w:bookmarkStart w:id="60" w:name="X8071b7ae643e6cecadbf8a281c84bb90b511e63"/>
     <w:p>
       <w:pPr>
         <w:pStyle w:val="Heading4"/>
@@ -3348,8 +3680,8 @@
         <w:t xml:space="preserve">Oorspronkelijke metingen en pinlocaties vinden en op waarnemingsniveau aan Meijendel koppelen</w:t>
       </w:r>
     </w:p>
-    <w:bookmarkEnd w:id="59"/>
-    <w:bookmarkStart w:id="60" w:name="langjarige-droge-duinvegetatieplots"/>
+    <w:bookmarkEnd w:id="60"/>
+    <w:bookmarkStart w:id="61" w:name="X1b05a95cacb83608c9b762adcf4298810ed86f9"/>
     <w:p>
       <w:pPr>
         <w:pStyle w:val="Heading4"/>
@@ -3430,8 +3762,8 @@
         <w:t xml:space="preserve">De publicatiekaart toont de 41 punten in Helmduinen, Kijfhoek en Bierlap, maar zonder koppelbare plotcodes. De toegelaten LVD-opnamen leverden geen betrouwbare vertaling op naar deze 41 plots. Oorspronkelijke plotcodes, opnamen en locaties blijven daarom noodzakelijk.</w:t>
       </w:r>
     </w:p>
-    <w:bookmarkEnd w:id="60"/>
-    <w:bookmarkStart w:id="62" w:name="neuropteren-van-meijendel"/>
+    <w:bookmarkEnd w:id="61"/>
+    <w:bookmarkStart w:id="63" w:name="X4578481a165cef1470f100d42a5e836ac7456f8"/>
     <w:p>
       <w:pPr>
         <w:pStyle w:val="Heading4"/>
@@ -3442,7 +3774,7 @@
       <w:r>
         <w:t xml:space="preserve"> </w:t>
       </w:r>
-      <w:hyperlink r:id="rId61">
+      <w:hyperlink r:id="rId62">
         <w:r>
           <w:rPr>
             <w:rStyle w:val="Hyperlink"/>
@@ -3523,8 +3855,8 @@
         <w:t xml:space="preserve">De specimen- en soortenlijsten uit de publicatie digitaliseren, datum en plaats per record vaststellen en vergelijken met Naturalis-collecties en NDFF.</w:t>
       </w:r>
     </w:p>
-    <w:bookmarkEnd w:id="62"/>
-    <w:bookmarkStart w:id="64" w:name="zweefvliegen-van-meijendel"/>
+    <w:bookmarkEnd w:id="63"/>
+    <w:bookmarkStart w:id="65" w:name="X642992b46f3d655730973d9bd57c00f9c7aad9f"/>
     <w:p>
       <w:pPr>
         <w:pStyle w:val="Heading4"/>
@@ -3535,7 +3867,7 @@
       <w:r>
         <w:t xml:space="preserve"> </w:t>
       </w:r>
-      <w:hyperlink r:id="rId63">
+      <w:hyperlink r:id="rId64">
         <w:r>
           <w:rPr>
             <w:rStyle w:val="Hyperlink"/>
@@ -3616,8 +3948,8 @@
         <w:t xml:space="preserve">De volledige specimenlijst digitaliseren en per exemplaar datum en locatie vastleggen; daarna ontdubbelen tegen museumcollecties en NDFF.</w:t>
       </w:r>
     </w:p>
-    <w:bookmarkEnd w:id="64"/>
-    <w:bookmarkStart w:id="66" w:name="terra-dunes-plant--en-bodemmicrobiomen"/>
+    <w:bookmarkEnd w:id="65"/>
+    <w:bookmarkStart w:id="67" w:name="X80b82bf48485caf594896b8d6bc490be5f328ee"/>
     <w:p>
       <w:pPr>
         <w:pStyle w:val="Heading4"/>
@@ -3646,7 +3978,7 @@
       <w:r>
         <w:t xml:space="preserve"> </w:t>
       </w:r>
-      <w:hyperlink r:id="rId65">
+      <w:hyperlink r:id="rId66">
         <w:r>
           <w:rPr>
             <w:rStyle w:val="Hyperlink"/>
@@ -3691,8 +4023,8 @@
         <w:t xml:space="preserve">Geschikt voor samenhang tussen vegetatie en microbiomen. Niet toelaten voordat de proefvlakken geografisch zijn gereconstrueerd.</w:t>
       </w:r>
     </w:p>
-    <w:bookmarkEnd w:id="66"/>
-    <w:bookmarkStart w:id="68" w:name="rups--en-bodemmicrobiomen"/>
+    <w:bookmarkEnd w:id="67"/>
+    <w:bookmarkStart w:id="69" w:name="X4b2db10b2340db42e20505c45425c0b84f14c27"/>
     <w:p>
       <w:pPr>
         <w:pStyle w:val="Heading4"/>
@@ -3721,7 +4053,7 @@
       <w:r>
         <w:t xml:space="preserve"> </w:t>
       </w:r>
-      <w:hyperlink r:id="rId67">
+      <w:hyperlink r:id="rId68">
         <w:r>
           <w:rPr>
             <w:rStyle w:val="Hyperlink"/>
@@ -3766,8 +4098,8 @@
         <w:t xml:space="preserve">Eenmalige genetische en microbiële momentopname. Geen populatietrend, wel lokale ecologische vergelijking na controle van alle monsterlocaties.</w:t>
       </w:r>
     </w:p>
-    <w:bookmarkEnd w:id="68"/>
-    <w:bookmarkStart w:id="70" w:name="schimmels-bij-kruipwilg"/>
+    <w:bookmarkEnd w:id="69"/>
+    <w:bookmarkStart w:id="71" w:name="X442e94e4e2997aa133d10bf618574e2528e759d"/>
     <w:p>
       <w:pPr>
         <w:pStyle w:val="Heading4"/>
@@ -3796,7 +4128,7 @@
       <w:r>
         <w:t xml:space="preserve"> </w:t>
       </w:r>
-      <w:hyperlink r:id="rId69">
+      <w:hyperlink r:id="rId70">
         <w:r>
           <w:rPr>
             <w:rStyle w:val="Hyperlink"/>
@@ -3841,8 +4173,8 @@
         <w:t xml:space="preserve">Bruikbaar als lokale microbiële referentie, niet als tijdreeks of gebiedsdekkende inventarisatie.</w:t>
       </w:r>
     </w:p>
-    <w:bookmarkEnd w:id="70"/>
-    <w:bookmarkStart w:id="72" w:name="plantengroei-bodemvocht-en-weer"/>
+    <w:bookmarkEnd w:id="71"/>
+    <w:bookmarkStart w:id="73" w:name="X36e8e197a59cff4a0251b791dc5fc6bc0e135bf"/>
     <w:p>
       <w:pPr>
         <w:pStyle w:val="Heading4"/>
@@ -3871,7 +4203,7 @@
       <w:r>
         <w:t xml:space="preserve"> </w:t>
       </w:r>
-      <w:hyperlink r:id="rId71">
+      <w:hyperlink r:id="rId72">
         <w:r>
           <w:rPr>
             <w:rStyle w:val="Hyperlink"/>
@@ -3916,8 +4248,8 @@
         <w:t xml:space="preserve">Gedetailleerde processtudie van de reactie van duingrassen op neerslag en droogte. Eerst locaties en meetkwaliteit controleren; één halfjaar geeft geen langjarige ontwikkeling.</w:t>
       </w:r>
     </w:p>
-    <w:bookmarkEnd w:id="72"/>
-    <w:bookmarkStart w:id="73" w:name="genetische-datasets-amfibieën"/>
+    <w:bookmarkEnd w:id="73"/>
+    <w:bookmarkStart w:id="74" w:name="X49ed5beca1c3c65272a43e85c3687f3c3d41d64"/>
     <w:p>
       <w:pPr>
         <w:pStyle w:val="Heading4"/>
@@ -3980,9 +4312,9 @@
         <w:t xml:space="preserve">Bruikbaar voor populatiegenetische context. Jaar, locatie en relatie met bestaande RAVON-waarnemingen moeten eerst worden vastgesteld.</w:t>
       </w:r>
     </w:p>
-    <w:bookmarkEnd w:id="73"/>
     <w:bookmarkEnd w:id="74"/>
-    <w:bookmarkStart w:id="76" w:name="X8c2748f02893018608c8a38a1054acf3030739d"/>
+    <w:bookmarkEnd w:id="75"/>
+    <w:bookmarkStart w:id="77" w:name="X136d668cd3b301eba92f27584d1a2d49d57a73c"/>
     <w:p>
       <w:pPr>
         <w:pStyle w:val="Heading3"/>
@@ -4135,7 +4467,7 @@
       <w:pPr>
         <w:pStyle w:val="BodyText"/>
       </w:pPr>
-      <w:hyperlink r:id="rId75">
+      <w:hyperlink r:id="rId76">
         <w:r>
           <w:rPr>
             <w:rStyle w:val="Hyperlink"/>
@@ -4195,9 +4527,9 @@
         <w:t xml:space="preserve">publicaties noemen 32–35 stuifkuilen die vanaf 1983 tweemaal per jaar zijn gemeten, 19 permanente vegetatieplots en vergelijkingen van luchtfoto’s en orthofoto’s. De oorspronkelijke tabellen, plot-ID’s en digitale kaartlagen zijn nog niet voldoende geïdentificeerd om deze als afzonderlijke gegevensbron toe te laten.</w:t>
       </w:r>
     </w:p>
-    <w:bookmarkEnd w:id="76"/>
     <w:bookmarkEnd w:id="77"/>
-    <w:bookmarkStart w:id="78" w:name="verwachte-aanvullingen"/>
+    <w:bookmarkEnd w:id="78"/>
+    <w:bookmarkStart w:id="79" w:name="Xc540a83ee65aaec11aa446aec0815d16fd21e21"/>
     <w:p>
       <w:pPr>
         <w:pStyle w:val="Heading2"/>
@@ -4260,8 +4592,8 @@
         <w:t xml:space="preserve">Provincie Zuid-Holland heeft toegezegd de kaart te delen zodra zij later in 2026 beschikbaar komt. De kaart kan veranderingen in habitat helpen verklaren, maar is zelf geen soortenwaarneming.</w:t>
       </w:r>
     </w:p>
-    <w:bookmarkEnd w:id="78"/>
-    <w:bookmarkStart w:id="79" w:name="Xbd1d36805349ef5ec39b6efd044fd20b47e23f4"/>
+    <w:bookmarkEnd w:id="79"/>
+    <w:bookmarkStart w:id="80" w:name="X422e6271160c2b04a3b59fb5b59cfcc2e3afc55"/>
     <w:p>
       <w:pPr>
         <w:pStyle w:val="Heading2"/>
@@ -4294,8 +4626,8 @@
         <w:t xml:space="preserve">Algemene verzamelbronnen zoals Observation.org, iNaturalist en eBird worden ook niet opnieuw als zelfstandige Meijendelbron ingevoerd zolang niet is aangetoond dat zij waarnemingen bevatten die ontbreken in NDFF of in de primaire VWG/SOVON-reeksen. Anders zou dezelfde waarneming vooral nogmaals worden opgeslagen.</w:t>
       </w:r>
     </w:p>
-    <w:bookmarkEnd w:id="79"/>
-    <w:bookmarkStart w:id="80" w:name="gebruik-van-dit-register"/>
+    <w:bookmarkEnd w:id="80"/>
+    <w:bookmarkStart w:id="81" w:name="Xb05dec49988a12f7955d21ff17f1c91e4d061eb"/>
     <w:p>
       <w:pPr>
         <w:pStyle w:val="Heading2"/>
@@ -4383,8 +4715,8 @@
         <w:t xml:space="preserve">Pas daarna volgt een afzonderlijk importbesluit.</w:t>
       </w:r>
     </w:p>
-    <w:bookmarkEnd w:id="80"/>
-    <w:bookmarkStart w:id="86" w:name="actieplan"/>
+    <w:bookmarkEnd w:id="81"/>
+    <w:bookmarkStart w:id="87" w:name="X67781990bcb7d7d43cc312a7ef48f37a1f83265"/>
     <w:p>
       <w:pPr>
         <w:pStyle w:val="Heading2"/>
@@ -4416,7 +4748,7 @@
         <w:t xml:space="preserve">bevat alleen waarnemingen die aan de ruimtelijke toelatingsregel voldoen.</w:t>
       </w:r>
     </w:p>
-    <w:bookmarkStart w:id="81" w:name="fase-1-openbare-direct-toetsbare-bronnen"/>
+    <w:bookmarkStart w:id="82" w:name="Xd7f889e2150e602eaeb242f489896c9b52af547"/>
     <w:p>
       <w:pPr>
         <w:pStyle w:val="Heading3"/>
@@ -4503,8 +4835,8 @@
         <w:t xml:space="preserve">.</w:t>
       </w:r>
     </w:p>
-    <w:bookmarkEnd w:id="81"/>
-    <w:bookmarkStart w:id="82" w:name="X1e65d730f223a62ff579853fd3c77c9308748df"/>
+    <w:bookmarkEnd w:id="82"/>
+    <w:bookmarkStart w:id="83" w:name="Xa67120beb48c3916f8a53c623f303ce8b8a6005"/>
     <w:p>
       <w:pPr>
         <w:pStyle w:val="Heading3"/>
@@ -4657,8 +4989,8 @@
         <w:t xml:space="preserve">De kaart in het proefschrift is visueel gecontroleerd en toont 41 punten in Helmduinen, Kijfhoek en Bierlap, maar geen koppelbare plotcodes. Ook de LVD-selectie levert geen betrouwbare vertaling. De reeks blijft kandidaat totdat de oorspronkelijke plotkaart en opnametabellen zijn gevonden.</w:t>
       </w:r>
     </w:p>
-    <w:bookmarkEnd w:id="82"/>
-    <w:bookmarkStart w:id="83" w:name="X6b9d0c88ffcb5584e67daa74c9524b522af67c0"/>
+    <w:bookmarkEnd w:id="83"/>
+    <w:bookmarkStart w:id="84" w:name="Xc96f79f2027e81b7ab280f9bf69df5af8bdf464"/>
     <w:p>
       <w:pPr>
         <w:pStyle w:val="Heading3"/>
@@ -4736,8 +5068,8 @@
         <w:t xml:space="preserve">Voeg de Habitatkaart T1, de landbedekking van 2001 en 2022 en eventueel gevonden remote-sensingrasters toe als omgevingslagen. Zij mogen ecologische veranderingen helpen verklaren, maar worden niet als soortenwaarnemingen behandeld.</w:t>
       </w:r>
     </w:p>
-    <w:bookmarkEnd w:id="83"/>
-    <w:bookmarkStart w:id="84" w:name="vaste-werkwijze-per-bron"/>
+    <w:bookmarkEnd w:id="84"/>
+    <w:bookmarkStart w:id="85" w:name="vaste-werkwijze-per-bron"/>
     <w:p>
       <w:pPr>
         <w:pStyle w:val="Heading3"/>
@@ -4754,8 +5086,8 @@
         <w:t xml:space="preserve">Iedere bron doorloopt dezelfde vijf stappen: een onveranderde bronkopie met checksum bewaren; gegevenswoordenboek en rechten vastleggen; locaties en analyseeenheid controleren; overlap en dubbelen bepalen; pas daarna een reproduceerbare import en analyseview maken. Na iedere statuswijziging worden dit register en de Wordversie meteen bijgewerkt.</w:t>
       </w:r>
     </w:p>
-    <w:bookmarkEnd w:id="84"/>
-    <w:bookmarkStart w:id="85" w:name="dekking-van-de-internetcontrole"/>
+    <w:bookmarkEnd w:id="85"/>
+    <w:bookmarkStart w:id="86" w:name="dekking-van-de-internetcontrole"/>
     <w:p>
       <w:pPr>
         <w:pStyle w:val="Heading3"/>
@@ -4772,9 +5104,9 @@
         <w:t xml:space="preserve">De controle van 26 september 2026 omvatte GBIF, DataCite, Zenodo, Dryad, Figshare, Europe PMC, Naturalis Repository, Wageningen Research e-depot en de repositories van Universiteit Leiden en TU Delft. Algemene aggregators zijn niet als zelfstandige bron opgenomen wanneer zij waarschijnlijk dezelfde waarnemingen als NDFF of primaire collecties bevatten. Een openbare zoekronde kan nooit bewijzen dat geen ongepubliceerde of slecht geïndexeerde bron bestaat; dit register legt daarom ook de zoekdatum en toelatingsreden vast.</w:t>
       </w:r>
     </w:p>
-    <w:bookmarkEnd w:id="85"/>
     <w:bookmarkEnd w:id="86"/>
-    <w:bookmarkStart w:id="94" w:name="achterliggende-verantwoording"/>
+    <w:bookmarkEnd w:id="87"/>
+    <w:bookmarkStart w:id="95" w:name="achterliggende-verantwoording"/>
     <w:p>
       <w:pPr>
         <w:pStyle w:val="Heading2"/>
@@ -4788,10 +5120,10 @@
         <w:pStyle w:val="Compact"/>
         <w:numPr>
           <w:ilvl w:val="0"/>
-          <w:numId w:val="1004"/>
+          <w:numId w:val="1005"/>
         </w:numPr>
       </w:pPr>
-      <w:hyperlink r:id="rId87">
+      <w:hyperlink r:id="rId88">
         <w:r>
           <w:rPr>
             <w:rStyle w:val="Hyperlink"/>
@@ -4805,10 +5137,10 @@
         <w:pStyle w:val="Compact"/>
         <w:numPr>
           <w:ilvl w:val="0"/>
-          <w:numId w:val="1004"/>
+          <w:numId w:val="1005"/>
         </w:numPr>
       </w:pPr>
-      <w:hyperlink r:id="rId88">
+      <w:hyperlink r:id="rId89">
         <w:r>
           <w:rPr>
             <w:rStyle w:val="Hyperlink"/>
@@ -4822,10 +5154,10 @@
         <w:pStyle w:val="Compact"/>
         <w:numPr>
           <w:ilvl w:val="0"/>
-          <w:numId w:val="1004"/>
+          <w:numId w:val="1005"/>
         </w:numPr>
       </w:pPr>
-      <w:hyperlink r:id="rId89">
+      <w:hyperlink r:id="rId90">
         <w:r>
           <w:rPr>
             <w:rStyle w:val="Hyperlink"/>
@@ -4839,10 +5171,10 @@
         <w:pStyle w:val="Compact"/>
         <w:numPr>
           <w:ilvl w:val="0"/>
-          <w:numId w:val="1004"/>
+          <w:numId w:val="1005"/>
         </w:numPr>
       </w:pPr>
-      <w:hyperlink r:id="rId90">
+      <w:hyperlink r:id="rId91">
         <w:r>
           <w:rPr>
             <w:rStyle w:val="Hyperlink"/>
@@ -4856,10 +5188,10 @@
         <w:pStyle w:val="Compact"/>
         <w:numPr>
           <w:ilvl w:val="0"/>
-          <w:numId w:val="1004"/>
+          <w:numId w:val="1005"/>
         </w:numPr>
       </w:pPr>
-      <w:hyperlink r:id="rId91">
+      <w:hyperlink r:id="rId92">
         <w:r>
           <w:rPr>
             <w:rStyle w:val="Hyperlink"/>
@@ -4873,10 +5205,10 @@
         <w:pStyle w:val="Compact"/>
         <w:numPr>
           <w:ilvl w:val="0"/>
-          <w:numId w:val="1004"/>
+          <w:numId w:val="1005"/>
         </w:numPr>
       </w:pPr>
-      <w:hyperlink r:id="rId92">
+      <w:hyperlink r:id="rId93">
         <w:r>
           <w:rPr>
             <w:rStyle w:val="Hyperlink"/>
@@ -4890,10 +5222,10 @@
         <w:pStyle w:val="Compact"/>
         <w:numPr>
           <w:ilvl w:val="0"/>
-          <w:numId w:val="1004"/>
+          <w:numId w:val="1005"/>
         </w:numPr>
       </w:pPr>
-      <w:hyperlink r:id="rId93">
+      <w:hyperlink r:id="rId94">
         <w:r>
           <w:rPr>
             <w:rStyle w:val="Hyperlink"/>
@@ -4902,8 +5234,8 @@
         </w:r>
       </w:hyperlink>
     </w:p>
-    <w:bookmarkEnd w:id="94"/>
     <w:bookmarkEnd w:id="95"/>
+    <w:bookmarkEnd w:id="96"/>
     <w:sectPr>
       <w:footnotePr>
         <w:numRestart w:val="eachSect"/>
@@ -5130,6 +5462,9 @@
     <w:abstractNumId w:val="991"/>
   </w:num>
   <w:num w:numId="1004">
+    <w:abstractNumId w:val="991"/>
+  </w:num>
+  <w:num w:numId="1005">
     <w:abstractNumId w:val="991"/>
   </w:num>
 </w:numbering>

</xml_diff>

<commit_message>
Leg voorlopige vogelnaamgebruiken en veilige bronkoppelingen vast
</commit_message>
<xml_diff>
--- a/docs/MEIJENDEL_BRONREGISTER.docx
+++ b/docs/MEIJENDEL_BRONREGISTER.docx
@@ -20,7 +20,7 @@
           <w:b/>
           <w:bCs/>
         </w:rPr>
-        <w:t xml:space="preserve">Stand: 26 september 2026.</w:t>
+        <w:t>Stand: 27 september 2026.</w:t>
       </w:r>
     </w:p>
     <w:p>
@@ -707,6 +707,20 @@
     </w:p>
     <w:bookmarkEnd w:id="12"/>
     <w:bookmarkStart w:id="13" w:name="X9645acbfea6b379f23d12aeedc36c987000825a"/>
+    <w:p>
+      <w:pPr>
+        <w:pStyle w:val="BodyText"/>
+      </w:pPr>
+      <w:r>
+        <w:rPr>
+          <w:b/>
+        </w:rPr>
+        <w:t xml:space="preserve">Taxonomische ontsluiting, 27 september 2026. </w:t>
+      </w:r>
+      <w:r>
+        <w:t>De 263 gebruikte vogelcategorieën uit soorten hebben ieder een voorlopig naamgebruik in taxa en een kandidaat in taxa_bronkoppeling. De koppelproef omvat 71.155 territoriumregels (1958–2025), 600.959 BMP-regels (2007–2025) en 105.712 wintertelregels (2000–2025). Dit is een afgebakende controle van deze drie tabellen, niet een nieuwe telling van alle vogelbronnen. Bron-IDs en letterlijke cataloguswaarden blijven behouden. De kandidaten leggen nog geen gelijkheid met externe taxonconcepten vast; brongegevens, analytische status en gebruik door website, dashboard en Shiny veranderen niet.</w:t>
+      </w:r>
+    </w:p>
     <w:p>
       <w:pPr>
         <w:pStyle w:val="Heading3"/>

</xml_diff>

<commit_message>
Documenteer invoermanifest overige taxa en LVD-rangbeperking
</commit_message>
<xml_diff>
--- a/docs/MEIJENDEL_BRONREGISTER.docx
+++ b/docs/MEIJENDEL_BRONREGISTER.docx
@@ -2457,6 +2457,12 @@
     </w:p>
     <w:bookmarkEnd w:id="38"/>
     <w:bookmarkStart w:id="39" w:name="Xa66e2be297c2cf82b37e3e4b59e101c55a2b789"/>
+    <w:p>
+      <w:pPr/>
+      <w:r>
+        <w:t>Taxonomische importbeperking, vastgesteld 27 september 2026. Bij alle 81.310 toegelaten LVD-resultaten (1959–2015; 998 verschillende naamstrings) bevat externe_ecologie_resultaat.taxonrang een status in plaats van een rang: 81.285 keer accepted en 25 keer synonym. De importeur heeft hiervoor taxonomicStatus gebruikt; de oorspronkelijke status is ook in bronmetadata bewaard. Gebruik dit veld niet als taxonomische rang. Het nieuwe taxonmanifest laat de rang leeg en houdt de bronstatus afzonderlijk herkenbaar. De bestaande import en database zijn niet gecorrigeerd; de ruimtelijke toelating, overlapbesluiten en meetwaarden blijven ongewijzigd. Zie docs/database/TAXONREGISTER.md voor de vervolgcontrole.</w:t>
+      </w:r>
+    </w:p>
     <w:p>
       <w:pPr>
         <w:pStyle w:val="Heading4"/>

</xml_diff>

<commit_message>
Beoordeel taxonuitzonderingen en corrigeer invoergereedheidsadvies
</commit_message>
<xml_diff>
--- a/docs/MEIJENDEL_BRONREGISTER.docx
+++ b/docs/MEIJENDEL_BRONREGISTER.docx
@@ -2461,6 +2461,12 @@
       <w:pPr/>
       <w:r>
         <w:t>Taxonomische importbeperking, vastgesteld 27 september 2026. Bij alle 81.310 toegelaten LVD-resultaten (1959–2015; 998 verschillende naamstrings) bevat externe_ecologie_resultaat.taxonrang een status in plaats van een rang: 81.285 keer accepted en 25 keer synonym. De importeur heeft hiervoor taxonomicStatus gebruikt; de oorspronkelijke status is ook in bronmetadata bewaard. Gebruik dit veld niet als taxonomische rang. Het nieuwe taxonmanifest laat de rang leeg en houdt de bronstatus afzonderlijk herkenbaar. De bestaande import en database zijn niet gecorrigeerd; de ruimtelijke toelating, overlapbesluiten en meetwaarden blijven ongewijzigd. Zie docs/database/TAXONREGISTER.md voor de vervolgcontrole.</w:t>
+      </w:r>
+    </w:p>
+    <w:p>
+      <w:pPr/>
+      <w:r>
+        <w:t>Aanvullende taxonomische metadata, beoordeeld 27 september 2026. In de extractie van 998 LVD-naamgebruiken uit de bronreeks 1959–2015 is bij 122 het veld scientificNameAuthorship gelijk aan de volledige scientificName. Het invoermanifest kopieert dit naar naam_auteur. Deze waarden mogen niet zonder nadere beoordeling als auteurschap in het centrale register worden opgenomen; behoud de letterlijke bronmetadata en laat het centrale auteursveld voor deze gevallen voorlopig leeg. Dit betreft 122 naamgebruiken, niet 122 waarnemingen. Het manifest en de bestaande database zijn nog niet aangepast; meetwaarden, ruimtelijke toelating en overlapbesluiten blijven gelijk.</w:t>
       </w:r>
     </w:p>
     <w:p>

</xml_diff>

<commit_message>
Vul taxonregister brongetrouw aan en borg nacontroles
</commit_message>
<xml_diff>
--- a/docs/MEIJENDEL_BRONREGISTER.docx
+++ b/docs/MEIJENDEL_BRONREGISTER.docx
@@ -233,6 +233,12 @@
     </w:p>
     <w:bookmarkEnd w:id="9"/>
     <w:bookmarkStart w:id="10" w:name="overkoepelende-analysegeschiktheid"/>
+    <w:p>
+      <w:pPr/>
+      <w:r>
+        <w:t>Taxonomisch register aangevuld, 27 september 2026. De levende lokale database bevat nu 27 praktische groepen, 14.576 voorlopige naamgebruiken en 15.614 bronkoppelingen. Dit zijn brongebonden registraties, geen telling van unieke biologische soorten of lokale aanwezigheid. De toevoeging omvat NDFF, provinciale PQ, Vangblik, SOVON/AVIMAP, de zes externe datasets en aanvullende referentiecatalogi. De oorspronkelijke meetperioden en toelatingsvoorwaarden blijven die van de afzonderlijke bronnen hieronder. Van de koppelingen zijn er 89 nog zonder centraal taxon: 87 PQ-vermeldingen waarvan de naamtekst niet voldoende is onderbouwd, één Naturalis-Indet. en Toendrarietgans zonder wetenschappelijke bronnaam. Alle broncodes en oorspronkelijke metadata blijven behouden. Bij 2.787 naamgebruiken is de primaire groep nog niet vastgesteld. Er zijn geen bevestigde conceptgelijkstellingen toegevoegd en geen metingen samengevoegd. De 263 bestaande vogelnaamgebruiken en hun koppelingen zijn ongewijzigd. Website, dashboard en Shiny zijn niet op dit register omgeschakeld. Uitvoering, ROLLBACK-proeven en controles staan in docs/database/TAXONREGISTER.md.</w:t>
+      </w:r>
+    </w:p>
     <w:p>
       <w:pPr>
         <w:pStyle w:val="Heading2"/>
@@ -2460,13 +2466,13 @@
     <w:p>
       <w:pPr/>
       <w:r>
-        <w:t>Taxonomische importbeperking, vastgesteld 27 september 2026. Bij alle 81.310 toegelaten LVD-resultaten (1959–2015; 998 verschillende naamstrings) bevat externe_ecologie_resultaat.taxonrang een status in plaats van een rang: 81.285 keer accepted en 25 keer synonym. De importeur heeft hiervoor taxonomicStatus gebruikt; de oorspronkelijke status is ook in bronmetadata bewaard. Gebruik dit veld niet als taxonomische rang. Het nieuwe taxonmanifest laat de rang leeg en houdt de bronstatus afzonderlijk herkenbaar. De bestaande import en database zijn niet gecorrigeerd; de ruimtelijke toelating, overlapbesluiten en meetwaarden blijven ongewijzigd. Zie docs/database/TAXONREGISTER.md voor de vervolgcontrole.</w:t>
+        <w:t>Taxonomische importbeperking, vastgesteld 27 september 2026. Bij alle 81.310 toegelaten LVD-resultaten (1959–2015; 998 verschillende naamstrings) bevat externe_ecologie_resultaat.taxonrang een status in plaats van een rang: 81.285 keer accepted en 25 keer synonym. De importeur heeft hiervoor taxonomicStatus gebruikt; de oorspronkelijke status is ook in bronmetadata bewaard. Gebruik dit veld niet als taxonomische rang. De uitgevoerde centrale registratie laat de rang leeg en houdt de bronstatus afzonderlijk herkenbaar. De bestaande import en bronlaag zijn niet gecorrigeerd; de ruimtelijke toelating, overlapbesluiten en meetwaarden blijven ongewijzigd. Zie docs/database/TAXONREGISTER.md voor het controlebewijs.</w:t>
       </w:r>
     </w:p>
     <w:p>
       <w:pPr/>
       <w:r>
-        <w:t>Aanvullende taxonomische metadata, beoordeeld 27 september 2026. In de extractie van 998 LVD-naamgebruiken uit de bronreeks 1959–2015 is bij 122 het veld scientificNameAuthorship gelijk aan de volledige scientificName. Het invoermanifest kopieert dit naar naam_auteur. Deze waarden mogen niet zonder nadere beoordeling als auteurschap in het centrale register worden opgenomen; behoud de letterlijke bronmetadata en laat het centrale auteursveld voor deze gevallen voorlopig leeg. Dit betreft 122 naamgebruiken, niet 122 waarnemingen. Het manifest en de bestaande database zijn nog niet aangepast; meetwaarden, ruimtelijke toelating en overlapbesluiten blijven gelijk.</w:t>
+        <w:t>Aanvullende taxonomische metadata, beoordeeld 27 september 2026. In de extractie van 998 LVD-naamgebruiken uit de bronreeks 1959–2015 is bij 122 het veld scientificNameAuthorship gelijk aan de volledige scientificName. Manifest v3 heeft deze tekst niet als auteur overgenomen: het centrale veld naam_auteur blijft voor deze 122 naamgebruiken leeg. De letterlijke bronmetadata zijn in taxa_bronkoppeling behouden. Dit betreft 122 naamgebruiken, niet 122 waarnemingen. De toevoeging aan het register verandert geen meetwaarden, ruimtelijke toelating, overlapbesluiten of bestaande bronvelden.</w:t>
       </w:r>
     </w:p>
     <w:p>

</xml_diff>

<commit_message>
Rond veilige taxonaanvulling en bronverbinding af
</commit_message>
<xml_diff>
--- a/docs/MEIJENDEL_BRONREGISTER.docx
+++ b/docs/MEIJENDEL_BRONREGISTER.docx
@@ -236,7 +236,37 @@
     <w:p>
       <w:pPr/>
       <w:r>
-        <w:t>Taxonomisch register aangevuld, 27 september 2026. De levende lokale database bevat nu 27 praktische groepen, 14.663 voorlopige naamgebruiken en 15.701 bronbesluiten, waarvan 15.614 actief. Dit zijn brongebonden registraties, geen telling van unieke biologische soorten of lokale aanwezigheid; het register heeft geen eigen waarnemingsperiode. Het omvat NDFF, provinciale PQ, Vangblik, SOVON/AVIMAP, de zes externe datasets en aanvullende referentiecatalogi. Meetperioden en toelatingsvoorwaarden blijven die van de afzonderlijke bronnen hieronder. Bij 1.283 bestaande naamgebruiken is een onderbouwde soortgroep toegevoegd. Alle 87 eerder onopgeloste PQ-naamteksten uit 1981–2025 zijn onderbouwd met code, wetenschappelijke en Nederlandse naam uit de officiële Floranld_2020-lijst; zij hebben een nieuw voorlopig naamgebruik en een nieuwe bronbesluitversie gekregen. Deze openbare Turboveg-referentielijst, aangeboden op 10 maart 2026 via www.synbiosys.alterra.nl/turboveg/, bevat 17.468 codes en bewijst geen lokale aanwezigheid of gelijkheid van historische soortafbakening. Alle oorspronkelijke bronwaarden en eerdere besluiten blijven behouden. Er blijven 1.504 naamgebruiken zonder primaire groep en twee actieve bronvermeldingen zonder doel: Naturalis-Indet. benoemt geen taxon; bij Toendrarietgans ontbreekt de wetenschappelijke bronnaam en moet de herkomst van lokale code 1582 worden vastgesteld. Er zijn geen bevestigde conceptgelijkstellingen toegevoegd en geen metingen samengevoegd. Voor verdere vergelijking via GBIF is toestemming gevraagd om uitsluitend wetenschappelijke namen te versturen; die opvraging is nog niet uitgevoerd. De 263 bestaande vogelnaamgebruiken en hun koppelingen zijn ongewijzigd. Website, dashboard en Shiny zijn niet op dit register omgeschakeld. Uitvoering, terugdraaiproef en controles staan in docs/database/TAXONREGISTER.md.</w:t>
+        <w:t>Taxonomisch register aangevuld, 27 september 2026 om 21:53 uur. De levende lokale database bevat nu 27 praktische groepen en 15.580 naamgebruiken en referenties. Daarvan zijn 14.663 registraties aan hun oorspronkelijke bron gebonden; 917 zijn gedeelde externe naamreferenties. De 18.437 bronbesluiten omvatten 18.350 actieve besluiten en 87 bewaarde eerdere versies. Dit is geen telling van unieke biologische soorten of lokale aanwezigheid. Het register heeft geen eigen waarnemingsperiode en omvat NDFF, provinciale PQ, Vangblik, SOVON/AVIMAP, de zes externe datasets en aanvullende referentiecatalogi. Meetperioden en toelatingsvoorwaarden blijven die van de afzonderlijke bronnen hieronder.</w:t>
+      </w:r>
+    </w:p>
+    <w:p>
+      <w:pPr/>
+      <w:r>
+        <w:t>De aanvulling maakt overeenkomsten tussen bronnen vindbaar. In twee stappen hebben 2.509 bestaande registraties alsnog een primaire soortgroep gekregen, waarvan 1.226 in de laatste stap. Alle 87 eerder onopgeloste PQ-naamteksten uit 1981–2025 zijn onderbouwd met code, wetenschappelijke en Nederlandse naam uit Floranld_2020. Deze openbare Turboveg-referentielijst, aangeboden op 10 maart 2026 via www.synbiosys.alterra.nl/turboveg/, bevat 17.468 codes. De oorspronkelijke PQ-waarden en eerdere besluiten blijven behouden.</w:t>
+      </w:r>
+    </w:p>
+    <w:p>
+      <w:pPr/>
+      <w:r>
+        <w:t>Alle 12.173 verschillende wetenschappelijke naamteksten zijn bij GBIF opgezocht. Uitsluitend die naamteksten zijn verstuurd, geen vindplaatsen, tellingen of persoonsgegevens. Via 917 gedeelde naamreferenties zijn nu 1.819 bestaande bronregistraties met elkaar in verband te brengen. Iedere referentie verbindt minstens twee oorspronkelijke datasets. Het zijn onderbouwde zoekverbindingen, geen bevestiging dat historische bronnen precies dezelfde soortafbakening gebruiken. Alle nieuwe koppelingen blijven daarom kandidaat met onbekende conceptrelatie; er zijn geen metingen samengevoegd.</w:t>
+      </w:r>
+    </w:p>
+    <w:p>
+      <w:pPr/>
+      <w:r>
+        <w:t>De geraadpleegde Catalogue of Life-lijst via GBIF is een naam- en classificatiereferentie, geen nieuwe waarnemingsbron. Uitgever is de Catalogue of Life Foundation; de metadata vermelden CC BY 4.0 en DOI 10.48580/dgyy9. Omdat de dienstmetadata verschillende versielabels bevatten, zijn de feitelijke antwoorden van 27 september 2026, hun ophaaltijden en bestandshashes vastgelegd. Die bewaarde antwoorden bepalen de gebruikte versie. Darwin Core en TDWG TCS blijven de toetsingsbasis.</w:t>
+      </w:r>
+    </w:p>
+    <w:p>
+      <w:pPr/>
+      <w:r>
+        <w:t>Er blijven 278 beoordeelde registraties zonder primaire groep. Bij 116 ontbreekt de onderbouwing voor de scheiding schimmels/korstmossen; bij 53 bevat een alternatieve naamtreffer onvolledige of afwijkende groepsinformatie; bij 50 ontbreekt een exacte referentienaam; bij 39 is de vertaling naar de lokale groepen niet eenduidig. Verder gaat het om acht verzamel- of onvolledig gedetermineerde begrippen, vijf slijmzwammen die niet bij de huidige groepsomschrijving passen, vier afwijkende naamnotaties en drie niet verder ingedeelde vlinderregistraties. Deze gegevens blijven bewaard. Een nauwkeuriger indeling vereist gerichte onderbouwing; een geforceerde keuze zou het register minder betrouwbaar maken.</w:t>
+      </w:r>
+    </w:p>
+    <w:p>
+      <w:pPr/>
+      <w:r>
+        <w:t>Twee actieve bronvermeldingen blijven zonder doeltaxon: Naturalis-Indet. benoemt geen taxon; bij Toendrarietgans ontbreekt de wetenschappelijke bronnaam en strookt lokale code 1582 niet met de actuele EURING-code 01574. De 263 oorspronkelijke vogelnaamgebruiken en hun koppelingen zijn ongewijzigd. Alle 249 overige tabellen en bijbehorende databaseobjecten zijn vóór en na de aanvulling identiek. Website, dashboard en Shiny zijn niet aangepast. De veilige registeraanvulling is uitgevoerd en gecontroleerd met een terugdraaiproef en nacontrole. Details en herstelbewijs staan in docs/database/TAXONREGISTER.md.</w:t>
       </w:r>
     </w:p>
     <w:p>

</xml_diff>

<commit_message>
Integreer PQ-bronopnamen met centraal taxonregister
</commit_message>
<xml_diff>
--- a/docs/MEIJENDEL_BRONREGISTER.docx
+++ b/docs/MEIJENDEL_BRONREGISTER.docx
@@ -839,6 +839,20 @@
     </w:p>
     <w:bookmarkEnd w:id="13"/>
     <w:bookmarkStart w:id="14" w:name="X58edaa7a0159e378417d8d9e2f3abf27d746f4f"/>
+    <w:p>
+      <w:pPr>
+        <w:pStyle w:val="BodyText"/>
+      </w:pPr>
+      <w:r>
+        <w:rPr>
+          <w:b/>
+        </w:rPr>
+        <w:t>PQ-integratie, 27 september 2026.</w:t>
+      </w:r>
+      <w:r>
+        <w:t xml:space="preserve"> De 53.122 provinciale taxonregels uit 1981–2025 zijn in de levende lokale database rechtstreeks verbonden met het centrale taxonregister. De 714 oorspronkelijke taxonvermeldingen zijn daar met alle bronvelden behouden; de afzonderlijke PQ-taxoncatalogus is verwijderd. De 2.007 opnamen en de 513 gepubliceerde plot-jaaruitkomsten zijn ongewijzigd. Daarnaast zijn 644 vermoedelijk verwante LVD-bronopnamen met 16.627 resultaten uit 1981–2015 binnen de PQ-tabellen bijeengebracht. Zij behouden alle bronwaarden en 652 mogelijke opnamekoppelingen en tellen niet zelfstandig mee. De oorspronkelijke externe rijen zijn pas na inhoudscontrole verwijderd. De volledige migratie, het terugdraaien en het herstel uit back-up zijn beproefd. De publicatie naar website, dashboard en Shiny volgt via de gecontroleerde exportketen; hun bestaande provinciale uitkomsten blijven gelijk.</w:t>
+      </w:r>
+    </w:p>
     <w:p>
       <w:pPr>
         <w:pStyle w:val="Heading3"/>
@@ -2473,30 +2487,48 @@
         <w:t xml:space="preserve">De gepubliceerde bronversie 1.6 bevat binnen het basisgebied 5.195 opnamen en 119.006 taxonregels uit 1930–2015. Toegelaten zijn 3.437 opnamen met een gepubliceerde locatie-onzekerheid van maximaal 50 meter en 81.310 taxonresultaten uit 1959–2015. De overige 1.758 opnamen blijven buiten de analytische selectie vanwege een onzekerheid van 100, 1.000 of 5.000 meter.</w:t>
       </w:r>
     </w:p>
-    <w:p>
-      <w:pPr>
-        <w:pStyle w:val="BodyText"/>
-      </w:pPr>
-      <w:r>
-        <w:rPr>
-          <w:b/>
-          <w:bCs/>
-        </w:rPr>
-        <w:t xml:space="preserve">Overlap en gebruik.</w:t>
-      </w:r>
-      <w:r>
-        <w:t xml:space="preserve"> </w:t>
-      </w:r>
-      <w:r>
-        <w:t xml:space="preserve">De controle op datum, taxon en afstand markeert 8.006 resultaten als exacte en 5.163 als waarschijnlijke overlap met de primaire provinciale PQ-reeks. Deze 13.169 resultaten tellen niet als onafhankelijke tweede waarneming. Daarnaast hebben 51.078 LVD-resultaten een mogelijke overeenkomst met een NDFF-regel op taxon, datum en onzekerheidspolygoon. Omdat NDFF geen gedeelde bron-ID levert en de polygonen ruimtelijke onzekerheid weergeven, wordt die mogelijke overlap niet automatisch als dubbel verwijderd. De resterende opnamecontext is bruikbaar voor historische vegetatiesamenstelling en verspreiding; vergelijking door de tijd vereist controle van opnametype, oppervlak en herhaling.</w:t>
-      </w:r>
-    </w:p>
     <w:bookmarkEnd w:id="38"/>
     <w:bookmarkStart w:id="39" w:name="Xa66e2be297c2cf82b37e3e4b59e101c55a2b789"/>
     <w:p>
-      <w:pPr/>
-      <w:r>
-        <w:t>Taxonomische importbeperking, vastgesteld 27 september 2026. Bij alle 81.310 toegelaten LVD-resultaten (1959–2015; 998 verschillende naamstrings) bevat externe_ecologie_resultaat.taxonrang een status in plaats van een rang: 81.285 keer accepted en 25 keer synonym. De importeur heeft hiervoor taxonomicStatus gebruikt; de oorspronkelijke status is ook in bronmetadata bewaard. Gebruik dit veld niet als taxonomische rang. De uitgevoerde centrale registratie laat de rang leeg en houdt de bronstatus afzonderlijk herkenbaar. De bestaande import en bronlaag zijn niet gecorrigeerd; de ruimtelijke toelating, overlapbesluiten en meetwaarden blijven ongewijzigd. Zie docs/database/TAXONREGISTER.md voor het controlebewijs.</w:t>
+      <w:pPr>
+        <w:pStyle w:val="BodyText"/>
+      </w:pPr>
+      <w:r>
+        <w:rPr>
+          <w:b/>
+        </w:rPr>
+        <w:t>Overlap en gebruik.</w:t>
+      </w:r>
+      <w:r>
+        <w:t xml:space="preserve"> De oorspronkelijke controle op datum, taxon en afstand markeerde 8.006 resultaten als exacte en 5.163 als waarschijnlijke overlap met de primaire provinciale PQ-reeks. Dit betreft overeenkomsten per taxonregel, geen bewezen identieke volledige opnamen. Bij de PQ-integratie zijn de 644 volledige LVD-opnamen waartoe deze 13.169 resultaten behoren verplaatst, inclusief alle 16.627 bijbehorende resultaten uit 1981–2015. Geen van deze bronvarianten telt zelfstandig mee. Alle 32.657 bestaande overlapregels bij de verplaatste resultaten zijn behouden, ook hun mogelijke NDFF-koppelingen. Over de volledige LVD-selectie hebben 51.078 resultaten een mogelijke overeenkomst met een NDFF-regel op taxon, datum en onzekerheidspolygoon. Omdat NDFF geen gedeelde bron-ID levert en de polygonen ruimtelijke onzekerheid weergeven, wordt die mogelijke overlap niet automatisch als dubbel verwijderd. De opnamecontext blijft beschikbaar voor historische vegetatiesamenstelling en verspreiding; vergelijking door de tijd vereist controle van opnametype, oppervlak en herhaling.</w:t>
+      </w:r>
+    </w:p>
+    <w:p>
+      <w:pPr>
+        <w:pStyle w:val="BodyText"/>
+      </w:pPr>
+      <w:r>
+        <w:rPr>
+          <w:b/>
+        </w:rPr>
+        <w:t>PQ-broncontrole, 27 september 2026.</w:t>
+      </w:r>
+      <w:r>
+        <w:t xml:space="preserve"> Het oorspronkelijke LVD-archief is met toestemming alleen-lezen op de T7 gecontroleerd. De bestandshash klopt met de geïmporteerde bronversie. Het archief bevat opname-identificaties, maar geen vaste PQ-identificatie; voor de 3.437 geïmporteerde opnamen uit 1959–2015 bevat de reference-extensie geen aanvullende bronverwijzingen. Vergelijking met de 2.007 provinciale opnamen uit 1981–2025 levert op datum en afstand 654 mogelijke opnameparen uit 1981–2015 op. Bij 20 paren zijn de volledige lijsten met letterlijke taxonnamen en bedekkingscodes gelijk; bij vier daarvan verschillen de percentages. Verschillende namen zijn in deze vergelijking niet als synoniemen samengenomen. Ook een gelijke lijst bewijst op zichzelf geen gedeelde PQ-identiteit. De verplaatsing omvat uitsluitend de 644 LVD-opnamen met al vastgelegde provinciale overlap, samen 652 mogelijke opnameparen. De twee overige nabijheidskandidaten worden niet verplaatst. De herhaalbare vergelijking voor beide opslagplaatsen is gis/scripts/run_external_ecology_overlap_audit.py --pq-inventarisatie. Uitvoeringsbewijs en gecontroleerde herstelback-up staan lokaal onder outputs/pq-integratie.</w:t>
+      </w:r>
+    </w:p>
+    <w:p>
+      <w:pPr>
+        <w:pStyle w:val="BodyText"/>
+      </w:pPr>
+      <w:r>
+        <w:rPr>
+          <w:b/>
+        </w:rPr>
+        <w:t>Taxonomische importbeperking, vastgesteld 27 september 2026.</w:t>
+      </w:r>
+      <w:r>
+        <w:t xml:space="preserve"> De oorspronkelijke import gebruikte bij alle 81.310 toegelaten LVD-resultaten (1959–2015; 998 verschillende naamstrings) een status als taxonrang: 81.285 keer accepted en 25 keer synonym. De oorspronkelijke status blijft ook in de bronmetadata bewaard. Bij de 16.627 verplaatste resultaten heet dit veld nu taxonomische_status_aangeleverd; hun werkelijke taxonrang komt uit het centrale register en blijft leeg waar de bron geen rang levert. De 64.683 overige resultaten staan nog in de externe bronlaag met de oude veldnaam, die niet als rang mag worden gebruikt. De historische bulkimport blokkeert na de migratie tegen het opnieuw invoeren van verplaatste bronregels. Alle meetwaarden, ruimtelijke toelating en oorspronkelijke overlapbesluiten zijn behouden. Zie docs/database/TAXONREGISTER.md voor model, controles en herstelwijze.</w:t>
       </w:r>
     </w:p>
     <w:p>
@@ -4867,38 +4899,22 @@
         <w:t xml:space="preserve">, etiketplaats, oorspronkelijke en voor analyse genormaliseerde taxonnaam, datum of datuminterval, coördinaten, onzekerheid, licentie, DOI en bronmetadata zijn behouden. Ruimtelijke treffers zonder expliciet Meijendel-etiket en expliciete Meijendel-records zonder datum zijn niet toegelaten.</w:t>
       </w:r>
     </w:p>
-    <w:p>
-      <w:pPr>
-        <w:pStyle w:val="BodyText"/>
-      </w:pPr>
-      <w:r>
-        <w:rPr>
-          <w:b/>
-          <w:bCs/>
-        </w:rPr>
-        <w:t xml:space="preserve">Landelijke Vegetatie Databank: uitgevoerd voor de reproduceerbare bronversie 1.6.</w:t>
-      </w:r>
-      <w:r>
-        <w:t xml:space="preserve"> </w:t>
-      </w:r>
-      <w:r>
-        <w:t xml:space="preserve">Van 5.195 opnamen en 119.006 taxonregels zijn 3.437 opnamen en 81.310 taxonresultaten met maximaal 50 meter locatie-onzekerheid toegelaten. De overlapaudit markeert 13.169 resultaten als exact of waarschijnlijk reeds aanwezig in de provinciale PQ-reeks. Mogelijke NDFF-overlap blijft zichtbaar, maar wordt vanwege de NDFF-onzekerheidspolygonen niet automatisch als dubbel verwijderd. De duinvalleireeks kan zonder georeferentie niet op opnameniveau worden gekoppeld en blijft afzonderlijk in</w:t>
-      </w:r>
-      <w:r>
-        <w:t xml:space="preserve"> </w:t>
-      </w:r>
-      <w:r>
-        <w:rPr>
-          <w:rStyle w:val="VerbatimChar"/>
-        </w:rPr>
-        <w:t xml:space="preserve">Meijendel_bronnen</w:t>
-      </w:r>
-      <w:r>
-        <w:t xml:space="preserve">.</w:t>
-      </w:r>
-    </w:p>
     <w:bookmarkEnd w:id="82"/>
     <w:bookmarkStart w:id="83" w:name="Xa67120beb48c3916f8a53c623f303ce8b8a6005"/>
+    <w:p>
+      <w:pPr>
+        <w:pStyle w:val="BodyText"/>
+      </w:pPr>
+      <w:r>
+        <w:rPr>
+          <w:b/>
+        </w:rPr>
+        <w:t>Landelijke Vegetatie Databank: uitgevoerd voor de reproduceerbare bronversie 1.6.</w:t>
+      </w:r>
+      <w:r>
+        <w:t xml:space="preserve"> Van 5.195 opnamen en 119.006 taxonregels zijn 3.437 opnamen en 81.310 taxonresultaten uit 1959–2015 met maximaal 50 meter locatie-onzekerheid toegelaten. De PQ-integratie heeft 644 volledige bronopnamen met 16.627 resultaten uit 1981–2015 naar de PQ-tabellen verplaatst, met vermoedelijke koppelingen en zonder zelfstandig meetellen. De overige 2.793 opnamen met 64.683 resultaten blijven in de externe bronlaag. De bestaande analyse-ingang ontsluit beide opslagplaatsen zonder fysieke kopieën. Mogelijke NDFF-overlap blijft zichtbaar, maar wordt vanwege de NDFF-onzekerheidspolygonen niet automatisch als dubbel verwijderd. De duinvalleireeks kan zonder georeferentie niet op opnameniveau worden gekoppeld en blijft afzonderlijk in Meijendel_bronnen.</w:t>
+      </w:r>
+    </w:p>
     <w:p>
       <w:pPr>
         <w:pStyle w:val="Heading3"/>

</xml_diff>

<commit_message>
Bescherm productie-eigen objecten bij Meijendel-publicatie
</commit_message>
<xml_diff>
--- a/docs/MEIJENDEL_BRONREGISTER.docx
+++ b/docs/MEIJENDEL_BRONREGISTER.docx
@@ -13,14 +13,16 @@
     </w:p>
     <w:p>
       <w:pPr>
-        <w:pStyle w:val="FirstParagraph"/>
-      </w:pPr>
-      <w:r>
-        <w:rPr>
-          <w:b/>
-          <w:bCs/>
-        </w:rPr>
-        <w:t>Stand: 27 september 2026.</w:t>
+        <w:pStyle w:val="BodyText"/>
+      </w:pPr>
+      <w:r>
+        <w:rPr>
+          <w:b/>
+        </w:rPr>
+        <w:t>Stand: 28 september 2026.</w:t>
+      </w:r>
+      <w:r>
+        <w:t xml:space="preserve"> </w:t>
       </w:r>
     </w:p>
     <w:p>
@@ -3267,26 +3269,22 @@
         <w:t xml:space="preserve">204 regels uit 1924</w:t>
       </w:r>
     </w:p>
-    <w:p>
-      <w:pPr>
-        <w:pStyle w:val="BodyText"/>
-      </w:pPr>
-      <w:r>
-        <w:rPr>
-          <w:b/>
-          <w:bCs/>
-        </w:rPr>
-        <w:t xml:space="preserve">Waarde en beperking.</w:t>
-      </w:r>
-      <w:r>
-        <w:t xml:space="preserve"> </w:t>
-      </w:r>
-      <w:r>
-        <w:t xml:space="preserve">Historische vogelcontext. Zonder locatie per regel geen kavel- of ruimtelijke analyse.</w:t>
-      </w:r>
-    </w:p>
     <w:bookmarkEnd w:id="53"/>
     <w:bookmarkStart w:id="54" w:name="Xb3fdc40884db1bbf06132e666e117a731445140"/>
+    <w:p>
+      <w:pPr>
+        <w:pStyle w:val="BodyText"/>
+      </w:pPr>
+      <w:r>
+        <w:rPr>
+          <w:b/>
+        </w:rPr>
+        <w:t>Waarde en beperking.</w:t>
+      </w:r>
+      <w:r>
+        <w:t xml:space="preserve"> Historische vogelcontext. Zonder locatie per regel geen kavel- of ruimtelijke analyse. Het productieoverzicht van 28 september 2026 toont daarnaast een bestaande tabel vogelstand_1924 buiten de canonieke export. Deze blijft tijdens de PQ-publicatie onaangetast; haar aanwezigheid geeft geen nieuwe analysetoestemming. Dit schema-overzicht bewijst de tabelnaam en het type, niet haar actuele rijtelling.</w:t>
+      </w:r>
+    </w:p>
     <w:p>
       <w:pPr>
         <w:pStyle w:val="Heading3"/>

</xml_diff>

<commit_message>
Leg geslaagde PQ-publicatie en resterend MySQL-onderhoud vast
</commit_message>
<xml_diff>
--- a/docs/MEIJENDEL_BRONREGISTER.docx
+++ b/docs/MEIJENDEL_BRONREGISTER.docx
@@ -849,10 +849,10 @@
         <w:rPr>
           <w:b/>
         </w:rPr>
-        <w:t>PQ-integratie, 27 september 2026.</w:t>
-      </w:r>
-      <w:r>
-        <w:t xml:space="preserve"> De 53.122 provinciale taxonregels uit 1981–2025 zijn in de levende lokale database rechtstreeks verbonden met het centrale taxonregister. De 714 oorspronkelijke taxonvermeldingen zijn daar met alle bronvelden behouden; de afzonderlijke PQ-taxoncatalogus is verwijderd. De 2.007 opnamen en de 513 gepubliceerde plot-jaaruitkomsten zijn ongewijzigd. Daarnaast zijn 644 vermoedelijk verwante LVD-bronopnamen met 16.627 resultaten uit 1981–2015 binnen de PQ-tabellen bijeengebracht. Zij behouden alle bronwaarden en 652 mogelijke opnamekoppelingen en tellen niet zelfstandig mee. De oorspronkelijke externe rijen zijn pas na inhoudscontrole verwijderd. De volledige migratie, het terugdraaien en het herstel uit back-up zijn beproefd. De publicatie naar website, dashboard en Shiny volgt via de gecontroleerde exportketen; hun bestaande provinciale uitkomsten blijven gelijk.</w:t>
+        <w:t>PQ-integratie, 27–28 september 2026.</w:t>
+      </w:r>
+      <w:r>
+        <w:t xml:space="preserve"> De 53.122 provinciale taxonregels uit 1981–2025 zijn lokaal en op de VPS rechtstreeks verbonden met het centrale taxonregister. De 714 oorspronkelijke taxonvermeldingen zijn daar met alle bronvelden behouden; de afzonderlijke PQ-taxoncatalogus is verwijderd. De 2.007 opnamen en de 513 gepubliceerde plot-jaaruitkomsten zijn ongewijzigd. Daarnaast zijn 644 vermoedelijk verwante LVD-bronopnamen met 16.627 resultaten uit 1981–2015 binnen de PQ-tabellen bijeengebracht. Zij behouden alle bronwaarden en 652 mogelijke opnamekoppelingen en tellen niet zelfstandig mee. De oorspronkelijke externe rijen zijn pas na inhoudscontrole verwijderd. De volledige migratie, het terugdraaien en het herstel uit back-up zijn beproefd. De gecontroleerde publicatie naar website, dashboard en Shiny is op 28 september om 15:33 uur geslaagd; hun bestaande provinciale uitkomsten zijn gelijk gebleven.</w:t>
       </w:r>
     </w:p>
     <w:p>

</xml_diff>

<commit_message>
Koppel Vangblik aan centraal taxonregister met behoudsproeven
</commit_message>
<xml_diff>
--- a/docs/MEIJENDEL_BRONREGISTER.docx
+++ b/docs/MEIJENDEL_BRONREGISTER.docx
@@ -1049,6 +1049,20 @@
     </w:p>
     <w:bookmarkEnd w:id="16"/>
     <w:bookmarkStart w:id="34" w:name="X05a7f9ed9696b113895f0c60145ad70b98b3ccf"/>
+    <w:p>
+      <w:pPr>
+        <w:pStyle w:val="BodyText"/>
+      </w:pPr>
+      <w:r>
+        <w:rPr>
+          <w:b/>
+        </w:rPr>
+        <w:t>Vangblik-opschoning, 28 september 2026.</w:t>
+      </w:r>
+      <w:r>
+        <w:t xml:space="preserve"> De 60.560 vangstregels uit 1953–1960 zijn lokaal rechtstreeks verbonden met het centrale taxonregister. De 275 oorspronkelijke taxonvermeldingen zijn daar met alle bronvelden behouden; de afzonderlijke tabel vangblik_soorten is verwijderd. Alle 99.652 individuen, events, locaties, kwaliteitsvlaggen en oorspronkelijke bronwaarden zijn behouden. Ook de twee vangstregels uit 1959 zonder bijbehorend event blijven herkenbaar en uitgesloten. De bestaande taxonkoppelingen blijven kandidaat; deze opschoning bevestigt geen nieuwe soortidentificaties en verandert de analysegeschiktheid niet. De migratie, het terugdraaien en het volledige herstel uit back-up zijn beproefd. Website, dashboard en Shiny zijn niet aangepast; er is niets naar de VPS gepubliceerd.</w:t>
+      </w:r>
+    </w:p>
     <w:p>
       <w:pPr>
         <w:pStyle w:val="Heading3"/>

</xml_diff>

<commit_message>
Voeg bewezen dubbele taxonregistraties veilig samen
</commit_message>
<xml_diff>
--- a/docs/MEIJENDEL_BRONREGISTER.docx
+++ b/docs/MEIJENDEL_BRONREGISTER.docx
@@ -238,7 +238,27 @@
     <w:p>
       <w:pPr/>
       <w:r>
-        <w:t>Taxonomisch register aangevuld, 27 september 2026 om 21:53 uur. De levende lokale database bevat nu 27 praktische groepen en 15.580 naamgebruiken en referenties. Daarvan zijn 14.663 registraties aan hun oorspronkelijke bron gebonden; 917 zijn gedeelde externe naamreferenties. De 18.437 bronbesluiten omvatten 18.350 actieve besluiten en 87 bewaarde eerdere versies. Dit is geen telling van unieke biologische soorten of lokale aanwezigheid. Het register heeft geen eigen waarnemingsperiode en omvat NDFF, provinciale PQ, Vangblik, SOVON/AVIMAP, de zes externe datasets en aanvullende referentiecatalogi. Meetperioden en toelatingsvoorwaarden blijven die van de afzonderlijke bronnen hieronder.</w:t>
+        <w:rPr>
+          <w:b/>
+        </w:rPr>
+        <w:t>Taxonomisch register aangevuld en gericht opgeschoond, stand 28 september 2026.</w:t>
+      </w:r>
+      <w:r>
+        <w:t xml:space="preserve"> De levende lokale database bevat nu 27 praktische groepen en 15.577 naamgebruiken en referenties. Daarvan zijn 14.660 registraties aan hun oorspronkelijke bron gebonden; 917 zijn gedeelde externe naamreferenties. Alle 18.437 oorspronkelijke bronbesluiten zijn behouden: 18.350 actieve besluiten en 87 bewaarde eerdere versies. Daarnaast zijn drie technische doorverwijzingen voor samengevoegde identificaties vastgelegd. Dit is geen telling van unieke biologische soorten of lokale aanwezigheid. Het register heeft geen eigen waarnemingsperiode en omvat NDFF, provinciale PQ, Vangblik, SOVON/AVIMAP, de zes externe datasets en aanvullende referentiecatalogi. Meetperioden en toelatingsvoorwaarden blijven die van de afzonderlijke bronnen hieronder.</w:t>
+      </w:r>
+    </w:p>
+    <w:p>
+      <w:pPr>
+        <w:pStyle w:val="BodyText"/>
+      </w:pPr>
+      <w:r>
+        <w:rPr>
+          <w:b/>
+        </w:rPr>
+        <w:t>Gerichte taxonfusie, 28 september 2026.</w:t>
+      </w:r>
+      <w:r>
+        <w:t xml:space="preserve"> Vijf naamregistraties van Rhantus frontalis en Haliplus ruficollis uit dezelfde Naturalis-keverlevering van 24 september 2026 zijn tot twee centrale records teruggebracht. De bronwaarden verschillen uitsluitend in subgenusnotatie; de overige taxonvelden en broncontext zijn gelijk. Alle oorspronkelijke waarden en bronkoppelingnummers zijn behouden en oude taxonnummers en UUIDs blijven herleidbaar. De meetrecords, perioden, locatiekwaliteit, rechten en analysegeschiktheid zijn niet veranderd. Volledige back-up, fusieproef, terugdraaien, volledig herstel en nacontrole zijn geslaagd. De overige 251 tabellen en alle 16 viewuitkomsten zijn ongewijzigd. Er is niets naar de VPS gepubliceerd. Er blijven 1.812 groepen met dezelfde wetenschappelijke naam; die zijn niet zonder verdere beoordeling als dubbelen te verwijderen. Selectie, onderbouwing en herstelbewijs staan in docs/database/TAXONREGISTER.md.</w:t>
       </w:r>
     </w:p>
     <w:p>

</xml_diff>

<commit_message>
Centraliseer bewezen dubbele taxa met volledig bronbehoud
</commit_message>
<xml_diff>
--- a/docs/MEIJENDEL_BRONREGISTER.docx
+++ b/docs/MEIJENDEL_BRONREGISTER.docx
@@ -19,7 +19,7 @@
         <w:rPr>
           <w:b/>
         </w:rPr>
-        <w:t>Stand: 28 september 2026.</w:t>
+        <w:t>Stand: 29 september 2026.</w:t>
       </w:r>
       <w:r>
         <w:t xml:space="preserve"> </w:t>
@@ -241,24 +241,24 @@
         <w:rPr>
           <w:b/>
         </w:rPr>
-        <w:t>Taxonomisch register aangevuld en gericht opgeschoond, stand 28 september 2026.</w:t>
-      </w:r>
-      <w:r>
-        <w:t xml:space="preserve"> De levende lokale database bevat nu 27 praktische groepen en 15.577 naamgebruiken en referenties. Daarvan zijn 14.660 registraties aan hun oorspronkelijke bron gebonden; 917 zijn gedeelde externe naamreferenties. Alle 18.437 oorspronkelijke bronbesluiten zijn behouden: 18.350 actieve besluiten en 87 bewaarde eerdere versies. Daarnaast zijn drie technische doorverwijzingen voor samengevoegde identificaties vastgelegd. Dit is geen telling van unieke biologische soorten of lokale aanwezigheid. Het register heeft geen eigen waarnemingsperiode en omvat NDFF, provinciale PQ, Vangblik, SOVON/AVIMAP, de zes externe datasets en aanvullende referentiecatalogi. Meetperioden en toelatingsvoorwaarden blijven die van de afzonderlijke bronnen hieronder.</w:t>
-      </w:r>
-    </w:p>
-    <w:p>
-      <w:pPr>
-        <w:pStyle w:val="BodyText"/>
-      </w:pPr>
-      <w:r>
-        <w:rPr>
-          <w:b/>
-        </w:rPr>
-        <w:t>Gerichte taxonfusie, 28 september 2026.</w:t>
-      </w:r>
-      <w:r>
-        <w:t xml:space="preserve"> Vijf naamregistraties van Rhantus frontalis en Haliplus ruficollis uit dezelfde Naturalis-keverlevering van 24 september 2026 zijn tot twee centrale records teruggebracht. De bronwaarden verschillen uitsluitend in subgenusnotatie; de overige taxonvelden en broncontext zijn gelijk. Alle oorspronkelijke waarden en bronkoppelingnummers zijn behouden en oude taxonnummers en UUIDs blijven herleidbaar. De meetrecords, perioden, locatiekwaliteit, rechten en analysegeschiktheid zijn niet veranderd. Volledige back-up, fusieproef, terugdraaien, volledig herstel en nacontrole zijn geslaagd. De overige 251 tabellen en alle 16 viewuitkomsten zijn ongewijzigd. Er is niets naar de VPS gepubliceerd. Er blijven 1.812 groepen met dezelfde wetenschappelijke naam; die zijn niet zonder verdere beoordeling als dubbelen te verwijderen. Selectie, onderbouwing en herstelbewijs staan in docs/database/TAXONREGISTER.md.</w:t>
+        <w:t>Taxonomisch register aangevuld en centraal opgeschoond, stand 29 september 2026.</w:t>
+      </w:r>
+      <w:r>
+        <w:t xml:space="preserve"> De levende lokale database bevat nu 27 praktische groepen en 13.421 centrale naamvermeldingen. De tabel met bronkoppelingen bevat 21.799 rijen: alle 18.437 oorspronkelijke bronbesluiten, drie eerdere identificatie-aliassen en 3.359 volledig bewaarde oorspronkelijke taxoncontexten. Van de oorspronkelijke besluiten blijven 18.350 actief en 87 als eerdere versies bewaard. Dit is geen telling van unieke biologische soorten of lokale aanwezigheid. Het register heeft geen eigen waarnemingsperiode en omvat NDFF, provinciale PQ, Vangblik, SOVON/AVIMAP, de zes externe datasets en aanvullende referentiecatalogi. Meetperioden en toelatingsvoorwaarden blijven die van de afzonderlijke bronnen hieronder.</w:t>
+      </w:r>
+    </w:p>
+    <w:p>
+      <w:pPr>
+        <w:pStyle w:val="BodyText"/>
+      </w:pPr>
+      <w:r>
+        <w:rPr>
+          <w:b/>
+        </w:rPr>
+        <w:t>Gerichte taxonfusie, 28 en 29 september 2026.</w:t>
+      </w:r>
+      <w:r>
+        <w:t xml:space="preserve"> Na de eerste samenvoeging van drie Naturalis-keverregistraties zijn op 29 september in 1.203 naamgroepen nog 2.156 dubbele centrale rijen samengebracht. Ook Glaucium flavum staat nu één keer centraal. Alle oorspronkelijke waarden en bronkoppelingnummers zijn behouden; oude taxonnummers en UUIDs blijven met hun oorspronkelijke context herleidbaar. De meetrecords, perioden, locatiekwaliteit, rechten en analysegeschiktheid zijn niet veranderd. Volledige back-up, fusieproef, terugdraaien, volledig herstel en levende nacontrole zijn geslaagd. De overige 251 tabellen en alle 16 viewuitkomsten zijn ongewijzigd. Alle 18.351 geteste bestaande bronidentiteiten vinden bij herhaling hun bestaande koppeling terug. Er is niets naar de VPS gepubliceerd. De lijst is nog niet geheel ontdubbeld: 751 naamgroepen met samen 1.960 rijen vragen verdere beoordeling van naamgenoten, auteurschap, classificatie of determinatieniveau. Zij zijn niet allemaal bewezen verschillende taxa. Selectie, redenen en herstelbewijs staan in docs/database/TAXONREGISTER.md.</w:t>
       </w:r>
     </w:p>
     <w:p>
@@ -288,7 +288,7 @@
     <w:p>
       <w:pPr/>
       <w:r>
-        <w:t>Twee actieve bronvermeldingen blijven zonder doeltaxon: Naturalis-Indet. benoemt geen taxon; bij Toendrarietgans ontbreekt de wetenschappelijke bronnaam en strookt lokale code 1582 niet met de actuele EURING-code 01574. De 263 oorspronkelijke vogelnaamgebruiken en hun koppelingen zijn ongewijzigd. Alle 249 overige tabellen en bijbehorende databaseobjecten zijn vóór en na de aanvulling identiek. Website, dashboard en Shiny zijn niet aangepast. De veilige registeraanvulling is uitgevoerd en gecontroleerd met een terugdraaiproef en nacontrole. Details en herstelbewijs staan in docs/database/TAXONREGISTER.md.</w:t>
+        <w:t>Twee actieve bronvermeldingen blijven zonder doeltaxon: Naturalis-Indet. benoemt geen taxon; bij Toendrarietgans ontbreekt de wetenschappelijke bronnaam en strookt lokale code 1582 niet met de actuele EURING-code 01574. De 263 oorspronkelijke vogelnaamgebruiken zijn volledig bewaard en hun koppelingnummers blijven gelijk. Bij de registeraanvulling van 27 september waren alle 249 toenmalige overige tabellen en bijbehorende databaseobjecten vóór en na de aanvulling identiek. Bij de centralisatie van 29 september geldt dat voor de inmiddels 251 overige tabellen. Website, dashboard en Shiny zijn niet aangepast. Beide uitvoeringen zijn gecontroleerd met een terugdraaiproef en nacontrole. Details en herstelbewijs staan in docs/database/TAXONREGISTER.md.</w:t>
       </w:r>
     </w:p>
     <w:p>

</xml_diff>

<commit_message>
Rond taxonontdubbeling af met bronbehoud en importbewaking
</commit_message>
<xml_diff>
--- a/docs/MEIJENDEL_BRONREGISTER.docx
+++ b/docs/MEIJENDEL_BRONREGISTER.docx
@@ -244,7 +244,7 @@
         <w:t>Taxonomisch register aangevuld en centraal opgeschoond, stand 29 september 2026.</w:t>
       </w:r>
       <w:r>
-        <w:t xml:space="preserve"> De levende lokale database bevat nu 27 praktische groepen en 13.421 centrale naamvermeldingen. De tabel met bronkoppelingen bevat 21.799 rijen: alle 18.437 oorspronkelijke bronbesluiten, drie eerdere identificatie-aliassen en 3.359 volledig bewaarde oorspronkelijke taxoncontexten. Van de oorspronkelijke besluiten blijven 18.350 actief en 87 als eerdere versies bewaard. Dit is geen telling van unieke biologische soorten of lokale aanwezigheid. Het register heeft geen eigen waarnemingsperiode en omvat NDFF, provinciale PQ, Vangblik, SOVON/AVIMAP, de zes externe datasets en aanvullende referentiecatalogi. Meetperioden en toelatingsvoorwaarden blijven die van de afzonderlijke bronnen hieronder.</w:t>
+        <w:t xml:space="preserve"> De levende lokale database bevat nu 27 praktische groepen en 11.659 centrale naamvermeldingen. De tabel met bronkoppelingen bevat 24.561 rijen: alle 18.437 oorspronkelijke bronbesluiten, drie eerdere identificatie-aliassen en 6.121 volledig bewaarde oorspronkelijke taxoncontexten. Van de oorspronkelijke besluiten blijven 18.350 actief en 87 als eerdere versies bewaard. Dit is geen telling van unieke biologische soorten of lokale aanwezigheid. Het register heeft geen eigen waarnemingsperiode en omvat NDFF, provinciale PQ, Vangblik, SOVON/AVIMAP, de zes externe datasets en aanvullende referentiecatalogi. Meetperioden en toelatingsvoorwaarden blijven die van de afzonderlijke bronnen hieronder.</w:t>
       </w:r>
     </w:p>
     <w:p>
@@ -258,7 +258,7 @@
         <w:t>Gerichte taxonfusie, 28 en 29 september 2026.</w:t>
       </w:r>
       <w:r>
-        <w:t xml:space="preserve"> Na de eerste samenvoeging van drie Naturalis-keverregistraties zijn op 29 september in 1.203 naamgroepen nog 2.156 dubbele centrale rijen samengebracht. Ook Glaucium flavum staat nu één keer centraal. Alle oorspronkelijke waarden en bronkoppelingnummers zijn behouden; oude taxonnummers en UUIDs blijven met hun oorspronkelijke context herleidbaar. De meetrecords, perioden, locatiekwaliteit, rechten en analysegeschiktheid zijn niet veranderd. Volledige back-up, fusieproef, terugdraaien, volledig herstel en levende nacontrole zijn geslaagd. De overige 251 tabellen en alle 16 viewuitkomsten zijn ongewijzigd. Alle 18.351 geteste bestaande bronidentiteiten vinden bij herhaling hun bestaande koppeling terug. Er is niets naar de VPS gepubliceerd. De lijst is nog niet geheel ontdubbeld: 751 naamgroepen met samen 1.960 rijen vragen verdere beoordeling van naamgenoten, auteurschap, classificatie of determinatieniveau. Zij zijn niet allemaal bewezen verschillende taxa. Selectie, redenen en herstelbewijs staan in docs/database/TAXONREGISTER.md.</w:t>
+        <w:t xml:space="preserve"> Na de eerste samenvoeging van drie Naturalis-keverregistraties zijn op 29 september eerst 2.156 en daarna nog 1.762 dubbele centrale rijen samengebracht. Ook Glaucium flavum staat nu één keer centraal. De 751 eerder overgebleven naamgroepen zijn inhoudelijk afgehandeld, evenals aanvullende auteurs-, rang-, spelling- en conditievarianten. Zeven gelijknamige paren blijven afzonderlijk omdat zij verschillende taxa of determinatie-eenheden betekenen. Alle oorspronkelijke waarden en bronkoppelingnummers zijn behouden; oude taxonnummers en UUIDs blijven met hun oorspronkelijke context herleidbaar. Meetrecords, perioden, locatiekwaliteit, rechten en analysegeschiktheid zijn niet veranderd. Back-up, fusieproef, terugdraaien, volledig herstel en levende nacontrole zijn geslaagd. De overige 251 tabellen en alle 16 viewuitkomsten zijn ongewijzigd. Alle 21.710 geteste bestaande bronidentiteiten vinden bij herhaling hun bestaande koppeling terug. De importpoort blokkeert onbesliste nieuwe naamvarianten. Er is niets naar de VPS gepubliceerd. Selectie, de zeven uitzonderingen en herstelbewijs staan in docs/database/TAXONREGISTER.md.</w:t>
       </w:r>
     </w:p>
     <w:p>
@@ -282,7 +282,7 @@
     <w:p>
       <w:pPr/>
       <w:r>
-        <w:t>Er blijven 278 beoordeelde registraties zonder primaire groep. Bij 116 ontbreekt de onderbouwing voor de scheiding schimmels/korstmossen; bij 53 bevat een alternatieve naamtreffer onvolledige of afwijkende groepsinformatie; bij 50 ontbreekt een exacte referentienaam; bij 39 is de vertaling naar de lokale groepen niet eenduidig. Verder gaat het om acht verzamel- of onvolledig gedetermineerde begrippen, vijf slijmzwammen die niet bij de huidige groepsomschrijving passen, vier afwijkende naamnotaties en drie niet verder ingedeelde vlinderregistraties. Deze gegevens blijven bewaard. Een nauwkeuriger indeling vereist gerichte onderbouwing; een geforceerde keuze zou het register minder betrouwbaar maken.</w:t>
+        <w:t>De eerdere beoordeling liet 278 bronregistraties zonder primaire groep. Na centralisatie en de onderbouwde fusies zijn er 235 centrale naamvermeldingen zonder primaire groep. Dit zijn andere teleenheden: oorspronkelijke bronregistraties blijven bij hun centrale bestemming bewaard. De ontbrekende groep betreft onder meer de scheiding schimmels/korstmossen, onvolledige classificatie, verzamelbegrippen en slijmzwammen die niet bij de huidige groepsomschrijving passen. De oorspronkelijke reden blijft per bronregistratie vastgelegd. Dit staat los van dubbelingen: een geforceerde groepskeuze zou de gegevens niet betrouwbaarder maken.</w:t>
       </w:r>
     </w:p>
     <w:p>
@@ -2564,13 +2564,19 @@
         <w:t>Taxonomische importbeperking, vastgesteld 27 september 2026.</w:t>
       </w:r>
       <w:r>
-        <w:t xml:space="preserve"> De oorspronkelijke import gebruikte bij alle 81.310 toegelaten LVD-resultaten (1959–2015; 998 verschillende naamstrings) een status als taxonrang: 81.285 keer accepted en 25 keer synonym. De oorspronkelijke status blijft ook in de bronmetadata bewaard. Bij de 16.627 verplaatste resultaten heet dit veld nu taxonomische_status_aangeleverd; hun werkelijke taxonrang komt uit het centrale register en blijft leeg waar de bron geen rang levert. De 64.683 overige resultaten staan nog in de externe bronlaag met de oude veldnaam, die niet als rang mag worden gebruikt. De historische bulkimport blokkeert na de migratie tegen het opnieuw invoeren van verplaatste bronregels. Alle meetwaarden, ruimtelijke toelating en oorspronkelijke overlapbesluiten zijn behouden. Zie docs/database/TAXONREGISTER.md voor model, controles en herstelwijze.</w:t>
+        <w:t xml:space="preserve"> De oorspronkelijke import gebruikte bij alle 81.310 toegelaten LVD-resultaten (1959–2015; 998 verschillende naamstrings) een status als taxonrang: 81.285 keer accepted en 25 keer synonym. De oorspronkelijke status blijft ook in de bronmetadata bewaard. Bij de 16.627 verplaatste resultaten heet dit veld nu taxonomische_status_aangeleverd; hun oorspronkelijke taxonrang wordt via het centrale register uit de bewaarde broncontext gelezen en blijft leeg waar de bron geen rang levert. De 64.683 overige resultaten staan nog in de externe bronlaag met de oude veldnaam, die niet als rang mag worden gebruikt. De historische bulkimport blokkeert na de migratie tegen het opnieuw invoeren van verplaatste bronregels. Alle meetwaarden, ruimtelijke toelating en oorspronkelijke overlapbesluiten zijn behouden. Zie docs/database/TAXONREGISTER.md voor model, controles en herstelwijze.</w:t>
       </w:r>
     </w:p>
     <w:p>
       <w:pPr/>
       <w:r>
-        <w:t>Aanvullende taxonomische metadata, beoordeeld 27 september 2026. In de extractie van 998 LVD-naamgebruiken uit de bronreeks 1959–2015 is bij 122 het veld scientificNameAuthorship gelijk aan de volledige scientificName. Manifest v3 heeft deze tekst niet als auteur overgenomen: het centrale veld naam_auteur blijft voor deze 122 naamgebruiken leeg. De letterlijke bronmetadata zijn in taxa_bronkoppeling behouden. Dit betreft 122 naamgebruiken, niet 122 waarnemingen. De toevoeging aan het register verandert geen meetwaarden, ruimtelijke toelating, overlapbesluiten of bestaande bronvelden.</w:t>
+        <w:rPr>
+          <w:b/>
+        </w:rPr>
+        <w:t>Aanvullende taxonomische metadata, beoordeeld 27 september 2026.</w:t>
+      </w:r>
+      <w:r>
+        <w:t xml:space="preserve"> In de extractie van 998 LVD-naamgebruiken uit de bronreeks 1959–2015 is bij 122 het veld scientificNameAuthorship gelijk aan de volledige scientificName. Manifest v3 heeft deze tekst niet als auteur overgenomen: het centrale veld naam_auteur bleef bij die invoer voor deze 122 naamgebruiken leeg. Bij de centralisatie zijn afzonderlijk onderbouwde auteursnamen aangevuld; de oorspronkelijke lege waarde blijft in de broncontext bewaard. De letterlijke bronmetadata zijn in taxa_bronkoppeling behouden. Dit betreft 122 naamgebruiken, niet 122 waarnemingen. De toevoeging aan het register verandert geen meetwaarden, ruimtelijke toelating, overlapbesluiten of bestaande bronvelden.</w:t>
       </w:r>
     </w:p>
     <w:p>

</xml_diff>

<commit_message>
Ontsluit alle soortwaarnemingen via centraal taxonregister
</commit_message>
<xml_diff>
--- a/docs/MEIJENDEL_BRONREGISTER.docx
+++ b/docs/MEIJENDEL_BRONREGISTER.docx
@@ -5,9 +5,12 @@
     <w:bookmarkStart w:id="96" w:name="Xdea145a7474320bcc321aebaf5687f9ab4d02fb"/>
     <w:p>
       <w:pPr>
-        <w:pStyle w:val="Heading1"/>
-      </w:pPr>
-      <w:r>
+        <w:pStyle w:val="Title"/>
+      </w:pPr>
+      <w:r>
+        <w:rPr>
+          <w:color w:val="000000"/>
+        </w:rPr>
         <w:t xml:space="preserve">Bronregister ecologische gegevens Meijendel</w:t>
       </w:r>
     </w:p>
@@ -91,6 +94,9 @@
         <w:pStyle w:val="Heading2"/>
       </w:pPr>
       <w:r>
+        <w:rPr>
+          <w:color w:val="000000"/>
+        </w:rPr>
         <w:t xml:space="preserve">De statussen</w:t>
       </w:r>
     </w:p>
@@ -244,7 +250,20 @@
         <w:t>Taxonomisch register aangevuld en centraal opgeschoond, stand 29 september 2026.</w:t>
       </w:r>
       <w:r>
-        <w:t xml:space="preserve"> De levende lokale database bevat nu 27 praktische groepen en 11.659 centrale naamvermeldingen. De tabel met bronkoppelingen bevat 24.561 rijen: alle 18.437 oorspronkelijke bronbesluiten, drie eerdere identificatie-aliassen en 6.121 volledig bewaarde oorspronkelijke taxoncontexten. Van de oorspronkelijke besluiten blijven 18.350 actief en 87 als eerdere versies bewaard. Dit is geen telling van unieke biologische soorten of lokale aanwezigheid. Het register heeft geen eigen waarnemingsperiode en omvat NDFF, provinciale PQ, Vangblik, SOVON/AVIMAP, de zes externe datasets en aanvullende referentiecatalogi. Meetperioden en toelatingsvoorwaarden blijven die van de afzonderlijke bronnen hieronder.</w:t>
+        <w:t xml:space="preserve"> De levende lokale database bevat nu 27 praktische groepen en 11.660 centrale vermeldingen: 11.659 naamvermeldingen en één uitdrukkelijk onbepaald operationeel collectieobject. De tabel met bronkoppelingen bevat 30.035 rijen: alle 18.437 oorspronkelijke bronbesluiten, drie eerdere identificatie-aliassen, 6.121 volledig bewaarde oorspronkelijke taxoncontexten, 5.473 aanvullende brongebruiken voor afgeleide meet-/doelsoortregels en de koppeling van het onbepaalde object. Van de oorspronkelijke besluiten blijven 18.350 actief en 87 als eerdere versies bewaard. Dit is geen telling van unieke biologische soorten of lokale aanwezigheid. Het register heeft geen eigen waarnemingsperiode en omvat NDFF, provinciale PQ, Vangblik, SOVON/AVIMAP, de zes externe datasets en aanvullende referentiecatalogi. Meetperioden en toelatingsvoorwaarden blijven die van de afzonderlijke bronnen hieronder.</w:t>
+      </w:r>
+    </w:p>
+    <w:p>
+      <w:pPr/>
+      <w:pPr/>
+      <w:r>
+        <w:rPr>
+          <w:b/>
+        </w:rPr>
+        <w:t>Alle soortwaarnemingen centraal bereikbaar, 29 september 2026.</w:t>
+      </w:r>
+      <w:r>
+        <w:t xml:space="preserve"> Vanuit taxa, taxa_bronkoppeling en taxon_groepen zijn alle oorspronkelijke soortwaarnemingen, afgeleide meetregels, echte nullen en historische versies in Meijendel bereikbaar. De volledige inventarisatie van 253 basistabellen geeft 122 beoordeelde routes, zonder ontbrekende koppelingen of vermenigvuldiging van soortregels. Dit omvat ook alle LVD-resultaten binnen en buiten pq_*. Alle oorspronkelijke gegevens, bronwaarden, interne verwijzingen, analysebeperkingen en 16 bestaande viewuitkomsten zijn behouden. Terugdraaien, onafhankelijk volledig herstel en levende nacontrole zijn geslaagd. Iedere volgende databasewijziging wordt vóór en na uitvoering volledig gecontroleerd; 242 rijtriggers beschermen bestaande bronidentiteiten en verwijzingen. Nieuwe gegevenslagen moeten expliciet in die controle worden opgenomen. Geen VPS-publicatie. De fysieke verplaatsing van resterende PQ/LVD-inhoud is een afzonderlijke, nog open taak. Uitvoering, aantallen per bron en periode, querygebruik en herstelbewijs staan in docs/database/TAXONREGISTER.md.</w:t>
       </w:r>
     </w:p>
     <w:p>
@@ -282,13 +301,13 @@
     <w:p>
       <w:pPr/>
       <w:r>
-        <w:t>De eerdere beoordeling liet 278 bronregistraties zonder primaire groep. Na centralisatie en de onderbouwde fusies zijn er 235 centrale naamvermeldingen zonder primaire groep. Dit zijn andere teleenheden: oorspronkelijke bronregistraties blijven bij hun centrale bestemming bewaard. De ontbrekende groep betreft onder meer de scheiding schimmels/korstmossen, onvolledige classificatie, verzamelbegrippen en slijmzwammen die niet bij de huidige groepsomschrijving passen. De oorspronkelijke reden blijft per bronregistratie vastgelegd. Dit staat los van dubbelingen: een geforceerde groepskeuze zou de gegevens niet betrouwbaarder maken.</w:t>
+        <w:t>De eerdere beoordeling liet 278 bronregistraties zonder primaire groep. Na centralisatie en de onderbouwde fusies zijn er 235 centrale naamvermeldingen zonder primaire groep, plus het onbepaalde operationele collectieobject. Dit zijn andere teleenheden: oorspronkelijke bronregistraties blijven bij hun centrale bestemming bewaard. De ontbrekende groep betreft onder meer de scheiding schimmels/korstmossen, onvolledige classificatie, verzamelbegrippen en slijmzwammen die niet bij de huidige groepsomschrijving passen. De oorspronkelijke reden blijft per bronregistratie vastgelegd. Dit staat los van dubbelingen: een geforceerde groepskeuze zou de gegevens niet betrouwbaarder maken. Een ontbrekende groep sluit geen waarneming uit van de centrale zoekroute.</w:t>
       </w:r>
     </w:p>
     <w:p>
       <w:pPr/>
       <w:r>
-        <w:t>Twee actieve bronvermeldingen blijven zonder doeltaxon: Naturalis-Indet. benoemt geen taxon; bij Toendrarietgans ontbreekt de wetenschappelijke bronnaam en strookt lokale code 1582 niet met de actuele EURING-code 01574. De 263 oorspronkelijke vogelnaamgebruiken zijn volledig bewaard en hun koppelingnummers blijven gelijk. Bij de registeraanvulling van 27 september waren alle 249 toenmalige overige tabellen en bijbehorende databaseobjecten vóór en na de aanvulling identiek. Bij de centralisatie van 29 september geldt dat voor de inmiddels 251 overige tabellen. Website, dashboard en Shiny zijn niet aangepast. Beide uitvoeringen zijn gecontroleerd met een terugdraaiproef en nacontrole. Details en herstelbewijs staan in docs/database/TAXONREGISTER.md.</w:t>
+        <w:t>Twee oorspronkelijke actieve bronbesluiten blijven inhoudelijk onbeoordeeld en zonder biologisch doeltaxon. Naturalis-Indet. benoemt geen taxon; zijn ene collectieobject uit 2018 is nu via een aanvullende, uitdrukkelijk onbepaalde operationele koppeling centraal bereikbaar. Bij Toendrarietgans ontbreekt de wetenschappelijke bronnaam en strookt lokale code 1582 niet met de actuele EURING-code 01574. Deze bronregel wordt alleen gebruikt in twee beleidsreferentierijen en niet in vogelwaarnemingen; een nieuwe waarneming met deze onopgeloste sleutel wordt geweigerd. De 263 oorspronkelijke vogelnaamgebruiken, koppelingnummers en bronbesluiten zijn volledig bewaard. De eerdere registeraanvulling en taxonfusie en de huidige volledige waarnemingskoppeling zijn afzonderlijk gecontroleerd. Website, dashboard en Shiny zijn niet aangepast. Details en herstelbewijs staan in docs/database/TAXONREGISTER.md.</w:t>
       </w:r>
     </w:p>
     <w:p>
@@ -296,6 +315,9 @@
         <w:pStyle w:val="Heading2"/>
       </w:pPr>
       <w:r>
+        <w:rPr>
+          <w:color w:val="000000"/>
+        </w:rPr>
         <w:t xml:space="preserve">Overkoepelende analysegeschiktheid</w:t>
       </w:r>
     </w:p>
@@ -652,6 +674,9 @@
         <w:pStyle w:val="Heading2"/>
       </w:pPr>
       <w:r>
+        <w:rPr>
+          <w:color w:val="000000"/>
+        </w:rPr>
         <w:t xml:space="preserve">Beheerregel</w:t>
       </w:r>
     </w:p>
@@ -660,7 +685,7 @@
         <w:pStyle w:val="FirstParagraph"/>
       </w:pPr>
       <w:r>
-        <w:t xml:space="preserve">Iedere ontdekking, levering, import, verplaatsing, uitsluiting of nieuwe beoordeling van een Meijendel-gegevensbron wordt in dit document verwerkt. Dat geldt ook wanneer eigenaar, omvang, periode, locatiekwaliteit, rechten, overlap, validatiestatus of statistische bruikbaarheid verandert. Daarbij worden steeds de analytische database MySQL Meijendel, de MySQL contextdatabase Meijendel_bronnen en de kandidaatbronnen gezamenlijk gecontroleerd. De Markdown-versie is leidend; de Wordversie wordt in dezelfde wijziging inhoudelijk gelijkgetrokken, gerenderd en gecontroleerd.</w:t>
+        <w:t>Iedere ontdekking, levering, import, verplaatsing, uitsluiting of nieuwe beoordeling van een Meijendel-gegevensbron wordt in dit document verwerkt. Dat geldt ook wanneer eigenaar, omvang, periode, locatiekwaliteit, rechten, overlap, validatiestatus of statistische bruikbaarheid verandert. Daarbij worden steeds de analytische database MySQL Meijendel, de MySQL contextdatabase Meijendel_bronnen en de kandidaatbronnen gezamenlijk gecontroleerd. Iedere wijziging van Meijendel vereist ook de volledige voor- en nacontrole van de bereikbaarheid van alle soortwaarnemingen via het centrale taxonregister. De Markdown-versie is leidend; de Wordversie wordt in dezelfde wijziging inhoudelijk gelijkgetrokken, gerenderd en gecontroleerd.</w:t>
       </w:r>
     </w:p>
     <w:bookmarkEnd w:id="11"/>
@@ -670,14 +695,21 @@
         <w:pStyle w:val="Heading2"/>
       </w:pPr>
       <w:r>
+        <w:rPr>
+          <w:color w:val="000000"/>
+        </w:rPr>
         <w:t xml:space="preserve">1. Bronnen in MySQL-database</w:t>
       </w:r>
       <w:r>
+        <w:rPr>
+          <w:color w:val="000000"/>
+        </w:rPr>
         <w:t xml:space="preserve"> </w:t>
       </w:r>
       <w:r>
         <w:rPr>
           <w:rStyle w:val="VerbatimChar"/>
+          <w:color w:val="000000"/>
         </w:rPr>
         <w:t xml:space="preserve">Meijendel</w:t>
       </w:r>
@@ -688,6 +720,9 @@
         <w:pStyle w:val="Heading3"/>
       </w:pPr>
       <w:r>
+        <w:rPr>
+          <w:color w:val="000000"/>
+        </w:rPr>
         <w:t xml:space="preserve">1.1. Vogelgegevens van Vogelwerkgroep Meijendel en SOVON</w:t>
       </w:r>
     </w:p>
@@ -784,6 +819,9 @@
         <w:pStyle w:val="Heading3"/>
       </w:pPr>
       <w:r>
+        <w:rPr>
+          <w:color w:val="000000"/>
+        </w:rPr>
         <w:t xml:space="preserve">1.2. Provinciale permanente kwadraten</w:t>
       </w:r>
     </w:p>
@@ -880,6 +918,9 @@
         <w:pStyle w:val="Heading3"/>
       </w:pPr>
       <w:r>
+        <w:rPr>
+          <w:color w:val="000000"/>
+        </w:rPr>
         <w:t xml:space="preserve">1.3. Zoogdieren tijdens SOVON- en VWG-bezoeken</w:t>
       </w:r>
     </w:p>
@@ -962,6 +1003,9 @@
         <w:pStyle w:val="Heading3"/>
       </w:pPr>
       <w:r>
+        <w:rPr>
+          <w:color w:val="000000"/>
+        </w:rPr>
         <w:t xml:space="preserve">1.4. Historisch vangblikonderzoek</w:t>
       </w:r>
     </w:p>
@@ -1088,6 +1132,9 @@
         <w:pStyle w:val="Heading3"/>
       </w:pPr>
       <w:r>
+        <w:rPr>
+          <w:color w:val="000000"/>
+        </w:rPr>
         <w:t xml:space="preserve">1.5. NDFF: één canonieke laag van openbare en beveiligde gegevens</w:t>
       </w:r>
     </w:p>
@@ -1098,15 +1145,11 @@
       <w:r>
         <w:rPr>
           <w:b/>
-          <w:bCs/>
-        </w:rPr>
-        <w:t xml:space="preserve">Omvang en periode.</w:t>
-      </w:r>
-      <w:r>
-        <w:t xml:space="preserve"> </w:t>
-      </w:r>
-      <w:r>
-        <w:t xml:space="preserve">De levering bevat 810.830 unieke niet-vogelrecords uit 1950–2025. De beveiligde levering bevat 14.573 records voor 191 geselecteerde taxa. Daarvan vervangen 14.420 records hun openbare, vervaagde tegenhanger en zijn 153 records alleen in de beveiligde levering aanwezig. De gecombineerde laag telt daardoor 810.983 unieke waarnemingen.</w:t>
+        </w:rPr>
+        <w:t>Omvang en periode.</w:t>
+      </w:r>
+      <w:r>
+        <w:t xml:space="preserve"> De openbare levering bevat 810.830 unieke niet-vogelrecords uit de downloadselectie 1950–2025. De ruwe bronjaren lopen echter van 1700 tot 2025: 5.336 regels hebben een bronjaar in 1700–1949. Dat bevestigt geen waarnemingsdatum in die eerdere jaren; bronintervallen en datumkwaliteit blijven per record behouden. De beveiligde levering bevat 14.573 records voor 191 geselecteerde taxa. Daarvan vervangen 14.420 records hun openbare, vervaagde tegenhanger en zijn 153 records alleen in de beveiligde levering aanwezig. De gecombineerde laag telt daardoor 810.983 unieke waarnemingen.</w:t>
       </w:r>
     </w:p>
     <w:p>
@@ -1169,6 +1212,9 @@
         <w:pStyle w:val="Heading4"/>
       </w:pPr>
       <w:r>
+        <w:rPr>
+          <w:color w:val="000000"/>
+        </w:rPr>
         <w:t xml:space="preserve">1.5.1. Dagvlinders</w:t>
       </w:r>
     </w:p>
@@ -1233,6 +1279,9 @@
         <w:pStyle w:val="Heading4"/>
       </w:pPr>
       <w:r>
+        <w:rPr>
+          <w:color w:val="000000"/>
+        </w:rPr>
         <w:t xml:space="preserve">1.5.2. Hommels</w:t>
       </w:r>
     </w:p>
@@ -1297,6 +1346,9 @@
         <w:pStyle w:val="Heading4"/>
       </w:pPr>
       <w:r>
+        <w:rPr>
+          <w:color w:val="000000"/>
+        </w:rPr>
         <w:t xml:space="preserve">1.5.3. Libellen</w:t>
       </w:r>
     </w:p>
@@ -1361,6 +1413,9 @@
         <w:pStyle w:val="Heading4"/>
       </w:pPr>
       <w:r>
+        <w:rPr>
+          <w:color w:val="000000"/>
+        </w:rPr>
         <w:t xml:space="preserve">1.5.4. Nachtvlinders</w:t>
       </w:r>
     </w:p>
@@ -1425,6 +1480,9 @@
         <w:pStyle w:val="Heading4"/>
       </w:pPr>
       <w:r>
+        <w:rPr>
+          <w:color w:val="000000"/>
+        </w:rPr>
         <w:t xml:space="preserve">1.5.5. Amfibieën</w:t>
       </w:r>
     </w:p>
@@ -1489,6 +1547,9 @@
         <w:pStyle w:val="Heading4"/>
       </w:pPr>
       <w:r>
+        <w:rPr>
+          <w:color w:val="000000"/>
+        </w:rPr>
         <w:t xml:space="preserve">1.5.6. Reptielen</w:t>
       </w:r>
     </w:p>
@@ -1553,6 +1614,9 @@
         <w:pStyle w:val="Heading4"/>
       </w:pPr>
       <w:r>
+        <w:rPr>
+          <w:color w:val="000000"/>
+        </w:rPr>
         <w:t xml:space="preserve">1.5.7. Vissen</w:t>
       </w:r>
     </w:p>
@@ -1617,6 +1681,9 @@
         <w:pStyle w:val="Heading4"/>
       </w:pPr>
       <w:r>
+        <w:rPr>
+          <w:color w:val="000000"/>
+        </w:rPr>
         <w:t xml:space="preserve">1.5.8. Vleermuistransecten</w:t>
       </w:r>
     </w:p>
@@ -1681,6 +1748,9 @@
         <w:pStyle w:val="Heading4"/>
       </w:pPr>
       <w:r>
+        <w:rPr>
+          <w:color w:val="000000"/>
+        </w:rPr>
         <w:t xml:space="preserve">1.5.9. Konijnentellingen in de duinen</w:t>
       </w:r>
     </w:p>
@@ -1745,6 +1815,9 @@
         <w:pStyle w:val="Heading4"/>
       </w:pPr>
       <w:r>
+        <w:rPr>
+          <w:color w:val="000000"/>
+        </w:rPr>
         <w:t xml:space="preserve">1.5.10. Wintertellingen vleermuizen</w:t>
       </w:r>
     </w:p>
@@ -1809,6 +1882,9 @@
         <w:pStyle w:val="Heading4"/>
       </w:pPr>
       <w:r>
+        <w:rPr>
+          <w:color w:val="000000"/>
+        </w:rPr>
         <w:t xml:space="preserve">1.5.11. Het Nieuwe Strepen</w:t>
       </w:r>
     </w:p>
@@ -1873,6 +1949,9 @@
         <w:pStyle w:val="Heading4"/>
       </w:pPr>
       <w:r>
+        <w:rPr>
+          <w:color w:val="000000"/>
+        </w:rPr>
         <w:t xml:space="preserve">1.5.12. FLORBASE en andere vaatplantinventarisaties</w:t>
       </w:r>
     </w:p>
@@ -1937,6 +2016,9 @@
         <w:pStyle w:val="Heading4"/>
       </w:pPr>
       <w:r>
+        <w:rPr>
+          <w:color w:val="000000"/>
+        </w:rPr>
         <w:t xml:space="preserve">1.5.13. LMF-aandachtssoorten</w:t>
       </w:r>
     </w:p>
@@ -2001,6 +2083,9 @@
         <w:pStyle w:val="Heading4"/>
       </w:pPr>
       <w:r>
+        <w:rPr>
+          <w:color w:val="000000"/>
+        </w:rPr>
         <w:t xml:space="preserve">1.5.14. Mossen en korstmossen</w:t>
       </w:r>
     </w:p>
@@ -2065,6 +2150,9 @@
         <w:pStyle w:val="Heading4"/>
       </w:pPr>
       <w:r>
+        <w:rPr>
+          <w:color w:val="000000"/>
+        </w:rPr>
         <w:t xml:space="preserve">1.5.15. Bos- en zeereeppaddenstoelen</w:t>
       </w:r>
     </w:p>
@@ -2129,6 +2217,9 @@
         <w:pStyle w:val="Heading4"/>
       </w:pPr>
       <w:r>
+        <w:rPr>
+          <w:color w:val="000000"/>
+        </w:rPr>
         <w:t xml:space="preserve">1.5.16. Weekdieren</w:t>
       </w:r>
     </w:p>
@@ -2193,6 +2284,9 @@
         <w:pStyle w:val="Heading4"/>
       </w:pPr>
       <w:r>
+        <w:rPr>
+          <w:color w:val="000000"/>
+        </w:rPr>
         <w:t xml:space="preserve">1.5.17. SNL-gebiedsmonitoring</w:t>
       </w:r>
     </w:p>
@@ -2266,6 +2360,9 @@
         <w:pStyle w:val="Heading3"/>
       </w:pPr>
       <w:r>
+        <w:rPr>
+          <w:color w:val="000000"/>
+        </w:rPr>
         <w:t xml:space="preserve">1.6. Openbare externe ecologiebronnen</w:t>
       </w:r>
     </w:p>
@@ -2332,6 +2429,9 @@
         <w:pStyle w:val="Heading4"/>
       </w:pPr>
       <w:r>
+        <w:rPr>
+          <w:color w:val="000000"/>
+        </w:rPr>
         <w:t xml:space="preserve">1.6.1. STOWA Limnodata</w:t>
       </w:r>
     </w:p>
@@ -2420,6 +2520,9 @@
         <w:pStyle w:val="Heading4"/>
       </w:pPr>
       <w:r>
+        <w:rPr>
+          <w:color w:val="000000"/>
+        </w:rPr>
         <w:t xml:space="preserve">1.6.2. ENDURE helmduinfauna</w:t>
       </w:r>
     </w:p>
@@ -2484,6 +2587,9 @@
         <w:pStyle w:val="Heading4"/>
       </w:pPr>
       <w:r>
+        <w:rPr>
+          <w:color w:val="000000"/>
+        </w:rPr>
         <w:t xml:space="preserve">1.6.3. Landelijke Vegetatie Databank</w:t>
       </w:r>
     </w:p>
@@ -2584,6 +2690,9 @@
         <w:pStyle w:val="Heading4"/>
       </w:pPr>
       <w:r>
+        <w:rPr>
+          <w:color w:val="000000"/>
+        </w:rPr>
         <w:t xml:space="preserve">1.6.4. Historische vlinder- en motcollectie</w:t>
       </w:r>
     </w:p>
@@ -2648,6 +2757,9 @@
         <w:pStyle w:val="Heading4"/>
       </w:pPr>
       <w:r>
+        <w:rPr>
+          <w:color w:val="000000"/>
+        </w:rPr>
         <w:t xml:space="preserve">1.6.5. Naturalis Botany</w:t>
       </w:r>
     </w:p>
@@ -2712,6 +2824,9 @@
         <w:pStyle w:val="Heading4"/>
       </w:pPr>
       <w:r>
+        <w:rPr>
+          <w:color w:val="000000"/>
+        </w:rPr>
         <w:t xml:space="preserve">1.6.6. Naturalis Coleoptera</w:t>
       </w:r>
     </w:p>
@@ -2777,6 +2892,9 @@
         <w:pStyle w:val="Heading3"/>
       </w:pPr>
       <w:r>
+        <w:rPr>
+          <w:color w:val="000000"/>
+        </w:rPr>
         <w:t xml:space="preserve">1.7. Openstaande ruimtelijke toelatingscontrole</w:t>
       </w:r>
     </w:p>
@@ -2815,6 +2933,9 @@
         <w:pStyle w:val="Heading3"/>
       </w:pPr>
       <w:r>
+        <w:rPr>
+          <w:color w:val="000000"/>
+        </w:rPr>
         <w:t xml:space="preserve">1.8. Verklarende omgevingslagen</w:t>
       </w:r>
     </w:p>
@@ -2832,6 +2953,9 @@
         <w:pStyle w:val="Heading4"/>
       </w:pPr>
       <w:r>
+        <w:rPr>
+          <w:color w:val="000000"/>
+        </w:rPr>
         <w:t xml:space="preserve">1.8.1. Dagelijks weer</w:t>
       </w:r>
     </w:p>
@@ -2896,6 +3020,9 @@
         <w:pStyle w:val="Heading4"/>
       </w:pPr>
       <w:r>
+        <w:rPr>
+          <w:color w:val="000000"/>
+        </w:rPr>
         <w:t xml:space="preserve">1.8.2. Hoogte</w:t>
       </w:r>
     </w:p>
@@ -2960,6 +3087,9 @@
         <w:pStyle w:val="Heading4"/>
       </w:pPr>
       <w:r>
+        <w:rPr>
+          <w:color w:val="000000"/>
+        </w:rPr>
         <w:t xml:space="preserve">1.8.3. Stikstofdepositie</w:t>
       </w:r>
     </w:p>
@@ -3024,6 +3154,9 @@
         <w:pStyle w:val="Heading4"/>
       </w:pPr>
       <w:r>
+        <w:rPr>
+          <w:color w:val="000000"/>
+        </w:rPr>
         <w:t xml:space="preserve">1.8.4. Bodemgebruik</w:t>
       </w:r>
     </w:p>
@@ -3088,6 +3221,9 @@
         <w:pStyle w:val="Heading4"/>
       </w:pPr>
       <w:r>
+        <w:rPr>
+          <w:color w:val="000000"/>
+        </w:rPr>
         <w:t xml:space="preserve">1.8.5. Natura 2000-habitat</w:t>
       </w:r>
     </w:p>
@@ -3154,14 +3290,21 @@
         <w:pStyle w:val="Heading2"/>
       </w:pPr>
       <w:r>
+        <w:rPr>
+          <w:color w:val="000000"/>
+        </w:rPr>
         <w:t xml:space="preserve">2. Bronnen in MySQL-database</w:t>
       </w:r>
       <w:r>
+        <w:rPr>
+          <w:color w:val="000000"/>
+        </w:rPr>
         <w:t xml:space="preserve"> </w:t>
       </w:r>
       <w:r>
         <w:rPr>
           <w:rStyle w:val="VerbatimChar"/>
+          <w:color w:val="000000"/>
         </w:rPr>
         <w:t xml:space="preserve">Meijendel_bronnen</w:t>
       </w:r>
@@ -3195,6 +3338,9 @@
         <w:pStyle w:val="Heading3"/>
       </w:pPr>
       <w:r>
+        <w:rPr>
+          <w:color w:val="000000"/>
+        </w:rPr>
         <w:t xml:space="preserve">2.1. Duinvalleivegetatie</w:t>
       </w:r>
     </w:p>
@@ -3270,6 +3416,9 @@
         <w:pStyle w:val="Heading3"/>
       </w:pPr>
       <w:r>
+        <w:rPr>
+          <w:color w:val="000000"/>
+        </w:rPr>
         <w:t xml:space="preserve">2.2. Vogelstand 1924</w:t>
       </w:r>
     </w:p>
@@ -3330,6 +3479,9 @@
         <w:pStyle w:val="Heading3"/>
       </w:pPr>
       <w:r>
+        <w:rPr>
+          <w:color w:val="000000"/>
+        </w:rPr>
         <w:t xml:space="preserve">2.3. Jachtspinnen</w:t>
       </w:r>
     </w:p>
@@ -3394,6 +3546,9 @@
         <w:pStyle w:val="Heading3"/>
       </w:pPr>
       <w:r>
+        <w:rPr>
+          <w:color w:val="000000"/>
+        </w:rPr>
         <w:t xml:space="preserve">2.4. Literatuuroverzicht</w:t>
       </w:r>
     </w:p>
@@ -3458,6 +3613,9 @@
         <w:pStyle w:val="Heading3"/>
       </w:pPr>
       <w:r>
+        <w:rPr>
+          <w:color w:val="000000"/>
+        </w:rPr>
         <w:t xml:space="preserve">2.5. Bijenmonitoring in vier beheergebieden</w:t>
       </w:r>
     </w:p>
@@ -3534,6 +3692,9 @@
         <w:pStyle w:val="Heading3"/>
       </w:pPr>
       <w:r>
+        <w:rPr>
+          <w:color w:val="000000"/>
+        </w:rPr>
         <w:t xml:space="preserve">2.6. Aquatische macrofauna 1974–1975</w:t>
       </w:r>
     </w:p>
@@ -3614,6 +3775,9 @@
         <w:pStyle w:val="Heading2"/>
       </w:pPr>
       <w:r>
+        <w:rPr>
+          <w:color w:val="000000"/>
+        </w:rPr>
         <w:t xml:space="preserve">3. Geïdentificeerde externe kandidaatbronnen</w:t>
       </w:r>
     </w:p>
@@ -3631,6 +3795,9 @@
         <w:pStyle w:val="Heading3"/>
       </w:pPr>
       <w:r>
+        <w:rPr>
+          <w:color w:val="000000"/>
+        </w:rPr>
         <w:t xml:space="preserve">Kandidaten met de grootste verwachte aanvulling</w:t>
       </w:r>
     </w:p>
@@ -3640,6 +3807,9 @@
         <w:pStyle w:val="Heading4"/>
       </w:pPr>
       <w:r>
+        <w:rPr>
+          <w:color w:val="000000"/>
+        </w:rPr>
         <w:t xml:space="preserve">3.1. Historische en actuele ringgegevens</w:t>
       </w:r>
     </w:p>
@@ -3737,6 +3907,9 @@
         <w:pStyle w:val="Heading4"/>
       </w:pPr>
       <w:r>
+        <w:rPr>
+          <w:color w:val="000000"/>
+        </w:rPr>
         <w:t xml:space="preserve">3.2. Erosiepinnen in een stuifkuilcomplex</w:t>
       </w:r>
     </w:p>
@@ -3819,6 +3992,9 @@
         <w:pStyle w:val="Heading4"/>
       </w:pPr>
       <w:r>
+        <w:rPr>
+          <w:color w:val="000000"/>
+        </w:rPr>
         <w:t xml:space="preserve">3.3. Langjarige droge-duinvegetatieplots</w:t>
       </w:r>
     </w:p>
@@ -3901,9 +4077,15 @@
         <w:pStyle w:val="Heading4"/>
       </w:pPr>
       <w:r>
+        <w:rPr>
+          <w:color w:val="000000"/>
+        </w:rPr>
         <w:t xml:space="preserve">3.4.</w:t>
       </w:r>
       <w:r>
+        <w:rPr>
+          <w:color w:val="000000"/>
+        </w:rPr>
         <w:t xml:space="preserve"> </w:t>
       </w:r>
       <w:hyperlink r:id="rId62">
@@ -3994,9 +4176,15 @@
         <w:pStyle w:val="Heading4"/>
       </w:pPr>
       <w:r>
+        <w:rPr>
+          <w:color w:val="000000"/>
+        </w:rPr>
         <w:t xml:space="preserve">3.5.</w:t>
       </w:r>
       <w:r>
+        <w:rPr>
+          <w:color w:val="000000"/>
+        </w:rPr>
         <w:t xml:space="preserve"> </w:t>
       </w:r>
       <w:hyperlink r:id="rId64">
@@ -4087,6 +4275,9 @@
         <w:pStyle w:val="Heading4"/>
       </w:pPr>
       <w:r>
+        <w:rPr>
+          <w:color w:val="000000"/>
+        </w:rPr>
         <w:t xml:space="preserve">3.6. TERRA-Dunes plant- en bodemmicrobiomen</w:t>
       </w:r>
     </w:p>
@@ -4162,6 +4353,9 @@
         <w:pStyle w:val="Heading4"/>
       </w:pPr>
       <w:r>
+        <w:rPr>
+          <w:color w:val="000000"/>
+        </w:rPr>
         <w:t xml:space="preserve">3.7. Rups- en bodemmicrobiomen</w:t>
       </w:r>
     </w:p>
@@ -4237,6 +4431,9 @@
         <w:pStyle w:val="Heading4"/>
       </w:pPr>
       <w:r>
+        <w:rPr>
+          <w:color w:val="000000"/>
+        </w:rPr>
         <w:t xml:space="preserve">3.8. Schimmels bij kruipwilg</w:t>
       </w:r>
     </w:p>
@@ -4312,6 +4509,9 @@
         <w:pStyle w:val="Heading4"/>
       </w:pPr>
       <w:r>
+        <w:rPr>
+          <w:color w:val="000000"/>
+        </w:rPr>
         <w:t xml:space="preserve">3.9. Plantengroei, bodemvocht en weer</w:t>
       </w:r>
     </w:p>
@@ -4387,6 +4587,9 @@
         <w:pStyle w:val="Heading4"/>
       </w:pPr>
       <w:r>
+        <w:rPr>
+          <w:color w:val="000000"/>
+        </w:rPr>
         <w:t xml:space="preserve">3.10. Genetische datasets amfibieën</w:t>
       </w:r>
     </w:p>
@@ -4452,6 +4655,9 @@
         <w:pStyle w:val="Heading3"/>
       </w:pPr>
       <w:r>
+        <w:rPr>
+          <w:color w:val="000000"/>
+        </w:rPr>
         <w:t xml:space="preserve">3.11. Alleen context of nog een onderzoeksaanwijzing</w:t>
       </w:r>
     </w:p>
@@ -4667,6 +4873,9 @@
         <w:pStyle w:val="Heading2"/>
       </w:pPr>
       <w:r>
+        <w:rPr>
+          <w:color w:val="000000"/>
+        </w:rPr>
         <w:t xml:space="preserve">4. Verwachte aanvullingen</w:t>
       </w:r>
     </w:p>
@@ -4731,6 +4940,9 @@
         <w:pStyle w:val="Heading2"/>
       </w:pPr>
       <w:r>
+        <w:rPr>
+          <w:color w:val="000000"/>
+        </w:rPr>
         <w:t xml:space="preserve">5. Bronnen die niet verder worden uitgewerkt</w:t>
       </w:r>
     </w:p>
@@ -4765,6 +4977,9 @@
         <w:pStyle w:val="Heading2"/>
       </w:pPr>
       <w:r>
+        <w:rPr>
+          <w:color w:val="000000"/>
+        </w:rPr>
         <w:t xml:space="preserve">6. Gebruik van dit register</w:t>
       </w:r>
     </w:p>
@@ -4854,6 +5069,9 @@
         <w:pStyle w:val="Heading2"/>
       </w:pPr>
       <w:r>
+        <w:rPr>
+          <w:color w:val="000000"/>
+        </w:rPr>
         <w:t xml:space="preserve">7. Actieplan</w:t>
       </w:r>
     </w:p>
@@ -4886,6 +5104,9 @@
         <w:pStyle w:val="Heading3"/>
       </w:pPr>
       <w:r>
+        <w:rPr>
+          <w:color w:val="000000"/>
+        </w:rPr>
         <w:t xml:space="preserve">Fase 1 — openbare, direct toetsbare bronnen</w:t>
       </w:r>
     </w:p>
@@ -4958,6 +5179,9 @@
         <w:pStyle w:val="Heading3"/>
       </w:pPr>
       <w:r>
+        <w:rPr>
+          <w:color w:val="000000"/>
+        </w:rPr>
         <w:t xml:space="preserve">Fase 2 — reeksen met grote historische of trendwaarde</w:t>
       </w:r>
     </w:p>
@@ -5112,6 +5336,9 @@
         <w:pStyle w:val="Heading3"/>
       </w:pPr>
       <w:r>
+        <w:rPr>
+          <w:color w:val="000000"/>
+        </w:rPr>
         <w:t xml:space="preserve">Fase 3 — reeds bekende bronhouders en contextdatasets</w:t>
       </w:r>
     </w:p>
@@ -5191,6 +5418,9 @@
         <w:pStyle w:val="Heading3"/>
       </w:pPr>
       <w:r>
+        <w:rPr>
+          <w:color w:val="000000"/>
+        </w:rPr>
         <w:t xml:space="preserve">Vaste werkwijze per bron</w:t>
       </w:r>
     </w:p>
@@ -5209,6 +5439,9 @@
         <w:pStyle w:val="Heading3"/>
       </w:pPr>
       <w:r>
+        <w:rPr>
+          <w:color w:val="000000"/>
+        </w:rPr>
         <w:t xml:space="preserve">Dekking van de internetcontrole</w:t>
       </w:r>
     </w:p>
@@ -5228,6 +5461,9 @@
         <w:pStyle w:val="Heading2"/>
       </w:pPr>
       <w:r>
+        <w:rPr>
+          <w:color w:val="000000"/>
+        </w:rPr>
         <w:t xml:space="preserve">Achterliggende verantwoording</w:t>
       </w:r>
     </w:p>
@@ -5640,14 +5876,17 @@
     <w:qFormat/>
     <w:rsid w:val="00A10FD9"/>
     <w:pPr>
-      <w:spacing w:after="80" w:line="240" w:lineRule="auto"/>
-      <w:contextualSpacing/>
-      <w:jc w:val="center"/>
+      <w:keepNext/>
+      <w:keepLines/>
+      <w:spacing w:after="80" w:before="360"/>
+      <w:outlineLvl w:val="0"/>
     </w:pPr>
     <w:rPr>
       <w:rFonts w:asciiTheme="majorHAnsi" w:cstheme="majorBidi" w:eastAsiaTheme="majorEastAsia" w:hAnsiTheme="majorHAnsi"/>
-      <w:sz w:val="56"/>
-      <w:szCs w:val="56"/>
+      <w:color w:val="000000"/>
+      <w:sz w:val="40"/>
+      <w:szCs w:val="40"/>
+      <w:u w:val="none"/>
     </w:rPr>
   </w:style>
   <w:style w:customStyle="1" w:styleId="TitleChar" w:type="character">
@@ -5780,7 +6019,7 @@
     </w:pPr>
     <w:rPr>
       <w:rFonts w:asciiTheme="majorHAnsi" w:cstheme="majorBidi" w:eastAsiaTheme="majorEastAsia" w:hAnsiTheme="majorHAnsi"/>
-      <w:color w:themeColor="accent1" w:themeShade="BF" w:val="0F4761"/>
+      <w:color w:val="000000"/>
       <w:sz w:val="40"/>
       <w:szCs w:val="40"/>
     </w:rPr>
@@ -5803,7 +6042,7 @@
     </w:pPr>
     <w:rPr>
       <w:rFonts w:asciiTheme="majorHAnsi" w:cstheme="majorBidi" w:eastAsiaTheme="majorEastAsia" w:hAnsiTheme="majorHAnsi"/>
-      <w:color w:themeColor="accent1" w:themeShade="BF" w:val="0F4761"/>
+      <w:color w:val="000000"/>
       <w:sz w:val="32"/>
       <w:szCs w:val="32"/>
     </w:rPr>
@@ -5826,7 +6065,7 @@
     </w:pPr>
     <w:rPr>
       <w:rFonts w:cstheme="majorBidi" w:eastAsiaTheme="majorEastAsia"/>
-      <w:color w:themeColor="accent1" w:themeShade="BF" w:val="0F4761"/>
+      <w:color w:val="000000"/>
       <w:sz w:val="28"/>
       <w:szCs w:val="28"/>
     </w:rPr>
@@ -5851,7 +6090,7 @@
       <w:rFonts w:cstheme="majorBidi" w:eastAsiaTheme="majorEastAsia"/>
       <w:i/>
       <w:iCs/>
-      <w:color w:themeColor="accent1" w:themeShade="BF" w:val="0F4761"/>
+      <w:color w:val="000000"/>
     </w:rPr>
   </w:style>
   <w:style w:styleId="Heading5" w:type="paragraph">
@@ -5872,7 +6111,7 @@
     </w:pPr>
     <w:rPr>
       <w:rFonts w:cstheme="majorBidi" w:eastAsiaTheme="majorEastAsia"/>
-      <w:color w:themeColor="accent1" w:themeShade="BF" w:val="0F4761"/>
+      <w:color w:val="000000"/>
     </w:rPr>
   </w:style>
   <w:style w:styleId="Heading6" w:type="paragraph">
@@ -5895,7 +6134,7 @@
       <w:rFonts w:cstheme="majorBidi" w:eastAsiaTheme="majorEastAsia"/>
       <w:i/>
       <w:iCs/>
-      <w:color w:themeColor="text1" w:themeTint="A6" w:val="595959"/>
+      <w:color w:val="000000"/>
     </w:rPr>
   </w:style>
   <w:style w:styleId="Heading7" w:type="paragraph">
@@ -5916,7 +6155,7 @@
     </w:pPr>
     <w:rPr>
       <w:rFonts w:cstheme="majorBidi" w:eastAsiaTheme="majorEastAsia"/>
-      <w:color w:themeColor="text1" w:themeTint="A6" w:val="595959"/>
+      <w:color w:val="000000"/>
     </w:rPr>
   </w:style>
   <w:style w:styleId="Heading8" w:type="paragraph">
@@ -5939,7 +6178,7 @@
       <w:rFonts w:cstheme="majorBidi" w:eastAsiaTheme="majorEastAsia"/>
       <w:i/>
       <w:iCs/>
-      <w:color w:themeColor="text1" w:themeTint="D8" w:val="272727"/>
+      <w:color w:val="000000"/>
     </w:rPr>
   </w:style>
   <w:style w:styleId="Heading9" w:type="paragraph">
@@ -5960,7 +6199,7 @@
     </w:pPr>
     <w:rPr>
       <w:rFonts w:cstheme="majorBidi" w:eastAsiaTheme="majorEastAsia"/>
-      <w:color w:themeColor="text1" w:themeTint="D8" w:val="272727"/>
+      <w:color w:val="000000"/>
     </w:rPr>
   </w:style>
   <w:style w:customStyle="1" w:styleId="Heading1Char" w:type="character">
@@ -5971,7 +6210,7 @@
     <w:rsid w:val="00A10FD9"/>
     <w:rPr>
       <w:rFonts w:asciiTheme="majorHAnsi" w:cstheme="majorBidi" w:eastAsiaTheme="majorEastAsia" w:hAnsiTheme="majorHAnsi"/>
-      <w:color w:themeColor="accent1" w:themeShade="BF" w:val="0F4761"/>
+      <w:color w:val="000000"/>
       <w:sz w:val="40"/>
       <w:szCs w:val="40"/>
     </w:rPr>
@@ -5985,7 +6224,7 @@
     <w:rsid w:val="00A10FD9"/>
     <w:rPr>
       <w:rFonts w:asciiTheme="majorHAnsi" w:cstheme="majorBidi" w:eastAsiaTheme="majorEastAsia" w:hAnsiTheme="majorHAnsi"/>
-      <w:color w:themeColor="accent1" w:themeShade="BF" w:val="0F4761"/>
+      <w:color w:val="000000"/>
       <w:sz w:val="32"/>
       <w:szCs w:val="32"/>
     </w:rPr>
@@ -5999,7 +6238,7 @@
     <w:rsid w:val="00A10FD9"/>
     <w:rPr>
       <w:rFonts w:cstheme="majorBidi" w:eastAsiaTheme="majorEastAsia"/>
-      <w:color w:themeColor="accent1" w:themeShade="BF" w:val="0F4761"/>
+      <w:color w:val="000000"/>
       <w:sz w:val="28"/>
       <w:szCs w:val="28"/>
     </w:rPr>
@@ -6015,7 +6254,7 @@
       <w:rFonts w:cstheme="majorBidi" w:eastAsiaTheme="majorEastAsia"/>
       <w:i/>
       <w:iCs/>
-      <w:color w:themeColor="accent1" w:themeShade="BF" w:val="0F4761"/>
+      <w:color w:val="000000"/>
     </w:rPr>
   </w:style>
   <w:style w:customStyle="1" w:styleId="Heading5Char" w:type="character">
@@ -6027,7 +6266,7 @@
     <w:rsid w:val="00A10FD9"/>
     <w:rPr>
       <w:rFonts w:cstheme="majorBidi" w:eastAsiaTheme="majorEastAsia"/>
-      <w:color w:themeColor="accent1" w:themeShade="BF" w:val="0F4761"/>
+      <w:color w:val="000000"/>
     </w:rPr>
   </w:style>
   <w:style w:customStyle="1" w:styleId="Heading6Char" w:type="character">
@@ -6041,7 +6280,7 @@
       <w:rFonts w:cstheme="majorBidi" w:eastAsiaTheme="majorEastAsia"/>
       <w:i/>
       <w:iCs/>
-      <w:color w:themeColor="text1" w:themeTint="A6" w:val="595959"/>
+      <w:color w:val="000000"/>
     </w:rPr>
   </w:style>
   <w:style w:customStyle="1" w:styleId="Heading7Char" w:type="character">
@@ -6053,7 +6292,7 @@
     <w:rsid w:val="00A10FD9"/>
     <w:rPr>
       <w:rFonts w:cstheme="majorBidi" w:eastAsiaTheme="majorEastAsia"/>
-      <w:color w:themeColor="text1" w:themeTint="A6" w:val="595959"/>
+      <w:color w:val="000000"/>
     </w:rPr>
   </w:style>
   <w:style w:customStyle="1" w:styleId="Heading8Char" w:type="character">
@@ -6067,7 +6306,7 @@
       <w:rFonts w:cstheme="majorBidi" w:eastAsiaTheme="majorEastAsia"/>
       <w:i/>
       <w:iCs/>
-      <w:color w:themeColor="text1" w:themeTint="D8" w:val="272727"/>
+      <w:color w:val="000000"/>
     </w:rPr>
   </w:style>
   <w:style w:customStyle="1" w:styleId="Heading9Char" w:type="character">
@@ -6079,7 +6318,7 @@
     <w:rsid w:val="00A10FD9"/>
     <w:rPr>
       <w:rFonts w:cstheme="majorBidi" w:eastAsiaTheme="majorEastAsia"/>
-      <w:color w:themeColor="text1" w:themeTint="D8" w:val="272727"/>
+      <w:color w:val="000000"/>
     </w:rPr>
   </w:style>
   <w:style w:styleId="BlockText" w:type="paragraph">

</xml_diff>

<commit_message>
Ontvlecht vijf externe ecologiebronnen lokaal per bron
</commit_message>
<xml_diff>
--- a/docs/MEIJENDEL_BRONREGISTER.docx
+++ b/docs/MEIJENDEL_BRONREGISTER.docx
@@ -2,30 +2,29 @@
 <file path=word/document.xml><?xml version="1.0" encoding="utf-8"?>
 <w:document xmlns:w="http://schemas.openxmlformats.org/wordprocessingml/2006/main" xmlns:m="http://schemas.openxmlformats.org/officeDocument/2006/math" xmlns:r="http://schemas.openxmlformats.org/officeDocument/2006/relationships" xmlns:o="urn:schemas-microsoft-com:office:office" xmlns:v="urn:schemas-microsoft-com:vml" xmlns:w10="urn:schemas-microsoft-com:office:word" xmlns:a="http://schemas.openxmlformats.org/drawingml/2006/main" xmlns:pic="http://schemas.openxmlformats.org/drawingml/2006/picture" xmlns:wp="http://schemas.openxmlformats.org/drawingml/2006/wordprocessingDrawing">
   <w:body>
-    <w:bookmarkStart w:id="96" w:name="Xdea145a7474320bcc321aebaf5687f9ab4d02fb"/>
-    <w:p>
-      <w:pPr>
-        <w:pStyle w:val="Title"/>
-      </w:pPr>
-      <w:r>
-        <w:rPr>
-          <w:color w:val="000000"/>
+    <w:bookmarkStart w:id="97" w:name="Xdea145a7474320bcc321aebaf5687f9ab4d02fb"/>
+    <w:p>
+      <w:pPr>
+        <w:pStyle w:val="Heading1"/>
+      </w:pPr>
+      <w:r>
+        <w:rPr>
+          <w:color w:val="000000"/>
+          <w:u w:val="none"/>
         </w:rPr>
         <w:t xml:space="preserve">Bronregister ecologische gegevens Meijendel</w:t>
       </w:r>
     </w:p>
     <w:p>
       <w:pPr>
-        <w:pStyle w:val="BodyText"/>
-      </w:pPr>
-      <w:r>
-        <w:rPr>
-          <w:b/>
-        </w:rPr>
-        <w:t>Stand: 29 september 2026.</w:t>
-      </w:r>
-      <w:r>
-        <w:t xml:space="preserve"> </w:t>
+        <w:pStyle w:val="FirstParagraph"/>
+      </w:pPr>
+      <w:r>
+        <w:rPr>
+          <w:b/>
+          <w:bCs/>
+        </w:rPr>
+        <w:t xml:space="preserve">Stand: 29 september 2026.</w:t>
       </w:r>
     </w:p>
     <w:p>
@@ -96,6 +95,7 @@
       <w:r>
         <w:rPr>
           <w:color w:val="000000"/>
+          <w:u w:val="none"/>
         </w:rPr>
         <w:t xml:space="preserve">De statussen</w:t>
       </w:r>
@@ -239,84 +239,122 @@
         <w:t xml:space="preserve">opgenomen; hun verschillende analysemogelijkheden blijven per record zichtbaar.</w:t>
       </w:r>
     </w:p>
+    <w:p>
+      <w:pPr>
+        <w:pStyle w:val="FirstParagraph"/>
+      </w:pPr>
+      <w:r>
+        <w:rPr>
+          <w:b/>
+          <w:bCs/>
+        </w:rPr>
+        <w:t xml:space="preserve">Taxonomisch register aangevuld en centraal opgeschoond, stand 29 september 2026.</w:t>
+      </w:r>
+      <w:r>
+        <w:t xml:space="preserve"> </w:t>
+      </w:r>
+      <w:r>
+        <w:t xml:space="preserve">De levende lokale database bevat nu 27 praktische groepen en 11.660 centrale vermeldingen: 11.659 naamvermeldingen en één uitdrukkelijk onbepaald operationeel collectieobject. De tabel met bronkoppelingen bevat 30.035 rijen: alle 18.437 oorspronkelijke bronbesluiten, drie eerdere identificatie-aliassen, 6.121 volledig bewaarde oorspronkelijke taxoncontexten, 5.473 aanvullende brongebruiken voor afgeleide meet-/doelsoortregels en de koppeling van het onbepaalde object. Van de oorspronkelijke besluiten blijven 18.350 actief en 87 als eerdere versies bewaard. Dit is geen telling van unieke biologische soorten of lokale aanwezigheid. Het register heeft geen eigen waarnemingsperiode en omvat NDFF, provinciale PQ, Vangblik, SOVON/AVIMAP, de zes externe datasets en aanvullende referentiecatalogi. Meetperioden en toelatingsvoorwaarden blijven die van de afzonderlijke bronnen hieronder.</w:t>
+      </w:r>
+    </w:p>
+    <w:p>
+      <w:pPr>
+        <w:pStyle w:val="BodyText"/>
+      </w:pPr>
+      <w:r>
+        <w:rPr>
+          <w:b/>
+          <w:bCs/>
+        </w:rPr>
+        <w:t xml:space="preserve">Alle soortwaarnemingen centraal bereikbaar, 29 september 2026.</w:t>
+      </w:r>
+      <w:r>
+        <w:t xml:space="preserve"> </w:t>
+      </w:r>
+      <w:r>
+        <w:t xml:space="preserve">Vanuit taxa, taxa_bronkoppeling en taxon_groepen zijn alle oorspronkelijke soortwaarnemingen, afgeleide meetregels, echte nullen en historische versies in Meijendel bereikbaar. De volledige inventarisatie van 273 basistabellen geeft 127 beoordeelde routes, zonder ontbrekende koppelingen of vermenigvuldiging van soortregels. Dit omvat ook alle LVD-resultaten binnen en buiten pq_* en de vijf afzonderlijk opgeslagen externe bronnen. Alle oorspronkelijke gegevens, bronwaarden, interne verwijzingen, analysebeperkingen en 16 bestaande viewuitkomsten zijn behouden. Terugdraaien, onafhankelijk volledig herstel en levende nacontrole zijn geslaagd. Iedere volgende databasewijziging wordt vóór en na uitvoering volledig gecontroleerd; 267 rijtriggers beschermen bestaande bronidentiteiten en verwijzingen. Nieuwe gegevenslagen moeten expliciet in die controle worden opgenomen. Geen VPS-publicatie. De fysieke verplaatsing van resterende PQ/LVD-inhoud is een afzonderlijke, nog open taak. Uitvoering, aantallen per bron en periode, querygebruik en herstelbewijs staan in docs/database/TAXONREGISTER.md.</w:t>
+      </w:r>
+    </w:p>
+    <w:p>
+      <w:pPr>
+        <w:pStyle w:val="BodyText"/>
+      </w:pPr>
+      <w:r>
+        <w:rPr>
+          <w:b/>
+          <w:bCs/>
+        </w:rPr>
+        <w:t xml:space="preserve">Gerichte taxonfusie, 28 en 29 september 2026.</w:t>
+      </w:r>
+      <w:r>
+        <w:t xml:space="preserve"> </w:t>
+      </w:r>
+      <w:r>
+        <w:t xml:space="preserve">Na de eerste samenvoeging van drie Naturalis-keverregistraties zijn op 29 september eerst 2.156 en daarna nog 1.762 dubbele centrale rijen samengebracht. Ook Glaucium flavum staat nu één keer centraal. De 751 eerder overgebleven naamgroepen zijn inhoudelijk afgehandeld, evenals aanvullende auteurs-, rang-, spelling- en conditievarianten. Zeven gelijknamige paren blijven afzonderlijk omdat zij verschillende taxa of determinatie-eenheden betekenen. Alle oorspronkelijke waarden en bronkoppelingnummers zijn behouden; oude taxonnummers en UUIDs blijven met hun oorspronkelijke context herleidbaar. Meetrecords, perioden, locatiekwaliteit, rechten en analysegeschiktheid zijn niet veranderd. Back-up, fusieproef, terugdraaien, volledig herstel en levende nacontrole zijn geslaagd. De overige 251 tabellen en alle 16 viewuitkomsten zijn ongewijzigd. Alle 21.710 geteste bestaande bronidentiteiten vinden bij herhaling hun bestaande koppeling terug. De importpoort blokkeert onbesliste nieuwe naamvarianten. Er is niets naar de VPS gepubliceerd. Selectie, de zeven uitzonderingen en herstelbewijs staan in</w:t>
+      </w:r>
+      <w:r>
+        <w:t xml:space="preserve"> </w:t>
+      </w:r>
+      <w:r>
+        <w:rPr>
+          <w:rStyle w:val="VerbatimChar"/>
+        </w:rPr>
+        <w:t xml:space="preserve">docs/database/TAXONREGISTER.md</w:t>
+      </w:r>
+      <w:r>
+        <w:t xml:space="preserve">.</w:t>
+      </w:r>
+    </w:p>
+    <w:p>
+      <w:pPr>
+        <w:pStyle w:val="BodyText"/>
+      </w:pPr>
+      <w:r>
+        <w:t xml:space="preserve">De aanvulling maakt overeenkomsten tussen bronnen vindbaar. In twee stappen hebben 2.509 bestaande registraties alsnog een primaire soortgroep gekregen, waarvan 1.226 in de laatste stap. Alle 87 eerder onopgeloste PQ-naamteksten uit 1981–2025 zijn onderbouwd met code, wetenschappelijke en Nederlandse naam uit Floranld_2020. Deze openbare Turboveg-referentielijst, aangeboden op 10 maart 2026 via www.synbiosys.alterra.nl/turboveg/, bevat 17.468 codes. De oorspronkelijke PQ-waarden en eerdere besluiten blijven behouden.</w:t>
+      </w:r>
+    </w:p>
+    <w:p>
+      <w:pPr>
+        <w:pStyle w:val="BodyText"/>
+      </w:pPr>
+      <w:r>
+        <w:t xml:space="preserve">Alle 12.173 verschillende wetenschappelijke naamteksten zijn bij GBIF opgezocht. Uitsluitend die naamteksten zijn verstuurd, geen vindplaatsen, tellingen of persoonsgegevens. Via 917 gedeelde naamreferenties zijn nu 1.819 bestaande bronregistraties met elkaar in verband te brengen. Iedere referentie verbindt minstens twee oorspronkelijke datasets. Het zijn onderbouwde zoekverbindingen, geen bevestiging dat historische bronnen precies dezelfde soortafbakening gebruiken. Alle nieuwe koppelingen blijven daarom kandidaat met onbekende conceptrelatie; er zijn geen metingen samengevoegd.</w:t>
+      </w:r>
+    </w:p>
+    <w:p>
+      <w:pPr>
+        <w:pStyle w:val="BodyText"/>
+      </w:pPr>
+      <w:r>
+        <w:t xml:space="preserve">De geraadpleegde Catalogue of Life-lijst via GBIF is een naam- en classificatiereferentie, geen nieuwe waarnemingsbron. Uitgever is de Catalogue of Life Foundation; de metadata vermelden CC BY 4.0 en DOI 10.48580/dgyy9. Omdat de dienstmetadata verschillende versielabels bevatten, zijn de feitelijke antwoorden van 27 september 2026, hun ophaaltijden en bestandshashes vastgelegd. Die bewaarde antwoorden bepalen de gebruikte versie. Darwin Core en TDWG TCS blijven de toetsingsbasis.</w:t>
+      </w:r>
+    </w:p>
+    <w:p>
+      <w:pPr>
+        <w:pStyle w:val="BodyText"/>
+      </w:pPr>
+      <w:r>
+        <w:t xml:space="preserve">De eerdere beoordeling liet 278 bronregistraties zonder primaire groep. Na centralisatie en de onderbouwde fusies zijn er 235 centrale naamvermeldingen zonder primaire groep, plus het onbepaalde operationele collectieobject. Dit zijn andere teleenheden: oorspronkelijke bronregistraties blijven bij hun centrale bestemming bewaard. De ontbrekende groep betreft onder meer de scheiding schimmels/korstmossen, onvolledige classificatie, verzamelbegrippen en slijmzwammen die niet bij de huidige groepsomschrijving passen. De oorspronkelijke reden blijft per bronregistratie vastgelegd. Dit staat los van dubbelingen: een geforceerde groepskeuze zou de gegevens niet betrouwbaarder maken. Een ontbrekende groep sluit geen waarneming uit van de centrale zoekroute.</w:t>
+      </w:r>
+    </w:p>
+    <w:p>
+      <w:pPr>
+        <w:pStyle w:val="BodyText"/>
+      </w:pPr>
+      <w:r>
+        <w:t xml:space="preserve">Twee oorspronkelijke actieve bronbesluiten blijven inhoudelijk onbeoordeeld en zonder biologisch doeltaxon. Naturalis-Indet. benoemt geen taxon; zijn ene collectieobject uit 2018 is nu via een aanvullende, uitdrukkelijk onbepaalde operationele koppeling centraal bereikbaar. Bij Toendrarietgans ontbreekt de wetenschappelijke bronnaam en strookt lokale code 1582 niet met de actuele EURING-code 01574. Deze bronregel wordt alleen gebruikt in twee beleidsreferentierijen en niet in vogelwaarnemingen; een nieuwe waarneming met deze onopgeloste sleutel wordt geweigerd. De 263 oorspronkelijke vogelnaamgebruiken, koppelingnummers en bronbesluiten zijn volledig bewaard. De eerdere registeraanvulling en taxonfusie en de huidige volledige waarnemingskoppeling zijn afzonderlijk gecontroleerd. Website, dashboard en Shiny zijn niet aangepast. Details en herstelbewijs staan in docs/database/TAXONREGISTER.md.</w:t>
+      </w:r>
+    </w:p>
     <w:bookmarkEnd w:id="9"/>
     <w:bookmarkStart w:id="10" w:name="overkoepelende-analysegeschiktheid"/>
     <w:p>
-      <w:pPr/>
-      <w:r>
-        <w:rPr>
-          <w:b/>
-        </w:rPr>
-        <w:t>Taxonomisch register aangevuld en centraal opgeschoond, stand 29 september 2026.</w:t>
-      </w:r>
-      <w:r>
-        <w:t xml:space="preserve"> De levende lokale database bevat nu 27 praktische groepen en 11.660 centrale vermeldingen: 11.659 naamvermeldingen en één uitdrukkelijk onbepaald operationeel collectieobject. De tabel met bronkoppelingen bevat 30.035 rijen: alle 18.437 oorspronkelijke bronbesluiten, drie eerdere identificatie-aliassen, 6.121 volledig bewaarde oorspronkelijke taxoncontexten, 5.473 aanvullende brongebruiken voor afgeleide meet-/doelsoortregels en de koppeling van het onbepaalde object. Van de oorspronkelijke besluiten blijven 18.350 actief en 87 als eerdere versies bewaard. Dit is geen telling van unieke biologische soorten of lokale aanwezigheid. Het register heeft geen eigen waarnemingsperiode en omvat NDFF, provinciale PQ, Vangblik, SOVON/AVIMAP, de zes externe datasets en aanvullende referentiecatalogi. Meetperioden en toelatingsvoorwaarden blijven die van de afzonderlijke bronnen hieronder.</w:t>
-      </w:r>
-    </w:p>
-    <w:p>
-      <w:pPr/>
-      <w:pPr/>
-      <w:r>
-        <w:rPr>
-          <w:b/>
-        </w:rPr>
-        <w:t>Alle soortwaarnemingen centraal bereikbaar, 29 september 2026.</w:t>
-      </w:r>
-      <w:r>
-        <w:t xml:space="preserve"> Vanuit taxa, taxa_bronkoppeling en taxon_groepen zijn alle oorspronkelijke soortwaarnemingen, afgeleide meetregels, echte nullen en historische versies in Meijendel bereikbaar. De volledige inventarisatie van 253 basistabellen geeft 122 beoordeelde routes, zonder ontbrekende koppelingen of vermenigvuldiging van soortregels. Dit omvat ook alle LVD-resultaten binnen en buiten pq_*. Alle oorspronkelijke gegevens, bronwaarden, interne verwijzingen, analysebeperkingen en 16 bestaande viewuitkomsten zijn behouden. Terugdraaien, onafhankelijk volledig herstel en levende nacontrole zijn geslaagd. Iedere volgende databasewijziging wordt vóór en na uitvoering volledig gecontroleerd; 242 rijtriggers beschermen bestaande bronidentiteiten en verwijzingen. Nieuwe gegevenslagen moeten expliciet in die controle worden opgenomen. Geen VPS-publicatie. De fysieke verplaatsing van resterende PQ/LVD-inhoud is een afzonderlijke, nog open taak. Uitvoering, aantallen per bron en periode, querygebruik en herstelbewijs staan in docs/database/TAXONREGISTER.md.</w:t>
-      </w:r>
-    </w:p>
-    <w:p>
-      <w:pPr>
-        <w:pStyle w:val="BodyText"/>
-      </w:pPr>
-      <w:r>
-        <w:rPr>
-          <w:b/>
-        </w:rPr>
-        <w:t>Gerichte taxonfusie, 28 en 29 september 2026.</w:t>
-      </w:r>
-      <w:r>
-        <w:t xml:space="preserve"> Na de eerste samenvoeging van drie Naturalis-keverregistraties zijn op 29 september eerst 2.156 en daarna nog 1.762 dubbele centrale rijen samengebracht. Ook Glaucium flavum staat nu één keer centraal. De 751 eerder overgebleven naamgroepen zijn inhoudelijk afgehandeld, evenals aanvullende auteurs-, rang-, spelling- en conditievarianten. Zeven gelijknamige paren blijven afzonderlijk omdat zij verschillende taxa of determinatie-eenheden betekenen. Alle oorspronkelijke waarden en bronkoppelingnummers zijn behouden; oude taxonnummers en UUIDs blijven met hun oorspronkelijke context herleidbaar. Meetrecords, perioden, locatiekwaliteit, rechten en analysegeschiktheid zijn niet veranderd. Back-up, fusieproef, terugdraaien, volledig herstel en levende nacontrole zijn geslaagd. De overige 251 tabellen en alle 16 viewuitkomsten zijn ongewijzigd. Alle 21.710 geteste bestaande bronidentiteiten vinden bij herhaling hun bestaande koppeling terug. De importpoort blokkeert onbesliste nieuwe naamvarianten. Er is niets naar de VPS gepubliceerd. Selectie, de zeven uitzonderingen en herstelbewijs staan in docs/database/TAXONREGISTER.md.</w:t>
-      </w:r>
-    </w:p>
-    <w:p>
-      <w:pPr/>
-      <w:r>
-        <w:t>De aanvulling maakt overeenkomsten tussen bronnen vindbaar. In twee stappen hebben 2.509 bestaande registraties alsnog een primaire soortgroep gekregen, waarvan 1.226 in de laatste stap. Alle 87 eerder onopgeloste PQ-naamteksten uit 1981–2025 zijn onderbouwd met code, wetenschappelijke en Nederlandse naam uit Floranld_2020. Deze openbare Turboveg-referentielijst, aangeboden op 10 maart 2026 via www.synbiosys.alterra.nl/turboveg/, bevat 17.468 codes. De oorspronkelijke PQ-waarden en eerdere besluiten blijven behouden.</w:t>
-      </w:r>
-    </w:p>
-    <w:p>
-      <w:pPr/>
-      <w:r>
-        <w:t>Alle 12.173 verschillende wetenschappelijke naamteksten zijn bij GBIF opgezocht. Uitsluitend die naamteksten zijn verstuurd, geen vindplaatsen, tellingen of persoonsgegevens. Via 917 gedeelde naamreferenties zijn nu 1.819 bestaande bronregistraties met elkaar in verband te brengen. Iedere referentie verbindt minstens twee oorspronkelijke datasets. Het zijn onderbouwde zoekverbindingen, geen bevestiging dat historische bronnen precies dezelfde soortafbakening gebruiken. Alle nieuwe koppelingen blijven daarom kandidaat met onbekende conceptrelatie; er zijn geen metingen samengevoegd.</w:t>
-      </w:r>
-    </w:p>
-    <w:p>
-      <w:pPr/>
-      <w:r>
-        <w:t>De geraadpleegde Catalogue of Life-lijst via GBIF is een naam- en classificatiereferentie, geen nieuwe waarnemingsbron. Uitgever is de Catalogue of Life Foundation; de metadata vermelden CC BY 4.0 en DOI 10.48580/dgyy9. Omdat de dienstmetadata verschillende versielabels bevatten, zijn de feitelijke antwoorden van 27 september 2026, hun ophaaltijden en bestandshashes vastgelegd. Die bewaarde antwoorden bepalen de gebruikte versie. Darwin Core en TDWG TCS blijven de toetsingsbasis.</w:t>
-      </w:r>
-    </w:p>
-    <w:p>
-      <w:pPr/>
-      <w:r>
-        <w:t>De eerdere beoordeling liet 278 bronregistraties zonder primaire groep. Na centralisatie en de onderbouwde fusies zijn er 235 centrale naamvermeldingen zonder primaire groep, plus het onbepaalde operationele collectieobject. Dit zijn andere teleenheden: oorspronkelijke bronregistraties blijven bij hun centrale bestemming bewaard. De ontbrekende groep betreft onder meer de scheiding schimmels/korstmossen, onvolledige classificatie, verzamelbegrippen en slijmzwammen die niet bij de huidige groepsomschrijving passen. De oorspronkelijke reden blijft per bronregistratie vastgelegd. Dit staat los van dubbelingen: een geforceerde groepskeuze zou de gegevens niet betrouwbaarder maken. Een ontbrekende groep sluit geen waarneming uit van de centrale zoekroute.</w:t>
-      </w:r>
-    </w:p>
-    <w:p>
-      <w:pPr/>
-      <w:r>
-        <w:t>Twee oorspronkelijke actieve bronbesluiten blijven inhoudelijk onbeoordeeld en zonder biologisch doeltaxon. Naturalis-Indet. benoemt geen taxon; zijn ene collectieobject uit 2018 is nu via een aanvullende, uitdrukkelijk onbepaalde operationele koppeling centraal bereikbaar. Bij Toendrarietgans ontbreekt de wetenschappelijke bronnaam en strookt lokale code 1582 niet met de actuele EURING-code 01574. Deze bronregel wordt alleen gebruikt in twee beleidsreferentierijen en niet in vogelwaarnemingen; een nieuwe waarneming met deze onopgeloste sleutel wordt geweigerd. De 263 oorspronkelijke vogelnaamgebruiken, koppelingnummers en bronbesluiten zijn volledig bewaard. De eerdere registeraanvulling en taxonfusie en de huidige volledige waarnemingskoppeling zijn afzonderlijk gecontroleerd. Website, dashboard en Shiny zijn niet aangepast. Details en herstelbewijs staan in docs/database/TAXONREGISTER.md.</w:t>
-      </w:r>
-    </w:p>
-    <w:p>
       <w:pPr>
         <w:pStyle w:val="Heading2"/>
       </w:pPr>
       <w:r>
         <w:rPr>
           <w:color w:val="000000"/>
+          <w:u w:val="none"/>
         </w:rPr>
         <w:t xml:space="preserve">Overkoepelende analysegeschiktheid</w:t>
       </w:r>
@@ -676,6 +714,7 @@
       <w:r>
         <w:rPr>
           <w:color w:val="000000"/>
+          <w:u w:val="none"/>
         </w:rPr>
         <w:t xml:space="preserve">Beheerregel</w:t>
       </w:r>
@@ -685,11 +724,11 @@
         <w:pStyle w:val="FirstParagraph"/>
       </w:pPr>
       <w:r>
-        <w:t>Iedere ontdekking, levering, import, verplaatsing, uitsluiting of nieuwe beoordeling van een Meijendel-gegevensbron wordt in dit document verwerkt. Dat geldt ook wanneer eigenaar, omvang, periode, locatiekwaliteit, rechten, overlap, validatiestatus of statistische bruikbaarheid verandert. Daarbij worden steeds de analytische database MySQL Meijendel, de MySQL contextdatabase Meijendel_bronnen en de kandidaatbronnen gezamenlijk gecontroleerd. Iedere wijziging van Meijendel vereist ook de volledige voor- en nacontrole van de bereikbaarheid van alle soortwaarnemingen via het centrale taxonregister. De Markdown-versie is leidend; de Wordversie wordt in dezelfde wijziging inhoudelijk gelijkgetrokken, gerenderd en gecontroleerd.</w:t>
+        <w:t xml:space="preserve">Iedere ontdekking, levering, import, verplaatsing, uitsluiting of nieuwe beoordeling van een Meijendel-gegevensbron wordt in dit document verwerkt. Dat geldt ook wanneer eigenaar, omvang, periode, locatiekwaliteit, rechten, overlap, validatiestatus of statistische bruikbaarheid verandert. Daarbij worden steeds de analytische database MySQL Meijendel, de MySQL contextdatabase Meijendel_bronnen en de kandidaatbronnen gezamenlijk gecontroleerd. Iedere wijziging van Meijendel vereist ook de volledige voor- en nacontrole van de bereikbaarheid van alle soortwaarnemingen via het centrale taxonregister. De Markdown-versie is leidend; de Wordversie wordt in dezelfde wijziging inhoudelijk gelijkgetrokken, gerenderd en gecontroleerd.</w:t>
       </w:r>
     </w:p>
     <w:bookmarkEnd w:id="11"/>
-    <w:bookmarkStart w:id="50" w:name="Xc07dfd40f027bce65d2d0499dc5da8ab7f6fd0f"/>
+    <w:bookmarkStart w:id="51" w:name="bronnen-in-mysql-database-meijendel"/>
     <w:p>
       <w:pPr>
         <w:pStyle w:val="Heading2"/>
@@ -697,12 +736,14 @@
       <w:r>
         <w:rPr>
           <w:color w:val="000000"/>
+          <w:u w:val="none"/>
         </w:rPr>
         <w:t xml:space="preserve">1. Bronnen in MySQL-database</w:t>
       </w:r>
       <w:r>
         <w:rPr>
           <w:color w:val="000000"/>
+          <w:u w:val="none"/>
         </w:rPr>
         <w:t xml:space="preserve"> </w:t>
       </w:r>
@@ -710,11 +751,12 @@
         <w:rPr>
           <w:rStyle w:val="VerbatimChar"/>
           <w:color w:val="000000"/>
+          <w:u w:val="none"/>
         </w:rPr>
         <w:t xml:space="preserve">Meijendel</w:t>
       </w:r>
     </w:p>
-    <w:bookmarkStart w:id="12" w:name="X32ab8fbd5be08d3f325e2553cd15813ff7e9c1f"/>
+    <w:bookmarkStart w:id="12" w:name="Xccd8cb4345e3f59364194a2576f706cc2c0a66e"/>
     <w:p>
       <w:pPr>
         <w:pStyle w:val="Heading3"/>
@@ -722,6 +764,7 @@
       <w:r>
         <w:rPr>
           <w:color w:val="000000"/>
+          <w:u w:val="none"/>
         </w:rPr>
         <w:t xml:space="preserve">1.1. Vogelgegevens van Vogelwerkgroep Meijendel en SOVON</w:t>
       </w:r>
@@ -798,22 +841,68 @@
         <w:t xml:space="preserve">Analyseklaar en primaire bron.</w:t>
       </w:r>
     </w:p>
+    <w:p>
+      <w:pPr>
+        <w:pStyle w:val="BodyText"/>
+      </w:pPr>
+      <w:r>
+        <w:rPr>
+          <w:b/>
+          <w:bCs/>
+        </w:rPr>
+        <w:t xml:space="preserve">Taxonomische ontsluiting, 27 september 2026.</w:t>
+      </w:r>
+      <w:r>
+        <w:t xml:space="preserve"> </w:t>
+      </w:r>
+      <w:r>
+        <w:t xml:space="preserve">De 263 gebruikte vogelcategorieën uit</w:t>
+      </w:r>
+      <w:r>
+        <w:t xml:space="preserve"> </w:t>
+      </w:r>
+      <w:r>
+        <w:rPr>
+          <w:rStyle w:val="VerbatimChar"/>
+        </w:rPr>
+        <w:t xml:space="preserve">soorten</w:t>
+      </w:r>
+      <w:r>
+        <w:t xml:space="preserve"> </w:t>
+      </w:r>
+      <w:r>
+        <w:t xml:space="preserve">hebben ieder een voorlopig naamgebruik in</w:t>
+      </w:r>
+      <w:r>
+        <w:t xml:space="preserve"> </w:t>
+      </w:r>
+      <w:r>
+        <w:rPr>
+          <w:rStyle w:val="VerbatimChar"/>
+        </w:rPr>
+        <w:t xml:space="preserve">taxa</w:t>
+      </w:r>
+      <w:r>
+        <w:t xml:space="preserve"> </w:t>
+      </w:r>
+      <w:r>
+        <w:t xml:space="preserve">en een kandidaat in</w:t>
+      </w:r>
+      <w:r>
+        <w:t xml:space="preserve"> </w:t>
+      </w:r>
+      <w:r>
+        <w:rPr>
+          <w:rStyle w:val="VerbatimChar"/>
+        </w:rPr>
+        <w:t xml:space="preserve">taxa_bronkoppeling</w:t>
+      </w:r>
+      <w:r>
+        <w:t xml:space="preserve">. De koppelproef omvat 71.155 territoriumregels (1958–2025), 600.959 BMP-regels (2007–2025) en 105.712 wintertelregels (2000–2025). Dit is een afgebakende controle van deze drie tabellen, niet een nieuwe telling van alle vogelbronnen. Bron-IDs en letterlijke cataloguswaarden blijven behouden. De kandidaten leggen nog geen gelijkheid met externe taxonconcepten vast; brongegevens, analytische status en gebruik door website, dashboard en Shiny veranderen niet.</w:t>
+      </w:r>
+    </w:p>
     <w:bookmarkEnd w:id="12"/>
-    <w:bookmarkStart w:id="13" w:name="X9645acbfea6b379f23d12aeedc36c987000825a"/>
-    <w:p>
-      <w:pPr>
-        <w:pStyle w:val="BodyText"/>
-      </w:pPr>
-      <w:r>
-        <w:rPr>
-          <w:b/>
-        </w:rPr>
-        <w:t xml:space="preserve">Taxonomische ontsluiting, 27 september 2026. </w:t>
-      </w:r>
-      <w:r>
-        <w:t>De 263 gebruikte vogelcategorieën uit soorten hebben ieder een voorlopig naamgebruik in taxa en een kandidaat in taxa_bronkoppeling. De koppelproef omvat 71.155 territoriumregels (1958–2025), 600.959 BMP-regels (2007–2025) en 105.712 wintertelregels (2000–2025). Dit is een afgebakende controle van deze drie tabellen, niet een nieuwe telling van alle vogelbronnen. Bron-IDs en letterlijke cataloguswaarden blijven behouden. De kandidaten leggen nog geen gelijkheid met externe taxonconcepten vast; brongegevens, analytische status en gebruik door website, dashboard en Shiny veranderen niet.</w:t>
-      </w:r>
-    </w:p>
+    <w:bookmarkStart w:id="13" w:name="provinciale-permanente-kwadraten"/>
     <w:p>
       <w:pPr>
         <w:pStyle w:val="Heading3"/>
@@ -821,6 +910,7 @@
       <w:r>
         <w:rPr>
           <w:color w:val="000000"/>
+          <w:u w:val="none"/>
         </w:rPr>
         <w:t xml:space="preserve">1.2. Provinciale permanente kwadraten</w:t>
       </w:r>
@@ -897,22 +987,26 @@
         <w:t xml:space="preserve">Analyseklaar en primaire bron.</w:t>
       </w:r>
     </w:p>
+    <w:p>
+      <w:pPr>
+        <w:pStyle w:val="BodyText"/>
+      </w:pPr>
+      <w:r>
+        <w:rPr>
+          <w:b/>
+          <w:bCs/>
+        </w:rPr>
+        <w:t xml:space="preserve">PQ-integratie, 27–28 september 2026.</w:t>
+      </w:r>
+      <w:r>
+        <w:t xml:space="preserve"> </w:t>
+      </w:r>
+      <w:r>
+        <w:t xml:space="preserve">De 53.122 provinciale taxonregels uit 1981–2025 zijn lokaal en op de VPS rechtstreeks verbonden met het centrale taxonregister. De 714 oorspronkelijke taxonvermeldingen zijn daar met alle bronvelden behouden; de afzonderlijke PQ-taxoncatalogus is verwijderd. De 2.007 opnamen en de 513 gepubliceerde plot-jaaruitkomsten zijn ongewijzigd. Daarnaast zijn 644 vermoedelijk verwante LVD-bronopnamen met 16.627 resultaten uit 1981–2015 binnen de PQ-tabellen bijeengebracht. Zij behouden alle bronwaarden en 652 mogelijke opnamekoppelingen en tellen niet zelfstandig mee. De oorspronkelijke externe rijen zijn pas na inhoudscontrole verwijderd. De volledige migratie, het terugdraaien en het herstel uit back-up zijn beproefd. De gecontroleerde publicatie naar website, dashboard en Shiny is op 28 september om 15:33 uur geslaagd; hun bestaande provinciale uitkomsten zijn gelijk gebleven.</w:t>
+      </w:r>
+    </w:p>
     <w:bookmarkEnd w:id="13"/>
-    <w:bookmarkStart w:id="14" w:name="X58edaa7a0159e378417d8d9e2f3abf27d746f4f"/>
-    <w:p>
-      <w:pPr>
-        <w:pStyle w:val="BodyText"/>
-      </w:pPr>
-      <w:r>
-        <w:rPr>
-          <w:b/>
-        </w:rPr>
-        <w:t>PQ-integratie, 27–28 september 2026.</w:t>
-      </w:r>
-      <w:r>
-        <w:t xml:space="preserve"> De 53.122 provinciale taxonregels uit 1981–2025 zijn lokaal en op de VPS rechtstreeks verbonden met het centrale taxonregister. De 714 oorspronkelijke taxonvermeldingen zijn daar met alle bronvelden behouden; de afzonderlijke PQ-taxoncatalogus is verwijderd. De 2.007 opnamen en de 513 gepubliceerde plot-jaaruitkomsten zijn ongewijzigd. Daarnaast zijn 644 vermoedelijk verwante LVD-bronopnamen met 16.627 resultaten uit 1981–2015 binnen de PQ-tabellen bijeengebracht. Zij behouden alle bronwaarden en 652 mogelijke opnamekoppelingen en tellen niet zelfstandig mee. De oorspronkelijke externe rijen zijn pas na inhoudscontrole verwijderd. De volledige migratie, het terugdraaien en het herstel uit back-up zijn beproefd. De gecontroleerde publicatie naar website, dashboard en Shiny is op 28 september om 15:33 uur geslaagd; hun bestaande provinciale uitkomsten zijn gelijk gebleven.</w:t>
-      </w:r>
-    </w:p>
+    <w:bookmarkStart w:id="14" w:name="Xded6c184b9a569c146345b6e935b052f391caf7"/>
     <w:p>
       <w:pPr>
         <w:pStyle w:val="Heading3"/>
@@ -920,6 +1014,7 @@
       <w:r>
         <w:rPr>
           <w:color w:val="000000"/>
+          <w:u w:val="none"/>
         </w:rPr>
         <w:t xml:space="preserve">1.3. Zoogdieren tijdens SOVON- en VWG-bezoeken</w:t>
       </w:r>
@@ -997,7 +1092,7 @@
       </w:r>
     </w:p>
     <w:bookmarkEnd w:id="14"/>
-    <w:bookmarkStart w:id="16" w:name="Xd3fb9a25da94fa35cd3895c324ae264efa6b6ce"/>
+    <w:bookmarkStart w:id="16" w:name="historisch-vangblikonderzoek"/>
     <w:p>
       <w:pPr>
         <w:pStyle w:val="Heading3"/>
@@ -1005,6 +1100,7 @@
       <w:r>
         <w:rPr>
           <w:color w:val="000000"/>
+          <w:u w:val="none"/>
         </w:rPr>
         <w:t xml:space="preserve">1.4. Historisch vangblikonderzoek</w:t>
       </w:r>
@@ -1111,22 +1207,41 @@
         <w:t xml:space="preserve">Analyseklaar binnen de historische onderzoeksopzet.</w:t>
       </w:r>
     </w:p>
+    <w:p>
+      <w:pPr>
+        <w:pStyle w:val="BodyText"/>
+      </w:pPr>
+      <w:r>
+        <w:rPr>
+          <w:b/>
+          <w:bCs/>
+        </w:rPr>
+        <w:t xml:space="preserve">Vangblik-opschoning, 28 september 2026.</w:t>
+      </w:r>
+      <w:r>
+        <w:t xml:space="preserve"> </w:t>
+      </w:r>
+      <w:r>
+        <w:t xml:space="preserve">De 60.560 vangstregels uit 1953–1960 zijn lokaal rechtstreeks verbonden met het centrale taxonregister. De 275 oorspronkelijke taxonvermeldingen zijn daar met alle bronvelden behouden; de afzonderlijke tabel</w:t>
+      </w:r>
+      <w:r>
+        <w:t xml:space="preserve"> </w:t>
+      </w:r>
+      <w:r>
+        <w:rPr>
+          <w:rStyle w:val="VerbatimChar"/>
+        </w:rPr>
+        <w:t xml:space="preserve">vangblik_soorten</w:t>
+      </w:r>
+      <w:r>
+        <w:t xml:space="preserve"> </w:t>
+      </w:r>
+      <w:r>
+        <w:t xml:space="preserve">is verwijderd. Alle 99.652 individuen, events, locaties, kwaliteitsvlaggen en oorspronkelijke bronwaarden zijn behouden. Ook de twee vangstregels uit 1959 zonder bijbehorend event blijven herkenbaar en uitgesloten. De bestaande taxonkoppelingen blijven kandidaat; deze opschoning bevestigt geen nieuwe soortidentificaties en verandert de analysegeschiktheid niet. De migratie, het terugdraaien en het volledige herstel uit back-up zijn beproefd. Website, dashboard en Shiny zijn niet aangepast; er is niets naar de VPS gepubliceerd.</w:t>
+      </w:r>
+    </w:p>
     <w:bookmarkEnd w:id="16"/>
-    <w:bookmarkStart w:id="34" w:name="X05a7f9ed9696b113895f0c60145ad70b98b3ccf"/>
-    <w:p>
-      <w:pPr>
-        <w:pStyle w:val="BodyText"/>
-      </w:pPr>
-      <w:r>
-        <w:rPr>
-          <w:b/>
-        </w:rPr>
-        <w:t>Vangblik-opschoning, 28 september 2026.</w:t>
-      </w:r>
-      <w:r>
-        <w:t xml:space="preserve"> De 60.560 vangstregels uit 1953–1960 zijn lokaal rechtstreeks verbonden met het centrale taxonregister. De 275 oorspronkelijke taxonvermeldingen zijn daar met alle bronvelden behouden; de afzonderlijke tabel vangblik_soorten is verwijderd. Alle 99.652 individuen, events, locaties, kwaliteitsvlaggen en oorspronkelijke bronwaarden zijn behouden. Ook de twee vangstregels uit 1959 zonder bijbehorend event blijven herkenbaar en uitgesloten. De bestaande taxonkoppelingen blijven kandidaat; deze opschoning bevestigt geen nieuwe soortidentificaties en verandert de analysegeschiktheid niet. De migratie, het terugdraaien en het volledige herstel uit back-up zijn beproefd. Website, dashboard en Shiny zijn niet aangepast; er is niets naar de VPS gepubliceerd.</w:t>
-      </w:r>
-    </w:p>
+    <w:bookmarkStart w:id="34" w:name="X003d1b4454050d8b2300662d18ee0e6097f4328"/>
     <w:p>
       <w:pPr>
         <w:pStyle w:val="Heading3"/>
@@ -1134,6 +1249,7 @@
       <w:r>
         <w:rPr>
           <w:color w:val="000000"/>
+          <w:u w:val="none"/>
         </w:rPr>
         <w:t xml:space="preserve">1.5. NDFF: één canonieke laag van openbare en beveiligde gegevens</w:t>
       </w:r>
@@ -1145,11 +1261,15 @@
       <w:r>
         <w:rPr>
           <w:b/>
-        </w:rPr>
-        <w:t>Omvang en periode.</w:t>
-      </w:r>
-      <w:r>
-        <w:t xml:space="preserve"> De openbare levering bevat 810.830 unieke niet-vogelrecords uit de downloadselectie 1950–2025. De ruwe bronjaren lopen echter van 1700 tot 2025: 5.336 regels hebben een bronjaar in 1700–1949. Dat bevestigt geen waarnemingsdatum in die eerdere jaren; bronintervallen en datumkwaliteit blijven per record behouden. De beveiligde levering bevat 14.573 records voor 191 geselecteerde taxa. Daarvan vervangen 14.420 records hun openbare, vervaagde tegenhanger en zijn 153 records alleen in de beveiligde levering aanwezig. De gecombineerde laag telt daardoor 810.983 unieke waarnemingen.</w:t>
+          <w:bCs/>
+        </w:rPr>
+        <w:t xml:space="preserve">Omvang en periode.</w:t>
+      </w:r>
+      <w:r>
+        <w:t xml:space="preserve"> </w:t>
+      </w:r>
+      <w:r>
+        <w:t xml:space="preserve">De openbare levering bevat 810.830 unieke niet-vogelrecords uit de downloadselectie 1950–2025. De ruwe bronjaren lopen echter van 1700 tot 2025: 5.336 regels hebben een bronjaar in 1700–1949. Dat bevestigt geen waarnemingsdatum in die eerdere jaren; bronintervallen en datumkwaliteit blijven per record behouden. De beveiligde levering bevat 14.573 records voor 191 geselecteerde taxa. Daarvan vervangen 14.420 records hun openbare, vervaagde tegenhanger en zijn 153 records alleen in de beveiligde levering aanwezig. De gecombineerde laag telt daardoor 810.983 unieke waarnemingen.</w:t>
       </w:r>
     </w:p>
     <w:p>
@@ -1206,7 +1326,7 @@
         <w:t xml:space="preserve">Voorwaardelijk bruikbaar. De bronorganisaties zijn aangeschreven met het verzoek de aanvullende metadata te leveren.</w:t>
       </w:r>
     </w:p>
-    <w:bookmarkStart w:id="17" w:name="Xf2f5e1637d9b0d825d88db49318fbe09fe4562d"/>
+    <w:bookmarkStart w:id="17" w:name="dagvlinders"/>
     <w:p>
       <w:pPr>
         <w:pStyle w:val="Heading4"/>
@@ -1214,6 +1334,7 @@
       <w:r>
         <w:rPr>
           <w:color w:val="000000"/>
+          <w:u w:val="none"/>
         </w:rPr>
         <w:t xml:space="preserve">1.5.1. Dagvlinders</w:t>
       </w:r>
@@ -1273,7 +1394,7 @@
       </w:r>
     </w:p>
     <w:bookmarkEnd w:id="17"/>
-    <w:bookmarkStart w:id="18" w:name="Xab588a339567fbeba82f7ca9f0ef20022ceaf38"/>
+    <w:bookmarkStart w:id="18" w:name="hommels"/>
     <w:p>
       <w:pPr>
         <w:pStyle w:val="Heading4"/>
@@ -1281,6 +1402,7 @@
       <w:r>
         <w:rPr>
           <w:color w:val="000000"/>
+          <w:u w:val="none"/>
         </w:rPr>
         <w:t xml:space="preserve">1.5.2. Hommels</w:t>
       </w:r>
@@ -1340,7 +1462,7 @@
       </w:r>
     </w:p>
     <w:bookmarkEnd w:id="18"/>
-    <w:bookmarkStart w:id="19" w:name="X5eeebc0b3ea39369efcb9361b685b51ab379390"/>
+    <w:bookmarkStart w:id="19" w:name="libellen"/>
     <w:p>
       <w:pPr>
         <w:pStyle w:val="Heading4"/>
@@ -1348,6 +1470,7 @@
       <w:r>
         <w:rPr>
           <w:color w:val="000000"/>
+          <w:u w:val="none"/>
         </w:rPr>
         <w:t xml:space="preserve">1.5.3. Libellen</w:t>
       </w:r>
@@ -1407,7 +1530,7 @@
       </w:r>
     </w:p>
     <w:bookmarkEnd w:id="19"/>
-    <w:bookmarkStart w:id="20" w:name="Xf7f75bff85528639d3a54437d815ffc982ac078"/>
+    <w:bookmarkStart w:id="20" w:name="nachtvlinders"/>
     <w:p>
       <w:pPr>
         <w:pStyle w:val="Heading4"/>
@@ -1415,6 +1538,7 @@
       <w:r>
         <w:rPr>
           <w:color w:val="000000"/>
+          <w:u w:val="none"/>
         </w:rPr>
         <w:t xml:space="preserve">1.5.4. Nachtvlinders</w:t>
       </w:r>
@@ -1474,7 +1598,7 @@
       </w:r>
     </w:p>
     <w:bookmarkEnd w:id="20"/>
-    <w:bookmarkStart w:id="21" w:name="X5952ec78f96e716985cfd2bef0c6dea751da098"/>
+    <w:bookmarkStart w:id="21" w:name="amfibieën"/>
     <w:p>
       <w:pPr>
         <w:pStyle w:val="Heading4"/>
@@ -1482,6 +1606,7 @@
       <w:r>
         <w:rPr>
           <w:color w:val="000000"/>
+          <w:u w:val="none"/>
         </w:rPr>
         <w:t xml:space="preserve">1.5.5. Amfibieën</w:t>
       </w:r>
@@ -1541,7 +1666,7 @@
       </w:r>
     </w:p>
     <w:bookmarkEnd w:id="21"/>
-    <w:bookmarkStart w:id="22" w:name="Xf98973ac0b4b22a8147264cf6fda7ae2d1f2584"/>
+    <w:bookmarkStart w:id="22" w:name="reptielen"/>
     <w:p>
       <w:pPr>
         <w:pStyle w:val="Heading4"/>
@@ -1549,6 +1674,7 @@
       <w:r>
         <w:rPr>
           <w:color w:val="000000"/>
+          <w:u w:val="none"/>
         </w:rPr>
         <w:t xml:space="preserve">1.5.6. Reptielen</w:t>
       </w:r>
@@ -1608,7 +1734,7 @@
       </w:r>
     </w:p>
     <w:bookmarkEnd w:id="22"/>
-    <w:bookmarkStart w:id="23" w:name="X9ffbbed58a474302bc88f9b6483937563542adc"/>
+    <w:bookmarkStart w:id="23" w:name="vissen"/>
     <w:p>
       <w:pPr>
         <w:pStyle w:val="Heading4"/>
@@ -1616,6 +1742,7 @@
       <w:r>
         <w:rPr>
           <w:color w:val="000000"/>
+          <w:u w:val="none"/>
         </w:rPr>
         <w:t xml:space="preserve">1.5.7. Vissen</w:t>
       </w:r>
@@ -1675,7 +1802,7 @@
       </w:r>
     </w:p>
     <w:bookmarkEnd w:id="23"/>
-    <w:bookmarkStart w:id="24" w:name="X90b1412457ba2ad39675de54e16fb4052a9af96"/>
+    <w:bookmarkStart w:id="24" w:name="vleermuistransecten"/>
     <w:p>
       <w:pPr>
         <w:pStyle w:val="Heading4"/>
@@ -1683,6 +1810,7 @@
       <w:r>
         <w:rPr>
           <w:color w:val="000000"/>
+          <w:u w:val="none"/>
         </w:rPr>
         <w:t xml:space="preserve">1.5.8. Vleermuistransecten</w:t>
       </w:r>
@@ -1742,7 +1870,7 @@
       </w:r>
     </w:p>
     <w:bookmarkEnd w:id="24"/>
-    <w:bookmarkStart w:id="25" w:name="X0bf7c6d2026ffa63b6182a76ed7ab201ef2ca1a"/>
+    <w:bookmarkStart w:id="25" w:name="konijnentellingen-in-de-duinen"/>
     <w:p>
       <w:pPr>
         <w:pStyle w:val="Heading4"/>
@@ -1750,6 +1878,7 @@
       <w:r>
         <w:rPr>
           <w:color w:val="000000"/>
+          <w:u w:val="none"/>
         </w:rPr>
         <w:t xml:space="preserve">1.5.9. Konijnentellingen in de duinen</w:t>
       </w:r>
@@ -1809,7 +1938,7 @@
       </w:r>
     </w:p>
     <w:bookmarkEnd w:id="25"/>
-    <w:bookmarkStart w:id="26" w:name="Xd64910a2091f56dedd2aaa5a75994d38ec4c969"/>
+    <w:bookmarkStart w:id="26" w:name="wintertellingen-vleermuizen"/>
     <w:p>
       <w:pPr>
         <w:pStyle w:val="Heading4"/>
@@ -1817,6 +1946,7 @@
       <w:r>
         <w:rPr>
           <w:color w:val="000000"/>
+          <w:u w:val="none"/>
         </w:rPr>
         <w:t xml:space="preserve">1.5.10. Wintertellingen vleermuizen</w:t>
       </w:r>
@@ -1876,7 +2006,7 @@
       </w:r>
     </w:p>
     <w:bookmarkEnd w:id="26"/>
-    <w:bookmarkStart w:id="27" w:name="X9cec44656db08bd57f600992eaa74a526d260b3"/>
+    <w:bookmarkStart w:id="27" w:name="het-nieuwe-strepen"/>
     <w:p>
       <w:pPr>
         <w:pStyle w:val="Heading4"/>
@@ -1884,6 +2014,7 @@
       <w:r>
         <w:rPr>
           <w:color w:val="000000"/>
+          <w:u w:val="none"/>
         </w:rPr>
         <w:t xml:space="preserve">1.5.11. Het Nieuwe Strepen</w:t>
       </w:r>
@@ -1943,7 +2074,7 @@
       </w:r>
     </w:p>
     <w:bookmarkEnd w:id="27"/>
-    <w:bookmarkStart w:id="28" w:name="Xc056d2025de29c95bc511421c5f5e41469354eb"/>
+    <w:bookmarkStart w:id="28" w:name="Xadd682eaf9770b54759a1b54720dedd522bc07f"/>
     <w:p>
       <w:pPr>
         <w:pStyle w:val="Heading4"/>
@@ -1951,6 +2082,7 @@
       <w:r>
         <w:rPr>
           <w:color w:val="000000"/>
+          <w:u w:val="none"/>
         </w:rPr>
         <w:t xml:space="preserve">1.5.12. FLORBASE en andere vaatplantinventarisaties</w:t>
       </w:r>
@@ -2010,7 +2142,7 @@
       </w:r>
     </w:p>
     <w:bookmarkEnd w:id="28"/>
-    <w:bookmarkStart w:id="29" w:name="Xb2fbeb28e0a334b9e6cb93232c4d845faf48221"/>
+    <w:bookmarkStart w:id="29" w:name="lmf-aandachtssoorten"/>
     <w:p>
       <w:pPr>
         <w:pStyle w:val="Heading4"/>
@@ -2018,6 +2150,7 @@
       <w:r>
         <w:rPr>
           <w:color w:val="000000"/>
+          <w:u w:val="none"/>
         </w:rPr>
         <w:t xml:space="preserve">1.5.13. LMF-aandachtssoorten</w:t>
       </w:r>
@@ -2077,7 +2210,7 @@
       </w:r>
     </w:p>
     <w:bookmarkEnd w:id="29"/>
-    <w:bookmarkStart w:id="30" w:name="X0ce2ec4e8b5503e251897e5490450ca2d9e0742"/>
+    <w:bookmarkStart w:id="30" w:name="mossen-en-korstmossen"/>
     <w:p>
       <w:pPr>
         <w:pStyle w:val="Heading4"/>
@@ -2085,6 +2218,7 @@
       <w:r>
         <w:rPr>
           <w:color w:val="000000"/>
+          <w:u w:val="none"/>
         </w:rPr>
         <w:t xml:space="preserve">1.5.14. Mossen en korstmossen</w:t>
       </w:r>
@@ -2144,7 +2278,7 @@
       </w:r>
     </w:p>
     <w:bookmarkEnd w:id="30"/>
-    <w:bookmarkStart w:id="31" w:name="X339fafe251367982d6218746f16721a93fa7f70"/>
+    <w:bookmarkStart w:id="31" w:name="bos--en-zeereeppaddenstoelen"/>
     <w:p>
       <w:pPr>
         <w:pStyle w:val="Heading4"/>
@@ -2152,6 +2286,7 @@
       <w:r>
         <w:rPr>
           <w:color w:val="000000"/>
+          <w:u w:val="none"/>
         </w:rPr>
         <w:t xml:space="preserve">1.5.15. Bos- en zeereeppaddenstoelen</w:t>
       </w:r>
@@ -2211,7 +2346,7 @@
       </w:r>
     </w:p>
     <w:bookmarkEnd w:id="31"/>
-    <w:bookmarkStart w:id="32" w:name="X342bae7ae5afae546f17223888206446d449411"/>
+    <w:bookmarkStart w:id="32" w:name="weekdieren"/>
     <w:p>
       <w:pPr>
         <w:pStyle w:val="Heading4"/>
@@ -2219,6 +2354,7 @@
       <w:r>
         <w:rPr>
           <w:color w:val="000000"/>
+          <w:u w:val="none"/>
         </w:rPr>
         <w:t xml:space="preserve">1.5.16. Weekdieren</w:t>
       </w:r>
@@ -2278,7 +2414,7 @@
       </w:r>
     </w:p>
     <w:bookmarkEnd w:id="32"/>
-    <w:bookmarkStart w:id="33" w:name="Xcc11e4dda0fa9b87cf2613be17ff277804bdc91"/>
+    <w:bookmarkStart w:id="33" w:name="snl-gebiedsmonitoring"/>
     <w:p>
       <w:pPr>
         <w:pStyle w:val="Heading4"/>
@@ -2286,6 +2422,7 @@
       <w:r>
         <w:rPr>
           <w:color w:val="000000"/>
+          <w:u w:val="none"/>
         </w:rPr>
         <w:t xml:space="preserve">1.5.17. SNL-gebiedsmonitoring</w:t>
       </w:r>
@@ -2354,7 +2491,7 @@
     </w:p>
     <w:bookmarkEnd w:id="33"/>
     <w:bookmarkEnd w:id="34"/>
-    <w:bookmarkStart w:id="42" w:name="X77733873953f7250a44afc39ac6f33e9c0fface"/>
+    <w:bookmarkStart w:id="43" w:name="openbare-externe-ecologiebronnen"/>
     <w:p>
       <w:pPr>
         <w:pStyle w:val="Heading3"/>
@@ -2362,6 +2499,7 @@
       <w:r>
         <w:rPr>
           <w:color w:val="000000"/>
+          <w:u w:val="none"/>
         </w:rPr>
         <w:t xml:space="preserve">1.6. Openbare externe ecologiebronnen</w:t>
       </w:r>
@@ -2423,7 +2561,174 @@
         <w:t xml:space="preserve">.</w:t>
       </w:r>
     </w:p>
-    <w:bookmarkStart w:id="36" w:name="Xaa03dabe850e534118471d9a4587f103d7cc6d0"/>
+    <w:p>
+      <w:pPr>
+        <w:pStyle w:val="BodyText"/>
+      </w:pPr>
+      <w:r>
+        <w:rPr>
+          <w:b/>
+          <w:bCs/>
+        </w:rPr>
+        <w:t xml:space="preserve">Bronopslag na de gerichte ontvlechting van 29 september 2026.</w:t>
+      </w:r>
+      <w:r>
+        <w:t xml:space="preserve"> </w:t>
+      </w:r>
+      <w:r>
+        <w:t xml:space="preserve">De vijf niet-LVD-bronnen staan ieder onder een herkenbare bronnaam:</w:t>
+      </w:r>
+      <w:r>
+        <w:t xml:space="preserve"> </w:t>
+      </w:r>
+      <w:r>
+        <w:rPr>
+          <w:rStyle w:val="VerbatimChar"/>
+        </w:rPr>
+        <w:t xml:space="preserve">endure_*</w:t>
+      </w:r>
+      <w:r>
+        <w:t xml:space="preserve">,</w:t>
+      </w:r>
+      <w:r>
+        <w:t xml:space="preserve"> </w:t>
+      </w:r>
+      <w:r>
+        <w:rPr>
+          <w:rStyle w:val="VerbatimChar"/>
+        </w:rPr>
+        <w:t xml:space="preserve">stowa_limnodata_*</w:t>
+      </w:r>
+      <w:r>
+        <w:t xml:space="preserve">,</w:t>
+      </w:r>
+      <w:r>
+        <w:t xml:space="preserve"> </w:t>
+      </w:r>
+      <w:r>
+        <w:rPr>
+          <w:rStyle w:val="VerbatimChar"/>
+        </w:rPr>
+        <w:t xml:space="preserve">naturalis_botany_*</w:t>
+      </w:r>
+      <w:r>
+        <w:t xml:space="preserve">,</w:t>
+      </w:r>
+      <w:r>
+        <w:t xml:space="preserve"> </w:t>
+      </w:r>
+      <w:r>
+        <w:rPr>
+          <w:rStyle w:val="VerbatimChar"/>
+        </w:rPr>
+        <w:t xml:space="preserve">naturalis_coleoptera_*</w:t>
+      </w:r>
+      <w:r>
+        <w:t xml:space="preserve"> </w:t>
+      </w:r>
+      <w:r>
+        <w:t xml:space="preserve">en</w:t>
+      </w:r>
+      <w:r>
+        <w:t xml:space="preserve"> </w:t>
+      </w:r>
+      <w:r>
+        <w:rPr>
+          <w:rStyle w:val="VerbatimChar"/>
+        </w:rPr>
+        <w:t xml:space="preserve">nmr_vlinders_*</w:t>
+      </w:r>
+      <w:r>
+        <w:t xml:space="preserve">. Iedere familie heeft een dataset-, event-, resultaat- en overlaptabel. Samen gaat het om vijf datasets, 7.557 events, 17.606 resultaten en 5.942 overlapbeoordelingen uit 1875–2025; dit zijn bronregels en geen opgetelde unieke waarnemingen. Hun oorspronkelijke IDs, bronversies, bronmetadata, expliciete afwezigheden, eenheden, analysebeperkingen en mogelijke overlappen blijven behouden. Bronresultaten blijven via</w:t>
+      </w:r>
+      <w:r>
+        <w:t xml:space="preserve"> </w:t>
+      </w:r>
+      <w:r>
+        <w:rPr>
+          <w:rStyle w:val="VerbatimChar"/>
+        </w:rPr>
+        <w:t xml:space="preserve">taxa_bronkoppeling</w:t>
+      </w:r>
+      <w:r>
+        <w:t xml:space="preserve"> </w:t>
+      </w:r>
+      <w:r>
+        <w:t xml:space="preserve">vanuit</w:t>
+      </w:r>
+      <w:r>
+        <w:t xml:space="preserve"> </w:t>
+      </w:r>
+      <w:r>
+        <w:rPr>
+          <w:rStyle w:val="VerbatimChar"/>
+        </w:rPr>
+        <w:t xml:space="preserve">taxa</w:t>
+      </w:r>
+      <w:r>
+        <w:t xml:space="preserve"> </w:t>
+      </w:r>
+      <w:r>
+        <w:t xml:space="preserve">en met</w:t>
+      </w:r>
+      <w:r>
+        <w:t xml:space="preserve"> </w:t>
+      </w:r>
+      <w:r>
+        <w:rPr>
+          <w:rStyle w:val="VerbatimChar"/>
+        </w:rPr>
+        <w:t xml:space="preserve">taxon_groepen</w:t>
+      </w:r>
+      <w:r>
+        <w:t xml:space="preserve"> </w:t>
+      </w:r>
+      <w:r>
+        <w:t xml:space="preserve">als indeling bereikbaar. De bestaande analyse-ingang levert dezelfde uitkomsten. De overige 2.793 LVD-opnamen met 64.683 resultaten uit 1959–2015 blijven voorlopig in</w:t>
+      </w:r>
+      <w:r>
+        <w:t xml:space="preserve"> </w:t>
+      </w:r>
+      <w:r>
+        <w:rPr>
+          <w:rStyle w:val="VerbatimChar"/>
+        </w:rPr>
+        <w:t xml:space="preserve">externe_ecologie_*</w:t>
+      </w:r>
+      <w:r>
+        <w:t xml:space="preserve">; de 644 eerder onder</w:t>
+      </w:r>
+      <w:r>
+        <w:t xml:space="preserve"> </w:t>
+      </w:r>
+      <w:r>
+        <w:rPr>
+          <w:rStyle w:val="VerbatimChar"/>
+        </w:rPr>
+        <w:t xml:space="preserve">pq_*</w:t>
+      </w:r>
+      <w:r>
+        <w:t xml:space="preserve"> </w:t>
+      </w:r>
+      <w:r>
+        <w:t xml:space="preserve">gebrachte LVD-opnamen met 16.627 resultaten uit 1981–2015 blijven daar. Dit is geen oordeel dat alle LVD-opnamen permanente kwadraten zijn. Er is niets naar de VPS gepubliceerd. De volledige brontabelkaart, controles en herstelafbakening staan in</w:t>
+      </w:r>
+      <w:r>
+        <w:t xml:space="preserve"> </w:t>
+      </w:r>
+      <w:hyperlink r:id="rId36">
+        <w:r>
+          <w:rPr>
+            <w:rStyle w:val="Hyperlink"/>
+          </w:rPr>
+          <w:t xml:space="preserve">het taxonregister</w:t>
+        </w:r>
+      </w:hyperlink>
+      <w:r>
+        <w:t xml:space="preserve">.</w:t>
+      </w:r>
+    </w:p>
+    <w:bookmarkStart w:id="37" w:name="stowa-limnodata"/>
     <w:p>
       <w:pPr>
         <w:pStyle w:val="Heading4"/>
@@ -2431,6 +2736,7 @@
       <w:r>
         <w:rPr>
           <w:color w:val="000000"/>
+          <w:u w:val="none"/>
         </w:rPr>
         <w:t xml:space="preserve">1.6.1. STOWA Limnodata</w:t>
       </w:r>
@@ -2513,8 +2819,8 @@
         <w:t xml:space="preserve">, 196 als Braun-Blanquetklasse en 56 zonder eenheid. Niet gemelde soorten zijn geen nulwaarneming.</w:t>
       </w:r>
     </w:p>
-    <w:bookmarkEnd w:id="36"/>
-    <w:bookmarkStart w:id="37" w:name="Xe9b446960bca12075cdde30af1cbaf73f645a87"/>
+    <w:bookmarkEnd w:id="37"/>
+    <w:bookmarkStart w:id="38" w:name="endure-helmduinfauna"/>
     <w:p>
       <w:pPr>
         <w:pStyle w:val="Heading4"/>
@@ -2522,6 +2828,7 @@
       <w:r>
         <w:rPr>
           <w:color w:val="000000"/>
+          <w:u w:val="none"/>
         </w:rPr>
         <w:t xml:space="preserve">1.6.2. ENDURE helmduinfauna</w:t>
       </w:r>
@@ -2580,8 +2887,8 @@
         <w:t xml:space="preserve">Dit is een gestandaardiseerde en herhaalbare referentiemeting voor ongewervelden in witte duinen. De expliciete afwezigheden zijn bruikbaar binnen de veertien complete matrices. Eén meetjaar levert geen ontwikkeling door de tijd op.</w:t>
       </w:r>
     </w:p>
-    <w:bookmarkEnd w:id="37"/>
-    <w:bookmarkStart w:id="38" w:name="X0079604d46da30ac9b5828c2b6c106eff7cd8f8"/>
+    <w:bookmarkEnd w:id="38"/>
+    <w:bookmarkStart w:id="39" w:name="landelijke-vegetatie-databank"/>
     <w:p>
       <w:pPr>
         <w:pStyle w:val="Heading4"/>
@@ -2589,6 +2896,7 @@
       <w:r>
         <w:rPr>
           <w:color w:val="000000"/>
+          <w:u w:val="none"/>
         </w:rPr>
         <w:t xml:space="preserve">1.6.3. Landelijke Vegetatie Databank</w:t>
       </w:r>
@@ -2629,62 +2937,215 @@
         <w:t xml:space="preserve">De gepubliceerde bronversie 1.6 bevat binnen het basisgebied 5.195 opnamen en 119.006 taxonregels uit 1930–2015. Toegelaten zijn 3.437 opnamen met een gepubliceerde locatie-onzekerheid van maximaal 50 meter en 81.310 taxonresultaten uit 1959–2015. De overige 1.758 opnamen blijven buiten de analytische selectie vanwege een onzekerheid van 100, 1.000 of 5.000 meter.</w:t>
       </w:r>
     </w:p>
-    <w:bookmarkEnd w:id="38"/>
-    <w:bookmarkStart w:id="39" w:name="Xa66e2be297c2cf82b37e3e4b59e101c55a2b789"/>
-    <w:p>
-      <w:pPr>
-        <w:pStyle w:val="BodyText"/>
-      </w:pPr>
-      <w:r>
-        <w:rPr>
-          <w:b/>
-        </w:rPr>
-        <w:t>Overlap en gebruik.</w:t>
-      </w:r>
-      <w:r>
-        <w:t xml:space="preserve"> De oorspronkelijke controle op datum, taxon en afstand markeerde 8.006 resultaten als exacte en 5.163 als waarschijnlijke overlap met de primaire provinciale PQ-reeks. Dit betreft overeenkomsten per taxonregel, geen bewezen identieke volledige opnamen. Bij de PQ-integratie zijn de 644 volledige LVD-opnamen waartoe deze 13.169 resultaten behoren verplaatst, inclusief alle 16.627 bijbehorende resultaten uit 1981–2015. Geen van deze bronvarianten telt zelfstandig mee. Alle 32.657 bestaande overlapregels bij de verplaatste resultaten zijn behouden, ook hun mogelijke NDFF-koppelingen. Over de volledige LVD-selectie hebben 51.078 resultaten een mogelijke overeenkomst met een NDFF-regel op taxon, datum en onzekerheidspolygoon. Omdat NDFF geen gedeelde bron-ID levert en de polygonen ruimtelijke onzekerheid weergeven, wordt die mogelijke overlap niet automatisch als dubbel verwijderd. De opnamecontext blijft beschikbaar voor historische vegetatiesamenstelling en verspreiding; vergelijking door de tijd vereist controle van opnametype, oppervlak en herhaling.</w:t>
-      </w:r>
-    </w:p>
-    <w:p>
-      <w:pPr>
-        <w:pStyle w:val="BodyText"/>
-      </w:pPr>
-      <w:r>
-        <w:rPr>
-          <w:b/>
-        </w:rPr>
-        <w:t>PQ-broncontrole, 27 september 2026.</w:t>
-      </w:r>
-      <w:r>
-        <w:t xml:space="preserve"> Het oorspronkelijke LVD-archief is met toestemming alleen-lezen op de T7 gecontroleerd. De bestandshash klopt met de geïmporteerde bronversie. Het archief bevat opname-identificaties, maar geen vaste PQ-identificatie; voor de 3.437 geïmporteerde opnamen uit 1959–2015 bevat de reference-extensie geen aanvullende bronverwijzingen. Vergelijking met de 2.007 provinciale opnamen uit 1981–2025 levert op datum en afstand 654 mogelijke opnameparen uit 1981–2015 op. Bij 20 paren zijn de volledige lijsten met letterlijke taxonnamen en bedekkingscodes gelijk; bij vier daarvan verschillen de percentages. Verschillende namen zijn in deze vergelijking niet als synoniemen samengenomen. Ook een gelijke lijst bewijst op zichzelf geen gedeelde PQ-identiteit. De verplaatsing omvat uitsluitend de 644 LVD-opnamen met al vastgelegde provinciale overlap, samen 652 mogelijke opnameparen. De twee overige nabijheidskandidaten worden niet verplaatst. De herhaalbare vergelijking voor beide opslagplaatsen is gis/scripts/run_external_ecology_overlap_audit.py --pq-inventarisatie. Uitvoeringsbewijs en gecontroleerde herstelback-up staan lokaal onder outputs/pq-integratie.</w:t>
-      </w:r>
-    </w:p>
-    <w:p>
-      <w:pPr>
-        <w:pStyle w:val="BodyText"/>
-      </w:pPr>
-      <w:r>
-        <w:rPr>
-          <w:b/>
-        </w:rPr>
-        <w:t>Taxonomische importbeperking, vastgesteld 27 september 2026.</w:t>
-      </w:r>
-      <w:r>
-        <w:t xml:space="preserve"> De oorspronkelijke import gebruikte bij alle 81.310 toegelaten LVD-resultaten (1959–2015; 998 verschillende naamstrings) een status als taxonrang: 81.285 keer accepted en 25 keer synonym. De oorspronkelijke status blijft ook in de bronmetadata bewaard. Bij de 16.627 verplaatste resultaten heet dit veld nu taxonomische_status_aangeleverd; hun oorspronkelijke taxonrang wordt via het centrale register uit de bewaarde broncontext gelezen en blijft leeg waar de bron geen rang levert. De 64.683 overige resultaten staan nog in de externe bronlaag met de oude veldnaam, die niet als rang mag worden gebruikt. De historische bulkimport blokkeert na de migratie tegen het opnieuw invoeren van verplaatste bronregels. Alle meetwaarden, ruimtelijke toelating en oorspronkelijke overlapbesluiten zijn behouden. Zie docs/database/TAXONREGISTER.md voor model, controles en herstelwijze.</w:t>
-      </w:r>
-    </w:p>
-    <w:p>
-      <w:pPr/>
-      <w:r>
-        <w:rPr>
-          <w:b/>
-        </w:rPr>
-        <w:t>Aanvullende taxonomische metadata, beoordeeld 27 september 2026.</w:t>
-      </w:r>
-      <w:r>
-        <w:t xml:space="preserve"> In de extractie van 998 LVD-naamgebruiken uit de bronreeks 1959–2015 is bij 122 het veld scientificNameAuthorship gelijk aan de volledige scientificName. Manifest v3 heeft deze tekst niet als auteur overgenomen: het centrale veld naam_auteur bleef bij die invoer voor deze 122 naamgebruiken leeg. Bij de centralisatie zijn afzonderlijk onderbouwde auteursnamen aangevuld; de oorspronkelijke lege waarde blijft in de broncontext bewaard. De letterlijke bronmetadata zijn in taxa_bronkoppeling behouden. Dit betreft 122 naamgebruiken, niet 122 waarnemingen. De toevoeging aan het register verandert geen meetwaarden, ruimtelijke toelating, overlapbesluiten of bestaande bronvelden.</w:t>
-      </w:r>
-    </w:p>
+    <w:p>
+      <w:pPr>
+        <w:pStyle w:val="BodyText"/>
+      </w:pPr>
+      <w:r>
+        <w:rPr>
+          <w:b/>
+          <w:bCs/>
+        </w:rPr>
+        <w:t xml:space="preserve">Overlap en gebruik.</w:t>
+      </w:r>
+      <w:r>
+        <w:t xml:space="preserve"> </w:t>
+      </w:r>
+      <w:r>
+        <w:t xml:space="preserve">De oorspronkelijke controle op datum, taxon en afstand markeerde 8.006 resultaten als exacte en 5.163 als waarschijnlijke overlap met de primaire provinciale PQ-reeks. Dit betreft overeenkomsten per taxonregel, geen bewezen identieke volledige opnamen. Bij de PQ-integratie zijn de 644 volledige LVD-opnamen waartoe deze 13.169 resultaten behoren verplaatst, inclusief alle 16.627 bijbehorende resultaten uit 1981–2015. Geen van deze bronvarianten telt zelfstandig mee. Alle 32.657 bestaande overlapregels bij de verplaatste resultaten zijn behouden, ook hun mogelijke NDFF-koppelingen. Over de volledige LVD-selectie hebben 51.078 resultaten een mogelijke overeenkomst met een NDFF-regel op taxon, datum en onzekerheidspolygoon. Omdat NDFF geen gedeelde bron-ID levert en de polygonen ruimtelijke onzekerheid weergeven, wordt die mogelijke overlap niet automatisch als dubbel verwijderd. De opnamecontext blijft beschikbaar voor historische vegetatiesamenstelling en verspreiding; vergelijking door de tijd vereist controle van opnametype, oppervlak en herhaling.</w:t>
+      </w:r>
+    </w:p>
+    <w:p>
+      <w:pPr>
+        <w:pStyle w:val="BodyText"/>
+      </w:pPr>
+      <w:r>
+        <w:rPr>
+          <w:b/>
+          <w:bCs/>
+        </w:rPr>
+        <w:t xml:space="preserve">PQ-broncontrole, 27 september 2026.</w:t>
+      </w:r>
+      <w:r>
+        <w:t xml:space="preserve"> </w:t>
+      </w:r>
+      <w:r>
+        <w:t xml:space="preserve">Het oorspronkelijke LVD-archief is met toestemming alleen-lezen op de T7 gecontroleerd. De bestandshash klopt met de geïmporteerde bronversie. Het archief bevat opname-identificaties, maar geen vaste PQ-identificatie; voor de 3.437 geïmporteerde opnamen uit 1959–2015 bevat de reference-extensie geen aanvullende bronverwijzingen. Vergelijking met de 2.007 provinciale opnamen uit 1981–2025 levert op datum en afstand 654 mogelijke opnameparen uit 1981–2015 op. Bij 20 paren zijn de volledige lijsten met letterlijke taxonnamen en bedekkingscodes gelijk; bij vier daarvan verschillen de percentages. Verschillende namen zijn in deze vergelijking niet als synoniemen samengenomen. Ook een gelijke lijst bewijst op zichzelf geen gedeelde PQ-identiteit. De verplaatsing omvat uitsluitend de 644 LVD-opnamen met al vastgelegde provinciale overlap, samen 652 mogelijke opnameparen. De twee overige nabijheidskandidaten worden niet verplaatst. De herhaalbare vergelijking voor beide opslagplaatsen is</w:t>
+      </w:r>
+      <w:r>
+        <w:t xml:space="preserve"> </w:t>
+      </w:r>
+      <w:r>
+        <w:rPr>
+          <w:rStyle w:val="VerbatimChar"/>
+        </w:rPr>
+        <w:t xml:space="preserve">gis/scripts/run_external_ecology_overlap_audit.py --pq-inventarisatie</w:t>
+      </w:r>
+      <w:r>
+        <w:t xml:space="preserve">. Uitvoeringsbewijs en gecontroleerde herstelback-up staan lokaal onder</w:t>
+      </w:r>
+      <w:r>
+        <w:t xml:space="preserve"> </w:t>
+      </w:r>
+      <w:r>
+        <w:rPr>
+          <w:rStyle w:val="VerbatimChar"/>
+        </w:rPr>
+        <w:t xml:space="preserve">outputs/pq-integratie</w:t>
+      </w:r>
+      <w:r>
+        <w:t xml:space="preserve">.</w:t>
+      </w:r>
+    </w:p>
+    <w:p>
+      <w:pPr>
+        <w:pStyle w:val="BodyText"/>
+      </w:pPr>
+      <w:r>
+        <w:rPr>
+          <w:b/>
+          <w:bCs/>
+        </w:rPr>
+        <w:t xml:space="preserve">Taxonomische importbeperking, vastgesteld 27 september 2026.</w:t>
+      </w:r>
+      <w:r>
+        <w:t xml:space="preserve"> </w:t>
+      </w:r>
+      <w:r>
+        <w:t xml:space="preserve">De oorspronkelijke import gebruikte bij alle 81.310 toegelaten LVD-resultaten (1959–2015; 998 verschillende naamstrings) een status als taxonrang: 81.285 keer</w:t>
+      </w:r>
+      <w:r>
+        <w:t xml:space="preserve"> </w:t>
+      </w:r>
+      <w:r>
+        <w:rPr>
+          <w:rStyle w:val="VerbatimChar"/>
+        </w:rPr>
+        <w:t xml:space="preserve">accepted</w:t>
+      </w:r>
+      <w:r>
+        <w:t xml:space="preserve"> </w:t>
+      </w:r>
+      <w:r>
+        <w:t xml:space="preserve">en 25 keer</w:t>
+      </w:r>
+      <w:r>
+        <w:t xml:space="preserve"> </w:t>
+      </w:r>
+      <w:r>
+        <w:rPr>
+          <w:rStyle w:val="VerbatimChar"/>
+        </w:rPr>
+        <w:t xml:space="preserve">synonym</w:t>
+      </w:r>
+      <w:r>
+        <w:t xml:space="preserve">. De oorspronkelijke status blijft ook in de bronmetadata bewaard. Bij de 16.627 verplaatste resultaten heet dit veld nu</w:t>
+      </w:r>
+      <w:r>
+        <w:t xml:space="preserve"> </w:t>
+      </w:r>
+      <w:r>
+        <w:rPr>
+          <w:rStyle w:val="VerbatimChar"/>
+        </w:rPr>
+        <w:t xml:space="preserve">taxonomische_status_aangeleverd</w:t>
+      </w:r>
+      <w:r>
+        <w:t xml:space="preserve">; hun oorspronkelijke taxonrang wordt via het centrale register uit de bewaarde broncontext gelezen en blijft leeg waar de bron geen rang levert. De 64.683 overige resultaten staan nog in de externe bronlaag met de oude veldnaam, die niet als rang mag worden gebruikt. De historische bulkimport blokkeert na de migratie tegen het opnieuw invoeren van verplaatste bronregels. Alle meetwaarden, ruimtelijke toelating en oorspronkelijke overlapbesluiten zijn behouden. Zie</w:t>
+      </w:r>
+      <w:r>
+        <w:t xml:space="preserve"> </w:t>
+      </w:r>
+      <w:r>
+        <w:rPr>
+          <w:rStyle w:val="VerbatimChar"/>
+        </w:rPr>
+        <w:t xml:space="preserve">docs/database/TAXONREGISTER.md</w:t>
+      </w:r>
+      <w:r>
+        <w:t xml:space="preserve"> </w:t>
+      </w:r>
+      <w:r>
+        <w:t xml:space="preserve">voor model, controles en herstelwijze.</w:t>
+      </w:r>
+    </w:p>
+    <w:p>
+      <w:pPr>
+        <w:pStyle w:val="BodyText"/>
+      </w:pPr>
+      <w:r>
+        <w:rPr>
+          <w:b/>
+          <w:bCs/>
+        </w:rPr>
+        <w:t xml:space="preserve">Aanvullende taxonomische metadata, beoordeeld 27 september 2026.</w:t>
+      </w:r>
+      <w:r>
+        <w:t xml:space="preserve"> </w:t>
+      </w:r>
+      <w:r>
+        <w:t xml:space="preserve">In de extractie van 998 LVD-naamgebruiken uit de bronreeks 1959–2015 is bij 122 het veld</w:t>
+      </w:r>
+      <w:r>
+        <w:t xml:space="preserve"> </w:t>
+      </w:r>
+      <w:r>
+        <w:rPr>
+          <w:rStyle w:val="VerbatimChar"/>
+        </w:rPr>
+        <w:t xml:space="preserve">scientificNameAuthorship</w:t>
+      </w:r>
+      <w:r>
+        <w:t xml:space="preserve"> </w:t>
+      </w:r>
+      <w:r>
+        <w:t xml:space="preserve">gelijk aan de volledige</w:t>
+      </w:r>
+      <w:r>
+        <w:t xml:space="preserve"> </w:t>
+      </w:r>
+      <w:r>
+        <w:rPr>
+          <w:rStyle w:val="VerbatimChar"/>
+        </w:rPr>
+        <w:t xml:space="preserve">scientificName</w:t>
+      </w:r>
+      <w:r>
+        <w:t xml:space="preserve">. Manifest v3 heeft deze tekst niet als auteur overgenomen: het centrale veld</w:t>
+      </w:r>
+      <w:r>
+        <w:t xml:space="preserve"> </w:t>
+      </w:r>
+      <w:r>
+        <w:rPr>
+          <w:rStyle w:val="VerbatimChar"/>
+        </w:rPr>
+        <w:t xml:space="preserve">naam_auteur</w:t>
+      </w:r>
+      <w:r>
+        <w:t xml:space="preserve"> </w:t>
+      </w:r>
+      <w:r>
+        <w:t xml:space="preserve">bleef bij die invoer voor deze 122 naamgebruiken leeg. Bij de centralisatie zijn afzonderlijk onderbouwde auteursnamen aangevuld; de oorspronkelijke lege waarde blijft in de broncontext bewaard. De letterlijke bronmetadata zijn in</w:t>
+      </w:r>
+      <w:r>
+        <w:t xml:space="preserve"> </w:t>
+      </w:r>
+      <w:r>
+        <w:rPr>
+          <w:rStyle w:val="VerbatimChar"/>
+        </w:rPr>
+        <w:t xml:space="preserve">taxa_bronkoppeling</w:t>
+      </w:r>
+      <w:r>
+        <w:t xml:space="preserve"> </w:t>
+      </w:r>
+      <w:r>
+        <w:t xml:space="preserve">behouden. Dit betreft 122 naamgebruiken, niet 122 waarnemingen. De toevoeging aan het register verandert geen meetwaarden, ruimtelijke toelating, overlapbesluiten of bestaande bronvelden.</w:t>
+      </w:r>
+    </w:p>
+    <w:bookmarkEnd w:id="39"/>
+    <w:bookmarkStart w:id="40" w:name="historische-vlinder--en-motcollectie"/>
     <w:p>
       <w:pPr>
         <w:pStyle w:val="Heading4"/>
@@ -2692,6 +3153,7 @@
       <w:r>
         <w:rPr>
           <w:color w:val="000000"/>
+          <w:u w:val="none"/>
         </w:rPr>
         <w:t xml:space="preserve">1.6.4. Historische vlinder- en motcollectie</w:t>
       </w:r>
@@ -2750,8 +3212,8 @@
         <w:t xml:space="preserve">De collectie geeft controleerbare historische aanwezigheid, vooral door de intensieve vangsten van J.A.W. Lucas in 1955–1956. Zonder vanginspanning en lege vangnachten is dit geen populatietrend. De mogelijke NDFF-overlap blijft gemarkeerd en wordt niet automatisch samengevoegd.</w:t>
       </w:r>
     </w:p>
-    <w:bookmarkEnd w:id="39"/>
-    <w:bookmarkStart w:id="40" w:name="X0623f0a4d9ecb153e84d6aa679ad58f6c310383"/>
+    <w:bookmarkEnd w:id="40"/>
+    <w:bookmarkStart w:id="41" w:name="naturalis-botany"/>
     <w:p>
       <w:pPr>
         <w:pStyle w:val="Heading4"/>
@@ -2759,6 +3221,7 @@
       <w:r>
         <w:rPr>
           <w:color w:val="000000"/>
+          <w:u w:val="none"/>
         </w:rPr>
         <w:t xml:space="preserve">1.6.5. Naturalis Botany</w:t>
       </w:r>
@@ -2817,8 +3280,8 @@
         <w:t xml:space="preserve">Gedateerde historische plantenvondsten met bewaard bewijsmateriaal. De records tonen aanwezigheid, geen gestandaardiseerde telinspanning of afwezigheid.</w:t>
       </w:r>
     </w:p>
-    <w:bookmarkEnd w:id="40"/>
-    <w:bookmarkStart w:id="41" w:name="Xdd278617f9613de433492781e9679e24605d2f3"/>
+    <w:bookmarkEnd w:id="41"/>
+    <w:bookmarkStart w:id="42" w:name="naturalis-coleoptera"/>
     <w:p>
       <w:pPr>
         <w:pStyle w:val="Heading4"/>
@@ -2826,6 +3289,7 @@
       <w:r>
         <w:rPr>
           <w:color w:val="000000"/>
+          <w:u w:val="none"/>
         </w:rPr>
         <w:t xml:space="preserve">1.6.6. Naturalis Coleoptera</w:t>
       </w:r>
@@ -2884,9 +3348,9 @@
         <w:t xml:space="preserve">Historische aanwezigheid van kevers met bewaard collectiemateriaal. De bron ondersteunt geen populatietrend zonder gestandaardiseerde vanginspanning. De oorspronkelijke etiketplaats en de gepubliceerde locatie-onzekerheid blijven per specimen beschikbaar.</w:t>
       </w:r>
     </w:p>
-    <w:bookmarkEnd w:id="41"/>
     <w:bookmarkEnd w:id="42"/>
-    <w:bookmarkStart w:id="43" w:name="X4dcded00268e6461b0ddc34253d4faf52bf1dd1"/>
+    <w:bookmarkEnd w:id="43"/>
+    <w:bookmarkStart w:id="44" w:name="X5d611a31ac68a696fd179c2c85c282500afefc7"/>
     <w:p>
       <w:pPr>
         <w:pStyle w:val="Heading3"/>
@@ -2894,6 +3358,7 @@
       <w:r>
         <w:rPr>
           <w:color w:val="000000"/>
+          <w:u w:val="none"/>
         </w:rPr>
         <w:t xml:space="preserve">1.7. Openstaande ruimtelijke toelatingscontrole</w:t>
       </w:r>
@@ -2926,8 +3391,8 @@
         <w:t xml:space="preserve">Deze records blijven herkenbaar als bronmateriaal, maar worden niet zonder een afzonderlijk ruimtelijk besluit in Meijendelanalyses gebruikt. Alle 37.770 vangblikevents en alle territoriumplots liggen binnen het basisgebied.</w:t>
       </w:r>
     </w:p>
-    <w:bookmarkEnd w:id="43"/>
-    <w:bookmarkStart w:id="49" w:name="X14c58f11b78e283997281ebde92c6b31ebc0c80"/>
+    <w:bookmarkEnd w:id="44"/>
+    <w:bookmarkStart w:id="50" w:name="verklarende-omgevingslagen"/>
     <w:p>
       <w:pPr>
         <w:pStyle w:val="Heading3"/>
@@ -2935,6 +3400,7 @@
       <w:r>
         <w:rPr>
           <w:color w:val="000000"/>
+          <w:u w:val="none"/>
         </w:rPr>
         <w:t xml:space="preserve">1.8. Verklarende omgevingslagen</w:t>
       </w:r>
@@ -2947,7 +3413,7 @@
         <w:t xml:space="preserve">Deze gegevens zijn geen soortenwaarnemingen. Zij kunnen wel helpen om ecologische veranderingen te beschrijven of als mogelijke verklaring te toetsen.</w:t>
       </w:r>
     </w:p>
-    <w:bookmarkStart w:id="44" w:name="X97e37a83ef92e6db79e0a815abf4c3d8d6d1754"/>
+    <w:bookmarkStart w:id="45" w:name="dagelijks-weer"/>
     <w:p>
       <w:pPr>
         <w:pStyle w:val="Heading4"/>
@@ -2955,6 +3421,7 @@
       <w:r>
         <w:rPr>
           <w:color w:val="000000"/>
+          <w:u w:val="none"/>
         </w:rPr>
         <w:t xml:space="preserve">1.8.1. Dagelijks weer</w:t>
       </w:r>
@@ -3013,8 +3480,8 @@
         <w:t xml:space="preserve">Temperatuur, neerslag, wind, zon en luchtdruk kunnen als covariaten worden gebruikt. Alleen de genormaliseerde analyseview is geldig; 2026 is nog niet compleet.</w:t>
       </w:r>
     </w:p>
-    <w:bookmarkEnd w:id="44"/>
-    <w:bookmarkStart w:id="45" w:name="X625608f018b59d28869e33232003bd07c2f07d5"/>
+    <w:bookmarkEnd w:id="45"/>
+    <w:bookmarkStart w:id="46" w:name="hoogte"/>
     <w:p>
       <w:pPr>
         <w:pStyle w:val="Heading4"/>
@@ -3022,6 +3489,7 @@
       <w:r>
         <w:rPr>
           <w:color w:val="000000"/>
+          <w:u w:val="none"/>
         </w:rPr>
         <w:t xml:space="preserve">1.8.2. Hoogte</w:t>
       </w:r>
@@ -3080,8 +3548,8 @@
         <w:t xml:space="preserve">Beschrijft hoogte en hoogtevariatie per plot. Eén peiljaar geeft geen ontwikkeling door de tijd.</w:t>
       </w:r>
     </w:p>
-    <w:bookmarkEnd w:id="45"/>
-    <w:bookmarkStart w:id="46" w:name="X8ebc62c1d17a2d7a08504bddffeeb5916a0bcb3"/>
+    <w:bookmarkEnd w:id="46"/>
+    <w:bookmarkStart w:id="47" w:name="stikstofdepositie"/>
     <w:p>
       <w:pPr>
         <w:pStyle w:val="Heading4"/>
@@ -3089,6 +3557,7 @@
       <w:r>
         <w:rPr>
           <w:color w:val="000000"/>
+          <w:u w:val="none"/>
         </w:rPr>
         <w:t xml:space="preserve">1.8.3. Stikstofdepositie</w:t>
       </w:r>
@@ -3147,8 +3616,8 @@
         <w:t xml:space="preserve">Geschikt als mogelijke verklarende factor naast soorten- en vegetatiereeksen. Een samenhang bewijst niet dat stikstof de enige oorzaak is.</w:t>
       </w:r>
     </w:p>
-    <w:bookmarkEnd w:id="46"/>
-    <w:bookmarkStart w:id="47" w:name="X972156668716d33d6f7bf93cdaf573c7928edca"/>
+    <w:bookmarkEnd w:id="47"/>
+    <w:bookmarkStart w:id="48" w:name="bodemgebruik"/>
     <w:p>
       <w:pPr>
         <w:pStyle w:val="Heading4"/>
@@ -3156,6 +3625,7 @@
       <w:r>
         <w:rPr>
           <w:color w:val="000000"/>
+          <w:u w:val="none"/>
         </w:rPr>
         <w:t xml:space="preserve">1.8.4. Bodemgebruik</w:t>
       </w:r>
@@ -3214,8 +3684,8 @@
         <w:t xml:space="preserve">Laat veranderingen in de ruimtelijke omgeving van plots zien. De meetjaren zijn niet jaarlijks beschikbaar.</w:t>
       </w:r>
     </w:p>
-    <w:bookmarkEnd w:id="47"/>
-    <w:bookmarkStart w:id="48" w:name="X92770fc640c1bb2fd0ffeda71d68ce2650b46be"/>
+    <w:bookmarkEnd w:id="48"/>
+    <w:bookmarkStart w:id="49" w:name="natura-2000-habitat"/>
     <w:p>
       <w:pPr>
         <w:pStyle w:val="Heading4"/>
@@ -3223,6 +3693,7 @@
       <w:r>
         <w:rPr>
           <w:color w:val="000000"/>
+          <w:u w:val="none"/>
         </w:rPr>
         <w:t xml:space="preserve">1.8.5. Natura 2000-habitat</w:t>
       </w:r>
@@ -3281,10 +3752,10 @@
         <w:t xml:space="preserve">Geeft de verdeling van habitattypen binnen plots. Dit is één kaartjaar; de aangekondigde T1-kaart is nodig voor een directe vergelijking door de tijd.</w:t>
       </w:r>
     </w:p>
-    <w:bookmarkEnd w:id="48"/>
     <w:bookmarkEnd w:id="49"/>
     <w:bookmarkEnd w:id="50"/>
-    <w:bookmarkStart w:id="58" w:name="X692b0a71312b2a939db271d079fb23757bfc15a"/>
+    <w:bookmarkEnd w:id="51"/>
+    <w:bookmarkStart w:id="59" w:name="X3b532014da7425692b0b753bfd67f02e729afe2"/>
     <w:p>
       <w:pPr>
         <w:pStyle w:val="Heading2"/>
@@ -3292,12 +3763,14 @@
       <w:r>
         <w:rPr>
           <w:color w:val="000000"/>
+          <w:u w:val="none"/>
         </w:rPr>
         <w:t xml:space="preserve">2. Bronnen in MySQL-database</w:t>
       </w:r>
       <w:r>
         <w:rPr>
           <w:color w:val="000000"/>
+          <w:u w:val="none"/>
         </w:rPr>
         <w:t xml:space="preserve"> </w:t>
       </w:r>
@@ -3305,6 +3778,7 @@
         <w:rPr>
           <w:rStyle w:val="VerbatimChar"/>
           <w:color w:val="000000"/>
+          <w:u w:val="none"/>
         </w:rPr>
         <w:t xml:space="preserve">Meijendel_bronnen</w:t>
       </w:r>
@@ -3332,7 +3806,7 @@
         <w:t xml:space="preserve">gebruikt. De nieuwe bijen- en aquatische context uit fase 2 staat op 26 september 2026 alleen in de lokale canonieke database en is nog niet naar de VPS gepubliceerd.</w:t>
       </w:r>
     </w:p>
-    <w:bookmarkStart w:id="52" w:name="X7ae3f60e8dd3c65bdde3d5f608a55d96632a876"/>
+    <w:bookmarkStart w:id="53" w:name="duinvalleivegetatie"/>
     <w:p>
       <w:pPr>
         <w:pStyle w:val="Heading3"/>
@@ -3340,6 +3814,7 @@
       <w:r>
         <w:rPr>
           <w:color w:val="000000"/>
+          <w:u w:val="none"/>
         </w:rPr>
         <w:t xml:space="preserve">2.1. Duinvalleivegetatie</w:t>
       </w:r>
@@ -3364,7 +3839,7 @@
       <w:r>
         <w:t xml:space="preserve"> </w:t>
       </w:r>
-      <w:hyperlink r:id="rId51">
+      <w:hyperlink r:id="rId52">
         <w:r>
           <w:rPr>
             <w:rStyle w:val="Hyperlink"/>
@@ -3409,8 +3884,8 @@
         <w:t xml:space="preserve">De volledige matrix van 208 taxa bevat echte nullen en maakt vergelijking tussen de drie jaren mogelijk. De locatiecodes zijn nog niet betrouwbaar aan geometrieën gekoppeld. Opname 18I01 blijft uitgesloten: daarin zijn 159 taxa geregistreerd, tegenover maximaal 40 in alle overige opnamen. Deze reeks blijft afzonderlijk van de provinciale PQ-reeks.</w:t>
       </w:r>
     </w:p>
-    <w:bookmarkEnd w:id="52"/>
-    <w:bookmarkStart w:id="53" w:name="X6cd5cd3671e295c222d5bd4a47757f0a76f0a19"/>
+    <w:bookmarkEnd w:id="53"/>
+    <w:bookmarkStart w:id="54" w:name="vogelstand-1924"/>
     <w:p>
       <w:pPr>
         <w:pStyle w:val="Heading3"/>
@@ -3418,6 +3893,7 @@
       <w:r>
         <w:rPr>
           <w:color w:val="000000"/>
+          <w:u w:val="none"/>
         </w:rPr>
         <w:t xml:space="preserve">2.2. Vogelstand 1924</w:t>
       </w:r>
@@ -3458,22 +3934,41 @@
         <w:t xml:space="preserve">204 regels uit 1924</w:t>
       </w:r>
     </w:p>
-    <w:bookmarkEnd w:id="53"/>
-    <w:bookmarkStart w:id="54" w:name="Xb3fdc40884db1bbf06132e666e117a731445140"/>
-    <w:p>
-      <w:pPr>
-        <w:pStyle w:val="BodyText"/>
-      </w:pPr>
-      <w:r>
-        <w:rPr>
-          <w:b/>
-        </w:rPr>
-        <w:t>Waarde en beperking.</w:t>
-      </w:r>
-      <w:r>
-        <w:t xml:space="preserve"> Historische vogelcontext. Zonder locatie per regel geen kavel- of ruimtelijke analyse. Het productieoverzicht van 28 september 2026 toont daarnaast een bestaande tabel vogelstand_1924 buiten de canonieke export. Deze blijft tijdens de PQ-publicatie onaangetast; haar aanwezigheid geeft geen nieuwe analysetoestemming. Dit schema-overzicht bewijst de tabelnaam en het type, niet haar actuele rijtelling.</w:t>
-      </w:r>
-    </w:p>
+    <w:p>
+      <w:pPr>
+        <w:pStyle w:val="BodyText"/>
+      </w:pPr>
+      <w:r>
+        <w:rPr>
+          <w:b/>
+          <w:bCs/>
+        </w:rPr>
+        <w:t xml:space="preserve">Waarde en beperking.</w:t>
+      </w:r>
+      <w:r>
+        <w:t xml:space="preserve"> </w:t>
+      </w:r>
+      <w:r>
+        <w:t xml:space="preserve">Historische vogelcontext. Zonder locatie per regel geen kavel- of ruimtelijke analyse. Het productieoverzicht van 28 september 2026 toont daarnaast een bestaande tabel</w:t>
+      </w:r>
+      <w:r>
+        <w:t xml:space="preserve"> </w:t>
+      </w:r>
+      <w:r>
+        <w:rPr>
+          <w:rStyle w:val="VerbatimChar"/>
+        </w:rPr>
+        <w:t xml:space="preserve">vogelstand_1924</w:t>
+      </w:r>
+      <w:r>
+        <w:t xml:space="preserve"> </w:t>
+      </w:r>
+      <w:r>
+        <w:t xml:space="preserve">buiten de canonieke export. Deze blijft tijdens de PQ-publicatie onaangetast; haar aanwezigheid geeft geen nieuwe analysetoestemming. Dit schema-overzicht bewijst de tabelnaam en het type, niet haar actuele rijtelling.</w:t>
+      </w:r>
+    </w:p>
+    <w:bookmarkEnd w:id="54"/>
+    <w:bookmarkStart w:id="55" w:name="jachtspinnen"/>
     <w:p>
       <w:pPr>
         <w:pStyle w:val="Heading3"/>
@@ -3481,6 +3976,7 @@
       <w:r>
         <w:rPr>
           <w:color w:val="000000"/>
+          <w:u w:val="none"/>
         </w:rPr>
         <w:t xml:space="preserve">2.3. Jachtspinnen</w:t>
       </w:r>
@@ -3539,8 +4035,8 @@
         <w:t xml:space="preserve">De samengevoegde vangstmatrix ondersteunt een soorten-milieuanalyse, maar geen ontwikkeling door de tijd. Datums en vangrondes ontbreken. De 28 locatienummers zijn bovendien nog niet naar werkelijke plaatsen te vertalen en mogen daarom niet als Meijendelwaarnemingen worden geanalyseerd.</w:t>
       </w:r>
     </w:p>
-    <w:bookmarkEnd w:id="54"/>
-    <w:bookmarkStart w:id="55" w:name="X7c2c13aacf0ea926ee35ca97ab69391a3624a6f"/>
+    <w:bookmarkEnd w:id="55"/>
+    <w:bookmarkStart w:id="56" w:name="literatuuroverzicht"/>
     <w:p>
       <w:pPr>
         <w:pStyle w:val="Heading3"/>
@@ -3548,6 +4044,7 @@
       <w:r>
         <w:rPr>
           <w:color w:val="000000"/>
+          <w:u w:val="none"/>
         </w:rPr>
         <w:t xml:space="preserve">2.4. Literatuuroverzicht</w:t>
       </w:r>
@@ -3606,8 +4103,8 @@
         <w:t xml:space="preserve">Zoekingang naar onderzoek en historische context. Dit zijn verwijzingen, geen waarnemingsregels; volledige teksten blijven in Zotero en worden niet op de VPS gekopieerd.</w:t>
       </w:r>
     </w:p>
-    <w:bookmarkEnd w:id="55"/>
-    <w:bookmarkStart w:id="56" w:name="X4a1f2475629c7656191227e4ca81566bef187e2"/>
+    <w:bookmarkEnd w:id="56"/>
+    <w:bookmarkStart w:id="57" w:name="bijenmonitoring-in-vier-beheergebieden"/>
     <w:p>
       <w:pPr>
         <w:pStyle w:val="Heading3"/>
@@ -3615,6 +4112,7 @@
       <w:r>
         <w:rPr>
           <w:color w:val="000000"/>
+          <w:u w:val="none"/>
         </w:rPr>
         <w:t xml:space="preserve">2.5. Bijenmonitoring in vier beheergebieden</w:t>
       </w:r>
@@ -3685,8 +4183,8 @@
         <w:t xml:space="preserve">. Drie onderzoeksjaren zijn bovendien een reeks van gestandaardiseerde herhalingen, geen robuuste langjarige trend.</w:t>
       </w:r>
     </w:p>
-    <w:bookmarkEnd w:id="56"/>
-    <w:bookmarkStart w:id="57" w:name="Xbef92f685785a24a45e5325384551ba55c57cc1"/>
+    <w:bookmarkEnd w:id="57"/>
+    <w:bookmarkStart w:id="58" w:name="aquatische-macrofauna-19741975"/>
     <w:p>
       <w:pPr>
         <w:pStyle w:val="Heading3"/>
@@ -3694,6 +4192,7 @@
       <w:r>
         <w:rPr>
           <w:color w:val="000000"/>
+          <w:u w:val="none"/>
         </w:rPr>
         <w:t xml:space="preserve">2.6. Aquatische macrofauna 1974–1975</w:t>
       </w:r>
@@ -3767,9 +4266,9 @@
         <w:t xml:space="preserve">overgebracht.</w:t>
       </w:r>
     </w:p>
-    <w:bookmarkEnd w:id="57"/>
     <w:bookmarkEnd w:id="58"/>
-    <w:bookmarkStart w:id="78" w:name="X2b62b82ef201b4c91783bce15da2b1d0258c34c"/>
+    <w:bookmarkEnd w:id="59"/>
+    <w:bookmarkStart w:id="79" w:name="Xae67a70ad36e2d1d11a7d910c2e5a6d669a3a5f"/>
     <w:p>
       <w:pPr>
         <w:pStyle w:val="Heading2"/>
@@ -3777,6 +4276,7 @@
       <w:r>
         <w:rPr>
           <w:color w:val="000000"/>
+          <w:u w:val="none"/>
         </w:rPr>
         <w:t xml:space="preserve">3. Geïdentificeerde externe kandidaatbronnen</w:t>
       </w:r>
@@ -3789,7 +4289,7 @@
         <w:t xml:space="preserve">Deze bronnen zijn gevonden, maar nog niet toegelaten. De genoemde aantallen hebben betrekking op de al gemaakte Meijendelselectie of op de beschreven onderzoeksopzet. Voor iedere import volgt eerst controle van locatie per waarneming, overlap met bestaande bronnen, rechten en statistische betekenis.</w:t>
       </w:r>
     </w:p>
-    <w:bookmarkStart w:id="75" w:name="Xd53aceb4d9e4863cdbb6367737be5e291cdac65"/>
+    <w:bookmarkStart w:id="76" w:name="Xd53aceb4d9e4863cdbb6367737be5e291cdac65"/>
     <w:p>
       <w:pPr>
         <w:pStyle w:val="Heading3"/>
@@ -3797,11 +4297,12 @@
       <w:r>
         <w:rPr>
           <w:color w:val="000000"/>
+          <w:u w:val="none"/>
         </w:rPr>
         <w:t xml:space="preserve">Kandidaten met de grootste verwachte aanvulling</w:t>
       </w:r>
     </w:p>
-    <w:bookmarkStart w:id="59" w:name="Xbddce02f5cb2b082bf32fac381c8bc0ea5284d3"/>
+    <w:bookmarkStart w:id="60" w:name="historische-en-actuele-ringgegevens"/>
     <w:p>
       <w:pPr>
         <w:pStyle w:val="Heading4"/>
@@ -3809,6 +4310,7 @@
       <w:r>
         <w:rPr>
           <w:color w:val="000000"/>
+          <w:u w:val="none"/>
         </w:rPr>
         <w:t xml:space="preserve">3.1. Historische en actuele ringgegevens</w:t>
       </w:r>
@@ -3900,8 +4402,8 @@
         <w:t xml:space="preserve">blijkt in de officiële EURING-codebeschrijving de provincie Zuid-Holland aan te duiden en niet VRS Meijendel. Trektellen-site 403 is wel VRS Meijendel en bevat inspanningsinformatie, maar er is nog geen recordsleutel tussen beide bronnen gevonden. De 100.417 ruimtelijke treffers zijn daarom niet als VRS-Meijendelvangsten geïmporteerd.</w:t>
       </w:r>
     </w:p>
-    <w:bookmarkEnd w:id="59"/>
-    <w:bookmarkStart w:id="60" w:name="X8071b7ae643e6cecadbf8a281c84bb90b511e63"/>
+    <w:bookmarkEnd w:id="60"/>
+    <w:bookmarkStart w:id="61" w:name="erosiepinnen-in-een-stuifkuilcomplex"/>
     <w:p>
       <w:pPr>
         <w:pStyle w:val="Heading4"/>
@@ -3909,6 +4411,7 @@
       <w:r>
         <w:rPr>
           <w:color w:val="000000"/>
+          <w:u w:val="none"/>
         </w:rPr>
         <w:t xml:space="preserve">3.2. Erosiepinnen in een stuifkuilcomplex</w:t>
       </w:r>
@@ -3985,8 +4488,8 @@
         <w:t xml:space="preserve">Oorspronkelijke metingen en pinlocaties vinden en op waarnemingsniveau aan Meijendel koppelen</w:t>
       </w:r>
     </w:p>
-    <w:bookmarkEnd w:id="60"/>
-    <w:bookmarkStart w:id="61" w:name="X1b05a95cacb83608c9b762adcf4298810ed86f9"/>
+    <w:bookmarkEnd w:id="61"/>
+    <w:bookmarkStart w:id="62" w:name="langjarige-droge-duinvegetatieplots"/>
     <w:p>
       <w:pPr>
         <w:pStyle w:val="Heading4"/>
@@ -3994,6 +4497,7 @@
       <w:r>
         <w:rPr>
           <w:color w:val="000000"/>
+          <w:u w:val="none"/>
         </w:rPr>
         <w:t xml:space="preserve">3.3. Langjarige droge-duinvegetatieplots</w:t>
       </w:r>
@@ -4070,8 +4574,8 @@
         <w:t xml:space="preserve">De publicatiekaart toont de 41 punten in Helmduinen, Kijfhoek en Bierlap, maar zonder koppelbare plotcodes. De toegelaten LVD-opnamen leverden geen betrouwbare vertaling op naar deze 41 plots. Oorspronkelijke plotcodes, opnamen en locaties blijven daarom noodzakelijk.</w:t>
       </w:r>
     </w:p>
-    <w:bookmarkEnd w:id="61"/>
-    <w:bookmarkStart w:id="63" w:name="X4578481a165cef1470f100d42a5e836ac7456f8"/>
+    <w:bookmarkEnd w:id="62"/>
+    <w:bookmarkStart w:id="64" w:name="neuropteren-van-meijendel"/>
     <w:p>
       <w:pPr>
         <w:pStyle w:val="Heading4"/>
@@ -4079,16 +4583,18 @@
       <w:r>
         <w:rPr>
           <w:color w:val="000000"/>
+          <w:u w:val="none"/>
         </w:rPr>
         <w:t xml:space="preserve">3.4.</w:t>
       </w:r>
       <w:r>
         <w:rPr>
           <w:color w:val="000000"/>
-        </w:rPr>
-        <w:t xml:space="preserve"> </w:t>
-      </w:r>
-      <w:hyperlink r:id="rId62">
+          <w:u w:val="none"/>
+        </w:rPr>
+        <w:t xml:space="preserve"> </w:t>
+      </w:r>
+      <w:hyperlink r:id="rId63">
         <w:r>
           <w:rPr>
             <w:rStyle w:val="Hyperlink"/>
@@ -4169,8 +4675,8 @@
         <w:t xml:space="preserve">De specimen- en soortenlijsten uit de publicatie digitaliseren, datum en plaats per record vaststellen en vergelijken met Naturalis-collecties en NDFF.</w:t>
       </w:r>
     </w:p>
-    <w:bookmarkEnd w:id="63"/>
-    <w:bookmarkStart w:id="65" w:name="X642992b46f3d655730973d9bd57c00f9c7aad9f"/>
+    <w:bookmarkEnd w:id="64"/>
+    <w:bookmarkStart w:id="66" w:name="zweefvliegen-van-meijendel"/>
     <w:p>
       <w:pPr>
         <w:pStyle w:val="Heading4"/>
@@ -4178,16 +4684,18 @@
       <w:r>
         <w:rPr>
           <w:color w:val="000000"/>
+          <w:u w:val="none"/>
         </w:rPr>
         <w:t xml:space="preserve">3.5.</w:t>
       </w:r>
       <w:r>
         <w:rPr>
           <w:color w:val="000000"/>
-        </w:rPr>
-        <w:t xml:space="preserve"> </w:t>
-      </w:r>
-      <w:hyperlink r:id="rId64">
+          <w:u w:val="none"/>
+        </w:rPr>
+        <w:t xml:space="preserve"> </w:t>
+      </w:r>
+      <w:hyperlink r:id="rId65">
         <w:r>
           <w:rPr>
             <w:rStyle w:val="Hyperlink"/>
@@ -4268,8 +4776,8 @@
         <w:t xml:space="preserve">De volledige specimenlijst digitaliseren en per exemplaar datum en locatie vastleggen; daarna ontdubbelen tegen museumcollecties en NDFF.</w:t>
       </w:r>
     </w:p>
-    <w:bookmarkEnd w:id="65"/>
-    <w:bookmarkStart w:id="67" w:name="X80b82bf48485caf594896b8d6bc490be5f328ee"/>
+    <w:bookmarkEnd w:id="66"/>
+    <w:bookmarkStart w:id="68" w:name="terra-dunes-plant--en-bodemmicrobiomen"/>
     <w:p>
       <w:pPr>
         <w:pStyle w:val="Heading4"/>
@@ -4277,6 +4785,7 @@
       <w:r>
         <w:rPr>
           <w:color w:val="000000"/>
+          <w:u w:val="none"/>
         </w:rPr>
         <w:t xml:space="preserve">3.6. TERRA-Dunes plant- en bodemmicrobiomen</w:t>
       </w:r>
@@ -4301,7 +4810,7 @@
       <w:r>
         <w:t xml:space="preserve"> </w:t>
       </w:r>
-      <w:hyperlink r:id="rId66">
+      <w:hyperlink r:id="rId67">
         <w:r>
           <w:rPr>
             <w:rStyle w:val="Hyperlink"/>
@@ -4346,8 +4855,8 @@
         <w:t xml:space="preserve">Geschikt voor samenhang tussen vegetatie en microbiomen. Niet toelaten voordat de proefvlakken geografisch zijn gereconstrueerd.</w:t>
       </w:r>
     </w:p>
-    <w:bookmarkEnd w:id="67"/>
-    <w:bookmarkStart w:id="69" w:name="X4b2db10b2340db42e20505c45425c0b84f14c27"/>
+    <w:bookmarkEnd w:id="68"/>
+    <w:bookmarkStart w:id="70" w:name="rups--en-bodemmicrobiomen"/>
     <w:p>
       <w:pPr>
         <w:pStyle w:val="Heading4"/>
@@ -4355,6 +4864,7 @@
       <w:r>
         <w:rPr>
           <w:color w:val="000000"/>
+          <w:u w:val="none"/>
         </w:rPr>
         <w:t xml:space="preserve">3.7. Rups- en bodemmicrobiomen</w:t>
       </w:r>
@@ -4379,7 +4889,7 @@
       <w:r>
         <w:t xml:space="preserve"> </w:t>
       </w:r>
-      <w:hyperlink r:id="rId68">
+      <w:hyperlink r:id="rId69">
         <w:r>
           <w:rPr>
             <w:rStyle w:val="Hyperlink"/>
@@ -4424,8 +4934,8 @@
         <w:t xml:space="preserve">Eenmalige genetische en microbiële momentopname. Geen populatietrend, wel lokale ecologische vergelijking na controle van alle monsterlocaties.</w:t>
       </w:r>
     </w:p>
-    <w:bookmarkEnd w:id="69"/>
-    <w:bookmarkStart w:id="71" w:name="X442e94e4e2997aa133d10bf618574e2528e759d"/>
+    <w:bookmarkEnd w:id="70"/>
+    <w:bookmarkStart w:id="72" w:name="schimmels-bij-kruipwilg"/>
     <w:p>
       <w:pPr>
         <w:pStyle w:val="Heading4"/>
@@ -4433,6 +4943,7 @@
       <w:r>
         <w:rPr>
           <w:color w:val="000000"/>
+          <w:u w:val="none"/>
         </w:rPr>
         <w:t xml:space="preserve">3.8. Schimmels bij kruipwilg</w:t>
       </w:r>
@@ -4457,7 +4968,7 @@
       <w:r>
         <w:t xml:space="preserve"> </w:t>
       </w:r>
-      <w:hyperlink r:id="rId70">
+      <w:hyperlink r:id="rId71">
         <w:r>
           <w:rPr>
             <w:rStyle w:val="Hyperlink"/>
@@ -4502,8 +5013,8 @@
         <w:t xml:space="preserve">Bruikbaar als lokale microbiële referentie, niet als tijdreeks of gebiedsdekkende inventarisatie.</w:t>
       </w:r>
     </w:p>
-    <w:bookmarkEnd w:id="71"/>
-    <w:bookmarkStart w:id="73" w:name="X36e8e197a59cff4a0251b791dc5fc6bc0e135bf"/>
+    <w:bookmarkEnd w:id="72"/>
+    <w:bookmarkStart w:id="74" w:name="plantengroei-bodemvocht-en-weer"/>
     <w:p>
       <w:pPr>
         <w:pStyle w:val="Heading4"/>
@@ -4511,6 +5022,7 @@
       <w:r>
         <w:rPr>
           <w:color w:val="000000"/>
+          <w:u w:val="none"/>
         </w:rPr>
         <w:t xml:space="preserve">3.9. Plantengroei, bodemvocht en weer</w:t>
       </w:r>
@@ -4535,7 +5047,7 @@
       <w:r>
         <w:t xml:space="preserve"> </w:t>
       </w:r>
-      <w:hyperlink r:id="rId72">
+      <w:hyperlink r:id="rId73">
         <w:r>
           <w:rPr>
             <w:rStyle w:val="Hyperlink"/>
@@ -4580,8 +5092,8 @@
         <w:t xml:space="preserve">Gedetailleerde processtudie van de reactie van duingrassen op neerslag en droogte. Eerst locaties en meetkwaliteit controleren; één halfjaar geeft geen langjarige ontwikkeling.</w:t>
       </w:r>
     </w:p>
-    <w:bookmarkEnd w:id="73"/>
-    <w:bookmarkStart w:id="74" w:name="X49ed5beca1c3c65272a43e85c3687f3c3d41d64"/>
+    <w:bookmarkEnd w:id="74"/>
+    <w:bookmarkStart w:id="75" w:name="genetische-datasets-amfibieën"/>
     <w:p>
       <w:pPr>
         <w:pStyle w:val="Heading4"/>
@@ -4589,6 +5101,7 @@
       <w:r>
         <w:rPr>
           <w:color w:val="000000"/>
+          <w:u w:val="none"/>
         </w:rPr>
         <w:t xml:space="preserve">3.10. Genetische datasets amfibieën</w:t>
       </w:r>
@@ -4647,9 +5160,9 @@
         <w:t xml:space="preserve">Bruikbaar voor populatiegenetische context. Jaar, locatie en relatie met bestaande RAVON-waarnemingen moeten eerst worden vastgesteld.</w:t>
       </w:r>
     </w:p>
-    <w:bookmarkEnd w:id="74"/>
     <w:bookmarkEnd w:id="75"/>
-    <w:bookmarkStart w:id="77" w:name="X136d668cd3b301eba92f27584d1a2d49d57a73c"/>
+    <w:bookmarkEnd w:id="76"/>
+    <w:bookmarkStart w:id="78" w:name="X8c2748f02893018608c8a38a1054acf3030739d"/>
     <w:p>
       <w:pPr>
         <w:pStyle w:val="Heading3"/>
@@ -4657,6 +5170,7 @@
       <w:r>
         <w:rPr>
           <w:color w:val="000000"/>
+          <w:u w:val="none"/>
         </w:rPr>
         <w:t xml:space="preserve">3.11. Alleen context of nog een onderzoeksaanwijzing</w:t>
       </w:r>
@@ -4805,7 +5319,7 @@
       <w:pPr>
         <w:pStyle w:val="BodyText"/>
       </w:pPr>
-      <w:hyperlink r:id="rId76">
+      <w:hyperlink r:id="rId77">
         <w:r>
           <w:rPr>
             <w:rStyle w:val="Hyperlink"/>
@@ -4865,9 +5379,9 @@
         <w:t xml:space="preserve">publicaties noemen 32–35 stuifkuilen die vanaf 1983 tweemaal per jaar zijn gemeten, 19 permanente vegetatieplots en vergelijkingen van luchtfoto’s en orthofoto’s. De oorspronkelijke tabellen, plot-ID’s en digitale kaartlagen zijn nog niet voldoende geïdentificeerd om deze als afzonderlijke gegevensbron toe te laten.</w:t>
       </w:r>
     </w:p>
-    <w:bookmarkEnd w:id="77"/>
     <w:bookmarkEnd w:id="78"/>
-    <w:bookmarkStart w:id="79" w:name="Xc540a83ee65aaec11aa446aec0815d16fd21e21"/>
+    <w:bookmarkEnd w:id="79"/>
+    <w:bookmarkStart w:id="80" w:name="verwachte-aanvullingen"/>
     <w:p>
       <w:pPr>
         <w:pStyle w:val="Heading2"/>
@@ -4875,6 +5389,7 @@
       <w:r>
         <w:rPr>
           <w:color w:val="000000"/>
+          <w:u w:val="none"/>
         </w:rPr>
         <w:t xml:space="preserve">4. Verwachte aanvullingen</w:t>
       </w:r>
@@ -4933,8 +5448,8 @@
         <w:t xml:space="preserve">Provincie Zuid-Holland heeft toegezegd de kaart te delen zodra zij later in 2026 beschikbaar komt. De kaart kan veranderingen in habitat helpen verklaren, maar is zelf geen soortenwaarneming.</w:t>
       </w:r>
     </w:p>
-    <w:bookmarkEnd w:id="79"/>
-    <w:bookmarkStart w:id="80" w:name="X422e6271160c2b04a3b59fb5b59cfcc2e3afc55"/>
+    <w:bookmarkEnd w:id="80"/>
+    <w:bookmarkStart w:id="81" w:name="Xbd1d36805349ef5ec39b6efd044fd20b47e23f4"/>
     <w:p>
       <w:pPr>
         <w:pStyle w:val="Heading2"/>
@@ -4942,6 +5457,7 @@
       <w:r>
         <w:rPr>
           <w:color w:val="000000"/>
+          <w:u w:val="none"/>
         </w:rPr>
         <w:t xml:space="preserve">5. Bronnen die niet verder worden uitgewerkt</w:t>
       </w:r>
@@ -4970,8 +5486,8 @@
         <w:t xml:space="preserve">Algemene verzamelbronnen zoals Observation.org, iNaturalist en eBird worden ook niet opnieuw als zelfstandige Meijendelbron ingevoerd zolang niet is aangetoond dat zij waarnemingen bevatten die ontbreken in NDFF of in de primaire VWG/SOVON-reeksen. Anders zou dezelfde waarneming vooral nogmaals worden opgeslagen.</w:t>
       </w:r>
     </w:p>
-    <w:bookmarkEnd w:id="80"/>
-    <w:bookmarkStart w:id="81" w:name="Xb05dec49988a12f7955d21ff17f1c91e4d061eb"/>
+    <w:bookmarkEnd w:id="81"/>
+    <w:bookmarkStart w:id="82" w:name="gebruik-van-dit-register"/>
     <w:p>
       <w:pPr>
         <w:pStyle w:val="Heading2"/>
@@ -4979,6 +5495,7 @@
       <w:r>
         <w:rPr>
           <w:color w:val="000000"/>
+          <w:u w:val="none"/>
         </w:rPr>
         <w:t xml:space="preserve">6. Gebruik van dit register</w:t>
       </w:r>
@@ -5062,8 +5579,8 @@
         <w:t xml:space="preserve">Pas daarna volgt een afzonderlijk importbesluit.</w:t>
       </w:r>
     </w:p>
-    <w:bookmarkEnd w:id="81"/>
-    <w:bookmarkStart w:id="87" w:name="X67781990bcb7d7d43cc312a7ef48f37a1f83265"/>
+    <w:bookmarkEnd w:id="82"/>
+    <w:bookmarkStart w:id="88" w:name="actieplan"/>
     <w:p>
       <w:pPr>
         <w:pStyle w:val="Heading2"/>
@@ -5071,6 +5588,7 @@
       <w:r>
         <w:rPr>
           <w:color w:val="000000"/>
+          <w:u w:val="none"/>
         </w:rPr>
         <w:t xml:space="preserve">7. Actieplan</w:t>
       </w:r>
@@ -5098,7 +5616,7 @@
         <w:t xml:space="preserve">bevat alleen waarnemingen die aan de ruimtelijke toelatingsregel voldoen.</w:t>
       </w:r>
     </w:p>
-    <w:bookmarkStart w:id="82" w:name="Xd7f889e2150e602eaeb242f489896c9b52af547"/>
+    <w:bookmarkStart w:id="83" w:name="fase-1-openbare-direct-toetsbare-bronnen"/>
     <w:p>
       <w:pPr>
         <w:pStyle w:val="Heading3"/>
@@ -5106,6 +5624,7 @@
       <w:r>
         <w:rPr>
           <w:color w:val="000000"/>
+          <w:u w:val="none"/>
         </w:rPr>
         <w:t xml:space="preserve">Fase 1 — openbare, direct toetsbare bronnen</w:t>
       </w:r>
@@ -5158,22 +5677,38 @@
         <w:t xml:space="preserve">, etiketplaats, oorspronkelijke en voor analyse genormaliseerde taxonnaam, datum of datuminterval, coördinaten, onzekerheid, licentie, DOI en bronmetadata zijn behouden. Ruimtelijke treffers zonder expliciet Meijendel-etiket en expliciete Meijendel-records zonder datum zijn niet toegelaten.</w:t>
       </w:r>
     </w:p>
-    <w:bookmarkEnd w:id="82"/>
-    <w:bookmarkStart w:id="83" w:name="Xa67120beb48c3916f8a53c623f303ce8b8a6005"/>
-    <w:p>
-      <w:pPr>
-        <w:pStyle w:val="BodyText"/>
-      </w:pPr>
-      <w:r>
-        <w:rPr>
-          <w:b/>
-        </w:rPr>
-        <w:t>Landelijke Vegetatie Databank: uitgevoerd voor de reproduceerbare bronversie 1.6.</w:t>
-      </w:r>
-      <w:r>
-        <w:t xml:space="preserve"> Van 5.195 opnamen en 119.006 taxonregels zijn 3.437 opnamen en 81.310 taxonresultaten uit 1959–2015 met maximaal 50 meter locatie-onzekerheid toegelaten. De PQ-integratie heeft 644 volledige bronopnamen met 16.627 resultaten uit 1981–2015 naar de PQ-tabellen verplaatst, met vermoedelijke koppelingen en zonder zelfstandig meetellen. De overige 2.793 opnamen met 64.683 resultaten blijven in de externe bronlaag. De bestaande analyse-ingang ontsluit beide opslagplaatsen zonder fysieke kopieën. Mogelijke NDFF-overlap blijft zichtbaar, maar wordt vanwege de NDFF-onzekerheidspolygonen niet automatisch als dubbel verwijderd. De duinvalleireeks kan zonder georeferentie niet op opnameniveau worden gekoppeld en blijft afzonderlijk in Meijendel_bronnen.</w:t>
-      </w:r>
-    </w:p>
+    <w:p>
+      <w:pPr>
+        <w:pStyle w:val="BodyText"/>
+      </w:pPr>
+      <w:r>
+        <w:rPr>
+          <w:b/>
+          <w:bCs/>
+        </w:rPr>
+        <w:t xml:space="preserve">Landelijke Vegetatie Databank: uitgevoerd voor de reproduceerbare bronversie 1.6.</w:t>
+      </w:r>
+      <w:r>
+        <w:t xml:space="preserve"> </w:t>
+      </w:r>
+      <w:r>
+        <w:t xml:space="preserve">Van 5.195 opnamen en 119.006 taxonregels zijn 3.437 opnamen en 81.310 taxonresultaten uit 1959–2015 met maximaal 50 meter locatie-onzekerheid toegelaten. De PQ-integratie heeft 644 volledige bronopnamen met 16.627 resultaten uit 1981–2015 naar de PQ-tabellen verplaatst, met vermoedelijke koppelingen en zonder zelfstandig meetellen. De overige 2.793 opnamen met 64.683 resultaten blijven in de externe bronlaag. De bestaande analyse-ingang ontsluit beide opslagplaatsen zonder fysieke kopieën. Mogelijke NDFF-overlap blijft zichtbaar, maar wordt vanwege de NDFF-onzekerheidspolygonen niet automatisch als dubbel verwijderd. De duinvalleireeks kan zonder georeferentie niet op opnameniveau worden gekoppeld en blijft afzonderlijk in</w:t>
+      </w:r>
+      <w:r>
+        <w:t xml:space="preserve"> </w:t>
+      </w:r>
+      <w:r>
+        <w:rPr>
+          <w:rStyle w:val="VerbatimChar"/>
+        </w:rPr>
+        <w:t xml:space="preserve">Meijendel_bronnen</w:t>
+      </w:r>
+      <w:r>
+        <w:t xml:space="preserve">.</w:t>
+      </w:r>
+    </w:p>
+    <w:bookmarkEnd w:id="83"/>
+    <w:bookmarkStart w:id="84" w:name="X1e65d730f223a62ff579853fd3c77c9308748df"/>
     <w:p>
       <w:pPr>
         <w:pStyle w:val="Heading3"/>
@@ -5181,6 +5716,7 @@
       <w:r>
         <w:rPr>
           <w:color w:val="000000"/>
+          <w:u w:val="none"/>
         </w:rPr>
         <w:t xml:space="preserve">Fase 2 — reeksen met grote historische of trendwaarde</w:t>
       </w:r>
@@ -5329,8 +5865,8 @@
         <w:t xml:space="preserve">De kaart in het proefschrift is visueel gecontroleerd en toont 41 punten in Helmduinen, Kijfhoek en Bierlap, maar geen koppelbare plotcodes. Ook de LVD-selectie levert geen betrouwbare vertaling. De reeks blijft kandidaat totdat de oorspronkelijke plotkaart en opnametabellen zijn gevonden.</w:t>
       </w:r>
     </w:p>
-    <w:bookmarkEnd w:id="83"/>
-    <w:bookmarkStart w:id="84" w:name="Xc96f79f2027e81b7ab280f9bf69df5af8bdf464"/>
+    <w:bookmarkEnd w:id="84"/>
+    <w:bookmarkStart w:id="85" w:name="X6b9d0c88ffcb5584e67daa74c9524b522af67c0"/>
     <w:p>
       <w:pPr>
         <w:pStyle w:val="Heading3"/>
@@ -5338,6 +5874,7 @@
       <w:r>
         <w:rPr>
           <w:color w:val="000000"/>
+          <w:u w:val="none"/>
         </w:rPr>
         <w:t xml:space="preserve">Fase 3 — reeds bekende bronhouders en contextdatasets</w:t>
       </w:r>
@@ -5411,8 +5948,8 @@
         <w:t xml:space="preserve">Voeg de Habitatkaart T1, de landbedekking van 2001 en 2022 en eventueel gevonden remote-sensingrasters toe als omgevingslagen. Zij mogen ecologische veranderingen helpen verklaren, maar worden niet als soortenwaarnemingen behandeld.</w:t>
       </w:r>
     </w:p>
-    <w:bookmarkEnd w:id="84"/>
-    <w:bookmarkStart w:id="85" w:name="vaste-werkwijze-per-bron"/>
+    <w:bookmarkEnd w:id="85"/>
+    <w:bookmarkStart w:id="86" w:name="vaste-werkwijze-per-bron"/>
     <w:p>
       <w:pPr>
         <w:pStyle w:val="Heading3"/>
@@ -5420,6 +5957,7 @@
       <w:r>
         <w:rPr>
           <w:color w:val="000000"/>
+          <w:u w:val="none"/>
         </w:rPr>
         <w:t xml:space="preserve">Vaste werkwijze per bron</w:t>
       </w:r>
@@ -5432,8 +5970,8 @@
         <w:t xml:space="preserve">Iedere bron doorloopt dezelfde vijf stappen: een onveranderde bronkopie met checksum bewaren; gegevenswoordenboek en rechten vastleggen; locaties en analyseeenheid controleren; overlap en dubbelen bepalen; pas daarna een reproduceerbare import en analyseview maken. Na iedere statuswijziging worden dit register en de Wordversie meteen bijgewerkt.</w:t>
       </w:r>
     </w:p>
-    <w:bookmarkEnd w:id="85"/>
-    <w:bookmarkStart w:id="86" w:name="dekking-van-de-internetcontrole"/>
+    <w:bookmarkEnd w:id="86"/>
+    <w:bookmarkStart w:id="87" w:name="dekking-van-de-internetcontrole"/>
     <w:p>
       <w:pPr>
         <w:pStyle w:val="Heading3"/>
@@ -5441,6 +5979,7 @@
       <w:r>
         <w:rPr>
           <w:color w:val="000000"/>
+          <w:u w:val="none"/>
         </w:rPr>
         <w:t xml:space="preserve">Dekking van de internetcontrole</w:t>
       </w:r>
@@ -5453,9 +5992,9 @@
         <w:t xml:space="preserve">De controle van 26 september 2026 omvatte GBIF, DataCite, Zenodo, Dryad, Figshare, Europe PMC, Naturalis Repository, Wageningen Research e-depot en de repositories van Universiteit Leiden en TU Delft. Algemene aggregators zijn niet als zelfstandige bron opgenomen wanneer zij waarschijnlijk dezelfde waarnemingen als NDFF of primaire collecties bevatten. Een openbare zoekronde kan nooit bewijzen dat geen ongepubliceerde of slecht geïndexeerde bron bestaat; dit register legt daarom ook de zoekdatum en toelatingsreden vast.</w:t>
       </w:r>
     </w:p>
-    <w:bookmarkEnd w:id="86"/>
     <w:bookmarkEnd w:id="87"/>
-    <w:bookmarkStart w:id="95" w:name="achterliggende-verantwoording"/>
+    <w:bookmarkEnd w:id="88"/>
+    <w:bookmarkStart w:id="96" w:name="achterliggende-verantwoording"/>
     <w:p>
       <w:pPr>
         <w:pStyle w:val="Heading2"/>
@@ -5463,6 +6002,7 @@
       <w:r>
         <w:rPr>
           <w:color w:val="000000"/>
+          <w:u w:val="none"/>
         </w:rPr>
         <w:t xml:space="preserve">Achterliggende verantwoording</w:t>
       </w:r>
@@ -5475,7 +6015,7 @@
           <w:numId w:val="1005"/>
         </w:numPr>
       </w:pPr>
-      <w:hyperlink r:id="rId88">
+      <w:hyperlink r:id="rId89">
         <w:r>
           <w:rPr>
             <w:rStyle w:val="Hyperlink"/>
@@ -5492,7 +6032,7 @@
           <w:numId w:val="1005"/>
         </w:numPr>
       </w:pPr>
-      <w:hyperlink r:id="rId89">
+      <w:hyperlink r:id="rId90">
         <w:r>
           <w:rPr>
             <w:rStyle w:val="Hyperlink"/>
@@ -5509,7 +6049,7 @@
           <w:numId w:val="1005"/>
         </w:numPr>
       </w:pPr>
-      <w:hyperlink r:id="rId90">
+      <w:hyperlink r:id="rId91">
         <w:r>
           <w:rPr>
             <w:rStyle w:val="Hyperlink"/>
@@ -5526,7 +6066,7 @@
           <w:numId w:val="1005"/>
         </w:numPr>
       </w:pPr>
-      <w:hyperlink r:id="rId91">
+      <w:hyperlink r:id="rId92">
         <w:r>
           <w:rPr>
             <w:rStyle w:val="Hyperlink"/>
@@ -5543,7 +6083,7 @@
           <w:numId w:val="1005"/>
         </w:numPr>
       </w:pPr>
-      <w:hyperlink r:id="rId92">
+      <w:hyperlink r:id="rId93">
         <w:r>
           <w:rPr>
             <w:rStyle w:val="Hyperlink"/>
@@ -5560,7 +6100,7 @@
           <w:numId w:val="1005"/>
         </w:numPr>
       </w:pPr>
-      <w:hyperlink r:id="rId93">
+      <w:hyperlink r:id="rId94">
         <w:r>
           <w:rPr>
             <w:rStyle w:val="Hyperlink"/>
@@ -5577,7 +6117,7 @@
           <w:numId w:val="1005"/>
         </w:numPr>
       </w:pPr>
-      <w:hyperlink r:id="rId94">
+      <w:hyperlink r:id="rId95">
         <w:r>
           <w:rPr>
             <w:rStyle w:val="Hyperlink"/>
@@ -5586,8 +6126,8 @@
         </w:r>
       </w:hyperlink>
     </w:p>
-    <w:bookmarkEnd w:id="95"/>
     <w:bookmarkEnd w:id="96"/>
+    <w:bookmarkEnd w:id="97"/>
     <w:sectPr>
       <w:footnotePr>
         <w:numRestart w:val="eachSect"/>
@@ -5916,9 +6456,11 @@
     </w:pPr>
     <w:rPr>
       <w:rFonts w:cstheme="majorBidi" w:eastAsiaTheme="majorEastAsia"/>
+      <w:color w:val="000000"/>
       <w:spacing w:val="15"/>
       <w:sz w:val="28"/>
       <w:szCs w:val="28"/>
+      <w:u w:val="none"/>
     </w:rPr>
   </w:style>
   <w:style w:customStyle="1" w:styleId="SubtitleChar" w:type="character">
@@ -6022,6 +6564,7 @@
       <w:color w:val="000000"/>
       <w:sz w:val="40"/>
       <w:szCs w:val="40"/>
+      <w:u w:val="none"/>
     </w:rPr>
   </w:style>
   <w:style w:styleId="Heading2" w:type="paragraph">
@@ -6045,6 +6588,7 @@
       <w:color w:val="000000"/>
       <w:sz w:val="32"/>
       <w:szCs w:val="32"/>
+      <w:u w:val="none"/>
     </w:rPr>
   </w:style>
   <w:style w:styleId="Heading3" w:type="paragraph">
@@ -6068,6 +6612,7 @@
       <w:color w:val="000000"/>
       <w:sz w:val="28"/>
       <w:szCs w:val="28"/>
+      <w:u w:val="none"/>
     </w:rPr>
   </w:style>
   <w:style w:styleId="Heading4" w:type="paragraph">
@@ -6091,6 +6636,7 @@
       <w:i/>
       <w:iCs/>
       <w:color w:val="000000"/>
+      <w:u w:val="none"/>
     </w:rPr>
   </w:style>
   <w:style w:styleId="Heading5" w:type="paragraph">
@@ -6112,6 +6658,7 @@
     <w:rPr>
       <w:rFonts w:cstheme="majorBidi" w:eastAsiaTheme="majorEastAsia"/>
       <w:color w:val="000000"/>
+      <w:u w:val="none"/>
     </w:rPr>
   </w:style>
   <w:style w:styleId="Heading6" w:type="paragraph">
@@ -6135,6 +6682,7 @@
       <w:i/>
       <w:iCs/>
       <w:color w:val="000000"/>
+      <w:u w:val="none"/>
     </w:rPr>
   </w:style>
   <w:style w:styleId="Heading7" w:type="paragraph">
@@ -6156,6 +6704,7 @@
     <w:rPr>
       <w:rFonts w:cstheme="majorBidi" w:eastAsiaTheme="majorEastAsia"/>
       <w:color w:val="000000"/>
+      <w:u w:val="none"/>
     </w:rPr>
   </w:style>
   <w:style w:styleId="Heading8" w:type="paragraph">
@@ -6179,6 +6728,7 @@
       <w:i/>
       <w:iCs/>
       <w:color w:val="000000"/>
+      <w:u w:val="none"/>
     </w:rPr>
   </w:style>
   <w:style w:styleId="Heading9" w:type="paragraph">
@@ -6200,6 +6750,7 @@
     <w:rPr>
       <w:rFonts w:cstheme="majorBidi" w:eastAsiaTheme="majorEastAsia"/>
       <w:color w:val="000000"/>
+      <w:u w:val="none"/>
     </w:rPr>
   </w:style>
   <w:style w:customStyle="1" w:styleId="Heading1Char" w:type="character">
@@ -6213,6 +6764,7 @@
       <w:color w:val="000000"/>
       <w:sz w:val="40"/>
       <w:szCs w:val="40"/>
+      <w:u w:val="none"/>
     </w:rPr>
   </w:style>
   <w:style w:customStyle="1" w:styleId="Heading2Char" w:type="character">
@@ -6227,6 +6779,7 @@
       <w:color w:val="000000"/>
       <w:sz w:val="32"/>
       <w:szCs w:val="32"/>
+      <w:u w:val="none"/>
     </w:rPr>
   </w:style>
   <w:style w:customStyle="1" w:styleId="Heading3Char" w:type="character">
@@ -6241,6 +6794,7 @@
       <w:color w:val="000000"/>
       <w:sz w:val="28"/>
       <w:szCs w:val="28"/>
+      <w:u w:val="none"/>
     </w:rPr>
   </w:style>
   <w:style w:customStyle="1" w:styleId="Heading4Char" w:type="character">
@@ -6255,6 +6809,7 @@
       <w:i/>
       <w:iCs/>
       <w:color w:val="000000"/>
+      <w:u w:val="none"/>
     </w:rPr>
   </w:style>
   <w:style w:customStyle="1" w:styleId="Heading5Char" w:type="character">
@@ -6267,6 +6822,7 @@
     <w:rPr>
       <w:rFonts w:cstheme="majorBidi" w:eastAsiaTheme="majorEastAsia"/>
       <w:color w:val="000000"/>
+      <w:u w:val="none"/>
     </w:rPr>
   </w:style>
   <w:style w:customStyle="1" w:styleId="Heading6Char" w:type="character">
@@ -6281,6 +6837,7 @@
       <w:i/>
       <w:iCs/>
       <w:color w:val="000000"/>
+      <w:u w:val="none"/>
     </w:rPr>
   </w:style>
   <w:style w:customStyle="1" w:styleId="Heading7Char" w:type="character">
@@ -6293,6 +6850,7 @@
     <w:rPr>
       <w:rFonts w:cstheme="majorBidi" w:eastAsiaTheme="majorEastAsia"/>
       <w:color w:val="000000"/>
+      <w:u w:val="none"/>
     </w:rPr>
   </w:style>
   <w:style w:customStyle="1" w:styleId="Heading8Char" w:type="character">
@@ -6307,6 +6865,7 @@
       <w:i/>
       <w:iCs/>
       <w:color w:val="000000"/>
+      <w:u w:val="none"/>
     </w:rPr>
   </w:style>
   <w:style w:customStyle="1" w:styleId="Heading9Char" w:type="character">
@@ -6319,6 +6878,7 @@
     <w:rPr>
       <w:rFonts w:cstheme="majorBidi" w:eastAsiaTheme="majorEastAsia"/>
       <w:color w:val="000000"/>
+      <w:u w:val="none"/>
     </w:rPr>
   </w:style>
   <w:style w:styleId="BlockText" w:type="paragraph">

</xml_diff>

<commit_message>
Hernoem resterende LVD-tabellen lokaal
</commit_message>
<xml_diff>
--- a/docs/MEIJENDEL_BRONREGISTER.docx
+++ b/docs/MEIJENDEL_BRONREGISTER.docx
@@ -2684,7 +2684,7 @@
         <w:t xml:space="preserve"> </w:t>
       </w:r>
       <w:r>
-        <w:t xml:space="preserve">als indeling bereikbaar. De bestaande analyse-ingang levert dezelfde uitkomsten. De overige 2.793 LVD-opnamen met 64.683 resultaten uit 1959–2015 blijven voorlopig in</w:t>
+        <w:t>als indeling bereikbaar. De bestaande analyse-ingang levert dezelfde uitkomsten. De overige 2.793 LVD-opnamen met 64.683 resultaten uit 1959–2015 staan onder</w:t>
       </w:r>
       <w:r>
         <w:t xml:space="preserve"> </w:t>
@@ -2693,7 +2693,7 @@
         <w:rPr>
           <w:rStyle w:val="VerbatimChar"/>
         </w:rPr>
-        <w:t xml:space="preserve">externe_ecologie_*</w:t>
+        <w:t>lvd_*</w:t>
       </w:r>
       <w:r>
         <w:t xml:space="preserve">; de 644 eerder onder</w:t>

</xml_diff>

<commit_message>
Leg leidende tellerregistratie vast
</commit_message>
<xml_diff>
--- a/docs/MEIJENDEL_BRONREGISTER.docx
+++ b/docs/MEIJENDEL_BRONREGISTER.docx
@@ -24,7 +24,7 @@
           <w:b/>
           <w:bCs/>
         </w:rPr>
-        <w:t xml:space="preserve">Stand: 29 september 2026.</w:t>
+        <w:t>Stand: 1 oktober 2026.</w:t>
       </w:r>
     </w:p>
     <w:p>
@@ -899,6 +899,20 @@
       </w:r>
       <w:r>
         <w:t xml:space="preserve">. De koppelproef omvat 71.155 territoriumregels (1958–2025), 600.959 BMP-regels (2007–2025) en 105.712 wintertelregels (2000–2025). Dit is een afgebakende controle van deze drie tabellen, niet een nieuwe telling van alle vogelbronnen. Bron-IDs en letterlijke cataloguswaarden blijven behouden. De kandidaten leggen nog geen gelijkheid met externe taxonconcepten vast; brongegevens, analytische status en gebruik door website, dashboard en Shiny veranderen niet.</w:t>
+      </w:r>
+    </w:p>
+    <w:p>
+      <w:pPr>
+        <w:pStyle w:val="BodyText"/>
+      </w:pPr>
+      <w:r>
+        <w:rPr>
+          <w:b/>
+        </w:rPr>
+        <w:t>Telleridentificatie, 1 oktober 2026.</w:t>
+      </w:r>
+      <w:r>
+        <w:t xml:space="preserve"> Voor telleridentificatie is plot_jaar_teller in de levende lokale database de leidende projectregistratie. Een vergelijking met waarnemer uit de actuele SOVON/AVIMAP-resultatendownload omvat 25.555 soortresultaten in 752 plotjaren uit 2007 en 2009–2026. In 282 plotjaren is de ene AVIMAP-code exact gelijk aan de databasecode, in 56 is zij lid van een groter geregistreerd tellerteam, in 400 ontbreekt zij geheel in het geregistreerde team en voor 14 plotjaren ontbreekt plot_jaar_teller. Inhoudelijke controle door de data-eigenaar toont concrete AVIMAP-toeschrijvingen aan kavels die de genoemde waarnemer niet heeft geteld. Het AVIMAP-veld wordt daarom niet gebruikt om plot_jaar_teller te vervangen, aan te vullen of te corrigeren; het blijft uitsluitend als letterlijke bronwaarde en auditinformatie behouden. Deze beperking betreft alleen telleridentificatie en keurt de territorium- en bezoekgegevens uit de download niet als geheel af. Bij meerdere tellers blijft een plotjaar een teamregistratie. Omdat de AVIMAP-bezoekentabel geen teller bevat, wordt zonder andere expliciete bron niet afgeleid wie aan een afzonderlijk bezoek deelnam. Tellersensitiviteitsanalyses gebruiken plot_jaar_teller en houden tellerteams en ontbrekende koppelingen afzonderlijk herkenbaar.</w:t>
       </w:r>
     </w:p>
     <w:bookmarkEnd w:id="12"/>

</xml_diff>

<commit_message>
Leg goedkeuringsstatus territoria vast
</commit_message>
<xml_diff>
--- a/docs/MEIJENDEL_BRONREGISTER.docx
+++ b/docs/MEIJENDEL_BRONREGISTER.docx
@@ -913,6 +913,20 @@
       </w:r>
       <w:r>
         <w:t xml:space="preserve"> Voor telleridentificatie is plot_jaar_teller in de levende lokale database de leidende projectregistratie. Een vergelijking met waarnemer uit de actuele SOVON/AVIMAP-resultatendownload omvat 25.555 soortresultaten in 752 plotjaren uit 2007 en 2009–2026. In 282 plotjaren is de ene AVIMAP-code exact gelijk aan de databasecode, in 56 is zij lid van een groter geregistreerd tellerteam, in 400 ontbreekt zij geheel in het geregistreerde team en voor 14 plotjaren ontbreekt plot_jaar_teller. Inhoudelijke controle door de data-eigenaar toont concrete AVIMAP-toeschrijvingen aan kavels die de genoemde waarnemer niet heeft geteld. Het AVIMAP-veld wordt daarom niet gebruikt om plot_jaar_teller te vervangen, aan te vullen of te corrigeren; het blijft uitsluitend als letterlijke bronwaarde en auditinformatie behouden. Deze beperking betreft alleen telleridentificatie en keurt de territorium- en bezoekgegevens uit de download niet als geheel af. Bij meerdere tellers blijft een plotjaar een teamregistratie. Omdat de AVIMAP-bezoekentabel geen teller bevat, wordt zonder andere expliciete bron niet afgeleid wie aan een afzonderlijk bezoek deelnam. Tellersensitiviteitsanalyses gebruiken plot_jaar_teller en houden tellerteams en ontbrekende koppelingen afzonderlijk herkenbaar.</w:t>
+      </w:r>
+    </w:p>
+    <w:p>
+      <w:pPr>
+        <w:pStyle w:val="BodyText"/>
+      </w:pPr>
+      <w:r>
+        <w:rPr>
+          <w:b/>
+        </w:rPr>
+        <w:t>Goedkeuringsstatus territoria, 1 oktober 2026.</w:t>
+      </w:r>
+      <w:r>
+        <w:t xml:space="preserve"> De tabel territoria bevat uitsluitend formele territoria uit goedgekeurde tellingen. De aanwezigheid van een territoriumregel voor een plot en jaar betekent daarom dat deze uit een goedgekeurde telling komt. dagbezoeken_bmp en dagwaarnemingen_bmp kunnen daarnaast gegevens uit niet-goedgekeurde tellingen bevatten; hun aanwezigheid bewijst niet dat het plotjaar als territoriumtelling is toegelaten. Het ontbreken van een territoriumregel bewijst omgekeerd niet zonder meer dat een telling is afgekeurd, omdat een goedgekeurd plotjaar voor een afzonderlijke soort nul territoria kan hebben. Analyses van territoria, trends en tellersensitiviteit gebruiken uitsluitend de goedgekeurde territoriumuitkomsten en de bijbehorende plot_jaar_teller-registraties.</w:t>
       </w:r>
     </w:p>
     <w:bookmarkEnd w:id="12"/>

</xml_diff>

<commit_message>
Leg correcties territoria en tellers vast
</commit_message>
<xml_diff>
--- a/docs/MEIJENDEL_BRONREGISTER.docx
+++ b/docs/MEIJENDEL_BRONREGISTER.docx
@@ -912,7 +912,7 @@
         <w:t>Telleridentificatie, 1 oktober 2026.</w:t>
       </w:r>
       <w:r>
-        <w:t xml:space="preserve"> Voor telleridentificatie is plot_jaar_teller in de levende lokale database de leidende projectregistratie. Een vergelijking met waarnemer uit de actuele SOVON/AVIMAP-resultatendownload omvat 25.555 soortresultaten in 752 plotjaren uit 2007 en 2009–2026. In 282 plotjaren is de ene AVIMAP-code exact gelijk aan de databasecode, in 56 is zij lid van een groter geregistreerd tellerteam, in 400 ontbreekt zij geheel in het geregistreerde team en voor 14 plotjaren ontbreekt plot_jaar_teller. Inhoudelijke controle door de data-eigenaar toont concrete AVIMAP-toeschrijvingen aan kavels die de genoemde waarnemer niet heeft geteld. Het AVIMAP-veld wordt daarom niet gebruikt om plot_jaar_teller te vervangen, aan te vullen of te corrigeren; het blijft uitsluitend als letterlijke bronwaarde en auditinformatie behouden. Deze beperking betreft alleen telleridentificatie en keurt de territorium- en bezoekgegevens uit de download niet als geheel af. Bij meerdere tellers blijft een plotjaar een teamregistratie. Omdat de AVIMAP-bezoekentabel geen teller bevat, wordt zonder andere expliciete bron niet afgeleid wie aan een afzonderlijk bezoek deelnam. Tellersensitiviteitsanalyses gebruiken plot_jaar_teller en houden tellerteams en ontbrekende koppelingen afzonderlijk herkenbaar.</w:t>
+        <w:t xml:space="preserve"> Voor telleridentificatie is plot_jaar_teller in de levende lokale database de leidende projectregistratie. Een vergelijking met waarnemer uit de actuele SOVON/AVIMAP-resultatendownload omvat 25.555 soortresultaten in 752 plotjaren uit 2007 en 2009–2026. In 282 plotjaren is de ene AVIMAP-code exact gelijk aan de databasecode, in 56 is zij lid van een groter geregistreerd tellerteam, in 400 ontbreekt zij geheel in het geregistreerde team en voor 14 plotjaren ontbrak aanvankelijk plot_jaar_teller. Inhoudelijke controle door de data-eigenaar toont concrete AVIMAP-toeschrijvingen aan kavels die de genoemde waarnemer niet heeft geteld. Het AVIMAP-veld wordt daarom niet gebruikt om plot_jaar_teller te vervangen, aan te vullen of te corrigeren; het blijft uitsluitend als letterlijke bronwaarde en auditinformatie behouden. Deze beperking betreft alleen telleridentificatie en keurt de territorium- en bezoekgegevens uit de download niet als geheel af. Bij meerdere tellers blijft een plotjaar een teamregistratie. Omdat de AVIMAP-bezoekentabel geen teller bevat, wordt zonder andere expliciete bron niet afgeleid wie aan een afzonderlijk bezoek deelnam. Tellersensitiviteitsanalyses gebruiken plot_jaar_teller en houden tellerteams en ontbrekende koppelingen afzonderlijk herkenbaar. Op basis van inhoudelijke vaststelling door de data-eigenaar zijn vier koppelingen aan de levende tabel toegevoegd: 2010/M54a–AZNA00 (plot_id 12381), 2012/M66–WCLE00 (plot_id 3503), 2018/M34–B_0097 (plot_id 3496) en 2018/M8–B_0098 (plot_id 3530). plot_jaar_teller bevat daarna 2.453 regels.</w:t>
       </w:r>
     </w:p>
     <w:p>
@@ -926,7 +926,7 @@
         <w:t>Goedkeuringsstatus territoria, 1 oktober 2026.</w:t>
       </w:r>
       <w:r>
-        <w:t xml:space="preserve"> De tabel territoria bevat uitsluitend formele territoria uit goedgekeurde tellingen. De aanwezigheid van een territoriumregel voor een plot en jaar betekent daarom dat deze uit een goedgekeurde telling komt. dagbezoeken_bmp en dagwaarnemingen_bmp kunnen daarnaast gegevens uit niet-goedgekeurde tellingen bevatten; hun aanwezigheid bewijst niet dat het plotjaar als territoriumtelling is toegelaten. Het ontbreken van een territoriumregel bewijst omgekeerd niet zonder meer dat een telling is afgekeurd, omdat een goedgekeurd plotjaar voor een afzonderlijke soort nul territoria kan hebben. Analyses van territoria, trends en tellersensitiviteit gebruiken uitsluitend de goedgekeurde territoriumuitkomsten en de bijbehorende plot_jaar_teller-registraties.</w:t>
+        <w:t xml:space="preserve"> De inhoudelijke regel is dat territoria uitsluitend formele territoria uit goedgekeurde tellingen hoort te bevatten. Nader onderzoek door de data-eigenaar heeft vier bijzondere plotjaren vastgesteld. 2009/M36, 2018/M55 en 2019/M8 zijn afgekeurd. De 26 regels en 98 territoria van 2009/M36, de 2 regels en 2 territoria van 2018/M55 en de 19 regels en 114 territoria van 2019/M8 zijn na afzonderlijke gerichte herstelkopieën uit de levende tabel verwijderd; de tabel bevat daardoor 71.108 regels. Er resteert geen bekende afgekeurde telling in territoria. 2016/M62 (1 regel, 1 territorium) was een afzonderlijke roofvogeltelling en vervalt uit de BMP-tellersensitiviteitsanalyse; dit is een uitzondering op de vergelijkbaarheid, niet op de goedkeuringsstatus. dagbezoeken_bmp en dagwaarnemingen_bmp kunnen nog wel gegevens uit niet-goedgekeurde tellingen bevatten en zijn daarom op zichzelf geen goedkeuringsbewijs. Het ontbreken van een territoriumregel bewijst omgekeerd niet zonder meer dat een telling is afgekeurd. De eerder ontbrekende tellerkoppelingen voor 2010/M54a, 2012/M66, 2018/M34 en 2018/M8 zijn inmiddels in plot_jaar_teller vastgelegd. Analyses gebruiken uitsluitend inhoudelijk goedgekeurde, protocolmatig vergelijkbare territoriumuitkomsten en de bijbehorende plot_jaar_teller-registraties.</w:t>
       </w:r>
     </w:p>
     <w:bookmarkEnd w:id="12"/>

</xml_diff>

<commit_message>
Borg Natura 2000-analysescope voor plots
</commit_message>
<xml_diff>
--- a/docs/MEIJENDEL_BRONREGISTER.docx
+++ b/docs/MEIJENDEL_BRONREGISTER.docx
@@ -24,7 +24,12 @@
           <w:b/>
           <w:bCs/>
         </w:rPr>
-        <w:t>Stand: 1 oktober 2026.</w:t>
+      </w:r>
+      <w:r>
+        <w:rPr>
+          <w:b/>
+        </w:rPr>
+        <w:t>Stand: 2 oktober 2026.</w:t>
       </w:r>
     </w:p>
     <w:p>
@@ -927,6 +932,20 @@
       </w:r>
       <w:r>
         <w:t xml:space="preserve"> De inhoudelijke regel is dat territoria uitsluitend formele territoria uit goedgekeurde tellingen hoort te bevatten. De data-eigenaar heeft elf plotjaren als afgekeurd vastgesteld: 2009/M35, 2009/M36, 2012/M105, 2012/M54a, 2015/M53, 2018/M54b, 2018/M55, 2019/M78/79, 2019/M8, 2021/M61 en 2022/M1a. Acht daarvan stonden in territoria. De 142 betrokken regels met 1.017 territoria zijn op 1 oktober 2026, na gerichte herstelkopieën, uit de levende tabel verwijderd. Voor 2012/M105, 2015/M53 en 2021/M61 stonden al geen territoriumregels in de tabel. territoria bevat daarna 71.013 regels; geen van de elf afgekeurde plotjaren komt er nog in voor. 2016/M62 (1 regel, 1 territorium) was een afzonderlijke roofvogeltelling en vervalt uit de BMP-tellersensitiviteitsanalyse; dit is een uitzondering op de vergelijkbaarheid, niet op de goedkeuringsstatus. dagbezoeken_bmp en dagwaarnemingen_bmp kunnen nog wel gegevens uit niet-goedgekeurde tellingen bevatten en zijn daarom op zichzelf geen goedkeuringsbewijs. Het ontbreken van een territoriumregel bewijst omgekeerd niet zonder meer dat een telling is afgekeurd. De eerder ontbrekende tellerkoppelingen voor 2010/M54a, 2012/M66, 2018/M34 en 2018/M8 zijn inmiddels in plot_jaar_teller vastgelegd. Analyses gebruiken uitsluitend inhoudelijk goedgekeurde, protocolmatig vergelijkbare territoriumuitkomsten en de bijbehorende plot_jaar_teller-registraties.</w:t>
+      </w:r>
+    </w:p>
+    <w:p>
+      <w:pPr>
+        <w:pStyle w:val="BodyText"/>
+      </w:pPr>
+      <w:r>
+        <w:rPr>
+          <w:b/>
+        </w:rPr>
+        <w:t>Natura 2000-analysescope vogelplots, vastgesteld 1 oktober 2026.</w:t>
+      </w:r>
+      <w:r>
+        <w:t xml:space="preserve"> De geldige bronverzameling territoria bevat 71.013 regels, 54 plots en 2.168 plotjaren uit 1958–2025. M66 (Haagsche Golf Club, plot_id = 3503) bevat daarin 1.593 regels en 10.420 territoria in 39 jaren uit 1985–2025. M91 (Voorlinden, plot_id = 3514) bevat 774 regels en 4.672 territoria in 18 jaren uit 1993–2021. Beide plots blijven als geldige brondata bewaard, maar hebben in plot_analyse_scope onder meijendel_natura2000 de status in_scope = 0 met reden Geen onderdeel van Natura 2000-analysegebied. De standaardselectie via v_meijendel_analyseplot_actueel bevat daardoor 68.646 territoriumregels, 52 plots en 2.111 plotjaren uit 1958–2025. Repositoryberekeningen gebruiken deze scope standaard en nemen M66 en/of M91 alleen mee na een uitdrukkelijke keuze van de gebruiker. plots.in_gebruik beschrijft alleen actueel gebruik en bepaalt deze inhoudelijke grens niet.</w:t>
       </w:r>
     </w:p>
     <w:bookmarkEnd w:id="12"/>

</xml_diff>

<commit_message>
Voeg SOVON BMP ontvangstcontrole toe
</commit_message>
<xml_diff>
--- a/docs/MEIJENDEL_BRONREGISTER.docx
+++ b/docs/MEIJENDEL_BRONREGISTER.docx
@@ -854,10 +854,18 @@
         <w:rPr>
           <w:b/>
         </w:rPr>
-        <w:t xml:space="preserve">Aanvullende SOVON-jaarwerkboeken, 2 oktober 2026. </w:t>
-      </w:r>
-      <w:r>
-        <w:t>Op de T7 staan voor ieder jaar uit 1984–2025 twee aanvullende officiële SOVON/AVIMAP-exports: 42 territoriummatrices en 42 werkboeken met totalen per bezoek, samen 84 Excelbestanden. Alle 84 werkboeken zijn leesbaar en bevatten uitsluitend het jaarlabel van de betreffende jaarmap; in de hoofdmap zijn geen losse Excelbestanden achtergebleven. De territoriummatrices bevatten expliciete nulcellen, maar deze levering is nog niet in de levende database verwerkt. De vergelijking en eventuele verrijking volgen per jaar. Daarbij worden BMP-type, standaard alle soorten of een expliciete uitzondering, volledig geteld, goedgekeurd of formeel afgekeurd en de toepasselijke officiële soortenlijst afzonderlijk vastgelegd. Broedcode 0 blijft een positieve vogelwaarneming. Tellerscodes worden per jaar gecontroleerd; tracks en de actuele SOVON-gebiedspolygonen worden niet opgenomen. Het lopende jaar 2026 valt buiten deze afgeronde reeks.</w:t>
+        <w:t xml:space="preserve">Aanvullende SOVON-jaarleveringen, 2 oktober 2026. </w:t>
+      </w:r>
+      <w:r>
+        <w:t>Op de T7 staan voor ieder jaar uit 1984–2025 twee aanvullende officiële SOVON/AVIMAP-werkboeken: 42 territoriummatrices en 42 werkboeken met totalen per bezoek, samen 84 Excelbestanden. Iedere jaarmap bevat daarnaast een puntlaag met individuele bezoekwaarnemingen en een puntlaag met territoria. De waarnemingslagen bevatten samen 623.264 punten uit 2007 en 2009–2025; de territoriumpuntlagen bevatten 126.682 punten uit dezelfde jaren. Voor 1984–2006 en 2008 zijn beide puntlagen leeg. Alle werkboeken zijn leesbaar en bevatten uitsluitend het jaarlabel van de betreffende jaarmap; in de hoofdmap zijn geen losse Excelbestanden achtergebleven. Tracks en de actuele SOVON-gebiedspolygonen worden niet opgenomen. Het lopende jaar 2026 valt buiten deze afgeronde reeks.</w:t>
+      </w:r>
+    </w:p>
+    <w:p>
+      <w:pPr>
+        <w:pStyle w:val="BodyText"/>
+      </w:pPr>
+      <w:r>
+        <w:t>De 42 territoriummatrices bevatten 222.852 plot-soortregels: 52.450 positieve resultaten, 86.983 expliciete nulcellen en 83.419 lege cellen. Een lege cel geldt niet als nul. De puntlagen bevatten 22.305 bronwaarnemingen die nog niet in dagwaarnemingen_bmp staan; omgekeerd ontbreekt geen bestaande SOVON-bron-ID in de nieuwe levering. Bij 2.629 gedeelde bron-ID’s levert SOVON broedcode 0 terwijl de database NULL bevat. De downloads bevatten geen zelfstandig veld dat een telling formeel als afgekeurd markeert. Deze levering is daarom nog niet in de levende database verwerkt; vergelijking en eventuele verrijking volgen per jaar. Daarbij worden BMP-type, standaard alle soorten of een expliciete uitzondering, volledig geteld, goedgekeurd of formeel afgekeurd en de toepasselijke officiële soortenlijst afzonderlijk vastgelegd. Broedcode 0 blijft een positieve vogelwaarneming. Tellercodes worden per jaar gecontroleerd.</w:t>
       </w:r>
     </w:p>
     <w:p>

</xml_diff>

<commit_message>
Verwerk SOVON BMP controlejaar 1984
</commit_message>
<xml_diff>
--- a/docs/MEIJENDEL_BRONREGISTER.docx
+++ b/docs/MEIJENDEL_BRONREGISTER.docx
@@ -865,7 +865,63 @@
         <w:pStyle w:val="BodyText"/>
       </w:pPr>
       <w:r>
-        <w:t>De 42 territoriummatrices bevatten 222.852 plot-soortregels: 52.450 positieve resultaten, 86.983 expliciete nulcellen en 83.419 lege cellen. Een lege cel geldt niet als nul. De puntlagen bevatten 22.305 bronwaarnemingen die nog niet in dagwaarnemingen_bmp staan; omgekeerd ontbreekt geen bestaande SOVON-bron-ID in de nieuwe levering. Bij 2.629 gedeelde bron-ID’s levert SOVON broedcode 0 terwijl de database NULL bevat. De downloads bevatten geen zelfstandig veld dat een telling formeel als afgekeurd markeert. Deze levering is daarom nog niet in de levende database verwerkt; vergelijking en eventuele verrijking volgen per jaar. Daarbij worden BMP-type, standaard alle soorten of een expliciete uitzondering, volledig geteld, goedgekeurd of formeel afgekeurd en de toepasselijke officiële soortenlijst afzonderlijk vastgelegd. Broedcode 0 blijft een positieve vogelwaarneming. Tellercodes worden per jaar gecontroleerd.</w:t>
+        <w:t>De 42 territoriummatrices bevatten 222.852 plot-soortregels: 52.450 positieve resultaten, 86.983 expliciete nulcellen en 83.419 lege cellen. Een lege cel geldt niet als nul. De puntlagen bevatten 22.305 bronwaarnemingen die nog niet in dagwaarnemingen_bmp staan; omgekeerd ontbreekt geen bestaande SOVON-bron-ID in de nieuwe levering. Bij 2.629 gedeelde bron-ID's levert SOVON broedcode 0 terwijl de database NULL bevat. De downloads bevatten geen zelfstandig veld dat een telling formeel als afgekeurd markeert. Vergelijking en eventuele verrijking volgen daarom per jaar. Daarbij worden BMP-type, standaard alle soorten of een expliciete uitzondering, volledig geteld, goedgekeurd of formeel afgekeurd en de toepasselijke officiële soortenlijst afzonderlijk vastgelegd. Broedcode 0 blijft een positieve vogelwaarneming. Tellercodes worden per jaar gecontroleerd.</w:t>
+      </w:r>
+    </w:p>
+    <w:p>
+      <w:pPr>
+        <w:pStyle w:val="BodyText"/>
+      </w:pPr>
+      <w:r>
+        <w:rPr>
+          <w:b/>
+        </w:rPr>
+        <w:t xml:space="preserve">Jaarcontrole 1984, 2 oktober 2026. </w:t>
+      </w:r>
+      <w:r>
+        <w:t>De SOVON-download bevat 230 bezoeken in 16 plots. Alle 230 bezoeken zijn inhoudelijk gelijk aan de 230 bezoeken onder bron sovon_m in de levende database. Voor 15 bezochte plotjaren bevat de download 568 positieve vogelcellen met samen 7.811 territoria, 860 expliciete nulcellen en 18 lege soortcellen. Die 18 cellen zijn leeg binnen plotjaren die voor andere soorten wel resultaten bevatten; zij zijn niet als nul verwerkt. In de ontvangstlaag zijn voor deze 15 plotjaren 222 bezoeken en alle 1.446 cellen vastgelegd. De 40 geselecteerde maar niet-bezochte plots met 3.497 uitsluitend lege vogelcellen zijn genegeerd.</w:t>
+      </w:r>
+    </w:p>
+    <w:p>
+      <w:pPr>
+        <w:pStyle w:val="BodyText"/>
+      </w:pPr>
+      <w:r>
+        <w:rPr>
+          <w:b/>
+        </w:rPr>
+        <w:t xml:space="preserve">M35. </w:t>
+      </w:r>
+      <w:r>
+        <w:t>M35 is nog niet ingevoerd. De SOVON-download bevat voor M35 acht bezoeken en 49 lege vogelcellen, zonder positieve waarde of expliciete nul. De levende database bevat dezelfde acht bezoeken onder sovon_m, geen territoriumregel onder sovon_m, en 13 afzonderlijke regels met samen 106 territoria onder jrvslg_m. Het verslag over 1983-1985 stelt dat de resultatentabel 1984 uitsluitend BMP-getelde kavels omvat. Kavel 35 staat in de bezettingslijst bij J. Bosland en heeft resultaten in die tabel. De lege SOVON-cellen betekenen dus niet dat M35 niet is geteld en zijn geen nullen; de SOVON-resultaten ontbreken. De jaarverslagregels blijven buiten de SOVON-verwerking. Van de 568 positieve SOVON-cellen zijn er 562 exact gelijk aan sovon_m. De overige zes zijn meeuwenwaarden voor M7, M8, M4-5 en M16s. Zij zijn als SOVON-bronconflict bewaard, maar meeuwen_literatuur blijft voor deze zes plot-soortcombinaties leidend in territoria. De kerntabellen dagbezoeken_bmp (14.455 regels), dagwaarnemingen_bmp (600.959), territoria (71.013) en plot_jaar_teller (2.453) zijn niet gewijzigd.</w:t>
+      </w:r>
+    </w:p>
+    <w:p>
+      <w:pPr>
+        <w:pStyle w:val="BodyText"/>
+      </w:pPr>
+      <w:r>
+        <w:rPr>
+          <w:b/>
+        </w:rPr>
+        <w:t xml:space="preserve">Analytische nulstatus. </w:t>
+      </w:r>
+      <w:r>
+        <w:t>De data-eigenaar heeft op 2 oktober 2026 besloten de actuele officiële SOVON BMP-A-soortenlijst vanaf 1984 toe te passen. Lijstversie sovon-bmp-a-actueel-retroactief-vanaf-1984-v1 gebruikt het officiële PDF-bestand met SHA-256 3af7adf5febb2164d554246882ead82d93efd9bb505b8c195fc842e09fa67b39. De 15 goedgekeurde, volledig getelde BMP-A-plotjaren zijn eraan gekoppeld; de lijsttaxontabel bevat de 187 vogeltaxa die in de 1984-matrix voorkomen. Daarmee bevat v_sovon_bmp_analyse voor 1984 860 notDetected-regels en 562 niet-conflicterende detected-regels. De zes meeuwenconflicten blijven in de ontvangstlaag, maar zijn uit deze analyseview uitgesloten. Zeven historische SOVON-broncategorieën die niet onder dezelfde naam in de actuele lijst staan - Barmsijs, Beflijster, Bosruiter, Goudplevier, Klapekster, Koperwiek en Kuifleeuwerik - blijven onder hun oorspronkelijke naam en bestaande centrale bronkoppeling bewaard. De retroactieve BMP-A-toepassing is geen taxonomische conceptfusie.</w:t>
+      </w:r>
+    </w:p>
+    <w:p>
+      <w:pPr>
+        <w:pStyle w:val="BodyText"/>
+      </w:pPr>
+      <w:r>
+        <w:rPr>
+          <w:b/>
+        </w:rPr>
+        <w:t xml:space="preserve">Kavel 16 en 16s. </w:t>
+      </w:r>
+      <w:r>
+        <w:t>Voor kavel 16 vermeldt het verslag dat in 1984 alleen het centrale deel is geïnventariseerd. De bestaande geaccepteerde historische kavelmapping koppelt 16S aan SOVON-plot 29456 (M16s). Dit past bij de download: M16s bevat 15 bezoeken en 90 vogelcellen, waarvan 47 positief, 42 expliciete nul en één leeg; M16 bevat geen bezoeken en 99 lege cellen. De historische verslagnaam 16 verklaart dat plot_jaar_teller de teller op M16 registreert, maar bewijst niet dat het volledige huidige M16 is geteld. De tellerregel is daarom niet verplaatst. De volledige centrale nacontrole omvat 132 taxonroutes en nul fouten.</w:t>
       </w:r>
     </w:p>
     <w:p>

</xml_diff>

<commit_message>
Leg brongetrouwe SOVON-nulregel vast
</commit_message>
<xml_diff>
--- a/docs/MEIJENDEL_BRONREGISTER.docx
+++ b/docs/MEIJENDEL_BRONREGISTER.docx
@@ -20,7 +20,7 @@
           <w:b/>
           <w:bCs/>
         </w:rPr>
-        <w:t xml:space="preserve">Stand: 2 oktober 2026.</w:t>
+        <w:t xml:space="preserve">Stand: 3 oktober 2026.</w:t>
       </w:r>
     </w:p>
     <w:p>
@@ -1115,7 +1115,61 @@
         <w:pStyle w:val="BodyText"/>
       </w:pPr>
       <w:r>
-        <w:t xml:space="preserve">De 860 ingevoerde nullen zijn uitsluitend letterlijke nulcellen uit de SOVON-matrix. Voor de 249 centraal gekoppelde officiële BMP-A-lijstsoorten en de 15 plotjaren met resultaten zijn 3.735 plot-soortcombinaties mogelijk; 2.338 daarvan ontbreken geheel uit de matrix en zijn nog niet als nul afgeleid. Daarnaast ontbreken alle 225 combinaties van de 15 nog niet centraal gekoppelde officiële lijstnamen en de 15 plotjaren. Eventuele omzetting van deze 2.563 ontbrekende combinaties naar nullen vergt een afzonderlijk besluit; voor de laatste 225 moet bovendien eerst de taxonidentiteit worden opgelost.</w:t>
+        <w:t xml:space="preserve">De 860 ingevoerde nullen zijn uitsluitend letterlijke nulcellen uit de SOVON-matrix. Op 3 oktober 2026 is besloten dat</w:t>
+      </w:r>
+      <w:r>
+        <w:t xml:space="preserve"> </w:t>
+      </w:r>
+      <w:r>
+        <w:rPr>
+          <w:rStyle w:val="VerbatimChar"/>
+        </w:rPr>
+        <w:t xml:space="preserve">territoria</w:t>
+      </w:r>
+      <w:r>
+        <w:t xml:space="preserve"> </w:t>
+      </w:r>
+      <w:r>
+        <w:t xml:space="preserve">alleen werkelijk door de bron geleverde territoriumwaarden bevat; afgeleide gegevens worden niet in deze tabel opgenomen. Voor de 249 centraal gekoppelde officiële BMP-A-lijstsoorten en de 15 plotjaren met resultaten zijn 3.735 plot-soortcombinaties mogelijk; 2.338 daarvan ontbreken geheel uit de matrix en blijven buiten</w:t>
+      </w:r>
+      <w:r>
+        <w:t xml:space="preserve"> </w:t>
+      </w:r>
+      <w:r>
+        <w:rPr>
+          <w:rStyle w:val="VerbatimChar"/>
+        </w:rPr>
+        <w:t xml:space="preserve">territoria</w:t>
+      </w:r>
+      <w:r>
+        <w:t xml:space="preserve">. Ook de 225 ontbrekende combinaties van de 15 nog niet centraal gekoppelde officiële lijstnamen en de 15 plotjaren blijven buiten</w:t>
+      </w:r>
+      <w:r>
+        <w:t xml:space="preserve"> </w:t>
+      </w:r>
+      <w:r>
+        <w:rPr>
+          <w:rStyle w:val="VerbatimChar"/>
+        </w:rPr>
+        <w:t xml:space="preserve">territoria</w:t>
+      </w:r>
+      <w:r>
+        <w:t xml:space="preserve">. BMP-type, volledigheid, soortenlijst en overige protocolmetadata kunnen dus wel worden gebruikt voor controle en analyse, maar nooit om in</w:t>
+      </w:r>
+      <w:r>
+        <w:t xml:space="preserve"> </w:t>
+      </w:r>
+      <w:r>
+        <w:rPr>
+          <w:rStyle w:val="VerbatimChar"/>
+        </w:rPr>
+        <w:t xml:space="preserve">territoria</w:t>
+      </w:r>
+      <w:r>
+        <w:t xml:space="preserve"> </w:t>
+      </w:r>
+      <w:r>
+        <w:t xml:space="preserve">een ontbrekende bronregel als nul aan te maken.</w:t>
       </w:r>
     </w:p>
     <w:p>

</xml_diff>

<commit_message>
Verwerk SOVON-jaarcontroles 1986 en 1987
</commit_message>
<xml_diff>
--- a/docs/MEIJENDEL_BRONREGISTER.docx
+++ b/docs/MEIJENDEL_BRONREGISTER.docx
@@ -746,15 +746,11 @@
       <w:r>
         <w:rPr>
           <w:b/>
-          <w:bCs/>
-        </w:rPr>
-        <w:t xml:space="preserve">Omvang en periode.</w:t>
-      </w:r>
-      <w:r>
-        <w:t xml:space="preserve"> </w:t>
-      </w:r>
-      <w:r>
-        <w:t xml:space="preserve">De database bevat 1.063.936 vogelwaarnemingen uit 1958–2025. De oorspronkelijke telgebieden, bezoeken, protocollen en aantallen zijn beschikbaar. Het betreft territoriumgegevens vanaf 1958, bezoekwaarnemingen van wintertellingen vanaf seizoen 2000/2001 en bezoekwaarnemingen van BMP-tellingen vanaf 2009.</w:t>
+        </w:rPr>
+        <w:t xml:space="preserve">Omvang en periode. </w:t>
+      </w:r>
+      <w:r>
+        <w:t>De database bevat 1.067.141 vogelwaarnemingen uit 1958–2025. De oorspronkelijke telgebieden, bezoeken, protocollen en aantallen zijn beschikbaar. Het betreft territoriumgegevens vanaf 1958, bezoekwaarnemingen van wintertellingen vanaf seizoen 2000/2001 en bezoekwaarnemingen van BMP-tellingen vanaf 2009.</w:t>
       </w:r>
     </w:p>
     <w:p>
@@ -1106,6 +1102,68 @@
         <w:pStyle w:val="BodyText"/>
       </w:pPr>
       <w:r>
+        <w:rPr>
+          <w:b/>
+        </w:rPr>
+        <w:t xml:space="preserve">Jaarcontrole 1986, 3 oktober 2026. </w:t>
+      </w:r>
+      <w:r>
+        <w:t>De SOVON-download bevat 305 bezoeken in 25 plots; alle 305 komen op bron-ID en inhoud overeen met dagbezoeken_bmp. De vogelmatrix bevat 925 positieve waarden, 1.422 letterlijke nulcellen en 2.645 lege cellen. Van de positieve waarden zijn 919 gelijk aan bestaande SOVON-regels. De zes overige positieve waarden zijn meeuwenaantallen voor M7, M16 en M8 en zijn niet toegevoegd, omdat meeuwen_literatuur voor die combinaties leidend blijft. Van de 1.422 letterlijke nullen zijn 1.417 als territoria = 0 met SOVON als bron toegevoegd. De vijf uitgesloten nullen betreffen Stormmeeuw, Kleine Mantelmeeuw en Zilvermeeuw op M14 en Stormmeeuw en Zilvermeeuw op M4-5; meeuwen_literatuur bevat daar positieve aantallen. De 27 lege cellen binnen plots met overige resultaten, de 49 uitsluitend lege M35-cellen en de 2.569 lege cellen in 31 niet-bezochte plots zijn niet ingevoerd.</w:t>
+      </w:r>
+    </w:p>
+    <w:p>
+      <w:pPr>
+        <w:pStyle w:val="BodyText"/>
+      </w:pPr>
+      <w:r>
+        <w:t>Het bezoektotalenbestand vermeldt bij 927 soort-plotregels telkens één niet-bruikbare waarneming, dus 927 aggregaatvermeldingen, maar bevat geen individuele bron-ID, bezoek, datum, broedcode, locatie of formele afkeurstatus. De lege puntlagen en het lege standaardbestand resultaten.xlsx leveren evenmin individuele regels. Deze vermeldingen zijn daarom niet als formeel afgekeurde waarnemingen in dagwaarnemingen_bmp gereconstrueerd. M66 HGC bevat 15 bezoeken en 45 positieve SOVON-regels met samen 336 territoria. Voor dit plotjaar ontbreekt een tellercode in zowel de download als plot_jaar_teller; ook het jaarverslag noemt M66 HGC niet. Het tellerveld blijft daarom leeg. M35 bevat zeven bezoeken en 49 lege matrixcellen. Het jaarverslag bevat 17 regels met samen 156 territoria en meeuwen_literatuur twee Stormmeeuwterritoria, samen gelijk aan het verslagtotaal van 158; deze afzonderlijke bronnen zijn niet als SOVON-regels ingevoerd.</w:t>
+      </w:r>
+    </w:p>
+    <w:p>
+      <w:pPr>
+        <w:pStyle w:val="BodyText"/>
+      </w:pPr>
+      <w:r>
+        <w:rPr>
+          <w:b/>
+        </w:rPr>
+        <w:t xml:space="preserve">Jaarcontrole 1987, 3 oktober 2026. </w:t>
+      </w:r>
+      <w:r>
+        <w:t>De SOVON-download bevat 328 bezoeken; alle 328 komen op bron-ID en inhoud overeen met dagbezoeken_bmp. De vogelmatrix bevat 1.088 positieve waarden, 1.788 letterlijke nulcellen en 2.116 lege cellen. Van de positieve waarden zijn 1.081 gelijk aan bestaande SOVON-regels. De zeven overige positieve waarden zijn Stormmeeuw, Kleine Mantelmeeuw en Zilvermeeuw op M15 en M16 en Kleine Mantelmeeuw op M8. Zij zijn niet toegevoegd, omdat meeuwen_literatuur voor deze combinaties leidend blijft. Alle 1.788 letterlijke nullen waren niet-conflicterend en zijn als territoria = 0 met SOVON als bron toegevoegd. De 32 lege cellen binnen bezochte plots met overige resultaten, de 49 uitsluitend lege M35-cellen, de twee lege M8-cellen en de 2.033 lege cellen in 25 niet-bezochte plots zijn niet ingevoerd.</w:t>
+      </w:r>
+    </w:p>
+    <w:p>
+      <w:pPr>
+        <w:pStyle w:val="BodyText"/>
+      </w:pPr>
+      <w:r>
+        <w:rPr>
+          <w:b w:val="0"/>
+        </w:rPr>
+      </w:r>
+      <w:r>
+        <w:t>Het bezoektotalenbestand vermeldt bij 1.091 soort-plotregels telkens één niet-bruikbare waarneming, dus 1.091 aggregaatvermeldingen, maar bevat geen individuele bron-ID, bezoek, datum, broedcode, locatie of formele afkeurstatus. Deze vermeldingen zijn daarom niet als formeel afgekeurde waarnemingen gereconstrueerd. Voor M66 HGC ontbreekt een tellercode in zowel de download als plot_jaar_teller; dit veld blijft leeg. De overige 29 plots met resultaten hebben al een database-tellercode. M8 heeft 41 positieve waarden, 57 letterlijke nullen en twee lege cellen, maar geen bezoekregels in de SOVON-download of dagbezoeken_bmp. Het jaarverslag noemt R. Wanders als teller en twaalf BMP-bezoeken; de bestaande databasecode RWNS00 blijft staan. De twaalf verslagbezoeken zijn niet als SOVON-bezoeken gereconstrueerd. M35 heeft zeven SOVON-bezoeken maar uitsluitend 49 lege matrixcellen. In de database staan voor M35 zeventien jaarverslagregels met samen 54 territoria en één meeuwen_literatuur-regel met 64 territoria; deze bronnen blijven gescheiden van SOVON.</w:t>
+      </w:r>
+    </w:p>
+    <w:p>
+      <w:pPr>
+        <w:pStyle w:val="BodyText"/>
+      </w:pPr>
+      <w:r>
+        <w:rPr>
+          <w:b/>
+        </w:rPr>
+      </w:r>
+      <w:r>
+        <w:t>Vanaf 3 oktober 2026 gelden voor de verdere jaarcontrole drie algemene besluiten: niet-conflicterende letterlijke SOVON-nullen worden zonder nieuwe jaarbeslissing opgenomen; niet tot individuele bronregels herleidbare aggregaatvermeldingen worden niet als formeel afgekeurde waarnemingen gereconstrueerd; en bij ontbreken van een tellercode in zowel database als download blijft plot_jaar_teller leeg. Ieder jaar wordt nog steeds eerst volledig vergeleken. Nieuwe soorten verschillen, bronconflicten en wel individueel herleidbare afkeuringsinformatie blijven afzonderlijke beslispunten.</w:t>
+      </w:r>
+    </w:p>
+    <w:p>
+      <w:pPr>
+        <w:pStyle w:val="BodyText"/>
+      </w:pPr>
+      <w:r>
         <w:t xml:space="preserve">De data-eigenaar heeft op 2 oktober 2026 besloten de actuele officiële SOVON BMP-A-soortenlijst vanaf 1984 toe te passen. Lijstversie</w:t>
       </w:r>
       <w:r>
@@ -1141,34 +1199,12 @@
         <w:pStyle w:val="BodyText"/>
       </w:pPr>
       <w:r>
-        <w:t xml:space="preserve">De aanvankelijk aangelegde ontvangsttabellen met kopieën van bezoeken en resultaten zijn op 2 oktober 2026 verwijderd. Over blijven vijf </w:t>
-      </w:r>
-      <w:r>
-        <w:rPr>
-          <w:rStyle w:val="VerbatimChar"/>
-        </w:rPr>
-        <w:t>sovon_bmp_*</w:t>
-      </w:r>
-      <w:r>
-        <w:t xml:space="preserve">-tabellen met uitsluitend niet elders aanwezige vergelijkingsmetadata: jaarlevering, plotjaarvoorwaarden, tellercodes, soortenlijstversie en soortenlijstnamen. </w:t>
-      </w:r>
-      <w:r>
-        <w:rPr>
-          <w:rStyle w:val="VerbatimChar"/>
-        </w:rPr>
-        <w:t>territoria</w:t>
-      </w:r>
-      <w:r>
-        <w:t xml:space="preserve"> bevat na de controles van 1984 en 1985 73.258 regels uit 1958-2025. SOVON levert voor 1984 1.422 regels, bestaande uit 562 positieve territoriumresultaten en 860 letterlijke nullen, en voor 1985 2.240 regels, bestaande uit 855 positieve resultaten en 1.385 letterlijke nullen. </w:t>
-      </w:r>
-      <w:r>
-        <w:rPr>
-          <w:rStyle w:val="VerbatimChar"/>
-        </w:rPr>
-        <w:t>dagbezoeken_bmp</w:t>
-      </w:r>
-      <w:r>
-        <w:t xml:space="preserve"> bevat de reeds aanwezige 230 SOVON-bezoeken uit 1984 en 323 uit 1985. De download is dus geen tweede in te voeren gegevenslaag: per jaar wordt hij met de bestaande kerntabellen vergeleken en alleen een vastgesteld, besloten verschil leidt tot een wijziging.</w:t>
+        <w:rPr>
+          <w:b w:val="0"/>
+        </w:rPr>
+      </w:r>
+      <w:r>
+        <w:t>De aanvankelijk aangelegde ontvangsttabellen met kopieën van bezoeken en resultaten zijn op 2 oktober 2026 verwijderd. Over blijven vijf sovon_bmp_*-tabellen met uitsluitend niet elders aanwezige vergelijkingsmetadata: jaarlevering, plotjaarvoorwaarden, tellercodes, soortenlijstversie en soortenlijstnamen. territoria bevat na de controles van 1984–1987 76.463 regels uit 1958-2025. SOVON levert voor 1984 1.422 regels, bestaande uit 562 positieve territoriumresultaten en 860 letterlijke nullen, voor 1985 2.240 regels, bestaande uit 855 positieve resultaten en 1.385 letterlijke nullen, voor 1986 2.336 regels, bestaande uit 919 positieve resultaten en 1.417 letterlijke nullen, en voor 1987 2.869 regels, bestaande uit 1.081 positieve resultaten en 1.788 letterlijke nullen. dagbezoeken_bmp bevat de reeds aanwezige 230 SOVON-bezoeken uit 1984, 323 uit 1985, 305 uit 1986 en 328 uit 1987. De download is dus geen tweede in te voeren gegevenslaag: per jaar wordt hij met de bestaande kerntabellen vergeleken en alleen een vastgesteld, besloten verschil leidt tot een wijziging.</w:t>
       </w:r>
     </w:p>
     <w:p>
@@ -1548,91 +1584,10 @@
         <w:rPr>
           <w:b/>
         </w:rPr>
-        <w:t>Natura 2000-analysescope vogelplots, vastgesteld 1 oktober 2026 en bijgewerkt na de 1985-correctie.</w:t>
-      </w:r>
-      <w:r>
-        <w:t xml:space="preserve"> De geldige bronverzameling </w:t>
-      </w:r>
-      <w:r>
-        <w:rPr>
-          <w:rStyle w:val="VerbatimChar"/>
-        </w:rPr>
-        <w:t>territoria</w:t>
-      </w:r>
-      <w:r>
-        <w:t xml:space="preserve"> bevat 73.258 regels, 54 plots en 2.168 plotjaren uit 1958–2025. M66 (Haagsche Golf Club, </w:t>
-      </w:r>
-      <w:r>
-        <w:rPr>
-          <w:rStyle w:val="VerbatimChar"/>
-        </w:rPr>
-        <w:t>plot_id = 3503</w:t>
-      </w:r>
-      <w:r>
-        <w:t xml:space="preserve">) bevat daarin 1.669 regels en 10.420 territoria in 39 jaren uit 1985–2025. M91 (Voorlinden, </w:t>
-      </w:r>
-      <w:r>
-        <w:rPr>
-          <w:rStyle w:val="VerbatimChar"/>
-        </w:rPr>
-        <w:t>plot_id = 3514</w:t>
-      </w:r>
-      <w:r>
-        <w:t xml:space="preserve">) bevat 774 regels en 4.672 territoria in 18 jaren uit 1993–2021. Beide plots blijven als geldige brondata bewaard, maar hebben in </w:t>
-      </w:r>
-      <w:r>
-        <w:rPr>
-          <w:rStyle w:val="VerbatimChar"/>
-        </w:rPr>
-        <w:t>plot_analyse_scope</w:t>
-      </w:r>
-      <w:r>
-        <w:t xml:space="preserve"> onder </w:t>
-      </w:r>
-      <w:r>
-        <w:rPr>
-          <w:rStyle w:val="VerbatimChar"/>
-        </w:rPr>
-        <w:t>meijendel_natura2000</w:t>
-      </w:r>
-      <w:r>
-        <w:t xml:space="preserve"> de status </w:t>
-      </w:r>
-      <w:r>
-        <w:rPr>
-          <w:rStyle w:val="VerbatimChar"/>
-        </w:rPr>
-        <w:t>in_scope = 0</w:t>
-      </w:r>
-      <w:r>
-        <w:t xml:space="preserve"> met reden </w:t>
-      </w:r>
-      <w:r>
-        <w:rPr>
-          <w:rStyle w:val="VerbatimChar"/>
-        </w:rPr>
-        <w:t>Geen onderdeel van Natura 2000-analysegebied.</w:t>
-      </w:r>
-      <w:r>
-        <w:t xml:space="preserve"> De standaardselectie via </w:t>
-      </w:r>
-      <w:r>
-        <w:rPr>
-          <w:rStyle w:val="VerbatimChar"/>
-        </w:rPr>
-        <w:t>v_meijendel_analyseplot_actueel</w:t>
-      </w:r>
-      <w:r>
-        <w:t xml:space="preserve"> bevat daardoor 70.815 territoriumregels, 52 plots en 2.111 plotjaren uit 1958–2025. Repositoryberekeningen gebruiken deze scope standaard en nemen M66 en/of M91 alleen mee na een uitdrukkelijke keuze van de gebruiker. </w:t>
-      </w:r>
-      <w:r>
-        <w:rPr>
-          <w:rStyle w:val="VerbatimChar"/>
-        </w:rPr>
-        <w:t>plots.in_gebruik</w:t>
-      </w:r>
-      <w:r>
-        <w:t xml:space="preserve"> beschrijft alleen actueel gebruik en bepaalt deze inhoudelijke grens niet.</w:t>
+        <w:t xml:space="preserve">Natura 2000-analysescope vogelplots, vastgesteld 1 oktober 2026 en bijgewerkt na de 1987-correctie. </w:t>
+      </w:r>
+      <w:r>
+        <w:t>De geldige bronverzameling territoria bevat 76.463 regels, 54 plots en 2.168 plotjaren uit 1958–2025. M66 (Haagsche Golf Club, plot_id = 3503) bevat daarin 1.802 regels en 10.420 territoria in 39 jaren uit 1985–2025. M91 (Voorlinden, plot_id = 3514) bevat 774 regels en 4.672 territoria in 18 jaren uit 1993–2021. Beide plots blijven als geldige brondata bewaard, maar hebben in plot_analyse_scope onder meijendel_natura2000 de status in_scope = 0 met reden Geen onderdeel van Natura 2000-analysegebied. De standaardselectie via v_meijendel_analyseplot_actueel bevat daardoor 73.887 territoriumregels, 52 plots en 2.111 plotjaren uit 1958–2025. Repositoryberekeningen gebruiken deze scope standaard en nemen M66 en/of M91 alleen mee na een uitdrukkelijke keuze van de gebruiker. plots.in_gebruik beschrijft alleen actueel gebruik en bepaalt deze inhoudelijke grens niet.</w:t>
       </w:r>
     </w:p>
     <w:bookmarkEnd w:id="12"/>

</xml_diff>

<commit_message>
Hernoem DAZ-BMP-tabellen en vul SOVON 2005 aan
</commit_message>
<xml_diff>
--- a/docs/MEIJENDEL_BRONREGISTER.docx
+++ b/docs/MEIJENDEL_BRONREGISTER.docx
@@ -240,13 +240,13 @@
           <w:b/>
           <w:bCs/>
         </w:rPr>
-        <w:t xml:space="preserve">Taxonomisch register aangevuld en centraal opgeschoond, stand 29 september 2026.</w:t>
-      </w:r>
-      <w:r>
-        <w:t xml:space="preserve"> </w:t>
-      </w:r>
-      <w:r>
-        <w:t xml:space="preserve">De levende lokale database bevat nu 27 praktische groepen en 11.660 centrale vermeldingen: 11.659 naamvermeldingen en één uitdrukkelijk onbepaald operationeel collectieobject. De tabel met bronkoppelingen bevat 30.035 rijen: alle 18.437 oorspronkelijke bronbesluiten, drie eerdere identificatie-aliassen, 6.121 volledig bewaarde oorspronkelijke taxoncontexten, 5.473 aanvullende brongebruiken voor afgeleide meet-/doelsoortregels en de koppeling van het onbepaalde object. Van de oorspronkelijke besluiten blijven 18.350 actief en 87 als eerdere versies bewaard. Dit is geen telling van unieke biologische soorten of lokale aanwezigheid. Het register heeft geen eigen waarnemingsperiode en omvat NDFF, provinciale PQ, Vangblik, SOVON/AVIMAP, de zes externe datasets en aanvullende referentiecatalogi. Meetperioden en toelatingsvoorwaarden blijven die van de afzonderlijke bronnen hieronder.</w:t>
+        <w:t xml:space="preserve">Taxonomisch register aangevuld en centraal opgeschoond, stand 3 oktober 2026.</w:t>
+      </w:r>
+      <w:r>
+        <w:t xml:space="preserve"> </w:t>
+      </w:r>
+      <w:r>
+        <w:t xml:space="preserve">De levende lokale database bevat 27 praktische groepen en 11.660 centrale vermeldingen: 11.659 naamvermeldingen en één uitdrukkelijk onbepaald operationeel collectieobject. De tabel met bronkoppelingen bevat 30.040 rijen: alle 18.437 oorspronkelijke bronbesluiten, drie eerdere identificatie-aliassen, 6.121 volledig bewaarde oorspronkelijke taxoncontexten, 5.478 aanvullende brongebruiken voor afgeleide meet-/doelsoortregels en de koppeling van het onbepaalde object. Van de oorspronkelijke besluiten blijven 18.350 actief en 87 als eerdere versies bewaard. Dit is geen telling van unieke biologische soorten of lokale aanwezigheid. Het register heeft geen eigen waarnemingsperiode en omvat NDFF, provinciale PQ, Vangblik, SOVON/AVIMAP, de zes externe datasets en aanvullende referentiecatalogi. Meetperioden en toelatingsvoorwaarden blijven die van de afzonderlijke bronnen hieronder.</w:t>
       </w:r>
     </w:p>
     <w:p>
@@ -746,11 +746,15 @@
       <w:r>
         <w:rPr>
           <w:b/>
-        </w:rPr>
-        <w:t xml:space="preserve">Omvang en periode. </w:t>
-      </w:r>
-      <w:r>
-        <w:t>De database bevat 1.067.141 vogelwaarnemingen uit 1958–2025. De oorspronkelijke telgebieden, bezoeken, protocollen en aantallen zijn beschikbaar. Het betreft territoriumgegevens vanaf 1958, bezoekwaarnemingen van wintertellingen vanaf seizoen 2000/2001 en bezoekwaarnemingen van BMP-tellingen vanaf 2009.</w:t>
+          <w:bCs/>
+        </w:rPr>
+        <w:t xml:space="preserve">Omvang en periode.</w:t>
+      </w:r>
+      <w:r>
+        <w:t xml:space="preserve"> </w:t>
+      </w:r>
+      <w:r>
+        <w:t xml:space="preserve">De database bevat 1.097.599 vogelwaarnemingen uit 1958–2025. De oorspronkelijke telgebieden, bezoeken, protocollen en aantallen zijn beschikbaar. Het betreft territoriumgegevens vanaf 1958, bezoekwaarnemingen van wintertellingen vanaf seizoen 2000/2001 en bezoekwaarnemingen van BMP-tellingen vanaf 2009.</w:t>
       </w:r>
     </w:p>
     <w:p>
@@ -1028,135 +1032,630 @@
       <w:r>
         <w:rPr>
           <w:b/>
-        </w:rPr>
-        <w:t>Jaarcontrole 1985, 3 oktober 2026.</w:t>
-      </w:r>
-      <w:r>
-        <w:t xml:space="preserve"> De SOVON-download bevat 323 bezoeken in 24 plots; alle 323 komen veld voor veld overeen met </w:t>
-      </w:r>
-      <w:r>
-        <w:rPr>
-          <w:rStyle w:val="VerbatimChar"/>
-        </w:rPr>
-        <w:t>dagbezoeken_bmp</w:t>
-      </w:r>
-      <w:r>
-        <w:t xml:space="preserve">. De vogelmatrix bevat 864 positieve waarden, 1.386 letterlijke nulcellen en 2.742 lege cellen. Van de positieve waarden zijn 855 gelijk aan bestaande SOVON-regels. De negen overige positieve waarden zijn meeuwenaantallen voor M7, M16, M8 en M16s en zijn niet toegevoegd, omdat </w:t>
-      </w:r>
-      <w:r>
-        <w:rPr>
-          <w:rStyle w:val="VerbatimChar"/>
-        </w:rPr>
-        <w:t>meeuwen_literatuur</w:t>
-      </w:r>
-      <w:r>
-        <w:t xml:space="preserve"> voor die combinaties leidend blijft. Van de 1.386 letterlijke nullen zijn 1.385 als </w:t>
-      </w:r>
-      <w:r>
-        <w:rPr>
-          <w:rStyle w:val="VerbatimChar"/>
-        </w:rPr>
-        <w:t>territoria = 0</w:t>
-      </w:r>
-      <w:r>
-        <w:t xml:space="preserve"> met SOVON als bron toegevoegd. De ene uitgesloten nul is M4-5/Zilvermeeuw: SOVON levert 0, terwijl </w:t>
-      </w:r>
-      <w:r>
-        <w:rPr>
-          <w:rStyle w:val="VerbatimChar"/>
-        </w:rPr>
-        <w:t>meeuwen_literatuur</w:t>
-      </w:r>
-      <w:r>
-        <w:t xml:space="preserve"> 55 territoria bevat. De leidende literatuurwaarde blijft staan. De 22 lege cellen binnen twaalf plots met overige resultaten, de 49 uitsluitend lege M35-cellen en de 2.671 lege cellen in 32 niet-bezochte plots zijn niet ingevoerd.</w:t>
-      </w:r>
-    </w:p>
-    <w:p>
-      <w:pPr>
-        <w:pStyle w:val="BodyText"/>
-      </w:pPr>
-      <w:r>
-        <w:t xml:space="preserve">De SOVON-download bevat voor 1985 geen bezoekwaarnemingen, territoriumpunten, formele afkeuringsaanduiding of tellercodes. Er is daarom niets toegevoegd aan </w:t>
-      </w:r>
-      <w:r>
-        <w:rPr>
-          <w:rStyle w:val="VerbatimChar"/>
-        </w:rPr>
-        <w:t>dagwaarnemingen_bmp</w:t>
-      </w:r>
-      <w:r>
-        <w:t xml:space="preserve"> en geen broedcode 0 hersteld. Het verslag bevestigt dat J. Bosland M35 telde en dat kavel 16 bij J.P. Oppentocht hoorde. Op besluit van de data-eigenaar zijn daarom drie ontbrekende regels aan </w:t>
-      </w:r>
-      <w:r>
-        <w:rPr>
-          <w:rStyle w:val="VerbatimChar"/>
-        </w:rPr>
-        <w:t>plot_jaar_teller</w:t>
-      </w:r>
-      <w:r>
-        <w:t xml:space="preserve"> toegevoegd: 1985/M35–B_0042 en 1984 en 1985/M16s–A_0042. De al aanwezige regels 1984/M35–B_0042 en 1984 en 1985/M16–A_0042 zijn behouden; er is niets verplaatst of gedupliceerd.</w:t>
-      </w:r>
-    </w:p>
-    <w:p>
-      <w:pPr>
-        <w:pStyle w:val="BodyText"/>
-      </w:pPr>
-      <w:r>
-        <w:rPr>
-          <w:b/>
-        </w:rPr>
-        <w:t xml:space="preserve">Jaarcontrole 1986, 3 oktober 2026. </w:t>
-      </w:r>
-      <w:r>
-        <w:t>De SOVON-download bevat 305 bezoeken in 25 plots; alle 305 komen op bron-ID en inhoud overeen met dagbezoeken_bmp. De vogelmatrix bevat 925 positieve waarden, 1.422 letterlijke nulcellen en 2.645 lege cellen. Van de positieve waarden zijn 919 gelijk aan bestaande SOVON-regels. De zes overige positieve waarden zijn meeuwenaantallen voor M7, M16 en M8 en zijn niet toegevoegd, omdat meeuwen_literatuur voor die combinaties leidend blijft. Van de 1.422 letterlijke nullen zijn 1.417 als territoria = 0 met SOVON als bron toegevoegd. De vijf uitgesloten nullen betreffen Stormmeeuw, Kleine Mantelmeeuw en Zilvermeeuw op M14 en Stormmeeuw en Zilvermeeuw op M4-5; meeuwen_literatuur bevat daar positieve aantallen. De 27 lege cellen binnen plots met overige resultaten, de 49 uitsluitend lege M35-cellen en de 2.569 lege cellen in 31 niet-bezochte plots zijn niet ingevoerd.</w:t>
-      </w:r>
-    </w:p>
-    <w:p>
-      <w:pPr>
-        <w:pStyle w:val="BodyText"/>
-      </w:pPr>
-      <w:r>
-        <w:t>Het bezoektotalenbestand vermeldt bij 927 soort-plotregels telkens één niet-bruikbare waarneming, dus 927 aggregaatvermeldingen, maar bevat geen individuele bron-ID, bezoek, datum, broedcode, locatie of formele afkeurstatus. De lege puntlagen en het lege standaardbestand resultaten.xlsx leveren evenmin individuele regels. Deze vermeldingen zijn daarom niet als formeel afgekeurde waarnemingen in dagwaarnemingen_bmp gereconstrueerd. M66 HGC bevat 15 bezoeken en 45 positieve SOVON-regels met samen 336 territoria. Voor dit plotjaar ontbreekt een tellercode in zowel de download als plot_jaar_teller; ook het jaarverslag noemt M66 HGC niet. Het tellerveld blijft daarom leeg. M35 bevat zeven bezoeken en 49 lege matrixcellen. Het jaarverslag bevat 17 regels met samen 156 territoria en meeuwen_literatuur twee Stormmeeuwterritoria, samen gelijk aan het verslagtotaal van 158; deze afzonderlijke bronnen zijn niet als SOVON-regels ingevoerd.</w:t>
-      </w:r>
-    </w:p>
-    <w:p>
-      <w:pPr>
-        <w:pStyle w:val="BodyText"/>
-      </w:pPr>
-      <w:r>
-        <w:rPr>
-          <w:b/>
-        </w:rPr>
-        <w:t xml:space="preserve">Jaarcontrole 1987, 3 oktober 2026. </w:t>
-      </w:r>
-      <w:r>
-        <w:t>De SOVON-download bevat 328 bezoeken; alle 328 komen op bron-ID en inhoud overeen met dagbezoeken_bmp. De vogelmatrix bevat 1.088 positieve waarden, 1.788 letterlijke nulcellen en 2.116 lege cellen. Van de positieve waarden zijn 1.081 gelijk aan bestaande SOVON-regels. De zeven overige positieve waarden zijn Stormmeeuw, Kleine Mantelmeeuw en Zilvermeeuw op M15 en M16 en Kleine Mantelmeeuw op M8. Zij zijn niet toegevoegd, omdat meeuwen_literatuur voor deze combinaties leidend blijft. Alle 1.788 letterlijke nullen waren niet-conflicterend en zijn als territoria = 0 met SOVON als bron toegevoegd. De 32 lege cellen binnen bezochte plots met overige resultaten, de 49 uitsluitend lege M35-cellen, de twee lege M8-cellen en de 2.033 lege cellen in 25 niet-bezochte plots zijn niet ingevoerd.</w:t>
-      </w:r>
-    </w:p>
-    <w:p>
-      <w:pPr>
-        <w:pStyle w:val="BodyText"/>
-      </w:pPr>
-      <w:r>
-        <w:rPr>
-          <w:b w:val="0"/>
-        </w:rPr>
-      </w:r>
-      <w:r>
-        <w:t>Het bezoektotalenbestand vermeldt bij 1.091 soort-plotregels telkens één niet-bruikbare waarneming, dus 1.091 aggregaatvermeldingen, maar bevat geen individuele bron-ID, bezoek, datum, broedcode, locatie of formele afkeurstatus. Deze vermeldingen zijn daarom niet als formeel afgekeurde waarnemingen gereconstrueerd. Voor M66 HGC ontbreekt een tellercode in zowel de download als plot_jaar_teller; dit veld blijft leeg. De overige 29 plots met resultaten hebben al een database-tellercode. M8 heeft 41 positieve waarden, 57 letterlijke nullen en twee lege cellen, maar geen bezoekregels in de SOVON-download of dagbezoeken_bmp. Het jaarverslag noemt R. Wanders als teller en twaalf BMP-bezoeken; de bestaande databasecode RWNS00 blijft staan. De twaalf verslagbezoeken zijn niet als SOVON-bezoeken gereconstrueerd. M35 heeft zeven SOVON-bezoeken maar uitsluitend 49 lege matrixcellen. In de database staan voor M35 zeventien jaarverslagregels met samen 54 territoria en één meeuwen_literatuur-regel met 64 territoria; deze bronnen blijven gescheiden van SOVON.</w:t>
-      </w:r>
-    </w:p>
-    <w:p>
-      <w:pPr>
-        <w:pStyle w:val="BodyText"/>
-      </w:pPr>
-      <w:r>
-        <w:rPr>
-          <w:b/>
-        </w:rPr>
-      </w:r>
-      <w:r>
-        <w:t>Vanaf 3 oktober 2026 gelden voor de verdere jaarcontrole drie algemene besluiten: niet-conflicterende letterlijke SOVON-nullen worden zonder nieuwe jaarbeslissing opgenomen; niet tot individuele bronregels herleidbare aggregaatvermeldingen worden niet als formeel afgekeurde waarnemingen gereconstrueerd; en bij ontbreken van een tellercode in zowel database als download blijft plot_jaar_teller leeg. Ieder jaar wordt nog steeds eerst volledig vergeleken. Nieuwe soorten verschillen, bronconflicten en wel individueel herleidbare afkeuringsinformatie blijven afzonderlijke beslispunten.</w:t>
+          <w:bCs/>
+        </w:rPr>
+        <w:t xml:space="preserve">Jaarcontrole 1985, 3 oktober 2026.</w:t>
+      </w:r>
+      <w:r>
+        <w:t xml:space="preserve"> </w:t>
+      </w:r>
+      <w:r>
+        <w:t xml:space="preserve">De SOVON-download bevat 323 bezoeken in 24 plots; alle 323 komen veld voor veld overeen met</w:t>
+      </w:r>
+      <w:r>
+        <w:t xml:space="preserve"> </w:t>
+      </w:r>
+      <w:r>
+        <w:rPr>
+          <w:rStyle w:val="VerbatimChar"/>
+        </w:rPr>
+        <w:t xml:space="preserve">dagbezoeken_bmp</w:t>
+      </w:r>
+      <w:r>
+        <w:t xml:space="preserve">. De vogelmatrix bevat 864 positieve waarden, 1.386 letterlijke nulcellen en 2.742 lege cellen. Van de positieve waarden zijn 855 gelijk aan bestaande SOVON-regels. De negen overige positieve waarden zijn meeuwenaantallen voor M7, M16, M8 en M16s en zijn niet toegevoegd, omdat</w:t>
+      </w:r>
+      <w:r>
+        <w:t xml:space="preserve"> </w:t>
+      </w:r>
+      <w:r>
+        <w:rPr>
+          <w:rStyle w:val="VerbatimChar"/>
+        </w:rPr>
+        <w:t xml:space="preserve">meeuwen_literatuur</w:t>
+      </w:r>
+      <w:r>
+        <w:t xml:space="preserve"> </w:t>
+      </w:r>
+      <w:r>
+        <w:t xml:space="preserve">voor die combinaties leidend blijft. Van de 1.386 letterlijke nullen zijn 1.385 als</w:t>
+      </w:r>
+      <w:r>
+        <w:t xml:space="preserve"> </w:t>
+      </w:r>
+      <w:r>
+        <w:rPr>
+          <w:rStyle w:val="VerbatimChar"/>
+        </w:rPr>
+        <w:t xml:space="preserve">territoria = 0</w:t>
+      </w:r>
+      <w:r>
+        <w:t xml:space="preserve"> </w:t>
+      </w:r>
+      <w:r>
+        <w:t xml:space="preserve">met SOVON als bron toegevoegd. De ene uitgesloten nul is M4-5/Zilvermeeuw: SOVON levert 0, terwijl</w:t>
+      </w:r>
+      <w:r>
+        <w:t xml:space="preserve"> </w:t>
+      </w:r>
+      <w:r>
+        <w:rPr>
+          <w:rStyle w:val="VerbatimChar"/>
+        </w:rPr>
+        <w:t xml:space="preserve">meeuwen_literatuur</w:t>
+      </w:r>
+      <w:r>
+        <w:t xml:space="preserve"> </w:t>
+      </w:r>
+      <w:r>
+        <w:t xml:space="preserve">55 territoria bevat. De leidende literatuurwaarde blijft staan. De 22 lege cellen binnen twaalf plots met overige resultaten, de 49 uitsluitend lege M35-cellen en de 2.671 lege cellen in 32 niet-bezochte plots zijn niet ingevoerd.</w:t>
+      </w:r>
+    </w:p>
+    <w:p>
+      <w:pPr>
+        <w:pStyle w:val="BodyText"/>
+      </w:pPr>
+      <w:r>
+        <w:t xml:space="preserve">De SOVON-download bevat voor 1985 geen bezoekwaarnemingen, territoriumpunten, formele afkeuringsaanduiding of tellercodes. Er is daarom niets toegevoegd aan</w:t>
+      </w:r>
+      <w:r>
+        <w:t xml:space="preserve"> </w:t>
+      </w:r>
+      <w:r>
+        <w:rPr>
+          <w:rStyle w:val="VerbatimChar"/>
+        </w:rPr>
+        <w:t xml:space="preserve">dagwaarnemingen_bmp</w:t>
+      </w:r>
+      <w:r>
+        <w:t xml:space="preserve"> </w:t>
+      </w:r>
+      <w:r>
+        <w:t xml:space="preserve">en geen broedcode 0 hersteld. Het verslag bevestigt dat J. Bosland M35 telde en dat kavel 16 bij J.P. Oppentocht hoorde. Op besluit van de data-eigenaar zijn daarom drie ontbrekende regels aan</w:t>
+      </w:r>
+      <w:r>
+        <w:t xml:space="preserve"> </w:t>
+      </w:r>
+      <w:r>
+        <w:rPr>
+          <w:rStyle w:val="VerbatimChar"/>
+        </w:rPr>
+        <w:t xml:space="preserve">plot_jaar_teller</w:t>
+      </w:r>
+      <w:r>
+        <w:t xml:space="preserve"> </w:t>
+      </w:r>
+      <w:r>
+        <w:t xml:space="preserve">toegevoegd: 1985/M35–B_0042 en 1984 en 1985/M16s–A_0042. De al aanwezige regels 1984/M35–B_0042 en 1984 en 1985/M16–A_0042 zijn behouden; er is niets verplaatst of gedupliceerd.</w:t>
+      </w:r>
+    </w:p>
+    <w:p>
+      <w:pPr>
+        <w:pStyle w:val="BodyText"/>
+      </w:pPr>
+      <w:r>
+        <w:rPr>
+          <w:b/>
+          <w:bCs/>
+        </w:rPr>
+        <w:t xml:space="preserve">Jaarcontrole 1986, 3 oktober 2026.</w:t>
+      </w:r>
+      <w:r>
+        <w:t xml:space="preserve"> </w:t>
+      </w:r>
+      <w:r>
+        <w:t xml:space="preserve">De SOVON-download bevat 305 bezoeken in 25 plots; alle 305 komen op bron-ID en inhoud overeen met</w:t>
+      </w:r>
+      <w:r>
+        <w:t xml:space="preserve"> </w:t>
+      </w:r>
+      <w:r>
+        <w:rPr>
+          <w:rStyle w:val="VerbatimChar"/>
+        </w:rPr>
+        <w:t xml:space="preserve">dagbezoeken_bmp</w:t>
+      </w:r>
+      <w:r>
+        <w:t xml:space="preserve">. De vogelmatrix bevat 925 positieve waarden, 1.422 letterlijke nulcellen en 2.645 lege cellen. Van de positieve waarden zijn 919 gelijk aan bestaande SOVON-regels. De zes overige positieve waarden zijn meeuwenaantallen voor M7, M16 en M8 en zijn niet toegevoegd, omdat</w:t>
+      </w:r>
+      <w:r>
+        <w:t xml:space="preserve"> </w:t>
+      </w:r>
+      <w:r>
+        <w:rPr>
+          <w:rStyle w:val="VerbatimChar"/>
+        </w:rPr>
+        <w:t xml:space="preserve">meeuwen_literatuur</w:t>
+      </w:r>
+      <w:r>
+        <w:t xml:space="preserve"> </w:t>
+      </w:r>
+      <w:r>
+        <w:t xml:space="preserve">voor die combinaties leidend blijft. Van de 1.422 letterlijke nullen zijn 1.417 als</w:t>
+      </w:r>
+      <w:r>
+        <w:t xml:space="preserve"> </w:t>
+      </w:r>
+      <w:r>
+        <w:rPr>
+          <w:rStyle w:val="VerbatimChar"/>
+        </w:rPr>
+        <w:t xml:space="preserve">territoria = 0</w:t>
+      </w:r>
+      <w:r>
+        <w:t xml:space="preserve"> </w:t>
+      </w:r>
+      <w:r>
+        <w:t xml:space="preserve">met SOVON als bron toegevoegd. De vijf uitgesloten nullen betreffen Stormmeeuw, Kleine Mantelmeeuw en Zilvermeeuw op M14 en Stormmeeuw en Zilvermeeuw op M4-5;</w:t>
+      </w:r>
+      <w:r>
+        <w:t xml:space="preserve"> </w:t>
+      </w:r>
+      <w:r>
+        <w:rPr>
+          <w:rStyle w:val="VerbatimChar"/>
+        </w:rPr>
+        <w:t xml:space="preserve">meeuwen_literatuur</w:t>
+      </w:r>
+      <w:r>
+        <w:t xml:space="preserve"> </w:t>
+      </w:r>
+      <w:r>
+        <w:t xml:space="preserve">bevat daar positieve aantallen. De 27 lege cellen binnen plots met overige resultaten, de 49 uitsluitend lege M35-cellen en de 2.569 lege cellen in 31 niet-bezochte plots zijn niet ingevoerd.</w:t>
+      </w:r>
+    </w:p>
+    <w:p>
+      <w:pPr>
+        <w:pStyle w:val="BodyText"/>
+      </w:pPr>
+      <w:r>
+        <w:t xml:space="preserve">Het bezoektotalenbestand vermeldt bij 927 soort-plotregels telkens één niet-bruikbare waarneming, dus 927 aggregaatvermeldingen, maar bevat geen individuele bron-ID, bezoek, datum, broedcode, locatie of formele afkeurstatus. De lege puntlagen en het lege standaardbestand</w:t>
+      </w:r>
+      <w:r>
+        <w:t xml:space="preserve"> </w:t>
+      </w:r>
+      <w:r>
+        <w:rPr>
+          <w:rStyle w:val="VerbatimChar"/>
+        </w:rPr>
+        <w:t xml:space="preserve">resultaten.xlsx</w:t>
+      </w:r>
+      <w:r>
+        <w:t xml:space="preserve"> </w:t>
+      </w:r>
+      <w:r>
+        <w:t xml:space="preserve">leveren evenmin individuele regels. Deze vermeldingen zijn daarom niet als formeel afgekeurde waarnemingen in</w:t>
+      </w:r>
+      <w:r>
+        <w:t xml:space="preserve"> </w:t>
+      </w:r>
+      <w:r>
+        <w:rPr>
+          <w:rStyle w:val="VerbatimChar"/>
+        </w:rPr>
+        <w:t xml:space="preserve">dagwaarnemingen_bmp</w:t>
+      </w:r>
+      <w:r>
+        <w:t xml:space="preserve"> </w:t>
+      </w:r>
+      <w:r>
+        <w:t xml:space="preserve">gereconstrueerd. M66 HGC bevat 15 bezoeken en 45 positieve SOVON-regels met samen 336 territoria. Voor dit plotjaar ontbreekt een tellercode in zowel de download als</w:t>
+      </w:r>
+      <w:r>
+        <w:t xml:space="preserve"> </w:t>
+      </w:r>
+      <w:r>
+        <w:rPr>
+          <w:rStyle w:val="VerbatimChar"/>
+        </w:rPr>
+        <w:t xml:space="preserve">plot_jaar_teller</w:t>
+      </w:r>
+      <w:r>
+        <w:t xml:space="preserve">; ook het jaarverslag noemt M66 HGC niet. Het tellerveld blijft daarom leeg. M35 bevat zeven bezoeken en 49 lege matrixcellen. Het jaarverslag bevat 17 regels met samen 156 territoria en</w:t>
+      </w:r>
+      <w:r>
+        <w:t xml:space="preserve"> </w:t>
+      </w:r>
+      <w:r>
+        <w:rPr>
+          <w:rStyle w:val="VerbatimChar"/>
+        </w:rPr>
+        <w:t xml:space="preserve">meeuwen_literatuur</w:t>
+      </w:r>
+      <w:r>
+        <w:t xml:space="preserve"> </w:t>
+      </w:r>
+      <w:r>
+        <w:t xml:space="preserve">twee Stormmeeuwterritoria, samen gelijk aan het verslagtotaal van 158; deze afzonderlijke bronnen zijn niet als SOVON-regels ingevoerd.</w:t>
+      </w:r>
+    </w:p>
+    <w:p>
+      <w:pPr>
+        <w:pStyle w:val="BodyText"/>
+      </w:pPr>
+      <w:r>
+        <w:rPr>
+          <w:b/>
+          <w:bCs/>
+        </w:rPr>
+        <w:t xml:space="preserve">Jaarcontrole 1987, 3 oktober 2026.</w:t>
+      </w:r>
+      <w:r>
+        <w:t xml:space="preserve"> </w:t>
+      </w:r>
+      <w:r>
+        <w:t xml:space="preserve">De SOVON-download bevat 328 bezoeken; alle 328 komen op bron-ID en inhoud overeen met</w:t>
+      </w:r>
+      <w:r>
+        <w:t xml:space="preserve"> </w:t>
+      </w:r>
+      <w:r>
+        <w:rPr>
+          <w:rStyle w:val="VerbatimChar"/>
+        </w:rPr>
+        <w:t xml:space="preserve">dagbezoeken_bmp</w:t>
+      </w:r>
+      <w:r>
+        <w:t xml:space="preserve">. De vogelmatrix bevat 1.088 positieve waarden, 1.788 letterlijke nulcellen en 2.116 lege cellen. Van de positieve waarden zijn 1.081 gelijk aan bestaande SOVON-regels. De zeven overige positieve waarden zijn Stormmeeuw, Kleine Mantelmeeuw en Zilvermeeuw op M15 en M16 en Kleine Mantelmeeuw op M8. Zij zijn niet toegevoegd, omdat</w:t>
+      </w:r>
+      <w:r>
+        <w:t xml:space="preserve"> </w:t>
+      </w:r>
+      <w:r>
+        <w:rPr>
+          <w:rStyle w:val="VerbatimChar"/>
+        </w:rPr>
+        <w:t xml:space="preserve">meeuwen_literatuur</w:t>
+      </w:r>
+      <w:r>
+        <w:t xml:space="preserve"> </w:t>
+      </w:r>
+      <w:r>
+        <w:t xml:space="preserve">voor deze combinaties leidend blijft. Alle 1.788 letterlijke nullen waren niet-conflicterend en zijn als</w:t>
+      </w:r>
+      <w:r>
+        <w:t xml:space="preserve"> </w:t>
+      </w:r>
+      <w:r>
+        <w:rPr>
+          <w:rStyle w:val="VerbatimChar"/>
+        </w:rPr>
+        <w:t xml:space="preserve">territoria = 0</w:t>
+      </w:r>
+      <w:r>
+        <w:t xml:space="preserve"> </w:t>
+      </w:r>
+      <w:r>
+        <w:t xml:space="preserve">met SOVON als bron toegevoegd. De 32 lege cellen binnen bezochte plots met overige resultaten, de 49 uitsluitend lege M35-cellen, de twee lege M8-cellen en de 2.033 lege cellen in 25 niet-bezochte plots zijn niet ingevoerd.</w:t>
+      </w:r>
+    </w:p>
+    <w:p>
+      <w:pPr>
+        <w:pStyle w:val="BodyText"/>
+      </w:pPr>
+      <w:r>
+        <w:t xml:space="preserve">Het bezoektotalenbestand vermeldt bij 1.091 soort-plotregels telkens één niet-bruikbare waarneming, dus 1.091 aggregaatvermeldingen, maar bevat geen individuele bron-ID, bezoek, datum, broedcode, locatie of formele afkeurstatus. Deze vermeldingen zijn daarom niet als formeel afgekeurde waarnemingen gereconstrueerd. Voor M66 HGC ontbreekt een tellercode in zowel de download als</w:t>
+      </w:r>
+      <w:r>
+        <w:t xml:space="preserve"> </w:t>
+      </w:r>
+      <w:r>
+        <w:rPr>
+          <w:rStyle w:val="VerbatimChar"/>
+        </w:rPr>
+        <w:t xml:space="preserve">plot_jaar_teller</w:t>
+      </w:r>
+      <w:r>
+        <w:t xml:space="preserve">; dit veld blijft leeg. De overige 29 plots met resultaten hebben al een database-tellercode. M8 heeft 41 positieve waarden, 57 letterlijke nullen en twee lege cellen, maar geen bezoekregels in de SOVON-download of</w:t>
+      </w:r>
+      <w:r>
+        <w:t xml:space="preserve"> </w:t>
+      </w:r>
+      <w:r>
+        <w:rPr>
+          <w:rStyle w:val="VerbatimChar"/>
+        </w:rPr>
+        <w:t xml:space="preserve">dagbezoeken_bmp</w:t>
+      </w:r>
+      <w:r>
+        <w:t xml:space="preserve">. Het jaarverslag noemt R. Wanders als teller en twaalf BMP-bezoeken; de bestaande databasecode</w:t>
+      </w:r>
+      <w:r>
+        <w:t xml:space="preserve"> </w:t>
+      </w:r>
+      <w:r>
+        <w:rPr>
+          <w:rStyle w:val="VerbatimChar"/>
+        </w:rPr>
+        <w:t xml:space="preserve">RWNS00</w:t>
+      </w:r>
+      <w:r>
+        <w:t xml:space="preserve"> </w:t>
+      </w:r>
+      <w:r>
+        <w:t xml:space="preserve">blijft staan. De twaalf verslagbezoeken zijn niet als SOVON-bezoeken gereconstrueerd. M35 heeft zeven SOVON-bezoeken maar uitsluitend 49 lege matrixcellen. In de database staan voor M35 zeventien jaarverslagregels met samen 54 territoria en één</w:t>
+      </w:r>
+      <w:r>
+        <w:t xml:space="preserve"> </w:t>
+      </w:r>
+      <w:r>
+        <w:rPr>
+          <w:rStyle w:val="VerbatimChar"/>
+        </w:rPr>
+        <w:t xml:space="preserve">meeuwen_literatuur</w:t>
+      </w:r>
+      <w:r>
+        <w:t xml:space="preserve">-regel met 64 territoria; deze bronnen blijven gescheiden van SOVON.</w:t>
+      </w:r>
+    </w:p>
+    <w:p>
+      <w:pPr>
+        <w:pStyle w:val="BodyText"/>
+      </w:pPr>
+      <w:r>
+        <w:rPr>
+          <w:b/>
+          <w:bCs/>
+        </w:rPr>
+        <w:t xml:space="preserve">Jaarcontroles 1988-2004, 3 oktober 2026.</w:t>
+      </w:r>
+      <w:r>
+        <w:t xml:space="preserve"> </w:t>
+      </w:r>
+      <w:r>
+        <w:t xml:space="preserve">De zeventien SOVON-downloads bevatten samen 5.141 in-scope bezoeken. Alle 5.141 stonden al op bron-ID en inhoud gelijk in</w:t>
+      </w:r>
+      <w:r>
+        <w:t xml:space="preserve"> </w:t>
+      </w:r>
+      <w:r>
+        <w:rPr>
+          <w:rStyle w:val="VerbatimChar"/>
+        </w:rPr>
+        <w:t xml:space="preserve">dagbezoeken_bmp</w:t>
+      </w:r>
+      <w:r>
+        <w:t xml:space="preserve">; er is geen bezoek toegevoegd of gewijzigd. De matrices bevatten na uitsluiting van De Horsten samen 19.197 positieve SOVON-resultaten. Die waren gelijk aan de bestaande SOVON-regels, behoudens meeuwencombinaties waarvoor een aanwezige regel uit</w:t>
+      </w:r>
+      <w:r>
+        <w:t xml:space="preserve"> </w:t>
+      </w:r>
+      <w:r>
+        <w:rPr>
+          <w:rStyle w:val="VerbatimChar"/>
+        </w:rPr>
+        <w:t xml:space="preserve">meeuwen_literatuur</w:t>
+      </w:r>
+      <w:r>
+        <w:t xml:space="preserve"> </w:t>
+      </w:r>
+      <w:r>
+        <w:t xml:space="preserve">leidend bleef. In</w:t>
+      </w:r>
+      <w:r>
+        <w:t xml:space="preserve"> </w:t>
+      </w:r>
+      <w:r>
+        <w:rPr>
+          <w:rStyle w:val="VerbatimChar"/>
+        </w:rPr>
+        <w:t xml:space="preserve">territoria</w:t>
+      </w:r>
+      <w:r>
+        <w:t xml:space="preserve"> </w:t>
+      </w:r>
+      <w:r>
+        <w:t xml:space="preserve">zijn per jaar uitsluitend de volgende aantallen letterlijke, niet-conflicterende SOVON-nullen toegevoegd: 1988 1.444; 1989 1.512; 1990 1.622; 1991 1.761; 1992 1.739; 1993 2.057; 1994 1.838; 1995 1.811; 1996 1.797; 1997 1.829; 1998 1.834; 1999 1.873; 2000 1.773; 2001 1.846; 2002 1.884; 2003 1.854; 2004 1.984. Samen zijn dit 30.458 nieuwe regels.</w:t>
+      </w:r>
+      <w:r>
+        <w:t xml:space="preserve"> </w:t>
+      </w:r>
+      <w:r>
+        <w:rPr>
+          <w:rStyle w:val="VerbatimChar"/>
+        </w:rPr>
+        <w:t xml:space="preserve">territoria</w:t>
+      </w:r>
+      <w:r>
+        <w:t xml:space="preserve"> </w:t>
+      </w:r>
+      <w:r>
+        <w:t xml:space="preserve">bevat daarna 106.921 regels. Alle nieuwe nulregels zijn via</w:t>
+      </w:r>
+      <w:r>
+        <w:t xml:space="preserve"> </w:t>
+      </w:r>
+      <w:r>
+        <w:rPr>
+          <w:rStyle w:val="VerbatimChar"/>
+        </w:rPr>
+        <w:t xml:space="preserve">soorten</w:t>
+      </w:r>
+      <w:r>
+        <w:t xml:space="preserve">,</w:t>
+      </w:r>
+      <w:r>
+        <w:t xml:space="preserve"> </w:t>
+      </w:r>
+      <w:r>
+        <w:rPr>
+          <w:rStyle w:val="VerbatimChar"/>
+        </w:rPr>
+        <w:t xml:space="preserve">taxa_bronkoppeling</w:t>
+      </w:r>
+      <w:r>
+        <w:t xml:space="preserve">,</w:t>
+      </w:r>
+      <w:r>
+        <w:t xml:space="preserve"> </w:t>
+      </w:r>
+      <w:r>
+        <w:rPr>
+          <w:rStyle w:val="VerbatimChar"/>
+        </w:rPr>
+        <w:t xml:space="preserve">taxa</w:t>
+      </w:r>
+      <w:r>
+        <w:t xml:space="preserve"> </w:t>
+      </w:r>
+      <w:r>
+        <w:t xml:space="preserve">en</w:t>
+      </w:r>
+      <w:r>
+        <w:t xml:space="preserve"> </w:t>
+      </w:r>
+      <w:r>
+        <w:rPr>
+          <w:rStyle w:val="VerbatimChar"/>
+        </w:rPr>
+        <w:t xml:space="preserve">taxon_groepen</w:t>
+      </w:r>
+      <w:r>
+        <w:t xml:space="preserve"> </w:t>
+      </w:r>
+      <w:r>
+        <w:t xml:space="preserve">als vogels bereikbaar; de jaarlijkse databasebrede nacontrole omvat 128 routes en geeft nul fouten.</w:t>
+      </w:r>
+    </w:p>
+    <w:p>
+      <w:pPr>
+        <w:pStyle w:val="BodyText"/>
+      </w:pPr>
+      <w:r>
+        <w:t xml:space="preserve">In 1991 zijn vier SOVON-meeuwennullen niet ingevoerd omdat voor dezelfde plot-soortcombinatie een positieve, leidende waarde uit</w:t>
+      </w:r>
+      <w:r>
+        <w:t xml:space="preserve"> </w:t>
+      </w:r>
+      <w:r>
+        <w:rPr>
+          <w:rStyle w:val="VerbatimChar"/>
+        </w:rPr>
+        <w:t xml:space="preserve">meeuwen_literatuur</w:t>
+      </w:r>
+      <w:r>
+        <w:t xml:space="preserve"> </w:t>
+      </w:r>
+      <w:r>
+        <w:t xml:space="preserve">bestaat. Een retroactieve afwezigheidscontrole over 1984-2004 houdt 1.309</w:t>
+      </w:r>
+      <w:r>
+        <w:t xml:space="preserve"> </w:t>
+      </w:r>
+      <w:r>
+        <w:rPr>
+          <w:rStyle w:val="VerbatimChar"/>
+        </w:rPr>
+        <w:t xml:space="preserve">jrvslg_m</w:t>
+      </w:r>
+      <w:r>
+        <w:t xml:space="preserve">-regels en 70</w:t>
+      </w:r>
+      <w:r>
+        <w:t xml:space="preserve"> </w:t>
+      </w:r>
+      <w:r>
+        <w:rPr>
+          <w:rStyle w:val="VerbatimChar"/>
+        </w:rPr>
+        <w:t xml:space="preserve">meeuwen_literatuur</w:t>
+      </w:r>
+      <w:r>
+        <w:t xml:space="preserve">-regels bewust in stand: de SOVON-matrix bevat voor die combinaties geen positieve of letterlijke nulwaarde, en ontbreken in de download is geen wijzigings- of verwijderingsgrond. Jaarverslagen zijn ieder jaar gebruikt om ontbrekende tellers en andere bronverschillen te verklaren. In 1988-2004 leverde dit geen ontbrekende tellerkoppeling op; waar database en download geen teller bevatten, noemde ook het verslag geen ondubbelzinnig aan een bestaande code koppelbare waarnemer voor dat plotjaar.</w:t>
+      </w:r>
+    </w:p>
+    <w:p>
+      <w:pPr>
+        <w:pStyle w:val="BodyText"/>
+      </w:pPr>
+      <w:r>
+        <w:t xml:space="preserve">De Horsten behoort niet tot Meijendel. Uit de download van 1996 zijn daarom negen bezoeken, 41 positieve resultaten met samen 636 territoria, 30 letterlijke nullen en vier lege cellen volledig genegeerd. De uitsluitend lege selecties van De Horsten in volgende jaren zijn eveneens buiten de vergelijking gehouden. Voor 2000 verklaart het jaarverslag de lege SOVON-resultaten van M35: de werkgroep telde M35 en M36 wel, maar stuurde die resultaten dat jaar niet aan SOVON. De bestaande</w:t>
+      </w:r>
+      <w:r>
+        <w:t xml:space="preserve"> </w:t>
+      </w:r>
+      <w:r>
+        <w:rPr>
+          <w:rStyle w:val="VerbatimChar"/>
+        </w:rPr>
+        <w:t xml:space="preserve">jrvslg_m</w:t>
+      </w:r>
+      <w:r>
+        <w:t xml:space="preserve">-regels blijven daarom staan; uit de lege SOVON-cellen is niets afgeleid.</w:t>
+      </w:r>
+    </w:p>
+    <w:p>
+      <w:pPr>
+        <w:pStyle w:val="BodyText"/>
+      </w:pPr>
+      <w:r>
+        <w:rPr>
+          <w:b/>
+          <w:bCs/>
+        </w:rPr>
+        <w:t xml:space="preserve">Controlejaar 2005, gedeeltelijk verwerkt.</w:t>
+      </w:r>
+      <w:r>
+        <w:t xml:space="preserve"> </w:t>
+      </w:r>
+      <w:r>
+        <w:t xml:space="preserve">De 111 geleverde bezoeken staan al gelijk in</w:t>
+      </w:r>
+      <w:r>
+        <w:t xml:space="preserve"> </w:t>
+      </w:r>
+      <w:r>
+        <w:rPr>
+          <w:rStyle w:val="VerbatimChar"/>
+        </w:rPr>
+        <w:t xml:space="preserve">dagbezoeken_bmp</w:t>
+      </w:r>
+      <w:r>
+        <w:t xml:space="preserve">; 1.156 positieve vogelresultaten zijn gelijk en 1.999 letterlijke vogelnullen zijn niet-conflicterend. Het bezoektotalenbestand bevat daarnaast 101 positieve zoogdierregels op 58 bestaande BMP-bezoeken in zeven plots: Konijn 46 regels met totaal 241, Ree 34 met totaal 89, Vos 15 met totaal 22, Eekhoorn vijf met totaal 6 en Dwergspitsmuis één met totaal 1. Vergelijking op bezoek en centraal taxon gaf 20 gelijke waarden, 79 ontbrekende waarden en twee afwijkende waarden. De 79 ontbrekende regels, samen 281 dieren op 44 bezoeken, zijn zonder puntgeometrie maar met bestaande bezoekkoppeling opgenomen in</w:t>
+      </w:r>
+      <w:r>
+        <w:t xml:space="preserve"> </w:t>
+      </w:r>
+      <w:r>
+        <w:rPr>
+          <w:rStyle w:val="VerbatimChar"/>
+        </w:rPr>
+        <w:t xml:space="preserve">daz_bmp_*</w:t>
+      </w:r>
+      <w:r>
+        <w:t xml:space="preserve">; er zijn geen nullen afgeleid. De twee open telconflicten betreffen Konijn in M16: bezoek 365793 heeft SOVON 2 tegenover NDFF 9 en bezoek 365789 heeft SOVON 1 tegenover NDFF 3. Die vier bronwaarden zijn niet gewijzigd. De 1.999 vogelnullen zijn nog niet verwerkt.</w:t>
+      </w:r>
+    </w:p>
+    <w:p>
+      <w:pPr>
+        <w:pStyle w:val="BodyText"/>
+      </w:pPr>
+      <w:r>
+        <w:t xml:space="preserve">Vanaf 3 oktober 2026 geldt als hoofdregel dat alle werkelijk aanvullende SOVON-gegevens in de bestaande Meijendel-kerntabellen mogen worden opgenomen. Bestaande Meijendelgegevens blijven staan wanneer zij in de download ontbreken. Alleen een afzonderlijke conflictregel kan daarvan afwijken. Een aanwezige regel uit</w:t>
+      </w:r>
+      <w:r>
+        <w:t xml:space="preserve"> </w:t>
+      </w:r>
+      <w:r>
+        <w:rPr>
+          <w:rStyle w:val="VerbatimChar"/>
+        </w:rPr>
+        <w:t xml:space="preserve">meeuwen_literatuur</w:t>
+      </w:r>
+      <w:r>
+        <w:t xml:space="preserve"> </w:t>
+      </w:r>
+      <w:r>
+        <w:t xml:space="preserve">blijft voor meeuwen leidend; zonder zo’n regel mag de SOVON-waarde aanvullen of corrigeren. Een ontbrekende teller mag vanuit het jaarverslag worden toegevoegd wanneer kavel en waarnemer ondubbelzinnig zijn en een bestaande code beschikbaar is. De Horsten wordt volledig genegeerd. Niet-conflicterende letterlijke SOVON-nullen worden zonder nieuwe jaarbeslissing opgenomen; niet tot individuele bronregels herleidbare aggregaatvermeldingen worden niet als formeel afgekeurde waarnemingen gereconstrueerd. Ieder jaar wordt eerst volledig vergeleken. Nieuwe soortenconflicten, nieuwe gegevensmodellen en wel individueel herleidbare afkeuringsinformatie blijven afzonderlijke beslispunten.</w:t>
       </w:r>
     </w:p>
     <w:p>
@@ -1199,12 +1698,49 @@
         <w:pStyle w:val="BodyText"/>
       </w:pPr>
       <w:r>
-        <w:rPr>
-          <w:b w:val="0"/>
-        </w:rPr>
-      </w:r>
-      <w:r>
-        <w:t>De aanvankelijk aangelegde ontvangsttabellen met kopieën van bezoeken en resultaten zijn op 2 oktober 2026 verwijderd. Over blijven vijf sovon_bmp_*-tabellen met uitsluitend niet elders aanwezige vergelijkingsmetadata: jaarlevering, plotjaarvoorwaarden, tellercodes, soortenlijstversie en soortenlijstnamen. territoria bevat na de controles van 1984–1987 76.463 regels uit 1958-2025. SOVON levert voor 1984 1.422 regels, bestaande uit 562 positieve territoriumresultaten en 860 letterlijke nullen, voor 1985 2.240 regels, bestaande uit 855 positieve resultaten en 1.385 letterlijke nullen, voor 1986 2.336 regels, bestaande uit 919 positieve resultaten en 1.417 letterlijke nullen, en voor 1987 2.869 regels, bestaande uit 1.081 positieve resultaten en 1.788 letterlijke nullen. dagbezoeken_bmp bevat de reeds aanwezige 230 SOVON-bezoeken uit 1984, 323 uit 1985, 305 uit 1986 en 328 uit 1987. De download is dus geen tweede in te voeren gegevenslaag: per jaar wordt hij met de bestaande kerntabellen vergeleken en alleen een vastgesteld, besloten verschil leidt tot een wijziging.</w:t>
+        <w:t xml:space="preserve">De aanvankelijk aangelegde ontvangsttabellen met kopieën van bezoeken en resultaten zijn op 2 oktober 2026 verwijderd. Over blijven vijf</w:t>
+      </w:r>
+      <w:r>
+        <w:t xml:space="preserve"> </w:t>
+      </w:r>
+      <w:r>
+        <w:rPr>
+          <w:rStyle w:val="VerbatimChar"/>
+        </w:rPr>
+        <w:t xml:space="preserve">sovon_bmp_*</w:t>
+      </w:r>
+      <w:r>
+        <w:t xml:space="preserve">-tabellen met uitsluitend niet elders aanwezige vergelijkingsmetadata: jaarlevering, plotjaarvoorwaarden, tellercodes, soortenlijstversie en soortenlijstnamen.</w:t>
+      </w:r>
+      <w:r>
+        <w:t xml:space="preserve"> </w:t>
+      </w:r>
+      <w:r>
+        <w:rPr>
+          <w:rStyle w:val="VerbatimChar"/>
+        </w:rPr>
+        <w:t xml:space="preserve">territoria</w:t>
+      </w:r>
+      <w:r>
+        <w:t xml:space="preserve"> </w:t>
+      </w:r>
+      <w:r>
+        <w:t xml:space="preserve">bevat na de controles van 1984–2004 106.921 regels uit 1958-2025.</w:t>
+      </w:r>
+      <w:r>
+        <w:t xml:space="preserve"> </w:t>
+      </w:r>
+      <w:r>
+        <w:rPr>
+          <w:rStyle w:val="VerbatimChar"/>
+        </w:rPr>
+        <w:t xml:space="preserve">dagbezoeken_bmp</w:t>
+      </w:r>
+      <w:r>
+        <w:t xml:space="preserve"> </w:t>
+      </w:r>
+      <w:r>
+        <w:t xml:space="preserve">bevat voor die 21 controlejaren alle 6.327 in-scope SOVON-bezoeken uit de downloads al ongewijzigd. De download is dus geen tweede in te voeren gegevenslaag: per jaar wordt hij met de bestaande kerntabellen vergeleken en alleen een vastgesteld, besloten aanvullend gegeven leidt tot een wijziging.</w:t>
       </w:r>
     </w:p>
     <w:p>
@@ -1274,25 +1810,31 @@
         <w:pStyle w:val="BodyText"/>
       </w:pPr>
       <w:r>
-        <w:t xml:space="preserve">Voor kavel 16 vermeldt het verslag dat in 1984 alleen het centrale deel is geïnventariseerd. De bestaande geaccepteerde historische kavelmapping koppelt </w:t>
-      </w:r>
-      <w:r>
-        <w:rPr>
-          <w:rStyle w:val="VerbatimChar"/>
-        </w:rPr>
-        <w:t>16S</w:t>
-      </w:r>
-      <w:r>
-        <w:t xml:space="preserve"> aan SOVON-plot 29456 (</w:t>
-      </w:r>
-      <w:r>
-        <w:rPr>
-          <w:rStyle w:val="VerbatimChar"/>
-        </w:rPr>
-        <w:t>M16s</w:t>
-      </w:r>
-      <w:r>
-        <w:t>). Dit past bij de download: M16s bevat 15 bezoeken en 90 vogelcellen, waarvan 47 positief, 42 expliciete nul en één leeg; M16 bevat geen bezoeken en 99 lege cellen. Op besluit van de data-eigenaar is de bestaande teller A_0042 daarom voor 1984 ook aan M16s gekoppeld. De bestaande historische tellerregel op M16 is niet verplaatst of verwijderd. De volledige centrale nacontrole na de 1985-verwerking omvat 128 taxonroutes en geeft nul fouten.</w:t>
+        <w:t xml:space="preserve">Voor kavel 16 vermeldt het verslag dat in 1984 alleen het centrale deel is geïnventariseerd. De bestaande geaccepteerde historische kavelmapping koppelt</w:t>
+      </w:r>
+      <w:r>
+        <w:t xml:space="preserve"> </w:t>
+      </w:r>
+      <w:r>
+        <w:rPr>
+          <w:rStyle w:val="VerbatimChar"/>
+        </w:rPr>
+        <w:t xml:space="preserve">16S</w:t>
+      </w:r>
+      <w:r>
+        <w:t xml:space="preserve"> </w:t>
+      </w:r>
+      <w:r>
+        <w:t xml:space="preserve">aan SOVON-plot 29456 (</w:t>
+      </w:r>
+      <w:r>
+        <w:rPr>
+          <w:rStyle w:val="VerbatimChar"/>
+        </w:rPr>
+        <w:t xml:space="preserve">M16s</w:t>
+      </w:r>
+      <w:r>
+        <w:t xml:space="preserve">). Dit past bij de download: M16s bevat 15 bezoeken en 90 vogelcellen, waarvan 47 positief, 42 expliciete nul en één leeg; M16 bevat geen bezoeken en 99 lege cellen. Op besluit van de data-eigenaar is de bestaande teller A_0042 daarom voor 1984 ook aan M16s gekoppeld. De bestaande historische tellerregel op M16 is niet verplaatst of verwijderd. De volledige centrale nacontrole na de 1985-verwerking omvat 128 taxonroutes en geeft nul fouten.</w:t>
       </w:r>
     </w:p>
     <w:p>
@@ -1362,101 +1904,150 @@
       <w:r>
         <w:rPr>
           <w:b/>
-        </w:rPr>
-        <w:t>Telleridentificatie, bijgewerkt 3 oktober 2026.</w:t>
-      </w:r>
-      <w:r>
-        <w:t xml:space="preserve"> Voor telleridentificatie is </w:t>
-      </w:r>
-      <w:r>
-        <w:rPr>
-          <w:rStyle w:val="VerbatimChar"/>
-        </w:rPr>
-        <w:t>plot_jaar_teller</w:t>
-      </w:r>
-      <w:r>
-        <w:t xml:space="preserve"> in de levende lokale database de leidende projectregistratie. Een vergelijking met </w:t>
-      </w:r>
-      <w:r>
-        <w:rPr>
-          <w:rStyle w:val="VerbatimChar"/>
-        </w:rPr>
-        <w:t>waarnemer</w:t>
-      </w:r>
-      <w:r>
-        <w:t xml:space="preserve"> uit de actuele SOVON/AVIMAP-resultatendownload omvat 25.555 soortresultaten in 752 plotjaren uit 2007 en 2009–2026. In 282 plotjaren is de ene AVIMAP-code exact gelijk aan de databasecode, in 56 is zij lid van een groter geregistreerd tellerteam, in 400 ontbreekt zij geheel in het geregistreerde team en voor 14 plotjaren ontbrak aanvankelijk </w:t>
-      </w:r>
-      <w:r>
-        <w:rPr>
-          <w:rStyle w:val="VerbatimChar"/>
-        </w:rPr>
-        <w:t>plot_jaar_teller</w:t>
-      </w:r>
-      <w:r>
-        <w:t xml:space="preserve">. Inhoudelijke controle door de data-eigenaar toont concrete AVIMAP-toeschrijvingen aan kavels die de genoemde waarnemer niet heeft geteld. Het AVIMAP-veld wordt daarom niet gebruikt om </w:t>
-      </w:r>
-      <w:r>
-        <w:rPr>
-          <w:rStyle w:val="VerbatimChar"/>
-        </w:rPr>
-        <w:t>plot_jaar_teller</w:t>
-      </w:r>
-      <w:r>
-        <w:t xml:space="preserve"> te vervangen, aan te vullen of te corrigeren; het blijft uitsluitend als letterlijke bronwaarde en auditinformatie behouden. Deze beperking betreft alleen telleridentificatie en keurt de territorium- en bezoekgegevens uit de download niet als geheel af. Bij meerdere tellers blijft een plotjaar een teamregistratie. Omdat de AVIMAP-bezoekentabel geen teller bevat, wordt zonder andere expliciete bron niet afgeleid wie aan een afzonderlijk bezoek deelnam. Tellersensitiviteitsanalyses gebruiken </w:t>
-      </w:r>
-      <w:r>
-        <w:rPr>
-          <w:rStyle w:val="VerbatimChar"/>
-        </w:rPr>
-        <w:t>plot_jaar_teller</w:t>
-      </w:r>
-      <w:r>
-        <w:t xml:space="preserve"> en houden tellerteams en ontbrekende koppelingen afzonderlijk herkenbaar. Op basis van inhoudelijke vaststelling door de data-eigenaar zijn vier koppelingen op 1 oktober toegevoegd: 2010/M54a–AZNA00 (</w:t>
-      </w:r>
-      <w:r>
-        <w:rPr>
-          <w:rStyle w:val="VerbatimChar"/>
-        </w:rPr>
-        <w:t>plot_id</w:t>
-      </w:r>
-      <w:r>
-        <w:t xml:space="preserve"> 12381), 2012/M66–WCLE00 (</w:t>
-      </w:r>
-      <w:r>
-        <w:rPr>
-          <w:rStyle w:val="VerbatimChar"/>
-        </w:rPr>
-        <w:t>plot_id</w:t>
-      </w:r>
-      <w:r>
-        <w:t xml:space="preserve"> 3503), 2018/M34–B_0097 (</w:t>
-      </w:r>
-      <w:r>
-        <w:rPr>
-          <w:rStyle w:val="VerbatimChar"/>
-        </w:rPr>
-        <w:t>plot_id</w:t>
-      </w:r>
-      <w:r>
-        <w:t xml:space="preserve"> 3496) en 2018/M8–B_0098 (</w:t>
-      </w:r>
-      <w:r>
-        <w:rPr>
-          <w:rStyle w:val="VerbatimChar"/>
-        </w:rPr>
-        <w:t>plot_id</w:t>
-      </w:r>
-      <w:r>
-        <w:t xml:space="preserve"> 3530). Op 3 oktober zijn na controle van de jaarverslagen 1985/M35–B_0042 en 1984 en 1985/M16s–A_0042 toegevoegd. </w:t>
-      </w:r>
-      <w:r>
-        <w:rPr>
-          <w:rStyle w:val="VerbatimChar"/>
-        </w:rPr>
-        <w:t>plot_jaar_teller</w:t>
-      </w:r>
-      <w:r>
-        <w:t xml:space="preserve"> bevat daarna 2.456 regels.</w:t>
+          <w:bCs/>
+        </w:rPr>
+        <w:t xml:space="preserve">Telleridentificatie, bijgewerkt 3 oktober 2026.</w:t>
+      </w:r>
+      <w:r>
+        <w:t xml:space="preserve"> </w:t>
+      </w:r>
+      <w:r>
+        <w:t xml:space="preserve">Voor telleridentificatie is</w:t>
+      </w:r>
+      <w:r>
+        <w:t xml:space="preserve"> </w:t>
+      </w:r>
+      <w:r>
+        <w:rPr>
+          <w:rStyle w:val="VerbatimChar"/>
+        </w:rPr>
+        <w:t xml:space="preserve">plot_jaar_teller</w:t>
+      </w:r>
+      <w:r>
+        <w:t xml:space="preserve"> </w:t>
+      </w:r>
+      <w:r>
+        <w:t xml:space="preserve">in de levende lokale database de leidende projectregistratie. Een vergelijking met</w:t>
+      </w:r>
+      <w:r>
+        <w:t xml:space="preserve"> </w:t>
+      </w:r>
+      <w:r>
+        <w:rPr>
+          <w:rStyle w:val="VerbatimChar"/>
+        </w:rPr>
+        <w:t xml:space="preserve">waarnemer</w:t>
+      </w:r>
+      <w:r>
+        <w:t xml:space="preserve"> </w:t>
+      </w:r>
+      <w:r>
+        <w:t xml:space="preserve">uit de actuele SOVON/AVIMAP-resultatendownload omvat 25.555 soortresultaten in 752 plotjaren uit 2007 en 2009–2026. In 282 plotjaren is de ene AVIMAP-code exact gelijk aan de databasecode, in 56 is zij lid van een groter geregistreerd tellerteam, in 400 ontbreekt zij geheel in het geregistreerde team en voor 14 plotjaren ontbrak aanvankelijk</w:t>
+      </w:r>
+      <w:r>
+        <w:t xml:space="preserve"> </w:t>
+      </w:r>
+      <w:r>
+        <w:rPr>
+          <w:rStyle w:val="VerbatimChar"/>
+        </w:rPr>
+        <w:t xml:space="preserve">plot_jaar_teller</w:t>
+      </w:r>
+      <w:r>
+        <w:t xml:space="preserve">. Inhoudelijke controle door de data-eigenaar toont concrete AVIMAP-toeschrijvingen aan kavels die de genoemde waarnemer niet heeft geteld. Het AVIMAP-veld wordt daarom niet gebruikt om</w:t>
+      </w:r>
+      <w:r>
+        <w:t xml:space="preserve"> </w:t>
+      </w:r>
+      <w:r>
+        <w:rPr>
+          <w:rStyle w:val="VerbatimChar"/>
+        </w:rPr>
+        <w:t xml:space="preserve">plot_jaar_teller</w:t>
+      </w:r>
+      <w:r>
+        <w:t xml:space="preserve"> </w:t>
+      </w:r>
+      <w:r>
+        <w:t xml:space="preserve">te vervangen, aan te vullen of te corrigeren; het blijft uitsluitend als letterlijke bronwaarde en auditinformatie behouden. Deze beperking betreft alleen telleridentificatie en keurt de territorium- en bezoekgegevens uit de download niet als geheel af. Bij meerdere tellers blijft een plotjaar een teamregistratie. Omdat de AVIMAP-bezoekentabel geen teller bevat, wordt zonder andere expliciete bron niet afgeleid wie aan een afzonderlijk bezoek deelnam. Tellersensitiviteitsanalyses gebruiken</w:t>
+      </w:r>
+      <w:r>
+        <w:t xml:space="preserve"> </w:t>
+      </w:r>
+      <w:r>
+        <w:rPr>
+          <w:rStyle w:val="VerbatimChar"/>
+        </w:rPr>
+        <w:t xml:space="preserve">plot_jaar_teller</w:t>
+      </w:r>
+      <w:r>
+        <w:t xml:space="preserve"> </w:t>
+      </w:r>
+      <w:r>
+        <w:t xml:space="preserve">en houden tellerteams en ontbrekende koppelingen afzonderlijk herkenbaar. Op basis van inhoudelijke vaststelling door de data-eigenaar zijn vier koppelingen op 1 oktober toegevoegd: 2010/M54a–AZNA00 (</w:t>
+      </w:r>
+      <w:r>
+        <w:rPr>
+          <w:rStyle w:val="VerbatimChar"/>
+        </w:rPr>
+        <w:t xml:space="preserve">plot_id</w:t>
+      </w:r>
+      <w:r>
+        <w:t xml:space="preserve"> </w:t>
+      </w:r>
+      <w:r>
+        <w:t xml:space="preserve">12381), 2012/M66–WCLE00 (</w:t>
+      </w:r>
+      <w:r>
+        <w:rPr>
+          <w:rStyle w:val="VerbatimChar"/>
+        </w:rPr>
+        <w:t xml:space="preserve">plot_id</w:t>
+      </w:r>
+      <w:r>
+        <w:t xml:space="preserve"> </w:t>
+      </w:r>
+      <w:r>
+        <w:t xml:space="preserve">3503), 2018/M34–B_0097 (</w:t>
+      </w:r>
+      <w:r>
+        <w:rPr>
+          <w:rStyle w:val="VerbatimChar"/>
+        </w:rPr>
+        <w:t xml:space="preserve">plot_id</w:t>
+      </w:r>
+      <w:r>
+        <w:t xml:space="preserve"> </w:t>
+      </w:r>
+      <w:r>
+        <w:t xml:space="preserve">3496) en 2018/M8–B_0098 (</w:t>
+      </w:r>
+      <w:r>
+        <w:rPr>
+          <w:rStyle w:val="VerbatimChar"/>
+        </w:rPr>
+        <w:t xml:space="preserve">plot_id</w:t>
+      </w:r>
+      <w:r>
+        <w:t xml:space="preserve"> </w:t>
+      </w:r>
+      <w:r>
+        <w:t xml:space="preserve">3530). Op 3 oktober zijn na controle van de jaarverslagen 1985/M35–B_0042 en 1984 en 1985/M16s–A_0042 toegevoegd.</w:t>
+      </w:r>
+      <w:r>
+        <w:t xml:space="preserve"> </w:t>
+      </w:r>
+      <w:r>
+        <w:rPr>
+          <w:rStyle w:val="VerbatimChar"/>
+        </w:rPr>
+        <w:t xml:space="preserve">plot_jaar_teller</w:t>
+      </w:r>
+      <w:r>
+        <w:t xml:space="preserve"> </w:t>
+      </w:r>
+      <w:r>
+        <w:t xml:space="preserve">bevat daarna 2.456 regels.</w:t>
       </w:r>
     </w:p>
     <w:p>
@@ -1583,11 +2174,144 @@
       <w:r>
         <w:rPr>
           <w:b/>
-        </w:rPr>
-        <w:t xml:space="preserve">Natura 2000-analysescope vogelplots, vastgesteld 1 oktober 2026 en bijgewerkt na de 1987-correctie. </w:t>
-      </w:r>
-      <w:r>
-        <w:t>De geldige bronverzameling territoria bevat 76.463 regels, 54 plots en 2.168 plotjaren uit 1958–2025. M66 (Haagsche Golf Club, plot_id = 3503) bevat daarin 1.802 regels en 10.420 territoria in 39 jaren uit 1985–2025. M91 (Voorlinden, plot_id = 3514) bevat 774 regels en 4.672 territoria in 18 jaren uit 1993–2021. Beide plots blijven als geldige brondata bewaard, maar hebben in plot_analyse_scope onder meijendel_natura2000 de status in_scope = 0 met reden Geen onderdeel van Natura 2000-analysegebied. De standaardselectie via v_meijendel_analyseplot_actueel bevat daardoor 73.887 territoriumregels, 52 plots en 2.111 plotjaren uit 1958–2025. Repositoryberekeningen gebruiken deze scope standaard en nemen M66 en/of M91 alleen mee na een uitdrukkelijke keuze van de gebruiker. plots.in_gebruik beschrijft alleen actueel gebruik en bepaalt deze inhoudelijke grens niet.</w:t>
+          <w:bCs/>
+        </w:rPr>
+        <w:t xml:space="preserve">Natura 2000-analysescope vogelplots, vastgesteld 1 oktober 2026 en bijgewerkt na de controle tot en met 2004.</w:t>
+      </w:r>
+      <w:r>
+        <w:t xml:space="preserve"> </w:t>
+      </w:r>
+      <w:r>
+        <w:t xml:space="preserve">De geldige bronverzameling</w:t>
+      </w:r>
+      <w:r>
+        <w:t xml:space="preserve"> </w:t>
+      </w:r>
+      <w:r>
+        <w:rPr>
+          <w:rStyle w:val="VerbatimChar"/>
+        </w:rPr>
+        <w:t xml:space="preserve">territoria</w:t>
+      </w:r>
+      <w:r>
+        <w:t xml:space="preserve"> </w:t>
+      </w:r>
+      <w:r>
+        <w:t xml:space="preserve">bevat 106.921 regels, 54 plots en 2.168 plotjaren uit 1958–2025. M66 (Haagsche Golf Club,</w:t>
+      </w:r>
+      <w:r>
+        <w:t xml:space="preserve"> </w:t>
+      </w:r>
+      <w:r>
+        <w:rPr>
+          <w:rStyle w:val="VerbatimChar"/>
+        </w:rPr>
+        <w:t xml:space="preserve">plot_id = 3503</w:t>
+      </w:r>
+      <w:r>
+        <w:t xml:space="preserve">) bevat daarin 2.967 regels en 10.420 territoria in 39 jaren uit 1985–2025. M91 (Voorlinden,</w:t>
+      </w:r>
+      <w:r>
+        <w:t xml:space="preserve"> </w:t>
+      </w:r>
+      <w:r>
+        <w:rPr>
+          <w:rStyle w:val="VerbatimChar"/>
+        </w:rPr>
+        <w:t xml:space="preserve">plot_id = 3514</w:t>
+      </w:r>
+      <w:r>
+        <w:t xml:space="preserve">) bevat 874 regels en 4.672 territoria in 18 jaren uit 1993–2021. Beide plots blijven als geldige brondata bewaard, maar hebben in</w:t>
+      </w:r>
+      <w:r>
+        <w:t xml:space="preserve"> </w:t>
+      </w:r>
+      <w:r>
+        <w:rPr>
+          <w:rStyle w:val="VerbatimChar"/>
+        </w:rPr>
+        <w:t xml:space="preserve">plot_analyse_scope</w:t>
+      </w:r>
+      <w:r>
+        <w:t xml:space="preserve"> </w:t>
+      </w:r>
+      <w:r>
+        <w:t xml:space="preserve">onder</w:t>
+      </w:r>
+      <w:r>
+        <w:t xml:space="preserve"> </w:t>
+      </w:r>
+      <w:r>
+        <w:rPr>
+          <w:rStyle w:val="VerbatimChar"/>
+        </w:rPr>
+        <w:t xml:space="preserve">meijendel_natura2000</w:t>
+      </w:r>
+      <w:r>
+        <w:t xml:space="preserve"> </w:t>
+      </w:r>
+      <w:r>
+        <w:t xml:space="preserve">de status</w:t>
+      </w:r>
+      <w:r>
+        <w:t xml:space="preserve"> </w:t>
+      </w:r>
+      <w:r>
+        <w:rPr>
+          <w:rStyle w:val="VerbatimChar"/>
+        </w:rPr>
+        <w:t xml:space="preserve">in_scope = 0</w:t>
+      </w:r>
+      <w:r>
+        <w:t xml:space="preserve"> </w:t>
+      </w:r>
+      <w:r>
+        <w:t xml:space="preserve">met reden</w:t>
+      </w:r>
+      <w:r>
+        <w:t xml:space="preserve"> </w:t>
+      </w:r>
+      <w:r>
+        <w:rPr>
+          <w:rStyle w:val="VerbatimChar"/>
+        </w:rPr>
+        <w:t xml:space="preserve">Geen onderdeel van Natura 2000-analysegebied.</w:t>
+      </w:r>
+      <w:r>
+        <w:t xml:space="preserve"> </w:t>
+      </w:r>
+      <w:r>
+        <w:t xml:space="preserve">De standaardselectie via</w:t>
+      </w:r>
+      <w:r>
+        <w:t xml:space="preserve"> </w:t>
+      </w:r>
+      <w:r>
+        <w:rPr>
+          <w:rStyle w:val="VerbatimChar"/>
+        </w:rPr>
+        <w:t xml:space="preserve">v_meijendel_analyseplot_actueel</w:t>
+      </w:r>
+      <w:r>
+        <w:t xml:space="preserve"> </w:t>
+      </w:r>
+      <w:r>
+        <w:t xml:space="preserve">bevat daardoor 103.080 territoriumregels, 52 plots en 2.111 plotjaren uit 1958–2025. Repositoryberekeningen gebruiken deze scope standaard en nemen M66 en/of M91 alleen mee na een uitdrukkelijke keuze van de gebruiker.</w:t>
+      </w:r>
+      <w:r>
+        <w:t xml:space="preserve"> </w:t>
+      </w:r>
+      <w:r>
+        <w:rPr>
+          <w:rStyle w:val="VerbatimChar"/>
+        </w:rPr>
+        <w:t xml:space="preserve">plots.in_gebruik</w:t>
+      </w:r>
+      <w:r>
+        <w:t xml:space="preserve"> </w:t>
+      </w:r>
+      <w:r>
+        <w:t xml:space="preserve">beschrijft alleen actueel gebruik en bepaalt deze inhoudelijke grens niet.</w:t>
       </w:r>
     </w:p>
     <w:bookmarkEnd w:id="12"/>
@@ -1770,6 +2494,104 @@
       </w:r>
       <w:r>
         <w:t xml:space="preserve">Analyseklaar binnen deze afbakening; de primaire SOVON-bron gaat voor eventuele overeenkomstige NDFF-regels.</w:t>
+      </w:r>
+    </w:p>
+    <w:p>
+      <w:pPr>
+        <w:pStyle w:val="BodyText"/>
+      </w:pPr>
+      <w:r>
+        <w:rPr>
+          <w:b/>
+          <w:bCs/>
+        </w:rPr>
+        <w:t xml:space="preserve">Aanvullende bezoektotalen 2005, 3 oktober 2026.</w:t>
+      </w:r>
+      <w:r>
+        <w:t xml:space="preserve"> </w:t>
+      </w:r>
+      <w:r>
+        <w:t xml:space="preserve">De vier tabellen</w:t>
+      </w:r>
+      <w:r>
+        <w:t xml:space="preserve"> </w:t>
+      </w:r>
+      <w:r>
+        <w:rPr>
+          <w:rStyle w:val="VerbatimChar"/>
+        </w:rPr>
+        <w:t xml:space="preserve">ndff_daz_bmp_*</w:t>
+      </w:r>
+      <w:r>
+        <w:t xml:space="preserve"> </w:t>
+      </w:r>
+      <w:r>
+        <w:t xml:space="preserve">zijn zonder kopie of gegevensverlies hernoemd naar</w:t>
+      </w:r>
+      <w:r>
+        <w:t xml:space="preserve"> </w:t>
+      </w:r>
+      <w:r>
+        <w:rPr>
+          <w:rStyle w:val="VerbatimChar"/>
+        </w:rPr>
+        <w:t xml:space="preserve">daz_bmp_*</w:t>
+      </w:r>
+      <w:r>
+        <w:t xml:space="preserve">. Alle 27.923 bestaande rijen, foreign keys, centrale taxonroutes en reconstructieversies zijn behouden. Het schema ondersteunt nu daarnaast positieve SOVON-bezoektotalen met een afzonderlijk aantal buiten het plot en met</w:t>
+      </w:r>
+      <w:r>
+        <w:t xml:space="preserve"> </w:t>
+      </w:r>
+      <w:r>
+        <w:rPr>
+          <w:rStyle w:val="VerbatimChar"/>
+        </w:rPr>
+        <w:t xml:space="preserve">geen_nulafleiding</w:t>
+      </w:r>
+      <w:r>
+        <w:t xml:space="preserve"> </w:t>
+      </w:r>
+      <w:r>
+        <w:t xml:space="preserve">als expliciete status. Onder</w:t>
+      </w:r>
+      <w:r>
+        <w:t xml:space="preserve"> </w:t>
+      </w:r>
+      <w:r>
+        <w:rPr>
+          <w:rStyle w:val="VerbatimChar"/>
+        </w:rPr>
+        <w:t xml:space="preserve">sovon-bmp-jaarbestanden-v1</w:t>
+      </w:r>
+      <w:r>
+        <w:t xml:space="preserve"> </w:t>
+      </w:r>
+      <w:r>
+        <w:t xml:space="preserve">zijn 44 bestaande BMP-bezoeken en 79 werkelijk ontbrekende bezoek-taxoncellen met samen 281 dieren toegevoegd. Alle waarden liggen in 2005 binnen het plot. De vijf betrokken taxa zijn via vijf versiegebonden koppelingen centraal bereikbaar. Twintig bronwaarden waren al gelijk en zijn niet gedupliceerd. De twee afwijkende Konijnwaarden zijn nog niet opgenomen; daarvoor is een bronkeuze nodig. Deze 79 bezoekaggregaten blijven afzonderlijk van de 19.877 individuele SOVON/AVIMAP-waarnemingen hierboven.</w:t>
+      </w:r>
+    </w:p>
+    <w:p>
+      <w:pPr>
+        <w:pStyle w:val="BodyText"/>
+      </w:pPr>
+      <w:r>
+        <w:t xml:space="preserve">De centrale taxonroute bindt afgeleide bronidentiteiten mede aan de tabelnaam. Daarom zijn ook de 23 gebruikte bronkoppelingen naar</w:t>
+      </w:r>
+      <w:r>
+        <w:t xml:space="preserve"> </w:t>
+      </w:r>
+      <w:r>
+        <w:rPr>
+          <w:rStyle w:val="VerbatimChar"/>
+        </w:rPr>
+        <w:t xml:space="preserve">daz_bmp_bezoek_taxon</w:t>
+      </w:r>
+      <w:r>
+        <w:t xml:space="preserve"> </w:t>
+      </w:r>
+      <w:r>
+        <w:t xml:space="preserve">gemigreerd en zijn alle centrale schrijfguards opnieuw opgebouwd. Geen koppeling werd door een andere waarnemingstabel gedeeld. De volledige controle van 279 tabellen en 128 taxonroutes geeft nul fouten. Twee afzonderlijke tabelback-ups zijn met ongewijzigde SHA-256 teruggelezen in tijdelijke databases; beide herstelproeven reproduceerden exact de vier tabelrijtellingen vóór de betreffende wijziging.</w:t>
       </w:r>
     </w:p>
     <w:bookmarkEnd w:id="14"/>

</xml_diff>

<commit_message>
Verwerk SOVON-controles tot beslispunt 2007
</commit_message>
<xml_diff>
--- a/docs/MEIJENDEL_BRONREGISTER.docx
+++ b/docs/MEIJENDEL_BRONREGISTER.docx
@@ -1602,13 +1602,13 @@
           <w:b/>
           <w:bCs/>
         </w:rPr>
-        <w:t xml:space="preserve">Controlejaar 2005, gedeeltelijk verwerkt.</w:t>
-      </w:r>
-      <w:r>
-        <w:t xml:space="preserve"> </w:t>
-      </w:r>
-      <w:r>
-        <w:t xml:space="preserve">De 111 geleverde bezoeken staan al gelijk in</w:t>
+        <w:t xml:space="preserve">Controlejaar 2005, afgerond.</w:t>
+      </w:r>
+      <w:r>
+        <w:t xml:space="preserve"> </w:t>
+      </w:r>
+      <w:r>
+        <w:t xml:space="preserve">De 111 geleverde bezoeken staan veld voor veld gelijk in</w:t>
       </w:r>
       <w:r>
         <w:t xml:space="preserve"> </w:t>
@@ -1620,19 +1620,178 @@
         <w:t xml:space="preserve">dagbezoeken_bmp</w:t>
       </w:r>
       <w:r>
-        <w:t xml:space="preserve">; 1.156 positieve vogelresultaten zijn gelijk en 1.999 letterlijke vogelnullen zijn niet-conflicterend. Het bezoektotalenbestand bevat daarnaast 101 positieve zoogdierregels op 58 bestaande BMP-bezoeken in zeven plots: Konijn 46 regels met totaal 241, Ree 34 met totaal 89, Vos 15 met totaal 22, Eekhoorn vijf met totaal 6 en Dwergspitsmuis één met totaal 1. Vergelijking op bezoek en centraal taxon gaf 20 gelijke waarden, 79 ontbrekende waarden en twee afwijkende waarden. De 79 ontbrekende regels, samen 281 dieren op 44 bezoeken, zijn zonder puntgeometrie maar met bestaande bezoekkoppeling opgenomen in</w:t>
-      </w:r>
-      <w:r>
-        <w:t xml:space="preserve"> </w:t>
-      </w:r>
-      <w:r>
-        <w:rPr>
-          <w:rStyle w:val="VerbatimChar"/>
-        </w:rPr>
-        <w:t xml:space="preserve">daz_bmp_*</w:t>
-      </w:r>
-      <w:r>
-        <w:t xml:space="preserve">; er zijn geen nullen afgeleid. De twee open telconflicten betreffen Konijn in M16: bezoek 365793 heeft SOVON 2 tegenover NDFF 9 en bezoek 365789 heeft SOVON 1 tegenover NDFF 3. Die vier bronwaarden zijn niet gewijzigd. De 1.999 vogelnullen zijn nog niet verwerkt.</w:t>
+        <w:t xml:space="preserve">; 1.156 positieve vogelresultaten zijn gelijk. De 1.999 letterlijke, niet-conflicterende vogelnullen zijn in</w:t>
+      </w:r>
+      <w:r>
+        <w:t xml:space="preserve"> </w:t>
+      </w:r>
+      <w:r>
+        <w:rPr>
+          <w:rStyle w:val="VerbatimChar"/>
+        </w:rPr>
+        <w:t xml:space="preserve">territoria</w:t>
+      </w:r>
+      <w:r>
+        <w:t xml:space="preserve"> </w:t>
+      </w:r>
+      <w:r>
+        <w:t xml:space="preserve">opgenomen; 1.766 lege cellen niet. De puntenlaag bevat nul features. Het bezoektotalenbestand bevat daarnaast 101 positieve zoogdierregels op 58 bestaande BMP-bezoeken in zeven plots: Konijn 46 regels met totaal 241, Ree 34 met totaal 89, Vos 15 met totaal 22, Eekhoorn vijf met totaal 6 en Dwergspitsmuis één met totaal 1. Twintig waarden waren al gelijk. De overige 81 SOVON-regels met 284 dieren op 46 bezoeken zijn afzonderlijk opgenomen onder</w:t>
+      </w:r>
+      <w:r>
+        <w:t xml:space="preserve"> </w:t>
+      </w:r>
+      <w:r>
+        <w:rPr>
+          <w:rStyle w:val="VerbatimChar"/>
+        </w:rPr>
+        <w:t xml:space="preserve">sovon-bmp-jaarbestanden-v1</w:t>
+      </w:r>
+      <w:r>
+        <w:t xml:space="preserve">; daaronder vallen ook de twee afwijkende Konijnwaarden in M16. Bezoek 365793 bevat SOVON 2 naast NDFF 9 en bezoek 365789 bevat SOVON 1 naast NDFF 3. Het NDFF-auditspoor blijft staan; SOVON is bij gecombineerd gebruik leidend. Er zijn geen zoogdiernullen afgeleid.</w:t>
+      </w:r>
+    </w:p>
+    <w:p>
+      <w:pPr>
+        <w:pStyle w:val="BodyText"/>
+      </w:pPr>
+      <w:r>
+        <w:rPr>
+          <w:b/>
+          <w:bCs/>
+        </w:rPr>
+        <w:t xml:space="preserve">Controlejaar 2006, afgerond.</w:t>
+      </w:r>
+      <w:r>
+        <w:t xml:space="preserve"> </w:t>
+      </w:r>
+      <w:r>
+        <w:t xml:space="preserve">De 172 geleverde bezoeken staan veld voor veld gelijk in</w:t>
+      </w:r>
+      <w:r>
+        <w:t xml:space="preserve"> </w:t>
+      </w:r>
+      <w:r>
+        <w:rPr>
+          <w:rStyle w:val="VerbatimChar"/>
+        </w:rPr>
+        <w:t xml:space="preserve">dagbezoeken_bmp</w:t>
+      </w:r>
+      <w:r>
+        <w:t xml:space="preserve">; 1.069 positieve vogelresultaten zijn gelijk. De 1.865 letterlijke, niet-conflicterende vogelnullen zijn in</w:t>
+      </w:r>
+      <w:r>
+        <w:t xml:space="preserve"> </w:t>
+      </w:r>
+      <w:r>
+        <w:rPr>
+          <w:rStyle w:val="VerbatimChar"/>
+        </w:rPr>
+        <w:t xml:space="preserve">territoria</w:t>
+      </w:r>
+      <w:r>
+        <w:t xml:space="preserve"> </w:t>
+      </w:r>
+      <w:r>
+        <w:t xml:space="preserve">opgenomen; 1.987 lege cellen niet. De puntenlaag bevat nul features. Het bezoektotalenbestand bevat 159 positieve zoogdierregels. Daarvan waren 36 gelijk. Onder</w:t>
+      </w:r>
+      <w:r>
+        <w:t xml:space="preserve"> </w:t>
+      </w:r>
+      <w:r>
+        <w:rPr>
+          <w:rStyle w:val="VerbatimChar"/>
+        </w:rPr>
+        <w:t xml:space="preserve">sovon-bmp-jaarbestanden-v1</w:t>
+      </w:r>
+      <w:r>
+        <w:t xml:space="preserve"> </w:t>
+      </w:r>
+      <w:r>
+        <w:t xml:space="preserve">zijn 123 aanvullende regels met samen 523 dieren op 72 bezoeken opgenomen zonder nulafleiding. Daaronder staan acht afwijkende SOVON-bezoektotalen naast het NDFF-auditspoor; SOVON is bij gecombineerd gebruik leidend.</w:t>
+      </w:r>
+    </w:p>
+    <w:p>
+      <w:pPr>
+        <w:pStyle w:val="BodyText"/>
+      </w:pPr>
+      <w:r>
+        <w:rPr>
+          <w:b/>
+          <w:bCs/>
+        </w:rPr>
+        <w:t xml:space="preserve">Controlejaar 2007, verwerkt tot een bronbesluit.</w:t>
+      </w:r>
+      <w:r>
+        <w:t xml:space="preserve"> </w:t>
+      </w:r>
+      <w:r>
+        <w:t xml:space="preserve">De 172 geleverde bezoeken staan veld voor veld gelijk in</w:t>
+      </w:r>
+      <w:r>
+        <w:t xml:space="preserve"> </w:t>
+      </w:r>
+      <w:r>
+        <w:rPr>
+          <w:rStyle w:val="VerbatimChar"/>
+        </w:rPr>
+        <w:t xml:space="preserve">dagbezoeken_bmp</w:t>
+      </w:r>
+      <w:r>
+        <w:t xml:space="preserve">; 1.166 positieve vogelresultaten zijn gelijk. Alle 1.924 letterlijke vogelnullen zijn in</w:t>
+      </w:r>
+      <w:r>
+        <w:t xml:space="preserve"> </w:t>
+      </w:r>
+      <w:r>
+        <w:rPr>
+          <w:rStyle w:val="VerbatimChar"/>
+        </w:rPr>
+        <w:t xml:space="preserve">territoria</w:t>
+      </w:r>
+      <w:r>
+        <w:t xml:space="preserve"> </w:t>
+      </w:r>
+      <w:r>
+        <w:t xml:space="preserve">opgenomen; 1.831 lege cellen niet. Het bezoektotalenbestand bevat 249 positieve zoogdierregels. Daarvan waren 101 al gelijk. Er zijn 137 aanvullende regels met samen 649 dieren op 75 bezoeken opgenomen zonder nulafleiding. Elf verschillen tussen positieve SOVON- en positieve NDFF-telwaarden wachten op een bronbesluit. Voor M6 vermeldt de download teller</w:t>
+      </w:r>
+      <w:r>
+        <w:t xml:space="preserve"> </w:t>
+      </w:r>
+      <w:r>
+        <w:rPr>
+          <w:rStyle w:val="VerbatimChar"/>
+        </w:rPr>
+        <w:t xml:space="preserve">JASQ00</w:t>
+      </w:r>
+      <w:r>
+        <w:t xml:space="preserve">. Het verslag noemt T. Lansink voor M6 en M61 en J. van As voor M83; de database koppelt M6 en M61 aan</w:t>
+      </w:r>
+      <w:r>
+        <w:t xml:space="preserve"> </w:t>
+      </w:r>
+      <w:r>
+        <w:rPr>
+          <w:rStyle w:val="VerbatimChar"/>
+        </w:rPr>
+        <w:t xml:space="preserve">ALNK00</w:t>
+      </w:r>
+      <w:r>
+        <w:t xml:space="preserve"> </w:t>
+      </w:r>
+      <w:r>
+        <w:t xml:space="preserve">en M83 aan</w:t>
+      </w:r>
+      <w:r>
+        <w:t xml:space="preserve"> </w:t>
+      </w:r>
+      <w:r>
+        <w:rPr>
+          <w:rStyle w:val="VerbatimChar"/>
+        </w:rPr>
+        <w:t xml:space="preserve">JASQ00</w:t>
+      </w:r>
+      <w:r>
+        <w:t xml:space="preserve">. De downloadcode bij M6 is daarom niet overgenomen.</w:t>
       </w:r>
     </w:p>
     <w:p>
@@ -1725,7 +1884,7 @@
         <w:t xml:space="preserve"> </w:t>
       </w:r>
       <w:r>
-        <w:t xml:space="preserve">bevat na de controles van 1984–2004 106.921 regels uit 1958-2025.</w:t>
+        <w:t xml:space="preserve">bevat na de niet-conflicterende verwerking tot en met 2007 112.709 regels uit 1958-2025.</w:t>
       </w:r>
       <w:r>
         <w:t xml:space="preserve"> </w:t>
@@ -1740,7 +1899,7 @@
         <w:t xml:space="preserve"> </w:t>
       </w:r>
       <w:r>
-        <w:t xml:space="preserve">bevat voor die 21 controlejaren alle 6.327 in-scope SOVON-bezoeken uit de downloads al ongewijzigd. De download is dus geen tweede in te voeren gegevenslaag: per jaar wordt hij met de bestaande kerntabellen vergeleken en alleen een vastgesteld, besloten aanvullend gegeven leidt tot een wijziging.</w:t>
+        <w:t xml:space="preserve">bevat voor 1984-2007 alle 6.782 in-scope SOVON-bezoeken uit de downloads al ongewijzigd. De download is dus geen tweede in te voeren gegevenslaag: per jaar wordt hij met de bestaande kerntabellen vergeleken en alleen een vastgesteld, besloten aanvullend gegeven leidt tot een wijziging.</w:t>
       </w:r>
     </w:p>
     <w:p>
@@ -2176,7 +2335,7 @@
           <w:b/>
           <w:bCs/>
         </w:rPr>
-        <w:t xml:space="preserve">Natura 2000-analysescope vogelplots, vastgesteld 1 oktober 2026 en bijgewerkt na de controle tot en met 2004.</w:t>
+        <w:t xml:space="preserve">Natura 2000-analysescope vogelplots, vastgesteld 1 oktober 2026 en bijgewerkt na de controle van 2007.</w:t>
       </w:r>
       <w:r>
         <w:t xml:space="preserve"> </w:t>
@@ -2197,7 +2356,7 @@
         <w:t xml:space="preserve"> </w:t>
       </w:r>
       <w:r>
-        <w:t xml:space="preserve">bevat 106.921 regels, 54 plots en 2.168 plotjaren uit 1958–2025. M66 (Haagsche Golf Club,</w:t>
+        <w:t xml:space="preserve">bevat 112.709 regels, 54 plots en 2.168 plotjaren uit 1958–2025. M66 (Haagsche Golf Club,</w:t>
       </w:r>
       <w:r>
         <w:t xml:space="preserve"> </w:t>
@@ -2209,7 +2368,7 @@
         <w:t xml:space="preserve">plot_id = 3503</w:t>
       </w:r>
       <w:r>
-        <w:t xml:space="preserve">) bevat daarin 2.967 regels en 10.420 territoria in 39 jaren uit 1985–2025. M91 (Voorlinden,</w:t>
+        <w:t xml:space="preserve">) bevat daarin 3.182 regels en 10.420 territoria in 39 jaren uit 1985–2025. M91 (Voorlinden,</w:t>
       </w:r>
       <w:r>
         <w:t xml:space="preserve"> </w:t>
@@ -2221,7 +2380,7 @@
         <w:t xml:space="preserve">plot_id = 3514</w:t>
       </w:r>
       <w:r>
-        <w:t xml:space="preserve">) bevat 874 regels en 4.672 territoria in 18 jaren uit 1993–2021. Beide plots blijven als geldige brondata bewaard, maar hebben in</w:t>
+        <w:t xml:space="preserve">) bevat 928 regels en 4.672 territoria in 18 jaren uit 1993–2021. Beide plots blijven als geldige brondata bewaard, maar hebben in</w:t>
       </w:r>
       <w:r>
         <w:t xml:space="preserve"> </w:t>
@@ -2296,7 +2455,7 @@
         <w:t xml:space="preserve"> </w:t>
       </w:r>
       <w:r>
-        <w:t xml:space="preserve">bevat daardoor 103.080 territoriumregels, 52 plots en 2.111 plotjaren uit 1958–2025. Repositoryberekeningen gebruiken deze scope standaard en nemen M66 en/of M91 alleen mee na een uitdrukkelijke keuze van de gebruiker.</w:t>
+        <w:t xml:space="preserve">bevat daardoor 108.599 territoriumregels, 52 plots en 2.111 plotjaren uit 1958–2025. Repositoryberekeningen gebruiken deze scope standaard en nemen M66 en/of M91 alleen mee na een uitdrukkelijke keuze van de gebruiker.</w:t>
       </w:r>
       <w:r>
         <w:t xml:space="preserve"> </w:t>
@@ -2505,7 +2664,7 @@
           <w:b/>
           <w:bCs/>
         </w:rPr>
-        <w:t xml:space="preserve">Aanvullende bezoektotalen 2005, 3 oktober 2026.</w:t>
+        <w:t xml:space="preserve">Aanvullende bezoektotalen 2005–2007, 3 oktober 2026.</w:t>
       </w:r>
       <w:r>
         <w:t xml:space="preserve"> </w:t>
@@ -2538,7 +2697,7 @@
         <w:t xml:space="preserve">daz_bmp_*</w:t>
       </w:r>
       <w:r>
-        <w:t xml:space="preserve">. Alle 27.923 bestaande rijen, foreign keys, centrale taxonroutes en reconstructieversies zijn behouden. Het schema ondersteunt nu daarnaast positieve SOVON-bezoektotalen met een afzonderlijk aantal buiten het plot en met</w:t>
+        <w:t xml:space="preserve">. Alle historische rijen, foreign keys, centrale taxonroutes en reconstructieversies zijn behouden. Het schema ondersteunt daarnaast positieve SOVON-bezoektotalen met een afzonderlijk aantal buiten het plot en met</w:t>
       </w:r>
       <w:r>
         <w:t xml:space="preserve"> </w:t>
@@ -2568,7 +2727,42 @@
         <w:t xml:space="preserve"> </w:t>
       </w:r>
       <w:r>
-        <w:t xml:space="preserve">zijn 44 bestaande BMP-bezoeken en 79 werkelijk ontbrekende bezoek-taxoncellen met samen 281 dieren toegevoegd. Alle waarden liggen in 2005 binnen het plot. De vijf betrokken taxa zijn via vijf versiegebonden koppelingen centraal bereikbaar. Twintig bronwaarden waren al gelijk en zijn niet gedupliceerd. De twee afwijkende Konijnwaarden zijn nog niet opgenomen; daarvoor is een bronkeuze nodig. Deze 79 bezoekaggregaten blijven afzonderlijk van de 19.877 individuele SOVON/AVIMAP-waarnemingen hierboven.</w:t>
+        <w:t xml:space="preserve">staan nu 341 aanvullende bezoek-taxoncellen met samen 1.456 dieren: 81 regels op 46 bezoeken uit 2005, 123 regels op 72 bezoeken uit 2006 en 137 regels op 75 bezoeken uit 2007. De negen betrokken taxa zijn via versiegebonden koppelingen centraal bereikbaar. Gelijke bronwaarden zijn niet gedupliceerd. De twee positieve verschillen uit 2005 en acht uit 2006 staan met afzonderlijke herkomst naast het NDFF-auditspoor en gebruiken SOVON als leidende waarde; elf positieve verschillen uit 2007 wachten op een bronbesluit. Deze bezoekaggregaten blijven afzonderlijk van de 19.877 individuele SOVON/AVIMAP-waarnemingen hierboven.</w:t>
+      </w:r>
+    </w:p>
+    <w:p>
+      <w:pPr>
+        <w:pStyle w:val="BodyText"/>
+      </w:pPr>
+      <w:r>
+        <w:t xml:space="preserve">De 7.552 eerder uit</w:t>
+      </w:r>
+      <w:r>
+        <w:t xml:space="preserve"> </w:t>
+      </w:r>
+      <w:r>
+        <w:rPr>
+          <w:rStyle w:val="VerbatimChar"/>
+        </w:rPr>
+        <w:t xml:space="preserve">ndff-daz-bmp-v1</w:t>
+      </w:r>
+      <w:r>
+        <w:t xml:space="preserve"> </w:t>
+      </w:r>
+      <w:r>
+        <w:t xml:space="preserve">afgeleide nulregels zijn als volledig historisch auditspoor bewaard, maar herclassificeerd als</w:t>
+      </w:r>
+      <w:r>
+        <w:t xml:space="preserve"> </w:t>
+      </w:r>
+      <w:r>
+        <w:rPr>
+          <w:rStyle w:val="VerbatimChar"/>
+        </w:rPr>
+        <w:t xml:space="preserve">historische_afgeleide_nul</w:t>
+      </w:r>
+      <w:r>
+        <w:t xml:space="preserve">. De 1.475 bijbehorende bezoeken vermelden expliciet dat de reconstructie geen bewijs van afwezigheid levert. De regels zijn daarmee ongeschikt voor analyses die echte nullen vereisen.</w:t>
       </w:r>
     </w:p>
     <w:p>

</xml_diff>

<commit_message>
Verwerk SOVON-controles tot en met 2022
</commit_message>
<xml_diff>
--- a/docs/MEIJENDEL_BRONREGISTER.docx
+++ b/docs/MEIJENDEL_BRONREGISTER.docx
@@ -246,7 +246,7 @@
         <w:t xml:space="preserve"> </w:t>
       </w:r>
       <w:r>
-        <w:t xml:space="preserve">De levende lokale database bevat 27 praktische groepen en 11.660 centrale vermeldingen: 11.659 naamvermeldingen en één uitdrukkelijk onbepaald operationeel collectieobject. De tabel met bronkoppelingen bevat 30.040 rijen: alle 18.437 oorspronkelijke bronbesluiten, drie eerdere identificatie-aliassen, 6.121 volledig bewaarde oorspronkelijke taxoncontexten, 5.478 aanvullende brongebruiken voor afgeleide meet-/doelsoortregels en de koppeling van het onbepaalde object. Van de oorspronkelijke besluiten blijven 18.350 actief en 87 als eerdere versies bewaard. Dit is geen telling van unieke biologische soorten of lokale aanwezigheid. Het register heeft geen eigen waarnemingsperiode en omvat NDFF, provinciale PQ, Vangblik, SOVON/AVIMAP, de zes externe datasets en aanvullende referentiecatalogi. Meetperioden en toelatingsvoorwaarden blijven die van de afzonderlijke bronnen hieronder.</w:t>
+        <w:t xml:space="preserve">De levende lokale database bevat 27 praktische groepen en 11.660 centrale vermeldingen: 11.659 naamvermeldingen en één uitdrukkelijk onbepaald operationeel collectieobject. De tabel met bronkoppelingen bevat 30.057 rijen: alle 18.437 oorspronkelijke bronbesluiten, drie eerdere identificatie-aliassen, 6.121 volledig bewaarde oorspronkelijke taxoncontexten, 5.495 aanvullende brongebruiken voor afgeleide meet-/doelsoortregels en de koppeling van het onbepaalde object. Er zijn 29.970 actieve koppelingen en 87 als eerdere versies bewaarde koppelingen. Dit is geen telling van unieke biologische soorten of lokale aanwezigheid. Het register heeft geen eigen waarnemingsperiode en omvat NDFF, provinciale PQ, Vangblik, SOVON/AVIMAP, de zes externe datasets en aanvullende referentiecatalogi. Meetperioden en toelatingsvoorwaarden blijven die van de afzonderlijke bronnen hieronder.</w:t>
       </w:r>
     </w:p>
     <w:p>
@@ -1719,7 +1719,7 @@
           <w:b/>
           <w:bCs/>
         </w:rPr>
-        <w:t xml:space="preserve">Controlejaar 2007, verwerkt tot een bronbesluit.</w:t>
+        <w:t xml:space="preserve">Controlejaar 2007, afgerond.</w:t>
       </w:r>
       <w:r>
         <w:t xml:space="preserve"> </w:t>
@@ -1752,7 +1752,22 @@
         <w:t xml:space="preserve"> </w:t>
       </w:r>
       <w:r>
-        <w:t xml:space="preserve">opgenomen; 1.831 lege cellen niet. Het bezoektotalenbestand bevat 249 positieve zoogdierregels. Daarvan waren 101 al gelijk. Er zijn 137 aanvullende regels met samen 649 dieren op 75 bezoeken opgenomen zonder nulafleiding. Elf verschillen tussen positieve SOVON- en positieve NDFF-telwaarden wachten op een bronbesluit. Voor M6 vermeldt de download teller</w:t>
+        <w:t xml:space="preserve">opgenomen; 1.831 lege cellen niet. Het bezoektotalenbestand bevat 249 positieve zoogdierregels. Daarvan waren 101 al gelijk. Onder</w:t>
+      </w:r>
+      <w:r>
+        <w:t xml:space="preserve"> </w:t>
+      </w:r>
+      <w:r>
+        <w:rPr>
+          <w:rStyle w:val="VerbatimChar"/>
+        </w:rPr>
+        <w:t xml:space="preserve">sovon-bmp-jaarbestanden-v1</w:t>
+      </w:r>
+      <w:r>
+        <w:t xml:space="preserve"> </w:t>
+      </w:r>
+      <w:r>
+        <w:t xml:space="preserve">staan 148 aanvullende regels met 692 dieren op 84 bezoeken, inclusief de elf afwijkende SOVON-bezoektotalen. Het historische NDFF-auditspoor blijft bestaan; SOVON is bij gecombineerd gebruik leidend en beide waarden worden niet opgeteld. Voor M6 vermeldt de download teller</w:t>
       </w:r>
       <w:r>
         <w:t xml:space="preserve"> </w:t>
@@ -1799,6 +1814,99 @@
         <w:pStyle w:val="BodyText"/>
       </w:pPr>
       <w:r>
+        <w:rPr>
+          <w:b/>
+          <w:bCs/>
+        </w:rPr>
+        <w:t xml:space="preserve">Controlejaren 2008-2022, afgerond tot het eerstvolgende conflict.</w:t>
+      </w:r>
+      <w:r>
+        <w:t xml:space="preserve"> </w:t>
+      </w:r>
+      <w:r>
+        <w:t xml:space="preserve">De vijftien downloads bevatten 6.306 in-scope bezoeken. Zij staan alle al in</w:t>
+      </w:r>
+      <w:r>
+        <w:t xml:space="preserve"> </w:t>
+      </w:r>
+      <w:r>
+        <w:rPr>
+          <w:rStyle w:val="VerbatimChar"/>
+        </w:rPr>
+        <w:t xml:space="preserve">dagbezoeken_bmp</w:t>
+      </w:r>
+      <w:r>
+        <w:t xml:space="preserve">; bij 154 bezoeken verschilt uitsluitend afsluitende witruimte in</w:t>
+      </w:r>
+      <w:r>
+        <w:t xml:space="preserve"> </w:t>
+      </w:r>
+      <w:r>
+        <w:rPr>
+          <w:rStyle w:val="VerbatimChar"/>
+        </w:rPr>
+        <w:t xml:space="preserve">opmerking</w:t>
+      </w:r>
+      <w:r>
+        <w:t xml:space="preserve">, zodat geen bezoek is gewijzigd. Aan</w:t>
+      </w:r>
+      <w:r>
+        <w:t xml:space="preserve"> </w:t>
+      </w:r>
+      <w:r>
+        <w:rPr>
+          <w:rStyle w:val="VerbatimChar"/>
+        </w:rPr>
+        <w:t xml:space="preserve">territoria</w:t>
+      </w:r>
+      <w:r>
+        <w:t xml:space="preserve"> </w:t>
+      </w:r>
+      <w:r>
+        <w:t xml:space="preserve">zijn 37.213 letterlijke, niet-conflicterende SOVON-nullen toegevoegd. Lege cellen zijn niet ingevoerd. Bestaande Meijendelwaarden die in de download ontbreken zijn behouden. De 81 positieve downloadwaarden uit 2022 voor M105, M71 en M36 staan al met exact dezelfde aantallen onder</w:t>
+      </w:r>
+      <w:r>
+        <w:t xml:space="preserve"> </w:t>
+      </w:r>
+      <w:r>
+        <w:rPr>
+          <w:rStyle w:val="VerbatimChar"/>
+        </w:rPr>
+        <w:t xml:space="preserve">jrvslg_m</w:t>
+      </w:r>
+      <w:r>
+        <w:t xml:space="preserve">; een tweede SOVON-kopie is daarom niet gemaakt. Voor 2008-2022 staan 3.929 aanvullende positieve zoogdierregels op 2.334 bezoeken onder</w:t>
+      </w:r>
+      <w:r>
+        <w:t xml:space="preserve"> </w:t>
+      </w:r>
+      <w:r>
+        <w:rPr>
+          <w:rStyle w:val="VerbatimChar"/>
+        </w:rPr>
+        <w:t xml:space="preserve">sovon-bmp-jaarbestanden-v1</w:t>
+      </w:r>
+      <w:r>
+        <w:t xml:space="preserve">. Alle bronwaarden zijn na invoer gelijk aan de downloads; er zijn geen zoogdiernullen afgeleid. De verwerking is vóór 2023 gepauzeerd: voor M53/Zwarte Kraai bevat de nieuwe SOVON-matrix nul, terwijl de levende</w:t>
+      </w:r>
+      <w:r>
+        <w:t xml:space="preserve"> </w:t>
+      </w:r>
+      <w:r>
+        <w:rPr>
+          <w:rStyle w:val="VerbatimChar"/>
+        </w:rPr>
+        <w:t xml:space="preserve">sovon_m</w:t>
+      </w:r>
+      <w:r>
+        <w:t xml:space="preserve">-regel en Bijlage 2 van het vogelwerkgroepverslag beide één territorium bevatten.</w:t>
+      </w:r>
+    </w:p>
+    <w:p>
+      <w:pPr>
+        <w:pStyle w:val="BodyText"/>
+      </w:pPr>
+      <w:r>
         <w:t xml:space="preserve">Vanaf 3 oktober 2026 geldt als hoofdregel dat alle werkelijk aanvullende SOVON-gegevens in de bestaande Meijendel-kerntabellen mogen worden opgenomen. Bestaande Meijendelgegevens blijven staan wanneer zij in de download ontbreken. Alleen een afzonderlijke conflictregel kan daarvan afwijken. Een aanwezige regel uit</w:t>
       </w:r>
       <w:r>
@@ -1884,7 +1992,7 @@
         <w:t xml:space="preserve"> </w:t>
       </w:r>
       <w:r>
-        <w:t xml:space="preserve">bevat na de niet-conflicterende verwerking tot en met 2007 112.709 regels uit 1958-2025.</w:t>
+        <w:t xml:space="preserve">bevat na de niet-conflicterende verwerking tot en met 2022 149.922 regels uit 1958-2025. Daarvan zijn 126.337 SOVON-regels uit 1984-2022: 47.428 positieve waarden en 78.909 letterlijke nullen.</w:t>
       </w:r>
       <w:r>
         <w:t xml:space="preserve"> </w:t>
@@ -1899,7 +2007,7 @@
         <w:t xml:space="preserve"> </w:t>
       </w:r>
       <w:r>
-        <w:t xml:space="preserve">bevat voor 1984-2007 alle 6.782 in-scope SOVON-bezoeken uit de downloads al ongewijzigd. De download is dus geen tweede in te voeren gegevenslaag: per jaar wordt hij met de bestaande kerntabellen vergeleken en alleen een vastgesteld, besloten aanvullend gegeven leidt tot een wijziging.</w:t>
+        <w:t xml:space="preserve">bevat voor 1984-2022 alle 13.088 in-scope SOVON-bezoeken uit de downloads al ongewijzigd. De download is dus geen tweede in te voeren gegevenslaag: per jaar wordt hij met de bestaande kerntabellen vergeleken en alleen een vastgesteld, besloten aanvullend gegeven leidt tot een wijziging.</w:t>
       </w:r>
     </w:p>
     <w:p>
@@ -2335,7 +2443,7 @@
           <w:b/>
           <w:bCs/>
         </w:rPr>
-        <w:t xml:space="preserve">Natura 2000-analysescope vogelplots, vastgesteld 1 oktober 2026 en bijgewerkt na de controle van 2007.</w:t>
+        <w:t xml:space="preserve">Natura 2000-analysescope vogelplots, vastgesteld 1 oktober 2026 en bijgewerkt na de controle tot en met 2022.</w:t>
       </w:r>
       <w:r>
         <w:t xml:space="preserve"> </w:t>
@@ -2356,7 +2464,7 @@
         <w:t xml:space="preserve"> </w:t>
       </w:r>
       <w:r>
-        <w:t xml:space="preserve">bevat 112.709 regels, 54 plots en 2.168 plotjaren uit 1958–2025. M66 (Haagsche Golf Club,</w:t>
+        <w:t xml:space="preserve">bevat 149.922 regels, 54 plots en 2.168 plotjaren uit 1958–2025. M66 (Haagsche Golf Club,</w:t>
       </w:r>
       <w:r>
         <w:t xml:space="preserve"> </w:t>
@@ -2368,7 +2476,7 @@
         <w:t xml:space="preserve">plot_id = 3503</w:t>
       </w:r>
       <w:r>
-        <w:t xml:space="preserve">) bevat daarin 3.182 regels en 10.420 territoria in 39 jaren uit 1985–2025. M91 (Voorlinden,</w:t>
+        <w:t xml:space="preserve">) bevat daarin 4.128 regels en 10.420 territoria in 39 jaren uit 1985–2025. M91 (Voorlinden,</w:t>
       </w:r>
       <w:r>
         <w:t xml:space="preserve"> </w:t>
@@ -2380,7 +2488,7 @@
         <w:t xml:space="preserve">plot_id = 3514</w:t>
       </w:r>
       <w:r>
-        <w:t xml:space="preserve">) bevat 928 regels en 4.672 territoria in 18 jaren uit 1993–2021. Beide plots blijven als geldige brondata bewaard, maar hebben in</w:t>
+        <w:t xml:space="preserve">) bevat 1.674 regels en 4.672 territoria in 18 jaren uit 1993–2021. Beide plots blijven als geldige brondata bewaard, maar hebben in</w:t>
       </w:r>
       <w:r>
         <w:t xml:space="preserve"> </w:t>
@@ -2455,7 +2563,7 @@
         <w:t xml:space="preserve"> </w:t>
       </w:r>
       <w:r>
-        <w:t xml:space="preserve">bevat daardoor 108.599 territoriumregels, 52 plots en 2.111 plotjaren uit 1958–2025. Repositoryberekeningen gebruiken deze scope standaard en nemen M66 en/of M91 alleen mee na een uitdrukkelijke keuze van de gebruiker.</w:t>
+        <w:t xml:space="preserve">bevat daardoor 144.120 territoriumregels, 52 plots en 2.111 plotjaren uit 1958–2025. Repositoryberekeningen gebruiken deze scope standaard en nemen M66 en/of M91 alleen mee na een uitdrukkelijke keuze van de gebruiker.</w:t>
       </w:r>
       <w:r>
         <w:t xml:space="preserve"> </w:t>
@@ -2664,7 +2772,7 @@
           <w:b/>
           <w:bCs/>
         </w:rPr>
-        <w:t xml:space="preserve">Aanvullende bezoektotalen 2005–2007, 3 oktober 2026.</w:t>
+        <w:t xml:space="preserve">Aanvullende bezoektotalen 2005–2022, 3 oktober 2026.</w:t>
       </w:r>
       <w:r>
         <w:t xml:space="preserve"> </w:t>
@@ -2727,7 +2835,7 @@
         <w:t xml:space="preserve"> </w:t>
       </w:r>
       <w:r>
-        <w:t xml:space="preserve">staan nu 341 aanvullende bezoek-taxoncellen met samen 1.456 dieren: 81 regels op 46 bezoeken uit 2005, 123 regels op 72 bezoeken uit 2006 en 137 regels op 75 bezoeken uit 2007. De negen betrokken taxa zijn via versiegebonden koppelingen centraal bereikbaar. Gelijke bronwaarden zijn niet gedupliceerd. De twee positieve verschillen uit 2005 en acht uit 2006 staan met afzonderlijke herkomst naast het NDFF-auditspoor en gebruiken SOVON als leidende waarde; elf positieve verschillen uit 2007 wachten op een bronbesluit. Deze bezoekaggregaten blijven afzonderlijk van de 19.877 individuele SOVON/AVIMAP-waarnemingen hierboven.</w:t>
+        <w:t xml:space="preserve">staan nu 4.281 aanvullende bezoek-taxoncellen op 2.536 bezoeken, met 16.221 dieren binnen en 370 buiten het plot. De 22 betrokken brontaxa zijn via versiegebonden koppelingen centraal bereikbaar; de routes blijven kandidaat/onbekend en leggen geen onbewezen conceptgelijkheid vast. Gelijke bronwaarden zijn niet gedupliceerd. Afwijkende positieve SOVON-bezoektotalen staan met afzonderlijke herkomst naast het NDFF-auditspoor; SOVON is bij gecombineerd gebruik leidend en beide lagen worden nooit opgeteld. Deze bezoekaggregaten blijven afzonderlijk van de 19.877 individuele SOVON/AVIMAP-waarnemingen hierboven.</w:t>
       </w:r>
     </w:p>
     <w:p>

</xml_diff>

<commit_message>
Rond SOVON-jaarcontrole tot 2025 af
</commit_message>
<xml_diff>
--- a/docs/MEIJENDEL_BRONREGISTER.docx
+++ b/docs/MEIJENDEL_BRONREGISTER.docx
@@ -1818,7 +1818,7 @@
           <w:b/>
           <w:bCs/>
         </w:rPr>
-        <w:t xml:space="preserve">Controlejaren 2008-2022, afgerond tot het eerstvolgende conflict.</w:t>
+        <w:t xml:space="preserve">Controlejaren 2008-2022, afgerond.</w:t>
       </w:r>
       <w:r>
         <w:t xml:space="preserve"> </w:t>
@@ -1887,7 +1887,184 @@
         <w:t xml:space="preserve">sovon-bmp-jaarbestanden-v1</w:t>
       </w:r>
       <w:r>
-        <w:t xml:space="preserve">. Alle bronwaarden zijn na invoer gelijk aan de downloads; er zijn geen zoogdiernullen afgeleid. De verwerking is vóór 2023 gepauzeerd: voor M53/Zwarte Kraai bevat de nieuwe SOVON-matrix nul, terwijl de levende</w:t>
+        <w:t xml:space="preserve">. Alle bronwaarden zijn na invoer gelijk aan de downloads; er zijn geen zoogdiernullen afgeleid.</w:t>
+      </w:r>
+    </w:p>
+    <w:p>
+      <w:pPr>
+        <w:pStyle w:val="BodyText"/>
+      </w:pPr>
+      <w:r>
+        <w:rPr>
+          <w:b/>
+          <w:bCs/>
+        </w:rPr>
+        <w:t xml:space="preserve">Controlejaren 2023-2025, afgerond.</w:t>
+      </w:r>
+      <w:r>
+        <w:t xml:space="preserve"> </w:t>
+      </w:r>
+      <w:r>
+        <w:t xml:space="preserve">De drie downloads bevatten 1.367 in-scope bezoeken. Zij staan alle al in</w:t>
+      </w:r>
+      <w:r>
+        <w:t xml:space="preserve"> </w:t>
+      </w:r>
+      <w:r>
+        <w:rPr>
+          <w:rStyle w:val="VerbatimChar"/>
+        </w:rPr>
+        <w:t xml:space="preserve">dagbezoeken_bmp</w:t>
+      </w:r>
+      <w:r>
+        <w:t xml:space="preserve">; bij 24 bezoeken verschilt uitsluitend afsluitende witruimte in</w:t>
+      </w:r>
+      <w:r>
+        <w:t xml:space="preserve"> </w:t>
+      </w:r>
+      <w:r>
+        <w:rPr>
+          <w:rStyle w:val="VerbatimChar"/>
+        </w:rPr>
+        <w:t xml:space="preserve">opmerking</w:t>
+      </w:r>
+      <w:r>
+        <w:t xml:space="preserve">. Aan</w:t>
+      </w:r>
+      <w:r>
+        <w:t xml:space="preserve"> </w:t>
+      </w:r>
+      <w:r>
+        <w:rPr>
+          <w:rStyle w:val="VerbatimChar"/>
+        </w:rPr>
+        <w:t xml:space="preserve">territoria</w:t>
+      </w:r>
+      <w:r>
+        <w:t xml:space="preserve"> </w:t>
+      </w:r>
+      <w:r>
+        <w:t xml:space="preserve">zijn 8.012 nieuwe letterlijke nulregels toegevoegd. M53/Zwarte Kraai 2023 is na afzonderlijk akkoord van één naar nul gecorrigeerd: de kavelmatrix levert nul en het enige territoriumpunt, met aantal 1 en broedcode 2, heeft</w:t>
+      </w:r>
+      <w:r>
+        <w:t xml:space="preserve"> </w:t>
+      </w:r>
+      <w:r>
+        <w:rPr>
+          <w:rStyle w:val="VerbatimChar"/>
+        </w:rPr>
+        <w:t xml:space="preserve">inplot = 0</w:t>
+      </w:r>
+      <w:r>
+        <w:t xml:space="preserve">. Het punt blijft als bron- en auditgegeven behouden. M75 in 2024 en M51 in 2025 hebben bezoeken en positieve databasewaarden, maar uitsluitend lege SOVON-matrixcellen; de bestaande 27 waarden per kavel zijn daarom ongemoeid gelaten. M84s in 2025 heeft eveneens bezoeken en een volledig lege matrix; daaruit is niets afgeleid. Voor 2023-2025 zijn 1.171 aanvullende positieve zoogdierregels op 886 bezoeken toegevoegd, inclusief buiten-plotwaarden; geen zoogdiernullen zijn afgeleid. Het verslag 2024 koppelt M75 aan Patricia van Veen. De bestaande code</w:t>
+      </w:r>
+      <w:r>
+        <w:t xml:space="preserve"> </w:t>
+      </w:r>
+      <w:r>
+        <w:rPr>
+          <w:rStyle w:val="VerbatimChar"/>
+        </w:rPr>
+        <w:t xml:space="preserve">ANBN01</w:t>
+      </w:r>
+      <w:r>
+        <w:t xml:space="preserve"> </w:t>
+      </w:r>
+      <w:r>
+        <w:t xml:space="preserve">is daarom voor M75/2024 toegevoegd. Voor M51/2025 blijft de teller leeg: er is geen lokaal jaarverslag 2025 en de exportcode geldt niet zelfstandig als tellerbewijs.</w:t>
+      </w:r>
+    </w:p>
+    <w:p>
+      <w:pPr>
+        <w:pStyle w:val="BodyText"/>
+      </w:pPr>
+      <w:r>
+        <w:t xml:space="preserve">Vanaf 3 oktober 2026 geldt als hoofdregel dat alle werkelijk aanvullende SOVON-gegevens in de bestaande Meijendel-kerntabellen mogen worden opgenomen. Bestaande Meijendelgegevens blijven staan wanneer zij in de download ontbreken. Alleen een afzonderlijke conflictregel kan daarvan afwijken. Een aanwezige regel uit</w:t>
+      </w:r>
+      <w:r>
+        <w:t xml:space="preserve"> </w:t>
+      </w:r>
+      <w:r>
+        <w:rPr>
+          <w:rStyle w:val="VerbatimChar"/>
+        </w:rPr>
+        <w:t xml:space="preserve">meeuwen_literatuur</w:t>
+      </w:r>
+      <w:r>
+        <w:t xml:space="preserve"> </w:t>
+      </w:r>
+      <w:r>
+        <w:t xml:space="preserve">blijft voor meeuwen leidend; zonder zo’n regel mag de SOVON-waarde aanvullen of corrigeren. Een ontbrekende teller mag vanuit het jaarverslag worden toegevoegd wanneer kavel en waarnemer ondubbelzinnig zijn en een bestaande code beschikbaar is. De Horsten wordt volledig genegeerd. Niet-conflicterende letterlijke SOVON-nullen worden zonder nieuwe jaarbeslissing opgenomen; niet tot individuele bronregels herleidbare aggregaatvermeldingen worden niet als formeel afgekeurde waarnemingen gereconstrueerd. Ieder jaar wordt eerst volledig vergeleken. Nieuwe soortenconflicten, nieuwe gegevensmodellen en wel individueel herleidbare afkeuringsinformatie blijven afzonderlijke beslispunten.</w:t>
+      </w:r>
+    </w:p>
+    <w:p>
+      <w:pPr>
+        <w:pStyle w:val="BodyText"/>
+      </w:pPr>
+      <w:r>
+        <w:t xml:space="preserve">De data-eigenaar heeft op 2 oktober 2026 besloten de actuele officiële SOVON BMP-A-soortenlijst vanaf 1984 toe te passen. Lijstversie</w:t>
+      </w:r>
+      <w:r>
+        <w:t xml:space="preserve"> </w:t>
+      </w:r>
+      <w:r>
+        <w:rPr>
+          <w:rStyle w:val="VerbatimChar"/>
+        </w:rPr>
+        <w:t xml:space="preserve">sovon-bmp-a-actueel-retroactief-vanaf-1984-v1</w:t>
+      </w:r>
+      <w:r>
+        <w:t xml:space="preserve"> </w:t>
+      </w:r>
+      <w:r>
+        <w:t xml:space="preserve">gebruikt het officiële PDF-bestand met SHA-256</w:t>
+      </w:r>
+      <w:r>
+        <w:t xml:space="preserve"> </w:t>
+      </w:r>
+      <w:r>
+        <w:rPr>
+          <w:rStyle w:val="VerbatimChar"/>
+        </w:rPr>
+        <w:t xml:space="preserve">3af7adf5febb2164d554246882ead82d93efd9bb505b8c195fc842e09fa67b39</w:t>
+      </w:r>
+      <w:r>
+        <w:t xml:space="preserve">. De volledige lijst bevat 264 officiële namen. Daarvan zijn 240 op exacte naam en negen via een vastgelegde naamvariant gekoppeld aan het centrale taxonregister. Vijftien officiële lijstnamen blijven uitsluitend als lijstmetadata bewaard, omdat geen verantwoorde centrale identiteit kon worden vastgesteld; zij zijn dus geen waarnemingsregels. Zestien historische matrixcategorieën die niet op de actuele lijst staan, zijn als expliciet uitgesloten bewaard. De retroactieve BMP-A-toepassing is geen taxonomische conceptfusie.</w:t>
+      </w:r>
+    </w:p>
+    <w:p>
+      <w:pPr>
+        <w:pStyle w:val="BodyText"/>
+      </w:pPr>
+      <w:r>
+        <w:t xml:space="preserve">De aanvankelijk aangelegde ontvangsttabellen met kopieën van bezoeken en resultaten zijn op 2 oktober 2026 verwijderd. Over blijven vijf</w:t>
+      </w:r>
+      <w:r>
+        <w:t xml:space="preserve"> </w:t>
+      </w:r>
+      <w:r>
+        <w:rPr>
+          <w:rStyle w:val="VerbatimChar"/>
+        </w:rPr>
+        <w:t xml:space="preserve">sovon_bmp_*</w:t>
+      </w:r>
+      <w:r>
+        <w:t xml:space="preserve">-tabellen met uitsluitend niet elders aanwezige vergelijkingsmetadata: jaarlevering, plotjaarvoorwaarden, tellercodes, soortenlijstversie en soortenlijstnamen. Na afronding van de jaarvergelijking 1984-2025 bevat</w:t>
+      </w:r>
+      <w:r>
+        <w:t xml:space="preserve"> </w:t>
+      </w:r>
+      <w:r>
+        <w:rPr>
+          <w:rStyle w:val="VerbatimChar"/>
+        </w:rPr>
+        <w:t xml:space="preserve">territoria</w:t>
+      </w:r>
+      <w:r>
+        <w:t xml:space="preserve"> </w:t>
+      </w:r>
+      <w:r>
+        <w:t xml:space="preserve">157.934 regels uit 1958-2025. Daarvan zijn 139.271 regels uit bron</w:t>
       </w:r>
       <w:r>
         <w:t xml:space="preserve"> </w:t>
@@ -1899,85 +2076,48 @@
         <w:t xml:space="preserve">sovon_m</w:t>
       </w:r>
       <w:r>
-        <w:t xml:space="preserve">-regel en Bijlage 2 van het vogelwerkgroepverslag beide één territorium bevatten.</w:t>
-      </w:r>
-    </w:p>
-    <w:p>
-      <w:pPr>
-        <w:pStyle w:val="BodyText"/>
-      </w:pPr>
-      <w:r>
-        <w:t xml:space="preserve">Vanaf 3 oktober 2026 geldt als hoofdregel dat alle werkelijk aanvullende SOVON-gegevens in de bestaande Meijendel-kerntabellen mogen worden opgenomen. Bestaande Meijendelgegevens blijven staan wanneer zij in de download ontbreken. Alleen een afzonderlijke conflictregel kan daarvan afwijken. Een aanwezige regel uit</w:t>
-      </w:r>
-      <w:r>
-        <w:t xml:space="preserve"> </w:t>
-      </w:r>
-      <w:r>
-        <w:rPr>
-          <w:rStyle w:val="VerbatimChar"/>
-        </w:rPr>
-        <w:t xml:space="preserve">meeuwen_literatuur</w:t>
-      </w:r>
-      <w:r>
-        <w:t xml:space="preserve"> </w:t>
-      </w:r>
-      <w:r>
-        <w:t xml:space="preserve">blijft voor meeuwen leidend; zonder zo’n regel mag de SOVON-waarde aanvullen of corrigeren. Een ontbrekende teller mag vanuit het jaarverslag worden toegevoegd wanneer kavel en waarnemer ondubbelzinnig zijn en een bestaande code beschikbaar is. De Horsten wordt volledig genegeerd. Niet-conflicterende letterlijke SOVON-nullen worden zonder nieuwe jaarbeslissing opgenomen; niet tot individuele bronregels herleidbare aggregaatvermeldingen worden niet als formeel afgekeurde waarnemingen gereconstrueerd. Ieder jaar wordt eerst volledig vergeleken. Nieuwe soortenconflicten, nieuwe gegevensmodellen en wel individueel herleidbare afkeuringsinformatie blijven afzonderlijke beslispunten.</w:t>
-      </w:r>
-    </w:p>
-    <w:p>
-      <w:pPr>
-        <w:pStyle w:val="BodyText"/>
-      </w:pPr>
-      <w:r>
-        <w:t xml:space="preserve">De data-eigenaar heeft op 2 oktober 2026 besloten de actuele officiële SOVON BMP-A-soortenlijst vanaf 1984 toe te passen. Lijstversie</w:t>
-      </w:r>
-      <w:r>
-        <w:t xml:space="preserve"> </w:t>
-      </w:r>
-      <w:r>
-        <w:rPr>
-          <w:rStyle w:val="VerbatimChar"/>
-        </w:rPr>
-        <w:t xml:space="preserve">sovon-bmp-a-actueel-retroactief-vanaf-1984-v1</w:t>
-      </w:r>
-      <w:r>
-        <w:t xml:space="preserve"> </w:t>
-      </w:r>
-      <w:r>
-        <w:t xml:space="preserve">gebruikt het officiële PDF-bestand met SHA-256</w:t>
-      </w:r>
-      <w:r>
-        <w:t xml:space="preserve"> </w:t>
-      </w:r>
-      <w:r>
-        <w:rPr>
-          <w:rStyle w:val="VerbatimChar"/>
-        </w:rPr>
-        <w:t xml:space="preserve">3af7adf5febb2164d554246882ead82d93efd9bb505b8c195fc842e09fa67b39</w:t>
-      </w:r>
-      <w:r>
-        <w:t xml:space="preserve">. De volledige lijst bevat 264 officiële namen. Daarvan zijn 240 op exacte naam en negen via een vastgelegde naamvariant gekoppeld aan het centrale taxonregister. Vijftien officiële lijstnamen blijven uitsluitend als lijstmetadata bewaard, omdat geen verantwoorde centrale identiteit kon worden vastgesteld; zij zijn dus geen waarnemingsregels. Zestien historische matrixcategorieën die niet op de actuele lijst staan, zijn als expliciet uitgesloten bewaard. De retroactieve BMP-A-toepassing is geen taxonomische conceptfusie.</w:t>
-      </w:r>
-    </w:p>
-    <w:p>
-      <w:pPr>
-        <w:pStyle w:val="BodyText"/>
-      </w:pPr>
-      <w:r>
-        <w:t xml:space="preserve">De aanvankelijk aangelegde ontvangsttabellen met kopieën van bezoeken en resultaten zijn op 2 oktober 2026 verwijderd. Over blijven vijf</w:t>
-      </w:r>
-      <w:r>
-        <w:t xml:space="preserve"> </w:t>
-      </w:r>
-      <w:r>
-        <w:rPr>
-          <w:rStyle w:val="VerbatimChar"/>
-        </w:rPr>
-        <w:t xml:space="preserve">sovon_bmp_*</w:t>
-      </w:r>
-      <w:r>
-        <w:t xml:space="preserve">-tabellen met uitsluitend niet elders aanwezige vergelijkingsmetadata: jaarlevering, plotjaarvoorwaarden, tellercodes, soortenlijstversie en soortenlijstnamen.</w:t>
+        <w:t xml:space="preserve"> </w:t>
+      </w:r>
+      <w:r>
+        <w:t xml:space="preserve">in 1984-2025: 52.349 positieve waarden en 86.922 letterlijke nullen.</w:t>
+      </w:r>
+      <w:r>
+        <w:t xml:space="preserve"> </w:t>
+      </w:r>
+      <w:r>
+        <w:rPr>
+          <w:rStyle w:val="VerbatimChar"/>
+        </w:rPr>
+        <w:t xml:space="preserve">dagbezoeken_bmp</w:t>
+      </w:r>
+      <w:r>
+        <w:t xml:space="preserve"> </w:t>
+      </w:r>
+      <w:r>
+        <w:t xml:space="preserve">bevat voor 1984-2025 alle 14.455 in-scope SOVON-bezoeken uit de downloads. De download is dus geen tweede in te voeren gegevenslaag: per jaar is hij met de bestaande kerntabellen vergeleken en alleen een vastgesteld, besloten aanvullend gegeven heeft tot een wijziging geleid.</w:t>
+      </w:r>
+      <w:r>
+        <w:t xml:space="preserve"> </w:t>
+      </w:r>
+      <w:r>
+        <w:rPr>
+          <w:rStyle w:val="VerbatimChar"/>
+        </w:rPr>
+        <w:t xml:space="preserve">Meijendel.sql</w:t>
+      </w:r>
+      <w:r>
+        <w:t xml:space="preserve"> </w:t>
+      </w:r>
+      <w:r>
+        <w:t xml:space="preserve">en afgeleide caches worden pas vernieuwd na de afzonderlijke controle op formeel afgekeurde tellingen.</w:t>
+      </w:r>
+    </w:p>
+    <w:p>
+      <w:pPr>
+        <w:pStyle w:val="BodyText"/>
+      </w:pPr>
+      <w:r>
+        <w:t xml:space="preserve">De 860 ingevoerde nullen zijn uitsluitend letterlijke nulcellen uit de SOVON-matrix. Op 3 oktober 2026 is besloten dat</w:t>
       </w:r>
       <w:r>
         <w:t xml:space="preserve"> </w:t>
@@ -1992,30 +2132,7 @@
         <w:t xml:space="preserve"> </w:t>
       </w:r>
       <w:r>
-        <w:t xml:space="preserve">bevat na de niet-conflicterende verwerking tot en met 2022 149.922 regels uit 1958-2025. Daarvan zijn 126.337 SOVON-regels uit 1984-2022: 47.428 positieve waarden en 78.909 letterlijke nullen.</w:t>
-      </w:r>
-      <w:r>
-        <w:t xml:space="preserve"> </w:t>
-      </w:r>
-      <w:r>
-        <w:rPr>
-          <w:rStyle w:val="VerbatimChar"/>
-        </w:rPr>
-        <w:t xml:space="preserve">dagbezoeken_bmp</w:t>
-      </w:r>
-      <w:r>
-        <w:t xml:space="preserve"> </w:t>
-      </w:r>
-      <w:r>
-        <w:t xml:space="preserve">bevat voor 1984-2022 alle 13.088 in-scope SOVON-bezoeken uit de downloads al ongewijzigd. De download is dus geen tweede in te voeren gegevenslaag: per jaar wordt hij met de bestaande kerntabellen vergeleken en alleen een vastgesteld, besloten aanvullend gegeven leidt tot een wijziging.</w:t>
-      </w:r>
-    </w:p>
-    <w:p>
-      <w:pPr>
-        <w:pStyle w:val="BodyText"/>
-      </w:pPr>
-      <w:r>
-        <w:t xml:space="preserve">De 860 ingevoerde nullen zijn uitsluitend letterlijke nulcellen uit de SOVON-matrix. Op 3 oktober 2026 is besloten dat</w:t>
+        <w:t xml:space="preserve">alleen werkelijk door de bron geleverde territoriumwaarden bevat; afgeleide gegevens worden niet in deze tabel opgenomen. Voor de 249 centraal gekoppelde officiële BMP-A-lijstsoorten en de 15 plotjaren met resultaten zijn 3.735 plot-soortcombinaties mogelijk; 2.338 daarvan ontbreken geheel uit de matrix en blijven buiten</w:t>
       </w:r>
       <w:r>
         <w:t xml:space="preserve"> </w:t>
@@ -2027,10 +2144,7 @@
         <w:t xml:space="preserve">territoria</w:t>
       </w:r>
       <w:r>
-        <w:t xml:space="preserve"> </w:t>
-      </w:r>
-      <w:r>
-        <w:t xml:space="preserve">alleen werkelijk door de bron geleverde territoriumwaarden bevat; afgeleide gegevens worden niet in deze tabel opgenomen. Voor de 249 centraal gekoppelde officiële BMP-A-lijstsoorten en de 15 plotjaren met resultaten zijn 3.735 plot-soortcombinaties mogelijk; 2.338 daarvan ontbreken geheel uit de matrix en blijven buiten</w:t>
+        <w:t xml:space="preserve">. Ook de 225 ontbrekende combinaties van de 15 nog niet centraal gekoppelde officiële lijstnamen en de 15 plotjaren blijven buiten</w:t>
       </w:r>
       <w:r>
         <w:t xml:space="preserve"> </w:t>
@@ -2042,7 +2156,7 @@
         <w:t xml:space="preserve">territoria</w:t>
       </w:r>
       <w:r>
-        <w:t xml:space="preserve">. Ook de 225 ontbrekende combinaties van de 15 nog niet centraal gekoppelde officiële lijstnamen en de 15 plotjaren blijven buiten</w:t>
+        <w:t xml:space="preserve">. BMP-type, volledigheid, soortenlijst en overige protocolmetadata kunnen dus wel worden gebruikt voor controle en analyse, maar nooit om in</w:t>
       </w:r>
       <w:r>
         <w:t xml:space="preserve"> </w:t>
@@ -2054,18 +2168,6 @@
         <w:t xml:space="preserve">territoria</w:t>
       </w:r>
       <w:r>
-        <w:t xml:space="preserve">. BMP-type, volledigheid, soortenlijst en overige protocolmetadata kunnen dus wel worden gebruikt voor controle en analyse, maar nooit om in</w:t>
-      </w:r>
-      <w:r>
-        <w:t xml:space="preserve"> </w:t>
-      </w:r>
-      <w:r>
-        <w:rPr>
-          <w:rStyle w:val="VerbatimChar"/>
-        </w:rPr>
-        <w:t xml:space="preserve">territoria</w:t>
-      </w:r>
-      <w:r>
         <w:t xml:space="preserve"> </w:t>
       </w:r>
       <w:r>
@@ -2299,7 +2401,19 @@
         <w:t xml:space="preserve"> </w:t>
       </w:r>
       <w:r>
-        <w:t xml:space="preserve">3530). Op 3 oktober zijn na controle van de jaarverslagen 1985/M35–B_0042 en 1984 en 1985/M16s–A_0042 toegevoegd.</w:t>
+        <w:t xml:space="preserve">3530). Op 3 oktober zijn na controle van de jaarverslagen 1985/M35–B_0042 en 1984 en 1985/M16s–A_0042 toegevoegd. Het verslag 2024 noemt Patricia van Veen ondubbelzinnig als teller van M75; de bestaande code</w:t>
+      </w:r>
+      <w:r>
+        <w:t xml:space="preserve"> </w:t>
+      </w:r>
+      <w:r>
+        <w:rPr>
+          <w:rStyle w:val="VerbatimChar"/>
+        </w:rPr>
+        <w:t xml:space="preserve">ANBN01</w:t>
+      </w:r>
+      <w:r>
+        <w:t xml:space="preserve">, die ook in 2025 en 2026 aan M75 is gekoppeld, is daarom voor 2024 toegevoegd.</w:t>
       </w:r>
       <w:r>
         <w:t xml:space="preserve"> </w:t>
@@ -2314,7 +2428,7 @@
         <w:t xml:space="preserve"> </w:t>
       </w:r>
       <w:r>
-        <w:t xml:space="preserve">bevat daarna 2.456 regels.</w:t>
+        <w:t xml:space="preserve">bevat nu 2.458 regels.</w:t>
       </w:r>
     </w:p>
     <w:p>

</xml_diff>

<commit_message>
Pas TRIM nul- en statuspoort toe
</commit_message>
<xml_diff>
--- a/docs/MEIJENDEL_BRONREGISTER.docx
+++ b/docs/MEIJENDEL_BRONREGISTER.docx
@@ -13,14 +13,16 @@
     </w:p>
     <w:p>
       <w:pPr>
-        <w:pStyle w:val="FirstParagraph"/>
-      </w:pPr>
-      <w:r>
-        <w:rPr>
-          <w:b/>
-          <w:bCs/>
-        </w:rPr>
-        <w:t xml:space="preserve">Stand: 3 oktober 2026.</w:t>
+        <w:pStyle w:val="BodyText"/>
+      </w:pPr>
+      <w:r>
+        <w:rPr>
+          <w:b/>
+        </w:rPr>
+        <w:t>Stand: 4 oktober 2026.</w:t>
+      </w:r>
+      <w:r>
+        <w:t xml:space="preserve"> </w:t>
       </w:r>
     </w:p>
     <w:p>
@@ -834,7 +836,248 @@
         <w:pStyle w:val="BodyText"/>
       </w:pPr>
       <w:r>
-        <w:t xml:space="preserve">De 42 territoriummatrices bevatten 222.852 plot-soortregels: 52.450 positieve resultaten, 86.983 expliciete nulcellen en 83.419 lege cellen. Een lege cel geldt niet als nul. De puntlagen bevatten 22.305 bronwaarnemingen die nog niet in</w:t>
+        <w:t>De 42 territoriummatrices bevatten 222.852 plot-soortregels: 52.450 positieve resultaten, 86.983 expliciete nulcellen en 83.419 lege cellen. Een lege cel geldt niet als nul. De puntlagen bevatten 22.305 bronwaarnemingen die nog niet in dagwaarnemingen_bmp staan; omgekeerd ontbreekt geen bestaande SOVON-bron-ID in de nieuwe levering. Bij 2.629 gedeelde bron-ID's levert SOVON broedcode 0 terwijl de database NULL bevat. De downloads bevatten geen zelfstandig veld dat een telling formeel als afgekeurd markeert. Vergelijking en eventuele verrijking volgen daarom per jaar. Daarbij worden BMP-type, standaard alle soorten of een expliciete uitzondering, volledig geteld, goedgekeurd of formeel afgekeurd en de toepasselijke officiële soortenlijst afzonderlijk vastgelegd. Broedcode 0 blijft een positieve vogelwaarneming. Tellercodes worden per jaar gecontroleerd.</w:t>
+      </w:r>
+    </w:p>
+    <w:p>
+      <w:pPr>
+        <w:pStyle w:val="BodyText"/>
+      </w:pPr>
+      <w:r>
+        <w:rPr>
+          <w:b/>
+          <w:bCs/>
+        </w:rPr>
+        <w:t xml:space="preserve">Jaarcontrole 1984, 2 oktober 2026.</w:t>
+      </w:r>
+      <w:r>
+        <w:t xml:space="preserve"> </w:t>
+      </w:r>
+      <w:r>
+        <w:t xml:space="preserve">De SOVON-download bevat 230 bezoeken in 16 plots. Alle 230 bezoeken zijn inhoudelijk gelijk aan de 230 bezoeken onder bron</w:t>
+      </w:r>
+      <w:r>
+        <w:t xml:space="preserve"> </w:t>
+      </w:r>
+      <w:r>
+        <w:rPr>
+          <w:rStyle w:val="VerbatimChar"/>
+        </w:rPr>
+        <w:t xml:space="preserve">sovon_m</w:t>
+      </w:r>
+      <w:r>
+        <w:t xml:space="preserve"> </w:t>
+      </w:r>
+      <w:r>
+        <w:t xml:space="preserve">in</w:t>
+      </w:r>
+      <w:r>
+        <w:t xml:space="preserve"> </w:t>
+      </w:r>
+      <w:r>
+        <w:rPr>
+          <w:rStyle w:val="VerbatimChar"/>
+        </w:rPr>
+        <w:t xml:space="preserve">dagbezoeken_bmp</w:t>
+      </w:r>
+      <w:r>
+        <w:t xml:space="preserve">; er is daarom geen bezoek toegevoegd. Voor 15 bezochte plotjaren bevat de download 568 positieve vogelcellen met samen 7.811 territoria, 860 letterlijke nulcellen en 18 lege soortcellen. Van de 568 positieve waarden zijn 562 exact gelijk aan de bestaande SOVON-regels in</w:t>
+      </w:r>
+      <w:r>
+        <w:t xml:space="preserve"> </w:t>
+      </w:r>
+      <w:r>
+        <w:rPr>
+          <w:rStyle w:val="VerbatimChar"/>
+        </w:rPr>
+        <w:t xml:space="preserve">territoria</w:t>
+      </w:r>
+      <w:r>
+        <w:t xml:space="preserve">. De 860 letterlijke nullen zijn als regels met</w:t>
+      </w:r>
+      <w:r>
+        <w:t xml:space="preserve"> </w:t>
+      </w:r>
+      <w:r>
+        <w:rPr>
+          <w:rStyle w:val="VerbatimChar"/>
+        </w:rPr>
+        <w:t xml:space="preserve">territoria = 0</w:t>
+      </w:r>
+      <w:r>
+        <w:t xml:space="preserve"> </w:t>
+      </w:r>
+      <w:r>
+        <w:t xml:space="preserve">en SOVON als bron rechtstreeks aan</w:t>
+      </w:r>
+      <w:r>
+        <w:t xml:space="preserve"> </w:t>
+      </w:r>
+      <w:r>
+        <w:rPr>
+          <w:rStyle w:val="VerbatimChar"/>
+        </w:rPr>
+        <w:t xml:space="preserve">territoria</w:t>
+      </w:r>
+      <w:r>
+        <w:t xml:space="preserve"> </w:t>
+      </w:r>
+      <w:r>
+        <w:t xml:space="preserve">toegevoegd. De 18 cellen zijn leeg binnen plotjaren die voor andere soorten wel resultaten bevatten; zij zijn niet ingevoerd en gelden niet als nul. De 40 geselecteerde maar niet-bezochte plots met 3.497 uitsluitend lege vogelcellen zijn genegeerd.</w:t>
+      </w:r>
+    </w:p>
+    <w:p>
+      <w:pPr>
+        <w:pStyle w:val="BodyText"/>
+      </w:pPr>
+      <w:r>
+        <w:t xml:space="preserve">Voor M35 bevat de SOVON-download acht bezoeken en 49 lege vogelcellen, zonder positieve waarde of letterlijke nul. De levende database bevat dezelfde acht bezoeken onder</w:t>
+      </w:r>
+      <w:r>
+        <w:t xml:space="preserve"> </w:t>
+      </w:r>
+      <w:r>
+        <w:rPr>
+          <w:rStyle w:val="VerbatimChar"/>
+        </w:rPr>
+        <w:t xml:space="preserve">sovon_m</w:t>
+      </w:r>
+      <w:r>
+        <w:t xml:space="preserve">, geen territoriumregel onder</w:t>
+      </w:r>
+      <w:r>
+        <w:t xml:space="preserve"> </w:t>
+      </w:r>
+      <w:r>
+        <w:rPr>
+          <w:rStyle w:val="VerbatimChar"/>
+        </w:rPr>
+        <w:t xml:space="preserve">sovon_m</w:t>
+      </w:r>
+      <w:r>
+        <w:t xml:space="preserve">, en 13 afzonderlijke regels met samen 106 territoria onder</w:t>
+      </w:r>
+      <w:r>
+        <w:t xml:space="preserve"> </w:t>
+      </w:r>
+      <w:r>
+        <w:rPr>
+          <w:rStyle w:val="VerbatimChar"/>
+        </w:rPr>
+        <w:t xml:space="preserve">jrvslg_m</w:t>
+      </w:r>
+      <w:r>
+        <w:t xml:space="preserve">. Het verslag over 1983-1985 stelt dat de resultatentabel 1984 uitsluitend BMP-getelde kavels omvat. Kavel 35 staat in de bezettingslijst bij J. Bosland en heeft resultaten in die tabel. De lege SOVON-cellen betekenen dus niet dat M35 niet is geteld en zijn geen nullen; de SOVON-resultaten ontbreken. De jaarverslagregels blijven buiten deze SOVON-verwerking. De zes overige positieve verschillen zijn meeuwenwaarden voor M7, M8, M4-5 en M16s. Zij zijn niet als SOVON-regel toegevoegd, omdat</w:t>
+      </w:r>
+      <w:r>
+        <w:t xml:space="preserve"> </w:t>
+      </w:r>
+      <w:r>
+        <w:rPr>
+          <w:rStyle w:val="VerbatimChar"/>
+        </w:rPr>
+        <w:t xml:space="preserve">meeuwen_literatuur</w:t>
+      </w:r>
+      <w:r>
+        <w:t xml:space="preserve"> </w:t>
+      </w:r>
+      <w:r>
+        <w:t xml:space="preserve">voor deze zes plot-soortcombinaties leidend blijft in</w:t>
+      </w:r>
+      <w:r>
+        <w:t xml:space="preserve"> </w:t>
+      </w:r>
+      <w:r>
+        <w:rPr>
+          <w:rStyle w:val="VerbatimChar"/>
+        </w:rPr>
+        <w:t xml:space="preserve">territoria</w:t>
+      </w:r>
+      <w:r>
+        <w:t xml:space="preserve">.</w:t>
+      </w:r>
+    </w:p>
+    <w:p>
+      <w:pPr>
+        <w:pStyle w:val="BodyText"/>
+      </w:pPr>
+      <w:r>
+        <w:rPr>
+          <w:b/>
+          <w:bCs/>
+        </w:rPr>
+        <w:t xml:space="preserve">Jaarcontrole 1985, 3 oktober 2026.</w:t>
+      </w:r>
+      <w:r>
+        <w:t xml:space="preserve"> </w:t>
+      </w:r>
+      <w:r>
+        <w:t xml:space="preserve">De SOVON-download bevat 323 bezoeken in 24 plots; alle 323 komen veld voor veld overeen met</w:t>
+      </w:r>
+      <w:r>
+        <w:t xml:space="preserve"> </w:t>
+      </w:r>
+      <w:r>
+        <w:rPr>
+          <w:rStyle w:val="VerbatimChar"/>
+        </w:rPr>
+        <w:t xml:space="preserve">dagbezoeken_bmp</w:t>
+      </w:r>
+      <w:r>
+        <w:t xml:space="preserve">. De vogelmatrix bevat 864 positieve waarden, 1.386 letterlijke nulcellen en 2.742 lege cellen. Van de positieve waarden zijn 855 gelijk aan bestaande SOVON-regels. De negen overige positieve waarden zijn meeuwenaantallen voor M7, M16, M8 en M16s en zijn niet toegevoegd, omdat</w:t>
+      </w:r>
+      <w:r>
+        <w:t xml:space="preserve"> </w:t>
+      </w:r>
+      <w:r>
+        <w:rPr>
+          <w:rStyle w:val="VerbatimChar"/>
+        </w:rPr>
+        <w:t xml:space="preserve">meeuwen_literatuur</w:t>
+      </w:r>
+      <w:r>
+        <w:t xml:space="preserve"> </w:t>
+      </w:r>
+      <w:r>
+        <w:t xml:space="preserve">voor die combinaties leidend blijft. Van de 1.386 letterlijke nullen zijn 1.385 als</w:t>
+      </w:r>
+      <w:r>
+        <w:t xml:space="preserve"> </w:t>
+      </w:r>
+      <w:r>
+        <w:rPr>
+          <w:rStyle w:val="VerbatimChar"/>
+        </w:rPr>
+        <w:t xml:space="preserve">territoria = 0</w:t>
+      </w:r>
+      <w:r>
+        <w:t xml:space="preserve"> </w:t>
+      </w:r>
+      <w:r>
+        <w:t xml:space="preserve">met SOVON als bron toegevoegd. De ene uitgesloten nul is M4-5/Zilvermeeuw: SOVON levert 0, terwijl</w:t>
+      </w:r>
+      <w:r>
+        <w:t xml:space="preserve"> </w:t>
+      </w:r>
+      <w:r>
+        <w:rPr>
+          <w:rStyle w:val="VerbatimChar"/>
+        </w:rPr>
+        <w:t xml:space="preserve">meeuwen_literatuur</w:t>
+      </w:r>
+      <w:r>
+        <w:t xml:space="preserve"> </w:t>
+      </w:r>
+      <w:r>
+        <w:t xml:space="preserve">55 territoria bevat. De leidende literatuurwaarde blijft staan. De 22 lege cellen binnen twaalf plots met overige resultaten, de 49 uitsluitend lege M35-cellen en de 2.671 lege cellen in 32 niet-bezochte plots zijn niet ingevoerd.</w:t>
+      </w:r>
+    </w:p>
+    <w:p>
+      <w:pPr>
+        <w:pStyle w:val="BodyText"/>
+      </w:pPr>
+      <w:r>
+        <w:t xml:space="preserve">De SOVON-download bevat voor 1985 geen bezoekwaarnemingen, territoriumpunten, formele afkeuringsaanduiding of tellercodes. Er is daarom niets toegevoegd aan</w:t>
       </w:r>
       <w:r>
         <w:t xml:space="preserve"> </w:t>
@@ -849,55 +1092,40 @@
         <w:t xml:space="preserve"> </w:t>
       </w:r>
       <w:r>
-        <w:t xml:space="preserve">staan; omgekeerd ontbreekt geen bestaande SOVON-bron-ID in de nieuwe levering. Bij 2.629 gedeelde bron-ID’s levert SOVON broedcode 0 terwijl de database</w:t>
-      </w:r>
-      <w:r>
-        <w:t xml:space="preserve"> </w:t>
-      </w:r>
-      <w:r>
-        <w:rPr>
-          <w:rStyle w:val="VerbatimChar"/>
-        </w:rPr>
-        <w:t xml:space="preserve">NULL</w:t>
-      </w:r>
-      <w:r>
-        <w:t xml:space="preserve"> </w:t>
-      </w:r>
-      <w:r>
-        <w:t xml:space="preserve">bevat. De downloads bevatten geen zelfstandig veld dat een telling formeel als afgekeurd markeert. Vergelijking en eventuele verrijking volgen daarom per jaar. Daarbij worden BMP-type, standaard alle soorten of een expliciete uitzondering, volledig geteld, goedgekeurd of formeel afgekeurd en de toepasselijke officiële soortenlijst afzonderlijk vastgelegd. Broedcode 0 blijft een positieve vogelwaarneming. Tellercodes worden per jaar gecontroleerd.</w:t>
-      </w:r>
-    </w:p>
-    <w:p>
-      <w:pPr>
-        <w:pStyle w:val="BodyText"/>
-      </w:pPr>
-      <w:r>
-        <w:rPr>
-          <w:b/>
-          <w:bCs/>
-        </w:rPr>
-        <w:t xml:space="preserve">Jaarcontrole 1984, 2 oktober 2026.</w:t>
-      </w:r>
-      <w:r>
-        <w:t xml:space="preserve"> </w:t>
-      </w:r>
-      <w:r>
-        <w:t xml:space="preserve">De SOVON-download bevat 230 bezoeken in 16 plots. Alle 230 bezoeken zijn inhoudelijk gelijk aan de 230 bezoeken onder bron</w:t>
-      </w:r>
-      <w:r>
-        <w:t xml:space="preserve"> </w:t>
-      </w:r>
-      <w:r>
-        <w:rPr>
-          <w:rStyle w:val="VerbatimChar"/>
-        </w:rPr>
-        <w:t xml:space="preserve">sovon_m</w:t>
-      </w:r>
-      <w:r>
-        <w:t xml:space="preserve"> </w:t>
-      </w:r>
-      <w:r>
-        <w:t xml:space="preserve">in</w:t>
+        <w:t xml:space="preserve">en geen broedcode 0 hersteld. Het verslag bevestigt dat J. Bosland M35 telde en dat kavel 16 bij J.P. Oppentocht hoorde. Op besluit van de data-eigenaar zijn daarom drie ontbrekende regels aan</w:t>
+      </w:r>
+      <w:r>
+        <w:t xml:space="preserve"> </w:t>
+      </w:r>
+      <w:r>
+        <w:rPr>
+          <w:rStyle w:val="VerbatimChar"/>
+        </w:rPr>
+        <w:t xml:space="preserve">plot_jaar_teller</w:t>
+      </w:r>
+      <w:r>
+        <w:t xml:space="preserve"> </w:t>
+      </w:r>
+      <w:r>
+        <w:t xml:space="preserve">toegevoegd: 1985/M35–B_0042 en 1984 en 1985/M16s–A_0042. De al aanwezige regels 1984/M35–B_0042 en 1984 en 1985/M16–A_0042 zijn behouden; er is niets verplaatst of gedupliceerd.</w:t>
+      </w:r>
+    </w:p>
+    <w:p>
+      <w:pPr>
+        <w:pStyle w:val="BodyText"/>
+      </w:pPr>
+      <w:r>
+        <w:rPr>
+          <w:b/>
+          <w:bCs/>
+        </w:rPr>
+        <w:t xml:space="preserve">Jaarcontrole 1986, 3 oktober 2026.</w:t>
+      </w:r>
+      <w:r>
+        <w:t xml:space="preserve"> </w:t>
+      </w:r>
+      <w:r>
+        <w:t xml:space="preserve">De SOVON-download bevat 305 bezoeken in 25 plots; alle 305 komen op bron-ID en inhoud overeen met</w:t>
       </w:r>
       <w:r>
         <w:t xml:space="preserve"> </w:t>
@@ -909,7 +1137,281 @@
         <w:t xml:space="preserve">dagbezoeken_bmp</w:t>
       </w:r>
       <w:r>
-        <w:t xml:space="preserve">; er is daarom geen bezoek toegevoegd. Voor 15 bezochte plotjaren bevat de download 568 positieve vogelcellen met samen 7.811 territoria, 860 letterlijke nulcellen en 18 lege soortcellen. Van de 568 positieve waarden zijn 562 exact gelijk aan de bestaande SOVON-regels in</w:t>
+        <w:t xml:space="preserve">. De vogelmatrix bevat 925 positieve waarden, 1.422 letterlijke nulcellen en 2.645 lege cellen. Van de positieve waarden zijn 919 gelijk aan bestaande SOVON-regels. De zes overige positieve waarden zijn meeuwenaantallen voor M7, M16 en M8 en zijn niet toegevoegd, omdat</w:t>
+      </w:r>
+      <w:r>
+        <w:t xml:space="preserve"> </w:t>
+      </w:r>
+      <w:r>
+        <w:rPr>
+          <w:rStyle w:val="VerbatimChar"/>
+        </w:rPr>
+        <w:t xml:space="preserve">meeuwen_literatuur</w:t>
+      </w:r>
+      <w:r>
+        <w:t xml:space="preserve"> </w:t>
+      </w:r>
+      <w:r>
+        <w:t xml:space="preserve">voor die combinaties leidend blijft. Van de 1.422 letterlijke nullen zijn 1.417 als</w:t>
+      </w:r>
+      <w:r>
+        <w:t xml:space="preserve"> </w:t>
+      </w:r>
+      <w:r>
+        <w:rPr>
+          <w:rStyle w:val="VerbatimChar"/>
+        </w:rPr>
+        <w:t xml:space="preserve">territoria = 0</w:t>
+      </w:r>
+      <w:r>
+        <w:t xml:space="preserve"> </w:t>
+      </w:r>
+      <w:r>
+        <w:t xml:space="preserve">met SOVON als bron toegevoegd. De vijf uitgesloten nullen betreffen Stormmeeuw, Kleine Mantelmeeuw en Zilvermeeuw op M14 en Stormmeeuw en Zilvermeeuw op M4-5;</w:t>
+      </w:r>
+      <w:r>
+        <w:t xml:space="preserve"> </w:t>
+      </w:r>
+      <w:r>
+        <w:rPr>
+          <w:rStyle w:val="VerbatimChar"/>
+        </w:rPr>
+        <w:t xml:space="preserve">meeuwen_literatuur</w:t>
+      </w:r>
+      <w:r>
+        <w:t xml:space="preserve"> </w:t>
+      </w:r>
+      <w:r>
+        <w:t xml:space="preserve">bevat daar positieve aantallen. De 27 lege cellen binnen plots met overige resultaten, de 49 uitsluitend lege M35-cellen en de 2.569 lege cellen in 31 niet-bezochte plots zijn niet ingevoerd.</w:t>
+      </w:r>
+    </w:p>
+    <w:p>
+      <w:pPr>
+        <w:pStyle w:val="BodyText"/>
+      </w:pPr>
+      <w:r>
+        <w:t xml:space="preserve">Het bezoektotalenbestand vermeldt bij 927 soort-plotregels telkens één niet-bruikbare waarneming, dus 927 aggregaatvermeldingen, maar bevat geen individuele bron-ID, bezoek, datum, broedcode, locatie of formele afkeurstatus. De lege puntlagen en het lege standaardbestand</w:t>
+      </w:r>
+      <w:r>
+        <w:t xml:space="preserve"> </w:t>
+      </w:r>
+      <w:r>
+        <w:rPr>
+          <w:rStyle w:val="VerbatimChar"/>
+        </w:rPr>
+        <w:t xml:space="preserve">resultaten.xlsx</w:t>
+      </w:r>
+      <w:r>
+        <w:t xml:space="preserve"> </w:t>
+      </w:r>
+      <w:r>
+        <w:t xml:space="preserve">leveren evenmin individuele regels. Deze vermeldingen zijn daarom niet als formeel afgekeurde waarnemingen in</w:t>
+      </w:r>
+      <w:r>
+        <w:t xml:space="preserve"> </w:t>
+      </w:r>
+      <w:r>
+        <w:rPr>
+          <w:rStyle w:val="VerbatimChar"/>
+        </w:rPr>
+        <w:t xml:space="preserve">dagwaarnemingen_bmp</w:t>
+      </w:r>
+      <w:r>
+        <w:t xml:space="preserve"> </w:t>
+      </w:r>
+      <w:r>
+        <w:t xml:space="preserve">gereconstrueerd. M66 HGC bevat 15 bezoeken en 45 positieve SOVON-regels met samen 336 territoria. Voor dit plotjaar ontbreekt een tellercode in zowel de download als</w:t>
+      </w:r>
+      <w:r>
+        <w:t xml:space="preserve"> </w:t>
+      </w:r>
+      <w:r>
+        <w:rPr>
+          <w:rStyle w:val="VerbatimChar"/>
+        </w:rPr>
+        <w:t xml:space="preserve">plot_jaar_teller</w:t>
+      </w:r>
+      <w:r>
+        <w:t xml:space="preserve">; ook het jaarverslag noemt M66 HGC niet. Het tellerveld blijft daarom leeg. M35 bevat zeven bezoeken en 49 lege matrixcellen. Het jaarverslag bevat 17 regels met samen 156 territoria en</w:t>
+      </w:r>
+      <w:r>
+        <w:t xml:space="preserve"> </w:t>
+      </w:r>
+      <w:r>
+        <w:rPr>
+          <w:rStyle w:val="VerbatimChar"/>
+        </w:rPr>
+        <w:t xml:space="preserve">meeuwen_literatuur</w:t>
+      </w:r>
+      <w:r>
+        <w:t xml:space="preserve"> </w:t>
+      </w:r>
+      <w:r>
+        <w:t xml:space="preserve">twee Stormmeeuwterritoria, samen gelijk aan het verslagtotaal van 158; deze afzonderlijke bronnen zijn niet als SOVON-regels ingevoerd.</w:t>
+      </w:r>
+    </w:p>
+    <w:p>
+      <w:pPr>
+        <w:pStyle w:val="BodyText"/>
+      </w:pPr>
+      <w:r>
+        <w:rPr>
+          <w:b/>
+          <w:bCs/>
+        </w:rPr>
+        <w:t xml:space="preserve">Jaarcontrole 1987, 3 oktober 2026.</w:t>
+      </w:r>
+      <w:r>
+        <w:t xml:space="preserve"> </w:t>
+      </w:r>
+      <w:r>
+        <w:t xml:space="preserve">De SOVON-download bevat 328 bezoeken; alle 328 komen op bron-ID en inhoud overeen met</w:t>
+      </w:r>
+      <w:r>
+        <w:t xml:space="preserve"> </w:t>
+      </w:r>
+      <w:r>
+        <w:rPr>
+          <w:rStyle w:val="VerbatimChar"/>
+        </w:rPr>
+        <w:t xml:space="preserve">dagbezoeken_bmp</w:t>
+      </w:r>
+      <w:r>
+        <w:t xml:space="preserve">. De vogelmatrix bevat 1.088 positieve waarden, 1.788 letterlijke nulcellen en 2.116 lege cellen. Van de positieve waarden zijn 1.081 gelijk aan bestaande SOVON-regels. De zeven overige positieve waarden zijn Stormmeeuw, Kleine Mantelmeeuw en Zilvermeeuw op M15 en M16 en Kleine Mantelmeeuw op M8. Zij zijn niet toegevoegd, omdat</w:t>
+      </w:r>
+      <w:r>
+        <w:t xml:space="preserve"> </w:t>
+      </w:r>
+      <w:r>
+        <w:rPr>
+          <w:rStyle w:val="VerbatimChar"/>
+        </w:rPr>
+        <w:t xml:space="preserve">meeuwen_literatuur</w:t>
+      </w:r>
+      <w:r>
+        <w:t xml:space="preserve"> </w:t>
+      </w:r>
+      <w:r>
+        <w:t xml:space="preserve">voor deze combinaties leidend blijft. Alle 1.788 letterlijke nullen waren niet-conflicterend en zijn als</w:t>
+      </w:r>
+      <w:r>
+        <w:t xml:space="preserve"> </w:t>
+      </w:r>
+      <w:r>
+        <w:rPr>
+          <w:rStyle w:val="VerbatimChar"/>
+        </w:rPr>
+        <w:t xml:space="preserve">territoria = 0</w:t>
+      </w:r>
+      <w:r>
+        <w:t xml:space="preserve"> </w:t>
+      </w:r>
+      <w:r>
+        <w:t xml:space="preserve">met SOVON als bron toegevoegd. De 32 lege cellen binnen bezochte plots met overige resultaten, de 49 uitsluitend lege M35-cellen, de twee lege M8-cellen en de 2.033 lege cellen in 25 niet-bezochte plots zijn niet ingevoerd.</w:t>
+      </w:r>
+    </w:p>
+    <w:p>
+      <w:pPr>
+        <w:pStyle w:val="BodyText"/>
+      </w:pPr>
+      <w:r>
+        <w:t xml:space="preserve">Het bezoektotalenbestand vermeldt bij 1.091 soort-plotregels telkens één niet-bruikbare waarneming, dus 1.091 aggregaatvermeldingen, maar bevat geen individuele bron-ID, bezoek, datum, broedcode, locatie of formele afkeurstatus. Deze vermeldingen zijn daarom niet als formeel afgekeurde waarnemingen gereconstrueerd. Voor M66 HGC ontbreekt een tellercode in zowel de download als</w:t>
+      </w:r>
+      <w:r>
+        <w:t xml:space="preserve"> </w:t>
+      </w:r>
+      <w:r>
+        <w:rPr>
+          <w:rStyle w:val="VerbatimChar"/>
+        </w:rPr>
+        <w:t xml:space="preserve">plot_jaar_teller</w:t>
+      </w:r>
+      <w:r>
+        <w:t xml:space="preserve">; dit veld blijft leeg. De overige 29 plots met resultaten hebben al een database-tellercode. M8 heeft 41 positieve waarden, 57 letterlijke nullen en twee lege cellen, maar geen bezoekregels in de SOVON-download of</w:t>
+      </w:r>
+      <w:r>
+        <w:t xml:space="preserve"> </w:t>
+      </w:r>
+      <w:r>
+        <w:rPr>
+          <w:rStyle w:val="VerbatimChar"/>
+        </w:rPr>
+        <w:t xml:space="preserve">dagbezoeken_bmp</w:t>
+      </w:r>
+      <w:r>
+        <w:t xml:space="preserve">. Het jaarverslag noemt R. Wanders als teller en twaalf BMP-bezoeken; de bestaande databasecode</w:t>
+      </w:r>
+      <w:r>
+        <w:t xml:space="preserve"> </w:t>
+      </w:r>
+      <w:r>
+        <w:rPr>
+          <w:rStyle w:val="VerbatimChar"/>
+        </w:rPr>
+        <w:t xml:space="preserve">RWNS00</w:t>
+      </w:r>
+      <w:r>
+        <w:t xml:space="preserve"> </w:t>
+      </w:r>
+      <w:r>
+        <w:t xml:space="preserve">blijft staan. De twaalf verslagbezoeken zijn niet als SOVON-bezoeken gereconstrueerd. M35 heeft zeven SOVON-bezoeken maar uitsluitend 49 lege matrixcellen. In de database staan voor M35 zeventien jaarverslagregels met samen 54 territoria en één</w:t>
+      </w:r>
+      <w:r>
+        <w:t xml:space="preserve"> </w:t>
+      </w:r>
+      <w:r>
+        <w:rPr>
+          <w:rStyle w:val="VerbatimChar"/>
+        </w:rPr>
+        <w:t xml:space="preserve">meeuwen_literatuur</w:t>
+      </w:r>
+      <w:r>
+        <w:t xml:space="preserve">-regel met 64 territoria; deze bronnen blijven gescheiden van SOVON.</w:t>
+      </w:r>
+    </w:p>
+    <w:p>
+      <w:pPr>
+        <w:pStyle w:val="BodyText"/>
+      </w:pPr>
+      <w:r>
+        <w:rPr>
+          <w:b/>
+          <w:bCs/>
+        </w:rPr>
+        <w:t xml:space="preserve">Jaarcontroles 1988-2004, 3 oktober 2026.</w:t>
+      </w:r>
+      <w:r>
+        <w:t xml:space="preserve"> </w:t>
+      </w:r>
+      <w:r>
+        <w:t xml:space="preserve">De zeventien SOVON-downloads bevatten samen 5.141 in-scope bezoeken. Alle 5.141 stonden al op bron-ID en inhoud gelijk in</w:t>
+      </w:r>
+      <w:r>
+        <w:t xml:space="preserve"> </w:t>
+      </w:r>
+      <w:r>
+        <w:rPr>
+          <w:rStyle w:val="VerbatimChar"/>
+        </w:rPr>
+        <w:t xml:space="preserve">dagbezoeken_bmp</w:t>
+      </w:r>
+      <w:r>
+        <w:t xml:space="preserve">; er is geen bezoek toegevoegd of gewijzigd. De matrices bevatten na uitsluiting van De Horsten samen 19.197 positieve SOVON-resultaten. Die waren gelijk aan de bestaande SOVON-regels, behoudens meeuwencombinaties waarvoor een aanwezige regel uit</w:t>
+      </w:r>
+      <w:r>
+        <w:t xml:space="preserve"> </w:t>
+      </w:r>
+      <w:r>
+        <w:rPr>
+          <w:rStyle w:val="VerbatimChar"/>
+        </w:rPr>
+        <w:t xml:space="preserve">meeuwen_literatuur</w:t>
+      </w:r>
+      <w:r>
+        <w:t xml:space="preserve"> </w:t>
+      </w:r>
+      <w:r>
+        <w:t xml:space="preserve">leidend bleef. In</w:t>
       </w:r>
       <w:r>
         <w:t xml:space="preserve"> </w:t>
@@ -921,22 +1423,10 @@
         <w:t xml:space="preserve">territoria</w:t>
       </w:r>
       <w:r>
-        <w:t xml:space="preserve">. De 860 letterlijke nullen zijn als regels met</w:t>
-      </w:r>
-      <w:r>
-        <w:t xml:space="preserve"> </w:t>
-      </w:r>
-      <w:r>
-        <w:rPr>
-          <w:rStyle w:val="VerbatimChar"/>
-        </w:rPr>
-        <w:t xml:space="preserve">territoria = 0</w:t>
-      </w:r>
-      <w:r>
-        <w:t xml:space="preserve"> </w:t>
-      </w:r>
-      <w:r>
-        <w:t xml:space="preserve">en SOVON als bron rechtstreeks aan</w:t>
+        <w:t xml:space="preserve"> </w:t>
+      </w:r>
+      <w:r>
+        <w:t xml:space="preserve">zijn per jaar uitsluitend de volgende aantallen letterlijke, niet-conflicterende SOVON-nullen toegevoegd: 1988 1.444; 1989 1.512; 1990 1.622; 1991 1.761; 1992 1.739; 1993 2.057; 1994 1.838; 1995 1.811; 1996 1.797; 1997 1.829; 1998 1.834; 1999 1.873; 2000 1.773; 2001 1.846; 2002 1.884; 2003 1.854; 2004 1.984. Samen zijn dit 30.458 nieuwe regels.</w:t>
       </w:r>
       <w:r>
         <w:t xml:space="preserve"> </w:t>
@@ -951,39 +1441,84 @@
         <w:t xml:space="preserve"> </w:t>
       </w:r>
       <w:r>
-        <w:t xml:space="preserve">toegevoegd. De 18 cellen zijn leeg binnen plotjaren die voor andere soorten wel resultaten bevatten; zij zijn niet ingevoerd en gelden niet als nul. De 40 geselecteerde maar niet-bezochte plots met 3.497 uitsluitend lege vogelcellen zijn genegeerd.</w:t>
-      </w:r>
-    </w:p>
-    <w:p>
-      <w:pPr>
-        <w:pStyle w:val="BodyText"/>
-      </w:pPr>
-      <w:r>
-        <w:t xml:space="preserve">Voor M35 bevat de SOVON-download acht bezoeken en 49 lege vogelcellen, zonder positieve waarde of letterlijke nul. De levende database bevat dezelfde acht bezoeken onder</w:t>
-      </w:r>
-      <w:r>
-        <w:t xml:space="preserve"> </w:t>
-      </w:r>
-      <w:r>
-        <w:rPr>
-          <w:rStyle w:val="VerbatimChar"/>
-        </w:rPr>
-        <w:t xml:space="preserve">sovon_m</w:t>
-      </w:r>
-      <w:r>
-        <w:t xml:space="preserve">, geen territoriumregel onder</w:t>
-      </w:r>
-      <w:r>
-        <w:t xml:space="preserve"> </w:t>
-      </w:r>
-      <w:r>
-        <w:rPr>
-          <w:rStyle w:val="VerbatimChar"/>
-        </w:rPr>
-        <w:t xml:space="preserve">sovon_m</w:t>
-      </w:r>
-      <w:r>
-        <w:t xml:space="preserve">, en 13 afzonderlijke regels met samen 106 territoria onder</w:t>
+        <w:t xml:space="preserve">bevat daarna 106.921 regels. Alle nieuwe nulregels zijn via</w:t>
+      </w:r>
+      <w:r>
+        <w:t xml:space="preserve"> </w:t>
+      </w:r>
+      <w:r>
+        <w:rPr>
+          <w:rStyle w:val="VerbatimChar"/>
+        </w:rPr>
+        <w:t xml:space="preserve">soorten</w:t>
+      </w:r>
+      <w:r>
+        <w:t xml:space="preserve">,</w:t>
+      </w:r>
+      <w:r>
+        <w:t xml:space="preserve"> </w:t>
+      </w:r>
+      <w:r>
+        <w:rPr>
+          <w:rStyle w:val="VerbatimChar"/>
+        </w:rPr>
+        <w:t xml:space="preserve">taxa_bronkoppeling</w:t>
+      </w:r>
+      <w:r>
+        <w:t xml:space="preserve">,</w:t>
+      </w:r>
+      <w:r>
+        <w:t xml:space="preserve"> </w:t>
+      </w:r>
+      <w:r>
+        <w:rPr>
+          <w:rStyle w:val="VerbatimChar"/>
+        </w:rPr>
+        <w:t xml:space="preserve">taxa</w:t>
+      </w:r>
+      <w:r>
+        <w:t xml:space="preserve"> </w:t>
+      </w:r>
+      <w:r>
+        <w:t xml:space="preserve">en</w:t>
+      </w:r>
+      <w:r>
+        <w:t xml:space="preserve"> </w:t>
+      </w:r>
+      <w:r>
+        <w:rPr>
+          <w:rStyle w:val="VerbatimChar"/>
+        </w:rPr>
+        <w:t xml:space="preserve">taxon_groepen</w:t>
+      </w:r>
+      <w:r>
+        <w:t xml:space="preserve"> </w:t>
+      </w:r>
+      <w:r>
+        <w:t xml:space="preserve">als vogels bereikbaar; de jaarlijkse databasebrede nacontrole omvat 128 routes en geeft nul fouten.</w:t>
+      </w:r>
+    </w:p>
+    <w:p>
+      <w:pPr>
+        <w:pStyle w:val="BodyText"/>
+      </w:pPr>
+      <w:r>
+        <w:t xml:space="preserve">In 1991 zijn vier SOVON-meeuwennullen niet ingevoerd omdat voor dezelfde plot-soortcombinatie een positieve, leidende waarde uit</w:t>
+      </w:r>
+      <w:r>
+        <w:t xml:space="preserve"> </w:t>
+      </w:r>
+      <w:r>
+        <w:rPr>
+          <w:rStyle w:val="VerbatimChar"/>
+        </w:rPr>
+        <w:t xml:space="preserve">meeuwen_literatuur</w:t>
+      </w:r>
+      <w:r>
+        <w:t xml:space="preserve"> </w:t>
+      </w:r>
+      <w:r>
+        <w:t xml:space="preserve">bestaat. Een retroactieve afwezigheidscontrole over 1984-2004 houdt 1.309</w:t>
       </w:r>
       <w:r>
         <w:t xml:space="preserve"> </w:t>
@@ -995,7 +1530,7 @@
         <w:t xml:space="preserve">jrvslg_m</w:t>
       </w:r>
       <w:r>
-        <w:t xml:space="preserve">. Het verslag over 1983-1985 stelt dat de resultatentabel 1984 uitsluitend BMP-getelde kavels omvat. Kavel 35 staat in de bezettingslijst bij J. Bosland en heeft resultaten in die tabel. De lege SOVON-cellen betekenen dus niet dat M35 niet is geteld en zijn geen nullen; de SOVON-resultaten ontbreken. De jaarverslagregels blijven buiten deze SOVON-verwerking. De zes overige positieve verschillen zijn meeuwenwaarden voor M7, M8, M4-5 en M16s. Zij zijn niet als SOVON-regel toegevoegd, omdat</w:t>
+        <w:t xml:space="preserve">-regels en 70</w:t>
       </w:r>
       <w:r>
         <w:t xml:space="preserve"> </w:t>
@@ -1007,10 +1542,57 @@
         <w:t xml:space="preserve">meeuwen_literatuur</w:t>
       </w:r>
       <w:r>
-        <w:t xml:space="preserve"> </w:t>
-      </w:r>
-      <w:r>
-        <w:t xml:space="preserve">voor deze zes plot-soortcombinaties leidend blijft in</w:t>
+        <w:t xml:space="preserve">-regels bewust in stand: de SOVON-matrix bevat voor die combinaties geen positieve of letterlijke nulwaarde, en ontbreken in de download is geen wijzigings- of verwijderingsgrond. Jaarverslagen zijn ieder jaar gebruikt om ontbrekende tellers en andere bronverschillen te verklaren. In 1988-2004 leverde dit geen ontbrekende tellerkoppeling op; waar database en download geen teller bevatten, noemde ook het verslag geen ondubbelzinnig aan een bestaande code koppelbare waarnemer voor dat plotjaar.</w:t>
+      </w:r>
+    </w:p>
+    <w:p>
+      <w:pPr>
+        <w:pStyle w:val="BodyText"/>
+      </w:pPr>
+      <w:r>
+        <w:t xml:space="preserve">De Horsten behoort niet tot Meijendel. Uit de download van 1996 zijn daarom negen bezoeken, 41 positieve resultaten met samen 636 territoria, 30 letterlijke nullen en vier lege cellen volledig genegeerd. De uitsluitend lege selecties van De Horsten in volgende jaren zijn eveneens buiten de vergelijking gehouden. Voor 2000 verklaart het jaarverslag de lege SOVON-resultaten van M35: de werkgroep telde M35 en M36 wel, maar stuurde die resultaten dat jaar niet aan SOVON. De bestaande</w:t>
+      </w:r>
+      <w:r>
+        <w:t xml:space="preserve"> </w:t>
+      </w:r>
+      <w:r>
+        <w:rPr>
+          <w:rStyle w:val="VerbatimChar"/>
+        </w:rPr>
+        <w:t xml:space="preserve">jrvslg_m</w:t>
+      </w:r>
+      <w:r>
+        <w:t xml:space="preserve">-regels blijven daarom staan; uit de lege SOVON-cellen is niets afgeleid.</w:t>
+      </w:r>
+    </w:p>
+    <w:p>
+      <w:pPr>
+        <w:pStyle w:val="BodyText"/>
+      </w:pPr>
+      <w:r>
+        <w:rPr>
+          <w:b/>
+          <w:bCs/>
+        </w:rPr>
+        <w:t xml:space="preserve">Controlejaar 2005, afgerond.</w:t>
+      </w:r>
+      <w:r>
+        <w:t xml:space="preserve"> </w:t>
+      </w:r>
+      <w:r>
+        <w:t xml:space="preserve">De 111 geleverde bezoeken staan veld voor veld gelijk in</w:t>
+      </w:r>
+      <w:r>
+        <w:t xml:space="preserve"> </w:t>
+      </w:r>
+      <w:r>
+        <w:rPr>
+          <w:rStyle w:val="VerbatimChar"/>
+        </w:rPr>
+        <w:t xml:space="preserve">dagbezoeken_bmp</w:t>
+      </w:r>
+      <w:r>
+        <w:t xml:space="preserve">; 1.156 positieve vogelresultaten zijn gelijk. De 1.999 letterlijke, niet-conflicterende vogelnullen zijn in</w:t>
       </w:r>
       <w:r>
         <w:t xml:space="preserve"> </w:t>
@@ -1022,25 +1604,40 @@
         <w:t xml:space="preserve">territoria</w:t>
       </w:r>
       <w:r>
-        <w:t xml:space="preserve">.</w:t>
-      </w:r>
-    </w:p>
-    <w:p>
-      <w:pPr>
-        <w:pStyle w:val="BodyText"/>
-      </w:pPr>
-      <w:r>
-        <w:rPr>
-          <w:b/>
-          <w:bCs/>
-        </w:rPr>
-        <w:t xml:space="preserve">Jaarcontrole 1985, 3 oktober 2026.</w:t>
-      </w:r>
-      <w:r>
-        <w:t xml:space="preserve"> </w:t>
-      </w:r>
-      <w:r>
-        <w:t xml:space="preserve">De SOVON-download bevat 323 bezoeken in 24 plots; alle 323 komen veld voor veld overeen met</w:t>
+        <w:t xml:space="preserve"> </w:t>
+      </w:r>
+      <w:r>
+        <w:t xml:space="preserve">opgenomen; 1.766 lege cellen niet. De puntenlaag bevat nul features. Het bezoektotalenbestand bevat daarnaast 101 positieve zoogdierregels op 58 bestaande BMP-bezoeken in zeven plots: Konijn 46 regels met totaal 241, Ree 34 met totaal 89, Vos 15 met totaal 22, Eekhoorn vijf met totaal 6 en Dwergspitsmuis één met totaal 1. Twintig waarden waren al gelijk. De overige 81 SOVON-regels met 284 dieren op 46 bezoeken zijn afzonderlijk opgenomen onder</w:t>
+      </w:r>
+      <w:r>
+        <w:t xml:space="preserve"> </w:t>
+      </w:r>
+      <w:r>
+        <w:rPr>
+          <w:rStyle w:val="VerbatimChar"/>
+        </w:rPr>
+        <w:t xml:space="preserve">sovon-bmp-jaarbestanden-v1</w:t>
+      </w:r>
+      <w:r>
+        <w:t xml:space="preserve">; daaronder vallen ook de twee afwijkende Konijnwaarden in M16. Bezoek 365793 bevat SOVON 2 naast NDFF 9 en bezoek 365789 bevat SOVON 1 naast NDFF 3. Het NDFF-auditspoor blijft staan; SOVON is bij gecombineerd gebruik leidend. Er zijn geen zoogdiernullen afgeleid.</w:t>
+      </w:r>
+    </w:p>
+    <w:p>
+      <w:pPr>
+        <w:pStyle w:val="BodyText"/>
+      </w:pPr>
+      <w:r>
+        <w:rPr>
+          <w:b/>
+          <w:bCs/>
+        </w:rPr>
+        <w:t xml:space="preserve">Controlejaar 2006, afgerond.</w:t>
+      </w:r>
+      <w:r>
+        <w:t xml:space="preserve"> </w:t>
+      </w:r>
+      <w:r>
+        <w:t xml:space="preserve">De 172 geleverde bezoeken staan veld voor veld gelijk in</w:t>
       </w:r>
       <w:r>
         <w:t xml:space="preserve"> </w:t>
@@ -1052,108 +1649,55 @@
         <w:t xml:space="preserve">dagbezoeken_bmp</w:t>
       </w:r>
       <w:r>
-        <w:t xml:space="preserve">. De vogelmatrix bevat 864 positieve waarden, 1.386 letterlijke nulcellen en 2.742 lege cellen. Van de positieve waarden zijn 855 gelijk aan bestaande SOVON-regels. De negen overige positieve waarden zijn meeuwenaantallen voor M7, M16, M8 en M16s en zijn niet toegevoegd, omdat</w:t>
-      </w:r>
-      <w:r>
-        <w:t xml:space="preserve"> </w:t>
-      </w:r>
-      <w:r>
-        <w:rPr>
-          <w:rStyle w:val="VerbatimChar"/>
-        </w:rPr>
-        <w:t xml:space="preserve">meeuwen_literatuur</w:t>
-      </w:r>
-      <w:r>
-        <w:t xml:space="preserve"> </w:t>
-      </w:r>
-      <w:r>
-        <w:t xml:space="preserve">voor die combinaties leidend blijft. Van de 1.386 letterlijke nullen zijn 1.385 als</w:t>
-      </w:r>
-      <w:r>
-        <w:t xml:space="preserve"> </w:t>
-      </w:r>
-      <w:r>
-        <w:rPr>
-          <w:rStyle w:val="VerbatimChar"/>
-        </w:rPr>
-        <w:t xml:space="preserve">territoria = 0</w:t>
-      </w:r>
-      <w:r>
-        <w:t xml:space="preserve"> </w:t>
-      </w:r>
-      <w:r>
-        <w:t xml:space="preserve">met SOVON als bron toegevoegd. De ene uitgesloten nul is M4-5/Zilvermeeuw: SOVON levert 0, terwijl</w:t>
-      </w:r>
-      <w:r>
-        <w:t xml:space="preserve"> </w:t>
-      </w:r>
-      <w:r>
-        <w:rPr>
-          <w:rStyle w:val="VerbatimChar"/>
-        </w:rPr>
-        <w:t xml:space="preserve">meeuwen_literatuur</w:t>
-      </w:r>
-      <w:r>
-        <w:t xml:space="preserve"> </w:t>
-      </w:r>
-      <w:r>
-        <w:t xml:space="preserve">55 territoria bevat. De leidende literatuurwaarde blijft staan. De 22 lege cellen binnen twaalf plots met overige resultaten, de 49 uitsluitend lege M35-cellen en de 2.671 lege cellen in 32 niet-bezochte plots zijn niet ingevoerd.</w:t>
-      </w:r>
-    </w:p>
-    <w:p>
-      <w:pPr>
-        <w:pStyle w:val="BodyText"/>
-      </w:pPr>
-      <w:r>
-        <w:t xml:space="preserve">De SOVON-download bevat voor 1985 geen bezoekwaarnemingen, territoriumpunten, formele afkeuringsaanduiding of tellercodes. Er is daarom niets toegevoegd aan</w:t>
-      </w:r>
-      <w:r>
-        <w:t xml:space="preserve"> </w:t>
-      </w:r>
-      <w:r>
-        <w:rPr>
-          <w:rStyle w:val="VerbatimChar"/>
-        </w:rPr>
-        <w:t xml:space="preserve">dagwaarnemingen_bmp</w:t>
-      </w:r>
-      <w:r>
-        <w:t xml:space="preserve"> </w:t>
-      </w:r>
-      <w:r>
-        <w:t xml:space="preserve">en geen broedcode 0 hersteld. Het verslag bevestigt dat J. Bosland M35 telde en dat kavel 16 bij J.P. Oppentocht hoorde. Op besluit van de data-eigenaar zijn daarom drie ontbrekende regels aan</w:t>
-      </w:r>
-      <w:r>
-        <w:t xml:space="preserve"> </w:t>
-      </w:r>
-      <w:r>
-        <w:rPr>
-          <w:rStyle w:val="VerbatimChar"/>
-        </w:rPr>
-        <w:t xml:space="preserve">plot_jaar_teller</w:t>
-      </w:r>
-      <w:r>
-        <w:t xml:space="preserve"> </w:t>
-      </w:r>
-      <w:r>
-        <w:t xml:space="preserve">toegevoegd: 1985/M35–B_0042 en 1984 en 1985/M16s–A_0042. De al aanwezige regels 1984/M35–B_0042 en 1984 en 1985/M16–A_0042 zijn behouden; er is niets verplaatst of gedupliceerd.</w:t>
-      </w:r>
-    </w:p>
-    <w:p>
-      <w:pPr>
-        <w:pStyle w:val="BodyText"/>
-      </w:pPr>
-      <w:r>
-        <w:rPr>
-          <w:b/>
-          <w:bCs/>
-        </w:rPr>
-        <w:t xml:space="preserve">Jaarcontrole 1986, 3 oktober 2026.</w:t>
-      </w:r>
-      <w:r>
-        <w:t xml:space="preserve"> </w:t>
-      </w:r>
-      <w:r>
-        <w:t xml:space="preserve">De SOVON-download bevat 305 bezoeken in 25 plots; alle 305 komen op bron-ID en inhoud overeen met</w:t>
+        <w:t xml:space="preserve">; 1.069 positieve vogelresultaten zijn gelijk. De 1.865 letterlijke, niet-conflicterende vogelnullen zijn in</w:t>
+      </w:r>
+      <w:r>
+        <w:t xml:space="preserve"> </w:t>
+      </w:r>
+      <w:r>
+        <w:rPr>
+          <w:rStyle w:val="VerbatimChar"/>
+        </w:rPr>
+        <w:t xml:space="preserve">territoria</w:t>
+      </w:r>
+      <w:r>
+        <w:t xml:space="preserve"> </w:t>
+      </w:r>
+      <w:r>
+        <w:t xml:space="preserve">opgenomen; 1.987 lege cellen niet. De puntenlaag bevat nul features. Het bezoektotalenbestand bevat 159 positieve zoogdierregels. Daarvan waren 36 gelijk. Onder</w:t>
+      </w:r>
+      <w:r>
+        <w:t xml:space="preserve"> </w:t>
+      </w:r>
+      <w:r>
+        <w:rPr>
+          <w:rStyle w:val="VerbatimChar"/>
+        </w:rPr>
+        <w:t xml:space="preserve">sovon-bmp-jaarbestanden-v1</w:t>
+      </w:r>
+      <w:r>
+        <w:t xml:space="preserve"> </w:t>
+      </w:r>
+      <w:r>
+        <w:t xml:space="preserve">zijn 123 aanvullende regels met samen 523 dieren op 72 bezoeken opgenomen zonder nulafleiding. Daaronder staan acht afwijkende SOVON-bezoektotalen naast het NDFF-auditspoor; SOVON is bij gecombineerd gebruik leidend.</w:t>
+      </w:r>
+    </w:p>
+    <w:p>
+      <w:pPr>
+        <w:pStyle w:val="BodyText"/>
+      </w:pPr>
+      <w:r>
+        <w:rPr>
+          <w:b/>
+          <w:bCs/>
+        </w:rPr>
+        <w:t xml:space="preserve">Controlejaar 2007, afgerond.</w:t>
+      </w:r>
+      <w:r>
+        <w:t xml:space="preserve"> </w:t>
+      </w:r>
+      <w:r>
+        <w:t xml:space="preserve">De 172 geleverde bezoeken staan veld voor veld gelijk in</w:t>
       </w:r>
       <w:r>
         <w:t xml:space="preserve"> </w:t>
@@ -1165,135 +1709,94 @@
         <w:t xml:space="preserve">dagbezoeken_bmp</w:t>
       </w:r>
       <w:r>
-        <w:t xml:space="preserve">. De vogelmatrix bevat 925 positieve waarden, 1.422 letterlijke nulcellen en 2.645 lege cellen. Van de positieve waarden zijn 919 gelijk aan bestaande SOVON-regels. De zes overige positieve waarden zijn meeuwenaantallen voor M7, M16 en M8 en zijn niet toegevoegd, omdat</w:t>
-      </w:r>
-      <w:r>
-        <w:t xml:space="preserve"> </w:t>
-      </w:r>
-      <w:r>
-        <w:rPr>
-          <w:rStyle w:val="VerbatimChar"/>
-        </w:rPr>
-        <w:t xml:space="preserve">meeuwen_literatuur</w:t>
-      </w:r>
-      <w:r>
-        <w:t xml:space="preserve"> </w:t>
-      </w:r>
-      <w:r>
-        <w:t xml:space="preserve">voor die combinaties leidend blijft. Van de 1.422 letterlijke nullen zijn 1.417 als</w:t>
-      </w:r>
-      <w:r>
-        <w:t xml:space="preserve"> </w:t>
-      </w:r>
-      <w:r>
-        <w:rPr>
-          <w:rStyle w:val="VerbatimChar"/>
-        </w:rPr>
-        <w:t xml:space="preserve">territoria = 0</w:t>
-      </w:r>
-      <w:r>
-        <w:t xml:space="preserve"> </w:t>
-      </w:r>
-      <w:r>
-        <w:t xml:space="preserve">met SOVON als bron toegevoegd. De vijf uitgesloten nullen betreffen Stormmeeuw, Kleine Mantelmeeuw en Zilvermeeuw op M14 en Stormmeeuw en Zilvermeeuw op M4-5;</w:t>
-      </w:r>
-      <w:r>
-        <w:t xml:space="preserve"> </w:t>
-      </w:r>
-      <w:r>
-        <w:rPr>
-          <w:rStyle w:val="VerbatimChar"/>
-        </w:rPr>
-        <w:t xml:space="preserve">meeuwen_literatuur</w:t>
-      </w:r>
-      <w:r>
-        <w:t xml:space="preserve"> </w:t>
-      </w:r>
-      <w:r>
-        <w:t xml:space="preserve">bevat daar positieve aantallen. De 27 lege cellen binnen plots met overige resultaten, de 49 uitsluitend lege M35-cellen en de 2.569 lege cellen in 31 niet-bezochte plots zijn niet ingevoerd.</w:t>
-      </w:r>
-    </w:p>
-    <w:p>
-      <w:pPr>
-        <w:pStyle w:val="BodyText"/>
-      </w:pPr>
-      <w:r>
-        <w:t xml:space="preserve">Het bezoektotalenbestand vermeldt bij 927 soort-plotregels telkens één niet-bruikbare waarneming, dus 927 aggregaatvermeldingen, maar bevat geen individuele bron-ID, bezoek, datum, broedcode, locatie of formele afkeurstatus. De lege puntlagen en het lege standaardbestand</w:t>
-      </w:r>
-      <w:r>
-        <w:t xml:space="preserve"> </w:t>
-      </w:r>
-      <w:r>
-        <w:rPr>
-          <w:rStyle w:val="VerbatimChar"/>
-        </w:rPr>
-        <w:t xml:space="preserve">resultaten.xlsx</w:t>
-      </w:r>
-      <w:r>
-        <w:t xml:space="preserve"> </w:t>
-      </w:r>
-      <w:r>
-        <w:t xml:space="preserve">leveren evenmin individuele regels. Deze vermeldingen zijn daarom niet als formeel afgekeurde waarnemingen in</w:t>
-      </w:r>
-      <w:r>
-        <w:t xml:space="preserve"> </w:t>
-      </w:r>
-      <w:r>
-        <w:rPr>
-          <w:rStyle w:val="VerbatimChar"/>
-        </w:rPr>
-        <w:t xml:space="preserve">dagwaarnemingen_bmp</w:t>
-      </w:r>
-      <w:r>
-        <w:t xml:space="preserve"> </w:t>
-      </w:r>
-      <w:r>
-        <w:t xml:space="preserve">gereconstrueerd. M66 HGC bevat 15 bezoeken en 45 positieve SOVON-regels met samen 336 territoria. Voor dit plotjaar ontbreekt een tellercode in zowel de download als</w:t>
-      </w:r>
-      <w:r>
-        <w:t xml:space="preserve"> </w:t>
-      </w:r>
-      <w:r>
-        <w:rPr>
-          <w:rStyle w:val="VerbatimChar"/>
-        </w:rPr>
-        <w:t xml:space="preserve">plot_jaar_teller</w:t>
-      </w:r>
-      <w:r>
-        <w:t xml:space="preserve">; ook het jaarverslag noemt M66 HGC niet. Het tellerveld blijft daarom leeg. M35 bevat zeven bezoeken en 49 lege matrixcellen. Het jaarverslag bevat 17 regels met samen 156 territoria en</w:t>
-      </w:r>
-      <w:r>
-        <w:t xml:space="preserve"> </w:t>
-      </w:r>
-      <w:r>
-        <w:rPr>
-          <w:rStyle w:val="VerbatimChar"/>
-        </w:rPr>
-        <w:t xml:space="preserve">meeuwen_literatuur</w:t>
-      </w:r>
-      <w:r>
-        <w:t xml:space="preserve"> </w:t>
-      </w:r>
-      <w:r>
-        <w:t xml:space="preserve">twee Stormmeeuwterritoria, samen gelijk aan het verslagtotaal van 158; deze afzonderlijke bronnen zijn niet als SOVON-regels ingevoerd.</w:t>
-      </w:r>
-    </w:p>
-    <w:p>
-      <w:pPr>
-        <w:pStyle w:val="BodyText"/>
-      </w:pPr>
-      <w:r>
-        <w:rPr>
-          <w:b/>
-          <w:bCs/>
-        </w:rPr>
-        <w:t xml:space="preserve">Jaarcontrole 1987, 3 oktober 2026.</w:t>
-      </w:r>
-      <w:r>
-        <w:t xml:space="preserve"> </w:t>
-      </w:r>
-      <w:r>
-        <w:t xml:space="preserve">De SOVON-download bevat 328 bezoeken; alle 328 komen op bron-ID en inhoud overeen met</w:t>
+        <w:t xml:space="preserve">; 1.166 positieve vogelresultaten zijn gelijk. Alle 1.924 letterlijke vogelnullen zijn in</w:t>
+      </w:r>
+      <w:r>
+        <w:t xml:space="preserve"> </w:t>
+      </w:r>
+      <w:r>
+        <w:rPr>
+          <w:rStyle w:val="VerbatimChar"/>
+        </w:rPr>
+        <w:t xml:space="preserve">territoria</w:t>
+      </w:r>
+      <w:r>
+        <w:t xml:space="preserve"> </w:t>
+      </w:r>
+      <w:r>
+        <w:t xml:space="preserve">opgenomen; 1.831 lege cellen niet. Het bezoektotalenbestand bevat 249 positieve zoogdierregels. Daarvan waren 101 al gelijk. Onder</w:t>
+      </w:r>
+      <w:r>
+        <w:t xml:space="preserve"> </w:t>
+      </w:r>
+      <w:r>
+        <w:rPr>
+          <w:rStyle w:val="VerbatimChar"/>
+        </w:rPr>
+        <w:t xml:space="preserve">sovon-bmp-jaarbestanden-v1</w:t>
+      </w:r>
+      <w:r>
+        <w:t xml:space="preserve"> </w:t>
+      </w:r>
+      <w:r>
+        <w:t xml:space="preserve">staan 148 aanvullende regels met 692 dieren op 84 bezoeken, inclusief de elf afwijkende SOVON-bezoektotalen. Het historische NDFF-auditspoor blijft bestaan; SOVON is bij gecombineerd gebruik leidend en beide waarden worden niet opgeteld. Voor M6 vermeldt de download teller</w:t>
+      </w:r>
+      <w:r>
+        <w:t xml:space="preserve"> </w:t>
+      </w:r>
+      <w:r>
+        <w:rPr>
+          <w:rStyle w:val="VerbatimChar"/>
+        </w:rPr>
+        <w:t xml:space="preserve">JASQ00</w:t>
+      </w:r>
+      <w:r>
+        <w:t xml:space="preserve">. Het verslag noemt T. Lansink voor M6 en M61 en J. van As voor M83; de database koppelt M6 en M61 aan</w:t>
+      </w:r>
+      <w:r>
+        <w:t xml:space="preserve"> </w:t>
+      </w:r>
+      <w:r>
+        <w:rPr>
+          <w:rStyle w:val="VerbatimChar"/>
+        </w:rPr>
+        <w:t xml:space="preserve">ALNK00</w:t>
+      </w:r>
+      <w:r>
+        <w:t xml:space="preserve"> </w:t>
+      </w:r>
+      <w:r>
+        <w:t xml:space="preserve">en M83 aan</w:t>
+      </w:r>
+      <w:r>
+        <w:t xml:space="preserve"> </w:t>
+      </w:r>
+      <w:r>
+        <w:rPr>
+          <w:rStyle w:val="VerbatimChar"/>
+        </w:rPr>
+        <w:t xml:space="preserve">JASQ00</w:t>
+      </w:r>
+      <w:r>
+        <w:t xml:space="preserve">. De downloadcode bij M6 is daarom niet overgenomen.</w:t>
+      </w:r>
+    </w:p>
+    <w:p>
+      <w:pPr>
+        <w:pStyle w:val="BodyText"/>
+      </w:pPr>
+      <w:r>
+        <w:rPr>
+          <w:b/>
+          <w:bCs/>
+        </w:rPr>
+        <w:t xml:space="preserve">Controlejaren 2008-2022, afgerond.</w:t>
+      </w:r>
+      <w:r>
+        <w:t xml:space="preserve"> </w:t>
+      </w:r>
+      <w:r>
+        <w:t xml:space="preserve">De vijftien downloads bevatten 6.306 in-scope bezoeken. Zij staan alle al in</w:t>
       </w:r>
       <w:r>
         <w:t xml:space="preserve"> </w:t>
@@ -1305,141 +1808,19 @@
         <w:t xml:space="preserve">dagbezoeken_bmp</w:t>
       </w:r>
       <w:r>
-        <w:t xml:space="preserve">. De vogelmatrix bevat 1.088 positieve waarden, 1.788 letterlijke nulcellen en 2.116 lege cellen. Van de positieve waarden zijn 1.081 gelijk aan bestaande SOVON-regels. De zeven overige positieve waarden zijn Stormmeeuw, Kleine Mantelmeeuw en Zilvermeeuw op M15 en M16 en Kleine Mantelmeeuw op M8. Zij zijn niet toegevoegd, omdat</w:t>
-      </w:r>
-      <w:r>
-        <w:t xml:space="preserve"> </w:t>
-      </w:r>
-      <w:r>
-        <w:rPr>
-          <w:rStyle w:val="VerbatimChar"/>
-        </w:rPr>
-        <w:t xml:space="preserve">meeuwen_literatuur</w:t>
-      </w:r>
-      <w:r>
-        <w:t xml:space="preserve"> </w:t>
-      </w:r>
-      <w:r>
-        <w:t xml:space="preserve">voor deze combinaties leidend blijft. Alle 1.788 letterlijke nullen waren niet-conflicterend en zijn als</w:t>
-      </w:r>
-      <w:r>
-        <w:t xml:space="preserve"> </w:t>
-      </w:r>
-      <w:r>
-        <w:rPr>
-          <w:rStyle w:val="VerbatimChar"/>
-        </w:rPr>
-        <w:t xml:space="preserve">territoria = 0</w:t>
-      </w:r>
-      <w:r>
-        <w:t xml:space="preserve"> </w:t>
-      </w:r>
-      <w:r>
-        <w:t xml:space="preserve">met SOVON als bron toegevoegd. De 32 lege cellen binnen bezochte plots met overige resultaten, de 49 uitsluitend lege M35-cellen, de twee lege M8-cellen en de 2.033 lege cellen in 25 niet-bezochte plots zijn niet ingevoerd.</w:t>
-      </w:r>
-    </w:p>
-    <w:p>
-      <w:pPr>
-        <w:pStyle w:val="BodyText"/>
-      </w:pPr>
-      <w:r>
-        <w:t xml:space="preserve">Het bezoektotalenbestand vermeldt bij 1.091 soort-plotregels telkens één niet-bruikbare waarneming, dus 1.091 aggregaatvermeldingen, maar bevat geen individuele bron-ID, bezoek, datum, broedcode, locatie of formele afkeurstatus. Deze vermeldingen zijn daarom niet als formeel afgekeurde waarnemingen gereconstrueerd. Voor M66 HGC ontbreekt een tellercode in zowel de download als</w:t>
-      </w:r>
-      <w:r>
-        <w:t xml:space="preserve"> </w:t>
-      </w:r>
-      <w:r>
-        <w:rPr>
-          <w:rStyle w:val="VerbatimChar"/>
-        </w:rPr>
-        <w:t xml:space="preserve">plot_jaar_teller</w:t>
-      </w:r>
-      <w:r>
-        <w:t xml:space="preserve">; dit veld blijft leeg. De overige 29 plots met resultaten hebben al een database-tellercode. M8 heeft 41 positieve waarden, 57 letterlijke nullen en twee lege cellen, maar geen bezoekregels in de SOVON-download of</w:t>
-      </w:r>
-      <w:r>
-        <w:t xml:space="preserve"> </w:t>
-      </w:r>
-      <w:r>
-        <w:rPr>
-          <w:rStyle w:val="VerbatimChar"/>
-        </w:rPr>
-        <w:t xml:space="preserve">dagbezoeken_bmp</w:t>
-      </w:r>
-      <w:r>
-        <w:t xml:space="preserve">. Het jaarverslag noemt R. Wanders als teller en twaalf BMP-bezoeken; de bestaande databasecode</w:t>
-      </w:r>
-      <w:r>
-        <w:t xml:space="preserve"> </w:t>
-      </w:r>
-      <w:r>
-        <w:rPr>
-          <w:rStyle w:val="VerbatimChar"/>
-        </w:rPr>
-        <w:t xml:space="preserve">RWNS00</w:t>
-      </w:r>
-      <w:r>
-        <w:t xml:space="preserve"> </w:t>
-      </w:r>
-      <w:r>
-        <w:t xml:space="preserve">blijft staan. De twaalf verslagbezoeken zijn niet als SOVON-bezoeken gereconstrueerd. M35 heeft zeven SOVON-bezoeken maar uitsluitend 49 lege matrixcellen. In de database staan voor M35 zeventien jaarverslagregels met samen 54 territoria en één</w:t>
-      </w:r>
-      <w:r>
-        <w:t xml:space="preserve"> </w:t>
-      </w:r>
-      <w:r>
-        <w:rPr>
-          <w:rStyle w:val="VerbatimChar"/>
-        </w:rPr>
-        <w:t xml:space="preserve">meeuwen_literatuur</w:t>
-      </w:r>
-      <w:r>
-        <w:t xml:space="preserve">-regel met 64 territoria; deze bronnen blijven gescheiden van SOVON.</w:t>
-      </w:r>
-    </w:p>
-    <w:p>
-      <w:pPr>
-        <w:pStyle w:val="BodyText"/>
-      </w:pPr>
-      <w:r>
-        <w:rPr>
-          <w:b/>
-          <w:bCs/>
-        </w:rPr>
-        <w:t xml:space="preserve">Jaarcontroles 1988-2004, 3 oktober 2026.</w:t>
-      </w:r>
-      <w:r>
-        <w:t xml:space="preserve"> </w:t>
-      </w:r>
-      <w:r>
-        <w:t xml:space="preserve">De zeventien SOVON-downloads bevatten samen 5.141 in-scope bezoeken. Alle 5.141 stonden al op bron-ID en inhoud gelijk in</w:t>
-      </w:r>
-      <w:r>
-        <w:t xml:space="preserve"> </w:t>
-      </w:r>
-      <w:r>
-        <w:rPr>
-          <w:rStyle w:val="VerbatimChar"/>
-        </w:rPr>
-        <w:t xml:space="preserve">dagbezoeken_bmp</w:t>
-      </w:r>
-      <w:r>
-        <w:t xml:space="preserve">; er is geen bezoek toegevoegd of gewijzigd. De matrices bevatten na uitsluiting van De Horsten samen 19.197 positieve SOVON-resultaten. Die waren gelijk aan de bestaande SOVON-regels, behoudens meeuwencombinaties waarvoor een aanwezige regel uit</w:t>
-      </w:r>
-      <w:r>
-        <w:t xml:space="preserve"> </w:t>
-      </w:r>
-      <w:r>
-        <w:rPr>
-          <w:rStyle w:val="VerbatimChar"/>
-        </w:rPr>
-        <w:t xml:space="preserve">meeuwen_literatuur</w:t>
-      </w:r>
-      <w:r>
-        <w:t xml:space="preserve"> </w:t>
-      </w:r>
-      <w:r>
-        <w:t xml:space="preserve">leidend bleef. In</w:t>
+        <w:t xml:space="preserve">; bij 154 bezoeken verschilt uitsluitend afsluitende witruimte in</w:t>
+      </w:r>
+      <w:r>
+        <w:t xml:space="preserve"> </w:t>
+      </w:r>
+      <w:r>
+        <w:rPr>
+          <w:rStyle w:val="VerbatimChar"/>
+        </w:rPr>
+        <w:t xml:space="preserve">opmerking</w:t>
+      </w:r>
+      <w:r>
+        <w:t xml:space="preserve">, zodat geen bezoek is gewijzigd. Aan</w:t>
       </w:r>
       <w:r>
         <w:t xml:space="preserve"> </w:t>
@@ -1454,99 +1835,7 @@
         <w:t xml:space="preserve"> </w:t>
       </w:r>
       <w:r>
-        <w:t xml:space="preserve">zijn per jaar uitsluitend de volgende aantallen letterlijke, niet-conflicterende SOVON-nullen toegevoegd: 1988 1.444; 1989 1.512; 1990 1.622; 1991 1.761; 1992 1.739; 1993 2.057; 1994 1.838; 1995 1.811; 1996 1.797; 1997 1.829; 1998 1.834; 1999 1.873; 2000 1.773; 2001 1.846; 2002 1.884; 2003 1.854; 2004 1.984. Samen zijn dit 30.458 nieuwe regels.</w:t>
-      </w:r>
-      <w:r>
-        <w:t xml:space="preserve"> </w:t>
-      </w:r>
-      <w:r>
-        <w:rPr>
-          <w:rStyle w:val="VerbatimChar"/>
-        </w:rPr>
-        <w:t xml:space="preserve">territoria</w:t>
-      </w:r>
-      <w:r>
-        <w:t xml:space="preserve"> </w:t>
-      </w:r>
-      <w:r>
-        <w:t xml:space="preserve">bevat daarna 106.921 regels. Alle nieuwe nulregels zijn via</w:t>
-      </w:r>
-      <w:r>
-        <w:t xml:space="preserve"> </w:t>
-      </w:r>
-      <w:r>
-        <w:rPr>
-          <w:rStyle w:val="VerbatimChar"/>
-        </w:rPr>
-        <w:t xml:space="preserve">soorten</w:t>
-      </w:r>
-      <w:r>
-        <w:t xml:space="preserve">,</w:t>
-      </w:r>
-      <w:r>
-        <w:t xml:space="preserve"> </w:t>
-      </w:r>
-      <w:r>
-        <w:rPr>
-          <w:rStyle w:val="VerbatimChar"/>
-        </w:rPr>
-        <w:t xml:space="preserve">taxa_bronkoppeling</w:t>
-      </w:r>
-      <w:r>
-        <w:t xml:space="preserve">,</w:t>
-      </w:r>
-      <w:r>
-        <w:t xml:space="preserve"> </w:t>
-      </w:r>
-      <w:r>
-        <w:rPr>
-          <w:rStyle w:val="VerbatimChar"/>
-        </w:rPr>
-        <w:t xml:space="preserve">taxa</w:t>
-      </w:r>
-      <w:r>
-        <w:t xml:space="preserve"> </w:t>
-      </w:r>
-      <w:r>
-        <w:t xml:space="preserve">en</w:t>
-      </w:r>
-      <w:r>
-        <w:t xml:space="preserve"> </w:t>
-      </w:r>
-      <w:r>
-        <w:rPr>
-          <w:rStyle w:val="VerbatimChar"/>
-        </w:rPr>
-        <w:t xml:space="preserve">taxon_groepen</w:t>
-      </w:r>
-      <w:r>
-        <w:t xml:space="preserve"> </w:t>
-      </w:r>
-      <w:r>
-        <w:t xml:space="preserve">als vogels bereikbaar; de jaarlijkse databasebrede nacontrole omvat 128 routes en geeft nul fouten.</w:t>
-      </w:r>
-    </w:p>
-    <w:p>
-      <w:pPr>
-        <w:pStyle w:val="BodyText"/>
-      </w:pPr>
-      <w:r>
-        <w:t xml:space="preserve">In 1991 zijn vier SOVON-meeuwennullen niet ingevoerd omdat voor dezelfde plot-soortcombinatie een positieve, leidende waarde uit</w:t>
-      </w:r>
-      <w:r>
-        <w:t xml:space="preserve"> </w:t>
-      </w:r>
-      <w:r>
-        <w:rPr>
-          <w:rStyle w:val="VerbatimChar"/>
-        </w:rPr>
-        <w:t xml:space="preserve">meeuwen_literatuur</w:t>
-      </w:r>
-      <w:r>
-        <w:t xml:space="preserve"> </w:t>
-      </w:r>
-      <w:r>
-        <w:t xml:space="preserve">bestaat. Een retroactieve afwezigheidscontrole over 1984-2004 houdt 1.309</w:t>
+        <w:t xml:space="preserve">zijn 37.213 letterlijke, niet-conflicterende SOVON-nullen toegevoegd. Lege cellen zijn niet ingevoerd. Bestaande Meijendelwaarden die in de download ontbreken zijn behouden. De 81 positieve downloadwaarden uit 2022 voor M105, M71 en M36 staan al met exact dezelfde aantallen onder</w:t>
       </w:r>
       <w:r>
         <w:t xml:space="preserve"> </w:t>
@@ -1558,84 +1847,7 @@
         <w:t xml:space="preserve">jrvslg_m</w:t>
       </w:r>
       <w:r>
-        <w:t xml:space="preserve">-regels en 70</w:t>
-      </w:r>
-      <w:r>
-        <w:t xml:space="preserve"> </w:t>
-      </w:r>
-      <w:r>
-        <w:rPr>
-          <w:rStyle w:val="VerbatimChar"/>
-        </w:rPr>
-        <w:t xml:space="preserve">meeuwen_literatuur</w:t>
-      </w:r>
-      <w:r>
-        <w:t xml:space="preserve">-regels bewust in stand: de SOVON-matrix bevat voor die combinaties geen positieve of letterlijke nulwaarde, en ontbreken in de download is geen wijzigings- of verwijderingsgrond. Jaarverslagen zijn ieder jaar gebruikt om ontbrekende tellers en andere bronverschillen te verklaren. In 1988-2004 leverde dit geen ontbrekende tellerkoppeling op; waar database en download geen teller bevatten, noemde ook het verslag geen ondubbelzinnig aan een bestaande code koppelbare waarnemer voor dat plotjaar.</w:t>
-      </w:r>
-    </w:p>
-    <w:p>
-      <w:pPr>
-        <w:pStyle w:val="BodyText"/>
-      </w:pPr>
-      <w:r>
-        <w:t xml:space="preserve">De Horsten behoort niet tot Meijendel. Uit de download van 1996 zijn daarom negen bezoeken, 41 positieve resultaten met samen 636 territoria, 30 letterlijke nullen en vier lege cellen volledig genegeerd. De uitsluitend lege selecties van De Horsten in volgende jaren zijn eveneens buiten de vergelijking gehouden. Voor 2000 verklaart het jaarverslag de lege SOVON-resultaten van M35: de werkgroep telde M35 en M36 wel, maar stuurde die resultaten dat jaar niet aan SOVON. De bestaande</w:t>
-      </w:r>
-      <w:r>
-        <w:t xml:space="preserve"> </w:t>
-      </w:r>
-      <w:r>
-        <w:rPr>
-          <w:rStyle w:val="VerbatimChar"/>
-        </w:rPr>
-        <w:t xml:space="preserve">jrvslg_m</w:t>
-      </w:r>
-      <w:r>
-        <w:t xml:space="preserve">-regels blijven daarom staan; uit de lege SOVON-cellen is niets afgeleid.</w:t>
-      </w:r>
-    </w:p>
-    <w:p>
-      <w:pPr>
-        <w:pStyle w:val="BodyText"/>
-      </w:pPr>
-      <w:r>
-        <w:rPr>
-          <w:b/>
-          <w:bCs/>
-        </w:rPr>
-        <w:t xml:space="preserve">Controlejaar 2005, afgerond.</w:t>
-      </w:r>
-      <w:r>
-        <w:t xml:space="preserve"> </w:t>
-      </w:r>
-      <w:r>
-        <w:t xml:space="preserve">De 111 geleverde bezoeken staan veld voor veld gelijk in</w:t>
-      </w:r>
-      <w:r>
-        <w:t xml:space="preserve"> </w:t>
-      </w:r>
-      <w:r>
-        <w:rPr>
-          <w:rStyle w:val="VerbatimChar"/>
-        </w:rPr>
-        <w:t xml:space="preserve">dagbezoeken_bmp</w:t>
-      </w:r>
-      <w:r>
-        <w:t xml:space="preserve">; 1.156 positieve vogelresultaten zijn gelijk. De 1.999 letterlijke, niet-conflicterende vogelnullen zijn in</w:t>
-      </w:r>
-      <w:r>
-        <w:t xml:space="preserve"> </w:t>
-      </w:r>
-      <w:r>
-        <w:rPr>
-          <w:rStyle w:val="VerbatimChar"/>
-        </w:rPr>
-        <w:t xml:space="preserve">territoria</w:t>
-      </w:r>
-      <w:r>
-        <w:t xml:space="preserve"> </w:t>
-      </w:r>
-      <w:r>
-        <w:t xml:space="preserve">opgenomen; 1.766 lege cellen niet. De puntenlaag bevat nul features. Het bezoektotalenbestand bevat daarnaast 101 positieve zoogdierregels op 58 bestaande BMP-bezoeken in zeven plots: Konijn 46 regels met totaal 241, Ree 34 met totaal 89, Vos 15 met totaal 22, Eekhoorn vijf met totaal 6 en Dwergspitsmuis één met totaal 1. Twintig waarden waren al gelijk. De overige 81 SOVON-regels met 284 dieren op 46 bezoeken zijn afzonderlijk opgenomen onder</w:t>
+        <w:t xml:space="preserve">; een tweede SOVON-kopie is daarom niet gemaakt. Voor 2008-2022 staan 3.929 aanvullende positieve zoogdierregels op 2.334 bezoeken onder</w:t>
       </w:r>
       <w:r>
         <w:t xml:space="preserve"> </w:t>
@@ -1647,246 +1859,6 @@
         <w:t xml:space="preserve">sovon-bmp-jaarbestanden-v1</w:t>
       </w:r>
       <w:r>
-        <w:t xml:space="preserve">; daaronder vallen ook de twee afwijkende Konijnwaarden in M16. Bezoek 365793 bevat SOVON 2 naast NDFF 9 en bezoek 365789 bevat SOVON 1 naast NDFF 3. Het NDFF-auditspoor blijft staan; SOVON is bij gecombineerd gebruik leidend. Er zijn geen zoogdiernullen afgeleid.</w:t>
-      </w:r>
-    </w:p>
-    <w:p>
-      <w:pPr>
-        <w:pStyle w:val="BodyText"/>
-      </w:pPr>
-      <w:r>
-        <w:rPr>
-          <w:b/>
-          <w:bCs/>
-        </w:rPr>
-        <w:t xml:space="preserve">Controlejaar 2006, afgerond.</w:t>
-      </w:r>
-      <w:r>
-        <w:t xml:space="preserve"> </w:t>
-      </w:r>
-      <w:r>
-        <w:t xml:space="preserve">De 172 geleverde bezoeken staan veld voor veld gelijk in</w:t>
-      </w:r>
-      <w:r>
-        <w:t xml:space="preserve"> </w:t>
-      </w:r>
-      <w:r>
-        <w:rPr>
-          <w:rStyle w:val="VerbatimChar"/>
-        </w:rPr>
-        <w:t xml:space="preserve">dagbezoeken_bmp</w:t>
-      </w:r>
-      <w:r>
-        <w:t xml:space="preserve">; 1.069 positieve vogelresultaten zijn gelijk. De 1.865 letterlijke, niet-conflicterende vogelnullen zijn in</w:t>
-      </w:r>
-      <w:r>
-        <w:t xml:space="preserve"> </w:t>
-      </w:r>
-      <w:r>
-        <w:rPr>
-          <w:rStyle w:val="VerbatimChar"/>
-        </w:rPr>
-        <w:t xml:space="preserve">territoria</w:t>
-      </w:r>
-      <w:r>
-        <w:t xml:space="preserve"> </w:t>
-      </w:r>
-      <w:r>
-        <w:t xml:space="preserve">opgenomen; 1.987 lege cellen niet. De puntenlaag bevat nul features. Het bezoektotalenbestand bevat 159 positieve zoogdierregels. Daarvan waren 36 gelijk. Onder</w:t>
-      </w:r>
-      <w:r>
-        <w:t xml:space="preserve"> </w:t>
-      </w:r>
-      <w:r>
-        <w:rPr>
-          <w:rStyle w:val="VerbatimChar"/>
-        </w:rPr>
-        <w:t xml:space="preserve">sovon-bmp-jaarbestanden-v1</w:t>
-      </w:r>
-      <w:r>
-        <w:t xml:space="preserve"> </w:t>
-      </w:r>
-      <w:r>
-        <w:t xml:space="preserve">zijn 123 aanvullende regels met samen 523 dieren op 72 bezoeken opgenomen zonder nulafleiding. Daaronder staan acht afwijkende SOVON-bezoektotalen naast het NDFF-auditspoor; SOVON is bij gecombineerd gebruik leidend.</w:t>
-      </w:r>
-    </w:p>
-    <w:p>
-      <w:pPr>
-        <w:pStyle w:val="BodyText"/>
-      </w:pPr>
-      <w:r>
-        <w:rPr>
-          <w:b/>
-          <w:bCs/>
-        </w:rPr>
-        <w:t xml:space="preserve">Controlejaar 2007, afgerond.</w:t>
-      </w:r>
-      <w:r>
-        <w:t xml:space="preserve"> </w:t>
-      </w:r>
-      <w:r>
-        <w:t xml:space="preserve">De 172 geleverde bezoeken staan veld voor veld gelijk in</w:t>
-      </w:r>
-      <w:r>
-        <w:t xml:space="preserve"> </w:t>
-      </w:r>
-      <w:r>
-        <w:rPr>
-          <w:rStyle w:val="VerbatimChar"/>
-        </w:rPr>
-        <w:t xml:space="preserve">dagbezoeken_bmp</w:t>
-      </w:r>
-      <w:r>
-        <w:t xml:space="preserve">; 1.166 positieve vogelresultaten zijn gelijk. Alle 1.924 letterlijke vogelnullen zijn in</w:t>
-      </w:r>
-      <w:r>
-        <w:t xml:space="preserve"> </w:t>
-      </w:r>
-      <w:r>
-        <w:rPr>
-          <w:rStyle w:val="VerbatimChar"/>
-        </w:rPr>
-        <w:t xml:space="preserve">territoria</w:t>
-      </w:r>
-      <w:r>
-        <w:t xml:space="preserve"> </w:t>
-      </w:r>
-      <w:r>
-        <w:t xml:space="preserve">opgenomen; 1.831 lege cellen niet. Het bezoektotalenbestand bevat 249 positieve zoogdierregels. Daarvan waren 101 al gelijk. Onder</w:t>
-      </w:r>
-      <w:r>
-        <w:t xml:space="preserve"> </w:t>
-      </w:r>
-      <w:r>
-        <w:rPr>
-          <w:rStyle w:val="VerbatimChar"/>
-        </w:rPr>
-        <w:t xml:space="preserve">sovon-bmp-jaarbestanden-v1</w:t>
-      </w:r>
-      <w:r>
-        <w:t xml:space="preserve"> </w:t>
-      </w:r>
-      <w:r>
-        <w:t xml:space="preserve">staan 148 aanvullende regels met 692 dieren op 84 bezoeken, inclusief de elf afwijkende SOVON-bezoektotalen. Het historische NDFF-auditspoor blijft bestaan; SOVON is bij gecombineerd gebruik leidend en beide waarden worden niet opgeteld. Voor M6 vermeldt de download teller</w:t>
-      </w:r>
-      <w:r>
-        <w:t xml:space="preserve"> </w:t>
-      </w:r>
-      <w:r>
-        <w:rPr>
-          <w:rStyle w:val="VerbatimChar"/>
-        </w:rPr>
-        <w:t xml:space="preserve">JASQ00</w:t>
-      </w:r>
-      <w:r>
-        <w:t xml:space="preserve">. Het verslag noemt T. Lansink voor M6 en M61 en J. van As voor M83; de database koppelt M6 en M61 aan</w:t>
-      </w:r>
-      <w:r>
-        <w:t xml:space="preserve"> </w:t>
-      </w:r>
-      <w:r>
-        <w:rPr>
-          <w:rStyle w:val="VerbatimChar"/>
-        </w:rPr>
-        <w:t xml:space="preserve">ALNK00</w:t>
-      </w:r>
-      <w:r>
-        <w:t xml:space="preserve"> </w:t>
-      </w:r>
-      <w:r>
-        <w:t xml:space="preserve">en M83 aan</w:t>
-      </w:r>
-      <w:r>
-        <w:t xml:space="preserve"> </w:t>
-      </w:r>
-      <w:r>
-        <w:rPr>
-          <w:rStyle w:val="VerbatimChar"/>
-        </w:rPr>
-        <w:t xml:space="preserve">JASQ00</w:t>
-      </w:r>
-      <w:r>
-        <w:t xml:space="preserve">. De downloadcode bij M6 is daarom niet overgenomen.</w:t>
-      </w:r>
-    </w:p>
-    <w:p>
-      <w:pPr>
-        <w:pStyle w:val="BodyText"/>
-      </w:pPr>
-      <w:r>
-        <w:rPr>
-          <w:b/>
-          <w:bCs/>
-        </w:rPr>
-        <w:t xml:space="preserve">Controlejaren 2008-2022, afgerond.</w:t>
-      </w:r>
-      <w:r>
-        <w:t xml:space="preserve"> </w:t>
-      </w:r>
-      <w:r>
-        <w:t xml:space="preserve">De vijftien downloads bevatten 6.306 in-scope bezoeken. Zij staan alle al in</w:t>
-      </w:r>
-      <w:r>
-        <w:t xml:space="preserve"> </w:t>
-      </w:r>
-      <w:r>
-        <w:rPr>
-          <w:rStyle w:val="VerbatimChar"/>
-        </w:rPr>
-        <w:t xml:space="preserve">dagbezoeken_bmp</w:t>
-      </w:r>
-      <w:r>
-        <w:t xml:space="preserve">; bij 154 bezoeken verschilt uitsluitend afsluitende witruimte in</w:t>
-      </w:r>
-      <w:r>
-        <w:t xml:space="preserve"> </w:t>
-      </w:r>
-      <w:r>
-        <w:rPr>
-          <w:rStyle w:val="VerbatimChar"/>
-        </w:rPr>
-        <w:t xml:space="preserve">opmerking</w:t>
-      </w:r>
-      <w:r>
-        <w:t xml:space="preserve">, zodat geen bezoek is gewijzigd. Aan</w:t>
-      </w:r>
-      <w:r>
-        <w:t xml:space="preserve"> </w:t>
-      </w:r>
-      <w:r>
-        <w:rPr>
-          <w:rStyle w:val="VerbatimChar"/>
-        </w:rPr>
-        <w:t xml:space="preserve">territoria</w:t>
-      </w:r>
-      <w:r>
-        <w:t xml:space="preserve"> </w:t>
-      </w:r>
-      <w:r>
-        <w:t xml:space="preserve">zijn 37.213 letterlijke, niet-conflicterende SOVON-nullen toegevoegd. Lege cellen zijn niet ingevoerd. Bestaande Meijendelwaarden die in de download ontbreken zijn behouden. De 81 positieve downloadwaarden uit 2022 voor M105, M71 en M36 staan al met exact dezelfde aantallen onder</w:t>
-      </w:r>
-      <w:r>
-        <w:t xml:space="preserve"> </w:t>
-      </w:r>
-      <w:r>
-        <w:rPr>
-          <w:rStyle w:val="VerbatimChar"/>
-        </w:rPr>
-        <w:t xml:space="preserve">jrvslg_m</w:t>
-      </w:r>
-      <w:r>
-        <w:t xml:space="preserve">; een tweede SOVON-kopie is daarom niet gemaakt. Voor 2008-2022 staan 3.929 aanvullende positieve zoogdierregels op 2.334 bezoeken onder</w:t>
-      </w:r>
-      <w:r>
-        <w:t xml:space="preserve"> </w:t>
-      </w:r>
-      <w:r>
-        <w:rPr>
-          <w:rStyle w:val="VerbatimChar"/>
-        </w:rPr>
-        <w:t xml:space="preserve">sovon-bmp-jaarbestanden-v1</w:t>
-      </w:r>
-      <w:r>
         <w:t xml:space="preserve">. Alle bronwaarden zijn na invoer gelijk aan de downloads; er zijn geen zoogdiernullen afgeleid.</w:t>
       </w:r>
     </w:p>
@@ -1912,22 +1884,7 @@
         <w:pStyle w:val="BodyText"/>
       </w:pPr>
       <w:r>
-        <w:t xml:space="preserve">Vanaf 3 oktober 2026 geldt als hoofdregel dat alle werkelijk aanvullende SOVON-gegevens in de bestaande Meijendel-kerntabellen mogen worden opgenomen. Bestaande Meijendelgegevens blijven staan wanneer zij in de download ontbreken. Alleen een afzonderlijke conflictregel kan daarvan afwijken. Een aanwezige regel uit</w:t>
-      </w:r>
-      <w:r>
-        <w:t xml:space="preserve"> </w:t>
-      </w:r>
-      <w:r>
-        <w:rPr>
-          <w:rStyle w:val="VerbatimChar"/>
-        </w:rPr>
-        <w:t xml:space="preserve">meeuwen_literatuur</w:t>
-      </w:r>
-      <w:r>
-        <w:t xml:space="preserve"> </w:t>
-      </w:r>
-      <w:r>
-        <w:t xml:space="preserve">blijft voor meeuwen leidend; zonder zo’n regel mag de SOVON-waarde aanvullen of corrigeren. Een ontbrekende teller mag vanuit het jaarverslag worden toegevoegd wanneer kavel en waarnemer ondubbelzinnig zijn en een bestaande code beschikbaar is. De Horsten wordt volledig genegeerd. Niet-conflicterende letterlijke SOVON-nullen worden zonder nieuwe jaarbeslissing opgenomen; niet tot individuele bronregels herleidbare aggregaatvermeldingen worden niet als formeel afgekeurde waarnemingen gereconstrueerd. Ieder jaar wordt eerst volledig vergeleken. Nieuwe soortenconflicten, nieuwe gegevensmodellen en wel individueel herleidbare afkeuringsinformatie blijven afzonderlijke beslispunten.</w:t>
+        <w:t>Vanaf 3 oktober 2026 geldt als hoofdregel dat alle werkelijk aanvullende SOVON-gegevens in de bestaande Meijendel-kerntabellen mogen worden opgenomen. Bestaande Meijendelgegevens blijven staan wanneer zij in de download ontbreken. Alleen een afzonderlijke conflictregel kan daarvan afwijken. Een aanwezige regel uit meeuwen_literatuur blijft voor meeuwen leidend; zonder zo'n regel mag de SOVON-waarde aanvullen of corrigeren. Een ontbrekende teller mag vanuit het jaarverslag worden toegevoegd wanneer kavel en waarnemer ondubbelzinnig zijn en een bestaande code beschikbaar is. De Horsten wordt volledig genegeerd. Niet-conflicterende letterlijke SOVON-nullen worden zonder nieuwe jaarbeslissing opgenomen; niet tot individuele bronregels herleidbare aggregaatvermeldingen worden niet als formeel afgekeurde waarnemingen gereconstrueerd. Ieder jaar wordt eerst volledig vergeleken. Nieuwe soortenconflicten, nieuwe gegevensmodellen en wel individueel herleidbare afkeuringsinformatie blijven afzonderlijke beslispunten.</w:t>
       </w:r>
     </w:p>
     <w:p>
@@ -2353,6 +2310,20 @@
     </w:p>
     <w:bookmarkEnd w:id="12"/>
     <w:bookmarkStart w:id="13" w:name="provinciale-permanente-kwadraten"/>
+    <w:p>
+      <w:pPr>
+        <w:pStyle w:val="BodyText"/>
+      </w:pPr>
+      <w:r>
+        <w:rPr>
+          <w:b/>
+        </w:rPr>
+        <w:t>Standaard analysepoort territoria, vastgesteld 4 oktober 2026.</w:t>
+      </w:r>
+      <w:r>
+        <w:t xml:space="preserve"> Batchanalyse, Shiny en de zelfstandige GEE/power-route gebruiken dezelfde statusgestuurde selectie. Binnen de standaardscope met 151.583 territoriumregels in 52 plots en 2.107 plotjaren uit 1958-2025 is uitsluitend een aanwezige bronregel een analysewaarde. De 86.693 letterlijke sovon_m-nullen uit 1984-2025 blijven nul; een ontbrekende soortregel of lege matrixcel blijft NA. De 25 formeel afgekeurde SOVON-plotjaren uit 1984-2025 leveren voor SOVON geen analysewaarde. De 60 jrvslg_m-regels en vier meeuwen_literatuur-regels voor M35 in vijf van die afgekeurde plotjaren blijven als onafhankelijke bronwaarden geldig. M66 en M91 blijven standaard uitgesloten; plots.in_gebruik bepaalt deze inhoudelijke scope niet. Een soort komt pas in de analysepopulatie wanneer binnen exact de gebruikte plot-jaar-basis minstens één geaccepteerd positief territorium aanwezig is; nulregels vullen daarna de meetmatrix aan, maar maken op zichzelf geen soort tot analysekandidaat. GEE/GLMM-kenmerkenanalyses nemen zulke nul-only-soorten niet als afzonderlijk cluster op. Een groeps-, richtlijn- of habitatgroeptotaal wordt alleen berekend wanneer alle samenstellende soortcellen voor dat plotjaar een geaccepteerde waarde hebben; een gedeeltelijke som blijft NA. De herberekende hoofd-TRIM-uitvoer over 1958-2025 bevat daardoor 156 soorten in de statuslaag, 135 soorten met minimaal één indexreeks en 94 soorten met een brugbare reeks in beide modelperioden. De Sandra-uitvoer over 25 plots in 1997-2022 bevat 132 positief waargenomen soorten en 110 formele soorttrends. Deze poort is ook de standaard voor datasets waarmee de power voor relaties met vegetatieontwikkeling of beheermaatregelen wordt beoordeeld; ontbrekende bronwaarden worden nooit stilzwijgend als afwezigheid gebruikt.</w:t>
+      </w:r>
+    </w:p>
     <w:p>
       <w:pPr>
         <w:pStyle w:val="Heading3"/>

</xml_diff>

<commit_message>
Leg bronafhankelijke nulregels vast
</commit_message>
<xml_diff>
--- a/docs/MEIJENDEL_BRONREGISTER.docx
+++ b/docs/MEIJENDEL_BRONREGISTER.docx
@@ -13,16 +13,14 @@
     </w:p>
     <w:p>
       <w:pPr>
-        <w:pStyle w:val="BodyText"/>
-      </w:pPr>
-      <w:r>
-        <w:rPr>
-          <w:b/>
-        </w:rPr>
-        <w:t>Stand: 4 oktober 2026.</w:t>
-      </w:r>
-      <w:r>
-        <w:t xml:space="preserve"> </w:t>
+        <w:pStyle w:val="FirstParagraph"/>
+      </w:pPr>
+      <w:r>
+        <w:rPr>
+          <w:b/>
+          <w:bCs/>
+        </w:rPr>
+        <w:t xml:space="preserve">Stand: 6 oktober 2026.</w:t>
       </w:r>
     </w:p>
     <w:p>
@@ -836,7 +834,190 @@
         <w:pStyle w:val="BodyText"/>
       </w:pPr>
       <w:r>
-        <w:t>De 42 territoriummatrices bevatten 222.852 plot-soortregels: 52.450 positieve resultaten, 86.983 expliciete nulcellen en 83.419 lege cellen. Een lege cel geldt niet als nul. De puntlagen bevatten 22.305 bronwaarnemingen die nog niet in dagwaarnemingen_bmp staan; omgekeerd ontbreekt geen bestaande SOVON-bron-ID in de nieuwe levering. Bij 2.629 gedeelde bron-ID's levert SOVON broedcode 0 terwijl de database NULL bevat. De downloads bevatten geen zelfstandig veld dat een telling formeel als afgekeurd markeert. Vergelijking en eventuele verrijking volgen daarom per jaar. Daarbij worden BMP-type, standaard alle soorten of een expliciete uitzondering, volledig geteld, goedgekeurd of formeel afgekeurd en de toepasselijke officiële soortenlijst afzonderlijk vastgelegd. Broedcode 0 blijft een positieve vogelwaarneming. Tellercodes worden per jaar gecontroleerd.</w:t>
+        <w:t xml:space="preserve">De 42 territoriummatrices bevatten 222.852 plot-soortregels: 52.450 positieve resultaten, 86.983 expliciete nulcellen en 83.419 lege cellen. Een lege cel geldt niet als nul. De puntlagen bevatten 22.305 bronwaarnemingen die nog niet in</w:t>
+      </w:r>
+      <w:r>
+        <w:t xml:space="preserve"> </w:t>
+      </w:r>
+      <w:r>
+        <w:rPr>
+          <w:rStyle w:val="VerbatimChar"/>
+        </w:rPr>
+        <w:t xml:space="preserve">dagwaarnemingen_bmp</w:t>
+      </w:r>
+      <w:r>
+        <w:t xml:space="preserve"> </w:t>
+      </w:r>
+      <w:r>
+        <w:t xml:space="preserve">staan; omgekeerd ontbreekt geen bestaande SOVON-bron-ID in de nieuwe levering. Bij 2.629 gedeelde bron-ID’s levert SOVON broedcode 0 terwijl de database</w:t>
+      </w:r>
+      <w:r>
+        <w:t xml:space="preserve"> </w:t>
+      </w:r>
+      <w:r>
+        <w:rPr>
+          <w:rStyle w:val="VerbatimChar"/>
+        </w:rPr>
+        <w:t xml:space="preserve">NULL</w:t>
+      </w:r>
+      <w:r>
+        <w:t xml:space="preserve"> </w:t>
+      </w:r>
+      <w:r>
+        <w:t xml:space="preserve">bevat. De downloads bevatten geen zelfstandig veld dat een telling formeel als afgekeurd markeert. Vergelijking en eventuele verrijking volgen daarom per jaar. Daarbij worden BMP-type, standaard alle soorten of een expliciete uitzondering, volledig geteld, goedgekeurd of formeel afgekeurd en de toepasselijke officiële soortenlijst afzonderlijk vastgelegd. Broedcode 0 blijft een positieve vogelwaarneming. Tellercodes worden per jaar gecontroleerd.</w:t>
+      </w:r>
+    </w:p>
+    <w:p>
+      <w:pPr>
+        <w:pStyle w:val="BodyText"/>
+      </w:pPr>
+      <w:r>
+        <w:rPr>
+          <w:b/>
+          <w:bCs/>
+        </w:rPr>
+        <w:t xml:space="preserve">Betekenis van SOVON-nullen, bevestigd 6 oktober 2026.</w:t>
+      </w:r>
+      <w:r>
+        <w:t xml:space="preserve"> </w:t>
+      </w:r>
+      <w:r>
+        <w:t xml:space="preserve">SOVON Helpdesk heeft schriftelijk bevestigd dat in een Excel-download van alle jaren</w:t>
+      </w:r>
+      <w:r>
+        <w:t xml:space="preserve"> </w:t>
+      </w:r>
+      <w:r>
+        <w:rPr>
+          <w:rStyle w:val="VerbatimChar"/>
+        </w:rPr>
+        <w:t xml:space="preserve">0</w:t>
+      </w:r>
+      <w:r>
+        <w:t xml:space="preserve"> </w:t>
+      </w:r>
+      <w:r>
+        <w:t xml:space="preserve">een harde nul is: de soort is onderzocht maar niet vastgesteld. Als de soort niet is onderzocht, blijft de Excel-cel leeg. Deze betekenis geldt voor alle SOVON-territoriummatrices die in dit project zijn gebruikt. De huidige database en TRIM-poort volgen dit onderscheid: een letterlijke, niet-conflicterende en niet-afgekeurde SOVON-nul is</w:t>
+      </w:r>
+      <w:r>
+        <w:t xml:space="preserve"> </w:t>
+      </w:r>
+      <w:r>
+        <w:rPr>
+          <w:rStyle w:val="VerbatimChar"/>
+        </w:rPr>
+        <w:t xml:space="preserve">0</w:t>
+      </w:r>
+      <w:r>
+        <w:t xml:space="preserve">; een lege SOVON-cel blijft</w:t>
+      </w:r>
+      <w:r>
+        <w:t xml:space="preserve"> </w:t>
+      </w:r>
+      <w:r>
+        <w:rPr>
+          <w:rStyle w:val="VerbatimChar"/>
+        </w:rPr>
+        <w:t xml:space="preserve">NA</w:t>
+      </w:r>
+      <w:r>
+        <w:t xml:space="preserve">.</w:t>
+      </w:r>
+    </w:p>
+    <w:p>
+      <w:pPr>
+        <w:pStyle w:val="BodyText"/>
+      </w:pPr>
+      <w:r>
+        <w:rPr>
+          <w:b/>
+          <w:bCs/>
+        </w:rPr>
+        <w:t xml:space="preserve">Afgeleide nullen uit jaarverslagen, besluit 6 oktober 2026.</w:t>
+      </w:r>
+      <w:r>
+        <w:t xml:space="preserve"> </w:t>
+      </w:r>
+      <w:r>
+        <w:t xml:space="preserve">Voor de zelfstandige bron</w:t>
+      </w:r>
+      <w:r>
+        <w:t xml:space="preserve"> </w:t>
+      </w:r>
+      <w:r>
+        <w:rPr>
+          <w:rStyle w:val="VerbatimChar"/>
+        </w:rPr>
+        <w:t xml:space="preserve">jrvslg_m</w:t>
+      </w:r>
+      <w:r>
+        <w:t xml:space="preserve"> </w:t>
+      </w:r>
+      <w:r>
+        <w:t xml:space="preserve">geldt bij TRIM een expliciete analyseaanname. De tellers telden alle vogelsoorten. De relevante soortpool bestaat daarom uit iedere soort met ten minste één geaccepteerd positief territoriumresultaat in de volledige Meijendel-reeks 1958-2025. Als zo’n soort in een geteld jaarverslagplot ontbreekt, wordt de soort-plotjaarcombinatie als nul behandeld; het is niet vereist dat de soort in hetzelfde kalenderjaar elders is vastgesteld. Deze waarde is geen letterlijke bronnul, krijgt daarom de status</w:t>
+      </w:r>
+      <w:r>
+        <w:t xml:space="preserve"> </w:t>
+      </w:r>
+      <w:r>
+        <w:rPr>
+          <w:rStyle w:val="VerbatimChar"/>
+        </w:rPr>
+        <w:t xml:space="preserve">afgeleide_jaarverslagnul</w:t>
+      </w:r>
+      <w:r>
+        <w:t xml:space="preserve"> </w:t>
+      </w:r>
+      <w:r>
+        <w:t xml:space="preserve">en hoort niet als bronregel in</w:t>
+      </w:r>
+      <w:r>
+        <w:t xml:space="preserve"> </w:t>
+      </w:r>
+      <w:r>
+        <w:rPr>
+          <w:rStyle w:val="VerbatimChar"/>
+        </w:rPr>
+        <w:t xml:space="preserve">territoria</w:t>
+      </w:r>
+      <w:r>
+        <w:t xml:space="preserve">. Binnen 662 getelde</w:t>
+      </w:r>
+      <w:r>
+        <w:t xml:space="preserve"> </w:t>
+      </w:r>
+      <w:r>
+        <w:rPr>
+          <w:rStyle w:val="VerbatimChar"/>
+        </w:rPr>
+        <w:t xml:space="preserve">jrvslg_m</w:t>
+      </w:r>
+      <w:r>
+        <w:t xml:space="preserve">-plotjaren en een soortpool van 130 soorten zijn 67.562 zulke ontbrekende combinaties gevonden: 61.593 in 1958-1983 en 5.969 in 1984-2025. Na de bestaande selectie op eerste positieve jaar en actieve plots kunnen 14.902 cellen voor 120 soorten werkelijk in de modellen vallen: 14.254 in 1958-1983 en 648 in 1984-2025. De TRIM- en Shiny-code van 4 oktober past deze jaarverslagregel nog niet toe en laat deze cellen als</w:t>
+      </w:r>
+      <w:r>
+        <w:t xml:space="preserve"> </w:t>
+      </w:r>
+      <w:r>
+        <w:rPr>
+          <w:rStyle w:val="VerbatimChar"/>
+        </w:rPr>
+        <w:t xml:space="preserve">NA</w:t>
+      </w:r>
+      <w:r>
+        <w:t xml:space="preserve">; de lange reeksen moeten na implementatie worden herberekend. De Sandra-selectie 1997-2022 bevat geen</w:t>
+      </w:r>
+      <w:r>
+        <w:t xml:space="preserve"> </w:t>
+      </w:r>
+      <w:r>
+        <w:rPr>
+          <w:rStyle w:val="VerbatimChar"/>
+        </w:rPr>
+        <w:t xml:space="preserve">jrvslg_m</w:t>
+      </w:r>
+      <w:r>
+        <w:t xml:space="preserve">-plotjaar en verandert hierdoor niet.</w:t>
       </w:r>
     </w:p>
     <w:p>
@@ -1869,22 +2050,104 @@
       <w:r>
         <w:rPr>
           <w:b/>
-        </w:rPr>
-        <w:t>Controlejaren 2023-2025, afgerond.</w:t>
-      </w:r>
-      <w:r>
-        <w:rPr>
-          <w:b w:val="0"/>
-        </w:rPr>
-        <w:t xml:space="preserve"> De drie downloads bevatten 1.367 in-scope bezoeken. Zij staan alle al in dagbezoeken_bmp; bij 24 bezoeken verschilt uitsluitend afsluitende witruimte in opmerking. Aan territoria zijn 8.012 nieuwe letterlijke nulregels toegevoegd. M53/Zwarte Kraai 2023 is na afzonderlijk akkoord van één naar nul gecorrigeerd: de kavelmatrix levert nul en het enige territoriumpunt, met aantal 1 en broedcode 2, heeft inplot = 0. Het punt blijft als bron- en auditgegeven behouden. Voor 2023-2025 zijn 1.171 aanvullende positieve zoogdierregels op 886 bezoeken toegevoegd, inclusief buiten-plotwaarden; geen zoogdiernullen zijn afgeleid. Het verslag 2024 koppelt M75 aan Patricia van Veen. De bestaande code ANBN01 is daarom voor M75/2024 toegevoegd. Voor M51/2025 blijft de teller leeg: er is geen lokaal jaarverslag 2025 en de exportcode geldt niet zelfstandig als tellerbewijs. De positieve SOVON-resultaten voor M75/2024 en M51/2025 bleven bij deze bestandsvergelijking aanvankelijk staan, maar zijn na de afzonderlijke actuele statuscontrole van 3 oktober 2026 alsnog verwijderd omdat beide plotjaren op sovon.nl oranje-rood en afgekeurd staan. M84s/2025 is eveneens formeel afgekeurd; daarvoor stonden geen territoriumregels in de database.</w:t>
-      </w:r>
-    </w:p>
-    <w:p>
-      <w:pPr>
-        <w:pStyle w:val="BodyText"/>
-      </w:pPr>
-      <w:r>
-        <w:t>Vanaf 3 oktober 2026 geldt als hoofdregel dat alle werkelijk aanvullende SOVON-gegevens in de bestaande Meijendel-kerntabellen mogen worden opgenomen. Bestaande Meijendelgegevens blijven staan wanneer zij in de download ontbreken. Alleen een afzonderlijke conflictregel kan daarvan afwijken. Een aanwezige regel uit meeuwen_literatuur blijft voor meeuwen leidend; zonder zo'n regel mag de SOVON-waarde aanvullen of corrigeren. Een ontbrekende teller mag vanuit het jaarverslag worden toegevoegd wanneer kavel en waarnemer ondubbelzinnig zijn en een bestaande code beschikbaar is. De Horsten wordt volledig genegeerd. Niet-conflicterende letterlijke SOVON-nullen worden zonder nieuwe jaarbeslissing opgenomen; niet tot individuele bronregels herleidbare aggregaatvermeldingen worden niet als formeel afgekeurde waarnemingen gereconstrueerd. Ieder jaar wordt eerst volledig vergeleken. Nieuwe soortenconflicten, nieuwe gegevensmodellen en wel individueel herleidbare afkeuringsinformatie blijven afzonderlijke beslispunten.</w:t>
+          <w:bCs/>
+        </w:rPr>
+        <w:t xml:space="preserve">Controlejaren 2023-2025, afgerond.</w:t>
+      </w:r>
+      <w:r>
+        <w:t xml:space="preserve"> </w:t>
+      </w:r>
+      <w:r>
+        <w:t xml:space="preserve">De drie downloads bevatten 1.367 in-scope bezoeken. Zij staan alle al in</w:t>
+      </w:r>
+      <w:r>
+        <w:t xml:space="preserve"> </w:t>
+      </w:r>
+      <w:r>
+        <w:rPr>
+          <w:rStyle w:val="VerbatimChar"/>
+        </w:rPr>
+        <w:t xml:space="preserve">dagbezoeken_bmp</w:t>
+      </w:r>
+      <w:r>
+        <w:t xml:space="preserve">; bij 24 bezoeken verschilt uitsluitend afsluitende witruimte in</w:t>
+      </w:r>
+      <w:r>
+        <w:t xml:space="preserve"> </w:t>
+      </w:r>
+      <w:r>
+        <w:rPr>
+          <w:rStyle w:val="VerbatimChar"/>
+        </w:rPr>
+        <w:t xml:space="preserve">opmerking</w:t>
+      </w:r>
+      <w:r>
+        <w:t xml:space="preserve">. Aan</w:t>
+      </w:r>
+      <w:r>
+        <w:t xml:space="preserve"> </w:t>
+      </w:r>
+      <w:r>
+        <w:rPr>
+          <w:rStyle w:val="VerbatimChar"/>
+        </w:rPr>
+        <w:t xml:space="preserve">territoria</w:t>
+      </w:r>
+      <w:r>
+        <w:t xml:space="preserve"> </w:t>
+      </w:r>
+      <w:r>
+        <w:t xml:space="preserve">zijn 8.012 nieuwe letterlijke nulregels toegevoegd. M53/Zwarte Kraai 2023 is na afzonderlijk akkoord van één naar nul gecorrigeerd: de kavelmatrix levert nul en het enige territoriumpunt, met aantal 1 en broedcode 2, heeft</w:t>
+      </w:r>
+      <w:r>
+        <w:t xml:space="preserve"> </w:t>
+      </w:r>
+      <w:r>
+        <w:rPr>
+          <w:rStyle w:val="VerbatimChar"/>
+        </w:rPr>
+        <w:t xml:space="preserve">inplot = 0</w:t>
+      </w:r>
+      <w:r>
+        <w:t xml:space="preserve">. Het punt blijft als bron- en auditgegeven behouden. Voor 2023-2025 zijn 1.171 aanvullende positieve zoogdierregels op 886 bezoeken toegevoegd, inclusief buiten-plotwaarden; geen zoogdiernullen zijn afgeleid. Het verslag 2024 koppelt M75 aan Patricia van Veen. De bestaande code</w:t>
+      </w:r>
+      <w:r>
+        <w:t xml:space="preserve"> </w:t>
+      </w:r>
+      <w:r>
+        <w:rPr>
+          <w:rStyle w:val="VerbatimChar"/>
+        </w:rPr>
+        <w:t xml:space="preserve">ANBN01</w:t>
+      </w:r>
+      <w:r>
+        <w:t xml:space="preserve"> </w:t>
+      </w:r>
+      <w:r>
+        <w:t xml:space="preserve">is daarom voor M75/2024 toegevoegd. Voor M51/2025 blijft de teller leeg: er is geen lokaal jaarverslag 2025 en de exportcode geldt niet zelfstandig als tellerbewijs. De positieve SOVON-resultaten voor M75/2024 en M51/2025 bleven bij deze bestandsvergelijking aanvankelijk staan, maar zijn na de afzonderlijke actuele statuscontrole van 3 oktober 2026 alsnog verwijderd omdat beide plotjaren op sovon.nl oranje-rood en afgekeurd staan. M84s/2025 is eveneens formeel afgekeurd; daarvoor stonden geen territoriumregels in de database.</w:t>
+      </w:r>
+    </w:p>
+    <w:p>
+      <w:pPr>
+        <w:pStyle w:val="BodyText"/>
+      </w:pPr>
+      <w:r>
+        <w:t xml:space="preserve">Vanaf 3 oktober 2026 geldt als hoofdregel dat alle werkelijk aanvullende SOVON-gegevens in de bestaande Meijendel-kerntabellen mogen worden opgenomen. Bestaande Meijendelgegevens blijven staan wanneer zij in de download ontbreken. Alleen een afzonderlijke conflictregel kan daarvan afwijken. Een aanwezige regel uit</w:t>
+      </w:r>
+      <w:r>
+        <w:t xml:space="preserve"> </w:t>
+      </w:r>
+      <w:r>
+        <w:rPr>
+          <w:rStyle w:val="VerbatimChar"/>
+        </w:rPr>
+        <w:t xml:space="preserve">meeuwen_literatuur</w:t>
+      </w:r>
+      <w:r>
+        <w:t xml:space="preserve"> </w:t>
+      </w:r>
+      <w:r>
+        <w:t xml:space="preserve">blijft voor meeuwen leidend; zonder zo’n regel mag de SOVON-waarde aanvullen of corrigeren. Een ontbrekende teller mag vanuit het jaarverslag worden toegevoegd wanneer kavel en waarnemer ondubbelzinnig zijn en een bestaande code beschikbaar is. De Horsten wordt volledig genegeerd. Niet-conflicterende letterlijke SOVON-nullen worden zonder nieuwe jaarbeslissing opgenomen; niet tot individuele bronregels herleidbare aggregaatvermeldingen worden niet als formeel afgekeurde waarnemingen gereconstrueerd. Ieder jaar wordt eerst volledig vergeleken. Nieuwe soortenconflicten, nieuwe gegevensmodellen en wel individueel herleidbare afkeuringsinformatie blijven afzonderlijke beslispunten.</w:t>
       </w:r>
     </w:p>
     <w:p>
@@ -1927,10 +2190,91 @@
         <w:pStyle w:val="BodyText"/>
       </w:pPr>
       <w:r>
-        <w:rPr>
-          <w:b w:val="0"/>
-        </w:rPr>
-        <w:t>De aanvankelijk aangelegde ontvangsttabellen met kopieën van bezoeken en resultaten zijn op 2 oktober 2026 verwijderd. Over blijven vijf sovon_bmp_*-tabellen met uitsluitend niet elders aanwezige vergelijkingsmetadata: jaarlevering, plotjaarvoorwaarden, tellercodes, soortenlijstversie en soortenlijstnamen. Na afronding van de jaarvergelijking en de actuele SOVON-statuscontrole 1984-2025 bevat territoria 157.580 regels uit 1958-2025. Daarvan zijn 138.917 regels uit bron sovon_m in 1984-2025: 52.224 positieve waarden en 86.693 letterlijke nullen. dagbezoeken_bmp bevat voor 1984-2025 alle 14.455 in-scope SOVON-bezoeken uit de downloads; dagwaarnemingen_bmp bevat 600.959 vogelrecords. De download is dus geen tweede in te voeren gegevenslaag: per jaar is hij met de bestaande kerntabellen vergeleken en alleen een vastgesteld, besloten aanvullend gegeven heeft tot een wijziging geleid. De afgeleide dump, het exportmanifest en de lokale Shiny-cache zijn op 3 oktober 2026 na een geslaagde proefimport vernieuwd onder SQL-hash 57dea9216785c7c743ff2b7f6dfb06bf8af4bd7c74928b6d7560e7698ab69b83; er is niets naar de VPS gepubliceerd.</w:t>
+        <w:t xml:space="preserve">De aanvankelijk aangelegde ontvangsttabellen met kopieën van bezoeken en resultaten zijn op 2 oktober 2026 verwijderd. Over blijven vijf</w:t>
+      </w:r>
+      <w:r>
+        <w:t xml:space="preserve"> </w:t>
+      </w:r>
+      <w:r>
+        <w:rPr>
+          <w:rStyle w:val="VerbatimChar"/>
+        </w:rPr>
+        <w:t xml:space="preserve">sovon_bmp_*</w:t>
+      </w:r>
+      <w:r>
+        <w:t xml:space="preserve">-tabellen met uitsluitend niet elders aanwezige vergelijkingsmetadata: jaarlevering, plotjaarvoorwaarden, tellercodes, soortenlijstversie en soortenlijstnamen. Na afronding van de jaarvergelijking en de actuele SOVON-statuscontrole 1984-2025 bevat</w:t>
+      </w:r>
+      <w:r>
+        <w:t xml:space="preserve"> </w:t>
+      </w:r>
+      <w:r>
+        <w:rPr>
+          <w:rStyle w:val="VerbatimChar"/>
+        </w:rPr>
+        <w:t xml:space="preserve">territoria</w:t>
+      </w:r>
+      <w:r>
+        <w:t xml:space="preserve"> </w:t>
+      </w:r>
+      <w:r>
+        <w:t xml:space="preserve">157.580 regels uit 1958-2025. Daarvan zijn 138.917 regels uit bron</w:t>
+      </w:r>
+      <w:r>
+        <w:t xml:space="preserve"> </w:t>
+      </w:r>
+      <w:r>
+        <w:rPr>
+          <w:rStyle w:val="VerbatimChar"/>
+        </w:rPr>
+        <w:t xml:space="preserve">sovon_m</w:t>
+      </w:r>
+      <w:r>
+        <w:t xml:space="preserve"> </w:t>
+      </w:r>
+      <w:r>
+        <w:t xml:space="preserve">in 1984-2025: 52.224 positieve waarden en 86.693 letterlijke nullen.</w:t>
+      </w:r>
+      <w:r>
+        <w:t xml:space="preserve"> </w:t>
+      </w:r>
+      <w:r>
+        <w:rPr>
+          <w:rStyle w:val="VerbatimChar"/>
+        </w:rPr>
+        <w:t xml:space="preserve">dagbezoeken_bmp</w:t>
+      </w:r>
+      <w:r>
+        <w:t xml:space="preserve"> </w:t>
+      </w:r>
+      <w:r>
+        <w:t xml:space="preserve">bevat voor 1984-2025 alle 14.455 in-scope SOVON-bezoeken uit de downloads;</w:t>
+      </w:r>
+      <w:r>
+        <w:t xml:space="preserve"> </w:t>
+      </w:r>
+      <w:r>
+        <w:rPr>
+          <w:rStyle w:val="VerbatimChar"/>
+        </w:rPr>
+        <w:t xml:space="preserve">dagwaarnemingen_bmp</w:t>
+      </w:r>
+      <w:r>
+        <w:t xml:space="preserve"> </w:t>
+      </w:r>
+      <w:r>
+        <w:t xml:space="preserve">bevat 600.959 vogelrecords. De download is dus geen tweede in te voeren gegevenslaag: per jaar is hij met de bestaande kerntabellen vergeleken en alleen een vastgesteld, besloten aanvullend gegeven heeft tot een wijziging geleid. De afgeleide dump, het exportmanifest en de lokale Shiny-cache zijn op 3 oktober 2026 na een geslaagde proefimport vernieuwd onder SQL-hash</w:t>
+      </w:r>
+      <w:r>
+        <w:t xml:space="preserve"> </w:t>
+      </w:r>
+      <w:r>
+        <w:rPr>
+          <w:rStyle w:val="VerbatimChar"/>
+        </w:rPr>
+        <w:t xml:space="preserve">57dea9216785c7c743ff2b7f6dfb06bf8af4bd7c74928b6d7560e7698ab69b83</w:t>
+      </w:r>
+      <w:r>
+        <w:t xml:space="preserve">; er is niets naar de VPS gepubliceerd.</w:t>
       </w:r>
     </w:p>
     <w:p>
@@ -2259,71 +2603,452 @@
       <w:r>
         <w:rPr>
           <w:b/>
-        </w:rPr>
-        <w:t>Goedkeuringsstatus territoria, actueel 3 oktober 2026.</w:t>
-      </w:r>
-      <w:r>
-        <w:rPr>
-          <w:b w:val="0"/>
-        </w:rPr>
-        <w:t xml:space="preserve"> De inhoudelijke regel is dat territoria voor afgekeurde SOVON-tellingen geen actieve SOVON-uitkomsten bevat. De eerdere tussenstand van elf afgekeurde plotjaren is vervangen door een volledige visuele controle van 55 Meijendel-plots op sovon.nl voor 1984-2025; De Horsten is genegeerd. Daaruit volgen 25 formeel afgekeurde plotjaren met bezoeken of records: M35/1984-1988, M35/2000, M53/2007, M8/2008, M35 en M36/2009, M105 en M54a/2012, M53/2015, M34, M45, M8, M54b en M55/2018, M78/79/2019, M61/2021, M75 en M1a/2022, M75/2024 en M51 en M84s/2025. Zij staan met beoordelingsstatus = formeel_afgekeurd in sovon_bmp_plotjaar. De 373 SOVON-regels met samen 756 territoria voor M8/2008, M45/2018, M8/2018, M75/2024 en M51/2025 zijn na een herstelde en geteste back-up uit territoria verwijderd. Geen van de 25 plotjaren bevat nog een sovon_m-regel. Wel blijven voor M35 in 1984-1987 en 2000 60 regels uit jrvslg_m en vier uit meeuwen_literatuur, samen 481 territoria, volgens de afzonderlijke bronregels behouden. Bezoeken en individueel herleidbare waarnemingen blijven in de kerntabellen als auditspoor.</w:t>
-      </w:r>
-    </w:p>
-    <w:p>
-      <w:pPr>
-        <w:pStyle w:val="BodyText"/>
-      </w:pPr>
-      <w:r>
-        <w:rPr>
-          <w:b w:val="0"/>
-        </w:rPr>
-        <w:t>M8/2019 staat bij de actuele controle groen en vervangt daarom de eerdere afkeuringsbeslissing. De 10 bezoeken en 483 vogelwaarnemingen stonden al in de database. Uit het SOVON-standaardresultatenbestand zijn 19 positieve regels met samen 114 territoria hersteld. De 107 matrixcellen zijn allemaal leeg; er is daarom geen nul toegevoegd. De twaalf overige oranje-rode combinaties zonder bezoeken, soorten of records bevatten in de downloads samen 980 uitsluitend lege matrixcellen en nul standaardresultaten, bezoeken, waarnemingspunten en territoriumpunten. Zij zijn niet als afgekeurde telling en ook niet als plotjaarrecord vastgelegd. M35/2004 bevat wel 20 bestaande regels uit jrvslg_m, samen 44 territoria; die niet-SOVON-bron blijft ongemoeid.</w:t>
-      </w:r>
-    </w:p>
-    <w:p>
-      <w:pPr>
-        <w:pStyle w:val="BodyText"/>
-      </w:pPr>
-      <w:r>
-        <w:rPr>
-          <w:b w:val="0"/>
-        </w:rPr>
-        <w:t>M53/2007 vraagt een afzonderlijke beperking. SOVON toont 8 bezoeken, 36 soorten en 36 records, maar de acht bezoeken bevatten elk nul soorten en nul exemplaren; de detailpagina geeft aan dat uitsluitend territoriumlocaties zijn ingevoerd. De jaar-download bevat 99 lege matrixcellen en geen standaardresultaten, waarnemingspunten of territoriumpunten. De ingelogde interface biedt alleen kaart- en PDF-uitvoer, niet de individuele bron-ID, datum en bezoekkoppeling die nodig zijn voor dagwaarnemingen_bmp. Daarom zijn geen individuele waarnemingen gereconstrueerd. dagbezoeken_bmp bevat de 8 bezoeken; dagwaarnemingen_bmp en territoria bevatten voor dit plotjaar nul regels. De status en deze beperking staan wel in sovon_bmp_plotjaar.</w:t>
-      </w:r>
-    </w:p>
-    <w:p>
-      <w:pPr>
-        <w:pStyle w:val="BodyText"/>
-      </w:pPr>
-      <w:r>
-        <w:rPr>
-          <w:b/>
-        </w:rPr>
-        <w:t>Natura 2000-analysescope vogelplots, vastgesteld 1 oktober 2026 en bijgewerkt na de volledige SOVON-controle.</w:t>
-      </w:r>
-      <w:r>
-        <w:rPr>
-          <w:b w:val="0"/>
-        </w:rPr>
-        <w:t xml:space="preserve"> De geldige bronverzameling territoria bevat 157.580 regels, 54 plots en 2.164 plotjaren uit 1958-2025. M66 (Haagsche Golf Club, plot_id = 3503) bevat daarin 4.323 regels en 10.420 territoria in 39 jaren uit 1985-2025. M91 (Voorlinden, plot_id = 3514) bevat 1.674 regels en 4.672 territoria in 18 jaren uit 1993-2021. Beide plots blijven als geldige brondata bewaard, maar hebben in plot_analyse_scope onder meijendel_natura2000 de status in_scope = 0 met reden Geen onderdeel van Natura 2000-analysegebied. De standaardselectie via v_meijendel_analyseplot_actueel bevat daardoor 151.583 territoriumregels, 52 plots en 2.107 plotjaren uit 1958-2025. Repositoryberekeningen gebruiken deze scope standaard en nemen M66 en/of M91 alleen mee na een uitdrukkelijke keuze van de gebruiker. plots.in_gebruik beschrijft alleen actueel gebruik en bepaalt deze inhoudelijke grens niet.</w:t>
+          <w:bCs/>
+        </w:rPr>
+        <w:t xml:space="preserve">Goedkeuringsstatus territoria, actueel 3 oktober 2026.</w:t>
+      </w:r>
+      <w:r>
+        <w:t xml:space="preserve"> </w:t>
+      </w:r>
+      <w:r>
+        <w:t xml:space="preserve">De inhoudelijke regel is dat</w:t>
+      </w:r>
+      <w:r>
+        <w:t xml:space="preserve"> </w:t>
+      </w:r>
+      <w:r>
+        <w:rPr>
+          <w:rStyle w:val="VerbatimChar"/>
+        </w:rPr>
+        <w:t xml:space="preserve">territoria</w:t>
+      </w:r>
+      <w:r>
+        <w:t xml:space="preserve"> </w:t>
+      </w:r>
+      <w:r>
+        <w:t xml:space="preserve">voor afgekeurde SOVON-tellingen geen actieve SOVON-uitkomsten bevat. De eerdere tussenstand van elf afgekeurde plotjaren is vervangen door een volledige visuele controle van 55 Meijendel-plots op sovon.nl voor 1984-2025; De Horsten is genegeerd. Daaruit volgen 25 formeel afgekeurde plotjaren met bezoeken of records: M35/1984-1988, M35/2000, M53/2007, M8/2008, M35 en M36/2009, M105 en M54a/2012, M53/2015, M34, M45, M8, M54b en M55/2018, M78/79/2019, M61/2021, M75 en M1a/2022, M75/2024 en M51 en M84s/2025. Zij staan met</w:t>
+      </w:r>
+      <w:r>
+        <w:t xml:space="preserve"> </w:t>
+      </w:r>
+      <w:r>
+        <w:rPr>
+          <w:rStyle w:val="VerbatimChar"/>
+        </w:rPr>
+        <w:t xml:space="preserve">beoordelingsstatus = formeel_afgekeurd</w:t>
+      </w:r>
+      <w:r>
+        <w:t xml:space="preserve"> </w:t>
+      </w:r>
+      <w:r>
+        <w:t xml:space="preserve">in</w:t>
+      </w:r>
+      <w:r>
+        <w:t xml:space="preserve"> </w:t>
+      </w:r>
+      <w:r>
+        <w:rPr>
+          <w:rStyle w:val="VerbatimChar"/>
+        </w:rPr>
+        <w:t xml:space="preserve">sovon_bmp_plotjaar</w:t>
+      </w:r>
+      <w:r>
+        <w:t xml:space="preserve">. De 373 SOVON-regels met samen 756 territoria voor M8/2008, M45/2018, M8/2018, M75/2024 en M51/2025 zijn na een herstelde en geteste back-up uit</w:t>
+      </w:r>
+      <w:r>
+        <w:t xml:space="preserve"> </w:t>
+      </w:r>
+      <w:r>
+        <w:rPr>
+          <w:rStyle w:val="VerbatimChar"/>
+        </w:rPr>
+        <w:t xml:space="preserve">territoria</w:t>
+      </w:r>
+      <w:r>
+        <w:t xml:space="preserve"> </w:t>
+      </w:r>
+      <w:r>
+        <w:t xml:space="preserve">verwijderd. Geen van de 25 plotjaren bevat nog een</w:t>
+      </w:r>
+      <w:r>
+        <w:t xml:space="preserve"> </w:t>
+      </w:r>
+      <w:r>
+        <w:rPr>
+          <w:rStyle w:val="VerbatimChar"/>
+        </w:rPr>
+        <w:t xml:space="preserve">sovon_m</w:t>
+      </w:r>
+      <w:r>
+        <w:t xml:space="preserve">-regel. Wel blijven voor M35 in 1984-1987 en 2000 60 regels uit</w:t>
+      </w:r>
+      <w:r>
+        <w:t xml:space="preserve"> </w:t>
+      </w:r>
+      <w:r>
+        <w:rPr>
+          <w:rStyle w:val="VerbatimChar"/>
+        </w:rPr>
+        <w:t xml:space="preserve">jrvslg_m</w:t>
+      </w:r>
+      <w:r>
+        <w:t xml:space="preserve"> </w:t>
+      </w:r>
+      <w:r>
+        <w:t xml:space="preserve">en vier uit</w:t>
+      </w:r>
+      <w:r>
+        <w:t xml:space="preserve"> </w:t>
+      </w:r>
+      <w:r>
+        <w:rPr>
+          <w:rStyle w:val="VerbatimChar"/>
+        </w:rPr>
+        <w:t xml:space="preserve">meeuwen_literatuur</w:t>
+      </w:r>
+      <w:r>
+        <w:t xml:space="preserve">, samen 481 territoria, volgens de afzonderlijke bronregels behouden. Bezoeken en individueel herleidbare waarnemingen blijven in de kerntabellen als auditspoor.</w:t>
+      </w:r>
+    </w:p>
+    <w:p>
+      <w:pPr>
+        <w:pStyle w:val="BodyText"/>
+      </w:pPr>
+      <w:r>
+        <w:t xml:space="preserve">M8/2019 staat bij de actuele controle groen en vervangt daarom de eerdere afkeuringsbeslissing. De 10 bezoeken en 483 vogelwaarnemingen stonden al in de database. Uit het SOVON-standaardresultatenbestand zijn 19 positieve regels met samen 114 territoria hersteld. De 107 matrixcellen zijn allemaal leeg; er is daarom geen nul toegevoegd. De twaalf overige oranje-rode combinaties zonder bezoeken, soorten of records bevatten in de downloads samen 980 uitsluitend lege matrixcellen en nul standaardresultaten, bezoeken, waarnemingspunten en territoriumpunten. Zij zijn niet als afgekeurde telling en ook niet als plotjaarrecord vastgelegd. M35/2004 bevat wel 20 bestaande regels uit</w:t>
+      </w:r>
+      <w:r>
+        <w:t xml:space="preserve"> </w:t>
+      </w:r>
+      <w:r>
+        <w:rPr>
+          <w:rStyle w:val="VerbatimChar"/>
+        </w:rPr>
+        <w:t xml:space="preserve">jrvslg_m</w:t>
+      </w:r>
+      <w:r>
+        <w:t xml:space="preserve">, samen 44 territoria; die niet-SOVON-bron blijft ongemoeid.</w:t>
+      </w:r>
+    </w:p>
+    <w:p>
+      <w:pPr>
+        <w:pStyle w:val="BodyText"/>
+      </w:pPr>
+      <w:r>
+        <w:t xml:space="preserve">M53/2007 vraagt een afzonderlijke beperking. SOVON toont 8 bezoeken, 36 soorten en 36 records, maar de acht bezoeken bevatten elk nul soorten en nul exemplaren; de detailpagina geeft aan dat uitsluitend territoriumlocaties zijn ingevoerd. De jaar-download bevat 99 lege matrixcellen en geen standaardresultaten, waarnemingspunten of territoriumpunten. De ingelogde interface biedt alleen kaart- en PDF-uitvoer, niet de individuele bron-ID, datum en bezoekkoppeling die nodig zijn voor</w:t>
+      </w:r>
+      <w:r>
+        <w:t xml:space="preserve"> </w:t>
+      </w:r>
+      <w:r>
+        <w:rPr>
+          <w:rStyle w:val="VerbatimChar"/>
+        </w:rPr>
+        <w:t xml:space="preserve">dagwaarnemingen_bmp</w:t>
+      </w:r>
+      <w:r>
+        <w:t xml:space="preserve">. Daarom zijn geen individuele waarnemingen gereconstrueerd.</w:t>
+      </w:r>
+      <w:r>
+        <w:t xml:space="preserve"> </w:t>
+      </w:r>
+      <w:r>
+        <w:rPr>
+          <w:rStyle w:val="VerbatimChar"/>
+        </w:rPr>
+        <w:t xml:space="preserve">dagbezoeken_bmp</w:t>
+      </w:r>
+      <w:r>
+        <w:t xml:space="preserve"> </w:t>
+      </w:r>
+      <w:r>
+        <w:t xml:space="preserve">bevat de 8 bezoeken;</w:t>
+      </w:r>
+      <w:r>
+        <w:t xml:space="preserve"> </w:t>
+      </w:r>
+      <w:r>
+        <w:rPr>
+          <w:rStyle w:val="VerbatimChar"/>
+        </w:rPr>
+        <w:t xml:space="preserve">dagwaarnemingen_bmp</w:t>
+      </w:r>
+      <w:r>
+        <w:t xml:space="preserve"> </w:t>
+      </w:r>
+      <w:r>
+        <w:t xml:space="preserve">en</w:t>
+      </w:r>
+      <w:r>
+        <w:t xml:space="preserve"> </w:t>
+      </w:r>
+      <w:r>
+        <w:rPr>
+          <w:rStyle w:val="VerbatimChar"/>
+        </w:rPr>
+        <w:t xml:space="preserve">territoria</w:t>
+      </w:r>
+      <w:r>
+        <w:t xml:space="preserve"> </w:t>
+      </w:r>
+      <w:r>
+        <w:t xml:space="preserve">bevatten voor dit plotjaar nul regels. De status en deze beperking staan wel in</w:t>
+      </w:r>
+      <w:r>
+        <w:t xml:space="preserve"> </w:t>
+      </w:r>
+      <w:r>
+        <w:rPr>
+          <w:rStyle w:val="VerbatimChar"/>
+        </w:rPr>
+        <w:t xml:space="preserve">sovon_bmp_plotjaar</w:t>
+      </w:r>
+      <w:r>
+        <w:t xml:space="preserve">.</w:t>
+      </w:r>
+    </w:p>
+    <w:p>
+      <w:pPr>
+        <w:pStyle w:val="BodyText"/>
+      </w:pPr>
+      <w:r>
+        <w:rPr>
+          <w:b/>
+          <w:bCs/>
+        </w:rPr>
+        <w:t xml:space="preserve">Natura 2000-analysescope vogelplots, vastgesteld 1 oktober 2026 en bijgewerkt na de volledige SOVON-controle.</w:t>
+      </w:r>
+      <w:r>
+        <w:t xml:space="preserve"> </w:t>
+      </w:r>
+      <w:r>
+        <w:t xml:space="preserve">De geldige bronverzameling</w:t>
+      </w:r>
+      <w:r>
+        <w:t xml:space="preserve"> </w:t>
+      </w:r>
+      <w:r>
+        <w:rPr>
+          <w:rStyle w:val="VerbatimChar"/>
+        </w:rPr>
+        <w:t xml:space="preserve">territoria</w:t>
+      </w:r>
+      <w:r>
+        <w:t xml:space="preserve"> </w:t>
+      </w:r>
+      <w:r>
+        <w:t xml:space="preserve">bevat 157.580 regels, 54 plots en 2.164 plotjaren uit 1958-2025. M66 (Haagsche Golf Club,</w:t>
+      </w:r>
+      <w:r>
+        <w:t xml:space="preserve"> </w:t>
+      </w:r>
+      <w:r>
+        <w:rPr>
+          <w:rStyle w:val="VerbatimChar"/>
+        </w:rPr>
+        <w:t xml:space="preserve">plot_id = 3503</w:t>
+      </w:r>
+      <w:r>
+        <w:t xml:space="preserve">) bevat daarin 4.323 regels en 10.420 territoria in 39 jaren uit 1985-2025. M91 (Voorlinden,</w:t>
+      </w:r>
+      <w:r>
+        <w:t xml:space="preserve"> </w:t>
+      </w:r>
+      <w:r>
+        <w:rPr>
+          <w:rStyle w:val="VerbatimChar"/>
+        </w:rPr>
+        <w:t xml:space="preserve">plot_id = 3514</w:t>
+      </w:r>
+      <w:r>
+        <w:t xml:space="preserve">) bevat 1.674 regels en 4.672 territoria in 18 jaren uit 1993-2021. Beide plots blijven als geldige brondata bewaard, maar hebben in</w:t>
+      </w:r>
+      <w:r>
+        <w:t xml:space="preserve"> </w:t>
+      </w:r>
+      <w:r>
+        <w:rPr>
+          <w:rStyle w:val="VerbatimChar"/>
+        </w:rPr>
+        <w:t xml:space="preserve">plot_analyse_scope</w:t>
+      </w:r>
+      <w:r>
+        <w:t xml:space="preserve"> </w:t>
+      </w:r>
+      <w:r>
+        <w:t xml:space="preserve">onder</w:t>
+      </w:r>
+      <w:r>
+        <w:t xml:space="preserve"> </w:t>
+      </w:r>
+      <w:r>
+        <w:rPr>
+          <w:rStyle w:val="VerbatimChar"/>
+        </w:rPr>
+        <w:t xml:space="preserve">meijendel_natura2000</w:t>
+      </w:r>
+      <w:r>
+        <w:t xml:space="preserve"> </w:t>
+      </w:r>
+      <w:r>
+        <w:t xml:space="preserve">de status</w:t>
+      </w:r>
+      <w:r>
+        <w:t xml:space="preserve"> </w:t>
+      </w:r>
+      <w:r>
+        <w:rPr>
+          <w:rStyle w:val="VerbatimChar"/>
+        </w:rPr>
+        <w:t xml:space="preserve">in_scope = 0</w:t>
+      </w:r>
+      <w:r>
+        <w:t xml:space="preserve"> </w:t>
+      </w:r>
+      <w:r>
+        <w:t xml:space="preserve">met reden</w:t>
+      </w:r>
+      <w:r>
+        <w:t xml:space="preserve"> </w:t>
+      </w:r>
+      <w:r>
+        <w:rPr>
+          <w:rStyle w:val="VerbatimChar"/>
+        </w:rPr>
+        <w:t xml:space="preserve">Geen onderdeel van Natura 2000-analysegebied.</w:t>
+      </w:r>
+      <w:r>
+        <w:t xml:space="preserve"> </w:t>
+      </w:r>
+      <w:r>
+        <w:t xml:space="preserve">De standaardselectie via</w:t>
+      </w:r>
+      <w:r>
+        <w:t xml:space="preserve"> </w:t>
+      </w:r>
+      <w:r>
+        <w:rPr>
+          <w:rStyle w:val="VerbatimChar"/>
+        </w:rPr>
+        <w:t xml:space="preserve">v_meijendel_analyseplot_actueel</w:t>
+      </w:r>
+      <w:r>
+        <w:t xml:space="preserve"> </w:t>
+      </w:r>
+      <w:r>
+        <w:t xml:space="preserve">bevat daardoor 151.583 territoriumregels, 52 plots en 2.107 plotjaren uit 1958-2025. Repositoryberekeningen gebruiken deze scope standaard en nemen M66 en/of M91 alleen mee na een uitdrukkelijke keuze van de gebruiker.</w:t>
+      </w:r>
+      <w:r>
+        <w:t xml:space="preserve"> </w:t>
+      </w:r>
+      <w:r>
+        <w:rPr>
+          <w:rStyle w:val="VerbatimChar"/>
+        </w:rPr>
+        <w:t xml:space="preserve">plots.in_gebruik</w:t>
+      </w:r>
+      <w:r>
+        <w:t xml:space="preserve"> </w:t>
+      </w:r>
+      <w:r>
+        <w:t xml:space="preserve">beschrijft alleen actueel gebruik en bepaalt deze inhoudelijke grens niet.</w:t>
+      </w:r>
+    </w:p>
+    <w:p>
+      <w:pPr>
+        <w:pStyle w:val="BodyText"/>
+      </w:pPr>
+      <w:r>
+        <w:rPr>
+          <w:b/>
+          <w:bCs/>
+        </w:rPr>
+        <w:t xml:space="preserve">Standaard analysepoort territoria, vastgesteld 4 oktober 2026.</w:t>
+      </w:r>
+      <w:r>
+        <w:t xml:space="preserve"> </w:t>
+      </w:r>
+      <w:r>
+        <w:t xml:space="preserve">Batchanalyse, Shiny en de zelfstandige GEE/power-route gebruiken dezelfde statusgestuurde selectie. Binnen de standaardscope met 151.583 territoriumregels in 52 plots en 2.107 plotjaren uit 1958-2025 is uitsluitend een aanwezige bronregel een analysewaarde. De 86.693 letterlijke</w:t>
+      </w:r>
+      <w:r>
+        <w:t xml:space="preserve"> </w:t>
+      </w:r>
+      <w:r>
+        <w:rPr>
+          <w:rStyle w:val="VerbatimChar"/>
+        </w:rPr>
+        <w:t xml:space="preserve">sovon_m</w:t>
+      </w:r>
+      <w:r>
+        <w:t xml:space="preserve">-nullen uit 1984-2025 blijven nul; een ontbrekende soortregel of lege matrixcel blijft</w:t>
+      </w:r>
+      <w:r>
+        <w:t xml:space="preserve"> </w:t>
+      </w:r>
+      <w:r>
+        <w:rPr>
+          <w:rStyle w:val="VerbatimChar"/>
+        </w:rPr>
+        <w:t xml:space="preserve">NA</w:t>
+      </w:r>
+      <w:r>
+        <w:t xml:space="preserve">. De 25 formeel afgekeurde SOVON-plotjaren uit 1984-2025 leveren voor SOVON geen analysewaarde. De 60</w:t>
+      </w:r>
+      <w:r>
+        <w:t xml:space="preserve"> </w:t>
+      </w:r>
+      <w:r>
+        <w:rPr>
+          <w:rStyle w:val="VerbatimChar"/>
+        </w:rPr>
+        <w:t xml:space="preserve">jrvslg_m</w:t>
+      </w:r>
+      <w:r>
+        <w:t xml:space="preserve">-regels en vier</w:t>
+      </w:r>
+      <w:r>
+        <w:t xml:space="preserve"> </w:t>
+      </w:r>
+      <w:r>
+        <w:rPr>
+          <w:rStyle w:val="VerbatimChar"/>
+        </w:rPr>
+        <w:t xml:space="preserve">meeuwen_literatuur</w:t>
+      </w:r>
+      <w:r>
+        <w:t xml:space="preserve">-regels voor M35 in vijf van die afgekeurde plotjaren blijven als onafhankelijke bronwaarden geldig. M66 en M91 blijven standaard uitgesloten;</w:t>
+      </w:r>
+      <w:r>
+        <w:t xml:space="preserve"> </w:t>
+      </w:r>
+      <w:r>
+        <w:rPr>
+          <w:rStyle w:val="VerbatimChar"/>
+        </w:rPr>
+        <w:t xml:space="preserve">plots.in_gebruik</w:t>
+      </w:r>
+      <w:r>
+        <w:t xml:space="preserve"> </w:t>
+      </w:r>
+      <w:r>
+        <w:t xml:space="preserve">bepaalt deze inhoudelijke scope niet. Een soort komt pas in de analysepopulatie wanneer binnen exact de gebruikte plot-jaar-basis minstens één geaccepteerd positief territorium aanwezig is; nulregels vullen daarna de meetmatrix aan, maar maken op zichzelf geen soort tot analysekandidaat. GEE/GLMM-kenmerkenanalyses nemen zulke nul-only-soorten niet als afzonderlijk cluster op. Een groeps-, richtlijn- of habitatgroeptotaal wordt alleen berekend wanneer alle samenstellende soortcellen voor dat plotjaar een geaccepteerde waarde hebben; een gedeeltelijke som blijft</w:t>
+      </w:r>
+      <w:r>
+        <w:t xml:space="preserve"> </w:t>
+      </w:r>
+      <w:r>
+        <w:rPr>
+          <w:rStyle w:val="VerbatimChar"/>
+        </w:rPr>
+        <w:t xml:space="preserve">NA</w:t>
+      </w:r>
+      <w:r>
+        <w:t xml:space="preserve">. De herberekende hoofd-TRIM-uitvoer over 1958-2025 bevat daardoor 156 soorten in de statuslaag, 135 soorten met minimaal één indexreeks en 94 soorten met een brugbare reeks in beide modelperioden. De Sandra-uitvoer over 25 plots in 1997-2022 bevat 132 positief waargenomen soorten en 110 formele soorttrends. Deze poort is ook de standaard voor datasets waarmee de power voor relaties met vegetatieontwikkeling of beheermaatregelen wordt beoordeeld; ontbrekende bronwaarden worden nooit stilzwijgend als afwezigheid gebruikt.</w:t>
       </w:r>
     </w:p>
     <w:bookmarkEnd w:id="12"/>
     <w:bookmarkStart w:id="13" w:name="provinciale-permanente-kwadraten"/>
-    <w:p>
-      <w:pPr>
-        <w:pStyle w:val="BodyText"/>
-      </w:pPr>
-      <w:r>
-        <w:rPr>
-          <w:b/>
-        </w:rPr>
-        <w:t>Standaard analysepoort territoria, vastgesteld 4 oktober 2026.</w:t>
-      </w:r>
-      <w:r>
-        <w:t xml:space="preserve"> Batchanalyse, Shiny en de zelfstandige GEE/power-route gebruiken dezelfde statusgestuurde selectie. Binnen de standaardscope met 151.583 territoriumregels in 52 plots en 2.107 plotjaren uit 1958-2025 is uitsluitend een aanwezige bronregel een analysewaarde. De 86.693 letterlijke sovon_m-nullen uit 1984-2025 blijven nul; een ontbrekende soortregel of lege matrixcel blijft NA. De 25 formeel afgekeurde SOVON-plotjaren uit 1984-2025 leveren voor SOVON geen analysewaarde. De 60 jrvslg_m-regels en vier meeuwen_literatuur-regels voor M35 in vijf van die afgekeurde plotjaren blijven als onafhankelijke bronwaarden geldig. M66 en M91 blijven standaard uitgesloten; plots.in_gebruik bepaalt deze inhoudelijke scope niet. Een soort komt pas in de analysepopulatie wanneer binnen exact de gebruikte plot-jaar-basis minstens één geaccepteerd positief territorium aanwezig is; nulregels vullen daarna de meetmatrix aan, maar maken op zichzelf geen soort tot analysekandidaat. GEE/GLMM-kenmerkenanalyses nemen zulke nul-only-soorten niet als afzonderlijk cluster op. Een groeps-, richtlijn- of habitatgroeptotaal wordt alleen berekend wanneer alle samenstellende soortcellen voor dat plotjaar een geaccepteerde waarde hebben; een gedeeltelijke som blijft NA. De herberekende hoofd-TRIM-uitvoer over 1958-2025 bevat daardoor 156 soorten in de statuslaag, 135 soorten met minimaal één indexreeks en 94 soorten met een brugbare reeks in beide modelperioden. De Sandra-uitvoer over 25 plots in 1997-2022 bevat 132 positief waargenomen soorten en 110 formele soorttrends. Deze poort is ook de standaard voor datasets waarmee de power voor relaties met vegetatieontwikkeling of beheermaatregelen wordt beoordeeld; ontbrekende bronwaarden worden nooit stilzwijgend als afwezigheid gebruikt.</w:t>
-      </w:r>
-    </w:p>
     <w:p>
       <w:pPr>
         <w:pStyle w:val="Heading3"/>

</xml_diff>

<commit_message>
Verduidelijk terminologie teller en tellerteam
</commit_message>
<xml_diff>
--- a/docs/MEIJENDEL_BRONREGISTER.docx
+++ b/docs/MEIJENDEL_BRONREGISTER.docx
@@ -2479,7 +2479,7 @@
         <w:t xml:space="preserve"> </w:t>
       </w:r>
       <w:r>
-        <w:t xml:space="preserve">uit de actuele SOVON/AVIMAP-resultatendownload omvat 25.555 soortresultaten in 752 plotjaren uit 2007 en 2009–2026. In 282 plotjaren is de ene AVIMAP-code exact gelijk aan de databasecode, in 56 is zij lid van een groter geregistreerd tellerteam, in 400 ontbreekt zij geheel in het geregistreerde team en voor 14 plotjaren ontbrak aanvankelijk</w:t>
+        <w:t>uit de actuele SOVON/AVIMAP-resultatendownload omvat 25.555 soortresultaten in 752 plotjaren uit 2007 en 2009–2026. In 282 plotjaren is de ene AVIMAP-code exact gelijk aan de databasecode, in 56 is zij lid van een groter geregistreerd tellerteam, in 400 ontbreekt zij geheel in de registratie van teller/tellerteam en voor 14 plotjaren ontbrak aanvankelijk</w:t>
       </w:r>
       <w:r>
         <w:t xml:space="preserve"> </w:t>
@@ -2506,7 +2506,7 @@
         <w:t xml:space="preserve"> </w:t>
       </w:r>
       <w:r>
-        <w:t xml:space="preserve">te vervangen, aan te vullen of te corrigeren; het blijft uitsluitend als letterlijke bronwaarde en auditinformatie behouden. Deze beperking betreft alleen telleridentificatie en keurt de territorium- en bezoekgegevens uit de download niet als geheel af. Bij meerdere tellers blijft een plotjaar een teamregistratie. Omdat de AVIMAP-bezoekentabel geen teller bevat, wordt zonder andere expliciete bron niet afgeleid wie aan een afzonderlijk bezoek deelnam. Tellersensitiviteitsanalyses gebruiken</w:t>
+        <w:t>te vervangen, aan te vullen of te corrigeren; het blijft uitsluitend als letterlijke bronwaarde en auditinformatie behouden. Deze beperking betreft alleen telleridentificatie en keurt de territorium- en bezoekgegevens uit de download niet als geheel af. Bij twee of meer tellers blijft een plotjaar een tellerteamregistratie. Omdat de AVIMAP-bezoekentabel geen teller bevat, wordt zonder andere expliciete bron niet afgeleid wie aan een afzonderlijk bezoek deelnam. Tellersensitiviteitsanalyses gebruiken</w:t>
       </w:r>
       <w:r>
         <w:t xml:space="preserve"> </w:t>
@@ -2521,7 +2521,7 @@
         <w:t xml:space="preserve"> </w:t>
       </w:r>
       <w:r>
-        <w:t xml:space="preserve">en houden tellerteams en ontbrekende koppelingen afzonderlijk herkenbaar. Op basis van inhoudelijke vaststelling door de data-eigenaar zijn vier koppelingen op 1 oktober toegevoegd: 2010/M54a–AZNA00 (</w:t>
+        <w:t>en houden teller/tellerteam en ontbrekende koppelingen afzonderlijk herkenbaar. Op basis van inhoudelijke vaststelling door de data-eigenaar zijn vier koppelingen op 1 oktober toegevoegd: 2010/M54a–AZNA00 (</w:t>
       </w:r>
       <w:r>
         <w:rPr>

</xml_diff>

<commit_message>
Leg vegetatiesamenstelling en structuuruitkomsten vast
</commit_message>
<xml_diff>
--- a/docs/MEIJENDEL_BRONREGISTER.docx
+++ b/docs/MEIJENDEL_BRONREGISTER.docx
@@ -16,14 +16,16 @@
     </w:p>
     <w:p>
       <w:pPr>
-        <w:pStyle w:val="FirstParagraph"/>
-      </w:pPr>
-      <w:r>
-        <w:rPr>
-          <w:b/>
-          <w:bCs/>
-        </w:rPr>
-        <w:t xml:space="preserve">Stand: 7 oktober 2026.</w:t>
+        <w:pStyle w:val="BodyText"/>
+      </w:pPr>
+      <w:r>
+        <w:rPr>
+          <w:b/>
+        </w:rPr>
+        <w:t>Stand: 11 oktober 2026.</w:t>
+      </w:r>
+      <w:r>
+        <w:t xml:space="preserve"> </w:t>
       </w:r>
     </w:p>
     <w:p>
@@ -837,7 +839,319 @@
         <w:pStyle w:val="BodyText"/>
       </w:pPr>
       <w:r>
-        <w:t xml:space="preserve">De 42 territoriummatrices bevatten 222.852 plot-soortregels: 52.450 positieve resultaten, 86.983 expliciete nulcellen en 83.419 lege cellen. Een lege cel geldt niet als nul. De puntlagen bevatten 22.305 bronwaarnemingen die nog niet in</w:t>
+        <w:t>De 42 territoriummatrices bevatten 222.852 plot-soortregels: 52.450 positieve resultaten, 86.983 expliciete nulcellen en 83.419 lege cellen. Een lege cel geldt niet als nul. De puntlagen bevatten 22.305 bronwaarnemingen die nog niet in dagwaarnemingen_bmp staan; omgekeerd ontbreekt geen bestaande SOVON-bron-ID in de nieuwe levering. Bij 2.629 gedeelde bron-ID's levert SOVON broedcode 0 terwijl de database NULL bevat. De downloads bevatten geen zelfstandig veld dat een telling formeel als afgekeurd markeert. Vergelijking en eventuele verrijking volgen daarom per jaar. Daarbij worden BMP-type, standaard alle soorten of een expliciete uitzondering, volledig geteld, goedgekeurd of formeel afgekeurd en de toepasselijke officiële soortenlijst afzonderlijk vastgelegd. Broedcode 0 blijft een positieve vogelwaarneming. Tellercodes worden per jaar gecontroleerd.</w:t>
+      </w:r>
+    </w:p>
+    <w:p>
+      <w:pPr>
+        <w:pStyle w:val="BodyText"/>
+      </w:pPr>
+      <w:r>
+        <w:rPr>
+          <w:b/>
+          <w:bCs/>
+        </w:rPr>
+        <w:t xml:space="preserve">Betekenis van SOVON-nullen, bevestigd 6 oktober 2026.</w:t>
+      </w:r>
+      <w:r>
+        <w:t xml:space="preserve"> </w:t>
+      </w:r>
+      <w:r>
+        <w:t xml:space="preserve">SOVON Helpdesk heeft schriftelijk bevestigd dat in een Excel-download van alle jaren</w:t>
+      </w:r>
+      <w:r>
+        <w:t xml:space="preserve"> </w:t>
+      </w:r>
+      <w:r>
+        <w:rPr>
+          <w:rStyle w:val="VerbatimChar"/>
+        </w:rPr>
+        <w:t xml:space="preserve">0</w:t>
+      </w:r>
+      <w:r>
+        <w:t xml:space="preserve"> </w:t>
+      </w:r>
+      <w:r>
+        <w:t xml:space="preserve">een harde nul is: de soort is onderzocht maar niet vastgesteld. Als de soort niet is onderzocht, blijft de Excel-cel leeg. Deze betekenis geldt voor alle SOVON-territoriummatrices die in dit project zijn gebruikt. De huidige database en TRIM-poort volgen dit onderscheid: een letterlijke, niet-conflicterende en niet-afgekeurde SOVON-nul is</w:t>
+      </w:r>
+      <w:r>
+        <w:t xml:space="preserve"> </w:t>
+      </w:r>
+      <w:r>
+        <w:rPr>
+          <w:rStyle w:val="VerbatimChar"/>
+        </w:rPr>
+        <w:t xml:space="preserve">0</w:t>
+      </w:r>
+      <w:r>
+        <w:t xml:space="preserve">; een lege SOVON-cel blijft</w:t>
+      </w:r>
+      <w:r>
+        <w:t xml:space="preserve"> </w:t>
+      </w:r>
+      <w:r>
+        <w:rPr>
+          <w:rStyle w:val="VerbatimChar"/>
+        </w:rPr>
+        <w:t xml:space="preserve">NA</w:t>
+      </w:r>
+      <w:r>
+        <w:t xml:space="preserve">.</w:t>
+      </w:r>
+    </w:p>
+    <w:p>
+      <w:pPr>
+        <w:pStyle w:val="BodyText"/>
+      </w:pPr>
+      <w:r>
+        <w:rPr>
+          <w:b/>
+        </w:rPr>
+        <w:t>Afgeleide nullen uit jaarverslagen, uitgevoerd 7 oktober 2026.</w:t>
+      </w:r>
+      <w:r>
+        <w:t xml:space="preserve"> Voor de zelfstandige bron jrvslg_m geldt bij TRIM een expliciete analyseaanname. De tellers telden alle vogelsoorten. De relevante soortpool bestaat daarom uit iedere soort met ten minste één geaccepteerd positief jrvslg_m-resultaat in de volledige jaarverslagreeks 1958-2025. Als zo'n soort in een geteld jaarverslagplot ontbreekt, wordt de soort-plotjaarcombinatie als nul behandeld; het is niet vereist dat de soort in hetzelfde kalenderjaar elders is vastgesteld. Deze waarde is geen letterlijke bronnul, krijgt daarom de status afgeleide_jaarverslagnul en hoort niet als bronregel in territoria. Binnen 662 getelde jrvslg_m-plotjaren en een soortpool van 128 soorten bevat de actuele standaardanalyse over 52 Natura 2000-plots 66.116 afgeleide nullen: 60.387 in 1958-1983 en 5.729 in 1984-2025. Na selectie op eerste positieve jaar en actieve plots worden 15.921 daarvan als modelinvoer gebruikt: 14.149 in 1958-1983 en 1.772 in 1984-2025. De gedeelde observatiepoort past deze regel toe in batch-TRIM, Shiny, Sandra en GEE en bewaart analysebron, nulstatus en bewijsgrond. De herberekende hoofdreeks bevat 156 soorten in de statuslaag, 135 soorten met minimaal één indexreeks en 93 brugbare reeksen; Kuifleeuwerik verloor als enige de post-1984-modelreeks. De Sandra-selectie 1997-2022 bevat geen jrvslg_m-plotjaar; haar soorttrends en indexbestanden bleven bytegelijk.</w:t>
+      </w:r>
+    </w:p>
+    <w:p>
+      <w:pPr>
+        <w:pStyle w:val="BodyText"/>
+      </w:pPr>
+      <w:r>
+        <w:rPr>
+          <w:b/>
+          <w:bCs/>
+        </w:rPr>
+        <w:t xml:space="preserve">Jaarcontrole 1984, 2 oktober 2026.</w:t>
+      </w:r>
+      <w:r>
+        <w:t xml:space="preserve"> </w:t>
+      </w:r>
+      <w:r>
+        <w:t xml:space="preserve">De SOVON-download bevat 230 bezoeken in 16 plots. Alle 230 bezoeken zijn inhoudelijk gelijk aan de 230 bezoeken onder bron</w:t>
+      </w:r>
+      <w:r>
+        <w:t xml:space="preserve"> </w:t>
+      </w:r>
+      <w:r>
+        <w:rPr>
+          <w:rStyle w:val="VerbatimChar"/>
+        </w:rPr>
+        <w:t xml:space="preserve">sovon_m</w:t>
+      </w:r>
+      <w:r>
+        <w:t xml:space="preserve"> </w:t>
+      </w:r>
+      <w:r>
+        <w:t xml:space="preserve">in</w:t>
+      </w:r>
+      <w:r>
+        <w:t xml:space="preserve"> </w:t>
+      </w:r>
+      <w:r>
+        <w:rPr>
+          <w:rStyle w:val="VerbatimChar"/>
+        </w:rPr>
+        <w:t xml:space="preserve">dagbezoeken_bmp</w:t>
+      </w:r>
+      <w:r>
+        <w:t xml:space="preserve">; er is daarom geen bezoek toegevoegd. Voor 15 bezochte plotjaren bevat de download 568 positieve vogelcellen met samen 7.811 territoria, 860 letterlijke nulcellen en 18 lege soortcellen. Van de 568 positieve waarden zijn 562 exact gelijk aan de bestaande SOVON-regels in</w:t>
+      </w:r>
+      <w:r>
+        <w:t xml:space="preserve"> </w:t>
+      </w:r>
+      <w:r>
+        <w:rPr>
+          <w:rStyle w:val="VerbatimChar"/>
+        </w:rPr>
+        <w:t xml:space="preserve">territoria</w:t>
+      </w:r>
+      <w:r>
+        <w:t xml:space="preserve">. De 860 letterlijke nullen zijn als regels met</w:t>
+      </w:r>
+      <w:r>
+        <w:t xml:space="preserve"> </w:t>
+      </w:r>
+      <w:r>
+        <w:rPr>
+          <w:rStyle w:val="VerbatimChar"/>
+        </w:rPr>
+        <w:t xml:space="preserve">territoria = 0</w:t>
+      </w:r>
+      <w:r>
+        <w:t xml:space="preserve"> </w:t>
+      </w:r>
+      <w:r>
+        <w:t xml:space="preserve">en SOVON als bron rechtstreeks aan</w:t>
+      </w:r>
+      <w:r>
+        <w:t xml:space="preserve"> </w:t>
+      </w:r>
+      <w:r>
+        <w:rPr>
+          <w:rStyle w:val="VerbatimChar"/>
+        </w:rPr>
+        <w:t xml:space="preserve">territoria</w:t>
+      </w:r>
+      <w:r>
+        <w:t xml:space="preserve"> </w:t>
+      </w:r>
+      <w:r>
+        <w:t xml:space="preserve">toegevoegd. De 18 cellen zijn leeg binnen plotjaren die voor andere soorten wel resultaten bevatten; zij zijn niet ingevoerd en gelden niet als nul. De 40 geselecteerde maar niet-bezochte plots met 3.497 uitsluitend lege vogelcellen zijn genegeerd.</w:t>
+      </w:r>
+    </w:p>
+    <w:p>
+      <w:pPr>
+        <w:pStyle w:val="BodyText"/>
+      </w:pPr>
+      <w:r>
+        <w:t xml:space="preserve">Voor M35 bevat de SOVON-download acht bezoeken en 49 lege vogelcellen, zonder positieve waarde of letterlijke nul. De levende database bevat dezelfde acht bezoeken onder</w:t>
+      </w:r>
+      <w:r>
+        <w:t xml:space="preserve"> </w:t>
+      </w:r>
+      <w:r>
+        <w:rPr>
+          <w:rStyle w:val="VerbatimChar"/>
+        </w:rPr>
+        <w:t xml:space="preserve">sovon_m</w:t>
+      </w:r>
+      <w:r>
+        <w:t xml:space="preserve">, geen territoriumregel onder</w:t>
+      </w:r>
+      <w:r>
+        <w:t xml:space="preserve"> </w:t>
+      </w:r>
+      <w:r>
+        <w:rPr>
+          <w:rStyle w:val="VerbatimChar"/>
+        </w:rPr>
+        <w:t xml:space="preserve">sovon_m</w:t>
+      </w:r>
+      <w:r>
+        <w:t xml:space="preserve">, en 13 afzonderlijke regels met samen 106 territoria onder</w:t>
+      </w:r>
+      <w:r>
+        <w:t xml:space="preserve"> </w:t>
+      </w:r>
+      <w:r>
+        <w:rPr>
+          <w:rStyle w:val="VerbatimChar"/>
+        </w:rPr>
+        <w:t xml:space="preserve">jrvslg_m</w:t>
+      </w:r>
+      <w:r>
+        <w:t xml:space="preserve">. Het verslag over 1983-1985 stelt dat de resultatentabel 1984 uitsluitend BMP-getelde kavels omvat. Kavel 35 staat in de bezettingslijst bij J. Bosland en heeft resultaten in die tabel. De lege SOVON-cellen betekenen dus niet dat M35 niet is geteld en zijn geen nullen; de SOVON-resultaten ontbreken. De jaarverslagregels blijven buiten deze SOVON-verwerking. De zes overige positieve verschillen zijn meeuwenwaarden voor M7, M8, M4-5 en M16s. Zij zijn niet als SOVON-regel toegevoegd, omdat</w:t>
+      </w:r>
+      <w:r>
+        <w:t xml:space="preserve"> </w:t>
+      </w:r>
+      <w:r>
+        <w:rPr>
+          <w:rStyle w:val="VerbatimChar"/>
+        </w:rPr>
+        <w:t xml:space="preserve">meeuwen_literatuur</w:t>
+      </w:r>
+      <w:r>
+        <w:t xml:space="preserve"> </w:t>
+      </w:r>
+      <w:r>
+        <w:t xml:space="preserve">voor deze zes plot-soortcombinaties leidend blijft in</w:t>
+      </w:r>
+      <w:r>
+        <w:t xml:space="preserve"> </w:t>
+      </w:r>
+      <w:r>
+        <w:rPr>
+          <w:rStyle w:val="VerbatimChar"/>
+        </w:rPr>
+        <w:t xml:space="preserve">territoria</w:t>
+      </w:r>
+      <w:r>
+        <w:t xml:space="preserve">.</w:t>
+      </w:r>
+    </w:p>
+    <w:p>
+      <w:pPr>
+        <w:pStyle w:val="BodyText"/>
+      </w:pPr>
+      <w:r>
+        <w:rPr>
+          <w:b/>
+          <w:bCs/>
+        </w:rPr>
+        <w:t xml:space="preserve">Jaarcontrole 1985, 3 oktober 2026.</w:t>
+      </w:r>
+      <w:r>
+        <w:t xml:space="preserve"> </w:t>
+      </w:r>
+      <w:r>
+        <w:t xml:space="preserve">De SOVON-download bevat 323 bezoeken in 24 plots; alle 323 komen veld voor veld overeen met</w:t>
+      </w:r>
+      <w:r>
+        <w:t xml:space="preserve"> </w:t>
+      </w:r>
+      <w:r>
+        <w:rPr>
+          <w:rStyle w:val="VerbatimChar"/>
+        </w:rPr>
+        <w:t xml:space="preserve">dagbezoeken_bmp</w:t>
+      </w:r>
+      <w:r>
+        <w:t xml:space="preserve">. De vogelmatrix bevat 864 positieve waarden, 1.386 letterlijke nulcellen en 2.742 lege cellen. Van de positieve waarden zijn 855 gelijk aan bestaande SOVON-regels. De negen overige positieve waarden zijn meeuwenaantallen voor M7, M16, M8 en M16s en zijn niet toegevoegd, omdat</w:t>
+      </w:r>
+      <w:r>
+        <w:t xml:space="preserve"> </w:t>
+      </w:r>
+      <w:r>
+        <w:rPr>
+          <w:rStyle w:val="VerbatimChar"/>
+        </w:rPr>
+        <w:t xml:space="preserve">meeuwen_literatuur</w:t>
+      </w:r>
+      <w:r>
+        <w:t xml:space="preserve"> </w:t>
+      </w:r>
+      <w:r>
+        <w:t xml:space="preserve">voor die combinaties leidend blijft. Van de 1.386 letterlijke nullen zijn 1.385 als</w:t>
+      </w:r>
+      <w:r>
+        <w:t xml:space="preserve"> </w:t>
+      </w:r>
+      <w:r>
+        <w:rPr>
+          <w:rStyle w:val="VerbatimChar"/>
+        </w:rPr>
+        <w:t xml:space="preserve">territoria = 0</w:t>
+      </w:r>
+      <w:r>
+        <w:t xml:space="preserve"> </w:t>
+      </w:r>
+      <w:r>
+        <w:t xml:space="preserve">met SOVON als bron toegevoegd. De ene uitgesloten nul is M4-5/Zilvermeeuw: SOVON levert 0, terwijl</w:t>
+      </w:r>
+      <w:r>
+        <w:t xml:space="preserve"> </w:t>
+      </w:r>
+      <w:r>
+        <w:rPr>
+          <w:rStyle w:val="VerbatimChar"/>
+        </w:rPr>
+        <w:t xml:space="preserve">meeuwen_literatuur</w:t>
+      </w:r>
+      <w:r>
+        <w:t xml:space="preserve"> </w:t>
+      </w:r>
+      <w:r>
+        <w:t xml:space="preserve">55 territoria bevat. De leidende literatuurwaarde blijft staan. De 22 lege cellen binnen twaalf plots met overige resultaten, de 49 uitsluitend lege M35-cellen en de 2.671 lege cellen in 32 niet-bezochte plots zijn niet ingevoerd.</w:t>
+      </w:r>
+    </w:p>
+    <w:p>
+      <w:pPr>
+        <w:pStyle w:val="BodyText"/>
+      </w:pPr>
+      <w:r>
+        <w:t xml:space="preserve">De SOVON-download bevat voor 1985 geen bezoekwaarnemingen, territoriumpunten, formele afkeuringsaanduiding of tellercodes. Er is daarom niets toegevoegd aan</w:t>
       </w:r>
       <w:r>
         <w:t xml:space="preserve"> </w:t>
@@ -852,97 +1166,433 @@
         <w:t xml:space="preserve"> </w:t>
       </w:r>
       <w:r>
-        <w:t xml:space="preserve">staan; omgekeerd ontbreekt geen bestaande SOVON-bron-ID in de nieuwe levering. Bij 2.629 gedeelde bron-ID’s levert SOVON broedcode 0 terwijl de database</w:t>
-      </w:r>
-      <w:r>
-        <w:t xml:space="preserve"> </w:t>
-      </w:r>
-      <w:r>
-        <w:rPr>
-          <w:rStyle w:val="VerbatimChar"/>
-        </w:rPr>
-        <w:t xml:space="preserve">NULL</w:t>
-      </w:r>
-      <w:r>
-        <w:t xml:space="preserve"> </w:t>
-      </w:r>
-      <w:r>
-        <w:t xml:space="preserve">bevat. De downloads bevatten geen zelfstandig veld dat een telling formeel als afgekeurd markeert. Vergelijking en eventuele verrijking volgen daarom per jaar. Daarbij worden BMP-type, standaard alle soorten of een expliciete uitzondering, volledig geteld, goedgekeurd of formeel afgekeurd en de toepasselijke officiële soortenlijst afzonderlijk vastgelegd. Broedcode 0 blijft een positieve vogelwaarneming. Tellercodes worden per jaar gecontroleerd.</w:t>
-      </w:r>
-    </w:p>
-    <w:p>
-      <w:pPr>
-        <w:pStyle w:val="BodyText"/>
-      </w:pPr>
-      <w:r>
-        <w:rPr>
-          <w:b/>
-          <w:bCs/>
-        </w:rPr>
-        <w:t xml:space="preserve">Betekenis van SOVON-nullen, bevestigd 6 oktober 2026.</w:t>
-      </w:r>
-      <w:r>
-        <w:t xml:space="preserve"> </w:t>
-      </w:r>
-      <w:r>
-        <w:t xml:space="preserve">SOVON Helpdesk heeft schriftelijk bevestigd dat in een Excel-download van alle jaren</w:t>
-      </w:r>
-      <w:r>
-        <w:t xml:space="preserve"> </w:t>
-      </w:r>
-      <w:r>
-        <w:rPr>
-          <w:rStyle w:val="VerbatimChar"/>
-        </w:rPr>
-        <w:t xml:space="preserve">0</w:t>
-      </w:r>
-      <w:r>
-        <w:t xml:space="preserve"> </w:t>
-      </w:r>
-      <w:r>
-        <w:t xml:space="preserve">een harde nul is: de soort is onderzocht maar niet vastgesteld. Als de soort niet is onderzocht, blijft de Excel-cel leeg. Deze betekenis geldt voor alle SOVON-territoriummatrices die in dit project zijn gebruikt. De huidige database en TRIM-poort volgen dit onderscheid: een letterlijke, niet-conflicterende en niet-afgekeurde SOVON-nul is</w:t>
-      </w:r>
-      <w:r>
-        <w:t xml:space="preserve"> </w:t>
-      </w:r>
-      <w:r>
-        <w:rPr>
-          <w:rStyle w:val="VerbatimChar"/>
-        </w:rPr>
-        <w:t xml:space="preserve">0</w:t>
-      </w:r>
-      <w:r>
-        <w:t xml:space="preserve">; een lege SOVON-cel blijft</w:t>
-      </w:r>
-      <w:r>
-        <w:t xml:space="preserve"> </w:t>
-      </w:r>
-      <w:r>
-        <w:rPr>
-          <w:rStyle w:val="VerbatimChar"/>
-        </w:rPr>
-        <w:t xml:space="preserve">NA</w:t>
-      </w:r>
-      <w:r>
-        <w:t xml:space="preserve">.</w:t>
-      </w:r>
-    </w:p>
-    <w:p>
-      <w:pPr>
-        <w:pStyle w:val="BodyText"/>
-      </w:pPr>
-      <w:r>
-        <w:rPr>
-          <w:b/>
-          <w:bCs/>
-        </w:rPr>
-        <w:t xml:space="preserve">Afgeleide nullen uit jaarverslagen, uitgevoerd 7 oktober 2026.</w:t>
-      </w:r>
-      <w:r>
-        <w:t xml:space="preserve"> </w:t>
-      </w:r>
-      <w:r>
-        <w:t xml:space="preserve">Voor de zelfstandige bron</w:t>
+        <w:t xml:space="preserve">en geen broedcode 0 hersteld. Het verslag bevestigt dat J. Bosland M35 telde en dat kavel 16 bij J.P. Oppentocht hoorde. Op besluit van de data-eigenaar zijn daarom drie ontbrekende regels aan</w:t>
+      </w:r>
+      <w:r>
+        <w:t xml:space="preserve"> </w:t>
+      </w:r>
+      <w:r>
+        <w:rPr>
+          <w:rStyle w:val="VerbatimChar"/>
+        </w:rPr>
+        <w:t xml:space="preserve">plot_jaar_teller</w:t>
+      </w:r>
+      <w:r>
+        <w:t xml:space="preserve"> </w:t>
+      </w:r>
+      <w:r>
+        <w:t xml:space="preserve">toegevoegd: 1985/M35–B_0042 en 1984 en 1985/M16s–A_0042. De al aanwezige regels 1984/M35–B_0042 en 1984 en 1985/M16–A_0042 zijn behouden; er is niets verplaatst of gedupliceerd.</w:t>
+      </w:r>
+    </w:p>
+    <w:p>
+      <w:pPr>
+        <w:pStyle w:val="BodyText"/>
+      </w:pPr>
+      <w:r>
+        <w:rPr>
+          <w:b/>
+          <w:bCs/>
+        </w:rPr>
+        <w:t xml:space="preserve">Jaarcontrole 1986, 3 oktober 2026.</w:t>
+      </w:r>
+      <w:r>
+        <w:t xml:space="preserve"> </w:t>
+      </w:r>
+      <w:r>
+        <w:t xml:space="preserve">De SOVON-download bevat 305 bezoeken in 25 plots; alle 305 komen op bron-ID en inhoud overeen met</w:t>
+      </w:r>
+      <w:r>
+        <w:t xml:space="preserve"> </w:t>
+      </w:r>
+      <w:r>
+        <w:rPr>
+          <w:rStyle w:val="VerbatimChar"/>
+        </w:rPr>
+        <w:t xml:space="preserve">dagbezoeken_bmp</w:t>
+      </w:r>
+      <w:r>
+        <w:t xml:space="preserve">. De vogelmatrix bevat 925 positieve waarden, 1.422 letterlijke nulcellen en 2.645 lege cellen. Van de positieve waarden zijn 919 gelijk aan bestaande SOVON-regels. De zes overige positieve waarden zijn meeuwenaantallen voor M7, M16 en M8 en zijn niet toegevoegd, omdat</w:t>
+      </w:r>
+      <w:r>
+        <w:t xml:space="preserve"> </w:t>
+      </w:r>
+      <w:r>
+        <w:rPr>
+          <w:rStyle w:val="VerbatimChar"/>
+        </w:rPr>
+        <w:t xml:space="preserve">meeuwen_literatuur</w:t>
+      </w:r>
+      <w:r>
+        <w:t xml:space="preserve"> </w:t>
+      </w:r>
+      <w:r>
+        <w:t xml:space="preserve">voor die combinaties leidend blijft. Van de 1.422 letterlijke nullen zijn 1.417 als</w:t>
+      </w:r>
+      <w:r>
+        <w:t xml:space="preserve"> </w:t>
+      </w:r>
+      <w:r>
+        <w:rPr>
+          <w:rStyle w:val="VerbatimChar"/>
+        </w:rPr>
+        <w:t xml:space="preserve">territoria = 0</w:t>
+      </w:r>
+      <w:r>
+        <w:t xml:space="preserve"> </w:t>
+      </w:r>
+      <w:r>
+        <w:t xml:space="preserve">met SOVON als bron toegevoegd. De vijf uitgesloten nullen betreffen Stormmeeuw, Kleine Mantelmeeuw en Zilvermeeuw op M14 en Stormmeeuw en Zilvermeeuw op M4-5;</w:t>
+      </w:r>
+      <w:r>
+        <w:t xml:space="preserve"> </w:t>
+      </w:r>
+      <w:r>
+        <w:rPr>
+          <w:rStyle w:val="VerbatimChar"/>
+        </w:rPr>
+        <w:t xml:space="preserve">meeuwen_literatuur</w:t>
+      </w:r>
+      <w:r>
+        <w:t xml:space="preserve"> </w:t>
+      </w:r>
+      <w:r>
+        <w:t xml:space="preserve">bevat daar positieve aantallen. De 27 lege cellen binnen plots met overige resultaten, de 49 uitsluitend lege M35-cellen en de 2.569 lege cellen in 31 niet-bezochte plots zijn niet ingevoerd.</w:t>
+      </w:r>
+    </w:p>
+    <w:p>
+      <w:pPr>
+        <w:pStyle w:val="BodyText"/>
+      </w:pPr>
+      <w:r>
+        <w:t xml:space="preserve">Het bezoektotalenbestand vermeldt bij 927 soort-plotregels telkens één niet-bruikbare waarneming, dus 927 aggregaatvermeldingen, maar bevat geen individuele bron-ID, bezoek, datum, broedcode, locatie of formele afkeurstatus. De lege puntlagen en het lege standaardbestand</w:t>
+      </w:r>
+      <w:r>
+        <w:t xml:space="preserve"> </w:t>
+      </w:r>
+      <w:r>
+        <w:rPr>
+          <w:rStyle w:val="VerbatimChar"/>
+        </w:rPr>
+        <w:t xml:space="preserve">resultaten.xlsx</w:t>
+      </w:r>
+      <w:r>
+        <w:t xml:space="preserve"> </w:t>
+      </w:r>
+      <w:r>
+        <w:t xml:space="preserve">leveren evenmin individuele regels. Deze vermeldingen zijn daarom niet als formeel afgekeurde waarnemingen in</w:t>
+      </w:r>
+      <w:r>
+        <w:t xml:space="preserve"> </w:t>
+      </w:r>
+      <w:r>
+        <w:rPr>
+          <w:rStyle w:val="VerbatimChar"/>
+        </w:rPr>
+        <w:t xml:space="preserve">dagwaarnemingen_bmp</w:t>
+      </w:r>
+      <w:r>
+        <w:t xml:space="preserve"> </w:t>
+      </w:r>
+      <w:r>
+        <w:t xml:space="preserve">gereconstrueerd. M66 HGC bevat 15 bezoeken en 45 positieve SOVON-regels met samen 336 territoria. Voor dit plotjaar ontbreekt een tellercode in zowel de download als</w:t>
+      </w:r>
+      <w:r>
+        <w:t xml:space="preserve"> </w:t>
+      </w:r>
+      <w:r>
+        <w:rPr>
+          <w:rStyle w:val="VerbatimChar"/>
+        </w:rPr>
+        <w:t xml:space="preserve">plot_jaar_teller</w:t>
+      </w:r>
+      <w:r>
+        <w:t xml:space="preserve">; ook het jaarverslag noemt M66 HGC niet. Het tellerveld blijft daarom leeg. M35 bevat zeven bezoeken en 49 lege matrixcellen. Het jaarverslag bevat 17 regels met samen 156 territoria en</w:t>
+      </w:r>
+      <w:r>
+        <w:t xml:space="preserve"> </w:t>
+      </w:r>
+      <w:r>
+        <w:rPr>
+          <w:rStyle w:val="VerbatimChar"/>
+        </w:rPr>
+        <w:t xml:space="preserve">meeuwen_literatuur</w:t>
+      </w:r>
+      <w:r>
+        <w:t xml:space="preserve"> </w:t>
+      </w:r>
+      <w:r>
+        <w:t xml:space="preserve">twee Stormmeeuwterritoria, samen gelijk aan het verslagtotaal van 158; deze afzonderlijke bronnen zijn niet als SOVON-regels ingevoerd.</w:t>
+      </w:r>
+    </w:p>
+    <w:p>
+      <w:pPr>
+        <w:pStyle w:val="BodyText"/>
+      </w:pPr>
+      <w:r>
+        <w:rPr>
+          <w:b/>
+          <w:bCs/>
+        </w:rPr>
+        <w:t xml:space="preserve">Jaarcontrole 1987, 3 oktober 2026.</w:t>
+      </w:r>
+      <w:r>
+        <w:t xml:space="preserve"> </w:t>
+      </w:r>
+      <w:r>
+        <w:t xml:space="preserve">De SOVON-download bevat 328 bezoeken; alle 328 komen op bron-ID en inhoud overeen met</w:t>
+      </w:r>
+      <w:r>
+        <w:t xml:space="preserve"> </w:t>
+      </w:r>
+      <w:r>
+        <w:rPr>
+          <w:rStyle w:val="VerbatimChar"/>
+        </w:rPr>
+        <w:t xml:space="preserve">dagbezoeken_bmp</w:t>
+      </w:r>
+      <w:r>
+        <w:t xml:space="preserve">. De vogelmatrix bevat 1.088 positieve waarden, 1.788 letterlijke nulcellen en 2.116 lege cellen. Van de positieve waarden zijn 1.081 gelijk aan bestaande SOVON-regels. De zeven overige positieve waarden zijn Stormmeeuw, Kleine Mantelmeeuw en Zilvermeeuw op M15 en M16 en Kleine Mantelmeeuw op M8. Zij zijn niet toegevoegd, omdat</w:t>
+      </w:r>
+      <w:r>
+        <w:t xml:space="preserve"> </w:t>
+      </w:r>
+      <w:r>
+        <w:rPr>
+          <w:rStyle w:val="VerbatimChar"/>
+        </w:rPr>
+        <w:t xml:space="preserve">meeuwen_literatuur</w:t>
+      </w:r>
+      <w:r>
+        <w:t xml:space="preserve"> </w:t>
+      </w:r>
+      <w:r>
+        <w:t xml:space="preserve">voor deze combinaties leidend blijft. Alle 1.788 letterlijke nullen waren niet-conflicterend en zijn als</w:t>
+      </w:r>
+      <w:r>
+        <w:t xml:space="preserve"> </w:t>
+      </w:r>
+      <w:r>
+        <w:rPr>
+          <w:rStyle w:val="VerbatimChar"/>
+        </w:rPr>
+        <w:t xml:space="preserve">territoria = 0</w:t>
+      </w:r>
+      <w:r>
+        <w:t xml:space="preserve"> </w:t>
+      </w:r>
+      <w:r>
+        <w:t xml:space="preserve">met SOVON als bron toegevoegd. De 32 lege cellen binnen bezochte plots met overige resultaten, de 49 uitsluitend lege M35-cellen, de twee lege M8-cellen en de 2.033 lege cellen in 25 niet-bezochte plots zijn niet ingevoerd.</w:t>
+      </w:r>
+    </w:p>
+    <w:p>
+      <w:pPr>
+        <w:pStyle w:val="BodyText"/>
+      </w:pPr>
+      <w:r>
+        <w:t xml:space="preserve">Het bezoektotalenbestand vermeldt bij 1.091 soort-plotregels telkens één niet-bruikbare waarneming, dus 1.091 aggregaatvermeldingen, maar bevat geen individuele bron-ID, bezoek, datum, broedcode, locatie of formele afkeurstatus. Deze vermeldingen zijn daarom niet als formeel afgekeurde waarnemingen gereconstrueerd. Voor M66 HGC ontbreekt een tellercode in zowel de download als</w:t>
+      </w:r>
+      <w:r>
+        <w:t xml:space="preserve"> </w:t>
+      </w:r>
+      <w:r>
+        <w:rPr>
+          <w:rStyle w:val="VerbatimChar"/>
+        </w:rPr>
+        <w:t xml:space="preserve">plot_jaar_teller</w:t>
+      </w:r>
+      <w:r>
+        <w:t xml:space="preserve">; dit veld blijft leeg. De overige 29 plots met resultaten hebben al een database-tellercode. M8 heeft 41 positieve waarden, 57 letterlijke nullen en twee lege cellen, maar geen bezoekregels in de SOVON-download of</w:t>
+      </w:r>
+      <w:r>
+        <w:t xml:space="preserve"> </w:t>
+      </w:r>
+      <w:r>
+        <w:rPr>
+          <w:rStyle w:val="VerbatimChar"/>
+        </w:rPr>
+        <w:t xml:space="preserve">dagbezoeken_bmp</w:t>
+      </w:r>
+      <w:r>
+        <w:t xml:space="preserve">. Het jaarverslag noemt R. Wanders als teller en twaalf BMP-bezoeken; de bestaande databasecode</w:t>
+      </w:r>
+      <w:r>
+        <w:t xml:space="preserve"> </w:t>
+      </w:r>
+      <w:r>
+        <w:rPr>
+          <w:rStyle w:val="VerbatimChar"/>
+        </w:rPr>
+        <w:t xml:space="preserve">RWNS00</w:t>
+      </w:r>
+      <w:r>
+        <w:t xml:space="preserve"> </w:t>
+      </w:r>
+      <w:r>
+        <w:t xml:space="preserve">blijft staan. De twaalf verslagbezoeken zijn niet als SOVON-bezoeken gereconstrueerd. M35 heeft zeven SOVON-bezoeken maar uitsluitend 49 lege matrixcellen. In de database staan voor M35 zeventien jaarverslagregels met samen 54 territoria en één</w:t>
+      </w:r>
+      <w:r>
+        <w:t xml:space="preserve"> </w:t>
+      </w:r>
+      <w:r>
+        <w:rPr>
+          <w:rStyle w:val="VerbatimChar"/>
+        </w:rPr>
+        <w:t xml:space="preserve">meeuwen_literatuur</w:t>
+      </w:r>
+      <w:r>
+        <w:t xml:space="preserve">-regel met 64 territoria; deze bronnen blijven gescheiden van SOVON.</w:t>
+      </w:r>
+    </w:p>
+    <w:p>
+      <w:pPr>
+        <w:pStyle w:val="BodyText"/>
+      </w:pPr>
+      <w:r>
+        <w:rPr>
+          <w:b/>
+          <w:bCs/>
+        </w:rPr>
+        <w:t xml:space="preserve">Jaarcontroles 1988-2004, 3 oktober 2026.</w:t>
+      </w:r>
+      <w:r>
+        <w:t xml:space="preserve"> </w:t>
+      </w:r>
+      <w:r>
+        <w:t xml:space="preserve">De zeventien SOVON-downloads bevatten samen 5.141 in-scope bezoeken. Alle 5.141 stonden al op bron-ID en inhoud gelijk in</w:t>
+      </w:r>
+      <w:r>
+        <w:t xml:space="preserve"> </w:t>
+      </w:r>
+      <w:r>
+        <w:rPr>
+          <w:rStyle w:val="VerbatimChar"/>
+        </w:rPr>
+        <w:t xml:space="preserve">dagbezoeken_bmp</w:t>
+      </w:r>
+      <w:r>
+        <w:t xml:space="preserve">; er is geen bezoek toegevoegd of gewijzigd. De matrices bevatten na uitsluiting van De Horsten samen 19.197 positieve SOVON-resultaten. Die waren gelijk aan de bestaande SOVON-regels, behoudens meeuwencombinaties waarvoor een aanwezige regel uit</w:t>
+      </w:r>
+      <w:r>
+        <w:t xml:space="preserve"> </w:t>
+      </w:r>
+      <w:r>
+        <w:rPr>
+          <w:rStyle w:val="VerbatimChar"/>
+        </w:rPr>
+        <w:t xml:space="preserve">meeuwen_literatuur</w:t>
+      </w:r>
+      <w:r>
+        <w:t xml:space="preserve"> </w:t>
+      </w:r>
+      <w:r>
+        <w:t xml:space="preserve">leidend bleef. In</w:t>
+      </w:r>
+      <w:r>
+        <w:t xml:space="preserve"> </w:t>
+      </w:r>
+      <w:r>
+        <w:rPr>
+          <w:rStyle w:val="VerbatimChar"/>
+        </w:rPr>
+        <w:t xml:space="preserve">territoria</w:t>
+      </w:r>
+      <w:r>
+        <w:t xml:space="preserve"> </w:t>
+      </w:r>
+      <w:r>
+        <w:t xml:space="preserve">zijn per jaar uitsluitend de volgende aantallen letterlijke, niet-conflicterende SOVON-nullen toegevoegd: 1988 1.444; 1989 1.512; 1990 1.622; 1991 1.761; 1992 1.739; 1993 2.057; 1994 1.838; 1995 1.811; 1996 1.797; 1997 1.829; 1998 1.834; 1999 1.873; 2000 1.773; 2001 1.846; 2002 1.884; 2003 1.854; 2004 1.984. Samen zijn dit 30.458 nieuwe regels.</w:t>
+      </w:r>
+      <w:r>
+        <w:t xml:space="preserve"> </w:t>
+      </w:r>
+      <w:r>
+        <w:rPr>
+          <w:rStyle w:val="VerbatimChar"/>
+        </w:rPr>
+        <w:t xml:space="preserve">territoria</w:t>
+      </w:r>
+      <w:r>
+        <w:t xml:space="preserve"> </w:t>
+      </w:r>
+      <w:r>
+        <w:t xml:space="preserve">bevat daarna 106.921 regels. Alle nieuwe nulregels zijn via</w:t>
+      </w:r>
+      <w:r>
+        <w:t xml:space="preserve"> </w:t>
+      </w:r>
+      <w:r>
+        <w:rPr>
+          <w:rStyle w:val="VerbatimChar"/>
+        </w:rPr>
+        <w:t xml:space="preserve">soorten</w:t>
+      </w:r>
+      <w:r>
+        <w:t xml:space="preserve">,</w:t>
+      </w:r>
+      <w:r>
+        <w:t xml:space="preserve"> </w:t>
+      </w:r>
+      <w:r>
+        <w:rPr>
+          <w:rStyle w:val="VerbatimChar"/>
+        </w:rPr>
+        <w:t xml:space="preserve">taxa_bronkoppeling</w:t>
+      </w:r>
+      <w:r>
+        <w:t xml:space="preserve">,</w:t>
+      </w:r>
+      <w:r>
+        <w:t xml:space="preserve"> </w:t>
+      </w:r>
+      <w:r>
+        <w:rPr>
+          <w:rStyle w:val="VerbatimChar"/>
+        </w:rPr>
+        <w:t xml:space="preserve">taxa</w:t>
+      </w:r>
+      <w:r>
+        <w:t xml:space="preserve"> </w:t>
+      </w:r>
+      <w:r>
+        <w:t xml:space="preserve">en</w:t>
+      </w:r>
+      <w:r>
+        <w:t xml:space="preserve"> </w:t>
+      </w:r>
+      <w:r>
+        <w:rPr>
+          <w:rStyle w:val="VerbatimChar"/>
+        </w:rPr>
+        <w:t xml:space="preserve">taxon_groepen</w:t>
+      </w:r>
+      <w:r>
+        <w:t xml:space="preserve"> </w:t>
+      </w:r>
+      <w:r>
+        <w:t xml:space="preserve">als vogels bereikbaar; de jaarlijkse databasebrede nacontrole omvat 128 routes en geeft nul fouten.</w:t>
+      </w:r>
+    </w:p>
+    <w:p>
+      <w:pPr>
+        <w:pStyle w:val="BodyText"/>
+      </w:pPr>
+      <w:r>
+        <w:t xml:space="preserve">In 1991 zijn vier SOVON-meeuwennullen niet ingevoerd omdat voor dezelfde plot-soortcombinatie een positieve, leidende waarde uit</w:t>
+      </w:r>
+      <w:r>
+        <w:t xml:space="preserve"> </w:t>
+      </w:r>
+      <w:r>
+        <w:rPr>
+          <w:rStyle w:val="VerbatimChar"/>
+        </w:rPr>
+        <w:t xml:space="preserve">meeuwen_literatuur</w:t>
+      </w:r>
+      <w:r>
+        <w:t xml:space="preserve"> </w:t>
+      </w:r>
+      <w:r>
+        <w:t xml:space="preserve">bestaat. Een retroactieve afwezigheidscontrole over 1984-2004 houdt 1.309</w:t>
       </w:r>
       <w:r>
         <w:t xml:space="preserve"> </w:t>
@@ -954,10 +1604,27 @@
         <w:t xml:space="preserve">jrvslg_m</w:t>
       </w:r>
       <w:r>
-        <w:t xml:space="preserve"> </w:t>
-      </w:r>
-      <w:r>
-        <w:t xml:space="preserve">geldt bij TRIM een expliciete analyseaanname. De tellers telden alle vogelsoorten. De relevante soortpool bestaat daarom uit iedere soort met ten minste één geaccepteerd positief</w:t>
+        <w:t xml:space="preserve">-regels en 70</w:t>
+      </w:r>
+      <w:r>
+        <w:t xml:space="preserve"> </w:t>
+      </w:r>
+      <w:r>
+        <w:rPr>
+          <w:rStyle w:val="VerbatimChar"/>
+        </w:rPr>
+        <w:t xml:space="preserve">meeuwen_literatuur</w:t>
+      </w:r>
+      <w:r>
+        <w:t xml:space="preserve">-regels bewust in stand: de SOVON-matrix bevat voor die combinaties geen positieve of letterlijke nulwaarde, en ontbreken in de download is geen wijzigings- of verwijderingsgrond. Jaarverslagen zijn ieder jaar gebruikt om ontbrekende tellers en andere bronverschillen te verklaren. In 1988-2004 leverde dit geen ontbrekende tellerkoppeling op; waar database en download geen teller bevatten, noemde ook het verslag geen ondubbelzinnig aan een bestaande code koppelbare waarnemer voor dat plotjaar.</w:t>
+      </w:r>
+    </w:p>
+    <w:p>
+      <w:pPr>
+        <w:pStyle w:val="BodyText"/>
+      </w:pPr>
+      <w:r>
+        <w:t xml:space="preserve">De Horsten behoort niet tot Meijendel. Uit de download van 1996 zijn daarom negen bezoeken, 41 positieve resultaten met samen 636 territoria, 30 letterlijke nullen en vier lege cellen volledig genegeerd. De uitsluitend lege selecties van De Horsten in volgende jaren zijn eveneens buiten de vergelijking gehouden. Voor 2000 verklaart het jaarverslag de lege SOVON-resultaten van M35: de werkgroep telde M35 en M36 wel, maar stuurde die resultaten dat jaar niet aan SOVON. De bestaande</w:t>
       </w:r>
       <w:r>
         <w:t xml:space="preserve"> </w:t>
@@ -969,22 +1636,37 @@
         <w:t xml:space="preserve">jrvslg_m</w:t>
       </w:r>
       <w:r>
-        <w:t xml:space="preserve">-resultaat in de volledige jaarverslagreeks 1958-2025. Als zo’n soort in een geteld jaarverslagplot ontbreekt, wordt de soort-plotjaarcombinatie als nul behandeld; het is niet vereist dat de soort in hetzelfde kalenderjaar elders is vastgesteld. Deze waarde is geen letterlijke bronnul, krijgt daarom de status</w:t>
-      </w:r>
-      <w:r>
-        <w:t xml:space="preserve"> </w:t>
-      </w:r>
-      <w:r>
-        <w:rPr>
-          <w:rStyle w:val="VerbatimChar"/>
-        </w:rPr>
-        <w:t xml:space="preserve">afgeleide_jaarverslagnul</w:t>
-      </w:r>
-      <w:r>
-        <w:t xml:space="preserve"> </w:t>
-      </w:r>
-      <w:r>
-        <w:t xml:space="preserve">en hoort niet als bronregel in</w:t>
+        <w:t xml:space="preserve">-regels blijven daarom staan; uit de lege SOVON-cellen is niets afgeleid.</w:t>
+      </w:r>
+    </w:p>
+    <w:p>
+      <w:pPr>
+        <w:pStyle w:val="BodyText"/>
+      </w:pPr>
+      <w:r>
+        <w:rPr>
+          <w:b/>
+          <w:bCs/>
+        </w:rPr>
+        <w:t xml:space="preserve">Controlejaar 2005, afgerond.</w:t>
+      </w:r>
+      <w:r>
+        <w:t xml:space="preserve"> </w:t>
+      </w:r>
+      <w:r>
+        <w:t xml:space="preserve">De 111 geleverde bezoeken staan veld voor veld gelijk in</w:t>
+      </w:r>
+      <w:r>
+        <w:t xml:space="preserve"> </w:t>
+      </w:r>
+      <w:r>
+        <w:rPr>
+          <w:rStyle w:val="VerbatimChar"/>
+        </w:rPr>
+        <w:t xml:space="preserve">dagbezoeken_bmp</w:t>
+      </w:r>
+      <w:r>
+        <w:t xml:space="preserve">; 1.156 positieve vogelresultaten zijn gelijk. De 1.999 letterlijke, niet-conflicterende vogelnullen zijn in</w:t>
       </w:r>
       <w:r>
         <w:t xml:space="preserve"> </w:t>
@@ -996,7 +1678,238 @@
         <w:t xml:space="preserve">territoria</w:t>
       </w:r>
       <w:r>
-        <w:t xml:space="preserve">. Binnen 662 getelde</w:t>
+        <w:t xml:space="preserve"> </w:t>
+      </w:r>
+      <w:r>
+        <w:t xml:space="preserve">opgenomen; 1.766 lege cellen niet. De puntenlaag bevat nul features. Het bezoektotalenbestand bevat daarnaast 101 positieve zoogdierregels op 58 bestaande BMP-bezoeken in zeven plots: Konijn 46 regels met totaal 241, Ree 34 met totaal 89, Vos 15 met totaal 22, Eekhoorn vijf met totaal 6 en Dwergspitsmuis één met totaal 1. Twintig waarden waren al gelijk. De overige 81 SOVON-regels met 284 dieren op 46 bezoeken zijn afzonderlijk opgenomen onder</w:t>
+      </w:r>
+      <w:r>
+        <w:t xml:space="preserve"> </w:t>
+      </w:r>
+      <w:r>
+        <w:rPr>
+          <w:rStyle w:val="VerbatimChar"/>
+        </w:rPr>
+        <w:t xml:space="preserve">sovon-bmp-jaarbestanden-v1</w:t>
+      </w:r>
+      <w:r>
+        <w:t xml:space="preserve">; daaronder vallen ook de twee afwijkende Konijnwaarden in M16. Bezoek 365793 bevat SOVON 2 naast NDFF 9 en bezoek 365789 bevat SOVON 1 naast NDFF 3. Het NDFF-auditspoor blijft staan; SOVON is bij gecombineerd gebruik leidend. Er zijn geen zoogdiernullen afgeleid.</w:t>
+      </w:r>
+    </w:p>
+    <w:p>
+      <w:pPr>
+        <w:pStyle w:val="BodyText"/>
+      </w:pPr>
+      <w:r>
+        <w:rPr>
+          <w:b/>
+          <w:bCs/>
+        </w:rPr>
+        <w:t xml:space="preserve">Controlejaar 2006, afgerond.</w:t>
+      </w:r>
+      <w:r>
+        <w:t xml:space="preserve"> </w:t>
+      </w:r>
+      <w:r>
+        <w:t xml:space="preserve">De 172 geleverde bezoeken staan veld voor veld gelijk in</w:t>
+      </w:r>
+      <w:r>
+        <w:t xml:space="preserve"> </w:t>
+      </w:r>
+      <w:r>
+        <w:rPr>
+          <w:rStyle w:val="VerbatimChar"/>
+        </w:rPr>
+        <w:t xml:space="preserve">dagbezoeken_bmp</w:t>
+      </w:r>
+      <w:r>
+        <w:t xml:space="preserve">; 1.069 positieve vogelresultaten zijn gelijk. De 1.865 letterlijke, niet-conflicterende vogelnullen zijn in</w:t>
+      </w:r>
+      <w:r>
+        <w:t xml:space="preserve"> </w:t>
+      </w:r>
+      <w:r>
+        <w:rPr>
+          <w:rStyle w:val="VerbatimChar"/>
+        </w:rPr>
+        <w:t xml:space="preserve">territoria</w:t>
+      </w:r>
+      <w:r>
+        <w:t xml:space="preserve"> </w:t>
+      </w:r>
+      <w:r>
+        <w:t xml:space="preserve">opgenomen; 1.987 lege cellen niet. De puntenlaag bevat nul features. Het bezoektotalenbestand bevat 159 positieve zoogdierregels. Daarvan waren 36 gelijk. Onder</w:t>
+      </w:r>
+      <w:r>
+        <w:t xml:space="preserve"> </w:t>
+      </w:r>
+      <w:r>
+        <w:rPr>
+          <w:rStyle w:val="VerbatimChar"/>
+        </w:rPr>
+        <w:t xml:space="preserve">sovon-bmp-jaarbestanden-v1</w:t>
+      </w:r>
+      <w:r>
+        <w:t xml:space="preserve"> </w:t>
+      </w:r>
+      <w:r>
+        <w:t xml:space="preserve">zijn 123 aanvullende regels met samen 523 dieren op 72 bezoeken opgenomen zonder nulafleiding. Daaronder staan acht afwijkende SOVON-bezoektotalen naast het NDFF-auditspoor; SOVON is bij gecombineerd gebruik leidend.</w:t>
+      </w:r>
+    </w:p>
+    <w:p>
+      <w:pPr>
+        <w:pStyle w:val="BodyText"/>
+      </w:pPr>
+      <w:r>
+        <w:rPr>
+          <w:b/>
+          <w:bCs/>
+        </w:rPr>
+        <w:t xml:space="preserve">Controlejaar 2007, afgerond.</w:t>
+      </w:r>
+      <w:r>
+        <w:t xml:space="preserve"> </w:t>
+      </w:r>
+      <w:r>
+        <w:t xml:space="preserve">De 172 geleverde bezoeken staan veld voor veld gelijk in</w:t>
+      </w:r>
+      <w:r>
+        <w:t xml:space="preserve"> </w:t>
+      </w:r>
+      <w:r>
+        <w:rPr>
+          <w:rStyle w:val="VerbatimChar"/>
+        </w:rPr>
+        <w:t xml:space="preserve">dagbezoeken_bmp</w:t>
+      </w:r>
+      <w:r>
+        <w:t xml:space="preserve">; 1.166 positieve vogelresultaten zijn gelijk. Alle 1.924 letterlijke vogelnullen zijn in</w:t>
+      </w:r>
+      <w:r>
+        <w:t xml:space="preserve"> </w:t>
+      </w:r>
+      <w:r>
+        <w:rPr>
+          <w:rStyle w:val="VerbatimChar"/>
+        </w:rPr>
+        <w:t xml:space="preserve">territoria</w:t>
+      </w:r>
+      <w:r>
+        <w:t xml:space="preserve"> </w:t>
+      </w:r>
+      <w:r>
+        <w:t xml:space="preserve">opgenomen; 1.831 lege cellen niet. Het bezoektotalenbestand bevat 249 positieve zoogdierregels. Daarvan waren 101 al gelijk. Onder</w:t>
+      </w:r>
+      <w:r>
+        <w:t xml:space="preserve"> </w:t>
+      </w:r>
+      <w:r>
+        <w:rPr>
+          <w:rStyle w:val="VerbatimChar"/>
+        </w:rPr>
+        <w:t xml:space="preserve">sovon-bmp-jaarbestanden-v1</w:t>
+      </w:r>
+      <w:r>
+        <w:t xml:space="preserve"> </w:t>
+      </w:r>
+      <w:r>
+        <w:t xml:space="preserve">staan 148 aanvullende regels met 692 dieren op 84 bezoeken, inclusief de elf afwijkende SOVON-bezoektotalen. Het historische NDFF-auditspoor blijft bestaan; SOVON is bij gecombineerd gebruik leidend en beide waarden worden niet opgeteld. Voor M6 vermeldt de download teller</w:t>
+      </w:r>
+      <w:r>
+        <w:t xml:space="preserve"> </w:t>
+      </w:r>
+      <w:r>
+        <w:rPr>
+          <w:rStyle w:val="VerbatimChar"/>
+        </w:rPr>
+        <w:t xml:space="preserve">JASQ00</w:t>
+      </w:r>
+      <w:r>
+        <w:t xml:space="preserve">. Het verslag noemt T. Lansink voor M6 en M61 en J. van As voor M83; de database koppelt M6 en M61 aan</w:t>
+      </w:r>
+      <w:r>
+        <w:t xml:space="preserve"> </w:t>
+      </w:r>
+      <w:r>
+        <w:rPr>
+          <w:rStyle w:val="VerbatimChar"/>
+        </w:rPr>
+        <w:t xml:space="preserve">ALNK00</w:t>
+      </w:r>
+      <w:r>
+        <w:t xml:space="preserve"> </w:t>
+      </w:r>
+      <w:r>
+        <w:t xml:space="preserve">en M83 aan</w:t>
+      </w:r>
+      <w:r>
+        <w:t xml:space="preserve"> </w:t>
+      </w:r>
+      <w:r>
+        <w:rPr>
+          <w:rStyle w:val="VerbatimChar"/>
+        </w:rPr>
+        <w:t xml:space="preserve">JASQ00</w:t>
+      </w:r>
+      <w:r>
+        <w:t xml:space="preserve">. De downloadcode bij M6 is daarom niet overgenomen.</w:t>
+      </w:r>
+    </w:p>
+    <w:p>
+      <w:pPr>
+        <w:pStyle w:val="BodyText"/>
+      </w:pPr>
+      <w:r>
+        <w:rPr>
+          <w:b/>
+          <w:bCs/>
+        </w:rPr>
+        <w:t xml:space="preserve">Controlejaren 2008-2022, afgerond.</w:t>
+      </w:r>
+      <w:r>
+        <w:t xml:space="preserve"> </w:t>
+      </w:r>
+      <w:r>
+        <w:t xml:space="preserve">De vijftien downloads bevatten 6.306 in-scope bezoeken. Zij staan alle al in</w:t>
+      </w:r>
+      <w:r>
+        <w:t xml:space="preserve"> </w:t>
+      </w:r>
+      <w:r>
+        <w:rPr>
+          <w:rStyle w:val="VerbatimChar"/>
+        </w:rPr>
+        <w:t xml:space="preserve">dagbezoeken_bmp</w:t>
+      </w:r>
+      <w:r>
+        <w:t xml:space="preserve">; bij 154 bezoeken verschilt uitsluitend afsluitende witruimte in</w:t>
+      </w:r>
+      <w:r>
+        <w:t xml:space="preserve"> </w:t>
+      </w:r>
+      <w:r>
+        <w:rPr>
+          <w:rStyle w:val="VerbatimChar"/>
+        </w:rPr>
+        <w:t xml:space="preserve">opmerking</w:t>
+      </w:r>
+      <w:r>
+        <w:t xml:space="preserve">, zodat geen bezoek is gewijzigd. Aan</w:t>
+      </w:r>
+      <w:r>
+        <w:t xml:space="preserve"> </w:t>
+      </w:r>
+      <w:r>
+        <w:rPr>
+          <w:rStyle w:val="VerbatimChar"/>
+        </w:rPr>
+        <w:t xml:space="preserve">territoria</w:t>
+      </w:r>
+      <w:r>
+        <w:t xml:space="preserve"> </w:t>
+      </w:r>
+      <w:r>
+        <w:t xml:space="preserve">zijn 37.213 letterlijke, niet-conflicterende SOVON-nullen toegevoegd. Lege cellen zijn niet ingevoerd. Bestaande Meijendelwaarden die in de download ontbreken zijn behouden. De 81 positieve downloadwaarden uit 2022 voor M105, M71 en M36 staan al met exact dezelfde aantallen onder</w:t>
       </w:r>
       <w:r>
         <w:t xml:space="preserve"> </w:t>
@@ -1008,52 +1921,37 @@
         <w:t xml:space="preserve">jrvslg_m</w:t>
       </w:r>
       <w:r>
-        <w:t xml:space="preserve">-plotjaren en een soortpool van 128 soorten bevat de actuele standaardanalyse over 52 Natura 2000-plots 66.116 afgeleide nullen: 60.387 in 1958-1983 en 5.729 in 1984-2025. Na selectie op eerste positieve jaar en actieve plots worden 15.921 daarvan als modelinvoer gebruikt: 14.149 in 1958-1983 en 1.772 in 1984-2025. De gedeelde observatiepoort past deze regel toe in batch-TRIM, Shiny, Sandra en GEE en bewaart analysebron, nulstatus en bewijsgrond. De herberekende hoofdreeks bevat 156 soorten in de statuslaag, 135 soorten met minimaal één indexreeks en 93 brugbare reeksen; Kuifleeuwerik verloor als enige de post-1984-modelreeks. De Sandra-selectie 1997-2022 bevat geen</w:t>
-      </w:r>
-      <w:r>
-        <w:t xml:space="preserve"> </w:t>
-      </w:r>
-      <w:r>
-        <w:rPr>
-          <w:rStyle w:val="VerbatimChar"/>
-        </w:rPr>
-        <w:t xml:space="preserve">jrvslg_m</w:t>
-      </w:r>
-      <w:r>
-        <w:t xml:space="preserve">-plotjaar; haar soorttrends en indexbestanden bleven bytegelijk.</w:t>
-      </w:r>
-    </w:p>
-    <w:p>
-      <w:pPr>
-        <w:pStyle w:val="BodyText"/>
-      </w:pPr>
-      <w:r>
-        <w:rPr>
-          <w:b/>
-          <w:bCs/>
-        </w:rPr>
-        <w:t xml:space="preserve">Jaarcontrole 1984, 2 oktober 2026.</w:t>
-      </w:r>
-      <w:r>
-        <w:t xml:space="preserve"> </w:t>
-      </w:r>
-      <w:r>
-        <w:t xml:space="preserve">De SOVON-download bevat 230 bezoeken in 16 plots. Alle 230 bezoeken zijn inhoudelijk gelijk aan de 230 bezoeken onder bron</w:t>
-      </w:r>
-      <w:r>
-        <w:t xml:space="preserve"> </w:t>
-      </w:r>
-      <w:r>
-        <w:rPr>
-          <w:rStyle w:val="VerbatimChar"/>
-        </w:rPr>
-        <w:t xml:space="preserve">sovon_m</w:t>
-      </w:r>
-      <w:r>
-        <w:t xml:space="preserve"> </w:t>
-      </w:r>
-      <w:r>
-        <w:t xml:space="preserve">in</w:t>
+        <w:t xml:space="preserve">; een tweede SOVON-kopie is daarom niet gemaakt. Voor 2008-2022 staan 3.929 aanvullende positieve zoogdierregels op 2.334 bezoeken onder</w:t>
+      </w:r>
+      <w:r>
+        <w:t xml:space="preserve"> </w:t>
+      </w:r>
+      <w:r>
+        <w:rPr>
+          <w:rStyle w:val="VerbatimChar"/>
+        </w:rPr>
+        <w:t xml:space="preserve">sovon-bmp-jaarbestanden-v1</w:t>
+      </w:r>
+      <w:r>
+        <w:t xml:space="preserve">. Alle bronwaarden zijn na invoer gelijk aan de downloads; er zijn geen zoogdiernullen afgeleid.</w:t>
+      </w:r>
+    </w:p>
+    <w:p>
+      <w:pPr>
+        <w:pStyle w:val="BodyText"/>
+      </w:pPr>
+      <w:r>
+        <w:rPr>
+          <w:b/>
+          <w:bCs/>
+        </w:rPr>
+        <w:t xml:space="preserve">Controlejaren 2023-2025, afgerond.</w:t>
+      </w:r>
+      <w:r>
+        <w:t xml:space="preserve"> </w:t>
+      </w:r>
+      <w:r>
+        <w:t xml:space="preserve">De drie downloads bevatten 1.367 in-scope bezoeken. Zij staan alle al in</w:t>
       </w:r>
       <w:r>
         <w:t xml:space="preserve"> </w:t>
@@ -1065,7 +1963,19 @@
         <w:t xml:space="preserve">dagbezoeken_bmp</w:t>
       </w:r>
       <w:r>
-        <w:t xml:space="preserve">; er is daarom geen bezoek toegevoegd. Voor 15 bezochte plotjaren bevat de download 568 positieve vogelcellen met samen 7.811 territoria, 860 letterlijke nulcellen en 18 lege soortcellen. Van de 568 positieve waarden zijn 562 exact gelijk aan de bestaande SOVON-regels in</w:t>
+        <w:t xml:space="preserve">; bij 24 bezoeken verschilt uitsluitend afsluitende witruimte in</w:t>
+      </w:r>
+      <w:r>
+        <w:t xml:space="preserve"> </w:t>
+      </w:r>
+      <w:r>
+        <w:rPr>
+          <w:rStyle w:val="VerbatimChar"/>
+        </w:rPr>
+        <w:t xml:space="preserve">opmerking</w:t>
+      </w:r>
+      <w:r>
+        <w:t xml:space="preserve">. Aan</w:t>
       </w:r>
       <w:r>
         <w:t xml:space="preserve"> </w:t>
@@ -1077,1026 +1987,6 @@
         <w:t xml:space="preserve">territoria</w:t>
       </w:r>
       <w:r>
-        <w:t xml:space="preserve">. De 860 letterlijke nullen zijn als regels met</w:t>
-      </w:r>
-      <w:r>
-        <w:t xml:space="preserve"> </w:t>
-      </w:r>
-      <w:r>
-        <w:rPr>
-          <w:rStyle w:val="VerbatimChar"/>
-        </w:rPr>
-        <w:t xml:space="preserve">territoria = 0</w:t>
-      </w:r>
-      <w:r>
-        <w:t xml:space="preserve"> </w:t>
-      </w:r>
-      <w:r>
-        <w:t xml:space="preserve">en SOVON als bron rechtstreeks aan</w:t>
-      </w:r>
-      <w:r>
-        <w:t xml:space="preserve"> </w:t>
-      </w:r>
-      <w:r>
-        <w:rPr>
-          <w:rStyle w:val="VerbatimChar"/>
-        </w:rPr>
-        <w:t xml:space="preserve">territoria</w:t>
-      </w:r>
-      <w:r>
-        <w:t xml:space="preserve"> </w:t>
-      </w:r>
-      <w:r>
-        <w:t xml:space="preserve">toegevoegd. De 18 cellen zijn leeg binnen plotjaren die voor andere soorten wel resultaten bevatten; zij zijn niet ingevoerd en gelden niet als nul. De 40 geselecteerde maar niet-bezochte plots met 3.497 uitsluitend lege vogelcellen zijn genegeerd.</w:t>
-      </w:r>
-    </w:p>
-    <w:p>
-      <w:pPr>
-        <w:pStyle w:val="BodyText"/>
-      </w:pPr>
-      <w:r>
-        <w:t xml:space="preserve">Voor M35 bevat de SOVON-download acht bezoeken en 49 lege vogelcellen, zonder positieve waarde of letterlijke nul. De levende database bevat dezelfde acht bezoeken onder</w:t>
-      </w:r>
-      <w:r>
-        <w:t xml:space="preserve"> </w:t>
-      </w:r>
-      <w:r>
-        <w:rPr>
-          <w:rStyle w:val="VerbatimChar"/>
-        </w:rPr>
-        <w:t xml:space="preserve">sovon_m</w:t>
-      </w:r>
-      <w:r>
-        <w:t xml:space="preserve">, geen territoriumregel onder</w:t>
-      </w:r>
-      <w:r>
-        <w:t xml:space="preserve"> </w:t>
-      </w:r>
-      <w:r>
-        <w:rPr>
-          <w:rStyle w:val="VerbatimChar"/>
-        </w:rPr>
-        <w:t xml:space="preserve">sovon_m</w:t>
-      </w:r>
-      <w:r>
-        <w:t xml:space="preserve">, en 13 afzonderlijke regels met samen 106 territoria onder</w:t>
-      </w:r>
-      <w:r>
-        <w:t xml:space="preserve"> </w:t>
-      </w:r>
-      <w:r>
-        <w:rPr>
-          <w:rStyle w:val="VerbatimChar"/>
-        </w:rPr>
-        <w:t xml:space="preserve">jrvslg_m</w:t>
-      </w:r>
-      <w:r>
-        <w:t xml:space="preserve">. Het verslag over 1983-1985 stelt dat de resultatentabel 1984 uitsluitend BMP-getelde kavels omvat. Kavel 35 staat in de bezettingslijst bij J. Bosland en heeft resultaten in die tabel. De lege SOVON-cellen betekenen dus niet dat M35 niet is geteld en zijn geen nullen; de SOVON-resultaten ontbreken. De jaarverslagregels blijven buiten deze SOVON-verwerking. De zes overige positieve verschillen zijn meeuwenwaarden voor M7, M8, M4-5 en M16s. Zij zijn niet als SOVON-regel toegevoegd, omdat</w:t>
-      </w:r>
-      <w:r>
-        <w:t xml:space="preserve"> </w:t>
-      </w:r>
-      <w:r>
-        <w:rPr>
-          <w:rStyle w:val="VerbatimChar"/>
-        </w:rPr>
-        <w:t xml:space="preserve">meeuwen_literatuur</w:t>
-      </w:r>
-      <w:r>
-        <w:t xml:space="preserve"> </w:t>
-      </w:r>
-      <w:r>
-        <w:t xml:space="preserve">voor deze zes plot-soortcombinaties leidend blijft in</w:t>
-      </w:r>
-      <w:r>
-        <w:t xml:space="preserve"> </w:t>
-      </w:r>
-      <w:r>
-        <w:rPr>
-          <w:rStyle w:val="VerbatimChar"/>
-        </w:rPr>
-        <w:t xml:space="preserve">territoria</w:t>
-      </w:r>
-      <w:r>
-        <w:t xml:space="preserve">.</w:t>
-      </w:r>
-    </w:p>
-    <w:p>
-      <w:pPr>
-        <w:pStyle w:val="BodyText"/>
-      </w:pPr>
-      <w:r>
-        <w:rPr>
-          <w:b/>
-          <w:bCs/>
-        </w:rPr>
-        <w:t xml:space="preserve">Jaarcontrole 1985, 3 oktober 2026.</w:t>
-      </w:r>
-      <w:r>
-        <w:t xml:space="preserve"> </w:t>
-      </w:r>
-      <w:r>
-        <w:t xml:space="preserve">De SOVON-download bevat 323 bezoeken in 24 plots; alle 323 komen veld voor veld overeen met</w:t>
-      </w:r>
-      <w:r>
-        <w:t xml:space="preserve"> </w:t>
-      </w:r>
-      <w:r>
-        <w:rPr>
-          <w:rStyle w:val="VerbatimChar"/>
-        </w:rPr>
-        <w:t xml:space="preserve">dagbezoeken_bmp</w:t>
-      </w:r>
-      <w:r>
-        <w:t xml:space="preserve">. De vogelmatrix bevat 864 positieve waarden, 1.386 letterlijke nulcellen en 2.742 lege cellen. Van de positieve waarden zijn 855 gelijk aan bestaande SOVON-regels. De negen overige positieve waarden zijn meeuwenaantallen voor M7, M16, M8 en M16s en zijn niet toegevoegd, omdat</w:t>
-      </w:r>
-      <w:r>
-        <w:t xml:space="preserve"> </w:t>
-      </w:r>
-      <w:r>
-        <w:rPr>
-          <w:rStyle w:val="VerbatimChar"/>
-        </w:rPr>
-        <w:t xml:space="preserve">meeuwen_literatuur</w:t>
-      </w:r>
-      <w:r>
-        <w:t xml:space="preserve"> </w:t>
-      </w:r>
-      <w:r>
-        <w:t xml:space="preserve">voor die combinaties leidend blijft. Van de 1.386 letterlijke nullen zijn 1.385 als</w:t>
-      </w:r>
-      <w:r>
-        <w:t xml:space="preserve"> </w:t>
-      </w:r>
-      <w:r>
-        <w:rPr>
-          <w:rStyle w:val="VerbatimChar"/>
-        </w:rPr>
-        <w:t xml:space="preserve">territoria = 0</w:t>
-      </w:r>
-      <w:r>
-        <w:t xml:space="preserve"> </w:t>
-      </w:r>
-      <w:r>
-        <w:t xml:space="preserve">met SOVON als bron toegevoegd. De ene uitgesloten nul is M4-5/Zilvermeeuw: SOVON levert 0, terwijl</w:t>
-      </w:r>
-      <w:r>
-        <w:t xml:space="preserve"> </w:t>
-      </w:r>
-      <w:r>
-        <w:rPr>
-          <w:rStyle w:val="VerbatimChar"/>
-        </w:rPr>
-        <w:t xml:space="preserve">meeuwen_literatuur</w:t>
-      </w:r>
-      <w:r>
-        <w:t xml:space="preserve"> </w:t>
-      </w:r>
-      <w:r>
-        <w:t xml:space="preserve">55 territoria bevat. De leidende literatuurwaarde blijft staan. De 22 lege cellen binnen twaalf plots met overige resultaten, de 49 uitsluitend lege M35-cellen en de 2.671 lege cellen in 32 niet-bezochte plots zijn niet ingevoerd.</w:t>
-      </w:r>
-    </w:p>
-    <w:p>
-      <w:pPr>
-        <w:pStyle w:val="BodyText"/>
-      </w:pPr>
-      <w:r>
-        <w:t xml:space="preserve">De SOVON-download bevat voor 1985 geen bezoekwaarnemingen, territoriumpunten, formele afkeuringsaanduiding of tellercodes. Er is daarom niets toegevoegd aan</w:t>
-      </w:r>
-      <w:r>
-        <w:t xml:space="preserve"> </w:t>
-      </w:r>
-      <w:r>
-        <w:rPr>
-          <w:rStyle w:val="VerbatimChar"/>
-        </w:rPr>
-        <w:t xml:space="preserve">dagwaarnemingen_bmp</w:t>
-      </w:r>
-      <w:r>
-        <w:t xml:space="preserve"> </w:t>
-      </w:r>
-      <w:r>
-        <w:t xml:space="preserve">en geen broedcode 0 hersteld. Het verslag bevestigt dat J. Bosland M35 telde en dat kavel 16 bij J.P. Oppentocht hoorde. Op besluit van de data-eigenaar zijn daarom drie ontbrekende regels aan</w:t>
-      </w:r>
-      <w:r>
-        <w:t xml:space="preserve"> </w:t>
-      </w:r>
-      <w:r>
-        <w:rPr>
-          <w:rStyle w:val="VerbatimChar"/>
-        </w:rPr>
-        <w:t xml:space="preserve">plot_jaar_teller</w:t>
-      </w:r>
-      <w:r>
-        <w:t xml:space="preserve"> </w:t>
-      </w:r>
-      <w:r>
-        <w:t xml:space="preserve">toegevoegd: 1985/M35–B_0042 en 1984 en 1985/M16s–A_0042. De al aanwezige regels 1984/M35–B_0042 en 1984 en 1985/M16–A_0042 zijn behouden; er is niets verplaatst of gedupliceerd.</w:t>
-      </w:r>
-    </w:p>
-    <w:p>
-      <w:pPr>
-        <w:pStyle w:val="BodyText"/>
-      </w:pPr>
-      <w:r>
-        <w:rPr>
-          <w:b/>
-          <w:bCs/>
-        </w:rPr>
-        <w:t xml:space="preserve">Jaarcontrole 1986, 3 oktober 2026.</w:t>
-      </w:r>
-      <w:r>
-        <w:t xml:space="preserve"> </w:t>
-      </w:r>
-      <w:r>
-        <w:t xml:space="preserve">De SOVON-download bevat 305 bezoeken in 25 plots; alle 305 komen op bron-ID en inhoud overeen met</w:t>
-      </w:r>
-      <w:r>
-        <w:t xml:space="preserve"> </w:t>
-      </w:r>
-      <w:r>
-        <w:rPr>
-          <w:rStyle w:val="VerbatimChar"/>
-        </w:rPr>
-        <w:t xml:space="preserve">dagbezoeken_bmp</w:t>
-      </w:r>
-      <w:r>
-        <w:t xml:space="preserve">. De vogelmatrix bevat 925 positieve waarden, 1.422 letterlijke nulcellen en 2.645 lege cellen. Van de positieve waarden zijn 919 gelijk aan bestaande SOVON-regels. De zes overige positieve waarden zijn meeuwenaantallen voor M7, M16 en M8 en zijn niet toegevoegd, omdat</w:t>
-      </w:r>
-      <w:r>
-        <w:t xml:space="preserve"> </w:t>
-      </w:r>
-      <w:r>
-        <w:rPr>
-          <w:rStyle w:val="VerbatimChar"/>
-        </w:rPr>
-        <w:t xml:space="preserve">meeuwen_literatuur</w:t>
-      </w:r>
-      <w:r>
-        <w:t xml:space="preserve"> </w:t>
-      </w:r>
-      <w:r>
-        <w:t xml:space="preserve">voor die combinaties leidend blijft. Van de 1.422 letterlijke nullen zijn 1.417 als</w:t>
-      </w:r>
-      <w:r>
-        <w:t xml:space="preserve"> </w:t>
-      </w:r>
-      <w:r>
-        <w:rPr>
-          <w:rStyle w:val="VerbatimChar"/>
-        </w:rPr>
-        <w:t xml:space="preserve">territoria = 0</w:t>
-      </w:r>
-      <w:r>
-        <w:t xml:space="preserve"> </w:t>
-      </w:r>
-      <w:r>
-        <w:t xml:space="preserve">met SOVON als bron toegevoegd. De vijf uitgesloten nullen betreffen Stormmeeuw, Kleine Mantelmeeuw en Zilvermeeuw op M14 en Stormmeeuw en Zilvermeeuw op M4-5;</w:t>
-      </w:r>
-      <w:r>
-        <w:t xml:space="preserve"> </w:t>
-      </w:r>
-      <w:r>
-        <w:rPr>
-          <w:rStyle w:val="VerbatimChar"/>
-        </w:rPr>
-        <w:t xml:space="preserve">meeuwen_literatuur</w:t>
-      </w:r>
-      <w:r>
-        <w:t xml:space="preserve"> </w:t>
-      </w:r>
-      <w:r>
-        <w:t xml:space="preserve">bevat daar positieve aantallen. De 27 lege cellen binnen plots met overige resultaten, de 49 uitsluitend lege M35-cellen en de 2.569 lege cellen in 31 niet-bezochte plots zijn niet ingevoerd.</w:t>
-      </w:r>
-    </w:p>
-    <w:p>
-      <w:pPr>
-        <w:pStyle w:val="BodyText"/>
-      </w:pPr>
-      <w:r>
-        <w:t xml:space="preserve">Het bezoektotalenbestand vermeldt bij 927 soort-plotregels telkens één niet-bruikbare waarneming, dus 927 aggregaatvermeldingen, maar bevat geen individuele bron-ID, bezoek, datum, broedcode, locatie of formele afkeurstatus. De lege puntlagen en het lege standaardbestand</w:t>
-      </w:r>
-      <w:r>
-        <w:t xml:space="preserve"> </w:t>
-      </w:r>
-      <w:r>
-        <w:rPr>
-          <w:rStyle w:val="VerbatimChar"/>
-        </w:rPr>
-        <w:t xml:space="preserve">resultaten.xlsx</w:t>
-      </w:r>
-      <w:r>
-        <w:t xml:space="preserve"> </w:t>
-      </w:r>
-      <w:r>
-        <w:t xml:space="preserve">leveren evenmin individuele regels. Deze vermeldingen zijn daarom niet als formeel afgekeurde waarnemingen in</w:t>
-      </w:r>
-      <w:r>
-        <w:t xml:space="preserve"> </w:t>
-      </w:r>
-      <w:r>
-        <w:rPr>
-          <w:rStyle w:val="VerbatimChar"/>
-        </w:rPr>
-        <w:t xml:space="preserve">dagwaarnemingen_bmp</w:t>
-      </w:r>
-      <w:r>
-        <w:t xml:space="preserve"> </w:t>
-      </w:r>
-      <w:r>
-        <w:t xml:space="preserve">gereconstrueerd. M66 HGC bevat 15 bezoeken en 45 positieve SOVON-regels met samen 336 territoria. Voor dit plotjaar ontbreekt een tellercode in zowel de download als</w:t>
-      </w:r>
-      <w:r>
-        <w:t xml:space="preserve"> </w:t>
-      </w:r>
-      <w:r>
-        <w:rPr>
-          <w:rStyle w:val="VerbatimChar"/>
-        </w:rPr>
-        <w:t xml:space="preserve">plot_jaar_teller</w:t>
-      </w:r>
-      <w:r>
-        <w:t xml:space="preserve">; ook het jaarverslag noemt M66 HGC niet. Het tellerveld blijft daarom leeg. M35 bevat zeven bezoeken en 49 lege matrixcellen. Het jaarverslag bevat 17 regels met samen 156 territoria en</w:t>
-      </w:r>
-      <w:r>
-        <w:t xml:space="preserve"> </w:t>
-      </w:r>
-      <w:r>
-        <w:rPr>
-          <w:rStyle w:val="VerbatimChar"/>
-        </w:rPr>
-        <w:t xml:space="preserve">meeuwen_literatuur</w:t>
-      </w:r>
-      <w:r>
-        <w:t xml:space="preserve"> </w:t>
-      </w:r>
-      <w:r>
-        <w:t xml:space="preserve">twee Stormmeeuwterritoria, samen gelijk aan het verslagtotaal van 158; deze afzonderlijke bronnen zijn niet als SOVON-regels ingevoerd.</w:t>
-      </w:r>
-    </w:p>
-    <w:p>
-      <w:pPr>
-        <w:pStyle w:val="BodyText"/>
-      </w:pPr>
-      <w:r>
-        <w:rPr>
-          <w:b/>
-          <w:bCs/>
-        </w:rPr>
-        <w:t xml:space="preserve">Jaarcontrole 1987, 3 oktober 2026.</w:t>
-      </w:r>
-      <w:r>
-        <w:t xml:space="preserve"> </w:t>
-      </w:r>
-      <w:r>
-        <w:t xml:space="preserve">De SOVON-download bevat 328 bezoeken; alle 328 komen op bron-ID en inhoud overeen met</w:t>
-      </w:r>
-      <w:r>
-        <w:t xml:space="preserve"> </w:t>
-      </w:r>
-      <w:r>
-        <w:rPr>
-          <w:rStyle w:val="VerbatimChar"/>
-        </w:rPr>
-        <w:t xml:space="preserve">dagbezoeken_bmp</w:t>
-      </w:r>
-      <w:r>
-        <w:t xml:space="preserve">. De vogelmatrix bevat 1.088 positieve waarden, 1.788 letterlijke nulcellen en 2.116 lege cellen. Van de positieve waarden zijn 1.081 gelijk aan bestaande SOVON-regels. De zeven overige positieve waarden zijn Stormmeeuw, Kleine Mantelmeeuw en Zilvermeeuw op M15 en M16 en Kleine Mantelmeeuw op M8. Zij zijn niet toegevoegd, omdat</w:t>
-      </w:r>
-      <w:r>
-        <w:t xml:space="preserve"> </w:t>
-      </w:r>
-      <w:r>
-        <w:rPr>
-          <w:rStyle w:val="VerbatimChar"/>
-        </w:rPr>
-        <w:t xml:space="preserve">meeuwen_literatuur</w:t>
-      </w:r>
-      <w:r>
-        <w:t xml:space="preserve"> </w:t>
-      </w:r>
-      <w:r>
-        <w:t xml:space="preserve">voor deze combinaties leidend blijft. Alle 1.788 letterlijke nullen waren niet-conflicterend en zijn als</w:t>
-      </w:r>
-      <w:r>
-        <w:t xml:space="preserve"> </w:t>
-      </w:r>
-      <w:r>
-        <w:rPr>
-          <w:rStyle w:val="VerbatimChar"/>
-        </w:rPr>
-        <w:t xml:space="preserve">territoria = 0</w:t>
-      </w:r>
-      <w:r>
-        <w:t xml:space="preserve"> </w:t>
-      </w:r>
-      <w:r>
-        <w:t xml:space="preserve">met SOVON als bron toegevoegd. De 32 lege cellen binnen bezochte plots met overige resultaten, de 49 uitsluitend lege M35-cellen, de twee lege M8-cellen en de 2.033 lege cellen in 25 niet-bezochte plots zijn niet ingevoerd.</w:t>
-      </w:r>
-    </w:p>
-    <w:p>
-      <w:pPr>
-        <w:pStyle w:val="BodyText"/>
-      </w:pPr>
-      <w:r>
-        <w:t xml:space="preserve">Het bezoektotalenbestand vermeldt bij 1.091 soort-plotregels telkens één niet-bruikbare waarneming, dus 1.091 aggregaatvermeldingen, maar bevat geen individuele bron-ID, bezoek, datum, broedcode, locatie of formele afkeurstatus. Deze vermeldingen zijn daarom niet als formeel afgekeurde waarnemingen gereconstrueerd. Voor M66 HGC ontbreekt een tellercode in zowel de download als</w:t>
-      </w:r>
-      <w:r>
-        <w:t xml:space="preserve"> </w:t>
-      </w:r>
-      <w:r>
-        <w:rPr>
-          <w:rStyle w:val="VerbatimChar"/>
-        </w:rPr>
-        <w:t xml:space="preserve">plot_jaar_teller</w:t>
-      </w:r>
-      <w:r>
-        <w:t xml:space="preserve">; dit veld blijft leeg. De overige 29 plots met resultaten hebben al een database-tellercode. M8 heeft 41 positieve waarden, 57 letterlijke nullen en twee lege cellen, maar geen bezoekregels in de SOVON-download of</w:t>
-      </w:r>
-      <w:r>
-        <w:t xml:space="preserve"> </w:t>
-      </w:r>
-      <w:r>
-        <w:rPr>
-          <w:rStyle w:val="VerbatimChar"/>
-        </w:rPr>
-        <w:t xml:space="preserve">dagbezoeken_bmp</w:t>
-      </w:r>
-      <w:r>
-        <w:t xml:space="preserve">. Het jaarverslag noemt R. Wanders als teller en twaalf BMP-bezoeken; de bestaande databasecode</w:t>
-      </w:r>
-      <w:r>
-        <w:t xml:space="preserve"> </w:t>
-      </w:r>
-      <w:r>
-        <w:rPr>
-          <w:rStyle w:val="VerbatimChar"/>
-        </w:rPr>
-        <w:t xml:space="preserve">RWNS00</w:t>
-      </w:r>
-      <w:r>
-        <w:t xml:space="preserve"> </w:t>
-      </w:r>
-      <w:r>
-        <w:t xml:space="preserve">blijft staan. De twaalf verslagbezoeken zijn niet als SOVON-bezoeken gereconstrueerd. M35 heeft zeven SOVON-bezoeken maar uitsluitend 49 lege matrixcellen. In de database staan voor M35 zeventien jaarverslagregels met samen 54 territoria en één</w:t>
-      </w:r>
-      <w:r>
-        <w:t xml:space="preserve"> </w:t>
-      </w:r>
-      <w:r>
-        <w:rPr>
-          <w:rStyle w:val="VerbatimChar"/>
-        </w:rPr>
-        <w:t xml:space="preserve">meeuwen_literatuur</w:t>
-      </w:r>
-      <w:r>
-        <w:t xml:space="preserve">-regel met 64 territoria; deze bronnen blijven gescheiden van SOVON.</w:t>
-      </w:r>
-    </w:p>
-    <w:p>
-      <w:pPr>
-        <w:pStyle w:val="BodyText"/>
-      </w:pPr>
-      <w:r>
-        <w:rPr>
-          <w:b/>
-          <w:bCs/>
-        </w:rPr>
-        <w:t xml:space="preserve">Jaarcontroles 1988-2004, 3 oktober 2026.</w:t>
-      </w:r>
-      <w:r>
-        <w:t xml:space="preserve"> </w:t>
-      </w:r>
-      <w:r>
-        <w:t xml:space="preserve">De zeventien SOVON-downloads bevatten samen 5.141 in-scope bezoeken. Alle 5.141 stonden al op bron-ID en inhoud gelijk in</w:t>
-      </w:r>
-      <w:r>
-        <w:t xml:space="preserve"> </w:t>
-      </w:r>
-      <w:r>
-        <w:rPr>
-          <w:rStyle w:val="VerbatimChar"/>
-        </w:rPr>
-        <w:t xml:space="preserve">dagbezoeken_bmp</w:t>
-      </w:r>
-      <w:r>
-        <w:t xml:space="preserve">; er is geen bezoek toegevoegd of gewijzigd. De matrices bevatten na uitsluiting van De Horsten samen 19.197 positieve SOVON-resultaten. Die waren gelijk aan de bestaande SOVON-regels, behoudens meeuwencombinaties waarvoor een aanwezige regel uit</w:t>
-      </w:r>
-      <w:r>
-        <w:t xml:space="preserve"> </w:t>
-      </w:r>
-      <w:r>
-        <w:rPr>
-          <w:rStyle w:val="VerbatimChar"/>
-        </w:rPr>
-        <w:t xml:space="preserve">meeuwen_literatuur</w:t>
-      </w:r>
-      <w:r>
-        <w:t xml:space="preserve"> </w:t>
-      </w:r>
-      <w:r>
-        <w:t xml:space="preserve">leidend bleef. In</w:t>
-      </w:r>
-      <w:r>
-        <w:t xml:space="preserve"> </w:t>
-      </w:r>
-      <w:r>
-        <w:rPr>
-          <w:rStyle w:val="VerbatimChar"/>
-        </w:rPr>
-        <w:t xml:space="preserve">territoria</w:t>
-      </w:r>
-      <w:r>
-        <w:t xml:space="preserve"> </w:t>
-      </w:r>
-      <w:r>
-        <w:t xml:space="preserve">zijn per jaar uitsluitend de volgende aantallen letterlijke, niet-conflicterende SOVON-nullen toegevoegd: 1988 1.444; 1989 1.512; 1990 1.622; 1991 1.761; 1992 1.739; 1993 2.057; 1994 1.838; 1995 1.811; 1996 1.797; 1997 1.829; 1998 1.834; 1999 1.873; 2000 1.773; 2001 1.846; 2002 1.884; 2003 1.854; 2004 1.984. Samen zijn dit 30.458 nieuwe regels.</w:t>
-      </w:r>
-      <w:r>
-        <w:t xml:space="preserve"> </w:t>
-      </w:r>
-      <w:r>
-        <w:rPr>
-          <w:rStyle w:val="VerbatimChar"/>
-        </w:rPr>
-        <w:t xml:space="preserve">territoria</w:t>
-      </w:r>
-      <w:r>
-        <w:t xml:space="preserve"> </w:t>
-      </w:r>
-      <w:r>
-        <w:t xml:space="preserve">bevat daarna 106.921 regels. Alle nieuwe nulregels zijn via</w:t>
-      </w:r>
-      <w:r>
-        <w:t xml:space="preserve"> </w:t>
-      </w:r>
-      <w:r>
-        <w:rPr>
-          <w:rStyle w:val="VerbatimChar"/>
-        </w:rPr>
-        <w:t xml:space="preserve">soorten</w:t>
-      </w:r>
-      <w:r>
-        <w:t xml:space="preserve">,</w:t>
-      </w:r>
-      <w:r>
-        <w:t xml:space="preserve"> </w:t>
-      </w:r>
-      <w:r>
-        <w:rPr>
-          <w:rStyle w:val="VerbatimChar"/>
-        </w:rPr>
-        <w:t xml:space="preserve">taxa_bronkoppeling</w:t>
-      </w:r>
-      <w:r>
-        <w:t xml:space="preserve">,</w:t>
-      </w:r>
-      <w:r>
-        <w:t xml:space="preserve"> </w:t>
-      </w:r>
-      <w:r>
-        <w:rPr>
-          <w:rStyle w:val="VerbatimChar"/>
-        </w:rPr>
-        <w:t xml:space="preserve">taxa</w:t>
-      </w:r>
-      <w:r>
-        <w:t xml:space="preserve"> </w:t>
-      </w:r>
-      <w:r>
-        <w:t xml:space="preserve">en</w:t>
-      </w:r>
-      <w:r>
-        <w:t xml:space="preserve"> </w:t>
-      </w:r>
-      <w:r>
-        <w:rPr>
-          <w:rStyle w:val="VerbatimChar"/>
-        </w:rPr>
-        <w:t xml:space="preserve">taxon_groepen</w:t>
-      </w:r>
-      <w:r>
-        <w:t xml:space="preserve"> </w:t>
-      </w:r>
-      <w:r>
-        <w:t xml:space="preserve">als vogels bereikbaar; de jaarlijkse databasebrede nacontrole omvat 128 routes en geeft nul fouten.</w:t>
-      </w:r>
-    </w:p>
-    <w:p>
-      <w:pPr>
-        <w:pStyle w:val="BodyText"/>
-      </w:pPr>
-      <w:r>
-        <w:t xml:space="preserve">In 1991 zijn vier SOVON-meeuwennullen niet ingevoerd omdat voor dezelfde plot-soortcombinatie een positieve, leidende waarde uit</w:t>
-      </w:r>
-      <w:r>
-        <w:t xml:space="preserve"> </w:t>
-      </w:r>
-      <w:r>
-        <w:rPr>
-          <w:rStyle w:val="VerbatimChar"/>
-        </w:rPr>
-        <w:t xml:space="preserve">meeuwen_literatuur</w:t>
-      </w:r>
-      <w:r>
-        <w:t xml:space="preserve"> </w:t>
-      </w:r>
-      <w:r>
-        <w:t xml:space="preserve">bestaat. Een retroactieve afwezigheidscontrole over 1984-2004 houdt 1.309</w:t>
-      </w:r>
-      <w:r>
-        <w:t xml:space="preserve"> </w:t>
-      </w:r>
-      <w:r>
-        <w:rPr>
-          <w:rStyle w:val="VerbatimChar"/>
-        </w:rPr>
-        <w:t xml:space="preserve">jrvslg_m</w:t>
-      </w:r>
-      <w:r>
-        <w:t xml:space="preserve">-regels en 70</w:t>
-      </w:r>
-      <w:r>
-        <w:t xml:space="preserve"> </w:t>
-      </w:r>
-      <w:r>
-        <w:rPr>
-          <w:rStyle w:val="VerbatimChar"/>
-        </w:rPr>
-        <w:t xml:space="preserve">meeuwen_literatuur</w:t>
-      </w:r>
-      <w:r>
-        <w:t xml:space="preserve">-regels bewust in stand: de SOVON-matrix bevat voor die combinaties geen positieve of letterlijke nulwaarde, en ontbreken in de download is geen wijzigings- of verwijderingsgrond. Jaarverslagen zijn ieder jaar gebruikt om ontbrekende tellers en andere bronverschillen te verklaren. In 1988-2004 leverde dit geen ontbrekende tellerkoppeling op; waar database en download geen teller bevatten, noemde ook het verslag geen ondubbelzinnig aan een bestaande code koppelbare waarnemer voor dat plotjaar.</w:t>
-      </w:r>
-    </w:p>
-    <w:p>
-      <w:pPr>
-        <w:pStyle w:val="BodyText"/>
-      </w:pPr>
-      <w:r>
-        <w:t xml:space="preserve">De Horsten behoort niet tot Meijendel. Uit de download van 1996 zijn daarom negen bezoeken, 41 positieve resultaten met samen 636 territoria, 30 letterlijke nullen en vier lege cellen volledig genegeerd. De uitsluitend lege selecties van De Horsten in volgende jaren zijn eveneens buiten de vergelijking gehouden. Voor 2000 verklaart het jaarverslag de lege SOVON-resultaten van M35: de werkgroep telde M35 en M36 wel, maar stuurde die resultaten dat jaar niet aan SOVON. De bestaande</w:t>
-      </w:r>
-      <w:r>
-        <w:t xml:space="preserve"> </w:t>
-      </w:r>
-      <w:r>
-        <w:rPr>
-          <w:rStyle w:val="VerbatimChar"/>
-        </w:rPr>
-        <w:t xml:space="preserve">jrvslg_m</w:t>
-      </w:r>
-      <w:r>
-        <w:t xml:space="preserve">-regels blijven daarom staan; uit de lege SOVON-cellen is niets afgeleid.</w:t>
-      </w:r>
-    </w:p>
-    <w:p>
-      <w:pPr>
-        <w:pStyle w:val="BodyText"/>
-      </w:pPr>
-      <w:r>
-        <w:rPr>
-          <w:b/>
-          <w:bCs/>
-        </w:rPr>
-        <w:t xml:space="preserve">Controlejaar 2005, afgerond.</w:t>
-      </w:r>
-      <w:r>
-        <w:t xml:space="preserve"> </w:t>
-      </w:r>
-      <w:r>
-        <w:t xml:space="preserve">De 111 geleverde bezoeken staan veld voor veld gelijk in</w:t>
-      </w:r>
-      <w:r>
-        <w:t xml:space="preserve"> </w:t>
-      </w:r>
-      <w:r>
-        <w:rPr>
-          <w:rStyle w:val="VerbatimChar"/>
-        </w:rPr>
-        <w:t xml:space="preserve">dagbezoeken_bmp</w:t>
-      </w:r>
-      <w:r>
-        <w:t xml:space="preserve">; 1.156 positieve vogelresultaten zijn gelijk. De 1.999 letterlijke, niet-conflicterende vogelnullen zijn in</w:t>
-      </w:r>
-      <w:r>
-        <w:t xml:space="preserve"> </w:t>
-      </w:r>
-      <w:r>
-        <w:rPr>
-          <w:rStyle w:val="VerbatimChar"/>
-        </w:rPr>
-        <w:t xml:space="preserve">territoria</w:t>
-      </w:r>
-      <w:r>
-        <w:t xml:space="preserve"> </w:t>
-      </w:r>
-      <w:r>
-        <w:t xml:space="preserve">opgenomen; 1.766 lege cellen niet. De puntenlaag bevat nul features. Het bezoektotalenbestand bevat daarnaast 101 positieve zoogdierregels op 58 bestaande BMP-bezoeken in zeven plots: Konijn 46 regels met totaal 241, Ree 34 met totaal 89, Vos 15 met totaal 22, Eekhoorn vijf met totaal 6 en Dwergspitsmuis één met totaal 1. Twintig waarden waren al gelijk. De overige 81 SOVON-regels met 284 dieren op 46 bezoeken zijn afzonderlijk opgenomen onder</w:t>
-      </w:r>
-      <w:r>
-        <w:t xml:space="preserve"> </w:t>
-      </w:r>
-      <w:r>
-        <w:rPr>
-          <w:rStyle w:val="VerbatimChar"/>
-        </w:rPr>
-        <w:t xml:space="preserve">sovon-bmp-jaarbestanden-v1</w:t>
-      </w:r>
-      <w:r>
-        <w:t xml:space="preserve">; daaronder vallen ook de twee afwijkende Konijnwaarden in M16. Bezoek 365793 bevat SOVON 2 naast NDFF 9 en bezoek 365789 bevat SOVON 1 naast NDFF 3. Het NDFF-auditspoor blijft staan; SOVON is bij gecombineerd gebruik leidend. Er zijn geen zoogdiernullen afgeleid.</w:t>
-      </w:r>
-    </w:p>
-    <w:p>
-      <w:pPr>
-        <w:pStyle w:val="BodyText"/>
-      </w:pPr>
-      <w:r>
-        <w:rPr>
-          <w:b/>
-          <w:bCs/>
-        </w:rPr>
-        <w:t xml:space="preserve">Controlejaar 2006, afgerond.</w:t>
-      </w:r>
-      <w:r>
-        <w:t xml:space="preserve"> </w:t>
-      </w:r>
-      <w:r>
-        <w:t xml:space="preserve">De 172 geleverde bezoeken staan veld voor veld gelijk in</w:t>
-      </w:r>
-      <w:r>
-        <w:t xml:space="preserve"> </w:t>
-      </w:r>
-      <w:r>
-        <w:rPr>
-          <w:rStyle w:val="VerbatimChar"/>
-        </w:rPr>
-        <w:t xml:space="preserve">dagbezoeken_bmp</w:t>
-      </w:r>
-      <w:r>
-        <w:t xml:space="preserve">; 1.069 positieve vogelresultaten zijn gelijk. De 1.865 letterlijke, niet-conflicterende vogelnullen zijn in</w:t>
-      </w:r>
-      <w:r>
-        <w:t xml:space="preserve"> </w:t>
-      </w:r>
-      <w:r>
-        <w:rPr>
-          <w:rStyle w:val="VerbatimChar"/>
-        </w:rPr>
-        <w:t xml:space="preserve">territoria</w:t>
-      </w:r>
-      <w:r>
-        <w:t xml:space="preserve"> </w:t>
-      </w:r>
-      <w:r>
-        <w:t xml:space="preserve">opgenomen; 1.987 lege cellen niet. De puntenlaag bevat nul features. Het bezoektotalenbestand bevat 159 positieve zoogdierregels. Daarvan waren 36 gelijk. Onder</w:t>
-      </w:r>
-      <w:r>
-        <w:t xml:space="preserve"> </w:t>
-      </w:r>
-      <w:r>
-        <w:rPr>
-          <w:rStyle w:val="VerbatimChar"/>
-        </w:rPr>
-        <w:t xml:space="preserve">sovon-bmp-jaarbestanden-v1</w:t>
-      </w:r>
-      <w:r>
-        <w:t xml:space="preserve"> </w:t>
-      </w:r>
-      <w:r>
-        <w:t xml:space="preserve">zijn 123 aanvullende regels met samen 523 dieren op 72 bezoeken opgenomen zonder nulafleiding. Daaronder staan acht afwijkende SOVON-bezoektotalen naast het NDFF-auditspoor; SOVON is bij gecombineerd gebruik leidend.</w:t>
-      </w:r>
-    </w:p>
-    <w:p>
-      <w:pPr>
-        <w:pStyle w:val="BodyText"/>
-      </w:pPr>
-      <w:r>
-        <w:rPr>
-          <w:b/>
-          <w:bCs/>
-        </w:rPr>
-        <w:t xml:space="preserve">Controlejaar 2007, afgerond.</w:t>
-      </w:r>
-      <w:r>
-        <w:t xml:space="preserve"> </w:t>
-      </w:r>
-      <w:r>
-        <w:t xml:space="preserve">De 172 geleverde bezoeken staan veld voor veld gelijk in</w:t>
-      </w:r>
-      <w:r>
-        <w:t xml:space="preserve"> </w:t>
-      </w:r>
-      <w:r>
-        <w:rPr>
-          <w:rStyle w:val="VerbatimChar"/>
-        </w:rPr>
-        <w:t xml:space="preserve">dagbezoeken_bmp</w:t>
-      </w:r>
-      <w:r>
-        <w:t xml:space="preserve">; 1.166 positieve vogelresultaten zijn gelijk. Alle 1.924 letterlijke vogelnullen zijn in</w:t>
-      </w:r>
-      <w:r>
-        <w:t xml:space="preserve"> </w:t>
-      </w:r>
-      <w:r>
-        <w:rPr>
-          <w:rStyle w:val="VerbatimChar"/>
-        </w:rPr>
-        <w:t xml:space="preserve">territoria</w:t>
-      </w:r>
-      <w:r>
-        <w:t xml:space="preserve"> </w:t>
-      </w:r>
-      <w:r>
-        <w:t xml:space="preserve">opgenomen; 1.831 lege cellen niet. Het bezoektotalenbestand bevat 249 positieve zoogdierregels. Daarvan waren 101 al gelijk. Onder</w:t>
-      </w:r>
-      <w:r>
-        <w:t xml:space="preserve"> </w:t>
-      </w:r>
-      <w:r>
-        <w:rPr>
-          <w:rStyle w:val="VerbatimChar"/>
-        </w:rPr>
-        <w:t xml:space="preserve">sovon-bmp-jaarbestanden-v1</w:t>
-      </w:r>
-      <w:r>
-        <w:t xml:space="preserve"> </w:t>
-      </w:r>
-      <w:r>
-        <w:t xml:space="preserve">staan 148 aanvullende regels met 692 dieren op 84 bezoeken, inclusief de elf afwijkende SOVON-bezoektotalen. Het historische NDFF-auditspoor blijft bestaan; SOVON is bij gecombineerd gebruik leidend en beide waarden worden niet opgeteld. Voor M6 vermeldt de download teller</w:t>
-      </w:r>
-      <w:r>
-        <w:t xml:space="preserve"> </w:t>
-      </w:r>
-      <w:r>
-        <w:rPr>
-          <w:rStyle w:val="VerbatimChar"/>
-        </w:rPr>
-        <w:t xml:space="preserve">JASQ00</w:t>
-      </w:r>
-      <w:r>
-        <w:t xml:space="preserve">. Het verslag noemt T. Lansink voor M6 en M61 en J. van As voor M83; de database koppelt M6 en M61 aan</w:t>
-      </w:r>
-      <w:r>
-        <w:t xml:space="preserve"> </w:t>
-      </w:r>
-      <w:r>
-        <w:rPr>
-          <w:rStyle w:val="VerbatimChar"/>
-        </w:rPr>
-        <w:t xml:space="preserve">ALNK00</w:t>
-      </w:r>
-      <w:r>
-        <w:t xml:space="preserve"> </w:t>
-      </w:r>
-      <w:r>
-        <w:t xml:space="preserve">en M83 aan</w:t>
-      </w:r>
-      <w:r>
-        <w:t xml:space="preserve"> </w:t>
-      </w:r>
-      <w:r>
-        <w:rPr>
-          <w:rStyle w:val="VerbatimChar"/>
-        </w:rPr>
-        <w:t xml:space="preserve">JASQ00</w:t>
-      </w:r>
-      <w:r>
-        <w:t xml:space="preserve">. De downloadcode bij M6 is daarom niet overgenomen.</w:t>
-      </w:r>
-    </w:p>
-    <w:p>
-      <w:pPr>
-        <w:pStyle w:val="BodyText"/>
-      </w:pPr>
-      <w:r>
-        <w:rPr>
-          <w:b/>
-          <w:bCs/>
-        </w:rPr>
-        <w:t xml:space="preserve">Controlejaren 2008-2022, afgerond.</w:t>
-      </w:r>
-      <w:r>
-        <w:t xml:space="preserve"> </w:t>
-      </w:r>
-      <w:r>
-        <w:t xml:space="preserve">De vijftien downloads bevatten 6.306 in-scope bezoeken. Zij staan alle al in</w:t>
-      </w:r>
-      <w:r>
-        <w:t xml:space="preserve"> </w:t>
-      </w:r>
-      <w:r>
-        <w:rPr>
-          <w:rStyle w:val="VerbatimChar"/>
-        </w:rPr>
-        <w:t xml:space="preserve">dagbezoeken_bmp</w:t>
-      </w:r>
-      <w:r>
-        <w:t xml:space="preserve">; bij 154 bezoeken verschilt uitsluitend afsluitende witruimte in</w:t>
-      </w:r>
-      <w:r>
-        <w:t xml:space="preserve"> </w:t>
-      </w:r>
-      <w:r>
-        <w:rPr>
-          <w:rStyle w:val="VerbatimChar"/>
-        </w:rPr>
-        <w:t xml:space="preserve">opmerking</w:t>
-      </w:r>
-      <w:r>
-        <w:t xml:space="preserve">, zodat geen bezoek is gewijzigd. Aan</w:t>
-      </w:r>
-      <w:r>
-        <w:t xml:space="preserve"> </w:t>
-      </w:r>
-      <w:r>
-        <w:rPr>
-          <w:rStyle w:val="VerbatimChar"/>
-        </w:rPr>
-        <w:t xml:space="preserve">territoria</w:t>
-      </w:r>
-      <w:r>
-        <w:t xml:space="preserve"> </w:t>
-      </w:r>
-      <w:r>
-        <w:t xml:space="preserve">zijn 37.213 letterlijke, niet-conflicterende SOVON-nullen toegevoegd. Lege cellen zijn niet ingevoerd. Bestaande Meijendelwaarden die in de download ontbreken zijn behouden. De 81 positieve downloadwaarden uit 2022 voor M105, M71 en M36 staan al met exact dezelfde aantallen onder</w:t>
-      </w:r>
-      <w:r>
-        <w:t xml:space="preserve"> </w:t>
-      </w:r>
-      <w:r>
-        <w:rPr>
-          <w:rStyle w:val="VerbatimChar"/>
-        </w:rPr>
-        <w:t xml:space="preserve">jrvslg_m</w:t>
-      </w:r>
-      <w:r>
-        <w:t xml:space="preserve">; een tweede SOVON-kopie is daarom niet gemaakt. Voor 2008-2022 staan 3.929 aanvullende positieve zoogdierregels op 2.334 bezoeken onder</w:t>
-      </w:r>
-      <w:r>
-        <w:t xml:space="preserve"> </w:t>
-      </w:r>
-      <w:r>
-        <w:rPr>
-          <w:rStyle w:val="VerbatimChar"/>
-        </w:rPr>
-        <w:t xml:space="preserve">sovon-bmp-jaarbestanden-v1</w:t>
-      </w:r>
-      <w:r>
-        <w:t xml:space="preserve">. Alle bronwaarden zijn na invoer gelijk aan de downloads; er zijn geen zoogdiernullen afgeleid.</w:t>
-      </w:r>
-    </w:p>
-    <w:p>
-      <w:pPr>
-        <w:pStyle w:val="BodyText"/>
-      </w:pPr>
-      <w:r>
-        <w:rPr>
-          <w:b/>
-          <w:bCs/>
-        </w:rPr>
-        <w:t xml:space="preserve">Controlejaren 2023-2025, afgerond.</w:t>
-      </w:r>
-      <w:r>
-        <w:t xml:space="preserve"> </w:t>
-      </w:r>
-      <w:r>
-        <w:t xml:space="preserve">De drie downloads bevatten 1.367 in-scope bezoeken. Zij staan alle al in</w:t>
-      </w:r>
-      <w:r>
-        <w:t xml:space="preserve"> </w:t>
-      </w:r>
-      <w:r>
-        <w:rPr>
-          <w:rStyle w:val="VerbatimChar"/>
-        </w:rPr>
-        <w:t xml:space="preserve">dagbezoeken_bmp</w:t>
-      </w:r>
-      <w:r>
-        <w:t xml:space="preserve">; bij 24 bezoeken verschilt uitsluitend afsluitende witruimte in</w:t>
-      </w:r>
-      <w:r>
-        <w:t xml:space="preserve"> </w:t>
-      </w:r>
-      <w:r>
-        <w:rPr>
-          <w:rStyle w:val="VerbatimChar"/>
-        </w:rPr>
-        <w:t xml:space="preserve">opmerking</w:t>
-      </w:r>
-      <w:r>
-        <w:t xml:space="preserve">. Aan</w:t>
-      </w:r>
-      <w:r>
-        <w:t xml:space="preserve"> </w:t>
-      </w:r>
-      <w:r>
-        <w:rPr>
-          <w:rStyle w:val="VerbatimChar"/>
-        </w:rPr>
-        <w:t xml:space="preserve">territoria</w:t>
-      </w:r>
-      <w:r>
         <w:t xml:space="preserve"> </w:t>
       </w:r>
       <w:r>
@@ -2135,22 +2025,7 @@
         <w:pStyle w:val="BodyText"/>
       </w:pPr>
       <w:r>
-        <w:t xml:space="preserve">Vanaf 3 oktober 2026 geldt als hoofdregel dat alle werkelijk aanvullende SOVON-gegevens in de bestaande Meijendel-kerntabellen mogen worden opgenomen. Bestaande Meijendelgegevens blijven staan wanneer zij in de download ontbreken. Alleen een afzonderlijke conflictregel kan daarvan afwijken. Een aanwezige regel uit</w:t>
-      </w:r>
-      <w:r>
-        <w:t xml:space="preserve"> </w:t>
-      </w:r>
-      <w:r>
-        <w:rPr>
-          <w:rStyle w:val="VerbatimChar"/>
-        </w:rPr>
-        <w:t xml:space="preserve">meeuwen_literatuur</w:t>
-      </w:r>
-      <w:r>
-        <w:t xml:space="preserve"> </w:t>
-      </w:r>
-      <w:r>
-        <w:t xml:space="preserve">blijft voor meeuwen leidend; zonder zo’n regel mag de SOVON-waarde aanvullen of corrigeren. Een ontbrekende teller mag vanuit het jaarverslag worden toegevoegd wanneer kavel en waarnemer ondubbelzinnig zijn en een bestaande code beschikbaar is. De Horsten wordt volledig genegeerd. Niet-conflicterende letterlijke SOVON-nullen worden zonder nieuwe jaarbeslissing opgenomen; niet tot individuele bronregels herleidbare aggregaatvermeldingen worden niet als formeel afgekeurde waarnemingen gereconstrueerd. Ieder jaar wordt eerst volledig vergeleken. Nieuwe soortenconflicten, nieuwe gegevensmodellen en wel individueel herleidbare afkeuringsinformatie blijven afzonderlijke beslispunten.</w:t>
+        <w:t>Vanaf 3 oktober 2026 geldt als hoofdregel dat alle werkelijk aanvullende SOVON-gegevens in de bestaande Meijendel-kerntabellen mogen worden opgenomen. Bestaande Meijendelgegevens blijven staan wanneer zij in de download ontbreken. Alleen een afzonderlijke conflictregel kan daarvan afwijken. Een aanwezige regel uit meeuwen_literatuur blijft voor meeuwen leidend; zonder zo'n regel mag de SOVON-waarde aanvullen of corrigeren. Een ontbrekende teller mag vanuit het jaarverslag worden toegevoegd wanneer kavel en waarnemer ondubbelzinnig zijn en een bestaande code beschikbaar is. De Horsten wordt volledig genegeerd. Niet-conflicterende letterlijke SOVON-nullen worden zonder nieuwe jaarbeslissing opgenomen; niet tot individuele bronregels herleidbare aggregaatvermeldingen worden niet als formeel afgekeurde waarnemingen gereconstrueerd. Ieder jaar wordt eerst volledig vergeleken. Nieuwe soortenconflicten, nieuwe gegevensmodellen en wel individueel herleidbare afkeuringsinformatie blijven afzonderlijke beslispunten.</w:t>
       </w:r>
     </w:p>
     <w:p>
@@ -3164,6 +3039,20 @@
     </w:p>
     <w:bookmarkEnd w:id="13"/>
     <w:bookmarkStart w:id="14" w:name="Xded6c184b9a569c146345b6e935b052f391caf7"/>
+    <w:p>
+      <w:pPr>
+        <w:pStyle w:val="BodyText"/>
+      </w:pPr>
+      <w:r>
+        <w:rPr>
+          <w:b/>
+        </w:rPr>
+        <w:t>Gebruik van de volledige PQ-samenstelling, 11 oktober 2026.</w:t>
+      </w:r>
+      <w:r>
+        <w:t xml:space="preserve"> Voor de broedvogel–vegetatieanalyse zijn 1.314 van de 2.007 provinciale opnamen aan 35 actieve Natura 2000-vogelplots gekoppeld. Zij vormen 501 PQ-plotjaren en bevatten 642 van de 714 centrale taxa over 1981–2025. Een Hellinger-transformatie en drie compositieassen vatten 27,8% van de variatie samen. In de vogeloverlap van 37.140 soort–plot–jaarrijen, 406 vogelplotjaren, 35 plots en 154 soorten over 1989–2025 verbeteren deze assen de ruimtelijke voorspelling in vier van vijf plotblokken, maar niet de voorspelling van latere jaren in twee tijdsblokken. De uitkomst maakt de provinciale PQ-reeks bruikbaarder voor ruimtelijke habitatverschillen, maar levert nog geen voorspellende relatie tussen vegetatieverandering en vogelverandering.</w:t>
+      </w:r>
+    </w:p>
     <w:p>
       <w:pPr>
         <w:pStyle w:val="Heading3"/>
@@ -4278,45 +4167,11 @@
       <w:r>
         <w:rPr>
           <w:b/>
-          <w:bCs/>
-        </w:rPr>
-        <w:t xml:space="preserve">Wat heeft FLORON bevestigd?</w:t>
-      </w:r>
-      <w:r>
-        <w:t xml:space="preserve"> </w:t>
-      </w:r>
-      <w:r>
-        <w:t xml:space="preserve">Op 6 oktober 2026 meldde FLORON dat één kalenderdag in één kilometerhok als telling mag worden beschouwd. Zo’n telling kan één, twee of drie oorspronkelijke lijsten omvatten. Persoonsgegevens en daarvan afgeleide waarnemerscodes worden niet geleverd. De</w:t>
-      </w:r>
-      <w:r>
-        <w:t xml:space="preserve"> </w:t>
-      </w:r>
-      <w:r>
-        <w:rPr>
-          <w:rStyle w:val="VerbatimChar"/>
-        </w:rPr>
-        <w:t xml:space="preserve">uri</w:t>
-      </w:r>
-      <w:r>
-        <w:t xml:space="preserve"> </w:t>
-      </w:r>
-      <w:r>
-        <w:t xml:space="preserve">of</w:t>
-      </w:r>
-      <w:r>
-        <w:t xml:space="preserve"> </w:t>
-      </w:r>
-      <w:r>
-        <w:rPr>
-          <w:rStyle w:val="VerbatimChar"/>
-        </w:rPr>
-        <w:t xml:space="preserve">identity</w:t>
-      </w:r>
-      <w:r>
-        <w:t xml:space="preserve"> </w:t>
-      </w:r>
-      <w:r>
-        <w:t xml:space="preserve">uit de NDFF-export is de stabiele sleutel van de afzonderlijke waarneming.</w:t>
+        </w:rPr>
+        <w:t>Wat heeft FLORON bevestigd?</w:t>
+      </w:r>
+      <w:r>
+        <w:t xml:space="preserve"> Op 6 oktober 2026 meldde FLORON dat één kalenderdag in één kilometerhok als telling mag worden beschouwd. Zo'n telling kan één, twee of drie oorspronkelijke lijsten omvatten. Persoonsgegevens en daarvan afgeleide waarnemerscodes worden niet geleverd. De uri of identity uit de NDFF-export is de stabiele sleutel van de afzonderlijke waarneming.</w:t>
       </w:r>
     </w:p>
     <w:p>
@@ -4420,15 +4275,11 @@
       <w:r>
         <w:rPr>
           <w:b/>
-          <w:bCs/>
-        </w:rPr>
-        <w:t xml:space="preserve">Wat heeft FLORON bevestigd?</w:t>
-      </w:r>
-      <w:r>
-        <w:t xml:space="preserve"> </w:t>
-      </w:r>
-      <w:r>
-        <w:t xml:space="preserve">Eén jaar in één kilometerhok is de fijnste beschikbare teleenheid. Voor 2011 werden alleen soort, jaar, kilometerhok en waarnemer opgeslagen. FLORON beschikt niet over de eerder gevraagde lijst-ID’s, volledigheidsvlaggen, bezoekdata, bezoekduur, checklistversies of expliciete registraties van niet-aangetroffen soorten.</w:t>
+        </w:rPr>
+        <w:t>Wat heeft FLORON bevestigd?</w:t>
+      </w:r>
+      <w:r>
+        <w:t xml:space="preserve"> Eén jaar in één kilometerhok is de fijnste beschikbare teleenheid. Voor 2011 werden alleen soort, jaar, kilometerhok en waarnemer opgeslagen. FLORON beschikt niet over de eerder gevraagde lijst-ID's, volledigheidsvlaggen, bezoekdata, bezoekduur, checklistversies of expliciete registraties van niet-aangetroffen soorten.</w:t>
       </w:r>
     </w:p>
     <w:p>
@@ -5852,26 +5703,22 @@
         <w:t xml:space="preserve">55 plots, peiljaar 2025</w:t>
       </w:r>
     </w:p>
-    <w:p>
-      <w:pPr>
-        <w:pStyle w:val="BodyText"/>
-      </w:pPr>
-      <w:r>
-        <w:rPr>
-          <w:b/>
-          <w:bCs/>
-        </w:rPr>
-        <w:t xml:space="preserve">Gebruik en grens.</w:t>
-      </w:r>
-      <w:r>
-        <w:t xml:space="preserve"> </w:t>
-      </w:r>
-      <w:r>
-        <w:t xml:space="preserve">Beschrijft hoogte en hoogtevariatie per plot. Eén peiljaar geeft geen ontwikkeling door de tijd.</w:t>
-      </w:r>
-    </w:p>
     <w:bookmarkEnd w:id="46"/>
     <w:bookmarkStart w:id="47" w:name="stikstofdepositie"/>
+    <w:p>
+      <w:pPr>
+        <w:pStyle w:val="BodyText"/>
+      </w:pPr>
+      <w:r>
+        <w:rPr>
+          <w:b/>
+        </w:rPr>
+        <w:t>Gebruik en grens.</w:t>
+      </w:r>
+      <w:r>
+        <w:t xml:space="preserve"> De huidige tabel beschrijft maaiveldhoogte en hoogtevariatie per plot. Eén peiljaar geeft geen ontwikkeling door de tijd en een DTM meet geen vegetatiehoogte. AHN stelt per cyclus zowel een digitaal terreinmodel als een digitaal oppervlaktemodel beschikbaar. Het verschil DSM–DTM kan daarom als vegetatiehoogteproxy worden onderzocht, maar alleen na vaststelling van het werkelijke inwinningsjaar in Meijendel en controle op gebouwen, water en andere niet-vegetatieobjecten. Zo'n laag is nog niet voor de vogel–vegetatieanalyse afgeleid of in de database opgenomen.</w:t>
+      </w:r>
+    </w:p>
     <w:p>
       <w:pPr>
         <w:pStyle w:val="Heading4"/>
@@ -7520,43 +7367,33 @@
       <w:r>
         <w:rPr>
           <w:b/>
-          <w:bCs/>
-        </w:rPr>
-        <w:t xml:space="preserve">Remote sensing van vegetatiehoogte en -bedekking:</w:t>
-      </w:r>
-      <w:r>
-        <w:t xml:space="preserve"> </w:t>
-      </w:r>
-      <w:r>
-        <w:t xml:space="preserve">WUR beschreef kaarten voor 2008 en 2014; TU Delft beschreef elf beeldmomenten uit 2019–2021. De afgeleide rasterbestanden zijn nog niet als openbare dataset gevonden.</w:t>
-      </w:r>
-    </w:p>
-    <w:p>
-      <w:pPr>
-        <w:pStyle w:val="BodyText"/>
-      </w:pPr>
-      <w:hyperlink r:id="rId77">
-        <w:r>
-          <w:rPr>
-            <w:rStyle w:val="Hyperlink"/>
-            <w:b/>
-            <w:bCs/>
-          </w:rPr>
-          <w:t xml:space="preserve">Landbedekking in vogelplots</w:t>
-        </w:r>
-      </w:hyperlink>
-      <w:r>
-        <w:rPr>
-          <w:b/>
-          <w:bCs/>
-        </w:rPr>
-        <w:t xml:space="preserve">:</w:t>
-      </w:r>
-      <w:r>
-        <w:t xml:space="preserve"> </w:t>
-      </w:r>
-      <w:r>
-        <w:t xml:space="preserve">de openbare studie van Schmidt-Tauscher, Häger en Van der Hagen uit 2025 behandelt 25 BMP-plots met samen 925 hectare. Het openbare supplement bevat inmiddels de volledige tabel met de oppervlakte van zeven landbedekkingsklassen per plot in 2001 en 2022: struweel, bos, boomgroepen, lage vegetatie, riet, kaal zand en water. De vogelgegevens overlappen met de bestaande VWG/SOVON-reeks. De plot-tabel voegt wel een ecologisch specifiekere verklarende laag toe dan de reeds aanwezige CBS-landgebruikgegevens voor 55 plots in 1996, 2010, 2015, 2017 en 2022. De classificatie is afgeleid uit luchtfoto’s, teruggebracht tot pixels van 5 bij 5 meter en had een totale nauwkeurigheid van 81% in 2001 en 82% in 2022. De geclassificeerde rasters zelf zitten niet in het openbare supplement; de auteurs vermelden dat de gebruikte en gemaakte datasets op verzoek verkrijgbaar zijn. Met die rasters kunnen ook ruimtelijke samenhang, versnippering, randen en het vegetatiemozaïek binnen plots worden onderzocht. Het blijven twee momentopnamen binnen 25 van de 55 plots; zij meten geen jaarlijkse ontwikkeling, voedsel, nestgelegenheid of andere habitatkwaliteit en bewijzen op zichzelf geen beheereffect.</w:t>
+        </w:rPr>
+        <w:t>Remote sensing van vegetatiehoogte en -bedekking:</w:t>
+      </w:r>
+      <w:r>
+        <w:t xml:space="preserve"> WUR beschreef kaarten voor 2008 en 2014; TU Delft beschreef elf beeldmomenten uit 2019–2021. De afgeleide onderzoeksrasters zijn nog niet als openbare dataset gevonden. De AHN-dataroom biedt wel de landelijke DTM- en DSM-bronnen voor meerdere cycli. Daarmee kan een reproduceerbare vegetatiehoogteproxy worden afgeleid, maar niet zonder lokale kwaliteitscontrole en koppeling aan de feitelijke inwinningsjaren. Deze kandidaatbron is daarom beschikbaar voor een gerichte vervolgtoets, niet reeds analyseklaar.</w:t>
+      </w:r>
+    </w:p>
+    <w:p>
+      <w:pPr>
+        <w:pStyle w:val="BodyText"/>
+      </w:pPr>
+      <w:r>
+        <w:rPr>
+          <w:b/>
+        </w:rPr>
+        <w:t>Landbedekking in vogelplots:</w:t>
+      </w:r>
+      <w:r>
+        <w:t xml:space="preserve"> de openbare studie van Schmidt-Tauscher, Häger en Van der Hagen uit 2025 behandelt 25 BMP-plots met samen 925 hectare. Het openbare supplement bevat de volledige tabel met de oppervlakte van zeven landbedekkingsklassen per plot in 2001 en 2022: struweel, bos, boomgroepen, lage vegetatie, riet, kaal zand en water. De classificatie is afgeleid uit luchtfoto's, teruggebracht tot pixels van 5 bij 5 meter en had een totale nauwkeurigheid van 81% in 2001 en 82% in 2022. De bron-Excel is op 11 oktober 2026 reproduceerbaar in de lokale broedvogel–vegetatieanalyse gebruikt en met SHA256 in het uitvoermanifest vastgelegd; zij is niet als nieuwe brontabel in de levende database geïmporteerd. M17 heeft in de actuele vogelmatrix geen territoriumplotjaar en valt uit de modellen. De overige vogelgroepen gebruiken 22–24 plots. Bij M71 is in beide jaren 47,89 van 48,46 hectare geclassificeerd; de ontbrekende 0,57 hectare blijft zichtbaar en de klasseaandelen zijn alleen over het geclassificeerde deel berekend.</w:t>
+      </w:r>
+    </w:p>
+    <w:p>
+      <w:pPr>
+        <w:pStyle w:val="BodyText"/>
+      </w:pPr>
+      <w:r>
+        <w:t>De plot-tabel voegt een ecologisch specifiekere verklarende laag toe dan de CBS-landgebruikgegevens voor 55 plots in 1996, 2010, 2015, 2017 en 2022. Wateroppervlak leverde in alle vijf ruimtelijke validatieblokken een betere logscore voor watervogels. Voor de overige vogelgroepen waren de scores gemengd of te veel modellen numeriek ongeldig; van de 36 landbedekkingsvalidaties slaagden er 18. De geclassificeerde rasters zelf zitten niet in het openbare supplement; de auteurs vermelden dat de gebruikte en gemaakte datasets op verzoek verkrijgbaar zijn. Met die rasters zouden ook ruimtelijke samenhang, versnippering, randen en vegetatiemozaïek kunnen worden onderzocht. Het blijven twee momentopnamen binnen 25 plots; zij meten geen jaarlijkse ontwikkeling, vegetatiehoogte, voedsel, nestgelegenheid of andere habitatkwaliteit en bewijzen op zichzelf geen beheereffect.</w:t>
       </w:r>
     </w:p>
     <w:p>

</xml_diff>

<commit_message>
Voeg gerichte habitatmodellen met AHN en weer toe
</commit_message>
<xml_diff>
--- a/docs/MEIJENDEL_BRONREGISTER.docx
+++ b/docs/MEIJENDEL_BRONREGISTER.docx
@@ -5628,33 +5628,25 @@
       <w:r>
         <w:rPr>
           <w:b/>
-          <w:bCs/>
-        </w:rPr>
-        <w:t xml:space="preserve">Omvang en periode in de huidige SQL-dump.</w:t>
-      </w:r>
-      <w:r>
-        <w:t xml:space="preserve"> </w:t>
-      </w:r>
-      <w:r>
-        <w:t xml:space="preserve">24.837 dagregels, 1953–2026</w:t>
-      </w:r>
-    </w:p>
-    <w:p>
-      <w:pPr>
-        <w:pStyle w:val="BodyText"/>
-      </w:pPr>
-      <w:r>
-        <w:rPr>
-          <w:b/>
-          <w:bCs/>
-        </w:rPr>
-        <w:t xml:space="preserve">Gebruik en grens.</w:t>
-      </w:r>
-      <w:r>
-        <w:t xml:space="preserve"> </w:t>
-      </w:r>
-      <w:r>
-        <w:t xml:space="preserve">Temperatuur, neerslag, wind, zon en luchtdruk kunnen als covariaten worden gebruikt. Alleen de genormaliseerde analyseview is geldig; 2026 is nog niet compleet.</w:t>
+        </w:rPr>
+        <w:t xml:space="preserve">Omvang en periode in de levende database op 11 oktober 2026. </w:t>
+      </w:r>
+      <w:r>
+        <w:t>24.837 dagregels, 1 januari 1958 tot en met 31 december 2025.</w:t>
+      </w:r>
+    </w:p>
+    <w:p>
+      <w:pPr>
+        <w:pStyle w:val="BodyText"/>
+      </w:pPr>
+      <w:r>
+        <w:rPr>
+          <w:b/>
+        </w:rPr>
+        <w:t xml:space="preserve">Gebruik en grens. </w:t>
+      </w:r>
+      <w:r>
+        <w:t>Temperatuur, neerslag, wind, zon en luchtdruk kunnen als covariaten worden gebruikt. Alleen de genormaliseerde analyseview is geldig. De huidige reeks eindigt met het volledige kalenderjaar 2025.</w:t>
       </w:r>
     </w:p>
     <w:bookmarkEnd w:id="45"/>
@@ -5713,10 +5705,18 @@
         <w:rPr>
           <w:b/>
         </w:rPr>
-        <w:t>Gebruik en grens.</w:t>
-      </w:r>
-      <w:r>
-        <w:t xml:space="preserve"> De huidige tabel beschrijft maaiveldhoogte en hoogtevariatie per plot. Eén peiljaar geeft geen ontwikkeling door de tijd en een DTM meet geen vegetatiehoogte. AHN stelt per cyclus zowel een digitaal terreinmodel als een digitaal oppervlaktemodel beschikbaar. Het verschil DSM–DTM kan daarom als vegetatiehoogteproxy worden onderzocht, maar alleen na vaststelling van het werkelijke inwinningsjaar in Meijendel en controle op gebouwen, water en andere niet-vegetatieobjecten. Zo'n laag is nog niet voor de vogel–vegetatieanalyse afgeleid of in de database opgenomen.</w:t>
+        <w:t xml:space="preserve">Gebruik en grens. </w:t>
+      </w:r>
+      <w:r>
+        <w:t>De huidige tabel beschrijft maaiveldhoogte en hoogtevariatie per plot. Eén peiljaar geeft geen ontwikkeling door de tijd en een DTM meet geen vegetatiehoogte.</w:t>
+      </w:r>
+    </w:p>
+    <w:p>
+      <w:pPr>
+        <w:pStyle w:val="BodyText"/>
+      </w:pPr>
+      <w:r>
+        <w:t>Voor de vogel–vegetatieanalyse is daarnaast een reproduceerbare proxy uit AHN3 en AHN4 afgeleid. Deze analyse-uitvoer bevat 110 regels: 55 plots voor 2014 en 55 voor 2020, telkens DSM minus DTM op twee meter resolutie. Bij 100 regels volgt de inwinningsdatum uit vlakoverlap met de officiële vlieglijnen; bij tien uit de dichtstbijzijnde vlieglijn, op maximaal 254 meter. Vastgelegd zijn hoogteverdeling, aandelen open terrein, lage vegetatie, struweel en bomen en randlengte per hectare. Pixels boven 45 meter zijn als niet-vegetatieve uitbijter uitgesloten. De afgeleide waarden staan met manifest en controlesom onder analyses/broedvogel_vegetatie_power/resultaten/ en zijn niet als primaire bronmeting in de levende database opgenomen. Twee cycli tonen verschil, maar zijn zonder derde onafhankelijke meting onvoldoende om een vogelreactie op structuurverandering op een later moment te valideren.</w:t>
       </w:r>
     </w:p>
     <w:p>
@@ -7368,10 +7368,10 @@
         <w:rPr>
           <w:b/>
         </w:rPr>
-        <w:t>Remote sensing van vegetatiehoogte en -bedekking:</w:t>
-      </w:r>
-      <w:r>
-        <w:t xml:space="preserve"> WUR beschreef kaarten voor 2008 en 2014; TU Delft beschreef elf beeldmomenten uit 2019–2021. De afgeleide onderzoeksrasters zijn nog niet als openbare dataset gevonden. De AHN-dataroom biedt wel de landelijke DTM- en DSM-bronnen voor meerdere cycli. Daarmee kan een reproduceerbare vegetatiehoogteproxy worden afgeleid, maar niet zonder lokale kwaliteitscontrole en koppeling aan de feitelijke inwinningsjaren. Deze kandidaatbron is daarom beschikbaar voor een gerichte vervolgtoets, niet reeds analyseklaar.</w:t>
+        <w:t xml:space="preserve">Remote sensing van vegetatiehoogte en -bedekking: </w:t>
+      </w:r>
+      <w:r>
+        <w:t>WUR beschreef kaarten voor 2008 en 2014; TU Delft beschreef elf beeldmomenten uit 2019–2021. De afgeleide onderzoeksrasters zijn nog niet als openbare dataset gevonden en blijven kandidaatbron. De landelijke DTM- en DSM-bronnen uit de AHN-dataroom zijn inmiddels wel gebruikt om de onder 1.8.2 beschreven proxy voor 2014 en 2020 af te leiden en lokaal te controleren. De onderzoeksrasters en de AHN-proxy zijn dus niet dezelfde bron.</w:t>
       </w:r>
     </w:p>
     <w:p>

</xml_diff>

<commit_message>
Harmoniseer AHN2-AHN5 en beoordeel AHN1
</commit_message>
<xml_diff>
--- a/docs/MEIJENDEL_BRONREGISTER.docx
+++ b/docs/MEIJENDEL_BRONREGISTER.docx
@@ -2,30 +2,25 @@
 <file path=word/document.xml><?xml version="1.0" encoding="utf-8"?>
 <w:document xmlns:w="http://schemas.openxmlformats.org/wordprocessingml/2006/main" xmlns:m="http://schemas.openxmlformats.org/officeDocument/2006/math" xmlns:r="http://schemas.openxmlformats.org/officeDocument/2006/relationships" xmlns:o="urn:schemas-microsoft-com:office:office" xmlns:v="urn:schemas-microsoft-com:vml" xmlns:w10="urn:schemas-microsoft-com:office:word" xmlns:a="http://schemas.openxmlformats.org/drawingml/2006/main" xmlns:pic="http://schemas.openxmlformats.org/drawingml/2006/picture" xmlns:wp="http://schemas.openxmlformats.org/drawingml/2006/wordprocessingDrawing">
   <w:body>
-    <w:bookmarkStart w:id="97" w:name="Xdea145a7474320bcc321aebaf5687f9ab4d02fb"/>
-    <w:p>
-      <w:pPr>
-        <w:pStyle w:val="Title"/>
-      </w:pPr>
-      <w:r>
-        <w:rPr>
-          <w:color w:val="000000"/>
-        </w:rPr>
+    <w:bookmarkStart w:id="100" w:name="Xdea145a7474320bcc321aebaf5687f9ab4d02fb"/>
+    <w:p>
+      <w:pPr>
+        <w:pStyle w:val="Heading1"/>
+      </w:pPr>
+      <w:r>
         <w:t xml:space="preserve">Bronregister ecologische gegevens Meijendel</w:t>
       </w:r>
     </w:p>
     <w:p>
       <w:pPr>
-        <w:pStyle w:val="BodyText"/>
-      </w:pPr>
-      <w:r>
-        <w:rPr>
-          <w:b/>
-        </w:rPr>
-        <w:t>Stand: 11 oktober 2026.</w:t>
-      </w:r>
-      <w:r>
-        <w:t xml:space="preserve"> </w:t>
+        <w:pStyle w:val="FirstParagraph"/>
+      </w:pPr>
+      <w:r>
+        <w:rPr>
+          <w:b/>
+          <w:bCs/>
+        </w:rPr>
+        <w:t xml:space="preserve">Stand: 12 oktober 2026.</w:t>
       </w:r>
     </w:p>
     <w:p>
@@ -88,7 +83,7 @@
         <w:t xml:space="preserve">Het register beschrijft meet- en waarnemingsbronnen en de belangrijkste verklarende omgevingslagen, geen afzonderlijke soorten. Taxonomische referentietabellen, berekende analyse-uitkomsten en technische hulptabellen vallen buiten dit overzicht. Details over tabellen, imports en protocolcodes staan in de achterliggende projectdocumentatie.</w:t>
       </w:r>
     </w:p>
-    <w:bookmarkStart w:id="9" w:name="de-statussen"/>
+    <w:bookmarkStart w:id="10" w:name="de-statussen"/>
     <w:p>
       <w:pPr>
         <w:pStyle w:val="Heading2"/>
@@ -307,7 +302,21 @@
         <w:pStyle w:val="BodyText"/>
       </w:pPr>
       <w:r>
-        <w:t xml:space="preserve">De aanvulling maakt overeenkomsten tussen bronnen vindbaar. In twee stappen hebben 2.509 bestaande registraties alsnog een primaire soortgroep gekregen, waarvan 1.226 in de laatste stap. Alle 87 eerder onopgeloste PQ-naamteksten uit 1981–2025 zijn onderbouwd met code, wetenschappelijke en Nederlandse naam uit Floranld_2020. Deze openbare Turboveg-referentielijst, aangeboden op 10 maart 2026 via www.synbiosys.alterra.nl/turboveg/, bevat 17.468 codes. De oorspronkelijke PQ-waarden en eerdere besluiten blijven behouden.</w:t>
+        <w:t xml:space="preserve">De aanvulling maakt overeenkomsten tussen bronnen vindbaar. In twee stappen hebben 2.509 bestaande registraties alsnog een primaire soortgroep gekregen, waarvan 1.226 in de laatste stap. Alle 87 eerder onopgeloste PQ-naamteksten uit 1981–2025 zijn onderbouwd met code, wetenschappelijke en Nederlandse naam uit Floranld_2020. Deze openbare Turboveg-referentielijst, aangeboden op 10 maart 2026 via</w:t>
+      </w:r>
+      <w:r>
+        <w:t xml:space="preserve"> </w:t>
+      </w:r>
+      <w:hyperlink r:id="rId9">
+        <w:r>
+          <w:rPr>
+            <w:rStyle w:val="Hyperlink"/>
+          </w:rPr>
+          <w:t xml:space="preserve">www.synbiosys.alterra.nl/turboveg/</w:t>
+        </w:r>
+      </w:hyperlink>
+      <w:r>
+        <w:t xml:space="preserve">, bevat 17.468 codes. De oorspronkelijke PQ-waarden en eerdere besluiten blijven behouden.</w:t>
       </w:r>
     </w:p>
     <w:p>
@@ -342,8 +351,8 @@
         <w:t xml:space="preserve">Twee oorspronkelijke actieve bronbesluiten blijven inhoudelijk onbeoordeeld en zonder biologisch doeltaxon. Naturalis-Indet. benoemt geen taxon; zijn ene collectieobject uit 2018 is nu via een aanvullende, uitdrukkelijk onbepaalde operationele koppeling centraal bereikbaar. Bij Toendrarietgans ontbreekt de wetenschappelijke bronnaam en strookt lokale code 1582 niet met de actuele EURING-code 01574. Deze bronregel wordt alleen gebruikt in twee beleidsreferentierijen en niet in vogelwaarnemingen; een nieuwe waarneming met deze onopgeloste sleutel wordt geweigerd. De 263 oorspronkelijke vogelnaamgebruiken, koppelingnummers en bronbesluiten zijn volledig bewaard. De eerdere registeraanvulling en taxonfusie en de huidige volledige waarnemingskoppeling zijn afzonderlijk gecontroleerd. Website, dashboard en Shiny zijn niet aangepast. Details en herstelbewijs staan in docs/database/TAXONREGISTER.md.</w:t>
       </w:r>
     </w:p>
-    <w:bookmarkEnd w:id="9"/>
-    <w:bookmarkStart w:id="10" w:name="overkoepelende-analysegeschiktheid"/>
+    <w:bookmarkEnd w:id="10"/>
+    <w:bookmarkStart w:id="11" w:name="overkoepelende-analysegeschiktheid"/>
     <w:p>
       <w:pPr>
         <w:pStyle w:val="Heading2"/>
@@ -698,8 +707,8 @@
         <w:t xml:space="preserve">wordt hieronder de primaire bronorganisatie of uitgever bedoeld voor zover die nu bekend is. Het is geen afzonderlijke uitspraak over juridisch eigendom of auteursrecht.</w:t>
       </w:r>
     </w:p>
-    <w:bookmarkEnd w:id="10"/>
-    <w:bookmarkStart w:id="11" w:name="beheerregel"/>
+    <w:bookmarkEnd w:id="11"/>
+    <w:bookmarkStart w:id="12" w:name="beheerregel"/>
     <w:p>
       <w:pPr>
         <w:pStyle w:val="Heading2"/>
@@ -716,8 +725,8 @@
         <w:t xml:space="preserve">Iedere ontdekking, levering, import, verplaatsing, uitsluiting of nieuwe beoordeling van een Meijendel-gegevensbron wordt in dit document verwerkt. Dat geldt ook wanneer eigenaar, omvang, periode, locatiekwaliteit, rechten, overlap, validatiestatus of statistische bruikbaarheid verandert. Daarbij worden steeds de analytische database MySQL Meijendel, de MySQL contextdatabase Meijendel_bronnen en de kandidaatbronnen gezamenlijk gecontroleerd. Iedere wijziging van Meijendel vereist ook de volledige voor- en nacontrole van de bereikbaarheid van alle soortwaarnemingen via het centrale taxonregister. De Markdown-versie is leidend; de Wordversie wordt in dezelfde wijziging inhoudelijk gelijkgetrokken, gerenderd en gecontroleerd.</w:t>
       </w:r>
     </w:p>
-    <w:bookmarkEnd w:id="11"/>
-    <w:bookmarkStart w:id="51" w:name="bronnen-in-mysql-database-meijendel"/>
+    <w:bookmarkEnd w:id="12"/>
+    <w:bookmarkStart w:id="53" w:name="Xc07dfd40f027bce65d2d0499dc5da8ab7f6fd0f"/>
     <w:p>
       <w:pPr>
         <w:pStyle w:val="Heading2"/>
@@ -735,7 +744,7 @@
         <w:t xml:space="preserve">Meijendel</w:t>
       </w:r>
     </w:p>
-    <w:bookmarkStart w:id="12" w:name="Xccd8cb4345e3f59364194a2576f706cc2c0a66e"/>
+    <w:bookmarkStart w:id="13" w:name="X32ab8fbd5be08d3f325e2553cd15813ff7e9c1f"/>
     <w:p>
       <w:pPr>
         <w:pStyle w:val="Heading3"/>
@@ -839,7 +848,37 @@
         <w:pStyle w:val="BodyText"/>
       </w:pPr>
       <w:r>
-        <w:t>De 42 territoriummatrices bevatten 222.852 plot-soortregels: 52.450 positieve resultaten, 86.983 expliciete nulcellen en 83.419 lege cellen. Een lege cel geldt niet als nul. De puntlagen bevatten 22.305 bronwaarnemingen die nog niet in dagwaarnemingen_bmp staan; omgekeerd ontbreekt geen bestaande SOVON-bron-ID in de nieuwe levering. Bij 2.629 gedeelde bron-ID's levert SOVON broedcode 0 terwijl de database NULL bevat. De downloads bevatten geen zelfstandig veld dat een telling formeel als afgekeurd markeert. Vergelijking en eventuele verrijking volgen daarom per jaar. Daarbij worden BMP-type, standaard alle soorten of een expliciete uitzondering, volledig geteld, goedgekeurd of formeel afgekeurd en de toepasselijke officiële soortenlijst afzonderlijk vastgelegd. Broedcode 0 blijft een positieve vogelwaarneming. Tellercodes worden per jaar gecontroleerd.</w:t>
+        <w:t xml:space="preserve">De 42 territoriummatrices bevatten 222.852 plot-soortregels: 52.450 positieve resultaten, 86.983 expliciete nulcellen en 83.419 lege cellen. Een lege cel geldt niet als nul. De puntlagen bevatten 22.305 bronwaarnemingen die nog niet in</w:t>
+      </w:r>
+      <w:r>
+        <w:t xml:space="preserve"> </w:t>
+      </w:r>
+      <w:r>
+        <w:rPr>
+          <w:rStyle w:val="VerbatimChar"/>
+        </w:rPr>
+        <w:t xml:space="preserve">dagwaarnemingen_bmp</w:t>
+      </w:r>
+      <w:r>
+        <w:t xml:space="preserve"> </w:t>
+      </w:r>
+      <w:r>
+        <w:t xml:space="preserve">staan; omgekeerd ontbreekt geen bestaande SOVON-bron-ID in de nieuwe levering. Bij 2.629 gedeelde bron-ID's levert SOVON broedcode 0 terwijl de database</w:t>
+      </w:r>
+      <w:r>
+        <w:t xml:space="preserve"> </w:t>
+      </w:r>
+      <w:r>
+        <w:rPr>
+          <w:rStyle w:val="VerbatimChar"/>
+        </w:rPr>
+        <w:t xml:space="preserve">NULL</w:t>
+      </w:r>
+      <w:r>
+        <w:t xml:space="preserve"> </w:t>
+      </w:r>
+      <w:r>
+        <w:t xml:space="preserve">bevat. De downloads bevatten geen zelfstandig veld dat een telling formeel als afgekeurd markeert. Vergelijking en eventuele verrijking volgen daarom per jaar. Daarbij worden BMP-type, standaard alle soorten of een expliciete uitzondering, volledig geteld, goedgekeurd of formeel afgekeurd en de toepasselijke officiële soortenlijst afzonderlijk vastgelegd. Broedcode 0 blijft een positieve vogelwaarneming. Tellercodes worden per jaar gecontroleerd.</w:t>
       </w:r>
     </w:p>
     <w:p>
@@ -906,11 +945,93 @@
       <w:r>
         <w:rPr>
           <w:b/>
-        </w:rPr>
-        <w:t>Afgeleide nullen uit jaarverslagen, uitgevoerd 7 oktober 2026.</w:t>
-      </w:r>
-      <w:r>
-        <w:t xml:space="preserve"> Voor de zelfstandige bron jrvslg_m geldt bij TRIM een expliciete analyseaanname. De tellers telden alle vogelsoorten. De relevante soortpool bestaat daarom uit iedere soort met ten minste één geaccepteerd positief jrvslg_m-resultaat in de volledige jaarverslagreeks 1958-2025. Als zo'n soort in een geteld jaarverslagplot ontbreekt, wordt de soort-plotjaarcombinatie als nul behandeld; het is niet vereist dat de soort in hetzelfde kalenderjaar elders is vastgesteld. Deze waarde is geen letterlijke bronnul, krijgt daarom de status afgeleide_jaarverslagnul en hoort niet als bronregel in territoria. Binnen 662 getelde jrvslg_m-plotjaren en een soortpool van 128 soorten bevat de actuele standaardanalyse over 52 Natura 2000-plots 66.116 afgeleide nullen: 60.387 in 1958-1983 en 5.729 in 1984-2025. Na selectie op eerste positieve jaar en actieve plots worden 15.921 daarvan als modelinvoer gebruikt: 14.149 in 1958-1983 en 1.772 in 1984-2025. De gedeelde observatiepoort past deze regel toe in batch-TRIM, Shiny, Sandra en GEE en bewaart analysebron, nulstatus en bewijsgrond. De herberekende hoofdreeks bevat 156 soorten in de statuslaag, 135 soorten met minimaal één indexreeks en 93 brugbare reeksen; Kuifleeuwerik verloor als enige de post-1984-modelreeks. De Sandra-selectie 1997-2022 bevat geen jrvslg_m-plotjaar; haar soorttrends en indexbestanden bleven bytegelijk.</w:t>
+          <w:bCs/>
+        </w:rPr>
+        <w:t xml:space="preserve">Afgeleide nullen uit jaarverslagen, uitgevoerd 7 oktober 2026.</w:t>
+      </w:r>
+      <w:r>
+        <w:t xml:space="preserve"> </w:t>
+      </w:r>
+      <w:r>
+        <w:t xml:space="preserve">Voor de zelfstandige bron</w:t>
+      </w:r>
+      <w:r>
+        <w:t xml:space="preserve"> </w:t>
+      </w:r>
+      <w:r>
+        <w:rPr>
+          <w:rStyle w:val="VerbatimChar"/>
+        </w:rPr>
+        <w:t xml:space="preserve">jrvslg_m</w:t>
+      </w:r>
+      <w:r>
+        <w:t xml:space="preserve"> </w:t>
+      </w:r>
+      <w:r>
+        <w:t xml:space="preserve">geldt bij TRIM een expliciete analyseaanname. De tellers telden alle vogelsoorten. De relevante soortpool bestaat daarom uit iedere soort met ten minste één geaccepteerd positief</w:t>
+      </w:r>
+      <w:r>
+        <w:t xml:space="preserve"> </w:t>
+      </w:r>
+      <w:r>
+        <w:rPr>
+          <w:rStyle w:val="VerbatimChar"/>
+        </w:rPr>
+        <w:t xml:space="preserve">jrvslg_m</w:t>
+      </w:r>
+      <w:r>
+        <w:t xml:space="preserve">-resultaat in de volledige jaarverslagreeks 1958-2025. Als zo'n soort in een geteld jaarverslagplot ontbreekt, wordt de soort-plotjaarcombinatie als nul behandeld; het is niet vereist dat de soort in hetzelfde kalenderjaar elders is vastgesteld. Deze waarde is geen letterlijke bronnul, krijgt daarom de status</w:t>
+      </w:r>
+      <w:r>
+        <w:t xml:space="preserve"> </w:t>
+      </w:r>
+      <w:r>
+        <w:rPr>
+          <w:rStyle w:val="VerbatimChar"/>
+        </w:rPr>
+        <w:t xml:space="preserve">afgeleide_jaarverslagnul</w:t>
+      </w:r>
+      <w:r>
+        <w:t xml:space="preserve"> </w:t>
+      </w:r>
+      <w:r>
+        <w:t xml:space="preserve">en hoort niet als bronregel in</w:t>
+      </w:r>
+      <w:r>
+        <w:t xml:space="preserve"> </w:t>
+      </w:r>
+      <w:r>
+        <w:rPr>
+          <w:rStyle w:val="VerbatimChar"/>
+        </w:rPr>
+        <w:t xml:space="preserve">territoria</w:t>
+      </w:r>
+      <w:r>
+        <w:t xml:space="preserve">. Binnen 662 getelde</w:t>
+      </w:r>
+      <w:r>
+        <w:t xml:space="preserve"> </w:t>
+      </w:r>
+      <w:r>
+        <w:rPr>
+          <w:rStyle w:val="VerbatimChar"/>
+        </w:rPr>
+        <w:t xml:space="preserve">jrvslg_m</w:t>
+      </w:r>
+      <w:r>
+        <w:t xml:space="preserve">-plotjaren en een soortpool van 128 soorten bevat de actuele standaardanalyse over 52 Natura 2000-plots 66.116 afgeleide nullen: 60.387 in 1958-1983 en 5.729 in 1984-2025. Na selectie op eerste positieve jaar en actieve plots worden 15.921 daarvan als modelinvoer gebruikt: 14.149 in 1958-1983 en 1.772 in 1984-2025. De gedeelde observatiepoort past deze regel toe in batch-TRIM, Shiny, Sandra en GEE en bewaart analysebron, nulstatus en bewijsgrond. De herberekende hoofdreeks bevat 156 soorten in de statuslaag, 135 soorten met minimaal één indexreeks en 93 brugbare reeksen; Kuifleeuwerik verloor als enige de post-1984-modelreeks. De Sandra-selectie 1997-2022 bevat geen</w:t>
+      </w:r>
+      <w:r>
+        <w:t xml:space="preserve"> </w:t>
+      </w:r>
+      <w:r>
+        <w:rPr>
+          <w:rStyle w:val="VerbatimChar"/>
+        </w:rPr>
+        <w:t xml:space="preserve">jrvslg_m</w:t>
+      </w:r>
+      <w:r>
+        <w:t xml:space="preserve">-plotjaar; haar soorttrends en indexbestanden bleven bytegelijk.</w:t>
       </w:r>
     </w:p>
     <w:p>
@@ -2025,7 +2146,22 @@
         <w:pStyle w:val="BodyText"/>
       </w:pPr>
       <w:r>
-        <w:t>Vanaf 3 oktober 2026 geldt als hoofdregel dat alle werkelijk aanvullende SOVON-gegevens in de bestaande Meijendel-kerntabellen mogen worden opgenomen. Bestaande Meijendelgegevens blijven staan wanneer zij in de download ontbreken. Alleen een afzonderlijke conflictregel kan daarvan afwijken. Een aanwezige regel uit meeuwen_literatuur blijft voor meeuwen leidend; zonder zo'n regel mag de SOVON-waarde aanvullen of corrigeren. Een ontbrekende teller mag vanuit het jaarverslag worden toegevoegd wanneer kavel en waarnemer ondubbelzinnig zijn en een bestaande code beschikbaar is. De Horsten wordt volledig genegeerd. Niet-conflicterende letterlijke SOVON-nullen worden zonder nieuwe jaarbeslissing opgenomen; niet tot individuele bronregels herleidbare aggregaatvermeldingen worden niet als formeel afgekeurde waarnemingen gereconstrueerd. Ieder jaar wordt eerst volledig vergeleken. Nieuwe soortenconflicten, nieuwe gegevensmodellen en wel individueel herleidbare afkeuringsinformatie blijven afzonderlijke beslispunten.</w:t>
+        <w:t xml:space="preserve">Vanaf 3 oktober 2026 geldt als hoofdregel dat alle werkelijk aanvullende SOVON-gegevens in de bestaande Meijendel-kerntabellen mogen worden opgenomen. Bestaande Meijendelgegevens blijven staan wanneer zij in de download ontbreken. Alleen een afzonderlijke conflictregel kan daarvan afwijken. Een aanwezige regel uit</w:t>
+      </w:r>
+      <w:r>
+        <w:t xml:space="preserve"> </w:t>
+      </w:r>
+      <w:r>
+        <w:rPr>
+          <w:rStyle w:val="VerbatimChar"/>
+        </w:rPr>
+        <w:t xml:space="preserve">meeuwen_literatuur</w:t>
+      </w:r>
+      <w:r>
+        <w:t xml:space="preserve"> </w:t>
+      </w:r>
+      <w:r>
+        <w:t xml:space="preserve">blijft voor meeuwen leidend; zonder zo'n regel mag de SOVON-waarde aanvullen of corrigeren. Een ontbrekende teller mag vanuit het jaarverslag worden toegevoegd wanneer kavel en waarnemer ondubbelzinnig zijn en een bestaande code beschikbaar is. De Horsten wordt volledig genegeerd. Niet-conflicterende letterlijke SOVON-nullen worden zonder nieuwe jaarbeslissing opgenomen; niet tot individuele bronregels herleidbare aggregaatvermeldingen worden niet als formeel afgekeurde waarnemingen gereconstrueerd. Ieder jaar wordt eerst volledig vergeleken. Nieuwe soortenconflicten, nieuwe gegevensmodellen en wel individueel herleidbare afkeuringsinformatie blijven afzonderlijke beslispunten.</w:t>
       </w:r>
     </w:p>
     <w:p>
@@ -2354,7 +2490,7 @@
         <w:t xml:space="preserve"> </w:t>
       </w:r>
       <w:r>
-        <w:t>uit de actuele SOVON/AVIMAP-resultatendownload omvat 25.555 soortresultaten in 752 plotjaren uit 2007 en 2009–2026. In 282 plotjaren is de ene AVIMAP-code exact gelijk aan de databasecode, in 56 is zij lid van een groter geregistreerd tellerteam, in 400 ontbreekt zij geheel in de registratie van teller/tellerteam en voor 14 plotjaren ontbrak aanvankelijk</w:t>
+        <w:t xml:space="preserve">uit de actuele SOVON/AVIMAP-resultatendownload omvat 25.555 soortresultaten in 752 plotjaren uit 2007 en 2009–2026. In 282 plotjaren is de ene AVIMAP-code exact gelijk aan de databasecode, in 56 is zij lid van een groter geregistreerd tellerteam, in 400 ontbreekt zij geheel in de registratie van teller/tellerteam en voor 14 plotjaren ontbrak aanvankelijk</w:t>
       </w:r>
       <w:r>
         <w:t xml:space="preserve"> </w:t>
@@ -2381,7 +2517,7 @@
         <w:t xml:space="preserve"> </w:t>
       </w:r>
       <w:r>
-        <w:t>te vervangen, aan te vullen of te corrigeren; het blijft uitsluitend als letterlijke bronwaarde en auditinformatie behouden. Deze beperking betreft alleen telleridentificatie en keurt de territorium- en bezoekgegevens uit de download niet als geheel af. Bij twee of meer tellers blijft een plotjaar een tellerteamregistratie. Omdat de AVIMAP-bezoekentabel geen teller bevat, wordt zonder andere expliciete bron niet afgeleid wie aan een afzonderlijk bezoek deelnam. Tellersensitiviteitsanalyses gebruiken</w:t>
+        <w:t xml:space="preserve">te vervangen, aan te vullen of te corrigeren; het blijft uitsluitend als letterlijke bronwaarde en auditinformatie behouden. Deze beperking betreft alleen telleridentificatie en keurt de territorium- en bezoekgegevens uit de download niet als geheel af. Bij twee of meer tellers blijft een plotjaar een tellerteamregistratie. Omdat de AVIMAP-bezoekentabel geen teller bevat, wordt zonder andere expliciete bron niet afgeleid wie aan een afzonderlijk bezoek deelnam. Tellersensitiviteitsanalyses gebruiken</w:t>
       </w:r>
       <w:r>
         <w:t xml:space="preserve"> </w:t>
@@ -2396,7 +2532,7 @@
         <w:t xml:space="preserve"> </w:t>
       </w:r>
       <w:r>
-        <w:t>en houden teller/tellerteam en ontbrekende koppelingen afzonderlijk herkenbaar. Op basis van inhoudelijke vaststelling door de data-eigenaar zijn vier koppelingen op 1 oktober toegevoegd: 2010/M54a–AZNA00 (</w:t>
+        <w:t xml:space="preserve">en houden teller/tellerteam en ontbrekende koppelingen afzonderlijk herkenbaar. Op basis van inhoudelijke vaststelling door de data-eigenaar zijn vier koppelingen op 1 oktober toegevoegd: 2010/M54a–AZNA00 (</w:t>
       </w:r>
       <w:r>
         <w:rPr>
@@ -2937,8 +3073,8 @@
         <w:t xml:space="preserve">. De herberekende hoofd-TRIM-uitvoer over 1958-2025 bevat 156 soorten in de statuslaag, 135 soorten met minimaal één indexreeks en 93 soorten met een brugbare reeks in beide modelperioden. De Sandra-uitvoer over 25 plots in 1997-2022 bevat 132 positief waargenomen soorten en 110 formele soorttrends. Deze poort is ook de standaard voor datasets waarmee de power voor relaties met vegetatieontwikkeling of beheermaatregelen wordt beoordeeld; ontbrekende bronwaarden worden alleen als afwezigheid gebruikt wanneer de toepasselijke bronregel dat uitdrukkelijk rechtvaardigt.</w:t>
       </w:r>
     </w:p>
-    <w:bookmarkEnd w:id="12"/>
-    <w:bookmarkStart w:id="13" w:name="provinciale-permanente-kwadraten"/>
+    <w:bookmarkEnd w:id="13"/>
+    <w:bookmarkStart w:id="14" w:name="X9645acbfea6b379f23d12aeedc36c987000825a"/>
     <w:p>
       <w:pPr>
         <w:pStyle w:val="Heading3"/>
@@ -3037,22 +3173,86 @@
         <w:t xml:space="preserve">De 53.122 provinciale taxonregels uit 1981–2025 zijn lokaal en op de VPS rechtstreeks verbonden met het centrale taxonregister. De 714 oorspronkelijke taxonvermeldingen zijn daar met alle bronvelden behouden; de afzonderlijke PQ-taxoncatalogus is verwijderd. De 2.007 opnamen en de 513 gepubliceerde plot-jaaruitkomsten zijn ongewijzigd. Daarnaast zijn 644 vermoedelijk verwante LVD-bronopnamen met 16.627 resultaten uit 1981–2015 binnen de PQ-tabellen bijeengebracht. Zij behouden alle bronwaarden en 652 mogelijke opnamekoppelingen en tellen niet zelfstandig mee. De oorspronkelijke externe rijen zijn pas na inhoudscontrole verwijderd. De volledige migratie, het terugdraaien en het herstel uit back-up zijn beproefd. De gecontroleerde publicatie naar website, dashboard en Shiny is op 28 september om 15:33 uur geslaagd; hun bestaande provinciale uitkomsten zijn gelijk gebleven.</w:t>
       </w:r>
     </w:p>
-    <w:bookmarkEnd w:id="13"/>
-    <w:bookmarkStart w:id="14" w:name="Xded6c184b9a569c146345b6e935b052f391caf7"/>
-    <w:p>
-      <w:pPr>
-        <w:pStyle w:val="BodyText"/>
-      </w:pPr>
-      <w:r>
-        <w:rPr>
-          <w:b/>
-        </w:rPr>
-        <w:t>Gebruik van de volledige PQ-samenstelling, 11 oktober 2026.</w:t>
-      </w:r>
-      <w:r>
-        <w:t xml:space="preserve"> Voor de broedvogel–vegetatieanalyse zijn 1.314 van de 2.007 provinciale opnamen aan 35 actieve Natura 2000-vogelplots gekoppeld. Zij vormen 501 PQ-plotjaren en bevatten 642 van de 714 centrale taxa over 1981–2025. Een Hellinger-transformatie en drie compositieassen vatten 27,8% van de variatie samen. In de vogeloverlap van 37.140 soort–plot–jaarrijen, 406 vogelplotjaren, 35 plots en 154 soorten over 1989–2025 verbeteren deze assen de ruimtelijke voorspelling in vier van vijf plotblokken, maar niet de voorspelling van latere jaren in twee tijdsblokken. De uitkomst maakt de provinciale PQ-reeks bruikbaarder voor ruimtelijke habitatverschillen, maar levert nog geen voorspellende relatie tussen vegetatieverandering en vogelverandering.</w:t>
-      </w:r>
-    </w:p>
+    <w:p>
+      <w:pPr>
+        <w:pStyle w:val="BodyText"/>
+      </w:pPr>
+      <w:r>
+        <w:rPr>
+          <w:b/>
+          <w:bCs/>
+        </w:rPr>
+        <w:t xml:space="preserve">Gebruik van de volledige PQ-samenstelling, 11 oktober 2026.</w:t>
+      </w:r>
+      <w:r>
+        <w:t xml:space="preserve"> </w:t>
+      </w:r>
+      <w:r>
+        <w:t xml:space="preserve">Voor de</w:t>
+      </w:r>
+      <w:r>
+        <w:t xml:space="preserve"> </w:t>
+      </w:r>
+      <w:r>
+        <w:t xml:space="preserve">broedvogel–vegetatieanalyse zijn 1.314 van de 2.007 provinciale opnamen aan 35</w:t>
+      </w:r>
+      <w:r>
+        <w:t xml:space="preserve"> </w:t>
+      </w:r>
+      <w:r>
+        <w:t xml:space="preserve">actieve Natura 2000-vogelplots gekoppeld. Zij vormen 501 PQ-plotjaren en</w:t>
+      </w:r>
+      <w:r>
+        <w:t xml:space="preserve"> </w:t>
+      </w:r>
+      <w:r>
+        <w:t xml:space="preserve">bevatten 642 van de 714 centrale taxa over 1981–2025. Een</w:t>
+      </w:r>
+      <w:r>
+        <w:t xml:space="preserve"> </w:t>
+      </w:r>
+      <w:r>
+        <w:t xml:space="preserve">Hellinger-transformatie en drie compositieassen vatten 27,8% van de variatie</w:t>
+      </w:r>
+      <w:r>
+        <w:t xml:space="preserve"> </w:t>
+      </w:r>
+      <w:r>
+        <w:t xml:space="preserve">samen. In de vogeloverlap van 37.140 soort–plot–jaarrijen, 406 vogelplotjaren,</w:t>
+      </w:r>
+      <w:r>
+        <w:t xml:space="preserve"> </w:t>
+      </w:r>
+      <w:r>
+        <w:t xml:space="preserve">35 plots en 154 soorten over 1989–2025 verbeteren deze assen de ruimtelijke</w:t>
+      </w:r>
+      <w:r>
+        <w:t xml:space="preserve"> </w:t>
+      </w:r>
+      <w:r>
+        <w:t xml:space="preserve">voorspelling in vier van vijf plotblokken, maar niet de voorspelling van latere</w:t>
+      </w:r>
+      <w:r>
+        <w:t xml:space="preserve"> </w:t>
+      </w:r>
+      <w:r>
+        <w:t xml:space="preserve">jaren in twee tijdsblokken. De uitkomst maakt de provinciale PQ-reeks</w:t>
+      </w:r>
+      <w:r>
+        <w:t xml:space="preserve"> </w:t>
+      </w:r>
+      <w:r>
+        <w:t xml:space="preserve">bruikbaarder voor ruimtelijke habitatverschillen, maar levert nog geen</w:t>
+      </w:r>
+      <w:r>
+        <w:t xml:space="preserve"> </w:t>
+      </w:r>
+      <w:r>
+        <w:t xml:space="preserve">voorspellende relatie tussen vegetatieverandering en vogelverandering.</w:t>
+      </w:r>
+    </w:p>
+    <w:bookmarkEnd w:id="14"/>
+    <w:bookmarkStart w:id="15" w:name="X58edaa7a0159e378417d8d9e2f3abf27d746f4f"/>
     <w:p>
       <w:pPr>
         <w:pStyle w:val="Heading3"/>
@@ -3266,8 +3466,8 @@
         <w:t xml:space="preserve">gemigreerd en zijn alle centrale schrijfguards opnieuw opgebouwd. Geen koppeling werd door een andere waarnemingstabel gedeeld. De volledige controle van 279 tabellen en 128 taxonroutes geeft nul fouten. Twee afzonderlijke tabelback-ups zijn met ongewijzigde SHA-256 teruggelezen in tijdelijke databases; beide herstelproeven reproduceerden exact de vier tabelrijtellingen vóór de betreffende wijziging.</w:t>
       </w:r>
     </w:p>
-    <w:bookmarkEnd w:id="14"/>
-    <w:bookmarkStart w:id="16" w:name="historisch-vangblikonderzoek"/>
+    <w:bookmarkEnd w:id="15"/>
+    <w:bookmarkStart w:id="17" w:name="Xd3fb9a25da94fa35cd3895c324ae264efa6b6ce"/>
     <w:p>
       <w:pPr>
         <w:pStyle w:val="Heading3"/>
@@ -3330,7 +3530,7 @@
       <w:r>
         <w:t xml:space="preserve"> </w:t>
       </w:r>
-      <w:hyperlink r:id="rId15">
+      <w:hyperlink r:id="rId16">
         <w:r>
           <w:rPr>
             <w:rStyle w:val="Hyperlink"/>
@@ -3411,8 +3611,8 @@
         <w:t xml:space="preserve">is verwijderd. Alle 99.652 individuen, events, locaties, kwaliteitsvlaggen en oorspronkelijke bronwaarden zijn behouden. Ook de twee vangstregels uit 1959 zonder bijbehorend event blijven herkenbaar en uitgesloten. De bestaande taxonkoppelingen blijven kandidaat; deze opschoning bevestigt geen nieuwe soortidentificaties en verandert de analysegeschiktheid niet. De migratie, het terugdraaien en het volledige herstel uit back-up zijn beproefd. Website, dashboard en Shiny zijn niet aangepast; er is niets naar de VPS gepubliceerd.</w:t>
       </w:r>
     </w:p>
-    <w:bookmarkEnd w:id="16"/>
-    <w:bookmarkStart w:id="34" w:name="X003d1b4454050d8b2300662d18ee0e6097f4328"/>
+    <w:bookmarkEnd w:id="17"/>
+    <w:bookmarkStart w:id="35" w:name="X05a7f9ed9696b113895f0c60145ad70b98b3ccf"/>
     <w:p>
       <w:pPr>
         <w:pStyle w:val="Heading3"/>
@@ -3493,7 +3693,7 @@
         <w:t xml:space="preserve">Voorwaardelijk bruikbaar. De bronorganisaties zijn aangeschreven met het verzoek de aanvullende metadata te leveren.</w:t>
       </w:r>
     </w:p>
-    <w:bookmarkStart w:id="17" w:name="dagvlinders"/>
+    <w:bookmarkStart w:id="18" w:name="Xf2f5e1637d9b0d825d88db49318fbe09fe4562d"/>
     <w:p>
       <w:pPr>
         <w:pStyle w:val="Heading4"/>
@@ -3556,8 +3756,8 @@
         <w:t xml:space="preserve">Oorspronkelijke route- en bezoekcodes, complete bezoeken, gevolgde modules en tellingen zonder waarneming</w:t>
       </w:r>
     </w:p>
-    <w:bookmarkEnd w:id="17"/>
-    <w:bookmarkStart w:id="18" w:name="hommels"/>
+    <w:bookmarkEnd w:id="18"/>
+    <w:bookmarkStart w:id="19" w:name="Xab588a339567fbeba82f7ca9f0ef20022ceaf38"/>
     <w:p>
       <w:pPr>
         <w:pStyle w:val="Heading4"/>
@@ -3620,8 +3820,8 @@
         <w:t xml:space="preserve">Bevestiging dat hommels systematisch zijn geteld en op welk determinatieniveau</w:t>
       </w:r>
     </w:p>
-    <w:bookmarkEnd w:id="18"/>
-    <w:bookmarkStart w:id="19" w:name="libellen"/>
+    <w:bookmarkEnd w:id="19"/>
+    <w:bookmarkStart w:id="20" w:name="X5eeebc0b3ea39369efcb9361b685b51ab379390"/>
     <w:p>
       <w:pPr>
         <w:pStyle w:val="Heading4"/>
@@ -3684,8 +3884,8 @@
         <w:t xml:space="preserve">Oorspronkelijke route- en bezoekstructuur en volledige doelsoortenlijst</w:t>
       </w:r>
     </w:p>
-    <w:bookmarkEnd w:id="19"/>
-    <w:bookmarkStart w:id="20" w:name="nachtvlinders"/>
+    <w:bookmarkEnd w:id="20"/>
+    <w:bookmarkStart w:id="21" w:name="Xf7f75bff85528639d3a54437d815ffc982ac078"/>
     <w:p>
       <w:pPr>
         <w:pStyle w:val="Heading4"/>
@@ -3748,8 +3948,8 @@
         <w:t xml:space="preserve">Afzonderlijke vangnachten, telpunt, val, lamp, brandduur en lege vangnachten</w:t>
       </w:r>
     </w:p>
-    <w:bookmarkEnd w:id="20"/>
-    <w:bookmarkStart w:id="21" w:name="amfibieën"/>
+    <w:bookmarkEnd w:id="21"/>
+    <w:bookmarkStart w:id="22" w:name="X5952ec78f96e716985cfd2bef0c6dea751da098"/>
     <w:p>
       <w:pPr>
         <w:pStyle w:val="Heading4"/>
@@ -3812,8 +4012,8 @@
         <w:t xml:space="preserve">Oorspronkelijke water- en bezoekcodes, zoekmethode en volledige-lijststatus</w:t>
       </w:r>
     </w:p>
-    <w:bookmarkEnd w:id="21"/>
-    <w:bookmarkStart w:id="22" w:name="reptielen"/>
+    <w:bookmarkEnd w:id="22"/>
+    <w:bookmarkStart w:id="23" w:name="Xf98973ac0b4b22a8147264cf6fda7ae2d1f2584"/>
     <w:p>
       <w:pPr>
         <w:pStyle w:val="Heading4"/>
@@ -3876,8 +4076,8 @@
         <w:t xml:space="preserve">Ontbrekende bezoeken en volledige routeadministratie</w:t>
       </w:r>
     </w:p>
-    <w:bookmarkEnd w:id="22"/>
-    <w:bookmarkStart w:id="23" w:name="vissen"/>
+    <w:bookmarkEnd w:id="23"/>
+    <w:bookmarkStart w:id="24" w:name="X9ffbbed58a474302bc88f9b6483937563542adc"/>
     <w:p>
       <w:pPr>
         <w:pStyle w:val="Heading4"/>
@@ -3940,8 +4140,8 @@
         <w:t xml:space="preserve">Te weinig bezoeken en geen volledige meetstructuur voor een lokale trend</w:t>
       </w:r>
     </w:p>
-    <w:bookmarkEnd w:id="23"/>
-    <w:bookmarkStart w:id="24" w:name="vleermuistransecten"/>
+    <w:bookmarkEnd w:id="24"/>
+    <w:bookmarkStart w:id="25" w:name="X90b1412457ba2ad39675de54e16fb4052a9af96"/>
     <w:p>
       <w:pPr>
         <w:pStyle w:val="Heading4"/>
@@ -4004,8 +4204,8 @@
         <w:t xml:space="preserve">Oorspronkelijke routes, secties, bezoeken en volledige resultaten</w:t>
       </w:r>
     </w:p>
-    <w:bookmarkEnd w:id="24"/>
-    <w:bookmarkStart w:id="25" w:name="konijnentellingen-in-de-duinen"/>
+    <w:bookmarkEnd w:id="25"/>
+    <w:bookmarkStart w:id="26" w:name="X0bf7c6d2026ffa63b6182a76ed7ab201ef2ca1a"/>
     <w:p>
       <w:pPr>
         <w:pStyle w:val="Heading4"/>
@@ -4068,8 +4268,8 @@
         <w:t xml:space="preserve">Eerst overlap met de primaire SOVON- en VWG-reeks oplossen</w:t>
       </w:r>
     </w:p>
-    <w:bookmarkEnd w:id="25"/>
-    <w:bookmarkStart w:id="26" w:name="wintertellingen-vleermuizen"/>
+    <w:bookmarkEnd w:id="26"/>
+    <w:bookmarkStart w:id="27" w:name="Xd64910a2091f56dedd2aaa5a75994d38ec4c969"/>
     <w:p>
       <w:pPr>
         <w:pStyle w:val="Heading4"/>
@@ -4132,8 +4332,8 @@
         <w:t xml:space="preserve">Vaste object- en bezoekcodes en volledige tellingen</w:t>
       </w:r>
     </w:p>
-    <w:bookmarkEnd w:id="26"/>
-    <w:bookmarkStart w:id="27" w:name="het-nieuwe-strepen"/>
+    <w:bookmarkEnd w:id="27"/>
+    <w:bookmarkStart w:id="28" w:name="X9cec44656db08bd57f600992eaa74a526d260b3"/>
     <w:p>
       <w:pPr>
         <w:pStyle w:val="Heading4"/>
@@ -4167,11 +4367,45 @@
       <w:r>
         <w:rPr>
           <w:b/>
-        </w:rPr>
-        <w:t>Wat heeft FLORON bevestigd?</w:t>
-      </w:r>
-      <w:r>
-        <w:t xml:space="preserve"> Op 6 oktober 2026 meldde FLORON dat één kalenderdag in één kilometerhok als telling mag worden beschouwd. Zo'n telling kan één, twee of drie oorspronkelijke lijsten omvatten. Persoonsgegevens en daarvan afgeleide waarnemerscodes worden niet geleverd. De uri of identity uit de NDFF-export is de stabiele sleutel van de afzonderlijke waarneming.</w:t>
+          <w:bCs/>
+        </w:rPr>
+        <w:t xml:space="preserve">Wat heeft FLORON bevestigd?</w:t>
+      </w:r>
+      <w:r>
+        <w:t xml:space="preserve"> </w:t>
+      </w:r>
+      <w:r>
+        <w:t xml:space="preserve">Op 6 oktober 2026 meldde FLORON dat één kalenderdag in één kilometerhok als telling mag worden beschouwd. Zo'n telling kan één, twee of drie oorspronkelijke lijsten omvatten. Persoonsgegevens en daarvan afgeleide waarnemerscodes worden niet geleverd. De</w:t>
+      </w:r>
+      <w:r>
+        <w:t xml:space="preserve"> </w:t>
+      </w:r>
+      <w:r>
+        <w:rPr>
+          <w:rStyle w:val="VerbatimChar"/>
+        </w:rPr>
+        <w:t xml:space="preserve">uri</w:t>
+      </w:r>
+      <w:r>
+        <w:t xml:space="preserve"> </w:t>
+      </w:r>
+      <w:r>
+        <w:t xml:space="preserve">of</w:t>
+      </w:r>
+      <w:r>
+        <w:t xml:space="preserve"> </w:t>
+      </w:r>
+      <w:r>
+        <w:rPr>
+          <w:rStyle w:val="VerbatimChar"/>
+        </w:rPr>
+        <w:t xml:space="preserve">identity</w:t>
+      </w:r>
+      <w:r>
+        <w:t xml:space="preserve"> </w:t>
+      </w:r>
+      <w:r>
+        <w:t xml:space="preserve">uit de NDFF-export is de stabiele sleutel van de afzonderlijke waarneming.</w:t>
       </w:r>
     </w:p>
     <w:p>
@@ -4240,8 +4474,8 @@
         <w:t xml:space="preserve">geldt niet als tweede velddag. Bij 21 tellingen staat nu neutraal dat hetzelfde hok in hetzelfde jaar op meerdere kalenderdagen is geteld. Dat zegt niets over onafhankelijke waarnemers. De recordselectie, het doelbereik, de 4.439 positieve combinaties en de 11.730 nullen zijn gelijk aan v1. V1 blijft als historisch auditspoor bewaard. De indeling van 23 volledige tellingen en drie fragmenten blijft een lokale reconstructie en moet als zodanig zichtbaar blijven.</w:t>
       </w:r>
     </w:p>
-    <w:bookmarkEnd w:id="27"/>
-    <w:bookmarkStart w:id="28" w:name="Xadd682eaf9770b54759a1b54720dedd522bc07f"/>
+    <w:bookmarkEnd w:id="28"/>
+    <w:bookmarkStart w:id="29" w:name="Xc056d2025de29c95bc511421c5f5e41469354eb"/>
     <w:p>
       <w:pPr>
         <w:pStyle w:val="Heading4"/>
@@ -4275,11 +4509,15 @@
       <w:r>
         <w:rPr>
           <w:b/>
-        </w:rPr>
-        <w:t>Wat heeft FLORON bevestigd?</w:t>
-      </w:r>
-      <w:r>
-        <w:t xml:space="preserve"> Eén jaar in één kilometerhok is de fijnste beschikbare teleenheid. Voor 2011 werden alleen soort, jaar, kilometerhok en waarnemer opgeslagen. FLORON beschikt niet over de eerder gevraagde lijst-ID's, volledigheidsvlaggen, bezoekdata, bezoekduur, checklistversies of expliciete registraties van niet-aangetroffen soorten.</w:t>
+          <w:bCs/>
+        </w:rPr>
+        <w:t xml:space="preserve">Wat heeft FLORON bevestigd?</w:t>
+      </w:r>
+      <w:r>
+        <w:t xml:space="preserve"> </w:t>
+      </w:r>
+      <w:r>
+        <w:t xml:space="preserve">Eén jaar in één kilometerhok is de fijnste beschikbare teleenheid. Voor 2011 werden alleen soort, jaar, kilometerhok en waarnemer opgeslagen. FLORON beschikt niet over de eerder gevraagde lijst-ID's, volledigheidsvlaggen, bezoekdata, bezoekduur, checklistversies of expliciete registraties van niet-aangetroffen soorten.</w:t>
       </w:r>
     </w:p>
     <w:p>
@@ -4300,8 +4538,8 @@
         <w:t xml:space="preserve">Positieve waarnemingen, floristische samenstelling en veranderingen in geregistreerde verspreiding kunnen per kilometerhok en jaar worden onderzocht. De huidige 81.721 protocolnullen blijven afhankelijk van de lokale regel dat een hok-jaar met minimaal vijftig taxa als aannemelijk volledig geldt. Zij zijn geen door FLORON geleverde nulwaarnemingen en ondersteunen zonder gevoeligheidsanalyse geen definitieve trendclaim. Een nieuw verzoek aan FLORON kan deze leemte niet oplossen.</w:t>
       </w:r>
     </w:p>
-    <w:bookmarkEnd w:id="28"/>
-    <w:bookmarkStart w:id="29" w:name="lmf-aandachtssoorten"/>
+    <w:bookmarkEnd w:id="29"/>
+    <w:bookmarkStart w:id="30" w:name="Xb2fbeb28e0a334b9e6cb93232c4d845faf48221"/>
     <w:p>
       <w:pPr>
         <w:pStyle w:val="Heading4"/>
@@ -4442,8 +4680,8 @@
         <w:t xml:space="preserve">in de lokale analytische database. De oorspronkelijke NDFF-waarnemingen, bronvermelding en reconstructieversies blijven behouden. Alle tabelcontrolesommen zijn na de hernoeming gelijk aan de nulmeting en alle 18 foreign keys bleven intact; de centrale taxoncontrole geeft 128 werkende routes en nul fouten. De zware SQL-export en VPS-publicatie zijn nog niet uitgevoerd.</w:t>
       </w:r>
     </w:p>
-    <w:bookmarkEnd w:id="29"/>
-    <w:bookmarkStart w:id="30" w:name="mossen-en-korstmossen"/>
+    <w:bookmarkEnd w:id="30"/>
+    <w:bookmarkStart w:id="31" w:name="X0ce2ec4e8b5503e251897e5490450ca2d9e0742"/>
     <w:p>
       <w:pPr>
         <w:pStyle w:val="Heading4"/>
@@ -4506,8 +4744,8 @@
         <w:t xml:space="preserve">Oorspronkelijke proefvlak-, lijst- en waarnemersgegevens</w:t>
       </w:r>
     </w:p>
-    <w:bookmarkEnd w:id="30"/>
-    <w:bookmarkStart w:id="31" w:name="bos--en-zeereeppaddenstoelen"/>
+    <w:bookmarkEnd w:id="31"/>
+    <w:bookmarkStart w:id="32" w:name="X339fafe251367982d6218746f16721a93fa7f70"/>
     <w:p>
       <w:pPr>
         <w:pStyle w:val="Heading4"/>
@@ -4570,8 +4808,8 @@
         <w:t xml:space="preserve">Volledige bezoeken en het per teller gevolgde soortenbereik; geen vruchtlichaam is bovendien niet hetzelfde als geen mycelium</w:t>
       </w:r>
     </w:p>
-    <w:bookmarkEnd w:id="31"/>
-    <w:bookmarkStart w:id="32" w:name="weekdieren"/>
+    <w:bookmarkEnd w:id="32"/>
+    <w:bookmarkStart w:id="33" w:name="X342bae7ae5afae546f17223888206446d449411"/>
     <w:p>
       <w:pPr>
         <w:pStyle w:val="Heading4"/>
@@ -4634,8 +4872,8 @@
         <w:t xml:space="preserve">Locatie-, monster- en bezoekcodes om systematische tellingen van losse meldingen te scheiden</w:t>
       </w:r>
     </w:p>
-    <w:bookmarkEnd w:id="32"/>
-    <w:bookmarkStart w:id="33" w:name="snl-gebiedsmonitoring"/>
+    <w:bookmarkEnd w:id="33"/>
+    <w:bookmarkStart w:id="34" w:name="Xcc11e4dda0fa9b87cf2613be17ff277804bdc91"/>
     <w:p>
       <w:pPr>
         <w:pStyle w:val="Heading4"/>
@@ -4706,9 +4944,9 @@
         <w:t xml:space="preserve">De overige NDFF-regels zijn losse of uitsluitend positieve registraties. Zij blijven nuttig voor verspreiding, maar ontbreken mag daar nooit als afwezigheid worden uitgelegd.</w:t>
       </w:r>
     </w:p>
-    <w:bookmarkEnd w:id="33"/>
     <w:bookmarkEnd w:id="34"/>
-    <w:bookmarkStart w:id="43" w:name="openbare-externe-ecologiebronnen"/>
+    <w:bookmarkEnd w:id="35"/>
+    <w:bookmarkStart w:id="44" w:name="X77733873953f7250a44afc39ac6f33e9c0fface"/>
     <w:p>
       <w:pPr>
         <w:pStyle w:val="Heading3"/>
@@ -4735,7 +4973,7 @@
       <w:r>
         <w:t xml:space="preserve"> </w:t>
       </w:r>
-      <w:hyperlink r:id="rId35">
+      <w:hyperlink r:id="rId36">
         <w:r>
           <w:rPr>
             <w:rStyle w:val="Hyperlink"/>
@@ -4929,7 +5167,7 @@
       <w:r>
         <w:t xml:space="preserve"> </w:t>
       </w:r>
-      <w:hyperlink r:id="rId36">
+      <w:hyperlink r:id="rId37">
         <w:r>
           <w:rPr>
             <w:rStyle w:val="Hyperlink"/>
@@ -4941,7 +5179,7 @@
         <w:t xml:space="preserve">.</w:t>
       </w:r>
     </w:p>
-    <w:bookmarkStart w:id="37" w:name="stowa-limnodata"/>
+    <w:bookmarkStart w:id="38" w:name="Xaa03dabe850e534118471d9a4587f103d7cc6d0"/>
     <w:p>
       <w:pPr>
         <w:pStyle w:val="Heading4"/>
@@ -5028,8 +5266,8 @@
         <w:t xml:space="preserve">, 196 als Braun-Blanquetklasse en 56 zonder eenheid. Niet gemelde soorten zijn geen nulwaarneming.</w:t>
       </w:r>
     </w:p>
-    <w:bookmarkEnd w:id="37"/>
-    <w:bookmarkStart w:id="38" w:name="endure-helmduinfauna"/>
+    <w:bookmarkEnd w:id="38"/>
+    <w:bookmarkStart w:id="39" w:name="Xe9b446960bca12075cdde30af1cbaf73f645a87"/>
     <w:p>
       <w:pPr>
         <w:pStyle w:val="Heading4"/>
@@ -5092,8 +5330,8 @@
         <w:t xml:space="preserve">Dit is een gestandaardiseerde en herhaalbare referentiemeting voor ongewervelden in witte duinen. De expliciete afwezigheden zijn bruikbaar binnen de veertien complete matrices. Eén meetjaar levert geen ontwikkeling door de tijd op.</w:t>
       </w:r>
     </w:p>
-    <w:bookmarkEnd w:id="38"/>
-    <w:bookmarkStart w:id="39" w:name="landelijke-vegetatie-databank"/>
+    <w:bookmarkEnd w:id="39"/>
+    <w:bookmarkStart w:id="40" w:name="X0079604d46da30ac9b5828c2b6c106eff7cd8f8"/>
     <w:p>
       <w:pPr>
         <w:pStyle w:val="Heading4"/>
@@ -5345,8 +5583,8 @@
         <w:t xml:space="preserve">behouden. Dit betreft 122 naamgebruiken, niet 122 waarnemingen. De toevoeging aan het register verandert geen meetwaarden, ruimtelijke toelating, overlapbesluiten of bestaande bronvelden.</w:t>
       </w:r>
     </w:p>
-    <w:bookmarkEnd w:id="39"/>
-    <w:bookmarkStart w:id="40" w:name="historische-vlinder--en-motcollectie"/>
+    <w:bookmarkEnd w:id="40"/>
+    <w:bookmarkStart w:id="41" w:name="Xa66e2be297c2cf82b37e3e4b59e101c55a2b789"/>
     <w:p>
       <w:pPr>
         <w:pStyle w:val="Heading4"/>
@@ -5409,8 +5647,8 @@
         <w:t xml:space="preserve">De collectie geeft controleerbare historische aanwezigheid, vooral door de intensieve vangsten van J.A.W. Lucas in 1955–1956. Zonder vanginspanning en lege vangnachten is dit geen populatietrend. De mogelijke NDFF-overlap blijft gemarkeerd en wordt niet automatisch samengevoegd.</w:t>
       </w:r>
     </w:p>
-    <w:bookmarkEnd w:id="40"/>
-    <w:bookmarkStart w:id="41" w:name="naturalis-botany"/>
+    <w:bookmarkEnd w:id="41"/>
+    <w:bookmarkStart w:id="42" w:name="X0623f0a4d9ecb153e84d6aa679ad58f6c310383"/>
     <w:p>
       <w:pPr>
         <w:pStyle w:val="Heading4"/>
@@ -5473,8 +5711,8 @@
         <w:t xml:space="preserve">Gedateerde historische plantenvondsten met bewaard bewijsmateriaal. De records tonen aanwezigheid, geen gestandaardiseerde telinspanning of afwezigheid.</w:t>
       </w:r>
     </w:p>
-    <w:bookmarkEnd w:id="41"/>
-    <w:bookmarkStart w:id="42" w:name="naturalis-coleoptera"/>
+    <w:bookmarkEnd w:id="42"/>
+    <w:bookmarkStart w:id="43" w:name="Xdd278617f9613de433492781e9679e24605d2f3"/>
     <w:p>
       <w:pPr>
         <w:pStyle w:val="Heading4"/>
@@ -5537,9 +5775,9 @@
         <w:t xml:space="preserve">Historische aanwezigheid van kevers met bewaard collectiemateriaal. De bron ondersteunt geen populatietrend zonder gestandaardiseerde vanginspanning. De oorspronkelijke etiketplaats en de gepubliceerde locatie-onzekerheid blijven per specimen beschikbaar.</w:t>
       </w:r>
     </w:p>
-    <w:bookmarkEnd w:id="42"/>
     <w:bookmarkEnd w:id="43"/>
-    <w:bookmarkStart w:id="44" w:name="X5d611a31ac68a696fd179c2c85c282500afefc7"/>
+    <w:bookmarkEnd w:id="44"/>
+    <w:bookmarkStart w:id="45" w:name="X4dcded00268e6461b0ddc34253d4faf52bf1dd1"/>
     <w:p>
       <w:pPr>
         <w:pStyle w:val="Heading3"/>
@@ -5576,8 +5814,8 @@
         <w:t xml:space="preserve">Deze records blijven herkenbaar als bronmateriaal, maar worden niet zonder een afzonderlijk ruimtelijk besluit in Meijendelanalyses gebruikt. Alle 37.770 vangblikevents en alle territoriumplots liggen binnen het basisgebied.</w:t>
       </w:r>
     </w:p>
-    <w:bookmarkEnd w:id="44"/>
-    <w:bookmarkStart w:id="50" w:name="verklarende-omgevingslagen"/>
+    <w:bookmarkEnd w:id="45"/>
+    <w:bookmarkStart w:id="52" w:name="X14c58f11b78e283997281ebde92c6b31ebc0c80"/>
     <w:p>
       <w:pPr>
         <w:pStyle w:val="Heading3"/>
@@ -5594,7 +5832,7 @@
         <w:t xml:space="preserve">Deze gegevens zijn geen soortenwaarnemingen. Zij kunnen wel helpen om ecologische veranderingen te beschrijven of als mogelijke verklaring te toetsen.</w:t>
       </w:r>
     </w:p>
-    <w:bookmarkStart w:id="45" w:name="dagelijks-weer"/>
+    <w:bookmarkStart w:id="46" w:name="X97e37a83ef92e6db79e0a815abf4c3d8d6d1754"/>
     <w:p>
       <w:pPr>
         <w:pStyle w:val="Heading4"/>
@@ -5628,29 +5866,43 @@
       <w:r>
         <w:rPr>
           <w:b/>
-        </w:rPr>
-        <w:t xml:space="preserve">Omvang en periode in de levende database op 11 oktober 2026. </w:t>
-      </w:r>
-      <w:r>
-        <w:t>24.837 dagregels, 1 januari 1958 tot en met 31 december 2025.</w:t>
-      </w:r>
-    </w:p>
-    <w:p>
-      <w:pPr>
-        <w:pStyle w:val="BodyText"/>
-      </w:pPr>
-      <w:r>
-        <w:rPr>
-          <w:b/>
-        </w:rPr>
-        <w:t xml:space="preserve">Gebruik en grens. </w:t>
-      </w:r>
-      <w:r>
-        <w:t>Temperatuur, neerslag, wind, zon en luchtdruk kunnen als covariaten worden gebruikt. Alleen de genormaliseerde analyseview is geldig. De huidige reeks eindigt met het volledige kalenderjaar 2025.</w:t>
-      </w:r>
-    </w:p>
-    <w:bookmarkEnd w:id="45"/>
-    <w:bookmarkStart w:id="46" w:name="hoogte"/>
+          <w:bCs/>
+        </w:rPr>
+        <w:t xml:space="preserve">Omvang en periode in de levende database op 11 oktober 2026.</w:t>
+      </w:r>
+      <w:r>
+        <w:t xml:space="preserve"> </w:t>
+      </w:r>
+      <w:r>
+        <w:t xml:space="preserve">24.837</w:t>
+      </w:r>
+      <w:r>
+        <w:t xml:space="preserve"> </w:t>
+      </w:r>
+      <w:r>
+        <w:t xml:space="preserve">dagregels, 1 januari 1958 tot en met 31 december 2025.</w:t>
+      </w:r>
+    </w:p>
+    <w:p>
+      <w:pPr>
+        <w:pStyle w:val="BodyText"/>
+      </w:pPr>
+      <w:r>
+        <w:rPr>
+          <w:b/>
+          <w:bCs/>
+        </w:rPr>
+        <w:t xml:space="preserve">Gebruik en grens.</w:t>
+      </w:r>
+      <w:r>
+        <w:t xml:space="preserve"> </w:t>
+      </w:r>
+      <w:r>
+        <w:t xml:space="preserve">Temperatuur, neerslag, wind, zon en luchtdruk kunnen als covariaten worden gebruikt. Alleen de genormaliseerde analyseview is geldig. De huidige reeks eindigt met het volledige kalenderjaar 2025.</w:t>
+      </w:r>
+    </w:p>
+    <w:bookmarkEnd w:id="46"/>
+    <w:bookmarkStart w:id="47" w:name="X625608f018b59d28869e33232003bd07c2f07d5"/>
     <w:p>
       <w:pPr>
         <w:pStyle w:val="Heading4"/>
@@ -5695,30 +5947,168 @@
         <w:t xml:space="preserve">55 plots, peiljaar 2025</w:t>
       </w:r>
     </w:p>
-    <w:bookmarkEnd w:id="46"/>
-    <w:bookmarkStart w:id="47" w:name="stikstofdepositie"/>
-    <w:p>
-      <w:pPr>
-        <w:pStyle w:val="BodyText"/>
-      </w:pPr>
-      <w:r>
-        <w:rPr>
-          <w:b/>
-        </w:rPr>
-        <w:t xml:space="preserve">Gebruik en grens. </w:t>
-      </w:r>
-      <w:r>
-        <w:t>De huidige tabel beschrijft maaiveldhoogte en hoogtevariatie per plot. Eén peiljaar geeft geen ontwikkeling door de tijd en een DTM meet geen vegetatiehoogte.</w:t>
-      </w:r>
-    </w:p>
-    <w:p>
-      <w:pPr>
-        <w:pStyle w:val="BodyText"/>
-      </w:pPr>
-      <w:r>
-        <w:t>Voor de vogel–vegetatieanalyse is daarnaast een reproduceerbare proxy uit AHN3 en AHN4 afgeleid. Deze analyse-uitvoer bevat 110 regels: 55 plots voor 2014 en 55 voor 2020, telkens DSM minus DTM op twee meter resolutie. Bij 100 regels volgt de inwinningsdatum uit vlakoverlap met de officiële vlieglijnen; bij tien uit de dichtstbijzijnde vlieglijn, op maximaal 254 meter. Vastgelegd zijn hoogteverdeling, aandelen open terrein, lage vegetatie, struweel en bomen en randlengte per hectare. Pixels boven 45 meter zijn als niet-vegetatieve uitbijter uitgesloten. De afgeleide waarden staan met manifest en controlesom onder analyses/broedvogel_vegetatie_power/resultaten/ en zijn niet als primaire bronmeting in de levende database opgenomen. Twee cycli tonen verschil, maar zijn zonder derde onafhankelijke meting onvoldoende om een vogelreactie op structuurverandering op een later moment te valideren.</w:t>
-      </w:r>
-    </w:p>
+    <w:p>
+      <w:pPr>
+        <w:pStyle w:val="BodyText"/>
+      </w:pPr>
+      <w:r>
+        <w:rPr>
+          <w:b/>
+          <w:bCs/>
+        </w:rPr>
+        <w:t xml:space="preserve">Gebruik en grens.</w:t>
+      </w:r>
+      <w:r>
+        <w:t xml:space="preserve"> </w:t>
+      </w:r>
+      <w:r>
+        <w:t xml:space="preserve">De huidige tabel beschrijft maaiveldhoogte en</w:t>
+      </w:r>
+      <w:r>
+        <w:t xml:space="preserve"> </w:t>
+      </w:r>
+      <w:r>
+        <w:t xml:space="preserve">hoogtevariatie per plot. Eén peiljaar geeft geen ontwikkeling door de tijd en</w:t>
+      </w:r>
+      <w:r>
+        <w:t xml:space="preserve"> </w:t>
+      </w:r>
+      <w:r>
+        <w:t xml:space="preserve">een DTM meet geen vegetatiehoogte.</w:t>
+      </w:r>
+    </w:p>
+    <w:p>
+      <w:pPr>
+        <w:pStyle w:val="BodyText"/>
+      </w:pPr>
+      <w:r>
+        <w:t xml:space="preserve">Voor de vogel–vegetatieanalyse is daarnaast een reproduceerbare proxy uit</w:t>
+      </w:r>
+      <w:r>
+        <w:t xml:space="preserve"> </w:t>
+      </w:r>
+      <w:r>
+        <w:t xml:space="preserve">AHN2, AHN3, AHN4 en AHN5 afgeleid. Deze analyse-uitvoer bevat 220 regels: 55</w:t>
+      </w:r>
+      <w:r>
+        <w:t xml:space="preserve"> </w:t>
+      </w:r>
+      <w:r>
+        <w:t xml:space="preserve">plots voor de structuurmomenten 2008, 2014, 2020 en 2023, telkens DSM minus</w:t>
+      </w:r>
+      <w:r>
+        <w:t xml:space="preserve"> </w:t>
+      </w:r>
+      <w:r>
+        <w:t xml:space="preserve">DTM op hetzelfde tweemetergrid. Vastgelegd zijn hoogteverdeling, aandelen open</w:t>
+      </w:r>
+      <w:r>
+        <w:t xml:space="preserve"> </w:t>
+      </w:r>
+      <w:r>
+        <w:t xml:space="preserve">terrein, lage vegetatie, struweel en bomen en randlengte per hectare. Pixels</w:t>
+      </w:r>
+      <w:r>
+        <w:t xml:space="preserve"> </w:t>
+      </w:r>
+      <w:r>
+        <w:t xml:space="preserve">boven 45 meter zijn als niet-vegetatieve uitbijter uitgesloten. De afgeleide</w:t>
+      </w:r>
+      <w:r>
+        <w:t xml:space="preserve"> </w:t>
+      </w:r>
+      <w:r>
+        <w:t xml:space="preserve">waarden en de controles op bronhashes, rastergelijkheid, volledigheid en</w:t>
+      </w:r>
+      <w:r>
+        <w:t xml:space="preserve"> </w:t>
+      </w:r>
+      <w:r>
+        <w:t xml:space="preserve">overgangen staan onder</w:t>
+      </w:r>
+      <w:r>
+        <w:t xml:space="preserve"> </w:t>
+      </w:r>
+      <w:r>
+        <w:rPr>
+          <w:rStyle w:val="VerbatimChar"/>
+        </w:rPr>
+        <w:t xml:space="preserve">analyses/broedvogel_vegetatie_power/resultaten/</w:t>
+      </w:r>
+      <w:r>
+        <w:t xml:space="preserve">. Zij zijn niet als primaire</w:t>
+      </w:r>
+      <w:r>
+        <w:t xml:space="preserve"> </w:t>
+      </w:r>
+      <w:r>
+        <w:t xml:space="preserve">bronmeting in de levende database opgenomen. De vier cycli maken een</w:t>
+      </w:r>
+      <w:r>
+        <w:t xml:space="preserve"> </w:t>
+      </w:r>
+      <w:r>
+        <w:t xml:space="preserve">historische tijdstoets mogelijk; in vier vogelgroepmodellen slaagde alleen de</w:t>
+      </w:r>
+      <w:r>
+        <w:t xml:space="preserve"> </w:t>
+      </w:r>
+      <w:r>
+        <w:t xml:space="preserve">boomgroeptoets numeriek en die leverde geen robuuste voorspellingswinst.</w:t>
+      </w:r>
+    </w:p>
+    <w:p>
+      <w:pPr>
+        <w:pStyle w:val="BodyText"/>
+      </w:pPr>
+      <w:r>
+        <w:t xml:space="preserve">AHN1 uit 1997–1998 is afzonderlijk beoordeeld op 55 plots. Tien historische</w:t>
+      </w:r>
+      <w:r>
+        <w:t xml:space="preserve"> </w:t>
+      </w:r>
+      <w:r>
+        <w:t xml:space="preserve">grond- en niet-grondbestanden leveren binnen het analysevenster 12.318.672</w:t>
+      </w:r>
+      <w:r>
+        <w:t xml:space="preserve"> </w:t>
+      </w:r>
+      <w:r>
+        <w:t xml:space="preserve">punten. Op het gekozen vijfmeterraster heeft 68,17% van 1.663.416 cellen een</w:t>
+      </w:r>
+      <w:r>
+        <w:t xml:space="preserve"> </w:t>
+      </w:r>
+      <w:r>
+        <w:t xml:space="preserve">grondpunt en 71,36% enig punt. Twee verdedigbare DSM-afleidingen verschillen</w:t>
+      </w:r>
+      <w:r>
+        <w:t xml:space="preserve"> </w:t>
+      </w:r>
+      <w:r>
+        <w:t xml:space="preserve">gemiddeld 48,0 procentpunt in open terrein, 14,0 procentpunt in bomen en 4,81</w:t>
+      </w:r>
+      <w:r>
+        <w:t xml:space="preserve"> </w:t>
+      </w:r>
+      <w:r>
+        <w:t xml:space="preserve">meter in de 95e hoogtepercentiel. AHN1 blijft daarom een experimentele</w:t>
+      </w:r>
+      <w:r>
+        <w:t xml:space="preserve"> </w:t>
+      </w:r>
+      <w:r>
+        <w:t xml:space="preserve">gevoeligheidsanalyse en is niet als vergelijkbaar vijfde moment aan AHN2–AHN5</w:t>
+      </w:r>
+      <w:r>
+        <w:t xml:space="preserve"> </w:t>
+      </w:r>
+      <w:r>
+        <w:t xml:space="preserve">toegevoegd.</w:t>
+      </w:r>
+    </w:p>
+    <w:bookmarkEnd w:id="47"/>
+    <w:bookmarkStart w:id="48" w:name="X8ebc62c1d17a2d7a08504bddffeeb5916a0bcb3"/>
     <w:p>
       <w:pPr>
         <w:pStyle w:val="Heading4"/>
@@ -5781,8 +6171,8 @@
         <w:t xml:space="preserve">Geschikt als mogelijke verklarende factor naast soorten- en vegetatiereeksen. Een samenhang bewijst niet dat stikstof de enige oorzaak is.</w:t>
       </w:r>
     </w:p>
-    <w:bookmarkEnd w:id="47"/>
-    <w:bookmarkStart w:id="48" w:name="bodemgebruik"/>
+    <w:bookmarkEnd w:id="48"/>
+    <w:bookmarkStart w:id="49" w:name="X972156668716d33d6f7bf93cdaf573c7928edca"/>
     <w:p>
       <w:pPr>
         <w:pStyle w:val="Heading4"/>
@@ -5845,8 +6235,8 @@
         <w:t xml:space="preserve">Laat veranderingen in de ruimtelijke omgeving van plots zien. De meetjaren zijn niet jaarlijks beschikbaar.</w:t>
       </w:r>
     </w:p>
-    <w:bookmarkEnd w:id="48"/>
-    <w:bookmarkStart w:id="49" w:name="natura-2000-habitat"/>
+    <w:bookmarkEnd w:id="49"/>
+    <w:bookmarkStart w:id="50" w:name="X92770fc640c1bb2fd0ffeda71d68ce2650b46be"/>
     <w:p>
       <w:pPr>
         <w:pStyle w:val="Heading4"/>
@@ -5909,10 +6299,152 @@
         <w:t xml:space="preserve">Geeft de verdeling van habitattypen binnen plots. Dit is één kaartjaar; de aangekondigde T1-kaart is nodig voor een directe vergelijking door de tijd.</w:t>
       </w:r>
     </w:p>
-    <w:bookmarkEnd w:id="49"/>
     <w:bookmarkEnd w:id="50"/>
+    <w:bookmarkStart w:id="51" w:name="Xdb7eb24e1743be4ba71117664c27cd530984820"/>
+    <w:p>
+      <w:pPr>
+        <w:pStyle w:val="Heading4"/>
+      </w:pPr>
+      <w:r>
+        <w:t xml:space="preserve">1.8.6. Jaarlijks luchtfotobeeld</w:t>
+      </w:r>
+    </w:p>
+    <w:p>
+      <w:pPr>
+        <w:pStyle w:val="FirstParagraph"/>
+      </w:pPr>
+      <w:r>
+        <w:rPr>
+          <w:b/>
+          <w:bCs/>
+        </w:rPr>
+        <w:t xml:space="preserve">Eigenaar.</w:t>
+      </w:r>
+      <w:r>
+        <w:t xml:space="preserve"> </w:t>
+      </w:r>
+      <w:r>
+        <w:t xml:space="preserve">Beeldmateriaal Nederland, ontsloten via PDOK en het landelijke</w:t>
+      </w:r>
+      <w:r>
+        <w:t xml:space="preserve"> </w:t>
+      </w:r>
+      <w:r>
+        <w:t xml:space="preserve">downloadportaal.</w:t>
+      </w:r>
+    </w:p>
+    <w:p>
+      <w:pPr>
+        <w:pStyle w:val="BodyText"/>
+      </w:pPr>
+      <w:r>
+        <w:rPr>
+          <w:b/>
+          <w:bCs/>
+        </w:rPr>
+        <w:t xml:space="preserve">Omvang en periode.</w:t>
+      </w:r>
+      <w:r>
+        <w:t xml:space="preserve"> </w:t>
+      </w:r>
+      <w:r>
+        <w:t xml:space="preserve">Kandidaatbron, nog niet lokaal geïmporteerd. De landelijk</w:t>
+      </w:r>
+      <w:r>
+        <w:t xml:space="preserve"> </w:t>
+      </w:r>
+      <w:r>
+        <w:t xml:space="preserve">beschikbare zomerbeelden leveren vanaf 2016 RGB en nabij-infrarood op 25</w:t>
+      </w:r>
+      <w:r>
+        <w:t xml:space="preserve"> </w:t>
+      </w:r>
+      <w:r>
+        <w:t xml:space="preserve">centimeter, maar de 25-centimeterreeks mist in ieder geval 2021. Recentere</w:t>
+      </w:r>
+      <w:r>
+        <w:t xml:space="preserve"> </w:t>
+      </w:r>
+      <w:r>
+        <w:t xml:space="preserve">voorjaarsbeelden zijn afzonderlijk beschikbaar.</w:t>
+      </w:r>
+      <w:r>
+        <w:t xml:space="preserve"> </w:t>
+      </w:r>
+      <w:r>
+        <w:t xml:space="preserve">Voor de beoogde proef zijn 55 vogelplots en enkele jaren rond AHN3, AHN4 en</w:t>
+      </w:r>
+      <w:r>
+        <w:t xml:space="preserve"> </w:t>
+      </w:r>
+      <w:r>
+        <w:t xml:space="preserve">AHN5 nodig. De feitelijke tegelselectie, omvang en dekking worden pas bij die</w:t>
+      </w:r>
+      <w:r>
+        <w:t xml:space="preserve"> </w:t>
+      </w:r>
+      <w:r>
+        <w:t xml:space="preserve">proef vastgesteld.</w:t>
+      </w:r>
+    </w:p>
+    <w:p>
+      <w:pPr>
+        <w:pStyle w:val="BodyText"/>
+      </w:pPr>
+      <w:r>
+        <w:rPr>
+          <w:b/>
+          <w:bCs/>
+        </w:rPr>
+        <w:t xml:space="preserve">Gebruik en grens.</w:t>
+      </w:r>
+      <w:r>
+        <w:t xml:space="preserve"> </w:t>
+      </w:r>
+      <w:r>
+        <w:t xml:space="preserve">Een reproduceerbare RGB/CIR-classificatie kan jaarlijkse</w:t>
+      </w:r>
+      <w:r>
+        <w:t xml:space="preserve"> </w:t>
+      </w:r>
+      <w:r>
+        <w:t xml:space="preserve">horizontale bedekking door open zand, lage vegetatie, struweel, bomen en water</w:t>
+      </w:r>
+      <w:r>
+        <w:t xml:space="preserve"> </w:t>
+      </w:r>
+      <w:r>
+        <w:t xml:space="preserve">tussen de AHN-cycli volgen. Luchtfoto's meten geen vegetatiehoogte, maken AHN1</w:t>
+      </w:r>
+      <w:r>
+        <w:t xml:space="preserve"> </w:t>
+      </w:r>
+      <w:r>
+        <w:t xml:space="preserve">niet vergelijkbaar en mogen niet rechtstreeks als causale verklaring van</w:t>
+      </w:r>
+      <w:r>
+        <w:t xml:space="preserve"> </w:t>
+      </w:r>
+      <w:r>
+        <w:t xml:space="preserve">vogelverandering worden gebruikt. Eerst volgt een beperkte</w:t>
+      </w:r>
+      <w:r>
+        <w:t xml:space="preserve"> </w:t>
+      </w:r>
+      <w:r>
+        <w:t xml:space="preserve">classificatieproef; alleen bij voldoende jaar-op-jaarstabiliteit wordt deze</w:t>
+      </w:r>
+      <w:r>
+        <w:t xml:space="preserve"> </w:t>
+      </w:r>
+      <w:r>
+        <w:t xml:space="preserve">kandidaatbron analyseklaar gemaakt.</w:t>
+      </w:r>
+    </w:p>
     <w:bookmarkEnd w:id="51"/>
-    <w:bookmarkStart w:id="59" w:name="X3b532014da7425692b0b753bfd67f02e729afe2"/>
+    <w:bookmarkEnd w:id="52"/>
+    <w:bookmarkEnd w:id="53"/>
+    <w:bookmarkStart w:id="61" w:name="X692b0a71312b2a939db271d079fb23757bfc15a"/>
     <w:p>
       <w:pPr>
         <w:pStyle w:val="Heading2"/>
@@ -5953,7 +6485,7 @@
         <w:t xml:space="preserve">gebruikt. De nieuwe bijen- en aquatische context uit fase 2 staat op 26 september 2026 alleen in de lokale canonieke database en is nog niet naar de VPS gepubliceerd.</w:t>
       </w:r>
     </w:p>
-    <w:bookmarkStart w:id="53" w:name="duinvalleivegetatie"/>
+    <w:bookmarkStart w:id="55" w:name="X7ae3f60e8dd3c65bdde3d5f608a55d96632a876"/>
     <w:p>
       <w:pPr>
         <w:pStyle w:val="Heading3"/>
@@ -5982,7 +6514,7 @@
       <w:r>
         <w:t xml:space="preserve"> </w:t>
       </w:r>
-      <w:hyperlink r:id="rId52">
+      <w:hyperlink r:id="rId54">
         <w:r>
           <w:rPr>
             <w:rStyle w:val="Hyperlink"/>
@@ -6027,8 +6559,8 @@
         <w:t xml:space="preserve">De volledige matrix van 208 taxa bevat echte nullen en maakt vergelijking tussen de drie jaren mogelijk. De locatiecodes zijn nog niet betrouwbaar aan geometrieën gekoppeld. Opname 18I01 blijft uitgesloten: daarin zijn 159 taxa geregistreerd, tegenover maximaal 40 in alle overige opnamen. Deze reeks blijft afzonderlijk van de provinciale PQ-reeks.</w:t>
       </w:r>
     </w:p>
-    <w:bookmarkEnd w:id="53"/>
-    <w:bookmarkStart w:id="54" w:name="vogelstand-1924"/>
+    <w:bookmarkEnd w:id="55"/>
+    <w:bookmarkStart w:id="56" w:name="X6cd5cd3671e295c222d5bd4a47757f0a76f0a19"/>
     <w:p>
       <w:pPr>
         <w:pStyle w:val="Heading3"/>
@@ -6106,8 +6638,8 @@
         <w:t xml:space="preserve">buiten de canonieke export. Deze blijft tijdens de PQ-publicatie onaangetast; haar aanwezigheid geeft geen nieuwe analysetoestemming. Dit schema-overzicht bewijst de tabelnaam en het type, niet haar actuele rijtelling.</w:t>
       </w:r>
     </w:p>
-    <w:bookmarkEnd w:id="54"/>
-    <w:bookmarkStart w:id="55" w:name="jachtspinnen"/>
+    <w:bookmarkEnd w:id="56"/>
+    <w:bookmarkStart w:id="57" w:name="Xb3fdc40884db1bbf06132e666e117a731445140"/>
     <w:p>
       <w:pPr>
         <w:pStyle w:val="Heading3"/>
@@ -6170,8 +6702,8 @@
         <w:t xml:space="preserve">De samengevoegde vangstmatrix ondersteunt een soorten-milieuanalyse, maar geen ontwikkeling door de tijd. Datums en vangrondes ontbreken. De 28 locatienummers zijn bovendien nog niet naar werkelijke plaatsen te vertalen en mogen daarom niet als Meijendelwaarnemingen worden geanalyseerd.</w:t>
       </w:r>
     </w:p>
-    <w:bookmarkEnd w:id="55"/>
-    <w:bookmarkStart w:id="56" w:name="literatuuroverzicht"/>
+    <w:bookmarkEnd w:id="57"/>
+    <w:bookmarkStart w:id="58" w:name="X7c2c13aacf0ea926ee35ca97ab69391a3624a6f"/>
     <w:p>
       <w:pPr>
         <w:pStyle w:val="Heading3"/>
@@ -6234,8 +6766,8 @@
         <w:t xml:space="preserve">Zoekingang naar onderzoek en historische context. Dit zijn verwijzingen, geen waarnemingsregels; volledige teksten blijven in Zotero en worden niet op de VPS gekopieerd.</w:t>
       </w:r>
     </w:p>
-    <w:bookmarkEnd w:id="56"/>
-    <w:bookmarkStart w:id="57" w:name="bijenmonitoring-in-vier-beheergebieden"/>
+    <w:bookmarkEnd w:id="58"/>
+    <w:bookmarkStart w:id="59" w:name="X4a1f2475629c7656191227e4ca81566bef187e2"/>
     <w:p>
       <w:pPr>
         <w:pStyle w:val="Heading3"/>
@@ -6310,8 +6842,8 @@
         <w:t xml:space="preserve">. Drie onderzoeksjaren zijn bovendien een reeks van gestandaardiseerde herhalingen, geen robuuste langjarige trend.</w:t>
       </w:r>
     </w:p>
-    <w:bookmarkEnd w:id="57"/>
-    <w:bookmarkStart w:id="58" w:name="aquatische-macrofauna-19741975"/>
+    <w:bookmarkEnd w:id="59"/>
+    <w:bookmarkStart w:id="60" w:name="Xbef92f685785a24a45e5325384551ba55c57cc1"/>
     <w:p>
       <w:pPr>
         <w:pStyle w:val="Heading3"/>
@@ -6389,9 +6921,9 @@
         <w:t xml:space="preserve">overgebracht.</w:t>
       </w:r>
     </w:p>
-    <w:bookmarkEnd w:id="58"/>
-    <w:bookmarkEnd w:id="59"/>
-    <w:bookmarkStart w:id="79" w:name="Xae67a70ad36e2d1d11a7d910c2e5a6d669a3a5f"/>
+    <w:bookmarkEnd w:id="60"/>
+    <w:bookmarkEnd w:id="61"/>
+    <w:bookmarkStart w:id="82" w:name="X2b62b82ef201b4c91783bce15da2b1d0258c34c"/>
     <w:p>
       <w:pPr>
         <w:pStyle w:val="Heading2"/>
@@ -6408,7 +6940,7 @@
         <w:t xml:space="preserve">Deze bronnen zijn gevonden, maar nog niet toegelaten. De genoemde aantallen hebben betrekking op de al gemaakte Meijendelselectie of op de beschreven onderzoeksopzet. Voor iedere import volgt eerst controle van locatie per waarneming, overlap met bestaande bronnen, rechten en statistische betekenis.</w:t>
       </w:r>
     </w:p>
-    <w:bookmarkStart w:id="76" w:name="Xd53aceb4d9e4863cdbb6367737be5e291cdac65"/>
+    <w:bookmarkStart w:id="78" w:name="Xd53aceb4d9e4863cdbb6367737be5e291cdac65"/>
     <w:p>
       <w:pPr>
         <w:pStyle w:val="Heading3"/>
@@ -6417,7 +6949,7 @@
         <w:t xml:space="preserve">Kandidaten met de grootste verwachte aanvulling</w:t>
       </w:r>
     </w:p>
-    <w:bookmarkStart w:id="60" w:name="historische-en-actuele-ringgegevens"/>
+    <w:bookmarkStart w:id="62" w:name="Xbddce02f5cb2b082bf32fac381c8bc0ea5284d3"/>
     <w:p>
       <w:pPr>
         <w:pStyle w:val="Heading4"/>
@@ -6513,8 +7045,8 @@
         <w:t xml:space="preserve">blijkt in de officiële EURING-codebeschrijving de provincie Zuid-Holland aan te duiden en niet VRS Meijendel. Trektellen-site 403 is wel VRS Meijendel en bevat inspanningsinformatie, maar er is nog geen recordsleutel tussen beide bronnen gevonden. De 100.417 ruimtelijke treffers zijn daarom niet als VRS-Meijendelvangsten geïmporteerd.</w:t>
       </w:r>
     </w:p>
-    <w:bookmarkEnd w:id="60"/>
-    <w:bookmarkStart w:id="61" w:name="erosiepinnen-in-een-stuifkuilcomplex"/>
+    <w:bookmarkEnd w:id="62"/>
+    <w:bookmarkStart w:id="63" w:name="X8071b7ae643e6cecadbf8a281c84bb90b511e63"/>
     <w:p>
       <w:pPr>
         <w:pStyle w:val="Heading4"/>
@@ -6595,8 +7127,8 @@
         <w:t xml:space="preserve">Oorspronkelijke metingen en pinlocaties vinden en op waarnemingsniveau aan Meijendel koppelen</w:t>
       </w:r>
     </w:p>
-    <w:bookmarkEnd w:id="61"/>
-    <w:bookmarkStart w:id="62" w:name="langjarige-droge-duinvegetatieplots"/>
+    <w:bookmarkEnd w:id="63"/>
+    <w:bookmarkStart w:id="64" w:name="X1b05a95cacb83608c9b762adcf4298810ed86f9"/>
     <w:p>
       <w:pPr>
         <w:pStyle w:val="Heading4"/>
@@ -6677,8 +7209,8 @@
         <w:t xml:space="preserve">De publicatiekaart toont de 41 punten in Helmduinen, Kijfhoek en Bierlap, maar zonder koppelbare plotcodes. De toegelaten LVD-opnamen leverden geen betrouwbare vertaling op naar deze 41 plots. Oorspronkelijke plotcodes, opnamen en locaties blijven daarom noodzakelijk.</w:t>
       </w:r>
     </w:p>
-    <w:bookmarkEnd w:id="62"/>
-    <w:bookmarkStart w:id="64" w:name="neuropteren-van-meijendel"/>
+    <w:bookmarkEnd w:id="64"/>
+    <w:bookmarkStart w:id="66" w:name="X4578481a165cef1470f100d42a5e836ac7456f8"/>
     <w:p>
       <w:pPr>
         <w:pStyle w:val="Heading4"/>
@@ -6689,7 +7221,7 @@
       <w:r>
         <w:t xml:space="preserve"> </w:t>
       </w:r>
-      <w:hyperlink r:id="rId63">
+      <w:hyperlink r:id="rId65">
         <w:r>
           <w:rPr>
             <w:rStyle w:val="Hyperlink"/>
@@ -6770,8 +7302,8 @@
         <w:t xml:space="preserve">De specimen- en soortenlijsten uit de publicatie digitaliseren, datum en plaats per record vaststellen en vergelijken met Naturalis-collecties en NDFF.</w:t>
       </w:r>
     </w:p>
-    <w:bookmarkEnd w:id="64"/>
-    <w:bookmarkStart w:id="66" w:name="zweefvliegen-van-meijendel"/>
+    <w:bookmarkEnd w:id="66"/>
+    <w:bookmarkStart w:id="68" w:name="X642992b46f3d655730973d9bd57c00f9c7aad9f"/>
     <w:p>
       <w:pPr>
         <w:pStyle w:val="Heading4"/>
@@ -6782,7 +7314,7 @@
       <w:r>
         <w:t xml:space="preserve"> </w:t>
       </w:r>
-      <w:hyperlink r:id="rId65">
+      <w:hyperlink r:id="rId67">
         <w:r>
           <w:rPr>
             <w:rStyle w:val="Hyperlink"/>
@@ -6863,8 +7395,8 @@
         <w:t xml:space="preserve">De volledige specimenlijst digitaliseren en per exemplaar datum en locatie vastleggen; daarna ontdubbelen tegen museumcollecties en NDFF.</w:t>
       </w:r>
     </w:p>
-    <w:bookmarkEnd w:id="66"/>
-    <w:bookmarkStart w:id="68" w:name="terra-dunes-plant--en-bodemmicrobiomen"/>
+    <w:bookmarkEnd w:id="68"/>
+    <w:bookmarkStart w:id="70" w:name="X80b82bf48485caf594896b8d6bc490be5f328ee"/>
     <w:p>
       <w:pPr>
         <w:pStyle w:val="Heading4"/>
@@ -6893,7 +7425,7 @@
       <w:r>
         <w:t xml:space="preserve"> </w:t>
       </w:r>
-      <w:hyperlink r:id="rId67">
+      <w:hyperlink r:id="rId69">
         <w:r>
           <w:rPr>
             <w:rStyle w:val="Hyperlink"/>
@@ -6938,8 +7470,8 @@
         <w:t xml:space="preserve">Geschikt voor samenhang tussen vegetatie en microbiomen. Niet toelaten voordat de proefvlakken geografisch zijn gereconstrueerd.</w:t>
       </w:r>
     </w:p>
-    <w:bookmarkEnd w:id="68"/>
-    <w:bookmarkStart w:id="70" w:name="rups--en-bodemmicrobiomen"/>
+    <w:bookmarkEnd w:id="70"/>
+    <w:bookmarkStart w:id="72" w:name="X4b2db10b2340db42e20505c45425c0b84f14c27"/>
     <w:p>
       <w:pPr>
         <w:pStyle w:val="Heading4"/>
@@ -6968,7 +7500,7 @@
       <w:r>
         <w:t xml:space="preserve"> </w:t>
       </w:r>
-      <w:hyperlink r:id="rId69">
+      <w:hyperlink r:id="rId71">
         <w:r>
           <w:rPr>
             <w:rStyle w:val="Hyperlink"/>
@@ -7013,8 +7545,8 @@
         <w:t xml:space="preserve">Eenmalige genetische en microbiële momentopname. Geen populatietrend, wel lokale ecologische vergelijking na controle van alle monsterlocaties.</w:t>
       </w:r>
     </w:p>
-    <w:bookmarkEnd w:id="70"/>
-    <w:bookmarkStart w:id="72" w:name="schimmels-bij-kruipwilg"/>
+    <w:bookmarkEnd w:id="72"/>
+    <w:bookmarkStart w:id="74" w:name="X442e94e4e2997aa133d10bf618574e2528e759d"/>
     <w:p>
       <w:pPr>
         <w:pStyle w:val="Heading4"/>
@@ -7043,7 +7575,7 @@
       <w:r>
         <w:t xml:space="preserve"> </w:t>
       </w:r>
-      <w:hyperlink r:id="rId71">
+      <w:hyperlink r:id="rId73">
         <w:r>
           <w:rPr>
             <w:rStyle w:val="Hyperlink"/>
@@ -7088,8 +7620,8 @@
         <w:t xml:space="preserve">Bruikbaar als lokale microbiële referentie, niet als tijdreeks of gebiedsdekkende inventarisatie.</w:t>
       </w:r>
     </w:p>
-    <w:bookmarkEnd w:id="72"/>
-    <w:bookmarkStart w:id="74" w:name="plantengroei-bodemvocht-en-weer"/>
+    <w:bookmarkEnd w:id="74"/>
+    <w:bookmarkStart w:id="76" w:name="X36e8e197a59cff4a0251b791dc5fc6bc0e135bf"/>
     <w:p>
       <w:pPr>
         <w:pStyle w:val="Heading4"/>
@@ -7118,7 +7650,7 @@
       <w:r>
         <w:t xml:space="preserve"> </w:t>
       </w:r>
-      <w:hyperlink r:id="rId73">
+      <w:hyperlink r:id="rId75">
         <w:r>
           <w:rPr>
             <w:rStyle w:val="Hyperlink"/>
@@ -7163,8 +7695,8 @@
         <w:t xml:space="preserve">Gedetailleerde processtudie van de reactie van duingrassen op neerslag en droogte. Eerst locaties en meetkwaliteit controleren; één halfjaar geeft geen langjarige ontwikkeling.</w:t>
       </w:r>
     </w:p>
-    <w:bookmarkEnd w:id="74"/>
-    <w:bookmarkStart w:id="75" w:name="genetische-datasets-amfibieën"/>
+    <w:bookmarkEnd w:id="76"/>
+    <w:bookmarkStart w:id="77" w:name="X49ed5beca1c3c65272a43e85c3687f3c3d41d64"/>
     <w:p>
       <w:pPr>
         <w:pStyle w:val="Heading4"/>
@@ -7227,9 +7759,9 @@
         <w:t xml:space="preserve">Bruikbaar voor populatiegenetische context. Jaar, locatie en relatie met bestaande RAVON-waarnemingen moeten eerst worden vastgesteld.</w:t>
       </w:r>
     </w:p>
-    <w:bookmarkEnd w:id="75"/>
-    <w:bookmarkEnd w:id="76"/>
-    <w:bookmarkStart w:id="78" w:name="X8c2748f02893018608c8a38a1054acf3030739d"/>
+    <w:bookmarkEnd w:id="77"/>
+    <w:bookmarkEnd w:id="78"/>
+    <w:bookmarkStart w:id="81" w:name="X136d668cd3b301eba92f27584d1a2d49d57a73c"/>
     <w:p>
       <w:pPr>
         <w:pStyle w:val="Heading3"/>
@@ -7367,33 +7899,242 @@
       <w:r>
         <w:rPr>
           <w:b/>
-        </w:rPr>
-        <w:t xml:space="preserve">Remote sensing van vegetatiehoogte en -bedekking: </w:t>
-      </w:r>
-      <w:r>
-        <w:t>WUR beschreef kaarten voor 2008 en 2014; TU Delft beschreef elf beeldmomenten uit 2019–2021. De afgeleide onderzoeksrasters zijn nog niet als openbare dataset gevonden en blijven kandidaatbron. De landelijke DTM- en DSM-bronnen uit de AHN-dataroom zijn inmiddels wel gebruikt om de onder 1.8.2 beschreven proxy voor 2014 en 2020 af te leiden en lokaal te controleren. De onderzoeksrasters en de AHN-proxy zijn dus niet dezelfde bron.</w:t>
-      </w:r>
-    </w:p>
-    <w:p>
-      <w:pPr>
-        <w:pStyle w:val="BodyText"/>
-      </w:pPr>
-      <w:r>
-        <w:rPr>
-          <w:b/>
-        </w:rPr>
-        <w:t>Landbedekking in vogelplots:</w:t>
-      </w:r>
-      <w:r>
-        <w:t xml:space="preserve"> de openbare studie van Schmidt-Tauscher, Häger en Van der Hagen uit 2025 behandelt 25 BMP-plots met samen 925 hectare. Het openbare supplement bevat de volledige tabel met de oppervlakte van zeven landbedekkingsklassen per plot in 2001 en 2022: struweel, bos, boomgroepen, lage vegetatie, riet, kaal zand en water. De classificatie is afgeleid uit luchtfoto's, teruggebracht tot pixels van 5 bij 5 meter en had een totale nauwkeurigheid van 81% in 2001 en 82% in 2022. De bron-Excel is op 11 oktober 2026 reproduceerbaar in de lokale broedvogel–vegetatieanalyse gebruikt en met SHA256 in het uitvoermanifest vastgelegd; zij is niet als nieuwe brontabel in de levende database geïmporteerd. M17 heeft in de actuele vogelmatrix geen territoriumplotjaar en valt uit de modellen. De overige vogelgroepen gebruiken 22–24 plots. Bij M71 is in beide jaren 47,89 van 48,46 hectare geclassificeerd; de ontbrekende 0,57 hectare blijft zichtbaar en de klasseaandelen zijn alleen over het geclassificeerde deel berekend.</w:t>
-      </w:r>
-    </w:p>
-    <w:p>
-      <w:pPr>
-        <w:pStyle w:val="BodyText"/>
-      </w:pPr>
-      <w:r>
-        <w:t>De plot-tabel voegt een ecologisch specifiekere verklarende laag toe dan de CBS-landgebruikgegevens voor 55 plots in 1996, 2010, 2015, 2017 en 2022. Wateroppervlak leverde in alle vijf ruimtelijke validatieblokken een betere logscore voor watervogels. Voor de overige vogelgroepen waren de scores gemengd of te veel modellen numeriek ongeldig; van de 36 landbedekkingsvalidaties slaagden er 18. De geclassificeerde rasters zelf zitten niet in het openbare supplement; de auteurs vermelden dat de gebruikte en gemaakte datasets op verzoek verkrijgbaar zijn. Met die rasters zouden ook ruimtelijke samenhang, versnippering, randen en vegetatiemozaïek kunnen worden onderzocht. Het blijven twee momentopnamen binnen 25 plots; zij meten geen jaarlijkse ontwikkeling, vegetatiehoogte, voedsel, nestgelegenheid of andere habitatkwaliteit en bewijzen op zichzelf geen beheereffect.</w:t>
+          <w:bCs/>
+        </w:rPr>
+        <w:t xml:space="preserve">Remote sensing van vegetatiehoogte en -bedekking:</w:t>
+      </w:r>
+      <w:r>
+        <w:t xml:space="preserve"> </w:t>
+      </w:r>
+      <w:r>
+        <w:t xml:space="preserve">WUR beschreef kaarten</w:t>
+      </w:r>
+      <w:r>
+        <w:t xml:space="preserve"> </w:t>
+      </w:r>
+      <w:r>
+        <w:t xml:space="preserve">voor 2008 en 2014; TU Delft beschreef elf beeldmomenten uit 2019–2021. De</w:t>
+      </w:r>
+      <w:r>
+        <w:t xml:space="preserve"> </w:t>
+      </w:r>
+      <w:r>
+        <w:t xml:space="preserve">afgeleide onderzoeksrasters zijn nog niet als openbare dataset gevonden en</w:t>
+      </w:r>
+      <w:r>
+        <w:t xml:space="preserve"> </w:t>
+      </w:r>
+      <w:r>
+        <w:t xml:space="preserve">blijven kandidaatbron. De landelijke DTM- en DSM-bronnen uit de</w:t>
+      </w:r>
+      <w:r>
+        <w:t xml:space="preserve"> </w:t>
+      </w:r>
+      <w:hyperlink r:id="rId79">
+        <w:r>
+          <w:rPr>
+            <w:rStyle w:val="Hyperlink"/>
+          </w:rPr>
+          <w:t xml:space="preserve">AHN-dataroom</w:t>
+        </w:r>
+      </w:hyperlink>
+      <w:r>
+        <w:t xml:space="preserve"> </w:t>
+      </w:r>
+      <w:r>
+        <w:t xml:space="preserve">zijn inmiddels wel gebruikt om de</w:t>
+      </w:r>
+      <w:r>
+        <w:t xml:space="preserve"> </w:t>
+      </w:r>
+      <w:r>
+        <w:t xml:space="preserve">onder 1.8.2 beschreven proxy voor 2014 en 2020 af te leiden en lokaal te</w:t>
+      </w:r>
+      <w:r>
+        <w:t xml:space="preserve"> </w:t>
+      </w:r>
+      <w:r>
+        <w:t xml:space="preserve">controleren. De onderzoeksrasters en de AHN-proxy zijn dus niet dezelfde bron.</w:t>
+      </w:r>
+    </w:p>
+    <w:p>
+      <w:pPr>
+        <w:pStyle w:val="BodyText"/>
+      </w:pPr>
+      <w:hyperlink r:id="rId80">
+        <w:r>
+          <w:rPr>
+            <w:rStyle w:val="Hyperlink"/>
+            <w:b/>
+            <w:bCs/>
+          </w:rPr>
+          <w:t xml:space="preserve">Landbedekking in vogelplots</w:t>
+        </w:r>
+      </w:hyperlink>
+      <w:r>
+        <w:rPr>
+          <w:b/>
+          <w:bCs/>
+        </w:rPr>
+        <w:t xml:space="preserve">:</w:t>
+      </w:r>
+      <w:r>
+        <w:t xml:space="preserve"> </w:t>
+      </w:r>
+      <w:r>
+        <w:t xml:space="preserve">de openbare studie van Schmidt-Tauscher, Häger en Van der Hagen uit 2025</w:t>
+      </w:r>
+      <w:r>
+        <w:t xml:space="preserve"> </w:t>
+      </w:r>
+      <w:r>
+        <w:t xml:space="preserve">behandelt 25 BMP-plots met samen 925 hectare. Het openbare supplement bevat de</w:t>
+      </w:r>
+      <w:r>
+        <w:t xml:space="preserve"> </w:t>
+      </w:r>
+      <w:r>
+        <w:t xml:space="preserve">volledige tabel met de oppervlakte van zeven landbedekkingsklassen per plot in</w:t>
+      </w:r>
+      <w:r>
+        <w:t xml:space="preserve"> </w:t>
+      </w:r>
+      <w:r>
+        <w:t xml:space="preserve">2001 en 2022: struweel, bos, boomgroepen, lage vegetatie, riet, kaal zand en</w:t>
+      </w:r>
+      <w:r>
+        <w:t xml:space="preserve"> </w:t>
+      </w:r>
+      <w:r>
+        <w:t xml:space="preserve">water. De classificatie is afgeleid uit luchtfoto's, teruggebracht tot pixels</w:t>
+      </w:r>
+      <w:r>
+        <w:t xml:space="preserve"> </w:t>
+      </w:r>
+      <w:r>
+        <w:t xml:space="preserve">van 5 bij 5 meter en had een totale nauwkeurigheid van 81% in 2001 en 82% in</w:t>
+      </w:r>
+      <w:r>
+        <w:t xml:space="preserve"> </w:t>
+      </w:r>
+      <w:r>
+        <w:t xml:space="preserve">2022. De bron-Excel is op 11 oktober 2026 reproduceerbaar in de lokale</w:t>
+      </w:r>
+      <w:r>
+        <w:t xml:space="preserve"> </w:t>
+      </w:r>
+      <w:r>
+        <w:t xml:space="preserve">broedvogel–vegetatieanalyse gebruikt en met SHA256 in het uitvoermanifest</w:t>
+      </w:r>
+      <w:r>
+        <w:t xml:space="preserve"> </w:t>
+      </w:r>
+      <w:r>
+        <w:t xml:space="preserve">vastgelegd; zij is niet als nieuwe brontabel in de levende database</w:t>
+      </w:r>
+      <w:r>
+        <w:t xml:space="preserve"> </w:t>
+      </w:r>
+      <w:r>
+        <w:t xml:space="preserve">geïmporteerd. M17 heeft in de actuele vogelmatrix geen territoriumplotjaar en</w:t>
+      </w:r>
+      <w:r>
+        <w:t xml:space="preserve"> </w:t>
+      </w:r>
+      <w:r>
+        <w:t xml:space="preserve">valt uit de modellen. De overige vogelgroepen gebruiken 22–24 plots. Bij M71</w:t>
+      </w:r>
+      <w:r>
+        <w:t xml:space="preserve"> </w:t>
+      </w:r>
+      <w:r>
+        <w:t xml:space="preserve">is in beide jaren 47,89 van 48,46 hectare geclassificeerd; de ontbrekende 0,57</w:t>
+      </w:r>
+      <w:r>
+        <w:t xml:space="preserve"> </w:t>
+      </w:r>
+      <w:r>
+        <w:t xml:space="preserve">hectare blijft zichtbaar en de klasseaandelen zijn alleen over het</w:t>
+      </w:r>
+      <w:r>
+        <w:t xml:space="preserve"> </w:t>
+      </w:r>
+      <w:r>
+        <w:t xml:space="preserve">geclassificeerde deel berekend.</w:t>
+      </w:r>
+    </w:p>
+    <w:p>
+      <w:pPr>
+        <w:pStyle w:val="BodyText"/>
+      </w:pPr>
+      <w:r>
+        <w:t xml:space="preserve">De plot-tabel voegt een ecologisch specifiekere verklarende laag toe dan de</w:t>
+      </w:r>
+      <w:r>
+        <w:t xml:space="preserve"> </w:t>
+      </w:r>
+      <w:r>
+        <w:t xml:space="preserve">CBS-landgebruikgegevens voor 55 plots in 1996, 2010, 2015, 2017 en 2022.</w:t>
+      </w:r>
+      <w:r>
+        <w:t xml:space="preserve"> </w:t>
+      </w:r>
+      <w:r>
+        <w:t xml:space="preserve">Wateroppervlak leverde in alle vijf ruimtelijke validatieblokken een betere</w:t>
+      </w:r>
+      <w:r>
+        <w:t xml:space="preserve"> </w:t>
+      </w:r>
+      <w:r>
+        <w:t xml:space="preserve">logscore voor watervogels. Voor de overige vogelgroepen waren de scores</w:t>
+      </w:r>
+      <w:r>
+        <w:t xml:space="preserve"> </w:t>
+      </w:r>
+      <w:r>
+        <w:t xml:space="preserve">gemengd of te veel modellen numeriek ongeldig; van de 36</w:t>
+      </w:r>
+      <w:r>
+        <w:t xml:space="preserve"> </w:t>
+      </w:r>
+      <w:r>
+        <w:t xml:space="preserve">landbedekkingsvalidaties slaagden er 18. De geclassificeerde rasters zelf zitten</w:t>
+      </w:r>
+      <w:r>
+        <w:t xml:space="preserve"> </w:t>
+      </w:r>
+      <w:r>
+        <w:t xml:space="preserve">niet in het openbare supplement; de auteurs vermelden dat de gebruikte en</w:t>
+      </w:r>
+      <w:r>
+        <w:t xml:space="preserve"> </w:t>
+      </w:r>
+      <w:r>
+        <w:t xml:space="preserve">gemaakte datasets op verzoek verkrijgbaar zijn. Met die rasters zouden ook</w:t>
+      </w:r>
+      <w:r>
+        <w:t xml:space="preserve"> </w:t>
+      </w:r>
+      <w:r>
+        <w:t xml:space="preserve">ruimtelijke samenhang, versnippering, randen en vegetatiemozaïek kunnen worden</w:t>
+      </w:r>
+      <w:r>
+        <w:t xml:space="preserve"> </w:t>
+      </w:r>
+      <w:r>
+        <w:t xml:space="preserve">onderzocht. Het blijven twee momentopnamen binnen 25 plots; zij meten geen</w:t>
+      </w:r>
+      <w:r>
+        <w:t xml:space="preserve"> </w:t>
+      </w:r>
+      <w:r>
+        <w:t xml:space="preserve">jaarlijkse ontwikkeling, vegetatiehoogte, voedsel, nestgelegenheid of andere</w:t>
+      </w:r>
+      <w:r>
+        <w:t xml:space="preserve"> </w:t>
+      </w:r>
+      <w:r>
+        <w:t xml:space="preserve">habitatkwaliteit en bewijzen op zichzelf geen beheereffect.</w:t>
       </w:r>
     </w:p>
     <w:p>
@@ -7432,9 +8173,9 @@
         <w:t xml:space="preserve">publicaties noemen 32–35 stuifkuilen die vanaf 1983 tweemaal per jaar zijn gemeten, 19 permanente vegetatieplots en vergelijkingen van luchtfoto’s en orthofoto’s. De oorspronkelijke tabellen, plot-ID’s en digitale kaartlagen zijn nog niet voldoende geïdentificeerd om deze als afzonderlijke gegevensbron toe te laten.</w:t>
       </w:r>
     </w:p>
-    <w:bookmarkEnd w:id="78"/>
-    <w:bookmarkEnd w:id="79"/>
-    <w:bookmarkStart w:id="80" w:name="verwachte-aanvullingen"/>
+    <w:bookmarkEnd w:id="81"/>
+    <w:bookmarkEnd w:id="82"/>
+    <w:bookmarkStart w:id="83" w:name="Xc540a83ee65aaec11aa446aec0815d16fd21e21"/>
     <w:p>
       <w:pPr>
         <w:pStyle w:val="Heading2"/>
@@ -7497,8 +8238,8 @@
         <w:t xml:space="preserve">Provincie Zuid-Holland heeft toegezegd de kaart te delen zodra zij later in 2026 beschikbaar komt. De kaart kan veranderingen in habitat helpen verklaren, maar is zelf geen soortenwaarneming.</w:t>
       </w:r>
     </w:p>
-    <w:bookmarkEnd w:id="80"/>
-    <w:bookmarkStart w:id="81" w:name="Xbd1d36805349ef5ec39b6efd044fd20b47e23f4"/>
+    <w:bookmarkEnd w:id="83"/>
+    <w:bookmarkStart w:id="84" w:name="X422e6271160c2b04a3b59fb5b59cfcc2e3afc55"/>
     <w:p>
       <w:pPr>
         <w:pStyle w:val="Heading2"/>
@@ -7531,8 +8272,8 @@
         <w:t xml:space="preserve">Algemene verzamelbronnen zoals Observation.org, iNaturalist en eBird worden ook niet opnieuw als zelfstandige Meijendelbron ingevoerd zolang niet is aangetoond dat zij waarnemingen bevatten die ontbreken in NDFF of in de primaire VWG/SOVON-reeksen. Anders zou dezelfde waarneming vooral nogmaals worden opgeslagen.</w:t>
       </w:r>
     </w:p>
-    <w:bookmarkEnd w:id="81"/>
-    <w:bookmarkStart w:id="82" w:name="gebruik-van-dit-register"/>
+    <w:bookmarkEnd w:id="84"/>
+    <w:bookmarkStart w:id="85" w:name="Xb05dec49988a12f7955d21ff17f1c91e4d061eb"/>
     <w:p>
       <w:pPr>
         <w:pStyle w:val="Heading2"/>
@@ -7620,8 +8361,8 @@
         <w:t xml:space="preserve">Pas daarna volgt een afzonderlijk importbesluit.</w:t>
       </w:r>
     </w:p>
-    <w:bookmarkEnd w:id="82"/>
-    <w:bookmarkStart w:id="88" w:name="actieplan"/>
+    <w:bookmarkEnd w:id="85"/>
+    <w:bookmarkStart w:id="91" w:name="X67781990bcb7d7d43cc312a7ef48f37a1f83265"/>
     <w:p>
       <w:pPr>
         <w:pStyle w:val="Heading2"/>
@@ -7653,7 +8394,7 @@
         <w:t xml:space="preserve">bevat alleen waarnemingen die aan de ruimtelijke toelatingsregel voldoen.</w:t>
       </w:r>
     </w:p>
-    <w:bookmarkStart w:id="83" w:name="fase-1-openbare-direct-toetsbare-bronnen"/>
+    <w:bookmarkStart w:id="86" w:name="Xd7f889e2150e602eaeb242f489896c9b52af547"/>
     <w:p>
       <w:pPr>
         <w:pStyle w:val="Heading3"/>
@@ -7740,8 +8481,8 @@
         <w:t xml:space="preserve">.</w:t>
       </w:r>
     </w:p>
-    <w:bookmarkEnd w:id="83"/>
-    <w:bookmarkStart w:id="84" w:name="X1e65d730f223a62ff579853fd3c77c9308748df"/>
+    <w:bookmarkEnd w:id="86"/>
+    <w:bookmarkStart w:id="87" w:name="Xa67120beb48c3916f8a53c623f303ce8b8a6005"/>
     <w:p>
       <w:pPr>
         <w:pStyle w:val="Heading3"/>
@@ -7894,8 +8635,8 @@
         <w:t xml:space="preserve">De kaart in het proefschrift is visueel gecontroleerd en toont 41 punten in Helmduinen, Kijfhoek en Bierlap, maar geen koppelbare plotcodes. Ook de LVD-selectie levert geen betrouwbare vertaling. De reeks blijft kandidaat totdat de oorspronkelijke plotkaart en opnametabellen zijn gevonden.</w:t>
       </w:r>
     </w:p>
-    <w:bookmarkEnd w:id="84"/>
-    <w:bookmarkStart w:id="85" w:name="X6b9d0c88ffcb5584e67daa74c9524b522af67c0"/>
+    <w:bookmarkEnd w:id="87"/>
+    <w:bookmarkStart w:id="88" w:name="Xc96f79f2027e81b7ab280f9bf69df5af8bdf464"/>
     <w:p>
       <w:pPr>
         <w:pStyle w:val="Heading3"/>
@@ -7973,8 +8714,8 @@
         <w:t xml:space="preserve">Voeg de Habitatkaart T1, de landbedekking van 2001 en 2022 en eventueel gevonden remote-sensingrasters toe als omgevingslagen. Zij mogen ecologische veranderingen helpen verklaren, maar worden niet als soortenwaarnemingen behandeld.</w:t>
       </w:r>
     </w:p>
-    <w:bookmarkEnd w:id="85"/>
-    <w:bookmarkStart w:id="86" w:name="vaste-werkwijze-per-bron"/>
+    <w:bookmarkEnd w:id="88"/>
+    <w:bookmarkStart w:id="89" w:name="vaste-werkwijze-per-bron"/>
     <w:p>
       <w:pPr>
         <w:pStyle w:val="Heading3"/>
@@ -7991,8 +8732,8 @@
         <w:t xml:space="preserve">Iedere bron doorloopt dezelfde vijf stappen: een onveranderde bronkopie met checksum bewaren; gegevenswoordenboek en rechten vastleggen; locaties en analyseeenheid controleren; overlap en dubbelen bepalen; pas daarna een reproduceerbare import en analyseview maken. Na iedere statuswijziging worden dit register en de Wordversie meteen bijgewerkt.</w:t>
       </w:r>
     </w:p>
-    <w:bookmarkEnd w:id="86"/>
-    <w:bookmarkStart w:id="87" w:name="dekking-van-de-internetcontrole"/>
+    <w:bookmarkEnd w:id="89"/>
+    <w:bookmarkStart w:id="90" w:name="dekking-van-de-internetcontrole"/>
     <w:p>
       <w:pPr>
         <w:pStyle w:val="Heading3"/>
@@ -8009,9 +8750,9 @@
         <w:t xml:space="preserve">De controle van 26 september 2026 omvatte GBIF, DataCite, Zenodo, Dryad, Figshare, Europe PMC, Naturalis Repository, Wageningen Research e-depot en de repositories van Universiteit Leiden en TU Delft. Algemene aggregators zijn niet als zelfstandige bron opgenomen wanneer zij waarschijnlijk dezelfde waarnemingen als NDFF of primaire collecties bevatten. Een openbare zoekronde kan nooit bewijzen dat geen ongepubliceerde of slecht geïndexeerde bron bestaat; dit register legt daarom ook de zoekdatum en toelatingsreden vast.</w:t>
       </w:r>
     </w:p>
-    <w:bookmarkEnd w:id="87"/>
-    <w:bookmarkEnd w:id="88"/>
-    <w:bookmarkStart w:id="96" w:name="achterliggende-verantwoording"/>
+    <w:bookmarkEnd w:id="90"/>
+    <w:bookmarkEnd w:id="91"/>
+    <w:bookmarkStart w:id="99" w:name="achterliggende-verantwoording"/>
     <w:p>
       <w:pPr>
         <w:pStyle w:val="Heading2"/>
@@ -8028,7 +8769,7 @@
           <w:numId w:val="1005"/>
         </w:numPr>
       </w:pPr>
-      <w:hyperlink r:id="rId89">
+      <w:hyperlink r:id="rId92">
         <w:r>
           <w:rPr>
             <w:rStyle w:val="Hyperlink"/>
@@ -8045,7 +8786,7 @@
           <w:numId w:val="1005"/>
         </w:numPr>
       </w:pPr>
-      <w:hyperlink r:id="rId90">
+      <w:hyperlink r:id="rId93">
         <w:r>
           <w:rPr>
             <w:rStyle w:val="Hyperlink"/>
@@ -8062,7 +8803,7 @@
           <w:numId w:val="1005"/>
         </w:numPr>
       </w:pPr>
-      <w:hyperlink r:id="rId91">
+      <w:hyperlink r:id="rId94">
         <w:r>
           <w:rPr>
             <w:rStyle w:val="Hyperlink"/>
@@ -8079,7 +8820,7 @@
           <w:numId w:val="1005"/>
         </w:numPr>
       </w:pPr>
-      <w:hyperlink r:id="rId92">
+      <w:hyperlink r:id="rId95">
         <w:r>
           <w:rPr>
             <w:rStyle w:val="Hyperlink"/>
@@ -8096,7 +8837,7 @@
           <w:numId w:val="1005"/>
         </w:numPr>
       </w:pPr>
-      <w:hyperlink r:id="rId93">
+      <w:hyperlink r:id="rId96">
         <w:r>
           <w:rPr>
             <w:rStyle w:val="Hyperlink"/>
@@ -8113,7 +8854,7 @@
           <w:numId w:val="1005"/>
         </w:numPr>
       </w:pPr>
-      <w:hyperlink r:id="rId94">
+      <w:hyperlink r:id="rId97">
         <w:r>
           <w:rPr>
             <w:rStyle w:val="Hyperlink"/>
@@ -8130,7 +8871,7 @@
           <w:numId w:val="1005"/>
         </w:numPr>
       </w:pPr>
-      <w:hyperlink r:id="rId95">
+      <w:hyperlink r:id="rId98">
         <w:r>
           <w:rPr>
             <w:rStyle w:val="Hyperlink"/>
@@ -8139,8 +8880,8 @@
         </w:r>
       </w:hyperlink>
     </w:p>
-    <w:bookmarkEnd w:id="96"/>
-    <w:bookmarkEnd w:id="97"/>
+    <w:bookmarkEnd w:id="99"/>
+    <w:bookmarkEnd w:id="100"/>
     <w:sectPr>
       <w:footnotePr>
         <w:numRestart w:val="eachSect"/>

</xml_diff>

<commit_message>
Analyseer stikstof en landgebruik in vogelmodel
</commit_message>
<xml_diff>
--- a/docs/MEIJENDEL_BRONREGISTER.docx
+++ b/docs/MEIJENDEL_BRONREGISTER.docx
@@ -6168,7 +6168,91 @@
         <w:t xml:space="preserve"> </w:t>
       </w:r>
       <w:r>
-        <w:t xml:space="preserve">Geschikt als mogelijke verklarende factor naast soorten- en vegetatiereeksen. Een samenhang bewijst niet dat stikstof de enige oorzaak is.</w:t>
+        <w:t xml:space="preserve">De bron is op 12 oktober 2026 formeel gekoppeld aan de</w:t>
+      </w:r>
+      <w:r>
+        <w:t xml:space="preserve"> </w:t>
+      </w:r>
+      <w:r>
+        <w:t xml:space="preserve">broedvogelreeks. Na toepassing van de Natura 2000-scope en de geldige</w:t>
+      </w:r>
+      <w:r>
+        <w:t xml:space="preserve"> </w:t>
+      </w:r>
+      <w:r>
+        <w:t xml:space="preserve">vogelselectie bevat het stikstofmodel 60.127 soort–plot–jaarrijen uit 674</w:t>
+      </w:r>
+      <w:r>
+        <w:t xml:space="preserve"> </w:t>
+      </w:r>
+      <w:r>
+        <w:t xml:space="preserve">plotjaren in 51 plots, voor 155 soorten en 2005–2023. Het model corrigeert</w:t>
+      </w:r>
+      <w:r>
+        <w:t xml:space="preserve"> </w:t>
+      </w:r>
+      <w:r>
+        <w:t xml:space="preserve">tevens voor tijd, oppervlakte, bron, teller/tellerteam, geregistreerde</w:t>
+      </w:r>
+      <w:r>
+        <w:t xml:space="preserve"> </w:t>
+      </w:r>
+      <w:r>
+        <w:t xml:space="preserve">ervaring, bezoekinspanning, ongunstige bezoeksomstandigheden en vier</w:t>
+      </w:r>
+      <w:r>
+        <w:t xml:space="preserve"> </w:t>
+      </w:r>
+      <w:r>
+        <w:t xml:space="preserve">weermaten. Het verschil tussen plots is een factor 1,157 per</w:t>
+      </w:r>
+      <w:r>
+        <w:t xml:space="preserve"> </w:t>
+      </w:r>
+      <w:r>
+        <w:t xml:space="preserve">standaardafwijking hogere gemiddelde depositie; het verband tussen verandering</w:t>
+      </w:r>
+      <w:r>
+        <w:t xml:space="preserve"> </w:t>
+      </w:r>
+      <w:r>
+        <w:t xml:space="preserve">in depositie en verandering in vogelaantallen binnen dezelfde plot is 1,002,</w:t>
+      </w:r>
+      <w:r>
+        <w:t xml:space="preserve"> </w:t>
+      </w:r>
+      <w:r>
+        <w:t xml:space="preserve">met p = 0,924. Slechts één van vijf ruimtelijke validatieblokken is numeriek</w:t>
+      </w:r>
+      <w:r>
+        <w:t xml:space="preserve"> </w:t>
+      </w:r>
+      <w:r>
+        <w:t xml:space="preserve">geldig en dat voorspelt slechter; de tijdstoets op 2019–2023 valt numeriek uit.</w:t>
+      </w:r>
+      <w:r>
+        <w:t xml:space="preserve"> </w:t>
+      </w:r>
+      <w:r>
+        <w:t xml:space="preserve">De bron blijft geschikt als mogelijke verklarende factor, maar levert in deze</w:t>
+      </w:r>
+      <w:r>
+        <w:t xml:space="preserve"> </w:t>
+      </w:r>
+      <w:r>
+        <w:t xml:space="preserve">modelopzet geen bestendig voorspelmodel van vogelverandering en gaat niet door</w:t>
+      </w:r>
+      <w:r>
+        <w:t xml:space="preserve"> </w:t>
+      </w:r>
+      <w:r>
+        <w:t xml:space="preserve">naar power. Een samenhang bewijst bovendien niet dat stikstof de enige oorzaak</w:t>
+      </w:r>
+      <w:r>
+        <w:t xml:space="preserve"> </w:t>
+      </w:r>
+      <w:r>
+        <w:t xml:space="preserve">is.</w:t>
       </w:r>
     </w:p>
     <w:bookmarkEnd w:id="48"/>
@@ -6232,7 +6316,91 @@
         <w:t xml:space="preserve"> </w:t>
       </w:r>
       <w:r>
-        <w:t xml:space="preserve">Laat veranderingen in de ruimtelijke omgeving van plots zien. De meetjaren zijn niet jaarlijks beschikbaar.</w:t>
+        <w:t xml:space="preserve">De bron bevat vijf kaartmomenten: 1996, 2010, 2015, 2017</w:t>
+      </w:r>
+      <w:r>
+        <w:t xml:space="preserve"> </w:t>
+      </w:r>
+      <w:r>
+        <w:t xml:space="preserve">en 2022. De codes van 1996 zijn niet inhoudelijk aan de latere klassen</w:t>
+      </w:r>
+      <w:r>
+        <w:t xml:space="preserve"> </w:t>
+      </w:r>
+      <w:r>
+        <w:t xml:space="preserve">geharmoniseerd en zijn daarom niet stilzwijgend in het vogelmodel opgenomen.</w:t>
+      </w:r>
+      <w:r>
+        <w:t xml:space="preserve"> </w:t>
+      </w:r>
+      <w:r>
+        <w:t xml:space="preserve">Na toepassing van de Natura 2000-scope en de geldige vogelselectie gebruiken</w:t>
+      </w:r>
+      <w:r>
+        <w:t xml:space="preserve"> </w:t>
+      </w:r>
+      <w:r>
+        <w:t xml:space="preserve">de modellen voor open natuurlijk terrein, bos en water 15.039</w:t>
+      </w:r>
+      <w:r>
+        <w:t xml:space="preserve"> </w:t>
+      </w:r>
+      <w:r>
+        <w:t xml:space="preserve">soort–plot–jaarrijen uit 168 plotjaren in 49 plots, voor 155 soorten en de vier</w:t>
+      </w:r>
+      <w:r>
+        <w:t xml:space="preserve"> </w:t>
+      </w:r>
+      <w:r>
+        <w:t xml:space="preserve">kaartjaren 2010–2022. In de vijf analyses waarin landgebruik voorkomt zijn van</w:t>
+      </w:r>
+      <w:r>
+        <w:t xml:space="preserve"> </w:t>
+      </w:r>
+      <w:r>
+        <w:t xml:space="preserve">de tien volledige basis- en omgevingsmodellen twee geldig; geen modelpaar is</w:t>
+      </w:r>
+      <w:r>
+        <w:t xml:space="preserve"> </w:t>
+      </w:r>
+      <w:r>
+        <w:t xml:space="preserve">aan beide zijden geldig. Van dertig validaties zijn er elf geldig en negentien</w:t>
+      </w:r>
+      <w:r>
+        <w:t xml:space="preserve"> </w:t>
+      </w:r>
+      <w:r>
+        <w:t xml:space="preserve">ongeldig. Bos verbetert de logscore in vier van vier geldige ruimtelijke</w:t>
+      </w:r>
+      <w:r>
+        <w:t xml:space="preserve"> </w:t>
+      </w:r>
+      <w:r>
+        <w:t xml:space="preserve">blokken en water in</w:t>
+      </w:r>
+      <w:r>
+        <w:t xml:space="preserve"> </w:t>
+      </w:r>
+      <w:r>
+        <w:t xml:space="preserve">twee van twee, maar geen van de vijf tijdstoetsen slaagt. De bron kan dus</w:t>
+      </w:r>
+      <w:r>
+        <w:t xml:space="preserve"> </w:t>
+      </w:r>
+      <w:r>
+        <w:t xml:space="preserve">ruimtelijke verschillen tussen plots helpen beschrijven, maar levert in deze</w:t>
+      </w:r>
+      <w:r>
+        <w:t xml:space="preserve"> </w:t>
+      </w:r>
+      <w:r>
+        <w:t xml:space="preserve">modelopzet geen bestendig voorspelmodel van vogelverandering en gaat niet door</w:t>
+      </w:r>
+      <w:r>
+        <w:t xml:space="preserve"> </w:t>
+      </w:r>
+      <w:r>
+        <w:t xml:space="preserve">naar power. De kaartmomenten zijn niet jaarlijks beschikbaar.</w:t>
       </w:r>
     </w:p>
     <w:bookmarkEnd w:id="49"/>
@@ -6331,40 +6499,156 @@
       </w:r>
       <w:r>
         <w:t xml:space="preserve">downloadportaal.</w:t>
+      </w:r>
+    </w:p>
+    <w:p>
+      <w:pPr>
+        <w:pStyle w:val="BodyText"/>
+      </w:pPr>
+      <w:r>
+        <w:rPr>
+          <w:b/>
+          <w:bCs/>
+        </w:rPr>
+        <w:t xml:space="preserve">Omvang en periode.</w:t>
+      </w:r>
+      <w:r>
+        <w:t xml:space="preserve"> </w:t>
+      </w:r>
+      <w:r>
+        <w:t xml:space="preserve">Kandidaatbron, niet in de levende database opgenomen.</w:t>
+      </w:r>
+      <w:r>
+        <w:t xml:space="preserve"> </w:t>
+      </w:r>
+      <w:r>
+        <w:t xml:space="preserve">De uitgevoerde proef gebruikt tien officiële WMS-beelden: RGB en CIR voor</w:t>
+      </w:r>
+      <w:r>
+        <w:t xml:space="preserve"> </w:t>
+      </w:r>
+      <w:r>
+        <w:t xml:space="preserve">2016, 2020, 2022, 2023 en 2024. Elk beeld is op het gedeelde AHN-rooster</w:t>
+      </w:r>
+      <w:r>
+        <w:t xml:space="preserve"> </w:t>
+      </w:r>
+      <w:r>
+        <w:t xml:space="preserve">samengesteld tot 3.440 bij 3.018 pixels van 2 meter. De brongeometrie bevat 55</w:t>
+      </w:r>
+      <w:r>
+        <w:t xml:space="preserve"> </w:t>
+      </w:r>
+      <w:r>
+        <w:t xml:space="preserve">vogelplots; na uitsluiting van M66 en M91 zijn 53 Natura 2000-plots</w:t>
+      </w:r>
+      <w:r>
+        <w:t xml:space="preserve"> </w:t>
+      </w:r>
+      <w:r>
+        <w:t xml:space="preserve">geanalyseerd. De officiële 25-centimeterlagen bevatten geen RGB/CIR-paar voor</w:t>
+      </w:r>
+      <w:r>
+        <w:t xml:space="preserve"> </w:t>
+      </w:r>
+      <w:r>
+        <w:t xml:space="preserve">2021.</w:t>
+      </w:r>
+    </w:p>
+    <w:p>
+      <w:pPr>
+        <w:pStyle w:val="BodyText"/>
+      </w:pPr>
+      <w:r>
+        <w:rPr>
+          <w:b/>
+          <w:bCs/>
+        </w:rPr>
+        <w:t xml:space="preserve">Gebruik en grens.</w:t>
+      </w:r>
+      <w:r>
+        <w:t xml:space="preserve"> </w:t>
+      </w:r>
+      <w:r>
+        <w:t xml:space="preserve">De beperkte classificatieproef is uitgevoerd. De ruwe</w:t>
+      </w:r>
+      <w:r>
+        <w:t xml:space="preserve"> </w:t>
+      </w:r>
+      <w:r>
+        <w:t xml:space="preserve">RGB/CIR-kenmerken behalen bij overdracht van 2020 naar 2023 macro-F1 0,469 en</w:t>
+      </w:r>
+      <w:r>
+        <w:t xml:space="preserve"> </w:t>
+      </w:r>
+      <w:r>
+        <w:t xml:space="preserve">in omgekeerde richting 0,420; beide blijven onder de vooraf gekozen grens van</w:t>
+      </w:r>
+      <w:r>
+        <w:t xml:space="preserve"> </w:t>
+      </w:r>
+      <w:r>
+        <w:t xml:space="preserve">0,60. Radiometrische normalisatie en beeldtextuur verbeteren dit niet. De</w:t>
+      </w:r>
+      <w:r>
+        <w:t xml:space="preserve"> </w:t>
+      </w:r>
+      <w:r>
+        <w:t xml:space="preserve">voorspelde houtige bedekking correleert in 24 afzonderlijk begrensde plots in</w:t>
+      </w:r>
+      <w:r>
+        <w:t xml:space="preserve"> </w:t>
+      </w:r>
+      <w:r>
+        <w:t xml:space="preserve">2022 wel met de onafhankelijke landbedekking, 0,743 tot 0,869, maar de</w:t>
+      </w:r>
+      <w:r>
+        <w:t xml:space="preserve"> </w:t>
+      </w:r>
+      <w:r>
+        <w:t xml:space="preserve">gemiddelde absolute fout blijft 10,2 tot 10,6 procentpunt. Water en kaal zand</w:t>
+      </w:r>
+      <w:r>
+        <w:t xml:space="preserve"> </w:t>
+      </w:r>
+      <w:r>
+        <w:t xml:space="preserve">zijn zonder pixelreferenties niet afzonderlijk gevalideerd. De kandidaatbron</w:t>
+      </w:r>
+      <w:r>
+        <w:t xml:space="preserve"> </w:t>
+      </w:r>
+      <w:r>
+        <w:t xml:space="preserve">wordt daarom niet analyseklaar verklaard en niet tot een jaarlijkse reeks</w:t>
+      </w:r>
+      <w:r>
+        <w:t xml:space="preserve"> </w:t>
+      </w:r>
+      <w:r>
+        <w:t xml:space="preserve">uitgebreid. Een vervolg vereist onafhankelijke trainingsvlakken of de</w:t>
+      </w:r>
+      <w:r>
+        <w:t xml:space="preserve"> </w:t>
+      </w:r>
+      <w:r>
+        <w:t xml:space="preserve">oorspronkelijke classificatierasters. Luchtfoto's meten geen vegetatiehoogte,</w:t>
+      </w:r>
+      <w:r>
+        <w:t xml:space="preserve"> </w:t>
+      </w:r>
+      <w:r>
+        <w:t xml:space="preserve">maken AHN1 niet vergelijkbaar en mogen niet rechtstreeks als causale</w:t>
+      </w:r>
+      <w:r>
+        <w:t xml:space="preserve"> </w:t>
+      </w:r>
+      <w:r>
+        <w:t xml:space="preserve">verklaring van vogelverandering worden gebruikt.</w:t>
       </w:r>
     </w:p>
     <w:bookmarkEnd w:id="51"/>
     <w:bookmarkEnd w:id="52"/>
     <w:bookmarkEnd w:id="53"/>
     <w:bookmarkStart w:id="61" w:name="X692b0a71312b2a939db271d079fb23757bfc15a"/>
-    <w:p>
-      <w:pPr>
-        <w:pStyle w:val="BodyText"/>
-      </w:pPr>
-      <w:r>
-        <w:rPr>
-          <w:b/>
-        </w:rPr>
-        <w:t>Omvang en periode.</w:t>
-      </w:r>
-      <w:r>
-        <w:t xml:space="preserve"> Kandidaatbron, niet in de levende database opgenomen. De uitgevoerde proef gebruikt tien officiële WMS-beelden: RGB en CIR voor 2016, 2020, 2022, 2023 en 2024. Elk beeld is op het gedeelde AHN-rooster samengesteld tot 3.440 bij 3.018 pixels van 2 meter. De brongeometrie bevat 55 vogelplots; na uitsluiting van M66 en M91 zijn 53 Natura 2000-plots geanalyseerd. De officiële 25-centimeterlagen bevatten geen RGB/CIR-paar voor 2021.</w:t>
-      </w:r>
-    </w:p>
-    <w:p>
-      <w:pPr>
-        <w:pStyle w:val="BodyText"/>
-      </w:pPr>
-      <w:r>
-        <w:rPr>
-          <w:b/>
-        </w:rPr>
-        <w:t>Gebruik en grens.</w:t>
-      </w:r>
-      <w:r>
-        <w:t xml:space="preserve"> De beperkte classificatieproef is uitgevoerd. De ruwe RGB/CIR-kenmerken behalen bij overdracht van 2020 naar 2023 macro-F1 0,469 en in omgekeerde richting 0,420; beide blijven onder de vooraf gekozen grens van 0,60. Radiometrische normalisatie en beeldtextuur verbeteren dit niet. De voorspelde houtige bedekking correleert in 24 afzonderlijk begrensde plots in 2022 wel met de onafhankelijke landbedekking, 0,743 tot 0,869, maar de gemiddelde absolute fout blijft 10,2 tot 10,6 procentpunt. Water en kaal zand zijn zonder pixelreferenties niet afzonderlijk gevalideerd. De kandidaatbron wordt daarom niet analyseklaar verklaard en niet tot een jaarlijkse reeks uitgebreid. Een vervolg vereist onafhankelijke trainingsvlakken of de oorspronkelijke classificatierasters. Luchtfoto's meten geen vegetatiehoogte, maken AHN1 niet vergelijkbaar en mogen niet rechtstreeks als causale verklaring van vogelverandering worden gebruikt.</w:t>
-      </w:r>
-    </w:p>
     <w:p>
       <w:pPr>
         <w:pStyle w:val="Heading2"/>

</xml_diff>

<commit_message>
Integreer plotgebieden in levende database
</commit_message>
<xml_diff>
--- a/docs/MEIJENDEL_BRONREGISTER.docx
+++ b/docs/MEIJENDEL_BRONREGISTER.docx
@@ -2,24 +2,26 @@
 <file path=word/document.xml><?xml version="1.0" encoding="utf-8"?>
 <w:document xmlns:w="http://schemas.openxmlformats.org/wordprocessingml/2006/main" xmlns:m="http://schemas.openxmlformats.org/officeDocument/2006/math" xmlns:r="http://schemas.openxmlformats.org/officeDocument/2006/relationships" xmlns:o="urn:schemas-microsoft-com:office:office" xmlns:v="urn:schemas-microsoft-com:vml" xmlns:w10="urn:schemas-microsoft-com:office:word" xmlns:a="http://schemas.openxmlformats.org/drawingml/2006/main" xmlns:pic="http://schemas.openxmlformats.org/drawingml/2006/picture" xmlns:wp="http://schemas.openxmlformats.org/drawingml/2006/wordprocessingDrawing">
   <w:body>
-    <w:bookmarkStart w:id="97" w:name="Xdea145a7474320bcc321aebaf5687f9ab4d02fb"/>
-    <w:p>
-      <w:pPr>
-        <w:pStyle w:val="Title"/>
-      </w:pPr>
-      <w:r>
-        <w:rPr>
-          <w:color w:val="000000"/>
-        </w:rPr>
+    <w:p>
+      <w:pPr>
+        <w:pStyle w:val="Heading1"/>
+      </w:pPr>
+      <w:bookmarkStart w:id="9" w:name="_dea145a7474320bcc321aebaf5687f9ab4d02fb"/>
+      <w:r>
         <w:t xml:space="preserve">Bronregister ecologische gegevens Meijendel</w:t>
       </w:r>
+      <w:bookmarkEnd w:id="9"/>
     </w:p>
     <w:p>
       <w:pPr>
         <w:pStyle w:val="FirstParagraph"/>
       </w:pPr>
       <w:r>
-        <w:t>Stand: 13 oktober 2026.</w:t>
+        <w:rPr>
+          <w:b/>
+          <w:bCs/>
+        </w:rPr>
+        <w:t xml:space="preserve">Stand: 13 oktober 2026.</w:t>
       </w:r>
     </w:p>
     <w:p>
@@ -32,6 +34,7 @@
     </w:p>
     <w:p>
       <w:pPr>
+        <w:pStyle w:val="FirstParagraph"/>
         <w:numPr>
           <w:ilvl w:val="0"/>
           <w:numId w:val="1001"/>
@@ -43,6 +46,7 @@
     </w:p>
     <w:p>
       <w:pPr>
+        <w:pStyle w:val="FirstParagraph"/>
         <w:numPr>
           <w:ilvl w:val="0"/>
           <w:numId w:val="1001"/>
@@ -54,6 +58,7 @@
     </w:p>
     <w:p>
       <w:pPr>
+        <w:pStyle w:val="FirstParagraph"/>
         <w:numPr>
           <w:ilvl w:val="0"/>
           <w:numId w:val="1001"/>
@@ -65,6 +70,7 @@
     </w:p>
     <w:p>
       <w:pPr>
+        <w:pStyle w:val="FirstParagraph"/>
         <w:numPr>
           <w:ilvl w:val="0"/>
           <w:numId w:val="1001"/>
@@ -82,17 +88,19 @@
         <w:t xml:space="preserve">Het register beschrijft meet- en waarnemingsbronnen en de belangrijkste verklarende omgevingslagen, geen afzonderlijke soorten. Taxonomische referentietabellen, berekende analyse-uitkomsten en technische hulptabellen vallen buiten dit overzicht. Details over tabellen, imports en protocolcodes staan in de achterliggende projectdocumentatie.</w:t>
       </w:r>
     </w:p>
-    <w:bookmarkStart w:id="9" w:name="de-statussen"/>
     <w:p>
       <w:pPr>
         <w:pStyle w:val="Heading2"/>
       </w:pPr>
+      <w:bookmarkStart w:id="10" w:name="_2ca0d7580c0a389f0f36b624cbb3f91d53fb356"/>
       <w:r>
         <w:t xml:space="preserve">De statussen</w:t>
       </w:r>
-    </w:p>
-    <w:p>
-      <w:pPr>
+      <w:bookmarkEnd w:id="10"/>
+    </w:p>
+    <w:p>
+      <w:pPr>
+        <w:pStyle w:val="FirstParagraph"/>
         <w:numPr>
           <w:ilvl w:val="0"/>
           <w:numId w:val="1002"/>
@@ -111,6 +119,7 @@
     </w:p>
     <w:p>
       <w:pPr>
+        <w:pStyle w:val="FirstParagraph"/>
         <w:numPr>
           <w:ilvl w:val="0"/>
           <w:numId w:val="1002"/>
@@ -129,6 +138,7 @@
     </w:p>
     <w:p>
       <w:pPr>
+        <w:pStyle w:val="FirstParagraph"/>
         <w:numPr>
           <w:ilvl w:val="0"/>
           <w:numId w:val="1002"/>
@@ -147,6 +157,7 @@
     </w:p>
     <w:p>
       <w:pPr>
+        <w:pStyle w:val="FirstParagraph"/>
         <w:numPr>
           <w:ilvl w:val="0"/>
           <w:numId w:val="1002"/>
@@ -173,6 +184,7 @@
     </w:p>
     <w:p>
       <w:pPr>
+        <w:pStyle w:val="FirstParagraph"/>
         <w:numPr>
           <w:ilvl w:val="0"/>
           <w:numId w:val="1003"/>
@@ -184,6 +196,7 @@
     </w:p>
     <w:p>
       <w:pPr>
+        <w:pStyle w:val="FirstParagraph"/>
         <w:numPr>
           <w:ilvl w:val="0"/>
           <w:numId w:val="1003"/>
@@ -195,6 +208,7 @@
     </w:p>
     <w:p>
       <w:pPr>
+        <w:pStyle w:val="FirstParagraph"/>
         <w:numPr>
           <w:ilvl w:val="0"/>
           <w:numId w:val="1003"/>
@@ -206,6 +220,7 @@
     </w:p>
     <w:p>
       <w:pPr>
+        <w:pStyle w:val="FirstParagraph"/>
         <w:numPr>
           <w:ilvl w:val="0"/>
           <w:numId w:val="1003"/>
@@ -301,7 +316,21 @@
         <w:pStyle w:val="BodyText"/>
       </w:pPr>
       <w:r>
-        <w:t xml:space="preserve">De aanvulling maakt overeenkomsten tussen bronnen vindbaar. In twee stappen hebben 2.509 bestaande registraties alsnog een primaire soortgroep gekregen, waarvan 1.226 in de laatste stap. Alle 87 eerder onopgeloste PQ-naamteksten uit 1981–2025 zijn onderbouwd met code, wetenschappelijke en Nederlandse naam uit Floranld_2020. Deze openbare Turboveg-referentielijst, aangeboden op 10 maart 2026 via www.synbiosys.alterra.nl/turboveg/, bevat 17.468 codes. De oorspronkelijke PQ-waarden en eerdere besluiten blijven behouden.</w:t>
+        <w:t xml:space="preserve">De aanvulling maakt overeenkomsten tussen bronnen vindbaar. In twee stappen hebben 2.509 bestaande registraties alsnog een primaire soortgroep gekregen, waarvan 1.226 in de laatste stap. Alle 87 eerder onopgeloste PQ-naamteksten uit 1981–2025 zijn onderbouwd met code, wetenschappelijke en Nederlandse naam uit Floranld_2020. Deze openbare Turboveg-referentielijst, aangeboden op 10 maart 2026 via</w:t>
+      </w:r>
+      <w:r>
+        <w:t xml:space="preserve"> </w:t>
+      </w:r>
+      <w:hyperlink r:id="rId11">
+        <w:r>
+          <w:rPr>
+            <w:rStyle w:val="Hyperlink"/>
+          </w:rPr>
+          <w:t xml:space="preserve">www.synbiosys.alterra.nl/turboveg/</w:t>
+        </w:r>
+      </w:hyperlink>
+      <w:r>
+        <w:t xml:space="preserve">, bevat 17.468 codes. De oorspronkelijke PQ-waarden en eerdere besluiten blijven behouden.</w:t>
       </w:r>
     </w:p>
     <w:p>
@@ -336,15 +365,15 @@
         <w:t xml:space="preserve">Twee oorspronkelijke actieve bronbesluiten blijven inhoudelijk onbeoordeeld en zonder biologisch doeltaxon. Naturalis-Indet. benoemt geen taxon; zijn ene collectieobject uit 2018 is nu via een aanvullende, uitdrukkelijk onbepaalde operationele koppeling centraal bereikbaar. Bij Toendrarietgans ontbreekt de wetenschappelijke bronnaam en strookt lokale code 1582 niet met de actuele EURING-code 01574. Deze bronregel wordt alleen gebruikt in twee beleidsreferentierijen en niet in vogelwaarnemingen; een nieuwe waarneming met deze onopgeloste sleutel wordt geweigerd. De 263 oorspronkelijke vogelnaamgebruiken, koppelingnummers en bronbesluiten zijn volledig bewaard. De eerdere registeraanvulling en taxonfusie en de huidige volledige waarnemingskoppeling zijn afzonderlijk gecontroleerd. Website, dashboard en Shiny zijn niet aangepast. Details en herstelbewijs staan in docs/database/TAXONREGISTER.md.</w:t>
       </w:r>
     </w:p>
-    <w:bookmarkEnd w:id="9"/>
-    <w:bookmarkStart w:id="10" w:name="overkoepelende-analysegeschiktheid"/>
     <w:p>
       <w:pPr>
         <w:pStyle w:val="Heading2"/>
       </w:pPr>
+      <w:bookmarkStart w:id="12" w:name="_4a53154a1633e588416373f70b0c468114c0efc"/>
       <w:r>
         <w:t xml:space="preserve">Overkoepelende analysegeschiktheid</w:t>
       </w:r>
+      <w:bookmarkEnd w:id="12"/>
     </w:p>
     <w:p>
       <w:pPr>
@@ -692,15 +721,15 @@
         <w:t xml:space="preserve">wordt hieronder de primaire bronorganisatie of uitgever bedoeld voor zover die nu bekend is. Het is geen afzonderlijke uitspraak over juridisch eigendom of auteursrecht.</w:t>
       </w:r>
     </w:p>
-    <w:bookmarkEnd w:id="10"/>
-    <w:bookmarkStart w:id="11" w:name="beheerregel"/>
     <w:p>
       <w:pPr>
         <w:pStyle w:val="Heading2"/>
       </w:pPr>
+      <w:bookmarkStart w:id="13" w:name="_beheerregel"/>
       <w:r>
         <w:t xml:space="preserve">Beheerregel</w:t>
       </w:r>
+      <w:bookmarkEnd w:id="13"/>
     </w:p>
     <w:p>
       <w:pPr>
@@ -710,12 +739,11 @@
         <w:t xml:space="preserve">Iedere ontdekking, levering, import, verplaatsing, uitsluiting of nieuwe beoordeling van een Meijendel-gegevensbron wordt in dit document verwerkt. Dat geldt ook wanneer eigenaar, omvang, periode, locatiekwaliteit, rechten, overlap, validatiestatus of statistische bruikbaarheid verandert. Daarbij worden steeds de analytische database MySQL Meijendel, de MySQL contextdatabase Meijendel_bronnen en de kandidaatbronnen gezamenlijk gecontroleerd. Iedere wijziging van Meijendel vereist ook de volledige voor- en nacontrole van de bereikbaarheid van alle soortwaarnemingen via het centrale taxonregister. De Markdown-versie is leidend; de Wordversie wordt in dezelfde wijziging inhoudelijk gelijkgetrokken, gerenderd en gecontroleerd.</w:t>
       </w:r>
     </w:p>
-    <w:bookmarkEnd w:id="11"/>
-    <w:bookmarkStart w:id="51" w:name="bronnen-in-mysql-database-meijendel"/>
     <w:p>
       <w:pPr>
         <w:pStyle w:val="Heading2"/>
       </w:pPr>
+      <w:bookmarkStart w:id="14" w:name="_c07dfd40f027bce65d2d0499dc5da8ab7f6fd0f"/>
       <w:r>
         <w:t xml:space="preserve">1. Bronnen in MySQL-database</w:t>
       </w:r>
@@ -728,15 +756,17 @@
         </w:rPr>
         <w:t xml:space="preserve">Meijendel</w:t>
       </w:r>
-    </w:p>
-    <w:bookmarkStart w:id="12" w:name="Xccd8cb4345e3f59364194a2576f706cc2c0a66e"/>
+      <w:bookmarkEnd w:id="14"/>
+    </w:p>
     <w:p>
       <w:pPr>
         <w:pStyle w:val="Heading3"/>
       </w:pPr>
+      <w:bookmarkStart w:id="15" w:name="_32ab8fbd5be08d3f325e2553cd15813ff7e9c1f"/>
       <w:r>
         <w:t xml:space="preserve">1.1. Vogelgegevens van Vogelwerkgroep Meijendel en SOVON</w:t>
       </w:r>
+      <w:bookmarkEnd w:id="15"/>
     </w:p>
     <w:p>
       <w:pPr>
@@ -848,7 +878,7 @@
         <w:t xml:space="preserve"> </w:t>
       </w:r>
       <w:r>
-        <w:t xml:space="preserve">staan; omgekeerd ontbreekt geen bestaande SOVON-bron-ID in de nieuwe levering. Bij 2.629 gedeelde bron-ID’s levert SOVON broedcode 0 terwijl de database</w:t>
+        <w:t xml:space="preserve">staan; omgekeerd ontbreekt geen bestaande SOVON-bron-ID in de nieuwe levering. Bij 2.629 gedeelde bron-ID's levert SOVON broedcode 0 terwijl de database</w:t>
       </w:r>
       <w:r>
         <w:t xml:space="preserve"> </w:t>
@@ -965,7 +995,7 @@
         <w:t xml:space="preserve">jrvslg_m</w:t>
       </w:r>
       <w:r>
-        <w:t xml:space="preserve">-resultaat in de volledige jaarverslagreeks 1958-2025. Als zo’n soort in een geteld jaarverslagplot ontbreekt, wordt de soort-plotjaarcombinatie als nul behandeld; het is niet vereist dat de soort in hetzelfde kalenderjaar elders is vastgesteld. Deze waarde is geen letterlijke bronnul, krijgt daarom de status</w:t>
+        <w:t xml:space="preserve">-resultaat in de volledige jaarverslagreeks 1958-2025. Als zo'n soort in een geteld jaarverslagplot ontbreekt, wordt de soort-plotjaarcombinatie als nul behandeld; het is niet vereist dat de soort in hetzelfde kalenderjaar elders is vastgesteld. Deze waarde is geen letterlijke bronnul, krijgt daarom de status</w:t>
       </w:r>
       <w:r>
         <w:t xml:space="preserve"> </w:t>
@@ -2146,7 +2176,7 @@
         <w:t xml:space="preserve"> </w:t>
       </w:r>
       <w:r>
-        <w:t xml:space="preserve">blijft voor meeuwen leidend; zonder zo’n regel mag de SOVON-waarde aanvullen of corrigeren. Een ontbrekende teller mag vanuit het jaarverslag worden toegevoegd wanneer kavel en waarnemer ondubbelzinnig zijn en een bestaande code beschikbaar is. De Horsten wordt volledig genegeerd. Niet-conflicterende letterlijke SOVON-nullen worden zonder nieuwe jaarbeslissing opgenomen; niet tot individuele bronregels herleidbare aggregaatvermeldingen worden niet als formeel afgekeurde waarnemingen gereconstrueerd. Ieder jaar wordt eerst volledig vergeleken. Nieuwe soortenconflicten, nieuwe gegevensmodellen en wel individueel herleidbare afkeuringsinformatie blijven afzonderlijke beslispunten.</w:t>
+        <w:t xml:space="preserve">blijft voor meeuwen leidend; zonder zo'n regel mag de SOVON-waarde aanvullen of corrigeren. Een ontbrekende teller mag vanuit het jaarverslag worden toegevoegd wanneer kavel en waarnemer ondubbelzinnig zijn en een bestaande code beschikbaar is. De Horsten wordt volledig genegeerd. Niet-conflicterende letterlijke SOVON-nullen worden zonder nieuwe jaarbeslissing opgenomen; niet tot individuele bronregels herleidbare aggregaatvermeldingen worden niet als formeel afgekeurde waarnemingen gereconstrueerd. Ieder jaar wordt eerst volledig vergeleken. Nieuwe soortenconflicten, nieuwe gegevensmodellen en wel individueel herleidbare afkeuringsinformatie blijven afzonderlijke beslispunten.</w:t>
       </w:r>
     </w:p>
     <w:p>
@@ -3058,15 +3088,15 @@
         <w:t xml:space="preserve">. De herberekende hoofd-TRIM-uitvoer over 1958-2025 bevat 156 soorten in de statuslaag, 135 soorten met minimaal één indexreeks en 93 soorten met een brugbare reeks in beide modelperioden. De Sandra-uitvoer over 25 plots in 1997-2022 bevat 132 positief waargenomen soorten en 110 formele soorttrends. Deze poort is ook de standaard voor datasets waarmee de power voor relaties met vegetatieontwikkeling of beheermaatregelen wordt beoordeeld; ontbrekende bronwaarden worden alleen als afwezigheid gebruikt wanneer de toepasselijke bronregel dat uitdrukkelijk rechtvaardigt.</w:t>
       </w:r>
     </w:p>
-    <w:bookmarkEnd w:id="12"/>
-    <w:bookmarkStart w:id="13" w:name="provinciale-permanente-kwadraten"/>
     <w:p>
       <w:pPr>
         <w:pStyle w:val="Heading3"/>
       </w:pPr>
+      <w:bookmarkStart w:id="16" w:name="_9645acbfea6b379f23d12aeedc36c987000825a"/>
       <w:r>
         <w:t xml:space="preserve">1.2. Provinciale permanente kwadraten</w:t>
       </w:r>
+      <w:bookmarkEnd w:id="16"/>
     </w:p>
     <w:p>
       <w:pPr>
@@ -3158,29 +3188,45 @@
         <w:t xml:space="preserve">De 53.122 provinciale taxonregels uit 1981–2025 zijn lokaal en op de VPS rechtstreeks verbonden met het centrale taxonregister. De 714 oorspronkelijke taxonvermeldingen zijn daar met alle bronvelden behouden; de afzonderlijke PQ-taxoncatalogus is verwijderd. De 2.007 opnamen en de 513 gepubliceerde plot-jaaruitkomsten zijn ongewijzigd. Daarnaast zijn 644 vermoedelijk verwante LVD-bronopnamen met 16.627 resultaten uit 1981–2015 binnen de PQ-tabellen bijeengebracht. Zij behouden alle bronwaarden en 652 mogelijke opnamekoppelingen en tellen niet zelfstandig mee. De oorspronkelijke externe rijen zijn pas na inhoudscontrole verwijderd. De volledige migratie, het terugdraaien en het herstel uit back-up zijn beproefd. De gecontroleerde publicatie naar website, dashboard en Shiny is op 28 september om 15:33 uur geslaagd; hun bestaande provinciale uitkomsten zijn gelijk gebleven.</w:t>
       </w:r>
     </w:p>
-    <w:bookmarkEnd w:id="13"/>
-    <w:bookmarkStart w:id="14" w:name="Xded6c184b9a569c146345b6e935b052f391caf7"/>
-    <w:p>
-      <w:pPr>
-        <w:pStyle w:val="BodyText"/>
-      </w:pPr>
-      <w:r>
-        <w:rPr>
-          <w:b/>
-        </w:rPr>
-        <w:t xml:space="preserve">Vergelijking met NDFF, 10 oktober 2026. </w:t>
-      </w:r>
-      <w:r>
-        <w:t>De eerdere uitkomst dat 1.039 van 2.007 provinciale opnamen uit 1981–2025 in de openbare NDFF-download herkenbaar waren, was een resultaat van de toenmalige strikte matchmethode, niet een maat voor volledige NDFF-dekking. Binnen het huidige Meijendelgebied liggen 1.363 provinciale opnamen; 897 daarvan matchen strikt met de openbare export en 916 na een voorlopige proef met de gemelde verschuiving van beide coördinaten met 5 meter. Naamvarianten leveren op opnameniveau geen extra matches op. Van de 434 provinciale opnamen binnen Meijendel uit 2018–2025 blijven 91 herkenbaar. Afzonderlijk zijn bij 127 opnamen kandidaatmatches gevonden in de beveiligde, openbaar vervaagde NDFF-gegevens; deze kunnen overlappen met de openbare matches en worden niet opgeteld. De reden voor de overige niet-matches staat niet vast. De provinciale PQ-reeks blijft primair; NDFF-PQ telt niet als een tweede opname mee. De methode en de uitsplitsing naar taxonregels staan in docs/bronnen/bronvergelijkingen/NDFF_STAGINGDATASET.md.</w:t>
+    <w:p>
+      <w:pPr>
+        <w:pStyle w:val="BodyText"/>
+      </w:pPr>
+      <w:r>
+        <w:rPr>
+          <w:b/>
+          <w:bCs/>
+        </w:rPr>
+        <w:t xml:space="preserve">Vergelijking met NDFF, 10 oktober 2026.</w:t>
+      </w:r>
+      <w:r>
+        <w:t xml:space="preserve"> </w:t>
+      </w:r>
+      <w:r>
+        <w:t xml:space="preserve">De eerdere uitkomst dat 1.039 van 2.007 provinciale opnamen uit 1981–2025 in de openbare NDFF-download herkenbaar waren, was een resultaat van de toenmalige strikte matchmethode, niet een maat voor volledige NDFF-dekking. Binnen het huidige Meijendelgebied liggen 1.363 provinciale opnamen; 897 daarvan matchen strikt met de openbare export en 916 na een voorlopige proef met de gemelde verschuiving van beide coördinaten met 5 meter. Naamvarianten leveren op opnameniveau geen extra matches op. Van de 434 provinciale opnamen binnen Meijendel uit 2018–2025 blijven 91 herkenbaar. Afzonderlijk zijn bij 127 opnamen kandidaatmatches gevonden in de beveiligde, openbaar vervaagde NDFF-gegevens; deze kunnen overlappen met de openbare matches en worden niet opgeteld. De reden voor de overige niet-matches staat niet vast. De provinciale PQ-reeks blijft primair; NDFF-PQ telt niet als een tweede opname mee. De methode en de uitsplitsing naar taxonregels staan in</w:t>
+      </w:r>
+      <w:r>
+        <w:t xml:space="preserve"> </w:t>
+      </w:r>
+      <w:r>
+        <w:rPr>
+          <w:rStyle w:val="VerbatimChar"/>
+        </w:rPr>
+        <w:t xml:space="preserve">docs/bronnen/bronvergelijkingen/NDFF_STAGINGDATASET.md</w:t>
+      </w:r>
+      <w:r>
+        <w:t xml:space="preserve">.</w:t>
       </w:r>
     </w:p>
     <w:p>
       <w:pPr>
         <w:pStyle w:val="Heading3"/>
       </w:pPr>
+      <w:bookmarkStart w:id="17" w:name="_58edaa7a0159e378417d8d9e2f3abf27d746f4f"/>
       <w:r>
         <w:t xml:space="preserve">1.3. Zoogdieren tijdens SOVON- en VWG-bezoeken</w:t>
       </w:r>
+      <w:bookmarkEnd w:id="17"/>
     </w:p>
     <w:p>
       <w:pPr>
@@ -3387,15 +3433,15 @@
         <w:t xml:space="preserve">gemigreerd en zijn alle centrale schrijfguards opnieuw opgebouwd. Geen koppeling werd door een andere waarnemingstabel gedeeld. De volledige controle van 279 tabellen en 128 taxonroutes geeft nul fouten. Twee afzonderlijke tabelback-ups zijn met ongewijzigde SHA-256 teruggelezen in tijdelijke databases; beide herstelproeven reproduceerden exact de vier tabelrijtellingen vóór de betreffende wijziging.</w:t>
       </w:r>
     </w:p>
-    <w:bookmarkEnd w:id="14"/>
-    <w:bookmarkStart w:id="16" w:name="historisch-vangblikonderzoek"/>
     <w:p>
       <w:pPr>
         <w:pStyle w:val="Heading3"/>
       </w:pPr>
+      <w:bookmarkStart w:id="18" w:name="_d3fb9a25da94fa35cd3895c324ae264efa6b6ce"/>
       <w:r>
         <w:t xml:space="preserve">1.4. Historisch vangblikonderzoek</w:t>
       </w:r>
+      <w:bookmarkEnd w:id="18"/>
     </w:p>
     <w:p>
       <w:pPr>
@@ -3451,7 +3497,7 @@
       <w:r>
         <w:t xml:space="preserve"> </w:t>
       </w:r>
-      <w:hyperlink r:id="rId15">
+      <w:hyperlink r:id="rId19">
         <w:r>
           <w:rPr>
             <w:rStyle w:val="Hyperlink"/>
@@ -3532,15 +3578,15 @@
         <w:t xml:space="preserve">is verwijderd. Alle 99.652 individuen, events, locaties, kwaliteitsvlaggen en oorspronkelijke bronwaarden zijn behouden. Ook de twee vangstregels uit 1959 zonder bijbehorend event blijven herkenbaar en uitgesloten. De bestaande taxonkoppelingen blijven kandidaat; deze opschoning bevestigt geen nieuwe soortidentificaties en verandert de analysegeschiktheid niet. De migratie, het terugdraaien en het volledige herstel uit back-up zijn beproefd. Website, dashboard en Shiny zijn niet aangepast; er is niets naar de VPS gepubliceerd.</w:t>
       </w:r>
     </w:p>
-    <w:bookmarkEnd w:id="16"/>
-    <w:bookmarkStart w:id="34" w:name="X003d1b4454050d8b2300662d18ee0e6097f4328"/>
     <w:p>
       <w:pPr>
         <w:pStyle w:val="Heading3"/>
       </w:pPr>
+      <w:bookmarkStart w:id="20" w:name="_05a7f9ed9696b113895f0c60145ad70b98b3ccf"/>
       <w:r>
         <w:t xml:space="preserve">1.5. NDFF: één canonieke laag van openbare en beveiligde gegevens</w:t>
       </w:r>
+      <w:bookmarkEnd w:id="20"/>
     </w:p>
     <w:p>
       <w:pPr>
@@ -3614,14 +3660,15 @@
         <w:t xml:space="preserve">Voorwaardelijk bruikbaar. De bronorganisaties zijn aangeschreven met het verzoek de aanvullende metadata te leveren.</w:t>
       </w:r>
     </w:p>
-    <w:bookmarkStart w:id="17" w:name="dagvlinders"/>
     <w:p>
       <w:pPr>
         <w:pStyle w:val="Heading4"/>
       </w:pPr>
+      <w:bookmarkStart w:id="21" w:name="_f2f5e1637d9b0d825d88db49318fbe09fe4562d"/>
       <w:r>
         <w:t xml:space="preserve">1.5.1. Dagvlinders</w:t>
       </w:r>
+      <w:bookmarkEnd w:id="21"/>
     </w:p>
     <w:p>
       <w:pPr>
@@ -3677,15 +3724,15 @@
         <w:t xml:space="preserve">Oorspronkelijke route- en bezoekcodes, complete bezoeken, gevolgde modules en tellingen zonder waarneming</w:t>
       </w:r>
     </w:p>
-    <w:bookmarkEnd w:id="17"/>
-    <w:bookmarkStart w:id="18" w:name="hommels"/>
     <w:p>
       <w:pPr>
         <w:pStyle w:val="Heading4"/>
       </w:pPr>
+      <w:bookmarkStart w:id="22" w:name="_ab588a339567fbeba82f7ca9f0ef20022ceaf38"/>
       <w:r>
         <w:t xml:space="preserve">1.5.2. Hommels</w:t>
       </w:r>
+      <w:bookmarkEnd w:id="22"/>
     </w:p>
     <w:p>
       <w:pPr>
@@ -3741,15 +3788,15 @@
         <w:t xml:space="preserve">Bevestiging dat hommels systematisch zijn geteld en op welk determinatieniveau</w:t>
       </w:r>
     </w:p>
-    <w:bookmarkEnd w:id="18"/>
-    <w:bookmarkStart w:id="19" w:name="libellen"/>
     <w:p>
       <w:pPr>
         <w:pStyle w:val="Heading4"/>
       </w:pPr>
+      <w:bookmarkStart w:id="23" w:name="_5eeebc0b3ea39369efcb9361b685b51ab379390"/>
       <w:r>
         <w:t xml:space="preserve">1.5.3. Libellen</w:t>
       </w:r>
+      <w:bookmarkEnd w:id="23"/>
     </w:p>
     <w:p>
       <w:pPr>
@@ -3805,15 +3852,15 @@
         <w:t xml:space="preserve">Oorspronkelijke route- en bezoekstructuur en volledige doelsoortenlijst</w:t>
       </w:r>
     </w:p>
-    <w:bookmarkEnd w:id="19"/>
-    <w:bookmarkStart w:id="20" w:name="nachtvlinders"/>
     <w:p>
       <w:pPr>
         <w:pStyle w:val="Heading4"/>
       </w:pPr>
+      <w:bookmarkStart w:id="24" w:name="_f7f75bff85528639d3a54437d815ffc982ac078"/>
       <w:r>
         <w:t xml:space="preserve">1.5.4. Nachtvlinders</w:t>
       </w:r>
+      <w:bookmarkEnd w:id="24"/>
     </w:p>
     <w:p>
       <w:pPr>
@@ -3869,15 +3916,15 @@
         <w:t xml:space="preserve">Afzonderlijke vangnachten, telpunt, val, lamp, brandduur en lege vangnachten</w:t>
       </w:r>
     </w:p>
-    <w:bookmarkEnd w:id="20"/>
-    <w:bookmarkStart w:id="21" w:name="amfibieën"/>
     <w:p>
       <w:pPr>
         <w:pStyle w:val="Heading4"/>
       </w:pPr>
+      <w:bookmarkStart w:id="25" w:name="_5952ec78f96e716985cfd2bef0c6dea751da098"/>
       <w:r>
         <w:t xml:space="preserve">1.5.5. Amfibieën</w:t>
       </w:r>
+      <w:bookmarkEnd w:id="25"/>
     </w:p>
     <w:p>
       <w:pPr>
@@ -3933,15 +3980,15 @@
         <w:t xml:space="preserve">Oorspronkelijke water- en bezoekcodes, zoekmethode en volledige-lijststatus</w:t>
       </w:r>
     </w:p>
-    <w:bookmarkEnd w:id="21"/>
-    <w:bookmarkStart w:id="22" w:name="reptielen"/>
     <w:p>
       <w:pPr>
         <w:pStyle w:val="Heading4"/>
       </w:pPr>
+      <w:bookmarkStart w:id="26" w:name="_f98973ac0b4b22a8147264cf6fda7ae2d1f2584"/>
       <w:r>
         <w:t xml:space="preserve">1.5.6. Reptielen</w:t>
       </w:r>
+      <w:bookmarkEnd w:id="26"/>
     </w:p>
     <w:p>
       <w:pPr>
@@ -3997,15 +4044,15 @@
         <w:t xml:space="preserve">Ontbrekende bezoeken en volledige routeadministratie</w:t>
       </w:r>
     </w:p>
-    <w:bookmarkEnd w:id="22"/>
-    <w:bookmarkStart w:id="23" w:name="vissen"/>
     <w:p>
       <w:pPr>
         <w:pStyle w:val="Heading4"/>
       </w:pPr>
+      <w:bookmarkStart w:id="27" w:name="_9ffbbed58a474302bc88f9b6483937563542adc"/>
       <w:r>
         <w:t xml:space="preserve">1.5.7. Vissen</w:t>
       </w:r>
+      <w:bookmarkEnd w:id="27"/>
     </w:p>
     <w:p>
       <w:pPr>
@@ -4061,15 +4108,15 @@
         <w:t xml:space="preserve">Te weinig bezoeken en geen volledige meetstructuur voor een lokale trend</w:t>
       </w:r>
     </w:p>
-    <w:bookmarkEnd w:id="23"/>
-    <w:bookmarkStart w:id="24" w:name="vleermuistransecten"/>
     <w:p>
       <w:pPr>
         <w:pStyle w:val="Heading4"/>
       </w:pPr>
+      <w:bookmarkStart w:id="28" w:name="_90b1412457ba2ad39675de54e16fb4052a9af96"/>
       <w:r>
         <w:t xml:space="preserve">1.5.8. Vleermuistransecten</w:t>
       </w:r>
+      <w:bookmarkEnd w:id="28"/>
     </w:p>
     <w:p>
       <w:pPr>
@@ -4125,15 +4172,15 @@
         <w:t xml:space="preserve">Oorspronkelijke routes, secties, bezoeken en volledige resultaten</w:t>
       </w:r>
     </w:p>
-    <w:bookmarkEnd w:id="24"/>
-    <w:bookmarkStart w:id="25" w:name="konijnentellingen-in-de-duinen"/>
     <w:p>
       <w:pPr>
         <w:pStyle w:val="Heading4"/>
       </w:pPr>
+      <w:bookmarkStart w:id="29" w:name="_0bf7c6d2026ffa63b6182a76ed7ab201ef2ca1a"/>
       <w:r>
         <w:t xml:space="preserve">1.5.9. Konijnentellingen in de duinen</w:t>
       </w:r>
+      <w:bookmarkEnd w:id="29"/>
     </w:p>
     <w:p>
       <w:pPr>
@@ -4189,15 +4236,15 @@
         <w:t xml:space="preserve">Eerst overlap met de primaire SOVON- en VWG-reeks oplossen</w:t>
       </w:r>
     </w:p>
-    <w:bookmarkEnd w:id="25"/>
-    <w:bookmarkStart w:id="26" w:name="wintertellingen-vleermuizen"/>
     <w:p>
       <w:pPr>
         <w:pStyle w:val="Heading4"/>
       </w:pPr>
+      <w:bookmarkStart w:id="30" w:name="_d64910a2091f56dedd2aaa5a75994d38ec4c969"/>
       <w:r>
         <w:t xml:space="preserve">1.5.10. Wintertellingen vleermuizen</w:t>
       </w:r>
+      <w:bookmarkEnd w:id="30"/>
     </w:p>
     <w:p>
       <w:pPr>
@@ -4253,15 +4300,15 @@
         <w:t xml:space="preserve">Vaste object- en bezoekcodes en volledige tellingen</w:t>
       </w:r>
     </w:p>
-    <w:bookmarkEnd w:id="26"/>
-    <w:bookmarkStart w:id="27" w:name="het-nieuwe-strepen"/>
     <w:p>
       <w:pPr>
         <w:pStyle w:val="Heading4"/>
       </w:pPr>
+      <w:bookmarkStart w:id="31" w:name="_9cec44656db08bd57f600992eaa74a526d260b3"/>
       <w:r>
         <w:t xml:space="preserve">1.5.11. Het Nieuwe Strepen</w:t>
       </w:r>
+      <w:bookmarkEnd w:id="31"/>
     </w:p>
     <w:p>
       <w:pPr>
@@ -4296,7 +4343,7 @@
         <w:t xml:space="preserve"> </w:t>
       </w:r>
       <w:r>
-        <w:t xml:space="preserve">Op 6 oktober 2026 meldde FLORON dat één kalenderdag in één kilometerhok als telling mag worden beschouwd. Zo’n telling kan één, twee of drie oorspronkelijke lijsten omvatten. Persoonsgegevens en daarvan afgeleide waarnemerscodes worden niet geleverd. De</w:t>
+        <w:t xml:space="preserve">Op 6 oktober 2026 meldde FLORON dat één kalenderdag in één kilometerhok als telling mag worden beschouwd. Zo'n telling kan één, twee of drie oorspronkelijke lijsten omvatten. Persoonsgegevens en daarvan afgeleide waarnemerscodes worden niet geleverd. De</w:t>
       </w:r>
       <w:r>
         <w:t xml:space="preserve"> </w:t>
@@ -4395,15 +4442,15 @@
         <w:t xml:space="preserve">geldt niet als tweede velddag. Bij 21 tellingen staat nu neutraal dat hetzelfde hok in hetzelfde jaar op meerdere kalenderdagen is geteld. Dat zegt niets over onafhankelijke waarnemers. De recordselectie, het doelbereik, de 4.439 positieve combinaties en de 11.730 nullen zijn gelijk aan v1. V1 blijft als historisch auditspoor bewaard. De indeling van 23 volledige tellingen en drie fragmenten blijft een lokale reconstructie en moet als zodanig zichtbaar blijven.</w:t>
       </w:r>
     </w:p>
-    <w:bookmarkEnd w:id="27"/>
-    <w:bookmarkStart w:id="28" w:name="Xadd682eaf9770b54759a1b54720dedd522bc07f"/>
     <w:p>
       <w:pPr>
         <w:pStyle w:val="Heading4"/>
       </w:pPr>
+      <w:bookmarkStart w:id="32" w:name="_c056d2025de29c95bc511421c5f5e41469354eb"/>
       <w:r>
         <w:t xml:space="preserve">1.5.12. FLORBASE en andere vaatplantinventarisaties</w:t>
       </w:r>
+      <w:bookmarkEnd w:id="32"/>
     </w:p>
     <w:p>
       <w:pPr>
@@ -4438,7 +4485,7 @@
         <w:t xml:space="preserve"> </w:t>
       </w:r>
       <w:r>
-        <w:t xml:space="preserve">Eén jaar in één kilometerhok is de fijnste beschikbare teleenheid. Voor 2011 werden alleen soort, jaar, kilometerhok en waarnemer opgeslagen. FLORON beschikt niet over de eerder gevraagde lijst-ID’s, volledigheidsvlaggen, bezoekdata, bezoekduur, checklistversies of expliciete registraties van niet-aangetroffen soorten.</w:t>
+        <w:t xml:space="preserve">Eén jaar in één kilometerhok is de fijnste beschikbare teleenheid. Voor 2011 werden alleen soort, jaar, kilometerhok en waarnemer opgeslagen. FLORON beschikt niet over de eerder gevraagde lijst-ID's, volledigheidsvlaggen, bezoekdata, bezoekduur, checklistversies of expliciete registraties van niet-aangetroffen soorten.</w:t>
       </w:r>
     </w:p>
     <w:p>
@@ -4459,15 +4506,15 @@
         <w:t xml:space="preserve">Positieve waarnemingen, floristische samenstelling en veranderingen in geregistreerde verspreiding kunnen per kilometerhok en jaar worden onderzocht. De huidige 81.721 protocolnullen blijven afhankelijk van de lokale regel dat een hok-jaar met minimaal vijftig taxa als aannemelijk volledig geldt. Zij zijn geen door FLORON geleverde nulwaarnemingen en ondersteunen zonder gevoeligheidsanalyse geen definitieve trendclaim. Een nieuw verzoek aan FLORON kan deze leemte niet oplossen.</w:t>
       </w:r>
     </w:p>
-    <w:bookmarkEnd w:id="28"/>
-    <w:bookmarkStart w:id="29" w:name="lmf-aandachtssoorten"/>
     <w:p>
       <w:pPr>
         <w:pStyle w:val="Heading4"/>
       </w:pPr>
+      <w:bookmarkStart w:id="33" w:name="_b2fbeb28e0a334b9e6cb93232c4d845faf48221"/>
       <w:r>
         <w:t xml:space="preserve">1.5.13. LMF-aandachtssoorten</w:t>
       </w:r>
+      <w:bookmarkEnd w:id="33"/>
     </w:p>
     <w:p>
       <w:pPr>
@@ -4548,108 +4595,259 @@
       <w:r>
         <w:rPr>
           <w:b/>
-        </w:rPr>
-        <w:t xml:space="preserve">Opslag, 8 oktober 2026. </w:t>
-      </w:r>
-      <w:r>
-        <w:t>De veertien afgeleide tabellen van Het Nieuwe Strepen, FLORBASE en LMF-A heten nu respectievelijk hns_*, florbase_* en lmfa_* in de lokale analytische database en op de VPS. De oorspronkelijke NDFF-waarnemingen, bronvermelding en reconstructieversies blijven behouden. Alle tabelcontrolesommen zijn na de hernoeming gelijk aan de nulmeting en alle 18 foreign keys bleven intact; de centrale taxoncontrole geeft 128 werkende routes en nul fouten. De volledige SQL-export, Shiny-cache en website-uitvoer zijn op 8 oktober 2026 gepubliceerd als Meijendel-productiecommit 6dbc679887074501f0505ca784e4e494aecd5e3d. De releasehelper verwijderde uitsluitend de veertien oude ndff_hns_*-, ndff_florbase_*- en ndff_lmfa_*-tabelnamen. Het productieschema, de cachemodus SQL_CACHE=TRUE en de publieke rookproeven zijn daarna geslaagd.</w:t>
-      </w:r>
-    </w:p>
-    <w:bookmarkEnd w:id="29"/>
-    <w:bookmarkStart w:id="30" w:name="mossen-en-korstmossen"/>
+          <w:bCs/>
+        </w:rPr>
+        <w:t xml:space="preserve">Opslag, 8 oktober 2026.</w:t>
+      </w:r>
+      <w:r>
+        <w:t xml:space="preserve"> </w:t>
+      </w:r>
+      <w:r>
+        <w:t xml:space="preserve">De veertien afgeleide tabellen van Het Nieuwe Strepen, FLORBASE en LMF-A heten nu respectievelijk</w:t>
+      </w:r>
+      <w:r>
+        <w:t xml:space="preserve"> </w:t>
+      </w:r>
+      <w:r>
+        <w:rPr>
+          <w:rStyle w:val="VerbatimChar"/>
+        </w:rPr>
+        <w:t xml:space="preserve">hns_*</w:t>
+      </w:r>
+      <w:r>
+        <w:t xml:space="preserve">,</w:t>
+      </w:r>
+      <w:r>
+        <w:t xml:space="preserve"> </w:t>
+      </w:r>
+      <w:r>
+        <w:rPr>
+          <w:rStyle w:val="VerbatimChar"/>
+        </w:rPr>
+        <w:t xml:space="preserve">florbase_*</w:t>
+      </w:r>
+      <w:r>
+        <w:t xml:space="preserve"> </w:t>
+      </w:r>
+      <w:r>
+        <w:t xml:space="preserve">en</w:t>
+      </w:r>
+      <w:r>
+        <w:t xml:space="preserve"> </w:t>
+      </w:r>
+      <w:r>
+        <w:rPr>
+          <w:rStyle w:val="VerbatimChar"/>
+        </w:rPr>
+        <w:t xml:space="preserve">lmfa_*</w:t>
+      </w:r>
+      <w:r>
+        <w:t xml:space="preserve"> </w:t>
+      </w:r>
+      <w:r>
+        <w:t xml:space="preserve">in de lokale analytische database en op de VPS. De oorspronkelijke NDFF-waarnemingen, bronvermelding en reconstructieversies blijven behouden. Alle tabelcontrolesommen zijn na de hernoeming gelijk aan de nulmeting en alle 18 foreign keys bleven intact; de centrale taxoncontrole geeft 128 werkende routes en nul fouten. De volledige SQL-export, Shiny-cache en website-uitvoer zijn op 8 oktober 2026 gepubliceerd als Meijendel-productiecommit</w:t>
+      </w:r>
+      <w:r>
+        <w:t xml:space="preserve"> </w:t>
+      </w:r>
+      <w:r>
+        <w:rPr>
+          <w:rStyle w:val="VerbatimChar"/>
+        </w:rPr>
+        <w:t xml:space="preserve">6dbc679887074501f0505ca784e4e494aecd5e3d</w:t>
+      </w:r>
+      <w:r>
+        <w:t xml:space="preserve">. De releasehelper verwijderde uitsluitend de veertien oude</w:t>
+      </w:r>
+      <w:r>
+        <w:t xml:space="preserve"> </w:t>
+      </w:r>
+      <w:r>
+        <w:rPr>
+          <w:rStyle w:val="VerbatimChar"/>
+        </w:rPr>
+        <w:t xml:space="preserve">ndff_hns_*</w:t>
+      </w:r>
+      <w:r>
+        <w:t xml:space="preserve">-,</w:t>
+      </w:r>
+      <w:r>
+        <w:t xml:space="preserve"> </w:t>
+      </w:r>
+      <w:r>
+        <w:rPr>
+          <w:rStyle w:val="VerbatimChar"/>
+        </w:rPr>
+        <w:t xml:space="preserve">ndff_florbase_*</w:t>
+      </w:r>
+      <w:r>
+        <w:t xml:space="preserve">- en</w:t>
+      </w:r>
+      <w:r>
+        <w:t xml:space="preserve"> </w:t>
+      </w:r>
+      <w:r>
+        <w:rPr>
+          <w:rStyle w:val="VerbatimChar"/>
+        </w:rPr>
+        <w:t xml:space="preserve">ndff_lmfa_*</w:t>
+      </w:r>
+      <w:r>
+        <w:t xml:space="preserve">-tabelnamen. Het productieschema, de cachemodus</w:t>
+      </w:r>
+      <w:r>
+        <w:t xml:space="preserve"> </w:t>
+      </w:r>
+      <w:r>
+        <w:rPr>
+          <w:rStyle w:val="VerbatimChar"/>
+        </w:rPr>
+        <w:t xml:space="preserve">SQL_CACHE=TRUE</w:t>
+      </w:r>
+      <w:r>
+        <w:t xml:space="preserve"> </w:t>
+      </w:r>
+      <w:r>
+        <w:t xml:space="preserve">en de publieke rookproeven zijn daarna geslaagd.</w:t>
+      </w:r>
+    </w:p>
     <w:p>
       <w:pPr>
         <w:pStyle w:val="Heading4"/>
       </w:pPr>
+      <w:bookmarkStart w:id="34" w:name="_0ce2ec4e8b5503e251897e5490450ca2d9e0742"/>
       <w:r>
         <w:t xml:space="preserve">1.5.14. Mossen en korstmossen</w:t>
       </w:r>
+      <w:bookmarkEnd w:id="34"/>
     </w:p>
     <w:p>
       <w:pPr>
         <w:pStyle w:val="FirstParagraph"/>
       </w:pPr>
-      <w:r/>
-      <w:r>
-        <w:rPr>
-          <w:b/>
-        </w:rPr>
-        <w:t>Omvang en periode.</w:t>
-      </w:r>
-      <w:r>
-        <w:t xml:space="preserve"> De NDFF-levering bevat 384 korstmossenregels onder meetnetprotocol 02.202 uit 2000–2025 en 377 mossenregels onder protocol 02.204 uit 2000–2011.</w:t>
-      </w:r>
-    </w:p>
-    <w:p>
-      <w:pPr>
-        <w:pStyle w:val="BodyText"/>
-      </w:pPr>
-      <w:r/>
-      <w:r>
-        <w:rPr>
-          <w:b/>
-        </w:rPr>
-        <w:t>Nieuwe primaire bron, 8 oktober 2026.</w:t>
-      </w:r>
-      <w:r>
-        <w:t xml:space="preserve"> BLWG leverde voor korstmossen zes plots, 32 afzonderlijke telformulieren met waarnemer en lijstcode, en 292 positieve soortregels. Vier vaste plots zijn onderzocht in de veldjaren 2000, 2006, 2011, 2015, 2020 en 2025; twee andere plots zijn alleen in 2021 onderzocht. De levering bevat plotbegrenzingen en de oorspronkelijke kolom Kwantiteit, met vijf van de zes mogelijke klassen in deze selectie. Het rapportagejaar loopt meestal één jaar achter op de feitelijke velddatum; analyses gebruiken de velddatum.</w:t>
-      </w:r>
-    </w:p>
-    <w:p>
-      <w:pPr>
-        <w:pStyle w:val="BodyText"/>
-        <w:keepLines/>
-      </w:pPr>
-      <w:r/>
-      <w:r>
-        <w:rPr>
-          <w:b/>
-        </w:rPr>
-        <w:t>Vergelijking met NDFF.</w:t>
-      </w:r>
-      <w:r>
-        <w:t xml:space="preserve"> De 32 BLWG-formulieren zijn niet dezelfde 32 eenheden als de eerder uit NDFF gereconstrueerde plot-datumbezoeken: BLWG onderscheidt bijvoorbeeld de twee tellers in 2015 en 2021. Van de 292 BLWG-soortregels matchen 269 rechtstreeks op plot, velddatum en soortnaam met onvervaagde NDFF-regels; 20 betreffen de openbaar vervaagde Usnea articulata en drie verschillen alleen in de gebruikte wetenschappelijke naam. Die twintig regels en de precieze plotlocatie mogen niet in openbare afgeleide tabellen terechtkomen. De bron is ontvangen maar nog niet geïmporteerd.</w:t>
-      </w:r>
-    </w:p>
-    <w:bookmarkEnd w:id="30"/>
-    <w:bookmarkStart w:id="31" w:name="bos--en-zeereeppaddenstoelen"/>
-    <w:p>
-      <w:pPr>
-        <w:pStyle w:val="BodyText"/>
-      </w:pPr>
-      <w:r/>
-      <w:r>
-        <w:rPr>
-          <w:b/>
-        </w:rPr>
-        <w:t>Wat kan nu?</w:t>
-      </w:r>
-      <w:r>
-        <w:t xml:space="preserve"> De vier vaste korstmossenplots vormen dankzij de primaire plot-, bezoek- en soortenlijsten een veel betere kandidaat voor lokale analyse van aanwezigheid en ordinale bedekking over zes meetronden. Dit is nog geen gebiedsbrede populatietrend of bewijs voor een beheereffect. De twee plots uit 2021 bieden alleen een momentopname. Het mossendeel blijft bruikbaar als zeven kilometerhokinventarisaties, niet als zelfstandige lokale tijdreeks.</w:t>
-      </w:r>
-    </w:p>
-    <w:p>
-      <w:pPr>
-        <w:pStyle w:val="BodyText"/>
-      </w:pPr>
-      <w:r/>
-      <w:r>
-        <w:rPr>
-          <w:b/>
-        </w:rPr>
-        <w:t>Wat ontbreekt nog?</w:t>
-      </w:r>
-      <w:r>
-        <w:t xml:space="preserve"> De NDFF-selectie 02.202 bevat daarnaast 92 regels van zes andere BLWG-locaties: twee locaties met een bezoek op 15 februari 2015 en vier met een bezoek op 31 maart 2018. Zij staan niet in de ontvangen BLWG-export. Eerst moet duidelijk zijn of ook voor deze zes locaties de oorspronkelijke plot- en bezoekgegevens beschikbaar zijn; de bestaande NDFF-reconstructie blijft daarvoor voorlopig. Voor protocol 02.204 meldde BLWG dat het om kilometerhokinventarisaties gaat en dat, voor zover bekend, geen afzonderlijke kopgegevens worden bijgehouden. Er is daarvoor nu geen aanvullende levering te verwachten.</w:t>
+      <w:r>
+        <w:rPr>
+          <w:b/>
+          <w:bCs/>
+        </w:rPr>
+        <w:t xml:space="preserve">Omvang en periode.</w:t>
+      </w:r>
+      <w:r>
+        <w:t xml:space="preserve"> </w:t>
+      </w:r>
+      <w:r>
+        <w:t xml:space="preserve">De NDFF-levering bevat 384 korstmossenregels onder meetnetprotocol 02.202 uit 2000–2025 en 377 mossenregels onder protocol 02.204 uit 2000–2011.</w:t>
+      </w:r>
+    </w:p>
+    <w:p>
+      <w:pPr>
+        <w:pStyle w:val="BodyText"/>
+      </w:pPr>
+      <w:r>
+        <w:rPr>
+          <w:b/>
+          <w:bCs/>
+        </w:rPr>
+        <w:t xml:space="preserve">Nieuwe primaire bron, 8 oktober 2026.</w:t>
+      </w:r>
+      <w:r>
+        <w:t xml:space="preserve"> </w:t>
+      </w:r>
+      <w:r>
+        <w:t xml:space="preserve">BLWG leverde voor korstmossen zes plots, 32 afzonderlijke telformulieren met waarnemer en lijstcode, en 292 positieve soortregels. Vier vaste plots zijn onderzocht in de veldjaren 2000, 2006, 2011, 2015, 2020 en 2025; twee andere plots zijn alleen in 2021 onderzocht. De levering bevat plotbegrenzingen en de oorspronkelijke kolom</w:t>
+      </w:r>
+      <w:r>
+        <w:t xml:space="preserve"> </w:t>
+      </w:r>
+      <w:r>
+        <w:rPr>
+          <w:rStyle w:val="VerbatimChar"/>
+        </w:rPr>
+        <w:t xml:space="preserve">Kwantiteit</w:t>
+      </w:r>
+      <w:r>
+        <w:t xml:space="preserve">, met vijf van de zes mogelijke klassen in deze selectie. Het rapportagejaar loopt meestal één jaar achter op de feitelijke velddatum; analyses gebruiken de velddatum.</w:t>
+      </w:r>
+    </w:p>
+    <w:p>
+      <w:pPr>
+        <w:pStyle w:val="BodyText"/>
+      </w:pPr>
+      <w:r>
+        <w:rPr>
+          <w:b/>
+          <w:bCs/>
+        </w:rPr>
+        <w:t xml:space="preserve">Vergelijking met NDFF.</w:t>
+      </w:r>
+      <w:r>
+        <w:t xml:space="preserve"> </w:t>
+      </w:r>
+      <w:r>
+        <w:t xml:space="preserve">De 32 BLWG-formulieren zijn niet dezelfde 32 eenheden als de eerder uit NDFF gereconstrueerde plot-datumbezoeken: BLWG onderscheidt bijvoorbeeld de twee tellers in 2015 en 2021. Van de 292 BLWG-soortregels matchen 269 rechtstreeks op plot, velddatum en soortnaam met onvervaagde NDFF-regels; 20 betreffen de openbaar vervaagde</w:t>
+      </w:r>
+      <w:r>
+        <w:t xml:space="preserve"> </w:t>
+      </w:r>
+      <w:r>
+        <w:rPr>
+          <w:i/>
+          <w:iCs/>
+        </w:rPr>
+        <w:t xml:space="preserve">Usnea articulata</w:t>
+      </w:r>
+      <w:r>
+        <w:t xml:space="preserve"> </w:t>
+      </w:r>
+      <w:r>
+        <w:t xml:space="preserve">en drie verschillen alleen in de gebruikte wetenschappelijke naam. Die twintig regels en de precieze plotlocatie mogen niet in openbare afgeleide tabellen terechtkomen. De bron is ontvangen maar nog niet geïmporteerd.</w:t>
+      </w:r>
+    </w:p>
+    <w:p>
+      <w:pPr>
+        <w:pStyle w:val="BodyText"/>
+      </w:pPr>
+      <w:r>
+        <w:rPr>
+          <w:b/>
+          <w:bCs/>
+        </w:rPr>
+        <w:t xml:space="preserve">Wat kan nu?</w:t>
+      </w:r>
+      <w:r>
+        <w:t xml:space="preserve"> </w:t>
+      </w:r>
+      <w:r>
+        <w:t xml:space="preserve">De vier vaste korstmossenplots vormen dankzij de primaire plot-, bezoek- en soortenlijsten een veel betere kandidaat voor lokale analyse van aanwezigheid en ordinale bedekking over zes meetronden. Dit is nog geen gebiedsbrede populatietrend of bewijs voor een beheereffect. De twee plots uit 2021 bieden alleen een momentopname. Het mossendeel blijft bruikbaar als zeven kilometerhokinventarisaties, niet als zelfstandige lokale tijdreeks.</w:t>
+      </w:r>
+    </w:p>
+    <w:p>
+      <w:pPr>
+        <w:pStyle w:val="BodyText"/>
+      </w:pPr>
+      <w:r>
+        <w:rPr>
+          <w:b/>
+          <w:bCs/>
+        </w:rPr>
+        <w:t xml:space="preserve">Wat ontbreekt nog?</w:t>
+      </w:r>
+      <w:r>
+        <w:t xml:space="preserve"> </w:t>
+      </w:r>
+      <w:r>
+        <w:t xml:space="preserve">De NDFF-selectie 02.202 bevat daarnaast 92 regels van zes andere BLWG-locaties: twee locaties met een bezoek op 15 februari 2015 en vier met een bezoek op 31 maart 2018. Zij staan niet in de ontvangen BLWG-export. Eerst moet duidelijk zijn of ook voor deze zes locaties de oorspronkelijke plot- en bezoekgegevens beschikbaar zijn; de bestaande NDFF-reconstructie blijft daarvoor voorlopig. Voor protocol 02.204 meldde BLWG dat het om kilometerhokinventarisaties gaat en dat, voor zover bekend, geen afzonderlijke kopgegevens worden bijgehouden. Er is daarvoor nu geen aanvullende levering te verwachten.</w:t>
       </w:r>
     </w:p>
     <w:p>
       <w:pPr>
         <w:pStyle w:val="Heading4"/>
       </w:pPr>
+      <w:bookmarkStart w:id="35" w:name="_339fafe251367982d6218746f16721a93fa7f70"/>
       <w:r>
         <w:t xml:space="preserve">1.5.15. Bos- en zeereeppaddenstoelen</w:t>
       </w:r>
+      <w:bookmarkEnd w:id="35"/>
     </w:p>
     <w:p>
       <w:pPr>
@@ -4705,15 +4903,15 @@
         <w:t xml:space="preserve">Volledige bezoeken en het per teller gevolgde soortenbereik; geen vruchtlichaam is bovendien niet hetzelfde als geen mycelium</w:t>
       </w:r>
     </w:p>
-    <w:bookmarkEnd w:id="31"/>
-    <w:bookmarkStart w:id="32" w:name="weekdieren"/>
     <w:p>
       <w:pPr>
         <w:pStyle w:val="Heading4"/>
       </w:pPr>
+      <w:bookmarkStart w:id="36" w:name="_342bae7ae5afae546f17223888206446d449411"/>
       <w:r>
         <w:t xml:space="preserve">1.5.16. Weekdieren</w:t>
       </w:r>
+      <w:bookmarkEnd w:id="36"/>
     </w:p>
     <w:p>
       <w:pPr>
@@ -4769,15 +4967,15 @@
         <w:t xml:space="preserve">Locatie-, monster- en bezoekcodes om systematische tellingen van losse meldingen te scheiden</w:t>
       </w:r>
     </w:p>
-    <w:bookmarkEnd w:id="32"/>
-    <w:bookmarkStart w:id="33" w:name="snl-gebiedsmonitoring"/>
     <w:p>
       <w:pPr>
         <w:pStyle w:val="Heading4"/>
       </w:pPr>
+      <w:bookmarkStart w:id="37" w:name="_cc11e4dda0fa9b87cf2613be17ff277804bdc91"/>
       <w:r>
         <w:t xml:space="preserve">1.5.17. SNL-gebiedsmonitoring</w:t>
       </w:r>
+      <w:bookmarkEnd w:id="37"/>
     </w:p>
     <w:p>
       <w:pPr>
@@ -4841,16 +5039,15 @@
         <w:t xml:space="preserve">De overige NDFF-regels zijn losse of uitsluitend positieve registraties. Zij blijven nuttig voor verspreiding, maar ontbreken mag daar nooit als afwezigheid worden uitgelegd.</w:t>
       </w:r>
     </w:p>
-    <w:bookmarkEnd w:id="33"/>
-    <w:bookmarkEnd w:id="34"/>
-    <w:bookmarkStart w:id="43" w:name="openbare-externe-ecologiebronnen"/>
     <w:p>
       <w:pPr>
         <w:pStyle w:val="Heading3"/>
       </w:pPr>
+      <w:bookmarkStart w:id="38" w:name="_77733873953f7250a44afc39ac6f33e9c0fface"/>
       <w:r>
         <w:t xml:space="preserve">1.6. Openbare externe ecologiebronnen</w:t>
       </w:r>
+      <w:bookmarkEnd w:id="38"/>
     </w:p>
     <w:p>
       <w:pPr>
@@ -4870,7 +5067,7 @@
       <w:r>
         <w:t xml:space="preserve"> </w:t>
       </w:r>
-      <w:hyperlink r:id="rId35">
+      <w:hyperlink r:id="rId39">
         <w:r>
           <w:rPr>
             <w:rStyle w:val="Hyperlink"/>
@@ -5064,7 +5261,7 @@
       <w:r>
         <w:t xml:space="preserve"> </w:t>
       </w:r>
-      <w:hyperlink r:id="rId36">
+      <w:hyperlink r:id="rId40">
         <w:r>
           <w:rPr>
             <w:rStyle w:val="Hyperlink"/>
@@ -5076,14 +5273,15 @@
         <w:t xml:space="preserve">.</w:t>
       </w:r>
     </w:p>
-    <w:bookmarkStart w:id="37" w:name="stowa-limnodata"/>
     <w:p>
       <w:pPr>
         <w:pStyle w:val="Heading4"/>
       </w:pPr>
+      <w:bookmarkStart w:id="41" w:name="_aa03dabe850e534118471d9a4587f103d7cc6d0"/>
       <w:r>
         <w:t xml:space="preserve">1.6.1. STOWA Limnodata</w:t>
       </w:r>
+      <w:bookmarkEnd w:id="41"/>
     </w:p>
     <w:p>
       <w:pPr>
@@ -5163,15 +5361,15 @@
         <w:t xml:space="preserve">, 196 als Braun-Blanquetklasse en 56 zonder eenheid. Niet gemelde soorten zijn geen nulwaarneming.</w:t>
       </w:r>
     </w:p>
-    <w:bookmarkEnd w:id="37"/>
-    <w:bookmarkStart w:id="38" w:name="endure-helmduinfauna"/>
     <w:p>
       <w:pPr>
         <w:pStyle w:val="Heading4"/>
       </w:pPr>
+      <w:bookmarkStart w:id="42" w:name="_e9b446960bca12075cdde30af1cbaf73f645a87"/>
       <w:r>
         <w:t xml:space="preserve">1.6.2. ENDURE helmduinfauna</w:t>
       </w:r>
+      <w:bookmarkEnd w:id="42"/>
     </w:p>
     <w:p>
       <w:pPr>
@@ -5227,15 +5425,15 @@
         <w:t xml:space="preserve">Dit is een gestandaardiseerde en herhaalbare referentiemeting voor ongewervelden in witte duinen. De expliciete afwezigheden zijn bruikbaar binnen de veertien complete matrices. Eén meetjaar levert geen ontwikkeling door de tijd op.</w:t>
       </w:r>
     </w:p>
-    <w:bookmarkEnd w:id="38"/>
-    <w:bookmarkStart w:id="39" w:name="landelijke-vegetatie-databank"/>
     <w:p>
       <w:pPr>
         <w:pStyle w:val="Heading4"/>
       </w:pPr>
+      <w:bookmarkStart w:id="43" w:name="_0079604d46da30ac9b5828c2b6c106eff7cd8f8"/>
       <w:r>
         <w:t xml:space="preserve">1.6.3. Landelijke Vegetatie Databank</w:t>
       </w:r>
+      <w:bookmarkEnd w:id="43"/>
     </w:p>
     <w:p>
       <w:pPr>
@@ -5480,15 +5678,15 @@
         <w:t xml:space="preserve">behouden. Dit betreft 122 naamgebruiken, niet 122 waarnemingen. De toevoeging aan het register verandert geen meetwaarden, ruimtelijke toelating, overlapbesluiten of bestaande bronvelden.</w:t>
       </w:r>
     </w:p>
-    <w:bookmarkEnd w:id="39"/>
-    <w:bookmarkStart w:id="40" w:name="historische-vlinder--en-motcollectie"/>
     <w:p>
       <w:pPr>
         <w:pStyle w:val="Heading4"/>
       </w:pPr>
+      <w:bookmarkStart w:id="44" w:name="_a66e2be297c2cf82b37e3e4b59e101c55a2b789"/>
       <w:r>
         <w:t xml:space="preserve">1.6.4. Historische vlinder- en motcollectie</w:t>
       </w:r>
+      <w:bookmarkEnd w:id="44"/>
     </w:p>
     <w:p>
       <w:pPr>
@@ -5544,15 +5742,15 @@
         <w:t xml:space="preserve">De collectie geeft controleerbare historische aanwezigheid, vooral door de intensieve vangsten van J.A.W. Lucas in 1955–1956. Zonder vanginspanning en lege vangnachten is dit geen populatietrend. De mogelijke NDFF-overlap blijft gemarkeerd en wordt niet automatisch samengevoegd.</w:t>
       </w:r>
     </w:p>
-    <w:bookmarkEnd w:id="40"/>
-    <w:bookmarkStart w:id="41" w:name="naturalis-botany"/>
     <w:p>
       <w:pPr>
         <w:pStyle w:val="Heading4"/>
       </w:pPr>
+      <w:bookmarkStart w:id="45" w:name="_0623f0a4d9ecb153e84d6aa679ad58f6c310383"/>
       <w:r>
         <w:t xml:space="preserve">1.6.5. Naturalis Botany</w:t>
       </w:r>
+      <w:bookmarkEnd w:id="45"/>
     </w:p>
     <w:p>
       <w:pPr>
@@ -5608,15 +5806,15 @@
         <w:t xml:space="preserve">Gedateerde historische plantenvondsten met bewaard bewijsmateriaal. De records tonen aanwezigheid, geen gestandaardiseerde telinspanning of afwezigheid.</w:t>
       </w:r>
     </w:p>
-    <w:bookmarkEnd w:id="41"/>
-    <w:bookmarkStart w:id="42" w:name="naturalis-coleoptera"/>
     <w:p>
       <w:pPr>
         <w:pStyle w:val="Heading4"/>
       </w:pPr>
+      <w:bookmarkStart w:id="46" w:name="_dd278617f9613de433492781e9679e24605d2f3"/>
       <w:r>
         <w:t xml:space="preserve">1.6.6. Naturalis Coleoptera</w:t>
       </w:r>
+      <w:bookmarkEnd w:id="46"/>
     </w:p>
     <w:p>
       <w:pPr>
@@ -5672,16 +5870,15 @@
         <w:t xml:space="preserve">Historische aanwezigheid van kevers met bewaard collectiemateriaal. De bron ondersteunt geen populatietrend zonder gestandaardiseerde vanginspanning. De oorspronkelijke etiketplaats en de gepubliceerde locatie-onzekerheid blijven per specimen beschikbaar.</w:t>
       </w:r>
     </w:p>
-    <w:bookmarkEnd w:id="42"/>
-    <w:bookmarkEnd w:id="43"/>
-    <w:bookmarkStart w:id="44" w:name="X5d611a31ac68a696fd179c2c85c282500afefc7"/>
     <w:p>
       <w:pPr>
         <w:pStyle w:val="Heading3"/>
       </w:pPr>
+      <w:bookmarkStart w:id="47" w:name="_4dcded00268e6461b0ddc34253d4faf52bf1dd1"/>
       <w:r>
         <w:t xml:space="preserve">1.7. Openstaande ruimtelijke toelatingscontrole</w:t>
       </w:r>
+      <w:bookmarkEnd w:id="47"/>
     </w:p>
     <w:p>
       <w:pPr>
@@ -5711,15 +5908,15 @@
         <w:t xml:space="preserve">Deze records blijven herkenbaar als bronmateriaal, maar worden niet zonder een afzonderlijk ruimtelijk besluit in Meijendelanalyses gebruikt. Alle 37.770 vangblikevents en alle territoriumplots liggen binnen het basisgebied.</w:t>
       </w:r>
     </w:p>
-    <w:bookmarkEnd w:id="44"/>
-    <w:bookmarkStart w:id="50" w:name="verklarende-omgevingslagen"/>
     <w:p>
       <w:pPr>
         <w:pStyle w:val="Heading3"/>
       </w:pPr>
+      <w:bookmarkStart w:id="48" w:name="_14c58f11b78e283997281ebde92c6b31ebc0c80"/>
       <w:r>
         <w:t xml:space="preserve">1.8. Verklarende omgevingslagen</w:t>
       </w:r>
+      <w:bookmarkEnd w:id="48"/>
     </w:p>
     <w:p>
       <w:pPr>
@@ -5729,14 +5926,15 @@
         <w:t xml:space="preserve">Deze gegevens zijn geen soortenwaarnemingen. Zij kunnen wel helpen om ecologische veranderingen te beschrijven of als mogelijke verklaring te toetsen.</w:t>
       </w:r>
     </w:p>
-    <w:bookmarkStart w:id="45" w:name="dagelijks-weer"/>
     <w:p>
       <w:pPr>
         <w:pStyle w:val="Heading4"/>
       </w:pPr>
+      <w:bookmarkStart w:id="49" w:name="_97e37a83ef92e6db79e0a815abf4c3d8d6d1754"/>
       <w:r>
         <w:t xml:space="preserve">1.8.1. Dagelijks weer</w:t>
       </w:r>
+      <w:bookmarkEnd w:id="49"/>
     </w:p>
     <w:p>
       <w:pPr>
@@ -5792,15 +5990,15 @@
         <w:t xml:space="preserve">Temperatuur, neerslag, wind, zon en luchtdruk kunnen als covariaten worden gebruikt. Alleen de genormaliseerde analyseview is geldig; 2026 is nog niet compleet.</w:t>
       </w:r>
     </w:p>
-    <w:bookmarkEnd w:id="45"/>
-    <w:bookmarkStart w:id="46" w:name="hoogte"/>
     <w:p>
       <w:pPr>
         <w:pStyle w:val="Heading4"/>
       </w:pPr>
+      <w:bookmarkStart w:id="50" w:name="_625608f018b59d28869e33232003bd07c2f07d5"/>
       <w:r>
         <w:t xml:space="preserve">1.8.2. Hoogte</w:t>
       </w:r>
+      <w:bookmarkEnd w:id="50"/>
     </w:p>
     <w:p>
       <w:pPr>
@@ -5856,15 +6054,15 @@
         <w:t xml:space="preserve">Beschrijft hoogte en hoogtevariatie per plot. Eén peiljaar geeft geen ontwikkeling door de tijd.</w:t>
       </w:r>
     </w:p>
-    <w:bookmarkEnd w:id="46"/>
-    <w:bookmarkStart w:id="47" w:name="stikstofdepositie"/>
     <w:p>
       <w:pPr>
         <w:pStyle w:val="Heading4"/>
       </w:pPr>
+      <w:bookmarkStart w:id="51" w:name="_8ebc62c1d17a2d7a08504bddffeeb5916a0bcb3"/>
       <w:r>
         <w:t xml:space="preserve">1.8.3. Stikstofdepositie</w:t>
       </w:r>
+      <w:bookmarkEnd w:id="51"/>
     </w:p>
     <w:p>
       <w:pPr>
@@ -5920,15 +6118,15 @@
         <w:t xml:space="preserve">Geschikt als mogelijke verklarende factor naast soorten- en vegetatiereeksen. Een samenhang bewijst niet dat stikstof de enige oorzaak is.</w:t>
       </w:r>
     </w:p>
-    <w:bookmarkEnd w:id="47"/>
-    <w:bookmarkStart w:id="48" w:name="bodemgebruik"/>
     <w:p>
       <w:pPr>
         <w:pStyle w:val="Heading4"/>
       </w:pPr>
+      <w:bookmarkStart w:id="52" w:name="_972156668716d33d6f7bf93cdaf573c7928edca"/>
       <w:r>
         <w:t xml:space="preserve">1.8.4. Bodemgebruik</w:t>
       </w:r>
+      <w:bookmarkEnd w:id="52"/>
     </w:p>
     <w:p>
       <w:pPr>
@@ -5984,15 +6182,15 @@
         <w:t xml:space="preserve">Laat veranderingen in de ruimtelijke omgeving van plots zien. De meetjaren zijn niet jaarlijks beschikbaar.</w:t>
       </w:r>
     </w:p>
-    <w:bookmarkEnd w:id="48"/>
-    <w:bookmarkStart w:id="49" w:name="natura-2000-habitat"/>
     <w:p>
       <w:pPr>
         <w:pStyle w:val="Heading4"/>
       </w:pPr>
+      <w:bookmarkStart w:id="53" w:name="_92770fc640c1bb2fd0ffeda71d68ce2650b46be"/>
       <w:r>
         <w:t xml:space="preserve">1.8.5. Natura 2000-habitat</w:t>
       </w:r>
+      <w:bookmarkEnd w:id="53"/>
     </w:p>
     <w:p>
       <w:pPr>
@@ -6048,108 +6246,363 @@
         <w:t xml:space="preserve">Geeft de verdeling van habitattypen binnen plots. Dit is één kaartjaar; de aangekondigde T1-kaart is nodig voor een directe vergelijking door de tijd.</w:t>
       </w:r>
     </w:p>
-    <w:bookmarkEnd w:id="49"/>
-    <w:bookmarkEnd w:id="50"/>
-    <w:bookmarkEnd w:id="51"/>
-    <w:bookmarkStart w:id="59" w:name="X3b532014da7425692b0b753bfd67f02e729afe2"/>
+    <w:p>
+      <w:pPr>
+        <w:pStyle w:val="Heading3"/>
+      </w:pPr>
+      <w:bookmarkStart w:id="54" w:name="_f1f9cc3f4e7e57e7e99ffc1d85334cce67c3650"/>
+      <w:r>
+        <w:t xml:space="preserve">1.9. Werkzaamheden en beheermaatregelen</w:t>
+      </w:r>
+      <w:bookmarkEnd w:id="54"/>
+    </w:p>
+    <w:p>
+      <w:pPr>
+        <w:pStyle w:val="FirstParagraph"/>
+      </w:pPr>
+      <w:r>
+        <w:t xml:space="preserve">Deze laag bevat geen nieuwe soortenwaarnemingen. Zij legt uitvoeringsinformatie vast die later, na een afzonderlijk bewezen ruimtelijke koppeling, als verklarende beheerlaag kan worden gebruikt.</w:t>
+      </w:r>
+    </w:p>
+    <w:p>
+      <w:pPr>
+        <w:pStyle w:val="BodyText"/>
+      </w:pPr>
+      <w:r>
+        <w:rPr>
+          <w:b/>
+          <w:bCs/>
+        </w:rPr>
+        <w:t xml:space="preserve">Broncontrole.</w:t>
+      </w:r>
+      <w:r>
+        <w:t xml:space="preserve"> </w:t>
+      </w:r>
+      <w:r>
+        <w:t xml:space="preserve">De lokale Zotero-bibliotheek bevatte op 13 oktober 2026 1.434 items en 807 bijlagen. Alle 807 bijlagebestanden zijn op de toegestane gekoppelde opslag onder</w:t>
+      </w:r>
+      <w:r>
+        <w:t xml:space="preserve"> </w:t>
+      </w:r>
+      <w:r>
+        <w:rPr>
+          <w:rStyle w:val="VerbatimChar"/>
+        </w:rPr>
+        <w:t xml:space="preserve">/Volumes/zotero</w:t>
+      </w:r>
+      <w:r>
+        <w:t xml:space="preserve"> </w:t>
+      </w:r>
+      <w:r>
+        <w:t xml:space="preserve">gevonden en bestandsgewijs geraadpleegd via tekstextractie, formaatcontrole en voor vier relevante scans OCR. De inhoudelijke selectie leverde vijf lokale hoofdbronnen op:</w:t>
+      </w:r>
+      <w:r>
+        <w:t xml:space="preserve"> </w:t>
+      </w:r>
+      <w:r>
+        <w:rPr>
+          <w:i/>
+          <w:iCs/>
+        </w:rPr>
+        <w:t xml:space="preserve">De slibverwijdering van Pan 13</w:t>
+      </w:r>
+      <w:r>
+        <w:t xml:space="preserve"> </w:t>
+      </w:r>
+      <w:r>
+        <w:t xml:space="preserve">(1991),</w:t>
+      </w:r>
+      <w:r>
+        <w:t xml:space="preserve"> </w:t>
+      </w:r>
+      <w:r>
+        <w:rPr>
+          <w:i/>
+          <w:iCs/>
+        </w:rPr>
+        <w:t xml:space="preserve">Natuurherstel van de Kikkervalleien in Noord-Meijendel</w:t>
+      </w:r>
+      <w:r>
+        <w:t xml:space="preserve"> </w:t>
+      </w:r>
+      <w:r>
+        <w:t xml:space="preserve">(2010),</w:t>
+      </w:r>
+      <w:r>
+        <w:t xml:space="preserve"> </w:t>
+      </w:r>
+      <w:r>
+        <w:rPr>
+          <w:i/>
+          <w:iCs/>
+        </w:rPr>
+        <w:t xml:space="preserve">Grenzen slechten in Meijendel: stuifgaten in de zeereep</w:t>
+      </w:r>
+      <w:r>
+        <w:t xml:space="preserve"> </w:t>
+      </w:r>
+      <w:r>
+        <w:t xml:space="preserve">(2017), de definitieve</w:t>
+      </w:r>
+      <w:r>
+        <w:t xml:space="preserve"> </w:t>
+      </w:r>
+      <w:r>
+        <w:rPr>
+          <w:i/>
+          <w:iCs/>
+        </w:rPr>
+        <w:t xml:space="preserve">Evaluatie Natura 2000-beheerplan Meijendel &amp; Berkheide</w:t>
+      </w:r>
+      <w:r>
+        <w:t xml:space="preserve"> </w:t>
+      </w:r>
+      <w:r>
+        <w:t xml:space="preserve">(25 april 2025) en het ontwerpbeheerplan 2026–2032 (13 januari 2026). Het ontwerp is alleen als historische aanvulling en plancontext gebruikt; ontwerpmaatregelen zijn niet als uitgevoerd ingevoerd.</w:t>
+      </w:r>
+    </w:p>
+    <w:p>
+      <w:pPr>
+        <w:pStyle w:val="BodyText"/>
+      </w:pPr>
+      <w:r>
+        <w:t xml:space="preserve">Daarbij zijn zeven officiële internetbronnen geraadpleegd: vijf Dunea-pagina's over optimalisatie van de waterwinning, beheer in Meeuwenduin en Prinsenduin, vervanging van slagbomen, actuele werkzaamheden en duindynamiek; het Dunea-jaarverslag 2024; en het Zuid-Hollandse subsidie-openstellingsbesluit voor Bendel. De bronnen staan afzonderlijk in</w:t>
+      </w:r>
+      <w:r>
+        <w:t xml:space="preserve"> </w:t>
+      </w:r>
+      <w:r>
+        <w:rPr>
+          <w:rStyle w:val="VerbatimChar"/>
+        </w:rPr>
+        <w:t xml:space="preserve">maatregel_bron</w:t>
+      </w:r>
+      <w:r>
+        <w:t xml:space="preserve">, met URL of Zotero-itemcode, brondatum, raadpleegdatum en bronstatus.</w:t>
+      </w:r>
+    </w:p>
+    <w:p>
+      <w:pPr>
+        <w:pStyle w:val="BodyText"/>
+      </w:pPr>
+      <w:r>
+        <w:rPr>
+          <w:b/>
+          <w:bCs/>
+        </w:rPr>
+        <w:t xml:space="preserve">Omvang en periode.</w:t>
+      </w:r>
+      <w:r>
+        <w:t xml:space="preserve"> </w:t>
+      </w:r>
+      <w:r>
+        <w:t xml:space="preserve">De levende lokale database bevat 12 projecten, 12 bronnen, 33 uitvoeringen, 58 expliciete jaarbeoordelingen uit 1988–2025 en 39 bronkoppelingen. Van de jaarbeoordelingen zijn er 42</w:t>
+      </w:r>
+      <w:r>
+        <w:t xml:space="preserve"> </w:t>
+      </w:r>
+      <w:r>
+        <w:rPr>
+          <w:rStyle w:val="VerbatimChar"/>
+        </w:rPr>
+        <w:t xml:space="preserve">uitgevoerd</w:t>
+      </w:r>
+      <w:r>
+        <w:t xml:space="preserve">, 9</w:t>
+      </w:r>
+      <w:r>
+        <w:t xml:space="preserve"> </w:t>
+      </w:r>
+      <w:r>
+        <w:rPr>
+          <w:rStyle w:val="VerbatimChar"/>
+        </w:rPr>
+        <w:t xml:space="preserve">niet_uitgevoerd</w:t>
+      </w:r>
+      <w:r>
+        <w:t xml:space="preserve"> </w:t>
+      </w:r>
+      <w:r>
+        <w:t xml:space="preserve">en 7</w:t>
+      </w:r>
+      <w:r>
+        <w:t xml:space="preserve"> </w:t>
+      </w:r>
+      <w:r>
+        <w:rPr>
+          <w:rStyle w:val="VerbatimChar"/>
+        </w:rPr>
+        <w:t xml:space="preserve">onbekend</w:t>
+      </w:r>
+      <w:r>
+        <w:t xml:space="preserve">. De uitvoeringen lopen volgens de beschikbare datumvelden van oktober 1988 tot en met een gepland einde in maart 2027. Geplande werkzaamheden bij de Paardenstal en het subsidieerbare Bendel-nabeheer hebben geen uitgevoerd jaar gekregen; elektriciteitswerk in Vallei Meijendel staat als uitvoering onbekend en heeft eveneens geen jaarregel.</w:t>
+      </w:r>
+    </w:p>
+    <w:p>
+      <w:pPr>
+        <w:pStyle w:val="BodyText"/>
+      </w:pPr>
+      <w:r>
+        <w:rPr>
+          <w:b/>
+          <w:bCs/>
+        </w:rPr>
+        <w:t xml:space="preserve">Ruimtelijke kwaliteit.</w:t>
+      </w:r>
+      <w:r>
+        <w:t xml:space="preserve"> </w:t>
+      </w:r>
+      <w:r>
+        <w:t xml:space="preserve">De SOVON-plotlaag versie 2025 bevat 55 actuele kavelpolygonen in RD New; alle 55 zijn aanwezig en geldig. Ton heeft op 13 oktober 2026 alle 55 actuele en 14 historische kavels ingedeeld in vijf Meijendel-deelgebieden of drie speciale gebieden. De</w:t>
+      </w:r>
+      <w:r>
+        <w:t xml:space="preserve"> </w:t>
+      </w:r>
+      <w:hyperlink r:id="rId55">
+        <w:r>
+          <w:rPr>
+            <w:rStyle w:val="Hyperlink"/>
+          </w:rPr>
+          <w:t xml:space="preserve">globale overzichtskaart met historische gebiedsnamen</w:t>
+        </w:r>
+      </w:hyperlink>
+      <w:r>
+        <w:t xml:space="preserve"> </w:t>
+      </w:r>
+      <w:r>
+        <w:t xml:space="preserve">is als naamcontext gebruikt; zij bevat geen digitale grenzen waarmee namen als Meeuwenhoek, Harstenhoek of De Klip exact kunnen worden afgebakend. De 55 actuele polygonen leveren acht topologisch samengevoegde gebiedsgeometrieën op. De 14 historische kavels hebben in deze plotversie geen afzonderlijke geometrie en blijven daarom uitsluitend classificatieregels.</w:t>
+      </w:r>
+    </w:p>
+    <w:p>
+      <w:pPr>
+        <w:pStyle w:val="BodyText"/>
+      </w:pPr>
+      <w:r>
+        <w:rPr>
+          <w:rStyle w:val="VerbatimChar"/>
+        </w:rPr>
+        <w:t xml:space="preserve">maatregel_geometrie</w:t>
+      </w:r>
+      <w:r>
+        <w:t xml:space="preserve"> </w:t>
+      </w:r>
+      <w:r>
+        <w:t xml:space="preserve">bevat nog nul uitvoeringsgeometrieën.</w:t>
+      </w:r>
+      <w:r>
+        <w:t xml:space="preserve"> </w:t>
+      </w:r>
+      <w:r>
+        <w:rPr>
+          <w:rStyle w:val="VerbatimChar"/>
+        </w:rPr>
+        <w:t xml:space="preserve">maatregel_uitvoering_gebied</w:t>
+      </w:r>
+      <w:r>
+        <w:t xml:space="preserve"> </w:t>
+      </w:r>
+      <w:r>
+        <w:t xml:space="preserve">en</w:t>
+      </w:r>
+      <w:r>
+        <w:t xml:space="preserve"> </w:t>
+      </w:r>
+      <w:r>
+        <w:rPr>
+          <w:rStyle w:val="VerbatimChar"/>
+        </w:rPr>
+        <w:t xml:space="preserve">maatregel_plot_koppeling</w:t>
+      </w:r>
+      <w:r>
+        <w:t xml:space="preserve"> </w:t>
+      </w:r>
+      <w:r>
+        <w:t xml:space="preserve">bevatten ieder één veilige relatie: het ontwerpbeheerplan noemt Voorlinden en Ton bevestigde M91 als Voorlinden. Het doorsnijdingspercentage blijft leeg omdat de precieze uitvoeringsvoetafdruk binnen M91 niet bekend is. De jaarstatus voor 2025 blijft</w:t>
+      </w:r>
+      <w:r>
+        <w:t xml:space="preserve"> </w:t>
+      </w:r>
+      <w:r>
+        <w:rPr>
+          <w:rStyle w:val="VerbatimChar"/>
+        </w:rPr>
+        <w:t xml:space="preserve">onbekend</w:t>
+      </w:r>
+      <w:r>
+        <w:t xml:space="preserve">; daardoor bevat</w:t>
+      </w:r>
+      <w:r>
+        <w:t xml:space="preserve"> </w:t>
+      </w:r>
+      <w:r>
+        <w:rPr>
+          <w:rStyle w:val="VerbatimChar"/>
+        </w:rPr>
+        <w:t xml:space="preserve">v_plot_jaar_maatregel_bronvast</w:t>
+      </w:r>
+      <w:r>
+        <w:t xml:space="preserve"> </w:t>
+      </w:r>
+      <w:r>
+        <w:t xml:space="preserve">voor deze uitvoering en in totaal nog nul regels. Andere benoemde deelgebieden zijn niet automatisch over alle onderliggende plots verdeeld.</w:t>
+      </w:r>
+    </w:p>
+    <w:p>
+      <w:pPr>
+        <w:pStyle w:val="BodyText"/>
+      </w:pPr>
+      <w:r>
+        <w:rPr>
+          <w:b/>
+          <w:bCs/>
+        </w:rPr>
+        <w:t xml:space="preserve">Gebruik en grens.</w:t>
+      </w:r>
+      <w:r>
+        <w:t xml:space="preserve"> </w:t>
+      </w:r>
+      <w:r>
+        <w:t xml:space="preserve">De laag is geschikt om vast te leggen wat volgens welke bron is gepland, uitgevoerd, niet uitgevoerd of onbekend. Zij ondersteunt nog geen vergelijking van vogelontwikkeling per maatregelplot. De geëvalueerde bronnen melden bovendien geen afzonderlijke effectmeting per maatregel; uit de werkzaamhedenlaag volgt dus geen causaal beheereffect. De 144 bestaande regels in</w:t>
+      </w:r>
+      <w:r>
+        <w:t xml:space="preserve"> </w:t>
+      </w:r>
+      <w:r>
+        <w:rPr>
+          <w:rStyle w:val="VerbatimChar"/>
+        </w:rPr>
+        <w:t xml:space="preserve">plot_jaar_maatregel</w:t>
+      </w:r>
+      <w:r>
+        <w:t xml:space="preserve"> </w:t>
+      </w:r>
+      <w:r>
+        <w:t xml:space="preserve">betreffen begrazing in 16 plots uit 1991–1999, zijn bij deze migratie inhoudelijk ongewijzigd gebleven en worden niet als onderdeel van de nieuwe bronvaste laag geteld.</w:t>
+      </w:r>
+    </w:p>
+    <w:p>
+      <w:pPr>
+        <w:pStyle w:val="BodyText"/>
+      </w:pPr>
+      <w:r>
+        <w:rPr>
+          <w:b/>
+          <w:bCs/>
+        </w:rPr>
+        <w:t xml:space="preserve">Status.</w:t>
+      </w:r>
+      <w:r>
+        <w:t xml:space="preserve"> </w:t>
+      </w:r>
+      <w:r>
+        <w:t xml:space="preserve">Bronvast op project-, uitvoering- en jaarniveau. De algemene kavel- en gebiedsindeling is geometrisch beschikbaar voor de 55 actuele plots uit 2025. Alleen Voorlinden heeft een gevalideerde maatregel–plotrelatie; omdat uitvoering in 2025 onbekend is, zijn nog geen maatregelen tot de bronvaste plot-jaarlaag toegelaten.</w:t>
+      </w:r>
+    </w:p>
     <w:p>
       <w:pPr>
         <w:pStyle w:val="Heading2"/>
       </w:pPr>
-      <w:r>
-        <w:t>1.9. Werkzaamheden en beheermaatregelen</w:t>
-      </w:r>
-    </w:p>
-    <w:p>
-      <w:pPr>
-        <w:pStyle w:val="BodyText"/>
-      </w:pPr>
-      <w:r>
-        <w:t>Deze laag bevat geen nieuwe soortenwaarnemingen. Zij legt uitvoeringsinformatie vast die later, na een afzonderlijk bewezen ruimtelijke koppeling, als verklarende beheerlaag kan worden gebruikt.</w:t>
-      </w:r>
-    </w:p>
-    <w:p>
-      <w:pPr>
-        <w:pStyle w:val="BodyText"/>
-      </w:pPr>
-      <w:r>
-        <w:rPr>
-          <w:b/>
-        </w:rPr>
-        <w:t>Broncontrole.</w:t>
-      </w:r>
-      <w:r>
-        <w:t xml:space="preserve"> De lokale Zotero-bibliotheek bevatte op 13 oktober 2026 1.434 items en 807 bijlagen. Alle 807 bijlagebestanden zijn op de toegestane gekoppelde opslag onder /Volumes/zotero gevonden en bestandsgewijs geraadpleegd via tekstextractie, formaatcontrole en voor vier relevante scans OCR. De inhoudelijke selectie leverde vijf lokale hoofdbronnen op: De slibverwijdering van Pan 13 (1991), Natuurherstel van de Kikkervalleien in Noord-Meijendel (2010), Grenzen slechten in Meijendel: stuifgaten in de zeereep (2017), de definitieve Evaluatie Natura 2000-beheerplan Meijendel &amp; Berkheide (25 april 2025) en het ontwerpbeheerplan 2026–2032 (13 januari 2026). Het ontwerp is alleen als historische aanvulling en plancontext gebruikt; ontwerpmaatregelen zijn niet als uitgevoerd ingevoerd.</w:t>
-      </w:r>
-    </w:p>
-    <w:p>
-      <w:pPr>
-        <w:pStyle w:val="BodyText"/>
-      </w:pPr>
-      <w:r>
-        <w:t>Daarbij zijn zeven officiële internetbronnen geraadpleegd: vijf Dunea-pagina's over optimalisatie van de waterwinning, beheer in Meeuwenduin en Prinsenduin, vervanging van slagbomen, actuele werkzaamheden en duindynamiek; het Dunea-jaarverslag 2024; en het Zuid-Hollandse subsidie-openstellingsbesluit voor Bendel. De bronnen staan afzonderlijk in maatregel_bron, met URL of Zotero-itemcode, brondatum, raadpleegdatum en bronstatus.</w:t>
-      </w:r>
-    </w:p>
-    <w:p>
-      <w:pPr>
-        <w:pStyle w:val="BodyText"/>
-      </w:pPr>
-      <w:r>
-        <w:rPr>
-          <w:b/>
-        </w:rPr>
-        <w:t>Omvang en periode.</w:t>
-      </w:r>
-      <w:r>
-        <w:t xml:space="preserve"> De levende lokale database bevat 12 projecten, 12 bronnen, 33 uitvoeringen, 58 expliciete jaarbeoordelingen uit 1988–2025 en 39 bronkoppelingen. Van de jaarbeoordelingen zijn er 42 uitgevoerd, 9 niet uitgevoerd en 7 onbekend. De uitvoeringen lopen volgens de beschikbare datumvelden van oktober 1988 tot en met een gepland einde in maart 2027. Geplande werkzaamheden bij de Paardenstal en het subsidieerbare Bendel-nabeheer hebben geen uitgevoerd jaar gekregen; elektriciteitswerk in Vallei Meijendel staat als uitvoering onbekend en heeft eveneens geen jaarregel.</w:t>
-      </w:r>
-    </w:p>
-    <w:p>
-      <w:pPr>
-        <w:pStyle w:val="BodyText"/>
-      </w:pPr>
-      <w:r>
-        <w:rPr>
-          <w:b/>
-        </w:rPr>
-        <w:t>Ruimtelijke kwaliteit.</w:t>
-      </w:r>
-      <w:r>
-        <w:t xml:space="preserve"> De geraadpleegde bronnen noemen onder meer Pan 13, Kikkervalleien, de zeereep, Meeuwenduin, Prinsenduin, Vallei Meijendel en Bendel, maar leveren in deze selectie geen gevalideerde uitvoeringsgeometrie of eenduidige vogelplotrelatie. maatregel_geometrie en maatregel_plot_koppeling bevatten daarom beide nul regels. De afgeleide view v_plot_jaar_maatregel_bronvast bevat eveneens nul regels. Een benoemd deelgebied, oppervlaktecijfer of algemene aanduiding Meijendel wordt niet tot een plotkoppeling omgerekend.</w:t>
-      </w:r>
-    </w:p>
-    <w:p>
-      <w:pPr>
-        <w:pStyle w:val="BodyText"/>
-      </w:pPr>
-      <w:r>
-        <w:rPr>
-          <w:b/>
-        </w:rPr>
-        <w:t>Gebruik en grens.</w:t>
-      </w:r>
-      <w:r>
-        <w:t xml:space="preserve"> De laag is geschikt om vast te leggen wat volgens welke bron is gepland, uitgevoerd, niet uitgevoerd of onbekend. Zij ondersteunt nog geen vergelijking van vogelontwikkeling per maatregelplot. De geëvalueerde bronnen melden bovendien geen afzonderlijke effectmeting per maatregel; uit de werkzaamhedenlaag volgt dus geen causaal beheereffect. De 144 bestaande regels in plot_jaar_maatregel betreffen begrazing in 16 plots uit 1991–1999, zijn bij deze migratie inhoudelijk ongewijzigd gebleven en worden niet als onderdeel van de nieuwe bronvaste laag geteld.</w:t>
-      </w:r>
-    </w:p>
-    <w:p>
-      <w:pPr>
-        <w:pStyle w:val="BodyText"/>
-      </w:pPr>
-      <w:r>
-        <w:rPr>
-          <w:b/>
-        </w:rPr>
-        <w:t>Status.</w:t>
-      </w:r>
-      <w:r>
-        <w:t xml:space="preserve"> Bronvast op project-, uitvoering- en jaarniveau; ruimtelijk nog niet toegelaten tot plot-jaaranalyses.</w:t>
-      </w:r>
-    </w:p>
-    <w:p>
-      <w:pPr>
-        <w:pStyle w:val="Heading2"/>
-      </w:pPr>
+      <w:bookmarkStart w:id="56" w:name="_692b0a71312b2a939db271d079fb23757bfc15a"/>
       <w:r>
         <w:t xml:space="preserve">2. Bronnen in MySQL-database</w:t>
       </w:r>
@@ -6162,6 +6615,7 @@
         </w:rPr>
         <w:t xml:space="preserve">Meijendel_bronnen</w:t>
       </w:r>
+      <w:bookmarkEnd w:id="56"/>
     </w:p>
     <w:p>
       <w:pPr>
@@ -6186,14 +6640,15 @@
         <w:t xml:space="preserve">gebruikt. De nieuwe bijen- en aquatische context uit fase 2 staat op 26 september 2026 alleen in de lokale canonieke database en is nog niet naar de VPS gepubliceerd.</w:t>
       </w:r>
     </w:p>
-    <w:bookmarkStart w:id="53" w:name="duinvalleivegetatie"/>
     <w:p>
       <w:pPr>
         <w:pStyle w:val="Heading3"/>
       </w:pPr>
+      <w:bookmarkStart w:id="57" w:name="_7ae3f60e8dd3c65bdde3d5f608a55d96632a876"/>
       <w:r>
         <w:t xml:space="preserve">2.1. Duinvalleivegetatie</w:t>
       </w:r>
+      <w:bookmarkEnd w:id="57"/>
     </w:p>
     <w:p>
       <w:pPr>
@@ -6215,7 +6670,7 @@
       <w:r>
         <w:t xml:space="preserve"> </w:t>
       </w:r>
-      <w:hyperlink r:id="rId52">
+      <w:hyperlink r:id="rId58">
         <w:r>
           <w:rPr>
             <w:rStyle w:val="Hyperlink"/>
@@ -6260,15 +6715,15 @@
         <w:t xml:space="preserve">De volledige matrix van 208 taxa bevat echte nullen en maakt vergelijking tussen de drie jaren mogelijk. De locatiecodes zijn nog niet betrouwbaar aan geometrieën gekoppeld. Opname 18I01 blijft uitgesloten: daarin zijn 159 taxa geregistreerd, tegenover maximaal 40 in alle overige opnamen. Deze reeks blijft afzonderlijk van de provinciale PQ-reeks.</w:t>
       </w:r>
     </w:p>
-    <w:bookmarkEnd w:id="53"/>
-    <w:bookmarkStart w:id="54" w:name="vogelstand-1924"/>
     <w:p>
       <w:pPr>
         <w:pStyle w:val="Heading3"/>
       </w:pPr>
+      <w:bookmarkStart w:id="59" w:name="_6cd5cd3671e295c222d5bd4a47757f0a76f0a19"/>
       <w:r>
         <w:t xml:space="preserve">2.2. Vogelstand 1924</w:t>
       </w:r>
+      <w:bookmarkEnd w:id="59"/>
     </w:p>
     <w:p>
       <w:pPr>
@@ -6339,15 +6794,15 @@
         <w:t xml:space="preserve">buiten de canonieke export. Deze blijft tijdens de PQ-publicatie onaangetast; haar aanwezigheid geeft geen nieuwe analysetoestemming. Dit schema-overzicht bewijst de tabelnaam en het type, niet haar actuele rijtelling.</w:t>
       </w:r>
     </w:p>
-    <w:bookmarkEnd w:id="54"/>
-    <w:bookmarkStart w:id="55" w:name="jachtspinnen"/>
     <w:p>
       <w:pPr>
         <w:pStyle w:val="Heading3"/>
       </w:pPr>
+      <w:bookmarkStart w:id="60" w:name="_b3fdc40884db1bbf06132e666e117a731445140"/>
       <w:r>
         <w:t xml:space="preserve">2.3. Jachtspinnen</w:t>
       </w:r>
+      <w:bookmarkEnd w:id="60"/>
     </w:p>
     <w:p>
       <w:pPr>
@@ -6403,15 +6858,15 @@
         <w:t xml:space="preserve">De samengevoegde vangstmatrix ondersteunt een soorten-milieuanalyse, maar geen ontwikkeling door de tijd. Datums en vangrondes ontbreken. De 28 locatienummers zijn bovendien nog niet naar werkelijke plaatsen te vertalen en mogen daarom niet als Meijendelwaarnemingen worden geanalyseerd.</w:t>
       </w:r>
     </w:p>
-    <w:bookmarkEnd w:id="55"/>
-    <w:bookmarkStart w:id="56" w:name="literatuuroverzicht"/>
     <w:p>
       <w:pPr>
         <w:pStyle w:val="Heading3"/>
       </w:pPr>
+      <w:bookmarkStart w:id="61" w:name="_7c2c13aacf0ea926ee35ca97ab69391a3624a6f"/>
       <w:r>
         <w:t xml:space="preserve">2.4. Literatuuroverzicht</w:t>
       </w:r>
+      <w:bookmarkEnd w:id="61"/>
     </w:p>
     <w:p>
       <w:pPr>
@@ -6467,15 +6922,15 @@
         <w:t xml:space="preserve">Zoekingang naar onderzoek en historische context. Dit zijn verwijzingen, geen waarnemingsregels; volledige teksten blijven in Zotero en worden niet op de VPS gekopieerd.</w:t>
       </w:r>
     </w:p>
-    <w:bookmarkEnd w:id="56"/>
-    <w:bookmarkStart w:id="57" w:name="bijenmonitoring-in-vier-beheergebieden"/>
     <w:p>
       <w:pPr>
         <w:pStyle w:val="Heading3"/>
       </w:pPr>
+      <w:bookmarkStart w:id="62" w:name="_4a1f2475629c7656191227e4ca81566bef187e2"/>
       <w:r>
         <w:t xml:space="preserve">2.5. Bijenmonitoring in vier beheergebieden</w:t>
       </w:r>
+      <w:bookmarkEnd w:id="62"/>
     </w:p>
     <w:p>
       <w:pPr>
@@ -6543,15 +6998,15 @@
         <w:t xml:space="preserve">. Drie onderzoeksjaren zijn bovendien een reeks van gestandaardiseerde herhalingen, geen robuuste langjarige trend.</w:t>
       </w:r>
     </w:p>
-    <w:bookmarkEnd w:id="57"/>
-    <w:bookmarkStart w:id="58" w:name="aquatische-macrofauna-19741975"/>
     <w:p>
       <w:pPr>
         <w:pStyle w:val="Heading3"/>
       </w:pPr>
+      <w:bookmarkStart w:id="63" w:name="_bef92f685785a24a45e5325384551ba55c57cc1"/>
       <w:r>
         <w:t xml:space="preserve">2.6. Aquatische macrofauna 1974–1975</w:t>
       </w:r>
+      <w:bookmarkEnd w:id="63"/>
     </w:p>
     <w:p>
       <w:pPr>
@@ -6622,16 +7077,15 @@
         <w:t xml:space="preserve">overgebracht.</w:t>
       </w:r>
     </w:p>
-    <w:bookmarkEnd w:id="58"/>
-    <w:bookmarkEnd w:id="59"/>
-    <w:bookmarkStart w:id="79" w:name="Xae67a70ad36e2d1d11a7d910c2e5a6d669a3a5f"/>
     <w:p>
       <w:pPr>
         <w:pStyle w:val="Heading2"/>
       </w:pPr>
+      <w:bookmarkStart w:id="64" w:name="_2b62b82ef201b4c91783bce15da2b1d0258c34c"/>
       <w:r>
         <w:t xml:space="preserve">3. Geïdentificeerde externe kandidaatbronnen</w:t>
       </w:r>
+      <w:bookmarkEnd w:id="64"/>
     </w:p>
     <w:p>
       <w:pPr>
@@ -6641,23 +7095,25 @@
         <w:t xml:space="preserve">Deze bronnen zijn gevonden, maar nog niet toegelaten. De genoemde aantallen hebben betrekking op de al gemaakte Meijendelselectie of op de beschreven onderzoeksopzet. Voor iedere import volgt eerst controle van locatie per waarneming, overlap met bestaande bronnen, rechten en statistische betekenis.</w:t>
       </w:r>
     </w:p>
-    <w:bookmarkStart w:id="76" w:name="Xd53aceb4d9e4863cdbb6367737be5e291cdac65"/>
     <w:p>
       <w:pPr>
         <w:pStyle w:val="Heading3"/>
       </w:pPr>
+      <w:bookmarkStart w:id="65" w:name="_d53aceb4d9e4863cdbb6367737be5e291cdac65"/>
       <w:r>
         <w:t xml:space="preserve">Kandidaten met de grootste verwachte aanvulling</w:t>
       </w:r>
-    </w:p>
-    <w:bookmarkStart w:id="60" w:name="historische-en-actuele-ringgegevens"/>
+      <w:bookmarkEnd w:id="65"/>
+    </w:p>
     <w:p>
       <w:pPr>
         <w:pStyle w:val="Heading4"/>
       </w:pPr>
+      <w:bookmarkStart w:id="66" w:name="_bddce02f5cb2b082bf32fac381c8bc0ea5284d3"/>
       <w:r>
         <w:t xml:space="preserve">3.1. Historische en actuele ringgegevens</w:t>
       </w:r>
+      <w:bookmarkEnd w:id="66"/>
     </w:p>
     <w:p>
       <w:pPr>
@@ -6746,15 +7202,15 @@
         <w:t xml:space="preserve">blijkt in de officiële EURING-codebeschrijving de provincie Zuid-Holland aan te duiden en niet VRS Meijendel. Trektellen-site 403 is wel VRS Meijendel en bevat inspanningsinformatie, maar er is nog geen recordsleutel tussen beide bronnen gevonden. De 100.417 ruimtelijke treffers zijn daarom niet als VRS-Meijendelvangsten geïmporteerd.</w:t>
       </w:r>
     </w:p>
-    <w:bookmarkEnd w:id="60"/>
-    <w:bookmarkStart w:id="61" w:name="erosiepinnen-in-een-stuifkuilcomplex"/>
     <w:p>
       <w:pPr>
         <w:pStyle w:val="Heading4"/>
       </w:pPr>
+      <w:bookmarkStart w:id="67" w:name="_8071b7ae643e6cecadbf8a281c84bb90b511e63"/>
       <w:r>
         <w:t xml:space="preserve">3.2. Erosiepinnen in een stuifkuilcomplex</w:t>
       </w:r>
+      <w:bookmarkEnd w:id="67"/>
     </w:p>
     <w:p>
       <w:pPr>
@@ -6828,15 +7284,15 @@
         <w:t xml:space="preserve">Oorspronkelijke metingen en pinlocaties vinden en op waarnemingsniveau aan Meijendel koppelen</w:t>
       </w:r>
     </w:p>
-    <w:bookmarkEnd w:id="61"/>
-    <w:bookmarkStart w:id="62" w:name="langjarige-droge-duinvegetatieplots"/>
     <w:p>
       <w:pPr>
         <w:pStyle w:val="Heading4"/>
       </w:pPr>
+      <w:bookmarkStart w:id="68" w:name="_1b05a95cacb83608c9b762adcf4298810ed86f9"/>
       <w:r>
         <w:t xml:space="preserve">3.3. Langjarige droge-duinvegetatieplots</w:t>
       </w:r>
+      <w:bookmarkEnd w:id="68"/>
     </w:p>
     <w:p>
       <w:pPr>
@@ -6910,19 +7366,18 @@
         <w:t xml:space="preserve">De publicatiekaart toont de 41 punten in Helmduinen, Kijfhoek en Bierlap, maar zonder koppelbare plotcodes. De toegelaten LVD-opnamen leverden geen betrouwbare vertaling op naar deze 41 plots. Oorspronkelijke plotcodes, opnamen en locaties blijven daarom noodzakelijk.</w:t>
       </w:r>
     </w:p>
-    <w:bookmarkEnd w:id="62"/>
-    <w:bookmarkStart w:id="64" w:name="neuropteren-van-meijendel"/>
     <w:p>
       <w:pPr>
         <w:pStyle w:val="Heading4"/>
       </w:pPr>
+      <w:bookmarkStart w:id="70" w:name="_4578481a165cef1470f100d42a5e836ac7456f8"/>
       <w:r>
         <w:t xml:space="preserve">3.4.</w:t>
       </w:r>
       <w:r>
         <w:t xml:space="preserve"> </w:t>
       </w:r>
-      <w:hyperlink r:id="rId63">
+      <w:hyperlink r:id="rId69">
         <w:r>
           <w:rPr>
             <w:rStyle w:val="Hyperlink"/>
@@ -6930,6 +7385,7 @@
           <w:t xml:space="preserve">Neuropteren van Meijendel</w:t>
         </w:r>
       </w:hyperlink>
+      <w:bookmarkEnd w:id="70"/>
     </w:p>
     <w:p>
       <w:pPr>
@@ -7003,19 +7459,18 @@
         <w:t xml:space="preserve">De specimen- en soortenlijsten uit de publicatie digitaliseren, datum en plaats per record vaststellen en vergelijken met Naturalis-collecties en NDFF.</w:t>
       </w:r>
     </w:p>
-    <w:bookmarkEnd w:id="64"/>
-    <w:bookmarkStart w:id="66" w:name="zweefvliegen-van-meijendel"/>
     <w:p>
       <w:pPr>
         <w:pStyle w:val="Heading4"/>
       </w:pPr>
+      <w:bookmarkStart w:id="72" w:name="_642992b46f3d655730973d9bd57c00f9c7aad9f"/>
       <w:r>
         <w:t xml:space="preserve">3.5.</w:t>
       </w:r>
       <w:r>
         <w:t xml:space="preserve"> </w:t>
       </w:r>
-      <w:hyperlink r:id="rId65">
+      <w:hyperlink r:id="rId71">
         <w:r>
           <w:rPr>
             <w:rStyle w:val="Hyperlink"/>
@@ -7023,6 +7478,7 @@
           <w:t xml:space="preserve">Zweefvliegen van Meijendel</w:t>
         </w:r>
       </w:hyperlink>
+      <w:bookmarkEnd w:id="72"/>
     </w:p>
     <w:p>
       <w:pPr>
@@ -7096,15 +7552,15 @@
         <w:t xml:space="preserve">De volledige specimenlijst digitaliseren en per exemplaar datum en locatie vastleggen; daarna ontdubbelen tegen museumcollecties en NDFF.</w:t>
       </w:r>
     </w:p>
-    <w:bookmarkEnd w:id="66"/>
-    <w:bookmarkStart w:id="68" w:name="terra-dunes-plant--en-bodemmicrobiomen"/>
     <w:p>
       <w:pPr>
         <w:pStyle w:val="Heading4"/>
       </w:pPr>
+      <w:bookmarkStart w:id="73" w:name="_80b82bf48485caf594896b8d6bc490be5f328ee"/>
       <w:r>
         <w:t xml:space="preserve">3.6. TERRA-Dunes plant- en bodemmicrobiomen</w:t>
       </w:r>
+      <w:bookmarkEnd w:id="73"/>
     </w:p>
     <w:p>
       <w:pPr>
@@ -7126,7 +7582,7 @@
       <w:r>
         <w:t xml:space="preserve"> </w:t>
       </w:r>
-      <w:hyperlink r:id="rId67">
+      <w:hyperlink r:id="rId74">
         <w:r>
           <w:rPr>
             <w:rStyle w:val="Hyperlink"/>
@@ -7171,15 +7627,15 @@
         <w:t xml:space="preserve">Geschikt voor samenhang tussen vegetatie en microbiomen. Niet toelaten voordat de proefvlakken geografisch zijn gereconstrueerd.</w:t>
       </w:r>
     </w:p>
-    <w:bookmarkEnd w:id="68"/>
-    <w:bookmarkStart w:id="70" w:name="rups--en-bodemmicrobiomen"/>
     <w:p>
       <w:pPr>
         <w:pStyle w:val="Heading4"/>
       </w:pPr>
+      <w:bookmarkStart w:id="75" w:name="_4b2db10b2340db42e20505c45425c0b84f14c27"/>
       <w:r>
         <w:t xml:space="preserve">3.7. Rups- en bodemmicrobiomen</w:t>
       </w:r>
+      <w:bookmarkEnd w:id="75"/>
     </w:p>
     <w:p>
       <w:pPr>
@@ -7201,7 +7657,7 @@
       <w:r>
         <w:t xml:space="preserve"> </w:t>
       </w:r>
-      <w:hyperlink r:id="rId69">
+      <w:hyperlink r:id="rId76">
         <w:r>
           <w:rPr>
             <w:rStyle w:val="Hyperlink"/>
@@ -7246,15 +7702,15 @@
         <w:t xml:space="preserve">Eenmalige genetische en microbiële momentopname. Geen populatietrend, wel lokale ecologische vergelijking na controle van alle monsterlocaties.</w:t>
       </w:r>
     </w:p>
-    <w:bookmarkEnd w:id="70"/>
-    <w:bookmarkStart w:id="72" w:name="schimmels-bij-kruipwilg"/>
     <w:p>
       <w:pPr>
         <w:pStyle w:val="Heading4"/>
       </w:pPr>
+      <w:bookmarkStart w:id="77" w:name="_442e94e4e2997aa133d10bf618574e2528e759d"/>
       <w:r>
         <w:t xml:space="preserve">3.8. Schimmels bij kruipwilg</w:t>
       </w:r>
+      <w:bookmarkEnd w:id="77"/>
     </w:p>
     <w:p>
       <w:pPr>
@@ -7276,7 +7732,7 @@
       <w:r>
         <w:t xml:space="preserve"> </w:t>
       </w:r>
-      <w:hyperlink r:id="rId71">
+      <w:hyperlink r:id="rId78">
         <w:r>
           <w:rPr>
             <w:rStyle w:val="Hyperlink"/>
@@ -7321,15 +7777,15 @@
         <w:t xml:space="preserve">Bruikbaar als lokale microbiële referentie, niet als tijdreeks of gebiedsdekkende inventarisatie.</w:t>
       </w:r>
     </w:p>
-    <w:bookmarkEnd w:id="72"/>
-    <w:bookmarkStart w:id="74" w:name="plantengroei-bodemvocht-en-weer"/>
     <w:p>
       <w:pPr>
         <w:pStyle w:val="Heading4"/>
       </w:pPr>
+      <w:bookmarkStart w:id="79" w:name="_36e8e197a59cff4a0251b791dc5fc6bc0e135bf"/>
       <w:r>
         <w:t xml:space="preserve">3.9. Plantengroei, bodemvocht en weer</w:t>
       </w:r>
+      <w:bookmarkEnd w:id="79"/>
     </w:p>
     <w:p>
       <w:pPr>
@@ -7351,7 +7807,7 @@
       <w:r>
         <w:t xml:space="preserve"> </w:t>
       </w:r>
-      <w:hyperlink r:id="rId73">
+      <w:hyperlink r:id="rId80">
         <w:r>
           <w:rPr>
             <w:rStyle w:val="Hyperlink"/>
@@ -7396,15 +7852,15 @@
         <w:t xml:space="preserve">Gedetailleerde processtudie van de reactie van duingrassen op neerslag en droogte. Eerst locaties en meetkwaliteit controleren; één halfjaar geeft geen langjarige ontwikkeling.</w:t>
       </w:r>
     </w:p>
-    <w:bookmarkEnd w:id="74"/>
-    <w:bookmarkStart w:id="75" w:name="genetische-datasets-amfibieën"/>
     <w:p>
       <w:pPr>
         <w:pStyle w:val="Heading4"/>
       </w:pPr>
+      <w:bookmarkStart w:id="81" w:name="_49ed5beca1c3c65272a43e85c3687f3c3d41d64"/>
       <w:r>
         <w:t xml:space="preserve">3.10. Genetische datasets amfibieën</w:t>
       </w:r>
+      <w:bookmarkEnd w:id="81"/>
     </w:p>
     <w:p>
       <w:pPr>
@@ -7460,16 +7916,15 @@
         <w:t xml:space="preserve">Bruikbaar voor populatiegenetische context. Jaar, locatie en relatie met bestaande RAVON-waarnemingen moeten eerst worden vastgesteld.</w:t>
       </w:r>
     </w:p>
-    <w:bookmarkEnd w:id="75"/>
-    <w:bookmarkEnd w:id="76"/>
-    <w:bookmarkStart w:id="78" w:name="X8c2748f02893018608c8a38a1054acf3030739d"/>
     <w:p>
       <w:pPr>
         <w:pStyle w:val="Heading3"/>
       </w:pPr>
+      <w:bookmarkStart w:id="82" w:name="_136d668cd3b301eba92f27584d1a2d49d57a73c"/>
       <w:r>
         <w:t xml:space="preserve">3.11. Alleen context of nog een onderzoeksaanwijzing</w:t>
       </w:r>
+      <w:bookmarkEnd w:id="82"/>
     </w:p>
     <w:p>
       <w:pPr>
@@ -7615,7 +8070,7 @@
       <w:pPr>
         <w:pStyle w:val="BodyText"/>
       </w:pPr>
-      <w:hyperlink r:id="rId77">
+      <w:hyperlink r:id="rId83">
         <w:r>
           <w:rPr>
             <w:rStyle w:val="Hyperlink"/>
@@ -7675,16 +8130,15 @@
         <w:t xml:space="preserve">publicaties noemen 32–35 stuifkuilen die vanaf 1983 tweemaal per jaar zijn gemeten, 19 permanente vegetatieplots en vergelijkingen van luchtfoto’s en orthofoto’s. De oorspronkelijke tabellen, plot-ID’s en digitale kaartlagen zijn nog niet voldoende geïdentificeerd om deze als afzonderlijke gegevensbron toe te laten.</w:t>
       </w:r>
     </w:p>
-    <w:bookmarkEnd w:id="78"/>
-    <w:bookmarkEnd w:id="79"/>
-    <w:bookmarkStart w:id="80" w:name="verwachte-aanvullingen"/>
     <w:p>
       <w:pPr>
         <w:pStyle w:val="Heading2"/>
       </w:pPr>
+      <w:bookmarkStart w:id="84" w:name="_c540a83ee65aaec11aa446aec0815d16fd21e21"/>
       <w:r>
         <w:t xml:space="preserve">4. Verwachte aanvullingen</w:t>
       </w:r>
+      <w:bookmarkEnd w:id="84"/>
     </w:p>
     <w:p>
       <w:pPr>
@@ -7740,15 +8194,15 @@
         <w:t xml:space="preserve">Provincie Zuid-Holland heeft toegezegd de kaart te delen zodra zij later in 2026 beschikbaar komt. De kaart kan veranderingen in habitat helpen verklaren, maar is zelf geen soortenwaarneming.</w:t>
       </w:r>
     </w:p>
-    <w:bookmarkEnd w:id="80"/>
-    <w:bookmarkStart w:id="81" w:name="Xbd1d36805349ef5ec39b6efd044fd20b47e23f4"/>
     <w:p>
       <w:pPr>
         <w:pStyle w:val="Heading2"/>
       </w:pPr>
+      <w:bookmarkStart w:id="85" w:name="_422e6271160c2b04a3b59fb5b59cfcc2e3afc55"/>
       <w:r>
         <w:t xml:space="preserve">5. Bronnen die niet verder worden uitgewerkt</w:t>
       </w:r>
+      <w:bookmarkEnd w:id="85"/>
     </w:p>
     <w:p>
       <w:pPr>
@@ -7774,15 +8228,15 @@
         <w:t xml:space="preserve">Algemene verzamelbronnen zoals Observation.org, iNaturalist en eBird worden ook niet opnieuw als zelfstandige Meijendelbron ingevoerd zolang niet is aangetoond dat zij waarnemingen bevatten die ontbreken in NDFF of in de primaire VWG/SOVON-reeksen. Anders zou dezelfde waarneming vooral nogmaals worden opgeslagen.</w:t>
       </w:r>
     </w:p>
-    <w:bookmarkEnd w:id="81"/>
-    <w:bookmarkStart w:id="82" w:name="gebruik-van-dit-register"/>
     <w:p>
       <w:pPr>
         <w:pStyle w:val="Heading2"/>
       </w:pPr>
+      <w:bookmarkStart w:id="86" w:name="_b05dec49988a12f7955d21ff17f1c91e4d061eb"/>
       <w:r>
         <w:t xml:space="preserve">6. Gebruik van dit register</w:t>
       </w:r>
+      <w:bookmarkEnd w:id="86"/>
     </w:p>
     <w:p>
       <w:pPr>
@@ -7863,15 +8317,15 @@
         <w:t xml:space="preserve">Pas daarna volgt een afzonderlijk importbesluit.</w:t>
       </w:r>
     </w:p>
-    <w:bookmarkEnd w:id="82"/>
-    <w:bookmarkStart w:id="88" w:name="actieplan"/>
     <w:p>
       <w:pPr>
         <w:pStyle w:val="Heading2"/>
       </w:pPr>
+      <w:bookmarkStart w:id="87" w:name="_67781990bcb7d7d43cc312a7ef48f37a1f83265"/>
       <w:r>
         <w:t xml:space="preserve">7. Actieplan</w:t>
       </w:r>
+      <w:bookmarkEnd w:id="87"/>
     </w:p>
     <w:p>
       <w:pPr>
@@ -7896,14 +8350,15 @@
         <w:t xml:space="preserve">bevat alleen waarnemingen die aan de ruimtelijke toelatingsregel voldoen.</w:t>
       </w:r>
     </w:p>
-    <w:bookmarkStart w:id="83" w:name="fase-1-openbare-direct-toetsbare-bronnen"/>
     <w:p>
       <w:pPr>
         <w:pStyle w:val="Heading3"/>
       </w:pPr>
+      <w:bookmarkStart w:id="88" w:name="_d7f889e2150e602eaeb242f489896c9b52af547"/>
       <w:r>
         <w:t xml:space="preserve">Fase 1 — openbare, direct toetsbare bronnen</w:t>
       </w:r>
+      <w:bookmarkEnd w:id="88"/>
     </w:p>
     <w:p>
       <w:pPr>
@@ -7983,15 +8438,15 @@
         <w:t xml:space="preserve">.</w:t>
       </w:r>
     </w:p>
-    <w:bookmarkEnd w:id="83"/>
-    <w:bookmarkStart w:id="84" w:name="X1e65d730f223a62ff579853fd3c77c9308748df"/>
     <w:p>
       <w:pPr>
         <w:pStyle w:val="Heading3"/>
       </w:pPr>
+      <w:bookmarkStart w:id="89" w:name="_a67120beb48c3916f8a53c623f303ce8b8a6005"/>
       <w:r>
         <w:t xml:space="preserve">Fase 2 — reeksen met grote historische of trendwaarde</w:t>
       </w:r>
+      <w:bookmarkEnd w:id="89"/>
     </w:p>
     <w:p>
       <w:pPr>
@@ -8137,15 +8592,15 @@
         <w:t xml:space="preserve">De kaart in het proefschrift is visueel gecontroleerd en toont 41 punten in Helmduinen, Kijfhoek en Bierlap, maar geen koppelbare plotcodes. Ook de LVD-selectie levert geen betrouwbare vertaling. De reeks blijft kandidaat totdat de oorspronkelijke plotkaart en opnametabellen zijn gevonden.</w:t>
       </w:r>
     </w:p>
-    <w:bookmarkEnd w:id="84"/>
-    <w:bookmarkStart w:id="85" w:name="X6b9d0c88ffcb5584e67daa74c9524b522af67c0"/>
     <w:p>
       <w:pPr>
         <w:pStyle w:val="Heading3"/>
       </w:pPr>
+      <w:bookmarkStart w:id="90" w:name="_c96f79f2027e81b7ab280f9bf69df5af8bdf464"/>
       <w:r>
         <w:t xml:space="preserve">Fase 3 — reeds bekende bronhouders en contextdatasets</w:t>
       </w:r>
+      <w:bookmarkEnd w:id="90"/>
     </w:p>
     <w:p>
       <w:pPr>
@@ -8216,15 +8671,15 @@
         <w:t xml:space="preserve">Voeg de Habitatkaart T1, de landbedekking van 2001 en 2022 en eventueel gevonden remote-sensingrasters toe als omgevingslagen. Zij mogen ecologische veranderingen helpen verklaren, maar worden niet als soortenwaarnemingen behandeld.</w:t>
       </w:r>
     </w:p>
-    <w:bookmarkEnd w:id="85"/>
-    <w:bookmarkStart w:id="86" w:name="vaste-werkwijze-per-bron"/>
     <w:p>
       <w:pPr>
         <w:pStyle w:val="Heading3"/>
       </w:pPr>
+      <w:bookmarkStart w:id="91" w:name="_d490f73b19661b8ff0d346b94e527be91e989c7"/>
       <w:r>
         <w:t xml:space="preserve">Vaste werkwijze per bron</w:t>
       </w:r>
+      <w:bookmarkEnd w:id="91"/>
     </w:p>
     <w:p>
       <w:pPr>
@@ -8234,15 +8689,15 @@
         <w:t xml:space="preserve">Iedere bron doorloopt dezelfde vijf stappen: een onveranderde bronkopie met checksum bewaren; gegevenswoordenboek en rechten vastleggen; locaties en analyseeenheid controleren; overlap en dubbelen bepalen; pas daarna een reproduceerbare import en analyseview maken. Na iedere statuswijziging worden dit register en de Wordversie meteen bijgewerkt.</w:t>
       </w:r>
     </w:p>
-    <w:bookmarkEnd w:id="86"/>
-    <w:bookmarkStart w:id="87" w:name="dekking-van-de-internetcontrole"/>
     <w:p>
       <w:pPr>
         <w:pStyle w:val="Heading3"/>
       </w:pPr>
+      <w:bookmarkStart w:id="92" w:name="_1e50ec235a164d1e043cda4cec7be66fb154af3"/>
       <w:r>
         <w:t xml:space="preserve">Dekking van de internetcontrole</w:t>
       </w:r>
+      <w:bookmarkEnd w:id="92"/>
     </w:p>
     <w:p>
       <w:pPr>
@@ -8252,16 +8707,15 @@
         <w:t xml:space="preserve">De controle van 26 september 2026 omvatte GBIF, DataCite, Zenodo, Dryad, Figshare, Europe PMC, Naturalis Repository, Wageningen Research e-depot en de repositories van Universiteit Leiden en TU Delft. Algemene aggregators zijn niet als zelfstandige bron opgenomen wanneer zij waarschijnlijk dezelfde waarnemingen als NDFF of primaire collecties bevatten. Een openbare zoekronde kan nooit bewijzen dat geen ongepubliceerde of slecht geïndexeerde bron bestaat; dit register legt daarom ook de zoekdatum en toelatingsreden vast.</w:t>
       </w:r>
     </w:p>
-    <w:bookmarkEnd w:id="87"/>
-    <w:bookmarkEnd w:id="88"/>
-    <w:bookmarkStart w:id="96" w:name="achterliggende-verantwoording"/>
     <w:p>
       <w:pPr>
         <w:pStyle w:val="Heading2"/>
       </w:pPr>
+      <w:bookmarkStart w:id="93" w:name="_5001ec8ecf742000e2504f4f268bea177f3f158"/>
       <w:r>
         <w:t xml:space="preserve">Achterliggende verantwoording</w:t>
       </w:r>
+      <w:bookmarkEnd w:id="93"/>
     </w:p>
     <w:p>
       <w:pPr>
@@ -8271,7 +8725,7 @@
           <w:numId w:val="1005"/>
         </w:numPr>
       </w:pPr>
-      <w:hyperlink r:id="rId89">
+      <w:hyperlink r:id="rId94">
         <w:r>
           <w:rPr>
             <w:rStyle w:val="Hyperlink"/>
@@ -8288,7 +8742,7 @@
           <w:numId w:val="1005"/>
         </w:numPr>
       </w:pPr>
-      <w:hyperlink r:id="rId90">
+      <w:hyperlink r:id="rId95">
         <w:r>
           <w:rPr>
             <w:rStyle w:val="Hyperlink"/>
@@ -8305,7 +8759,7 @@
           <w:numId w:val="1005"/>
         </w:numPr>
       </w:pPr>
-      <w:hyperlink r:id="rId91">
+      <w:hyperlink r:id="rId96">
         <w:r>
           <w:rPr>
             <w:rStyle w:val="Hyperlink"/>
@@ -8322,7 +8776,7 @@
           <w:numId w:val="1005"/>
         </w:numPr>
       </w:pPr>
-      <w:hyperlink r:id="rId92">
+      <w:hyperlink r:id="rId97">
         <w:r>
           <w:rPr>
             <w:rStyle w:val="Hyperlink"/>
@@ -8339,7 +8793,7 @@
           <w:numId w:val="1005"/>
         </w:numPr>
       </w:pPr>
-      <w:hyperlink r:id="rId93">
+      <w:hyperlink r:id="rId98">
         <w:r>
           <w:rPr>
             <w:rStyle w:val="Hyperlink"/>
@@ -8356,7 +8810,7 @@
           <w:numId w:val="1005"/>
         </w:numPr>
       </w:pPr>
-      <w:hyperlink r:id="rId94">
+      <w:hyperlink r:id="rId99">
         <w:r>
           <w:rPr>
             <w:rStyle w:val="Hyperlink"/>
@@ -8373,7 +8827,7 @@
           <w:numId w:val="1005"/>
         </w:numPr>
       </w:pPr>
-      <w:hyperlink r:id="rId95">
+      <w:hyperlink r:id="rId100">
         <w:r>
           <w:rPr>
             <w:rStyle w:val="Hyperlink"/>
@@ -8382,8 +8836,6 @@
         </w:r>
       </w:hyperlink>
     </w:p>
-    <w:bookmarkEnd w:id="96"/>
-    <w:bookmarkEnd w:id="97"/>
     <w:sectPr>
       <w:footnotePr>
         <w:numRestart w:val="eachSect"/>

</xml_diff>

<commit_message>
Koppel Pan 13 aan kavels 2 en 3
</commit_message>
<xml_diff>
--- a/docs/MEIJENDEL_BRONREGISTER.docx
+++ b/docs/MEIJENDEL_BRONREGISTER.docx
@@ -6271,94 +6271,11 @@
       <w:r>
         <w:rPr>
           <w:b/>
-          <w:bCs/>
-        </w:rPr>
-        <w:t xml:space="preserve">Broncontrole.</w:t>
-      </w:r>
-      <w:r>
-        <w:t xml:space="preserve"> </w:t>
-      </w:r>
-      <w:r>
-        <w:t xml:space="preserve">De lokale Zotero-bibliotheek bevatte op 13 oktober 2026 1.434 items en 807 bijlagen. Alle 807 bijlagebestanden zijn op de toegestane gekoppelde opslag onder</w:t>
-      </w:r>
-      <w:r>
-        <w:t xml:space="preserve"> </w:t>
-      </w:r>
-      <w:r>
-        <w:rPr>
-          <w:rStyle w:val="VerbatimChar"/>
-        </w:rPr>
-        <w:t xml:space="preserve">/Volumes/zotero</w:t>
-      </w:r>
-      <w:r>
-        <w:t xml:space="preserve"> </w:t>
-      </w:r>
-      <w:r>
-        <w:t xml:space="preserve">gevonden en bestandsgewijs geraadpleegd via tekstextractie, formaatcontrole en voor vier relevante scans OCR. De inhoudelijke selectie leverde vijf lokale hoofdbronnen op:</w:t>
-      </w:r>
-      <w:r>
-        <w:t xml:space="preserve"> </w:t>
-      </w:r>
-      <w:r>
-        <w:rPr>
-          <w:i/>
-          <w:iCs/>
-        </w:rPr>
-        <w:t xml:space="preserve">De slibverwijdering van Pan 13</w:t>
-      </w:r>
-      <w:r>
-        <w:t xml:space="preserve"> </w:t>
-      </w:r>
-      <w:r>
-        <w:t xml:space="preserve">(1991),</w:t>
-      </w:r>
-      <w:r>
-        <w:t xml:space="preserve"> </w:t>
-      </w:r>
-      <w:r>
-        <w:rPr>
-          <w:i/>
-          <w:iCs/>
-        </w:rPr>
-        <w:t xml:space="preserve">Natuurherstel van de Kikkervalleien in Noord-Meijendel</w:t>
-      </w:r>
-      <w:r>
-        <w:t xml:space="preserve"> </w:t>
-      </w:r>
-      <w:r>
-        <w:t xml:space="preserve">(2010),</w:t>
-      </w:r>
-      <w:r>
-        <w:t xml:space="preserve"> </w:t>
-      </w:r>
-      <w:r>
-        <w:rPr>
-          <w:i/>
-          <w:iCs/>
-        </w:rPr>
-        <w:t xml:space="preserve">Grenzen slechten in Meijendel: stuifgaten in de zeereep</w:t>
-      </w:r>
-      <w:r>
-        <w:t xml:space="preserve"> </w:t>
-      </w:r>
-      <w:r>
-        <w:t xml:space="preserve">(2017), de definitieve</w:t>
-      </w:r>
-      <w:r>
-        <w:t xml:space="preserve"> </w:t>
-      </w:r>
-      <w:r>
-        <w:rPr>
-          <w:i/>
-          <w:iCs/>
-        </w:rPr>
-        <w:t xml:space="preserve">Evaluatie Natura 2000-beheerplan Meijendel &amp; Berkheide</w:t>
-      </w:r>
-      <w:r>
-        <w:t xml:space="preserve"> </w:t>
-      </w:r>
-      <w:r>
-        <w:t xml:space="preserve">(25 april 2025) en het ontwerpbeheerplan 2026–2032 (13 januari 2026). Het ontwerp is alleen als historische aanvulling en plancontext gebruikt; ontwerpmaatregelen zijn niet als uitgevoerd ingevoerd.</w:t>
+        </w:rPr>
+        <w:t>Broncontrole.</w:t>
+      </w:r>
+      <w:r>
+        <w:t xml:space="preserve"> De gekoppelde Zotero-opslag onder /Volumes/T7 Data/Zotero bevatte op 13 oktober 2026 3.830 bestanden, waaronder 1.137 PDF's inclusief migratiekopieën en verweesde opslagitems. De actieve hoofdmap bevatte 313 PDF's. Een volledige tekstzoektocht naar Pan 13 leverde 12 actieve PDF's en 17 Zotero-tekstcache-items op; deze aantallen mogen wegens duplicaten niet worden opgeteld als unieke publicaties. De inhoudelijke selectie voor het werkzaamhedenmodel bevat nu zes lokale hoofdbronnen: De slibverwijdering van Pan 13 (1991), Broedvogelmonitoring Meijendel 2006 (2007), Natuurherstel van de Kikkervalleien in Noord-Meijendel (2010), Grenzen slechten in Meijendel: stuifgaten in de zeereep (2017), de definitieve Evaluatie Natura 2000-beheerplan Meijendel &amp; Berkheide (25 april 2025) en het ontwerpbeheerplan 2026–2032 (13 januari 2026). Het ontwerp is alleen als historische aanvulling en plancontext gebruikt; ontwerpmaatregelen zijn niet als uitgevoerd ingevoerd.</w:t>
       </w:r>
     </w:p>
     <w:p>
@@ -6388,54 +6305,11 @@
       <w:r>
         <w:rPr>
           <w:b/>
-          <w:bCs/>
-        </w:rPr>
-        <w:t xml:space="preserve">Omvang en periode.</w:t>
-      </w:r>
-      <w:r>
-        <w:t xml:space="preserve"> </w:t>
-      </w:r>
-      <w:r>
-        <w:t xml:space="preserve">De levende lokale database bevat 12 projecten, 12 bronnen, 33 uitvoeringen, 58 expliciete jaarbeoordelingen uit 1988–2025 en 39 bronkoppelingen. Van de jaarbeoordelingen zijn er 42</w:t>
-      </w:r>
-      <w:r>
-        <w:t xml:space="preserve"> </w:t>
-      </w:r>
-      <w:r>
-        <w:rPr>
-          <w:rStyle w:val="VerbatimChar"/>
-        </w:rPr>
-        <w:t xml:space="preserve">uitgevoerd</w:t>
-      </w:r>
-      <w:r>
-        <w:t xml:space="preserve">, 9</w:t>
-      </w:r>
-      <w:r>
-        <w:t xml:space="preserve"> </w:t>
-      </w:r>
-      <w:r>
-        <w:rPr>
-          <w:rStyle w:val="VerbatimChar"/>
-        </w:rPr>
-        <w:t xml:space="preserve">niet_uitgevoerd</w:t>
-      </w:r>
-      <w:r>
-        <w:t xml:space="preserve"> </w:t>
-      </w:r>
-      <w:r>
-        <w:t xml:space="preserve">en 7</w:t>
-      </w:r>
-      <w:r>
-        <w:t xml:space="preserve"> </w:t>
-      </w:r>
-      <w:r>
-        <w:rPr>
-          <w:rStyle w:val="VerbatimChar"/>
-        </w:rPr>
-        <w:t xml:space="preserve">onbekend</w:t>
-      </w:r>
-      <w:r>
-        <w:t xml:space="preserve">. De uitvoeringen lopen volgens de beschikbare datumvelden van oktober 1988 tot en met een gepland einde in maart 2027. Geplande werkzaamheden bij de Paardenstal en het subsidieerbare Bendel-nabeheer hebben geen uitgevoerd jaar gekregen; elektriciteitswerk in Vallei Meijendel staat als uitvoering onbekend en heeft eveneens geen jaarregel.</w:t>
+        </w:rPr>
+        <w:t>Omvang en periode.</w:t>
+      </w:r>
+      <w:r>
+        <w:t xml:space="preserve"> De levende lokale database bevat 12 projecten, 13 bronnen, 33 uitvoeringen, 58 expliciete jaarbeoordelingen uit 1988–2025 en 40 bronkoppelingen. Van de jaarbeoordelingen zijn er 42 uitgevoerd, 9 niet_uitgevoerd en 7 onbekend. De uitvoeringen lopen volgens de beschikbare datumvelden van oktober 1988 tot en met een gepland einde in maart 2027. Geplande werkzaamheden bij de Paardenstal en het subsidieerbare Bendel-nabeheer hebben geen uitgevoerd jaar gekregen; elektriciteitswerk in Vallei Meijendel staat als uitvoering onbekend en heeft eveneens geen jaarregel.</w:t>
       </w:r>
     </w:p>
     <w:p>
@@ -6478,124 +6352,35 @@
         <w:pStyle w:val="BodyText"/>
       </w:pPr>
       <w:r>
-        <w:rPr>
-          <w:rStyle w:val="VerbatimChar"/>
-        </w:rPr>
-        <w:t xml:space="preserve">maatregel_geometrie</w:t>
-      </w:r>
-      <w:r>
-        <w:t xml:space="preserve"> </w:t>
-      </w:r>
-      <w:r>
-        <w:t xml:space="preserve">bevat nog nul uitvoeringsgeometrieën.</w:t>
-      </w:r>
-      <w:r>
-        <w:t xml:space="preserve"> </w:t>
-      </w:r>
-      <w:r>
-        <w:rPr>
-          <w:rStyle w:val="VerbatimChar"/>
-        </w:rPr>
-        <w:t xml:space="preserve">maatregel_uitvoering_gebied</w:t>
-      </w:r>
-      <w:r>
-        <w:t xml:space="preserve"> </w:t>
-      </w:r>
-      <w:r>
-        <w:t xml:space="preserve">en</w:t>
-      </w:r>
-      <w:r>
-        <w:t xml:space="preserve"> </w:t>
-      </w:r>
-      <w:r>
-        <w:rPr>
-          <w:rStyle w:val="VerbatimChar"/>
-        </w:rPr>
-        <w:t xml:space="preserve">maatregel_plot_koppeling</w:t>
-      </w:r>
-      <w:r>
-        <w:t xml:space="preserve"> </w:t>
-      </w:r>
-      <w:r>
-        <w:t xml:space="preserve">bevatten ieder één veilige relatie: het ontwerpbeheerplan noemt Voorlinden en Ton bevestigde M91 als Voorlinden. Het doorsnijdingspercentage blijft leeg omdat de precieze uitvoeringsvoetafdruk binnen M91 niet bekend is. De jaarstatus voor 2025 blijft</w:t>
-      </w:r>
-      <w:r>
-        <w:t xml:space="preserve"> </w:t>
-      </w:r>
-      <w:r>
-        <w:rPr>
-          <w:rStyle w:val="VerbatimChar"/>
-        </w:rPr>
-        <w:t xml:space="preserve">onbekend</w:t>
-      </w:r>
-      <w:r>
-        <w:t xml:space="preserve">; daardoor bevat</w:t>
-      </w:r>
-      <w:r>
-        <w:t xml:space="preserve"> </w:t>
-      </w:r>
-      <w:r>
-        <w:rPr>
-          <w:rStyle w:val="VerbatimChar"/>
-        </w:rPr>
-        <w:t xml:space="preserve">v_plot_jaar_maatregel_bronvast</w:t>
-      </w:r>
-      <w:r>
-        <w:t xml:space="preserve"> </w:t>
-      </w:r>
-      <w:r>
-        <w:t xml:space="preserve">voor deze uitvoering en in totaal nog nul regels. Andere benoemde deelgebieden zijn niet automatisch over alle onderliggende plots verdeeld.</w:t>
-      </w:r>
-    </w:p>
-    <w:p>
-      <w:pPr>
-        <w:pStyle w:val="BodyText"/>
-      </w:pPr>
-      <w:r>
-        <w:rPr>
-          <w:b/>
-          <w:bCs/>
-        </w:rPr>
-        <w:t xml:space="preserve">Gebruik en grens.</w:t>
-      </w:r>
-      <w:r>
-        <w:t xml:space="preserve"> </w:t>
-      </w:r>
-      <w:r>
-        <w:t xml:space="preserve">De laag is geschikt om vast te leggen wat volgens welke bron is gepland, uitgevoerd, niet uitgevoerd of onbekend. Zij ondersteunt nog geen vergelijking van vogelontwikkeling per maatregelplot. De geëvalueerde bronnen melden bovendien geen afzonderlijke effectmeting per maatregel; uit de werkzaamhedenlaag volgt dus geen causaal beheereffect. De 144 bestaande regels in</w:t>
-      </w:r>
-      <w:r>
-        <w:t xml:space="preserve"> </w:t>
-      </w:r>
-      <w:r>
-        <w:rPr>
-          <w:rStyle w:val="VerbatimChar"/>
-        </w:rPr>
-        <w:t xml:space="preserve">plot_jaar_maatregel</w:t>
-      </w:r>
-      <w:r>
-        <w:t xml:space="preserve"> </w:t>
-      </w:r>
-      <w:r>
-        <w:t xml:space="preserve">betreffen begrazing in 16 plots uit 1991–1999, zijn bij deze migratie inhoudelijk ongewijzigd gebleven en worden niet als onderdeel van de nieuwe bronvaste laag geteld.</w:t>
-      </w:r>
-    </w:p>
-    <w:p>
-      <w:pPr>
-        <w:pStyle w:val="BodyText"/>
-      </w:pPr>
-      <w:r>
-        <w:rPr>
-          <w:b/>
-          <w:bCs/>
-        </w:rPr>
-        <w:t xml:space="preserve">Status.</w:t>
-      </w:r>
-      <w:r>
-        <w:t xml:space="preserve"> </w:t>
-      </w:r>
-      <w:r>
-        <w:t xml:space="preserve">Bronvast op project-, uitvoering- en jaarniveau. De algemene kavel- en gebiedsindeling is geometrisch beschikbaar voor de 55 actuele plots uit 2025. Alleen Voorlinden heeft een gevalideerde maatregel–plotrelatie; omdat uitvoering in 2025 onbekend is, zijn nog geen maatregelen tot de bronvaste plot-jaarlaag toegelaten.</w:t>
+        <w:t>maatregel_geometrie bevat nog nul uitvoeringsgeometrieën. maatregel_uitvoering_gebied bevat één veilige relatie: het ontwerpbeheerplan noemt Voorlinden en Ton bevestigde M91 als Voorlinden. maatregel_plot_koppeling bevat drie geverifieerde relaties: Voorlinden–M91 en Pan 13–M2/M3. Het artikel uit 1991 noemt M2 als het zuidelijke deel van Pan 13; Broedvogelmonitoring Meijendel 2006 noemt de volledige circa 1.700 meter lange plassenserie expliciet in M2 en M3. De doorsnijdingspercentages blijven leeg omdat de bronnen geen uitvoeringsoppervlak per kavel geven. De uitgevoerde jaarstatussen 1988 en 1989 leveren voor Pan 13 vier regels in v_plot_jaar_maatregel_bronvast; Voorlinden levert geen regel omdat de jaarstatus voor 2025 onbekend is. Andere benoemde deelgebieden zijn niet automatisch over alle onderliggende plots verdeeld.</w:t>
+      </w:r>
+    </w:p>
+    <w:p>
+      <w:pPr>
+        <w:pStyle w:val="BodyText"/>
+      </w:pPr>
+      <w:r>
+        <w:rPr>
+          <w:b/>
+        </w:rPr>
+        <w:t>Gebruik en grens.</w:t>
+      </w:r>
+      <w:r>
+        <w:t xml:space="preserve"> De laag is geschikt om vast te leggen wat volgens welke bron is gepland, uitgevoerd, niet uitgevoerd of onbekend. Voor Pan 13 ondersteunt zij nu een beschrijvende vergelijking van vogelgegevens in M2 en M3 rond 1988–1989. De bronnen bewijzen niet dat de maatregel ieder deel van beide kavels raakte en een samenhang met vogelontwikkeling is geen causaal beheereffect. De 144 bestaande regels in plot_jaar_maatregel betreffen begrazing in 16 plots uit 1991–1999, blijven inhoudelijk ongewijzigd en worden niet als onderdeel van de nieuwe bronvaste laag geteld.</w:t>
+      </w:r>
+    </w:p>
+    <w:p>
+      <w:pPr>
+        <w:pStyle w:val="BodyText"/>
+      </w:pPr>
+      <w:r>
+        <w:rPr>
+          <w:b/>
+        </w:rPr>
+        <w:t>Status.</w:t>
+      </w:r>
+      <w:r>
+        <w:t xml:space="preserve"> Bronvast op project-, uitvoering- en jaarniveau. De algemene kavel- en gebiedsindeling is geometrisch beschikbaar voor de 55 actuele plots uit 2025. Voorlinden–M91 en Pan 13–M2/M3 zijn gevalideerde maatregel–plotrelaties. Alleen Pan 13 wordt tot dusver in de bronvaste plot-jaarlaag opgenomen: vier regels voor twee plots en twee uitgevoerde jaren.</w:t>
       </w:r>
     </w:p>
     <w:p>

</xml_diff>

<commit_message>
Vul maatregelenmodel aan vanuit Zotero
</commit_message>
<xml_diff>
--- a/docs/MEIJENDEL_BRONREGISTER.docx
+++ b/docs/MEIJENDEL_BRONREGISTER.docx
@@ -21,7 +21,7 @@
           <w:b/>
           <w:bCs/>
         </w:rPr>
-        <w:t xml:space="preserve">Stand: 13 oktober 2026.</w:t>
+        <w:t xml:space="preserve">Stand: 14 oktober 2026.</w:t>
       </w:r>
     </w:p>
     <w:p>
@@ -6271,11 +6271,62 @@
       <w:r>
         <w:rPr>
           <w:b/>
-        </w:rPr>
-        <w:t>Broncontrole.</w:t>
-      </w:r>
-      <w:r>
-        <w:t xml:space="preserve"> De gekoppelde Zotero-opslag onder /Volumes/T7 Data/Zotero bevatte op 13 oktober 2026 3.830 bestanden, waaronder 1.137 PDF's inclusief migratiekopieën en verweesde opslagitems. De actieve hoofdmap bevatte 313 PDF's. Een volledige tekstzoektocht naar Pan 13 leverde 12 actieve PDF's en 17 Zotero-tekstcache-items op; deze aantallen mogen wegens duplicaten niet worden opgeteld als unieke publicaties. De inhoudelijke selectie voor het werkzaamhedenmodel bevat nu zes lokale hoofdbronnen: De slibverwijdering van Pan 13 (1991), Broedvogelmonitoring Meijendel 2006 (2007), Natuurherstel van de Kikkervalleien in Noord-Meijendel (2010), Grenzen slechten in Meijendel: stuifgaten in de zeereep (2017), de definitieve Evaluatie Natura 2000-beheerplan Meijendel &amp; Berkheide (25 april 2025) en het ontwerpbeheerplan 2026–2032 (13 januari 2026). Het ontwerp is alleen als historische aanvulling en plancontext gebruikt; ontwerpmaatregelen zijn niet als uitgevoerd ingevoerd.</w:t>
+          <w:bCs/>
+        </w:rPr>
+        <w:t xml:space="preserve">Broncontrole.</w:t>
+      </w:r>
+      <w:r>
+        <w:t xml:space="preserve"> </w:t>
+      </w:r>
+      <w:r>
+        <w:t xml:space="preserve">Op 14 oktober 2026 zijn alle 807 actieve Zotero-bijlagen in de lokale bibliotheek gecontroleerd. Van 798 bijlagen was tekst beschikbaar via de lokale Zotero-API, de Zotero-tekstcache of het gekoppelde bestand onder</w:t>
+      </w:r>
+      <w:r>
+        <w:t xml:space="preserve"> </w:t>
+      </w:r>
+      <w:r>
+        <w:rPr>
+          <w:rStyle w:val="VerbatimChar"/>
+        </w:rPr>
+        <w:t xml:space="preserve">/Volumes/T7 Data/Zotero</w:t>
+      </w:r>
+      <w:r>
+        <w:t xml:space="preserve">; negen bijlagen hadden geen bruikbare documenttekst. Dat waren vijf oude</w:t>
+      </w:r>
+      <w:r>
+        <w:t xml:space="preserve"> </w:t>
+      </w:r>
+      <w:r>
+        <w:rPr>
+          <w:rStyle w:val="VerbatimChar"/>
+        </w:rPr>
+        <w:t xml:space="preserve">.xls</w:t>
+      </w:r>
+      <w:r>
+        <w:t xml:space="preserve">-protocollen voor vleermuisonderzoek uit 2009–2013 en vier als PDF geregistreerde bestanden die feitelijk HTML-landingspagina's waren. De vijf protocollen beschrijven onderzoeksformulieren, geen uitgevoerde terreinmaatregelen. De vier landingspagina's zijn niet als inhoudelijk geraadpleegd document behandeld.</w:t>
+      </w:r>
+    </w:p>
+    <w:p>
+      <w:pPr>
+        <w:pStyle w:val="BodyText"/>
+      </w:pPr>
+      <w:r>
+        <w:t xml:space="preserve">De brede tekstselectie bevatte 351 bijlagen. De strengere selectie op formuleringen die feitelijke uitvoering aanduiden bevatte 206 bijlagen bij 190 bibliografische bronnen. Na beoordeling op uitvoering, locatie, jaar, dubbeling en brontype zijn veertien aanvullende Zotero-bronnen ingevoerd: de vogelrapporten over 1967, 1968, 1969, 1972, 1973, 1974 en 1975; de rietpotenproef uit 1987/1992; publicaties over begrazing uit 2008 en 2012; duinvalleibeheer uit 2003; natuurherstel uit 2005; slib in infiltratieplassen uit 2005; en Plas 20.1 uit 2006. Samen met de zes al gebruikte Zotero-bronnen bevat</w:t>
+      </w:r>
+      <w:r>
+        <w:t xml:space="preserve"> </w:t>
+      </w:r>
+      <w:r>
+        <w:rPr>
+          <w:rStyle w:val="VerbatimChar"/>
+        </w:rPr>
+        <w:t xml:space="preserve">maatregel_bron</w:t>
+      </w:r>
+      <w:r>
+        <w:t xml:space="preserve"> </w:t>
+      </w:r>
+      <w:r>
+        <w:t xml:space="preserve">nu twintig lokale Zotero-bronnen. Dubbele exemplaren, algemene gebiedsbeschrijvingen, uitsluitend voorgenomen werk en niet-lokaliseerbare vermeldingen zijn niet als afzonderlijke uitvoering ingevoerd.</w:t>
       </w:r>
     </w:p>
     <w:p>
@@ -6305,11 +6356,54 @@
       <w:r>
         <w:rPr>
           <w:b/>
-        </w:rPr>
-        <w:t>Omvang en periode.</w:t>
-      </w:r>
-      <w:r>
-        <w:t xml:space="preserve"> De levende lokale database bevat 12 projecten, 13 bronnen, 33 uitvoeringen, 58 expliciete jaarbeoordelingen uit 1988–2025 en 40 bronkoppelingen. Van de jaarbeoordelingen zijn er 42 uitgevoerd, 9 niet_uitgevoerd en 7 onbekend. De uitvoeringen lopen volgens de beschikbare datumvelden van oktober 1988 tot en met een gepland einde in maart 2027. Geplande werkzaamheden bij de Paardenstal en het subsidieerbare Bendel-nabeheer hebben geen uitgevoerd jaar gekregen; elektriciteitswerk in Vallei Meijendel staat als uitvoering onbekend en heeft eveneens geen jaarregel.</w:t>
+          <w:bCs/>
+        </w:rPr>
+        <w:t xml:space="preserve">Omvang en periode.</w:t>
+      </w:r>
+      <w:r>
+        <w:t xml:space="preserve"> </w:t>
+      </w:r>
+      <w:r>
+        <w:t xml:space="preserve">De levende lokale database bevat 18 projecten, 27 bronnen, 61 uitvoeringen, 92 expliciete jaarbeoordelingen uit 1967–2025 en 78 bronkoppelingen. Van de jaarbeoordelingen zijn er 76</w:t>
+      </w:r>
+      <w:r>
+        <w:t xml:space="preserve"> </w:t>
+      </w:r>
+      <w:r>
+        <w:rPr>
+          <w:rStyle w:val="VerbatimChar"/>
+        </w:rPr>
+        <w:t xml:space="preserve">uitgevoerd</w:t>
+      </w:r>
+      <w:r>
+        <w:t xml:space="preserve">, 9</w:t>
+      </w:r>
+      <w:r>
+        <w:t xml:space="preserve"> </w:t>
+      </w:r>
+      <w:r>
+        <w:rPr>
+          <w:rStyle w:val="VerbatimChar"/>
+        </w:rPr>
+        <w:t xml:space="preserve">niet_uitgevoerd</w:t>
+      </w:r>
+      <w:r>
+        <w:t xml:space="preserve"> </w:t>
+      </w:r>
+      <w:r>
+        <w:t xml:space="preserve">en 7</w:t>
+      </w:r>
+      <w:r>
+        <w:t xml:space="preserve"> </w:t>
+      </w:r>
+      <w:r>
+        <w:rPr>
+          <w:rStyle w:val="VerbatimChar"/>
+        </w:rPr>
+        <w:t xml:space="preserve">onbekend</w:t>
+      </w:r>
+      <w:r>
+        <w:t xml:space="preserve">. De nieuwe invoer voegt 28 feitelijke uitvoeringen uit 1967–2006 toe. Zij betreft waterwinning en infiltratieplassen, pad- en rasterwerk, zandvastlegging, de rietpotenproef, begrazing, maaien, plaggen en slibverwijdering. De datumvelden van de totale laag lopen van 1967 tot en met een gepland einde in maart 2027. Geplande werkzaamheden bij de Paardenstal en het subsidieerbare Bendel-nabeheer hebben geen uitgevoerd jaar gekregen; elektriciteitswerk in Vallei Meijendel staat als uitvoering onbekend en heeft eveneens geen jaarregel.</w:t>
       </w:r>
     </w:p>
     <w:p>
@@ -6352,35 +6446,147 @@
         <w:pStyle w:val="BodyText"/>
       </w:pPr>
       <w:r>
-        <w:t>maatregel_geometrie bevat nog nul uitvoeringsgeometrieën. maatregel_uitvoering_gebied bevat één veilige relatie: het ontwerpbeheerplan noemt Voorlinden en Ton bevestigde M91 als Voorlinden. maatregel_plot_koppeling bevat drie geverifieerde relaties: Voorlinden–M91 en Pan 13–M2/M3. Het artikel uit 1991 noemt M2 als het zuidelijke deel van Pan 13; Broedvogelmonitoring Meijendel 2006 noemt de volledige circa 1.700 meter lange plassenserie expliciet in M2 en M3. De doorsnijdingspercentages blijven leeg omdat de bronnen geen uitvoeringsoppervlak per kavel geven. De uitgevoerde jaarstatussen 1988 en 1989 leveren voor Pan 13 vier regels in v_plot_jaar_maatregel_bronvast; Voorlinden levert geen regel omdat de jaarstatus voor 2025 onbekend is. Andere benoemde deelgebieden zijn niet automatisch over alle onderliggende plots verdeeld.</w:t>
-      </w:r>
-    </w:p>
-    <w:p>
-      <w:pPr>
-        <w:pStyle w:val="BodyText"/>
-      </w:pPr>
-      <w:r>
-        <w:rPr>
-          <w:b/>
-        </w:rPr>
-        <w:t>Gebruik en grens.</w:t>
-      </w:r>
-      <w:r>
-        <w:t xml:space="preserve"> De laag is geschikt om vast te leggen wat volgens welke bron is gepland, uitgevoerd, niet uitgevoerd of onbekend. Voor Pan 13 ondersteunt zij nu een beschrijvende vergelijking van vogelgegevens in M2 en M3 rond 1988–1989. De bronnen bewijzen niet dat de maatregel ieder deel van beide kavels raakte en een samenhang met vogelontwikkeling is geen causaal beheereffect. De 144 bestaande regels in plot_jaar_maatregel betreffen begrazing in 16 plots uit 1991–1999, blijven inhoudelijk ongewijzigd en worden niet als onderdeel van de nieuwe bronvaste laag geteld.</w:t>
-      </w:r>
-    </w:p>
-    <w:p>
-      <w:pPr>
-        <w:pStyle w:val="BodyText"/>
-      </w:pPr>
-      <w:r>
-        <w:rPr>
-          <w:b/>
-        </w:rPr>
-        <w:t>Status.</w:t>
-      </w:r>
-      <w:r>
-        <w:t xml:space="preserve"> Bronvast op project-, uitvoering- en jaarniveau. De algemene kavel- en gebiedsindeling is geometrisch beschikbaar voor de 55 actuele plots uit 2025. Voorlinden–M91 en Pan 13–M2/M3 zijn gevalideerde maatregel–plotrelaties. Alleen Pan 13 wordt tot dusver in de bronvaste plot-jaarlaag opgenomen: vier regels voor twee plots en twee uitgevoerde jaren.</w:t>
+        <w:rPr>
+          <w:rStyle w:val="VerbatimChar"/>
+        </w:rPr>
+        <w:t xml:space="preserve">maatregel_geometrie</w:t>
+      </w:r>
+      <w:r>
+        <w:t xml:space="preserve"> </w:t>
+      </w:r>
+      <w:r>
+        <w:t xml:space="preserve">bevat nog nul uitvoeringsgeometrieën.</w:t>
+      </w:r>
+      <w:r>
+        <w:t xml:space="preserve"> </w:t>
+      </w:r>
+      <w:r>
+        <w:rPr>
+          <w:rStyle w:val="VerbatimChar"/>
+        </w:rPr>
+        <w:t xml:space="preserve">maatregel_uitvoering_gebied</w:t>
+      </w:r>
+      <w:r>
+        <w:t xml:space="preserve"> </w:t>
+      </w:r>
+      <w:r>
+        <w:t xml:space="preserve">bevat twee veilige relaties: Voorlinden als locatie binnen het speciale gebied M91 en de in 1990 ingevoerde begrazing voor Kijfhoek en Bierlap als volledig benoemd gebied. Die laatste gebiedsrelatie is niet automatisch over de 23 onderliggende actuele en historische plots verdeeld.</w:t>
+      </w:r>
+      <w:r>
+        <w:t xml:space="preserve"> </w:t>
+      </w:r>
+      <w:r>
+        <w:rPr>
+          <w:rStyle w:val="VerbatimChar"/>
+        </w:rPr>
+        <w:t xml:space="preserve">maatregel_plot_koppeling</w:t>
+      </w:r>
+      <w:r>
+        <w:t xml:space="preserve"> </w:t>
+      </w:r>
+      <w:r>
+        <w:t xml:space="preserve">bevat 32 geverifieerde directe relaties. Drie bestonden al: Voorlinden–M91 en Pan 13–M2/M3. De 29 nieuwe relaties volgen letterlijke kavelvermeldingen in de vogelrapporten over 1967–1975 en betreffen M1b, M2, M3, M4, M5, M6, M7, M10, M12, M13, M13s, M14, M16, M17, M71 en M77. Historische M4, M5, M10, M12 en M17 blijven aan hun historische plotrecords gekoppeld; M17 is dus niet stilzwijgend vervangen door het actuele M17a.</w:t>
+      </w:r>
+    </w:p>
+    <w:p>
+      <w:pPr>
+        <w:pStyle w:val="BodyText"/>
+      </w:pPr>
+      <w:r>
+        <w:t xml:space="preserve">De 32 plotkoppelingen en 75 uitgevoerde jaarregels leveren samen 40 regels in</w:t>
+      </w:r>
+      <w:r>
+        <w:t xml:space="preserve"> </w:t>
+      </w:r>
+      <w:r>
+        <w:rPr>
+          <w:rStyle w:val="VerbatimChar"/>
+        </w:rPr>
+        <w:t xml:space="preserve">v_plot_jaar_maatregel_bronvast</w:t>
+      </w:r>
+      <w:r>
+        <w:t xml:space="preserve">: vier bestaande regels voor Pan 13 in M2 en M3 in 1988–1989 en 36 nieuwe regels voor expliciet benoemde kavels in 1967, 1968 en 1972–1975. Voorlinden levert geen plot-jaarregel omdat de jaarstatus voor 2025</w:t>
+      </w:r>
+      <w:r>
+        <w:t xml:space="preserve"> </w:t>
+      </w:r>
+      <w:r>
+        <w:rPr>
+          <w:rStyle w:val="VerbatimChar"/>
+        </w:rPr>
+        <w:t xml:space="preserve">onbekend</w:t>
+      </w:r>
+      <w:r>
+        <w:t xml:space="preserve"> </w:t>
+      </w:r>
+      <w:r>
+        <w:t xml:space="preserve">is. Reparatie bij Plas 20 in 1969, rietpoten in 1987, begrazing vanaf 1990 en vallei- en plassenbeheer in 1993–2006 hebben wel bronvaste uitvoerings- en jaarregels, maar nog geen directe plotkoppeling omdat de geraadpleegde bron geen eenduidig kavelnummer noemt.</w:t>
+      </w:r>
+    </w:p>
+    <w:p>
+      <w:pPr>
+        <w:pStyle w:val="BodyText"/>
+      </w:pPr>
+      <w:r>
+        <w:rPr>
+          <w:b/>
+          <w:bCs/>
+        </w:rPr>
+        <w:t xml:space="preserve">Gebruik en grens.</w:t>
+      </w:r>
+      <w:r>
+        <w:t xml:space="preserve"> </w:t>
+      </w:r>
+      <w:r>
+        <w:t xml:space="preserve">De laag is geschikt om vast te leggen wat volgens welke bron is gepland, uitgevoerd, niet uitgevoerd of onbekend. De bronvaste plot-jaarlaag kan nu beschrijvend naast vogelgegevens voor de expliciet benoemde kavels worden gelegd. Een kavelvermelding bewijst niet dat de maatregel ieder deel van de kavel raakte; een samenhang met vogelontwikkeling is geen causaal beheereffect. De 144 bestaande regels in</w:t>
+      </w:r>
+      <w:r>
+        <w:t xml:space="preserve"> </w:t>
+      </w:r>
+      <w:r>
+        <w:rPr>
+          <w:rStyle w:val="VerbatimChar"/>
+        </w:rPr>
+        <w:t xml:space="preserve">plot_jaar_maatregel</w:t>
+      </w:r>
+      <w:r>
+        <w:t xml:space="preserve"> </w:t>
+      </w:r>
+      <w:r>
+        <w:t xml:space="preserve">betreffen begrazing in 16 plots uit 1991–1999. Hun aantal en checksum</w:t>
+      </w:r>
+      <w:r>
+        <w:t xml:space="preserve"> </w:t>
+      </w:r>
+      <w:r>
+        <w:rPr>
+          <w:rStyle w:val="VerbatimChar"/>
+        </w:rPr>
+        <w:t xml:space="preserve">306480715648</w:t>
+      </w:r>
+      <w:r>
+        <w:t xml:space="preserve"> </w:t>
+      </w:r>
+      <w:r>
+        <w:t xml:space="preserve">zijn vóór en na deze invoer gelijk gebleven; zij worden niet als onderdeel van de nieuwe bronvaste laag geteld.</w:t>
+      </w:r>
+    </w:p>
+    <w:p>
+      <w:pPr>
+        <w:pStyle w:val="BodyText"/>
+      </w:pPr>
+      <w:r>
+        <w:rPr>
+          <w:b/>
+          <w:bCs/>
+        </w:rPr>
+        <w:t xml:space="preserve">Status.</w:t>
+      </w:r>
+      <w:r>
+        <w:t xml:space="preserve"> </w:t>
+      </w:r>
+      <w:r>
+        <w:t xml:space="preserve">Bronvast op project-, uitvoering- en jaarniveau voor de 27 ingevoerde bronnen en 61 uitvoeringen. De algemene kavel- en gebiedsindeling is geometrisch beschikbaar voor de 55 actuele plots uit 2025; vijf expliciet gekoppelde historische kavels hebben geen afzonderlijke geometrie. De bronvaste plot-jaarlaag bevat 40 regels voor de jaren 1967, 1968, 1972–1975, 1988 en 1989. De overige bronvaste uitvoeringen blijven op benoemd deelgebied totdat een bron of gecontroleerde geometrie de plotrelatie bewijst.</w:t>
       </w:r>
     </w:p>
     <w:p>

</xml_diff>

<commit_message>
Koppel Libellenvallei aan M17b
</commit_message>
<xml_diff>
--- a/docs/MEIJENDEL_BRONREGISTER.docx
+++ b/docs/MEIJENDEL_BRONREGISTER.docx
@@ -6487,7 +6487,7 @@
         <w:t xml:space="preserve"> </w:t>
       </w:r>
       <w:r>
-        <w:t xml:space="preserve">bevat 35 geverifieerde directe relaties. Drie bestonden al: Voorlinden–M91 en Pan 13–M2/M3. Van de 32 daarna toegevoegde relaties volgen er 29 uit letterlijke kavelvermeldingen in de vogelrapporten over 1967–1975; zij betreffen M1b, M2, M3, M4, M5, M6, M7, M10, M12, M13, M13s, M14, M16, M17, M71 en M77. Historische M4, M5, M10, M12 en M17 blijven aan hun historische plotrecords gekoppeld; M17 is dus niet stilzwijgend vervangen door het actuele M17a.</w:t>
+        <w:t xml:space="preserve">bevat 36 geverifieerde directe relaties. Drie bestonden al: Voorlinden–M91 en Pan 13–M2/M3. Van de 33 daarna toegevoegde relaties volgen er 29 uit letterlijke kavelvermeldingen in de vogelrapporten over 1967–1975; zij betreffen M1b, M2, M3, M4, M5, M6, M7, M10, M12, M13, M13s, M14, M16, M17, M71 en M77. Historische M4, M5, M10, M12 en M17 blijven aan hun historische plotrecords gekoppeld; M17 is dus niet stilzwijgend vervangen door het actuele M17a.</w:t>
       </w:r>
     </w:p>
     <w:p>
@@ -6535,7 +6535,47 @@
         <w:pStyle w:val="BodyText"/>
       </w:pPr>
       <w:r>
-        <w:t xml:space="preserve">De 35 plotkoppelingen en 75 uitgevoerde jaarregels leveren samen 43 regels in</w:t>
+        <w:t xml:space="preserve">Ton heeft op 14 oktober 2026 ook Libellenvallei gelokaliseerd in M17b. De publicatie</w:t>
+      </w:r>
+      <w:r>
+        <w:t xml:space="preserve"> </w:t>
+      </w:r>
+      <w:r>
+        <w:rPr>
+          <w:i/>
+          <w:iCs/>
+        </w:rPr>
+        <w:t xml:space="preserve">Vegetatieontwikkeling in duinvalleien van Meijendel na opheffen van infiltratieplassen</w:t>
+      </w:r>
+      <w:r>
+        <w:t xml:space="preserve"> </w:t>
+      </w:r>
+      <w:r>
+        <w:t xml:space="preserve">in</w:t>
+      </w:r>
+      <w:r>
+        <w:t xml:space="preserve"> </w:t>
+      </w:r>
+      <w:r>
+        <w:rPr>
+          <w:i/>
+          <w:iCs/>
+        </w:rPr>
+        <w:t xml:space="preserve">Holland’s Duinen</w:t>
+      </w:r>
+      <w:r>
+        <w:t xml:space="preserve"> </w:t>
+      </w:r>
+      <w:r>
+        <w:t xml:space="preserve">42 van april 2003 vermeldt dat de Libellenvallei sinds 1975 eenmaal per jaar in het najaar wordt gemaaid. Deze combinatie onderbouwt één koppeling voor het maaibeheer, met een uitgevoerde jaarregel voor 1975.</w:t>
+      </w:r>
+    </w:p>
+    <w:p>
+      <w:pPr>
+        <w:pStyle w:val="BodyText"/>
+      </w:pPr>
+      <w:r>
+        <w:t xml:space="preserve">De 36 plotkoppelingen en 75 uitgevoerde jaarregels leveren samen 44 regels in</w:t>
       </w:r>
       <w:r>
         <w:t xml:space="preserve"> </w:t>
@@ -6547,7 +6587,7 @@
         <w:t xml:space="preserve">v_plot_jaar_maatregel_bronvast</w:t>
       </w:r>
       <w:r>
-        <w:t xml:space="preserve">: vier bestaande regels voor Pan 13 in M2 en M3 in 1988–1989, 36 regels voor expliciet benoemde kavels in 1967, 1968 en 1972–1975 en drie regels voor Plas 20 in M16, M17a en M17b in 1969. Voorlinden levert geen plot-jaarregel omdat de jaarstatus voor 2025</w:t>
+        <w:t xml:space="preserve">: vier bestaande regels voor Pan 13 in M2 en M3 in 1988–1989, 36 regels voor expliciet benoemde kavels in 1967, 1968 en 1972–1975, drie regels voor Plas 20 in M16, M17a en M17b in 1969 en één regel voor Libellenvallei in M17b in 1975. Voorlinden levert geen plot-jaarregel omdat de jaarstatus voor 2025</w:t>
       </w:r>
       <w:r>
         <w:t xml:space="preserve"> </w:t>
@@ -6562,7 +6602,7 @@
         <w:t xml:space="preserve"> </w:t>
       </w:r>
       <w:r>
-        <w:t xml:space="preserve">is. Rietpoten in 1987, begrazing vanaf 1990 en vallei- en plassenbeheer in 1993–2006 hebben wel bronvaste uitvoerings- en jaarregels, maar nog geen directe plotkoppeling wanneer de geraadpleegde bron geen eenduidig kavelnummer noemt.</w:t>
+        <w:t xml:space="preserve">is. Rietpoten in 1987, begrazing vanaf 1990 en overige vallei- en plassenbeheer in 1993–2006 hebben wel bronvaste uitvoerings- en jaarregels, maar nog geen directe plotkoppeling wanneer de geraadpleegde bron geen eenduidig kavelnummer noemt.</w:t>
       </w:r>
     </w:p>
     <w:p>
@@ -6628,7 +6668,7 @@
         <w:t xml:space="preserve"> </w:t>
       </w:r>
       <w:r>
-        <w:t xml:space="preserve">Bronvast op project-, uitvoering- en jaarniveau voor de 27 ingevoerde bronnen en 61 uitvoeringen. De algemene kavel- en gebiedsindeling is geometrisch beschikbaar voor de 55 actuele plots uit 2025; vijf expliciet gekoppelde historische kavels hebben geen afzonderlijke geometrie. De bronvaste plot-jaarlaag bevat 43 regels voor de jaren 1967–1969, 1972–1975, 1988 en 1989. De overige bronvaste uitvoeringen blijven op benoemd deelgebied totdat Ton, een bron of een gecontroleerde geometrie de plotrelatie bewijst.</w:t>
+        <w:t xml:space="preserve">Bronvast op project-, uitvoering- en jaarniveau voor de 27 ingevoerde bronnen en 61 uitvoeringen. De algemene kavel- en gebiedsindeling is geometrisch beschikbaar voor de 55 actuele plots uit 2025; vijf expliciet gekoppelde historische kavels hebben geen afzonderlijke geometrie. De bronvaste plot-jaarlaag bevat 44 regels voor de jaren 1967–1969, 1972–1975, 1988 en 1989. De overige bronvaste uitvoeringen blijven op benoemd deelgebied totdat Ton, een bron of een gecontroleerde geometrie de plotrelatie bewijst.</w:t>
       </w:r>
     </w:p>
     <w:p>

</xml_diff>

<commit_message>
Actualiseer bronregister voor nameninventaris
</commit_message>
<xml_diff>
--- a/docs/MEIJENDEL_BRONREGISTER.docx
+++ b/docs/MEIJENDEL_BRONREGISTER.docx
@@ -19,7 +19,7 @@
         <w:pStyle w:val="FirstParagraph"/>
       </w:pPr>
       <w:r>
-        <w:t>Stand: 10 oktober 2026.</w:t>
+        <w:t>Stand: 14 oktober 2026.</w:t>
       </w:r>
     </w:p>
     <w:p>
@@ -6052,6 +6052,108 @@
     <w:bookmarkEnd w:id="50"/>
     <w:bookmarkEnd w:id="51"/>
     <w:bookmarkStart w:id="59" w:name="X3b532014da7425692b0b753bfd67f02e729afe2"/>
+    <w:p>
+      <w:pPr>
+        <w:pStyle w:val="Heading3"/>
+      </w:pPr>
+      <w:r>
+        <w:t>1.9. Geografische namen en historische paden</w:t>
+      </w:r>
+    </w:p>
+    <w:p>
+      <w:pPr>
+        <w:pStyle w:val="FirstParagraph"/>
+      </w:pPr>
+      <w:r>
+        <w:t>Deze laag bevat geen soortenwaarnemingen. Zij legt actuele en historische namen van gebieden, paden, wegen en wandelroutes vast, met brongeometrie waar de geraadpleegde bron die verantwoord levert.</w:t>
+      </w:r>
+    </w:p>
+    <w:p>
+      <w:pPr>
+        <w:pStyle w:val="BodyText"/>
+      </w:pPr>
+      <w:r>
+        <w:rPr>
+          <w:b/>
+        </w:rPr>
+        <w:t>Bronnen, omvang en periode.</w:t>
+      </w:r>
+      <w:r>
+        <w:t xml:space="preserve"> Op 14 oktober 2026 is de levering meijendel_nameninventaris_2026-10-14 in de levende lokale database Meijendel opgenomen. De levering bevat 182 naamobjecten en 299 gedateerde vermeldingen uit 1602–2026, afkomstig uit acht bronsnapshots: Beekman 2021, Van Leeuwen en Jungerius 1992, Neefjes 2010, Van der Meijden 2012, BRT TOP10NL, een lokale OpenStreetMap-export en twee Dunea-bronnen. Van de 182 objecten hebben er 52 actueel bronbewijs, 104 historisch bronbewijs en 26 beide soorten bronbewijs. Deze status zegt alleen wat in de acht bronnen is aangetroffen; zij is geen verklaring dat een naam officieel is vastgesteld of elders niet meer wordt gebruikt.</w:t>
+      </w:r>
+    </w:p>
+    <w:p>
+      <w:pPr>
+        <w:pStyle w:val="BodyText"/>
+      </w:pPr>
+      <w:r>
+        <w:rPr>
+          <w:b/>
+        </w:rPr>
+        <w:t>Ruimtelijke kwaliteit.</w:t>
+      </w:r>
+      <w:r>
+        <w:t xml:space="preserve"> Voor 71 van de 182 naamobjecten is brongeometrie in RD New opgeslagen; 111 objecten hebben bewust geen geometrie en een expliciete beoordeling van de bronlacune. De actuele kaartbasis bestaat uit 47 TOP10NL-features, samengebracht tot 46 naamobjecten, en 60 OSM-lijnsegmenten, samengebracht tot 25 pad- en wegnamen. De 47 TOP10NL-feature-ID's en 60 OSM-way-ID's zijn afzonderlijk gekoppeld; er staan geen lijsten met bron-ID's in één databaseveld. Alle 71 geometrieën hebben SRID 28992, zijn niet leeg en zijn geldig. De RD-geometrieën stemmen na herprojectie overeen met de 71 geometrieën in het geleverde GeoJSON.</w:t>
+      </w:r>
+    </w:p>
+    <w:p>
+      <w:pPr>
+        <w:pStyle w:val="BodyText"/>
+      </w:pPr>
+      <w:r>
+        <w:t>TOP10NL is de officiële topografische kaartbasis en is beschikbaar onder CC BY 4.0. OpenStreetMap is communitydata onder de ODbL en geldt niet als officiële naamvaststelling. De objectactualiteit van de geselecteerde TOP10NL-features loopt per object uiteen; de OSM-export is een momentopname van 3 april 2026. Historische tekst- en kaartvermeldingen leveren zonder bijbehorende georeferentie geen exact vlak of tracé.</w:t>
+      </w:r>
+    </w:p>
+    <w:p>
+      <w:pPr>
+        <w:pStyle w:val="BodyText"/>
+      </w:pPr>
+      <w:r>
+        <w:t>Van Leeuwen en Jungerius noemen in 1992 de proefdriehoek Klippad–Bunkerpad–Wassenaarse Slag en vermelden dat elf proefplekken in 1987 op een kaart 1:1.000 zijn ingetekend. Die kaart staat niet in het artikel. Van der Meijden bevestigt in 2012 alleen de onderlinge ligging. Bunkerpad en Klippad blijven daarom twee historische naamobjecten zonder geometrie. Zonder de oorspronkelijke 1:1.000-kaart uit 1987 wordt geen lijn gereconstrueerd.</w:t>
+      </w:r>
+    </w:p>
+    <w:p>
+      <w:pPr>
+        <w:pStyle w:val="BodyText"/>
+      </w:pPr>
+      <w:r>
+        <w:rPr>
+          <w:b/>
+        </w:rPr>
+        <w:t>Database en validatie.</w:t>
+      </w:r>
+      <w:r>
+        <w:t xml:space="preserve"> De bronlaag staat in zeven tabellen met prefix nameninventaris_: importbatch, bronnen, objecten, vermeldingen, geometrieën, geometrie-bronobjecten en beoordelingen. De import is gekoppeld aan leveringshash 72862f84d47daa3c98bb4e2960c57cc84945421619eaebd22d90a68791b7239c. De levende controle vond 0 dubbele beoordelingssleutels, 0 verweesde koppelingen en 0 ongeldige, lege of verkeerd geprojecteerde geometrieën. Een tweede import van dezelfde levering veranderde geen rijtelling of tabelchecksum. De databasebrede controle van 128 centrale taxonroutes gaf 0 fouten; de namenlaag bevat zelf geen taxa en vereist daarom geen taxonkoppeling.</w:t>
+      </w:r>
+    </w:p>
+    <w:p>
+      <w:pPr>
+        <w:pStyle w:val="BodyText"/>
+      </w:pPr>
+      <w:r>
+        <w:rPr>
+          <w:b/>
+        </w:rPr>
+        <w:t>Gebruik en grens.</w:t>
+      </w:r>
+      <w:r>
+        <w:t xml:space="preserve"> De laag is geschikt als bronvast namen- en locatieregister, voor kaartlabels, historische naamvarianten en later afzonderlijk te beoordelen relaties met andere ruimtelijke objecten. Zij is geen ecologische waarnemingslaag en bewijst geen aanwezigheid of afwezigheid van soorten. Er is geen automatische naamkoppeling gemaakt met VWG-kavels, plot_gebied, meijendel_basisgebied of meijendel_natura2000. De 111 objecten zonder geometrie mogen niet ruimtelijk worden geïnterpreteerd alsof hun ligging bekend is.</w:t>
+      </w:r>
+    </w:p>
+    <w:p>
+      <w:pPr>
+        <w:pStyle w:val="BodyText"/>
+      </w:pPr>
+      <w:r>
+        <w:rPr>
+          <w:b/>
+        </w:rPr>
+        <w:t>Status.</w:t>
+      </w:r>
+      <w:r>
+        <w:t xml:space="preserve"> Gevalideerd en op 14 oktober 2026 geïmporteerd in de levende lokale database Meijendel. Niet gepubliceerd naar de VPS. De zware afgeleide Meijendel.sql-export en Shiny-cache zijn niet vernieuwd.</w:t>
+      </w:r>
+    </w:p>
     <w:p>
       <w:pPr>
         <w:pStyle w:val="Heading2"/>

</xml_diff>

<commit_message>
Koppel nameninventaris aan vogelkavels
</commit_message>
<xml_diff>
--- a/docs/MEIJENDEL_BRONREGISTER.docx
+++ b/docs/MEIJENDEL_BRONREGISTER.docx
@@ -6101,6 +6101,14 @@
         <w:pStyle w:val="BodyText"/>
       </w:pPr>
       <w:r>
+        <w:t>De actuele vogelkavelgeometrieën komen rechtstreeks uit de SOVON/AVIMAP-shapefile avimap_252_diversen__gebieden.shp van 2 oktober 2026. De bronlaag bevat 56 polygonen in RD New. De Horsten (plotid 29945) ligt buiten Meijendel en is expliciet uitgesloten; de overige 55 unieke en geldige polygonen staan in plots.geom. De 14 historische kavels zonder verifieerbare polygonen houden daar een lege geometrie. De shapefilebundel is geregistreerd met SHA-256 a836869b9b394a0c43ffe56d747383d96e3f2b5c356f5d302a8aa03306782aa5.</w:t>
+      </w:r>
+    </w:p>
+    <w:p>
+      <w:pPr>
+        <w:pStyle w:val="BodyText"/>
+      </w:pPr>
+      <w:r>
         <w:t>TOP10NL is de officiële topografische kaartbasis en is beschikbaar onder CC BY 4.0. OpenStreetMap is communitydata onder de ODbL en geldt niet als officiële naamvaststelling. De objectactualiteit van de geselecteerde TOP10NL-features loopt per object uiteen; de OSM-export is een momentopname van 3 april 2026. Historische tekst- en kaartvermeldingen leveren zonder bijbehorende georeferentie geen exact vlak of tracé.</w:t>
       </w:r>
     </w:p>
@@ -6123,7 +6131,15 @@
         <w:t>Database en validatie.</w:t>
       </w:r>
       <w:r>
-        <w:t xml:space="preserve"> De bronlaag staat in zeven tabellen met prefix nameninventaris_: importbatch, bronnen, objecten, vermeldingen, geometrieën, geometrie-bronobjecten en beoordelingen. De import is gekoppeld aan leveringshash 72862f84d47daa3c98bb4e2960c57cc84945421619eaebd22d90a68791b7239c. De levende controle vond 0 dubbele beoordelingssleutels, 0 verweesde koppelingen en 0 ongeldige, lege of verkeerd geprojecteerde geometrieën. Een tweede import van dezelfde levering veranderde geen rijtelling of tabelchecksum. De databasebrede controle van 128 centrale taxonroutes gaf 0 fouten; de namenlaag bevat zelf geen taxa en vereist daarom geen taxonkoppeling.</w:t>
+        <w:t xml:space="preserve"> De bronlaag staat in zeven tabellen met prefix nameninventaris_: importbatch, bronnen, objecten, vermeldingen, geometrieën, geometrie-bronobjecten en beoordelingen. De import is gekoppeld aan leveringshash 72862f84d47daa3c98bb4e2960c57cc84945421619eaebd22d90a68791b7239c. De kavelbron staat afzonderlijk in plot_geometrie_import; herkomst en geometriehash zijn tevens aan plots.geom gekoppeld. nameninventaris_plot_koppeling bevat 377 actuele cartografische overlaprelaties: 299 vlakrelaties en 78 lijnrelaties. De view v_nameninventaris_plot_actueel beperkt dit met plot_analyse_scope tot 365 relaties voor 62 naamobjecten en 53 kavels binnen meijendel_natura2000; M66 en M91 blijven uitgesloten.</w:t>
+      </w:r>
+    </w:p>
+    <w:p>
+      <w:pPr>
+        <w:pStyle w:val="BodyText"/>
+      </w:pPr>
+      <w:r>
+        <w:t>De levende controle vond 0 dubbele beoordelingssleutels, 0 verweesde naam-kavelrelaties en 0 ongeldige, lege of verkeerd geprojecteerde opgeslagen polygonen. Alle 55 actuele kavelpolygonen hebben SRID 28992 en een verschillende geometriehash. De Horsten komt niet in plots of de koppeltabel voor. Bunkerpad en Klippad hebben beide 0 ruimtelijke koppelingen. Een tweede proefimport van dezelfde shapefilebundel hield één bronversie, 55 polygonen en dezelfde 377 relaties. De databasebrede controle van 128 centrale taxonroutes gaf bij de oorspronkelijke namenimport 0 fouten; de namenlaag bevat zelf geen taxa en vereist daarom geen taxonkoppeling.</w:t>
       </w:r>
     </w:p>
     <w:p>
@@ -6137,7 +6153,7 @@
         <w:t>Gebruik en grens.</w:t>
       </w:r>
       <w:r>
-        <w:t xml:space="preserve"> De laag is geschikt als bronvast namen- en locatieregister, voor kaartlabels, historische naamvarianten en later afzonderlijk te beoordelen relaties met andere ruimtelijke objecten. Zij is geen ecologische waarnemingslaag en bewijst geen aanwezigheid of afwezigheid van soorten. Er is geen automatische naamkoppeling gemaakt met VWG-kavels, plot_gebied, meijendel_basisgebied of meijendel_natura2000. De 111 objecten zonder geometrie mogen niet ruimtelijk worden geïnterpreteerd alsof hun ligging bekend is.</w:t>
+        <w:t xml:space="preserve"> De laag is geschikt als bronvast namen- en locatieregister, voor kaartlabels, historische naamvarianten en actuele cartografische relaties met vogelkavels. De koppeling leest uitsluitend plots.geom, niet de ndff_*-tabellen. Zij bewijst alleen ruimtelijke overlap tussen de huidige brongeometrieën: de SOVON-shapefile van 2 oktober 2026, de OSM-momentopname van 3 april 2026 en de geselecteerde TOP10NL-objecten. Zij bewijst niet dat een historische naam in dezelfde periode binnen een toenmalige kavelbegrenzing lag. De 111 naamobjecten en 14 historische kavels zonder geometrie blijven ruimtelijk onbekend. De namenlaag is geen ecologische waarnemingslaag en bewijst geen aanwezigheid of afwezigheid van soorten.</w:t>
       </w:r>
     </w:p>
     <w:p>
@@ -6151,7 +6167,7 @@
         <w:t>Status.</w:t>
       </w:r>
       <w:r>
-        <w:t xml:space="preserve"> Gevalideerd en op 14 oktober 2026 geïmporteerd in de levende lokale database Meijendel. Niet gepubliceerd naar de VPS. De zware afgeleide Meijendel.sql-export en Shiny-cache zijn niet vernieuwd.</w:t>
+        <w:t xml:space="preserve"> Gevalideerd en op 14 oktober 2026 geïmporteerd en aan de actuele vogelkavelgeometrieën gekoppeld in de levende lokale database Meijendel. Niet gepubliceerd naar de VPS. De zware afgeleide Meijendel.sql-export en Shiny-cache zijn niet vernieuwd.</w:t>
       </w:r>
     </w:p>
     <w:p>

</xml_diff>

<commit_message>
Koppel maatregelen via nameninventaris
</commit_message>
<xml_diff>
--- a/docs/MEIJENDEL_BRONREGISTER.docx
+++ b/docs/MEIJENDEL_BRONREGISTER.docx
@@ -6440,7 +6440,7 @@
         <w:t xml:space="preserve"> </w:t>
       </w:r>
       <w:r>
-        <w:t xml:space="preserve">is als naamcontext gebruikt; zij bevat geen digitale grenzen waarmee namen als Meeuwenhoek, Harstenhoek of De Klip exact kunnen worden afgebakend. De 55 actuele polygonen leveren acht topologisch samengevoegde gebiedsgeometrieën op. De 14 historische kavels hebben in deze plotversie geen afzonderlijke geometrie en blijven daarom uitsluitend classificatieregels.</w:t>
+        <w:t xml:space="preserve">is als naamcontext gebruikt, maar bevat zelf geen digitale grenzen. De afzonderlijke nameninventaris voegt voor onder meer Meeuwenhoek en De Klip wel actuele TOP10NL-geometrie toe; dat bewijst niet dat hun historische begrenzing identiek was. De 55 actuele plotpolygonen leveren acht topologisch samengevoegde gebiedsgeometrieën op. De 14 historische kavels hebben in deze plotversie geen afzonderlijke geometrie en blijven daarom uitsluitend classificatieregels.</w:t>
       </w:r>
     </w:p>
     <w:p>
@@ -6457,7 +6457,7 @@
         <w:t xml:space="preserve"> </w:t>
       </w:r>
       <w:r>
-        <w:t xml:space="preserve">bevat nog nul uitvoeringsgeometrieën.</w:t>
+        <w:t xml:space="preserve">bevat nog nul exacte uitvoeringsgeometrieën.</w:t>
       </w:r>
       <w:r>
         <w:t xml:space="preserve"> </w:t>
@@ -6472,7 +6472,7 @@
         <w:t xml:space="preserve"> </w:t>
       </w:r>
       <w:r>
-        <w:t xml:space="preserve">bevat twee veilige relaties: Voorlinden als locatie binnen het speciale gebied M91 en de in 1990 ingevoerde begrazing voor Kijfhoek en Bierlap als volledig benoemd gebied. Die laatste gebiedsrelatie is niet automatisch over de 23 onderliggende actuele en historische plots verdeeld.</w:t>
+        <w:t xml:space="preserve">bevat twee veilige relaties: Voorlinden als locatie binnen het speciale gebied M91 en de in 1990 ingevoerde begrazing voor Kijfhoek en Bierlap als volledig benoemd gebied.</w:t>
       </w:r>
       <w:r>
         <w:t xml:space="preserve"> </w:t>
@@ -6487,7 +6487,46 @@
         <w:t xml:space="preserve"> </w:t>
       </w:r>
       <w:r>
-        <w:t xml:space="preserve">bevat 36 geverifieerde directe relaties. Drie bestonden al: Voorlinden–M91 en Pan 13–M2/M3. Van de 33 daarna toegevoegde relaties volgen er 29 uit letterlijke kavelvermeldingen in de vogelrapporten over 1967–1975; zij betreffen M1b, M2, M3, M4, M5, M6, M7, M10, M12, M13, M13s, M14, M16, M17, M71 en M77. Historische M4, M5, M10, M12 en M17 blijven aan hun historische plotrecords gekoppeld; M17 is dus niet stilzwijgend vervangen door het actuele M17a.</w:t>
+        <w:t xml:space="preserve">bevat 79 geverifieerde directe relaties. Daarvan waren 36 al onderbouwd met expliciete kavelvermeldingen, gebruikersvaststellingen of een bijzondere gebiedsnaam. De nameninventaris voegt 32 geometrische doorsnijdingen toe voor zes volledig en letterlijk gelokaliseerde uitvoeringen met de naamobjecten Kijfhoek, Bierlap, Meeuwenhoek, Tafelberg, ’t Scheepje, Uilenbosch en Oude Rijs uit</w:t>
+      </w:r>
+      <w:r>
+        <w:t xml:space="preserve"> </w:t>
+      </w:r>
+      <w:r>
+        <w:rPr>
+          <w:rStyle w:val="VerbatimChar"/>
+        </w:rPr>
+        <w:t xml:space="preserve">meijendel_nameninventaris_2026-10-14</w:t>
+      </w:r>
+      <w:r>
+        <w:t xml:space="preserve">. Daarnaast zijn elf relaties toegevoegd voor de al vastgestelde volledige systemen Pan 13 en Plas 20. De geometrische naamkoppelingen gebruiken de actuele SOVON-plotgeometrie</w:t>
+      </w:r>
+      <w:r>
+        <w:t xml:space="preserve"> </w:t>
+      </w:r>
+      <w:r>
+        <w:rPr>
+          <w:rStyle w:val="VerbatimChar"/>
+        </w:rPr>
+        <w:t xml:space="preserve">sovon-avimap-2025-download-2026-10-02</w:t>
+      </w:r>
+      <w:r>
+        <w:t xml:space="preserve">. Een doorsnijding bewijst dat het genoemde naamgebied de plot raakt, niet welk percentage van de plot feitelijk is bewerkt;</w:t>
+      </w:r>
+      <w:r>
+        <w:t xml:space="preserve"> </w:t>
+      </w:r>
+      <w:r>
+        <w:rPr>
+          <w:rStyle w:val="VerbatimChar"/>
+        </w:rPr>
+        <w:t xml:space="preserve">doorsnijding_pct</w:t>
+      </w:r>
+      <w:r>
+        <w:t xml:space="preserve"> </w:t>
+      </w:r>
+      <w:r>
+        <w:t xml:space="preserve">blijft daarom leeg.</w:t>
       </w:r>
     </w:p>
     <w:p>
@@ -6527,7 +6566,7 @@
         <w:t xml:space="preserve"> </w:t>
       </w:r>
       <w:r>
-        <w:t xml:space="preserve">48 van maart 2006; het Zotero-jaar 1989 is onjuist en verwijst in de tekst naar de eerdere slibverwijdering in Plas 13. Deze combinatie van gebruikersvaststelling en ruimtelijke broncontext onderbouwt drie koppelingen voor de reparatie in 1969.</w:t>
+        <w:t xml:space="preserve">48 van maart 2006; het Zotero-jaar 1989 is onjuist en verwijst in de tekst naar de eerdere slibverwijdering in Plas 13. Deze combinatie van gebruikersvaststelling en ruimtelijke broncontext onderbouwt twaalf koppelingen: drie voor de reparatie in 1969 en telkens drie voor slibverwijdering, hydrologische aanpassing en infrastructuurwerk in 2005–2006. Pan 13 is op grond van de primaire bron en het broedvogelverslag over 2006 als volledig plassensysteem in M2 en M3 gekoppeld; zowel de slibverwijdering als de oeveraanpassing in 1988–1989 heeft daardoor twee directe kavelrelaties.</w:t>
       </w:r>
     </w:p>
     <w:p>
@@ -6575,7 +6614,7 @@
         <w:pStyle w:val="BodyText"/>
       </w:pPr>
       <w:r>
-        <w:t xml:space="preserve">De 36 plotkoppelingen en 75 uitgevoerde jaarregels leveren samen 44 regels in</w:t>
+        <w:t xml:space="preserve">De 79 plotkoppelingen en 75 uitgevoerde jaarregels leveren samen 102 regels in</w:t>
       </w:r>
       <w:r>
         <w:t xml:space="preserve"> </w:t>
@@ -6587,7 +6626,22 @@
         <w:t xml:space="preserve">v_plot_jaar_maatregel_bronvast</w:t>
       </w:r>
       <w:r>
-        <w:t xml:space="preserve">: vier bestaande regels voor Pan 13 in M2 en M3 in 1988–1989, 36 regels voor expliciet benoemde kavels in 1967, 1968 en 1972–1975, drie regels voor Plas 20 in M16, M17a en M17b in 1969 en één regel voor Libellenvallei in M17b in 1975. Voorlinden levert geen plot-jaarregel omdat de jaarstatus voor 2025</w:t>
+        <w:t xml:space="preserve">. De nameninventaris voegt 36 plot-jaarrijen toe: begrazing in Kijfhoek en Bierlap in 1990, hervat maaibeheer bij Tafelberg en ’t Scheepje in 2025, uitgevoerd maaibeheer in Uilenbosch in 2017–2021 en vogelkersbestrijding in Kijfhoek, Bierlap en Meeuwenhoek in 2020. De aanvullende systeemkoppelingen voegen 22 plot-jaarrijen toe: vier voor de oeveraanpassing van Pan 13 in 1988–1989 en achttien voor drie uitvoeringen in Plas 20 in 2005–2006. De koppelingen voor de uitbreiding van het begrazingsgebied met Meeuwenhoek en het maaibeheer in Oude Rijs leveren geen uitgevoerde plot-jaarrij, omdat respectievelijk een uitvoeringsjaar ontbreekt en 2025 als</w:t>
+      </w:r>
+      <w:r>
+        <w:t xml:space="preserve"> </w:t>
+      </w:r>
+      <w:r>
+        <w:rPr>
+          <w:rStyle w:val="VerbatimChar"/>
+        </w:rPr>
+        <w:t xml:space="preserve">niet_uitgevoerd</w:t>
+      </w:r>
+      <w:r>
+        <w:t xml:space="preserve"> </w:t>
+      </w:r>
+      <w:r>
+        <w:t xml:space="preserve">is vastgelegd. Voorlinden levert evenmin een plot-jaarrij omdat de jaarstatus voor 2025</w:t>
       </w:r>
       <w:r>
         <w:t xml:space="preserve"> </w:t>
@@ -6602,7 +6656,7 @@
         <w:t xml:space="preserve"> </w:t>
       </w:r>
       <w:r>
-        <w:t xml:space="preserve">is. Rietpoten in 1987, begrazing vanaf 1990 en overige vallei- en plassenbeheer in 1993–2006 hebben wel bronvaste uitvoerings- en jaarregels, maar nog geen directe plotkoppeling wanneer de geraadpleegde bron geen eenduidig kavelnummer noemt.</w:t>
+        <w:t xml:space="preserve">is.</w:t>
       </w:r>
     </w:p>
     <w:p>
@@ -6668,7 +6722,7 @@
         <w:t xml:space="preserve"> </w:t>
       </w:r>
       <w:r>
-        <w:t xml:space="preserve">Bronvast op project-, uitvoering- en jaarniveau voor de 27 ingevoerde bronnen en 61 uitvoeringen. De algemene kavel- en gebiedsindeling is geometrisch beschikbaar voor de 55 actuele plots uit 2025; vijf expliciet gekoppelde historische kavels hebben geen afzonderlijke geometrie. De bronvaste plot-jaarlaag bevat 44 regels voor de jaren 1967–1969, 1972–1975, 1988 en 1989. De overige bronvaste uitvoeringen blijven op benoemd deelgebied totdat Ton, een bron of een gecontroleerde geometrie de plotrelatie bewijst.</w:t>
+        <w:t xml:space="preserve">Bronvast op project-, uitvoering- en jaarniveau voor de 27 ingevoerde bronnen en 61 uitvoeringen. De algemene kavel- en gebiedsindeling is geometrisch beschikbaar voor de 55 actuele plots uit 2025; vijf expliciet gekoppelde historische kavels hebben geen afzonderlijke geometrie. De bronvaste plot-jaarlaag bevat 102 regels voor 1967–1969, 1972–1975, 1988–1990, 2005–2006, 2017–2021 en 2025. Zes uitvoeringen zijn via de nameninventaris aan 32 kavelsituaties gekoppeld; Pan 13 en Plas 20 voegen elf aanvullende relaties toe. Nog 31 uitvoeringen hebben geen directe plotkoppeling.</w:t>
       </w:r>
     </w:p>
     <w:p>
@@ -8205,13 +8259,124 @@
     </w:p>
     <w:p>
       <w:pPr>
+        <w:pStyle w:val="Heading3"/>
+      </w:pPr>
+      <w:bookmarkStart w:id="83" w:name="_41253e96e2b1ec8824f9b84bf0a06f4f5ff5fba"/>
+      <w:r>
+        <w:t xml:space="preserve">3.12. Geografische namen en historische paden</w:t>
+      </w:r>
+      <w:bookmarkEnd w:id="83"/>
+    </w:p>
+    <w:p>
+      <w:pPr>
+        <w:pStyle w:val="FirstParagraph"/>
+      </w:pPr>
+      <w:r>
+        <w:t xml:space="preserve">Op 14 oktober 2026 is een afzonderlijke GIS-levering samengesteld uit acht geraadpleegde bronverzamelingen: Beekman 2021, Van Leeuwen en Jungerius 1992, Neefjes 2010, Van der Meijden 2012, BRT TOP10NL, een lokale OpenStreetMap-export en twee Dunea-bronnen. Versie</w:t>
+      </w:r>
+      <w:r>
+        <w:t xml:space="preserve"> </w:t>
+      </w:r>
+      <w:r>
+        <w:rPr>
+          <w:rStyle w:val="VerbatimChar"/>
+        </w:rPr>
+        <w:t xml:space="preserve">meijendel_nameninventaris_2026-10-14</w:t>
+      </w:r>
+      <w:r>
+        <w:t xml:space="preserve"> </w:t>
+      </w:r>
+      <w:r>
+        <w:t xml:space="preserve">is in de levende lokale database</w:t>
+      </w:r>
+      <w:r>
+        <w:t xml:space="preserve"> </w:t>
+      </w:r>
+      <w:r>
+        <w:rPr>
+          <w:rStyle w:val="VerbatimChar"/>
+        </w:rPr>
+        <w:t xml:space="preserve">Meijendel</w:t>
+      </w:r>
+      <w:r>
+        <w:t xml:space="preserve"> </w:t>
+      </w:r>
+      <w:r>
+        <w:t xml:space="preserve">geïmporteerd. Zij bevat 182 onderscheiden pad-, route- en gebiedsnaamobjecten en 299 gedateerde vermeldingen uit 1602–2026. Voor 71 objecten is een brongeometrie beschikbaar; 111 objecten hebben bewust geen geometrie omdat de geraadpleegde kaart- of coördinaatgrondslag daarvoor onvoldoende is.</w:t>
+      </w:r>
+    </w:p>
+    <w:p>
+      <w:pPr>
+        <w:pStyle w:val="BodyText"/>
+      </w:pPr>
+      <w:r>
+        <w:t xml:space="preserve">De actuele ruimtelijke selectie bevat 35 TOP10NL-geografische features en 12 TOP10NL-functionele features die de ruime projectgrens raken, plus 60 benoemde OpenStreetMap-lijnsegmenten die tot 25 pad- en wegnamen binnen de lokale Natura 2000-geometrie zijn gegroepeerd. TOP10NL is de actuele officiële kaartbron; de objectactualiteit van de 47 geselecteerde features verschilt per object. De OpenStreetMap-export is een communitybron met bestandsdatum 3 april 2026 en geldt niet als officiële naamvaststelling.</w:t>
+      </w:r>
+    </w:p>
+    <w:p>
+      <w:pPr>
+        <w:pStyle w:val="BodyText"/>
+      </w:pPr>
+      <w:r>
+        <w:t xml:space="preserve">De 71 naamgeometrieën zijn vergeleken met alle 55 actuele SOVON-kavelpolygonen uit versie</w:t>
+      </w:r>
+      <w:r>
+        <w:t xml:space="preserve"> </w:t>
+      </w:r>
+      <w:r>
+        <w:rPr>
+          <w:rStyle w:val="VerbatimChar"/>
+        </w:rPr>
+        <w:t xml:space="preserve">sovon-avimap-2025-download-2026-10-02</w:t>
+      </w:r>
+      <w:r>
+        <w:t xml:space="preserve">. Dit levert 377 geometrische naam–kavelrelaties voor 66 naamobjecten op. De analyseview</w:t>
+      </w:r>
+      <w:r>
+        <w:t xml:space="preserve"> </w:t>
+      </w:r>
+      <w:r>
+        <w:rPr>
+          <w:rStyle w:val="VerbatimChar"/>
+        </w:rPr>
+        <w:t xml:space="preserve">v_nameninventaris_plot_actueel</w:t>
+      </w:r>
+      <w:r>
+        <w:t xml:space="preserve"> </w:t>
+      </w:r>
+      <w:r>
+        <w:t xml:space="preserve">bevat 365 relaties voor de 53 kavels binnen</w:t>
+      </w:r>
+      <w:r>
+        <w:t xml:space="preserve"> </w:t>
+      </w:r>
+      <w:r>
+        <w:rPr>
+          <w:rStyle w:val="VerbatimChar"/>
+        </w:rPr>
+        <w:t xml:space="preserve">meijendel_natura2000</w:t>
+      </w:r>
+      <w:r>
+        <w:t xml:space="preserve">; M66 en M91 blijven conform de algemene analysescope buiten deze view. De maatregelactualisering gebruikt alleen volledige, letterlijke locatienamen waarvan alle onderdelen een naamgeometrie hebben. Brede aanduidingen als Meijendel, gedeeltelijk geometriseerde samengestelde locaties en afwijkende namen worden niet automatisch gekoppeld.</w:t>
+      </w:r>
+    </w:p>
+    <w:p>
+      <w:pPr>
+        <w:pStyle w:val="BodyText"/>
+      </w:pPr>
+      <w:r>
+        <w:t xml:space="preserve">Van Leeuwen en Jungerius noemen in 1992 de proefdriehoek Klippad–Bunkerpad–Wassenaarse Slag en vermelden dat elf proefplekken in 1987 op een kaart 1:1.000 zijn ingetekend. Die kaart staat niet in het artikel. Van der Meijden bevestigt in 2012 alleen de onderlinge ligging. Bunkerpad en Klippad blijven daarom twee historische naamrecords met ontbrekend tracé. De kleinste resterende bronvraag is de oorspronkelijke 1:1.000-kaart uit 1987 bij DZH/Dunea-terreinbeheer; zonder die kaart wordt geen lijn gereconstrueerd.</w:t>
+      </w:r>
+    </w:p>
+    <w:p>
+      <w:pPr>
         <w:pStyle w:val="Heading2"/>
       </w:pPr>
-      <w:bookmarkStart w:id="83" w:name="_8e1aa2a9058c5df66a55f09f3195dc2392072ca"/>
+      <w:bookmarkStart w:id="84" w:name="_8e1aa2a9058c5df66a55f09f3195dc2392072ca"/>
       <w:r>
         <w:t xml:space="preserve">4. Verwachte aanvullingen</w:t>
       </w:r>
-      <w:bookmarkEnd w:id="83"/>
+      <w:bookmarkEnd w:id="84"/>
     </w:p>
     <w:p>
       <w:pPr>
@@ -8271,11 +8436,11 @@
       <w:pPr>
         <w:pStyle w:val="Heading2"/>
       </w:pPr>
-      <w:bookmarkStart w:id="84" w:name="_bd1d36805349ef5ec39b6efd044fd20b47e23f4"/>
+      <w:bookmarkStart w:id="85" w:name="_bd1d36805349ef5ec39b6efd044fd20b47e23f4"/>
       <w:r>
         <w:t xml:space="preserve">5. Bronnen die niet verder worden uitgewerkt</w:t>
       </w:r>
-      <w:bookmarkEnd w:id="84"/>
+      <w:bookmarkEnd w:id="85"/>
     </w:p>
     <w:p>
       <w:pPr>
@@ -8305,11 +8470,11 @@
       <w:pPr>
         <w:pStyle w:val="Heading2"/>
       </w:pPr>
-      <w:bookmarkStart w:id="85" w:name="_013584c0923eee2d005d13457186cf6f9764ca0"/>
+      <w:bookmarkStart w:id="86" w:name="_013584c0923eee2d005d13457186cf6f9764ca0"/>
       <w:r>
         <w:t xml:space="preserve">6. Gebruik van dit register</w:t>
       </w:r>
-      <w:bookmarkEnd w:id="85"/>
+      <w:bookmarkEnd w:id="86"/>
     </w:p>
     <w:p>
       <w:pPr>
@@ -8394,11 +8559,11 @@
       <w:pPr>
         <w:pStyle w:val="Heading2"/>
       </w:pPr>
-      <w:bookmarkStart w:id="86" w:name="_actieplan"/>
+      <w:bookmarkStart w:id="87" w:name="_actieplan"/>
       <w:r>
         <w:t xml:space="preserve">7. Actieplan</w:t>
       </w:r>
-      <w:bookmarkEnd w:id="86"/>
+      <w:bookmarkEnd w:id="87"/>
     </w:p>
     <w:p>
       <w:pPr>
@@ -8427,11 +8592,11 @@
       <w:pPr>
         <w:pStyle w:val="Heading3"/>
       </w:pPr>
-      <w:bookmarkStart w:id="87" w:name="_94b069977659593a87344faec87dcce83750292"/>
+      <w:bookmarkStart w:id="88" w:name="_94b069977659593a87344faec87dcce83750292"/>
       <w:r>
         <w:t xml:space="preserve">Fase 1 — openbare, direct toetsbare bronnen</w:t>
       </w:r>
-      <w:bookmarkEnd w:id="87"/>
+      <w:bookmarkEnd w:id="88"/>
     </w:p>
     <w:p>
       <w:pPr>
@@ -8515,11 +8680,11 @@
       <w:pPr>
         <w:pStyle w:val="Heading3"/>
       </w:pPr>
-      <w:bookmarkStart w:id="88" w:name="_1e65d730f223a62ff579853fd3c77c9308748df"/>
+      <w:bookmarkStart w:id="89" w:name="_1e65d730f223a62ff579853fd3c77c9308748df"/>
       <w:r>
         <w:t xml:space="preserve">Fase 2 — reeksen met grote historische of trendwaarde</w:t>
       </w:r>
-      <w:bookmarkEnd w:id="88"/>
+      <w:bookmarkEnd w:id="89"/>
     </w:p>
     <w:p>
       <w:pPr>
@@ -8669,11 +8834,11 @@
       <w:pPr>
         <w:pStyle w:val="Heading3"/>
       </w:pPr>
-      <w:bookmarkStart w:id="89" w:name="_6b9d0c88ffcb5584e67daa74c9524b522af67c0"/>
+      <w:bookmarkStart w:id="90" w:name="_6b9d0c88ffcb5584e67daa74c9524b522af67c0"/>
       <w:r>
         <w:t xml:space="preserve">Fase 3 — reeds bekende bronhouders en contextdatasets</w:t>
       </w:r>
-      <w:bookmarkEnd w:id="89"/>
+      <w:bookmarkEnd w:id="90"/>
     </w:p>
     <w:p>
       <w:pPr>
@@ -8748,11 +8913,11 @@
       <w:pPr>
         <w:pStyle w:val="Heading3"/>
       </w:pPr>
-      <w:bookmarkStart w:id="90" w:name="_d490f73b19661b8ff0d346b94e527be91e989c7"/>
+      <w:bookmarkStart w:id="91" w:name="_d490f73b19661b8ff0d346b94e527be91e989c7"/>
       <w:r>
         <w:t xml:space="preserve">Vaste werkwijze per bron</w:t>
       </w:r>
-      <w:bookmarkEnd w:id="90"/>
+      <w:bookmarkEnd w:id="91"/>
     </w:p>
     <w:p>
       <w:pPr>
@@ -8766,11 +8931,11 @@
       <w:pPr>
         <w:pStyle w:val="Heading3"/>
       </w:pPr>
-      <w:bookmarkStart w:id="91" w:name="_1e50ec235a164d1e043cda4cec7be66fb154af3"/>
+      <w:bookmarkStart w:id="92" w:name="_1e50ec235a164d1e043cda4cec7be66fb154af3"/>
       <w:r>
         <w:t xml:space="preserve">Dekking van de internetcontrole</w:t>
       </w:r>
-      <w:bookmarkEnd w:id="91"/>
+      <w:bookmarkEnd w:id="92"/>
     </w:p>
     <w:p>
       <w:pPr>
@@ -8784,11 +8949,11 @@
       <w:pPr>
         <w:pStyle w:val="Heading2"/>
       </w:pPr>
-      <w:bookmarkStart w:id="92" w:name="_5001ec8ecf742000e2504f4f268bea177f3f158"/>
+      <w:bookmarkStart w:id="93" w:name="_5001ec8ecf742000e2504f4f268bea177f3f158"/>
       <w:r>
         <w:t xml:space="preserve">Achterliggende verantwoording</w:t>
       </w:r>
-      <w:bookmarkEnd w:id="92"/>
+      <w:bookmarkEnd w:id="93"/>
     </w:p>
     <w:p>
       <w:pPr>
@@ -8798,7 +8963,7 @@
           <w:numId w:val="1005"/>
         </w:numPr>
       </w:pPr>
-      <w:hyperlink r:id="rId93">
+      <w:hyperlink r:id="rId94">
         <w:r>
           <w:rPr>
             <w:rStyle w:val="Hyperlink"/>
@@ -8815,7 +8980,7 @@
           <w:numId w:val="1005"/>
         </w:numPr>
       </w:pPr>
-      <w:hyperlink r:id="rId94">
+      <w:hyperlink r:id="rId95">
         <w:r>
           <w:rPr>
             <w:rStyle w:val="Hyperlink"/>
@@ -8832,7 +8997,7 @@
           <w:numId w:val="1005"/>
         </w:numPr>
       </w:pPr>
-      <w:hyperlink r:id="rId95">
+      <w:hyperlink r:id="rId96">
         <w:r>
           <w:rPr>
             <w:rStyle w:val="Hyperlink"/>
@@ -8849,7 +9014,7 @@
           <w:numId w:val="1005"/>
         </w:numPr>
       </w:pPr>
-      <w:hyperlink r:id="rId96">
+      <w:hyperlink r:id="rId97">
         <w:r>
           <w:rPr>
             <w:rStyle w:val="Hyperlink"/>
@@ -8866,7 +9031,7 @@
           <w:numId w:val="1005"/>
         </w:numPr>
       </w:pPr>
-      <w:hyperlink r:id="rId97">
+      <w:hyperlink r:id="rId98">
         <w:r>
           <w:rPr>
             <w:rStyle w:val="Hyperlink"/>
@@ -8883,7 +9048,7 @@
           <w:numId w:val="1005"/>
         </w:numPr>
       </w:pPr>
-      <w:hyperlink r:id="rId98">
+      <w:hyperlink r:id="rId99">
         <w:r>
           <w:rPr>
             <w:rStyle w:val="Hyperlink"/>
@@ -8900,7 +9065,7 @@
           <w:numId w:val="1005"/>
         </w:numPr>
       </w:pPr>
-      <w:hyperlink r:id="rId99">
+      <w:hyperlink r:id="rId100">
         <w:r>
           <w:rPr>
             <w:rStyle w:val="Hyperlink"/>

</xml_diff>

<commit_message>
Koppel Helmduinen aan zes kavels
</commit_message>
<xml_diff>
--- a/docs/MEIJENDEL_BRONREGISTER.docx
+++ b/docs/MEIJENDEL_BRONREGISTER.docx
@@ -6487,7 +6487,7 @@
         <w:t xml:space="preserve"> </w:t>
       </w:r>
       <w:r>
-        <w:t xml:space="preserve">bevat 79 geverifieerde directe relaties. Daarvan waren 36 al onderbouwd met expliciete kavelvermeldingen, gebruikersvaststellingen of een bijzondere gebiedsnaam. De nameninventaris voegt 32 geometrische doorsnijdingen toe voor zes volledig en letterlijk gelokaliseerde uitvoeringen met de naamobjecten Kijfhoek, Bierlap, Meeuwenhoek, Tafelberg, ’t Scheepje, Uilenbosch en Oude Rijs uit</w:t>
+        <w:t xml:space="preserve">bevat 85 geverifieerde directe relaties. Daarvan waren 36 al onderbouwd met expliciete kavelvermeldingen, gebruikersvaststellingen of een bijzondere gebiedsnaam. De nameninventaris voegt 32 geometrische doorsnijdingen toe voor zes volledig en letterlijk gelokaliseerde uitvoeringen met de naamobjecten Kijfhoek, Bierlap, Meeuwenhoek, Tafelberg, ’t Scheepje, Uilenbosch en Oude Rijs uit</w:t>
       </w:r>
       <w:r>
         <w:t xml:space="preserve"> </w:t>
@@ -6499,7 +6499,22 @@
         <w:t xml:space="preserve">meijendel_nameninventaris_2026-10-14</w:t>
       </w:r>
       <w:r>
-        <w:t xml:space="preserve">. Daarnaast zijn elf relaties toegevoegd voor de al vastgestelde volledige systemen Pan 13 en Plas 20. De geometrische naamkoppelingen gebruiken de actuele SOVON-plotgeometrie</w:t>
+        <w:t xml:space="preserve">. Daarnaast zijn elf relaties toegevoegd voor de al vastgestelde volledige systemen Pan 13 en Plas 20. De begrazing van de Helmduinen vanaf eind 1991 is op 14 oktober 2026 door Ton gekoppeld aan M13, M13s, M14, M15, M16 en M17a. M16 omvat het grootste deel; M15 en M17a zijn gedeeltelijk betrokken; voor M13, M13s en M14 zijn aanvullende consequenties vastgesteld. Omdat de bron geen oppervlakte per kavel geeft, blijft</w:t>
+      </w:r>
+      <w:r>
+        <w:t xml:space="preserve"> </w:t>
+      </w:r>
+      <w:r>
+        <w:rPr>
+          <w:rStyle w:val="VerbatimChar"/>
+        </w:rPr>
+        <w:t xml:space="preserve">doorsnijding_pct</w:t>
+      </w:r>
+      <w:r>
+        <w:t xml:space="preserve"> </w:t>
+      </w:r>
+      <w:r>
+        <w:t xml:space="preserve">voor alle zes leeg. De geometrische naamkoppelingen gebruiken de actuele SOVON-plotgeometrie</w:t>
       </w:r>
       <w:r>
         <w:t xml:space="preserve"> </w:t>
@@ -6614,7 +6629,7 @@
         <w:pStyle w:val="BodyText"/>
       </w:pPr>
       <w:r>
-        <w:t xml:space="preserve">De 79 plotkoppelingen en 75 uitgevoerde jaarregels leveren samen 102 regels in</w:t>
+        <w:t xml:space="preserve">De 85 plotkoppelingen en 75 uitgevoerde jaarregels leveren samen 108 regels in</w:t>
       </w:r>
       <w:r>
         <w:t xml:space="preserve"> </w:t>
@@ -6626,7 +6641,7 @@
         <w:t xml:space="preserve">v_plot_jaar_maatregel_bronvast</w:t>
       </w:r>
       <w:r>
-        <w:t xml:space="preserve">. De nameninventaris voegt 36 plot-jaarrijen toe: begrazing in Kijfhoek en Bierlap in 1990, hervat maaibeheer bij Tafelberg en ’t Scheepje in 2025, uitgevoerd maaibeheer in Uilenbosch in 2017–2021 en vogelkersbestrijding in Kijfhoek, Bierlap en Meeuwenhoek in 2020. De aanvullende systeemkoppelingen voegen 22 plot-jaarrijen toe: vier voor de oeveraanpassing van Pan 13 in 1988–1989 en achttien voor drie uitvoeringen in Plas 20 in 2005–2006. De koppelingen voor de uitbreiding van het begrazingsgebied met Meeuwenhoek en het maaibeheer in Oude Rijs leveren geen uitgevoerde plot-jaarrij, omdat respectievelijk een uitvoeringsjaar ontbreekt en 2025 als</w:t>
+        <w:t xml:space="preserve">. De nameninventaris voegt 36 plot-jaarrijen toe: begrazing in Kijfhoek en Bierlap in 1990, hervat maaibeheer bij Tafelberg en ’t Scheepje in 2025, uitgevoerd maaibeheer in Uilenbosch in 2017–2021 en vogelkersbestrijding in Kijfhoek, Bierlap en Meeuwenhoek in 2020. De aanvullende systeemkoppelingen voegen 22 plot-jaarrijen toe: vier voor de oeveraanpassing van Pan 13 in 1988–1989 en achttien voor drie uitvoeringen in Plas 20 in 2005–2006. De Helmduinen-koppeling voegt zes plot-jaarrijen voor 1991 toe. De koppelingen voor de uitbreiding van het begrazingsgebied met Meeuwenhoek en het maaibeheer in Oude Rijs leveren geen uitgevoerde plot-jaarrij, omdat respectievelijk een uitvoeringsjaar ontbreekt en 2025 als</w:t>
       </w:r>
       <w:r>
         <w:t xml:space="preserve"> </w:t>
@@ -6722,7 +6737,7 @@
         <w:t xml:space="preserve"> </w:t>
       </w:r>
       <w:r>
-        <w:t xml:space="preserve">Bronvast op project-, uitvoering- en jaarniveau voor de 27 ingevoerde bronnen en 61 uitvoeringen. De algemene kavel- en gebiedsindeling is geometrisch beschikbaar voor de 55 actuele plots uit 2025; vijf expliciet gekoppelde historische kavels hebben geen afzonderlijke geometrie. De bronvaste plot-jaarlaag bevat 102 regels voor 1967–1969, 1972–1975, 1988–1990, 2005–2006, 2017–2021 en 2025. Zes uitvoeringen zijn via de nameninventaris aan 32 kavelsituaties gekoppeld; Pan 13 en Plas 20 voegen elf aanvullende relaties toe. Nog 31 uitvoeringen hebben geen directe plotkoppeling.</w:t>
+        <w:t xml:space="preserve">Bronvast op project-, uitvoering- en jaarniveau voor de 27 ingevoerde bronnen en 61 uitvoeringen. De algemene kavel- en gebiedsindeling is geometrisch beschikbaar voor de 55 actuele plots uit 2025; vijf expliciet gekoppelde historische kavels hebben geen afzonderlijke geometrie. De bronvaste plot-jaarlaag bevat 108 regels voor 1967–1969, 1972–1975, 1988–1991, 2005–2006, 2017–2021 en 2025. Zes uitvoeringen zijn via de nameninventaris aan 32 kavelsituaties gekoppeld; Pan 13 en Plas 20 voegen elf aanvullende relaties toe en Helmduinen zes. Nog 30 uitvoeringen hebben geen directe plotkoppeling.</w:t>
       </w:r>
     </w:p>
     <w:p>

</xml_diff>

<commit_message>
Koppel Parnassiapad 2 aan M15
</commit_message>
<xml_diff>
--- a/docs/MEIJENDEL_BRONREGISTER.docx
+++ b/docs/MEIJENDEL_BRONREGISTER.docx
@@ -6297,7 +6297,7 @@
         <w:pStyle w:val="BodyText"/>
       </w:pPr>
       <w:r>
-        <w:t xml:space="preserve">De brede tekstselectie bevatte 351 bijlagen. De strengere selectie op formuleringen die feitelijke uitvoering aanduiden bevatte 206 bijlagen bij 190 bibliografische bronnen. Na beoordeling op uitvoering, locatie, jaar, dubbeling en brontype zijn veertien aanvullende Zotero-bronnen ingevoerd: de vogelrapporten over 1967, 1968, 1969, 1972, 1973, 1974 en 1975; de rietpotenproef uit 1987/1992; publicaties over begrazing uit 2008 en 2012;</w:t>
+        <w:t>De brede tekstselectie bevatte 351 bijlagen. De strengere selectie op formuleringen die feitelijke uitvoering aanduiden bevatte 206 bijlagen bij 190 bibliografische bronnen. Na beoordeling op uitvoering, locatie, jaar, dubbeling en brontype zijn vijftien aanvullende Zotero-bronnen ingevoerd: de vogelrapporten over 1967, 1968, 1969, 1972, 1973, 1974 en 1975; de rietpotenproef uit 1987/1992; publicaties over begrazing uit 2008 en 2012;</w:t>
       </w:r>
       <w:r>
         <w:t xml:space="preserve"> </w:t>
@@ -6313,7 +6313,7 @@
         <w:t xml:space="preserve"> </w:t>
       </w:r>
       <w:r>
-        <w:t xml:space="preserve">uit 2003; natuurherstel uit 2005; slib in infiltratieplassen uit 2005; en Plas 20.1 uit 2006. Samen met de zes al gebruikte Zotero-bronnen bevat</w:t>
+        <w:t>uit 2003; natuurherstel uit 2005; slib in infiltratieplassen uit 2005; Plas 20.1 uit 2006; en Holland’s Duinen 86 uit 2025 met de kaart van de dagvlinderroute Parnassiapad. Samen met de zes al gebruikte Zotero-bronnen bevat</w:t>
       </w:r>
       <w:r>
         <w:t xml:space="preserve"> </w:t>
@@ -6328,7 +6328,7 @@
         <w:t xml:space="preserve"> </w:t>
       </w:r>
       <w:r>
-        <w:t xml:space="preserve">nu twintig lokale Zotero-bronnen. Dubbele exemplaren, algemene gebiedsbeschrijvingen, uitsluitend voorgenomen werk en niet-lokaliseerbare vermeldingen zijn niet als afzonderlijke uitvoering ingevoerd.</w:t>
+        <w:t>nu 21 lokale Zotero-bronnen. Dubbele exemplaren, algemene gebiedsbeschrijvingen, uitsluitend voorgenomen werk en niet-lokaliseerbare vermeldingen zijn niet als afzonderlijke uitvoering ingevoerd.</w:t>
       </w:r>
     </w:p>
     <w:p>
@@ -6366,7 +6366,7 @@
         <w:t xml:space="preserve"> </w:t>
       </w:r>
       <w:r>
-        <w:t xml:space="preserve">De levende lokale database bevat 18 projecten, 27 bronnen, 61 uitvoeringen, 92 expliciete jaarbeoordelingen uit 1967–2025 en 79 bronkoppelingen. Van de jaarbeoordelingen zijn er 76</w:t>
+        <w:t>De levende lokale database bevat 18 projecten, 28 bronnen, 61 uitvoeringen, 92 expliciete jaarbeoordelingen uit 1967–2025 en 80 bronkoppelingen. Van de jaarbeoordelingen zijn er 76</w:t>
       </w:r>
       <w:r>
         <w:t xml:space="preserve"> </w:t>
@@ -6487,7 +6487,7 @@
         <w:t xml:space="preserve"> </w:t>
       </w:r>
       <w:r>
-        <w:t xml:space="preserve">bevat 85 geverifieerde directe relaties. Daarvan waren 36 al onderbouwd met expliciete kavelvermeldingen, gebruikersvaststellingen of een bijzondere gebiedsnaam. De nameninventaris voegt 32 geometrische doorsnijdingen toe voor zes volledig en letterlijk gelokaliseerde uitvoeringen met de naamobjecten Kijfhoek, Bierlap, Meeuwenhoek, Tafelberg, ’t Scheepje, Uilenbosch en Oude Rijs uit</w:t>
+        <w:t>bevat 86 geverifieerde directe relaties. Daarvan waren 36 al onderbouwd met expliciete kavelvermeldingen, gebruikersvaststellingen of een bijzondere gebiedsnaam. De nameninventaris voegt 32 geometrische doorsnijdingen toe voor zes volledig en letterlijk gelokaliseerde uitvoeringen met de naamobjecten Kijfhoek, Bierlap, Meeuwenhoek, Tafelberg, ’t Scheepje, Uilenbosch en Oude Rijs uit</w:t>
       </w:r>
       <w:r>
         <w:t xml:space="preserve"> </w:t>
@@ -6629,7 +6629,24 @@
         <w:pStyle w:val="BodyText"/>
       </w:pPr>
       <w:r>
-        <w:t xml:space="preserve">De 85 plotkoppelingen en 75 uitgevoerde jaarregels leveren samen 108 regels in</w:t>
+        <w:t xml:space="preserve">Ton heeft op 14 oktober 2026 Parnassiapad 2 gekoppeld aan M15. De primaire publicatie uit 2003 beschrijft twee permanente meetblokken binnen een circa twintig meter breed transect en noemt in 2001 een plagleeftijd van acht jaar; het uitvoeringsjaar is daarom als circa 1993 vastgelegd. </w:t>
+      </w:r>
+      <w:r>
+        <w:rPr>
+          <w:i/>
+        </w:rPr>
+        <w:t>Holland’s Duinen</w:t>
+      </w:r>
+      <w:r>
+        <w:t xml:space="preserve"> 86 van mei 2025 toont op pagina 49, figuur 1, de route Parnassiapad aan de noordzijde van de Helmduinen en is als aanvullende ruimtelijke context geregistreerd. De precieze plaggrens binnen M15 is niet bekend; doorsnijding_pct blijft leeg.</w:t>
+      </w:r>
+    </w:p>
+    <w:p>
+      <w:pPr>
+        <w:pStyle w:val="BodyText"/>
+      </w:pPr>
+      <w:r>
+        <w:t>De 86 plotkoppelingen en 75 uitgevoerde jaarregels leveren samen 109 regels in</w:t>
       </w:r>
       <w:r>
         <w:t xml:space="preserve"> </w:t>
@@ -6641,7 +6658,7 @@
         <w:t xml:space="preserve">v_plot_jaar_maatregel_bronvast</w:t>
       </w:r>
       <w:r>
-        <w:t xml:space="preserve">. De nameninventaris voegt 36 plot-jaarrijen toe: begrazing in Kijfhoek en Bierlap in 1990, hervat maaibeheer bij Tafelberg en ’t Scheepje in 2025, uitgevoerd maaibeheer in Uilenbosch in 2017–2021 en vogelkersbestrijding in Kijfhoek, Bierlap en Meeuwenhoek in 2020. De aanvullende systeemkoppelingen voegen 22 plot-jaarrijen toe: vier voor de oeveraanpassing van Pan 13 in 1988–1989 en achttien voor drie uitvoeringen in Plas 20 in 2005–2006. De Helmduinen-koppeling voegt zes plot-jaarrijen voor 1991 toe. De koppelingen voor de uitbreiding van het begrazingsgebied met Meeuwenhoek en het maaibeheer in Oude Rijs leveren geen uitgevoerde plot-jaarrij, omdat respectievelijk een uitvoeringsjaar ontbreekt en 2025 als</w:t>
+        <w:t>. De nameninventaris voegt 36 plot-jaarrijen toe: begrazing in Kijfhoek en Bierlap in 1990, hervat maaibeheer bij Tafelberg en ’t Scheepje in 2025, uitgevoerd maaibeheer in Uilenbosch in 2017–2021 en vogelkersbestrijding in Kijfhoek, Bierlap en Meeuwenhoek in 2020. De aanvullende systeemkoppelingen voegen 22 plot-jaarrijen toe: vier voor de oeveraanpassing van Pan 13 in 1988–1989 en achttien voor drie uitvoeringen in Plas 20 in 2005–2006. De Helmduinen-koppeling voegt zes plot-jaarrijen voor 1991 toe; Parnassiapad 2 voegt één plot-jaarrij voor M15 in 1993 toe. De koppelingen voor de uitbreiding van het begrazingsgebied met Meeuwenhoek en het maaibeheer in Oude Rijs leveren geen uitgevoerde plot-jaarrij, omdat respectievelijk een uitvoeringsjaar ontbreekt en 2025 als</w:t>
       </w:r>
       <w:r>
         <w:t xml:space="preserve"> </w:t>
@@ -6737,7 +6754,7 @@
         <w:t xml:space="preserve"> </w:t>
       </w:r>
       <w:r>
-        <w:t xml:space="preserve">Bronvast op project-, uitvoering- en jaarniveau voor de 27 ingevoerde bronnen en 61 uitvoeringen. De algemene kavel- en gebiedsindeling is geometrisch beschikbaar voor de 55 actuele plots uit 2025; vijf expliciet gekoppelde historische kavels hebben geen afzonderlijke geometrie. De bronvaste plot-jaarlaag bevat 108 regels voor 1967–1969, 1972–1975, 1988–1991, 2005–2006, 2017–2021 en 2025. Zes uitvoeringen zijn via de nameninventaris aan 32 kavelsituaties gekoppeld; Pan 13 en Plas 20 voegen elf aanvullende relaties toe en Helmduinen zes. Nog 30 uitvoeringen hebben geen directe plotkoppeling.</w:t>
+        <w:t>Bronvast op project-, uitvoering- en jaarniveau voor de 28 ingevoerde bronnen en 61 uitvoeringen. De algemene kavel- en gebiedsindeling is geometrisch beschikbaar voor de 55 actuele plots uit 2025; vijf expliciet gekoppelde historische kavels hebben geen afzonderlijke geometrie. De bronvaste plot-jaarlaag bevat 109 regels voor 1967–1969, 1972–1975, 1988–1991, 1993, 2005–2006, 2017–2021 en 2025. Zes uitvoeringen zijn via de nameninventaris aan 32 kavelsituaties gekoppeld; Pan 13 en Plas 20 voegen elf aanvullende relaties toe, Helmduinen zes en Parnassiapad 2 één. Nog 29 uitvoeringen hebben geen directe plotkoppeling.</w:t>
       </w:r>
     </w:p>
     <w:p>

</xml_diff>

<commit_message>
Scheid begrazing Helmduinen en Kikkervalleien
</commit_message>
<xml_diff>
--- a/docs/MEIJENDEL_BRONREGISTER.docx
+++ b/docs/MEIJENDEL_BRONREGISTER.docx
@@ -6499,7 +6499,29 @@
         <w:t xml:space="preserve">meijendel_nameninventaris_2026-10-14</w:t>
       </w:r>
       <w:r>
-        <w:t xml:space="preserve">. Daarnaast zijn elf relaties toegevoegd voor de al vastgestelde volledige systemen Pan 13 en Plas 20. De begrazing van de Helmduinen vanaf eind 1991 is op 14 oktober 2026 door Ton gekoppeld aan M13, M13s, M14, M15, M16 en M17a. M16 omvat het grootste deel; M15 en M17a zijn gedeeltelijk betrokken; voor M13, M13s en M14 zijn aanvullende consequenties vastgesteld. Omdat de bron geen oppervlakte per kavel geeft, blijft</w:t>
+        <w:t>. Daarnaast zijn elf relaties toegevoegd voor de al vastgestelde volledige systemen Pan 13 en Plas 20. De begrazing van de Helmduinen vanaf eind 1991 is op 14 oktober 2026 door Ton gekoppeld aan M15, M16 en M17a. M16 omvat het grootste deel; M15 en M17a zijn gedeeltelijk betrokken. De begrazing loopt volgens deze gebruikersvaststelling tot heden door. Omdat de bron geen oppervlakte per kavel geeft, blijft doorsnijding_pct voor alle drie leeg.</w:t>
+      </w:r>
+      <w:r/>
+      <w:r>
+        <w:rPr>
+          <w:rStyle w:val="VerbatimChar"/>
+        </w:rPr>
+      </w:r>
+      <w:r/>
+      <w:r>
+        <w:t xml:space="preserve"> De geometrische naamkoppelingen gebruiken de actuele SOVON-plotgeometrie</w:t>
+      </w:r>
+      <w:r>
+        <w:t xml:space="preserve"> </w:t>
+      </w:r>
+      <w:r>
+        <w:rPr>
+          <w:rStyle w:val="VerbatimChar"/>
+        </w:rPr>
+        <w:t xml:space="preserve">sovon-avimap-2025-download-2026-10-02</w:t>
+      </w:r>
+      <w:r>
+        <w:t xml:space="preserve">. Een doorsnijding bewijst dat het genoemde naamgebied de plot raakt, niet welk percentage van de plot feitelijk is bewerkt;</w:t>
       </w:r>
       <w:r>
         <w:t xml:space="preserve"> </w:t>
@@ -6514,34 +6536,24 @@
         <w:t xml:space="preserve"> </w:t>
       </w:r>
       <w:r>
-        <w:t xml:space="preserve">voor alle zes leeg. De geometrische naamkoppelingen gebruiken de actuele SOVON-plotgeometrie</w:t>
-      </w:r>
-      <w:r>
-        <w:t xml:space="preserve"> </w:t>
-      </w:r>
-      <w:r>
-        <w:rPr>
-          <w:rStyle w:val="VerbatimChar"/>
-        </w:rPr>
-        <w:t xml:space="preserve">sovon-avimap-2025-download-2026-10-02</w:t>
-      </w:r>
-      <w:r>
-        <w:t xml:space="preserve">. Een doorsnijding bewijst dat het genoemde naamgebied de plot raakt, niet welk percentage van de plot feitelijk is bewerkt;</w:t>
-      </w:r>
-      <w:r>
-        <w:t xml:space="preserve"> </w:t>
-      </w:r>
-      <w:r>
-        <w:rPr>
-          <w:rStyle w:val="VerbatimChar"/>
-        </w:rPr>
-        <w:t xml:space="preserve">doorsnijding_pct</w:t>
-      </w:r>
-      <w:r>
-        <w:t xml:space="preserve"> </w:t>
-      </w:r>
-      <w:r>
         <w:t xml:space="preserve">blijft daarom leeg.</w:t>
+      </w:r>
+    </w:p>
+    <w:p>
+      <w:pPr>
+        <w:pStyle w:val="BodyText"/>
+      </w:pPr>
+      <w:r>
+        <w:t xml:space="preserve">De uitbreiding van het begrazingsgebied met de Kikkervalleien is gekoppeld aan M13, M13s en M14. </w:t>
+      </w:r>
+      <w:r>
+        <w:rPr>
+          <w:i/>
+        </w:rPr>
+        <w:t>Holland's Duinen</w:t>
+      </w:r>
+      <w:r>
+        <w:t xml:space="preserve"> 55 van april 2010 beschrijft op pagina 5 dat direct na de herinrichting in het najaar van 1997 circa 50 hectare Kikkervalleien is toegevoegd aan het sinds 1991 begraasde Helmduinengebied van circa 125 hectare. Pagina 22 benoemt M13, M13s en M14 expliciet als de kavels waarin de Kikkervalleien liggen; samen beslaan de Kikkervalleien ongeveer een derde van deze drie kavels. Ton bevestigde op 14 oktober 2026 zowel deze toedeling als de voortzetting van de begrazing tot heden. De oppervlakte per afzonderlijke kavel is niet gegeven; doorsnijding_pct blijft daarom leeg.</w:t>
       </w:r>
     </w:p>
     <w:p>
@@ -6658,7 +6670,7 @@
         <w:t xml:space="preserve">v_plot_jaar_maatregel_bronvast</w:t>
       </w:r>
       <w:r>
-        <w:t>. De nameninventaris voegt 36 plot-jaarrijen toe: begrazing in Kijfhoek en Bierlap in 1990, hervat maaibeheer bij Tafelberg en ’t Scheepje in 2025, uitgevoerd maaibeheer in Uilenbosch in 2017–2021 en vogelkersbestrijding in Kijfhoek, Bierlap en Meeuwenhoek in 2020. De aanvullende systeemkoppelingen voegen 22 plot-jaarrijen toe: vier voor de oeveraanpassing van Pan 13 in 1988–1989 en achttien voor drie uitvoeringen in Plas 20 in 2005–2006. De Helmduinen-koppeling voegt zes plot-jaarrijen voor 1991 toe; Parnassiapad 2 voegt één plot-jaarrij voor M15 in 1993 toe. De koppelingen voor de uitbreiding van het begrazingsgebied met Meeuwenhoek en het maaibeheer in Oude Rijs leveren geen uitgevoerde plot-jaarrij, omdat respectievelijk een uitvoeringsjaar ontbreekt en 2025 als</w:t>
+        <w:t>. De nameninventaris voegt 36 plot-jaarrijen toe: begrazing in Kijfhoek en Bierlap in 1990, hervat maaibeheer bij Tafelberg en ’t Scheepje in 2025, uitgevoerd maaibeheer in Uilenbosch in 2017–2021 en vogelkersbestrijding in Kijfhoek, Bierlap en Meeuwenhoek in 2020. De aanvullende systeemkoppelingen voegen 22 plot-jaarrijen toe: vier voor de oeveraanpassing van Pan 13 in 1988–1989 en achttien voor drie uitvoeringen in Plas 20 in 2005–2006. De Helmduinen-koppeling voegt drie plot-jaarrijen voor 1991 toe en de uitbreiding met de Kikkervalleien drie plot-jaarrijen voor 1997; Parnassiapad 2 voegt één plot-jaarrij voor M15 in 1993 toe. Voor beide doorlopende begrazingsmaatregelen bewaart deze view alleen het expliciet onderbouwde startjaar; de open einddatum en cycliciteit='doorlopend tot heden' leggen de voortzetting tot en met 2026 vast zonder tussenliggende jaren als afzonderlijke bronbeweringen te construeren. De koppelingen voor de uitbreiding van het begrazingsgebied met Meeuwenhoek en het maaibeheer in Oude Rijs leveren geen uitgevoerde plot-jaarrij, omdat respectievelijk een uitvoeringsjaar ontbreekt en 2025 als</w:t>
       </w:r>
       <w:r>
         <w:t xml:space="preserve"> </w:t>
@@ -6754,7 +6766,7 @@
         <w:t xml:space="preserve"> </w:t>
       </w:r>
       <w:r>
-        <w:t>Bronvast op project-, uitvoering- en jaarniveau voor de 28 ingevoerde bronnen en 61 uitvoeringen. De algemene kavel- en gebiedsindeling is geometrisch beschikbaar voor de 55 actuele plots uit 2025; vijf expliciet gekoppelde historische kavels hebben geen afzonderlijke geometrie. De bronvaste plot-jaarlaag bevat 109 regels voor 1967–1969, 1972–1975, 1988–1991, 1993, 2005–2006, 2017–2021 en 2025. Zes uitvoeringen zijn via de nameninventaris aan 32 kavelsituaties gekoppeld; Pan 13 en Plas 20 voegen elf aanvullende relaties toe, Helmduinen zes en Parnassiapad 2 één. Nog 29 uitvoeringen hebben geen directe plotkoppeling.</w:t>
+        <w:t>Bronvast op project-, uitvoering- en jaarniveau voor de 28 ingevoerde bronnen en 61 uitvoeringen. De algemene kavel- en gebiedsindeling is geometrisch beschikbaar voor de 55 actuele plots uit 2025; vijf expliciet gekoppelde historische kavels hebben geen afzonderlijke geometrie. De bronvaste plot-jaarlaag bevat 109 regels voor 1967–1969, 1972–1975, 1988–1991, 1993, 1997, 2005–2006, 2017–2021 en 2025. Zes uitvoeringen zijn via de nameninventaris aan 32 kavelsituaties gekoppeld; Pan 13 en Plas 20 voegen elf aanvullende relaties toe, Helmduinen drie, Kikkervalleien drie en Parnassiapad 2 één. Nog 28 uitvoeringen hebben geen directe plotkoppeling.</w:t>
       </w:r>
     </w:p>
     <w:p>

</xml_diff>

<commit_message>
Koppel bodemherstel Kikkervalleien aan kavels
</commit_message>
<xml_diff>
--- a/docs/MEIJENDEL_BRONREGISTER.docx
+++ b/docs/MEIJENDEL_BRONREGISTER.docx
@@ -6481,14 +6481,10 @@
         <w:rPr>
           <w:rStyle w:val="VerbatimChar"/>
         </w:rPr>
-        <w:t xml:space="preserve">maatregel_plot_koppeling</w:t>
-      </w:r>
-      <w:r>
-        <w:t xml:space="preserve"> </w:t>
-      </w:r>
-      <w:r>
-        <w:t>bevat 86 geverifieerde directe relaties. Daarvan waren 36 al onderbouwd met expliciete kavelvermeldingen, gebruikersvaststellingen of een bijzondere gebiedsnaam. De nameninventaris voegt 32 geometrische doorsnijdingen toe voor zes volledig en letterlijk gelokaliseerde uitvoeringen met de naamobjecten Kijfhoek, Bierlap, Meeuwenhoek, Tafelberg, ’t Scheepje, Uilenbosch en Oude Rijs uit</w:t>
-      </w:r>
+        <w:t>maatregel_plot_koppeling bevat 89 geverifieerde directe relaties. Daarvan waren 36 al onderbouwd met expliciete kavelvermeldingen, gebruikersvaststellingen of een bijzondere gebiedsnaam. De nameninventaris voegt 32 geometrische doorsnijdingen toe voor zes volledig en letterlijk gelokaliseerde uitvoeringen met de naamobjecten Kijfhoek, Bierlap, Meeuwenhoek, Tafelberg, ’t Scheepje, Uilenbosch en Oude Rijs uit</w:t>
+      </w:r>
+      <w:r/>
+      <w:r/>
       <w:r>
         <w:t xml:space="preserve"> </w:t>
       </w:r>
@@ -6554,6 +6550,17 @@
       </w:r>
       <w:r>
         <w:t xml:space="preserve"> 55 van april 2010 beschrijft op pagina 5 dat direct na de herinrichting in het najaar van 1997 circa 50 hectare Kikkervalleien is toegevoegd aan het sinds 1991 begraasde Helmduinengebied van circa 125 hectare. Pagina 22 benoemt M13, M13s en M14 expliciet als de kavels waarin de Kikkervalleien liggen; samen beslaan de Kikkervalleien ongeveer een derde van deze drie kavels. Ton bevestigde op 14 oktober 2026 zowel deze toedeling als de voortzetting van de begrazing tot heden. De oppervlakte per afzonderlijke kavel is niet gegeven; doorsnijding_pct blijft daarom leeg.</w:t>
+      </w:r>
+    </w:p>
+    <w:p>
+      <w:pPr>
+        <w:pStyle w:val="BodyText"/>
+      </w:pPr>
+      <w:pPr>
+        <w:pStyle w:val="BodyText"/>
+      </w:pPr>
+      <w:r>
+        <w:t>De verwijdering van vegetatie en voedselrijke bovengrond in de Kikkervalleien in het najaar van 1997 is eveneens gekoppeld aan M13, M13s en M14. Holland's Duinen 55 beschrijft op pagina 5 de ingreep in en rond Pan 26.1; pagina 22 noemt de drie kavels en toont het bewerkte gebied met een zwarte begrenzing. Het totale werkgebied bedroeg circa 50 hectare. De bron verdeelt die oppervlakte niet over de kavels; doorsnijding_pct blijft daarom leeg. Deze maatregel is een eenmalige herinrichting in 1997, anders dan de daarna doorlopende begrazing.</w:t>
       </w:r>
     </w:p>
     <w:p>
@@ -6658,7 +6665,7 @@
         <w:pStyle w:val="BodyText"/>
       </w:pPr>
       <w:r>
-        <w:t>De 86 plotkoppelingen en 75 uitgevoerde jaarregels leveren samen 109 regels in</w:t>
+        <w:t>De 89 plotkoppelingen en 75 uitgevoerde jaarregels leveren samen 112 regels in</w:t>
       </w:r>
       <w:r>
         <w:t xml:space="preserve"> </w:t>
@@ -6670,7 +6677,7 @@
         <w:t xml:space="preserve">v_plot_jaar_maatregel_bronvast</w:t>
       </w:r>
       <w:r>
-        <w:t>. De nameninventaris voegt 36 plot-jaarrijen toe: begrazing in Kijfhoek en Bierlap in 1990, hervat maaibeheer bij Tafelberg en ’t Scheepje in 2025, uitgevoerd maaibeheer in Uilenbosch in 2017–2021 en vogelkersbestrijding in Kijfhoek, Bierlap en Meeuwenhoek in 2020. De aanvullende systeemkoppelingen voegen 22 plot-jaarrijen toe: vier voor de oeveraanpassing van Pan 13 in 1988–1989 en achttien voor drie uitvoeringen in Plas 20 in 2005–2006. De Helmduinen-koppeling voegt drie plot-jaarrijen voor 1991 toe en de uitbreiding met de Kikkervalleien drie plot-jaarrijen voor 1997; Parnassiapad 2 voegt één plot-jaarrij voor M15 in 1993 toe. Voor beide doorlopende begrazingsmaatregelen bewaart deze view alleen het expliciet onderbouwde startjaar; de open einddatum en cycliciteit='doorlopend tot heden' leggen de voortzetting tot en met 2026 vast zonder tussenliggende jaren als afzonderlijke bronbeweringen te construeren. De koppelingen voor de uitbreiding van het begrazingsgebied met Meeuwenhoek en het maaibeheer in Oude Rijs leveren geen uitgevoerde plot-jaarrij, omdat respectievelijk een uitvoeringsjaar ontbreekt en 2025 als</w:t>
+        <w:t>. De nameninventaris voegt 36 plot-jaarrijen toe: begrazing in Kijfhoek en Bierlap in 1990, hervat maaibeheer bij Tafelberg en ’t Scheepje in 2025, uitgevoerd maaibeheer in Uilenbosch in 2017–2021 en vogelkersbestrijding in Kijfhoek, Bierlap en Meeuwenhoek in 2020. De aanvullende systeemkoppelingen voegen 22 plot-jaarrijen toe: vier voor de oeveraanpassing van Pan 13 in 1988–1989 en achttien voor drie uitvoeringen in Plas 20 in 2005–2006. De Helmduinen-koppeling voegt drie plot-jaarrijen voor 1991 toe. De uitbreiding van de begrazing met de Kikkervalleien en de eenmalige verwijdering van vegetatie en voedselrijke bovengrond voegen ieder drie plot-jaarrijen voor 1997 toe; Parnassiapad 2 voegt één plot-jaarrij voor M15 in 1993 toe. Voor beide doorlopende begrazingsmaatregelen bewaart deze view alleen het expliciet onderbouwde startjaar; de open einddatum en cycliciteit='doorlopend tot heden' leggen de voortzetting tot en met 2026 vast zonder tussenliggende jaren als afzonderlijke bronbeweringen te construeren. De koppelingen voor de uitbreiding van het begrazingsgebied met Meeuwenhoek en het maaibeheer in Oude Rijs leveren geen uitgevoerde plot-jaarrij, omdat respectievelijk een uitvoeringsjaar ontbreekt en 2025 als</w:t>
       </w:r>
       <w:r>
         <w:t xml:space="preserve"> </w:t>
@@ -6766,7 +6773,7 @@
         <w:t xml:space="preserve"> </w:t>
       </w:r>
       <w:r>
-        <w:t>Bronvast op project-, uitvoering- en jaarniveau voor de 28 ingevoerde bronnen en 61 uitvoeringen. De algemene kavel- en gebiedsindeling is geometrisch beschikbaar voor de 55 actuele plots uit 2025; vijf expliciet gekoppelde historische kavels hebben geen afzonderlijke geometrie. De bronvaste plot-jaarlaag bevat 109 regels voor 1967–1969, 1972–1975, 1988–1991, 1993, 1997, 2005–2006, 2017–2021 en 2025. Zes uitvoeringen zijn via de nameninventaris aan 32 kavelsituaties gekoppeld; Pan 13 en Plas 20 voegen elf aanvullende relaties toe, Helmduinen drie, Kikkervalleien drie en Parnassiapad 2 één. Nog 28 uitvoeringen hebben geen directe plotkoppeling.</w:t>
+        <w:t>Bronvast op project-, uitvoering- en jaarniveau voor de 28 ingevoerde bronnen en 61 uitvoeringen. De algemene kavel- en gebiedsindeling is geometrisch beschikbaar voor de 55 actuele plots uit 2025; vijf expliciet gekoppelde historische kavels hebben geen afzonderlijke geometrie. De bronvaste plot-jaarlaag bevat 112 regels voor 1967–1969, 1972–1975, 1988–1991, 1993, 1997, 2005–2006, 2017–2021 en 2025. Zes uitvoeringen zijn via de nameninventaris aan 32 kavelsituaties gekoppeld; Pan 13 en Plas 20 voegen elf aanvullende relaties toe, Helmduinen drie, de Kikkervalleienbegrazing drie, het Kikkervalleien-bodemherstel drie en Parnassiapad 2 één. Nog 27 uitvoeringen hebben geen directe plotkoppeling.</w:t>
       </w:r>
     </w:p>
     <w:p>

</xml_diff>

<commit_message>
Koppel Kikkervalleien-infrastructuur aan kavels
</commit_message>
<xml_diff>
--- a/docs/MEIJENDEL_BRONREGISTER.docx
+++ b/docs/MEIJENDEL_BRONREGISTER.docx
@@ -6297,7 +6297,7 @@
         <w:pStyle w:val="BodyText"/>
       </w:pPr>
       <w:r>
-        <w:t>De brede tekstselectie bevatte 351 bijlagen. De strengere selectie op formuleringen die feitelijke uitvoering aanduiden bevatte 206 bijlagen bij 190 bibliografische bronnen. Na beoordeling op uitvoering, locatie, jaar, dubbeling en brontype zijn vijftien aanvullende Zotero-bronnen ingevoerd: de vogelrapporten over 1967, 1968, 1969, 1972, 1973, 1974 en 1975; de rietpotenproef uit 1987/1992; publicaties over begrazing uit 2008 en 2012;</w:t>
+        <w:t xml:space="preserve">De brede tekstselectie bevatte 351 bijlagen. De strengere selectie op formuleringen die feitelijke uitvoering aanduiden bevatte 206 bijlagen bij 190 bibliografische bronnen. Na beoordeling op uitvoering, locatie, jaar, dubbeling en brontype zijn zestien aanvullende Zotero-bronnen ingevoerd: de vogelrapporten over 1967, 1968, 1969, 1972, 1973, 1974 en 1975; de rietpotenproef uit 1987/1992; publicaties over begrazing uit 2008 en 2012;</w:t>
       </w:r>
       <w:r>
         <w:t xml:space="preserve"> </w:t>
@@ -6313,7 +6313,39 @@
         <w:t xml:space="preserve"> </w:t>
       </w:r>
       <w:r>
-        <w:t>uit 2003; natuurherstel uit 2005; slib in infiltratieplassen uit 2005; Plas 20.1 uit 2006; en Holland’s Duinen 86 uit 2025 met de kaart van de dagvlinderroute Parnassiapad. Samen met de zes al gebruikte Zotero-bronnen bevat</w:t>
+        <w:t xml:space="preserve">uit 2003; natuurherstel uit 2005; slib in infiltratieplassen uit 2005; Plas 20.1 uit 2006;</w:t>
+      </w:r>
+      <w:r>
+        <w:t xml:space="preserve"> </w:t>
+      </w:r>
+      <w:r>
+        <w:rPr>
+          <w:i/>
+          <w:iCs/>
+        </w:rPr>
+        <w:t xml:space="preserve">Holland’s Duinen</w:t>
+      </w:r>
+      <w:r>
+        <w:t xml:space="preserve"> </w:t>
+      </w:r>
+      <w:r>
+        <w:t xml:space="preserve">86 uit 2025 met de kaart van de dagvlinderroute Parnassiapad; en</w:t>
+      </w:r>
+      <w:r>
+        <w:t xml:space="preserve"> </w:t>
+      </w:r>
+      <w:r>
+        <w:rPr>
+          <w:i/>
+          <w:iCs/>
+        </w:rPr>
+        <w:t xml:space="preserve">Meijendel Mededelingen</w:t>
+      </w:r>
+      <w:r>
+        <w:t xml:space="preserve"> </w:t>
+      </w:r>
+      <w:r>
+        <w:t xml:space="preserve">30 uit november 1996 met de expliciete plaatsing van Sprang PI in M13s en van het betrokken rietgebied in M13s en M14. Samen met de zes al gebruikte Zotero-bronnen bevat</w:t>
       </w:r>
       <w:r>
         <w:t xml:space="preserve"> </w:t>
@@ -6328,7 +6360,7 @@
         <w:t xml:space="preserve"> </w:t>
       </w:r>
       <w:r>
-        <w:t>nu 21 lokale Zotero-bronnen. Dubbele exemplaren, algemene gebiedsbeschrijvingen, uitsluitend voorgenomen werk en niet-lokaliseerbare vermeldingen zijn niet als afzonderlijke uitvoering ingevoerd.</w:t>
+        <w:t xml:space="preserve">nu 22 lokale Zotero-bronnen. Dubbele exemplaren, algemene gebiedsbeschrijvingen, uitsluitend voorgenomen werk en niet-lokaliseerbare vermeldingen zijn niet als afzonderlijke uitvoering ingevoerd.</w:t>
       </w:r>
     </w:p>
     <w:p>
@@ -6366,7 +6398,7 @@
         <w:t xml:space="preserve"> </w:t>
       </w:r>
       <w:r>
-        <w:t>De levende lokale database bevat 18 projecten, 28 bronnen, 61 uitvoeringen, 92 expliciete jaarbeoordelingen uit 1967–2025 en 80 bronkoppelingen. Van de jaarbeoordelingen zijn er 76</w:t>
+        <w:t xml:space="preserve">De levende lokale database bevat 18 projecten, 29 bronnen, 61 uitvoeringen, 92 expliciete jaarbeoordelingen uit 1967–2025 en 81 bronkoppelingen. Van de jaarbeoordelingen zijn er 76</w:t>
       </w:r>
       <w:r>
         <w:t xml:space="preserve"> </w:t>
@@ -6481,10 +6513,14 @@
         <w:rPr>
           <w:rStyle w:val="VerbatimChar"/>
         </w:rPr>
-        <w:t>maatregel_plot_koppeling bevat 89 geverifieerde directe relaties. Daarvan waren 36 al onderbouwd met expliciete kavelvermeldingen, gebruikersvaststellingen of een bijzondere gebiedsnaam. De nameninventaris voegt 32 geometrische doorsnijdingen toe voor zes volledig en letterlijk gelokaliseerde uitvoeringen met de naamobjecten Kijfhoek, Bierlap, Meeuwenhoek, Tafelberg, ’t Scheepje, Uilenbosch en Oude Rijs uit</w:t>
-      </w:r>
-      <w:r/>
-      <w:r/>
+        <w:t xml:space="preserve">maatregel_plot_koppeling</w:t>
+      </w:r>
+      <w:r>
+        <w:t xml:space="preserve"> </w:t>
+      </w:r>
+      <w:r>
+        <w:t xml:space="preserve">bevat 92 geverifieerde directe relaties. Daarvan waren 36 al onderbouwd met expliciete kavelvermeldingen, gebruikersvaststellingen of een bijzondere gebiedsnaam. De nameninventaris voegt 32 geometrische doorsnijdingen toe voor zes volledig en letterlijk gelokaliseerde uitvoeringen met de naamobjecten Kijfhoek, Bierlap, Meeuwenhoek, Tafelberg, ’t Scheepje, Uilenbosch en Oude Rijs uit</w:t>
+      </w:r>
       <w:r>
         <w:t xml:space="preserve"> </w:t>
       </w:r>
@@ -6495,17 +6531,22 @@
         <w:t xml:space="preserve">meijendel_nameninventaris_2026-10-14</w:t>
       </w:r>
       <w:r>
-        <w:t>. Daarnaast zijn elf relaties toegevoegd voor de al vastgestelde volledige systemen Pan 13 en Plas 20. De begrazing van de Helmduinen vanaf eind 1991 is op 14 oktober 2026 door Ton gekoppeld aan M15, M16 en M17a. M16 omvat het grootste deel; M15 en M17a zijn gedeeltelijk betrokken. De begrazing loopt volgens deze gebruikersvaststelling tot heden door. Omdat de bron geen oppervlakte per kavel geeft, blijft doorsnijding_pct voor alle drie leeg.</w:t>
-      </w:r>
-      <w:r/>
-      <w:r>
-        <w:rPr>
-          <w:rStyle w:val="VerbatimChar"/>
-        </w:rPr>
-      </w:r>
-      <w:r/>
-      <w:r>
-        <w:t xml:space="preserve"> De geometrische naamkoppelingen gebruiken de actuele SOVON-plotgeometrie</w:t>
+        <w:t xml:space="preserve">. Daarnaast zijn elf relaties toegevoegd voor de al vastgestelde volledige systemen Pan 13 en Plas 20. De begrazing van de Helmduinen vanaf eind 1991 is op 14 oktober 2026 door Ton gekoppeld aan M15, M16 en M17a. M16 omvat het grootste deel; M15 en M17a zijn gedeeltelijk betrokken. De begrazing loopt volgens deze gebruikersvaststelling tot heden door. Omdat de bron geen oppervlakte per kavel geeft, blijft</w:t>
+      </w:r>
+      <w:r>
+        <w:t xml:space="preserve"> </w:t>
+      </w:r>
+      <w:r>
+        <w:rPr>
+          <w:rStyle w:val="VerbatimChar"/>
+        </w:rPr>
+        <w:t xml:space="preserve">doorsnijding_pct</w:t>
+      </w:r>
+      <w:r>
+        <w:t xml:space="preserve"> </w:t>
+      </w:r>
+      <w:r>
+        <w:t xml:space="preserve">voor alle drie leeg. De geometrische naamkoppelingen gebruiken de actuele SOVON-plotgeometrie</w:t>
       </w:r>
       <w:r>
         <w:t xml:space="preserve"> </w:t>
@@ -6540,35 +6581,7 @@
         <w:pStyle w:val="BodyText"/>
       </w:pPr>
       <w:r>
-        <w:t xml:space="preserve">De uitbreiding van het begrazingsgebied met de Kikkervalleien is gekoppeld aan M13, M13s en M14. </w:t>
-      </w:r>
-      <w:r>
-        <w:rPr>
-          <w:i/>
-        </w:rPr>
-        <w:t>Holland's Duinen</w:t>
-      </w:r>
-      <w:r>
-        <w:t xml:space="preserve"> 55 van april 2010 beschrijft op pagina 5 dat direct na de herinrichting in het najaar van 1997 circa 50 hectare Kikkervalleien is toegevoegd aan het sinds 1991 begraasde Helmduinengebied van circa 125 hectare. Pagina 22 benoemt M13, M13s en M14 expliciet als de kavels waarin de Kikkervalleien liggen; samen beslaan de Kikkervalleien ongeveer een derde van deze drie kavels. Ton bevestigde op 14 oktober 2026 zowel deze toedeling als de voortzetting van de begrazing tot heden. De oppervlakte per afzonderlijke kavel is niet gegeven; doorsnijding_pct blijft daarom leeg.</w:t>
-      </w:r>
-    </w:p>
-    <w:p>
-      <w:pPr>
-        <w:pStyle w:val="BodyText"/>
-      </w:pPr>
-      <w:pPr>
-        <w:pStyle w:val="BodyText"/>
-      </w:pPr>
-      <w:r>
-        <w:t>De verwijdering van vegetatie en voedselrijke bovengrond in de Kikkervalleien in het najaar van 1997 is eveneens gekoppeld aan M13, M13s en M14. Holland's Duinen 55 beschrijft op pagina 5 de ingreep in en rond Pan 26.1; pagina 22 noemt de drie kavels en toont het bewerkte gebied met een zwarte begrenzing. Het totale werkgebied bedroeg circa 50 hectare. De bron verdeelt die oppervlakte niet over de kavels; doorsnijding_pct blijft daarom leeg. Deze maatregel is een eenmalige herinrichting in 1997, anders dan de daarna doorlopende begrazing.</w:t>
-      </w:r>
-    </w:p>
-    <w:p>
-      <w:pPr>
-        <w:pStyle w:val="BodyText"/>
-      </w:pPr>
-      <w:r>
-        <w:t xml:space="preserve">Ton heeft op 14 oktober 2026 Plas 20 als volledig plassensysteem gelokaliseerd: de zuidelijke plas ligt in M17b, de middelste in M17a en de noordelijke in M16. De publicatie</w:t>
+        <w:t xml:space="preserve">De uitbreiding van het begrazingsgebied met de Kikkervalleien is gekoppeld aan M13, M13s en M14.</w:t>
       </w:r>
       <w:r>
         <w:t xml:space="preserve"> </w:t>
@@ -6578,13 +6591,36 @@
           <w:i/>
           <w:iCs/>
         </w:rPr>
-        <w:t xml:space="preserve">Schone start voor infiltratieplas 20 in Meijendel</w:t>
-      </w:r>
-      <w:r>
-        <w:t xml:space="preserve"> </w:t>
-      </w:r>
-      <w:r>
-        <w:t xml:space="preserve">toont het langgerekte systeem en de noordelijke, middelste en zuidelijke delen in figuur 1 en 2. Zij staat in</w:t>
+        <w:t xml:space="preserve">Holland’s Duinen</w:t>
+      </w:r>
+      <w:r>
+        <w:t xml:space="preserve"> </w:t>
+      </w:r>
+      <w:r>
+        <w:t xml:space="preserve">55 van april 2010 beschrijft op pagina 5 dat direct na de herinrichting in het najaar van 1997 circa 50 hectare Kikkervalleien is toegevoegd aan het sinds 1991 begraasde Helmduinengebied van circa 125 hectare. Pagina 22 benoemt M13, M13s en M14 expliciet als de kavels waarin de Kikkervalleien liggen; samen beslaan de Kikkervalleien ongeveer een derde van deze drie kavels. Ton bevestigde op 14 oktober 2026 zowel deze toedeling als de voortzetting van de begrazing tot heden. De oppervlakte per afzonderlijke kavel is niet gegeven;</w:t>
+      </w:r>
+      <w:r>
+        <w:t xml:space="preserve"> </w:t>
+      </w:r>
+      <w:r>
+        <w:rPr>
+          <w:rStyle w:val="VerbatimChar"/>
+        </w:rPr>
+        <w:t xml:space="preserve">doorsnijding_pct</w:t>
+      </w:r>
+      <w:r>
+        <w:t xml:space="preserve"> </w:t>
+      </w:r>
+      <w:r>
+        <w:t xml:space="preserve">blijft daarom leeg.</w:t>
+      </w:r>
+    </w:p>
+    <w:p>
+      <w:pPr>
+        <w:pStyle w:val="BodyText"/>
+      </w:pPr>
+      <w:r>
+        <w:t xml:space="preserve">De verwijdering van vegetatie en voedselrijke bovengrond in de Kikkervalleien in het najaar van 1997 is eveneens gekoppeld aan M13, M13s en M14.</w:t>
       </w:r>
       <w:r>
         <w:t xml:space="preserve"> </w:t>
@@ -6600,15 +6636,30 @@
         <w:t xml:space="preserve"> </w:t>
       </w:r>
       <w:r>
-        <w:t xml:space="preserve">48 van maart 2006; het Zotero-jaar 1989 is onjuist en verwijst in de tekst naar de eerdere slibverwijdering in Plas 13. Deze combinatie van gebruikersvaststelling en ruimtelijke broncontext onderbouwt twaalf koppelingen: drie voor de reparatie in 1969 en telkens drie voor slibverwijdering, hydrologische aanpassing en infrastructuurwerk in 2005–2006. Pan 13 is op grond van de primaire bron en het broedvogelverslag over 2006 als volledig plassensysteem in M2 en M3 gekoppeld; zowel de slibverwijdering als de oeveraanpassing in 1988–1989 heeft daardoor twee directe kavelrelaties.</w:t>
-      </w:r>
-    </w:p>
-    <w:p>
-      <w:pPr>
-        <w:pStyle w:val="BodyText"/>
-      </w:pPr>
-      <w:r>
-        <w:t xml:space="preserve">Ton heeft op 14 oktober 2026 ook Libellenvallei gelokaliseerd in M17b. De publicatie</w:t>
+        <w:t xml:space="preserve">55 beschrijft op pagina 5 de ingreep in en rond Pan 26.1; pagina 22 noemt de drie kavels en toont het bewerkte gebied met een zwarte begrenzing. Het totale werkgebied bedroeg circa 50 hectare. De bron verdeelt die oppervlakte niet over de kavels;</w:t>
+      </w:r>
+      <w:r>
+        <w:t xml:space="preserve"> </w:t>
+      </w:r>
+      <w:r>
+        <w:rPr>
+          <w:rStyle w:val="VerbatimChar"/>
+        </w:rPr>
+        <w:t xml:space="preserve">doorsnijding_pct</w:t>
+      </w:r>
+      <w:r>
+        <w:t xml:space="preserve"> </w:t>
+      </w:r>
+      <w:r>
+        <w:t xml:space="preserve">blijft daarom leeg. Deze maatregel is een eenmalige herinrichting in 1997, anders dan de daarna doorlopende begrazing.</w:t>
+      </w:r>
+    </w:p>
+    <w:p>
+      <w:pPr>
+        <w:pStyle w:val="BodyText"/>
+      </w:pPr>
+      <w:r>
+        <w:t xml:space="preserve">Ook het verwijderen van de omgevende leidingen en putten van Sprang PI en I in 1997 is gekoppeld aan M13, M13s en M14.</w:t>
       </w:r>
       <w:r>
         <w:t xml:space="preserve"> </w:t>
@@ -6618,13 +6669,25 @@
           <w:i/>
           <w:iCs/>
         </w:rPr>
-        <w:t xml:space="preserve">Vegetatieontwikkeling in duinvalleien van Meijendel na opheffen van infiltratieplassen</w:t>
-      </w:r>
-      <w:r>
-        <w:t xml:space="preserve"> </w:t>
-      </w:r>
-      <w:r>
-        <w:t xml:space="preserve">in</w:t>
+        <w:t xml:space="preserve">Meijendel Mededelingen</w:t>
+      </w:r>
+      <w:r>
+        <w:t xml:space="preserve"> </w:t>
+      </w:r>
+      <w:r>
+        <w:t xml:space="preserve">30 van november 1996 koppelt Sprang PI op pagina 99 letterlijk aan M13s en plaatst het betrokken rietgebied in M13s en M14; deze twee relaties zijn daarom</w:t>
+      </w:r>
+      <w:r>
+        <w:t xml:space="preserve"> </w:t>
+      </w:r>
+      <w:r>
+        <w:rPr>
+          <w:rStyle w:val="VerbatimChar"/>
+        </w:rPr>
+        <w:t xml:space="preserve">expliciet_in_bron</w:t>
+      </w:r>
+      <w:r>
+        <w:t xml:space="preserve">. De bronkaarten plaatsen Sprang I aan de oostzijde van het werkgebied en</w:t>
       </w:r>
       <w:r>
         <w:t xml:space="preserve"> </w:t>
@@ -6640,6 +6703,113 @@
         <w:t xml:space="preserve"> </w:t>
       </w:r>
       <w:r>
+        <w:t xml:space="preserve">55 plaatst het geschoonde gebied praktisch geheel binnen de drie kavels. Ton bevestigde M13 op 14 oktober 2026; die relatie is daarom</w:t>
+      </w:r>
+      <w:r>
+        <w:t xml:space="preserve"> </w:t>
+      </w:r>
+      <w:r>
+        <w:rPr>
+          <w:rStyle w:val="VerbatimChar"/>
+        </w:rPr>
+        <w:t xml:space="preserve">benoemd_gebied_gevalideerd</w:t>
+      </w:r>
+      <w:r>
+        <w:t xml:space="preserve">. Een exacte geometrie van leidingen en putten ontbreekt voor alle drie kavels, zodat</w:t>
+      </w:r>
+      <w:r>
+        <w:t xml:space="preserve"> </w:t>
+      </w:r>
+      <w:r>
+        <w:rPr>
+          <w:rStyle w:val="VerbatimChar"/>
+        </w:rPr>
+        <w:t xml:space="preserve">doorsnijding_pct</w:t>
+      </w:r>
+      <w:r>
+        <w:t xml:space="preserve"> </w:t>
+      </w:r>
+      <w:r>
+        <w:t xml:space="preserve">leeg blijft. Dit was een eenmalige ingreep in 1997.</w:t>
+      </w:r>
+    </w:p>
+    <w:p>
+      <w:pPr>
+        <w:pStyle w:val="BodyText"/>
+      </w:pPr>
+      <w:r>
+        <w:t xml:space="preserve">Ton heeft op 14 oktober 2026 Plas 20 als volledig plassensysteem gelokaliseerd: de zuidelijke plas ligt in M17b, de middelste in M17a en de noordelijke in M16. De publicatie</w:t>
+      </w:r>
+      <w:r>
+        <w:t xml:space="preserve"> </w:t>
+      </w:r>
+      <w:r>
+        <w:rPr>
+          <w:i/>
+          <w:iCs/>
+        </w:rPr>
+        <w:t xml:space="preserve">Schone start voor infiltratieplas 20 in Meijendel</w:t>
+      </w:r>
+      <w:r>
+        <w:t xml:space="preserve"> </w:t>
+      </w:r>
+      <w:r>
+        <w:t xml:space="preserve">toont het langgerekte systeem en de noordelijke, middelste en zuidelijke delen in figuur 1 en 2. Zij staat in</w:t>
+      </w:r>
+      <w:r>
+        <w:t xml:space="preserve"> </w:t>
+      </w:r>
+      <w:r>
+        <w:rPr>
+          <w:i/>
+          <w:iCs/>
+        </w:rPr>
+        <w:t xml:space="preserve">Holland’s Duinen</w:t>
+      </w:r>
+      <w:r>
+        <w:t xml:space="preserve"> </w:t>
+      </w:r>
+      <w:r>
+        <w:t xml:space="preserve">48 van maart 2006; het Zotero-jaar 1989 is onjuist en verwijst in de tekst naar de eerdere slibverwijdering in Plas 13. Deze combinatie van gebruikersvaststelling en ruimtelijke broncontext onderbouwt twaalf koppelingen: drie voor de reparatie in 1969 en telkens drie voor slibverwijdering, hydrologische aanpassing en infrastructuurwerk in 2005–2006. Pan 13 is op grond van de primaire bron en het broedvogelverslag over 2006 als volledig plassensysteem in M2 en M3 gekoppeld; zowel de slibverwijdering als de oeveraanpassing in 1988–1989 heeft daardoor twee directe kavelrelaties.</w:t>
+      </w:r>
+    </w:p>
+    <w:p>
+      <w:pPr>
+        <w:pStyle w:val="BodyText"/>
+      </w:pPr>
+      <w:r>
+        <w:t xml:space="preserve">Ton heeft op 14 oktober 2026 ook Libellenvallei gelokaliseerd in M17b. De publicatie</w:t>
+      </w:r>
+      <w:r>
+        <w:t xml:space="preserve"> </w:t>
+      </w:r>
+      <w:r>
+        <w:rPr>
+          <w:i/>
+          <w:iCs/>
+        </w:rPr>
+        <w:t xml:space="preserve">Vegetatieontwikkeling in duinvalleien van Meijendel na opheffen van infiltratieplassen</w:t>
+      </w:r>
+      <w:r>
+        <w:t xml:space="preserve"> </w:t>
+      </w:r>
+      <w:r>
+        <w:t xml:space="preserve">in</w:t>
+      </w:r>
+      <w:r>
+        <w:t xml:space="preserve"> </w:t>
+      </w:r>
+      <w:r>
+        <w:rPr>
+          <w:i/>
+          <w:iCs/>
+        </w:rPr>
+        <w:t xml:space="preserve">Holland’s Duinen</w:t>
+      </w:r>
+      <w:r>
+        <w:t xml:space="preserve"> </w:t>
+      </w:r>
+      <w:r>
         <w:t xml:space="preserve">42 van april 2003 vermeldt dat de Libellenvallei sinds 1975 eenmaal per jaar in het najaar wordt gemaaid. Deze combinatie onderbouwt één koppeling voor het maaibeheer, met een uitgevoerde jaarregel voor 1975.</w:t>
       </w:r>
     </w:p>
@@ -6648,24 +6818,46 @@
         <w:pStyle w:val="BodyText"/>
       </w:pPr>
       <w:r>
-        <w:t xml:space="preserve">Ton heeft op 14 oktober 2026 Parnassiapad 2 gekoppeld aan M15. De primaire publicatie uit 2003 beschrijft twee permanente meetblokken binnen een circa twintig meter breed transect en noemt in 2001 een plagleeftijd van acht jaar; het uitvoeringsjaar is daarom als circa 1993 vastgelegd. </w:t>
+        <w:t xml:space="preserve">Ton heeft op 14 oktober 2026 Parnassiapad 2 gekoppeld aan M15. De primaire publicatie uit 2003 beschrijft twee permanente meetblokken binnen een circa twintig meter breed transect en noemt in 2001 een plagleeftijd van acht jaar; het uitvoeringsjaar is daarom als circa 1993 vastgelegd.</w:t>
+      </w:r>
+      <w:r>
+        <w:t xml:space="preserve"> </w:t>
       </w:r>
       <w:r>
         <w:rPr>
           <w:i/>
-        </w:rPr>
-        <w:t>Holland’s Duinen</w:t>
-      </w:r>
-      <w:r>
-        <w:t xml:space="preserve"> 86 van mei 2025 toont op pagina 49, figuur 1, de route Parnassiapad aan de noordzijde van de Helmduinen en is als aanvullende ruimtelijke context geregistreerd. De precieze plaggrens binnen M15 is niet bekend; doorsnijding_pct blijft leeg.</w:t>
-      </w:r>
-    </w:p>
-    <w:p>
-      <w:pPr>
-        <w:pStyle w:val="BodyText"/>
-      </w:pPr>
-      <w:r>
-        <w:t>De 89 plotkoppelingen en 75 uitgevoerde jaarregels leveren samen 112 regels in</w:t>
+          <w:iCs/>
+        </w:rPr>
+        <w:t xml:space="preserve">Holland’s Duinen</w:t>
+      </w:r>
+      <w:r>
+        <w:t xml:space="preserve"> </w:t>
+      </w:r>
+      <w:r>
+        <w:t xml:space="preserve">86 van mei 2025 toont op pagina 49, figuur 1, de route Parnassiapad aan de noordzijde van de Helmduinen en is als aanvullende ruimtelijke context geregistreerd. De precieze plaggrens binnen M15 is niet bekend;</w:t>
+      </w:r>
+      <w:r>
+        <w:t xml:space="preserve"> </w:t>
+      </w:r>
+      <w:r>
+        <w:rPr>
+          <w:rStyle w:val="VerbatimChar"/>
+        </w:rPr>
+        <w:t xml:space="preserve">doorsnijding_pct</w:t>
+      </w:r>
+      <w:r>
+        <w:t xml:space="preserve"> </w:t>
+      </w:r>
+      <w:r>
+        <w:t xml:space="preserve">blijft leeg.</w:t>
+      </w:r>
+    </w:p>
+    <w:p>
+      <w:pPr>
+        <w:pStyle w:val="BodyText"/>
+      </w:pPr>
+      <w:r>
+        <w:t xml:space="preserve">De 92 plotkoppelingen en 75 uitgevoerde jaarregels leveren samen 115 regels in</w:t>
       </w:r>
       <w:r>
         <w:t xml:space="preserve"> </w:t>
@@ -6677,7 +6869,22 @@
         <w:t xml:space="preserve">v_plot_jaar_maatregel_bronvast</w:t>
       </w:r>
       <w:r>
-        <w:t>. De nameninventaris voegt 36 plot-jaarrijen toe: begrazing in Kijfhoek en Bierlap in 1990, hervat maaibeheer bij Tafelberg en ’t Scheepje in 2025, uitgevoerd maaibeheer in Uilenbosch in 2017–2021 en vogelkersbestrijding in Kijfhoek, Bierlap en Meeuwenhoek in 2020. De aanvullende systeemkoppelingen voegen 22 plot-jaarrijen toe: vier voor de oeveraanpassing van Pan 13 in 1988–1989 en achttien voor drie uitvoeringen in Plas 20 in 2005–2006. De Helmduinen-koppeling voegt drie plot-jaarrijen voor 1991 toe. De uitbreiding van de begrazing met de Kikkervalleien en de eenmalige verwijdering van vegetatie en voedselrijke bovengrond voegen ieder drie plot-jaarrijen voor 1997 toe; Parnassiapad 2 voegt één plot-jaarrij voor M15 in 1993 toe. Voor beide doorlopende begrazingsmaatregelen bewaart deze view alleen het expliciet onderbouwde startjaar; de open einddatum en cycliciteit='doorlopend tot heden' leggen de voortzetting tot en met 2026 vast zonder tussenliggende jaren als afzonderlijke bronbeweringen te construeren. De koppelingen voor de uitbreiding van het begrazingsgebied met Meeuwenhoek en het maaibeheer in Oude Rijs leveren geen uitgevoerde plot-jaarrij, omdat respectievelijk een uitvoeringsjaar ontbreekt en 2025 als</w:t>
+        <w:t xml:space="preserve">. De nameninventaris voegt 36 plot-jaarrijen toe: begrazing in Kijfhoek en Bierlap in 1990, hervat maaibeheer bij Tafelberg en ’t Scheepje in 2025, uitgevoerd maaibeheer in Uilenbosch in 2017–2021 en vogelkersbestrijding in Kijfhoek, Bierlap en Meeuwenhoek in 2020. De aanvullende systeemkoppelingen voegen 22 plot-jaarrijen toe: vier voor de oeveraanpassing van Pan 13 in 1988–1989 en achttien voor drie uitvoeringen in Plas 20 in 2005–2006. De Helmduinen-koppeling voegt drie plot-jaarrijen voor 1991 toe. De uitbreiding van de begrazing met de Kikkervalleien, de eenmalige verwijdering van vegetatie en voedselrijke bovengrond en het verwijderen van leidingen en putten voegen ieder drie plot-jaarrijen voor 1997 toe; Parnassiapad 2 voegt één plot-jaarrij voor M15 in 1993 toe. Voor beide doorlopende begrazingsmaatregelen bewaart deze view alleen het expliciet onderbouwde startjaar; de open einddatum en</w:t>
+      </w:r>
+      <w:r>
+        <w:t xml:space="preserve"> </w:t>
+      </w:r>
+      <w:r>
+        <w:rPr>
+          <w:rStyle w:val="VerbatimChar"/>
+        </w:rPr>
+        <w:t xml:space="preserve">cycliciteit='doorlopend tot heden'</w:t>
+      </w:r>
+      <w:r>
+        <w:t xml:space="preserve"> </w:t>
+      </w:r>
+      <w:r>
+        <w:t xml:space="preserve">leggen de voortzetting tot en met 2026 vast zonder tussenliggende jaren als afzonderlijke bronbeweringen te construeren. De koppelingen voor de uitbreiding van het begrazingsgebied met Meeuwenhoek en het maaibeheer in Oude Rijs leveren geen uitgevoerde plot-jaarrij, omdat respectievelijk een uitvoeringsjaar ontbreekt en 2025 als</w:t>
       </w:r>
       <w:r>
         <w:t xml:space="preserve"> </w:t>
@@ -6773,7 +6980,7 @@
         <w:t xml:space="preserve"> </w:t>
       </w:r>
       <w:r>
-        <w:t>Bronvast op project-, uitvoering- en jaarniveau voor de 28 ingevoerde bronnen en 61 uitvoeringen. De algemene kavel- en gebiedsindeling is geometrisch beschikbaar voor de 55 actuele plots uit 2025; vijf expliciet gekoppelde historische kavels hebben geen afzonderlijke geometrie. De bronvaste plot-jaarlaag bevat 112 regels voor 1967–1969, 1972–1975, 1988–1991, 1993, 1997, 2005–2006, 2017–2021 en 2025. Zes uitvoeringen zijn via de nameninventaris aan 32 kavelsituaties gekoppeld; Pan 13 en Plas 20 voegen elf aanvullende relaties toe, Helmduinen drie, de Kikkervalleienbegrazing drie, het Kikkervalleien-bodemherstel drie en Parnassiapad 2 één. Nog 27 uitvoeringen hebben geen directe plotkoppeling.</w:t>
+        <w:t xml:space="preserve">Bronvast op project-, uitvoering- en jaarniveau voor de 29 ingevoerde bronnen en 61 uitvoeringen. De algemene kavel- en gebiedsindeling is geometrisch beschikbaar voor de 55 actuele plots uit 2025; vijf expliciet gekoppelde historische kavels hebben geen afzonderlijke geometrie. De bronvaste plot-jaarlaag bevat 115 regels voor 1967–1969, 1972–1975, 1988–1991, 1993, 1997, 2005–2006, 2017–2021 en 2025. Zes uitvoeringen zijn via de nameninventaris aan 32 kavelsituaties gekoppeld; Pan 13 en Plas 20 voegen elf aanvullende relaties toe, Helmduinen drie, de Kikkervalleienbegrazing drie, het Kikkervalleien-bodemherstel drie, de Kikkervalleien-infrastructuuringreep drie en Parnassiapad 2 één. Nog 26 uitvoeringen hebben geen directe plotkoppeling.</w:t>
       </w:r>
     </w:p>
     <w:p>

</xml_diff>

<commit_message>
Koppel Watercrassulabestrijding aan Kikkervalleien
</commit_message>
<xml_diff>
--- a/docs/MEIJENDEL_BRONREGISTER.docx
+++ b/docs/MEIJENDEL_BRONREGISTER.docx
@@ -6398,7 +6398,7 @@
         <w:t xml:space="preserve"> </w:t>
       </w:r>
       <w:r>
-        <w:t xml:space="preserve">De levende lokale database bevat 18 projecten, 29 bronnen, 61 uitvoeringen, 92 expliciete jaarbeoordelingen uit 1967–2025 en 81 bronkoppelingen. Van de jaarbeoordelingen zijn er 76</w:t>
+        <w:t xml:space="preserve">De levende lokale database bevat 18 projecten, 29 bronnen, 61 uitvoeringen, 100 expliciete jaarbeoordelingen uit 1967–2025 en 82 bronkoppelingen. Van de jaarbeoordelingen zijn er 84</w:t>
       </w:r>
       <w:r>
         <w:t xml:space="preserve"> </w:t>
@@ -6519,7 +6519,7 @@
         <w:t xml:space="preserve"> </w:t>
       </w:r>
       <w:r>
-        <w:t xml:space="preserve">bevat 92 geverifieerde directe relaties. Daarvan waren 36 al onderbouwd met expliciete kavelvermeldingen, gebruikersvaststellingen of een bijzondere gebiedsnaam. De nameninventaris voegt 32 geometrische doorsnijdingen toe voor zes volledig en letterlijk gelokaliseerde uitvoeringen met de naamobjecten Kijfhoek, Bierlap, Meeuwenhoek, Tafelberg, ’t Scheepje, Uilenbosch en Oude Rijs uit</w:t>
+        <w:t xml:space="preserve">bevat 95 geverifieerde directe relaties. Daarvan waren 36 al onderbouwd met expliciete kavelvermeldingen, gebruikersvaststellingen of een bijzondere gebiedsnaam. De nameninventaris voegt 32 geometrische doorsnijdingen toe voor zes volledig en letterlijk gelokaliseerde uitvoeringen met de naamobjecten Kijfhoek, Bierlap, Meeuwenhoek, Tafelberg, ’t Scheepje, Uilenbosch en Oude Rijs uit</w:t>
       </w:r>
       <w:r>
         <w:t xml:space="preserve"> </w:t>
@@ -6659,7 +6659,22 @@
         <w:pStyle w:val="BodyText"/>
       </w:pPr>
       <w:r>
-        <w:t xml:space="preserve">Ook het verwijderen van de omgevende leidingen en putten van Sprang PI en I in 1997 is gekoppeld aan M13, M13s en M14.</w:t>
+        <w:t xml:space="preserve">De bestrijding van Watercrassula in de Kikkervallei is gekoppeld aan M13, M13s en M14. De Natura 2000-evaluatie van 25 april 2025 vermeldt op pagina 13 dat Watercrassula in 2015 en 2017 is aangetroffen, met zeil is afgedekt en sindsdien wordt bestreden. Daarmee zijn 2015 en 2017–2025 als</w:t>
+      </w:r>
+      <w:r>
+        <w:t xml:space="preserve"> </w:t>
+      </w:r>
+      <w:r>
+        <w:rPr>
+          <w:rStyle w:val="VerbatimChar"/>
+        </w:rPr>
+        <w:t xml:space="preserve">uitgevoerd</w:t>
+      </w:r>
+      <w:r>
+        <w:t xml:space="preserve"> </w:t>
+      </w:r>
+      <w:r>
+        <w:t xml:space="preserve">vastgelegd; 2016 en 2026 zijn niet toegevoegd.</w:t>
       </w:r>
       <w:r>
         <w:t xml:space="preserve"> </w:t>
@@ -6669,25 +6684,36 @@
           <w:i/>
           <w:iCs/>
         </w:rPr>
-        <w:t xml:space="preserve">Meijendel Mededelingen</w:t>
-      </w:r>
-      <w:r>
-        <w:t xml:space="preserve"> </w:t>
-      </w:r>
-      <w:r>
-        <w:t xml:space="preserve">30 van november 1996 koppelt Sprang PI op pagina 99 letterlijk aan M13s en plaatst het betrokken rietgebied in M13s en M14; deze twee relaties zijn daarom</w:t>
-      </w:r>
-      <w:r>
-        <w:t xml:space="preserve"> </w:t>
-      </w:r>
-      <w:r>
-        <w:rPr>
-          <w:rStyle w:val="VerbatimChar"/>
-        </w:rPr>
-        <w:t xml:space="preserve">expliciet_in_bron</w:t>
-      </w:r>
-      <w:r>
-        <w:t xml:space="preserve">. De bronkaarten plaatsen Sprang I aan de oostzijde van het werkgebied en</w:t>
+        <w:t xml:space="preserve">Holland’s Duinen</w:t>
+      </w:r>
+      <w:r>
+        <w:t xml:space="preserve"> </w:t>
+      </w:r>
+      <w:r>
+        <w:t xml:space="preserve">55 plaatst het Kikkervalleiengebied op pagina 22 praktisch geheel binnen de drie kavels. Ton bevestigde deze koppeling op 14 oktober 2026. De exacte besmettings- en behandelingsvoetafdruk per kavel is niet bekend;</w:t>
+      </w:r>
+      <w:r>
+        <w:t xml:space="preserve"> </w:t>
+      </w:r>
+      <w:r>
+        <w:rPr>
+          <w:rStyle w:val="VerbatimChar"/>
+        </w:rPr>
+        <w:t xml:space="preserve">doorsnijding_pct</w:t>
+      </w:r>
+      <w:r>
+        <w:t xml:space="preserve"> </w:t>
+      </w:r>
+      <w:r>
+        <w:t xml:space="preserve">blijft daarom leeg.</w:t>
+      </w:r>
+    </w:p>
+    <w:p>
+      <w:pPr>
+        <w:pStyle w:val="BodyText"/>
+      </w:pPr>
+      <w:r>
+        <w:t xml:space="preserve">Ook het verwijderen van de omgevende leidingen en putten van Sprang PI en I in 1997 is gekoppeld aan M13, M13s en M14.</w:t>
       </w:r>
       <w:r>
         <w:t xml:space="preserve"> </w:t>
@@ -6697,48 +6723,25 @@
           <w:i/>
           <w:iCs/>
         </w:rPr>
-        <w:t xml:space="preserve">Holland’s Duinen</w:t>
-      </w:r>
-      <w:r>
-        <w:t xml:space="preserve"> </w:t>
-      </w:r>
-      <w:r>
-        <w:t xml:space="preserve">55 plaatst het geschoonde gebied praktisch geheel binnen de drie kavels. Ton bevestigde M13 op 14 oktober 2026; die relatie is daarom</w:t>
-      </w:r>
-      <w:r>
-        <w:t xml:space="preserve"> </w:t>
-      </w:r>
-      <w:r>
-        <w:rPr>
-          <w:rStyle w:val="VerbatimChar"/>
-        </w:rPr>
-        <w:t xml:space="preserve">benoemd_gebied_gevalideerd</w:t>
-      </w:r>
-      <w:r>
-        <w:t xml:space="preserve">. Een exacte geometrie van leidingen en putten ontbreekt voor alle drie kavels, zodat</w:t>
-      </w:r>
-      <w:r>
-        <w:t xml:space="preserve"> </w:t>
-      </w:r>
-      <w:r>
-        <w:rPr>
-          <w:rStyle w:val="VerbatimChar"/>
-        </w:rPr>
-        <w:t xml:space="preserve">doorsnijding_pct</w:t>
-      </w:r>
-      <w:r>
-        <w:t xml:space="preserve"> </w:t>
-      </w:r>
-      <w:r>
-        <w:t xml:space="preserve">leeg blijft. Dit was een eenmalige ingreep in 1997.</w:t>
-      </w:r>
-    </w:p>
-    <w:p>
-      <w:pPr>
-        <w:pStyle w:val="BodyText"/>
-      </w:pPr>
-      <w:r>
-        <w:t xml:space="preserve">Ton heeft op 14 oktober 2026 Plas 20 als volledig plassensysteem gelokaliseerd: de zuidelijke plas ligt in M17b, de middelste in M17a en de noordelijke in M16. De publicatie</w:t>
+        <w:t xml:space="preserve">Meijendel Mededelingen</w:t>
+      </w:r>
+      <w:r>
+        <w:t xml:space="preserve"> </w:t>
+      </w:r>
+      <w:r>
+        <w:t xml:space="preserve">30 van november 1996 koppelt Sprang PI op pagina 99 letterlijk aan M13s en plaatst het betrokken rietgebied in M13s en M14; deze twee relaties zijn daarom</w:t>
+      </w:r>
+      <w:r>
+        <w:t xml:space="preserve"> </w:t>
+      </w:r>
+      <w:r>
+        <w:rPr>
+          <w:rStyle w:val="VerbatimChar"/>
+        </w:rPr>
+        <w:t xml:space="preserve">expliciet_in_bron</w:t>
+      </w:r>
+      <w:r>
+        <w:t xml:space="preserve">. De bronkaarten plaatsen Sprang I aan de oostzijde van het werkgebied en</w:t>
       </w:r>
       <w:r>
         <w:t xml:space="preserve"> </w:t>
@@ -6748,13 +6751,48 @@
           <w:i/>
           <w:iCs/>
         </w:rPr>
-        <w:t xml:space="preserve">Schone start voor infiltratieplas 20 in Meijendel</w:t>
-      </w:r>
-      <w:r>
-        <w:t xml:space="preserve"> </w:t>
-      </w:r>
-      <w:r>
-        <w:t xml:space="preserve">toont het langgerekte systeem en de noordelijke, middelste en zuidelijke delen in figuur 1 en 2. Zij staat in</w:t>
+        <w:t xml:space="preserve">Holland’s Duinen</w:t>
+      </w:r>
+      <w:r>
+        <w:t xml:space="preserve"> </w:t>
+      </w:r>
+      <w:r>
+        <w:t xml:space="preserve">55 plaatst het geschoonde gebied praktisch geheel binnen de drie kavels. Ton bevestigde M13 op 14 oktober 2026; die relatie is daarom</w:t>
+      </w:r>
+      <w:r>
+        <w:t xml:space="preserve"> </w:t>
+      </w:r>
+      <w:r>
+        <w:rPr>
+          <w:rStyle w:val="VerbatimChar"/>
+        </w:rPr>
+        <w:t xml:space="preserve">benoemd_gebied_gevalideerd</w:t>
+      </w:r>
+      <w:r>
+        <w:t xml:space="preserve">. Een exacte geometrie van leidingen en putten ontbreekt voor alle drie kavels, zodat</w:t>
+      </w:r>
+      <w:r>
+        <w:t xml:space="preserve"> </w:t>
+      </w:r>
+      <w:r>
+        <w:rPr>
+          <w:rStyle w:val="VerbatimChar"/>
+        </w:rPr>
+        <w:t xml:space="preserve">doorsnijding_pct</w:t>
+      </w:r>
+      <w:r>
+        <w:t xml:space="preserve"> </w:t>
+      </w:r>
+      <w:r>
+        <w:t xml:space="preserve">leeg blijft. Dit was een eenmalige ingreep in 1997.</w:t>
+      </w:r>
+    </w:p>
+    <w:p>
+      <w:pPr>
+        <w:pStyle w:val="BodyText"/>
+      </w:pPr>
+      <w:r>
+        <w:t xml:space="preserve">Ton heeft op 14 oktober 2026 Plas 20 als volledig plassensysteem gelokaliseerd: de zuidelijke plas ligt in M17b, de middelste in M17a en de noordelijke in M16. De publicatie</w:t>
       </w:r>
       <w:r>
         <w:t xml:space="preserve"> </w:t>
@@ -6764,21 +6802,13 @@
           <w:i/>
           <w:iCs/>
         </w:rPr>
-        <w:t xml:space="preserve">Holland’s Duinen</w:t>
-      </w:r>
-      <w:r>
-        <w:t xml:space="preserve"> </w:t>
-      </w:r>
-      <w:r>
-        <w:t xml:space="preserve">48 van maart 2006; het Zotero-jaar 1989 is onjuist en verwijst in de tekst naar de eerdere slibverwijdering in Plas 13. Deze combinatie van gebruikersvaststelling en ruimtelijke broncontext onderbouwt twaalf koppelingen: drie voor de reparatie in 1969 en telkens drie voor slibverwijdering, hydrologische aanpassing en infrastructuurwerk in 2005–2006. Pan 13 is op grond van de primaire bron en het broedvogelverslag over 2006 als volledig plassensysteem in M2 en M3 gekoppeld; zowel de slibverwijdering als de oeveraanpassing in 1988–1989 heeft daardoor twee directe kavelrelaties.</w:t>
-      </w:r>
-    </w:p>
-    <w:p>
-      <w:pPr>
-        <w:pStyle w:val="BodyText"/>
-      </w:pPr>
-      <w:r>
-        <w:t xml:space="preserve">Ton heeft op 14 oktober 2026 ook Libellenvallei gelokaliseerd in M17b. De publicatie</w:t>
+        <w:t xml:space="preserve">Schone start voor infiltratieplas 20 in Meijendel</w:t>
+      </w:r>
+      <w:r>
+        <w:t xml:space="preserve"> </w:t>
+      </w:r>
+      <w:r>
+        <w:t xml:space="preserve">toont het langgerekte systeem en de noordelijke, middelste en zuidelijke delen in figuur 1 en 2. Zij staat in</w:t>
       </w:r>
       <w:r>
         <w:t xml:space="preserve"> </w:t>
@@ -6788,13 +6818,21 @@
           <w:i/>
           <w:iCs/>
         </w:rPr>
-        <w:t xml:space="preserve">Vegetatieontwikkeling in duinvalleien van Meijendel na opheffen van infiltratieplassen</w:t>
-      </w:r>
-      <w:r>
-        <w:t xml:space="preserve"> </w:t>
-      </w:r>
-      <w:r>
-        <w:t xml:space="preserve">in</w:t>
+        <w:t xml:space="preserve">Holland’s Duinen</w:t>
+      </w:r>
+      <w:r>
+        <w:t xml:space="preserve"> </w:t>
+      </w:r>
+      <w:r>
+        <w:t xml:space="preserve">48 van maart 2006; het Zotero-jaar 1989 is onjuist en verwijst in de tekst naar de eerdere slibverwijdering in Plas 13. Deze combinatie van gebruikersvaststelling en ruimtelijke broncontext onderbouwt twaalf koppelingen: drie voor de reparatie in 1969 en telkens drie voor slibverwijdering, hydrologische aanpassing en infrastructuurwerk in 2005–2006. Pan 13 is op grond van de primaire bron en het broedvogelverslag over 2006 als volledig plassensysteem in M2 en M3 gekoppeld; zowel de slibverwijdering als de oeveraanpassing in 1988–1989 heeft daardoor twee directe kavelrelaties.</w:t>
+      </w:r>
+    </w:p>
+    <w:p>
+      <w:pPr>
+        <w:pStyle w:val="BodyText"/>
+      </w:pPr>
+      <w:r>
+        <w:t xml:space="preserve">Ton heeft op 14 oktober 2026 ook Libellenvallei gelokaliseerd in M17b. De publicatie</w:t>
       </w:r>
       <w:r>
         <w:t xml:space="preserve"> </w:t>
@@ -6804,21 +6842,13 @@
           <w:i/>
           <w:iCs/>
         </w:rPr>
-        <w:t xml:space="preserve">Holland’s Duinen</w:t>
-      </w:r>
-      <w:r>
-        <w:t xml:space="preserve"> </w:t>
-      </w:r>
-      <w:r>
-        <w:t xml:space="preserve">42 van april 2003 vermeldt dat de Libellenvallei sinds 1975 eenmaal per jaar in het najaar wordt gemaaid. Deze combinatie onderbouwt één koppeling voor het maaibeheer, met een uitgevoerde jaarregel voor 1975.</w:t>
-      </w:r>
-    </w:p>
-    <w:p>
-      <w:pPr>
-        <w:pStyle w:val="BodyText"/>
-      </w:pPr>
-      <w:r>
-        <w:t xml:space="preserve">Ton heeft op 14 oktober 2026 Parnassiapad 2 gekoppeld aan M15. De primaire publicatie uit 2003 beschrijft twee permanente meetblokken binnen een circa twintig meter breed transect en noemt in 2001 een plagleeftijd van acht jaar; het uitvoeringsjaar is daarom als circa 1993 vastgelegd.</w:t>
+        <w:t xml:space="preserve">Vegetatieontwikkeling in duinvalleien van Meijendel na opheffen van infiltratieplassen</w:t>
+      </w:r>
+      <w:r>
+        <w:t xml:space="preserve"> </w:t>
+      </w:r>
+      <w:r>
+        <w:t xml:space="preserve">in</w:t>
       </w:r>
       <w:r>
         <w:t xml:space="preserve"> </w:t>
@@ -6834,6 +6864,30 @@
         <w:t xml:space="preserve"> </w:t>
       </w:r>
       <w:r>
+        <w:t xml:space="preserve">42 van april 2003 vermeldt dat de Libellenvallei sinds 1975 eenmaal per jaar in het najaar wordt gemaaid. Deze combinatie onderbouwt één koppeling voor het maaibeheer, met een uitgevoerde jaarregel voor 1975.</w:t>
+      </w:r>
+    </w:p>
+    <w:p>
+      <w:pPr>
+        <w:pStyle w:val="BodyText"/>
+      </w:pPr>
+      <w:r>
+        <w:t xml:space="preserve">Ton heeft op 14 oktober 2026 Parnassiapad 2 gekoppeld aan M15. De primaire publicatie uit 2003 beschrijft twee permanente meetblokken binnen een circa twintig meter breed transect en noemt in 2001 een plagleeftijd van acht jaar; het uitvoeringsjaar is daarom als circa 1993 vastgelegd.</w:t>
+      </w:r>
+      <w:r>
+        <w:t xml:space="preserve"> </w:t>
+      </w:r>
+      <w:r>
+        <w:rPr>
+          <w:i/>
+          <w:iCs/>
+        </w:rPr>
+        <w:t xml:space="preserve">Holland’s Duinen</w:t>
+      </w:r>
+      <w:r>
+        <w:t xml:space="preserve"> </w:t>
+      </w:r>
+      <w:r>
         <w:t xml:space="preserve">86 van mei 2025 toont op pagina 49, figuur 1, de route Parnassiapad aan de noordzijde van de Helmduinen en is als aanvullende ruimtelijke context geregistreerd. De precieze plaggrens binnen M15 is niet bekend;</w:t>
       </w:r>
       <w:r>
@@ -6857,7 +6911,7 @@
         <w:pStyle w:val="BodyText"/>
       </w:pPr>
       <w:r>
-        <w:t xml:space="preserve">De 92 plotkoppelingen en 75 uitgevoerde jaarregels leveren samen 115 regels in</w:t>
+        <w:t xml:space="preserve">De 95 plotkoppelingen en 84 uitgevoerde jaarregels leveren samen 145 regels in</w:t>
       </w:r>
       <w:r>
         <w:t xml:space="preserve"> </w:t>
@@ -6869,7 +6923,7 @@
         <w:t xml:space="preserve">v_plot_jaar_maatregel_bronvast</w:t>
       </w:r>
       <w:r>
-        <w:t xml:space="preserve">. De nameninventaris voegt 36 plot-jaarrijen toe: begrazing in Kijfhoek en Bierlap in 1990, hervat maaibeheer bij Tafelberg en ’t Scheepje in 2025, uitgevoerd maaibeheer in Uilenbosch in 2017–2021 en vogelkersbestrijding in Kijfhoek, Bierlap en Meeuwenhoek in 2020. De aanvullende systeemkoppelingen voegen 22 plot-jaarrijen toe: vier voor de oeveraanpassing van Pan 13 in 1988–1989 en achttien voor drie uitvoeringen in Plas 20 in 2005–2006. De Helmduinen-koppeling voegt drie plot-jaarrijen voor 1991 toe. De uitbreiding van de begrazing met de Kikkervalleien, de eenmalige verwijdering van vegetatie en voedselrijke bovengrond en het verwijderen van leidingen en putten voegen ieder drie plot-jaarrijen voor 1997 toe; Parnassiapad 2 voegt één plot-jaarrij voor M15 in 1993 toe. Voor beide doorlopende begrazingsmaatregelen bewaart deze view alleen het expliciet onderbouwde startjaar; de open einddatum en</w:t>
+        <w:t xml:space="preserve">. De nameninventaris voegt 36 plot-jaarrijen toe: begrazing in Kijfhoek en Bierlap in 1990, hervat maaibeheer bij Tafelberg en ’t Scheepje in 2025, uitgevoerd maaibeheer in Uilenbosch in 2017–2021 en vogelkersbestrijding in Kijfhoek, Bierlap en Meeuwenhoek in 2020. De aanvullende systeemkoppelingen voegen 22 plot-jaarrijen toe: vier voor de oeveraanpassing van Pan 13 in 1988–1989 en achttien voor drie uitvoeringen in Plas 20 in 2005–2006. De Helmduinen-koppeling voegt drie plot-jaarrijen voor 1991 toe. De uitbreiding van de begrazing met de Kikkervalleien, de eenmalige verwijdering van vegetatie en voedselrijke bovengrond en het verwijderen van leidingen en putten voegen ieder drie plot-jaarrijen voor 1997 toe; Parnassiapad 2 voegt één plot-jaarrij voor M15 in 1993 toe. De Watercrassulabestrijding voegt dertig plot-jaarrijen toe voor M13, M13s en M14 in 2015 en 2017–2025. Voor beide doorlopende begrazingsmaatregelen bewaart deze view alleen het expliciet onderbouwde startjaar; de open einddatum en</w:t>
       </w:r>
       <w:r>
         <w:t xml:space="preserve"> </w:t>
@@ -6980,7 +7034,7 @@
         <w:t xml:space="preserve"> </w:t>
       </w:r>
       <w:r>
-        <w:t xml:space="preserve">Bronvast op project-, uitvoering- en jaarniveau voor de 29 ingevoerde bronnen en 61 uitvoeringen. De algemene kavel- en gebiedsindeling is geometrisch beschikbaar voor de 55 actuele plots uit 2025; vijf expliciet gekoppelde historische kavels hebben geen afzonderlijke geometrie. De bronvaste plot-jaarlaag bevat 115 regels voor 1967–1969, 1972–1975, 1988–1991, 1993, 1997, 2005–2006, 2017–2021 en 2025. Zes uitvoeringen zijn via de nameninventaris aan 32 kavelsituaties gekoppeld; Pan 13 en Plas 20 voegen elf aanvullende relaties toe, Helmduinen drie, de Kikkervalleienbegrazing drie, het Kikkervalleien-bodemherstel drie, de Kikkervalleien-infrastructuuringreep drie en Parnassiapad 2 één. Nog 26 uitvoeringen hebben geen directe plotkoppeling.</w:t>
+        <w:t xml:space="preserve">Bronvast op project-, uitvoering- en jaarniveau voor de 29 ingevoerde bronnen en 61 uitvoeringen. De algemene kavel- en gebiedsindeling is geometrisch beschikbaar voor de 55 actuele plots uit 2025; vijf expliciet gekoppelde historische kavels hebben geen afzonderlijke geometrie. De bronvaste plot-jaarlaag bevat 145 regels voor 1967–1969, 1972–1975, 1988–1991, 1993, 1997, 2005–2006 en 2017–2025. Zes uitvoeringen zijn via de nameninventaris aan 32 kavelsituaties gekoppeld; Pan 13 en Plas 20 voegen elf aanvullende relaties toe, Helmduinen drie, de Kikkervalleienbegrazing drie, het Kikkervalleien-bodemherstel drie, de Kikkervalleien-infrastructuuringreep drie, de Watercrassulabestrijding drie en Parnassiapad 2 één. Nog 25 uitvoeringen hebben geen directe plotkoppeling.</w:t>
       </w:r>
     </w:p>
     <w:p>

</xml_diff>

<commit_message>
Koppel konijnenproef aan M8 en M41
</commit_message>
<xml_diff>
--- a/docs/MEIJENDEL_BRONREGISTER.docx
+++ b/docs/MEIJENDEL_BRONREGISTER.docx
@@ -6368,7 +6368,7 @@
         <w:pStyle w:val="BodyText"/>
       </w:pPr>
       <w:r>
-        <w:t xml:space="preserve">Daarbij zijn zeven officiële internetbronnen geraadpleegd: vijf Dunea-pagina’s over optimalisatie van de waterwinning, beheer in Meeuwenduin en Prinsenduin, vervanging van slagbomen, actuele werkzaamheden en duindynamiek; het Dunea-jaarverslag 2024; en het Zuid-Hollandse subsidie-openstellingsbesluit voor Bendel. De bronnen staan afzonderlijk in</w:t>
+        <w:t xml:space="preserve">Daarbij zijn acht officiële internetbronnen geraadpleegd: vijf Dunea-pagina’s over optimalisatie van de waterwinning, beheer in Meeuwenduin en Prinsenduin, vervanging van slagbomen, actuele werkzaamheden en duindynamiek; het Dunea-jaarverslag 2024; het Zuid-Hollandse subsidie-openstellingsbesluit voor Bendel; en de ODH-beschikking van 28 augustus 2023 voor de konijnenbijplaatsingsproef. De bronnen staan afzonderlijk in</w:t>
       </w:r>
       <w:r>
         <w:t xml:space="preserve"> </w:t>
@@ -6398,7 +6398,7 @@
         <w:t xml:space="preserve"> </w:t>
       </w:r>
       <w:r>
-        <w:t xml:space="preserve">De levende lokale database bevat 18 projecten, 29 bronnen, 61 uitvoeringen, 100 expliciete jaarbeoordelingen uit 1967–2025 en 82 bronkoppelingen. Van de jaarbeoordelingen zijn er 84</w:t>
+        <w:t xml:space="preserve">De levende lokale database bevat 18 projecten, 30 bronnen, 61 uitvoeringen, 100 expliciete jaarbeoordelingen uit 1967–2025 en 83 bronkoppelingen. Van de jaarbeoordelingen zijn er 84</w:t>
       </w:r>
       <w:r>
         <w:t xml:space="preserve"> </w:t>
@@ -6519,7 +6519,7 @@
         <w:t xml:space="preserve"> </w:t>
       </w:r>
       <w:r>
-        <w:t xml:space="preserve">bevat 95 geverifieerde directe relaties. Daarvan waren 36 al onderbouwd met expliciete kavelvermeldingen, gebruikersvaststellingen of een bijzondere gebiedsnaam. De nameninventaris voegt 32 geometrische doorsnijdingen toe voor zes volledig en letterlijk gelokaliseerde uitvoeringen met de naamobjecten Kijfhoek, Bierlap, Meeuwenhoek, Tafelberg, ’t Scheepje, Uilenbosch en Oude Rijs uit</w:t>
+        <w:t xml:space="preserve">bevat 97 geverifieerde directe relaties. Daarvan waren 36 al onderbouwd met expliciete kavelvermeldingen, gebruikersvaststellingen of een bijzondere gebiedsnaam. De nameninventaris voegt 32 geometrische doorsnijdingen toe voor zes volledig en letterlijk gelokaliseerde uitvoeringen met de naamobjecten Kijfhoek, Bierlap, Meeuwenhoek, Tafelberg, ’t Scheepje, Uilenbosch en Oude Rijs uit</w:t>
       </w:r>
       <w:r>
         <w:t xml:space="preserve"> </w:t>
@@ -6911,7 +6911,30 @@
         <w:pStyle w:val="BodyText"/>
       </w:pPr>
       <w:r>
-        <w:t xml:space="preserve">De 95 plotkoppelingen en 84 uitgevoerde jaarregels leveren samen 145 regels in</w:t>
+        <w:t xml:space="preserve">De konijnenbijplaatsingsproef is voor 2024 gekoppeld aan M8 en M41. De ODH-beschikking van 28 augustus 2023 en het daarin opgenomen activiteitenplan benoemen en begrenzen de uitzetlocaties Kleine Pan en Waterschapsvallei. De nameninventaris koppelt Kleine Pan aan M8; vergelijking met de actuele SOVON-kavelgeometrie plaatst Waterschapsvallei in M41. Ton bevestigde beide koppelingen op 14 oktober 2026. Het Dunea-jaarverslag bevestigt dat de proef in 2024 is begonnen en dat rond de uitzetlocaties is gemonitord. De beschikking gold tot en met 31 maart 2026, maar dat vergunningsbereik bewijst geen uitvoering in 2025 of 2026. Daarom bevat de jaarlaag alleen 2024. De precieze uitzet- en monitoringsvoetafdruk binnen beide kavels is niet vastgesteld;</w:t>
+      </w:r>
+      <w:r>
+        <w:t xml:space="preserve"> </w:t>
+      </w:r>
+      <w:r>
+        <w:rPr>
+          <w:rStyle w:val="VerbatimChar"/>
+        </w:rPr>
+        <w:t xml:space="preserve">doorsnijding_pct</w:t>
+      </w:r>
+      <w:r>
+        <w:t xml:space="preserve"> </w:t>
+      </w:r>
+      <w:r>
+        <w:t xml:space="preserve">blijft leeg.</w:t>
+      </w:r>
+    </w:p>
+    <w:p>
+      <w:pPr>
+        <w:pStyle w:val="BodyText"/>
+      </w:pPr>
+      <w:r>
+        <w:t xml:space="preserve">De 97 plotkoppelingen en 84 uitgevoerde jaarregels leveren samen 147 regels in</w:t>
       </w:r>
       <w:r>
         <w:t xml:space="preserve"> </w:t>
@@ -6923,7 +6946,7 @@
         <w:t xml:space="preserve">v_plot_jaar_maatregel_bronvast</w:t>
       </w:r>
       <w:r>
-        <w:t xml:space="preserve">. De nameninventaris voegt 36 plot-jaarrijen toe: begrazing in Kijfhoek en Bierlap in 1990, hervat maaibeheer bij Tafelberg en ’t Scheepje in 2025, uitgevoerd maaibeheer in Uilenbosch in 2017–2021 en vogelkersbestrijding in Kijfhoek, Bierlap en Meeuwenhoek in 2020. De aanvullende systeemkoppelingen voegen 22 plot-jaarrijen toe: vier voor de oeveraanpassing van Pan 13 in 1988–1989 en achttien voor drie uitvoeringen in Plas 20 in 2005–2006. De Helmduinen-koppeling voegt drie plot-jaarrijen voor 1991 toe. De uitbreiding van de begrazing met de Kikkervalleien, de eenmalige verwijdering van vegetatie en voedselrijke bovengrond en het verwijderen van leidingen en putten voegen ieder drie plot-jaarrijen voor 1997 toe; Parnassiapad 2 voegt één plot-jaarrij voor M15 in 1993 toe. De Watercrassulabestrijding voegt dertig plot-jaarrijen toe voor M13, M13s en M14 in 2015 en 2017–2025. Voor beide doorlopende begrazingsmaatregelen bewaart deze view alleen het expliciet onderbouwde startjaar; de open einddatum en</w:t>
+        <w:t xml:space="preserve">. De nameninventaris voegt 36 plot-jaarrijen toe: begrazing in Kijfhoek en Bierlap in 1990, hervat maaibeheer bij Tafelberg en ’t Scheepje in 2025, uitgevoerd maaibeheer in Uilenbosch in 2017–2021 en vogelkersbestrijding in Kijfhoek, Bierlap en Meeuwenhoek in 2020. De aanvullende systeemkoppelingen voegen 22 plot-jaarrijen toe: vier voor de oeveraanpassing van Pan 13 in 1988–1989 en achttien voor drie uitvoeringen in Plas 20 in 2005–2006. De Helmduinen-koppeling voegt drie plot-jaarrijen voor 1991 toe. De uitbreiding van de begrazing met de Kikkervalleien, de eenmalige verwijdering van vegetatie en voedselrijke bovengrond en het verwijderen van leidingen en putten voegen ieder drie plot-jaarrijen voor 1997 toe; Parnassiapad 2 voegt één plot-jaarrij voor M15 in 1993 toe. De Watercrassulabestrijding voegt dertig plot-jaarrijen toe voor M13, M13s en M14 in 2015 en 2017–2025. De konijnenbijplaatsingsproef voegt twee plot-jaarrijen toe voor M8 en M41 in 2024. Voor beide doorlopende begrazingsmaatregelen bewaart deze view alleen het expliciet onderbouwde startjaar; de open einddatum en</w:t>
       </w:r>
       <w:r>
         <w:t xml:space="preserve"> </w:t>
@@ -7034,7 +7057,7 @@
         <w:t xml:space="preserve"> </w:t>
       </w:r>
       <w:r>
-        <w:t xml:space="preserve">Bronvast op project-, uitvoering- en jaarniveau voor de 29 ingevoerde bronnen en 61 uitvoeringen. De algemene kavel- en gebiedsindeling is geometrisch beschikbaar voor de 55 actuele plots uit 2025; vijf expliciet gekoppelde historische kavels hebben geen afzonderlijke geometrie. De bronvaste plot-jaarlaag bevat 145 regels voor 1967–1969, 1972–1975, 1988–1991, 1993, 1997, 2005–2006 en 2017–2025. Zes uitvoeringen zijn via de nameninventaris aan 32 kavelsituaties gekoppeld; Pan 13 en Plas 20 voegen elf aanvullende relaties toe, Helmduinen drie, de Kikkervalleienbegrazing drie, het Kikkervalleien-bodemherstel drie, de Kikkervalleien-infrastructuuringreep drie, de Watercrassulabestrijding drie en Parnassiapad 2 één. Nog 25 uitvoeringen hebben geen directe plotkoppeling.</w:t>
+        <w:t xml:space="preserve">Bronvast op project-, uitvoering- en jaarniveau voor de 30 ingevoerde bronnen en 61 uitvoeringen. De algemene kavel- en gebiedsindeling is geometrisch beschikbaar voor de 55 actuele plots uit 2025; vijf expliciet gekoppelde historische kavels hebben geen afzonderlijke geometrie. De bronvaste plot-jaarlaag bevat 147 regels voor 1967–1969, 1972–1975, 1988–1991, 1993, 1997, 2005–2006 en 2017–2025. Zes uitvoeringen zijn via de nameninventaris aan 32 kavelsituaties gekoppeld; Pan 13 en Plas 20 voegen elf aanvullende relaties toe, Helmduinen drie, de Kikkervalleienbegrazing drie, het Kikkervalleien-bodemherstel drie, de Kikkervalleien-infrastructuuringreep drie, de Watercrassulabestrijding drie, Parnassiapad 2 één en de konijnenbijplaatsingsproef twee. Nog 24 uitvoeringen hebben geen directe plotkoppeling.</w:t>
       </w:r>
     </w:p>
     <w:p>

</xml_diff>

<commit_message>
Koppel Parnassiapad 1 aan M15
</commit_message>
<xml_diff>
--- a/docs/MEIJENDEL_BRONREGISTER.docx
+++ b/docs/MEIJENDEL_BRONREGISTER.docx
@@ -6911,6 +6911,14 @@
         <w:pStyle w:val="BodyText"/>
       </w:pPr>
       <w:r>
+        <w:t>Ton heeft op 14 oktober 2026 ook Parnassiapad 1 gekoppeld aan M15. De primaire publicatie Vegetatieontwikkeling in duinvalleien van Meijendel na opheffen van infiltratieplassen uit 2003 onderscheidt Parnassiapad 1 in tabel 1 als de circa vier jaar eerder geplagde blokken E en F; het uitvoeringsjaar is daarom als circa 1997 vastgelegd. Bijlage A toont de opbouw en oriëntatie van het transect, maar geen kavelgrens of exacte plaggeometrie. De precieze plaggrens binnen M15 is daarom niet bekend en doorsnijding_pct blijft leeg.</w:t>
+      </w:r>
+    </w:p>
+    <w:p>
+      <w:pPr>
+        <w:pStyle w:val="BodyText"/>
+      </w:pPr>
+      <w:r>
         <w:t xml:space="preserve">De konijnenbijplaatsingsproef is voor 2024 gekoppeld aan M8 en M41. De ODH-beschikking van 28 augustus 2023 en het daarin opgenomen activiteitenplan benoemen en begrenzen de uitzetlocaties Kleine Pan en Waterschapsvallei. De nameninventaris koppelt Kleine Pan aan M8; vergelijking met de actuele SOVON-kavelgeometrie plaatst Waterschapsvallei in M41. Ton bevestigde beide koppelingen op 14 oktober 2026. Het Dunea-jaarverslag bevestigt dat de proef in 2024 is begonnen en dat rond de uitzetlocaties is gemonitord. De beschikking gold tot en met 31 maart 2026, maar dat vergunningsbereik bewijst geen uitvoering in 2025 of 2026. Daarom bevat de jaarlaag alleen 2024. De precieze uitzet- en monitoringsvoetafdruk binnen beide kavels is niet vastgesteld;</w:t>
       </w:r>
       <w:r>
@@ -6934,64 +6942,7 @@
         <w:pStyle w:val="BodyText"/>
       </w:pPr>
       <w:r>
-        <w:t xml:space="preserve">De 97 plotkoppelingen en 84 uitgevoerde jaarregels leveren samen 147 regels in</w:t>
-      </w:r>
-      <w:r>
-        <w:t xml:space="preserve"> </w:t>
-      </w:r>
-      <w:r>
-        <w:rPr>
-          <w:rStyle w:val="VerbatimChar"/>
-        </w:rPr>
-        <w:t xml:space="preserve">v_plot_jaar_maatregel_bronvast</w:t>
-      </w:r>
-      <w:r>
-        <w:t xml:space="preserve">. De nameninventaris voegt 36 plot-jaarrijen toe: begrazing in Kijfhoek en Bierlap in 1990, hervat maaibeheer bij Tafelberg en ’t Scheepje in 2025, uitgevoerd maaibeheer in Uilenbosch in 2017–2021 en vogelkersbestrijding in Kijfhoek, Bierlap en Meeuwenhoek in 2020. De aanvullende systeemkoppelingen voegen 22 plot-jaarrijen toe: vier voor de oeveraanpassing van Pan 13 in 1988–1989 en achttien voor drie uitvoeringen in Plas 20 in 2005–2006. De Helmduinen-koppeling voegt drie plot-jaarrijen voor 1991 toe. De uitbreiding van de begrazing met de Kikkervalleien, de eenmalige verwijdering van vegetatie en voedselrijke bovengrond en het verwijderen van leidingen en putten voegen ieder drie plot-jaarrijen voor 1997 toe; Parnassiapad 2 voegt één plot-jaarrij voor M15 in 1993 toe. De Watercrassulabestrijding voegt dertig plot-jaarrijen toe voor M13, M13s en M14 in 2015 en 2017–2025. De konijnenbijplaatsingsproef voegt twee plot-jaarrijen toe voor M8 en M41 in 2024. Voor beide doorlopende begrazingsmaatregelen bewaart deze view alleen het expliciet onderbouwde startjaar; de open einddatum en</w:t>
-      </w:r>
-      <w:r>
-        <w:t xml:space="preserve"> </w:t>
-      </w:r>
-      <w:r>
-        <w:rPr>
-          <w:rStyle w:val="VerbatimChar"/>
-        </w:rPr>
-        <w:t xml:space="preserve">cycliciteit='doorlopend tot heden'</w:t>
-      </w:r>
-      <w:r>
-        <w:t xml:space="preserve"> </w:t>
-      </w:r>
-      <w:r>
-        <w:t xml:space="preserve">leggen de voortzetting tot en met 2026 vast zonder tussenliggende jaren als afzonderlijke bronbeweringen te construeren. De koppelingen voor de uitbreiding van het begrazingsgebied met Meeuwenhoek en het maaibeheer in Oude Rijs leveren geen uitgevoerde plot-jaarrij, omdat respectievelijk een uitvoeringsjaar ontbreekt en 2025 als</w:t>
-      </w:r>
-      <w:r>
-        <w:t xml:space="preserve"> </w:t>
-      </w:r>
-      <w:r>
-        <w:rPr>
-          <w:rStyle w:val="VerbatimChar"/>
-        </w:rPr>
-        <w:t xml:space="preserve">niet_uitgevoerd</w:t>
-      </w:r>
-      <w:r>
-        <w:t xml:space="preserve"> </w:t>
-      </w:r>
-      <w:r>
-        <w:t xml:space="preserve">is vastgelegd. Voorlinden levert evenmin een plot-jaarrij omdat de jaarstatus voor 2025</w:t>
-      </w:r>
-      <w:r>
-        <w:t xml:space="preserve"> </w:t>
-      </w:r>
-      <w:r>
-        <w:rPr>
-          <w:rStyle w:val="VerbatimChar"/>
-        </w:rPr>
-        <w:t xml:space="preserve">onbekend</w:t>
-      </w:r>
-      <w:r>
-        <w:t xml:space="preserve"> </w:t>
-      </w:r>
-      <w:r>
-        <w:t xml:space="preserve">is.</w:t>
+        <w:t>De 98 plotkoppelingen en 84 uitgevoerde jaarregels leveren samen 148 regels in v_plot_jaar_maatregel_bronvast. De nameninventaris voegt 36 plot-jaarrijen toe: begrazing in Kijfhoek en Bierlap in 1990, hervat maaibeheer bij Tafelberg en 't Scheepje in 2025, uitgevoerd maaibeheer in Uilenbosch in 2017–2021 en vogelkersbestrijding in Kijfhoek, Bierlap en Meeuwenhoek in 2020. De aanvullende systeemkoppelingen voegen 22 plot-jaarrijen toe: vier voor de oeveraanpassing van Pan 13 in 1988–1989 en achttien voor drie uitvoeringen in Plas 20 in 2005–2006. De Helmduinen-koppeling voegt drie plot-jaarrijen voor 1991 toe. De uitbreiding van de begrazing met de Kikkervalleien, de eenmalige verwijdering van vegetatie en voedselrijke bovengrond en het verwijderen van leidingen en putten voegen ieder drie plot-jaarrijen voor 1997 toe; Parnassiapad 2 voegt één plot-jaarrij voor M15 in 1993 toe en Parnassiapad 1 één voor M15 in 1997. De Watercrassulabestrijding voegt dertig plot-jaarrijen toe voor M13, M13s en M14 in 2015 en 2017–2025. De konijnenbijplaatsingsproef voegt twee plot-jaarrijen toe voor M8 en M41 in 2024. Voor beide doorlopende begrazingsmaatregelen bewaart deze view alleen het expliciet onderbouwde startjaar; de open einddatum en cycliciteit='doorlopend tot heden' leggen de voortzetting tot en met 2026 vast zonder tussenliggende jaren als afzonderlijke bronbeweringen te construeren. De koppelingen voor de uitbreiding van het begrazingsgebied met Meeuwenhoek en het maaibeheer in Oude Rijs leveren geen uitgevoerde plot-jaarrij, omdat respectievelijk een uitvoeringsjaar ontbreekt en 2025 als niet_uitgevoerd is vastgelegd. Voorlinden levert evenmin een plot-jaarrij omdat de jaarstatus voor 2025 onbekend is.</w:t>
       </w:r>
     </w:p>
     <w:p>
@@ -7047,17 +6998,7 @@
         <w:pStyle w:val="BodyText"/>
       </w:pPr>
       <w:r>
-        <w:rPr>
-          <w:b/>
-          <w:bCs/>
-        </w:rPr>
-        <w:t xml:space="preserve">Status.</w:t>
-      </w:r>
-      <w:r>
-        <w:t xml:space="preserve"> </w:t>
-      </w:r>
-      <w:r>
-        <w:t xml:space="preserve">Bronvast op project-, uitvoering- en jaarniveau voor de 30 ingevoerde bronnen en 61 uitvoeringen. De algemene kavel- en gebiedsindeling is geometrisch beschikbaar voor de 55 actuele plots uit 2025; vijf expliciet gekoppelde historische kavels hebben geen afzonderlijke geometrie. De bronvaste plot-jaarlaag bevat 147 regels voor 1967–1969, 1972–1975, 1988–1991, 1993, 1997, 2005–2006 en 2017–2025. Zes uitvoeringen zijn via de nameninventaris aan 32 kavelsituaties gekoppeld; Pan 13 en Plas 20 voegen elf aanvullende relaties toe, Helmduinen drie, de Kikkervalleienbegrazing drie, het Kikkervalleien-bodemherstel drie, de Kikkervalleien-infrastructuuringreep drie, de Watercrassulabestrijding drie, Parnassiapad 2 één en de konijnenbijplaatsingsproef twee. Nog 24 uitvoeringen hebben geen directe plotkoppeling.</w:t>
+        <w:t>Status. Bronvast op project-, uitvoering- en jaarniveau voor de 30 ingevoerde bronnen en 61 uitvoeringen. De algemene kavel- en gebiedsindeling is geometrisch beschikbaar voor de 55 actuele plots uit 2025; vijf expliciet gekoppelde historische kavels hebben geen afzonderlijke geometrie. De bronvaste plot-jaarlaag bevat 148 regels voor 1967–1969, 1972–1975, 1988–1991, 1993, 1997, 2005–2006 en 2017–2025. Zes uitvoeringen zijn via de nameninventaris aan 32 kavelsituaties gekoppeld; Pan 13 en Plas 20 voegen elf aanvullende relaties toe, Helmduinen drie, de Kikkervalleienbegrazing drie, het Kikkervalleien-bodemherstel drie, de Kikkervalleien-infrastructuuringreep drie, de Watercrassulabestrijding drie, Parnassiapad 2 één, Parnassiapad 1 één en de konijnenbijplaatsingsproef twee. Nog 23 uitvoeringen hebben geen directe plotkoppeling.</w:t>
       </w:r>
     </w:p>
     <w:p>

</xml_diff>

<commit_message>
Koppel slibverwijdering Plas 8.4.2 aan M32
</commit_message>
<xml_diff>
--- a/docs/MEIJENDEL_BRONREGISTER.docx
+++ b/docs/MEIJENDEL_BRONREGISTER.docx
@@ -21,7 +21,7 @@
           <w:b/>
           <w:bCs/>
         </w:rPr>
-        <w:t xml:space="preserve">Stand: 14 oktober 2026.</w:t>
+        <w:t xml:space="preserve">Stand: 15 oktober 2026.</w:t>
       </w:r>
     </w:p>
     <w:p>
@@ -316,7 +316,21 @@
         <w:pStyle w:val="BodyText"/>
       </w:pPr>
       <w:r>
-        <w:t xml:space="preserve">De aanvulling maakt overeenkomsten tussen bronnen vindbaar. In twee stappen hebben 2.509 bestaande registraties alsnog een primaire soortgroep gekregen, waarvan 1.226 in de laatste stap. Alle 87 eerder onopgeloste PQ-naamteksten uit 1981–2025 zijn onderbouwd met code, wetenschappelijke en Nederlandse naam uit Floranld_2020. Deze openbare Turboveg-referentielijst, aangeboden op 10 maart 2026 via www.synbiosys.alterra.nl/turboveg/, bevat 17.468 codes. De oorspronkelijke PQ-waarden en eerdere besluiten blijven behouden.</w:t>
+        <w:t xml:space="preserve">De aanvulling maakt overeenkomsten tussen bronnen vindbaar. In twee stappen hebben 2.509 bestaande registraties alsnog een primaire soortgroep gekregen, waarvan 1.226 in de laatste stap. Alle 87 eerder onopgeloste PQ-naamteksten uit 1981–2025 zijn onderbouwd met code, wetenschappelijke en Nederlandse naam uit Floranld_2020. Deze openbare Turboveg-referentielijst, aangeboden op 10 maart 2026 via</w:t>
+      </w:r>
+      <w:r>
+        <w:t xml:space="preserve"> </w:t>
+      </w:r>
+      <w:hyperlink r:id="rId11">
+        <w:r>
+          <w:rPr>
+            <w:rStyle w:val="Hyperlink"/>
+          </w:rPr>
+          <w:t xml:space="preserve">www.synbiosys.alterra.nl/turboveg/</w:t>
+        </w:r>
+      </w:hyperlink>
+      <w:r>
+        <w:t xml:space="preserve">, bevat 17.468 codes. De oorspronkelijke PQ-waarden en eerdere besluiten blijven behouden.</w:t>
       </w:r>
     </w:p>
     <w:p>
@@ -355,11 +369,11 @@
       <w:pPr>
         <w:pStyle w:val="Heading2"/>
       </w:pPr>
-      <w:bookmarkStart w:id="11" w:name="_4a53154a1633e588416373f70b0c468114c0efc"/>
+      <w:bookmarkStart w:id="12" w:name="_4a53154a1633e588416373f70b0c468114c0efc"/>
       <w:r>
         <w:t xml:space="preserve">Overkoepelende analysegeschiktheid</w:t>
       </w:r>
-      <w:bookmarkEnd w:id="11"/>
+      <w:bookmarkEnd w:id="12"/>
     </w:p>
     <w:p>
       <w:pPr>
@@ -711,11 +725,11 @@
       <w:pPr>
         <w:pStyle w:val="Heading2"/>
       </w:pPr>
-      <w:bookmarkStart w:id="12" w:name="_beheerregel"/>
+      <w:bookmarkStart w:id="13" w:name="_beheerregel"/>
       <w:r>
         <w:t xml:space="preserve">Beheerregel</w:t>
       </w:r>
-      <w:bookmarkEnd w:id="12"/>
+      <w:bookmarkEnd w:id="13"/>
     </w:p>
     <w:p>
       <w:pPr>
@@ -729,7 +743,7 @@
       <w:pPr>
         <w:pStyle w:val="Heading2"/>
       </w:pPr>
-      <w:bookmarkStart w:id="13" w:name="_7243eacc1b8f4fc7d12d9437ed06490b9a892ca"/>
+      <w:bookmarkStart w:id="14" w:name="_c07dfd40f027bce65d2d0499dc5da8ab7f6fd0f"/>
       <w:r>
         <w:t xml:space="preserve">1. Bronnen in MySQL-database</w:t>
       </w:r>
@@ -742,17 +756,17 @@
         </w:rPr>
         <w:t xml:space="preserve">Meijendel</w:t>
       </w:r>
-      <w:bookmarkEnd w:id="13"/>
+      <w:bookmarkEnd w:id="14"/>
     </w:p>
     <w:p>
       <w:pPr>
         <w:pStyle w:val="Heading3"/>
       </w:pPr>
-      <w:bookmarkStart w:id="14" w:name="_ccd8cb4345e3f59364194a2576f706cc2c0a66e"/>
+      <w:bookmarkStart w:id="15" w:name="_32ab8fbd5be08d3f325e2553cd15813ff7e9c1f"/>
       <w:r>
         <w:t xml:space="preserve">1.1. Vogelgegevens van Vogelwerkgroep Meijendel en SOVON</w:t>
       </w:r>
-      <w:bookmarkEnd w:id="14"/>
+      <w:bookmarkEnd w:id="15"/>
     </w:p>
     <w:p>
       <w:pPr>
@@ -864,7 +878,7 @@
         <w:t xml:space="preserve"> </w:t>
       </w:r>
       <w:r>
-        <w:t xml:space="preserve">staan; omgekeerd ontbreekt geen bestaande SOVON-bron-ID in de nieuwe levering. Bij 2.629 gedeelde bron-ID’s levert SOVON broedcode 0 terwijl de database</w:t>
+        <w:t xml:space="preserve">staan; omgekeerd ontbreekt geen bestaande SOVON-bron-ID in de nieuwe levering. Bij 2.629 gedeelde bron-ID's levert SOVON broedcode 0 terwijl de database</w:t>
       </w:r>
       <w:r>
         <w:t xml:space="preserve"> </w:t>
@@ -981,7 +995,7 @@
         <w:t xml:space="preserve">jrvslg_m</w:t>
       </w:r>
       <w:r>
-        <w:t xml:space="preserve">-resultaat in de volledige jaarverslagreeks 1958-2025. Als zo’n soort in een geteld jaarverslagplot ontbreekt, wordt de soort-plotjaarcombinatie als nul behandeld; het is niet vereist dat de soort in hetzelfde kalenderjaar elders is vastgesteld. Deze waarde is geen letterlijke bronnul, krijgt daarom de status</w:t>
+        <w:t xml:space="preserve">-resultaat in de volledige jaarverslagreeks 1958-2025. Als zo'n soort in een geteld jaarverslagplot ontbreekt, wordt de soort-plotjaarcombinatie als nul behandeld; het is niet vereist dat de soort in hetzelfde kalenderjaar elders is vastgesteld. Deze waarde is geen letterlijke bronnul, krijgt daarom de status</w:t>
       </w:r>
       <w:r>
         <w:t xml:space="preserve"> </w:t>
@@ -2162,7 +2176,7 @@
         <w:t xml:space="preserve"> </w:t>
       </w:r>
       <w:r>
-        <w:t xml:space="preserve">blijft voor meeuwen leidend; zonder zo’n regel mag de SOVON-waarde aanvullen of corrigeren. Een ontbrekende teller mag vanuit het jaarverslag worden toegevoegd wanneer kavel en waarnemer ondubbelzinnig zijn en een bestaande code beschikbaar is. De Horsten wordt volledig genegeerd. Niet-conflicterende letterlijke SOVON-nullen worden zonder nieuwe jaarbeslissing opgenomen; niet tot individuele bronregels herleidbare aggregaatvermeldingen worden niet als formeel afgekeurde waarnemingen gereconstrueerd. Ieder jaar wordt eerst volledig vergeleken. Nieuwe soortenconflicten, nieuwe gegevensmodellen en wel individueel herleidbare afkeuringsinformatie blijven afzonderlijke beslispunten.</w:t>
+        <w:t xml:space="preserve">blijft voor meeuwen leidend; zonder zo'n regel mag de SOVON-waarde aanvullen of corrigeren. Een ontbrekende teller mag vanuit het jaarverslag worden toegevoegd wanneer kavel en waarnemer ondubbelzinnig zijn en een bestaande code beschikbaar is. De Horsten wordt volledig genegeerd. Niet-conflicterende letterlijke SOVON-nullen worden zonder nieuwe jaarbeslissing opgenomen; niet tot individuele bronregels herleidbare aggregaatvermeldingen worden niet als formeel afgekeurde waarnemingen gereconstrueerd. Ieder jaar wordt eerst volledig vergeleken. Nieuwe soortenconflicten, nieuwe gegevensmodellen en wel individueel herleidbare afkeuringsinformatie blijven afzonderlijke beslispunten.</w:t>
       </w:r>
     </w:p>
     <w:p>
@@ -3078,11 +3092,11 @@
       <w:pPr>
         <w:pStyle w:val="Heading3"/>
       </w:pPr>
-      <w:bookmarkStart w:id="15" w:name="_8a72a17aa3ecdd9f667bccd1a9ca55413034b5d"/>
+      <w:bookmarkStart w:id="16" w:name="_9645acbfea6b379f23d12aeedc36c987000825a"/>
       <w:r>
         <w:t xml:space="preserve">1.2. Provinciale permanente kwadraten</w:t>
       </w:r>
-      <w:bookmarkEnd w:id="15"/>
+      <w:bookmarkEnd w:id="16"/>
     </w:p>
     <w:p>
       <w:pPr>
@@ -3208,11 +3222,11 @@
       <w:pPr>
         <w:pStyle w:val="Heading3"/>
       </w:pPr>
-      <w:bookmarkStart w:id="16" w:name="_ded6c184b9a569c146345b6e935b052f391caf7"/>
+      <w:bookmarkStart w:id="17" w:name="_58edaa7a0159e378417d8d9e2f3abf27d746f4f"/>
       <w:r>
         <w:t xml:space="preserve">1.3. Zoogdieren tijdens SOVON- en VWG-bezoeken</w:t>
       </w:r>
-      <w:bookmarkEnd w:id="16"/>
+      <w:bookmarkEnd w:id="17"/>
     </w:p>
     <w:p>
       <w:pPr>
@@ -3423,11 +3437,11 @@
       <w:pPr>
         <w:pStyle w:val="Heading3"/>
       </w:pPr>
-      <w:bookmarkStart w:id="17" w:name="_94090b81dff39a8cf27d4389271118caece3ef6"/>
+      <w:bookmarkStart w:id="18" w:name="_d3fb9a25da94fa35cd3895c324ae264efa6b6ce"/>
       <w:r>
         <w:t xml:space="preserve">1.4. Historisch vangblikonderzoek</w:t>
       </w:r>
-      <w:bookmarkEnd w:id="17"/>
+      <w:bookmarkEnd w:id="18"/>
     </w:p>
     <w:p>
       <w:pPr>
@@ -3483,7 +3497,7 @@
       <w:r>
         <w:t xml:space="preserve"> </w:t>
       </w:r>
-      <w:hyperlink r:id="rId18">
+      <w:hyperlink r:id="rId19">
         <w:r>
           <w:rPr>
             <w:rStyle w:val="Hyperlink"/>
@@ -3568,11 +3582,11 @@
       <w:pPr>
         <w:pStyle w:val="Heading3"/>
       </w:pPr>
-      <w:bookmarkStart w:id="19" w:name="_003d1b4454050d8b2300662d18ee0e6097f4328"/>
+      <w:bookmarkStart w:id="20" w:name="_05a7f9ed9696b113895f0c60145ad70b98b3ccf"/>
       <w:r>
         <w:t xml:space="preserve">1.5. NDFF: één canonieke laag van openbare en beveiligde gegevens</w:t>
       </w:r>
-      <w:bookmarkEnd w:id="19"/>
+      <w:bookmarkEnd w:id="20"/>
     </w:p>
     <w:p>
       <w:pPr>
@@ -3650,11 +3664,11 @@
       <w:pPr>
         <w:pStyle w:val="Heading4"/>
       </w:pPr>
-      <w:bookmarkStart w:id="20" w:name="_dagvlinders"/>
+      <w:bookmarkStart w:id="21" w:name="_f2f5e1637d9b0d825d88db49318fbe09fe4562d"/>
       <w:r>
         <w:t xml:space="preserve">1.5.1. Dagvlinders</w:t>
       </w:r>
-      <w:bookmarkEnd w:id="20"/>
+      <w:bookmarkEnd w:id="21"/>
     </w:p>
     <w:p>
       <w:pPr>
@@ -3714,11 +3728,11 @@
       <w:pPr>
         <w:pStyle w:val="Heading4"/>
       </w:pPr>
-      <w:bookmarkStart w:id="21" w:name="_hommels"/>
+      <w:bookmarkStart w:id="22" w:name="_ab588a339567fbeba82f7ca9f0ef20022ceaf38"/>
       <w:r>
         <w:t xml:space="preserve">1.5.2. Hommels</w:t>
       </w:r>
-      <w:bookmarkEnd w:id="21"/>
+      <w:bookmarkEnd w:id="22"/>
     </w:p>
     <w:p>
       <w:pPr>
@@ -3778,11 +3792,11 @@
       <w:pPr>
         <w:pStyle w:val="Heading4"/>
       </w:pPr>
-      <w:bookmarkStart w:id="22" w:name="_libellen"/>
+      <w:bookmarkStart w:id="23" w:name="_5eeebc0b3ea39369efcb9361b685b51ab379390"/>
       <w:r>
         <w:t xml:space="preserve">1.5.3. Libellen</w:t>
       </w:r>
-      <w:bookmarkEnd w:id="22"/>
+      <w:bookmarkEnd w:id="23"/>
     </w:p>
     <w:p>
       <w:pPr>
@@ -3842,11 +3856,11 @@
       <w:pPr>
         <w:pStyle w:val="Heading4"/>
       </w:pPr>
-      <w:bookmarkStart w:id="23" w:name="_nachtvlinders"/>
+      <w:bookmarkStart w:id="24" w:name="_f7f75bff85528639d3a54437d815ffc982ac078"/>
       <w:r>
         <w:t xml:space="preserve">1.5.4. Nachtvlinders</w:t>
       </w:r>
-      <w:bookmarkEnd w:id="23"/>
+      <w:bookmarkEnd w:id="24"/>
     </w:p>
     <w:p>
       <w:pPr>
@@ -3906,11 +3920,11 @@
       <w:pPr>
         <w:pStyle w:val="Heading4"/>
       </w:pPr>
-      <w:bookmarkStart w:id="24" w:name="_amfibieën"/>
+      <w:bookmarkStart w:id="25" w:name="_5952ec78f96e716985cfd2bef0c6dea751da098"/>
       <w:r>
         <w:t xml:space="preserve">1.5.5. Amfibieën</w:t>
       </w:r>
-      <w:bookmarkEnd w:id="24"/>
+      <w:bookmarkEnd w:id="25"/>
     </w:p>
     <w:p>
       <w:pPr>
@@ -3970,11 +3984,11 @@
       <w:pPr>
         <w:pStyle w:val="Heading4"/>
       </w:pPr>
-      <w:bookmarkStart w:id="25" w:name="_reptielen"/>
+      <w:bookmarkStart w:id="26" w:name="_f98973ac0b4b22a8147264cf6fda7ae2d1f2584"/>
       <w:r>
         <w:t xml:space="preserve">1.5.6. Reptielen</w:t>
       </w:r>
-      <w:bookmarkEnd w:id="25"/>
+      <w:bookmarkEnd w:id="26"/>
     </w:p>
     <w:p>
       <w:pPr>
@@ -4034,11 +4048,11 @@
       <w:pPr>
         <w:pStyle w:val="Heading4"/>
       </w:pPr>
-      <w:bookmarkStart w:id="26" w:name="_vissen"/>
+      <w:bookmarkStart w:id="27" w:name="_9ffbbed58a474302bc88f9b6483937563542adc"/>
       <w:r>
         <w:t xml:space="preserve">1.5.7. Vissen</w:t>
       </w:r>
-      <w:bookmarkEnd w:id="26"/>
+      <w:bookmarkEnd w:id="27"/>
     </w:p>
     <w:p>
       <w:pPr>
@@ -4098,11 +4112,11 @@
       <w:pPr>
         <w:pStyle w:val="Heading4"/>
       </w:pPr>
-      <w:bookmarkStart w:id="27" w:name="_vleermuistransecten"/>
+      <w:bookmarkStart w:id="28" w:name="_90b1412457ba2ad39675de54e16fb4052a9af96"/>
       <w:r>
         <w:t xml:space="preserve">1.5.8. Vleermuistransecten</w:t>
       </w:r>
-      <w:bookmarkEnd w:id="27"/>
+      <w:bookmarkEnd w:id="28"/>
     </w:p>
     <w:p>
       <w:pPr>
@@ -4162,11 +4176,11 @@
       <w:pPr>
         <w:pStyle w:val="Heading4"/>
       </w:pPr>
-      <w:bookmarkStart w:id="28" w:name="_38cdc6eff084869e7169beb9a7d0a36448859a3"/>
+      <w:bookmarkStart w:id="29" w:name="_0bf7c6d2026ffa63b6182a76ed7ab201ef2ca1a"/>
       <w:r>
         <w:t xml:space="preserve">1.5.9. Konijnentellingen in de duinen</w:t>
       </w:r>
-      <w:bookmarkEnd w:id="28"/>
+      <w:bookmarkEnd w:id="29"/>
     </w:p>
     <w:p>
       <w:pPr>
@@ -4226,11 +4240,11 @@
       <w:pPr>
         <w:pStyle w:val="Heading4"/>
       </w:pPr>
-      <w:bookmarkStart w:id="29" w:name="_b7507ab25f19a705cdaea288841b95e0326cd82"/>
+      <w:bookmarkStart w:id="30" w:name="_d64910a2091f56dedd2aaa5a75994d38ec4c969"/>
       <w:r>
         <w:t xml:space="preserve">1.5.10. Wintertellingen vleermuizen</w:t>
       </w:r>
-      <w:bookmarkEnd w:id="29"/>
+      <w:bookmarkEnd w:id="30"/>
     </w:p>
     <w:p>
       <w:pPr>
@@ -4290,11 +4304,11 @@
       <w:pPr>
         <w:pStyle w:val="Heading4"/>
       </w:pPr>
-      <w:bookmarkStart w:id="30" w:name="_ba761ed76f0837e5aa40881d1ff3dfd4f2a2564"/>
+      <w:bookmarkStart w:id="31" w:name="_9cec44656db08bd57f600992eaa74a526d260b3"/>
       <w:r>
         <w:t xml:space="preserve">1.5.11. Het Nieuwe Strepen</w:t>
       </w:r>
-      <w:bookmarkEnd w:id="30"/>
+      <w:bookmarkEnd w:id="31"/>
     </w:p>
     <w:p>
       <w:pPr>
@@ -4329,7 +4343,7 @@
         <w:t xml:space="preserve"> </w:t>
       </w:r>
       <w:r>
-        <w:t xml:space="preserve">Op 6 oktober 2026 meldde FLORON dat één kalenderdag in één kilometerhok als telling mag worden beschouwd. Zo’n telling kan één, twee of drie oorspronkelijke lijsten omvatten. Persoonsgegevens en daarvan afgeleide waarnemerscodes worden niet geleverd. De</w:t>
+        <w:t xml:space="preserve">Op 6 oktober 2026 meldde FLORON dat één kalenderdag in één kilometerhok als telling mag worden beschouwd. Zo'n telling kan één, twee of drie oorspronkelijke lijsten omvatten. Persoonsgegevens en daarvan afgeleide waarnemerscodes worden niet geleverd. De</w:t>
       </w:r>
       <w:r>
         <w:t xml:space="preserve"> </w:t>
@@ -4432,11 +4446,11 @@
       <w:pPr>
         <w:pStyle w:val="Heading4"/>
       </w:pPr>
-      <w:bookmarkStart w:id="31" w:name="_add682eaf9770b54759a1b54720dedd522bc07f"/>
+      <w:bookmarkStart w:id="32" w:name="_c056d2025de29c95bc511421c5f5e41469354eb"/>
       <w:r>
         <w:t xml:space="preserve">1.5.12. FLORBASE en andere vaatplantinventarisaties</w:t>
       </w:r>
-      <w:bookmarkEnd w:id="31"/>
+      <w:bookmarkEnd w:id="32"/>
     </w:p>
     <w:p>
       <w:pPr>
@@ -4471,7 +4485,7 @@
         <w:t xml:space="preserve"> </w:t>
       </w:r>
       <w:r>
-        <w:t xml:space="preserve">Eén jaar in één kilometerhok is de fijnste beschikbare teleenheid. Voor 2011 werden alleen soort, jaar, kilometerhok en waarnemer opgeslagen. FLORON beschikt niet over de eerder gevraagde lijst-ID’s, volledigheidsvlaggen, bezoekdata, bezoekduur, checklistversies of expliciete registraties van niet-aangetroffen soorten.</w:t>
+        <w:t xml:space="preserve">Eén jaar in één kilometerhok is de fijnste beschikbare teleenheid. Voor 2011 werden alleen soort, jaar, kilometerhok en waarnemer opgeslagen. FLORON beschikt niet over de eerder gevraagde lijst-ID's, volledigheidsvlaggen, bezoekdata, bezoekduur, checklistversies of expliciete registraties van niet-aangetroffen soorten.</w:t>
       </w:r>
     </w:p>
     <w:p>
@@ -4496,11 +4510,11 @@
       <w:pPr>
         <w:pStyle w:val="Heading4"/>
       </w:pPr>
-      <w:bookmarkStart w:id="32" w:name="_ddc09a389d1414cf9c368e3f96b3cd144167922"/>
+      <w:bookmarkStart w:id="33" w:name="_b2fbeb28e0a334b9e6cb93232c4d845faf48221"/>
       <w:r>
         <w:t xml:space="preserve">1.5.13. LMF-aandachtssoorten</w:t>
       </w:r>
-      <w:bookmarkEnd w:id="32"/>
+      <w:bookmarkEnd w:id="33"/>
     </w:p>
     <w:p>
       <w:pPr>
@@ -4701,11 +4715,11 @@
       <w:pPr>
         <w:pStyle w:val="Heading4"/>
       </w:pPr>
-      <w:bookmarkStart w:id="33" w:name="_54b0c9881ebf1c9c32ceb4f54ebc7dcb81d8783"/>
+      <w:bookmarkStart w:id="34" w:name="_0ce2ec4e8b5503e251897e5490450ca2d9e0742"/>
       <w:r>
         <w:t xml:space="preserve">1.5.14. Mossen en korstmossen</w:t>
       </w:r>
-      <w:bookmarkEnd w:id="33"/>
+      <w:bookmarkEnd w:id="34"/>
     </w:p>
     <w:p>
       <w:pPr>
@@ -4829,11 +4843,11 @@
       <w:pPr>
         <w:pStyle w:val="Heading4"/>
       </w:pPr>
-      <w:bookmarkStart w:id="34" w:name="_1bea655362975aef3d944c226fffca3cc18312c"/>
+      <w:bookmarkStart w:id="35" w:name="_339fafe251367982d6218746f16721a93fa7f70"/>
       <w:r>
         <w:t xml:space="preserve">1.5.15. Bos- en zeereeppaddenstoelen</w:t>
       </w:r>
-      <w:bookmarkEnd w:id="34"/>
+      <w:bookmarkEnd w:id="35"/>
     </w:p>
     <w:p>
       <w:pPr>
@@ -4893,11 +4907,11 @@
       <w:pPr>
         <w:pStyle w:val="Heading4"/>
       </w:pPr>
-      <w:bookmarkStart w:id="35" w:name="_weekdieren"/>
+      <w:bookmarkStart w:id="36" w:name="_342bae7ae5afae546f17223888206446d449411"/>
       <w:r>
         <w:t xml:space="preserve">1.5.16. Weekdieren</w:t>
       </w:r>
-      <w:bookmarkEnd w:id="35"/>
+      <w:bookmarkEnd w:id="36"/>
     </w:p>
     <w:p>
       <w:pPr>
@@ -4957,11 +4971,11 @@
       <w:pPr>
         <w:pStyle w:val="Heading4"/>
       </w:pPr>
-      <w:bookmarkStart w:id="36" w:name="_1879253ee2dfd52031c9d63749e2737783da88e"/>
+      <w:bookmarkStart w:id="37" w:name="_cc11e4dda0fa9b87cf2613be17ff277804bdc91"/>
       <w:r>
         <w:t xml:space="preserve">1.5.17. SNL-gebiedsmonitoring</w:t>
       </w:r>
-      <w:bookmarkEnd w:id="36"/>
+      <w:bookmarkEnd w:id="37"/>
     </w:p>
     <w:p>
       <w:pPr>
@@ -5029,11 +5043,11 @@
       <w:pPr>
         <w:pStyle w:val="Heading3"/>
       </w:pPr>
-      <w:bookmarkStart w:id="37" w:name="_3dde7cd9c0fbcfd44f499ab6a6ef5cfd62b0862"/>
+      <w:bookmarkStart w:id="38" w:name="_77733873953f7250a44afc39ac6f33e9c0fface"/>
       <w:r>
         <w:t xml:space="preserve">1.6. Openbare externe ecologiebronnen</w:t>
       </w:r>
-      <w:bookmarkEnd w:id="37"/>
+      <w:bookmarkEnd w:id="38"/>
     </w:p>
     <w:p>
       <w:pPr>
@@ -5053,7 +5067,7 @@
       <w:r>
         <w:t xml:space="preserve"> </w:t>
       </w:r>
-      <w:hyperlink r:id="rId38">
+      <w:hyperlink r:id="rId39">
         <w:r>
           <w:rPr>
             <w:rStyle w:val="Hyperlink"/>
@@ -5247,7 +5261,7 @@
       <w:r>
         <w:t xml:space="preserve"> </w:t>
       </w:r>
-      <w:hyperlink r:id="rId39">
+      <w:hyperlink r:id="rId40">
         <w:r>
           <w:rPr>
             <w:rStyle w:val="Hyperlink"/>
@@ -5263,11 +5277,11 @@
       <w:pPr>
         <w:pStyle w:val="Heading4"/>
       </w:pPr>
-      <w:bookmarkStart w:id="40" w:name="_9c98e6e0799dea8eed6786abf4e9090b0506343"/>
+      <w:bookmarkStart w:id="41" w:name="_aa03dabe850e534118471d9a4587f103d7cc6d0"/>
       <w:r>
         <w:t xml:space="preserve">1.6.1. STOWA Limnodata</w:t>
       </w:r>
-      <w:bookmarkEnd w:id="40"/>
+      <w:bookmarkEnd w:id="41"/>
     </w:p>
     <w:p>
       <w:pPr>
@@ -5351,11 +5365,11 @@
       <w:pPr>
         <w:pStyle w:val="Heading4"/>
       </w:pPr>
-      <w:bookmarkStart w:id="41" w:name="_7810a275271da51e128daf1eadaca77f875310a"/>
+      <w:bookmarkStart w:id="42" w:name="_e9b446960bca12075cdde30af1cbaf73f645a87"/>
       <w:r>
         <w:t xml:space="preserve">1.6.2. ENDURE helmduinfauna</w:t>
       </w:r>
-      <w:bookmarkEnd w:id="41"/>
+      <w:bookmarkEnd w:id="42"/>
     </w:p>
     <w:p>
       <w:pPr>
@@ -5415,11 +5429,11 @@
       <w:pPr>
         <w:pStyle w:val="Heading4"/>
       </w:pPr>
-      <w:bookmarkStart w:id="42" w:name="_5a504ff8abd850ffc7704ce23c8f7bb19f98000"/>
+      <w:bookmarkStart w:id="43" w:name="_0079604d46da30ac9b5828c2b6c106eff7cd8f8"/>
       <w:r>
         <w:t xml:space="preserve">1.6.3. Landelijke Vegetatie Databank</w:t>
       </w:r>
-      <w:bookmarkEnd w:id="42"/>
+      <w:bookmarkEnd w:id="43"/>
     </w:p>
     <w:p>
       <w:pPr>
@@ -5668,11 +5682,11 @@
       <w:pPr>
         <w:pStyle w:val="Heading4"/>
       </w:pPr>
-      <w:bookmarkStart w:id="43" w:name="_a4b8938f650cad67af8384aa358648ef6881db5"/>
+      <w:bookmarkStart w:id="44" w:name="_a66e2be297c2cf82b37e3e4b59e101c55a2b789"/>
       <w:r>
         <w:t xml:space="preserve">1.6.4. Historische vlinder- en motcollectie</w:t>
       </w:r>
-      <w:bookmarkEnd w:id="43"/>
+      <w:bookmarkEnd w:id="44"/>
     </w:p>
     <w:p>
       <w:pPr>
@@ -5732,11 +5746,11 @@
       <w:pPr>
         <w:pStyle w:val="Heading4"/>
       </w:pPr>
-      <w:bookmarkStart w:id="44" w:name="_b06cb21dbe9ca56883ae8ed5d3f986798494e94"/>
+      <w:bookmarkStart w:id="45" w:name="_0623f0a4d9ecb153e84d6aa679ad58f6c310383"/>
       <w:r>
         <w:t xml:space="preserve">1.6.5. Naturalis Botany</w:t>
       </w:r>
-      <w:bookmarkEnd w:id="44"/>
+      <w:bookmarkEnd w:id="45"/>
     </w:p>
     <w:p>
       <w:pPr>
@@ -5796,11 +5810,11 @@
       <w:pPr>
         <w:pStyle w:val="Heading4"/>
       </w:pPr>
-      <w:bookmarkStart w:id="45" w:name="_335dc587b878851a017369d1c1c7e74fa2018ad"/>
+      <w:bookmarkStart w:id="46" w:name="_dd278617f9613de433492781e9679e24605d2f3"/>
       <w:r>
         <w:t xml:space="preserve">1.6.6. Naturalis Coleoptera</w:t>
       </w:r>
-      <w:bookmarkEnd w:id="45"/>
+      <w:bookmarkEnd w:id="46"/>
     </w:p>
     <w:p>
       <w:pPr>
@@ -5860,11 +5874,11 @@
       <w:pPr>
         <w:pStyle w:val="Heading3"/>
       </w:pPr>
-      <w:bookmarkStart w:id="46" w:name="_5d611a31ac68a696fd179c2c85c282500afefc7"/>
+      <w:bookmarkStart w:id="47" w:name="_4dcded00268e6461b0ddc34253d4faf52bf1dd1"/>
       <w:r>
         <w:t xml:space="preserve">1.7. Openstaande ruimtelijke toelatingscontrole</w:t>
       </w:r>
-      <w:bookmarkEnd w:id="46"/>
+      <w:bookmarkEnd w:id="47"/>
     </w:p>
     <w:p>
       <w:pPr>
@@ -5898,11 +5912,11 @@
       <w:pPr>
         <w:pStyle w:val="Heading3"/>
       </w:pPr>
-      <w:bookmarkStart w:id="47" w:name="_6e396c95ed446dc595f32661c45d91742a47fe5"/>
+      <w:bookmarkStart w:id="48" w:name="_14c58f11b78e283997281ebde92c6b31ebc0c80"/>
       <w:r>
         <w:t xml:space="preserve">1.8. Verklarende omgevingslagen</w:t>
       </w:r>
-      <w:bookmarkEnd w:id="47"/>
+      <w:bookmarkEnd w:id="48"/>
     </w:p>
     <w:p>
       <w:pPr>
@@ -5916,11 +5930,11 @@
       <w:pPr>
         <w:pStyle w:val="Heading4"/>
       </w:pPr>
-      <w:bookmarkStart w:id="48" w:name="_bb0c62bd471c774923f07d8b7b6f705ce2e805a"/>
+      <w:bookmarkStart w:id="49" w:name="_97e37a83ef92e6db79e0a815abf4c3d8d6d1754"/>
       <w:r>
         <w:t xml:space="preserve">1.8.1. Dagelijks weer</w:t>
       </w:r>
-      <w:bookmarkEnd w:id="48"/>
+      <w:bookmarkEnd w:id="49"/>
     </w:p>
     <w:p>
       <w:pPr>
@@ -5980,11 +5994,11 @@
       <w:pPr>
         <w:pStyle w:val="Heading4"/>
       </w:pPr>
-      <w:bookmarkStart w:id="49" w:name="_hoogte"/>
+      <w:bookmarkStart w:id="50" w:name="_625608f018b59d28869e33232003bd07c2f07d5"/>
       <w:r>
         <w:t xml:space="preserve">1.8.2. Hoogte</w:t>
       </w:r>
-      <w:bookmarkEnd w:id="49"/>
+      <w:bookmarkEnd w:id="50"/>
     </w:p>
     <w:p>
       <w:pPr>
@@ -6044,11 +6058,11 @@
       <w:pPr>
         <w:pStyle w:val="Heading4"/>
       </w:pPr>
-      <w:bookmarkStart w:id="50" w:name="_stikstofdepositie"/>
+      <w:bookmarkStart w:id="51" w:name="_8ebc62c1d17a2d7a08504bddffeeb5916a0bcb3"/>
       <w:r>
         <w:t xml:space="preserve">1.8.3. Stikstofdepositie</w:t>
       </w:r>
-      <w:bookmarkEnd w:id="50"/>
+      <w:bookmarkEnd w:id="51"/>
     </w:p>
     <w:p>
       <w:pPr>
@@ -6108,11 +6122,11 @@
       <w:pPr>
         <w:pStyle w:val="Heading4"/>
       </w:pPr>
-      <w:bookmarkStart w:id="51" w:name="_bodemgebruik"/>
+      <w:bookmarkStart w:id="52" w:name="_972156668716d33d6f7bf93cdaf573c7928edca"/>
       <w:r>
         <w:t xml:space="preserve">1.8.4. Bodemgebruik</w:t>
       </w:r>
-      <w:bookmarkEnd w:id="51"/>
+      <w:bookmarkEnd w:id="52"/>
     </w:p>
     <w:p>
       <w:pPr>
@@ -6172,11 +6186,11 @@
       <w:pPr>
         <w:pStyle w:val="Heading4"/>
       </w:pPr>
-      <w:bookmarkStart w:id="52" w:name="_6205564c333359604d547302ef9994dbae8e150"/>
+      <w:bookmarkStart w:id="53" w:name="_92770fc640c1bb2fd0ffeda71d68ce2650b46be"/>
       <w:r>
         <w:t xml:space="preserve">1.8.5. Natura 2000-habitat</w:t>
       </w:r>
-      <w:bookmarkEnd w:id="52"/>
+      <w:bookmarkEnd w:id="53"/>
     </w:p>
     <w:p>
       <w:pPr>
@@ -6236,11 +6250,11 @@
       <w:pPr>
         <w:pStyle w:val="Heading3"/>
       </w:pPr>
-      <w:bookmarkStart w:id="53" w:name="_55651eaef6a7220015a2870e55a9e8e9e62256a"/>
+      <w:bookmarkStart w:id="54" w:name="_f1f9cc3f4e7e57e7e99ffc1d85334cce67c3650"/>
       <w:r>
         <w:t xml:space="preserve">1.9. Werkzaamheden en beheermaatregelen</w:t>
       </w:r>
-      <w:bookmarkEnd w:id="53"/>
+      <w:bookmarkEnd w:id="54"/>
     </w:p>
     <w:p>
       <w:pPr>
@@ -6289,7 +6303,7 @@
         <w:t xml:space="preserve">.xls</w:t>
       </w:r>
       <w:r>
-        <w:t xml:space="preserve">-protocollen voor vleermuisonderzoek uit 2009–2013 en vier als PDF geregistreerde bestanden die feitelijk HTML-landingspagina’s waren. De vijf protocollen beschrijven onderzoeksformulieren, geen uitgevoerde terreinmaatregelen. De vier landingspagina’s zijn niet als inhoudelijk geraadpleegd document behandeld.</w:t>
+        <w:t xml:space="preserve">-protocollen voor vleermuisonderzoek uit 2009–2013 en vier als PDF geregistreerde bestanden die feitelijk HTML-landingspagina's waren. De vijf protocollen beschrijven onderzoeksformulieren, geen uitgevoerde terreinmaatregelen. De vier landingspagina's zijn niet als inhoudelijk geraadpleegd document behandeld.</w:t>
       </w:r>
     </w:p>
     <w:p>
@@ -6323,7 +6337,7 @@
           <w:i/>
           <w:iCs/>
         </w:rPr>
-        <w:t xml:space="preserve">Holland’s Duinen</w:t>
+        <w:t xml:space="preserve">Holland's Duinen</w:t>
       </w:r>
       <w:r>
         <w:t xml:space="preserve"> </w:t>
@@ -6368,7 +6382,7 @@
         <w:pStyle w:val="BodyText"/>
       </w:pPr>
       <w:r>
-        <w:t xml:space="preserve">Daarbij zijn acht officiële internetbronnen geraadpleegd: vijf Dunea-pagina’s over optimalisatie van de waterwinning, beheer in Meeuwenduin en Prinsenduin, vervanging van slagbomen, actuele werkzaamheden en duindynamiek; het Dunea-jaarverslag 2024; het Zuid-Hollandse subsidie-openstellingsbesluit voor Bendel; en de ODH-beschikking van 28 augustus 2023 voor de konijnenbijplaatsingsproef. De bronnen staan afzonderlijk in</w:t>
+        <w:t xml:space="preserve">Daarbij zijn acht officiële internetbronnen geraadpleegd: vijf Dunea-pagina's over optimalisatie van de waterwinning, beheer in Meeuwenduin en Prinsenduin, vervanging van slagbomen, actuele werkzaamheden en duindynamiek; het Dunea-jaarverslag 2024; het Zuid-Hollandse subsidie-openstellingsbesluit voor Bendel; en de ODH-beschikking van 28 augustus 2023 voor de konijnenbijplaatsingsproef. De bronnen staan afzonderlijk in</w:t>
       </w:r>
       <w:r>
         <w:t xml:space="preserve"> </w:t>
@@ -6460,7 +6474,7 @@
       <w:r>
         <w:t xml:space="preserve"> </w:t>
       </w:r>
-      <w:hyperlink r:id="rId54">
+      <w:hyperlink r:id="rId55">
         <w:r>
           <w:rPr>
             <w:rStyle w:val="Hyperlink"/>
@@ -6519,7 +6533,7 @@
         <w:t xml:space="preserve"> </w:t>
       </w:r>
       <w:r>
-        <w:t xml:space="preserve">bevat 97 geverifieerde directe relaties. Daarvan waren 36 al onderbouwd met expliciete kavelvermeldingen, gebruikersvaststellingen of een bijzondere gebiedsnaam. De nameninventaris voegt 32 geometrische doorsnijdingen toe voor zes volledig en letterlijk gelokaliseerde uitvoeringen met de naamobjecten Kijfhoek, Bierlap, Meeuwenhoek, Tafelberg, ’t Scheepje, Uilenbosch en Oude Rijs uit</w:t>
+        <w:t xml:space="preserve">bevat 99 geverifieerde directe relaties. Daarvan waren 36 al onderbouwd met expliciete kavelvermeldingen, gebruikersvaststellingen of een bijzondere gebiedsnaam. De nameninventaris voegt 32 geometrische doorsnijdingen toe voor zes volledig en letterlijk gelokaliseerde uitvoeringen met de naamobjecten Kijfhoek, Bierlap, Meeuwenhoek, Tafelberg, 't Scheepje, Uilenbosch en Oude Rijs uit</w:t>
       </w:r>
       <w:r>
         <w:t xml:space="preserve"> </w:t>
@@ -6591,7 +6605,7 @@
           <w:i/>
           <w:iCs/>
         </w:rPr>
-        <w:t xml:space="preserve">Holland’s Duinen</w:t>
+        <w:t xml:space="preserve">Holland's Duinen</w:t>
       </w:r>
       <w:r>
         <w:t xml:space="preserve"> </w:t>
@@ -6630,7 +6644,7 @@
           <w:i/>
           <w:iCs/>
         </w:rPr>
-        <w:t xml:space="preserve">Holland’s Duinen</w:t>
+        <w:t xml:space="preserve">Holland's Duinen</w:t>
       </w:r>
       <w:r>
         <w:t xml:space="preserve"> </w:t>
@@ -6684,7 +6698,7 @@
           <w:i/>
           <w:iCs/>
         </w:rPr>
-        <w:t xml:space="preserve">Holland’s Duinen</w:t>
+        <w:t xml:space="preserve">Holland's Duinen</w:t>
       </w:r>
       <w:r>
         <w:t xml:space="preserve"> </w:t>
@@ -6751,7 +6765,7 @@
           <w:i/>
           <w:iCs/>
         </w:rPr>
-        <w:t xml:space="preserve">Holland’s Duinen</w:t>
+        <w:t xml:space="preserve">Holland's Duinen</w:t>
       </w:r>
       <w:r>
         <w:t xml:space="preserve"> </w:t>
@@ -6818,7 +6832,7 @@
           <w:i/>
           <w:iCs/>
         </w:rPr>
-        <w:t xml:space="preserve">Holland’s Duinen</w:t>
+        <w:t xml:space="preserve">Holland's Duinen</w:t>
       </w:r>
       <w:r>
         <w:t xml:space="preserve"> </w:t>
@@ -6858,7 +6872,7 @@
           <w:i/>
           <w:iCs/>
         </w:rPr>
-        <w:t xml:space="preserve">Holland’s Duinen</w:t>
+        <w:t xml:space="preserve">Holland's Duinen</w:t>
       </w:r>
       <w:r>
         <w:t xml:space="preserve"> </w:t>
@@ -6882,7 +6896,7 @@
           <w:i/>
           <w:iCs/>
         </w:rPr>
-        <w:t xml:space="preserve">Holland’s Duinen</w:t>
+        <w:t xml:space="preserve">Holland's Duinen</w:t>
       </w:r>
       <w:r>
         <w:t xml:space="preserve"> </w:t>
@@ -6911,7 +6925,93 @@
         <w:pStyle w:val="BodyText"/>
       </w:pPr>
       <w:r>
-        <w:t>Ton heeft op 14 oktober 2026 ook Parnassiapad 1 gekoppeld aan M15. De primaire publicatie Vegetatieontwikkeling in duinvalleien van Meijendel na opheffen van infiltratieplassen uit 2003 onderscheidt Parnassiapad 1 in tabel 1 als de circa vier jaar eerder geplagde blokken E en F; het uitvoeringsjaar is daarom als circa 1997 vastgelegd. Bijlage A toont de opbouw en oriëntatie van het transect, maar geen kavelgrens of exacte plaggeometrie. De precieze plaggrens binnen M15 is daarom niet bekend en doorsnijding_pct blijft leeg.</w:t>
+        <w:t xml:space="preserve">Ton heeft op 14 oktober 2026 ook Parnassiapad 1 gekoppeld aan M15. De primaire publicatie</w:t>
+      </w:r>
+      <w:r>
+        <w:t xml:space="preserve"> </w:t>
+      </w:r>
+      <w:r>
+        <w:rPr>
+          <w:i/>
+          <w:iCs/>
+        </w:rPr>
+        <w:t xml:space="preserve">Vegetatieontwikkeling in duinvalleien van Meijendel na opheffen van infiltratieplassen</w:t>
+      </w:r>
+      <w:r>
+        <w:t xml:space="preserve"> </w:t>
+      </w:r>
+      <w:r>
+        <w:t xml:space="preserve">uit 2003 onderscheidt Parnassiapad 1 in tabel 1 als de circa vier jaar eerder geplagde blokken E en F; het uitvoeringsjaar is daarom als circa 1997 vastgelegd. Bijlage A toont de opbouw en oriëntatie van het transect, maar geen kavelgrens of exacte plaggeometrie. De precieze plaggrens binnen M15 is daarom niet bekend en</w:t>
+      </w:r>
+      <w:r>
+        <w:t xml:space="preserve"> </w:t>
+      </w:r>
+      <w:r>
+        <w:rPr>
+          <w:rStyle w:val="VerbatimChar"/>
+        </w:rPr>
+        <w:t xml:space="preserve">doorsnijding_pct</w:t>
+      </w:r>
+      <w:r>
+        <w:t xml:space="preserve"> </w:t>
+      </w:r>
+      <w:r>
+        <w:t xml:space="preserve">blijft leeg.</w:t>
+      </w:r>
+    </w:p>
+    <w:p>
+      <w:pPr>
+        <w:pStyle w:val="BodyText"/>
+      </w:pPr>
+      <w:r>
+        <w:t xml:space="preserve">Ton heeft op 15 oktober 2026 Plas 8.4.2 gekoppeld aan M32.</w:t>
+      </w:r>
+      <w:r>
+        <w:t xml:space="preserve"> </w:t>
+      </w:r>
+      <w:r>
+        <w:rPr>
+          <w:i/>
+          <w:iCs/>
+        </w:rPr>
+        <w:t xml:space="preserve">Slibverwijdering infiltratieplassen Meijendel</w:t>
+      </w:r>
+      <w:r>
+        <w:t xml:space="preserve"> </w:t>
+      </w:r>
+      <w:r>
+        <w:t xml:space="preserve">uit</w:t>
+      </w:r>
+      <w:r>
+        <w:t xml:space="preserve"> </w:t>
+      </w:r>
+      <w:r>
+        <w:rPr>
+          <w:i/>
+          <w:iCs/>
+        </w:rPr>
+        <w:t xml:space="preserve">Holland's Duinen</w:t>
+      </w:r>
+      <w:r>
+        <w:t xml:space="preserve"> </w:t>
+      </w:r>
+      <w:r>
+        <w:t xml:space="preserve">46 van april 2005 vermeldt dat deze regelmatig verstopte plas in 2002 opnieuw is uitgebaggerd en toont haar als zuidwestelijke plas van Complex 8. Vergelijking van deze overzichtskaart met de actuele TOP10NL-watergeometrie en SOVON-kavelgeometrie plaatst de volledige plas in M32. De precieze werkvoetafdruk van de slibverwijdering binnen de plas is niet begrensd;</w:t>
+      </w:r>
+      <w:r>
+        <w:t xml:space="preserve"> </w:t>
+      </w:r>
+      <w:r>
+        <w:rPr>
+          <w:rStyle w:val="VerbatimChar"/>
+        </w:rPr>
+        <w:t xml:space="preserve">doorsnijding_pct</w:t>
+      </w:r>
+      <w:r>
+        <w:t xml:space="preserve"> </w:t>
+      </w:r>
+      <w:r>
+        <w:t xml:space="preserve">blijft daarom leeg.</w:t>
       </w:r>
     </w:p>
     <w:p>
@@ -6942,7 +7042,64 @@
         <w:pStyle w:val="BodyText"/>
       </w:pPr>
       <w:r>
-        <w:t>De 98 plotkoppelingen en 84 uitgevoerde jaarregels leveren samen 148 regels in v_plot_jaar_maatregel_bronvast. De nameninventaris voegt 36 plot-jaarrijen toe: begrazing in Kijfhoek en Bierlap in 1990, hervat maaibeheer bij Tafelberg en 't Scheepje in 2025, uitgevoerd maaibeheer in Uilenbosch in 2017–2021 en vogelkersbestrijding in Kijfhoek, Bierlap en Meeuwenhoek in 2020. De aanvullende systeemkoppelingen voegen 22 plot-jaarrijen toe: vier voor de oeveraanpassing van Pan 13 in 1988–1989 en achttien voor drie uitvoeringen in Plas 20 in 2005–2006. De Helmduinen-koppeling voegt drie plot-jaarrijen voor 1991 toe. De uitbreiding van de begrazing met de Kikkervalleien, de eenmalige verwijdering van vegetatie en voedselrijke bovengrond en het verwijderen van leidingen en putten voegen ieder drie plot-jaarrijen voor 1997 toe; Parnassiapad 2 voegt één plot-jaarrij voor M15 in 1993 toe en Parnassiapad 1 één voor M15 in 1997. De Watercrassulabestrijding voegt dertig plot-jaarrijen toe voor M13, M13s en M14 in 2015 en 2017–2025. De konijnenbijplaatsingsproef voegt twee plot-jaarrijen toe voor M8 en M41 in 2024. Voor beide doorlopende begrazingsmaatregelen bewaart deze view alleen het expliciet onderbouwde startjaar; de open einddatum en cycliciteit='doorlopend tot heden' leggen de voortzetting tot en met 2026 vast zonder tussenliggende jaren als afzonderlijke bronbeweringen te construeren. De koppelingen voor de uitbreiding van het begrazingsgebied met Meeuwenhoek en het maaibeheer in Oude Rijs leveren geen uitgevoerde plot-jaarrij, omdat respectievelijk een uitvoeringsjaar ontbreekt en 2025 als niet_uitgevoerd is vastgelegd. Voorlinden levert evenmin een plot-jaarrij omdat de jaarstatus voor 2025 onbekend is.</w:t>
+        <w:t xml:space="preserve">De 99 plotkoppelingen en 84 uitgevoerde jaarregels leveren samen 149 regels in</w:t>
+      </w:r>
+      <w:r>
+        <w:t xml:space="preserve"> </w:t>
+      </w:r>
+      <w:r>
+        <w:rPr>
+          <w:rStyle w:val="VerbatimChar"/>
+        </w:rPr>
+        <w:t xml:space="preserve">v_plot_jaar_maatregel_bronvast</w:t>
+      </w:r>
+      <w:r>
+        <w:t xml:space="preserve">. De nameninventaris voegt 36 plot-jaarrijen toe: begrazing in Kijfhoek en Bierlap in 1990, hervat maaibeheer bij Tafelberg en 't Scheepje in 2025, uitgevoerd maaibeheer in Uilenbosch in 2017–2021 en vogelkersbestrijding in Kijfhoek, Bierlap en Meeuwenhoek in 2020. De aanvullende systeemkoppelingen voegen 22 plot-jaarrijen toe: vier voor de oeveraanpassing van Pan 13 in 1988–1989 en achttien voor drie uitvoeringen in Plas 20 in 2005–2006. De Helmduinen-koppeling voegt drie plot-jaarrijen voor 1991 toe. De uitbreiding van de begrazing met de Kikkervalleien, de eenmalige verwijdering van vegetatie en voedselrijke bovengrond en het verwijderen van leidingen en putten voegen ieder drie plot-jaarrijen voor 1997 toe; Parnassiapad 2 voegt één plot-jaarrij voor M15 in 1993 toe en Parnassiapad 1 één voor M15 in 1997. De Watercrassulabestrijding voegt dertig plot-jaarrijen toe voor M13, M13s en M14 in 2015 en 2017–2025. De konijnenbijplaatsingsproef voegt twee plot-jaarrijen toe voor M8 en M41 in 2024. De koppeling van Plas 8.4.2 aan M32 voegt één plot-jaarrij voor 2002 toe. Voor beide doorlopende begrazingsmaatregelen bewaart deze view alleen het expliciet onderbouwde startjaar; de open einddatum en</w:t>
+      </w:r>
+      <w:r>
+        <w:t xml:space="preserve"> </w:t>
+      </w:r>
+      <w:r>
+        <w:rPr>
+          <w:rStyle w:val="VerbatimChar"/>
+        </w:rPr>
+        <w:t xml:space="preserve">cycliciteit='doorlopend tot heden'</w:t>
+      </w:r>
+      <w:r>
+        <w:t xml:space="preserve"> </w:t>
+      </w:r>
+      <w:r>
+        <w:t xml:space="preserve">leggen de voortzetting tot en met 2026 vast zonder tussenliggende jaren als afzonderlijke bronbeweringen te construeren. De koppelingen voor de uitbreiding van het begrazingsgebied met Meeuwenhoek en het maaibeheer in Oude Rijs leveren geen uitgevoerde plot-jaarrij, omdat respectievelijk een uitvoeringsjaar ontbreekt en 2025 als</w:t>
+      </w:r>
+      <w:r>
+        <w:t xml:space="preserve"> </w:t>
+      </w:r>
+      <w:r>
+        <w:rPr>
+          <w:rStyle w:val="VerbatimChar"/>
+        </w:rPr>
+        <w:t xml:space="preserve">niet_uitgevoerd</w:t>
+      </w:r>
+      <w:r>
+        <w:t xml:space="preserve"> </w:t>
+      </w:r>
+      <w:r>
+        <w:t xml:space="preserve">is vastgelegd. Voorlinden levert evenmin een plot-jaarrij omdat de jaarstatus voor 2025</w:t>
+      </w:r>
+      <w:r>
+        <w:t xml:space="preserve"> </w:t>
+      </w:r>
+      <w:r>
+        <w:rPr>
+          <w:rStyle w:val="VerbatimChar"/>
+        </w:rPr>
+        <w:t xml:space="preserve">onbekend</w:t>
+      </w:r>
+      <w:r>
+        <w:t xml:space="preserve"> </w:t>
+      </w:r>
+      <w:r>
+        <w:t xml:space="preserve">is.</w:t>
       </w:r>
     </w:p>
     <w:p>
@@ -6998,14 +7155,24 @@
         <w:pStyle w:val="BodyText"/>
       </w:pPr>
       <w:r>
-        <w:t>Status. Bronvast op project-, uitvoering- en jaarniveau voor de 30 ingevoerde bronnen en 61 uitvoeringen. De algemene kavel- en gebiedsindeling is geometrisch beschikbaar voor de 55 actuele plots uit 2025; vijf expliciet gekoppelde historische kavels hebben geen afzonderlijke geometrie. De bronvaste plot-jaarlaag bevat 148 regels voor 1967–1969, 1972–1975, 1988–1991, 1993, 1997, 2005–2006 en 2017–2025. Zes uitvoeringen zijn via de nameninventaris aan 32 kavelsituaties gekoppeld; Pan 13 en Plas 20 voegen elf aanvullende relaties toe, Helmduinen drie, de Kikkervalleienbegrazing drie, het Kikkervalleien-bodemherstel drie, de Kikkervalleien-infrastructuuringreep drie, de Watercrassulabestrijding drie, Parnassiapad 2 één, Parnassiapad 1 één en de konijnenbijplaatsingsproef twee. Nog 23 uitvoeringen hebben geen directe plotkoppeling.</w:t>
+        <w:rPr>
+          <w:b/>
+          <w:bCs/>
+        </w:rPr>
+        <w:t xml:space="preserve">Status.</w:t>
+      </w:r>
+      <w:r>
+        <w:t xml:space="preserve"> </w:t>
+      </w:r>
+      <w:r>
+        <w:t xml:space="preserve">Bronvast op project-, uitvoering- en jaarniveau voor de 30 ingevoerde bronnen en 61 uitvoeringen. De algemene kavel- en gebiedsindeling is geometrisch beschikbaar voor de 55 actuele plots uit 2025; vijf expliciet gekoppelde historische kavels hebben geen afzonderlijke geometrie. De bronvaste plot-jaarlaag bevat 149 regels voor 1967–1969, 1972–1975, 1988–1991, 1993, 1997, 2002, 2005–2006 en 2017–2025. Zes uitvoeringen zijn via de nameninventaris aan 32 kavelsituaties gekoppeld; Pan 13 en Plas 20 voegen elf aanvullende relaties toe, Helmduinen drie, de Kikkervalleienbegrazing drie, het Kikkervalleien-bodemherstel drie, de Kikkervalleien-infrastructuuringreep drie, de Watercrassulabestrijding drie, Parnassiapad 2 één, Parnassiapad 1 één, Plas 8.4.2 één en de konijnenbijplaatsingsproef twee. Nog 22 uitvoeringen hebben geen directe plotkoppeling.</w:t>
       </w:r>
     </w:p>
     <w:p>
       <w:pPr>
         <w:pStyle w:val="Heading2"/>
       </w:pPr>
-      <w:bookmarkStart w:id="55" w:name="_3b532014da7425692b0b753bfd67f02e729afe2"/>
+      <w:bookmarkStart w:id="56" w:name="_692b0a71312b2a939db271d079fb23757bfc15a"/>
       <w:r>
         <w:t xml:space="preserve">2. Bronnen in MySQL-database</w:t>
       </w:r>
@@ -7018,7 +7185,7 @@
         </w:rPr>
         <w:t xml:space="preserve">Meijendel_bronnen</w:t>
       </w:r>
-      <w:bookmarkEnd w:id="55"/>
+      <w:bookmarkEnd w:id="56"/>
     </w:p>
     <w:p>
       <w:pPr>
@@ -7047,11 +7214,11 @@
       <w:pPr>
         <w:pStyle w:val="Heading3"/>
       </w:pPr>
-      <w:bookmarkStart w:id="56" w:name="_duinvalleivegetatie"/>
+      <w:bookmarkStart w:id="57" w:name="_7ae3f60e8dd3c65bdde3d5f608a55d96632a876"/>
       <w:r>
         <w:t xml:space="preserve">2.1. Duinvalleivegetatie</w:t>
       </w:r>
-      <w:bookmarkEnd w:id="56"/>
+      <w:bookmarkEnd w:id="57"/>
     </w:p>
     <w:p>
       <w:pPr>
@@ -7073,7 +7240,7 @@
       <w:r>
         <w:t xml:space="preserve"> </w:t>
       </w:r>
-      <w:hyperlink r:id="rId57">
+      <w:hyperlink r:id="rId58">
         <w:r>
           <w:rPr>
             <w:rStyle w:val="Hyperlink"/>
@@ -7122,11 +7289,11 @@
       <w:pPr>
         <w:pStyle w:val="Heading3"/>
       </w:pPr>
-      <w:bookmarkStart w:id="58" w:name="_b3fe4556564befcfb8496c13829480f8568428d"/>
+      <w:bookmarkStart w:id="59" w:name="_6cd5cd3671e295c222d5bd4a47757f0a76f0a19"/>
       <w:r>
         <w:t xml:space="preserve">2.2. Vogelstand 1924</w:t>
       </w:r>
-      <w:bookmarkEnd w:id="58"/>
+      <w:bookmarkEnd w:id="59"/>
     </w:p>
     <w:p>
       <w:pPr>
@@ -7201,11 +7368,11 @@
       <w:pPr>
         <w:pStyle w:val="Heading3"/>
       </w:pPr>
-      <w:bookmarkStart w:id="59" w:name="_jachtspinnen"/>
+      <w:bookmarkStart w:id="60" w:name="_b3fdc40884db1bbf06132e666e117a731445140"/>
       <w:r>
         <w:t xml:space="preserve">2.3. Jachtspinnen</w:t>
       </w:r>
-      <w:bookmarkEnd w:id="59"/>
+      <w:bookmarkEnd w:id="60"/>
     </w:p>
     <w:p>
       <w:pPr>
@@ -7265,11 +7432,11 @@
       <w:pPr>
         <w:pStyle w:val="Heading3"/>
       </w:pPr>
-      <w:bookmarkStart w:id="60" w:name="_literatuuroverzicht"/>
+      <w:bookmarkStart w:id="61" w:name="_7c2c13aacf0ea926ee35ca97ab69391a3624a6f"/>
       <w:r>
         <w:t xml:space="preserve">2.4. Literatuuroverzicht</w:t>
       </w:r>
-      <w:bookmarkEnd w:id="60"/>
+      <w:bookmarkEnd w:id="61"/>
     </w:p>
     <w:p>
       <w:pPr>
@@ -7329,11 +7496,11 @@
       <w:pPr>
         <w:pStyle w:val="Heading3"/>
       </w:pPr>
-      <w:bookmarkStart w:id="61" w:name="_c459e94267866b3631cced111f8a87d0309b41a"/>
+      <w:bookmarkStart w:id="62" w:name="_4a1f2475629c7656191227e4ca81566bef187e2"/>
       <w:r>
         <w:t xml:space="preserve">2.5. Bijenmonitoring in vier beheergebieden</w:t>
       </w:r>
-      <w:bookmarkEnd w:id="61"/>
+      <w:bookmarkEnd w:id="62"/>
     </w:p>
     <w:p>
       <w:pPr>
@@ -7405,11 +7572,11 @@
       <w:pPr>
         <w:pStyle w:val="Heading3"/>
       </w:pPr>
-      <w:bookmarkStart w:id="62" w:name="_3de3a6968c8894ad5b666eb1a40d580f2cd5807"/>
+      <w:bookmarkStart w:id="63" w:name="_bef92f685785a24a45e5325384551ba55c57cc1"/>
       <w:r>
         <w:t xml:space="preserve">2.6. Aquatische macrofauna 1974–1975</w:t>
       </w:r>
-      <w:bookmarkEnd w:id="62"/>
+      <w:bookmarkEnd w:id="63"/>
     </w:p>
     <w:p>
       <w:pPr>
@@ -7484,11 +7651,11 @@
       <w:pPr>
         <w:pStyle w:val="Heading2"/>
       </w:pPr>
-      <w:bookmarkStart w:id="63" w:name="_ae67a70ad36e2d1d11a7d910c2e5a6d669a3a5f"/>
+      <w:bookmarkStart w:id="64" w:name="_2b62b82ef201b4c91783bce15da2b1d0258c34c"/>
       <w:r>
         <w:t xml:space="preserve">3. Geïdentificeerde externe kandidaatbronnen</w:t>
       </w:r>
-      <w:bookmarkEnd w:id="63"/>
+      <w:bookmarkEnd w:id="64"/>
     </w:p>
     <w:p>
       <w:pPr>
@@ -7502,21 +7669,21 @@
       <w:pPr>
         <w:pStyle w:val="Heading3"/>
       </w:pPr>
-      <w:bookmarkStart w:id="64" w:name="_d53aceb4d9e4863cdbb6367737be5e291cdac65"/>
+      <w:bookmarkStart w:id="65" w:name="_d53aceb4d9e4863cdbb6367737be5e291cdac65"/>
       <w:r>
         <w:t xml:space="preserve">Kandidaten met de grootste verwachte aanvulling</w:t>
       </w:r>
-      <w:bookmarkEnd w:id="64"/>
+      <w:bookmarkEnd w:id="65"/>
     </w:p>
     <w:p>
       <w:pPr>
         <w:pStyle w:val="Heading4"/>
       </w:pPr>
-      <w:bookmarkStart w:id="65" w:name="_74b9659b0fdf809bf79d99a5b829eae72be789d"/>
+      <w:bookmarkStart w:id="66" w:name="_bddce02f5cb2b082bf32fac381c8bc0ea5284d3"/>
       <w:r>
         <w:t xml:space="preserve">3.1. Historische en actuele ringgegevens</w:t>
       </w:r>
-      <w:bookmarkEnd w:id="65"/>
+      <w:bookmarkEnd w:id="66"/>
     </w:p>
     <w:p>
       <w:pPr>
@@ -7609,11 +7776,11 @@
       <w:pPr>
         <w:pStyle w:val="Heading4"/>
       </w:pPr>
-      <w:bookmarkStart w:id="66" w:name="_78976b2620bc79a80ca8146881cbd2c6e6ff990"/>
+      <w:bookmarkStart w:id="67" w:name="_8071b7ae643e6cecadbf8a281c84bb90b511e63"/>
       <w:r>
         <w:t xml:space="preserve">3.2. Erosiepinnen in een stuifkuilcomplex</w:t>
       </w:r>
-      <w:bookmarkEnd w:id="66"/>
+      <w:bookmarkEnd w:id="67"/>
     </w:p>
     <w:p>
       <w:pPr>
@@ -7691,11 +7858,11 @@
       <w:pPr>
         <w:pStyle w:val="Heading4"/>
       </w:pPr>
-      <w:bookmarkStart w:id="67" w:name="_0e60eab001b7dad7f07f0f30fba1e4c43b4fb6d"/>
+      <w:bookmarkStart w:id="68" w:name="_1b05a95cacb83608c9b762adcf4298810ed86f9"/>
       <w:r>
         <w:t xml:space="preserve">3.3. Langjarige droge-duinvegetatieplots</w:t>
       </w:r>
-      <w:bookmarkEnd w:id="67"/>
+      <w:bookmarkEnd w:id="68"/>
     </w:p>
     <w:p>
       <w:pPr>
@@ -7773,14 +7940,14 @@
       <w:pPr>
         <w:pStyle w:val="Heading4"/>
       </w:pPr>
-      <w:bookmarkStart w:id="69" w:name="_f31d7749b8f822cf46569bbbcf696a184226376"/>
+      <w:bookmarkStart w:id="70" w:name="_4578481a165cef1470f100d42a5e836ac7456f8"/>
       <w:r>
         <w:t xml:space="preserve">3.4.</w:t>
       </w:r>
       <w:r>
         <w:t xml:space="preserve"> </w:t>
       </w:r>
-      <w:hyperlink r:id="rId68">
+      <w:hyperlink r:id="rId69">
         <w:r>
           <w:rPr>
             <w:rStyle w:val="Hyperlink"/>
@@ -7788,7 +7955,7 @@
           <w:t xml:space="preserve">Neuropteren van Meijendel</w:t>
         </w:r>
       </w:hyperlink>
-      <w:bookmarkEnd w:id="69"/>
+      <w:bookmarkEnd w:id="70"/>
     </w:p>
     <w:p>
       <w:pPr>
@@ -7866,14 +8033,14 @@
       <w:pPr>
         <w:pStyle w:val="Heading4"/>
       </w:pPr>
-      <w:bookmarkStart w:id="71" w:name="_2470413ff36fadda6aaee753e44801bf1df918f"/>
+      <w:bookmarkStart w:id="72" w:name="_642992b46f3d655730973d9bd57c00f9c7aad9f"/>
       <w:r>
         <w:t xml:space="preserve">3.5.</w:t>
       </w:r>
       <w:r>
         <w:t xml:space="preserve"> </w:t>
       </w:r>
-      <w:hyperlink r:id="rId70">
+      <w:hyperlink r:id="rId71">
         <w:r>
           <w:rPr>
             <w:rStyle w:val="Hyperlink"/>
@@ -7881,7 +8048,7 @@
           <w:t xml:space="preserve">Zweefvliegen van Meijendel</w:t>
         </w:r>
       </w:hyperlink>
-      <w:bookmarkEnd w:id="71"/>
+      <w:bookmarkEnd w:id="72"/>
     </w:p>
     <w:p>
       <w:pPr>
@@ -7959,11 +8126,11 @@
       <w:pPr>
         <w:pStyle w:val="Heading4"/>
       </w:pPr>
-      <w:bookmarkStart w:id="72" w:name="_17333f70ef292f70875eaae009d7701e7337d63"/>
+      <w:bookmarkStart w:id="73" w:name="_80b82bf48485caf594896b8d6bc490be5f328ee"/>
       <w:r>
         <w:t xml:space="preserve">3.6. TERRA-Dunes plant- en bodemmicrobiomen</w:t>
       </w:r>
-      <w:bookmarkEnd w:id="72"/>
+      <w:bookmarkEnd w:id="73"/>
     </w:p>
     <w:p>
       <w:pPr>
@@ -7985,7 +8152,7 @@
       <w:r>
         <w:t xml:space="preserve"> </w:t>
       </w:r>
-      <w:hyperlink r:id="rId73">
+      <w:hyperlink r:id="rId74">
         <w:r>
           <w:rPr>
             <w:rStyle w:val="Hyperlink"/>
@@ -8034,11 +8201,11 @@
       <w:pPr>
         <w:pStyle w:val="Heading4"/>
       </w:pPr>
-      <w:bookmarkStart w:id="74" w:name="_40b4b5f78cd8ca95bb70f0f0c78c7e4fbf296ca"/>
+      <w:bookmarkStart w:id="75" w:name="_4b2db10b2340db42e20505c45425c0b84f14c27"/>
       <w:r>
         <w:t xml:space="preserve">3.7. Rups- en bodemmicrobiomen</w:t>
       </w:r>
-      <w:bookmarkEnd w:id="74"/>
+      <w:bookmarkEnd w:id="75"/>
     </w:p>
     <w:p>
       <w:pPr>
@@ -8060,7 +8227,7 @@
       <w:r>
         <w:t xml:space="preserve"> </w:t>
       </w:r>
-      <w:hyperlink r:id="rId75">
+      <w:hyperlink r:id="rId76">
         <w:r>
           <w:rPr>
             <w:rStyle w:val="Hyperlink"/>
@@ -8109,11 +8276,11 @@
       <w:pPr>
         <w:pStyle w:val="Heading4"/>
       </w:pPr>
-      <w:bookmarkStart w:id="76" w:name="_1ba4dd18d3453a5dd5138bb384a5f14f39849e8"/>
+      <w:bookmarkStart w:id="77" w:name="_442e94e4e2997aa133d10bf618574e2528e759d"/>
       <w:r>
         <w:t xml:space="preserve">3.8. Schimmels bij kruipwilg</w:t>
       </w:r>
-      <w:bookmarkEnd w:id="76"/>
+      <w:bookmarkEnd w:id="77"/>
     </w:p>
     <w:p>
       <w:pPr>
@@ -8135,7 +8302,7 @@
       <w:r>
         <w:t xml:space="preserve"> </w:t>
       </w:r>
-      <w:hyperlink r:id="rId77">
+      <w:hyperlink r:id="rId78">
         <w:r>
           <w:rPr>
             <w:rStyle w:val="Hyperlink"/>
@@ -8184,11 +8351,11 @@
       <w:pPr>
         <w:pStyle w:val="Heading4"/>
       </w:pPr>
-      <w:bookmarkStart w:id="78" w:name="_374ab00ebf692a8e3319839c9c7bfae940c399a"/>
+      <w:bookmarkStart w:id="79" w:name="_36e8e197a59cff4a0251b791dc5fc6bc0e135bf"/>
       <w:r>
         <w:t xml:space="preserve">3.9. Plantengroei, bodemvocht en weer</w:t>
       </w:r>
-      <w:bookmarkEnd w:id="78"/>
+      <w:bookmarkEnd w:id="79"/>
     </w:p>
     <w:p>
       <w:pPr>
@@ -8210,7 +8377,7 @@
       <w:r>
         <w:t xml:space="preserve"> </w:t>
       </w:r>
-      <w:hyperlink r:id="rId79">
+      <w:hyperlink r:id="rId80">
         <w:r>
           <w:rPr>
             <w:rStyle w:val="Hyperlink"/>
@@ -8259,11 +8426,11 @@
       <w:pPr>
         <w:pStyle w:val="Heading4"/>
       </w:pPr>
-      <w:bookmarkStart w:id="80" w:name="_936150612b1bf240012fee005a20984db1c7c99"/>
+      <w:bookmarkStart w:id="81" w:name="_49ed5beca1c3c65272a43e85c3687f3c3d41d64"/>
       <w:r>
         <w:t xml:space="preserve">3.10. Genetische datasets amfibieën</w:t>
       </w:r>
-      <w:bookmarkEnd w:id="80"/>
+      <w:bookmarkEnd w:id="81"/>
     </w:p>
     <w:p>
       <w:pPr>
@@ -8323,11 +8490,11 @@
       <w:pPr>
         <w:pStyle w:val="Heading3"/>
       </w:pPr>
-      <w:bookmarkStart w:id="81" w:name="_8c2748f02893018608c8a38a1054acf3030739d"/>
+      <w:bookmarkStart w:id="82" w:name="_136d668cd3b301eba92f27584d1a2d49d57a73c"/>
       <w:r>
         <w:t xml:space="preserve">3.11. Alleen context of nog een onderzoeksaanwijzing</w:t>
       </w:r>
-      <w:bookmarkEnd w:id="81"/>
+      <w:bookmarkEnd w:id="82"/>
     </w:p>
     <w:p>
       <w:pPr>
@@ -8473,7 +8640,7 @@
       <w:pPr>
         <w:pStyle w:val="BodyText"/>
       </w:pPr>
-      <w:hyperlink r:id="rId82">
+      <w:hyperlink r:id="rId83">
         <w:r>
           <w:rPr>
             <w:rStyle w:val="Hyperlink"/>
@@ -8537,11 +8704,11 @@
       <w:pPr>
         <w:pStyle w:val="Heading3"/>
       </w:pPr>
-      <w:bookmarkStart w:id="83" w:name="_41253e96e2b1ec8824f9b84bf0a06f4f5ff5fba"/>
+      <w:bookmarkStart w:id="84" w:name="_5a3c854a1ae73aceac94ca91c157868f870ab17"/>
       <w:r>
         <w:t xml:space="preserve">3.12. Geografische namen en historische paden</w:t>
       </w:r>
-      <w:bookmarkEnd w:id="83"/>
+      <w:bookmarkEnd w:id="84"/>
     </w:p>
     <w:p>
       <w:pPr>
@@ -8648,11 +8815,11 @@
       <w:pPr>
         <w:pStyle w:val="Heading2"/>
       </w:pPr>
-      <w:bookmarkStart w:id="84" w:name="_8e1aa2a9058c5df66a55f09f3195dc2392072ca"/>
+      <w:bookmarkStart w:id="85" w:name="_c540a83ee65aaec11aa446aec0815d16fd21e21"/>
       <w:r>
         <w:t xml:space="preserve">4. Verwachte aanvullingen</w:t>
       </w:r>
-      <w:bookmarkEnd w:id="84"/>
+      <w:bookmarkEnd w:id="85"/>
     </w:p>
     <w:p>
       <w:pPr>
@@ -8712,11 +8879,11 @@
       <w:pPr>
         <w:pStyle w:val="Heading2"/>
       </w:pPr>
-      <w:bookmarkStart w:id="85" w:name="_bd1d36805349ef5ec39b6efd044fd20b47e23f4"/>
+      <w:bookmarkStart w:id="86" w:name="_422e6271160c2b04a3b59fb5b59cfcc2e3afc55"/>
       <w:r>
         <w:t xml:space="preserve">5. Bronnen die niet verder worden uitgewerkt</w:t>
       </w:r>
-      <w:bookmarkEnd w:id="85"/>
+      <w:bookmarkEnd w:id="86"/>
     </w:p>
     <w:p>
       <w:pPr>
@@ -8746,11 +8913,11 @@
       <w:pPr>
         <w:pStyle w:val="Heading2"/>
       </w:pPr>
-      <w:bookmarkStart w:id="86" w:name="_013584c0923eee2d005d13457186cf6f9764ca0"/>
+      <w:bookmarkStart w:id="87" w:name="_b05dec49988a12f7955d21ff17f1c91e4d061eb"/>
       <w:r>
         <w:t xml:space="preserve">6. Gebruik van dit register</w:t>
       </w:r>
-      <w:bookmarkEnd w:id="86"/>
+      <w:bookmarkEnd w:id="87"/>
     </w:p>
     <w:p>
       <w:pPr>
@@ -8835,11 +9002,11 @@
       <w:pPr>
         <w:pStyle w:val="Heading2"/>
       </w:pPr>
-      <w:bookmarkStart w:id="87" w:name="_actieplan"/>
+      <w:bookmarkStart w:id="88" w:name="_67781990bcb7d7d43cc312a7ef48f37a1f83265"/>
       <w:r>
         <w:t xml:space="preserve">7. Actieplan</w:t>
       </w:r>
-      <w:bookmarkEnd w:id="87"/>
+      <w:bookmarkEnd w:id="88"/>
     </w:p>
     <w:p>
       <w:pPr>
@@ -8868,11 +9035,11 @@
       <w:pPr>
         <w:pStyle w:val="Heading3"/>
       </w:pPr>
-      <w:bookmarkStart w:id="88" w:name="_94b069977659593a87344faec87dcce83750292"/>
+      <w:bookmarkStart w:id="89" w:name="_d7f889e2150e602eaeb242f489896c9b52af547"/>
       <w:r>
         <w:t xml:space="preserve">Fase 1 — openbare, direct toetsbare bronnen</w:t>
       </w:r>
-      <w:bookmarkEnd w:id="88"/>
+      <w:bookmarkEnd w:id="89"/>
     </w:p>
     <w:p>
       <w:pPr>
@@ -8956,11 +9123,11 @@
       <w:pPr>
         <w:pStyle w:val="Heading3"/>
       </w:pPr>
-      <w:bookmarkStart w:id="89" w:name="_1e65d730f223a62ff579853fd3c77c9308748df"/>
+      <w:bookmarkStart w:id="90" w:name="_a67120beb48c3916f8a53c623f303ce8b8a6005"/>
       <w:r>
         <w:t xml:space="preserve">Fase 2 — reeksen met grote historische of trendwaarde</w:t>
       </w:r>
-      <w:bookmarkEnd w:id="89"/>
+      <w:bookmarkEnd w:id="90"/>
     </w:p>
     <w:p>
       <w:pPr>
@@ -9110,11 +9277,11 @@
       <w:pPr>
         <w:pStyle w:val="Heading3"/>
       </w:pPr>
-      <w:bookmarkStart w:id="90" w:name="_6b9d0c88ffcb5584e67daa74c9524b522af67c0"/>
+      <w:bookmarkStart w:id="91" w:name="_c96f79f2027e81b7ab280f9bf69df5af8bdf464"/>
       <w:r>
         <w:t xml:space="preserve">Fase 3 — reeds bekende bronhouders en contextdatasets</w:t>
       </w:r>
-      <w:bookmarkEnd w:id="90"/>
+      <w:bookmarkEnd w:id="91"/>
     </w:p>
     <w:p>
       <w:pPr>
@@ -9189,11 +9356,11 @@
       <w:pPr>
         <w:pStyle w:val="Heading3"/>
       </w:pPr>
-      <w:bookmarkStart w:id="91" w:name="_d490f73b19661b8ff0d346b94e527be91e989c7"/>
+      <w:bookmarkStart w:id="92" w:name="_d490f73b19661b8ff0d346b94e527be91e989c7"/>
       <w:r>
         <w:t xml:space="preserve">Vaste werkwijze per bron</w:t>
       </w:r>
-      <w:bookmarkEnd w:id="91"/>
+      <w:bookmarkEnd w:id="92"/>
     </w:p>
     <w:p>
       <w:pPr>
@@ -9207,11 +9374,11 @@
       <w:pPr>
         <w:pStyle w:val="Heading3"/>
       </w:pPr>
-      <w:bookmarkStart w:id="92" w:name="_1e50ec235a164d1e043cda4cec7be66fb154af3"/>
+      <w:bookmarkStart w:id="93" w:name="_1e50ec235a164d1e043cda4cec7be66fb154af3"/>
       <w:r>
         <w:t xml:space="preserve">Dekking van de internetcontrole</w:t>
       </w:r>
-      <w:bookmarkEnd w:id="92"/>
+      <w:bookmarkEnd w:id="93"/>
     </w:p>
     <w:p>
       <w:pPr>
@@ -9225,11 +9392,11 @@
       <w:pPr>
         <w:pStyle w:val="Heading2"/>
       </w:pPr>
-      <w:bookmarkStart w:id="93" w:name="_5001ec8ecf742000e2504f4f268bea177f3f158"/>
+      <w:bookmarkStart w:id="94" w:name="_5001ec8ecf742000e2504f4f268bea177f3f158"/>
       <w:r>
         <w:t xml:space="preserve">Achterliggende verantwoording</w:t>
       </w:r>
-      <w:bookmarkEnd w:id="93"/>
+      <w:bookmarkEnd w:id="94"/>
     </w:p>
     <w:p>
       <w:pPr>
@@ -9239,7 +9406,7 @@
           <w:numId w:val="1005"/>
         </w:numPr>
       </w:pPr>
-      <w:hyperlink r:id="rId94">
+      <w:hyperlink r:id="rId95">
         <w:r>
           <w:rPr>
             <w:rStyle w:val="Hyperlink"/>
@@ -9256,7 +9423,7 @@
           <w:numId w:val="1005"/>
         </w:numPr>
       </w:pPr>
-      <w:hyperlink r:id="rId95">
+      <w:hyperlink r:id="rId96">
         <w:r>
           <w:rPr>
             <w:rStyle w:val="Hyperlink"/>
@@ -9273,7 +9440,7 @@
           <w:numId w:val="1005"/>
         </w:numPr>
       </w:pPr>
-      <w:hyperlink r:id="rId96">
+      <w:hyperlink r:id="rId97">
         <w:r>
           <w:rPr>
             <w:rStyle w:val="Hyperlink"/>
@@ -9290,7 +9457,7 @@
           <w:numId w:val="1005"/>
         </w:numPr>
       </w:pPr>
-      <w:hyperlink r:id="rId97">
+      <w:hyperlink r:id="rId98">
         <w:r>
           <w:rPr>
             <w:rStyle w:val="Hyperlink"/>
@@ -9307,7 +9474,7 @@
           <w:numId w:val="1005"/>
         </w:numPr>
       </w:pPr>
-      <w:hyperlink r:id="rId98">
+      <w:hyperlink r:id="rId99">
         <w:r>
           <w:rPr>
             <w:rStyle w:val="Hyperlink"/>
@@ -9324,7 +9491,7 @@
           <w:numId w:val="1005"/>
         </w:numPr>
       </w:pPr>
-      <w:hyperlink r:id="rId99">
+      <w:hyperlink r:id="rId100">
         <w:r>
           <w:rPr>
             <w:rStyle w:val="Hyperlink"/>
@@ -9341,7 +9508,7 @@
           <w:numId w:val="1005"/>
         </w:numPr>
       </w:pPr>
-      <w:hyperlink r:id="rId100">
+      <w:hyperlink r:id="rId101">
         <w:r>
           <w:rPr>
             <w:rStyle w:val="Hyperlink"/>

</xml_diff>

<commit_message>
Koppel beheer Meeuwenduin en Prinsenduin
</commit_message>
<xml_diff>
--- a/docs/MEIJENDEL_BRONREGISTER.docx
+++ b/docs/MEIJENDEL_BRONREGISTER.docx
@@ -6398,7 +6398,7 @@
         <w:t xml:space="preserve"> </w:t>
       </w:r>
       <w:r>
-        <w:t xml:space="preserve">De levende lokale database bevat 18 projecten, 30 bronnen, 61 uitvoeringen, 100 expliciete jaarbeoordelingen uit 1967–2025 en 83 bronkoppelingen. Van de jaarbeoordelingen zijn er 84</w:t>
+        <w:t xml:space="preserve">De levende lokale database bevat 18 projecten, 30 bronnen, 62 uitvoeringen, 100 expliciete jaarbeoordelingen uit 1967–2025 en 83 bronkoppelingen. Van de jaarbeoordelingen zijn er 84</w:t>
       </w:r>
       <w:r>
         <w:t xml:space="preserve"> </w:t>
@@ -6437,7 +6437,7 @@
         <w:t xml:space="preserve">onbekend</w:t>
       </w:r>
       <w:r>
-        <w:t xml:space="preserve">. De nieuwe invoer voegt 28 feitelijke uitvoeringen uit 1967–2006 toe. Zij betreft waterwinning en infiltratieplassen, pad- en rasterwerk, zandvastlegging, de rietpotenproef, begrazing, maaien, plaggen en slibverwijdering. De datumvelden van de totale laag lopen van 1967 tot en met een gepland einde in maart 2027. Geplande werkzaamheden bij de Paardenstal en het subsidieerbare Bendel-nabeheer hebben geen uitgevoerd jaar gekregen; elektriciteitswerk in Vallei Meijendel staat als uitvoering onbekend en heeft eveneens geen jaarregel.</w:t>
+        <w:t xml:space="preserve">. De uitvoering in Meeuwenduin en Prinsenduin is gesplitst: 2023 betreft beide naamgebieden; 2024 uitsluitend Prinsenduin. De nieuwe invoer voegt 28 feitelijke uitvoeringen uit 1967–2006 toe. Zij betreft waterwinning en infiltratieplassen, pad- en rasterwerk, zandvastlegging, de rietpotenproef, begrazing, maaien, plaggen en slibverwijdering. De datumvelden van de totale laag lopen van 1967 tot en met een gepland einde in maart 2027. Geplande werkzaamheden bij de Paardenstal en het subsidieerbare Bendel-nabeheer hebben geen uitgevoerd jaar gekregen; elektriciteitswerk in Vallei Meijendel staat als uitvoering onbekend en heeft eveneens geen jaarregel.</w:t>
       </w:r>
     </w:p>
     <w:p>
@@ -6519,7 +6519,7 @@
         <w:t xml:space="preserve"> </w:t>
       </w:r>
       <w:r>
-        <w:t xml:space="preserve">bevat 101 geverifieerde directe relaties. Daarvan waren 36 al onderbouwd met expliciete kavelvermeldingen, gebruikersvaststellingen of een bijzondere gebiedsnaam. De nameninventaris voegt 32 geometrische doorsnijdingen toe voor zes volledig en letterlijk gelokaliseerde uitvoeringen met de naamobjecten Kijfhoek, Bierlap, Meeuwenhoek, Tafelberg, ’t Scheepje, Uilenbosch en Oude Rijs uit</w:t>
+        <w:t xml:space="preserve">bevat 114 geverifieerde directe relaties. Daarvan waren 36 al onderbouwd met expliciete kavelvermeldingen, gebruikersvaststellingen of een bijzondere gebiedsnaam. De nameninventaris voegt 32 geometrische doorsnijdingen toe voor zes volledig en letterlijk gelokaliseerde uitvoeringen met de naamobjecten Kijfhoek, Bierlap, Meeuwenhoek, Tafelberg, ’t Scheepje, Uilenbosch en Oude Rijs uit</w:t>
       </w:r>
       <w:r>
         <w:t xml:space="preserve"> </w:t>
@@ -7028,6 +7028,29 @@
         <w:pStyle w:val="BodyText"/>
       </w:pPr>
       <w:r>
+        <w:t xml:space="preserve">Ton heeft op 15 oktober 2026 Meeuwenduin voor deze maatregel gelijkgesteld aan Meeuwenhoek en voorlopig de topografie van Prinsenberg voor Prinsenduin aangewezen. De uitvoering is naar bronjaar gesplitst. Het in november 2023 gestarte werk in Meeuwenduin en Prinsenduin is gekoppeld aan M10-12-76, M12a, M73, M74 en M75 voor Meeuwenduin en aan M2, M3, M35 en M36 voor Prinsenduin. Het Dunea-jaarverslag bevestigt in 2024 alleen voortzetting bij Prinsenduin; daarom is 2024 uitsluitend gekoppeld aan M2, M3, M35 en M36. De gelijkstelling Prinsenduin–Prinsenberg is voorlopig en de exacte werkvoetafdruk binnen de dertien uitvoering-kavelrelaties is onbekend;</w:t>
+      </w:r>
+      <w:r>
+        <w:t xml:space="preserve"> </w:t>
+      </w:r>
+      <w:r>
+        <w:rPr>
+          <w:rStyle w:val="VerbatimChar"/>
+        </w:rPr>
+        <w:t xml:space="preserve">doorsnijding_pct</w:t>
+      </w:r>
+      <w:r>
+        <w:t xml:space="preserve"> </w:t>
+      </w:r>
+      <w:r>
+        <w:t xml:space="preserve">blijft leeg.</w:t>
+      </w:r>
+    </w:p>
+    <w:p>
+      <w:pPr>
+        <w:pStyle w:val="BodyText"/>
+      </w:pPr>
+      <w:r>
         <w:t xml:space="preserve">De konijnenbijplaatsingsproef is voor 2024 gekoppeld aan M8 en M41. De ODH-beschikking van 28 augustus 2023 en het daarin opgenomen activiteitenplan benoemen en begrenzen de uitzetlocaties Kleine Pan en Waterschapsvallei. De nameninventaris koppelt Kleine Pan aan M8; vergelijking met de actuele SOVON-kavelgeometrie plaatst Waterschapsvallei in M41. Ton bevestigde beide koppelingen op 14 oktober 2026. Het Dunea-jaarverslag bevestigt dat de proef in 2024 is begonnen en dat rond de uitzetlocaties is gemonitord. De beschikking gold tot en met 31 maart 2026, maar dat vergunningsbereik bewijst geen uitvoering in 2025 of 2026. Daarom bevat de jaarlaag alleen 2024. De precieze uitzet- en monitoringsvoetafdruk binnen beide kavels is niet vastgesteld;</w:t>
       </w:r>
       <w:r>
@@ -7051,7 +7074,7 @@
         <w:pStyle w:val="BodyText"/>
       </w:pPr>
       <w:r>
-        <w:t xml:space="preserve">De 101 plotkoppelingen en 84 uitgevoerde jaarregels leveren samen 157 regels in</w:t>
+        <w:t xml:space="preserve">De 114 plotkoppelingen en 84 uitgevoerde jaarregels leveren samen 170 regels in</w:t>
       </w:r>
       <w:r>
         <w:t xml:space="preserve"> </w:t>
@@ -7063,7 +7086,7 @@
         <w:t xml:space="preserve">v_plot_jaar_maatregel_bronvast</w:t>
       </w:r>
       <w:r>
-        <w:t xml:space="preserve">. De nameninventaris voegt 36 plot-jaarrijen toe: begrazing in Kijfhoek en Bierlap in 1990, hervat maaibeheer bij Tafelberg en ’t Scheepje in 2025, uitgevoerd maaibeheer in Uilenbosch in 2017–2021 en vogelkersbestrijding in Kijfhoek, Bierlap en Meeuwenhoek in 2020. De aanvullende systeemkoppelingen voegen 22 plot-jaarrijen toe: vier voor de oeveraanpassing van Pan 13 in 1988–1989 en achttien voor drie uitvoeringen in Plas 20 in 2005–2006. De Helmduinen-koppeling voegt drie plot-jaarrijen voor 1991 toe. De uitbreiding van de begrazing met de Kikkervalleien, de eenmalige verwijdering van vegetatie en voedselrijke bovengrond en het verwijderen van leidingen en putten voegen ieder drie plot-jaarrijen voor 1997 toe; Parnassiapad 2 voegt één plot-jaarrij voor M15 in 1993 toe en Parnassiapad 1 één voor M15 in 1997. De Watercrassulabestrijding voegt dertig plot-jaarrijen toe voor M13, M13s en M14 in 2015 en 2017–2025. De konijnenbijplaatsingsproef voegt twee plot-jaarrijen toe voor M8 en M41 in 2024. De koppeling van Plas 8.4.2 aan M32 voegt één plot-jaarrij voor 2002 toe. Waalsdorp voegt acht plot-jaarrijen toe voor M84 en M43 in 2016–2019. De statussen</w:t>
+        <w:t xml:space="preserve">. De nameninventaris voegt 36 plot-jaarrijen toe: begrazing in Kijfhoek en Bierlap in 1990, hervat maaibeheer bij Tafelberg en ’t Scheepje in 2025, uitgevoerd maaibeheer in Uilenbosch in 2017–2021 en vogelkersbestrijding in Kijfhoek, Bierlap en Meeuwenhoek in 2020. De aanvullende systeemkoppelingen voegen 22 plot-jaarrijen toe: vier voor de oeveraanpassing van Pan 13 in 1988–1989 en achttien voor drie uitvoeringen in Plas 20 in 2005–2006. De Helmduinen-koppeling voegt drie plot-jaarrijen voor 1991 toe. De uitbreiding van de begrazing met de Kikkervalleien, de eenmalige verwijdering van vegetatie en voedselrijke bovengrond en het verwijderen van leidingen en putten voegen ieder drie plot-jaarrijen voor 1997 toe; Parnassiapad 2 voegt één plot-jaarrij voor M15 in 1993 toe en Parnassiapad 1 één voor M15 in 1997. De Watercrassulabestrijding voegt dertig plot-jaarrijen toe voor M13, M13s en M14 in 2015 en 2017–2025. Het opslagbeheer in Meeuwenduin en Prinsenduin voegt negen plot-jaarrijen voor 2023 toe; de afzonderlijke voortzetting in Prinsenduin voegt vier plot-jaarrijen voor 2024 toe. De konijnenbijplaatsingsproef voegt twee plot-jaarrijen toe voor M8 en M41 in 2024. De koppeling van Plas 8.4.2 aan M32 voegt één plot-jaarrij voor 2002 toe. Waalsdorp voegt acht plot-jaarrijen toe voor M84 en M43 in 2016–2019. De statussen</w:t>
       </w:r>
       <w:r>
         <w:t xml:space="preserve"> </w:t>
@@ -7204,7 +7227,7 @@
         <w:t xml:space="preserve"> </w:t>
       </w:r>
       <w:r>
-        <w:t xml:space="preserve">Bronvast op project-, uitvoering- en jaarniveau voor de 30 ingevoerde bronnen en 61 uitvoeringen. De algemene kavel- en gebiedsindeling is geometrisch beschikbaar voor de 55 actuele plots uit 2025; vijf expliciet gekoppelde historische kavels hebben geen afzonderlijke geometrie. De bronvaste plot-jaarlaag bevat 157 regels voor 1967–1969, 1972–1975, 1988–1991, 1993, 1997, 2002, 2005–2006 en 2017–2025. Zes uitvoeringen zijn via de nameninventaris aan 32 kavelsituaties gekoppeld; Pan 13 en Plas 20 voegen elf aanvullende relaties toe, Helmduinen drie, de Kikkervalleienbegrazing drie, het Kikkervalleien-bodemherstel drie, de Kikkervalleien-infrastructuuringreep drie, de Watercrassulabestrijding drie, Parnassiapad 2 één, Parnassiapad 1 één, Plas 8.4.2 één, Waalsdorp twee en de konijnenbijplaatsingsproef twee. Nog 21 uitvoeringen hebben geen directe plotkoppeling.</w:t>
+        <w:t xml:space="preserve">Bronvast op project-, uitvoering- en jaarniveau voor de 30 ingevoerde bronnen en 62 uitvoeringen. De algemene kavel- en gebiedsindeling is geometrisch beschikbaar voor de 55 actuele plots uit 2025; vijf expliciet gekoppelde historische kavels hebben geen afzonderlijke geometrie. De bronvaste plot-jaarlaag bevat 170 regels voor 1967–1969, 1972–1975, 1988–1991, 1993, 1997, 2002, 2005–2006 en 2017–2025. Zes uitvoeringen zijn via de nameninventaris aan 32 kavelsituaties gekoppeld; Pan 13 en Plas 20 voegen elf aanvullende relaties toe, Helmduinen drie, de Kikkervalleienbegrazing drie, het Kikkervalleien-bodemherstel drie, de Kikkervalleien-infrastructuuringreep drie, de Watercrassulabestrijding drie, Parnassiapad 2 één, Parnassiapad 1 één, Plas 8.4.2 één, Waalsdorp twee, Meeuwenduin en Prinsenduin samen dertien en de konijnenbijplaatsingsproef twee. Nog 20 uitvoeringen hebben geen directe plotkoppeling.</w:t>
       </w:r>
     </w:p>
     <w:p>

</xml_diff>

<commit_message>
Koppel elektriciteitswerk aan M51
</commit_message>
<xml_diff>
--- a/docs/MEIJENDEL_BRONREGISTER.docx
+++ b/docs/MEIJENDEL_BRONREGISTER.docx
@@ -6519,7 +6519,7 @@
         <w:t xml:space="preserve"> </w:t>
       </w:r>
       <w:r>
-        <w:t xml:space="preserve">bevat 114 geverifieerde directe relaties. Daarvan waren 36 al onderbouwd met expliciete kavelvermeldingen, gebruikersvaststellingen of een bijzondere gebiedsnaam. De nameninventaris voegt 32 geometrische doorsnijdingen toe voor zes volledig en letterlijk gelokaliseerde uitvoeringen met de naamobjecten Kijfhoek, Bierlap, Meeuwenhoek, Tafelberg, ’t Scheepje, Uilenbosch en Oude Rijs uit</w:t>
+        <w:t xml:space="preserve">bevat 115 geverifieerde directe relaties. Daarvan waren 36 al onderbouwd met expliciete kavelvermeldingen, gebruikersvaststellingen of een bijzondere gebiedsnaam. De nameninventaris voegt 32 geometrische doorsnijdingen toe voor zes volledig en letterlijk gelokaliseerde uitvoeringen met de naamobjecten Kijfhoek, Bierlap, Meeuwenhoek, Tafelberg, ’t Scheepje, Uilenbosch en Oude Rijs uit</w:t>
       </w:r>
       <w:r>
         <w:t xml:space="preserve"> </w:t>
@@ -7074,7 +7074,34 @@
         <w:pStyle w:val="BodyText"/>
       </w:pPr>
       <w:r>
-        <w:t xml:space="preserve">De 114 plotkoppelingen en 84 uitgevoerde jaarregels leveren samen 170 regels in</w:t>
+        <w:t xml:space="preserve">Het elektriciteitswerk in Vallei Meijendel is op 15 oktober 2026 door Ton gekoppeld aan M51. Dunea lokaliseert de aangekondigde kabels, elektriciteitskast en laadvoorbereiding op het parkeerterrein bij De Tapuit, het bezoekerscentrum en Boerderij Meyendel. De afzonderlijk gecontroleerde openbare locatiepunten van deze drie voorzieningen liggen volgens de actuele kavelgeometrie alle in M51. Het precieze kabeltracé en de werkvoetafdruk zijn niet gepubliceerd;</w:t>
+      </w:r>
+      <w:r>
+        <w:t xml:space="preserve"> </w:t>
+      </w:r>
+      <w:r>
+        <w:rPr>
+          <w:rStyle w:val="VerbatimChar"/>
+        </w:rPr>
+        <w:t xml:space="preserve">doorsnijding_pct</w:t>
+      </w:r>
+      <w:r>
+        <w:t xml:space="preserve"> </w:t>
+      </w:r>
+      <w:r>
+        <w:t xml:space="preserve">blijft daarom leeg. De bron bevestigt evenmin de voltooiing. De uitvoering houdt status</w:t>
+      </w:r>
+      <w:r>
+        <w:t xml:space="preserve"> </w:t>
+      </w:r>
+      <w:r>
+        <w:rPr>
+          <w:rStyle w:val="VerbatimChar"/>
+        </w:rPr>
+        <w:t xml:space="preserve">onbekend</w:t>
+      </w:r>
+      <w:r>
+        <w:t xml:space="preserve">, heeft nul jaarregels en voegt dus geen regel toe aan</w:t>
       </w:r>
       <w:r>
         <w:t xml:space="preserve"> </w:t>
@@ -7086,6 +7113,26 @@
         <w:t xml:space="preserve">v_plot_jaar_maatregel_bronvast</w:t>
       </w:r>
       <w:r>
+        <w:t xml:space="preserve">.</w:t>
+      </w:r>
+    </w:p>
+    <w:p>
+      <w:pPr>
+        <w:pStyle w:val="BodyText"/>
+      </w:pPr>
+      <w:r>
+        <w:t xml:space="preserve">De 115 plotkoppelingen en 84 uitgevoerde jaarregels leveren samen 170 regels in</w:t>
+      </w:r>
+      <w:r>
+        <w:t xml:space="preserve"> </w:t>
+      </w:r>
+      <w:r>
+        <w:rPr>
+          <w:rStyle w:val="VerbatimChar"/>
+        </w:rPr>
+        <w:t xml:space="preserve">v_plot_jaar_maatregel_bronvast</w:t>
+      </w:r>
+      <w:r>
         <w:t xml:space="preserve">. De nameninventaris voegt 36 plot-jaarrijen toe: begrazing in Kijfhoek en Bierlap in 1990, hervat maaibeheer bij Tafelberg en ’t Scheepje in 2025, uitgevoerd maaibeheer in Uilenbosch in 2017–2021 en vogelkersbestrijding in Kijfhoek, Bierlap en Meeuwenhoek in 2020. De aanvullende systeemkoppelingen voegen 22 plot-jaarrijen toe: vier voor de oeveraanpassing van Pan 13 in 1988–1989 en achttien voor drie uitvoeringen in Plas 20 in 2005–2006. De Helmduinen-koppeling voegt drie plot-jaarrijen voor 1991 toe. De uitbreiding van de begrazing met de Kikkervalleien, de eenmalige verwijdering van vegetatie en voedselrijke bovengrond en het verwijderen van leidingen en putten voegen ieder drie plot-jaarrijen voor 1997 toe; Parnassiapad 2 voegt één plot-jaarrij voor M15 in 1993 toe en Parnassiapad 1 één voor M15 in 1997. De Watercrassulabestrijding voegt dertig plot-jaarrijen toe voor M13, M13s en M14 in 2015 en 2017–2025. Het opslagbeheer in Meeuwenduin en Prinsenduin voegt negen plot-jaarrijen voor 2023 toe; de afzonderlijke voortzetting in Prinsenduin voegt vier plot-jaarrijen voor 2024 toe. De konijnenbijplaatsingsproef voegt twee plot-jaarrijen toe voor M8 en M41 in 2024. De koppeling van Plas 8.4.2 aan M32 voegt één plot-jaarrij voor 2002 toe. Waalsdorp voegt acht plot-jaarrijen toe voor M84 en M43 in 2016–2019. De statussen</w:t>
       </w:r>
       <w:r>
@@ -7146,22 +7193,7 @@
         <w:t xml:space="preserve"> </w:t>
       </w:r>
       <w:r>
-        <w:t xml:space="preserve">is vastgelegd. Voorlinden levert evenmin een plot-jaarrij omdat de jaarstatus voor 2025</w:t>
-      </w:r>
-      <w:r>
-        <w:t xml:space="preserve"> </w:t>
-      </w:r>
-      <w:r>
-        <w:rPr>
-          <w:rStyle w:val="VerbatimChar"/>
-        </w:rPr>
-        <w:t xml:space="preserve">onbekend</w:t>
-      </w:r>
-      <w:r>
-        <w:t xml:space="preserve"> </w:t>
-      </w:r>
-      <w:r>
-        <w:t xml:space="preserve">is.</w:t>
+        <w:t xml:space="preserve">is vastgelegd. Voorlinden en het elektriciteitswerk in M51 leveren evenmin een plot-jaarrij, omdat zij geen uitgevoerde jaarstatus hebben.</w:t>
       </w:r>
     </w:p>
     <w:p>
@@ -7227,7 +7259,7 @@
         <w:t xml:space="preserve"> </w:t>
       </w:r>
       <w:r>
-        <w:t xml:space="preserve">Bronvast op project-, uitvoering- en jaarniveau voor de 30 ingevoerde bronnen en 62 uitvoeringen. De algemene kavel- en gebiedsindeling is geometrisch beschikbaar voor de 55 actuele plots uit 2025; vijf expliciet gekoppelde historische kavels hebben geen afzonderlijke geometrie. De bronvaste plot-jaarlaag bevat 170 regels voor 1967–1969, 1972–1975, 1988–1991, 1993, 1997, 2002, 2005–2006 en 2017–2025. Zes uitvoeringen zijn via de nameninventaris aan 32 kavelsituaties gekoppeld; Pan 13 en Plas 20 voegen elf aanvullende relaties toe, Helmduinen drie, de Kikkervalleienbegrazing drie, het Kikkervalleien-bodemherstel drie, de Kikkervalleien-infrastructuuringreep drie, de Watercrassulabestrijding drie, Parnassiapad 2 één, Parnassiapad 1 één, Plas 8.4.2 één, Waalsdorp twee, Meeuwenduin en Prinsenduin samen dertien en de konijnenbijplaatsingsproef twee. Nog 20 uitvoeringen hebben geen directe plotkoppeling.</w:t>
+        <w:t xml:space="preserve">Bronvast op project-, uitvoering- en jaarniveau voor de 30 ingevoerde bronnen en 62 uitvoeringen. De algemene kavel- en gebiedsindeling is geometrisch beschikbaar voor de 55 actuele plots uit 2025; vijf expliciet gekoppelde historische kavels hebben geen afzonderlijke geometrie. De bronvaste plot-jaarlaag bevat 170 regels voor 1967–1969, 1972–1975, 1988–1991, 1993, 1997, 2002, 2005–2006 en 2017–2025. Zes uitvoeringen zijn via de nameninventaris aan 32 kavelsituaties gekoppeld; Pan 13 en Plas 20 voegen elf aanvullende relaties toe, Helmduinen drie, de Kikkervalleienbegrazing drie, het Kikkervalleien-bodemherstel drie, de Kikkervalleien-infrastructuuringreep drie, de Watercrassulabestrijding drie, Parnassiapad 2 één, Parnassiapad 1 één, Plas 8.4.2 één, Waalsdorp twee, Meeuwenduin en Prinsenduin samen dertien, de konijnenbijplaatsingsproef twee en het elektriciteitswerk in Vallei Meijendel één. Nog 19 uitvoeringen hebben geen directe plotkoppeling.</w:t>
       </w:r>
     </w:p>
     <w:p>

</xml_diff>

<commit_message>
Koppel Paardenstal aan M51
</commit_message>
<xml_diff>
--- a/docs/MEIJENDEL_BRONREGISTER.docx
+++ b/docs/MEIJENDEL_BRONREGISTER.docx
@@ -6368,7 +6368,7 @@
         <w:pStyle w:val="BodyText"/>
       </w:pPr>
       <w:r>
-        <w:t xml:space="preserve">Daarbij zijn acht officiële internetbronnen geraadpleegd: vijf Dunea-pagina’s over optimalisatie van de waterwinning, beheer in Meeuwenduin en Prinsenduin, vervanging van slagbomen, actuele werkzaamheden en duindynamiek; het Dunea-jaarverslag 2024; het Zuid-Hollandse subsidie-openstellingsbesluit voor Bendel; en de ODH-beschikking van 28 augustus 2023 voor de konijnenbijplaatsingsproef. De bronnen staan afzonderlijk in</w:t>
+        <w:t xml:space="preserve">Daarbij zijn negen officiële internetbronnen geraadpleegd: vijf Dunea-pagina’s over optimalisatie van de waterwinning, beheer in Meeuwenduin en Prinsenduin, vervanging van slagbomen, actuele werkzaamheden en duindynamiek; het Dunea-jaarverslag 2024; het Zuid-Hollandse subsidie-openstellingsbesluit voor Bendel; de ODH-beschikking van 28 augustus 2023 voor de konijnenbijplaatsingsproef; en de ODH-beschikking van 5 november 2025 voor de renovatie van de Paardenstal. De bronnen staan afzonderlijk in</w:t>
       </w:r>
       <w:r>
         <w:t xml:space="preserve"> </w:t>
@@ -6398,7 +6398,7 @@
         <w:t xml:space="preserve"> </w:t>
       </w:r>
       <w:r>
-        <w:t xml:space="preserve">De levende lokale database bevat 18 projecten, 30 bronnen, 62 uitvoeringen, 100 expliciete jaarbeoordelingen uit 1967–2025 en 83 bronkoppelingen. Van de jaarbeoordelingen zijn er 84</w:t>
+        <w:t xml:space="preserve">De levende lokale database bevat 18 projecten, 31 bronnen, 62 uitvoeringen, 100 expliciete jaarbeoordelingen uit 1967–2025 en 84 bronkoppelingen. Van de jaarbeoordelingen zijn er 84</w:t>
       </w:r>
       <w:r>
         <w:t xml:space="preserve"> </w:t>
@@ -6519,7 +6519,7 @@
         <w:t xml:space="preserve"> </w:t>
       </w:r>
       <w:r>
-        <w:t xml:space="preserve">bevat 115 geverifieerde directe relaties. Daarvan waren 36 al onderbouwd met expliciete kavelvermeldingen, gebruikersvaststellingen of een bijzondere gebiedsnaam. De nameninventaris voegt 32 geometrische doorsnijdingen toe voor zes volledig en letterlijk gelokaliseerde uitvoeringen met de naamobjecten Kijfhoek, Bierlap, Meeuwenhoek, Tafelberg, ’t Scheepje, Uilenbosch en Oude Rijs uit</w:t>
+        <w:t xml:space="preserve">bevat 116 geverifieerde directe relaties. Daarvan waren 36 al onderbouwd met expliciete kavelvermeldingen, gebruikersvaststellingen of een bijzondere gebiedsnaam. De nameninventaris voegt 32 geometrische doorsnijdingen toe voor zes volledig en letterlijk gelokaliseerde uitvoeringen met de naamobjecten Kijfhoek, Bierlap, Meeuwenhoek, Tafelberg, ’t Scheepje, Uilenbosch en Oude Rijs uit</w:t>
       </w:r>
       <w:r>
         <w:t xml:space="preserve"> </w:t>
@@ -7121,7 +7121,34 @@
         <w:pStyle w:val="BodyText"/>
       </w:pPr>
       <w:r>
-        <w:t xml:space="preserve">De 115 plotkoppelingen en 84 uitgevoerde jaarregels leveren samen 170 regels in</w:t>
+        <w:t xml:space="preserve">De werkzaamheden aan de Paardenstal zijn op 15 oktober 2026 door Ton gekoppeld aan M51. De definitieve ODH-beschikking van 5 november 2025, zaak 01132870 en kenmerk ODH1498120, beschrijft vervanging van houten dakdelen, plaatsing van zonnecollectoren, aanpassing van gevels en kozijnen en aanleg van water- en elektriciteitsleidingen. Zij legt tevens mitigerende maatregelen vast voor vier zomerverblijfplaatsen en één paarverblijfplaats van de Gewone dwergvleermuis. De kaartbijlagen op pagina 12–14 begrenzen de Paardenstal naast De Tapuit en Boerderij Meyendel. De exacte werkvoetafdruk binnen M51 is niet gepubliceerd;</w:t>
+      </w:r>
+      <w:r>
+        <w:t xml:space="preserve"> </w:t>
+      </w:r>
+      <w:r>
+        <w:rPr>
+          <w:rStyle w:val="VerbatimChar"/>
+        </w:rPr>
+        <w:t xml:space="preserve">doorsnijding_pct</w:t>
+      </w:r>
+      <w:r>
+        <w:t xml:space="preserve"> </w:t>
+      </w:r>
+      <w:r>
+        <w:t xml:space="preserve">blijft leeg. Dunea noemt 1 november 2026 tot en met 31 maart 2027 als werkperiode. Omdat noch Dunea noch de beschikking op 15 oktober 2026 uitvoering bevestigt, blijft de status</w:t>
+      </w:r>
+      <w:r>
+        <w:t xml:space="preserve"> </w:t>
+      </w:r>
+      <w:r>
+        <w:rPr>
+          <w:rStyle w:val="VerbatimChar"/>
+        </w:rPr>
+        <w:t xml:space="preserve">gepland</w:t>
+      </w:r>
+      <w:r>
+        <w:t xml:space="preserve">; de uitvoering heeft nul jaarregels en voegt geen regel toe aan</w:t>
       </w:r>
       <w:r>
         <w:t xml:space="preserve"> </w:t>
@@ -7133,6 +7160,26 @@
         <w:t xml:space="preserve">v_plot_jaar_maatregel_bronvast</w:t>
       </w:r>
       <w:r>
+        <w:t xml:space="preserve">.</w:t>
+      </w:r>
+    </w:p>
+    <w:p>
+      <w:pPr>
+        <w:pStyle w:val="BodyText"/>
+      </w:pPr>
+      <w:r>
+        <w:t xml:space="preserve">De 116 plotkoppelingen en 84 uitgevoerde jaarregels leveren samen 170 regels in</w:t>
+      </w:r>
+      <w:r>
+        <w:t xml:space="preserve"> </w:t>
+      </w:r>
+      <w:r>
+        <w:rPr>
+          <w:rStyle w:val="VerbatimChar"/>
+        </w:rPr>
+        <w:t xml:space="preserve">v_plot_jaar_maatregel_bronvast</w:t>
+      </w:r>
+      <w:r>
         <w:t xml:space="preserve">. De nameninventaris voegt 36 plot-jaarrijen toe: begrazing in Kijfhoek en Bierlap in 1990, hervat maaibeheer bij Tafelberg en ’t Scheepje in 2025, uitgevoerd maaibeheer in Uilenbosch in 2017–2021 en vogelkersbestrijding in Kijfhoek, Bierlap en Meeuwenhoek in 2020. De aanvullende systeemkoppelingen voegen 22 plot-jaarrijen toe: vier voor de oeveraanpassing van Pan 13 in 1988–1989 en achttien voor drie uitvoeringen in Plas 20 in 2005–2006. De Helmduinen-koppeling voegt drie plot-jaarrijen voor 1991 toe. De uitbreiding van de begrazing met de Kikkervalleien, de eenmalige verwijdering van vegetatie en voedselrijke bovengrond en het verwijderen van leidingen en putten voegen ieder drie plot-jaarrijen voor 1997 toe; Parnassiapad 2 voegt één plot-jaarrij voor M15 in 1993 toe en Parnassiapad 1 één voor M15 in 1997. De Watercrassulabestrijding voegt dertig plot-jaarrijen toe voor M13, M13s en M14 in 2015 en 2017–2025. Het opslagbeheer in Meeuwenduin en Prinsenduin voegt negen plot-jaarrijen voor 2023 toe; de afzonderlijke voortzetting in Prinsenduin voegt vier plot-jaarrijen voor 2024 toe. De konijnenbijplaatsingsproef voegt twee plot-jaarrijen toe voor M8 en M41 in 2024. De koppeling van Plas 8.4.2 aan M32 voegt één plot-jaarrij voor 2002 toe. Waalsdorp voegt acht plot-jaarrijen toe voor M84 en M43 in 2016–2019. De statussen</w:t>
       </w:r>
       <w:r>
@@ -7193,7 +7240,7 @@
         <w:t xml:space="preserve"> </w:t>
       </w:r>
       <w:r>
-        <w:t xml:space="preserve">is vastgelegd. Voorlinden en het elektriciteitswerk in M51 leveren evenmin een plot-jaarrij, omdat zij geen uitgevoerde jaarstatus hebben.</w:t>
+        <w:t xml:space="preserve">is vastgelegd. Voorlinden, het elektriciteitswerk in M51 en de Paardenstal in M51 leveren evenmin een plot-jaarrij, omdat zij geen uitgevoerde jaarstatus hebben.</w:t>
       </w:r>
     </w:p>
     <w:p>
@@ -7259,7 +7306,7 @@
         <w:t xml:space="preserve"> </w:t>
       </w:r>
       <w:r>
-        <w:t xml:space="preserve">Bronvast op project-, uitvoering- en jaarniveau voor de 30 ingevoerde bronnen en 62 uitvoeringen. De algemene kavel- en gebiedsindeling is geometrisch beschikbaar voor de 55 actuele plots uit 2025; vijf expliciet gekoppelde historische kavels hebben geen afzonderlijke geometrie. De bronvaste plot-jaarlaag bevat 170 regels voor 1967–1969, 1972–1975, 1988–1991, 1993, 1997, 2002, 2005–2006 en 2017–2025. Zes uitvoeringen zijn via de nameninventaris aan 32 kavelsituaties gekoppeld; Pan 13 en Plas 20 voegen elf aanvullende relaties toe, Helmduinen drie, de Kikkervalleienbegrazing drie, het Kikkervalleien-bodemherstel drie, de Kikkervalleien-infrastructuuringreep drie, de Watercrassulabestrijding drie, Parnassiapad 2 één, Parnassiapad 1 één, Plas 8.4.2 één, Waalsdorp twee, Meeuwenduin en Prinsenduin samen dertien, de konijnenbijplaatsingsproef twee en het elektriciteitswerk in Vallei Meijendel één. Nog 19 uitvoeringen hebben geen directe plotkoppeling.</w:t>
+        <w:t xml:space="preserve">Bronvast op project-, uitvoering- en jaarniveau voor de 31 ingevoerde bronnen en 62 uitvoeringen. De algemene kavel- en gebiedsindeling is geometrisch beschikbaar voor de 55 actuele plots uit 2025; vijf expliciet gekoppelde historische kavels hebben geen afzonderlijke geometrie. De bronvaste plot-jaarlaag bevat 170 regels voor 1967–1969, 1972–1975, 1988–1991, 1993, 1997, 2002, 2005–2006 en 2017–2025. Zes uitvoeringen zijn via de nameninventaris aan 32 kavelsituaties gekoppeld; Pan 13 en Plas 20 voegen elf aanvullende relaties toe, Helmduinen drie, de Kikkervalleienbegrazing drie, het Kikkervalleien-bodemherstel drie, de Kikkervalleien-infrastructuuringreep drie, de Watercrassulabestrijding drie, Parnassiapad 2 één, Parnassiapad 1 één, Plas 8.4.2 één, Waalsdorp twee, Meeuwenduin en Prinsenduin samen dertien, de konijnenbijplaatsingsproef twee, het elektriciteitswerk in Vallei Meijendel één en de Paardenstal één. Nog 18 uitvoeringen hebben geen directe plotkoppeling.</w:t>
       </w:r>
     </w:p>
     <w:p>

</xml_diff>

<commit_message>
Markeer Bendel buiten Meijendel-plots
</commit_message>
<xml_diff>
--- a/docs/MEIJENDEL_BRONREGISTER.docx
+++ b/docs/MEIJENDEL_BRONREGISTER.docx
@@ -6297,7 +6297,7 @@
         <w:pStyle w:val="BodyText"/>
       </w:pPr>
       <w:r>
-        <w:t xml:space="preserve">De brede tekstselectie bevatte 351 bijlagen. De strengere selectie op formuleringen die feitelijke uitvoering aanduiden bevatte 206 bijlagen bij 190 bibliografische bronnen. Na beoordeling op uitvoering, locatie, jaar, dubbeling en brontype zijn zestien aanvullende Zotero-bronnen ingevoerd: de vogelrapporten over 1967, 1968, 1969, 1972, 1973, 1974 en 1975; de rietpotenproef uit 1987/1992; publicaties over begrazing uit 2008 en 2012;</w:t>
+        <w:t xml:space="preserve">De brede tekstselectie bevatte 351 bijlagen. De strengere selectie op formuleringen die feitelijke uitvoering aanduiden bevatte 206 bijlagen bij 190 bibliografische bronnen. Na beoordeling op uitvoering, locatie, jaar, dubbeling en brontype zijn zeventien aanvullende Zotero-bronnen ingevoerd: de vogelrapporten over 1967, 1968, 1969, 1972, 1973, 1974 en 1975; de rietpotenproef uit 1987/1992; publicaties over begrazing uit 2008 en 2012;</w:t>
       </w:r>
       <w:r>
         <w:t xml:space="preserve"> </w:t>
@@ -6329,7 +6329,7 @@
         <w:t xml:space="preserve"> </w:t>
       </w:r>
       <w:r>
-        <w:t xml:space="preserve">86 uit 2025 met de kaart van de dagvlinderroute Parnassiapad; en</w:t>
+        <w:t xml:space="preserve">86 uit 2025 met de kaart van de dagvlinderroute Parnassiapad;</w:t>
       </w:r>
       <w:r>
         <w:t xml:space="preserve"> </w:t>
@@ -6345,7 +6345,23 @@
         <w:t xml:space="preserve"> </w:t>
       </w:r>
       <w:r>
-        <w:t xml:space="preserve">30 uit november 1996 met de expliciete plaatsing van Sprang PI in M13s en van het betrokken rietgebied in M13s en M14. Samen met de zes al gebruikte Zotero-bronnen bevat</w:t>
+        <w:t xml:space="preserve">30 uit november 1996 met de expliciete plaatsing van Sprang PI in M13s en van het betrokken rietgebied in M13s en M14; en</w:t>
+      </w:r>
+      <w:r>
+        <w:t xml:space="preserve"> </w:t>
+      </w:r>
+      <w:r>
+        <w:rPr>
+          <w:i/>
+          <w:iCs/>
+        </w:rPr>
+        <w:t xml:space="preserve">Holland’s Duinen</w:t>
+      </w:r>
+      <w:r>
+        <w:t xml:space="preserve"> </w:t>
+      </w:r>
+      <w:r>
+        <w:t xml:space="preserve">88 uit april 2026 met de afgeronde herinrichting van Bendel. Samen met de zes al gebruikte Zotero-bronnen bevat</w:t>
       </w:r>
       <w:r>
         <w:t xml:space="preserve"> </w:t>
@@ -6360,15 +6376,15 @@
         <w:t xml:space="preserve"> </w:t>
       </w:r>
       <w:r>
-        <w:t xml:space="preserve">nu 22 lokale Zotero-bronnen. Dubbele exemplaren, algemene gebiedsbeschrijvingen, uitsluitend voorgenomen werk en niet-lokaliseerbare vermeldingen zijn niet als afzonderlijke uitvoering ingevoerd.</w:t>
-      </w:r>
-    </w:p>
-    <w:p>
-      <w:pPr>
-        <w:pStyle w:val="BodyText"/>
-      </w:pPr>
-      <w:r>
-        <w:t xml:space="preserve">Daarbij zijn negen officiële internetbronnen geraadpleegd: vijf Dunea-pagina’s over optimalisatie van de waterwinning, beheer in Meeuwenduin en Prinsenduin, vervanging van slagbomen, actuele werkzaamheden en duindynamiek; het Dunea-jaarverslag 2024; het Zuid-Hollandse subsidie-openstellingsbesluit voor Bendel; de ODH-beschikking van 28 augustus 2023 voor de konijnenbijplaatsingsproef; en de ODH-beschikking van 5 november 2025 voor de renovatie van de Paardenstal. De bronnen staan afzonderlijk in</w:t>
+        <w:t xml:space="preserve">nu 23 lokale Zotero-bronnen. Dubbele exemplaren, algemene gebiedsbeschrijvingen, uitsluitend voorgenomen werk en niet-lokaliseerbare vermeldingen zijn niet als afzonderlijke uitvoering ingevoerd.</w:t>
+      </w:r>
+    </w:p>
+    <w:p>
+      <w:pPr>
+        <w:pStyle w:val="BodyText"/>
+      </w:pPr>
+      <w:r>
+        <w:t xml:space="preserve">Daarbij zijn tien officiële internetbronnen geraadpleegd: vijf Dunea-pagina’s over optimalisatie van de waterwinning, beheer in Meeuwenduin en Prinsenduin, vervanging van slagbomen, actuele werkzaamheden en duindynamiek; het Dunea-jaarverslag 2024; het Zuid-Hollandse subsidie-openstellingsbesluit voor Bendel; de Staatsbosbeheer-pagina over de herinrichting van Bendel; de ODH-beschikking van 28 augustus 2023 voor de konijnenbijplaatsingsproef; en de ODH-beschikking van 5 november 2025 voor de renovatie van de Paardenstal. De bronnen staan afzonderlijk in</w:t>
       </w:r>
       <w:r>
         <w:t xml:space="preserve"> </w:t>
@@ -6398,7 +6414,7 @@
         <w:t xml:space="preserve"> </w:t>
       </w:r>
       <w:r>
-        <w:t xml:space="preserve">De levende lokale database bevat 18 projecten, 31 bronnen, 62 uitvoeringen, 100 expliciete jaarbeoordelingen uit 1967–2025 en 84 bronkoppelingen. Van de jaarbeoordelingen zijn er 84</w:t>
+        <w:t xml:space="preserve">De levende lokale database bevat 18 projecten, 33 bronnen, 63 uitvoeringen, 102 expliciete jaarbeoordelingen uit 1967–2026 en 86 bronkoppelingen. Van de jaarbeoordelingen zijn er 86</w:t>
       </w:r>
       <w:r>
         <w:t xml:space="preserve"> </w:t>
@@ -6437,7 +6453,7 @@
         <w:t xml:space="preserve">onbekend</w:t>
       </w:r>
       <w:r>
-        <w:t xml:space="preserve">. De uitvoering in Meeuwenduin en Prinsenduin is gesplitst: 2023 betreft beide naamgebieden; 2024 uitsluitend Prinsenduin. De nieuwe invoer voegt 28 feitelijke uitvoeringen uit 1967–2006 toe. Zij betreft waterwinning en infiltratieplassen, pad- en rasterwerk, zandvastlegging, de rietpotenproef, begrazing, maaien, plaggen en slibverwijdering. De datumvelden van de totale laag lopen van 1967 tot en met een gepland einde in maart 2027. Geplande werkzaamheden bij de Paardenstal en het subsidieerbare Bendel-nabeheer hebben geen uitgevoerd jaar gekregen; elektriciteitswerk in Vallei Meijendel staat als uitvoering onbekend en heeft eveneens geen jaarregel.</w:t>
+        <w:t xml:space="preserve">. De uitvoering in Meeuwenduin en Prinsenduin is gesplitst: 2023 betreft beide naamgebieden; 2024 uitsluitend Prinsenduin. De nieuwe invoer voegt 28 feitelijke uitvoeringen uit 1967–2006 toe. Zij betreft waterwinning en infiltratieplassen, pad- en rasterwerk, zandvastlegging, de rietpotenproef, begrazing, maaien, plaggen en slibverwijdering. De datumvelden van de totale laag lopen van 1967 tot en met een gepland einde in maart 2027. Geplande werkzaamheden bij de Paardenstal en het subsidieerbare Bendel-nabeheer hebben geen uitgevoerd jaar gekregen; elektriciteitswerk in Vallei Meijendel staat als uitvoering onbekend en heeft eveneens geen jaarregel. De afzonderlijke herinrichting van Bendel is voor 2025 en 2026 als uitgevoerd vastgelegd, maar ligt buiten het Meijendel-plotgebied.</w:t>
       </w:r>
     </w:p>
     <w:p>
@@ -7168,7 +7184,61 @@
         <w:pStyle w:val="BodyText"/>
       </w:pPr>
       <w:r>
-        <w:t xml:space="preserve">De 116 plotkoppelingen en 84 uitgevoerde jaarregels leveren samen 170 regels in</w:t>
+        <w:t xml:space="preserve">Bendel is op 15 oktober 2026 als buiten het Meijendel-plotgebied beoordeeld. De nameninventaris bevat 182 objecten maar geen object met de naam Bendel. Staatsbosbeheer lokaliseert het gebied expliciet in Berkheide-Noord.</w:t>
+      </w:r>
+      <w:r>
+        <w:t xml:space="preserve"> </w:t>
+      </w:r>
+      <w:r>
+        <w:rPr>
+          <w:i/>
+          <w:iCs/>
+        </w:rPr>
+        <w:t xml:space="preserve">Holland’s Duinen</w:t>
+      </w:r>
+      <w:r>
+        <w:t xml:space="preserve"> </w:t>
+      </w:r>
+      <w:r>
+        <w:t xml:space="preserve">88 beschrijft daarnaast een afzonderlijke, afgeronde herinrichting van oktober 2025 tot maart 2026: herstel van historische duinakkers, dynamisch grijs duin en vochtige duinvalleien, plus aanleg van twee duinpoelen. Deze uitvoering heeft twee uitgevoerde jaarregels, voor 2025 en 2026. Het provinciale openstellingsbesluit van 22 april 2026 betreft aansluitend nabeheer voor H2130 en H2190, maar bewijst geen opdracht of uitvoering van dat nabeheer. Beide uitvoeringen zijn in</w:t>
+      </w:r>
+      <w:r>
+        <w:t xml:space="preserve"> </w:t>
+      </w:r>
+      <w:r>
+        <w:rPr>
+          <w:rStyle w:val="VerbatimChar"/>
+        </w:rPr>
+        <w:t xml:space="preserve">maatregel_uitvoering_plotscope</w:t>
+      </w:r>
+      <w:r>
+        <w:t xml:space="preserve"> </w:t>
+      </w:r>
+      <w:r>
+        <w:t xml:space="preserve">gemarkeerd als</w:t>
+      </w:r>
+      <w:r>
+        <w:t xml:space="preserve"> </w:t>
+      </w:r>
+      <w:r>
+        <w:rPr>
+          <w:rStyle w:val="VerbatimChar"/>
+        </w:rPr>
+        <w:t xml:space="preserve">buiten_meijendel_plotgebied</w:t>
+      </w:r>
+      <w:r>
+        <w:t xml:space="preserve"> </w:t>
+      </w:r>
+      <w:r>
+        <w:t xml:space="preserve">en krijgen geen Meijendel-kavelrelatie of plot-jaarrij.</w:t>
+      </w:r>
+    </w:p>
+    <w:p>
+      <w:pPr>
+        <w:pStyle w:val="BodyText"/>
+      </w:pPr>
+      <w:r>
+        <w:t xml:space="preserve">De 116 plotkoppelingen en 86 uitgevoerde jaarregels leveren samen 170 regels in</w:t>
       </w:r>
       <w:r>
         <w:t xml:space="preserve"> </w:t>
@@ -7240,7 +7310,7 @@
         <w:t xml:space="preserve"> </w:t>
       </w:r>
       <w:r>
-        <w:t xml:space="preserve">is vastgelegd. Voorlinden, het elektriciteitswerk in M51 en de Paardenstal in M51 leveren evenmin een plot-jaarrij, omdat zij geen uitgevoerde jaarstatus hebben.</w:t>
+        <w:t xml:space="preserve">is vastgelegd. Voorlinden, het elektriciteitswerk in M51 en de Paardenstal in M51 leveren evenmin een plot-jaarrij, omdat zij geen uitgevoerde jaarstatus hebben. De twee Bendel-jaarregels blijven buiten deze view omdat beide Bendel-uitvoeringen expliciet buiten het Meijendel-plotgebied vallen.</w:t>
       </w:r>
     </w:p>
     <w:p>
@@ -7306,7 +7376,7 @@
         <w:t xml:space="preserve"> </w:t>
       </w:r>
       <w:r>
-        <w:t xml:space="preserve">Bronvast op project-, uitvoering- en jaarniveau voor de 31 ingevoerde bronnen en 62 uitvoeringen. De algemene kavel- en gebiedsindeling is geometrisch beschikbaar voor de 55 actuele plots uit 2025; vijf expliciet gekoppelde historische kavels hebben geen afzonderlijke geometrie. De bronvaste plot-jaarlaag bevat 170 regels voor 1967–1969, 1972–1975, 1988–1991, 1993, 1997, 2002, 2005–2006 en 2017–2025. Zes uitvoeringen zijn via de nameninventaris aan 32 kavelsituaties gekoppeld; Pan 13 en Plas 20 voegen elf aanvullende relaties toe, Helmduinen drie, de Kikkervalleienbegrazing drie, het Kikkervalleien-bodemherstel drie, de Kikkervalleien-infrastructuuringreep drie, de Watercrassulabestrijding drie, Parnassiapad 2 één, Parnassiapad 1 één, Plas 8.4.2 één, Waalsdorp twee, Meeuwenduin en Prinsenduin samen dertien, de konijnenbijplaatsingsproef twee, het elektriciteitswerk in Vallei Meijendel één en de Paardenstal één. Nog 18 uitvoeringen hebben geen directe plotkoppeling.</w:t>
+        <w:t xml:space="preserve">Bronvast op project-, uitvoering- en jaarniveau voor de 33 ingevoerde bronnen en 63 uitvoeringen. De algemene kavel- en gebiedsindeling is geometrisch beschikbaar voor de 55 actuele plots uit 2025; vijf expliciet gekoppelde historische kavels hebben geen afzonderlijke geometrie. De bronvaste plot-jaarlaag bevat 170 regels voor 1967–1969, 1972–1975, 1988–1991, 1993, 1997, 2002, 2005–2006 en 2017–2025. Zes uitvoeringen zijn via de nameninventaris aan 32 kavelsituaties gekoppeld; Pan 13 en Plas 20 voegen elf aanvullende relaties toe, Helmduinen drie, de Kikkervalleienbegrazing drie, het Kikkervalleien-bodemherstel drie, de Kikkervalleien-infrastructuuringreep drie, de Watercrassulabestrijding drie, Parnassiapad 2 één, Parnassiapad 1 één, Plas 8.4.2 één, Waalsdorp twee, Meeuwenduin en Prinsenduin samen dertien, de konijnenbijplaatsingsproef twee, het elektriciteitswerk in Vallei Meijendel één en de Paardenstal één. Negentien uitvoeringen hebben geen directe plotkoppeling; de twee Bendel-uitvoeringen zijn daarvan aantoonbaar buiten het Meijendel-plotgebied geplaatst, zodat nog 17 uitvoeringen ruimtelijk moeten worden beoordeeld.</w:t>
       </w:r>
     </w:p>
     <w:p>

</xml_diff>

<commit_message>
Koppel Duindoornbeheer aan Kikkervalleien
</commit_message>
<xml_diff>
--- a/docs/MEIJENDEL_BRONREGISTER.docx
+++ b/docs/MEIJENDEL_BRONREGISTER.docx
@@ -6535,7 +6535,7 @@
         <w:t xml:space="preserve"> </w:t>
       </w:r>
       <w:r>
-        <w:t xml:space="preserve">bevat 116 geverifieerde directe relaties. Daarvan waren 36 al onderbouwd met expliciete kavelvermeldingen, gebruikersvaststellingen of een bijzondere gebiedsnaam. De nameninventaris voegt 32 geometrische doorsnijdingen toe voor zes volledig en letterlijk gelokaliseerde uitvoeringen met de naamobjecten Kijfhoek, Bierlap, Meeuwenhoek, Tafelberg, ’t Scheepje, Uilenbosch en Oude Rijs uit</w:t>
+        <w:t xml:space="preserve">bevat 119 geverifieerde directe relaties. Daarvan waren 36 al onderbouwd met expliciete kavelvermeldingen, gebruikersvaststellingen of een bijzondere gebiedsnaam. De nameninventaris voegt 32 geometrische doorsnijdingen toe voor zes volledig en letterlijk gelokaliseerde uitvoeringen met de naamobjecten Kijfhoek, Bierlap, Meeuwenhoek, Tafelberg, ’t Scheepje, Uilenbosch en Oude Rijs uit</w:t>
       </w:r>
       <w:r>
         <w:t xml:space="preserve"> </w:t>
@@ -6729,7 +6729,7 @@
         <w:pStyle w:val="BodyText"/>
       </w:pPr>
       <w:r>
-        <w:t xml:space="preserve">Ook het verwijderen van de omgevende leidingen en putten van Sprang PI en I in 1997 is gekoppeld aan M13, M13s en M14.</w:t>
+        <w:t xml:space="preserve">Ook het nabeheer tegen Duindoorn in de Kikkervalleien is gekoppeld aan M13, M13s en M14.</w:t>
       </w:r>
       <w:r>
         <w:t xml:space="preserve"> </w:t>
@@ -6739,25 +6739,36 @@
           <w:i/>
           <w:iCs/>
         </w:rPr>
-        <w:t xml:space="preserve">Meijendel Mededelingen</w:t>
-      </w:r>
-      <w:r>
-        <w:t xml:space="preserve"> </w:t>
-      </w:r>
-      <w:r>
-        <w:t xml:space="preserve">30 van november 1996 koppelt Sprang PI op pagina 99 letterlijk aan M13s en plaatst het betrokken rietgebied in M13s en M14; deze twee relaties zijn daarom</w:t>
-      </w:r>
-      <w:r>
-        <w:t xml:space="preserve"> </w:t>
-      </w:r>
-      <w:r>
-        <w:rPr>
-          <w:rStyle w:val="VerbatimChar"/>
-        </w:rPr>
-        <w:t xml:space="preserve">expliciet_in_bron</w:t>
-      </w:r>
-      <w:r>
-        <w:t xml:space="preserve">. De bronkaarten plaatsen Sprang I aan de oostzijde van het werkgebied en</w:t>
+        <w:t xml:space="preserve">Holland’s Duinen</w:t>
+      </w:r>
+      <w:r>
+        <w:t xml:space="preserve"> </w:t>
+      </w:r>
+      <w:r>
+        <w:t xml:space="preserve">55 vermeldt op pagina 5 dat na de herinrichting van 1997 eerst handmatig en later vooral machinaal Duindoorn is bestreden; de samenvatting op pagina 36 noemt jaarlijks maaien van de valleien om Duindoorn tegen te gaan. Pagina 22 benoemt M13, M13s en M14 als de kavels waarin de Kikkervalleien praktisch geheel liggen. Ton bevestigde de koppeling op 15 oktober 2026. De publicatie beschrijft ontwikkelingen tot en met 2009, maar geeft geen sluitende uitvoeringsreeks of behandelingsoppervlakte per kavel. Daarom blijven</w:t>
+      </w:r>
+      <w:r>
+        <w:t xml:space="preserve"> </w:t>
+      </w:r>
+      <w:r>
+        <w:rPr>
+          <w:rStyle w:val="VerbatimChar"/>
+        </w:rPr>
+        <w:t xml:space="preserve">doorsnijding_pct</w:t>
+      </w:r>
+      <w:r>
+        <w:t xml:space="preserve"> </w:t>
+      </w:r>
+      <w:r>
+        <w:t xml:space="preserve">en de jaarlaag leeg; de drie relaties voegen geen regel toe aan de bronvaste plot-jaarlaag.</w:t>
+      </w:r>
+    </w:p>
+    <w:p>
+      <w:pPr>
+        <w:pStyle w:val="BodyText"/>
+      </w:pPr>
+      <w:r>
+        <w:t xml:space="preserve">Ook het verwijderen van de omgevende leidingen en putten van Sprang PI en I in 1997 is gekoppeld aan M13, M13s en M14.</w:t>
       </w:r>
       <w:r>
         <w:t xml:space="preserve"> </w:t>
@@ -6767,48 +6778,25 @@
           <w:i/>
           <w:iCs/>
         </w:rPr>
-        <w:t xml:space="preserve">Holland’s Duinen</w:t>
-      </w:r>
-      <w:r>
-        <w:t xml:space="preserve"> </w:t>
-      </w:r>
-      <w:r>
-        <w:t xml:space="preserve">55 plaatst het geschoonde gebied praktisch geheel binnen de drie kavels. Ton bevestigde M13 op 14 oktober 2026; die relatie is daarom</w:t>
-      </w:r>
-      <w:r>
-        <w:t xml:space="preserve"> </w:t>
-      </w:r>
-      <w:r>
-        <w:rPr>
-          <w:rStyle w:val="VerbatimChar"/>
-        </w:rPr>
-        <w:t xml:space="preserve">benoemd_gebied_gevalideerd</w:t>
-      </w:r>
-      <w:r>
-        <w:t xml:space="preserve">. Een exacte geometrie van leidingen en putten ontbreekt voor alle drie kavels, zodat</w:t>
-      </w:r>
-      <w:r>
-        <w:t xml:space="preserve"> </w:t>
-      </w:r>
-      <w:r>
-        <w:rPr>
-          <w:rStyle w:val="VerbatimChar"/>
-        </w:rPr>
-        <w:t xml:space="preserve">doorsnijding_pct</w:t>
-      </w:r>
-      <w:r>
-        <w:t xml:space="preserve"> </w:t>
-      </w:r>
-      <w:r>
-        <w:t xml:space="preserve">leeg blijft. Dit was een eenmalige ingreep in 1997.</w:t>
-      </w:r>
-    </w:p>
-    <w:p>
-      <w:pPr>
-        <w:pStyle w:val="BodyText"/>
-      </w:pPr>
-      <w:r>
-        <w:t xml:space="preserve">Ton heeft op 14 oktober 2026 Plas 20 als volledig plassensysteem gelokaliseerd: de zuidelijke plas ligt in M17b, de middelste in M17a en de noordelijke in M16. De publicatie</w:t>
+        <w:t xml:space="preserve">Meijendel Mededelingen</w:t>
+      </w:r>
+      <w:r>
+        <w:t xml:space="preserve"> </w:t>
+      </w:r>
+      <w:r>
+        <w:t xml:space="preserve">30 van november 1996 koppelt Sprang PI op pagina 99 letterlijk aan M13s en plaatst het betrokken rietgebied in M13s en M14; deze twee relaties zijn daarom</w:t>
+      </w:r>
+      <w:r>
+        <w:t xml:space="preserve"> </w:t>
+      </w:r>
+      <w:r>
+        <w:rPr>
+          <w:rStyle w:val="VerbatimChar"/>
+        </w:rPr>
+        <w:t xml:space="preserve">expliciet_in_bron</w:t>
+      </w:r>
+      <w:r>
+        <w:t xml:space="preserve">. De bronkaarten plaatsen Sprang I aan de oostzijde van het werkgebied en</w:t>
       </w:r>
       <w:r>
         <w:t xml:space="preserve"> </w:t>
@@ -6818,13 +6806,48 @@
           <w:i/>
           <w:iCs/>
         </w:rPr>
-        <w:t xml:space="preserve">Schone start voor infiltratieplas 20 in Meijendel</w:t>
-      </w:r>
-      <w:r>
-        <w:t xml:space="preserve"> </w:t>
-      </w:r>
-      <w:r>
-        <w:t xml:space="preserve">toont het langgerekte systeem en de noordelijke, middelste en zuidelijke delen in figuur 1 en 2. Zij staat in</w:t>
+        <w:t xml:space="preserve">Holland’s Duinen</w:t>
+      </w:r>
+      <w:r>
+        <w:t xml:space="preserve"> </w:t>
+      </w:r>
+      <w:r>
+        <w:t xml:space="preserve">55 plaatst het geschoonde gebied praktisch geheel binnen de drie kavels. Ton bevestigde M13 op 14 oktober 2026; die relatie is daarom</w:t>
+      </w:r>
+      <w:r>
+        <w:t xml:space="preserve"> </w:t>
+      </w:r>
+      <w:r>
+        <w:rPr>
+          <w:rStyle w:val="VerbatimChar"/>
+        </w:rPr>
+        <w:t xml:space="preserve">benoemd_gebied_gevalideerd</w:t>
+      </w:r>
+      <w:r>
+        <w:t xml:space="preserve">. Een exacte geometrie van leidingen en putten ontbreekt voor alle drie kavels, zodat</w:t>
+      </w:r>
+      <w:r>
+        <w:t xml:space="preserve"> </w:t>
+      </w:r>
+      <w:r>
+        <w:rPr>
+          <w:rStyle w:val="VerbatimChar"/>
+        </w:rPr>
+        <w:t xml:space="preserve">doorsnijding_pct</w:t>
+      </w:r>
+      <w:r>
+        <w:t xml:space="preserve"> </w:t>
+      </w:r>
+      <w:r>
+        <w:t xml:space="preserve">leeg blijft. Dit was een eenmalige ingreep in 1997.</w:t>
+      </w:r>
+    </w:p>
+    <w:p>
+      <w:pPr>
+        <w:pStyle w:val="BodyText"/>
+      </w:pPr>
+      <w:r>
+        <w:t xml:space="preserve">Ton heeft op 14 oktober 2026 Plas 20 als volledig plassensysteem gelokaliseerd: de zuidelijke plas ligt in M17b, de middelste in M17a en de noordelijke in M16. De publicatie</w:t>
       </w:r>
       <w:r>
         <w:t xml:space="preserve"> </w:t>
@@ -6834,21 +6857,13 @@
           <w:i/>
           <w:iCs/>
         </w:rPr>
-        <w:t xml:space="preserve">Holland’s Duinen</w:t>
-      </w:r>
-      <w:r>
-        <w:t xml:space="preserve"> </w:t>
-      </w:r>
-      <w:r>
-        <w:t xml:space="preserve">48 van maart 2006; het Zotero-jaar 1989 is onjuist en verwijst in de tekst naar de eerdere slibverwijdering in Plas 13. Deze combinatie van gebruikersvaststelling en ruimtelijke broncontext onderbouwt twaalf koppelingen: drie voor de reparatie in 1969 en telkens drie voor slibverwijdering, hydrologische aanpassing en infrastructuurwerk in 2005–2006. Pan 13 is op grond van de primaire bron en het broedvogelverslag over 2006 als volledig plassensysteem in M2 en M3 gekoppeld; zowel de slibverwijdering als de oeveraanpassing in 1988–1989 heeft daardoor twee directe kavelrelaties.</w:t>
-      </w:r>
-    </w:p>
-    <w:p>
-      <w:pPr>
-        <w:pStyle w:val="BodyText"/>
-      </w:pPr>
-      <w:r>
-        <w:t xml:space="preserve">Ton heeft op 14 oktober 2026 ook Libellenvallei gelokaliseerd in M17b. De publicatie</w:t>
+        <w:t xml:space="preserve">Schone start voor infiltratieplas 20 in Meijendel</w:t>
+      </w:r>
+      <w:r>
+        <w:t xml:space="preserve"> </w:t>
+      </w:r>
+      <w:r>
+        <w:t xml:space="preserve">toont het langgerekte systeem en de noordelijke, middelste en zuidelijke delen in figuur 1 en 2. Zij staat in</w:t>
       </w:r>
       <w:r>
         <w:t xml:space="preserve"> </w:t>
@@ -6858,13 +6873,21 @@
           <w:i/>
           <w:iCs/>
         </w:rPr>
-        <w:t xml:space="preserve">Vegetatieontwikkeling in duinvalleien van Meijendel na opheffen van infiltratieplassen</w:t>
-      </w:r>
-      <w:r>
-        <w:t xml:space="preserve"> </w:t>
-      </w:r>
-      <w:r>
-        <w:t xml:space="preserve">in</w:t>
+        <w:t xml:space="preserve">Holland’s Duinen</w:t>
+      </w:r>
+      <w:r>
+        <w:t xml:space="preserve"> </w:t>
+      </w:r>
+      <w:r>
+        <w:t xml:space="preserve">48 van maart 2006; het Zotero-jaar 1989 is onjuist en verwijst in de tekst naar de eerdere slibverwijdering in Plas 13. Deze combinatie van gebruikersvaststelling en ruimtelijke broncontext onderbouwt twaalf koppelingen: drie voor de reparatie in 1969 en telkens drie voor slibverwijdering, hydrologische aanpassing en infrastructuurwerk in 2005–2006. Pan 13 is op grond van de primaire bron en het broedvogelverslag over 2006 als volledig plassensysteem in M2 en M3 gekoppeld; zowel de slibverwijdering als de oeveraanpassing in 1988–1989 heeft daardoor twee directe kavelrelaties.</w:t>
+      </w:r>
+    </w:p>
+    <w:p>
+      <w:pPr>
+        <w:pStyle w:val="BodyText"/>
+      </w:pPr>
+      <w:r>
+        <w:t xml:space="preserve">Ton heeft op 14 oktober 2026 ook Libellenvallei gelokaliseerd in M17b. De publicatie</w:t>
       </w:r>
       <w:r>
         <w:t xml:space="preserve"> </w:t>
@@ -6874,21 +6897,13 @@
           <w:i/>
           <w:iCs/>
         </w:rPr>
-        <w:t xml:space="preserve">Holland’s Duinen</w:t>
-      </w:r>
-      <w:r>
-        <w:t xml:space="preserve"> </w:t>
-      </w:r>
-      <w:r>
-        <w:t xml:space="preserve">42 van april 2003 vermeldt dat de Libellenvallei sinds 1975 eenmaal per jaar in het najaar wordt gemaaid. Deze combinatie onderbouwt één koppeling voor het maaibeheer, met een uitgevoerde jaarregel voor 1975.</w:t>
-      </w:r>
-    </w:p>
-    <w:p>
-      <w:pPr>
-        <w:pStyle w:val="BodyText"/>
-      </w:pPr>
-      <w:r>
-        <w:t xml:space="preserve">Ton heeft op 14 oktober 2026 Parnassiapad 2 gekoppeld aan M15. De primaire publicatie uit 2003 beschrijft twee permanente meetblokken binnen een circa twintig meter breed transect en noemt in 2001 een plagleeftijd van acht jaar; het uitvoeringsjaar is daarom als circa 1993 vastgelegd.</w:t>
+        <w:t xml:space="preserve">Vegetatieontwikkeling in duinvalleien van Meijendel na opheffen van infiltratieplassen</w:t>
+      </w:r>
+      <w:r>
+        <w:t xml:space="preserve"> </w:t>
+      </w:r>
+      <w:r>
+        <w:t xml:space="preserve">in</w:t>
       </w:r>
       <w:r>
         <w:t xml:space="preserve"> </w:t>
@@ -6904,30 +6919,15 @@
         <w:t xml:space="preserve"> </w:t>
       </w:r>
       <w:r>
-        <w:t xml:space="preserve">86 van mei 2025 toont op pagina 49, figuur 1, de route Parnassiapad aan de noordzijde van de Helmduinen en is als aanvullende ruimtelijke context geregistreerd. De precieze plaggrens binnen M15 is niet bekend;</w:t>
-      </w:r>
-      <w:r>
-        <w:t xml:space="preserve"> </w:t>
-      </w:r>
-      <w:r>
-        <w:rPr>
-          <w:rStyle w:val="VerbatimChar"/>
-        </w:rPr>
-        <w:t xml:space="preserve">doorsnijding_pct</w:t>
-      </w:r>
-      <w:r>
-        <w:t xml:space="preserve"> </w:t>
-      </w:r>
-      <w:r>
-        <w:t xml:space="preserve">blijft leeg.</w:t>
-      </w:r>
-    </w:p>
-    <w:p>
-      <w:pPr>
-        <w:pStyle w:val="BodyText"/>
-      </w:pPr>
-      <w:r>
-        <w:t xml:space="preserve">Ton heeft op 14 oktober 2026 ook Parnassiapad 1 gekoppeld aan M15. De primaire publicatie</w:t>
+        <w:t xml:space="preserve">42 van april 2003 vermeldt dat de Libellenvallei sinds 1975 eenmaal per jaar in het najaar wordt gemaaid. Deze combinatie onderbouwt één koppeling voor het maaibeheer, met een uitgevoerde jaarregel voor 1975.</w:t>
+      </w:r>
+    </w:p>
+    <w:p>
+      <w:pPr>
+        <w:pStyle w:val="BodyText"/>
+      </w:pPr>
+      <w:r>
+        <w:t xml:space="preserve">Ton heeft op 14 oktober 2026 Parnassiapad 2 gekoppeld aan M15. De primaire publicatie uit 2003 beschrijft twee permanente meetblokken binnen een circa twintig meter breed transect en noemt in 2001 een plagleeftijd van acht jaar; het uitvoeringsjaar is daarom als circa 1993 vastgelegd.</w:t>
       </w:r>
       <w:r>
         <w:t xml:space="preserve"> </w:t>
@@ -6937,13 +6937,13 @@
           <w:i/>
           <w:iCs/>
         </w:rPr>
-        <w:t xml:space="preserve">Vegetatieontwikkeling in duinvalleien van Meijendel na opheffen van infiltratieplassen</w:t>
-      </w:r>
-      <w:r>
-        <w:t xml:space="preserve"> </w:t>
-      </w:r>
-      <w:r>
-        <w:t xml:space="preserve">uit 2003 onderscheidt Parnassiapad 1 in tabel 1 als de circa vier jaar eerder geplagde blokken E en F; het uitvoeringsjaar is daarom als circa 1997 vastgelegd. Bijlage A toont de opbouw en oriëntatie van het transect, maar geen kavelgrens of exacte plaggeometrie. De precieze plaggrens binnen M15 is daarom niet bekend en</w:t>
+        <w:t xml:space="preserve">Holland’s Duinen</w:t>
+      </w:r>
+      <w:r>
+        <w:t xml:space="preserve"> </w:t>
+      </w:r>
+      <w:r>
+        <w:t xml:space="preserve">86 van mei 2025 toont op pagina 49, figuur 1, de route Parnassiapad aan de noordzijde van de Helmduinen en is als aanvullende ruimtelijke context geregistreerd. De precieze plaggrens binnen M15 is niet bekend;</w:t>
       </w:r>
       <w:r>
         <w:t xml:space="preserve"> </w:t>
@@ -6966,7 +6966,7 @@
         <w:pStyle w:val="BodyText"/>
       </w:pPr>
       <w:r>
-        <w:t xml:space="preserve">Ton heeft op 15 oktober 2026 Plas 8.4.2 gekoppeld aan M32.</w:t>
+        <w:t xml:space="preserve">Ton heeft op 14 oktober 2026 ook Parnassiapad 1 gekoppeld aan M15. De primaire publicatie</w:t>
       </w:r>
       <w:r>
         <w:t xml:space="preserve"> </w:t>
@@ -6976,13 +6976,36 @@
           <w:i/>
           <w:iCs/>
         </w:rPr>
-        <w:t xml:space="preserve">Slibverwijdering infiltratieplassen Meijendel</w:t>
-      </w:r>
-      <w:r>
-        <w:t xml:space="preserve"> </w:t>
-      </w:r>
-      <w:r>
-        <w:t xml:space="preserve">uit</w:t>
+        <w:t xml:space="preserve">Vegetatieontwikkeling in duinvalleien van Meijendel na opheffen van infiltratieplassen</w:t>
+      </w:r>
+      <w:r>
+        <w:t xml:space="preserve"> </w:t>
+      </w:r>
+      <w:r>
+        <w:t xml:space="preserve">uit 2003 onderscheidt Parnassiapad 1 in tabel 1 als de circa vier jaar eerder geplagde blokken E en F; het uitvoeringsjaar is daarom als circa 1997 vastgelegd. Bijlage A toont de opbouw en oriëntatie van het transect, maar geen kavelgrens of exacte plaggeometrie. De precieze plaggrens binnen M15 is daarom niet bekend en</w:t>
+      </w:r>
+      <w:r>
+        <w:t xml:space="preserve"> </w:t>
+      </w:r>
+      <w:r>
+        <w:rPr>
+          <w:rStyle w:val="VerbatimChar"/>
+        </w:rPr>
+        <w:t xml:space="preserve">doorsnijding_pct</w:t>
+      </w:r>
+      <w:r>
+        <w:t xml:space="preserve"> </w:t>
+      </w:r>
+      <w:r>
+        <w:t xml:space="preserve">blijft leeg.</w:t>
+      </w:r>
+    </w:p>
+    <w:p>
+      <w:pPr>
+        <w:pStyle w:val="BodyText"/>
+      </w:pPr>
+      <w:r>
+        <w:t xml:space="preserve">Ton heeft op 15 oktober 2026 Plas 8.4.2 gekoppeld aan M32.</w:t>
       </w:r>
       <w:r>
         <w:t xml:space="preserve"> </w:t>
@@ -6992,199 +7015,13 @@
           <w:i/>
           <w:iCs/>
         </w:rPr>
-        <w:t xml:space="preserve">Holland’s Duinen</w:t>
-      </w:r>
-      <w:r>
-        <w:t xml:space="preserve"> </w:t>
-      </w:r>
-      <w:r>
-        <w:t xml:space="preserve">46 van april 2005 vermeldt dat deze regelmatig verstopte plas in 2002 opnieuw is uitgebaggerd en toont haar als zuidwestelijke plas van Complex 8. Vergelijking van deze overzichtskaart met de actuele TOP10NL-watergeometrie en SOVON-kavelgeometrie plaatst de volledige plas in M32. De precieze werkvoetafdruk van de slibverwijdering binnen de plas is niet begrensd;</w:t>
-      </w:r>
-      <w:r>
-        <w:t xml:space="preserve"> </w:t>
-      </w:r>
-      <w:r>
-        <w:rPr>
-          <w:rStyle w:val="VerbatimChar"/>
-        </w:rPr>
-        <w:t xml:space="preserve">doorsnijding_pct</w:t>
-      </w:r>
-      <w:r>
-        <w:t xml:space="preserve"> </w:t>
-      </w:r>
-      <w:r>
-        <w:t xml:space="preserve">blijft daarom leeg.</w:t>
-      </w:r>
-    </w:p>
-    <w:p>
-      <w:pPr>
-        <w:pStyle w:val="BodyText"/>
-      </w:pPr>
-      <w:r>
-        <w:t xml:space="preserve">Ton heeft op 15 oktober 2026 maatregel 22d voor Waalsdorp gekoppeld aan M84 en M43 en M84s uitgesloten. De Natura 2000-evaluatie van 25 april 2025 beschrijft voor 2016–2019 maaien en schapenbegrazing en voor 2018–2019 tevens struweelverwijdering. Voor 2020 is uitvoering onbekend; in 2021 zijn geen werkzaamheden uitgevoerd. De actuele TOP10NL-geometrie van de Vlakte van Waalsdorp raakt beide gekozen kavels, maar begrenst de werkelijk behandelde hectare niet.</w:t>
-      </w:r>
-      <w:r>
-        <w:t xml:space="preserve"> </w:t>
-      </w:r>
-      <w:r>
-        <w:rPr>
-          <w:rStyle w:val="VerbatimChar"/>
-        </w:rPr>
-        <w:t xml:space="preserve">doorsnijding_pct</w:t>
-      </w:r>
-      <w:r>
-        <w:t xml:space="preserve"> </w:t>
-      </w:r>
-      <w:r>
-        <w:t xml:space="preserve">blijft daarom voor M84 en M43 leeg.</w:t>
-      </w:r>
-    </w:p>
-    <w:p>
-      <w:pPr>
-        <w:pStyle w:val="BodyText"/>
-      </w:pPr>
-      <w:r>
-        <w:t xml:space="preserve">Ton heeft op 15 oktober 2026 Meeuwenduin voor deze maatregel gelijkgesteld aan Meeuwenhoek en voorlopig de topografie van Prinsenberg voor Prinsenduin aangewezen. De uitvoering is naar bronjaar gesplitst. Het in november 2023 gestarte werk in Meeuwenduin en Prinsenduin is gekoppeld aan M10-12-76, M12a, M73, M74 en M75 voor Meeuwenduin en aan M2, M3, M35 en M36 voor Prinsenduin. Het Dunea-jaarverslag bevestigt in 2024 alleen voortzetting bij Prinsenduin; daarom is 2024 uitsluitend gekoppeld aan M2, M3, M35 en M36. De gelijkstelling Prinsenduin–Prinsenberg is voorlopig en de exacte werkvoetafdruk binnen de dertien uitvoering-kavelrelaties is onbekend;</w:t>
-      </w:r>
-      <w:r>
-        <w:t xml:space="preserve"> </w:t>
-      </w:r>
-      <w:r>
-        <w:rPr>
-          <w:rStyle w:val="VerbatimChar"/>
-        </w:rPr>
-        <w:t xml:space="preserve">doorsnijding_pct</w:t>
-      </w:r>
-      <w:r>
-        <w:t xml:space="preserve"> </w:t>
-      </w:r>
-      <w:r>
-        <w:t xml:space="preserve">blijft leeg.</w:t>
-      </w:r>
-    </w:p>
-    <w:p>
-      <w:pPr>
-        <w:pStyle w:val="BodyText"/>
-      </w:pPr>
-      <w:r>
-        <w:t xml:space="preserve">De konijnenbijplaatsingsproef is voor 2024 gekoppeld aan M8 en M41. De ODH-beschikking van 28 augustus 2023 en het daarin opgenomen activiteitenplan benoemen en begrenzen de uitzetlocaties Kleine Pan en Waterschapsvallei. De nameninventaris koppelt Kleine Pan aan M8; vergelijking met de actuele SOVON-kavelgeometrie plaatst Waterschapsvallei in M41. Ton bevestigde beide koppelingen op 14 oktober 2026. Het Dunea-jaarverslag bevestigt dat de proef in 2024 is begonnen en dat rond de uitzetlocaties is gemonitord. De beschikking gold tot en met 31 maart 2026, maar dat vergunningsbereik bewijst geen uitvoering in 2025 of 2026. Daarom bevat de jaarlaag alleen 2024. De precieze uitzet- en monitoringsvoetafdruk binnen beide kavels is niet vastgesteld;</w:t>
-      </w:r>
-      <w:r>
-        <w:t xml:space="preserve"> </w:t>
-      </w:r>
-      <w:r>
-        <w:rPr>
-          <w:rStyle w:val="VerbatimChar"/>
-        </w:rPr>
-        <w:t xml:space="preserve">doorsnijding_pct</w:t>
-      </w:r>
-      <w:r>
-        <w:t xml:space="preserve"> </w:t>
-      </w:r>
-      <w:r>
-        <w:t xml:space="preserve">blijft leeg.</w:t>
-      </w:r>
-    </w:p>
-    <w:p>
-      <w:pPr>
-        <w:pStyle w:val="BodyText"/>
-      </w:pPr>
-      <w:r>
-        <w:t xml:space="preserve">Het elektriciteitswerk in Vallei Meijendel is op 15 oktober 2026 door Ton gekoppeld aan M51. Dunea lokaliseert de aangekondigde kabels, elektriciteitskast en laadvoorbereiding op het parkeerterrein bij De Tapuit, het bezoekerscentrum en Boerderij Meyendel. De afzonderlijk gecontroleerde openbare locatiepunten van deze drie voorzieningen liggen volgens de actuele kavelgeometrie alle in M51. Het precieze kabeltracé en de werkvoetafdruk zijn niet gepubliceerd;</w:t>
-      </w:r>
-      <w:r>
-        <w:t xml:space="preserve"> </w:t>
-      </w:r>
-      <w:r>
-        <w:rPr>
-          <w:rStyle w:val="VerbatimChar"/>
-        </w:rPr>
-        <w:t xml:space="preserve">doorsnijding_pct</w:t>
-      </w:r>
-      <w:r>
-        <w:t xml:space="preserve"> </w:t>
-      </w:r>
-      <w:r>
-        <w:t xml:space="preserve">blijft daarom leeg. De bron bevestigt evenmin de voltooiing. De uitvoering houdt status</w:t>
-      </w:r>
-      <w:r>
-        <w:t xml:space="preserve"> </w:t>
-      </w:r>
-      <w:r>
-        <w:rPr>
-          <w:rStyle w:val="VerbatimChar"/>
-        </w:rPr>
-        <w:t xml:space="preserve">onbekend</w:t>
-      </w:r>
-      <w:r>
-        <w:t xml:space="preserve">, heeft nul jaarregels en voegt dus geen regel toe aan</w:t>
-      </w:r>
-      <w:r>
-        <w:t xml:space="preserve"> </w:t>
-      </w:r>
-      <w:r>
-        <w:rPr>
-          <w:rStyle w:val="VerbatimChar"/>
-        </w:rPr>
-        <w:t xml:space="preserve">v_plot_jaar_maatregel_bronvast</w:t>
-      </w:r>
-      <w:r>
-        <w:t xml:space="preserve">.</w:t>
-      </w:r>
-    </w:p>
-    <w:p>
-      <w:pPr>
-        <w:pStyle w:val="BodyText"/>
-      </w:pPr>
-      <w:r>
-        <w:t xml:space="preserve">De werkzaamheden aan de Paardenstal zijn op 15 oktober 2026 door Ton gekoppeld aan M51. De definitieve ODH-beschikking van 5 november 2025, zaak 01132870 en kenmerk ODH1498120, beschrijft vervanging van houten dakdelen, plaatsing van zonnecollectoren, aanpassing van gevels en kozijnen en aanleg van water- en elektriciteitsleidingen. Zij legt tevens mitigerende maatregelen vast voor vier zomerverblijfplaatsen en één paarverblijfplaats van de Gewone dwergvleermuis. De kaartbijlagen op pagina 12–14 begrenzen de Paardenstal naast De Tapuit en Boerderij Meyendel. De exacte werkvoetafdruk binnen M51 is niet gepubliceerd;</w:t>
-      </w:r>
-      <w:r>
-        <w:t xml:space="preserve"> </w:t>
-      </w:r>
-      <w:r>
-        <w:rPr>
-          <w:rStyle w:val="VerbatimChar"/>
-        </w:rPr>
-        <w:t xml:space="preserve">doorsnijding_pct</w:t>
-      </w:r>
-      <w:r>
-        <w:t xml:space="preserve"> </w:t>
-      </w:r>
-      <w:r>
-        <w:t xml:space="preserve">blijft leeg. Dunea noemt 1 november 2026 tot en met 31 maart 2027 als werkperiode. Omdat noch Dunea noch de beschikking op 15 oktober 2026 uitvoering bevestigt, blijft de status</w:t>
-      </w:r>
-      <w:r>
-        <w:t xml:space="preserve"> </w:t>
-      </w:r>
-      <w:r>
-        <w:rPr>
-          <w:rStyle w:val="VerbatimChar"/>
-        </w:rPr>
-        <w:t xml:space="preserve">gepland</w:t>
-      </w:r>
-      <w:r>
-        <w:t xml:space="preserve">; de uitvoering heeft nul jaarregels en voegt geen regel toe aan</w:t>
-      </w:r>
-      <w:r>
-        <w:t xml:space="preserve"> </w:t>
-      </w:r>
-      <w:r>
-        <w:rPr>
-          <w:rStyle w:val="VerbatimChar"/>
-        </w:rPr>
-        <w:t xml:space="preserve">v_plot_jaar_maatregel_bronvast</w:t>
-      </w:r>
-      <w:r>
-        <w:t xml:space="preserve">.</w:t>
-      </w:r>
-    </w:p>
-    <w:p>
-      <w:pPr>
-        <w:pStyle w:val="BodyText"/>
-      </w:pPr>
-      <w:r>
-        <w:t xml:space="preserve">Bendel is op 15 oktober 2026 als buiten het Meijendel-plotgebied beoordeeld. De nameninventaris bevat 182 objecten maar geen object met de naam Bendel. Staatsbosbeheer lokaliseert het gebied expliciet in Berkheide-Noord.</w:t>
+        <w:t xml:space="preserve">Slibverwijdering infiltratieplassen Meijendel</w:t>
+      </w:r>
+      <w:r>
+        <w:t xml:space="preserve"> </w:t>
+      </w:r>
+      <w:r>
+        <w:t xml:space="preserve">uit</w:t>
       </w:r>
       <w:r>
         <w:t xml:space="preserve"> </w:t>
@@ -7200,6 +7037,208 @@
         <w:t xml:space="preserve"> </w:t>
       </w:r>
       <w:r>
+        <w:t xml:space="preserve">46 van april 2005 vermeldt dat deze regelmatig verstopte plas in 2002 opnieuw is uitgebaggerd en toont haar als zuidwestelijke plas van Complex 8. Vergelijking van deze overzichtskaart met de actuele TOP10NL-watergeometrie en SOVON-kavelgeometrie plaatst de volledige plas in M32. De precieze werkvoetafdruk van de slibverwijdering binnen de plas is niet begrensd;</w:t>
+      </w:r>
+      <w:r>
+        <w:t xml:space="preserve"> </w:t>
+      </w:r>
+      <w:r>
+        <w:rPr>
+          <w:rStyle w:val="VerbatimChar"/>
+        </w:rPr>
+        <w:t xml:space="preserve">doorsnijding_pct</w:t>
+      </w:r>
+      <w:r>
+        <w:t xml:space="preserve"> </w:t>
+      </w:r>
+      <w:r>
+        <w:t xml:space="preserve">blijft daarom leeg.</w:t>
+      </w:r>
+    </w:p>
+    <w:p>
+      <w:pPr>
+        <w:pStyle w:val="BodyText"/>
+      </w:pPr>
+      <w:r>
+        <w:t xml:space="preserve">Ton heeft op 15 oktober 2026 maatregel 22d voor Waalsdorp gekoppeld aan M84 en M43 en M84s uitgesloten. De Natura 2000-evaluatie van 25 april 2025 beschrijft voor 2016–2019 maaien en schapenbegrazing en voor 2018–2019 tevens struweelverwijdering. Voor 2020 is uitvoering onbekend; in 2021 zijn geen werkzaamheden uitgevoerd. De actuele TOP10NL-geometrie van de Vlakte van Waalsdorp raakt beide gekozen kavels, maar begrenst de werkelijk behandelde hectare niet.</w:t>
+      </w:r>
+      <w:r>
+        <w:t xml:space="preserve"> </w:t>
+      </w:r>
+      <w:r>
+        <w:rPr>
+          <w:rStyle w:val="VerbatimChar"/>
+        </w:rPr>
+        <w:t xml:space="preserve">doorsnijding_pct</w:t>
+      </w:r>
+      <w:r>
+        <w:t xml:space="preserve"> </w:t>
+      </w:r>
+      <w:r>
+        <w:t xml:space="preserve">blijft daarom voor M84 en M43 leeg.</w:t>
+      </w:r>
+    </w:p>
+    <w:p>
+      <w:pPr>
+        <w:pStyle w:val="BodyText"/>
+      </w:pPr>
+      <w:r>
+        <w:t xml:space="preserve">Ton heeft op 15 oktober 2026 Meeuwenduin voor deze maatregel gelijkgesteld aan Meeuwenhoek en voorlopig de topografie van Prinsenberg voor Prinsenduin aangewezen. De uitvoering is naar bronjaar gesplitst. Het in november 2023 gestarte werk in Meeuwenduin en Prinsenduin is gekoppeld aan M10-12-76, M12a, M73, M74 en M75 voor Meeuwenduin en aan M2, M3, M35 en M36 voor Prinsenduin. Het Dunea-jaarverslag bevestigt in 2024 alleen voortzetting bij Prinsenduin; daarom is 2024 uitsluitend gekoppeld aan M2, M3, M35 en M36. De gelijkstelling Prinsenduin–Prinsenberg is voorlopig en de exacte werkvoetafdruk binnen de dertien uitvoering-kavelrelaties is onbekend;</w:t>
+      </w:r>
+      <w:r>
+        <w:t xml:space="preserve"> </w:t>
+      </w:r>
+      <w:r>
+        <w:rPr>
+          <w:rStyle w:val="VerbatimChar"/>
+        </w:rPr>
+        <w:t xml:space="preserve">doorsnijding_pct</w:t>
+      </w:r>
+      <w:r>
+        <w:t xml:space="preserve"> </w:t>
+      </w:r>
+      <w:r>
+        <w:t xml:space="preserve">blijft leeg.</w:t>
+      </w:r>
+    </w:p>
+    <w:p>
+      <w:pPr>
+        <w:pStyle w:val="BodyText"/>
+      </w:pPr>
+      <w:r>
+        <w:t xml:space="preserve">De konijnenbijplaatsingsproef is voor 2024 gekoppeld aan M8 en M41. De ODH-beschikking van 28 augustus 2023 en het daarin opgenomen activiteitenplan benoemen en begrenzen de uitzetlocaties Kleine Pan en Waterschapsvallei. De nameninventaris koppelt Kleine Pan aan M8; vergelijking met de actuele SOVON-kavelgeometrie plaatst Waterschapsvallei in M41. Ton bevestigde beide koppelingen op 14 oktober 2026. Het Dunea-jaarverslag bevestigt dat de proef in 2024 is begonnen en dat rond de uitzetlocaties is gemonitord. De beschikking gold tot en met 31 maart 2026, maar dat vergunningsbereik bewijst geen uitvoering in 2025 of 2026. Daarom bevat de jaarlaag alleen 2024. De precieze uitzet- en monitoringsvoetafdruk binnen beide kavels is niet vastgesteld;</w:t>
+      </w:r>
+      <w:r>
+        <w:t xml:space="preserve"> </w:t>
+      </w:r>
+      <w:r>
+        <w:rPr>
+          <w:rStyle w:val="VerbatimChar"/>
+        </w:rPr>
+        <w:t xml:space="preserve">doorsnijding_pct</w:t>
+      </w:r>
+      <w:r>
+        <w:t xml:space="preserve"> </w:t>
+      </w:r>
+      <w:r>
+        <w:t xml:space="preserve">blijft leeg.</w:t>
+      </w:r>
+    </w:p>
+    <w:p>
+      <w:pPr>
+        <w:pStyle w:val="BodyText"/>
+      </w:pPr>
+      <w:r>
+        <w:t xml:space="preserve">Het elektriciteitswerk in Vallei Meijendel is op 15 oktober 2026 door Ton gekoppeld aan M51. Dunea lokaliseert de aangekondigde kabels, elektriciteitskast en laadvoorbereiding op het parkeerterrein bij De Tapuit, het bezoekerscentrum en Boerderij Meyendel. De afzonderlijk gecontroleerde openbare locatiepunten van deze drie voorzieningen liggen volgens de actuele kavelgeometrie alle in M51. Het precieze kabeltracé en de werkvoetafdruk zijn niet gepubliceerd;</w:t>
+      </w:r>
+      <w:r>
+        <w:t xml:space="preserve"> </w:t>
+      </w:r>
+      <w:r>
+        <w:rPr>
+          <w:rStyle w:val="VerbatimChar"/>
+        </w:rPr>
+        <w:t xml:space="preserve">doorsnijding_pct</w:t>
+      </w:r>
+      <w:r>
+        <w:t xml:space="preserve"> </w:t>
+      </w:r>
+      <w:r>
+        <w:t xml:space="preserve">blijft daarom leeg. De bron bevestigt evenmin de voltooiing. De uitvoering houdt status</w:t>
+      </w:r>
+      <w:r>
+        <w:t xml:space="preserve"> </w:t>
+      </w:r>
+      <w:r>
+        <w:rPr>
+          <w:rStyle w:val="VerbatimChar"/>
+        </w:rPr>
+        <w:t xml:space="preserve">onbekend</w:t>
+      </w:r>
+      <w:r>
+        <w:t xml:space="preserve">, heeft nul jaarregels en voegt dus geen regel toe aan</w:t>
+      </w:r>
+      <w:r>
+        <w:t xml:space="preserve"> </w:t>
+      </w:r>
+      <w:r>
+        <w:rPr>
+          <w:rStyle w:val="VerbatimChar"/>
+        </w:rPr>
+        <w:t xml:space="preserve">v_plot_jaar_maatregel_bronvast</w:t>
+      </w:r>
+      <w:r>
+        <w:t xml:space="preserve">.</w:t>
+      </w:r>
+    </w:p>
+    <w:p>
+      <w:pPr>
+        <w:pStyle w:val="BodyText"/>
+      </w:pPr>
+      <w:r>
+        <w:t xml:space="preserve">De werkzaamheden aan de Paardenstal zijn op 15 oktober 2026 door Ton gekoppeld aan M51. De definitieve ODH-beschikking van 5 november 2025, zaak 01132870 en kenmerk ODH1498120, beschrijft vervanging van houten dakdelen, plaatsing van zonnecollectoren, aanpassing van gevels en kozijnen en aanleg van water- en elektriciteitsleidingen. Zij legt tevens mitigerende maatregelen vast voor vier zomerverblijfplaatsen en één paarverblijfplaats van de Gewone dwergvleermuis. De kaartbijlagen op pagina 12–14 begrenzen de Paardenstal naast De Tapuit en Boerderij Meyendel. De exacte werkvoetafdruk binnen M51 is niet gepubliceerd;</w:t>
+      </w:r>
+      <w:r>
+        <w:t xml:space="preserve"> </w:t>
+      </w:r>
+      <w:r>
+        <w:rPr>
+          <w:rStyle w:val="VerbatimChar"/>
+        </w:rPr>
+        <w:t xml:space="preserve">doorsnijding_pct</w:t>
+      </w:r>
+      <w:r>
+        <w:t xml:space="preserve"> </w:t>
+      </w:r>
+      <w:r>
+        <w:t xml:space="preserve">blijft leeg. Dunea noemt 1 november 2026 tot en met 31 maart 2027 als werkperiode. Omdat noch Dunea noch de beschikking op 15 oktober 2026 uitvoering bevestigt, blijft de status</w:t>
+      </w:r>
+      <w:r>
+        <w:t xml:space="preserve"> </w:t>
+      </w:r>
+      <w:r>
+        <w:rPr>
+          <w:rStyle w:val="VerbatimChar"/>
+        </w:rPr>
+        <w:t xml:space="preserve">gepland</w:t>
+      </w:r>
+      <w:r>
+        <w:t xml:space="preserve">; de uitvoering heeft nul jaarregels en voegt geen regel toe aan</w:t>
+      </w:r>
+      <w:r>
+        <w:t xml:space="preserve"> </w:t>
+      </w:r>
+      <w:r>
+        <w:rPr>
+          <w:rStyle w:val="VerbatimChar"/>
+        </w:rPr>
+        <w:t xml:space="preserve">v_plot_jaar_maatregel_bronvast</w:t>
+      </w:r>
+      <w:r>
+        <w:t xml:space="preserve">.</w:t>
+      </w:r>
+    </w:p>
+    <w:p>
+      <w:pPr>
+        <w:pStyle w:val="BodyText"/>
+      </w:pPr>
+      <w:r>
+        <w:t xml:space="preserve">Bendel is op 15 oktober 2026 als buiten het Meijendel-plotgebied beoordeeld. De nameninventaris bevat 182 objecten maar geen object met de naam Bendel. Staatsbosbeheer lokaliseert het gebied expliciet in Berkheide-Noord.</w:t>
+      </w:r>
+      <w:r>
+        <w:t xml:space="preserve"> </w:t>
+      </w:r>
+      <w:r>
+        <w:rPr>
+          <w:i/>
+          <w:iCs/>
+        </w:rPr>
+        <w:t xml:space="preserve">Holland’s Duinen</w:t>
+      </w:r>
+      <w:r>
+        <w:t xml:space="preserve"> </w:t>
+      </w:r>
+      <w:r>
         <w:t xml:space="preserve">88 beschrijft daarnaast een afzonderlijke, afgeronde herinrichting van oktober 2025 tot maart 2026: herstel van historische duinakkers, dynamisch grijs duin en vochtige duinvalleien, plus aanleg van twee duinpoelen. Deze uitvoering heeft twee uitgevoerde jaarregels, voor 2025 en 2026. Het provinciale openstellingsbesluit van 22 april 2026 betreft aansluitend nabeheer voor H2130 en H2190, maar bewijst geen opdracht of uitvoering van dat nabeheer. Beide uitvoeringen zijn in</w:t>
       </w:r>
       <w:r>
@@ -7238,7 +7277,7 @@
         <w:pStyle w:val="BodyText"/>
       </w:pPr>
       <w:r>
-        <w:t xml:space="preserve">De 116 plotkoppelingen en 86 uitgevoerde jaarregels leveren samen 170 regels in</w:t>
+        <w:t xml:space="preserve">De 119 plotkoppelingen en 86 uitgevoerde jaarregels leveren samen 170 regels in</w:t>
       </w:r>
       <w:r>
         <w:t xml:space="preserve"> </w:t>
@@ -7376,7 +7415,7 @@
         <w:t xml:space="preserve"> </w:t>
       </w:r>
       <w:r>
-        <w:t xml:space="preserve">Bronvast op project-, uitvoering- en jaarniveau voor de 33 ingevoerde bronnen en 63 uitvoeringen. De algemene kavel- en gebiedsindeling is geometrisch beschikbaar voor de 55 actuele plots uit 2025; vijf expliciet gekoppelde historische kavels hebben geen afzonderlijke geometrie. De bronvaste plot-jaarlaag bevat 170 regels voor 1967–1969, 1972–1975, 1988–1991, 1993, 1997, 2002, 2005–2006 en 2017–2025. Zes uitvoeringen zijn via de nameninventaris aan 32 kavelsituaties gekoppeld; Pan 13 en Plas 20 voegen elf aanvullende relaties toe, Helmduinen drie, de Kikkervalleienbegrazing drie, het Kikkervalleien-bodemherstel drie, de Kikkervalleien-infrastructuuringreep drie, de Watercrassulabestrijding drie, Parnassiapad 2 één, Parnassiapad 1 één, Plas 8.4.2 één, Waalsdorp twee, Meeuwenduin en Prinsenduin samen dertien, de konijnenbijplaatsingsproef twee, het elektriciteitswerk in Vallei Meijendel één en de Paardenstal één. Negentien uitvoeringen hebben geen directe plotkoppeling; de twee Bendel-uitvoeringen zijn daarvan aantoonbaar buiten het Meijendel-plotgebied geplaatst, zodat nog 17 uitvoeringen ruimtelijk moeten worden beoordeeld.</w:t>
+        <w:t xml:space="preserve">Bronvast op project-, uitvoering- en jaarniveau voor de 33 ingevoerde bronnen en 63 uitvoeringen. De algemene kavel- en gebiedsindeling is geometrisch beschikbaar voor de 55 actuele plots uit 2025; vijf expliciet gekoppelde historische kavels hebben geen afzonderlijke geometrie. De bronvaste plot-jaarlaag bevat 170 regels voor 1967–1969, 1972–1975, 1988–1991, 1993, 1997, 2002, 2005–2006 en 2017–2025. Zes uitvoeringen zijn via de nameninventaris aan 32 kavelsituaties gekoppeld; Pan 13 en Plas 20 voegen elf aanvullende relaties toe, Helmduinen drie, de Kikkervalleienbegrazing drie, het Kikkervalleien-bodemherstel drie, de Kikkervalleien-infrastructuuringreep drie, de Watercrassulabestrijding drie, het Kikkervalleien-Duindoornbeheer drie, Parnassiapad 2 één, Parnassiapad 1 één, Plas 8.4.2 één, Waalsdorp twee, Meeuwenduin en Prinsenduin samen dertien, de konijnenbijplaatsingsproef twee, het elektriciteitswerk in Vallei Meijendel één en de Paardenstal één. Achttien uitvoeringen hebben geen directe plotkoppeling; de twee Bendel-uitvoeringen zijn daarvan aantoonbaar buiten het Meijendel-plotgebied geplaatst, zodat nog 16 uitvoeringen ruimtelijk moeten worden beoordeeld.</w:t>
       </w:r>
     </w:p>
     <w:p>

</xml_diff>

<commit_message>
Koppel Ganzenhoekdunning aan twee kavels
</commit_message>
<xml_diff>
--- a/docs/MEIJENDEL_BRONREGISTER.docx
+++ b/docs/MEIJENDEL_BRONREGISTER.docx
@@ -6535,7 +6535,7 @@
         <w:t xml:space="preserve"> </w:t>
       </w:r>
       <w:r>
-        <w:t xml:space="preserve">bevat 119 geverifieerde directe relaties. Daarvan waren 36 al onderbouwd met expliciete kavelvermeldingen, gebruikersvaststellingen of een bijzondere gebiedsnaam. De nameninventaris voegt 32 geometrische doorsnijdingen toe voor zes volledig en letterlijk gelokaliseerde uitvoeringen met de naamobjecten Kijfhoek, Bierlap, Meeuwenhoek, Tafelberg, ’t Scheepje, Uilenbosch en Oude Rijs uit</w:t>
+        <w:t xml:space="preserve">bevat 121 geverifieerde directe relaties. Daarvan waren 36 al onderbouwd met expliciete kavelvermeldingen, gebruikersvaststellingen of een bijzondere gebiedsnaam. De nameninventaris voegt 32 geometrische doorsnijdingen toe voor zes volledig en letterlijk gelokaliseerde uitvoeringen met de naamobjecten Kijfhoek, Bierlap, Meeuwenhoek, Tafelberg, ’t Scheepje, Uilenbosch en Oude Rijs uit</w:t>
       </w:r>
       <w:r>
         <w:t xml:space="preserve"> </w:t>
@@ -6575,6 +6575,29 @@
       </w:r>
       <w:r>
         <w:t xml:space="preserve">. Een doorsnijding bewijst dat het genoemde naamgebied de plot raakt, niet welk percentage van de plot feitelijk is bewerkt;</w:t>
+      </w:r>
+      <w:r>
+        <w:t xml:space="preserve"> </w:t>
+      </w:r>
+      <w:r>
+        <w:rPr>
+          <w:rStyle w:val="VerbatimChar"/>
+        </w:rPr>
+        <w:t xml:space="preserve">doorsnijding_pct</w:t>
+      </w:r>
+      <w:r>
+        <w:t xml:space="preserve"> </w:t>
+      </w:r>
+      <w:r>
+        <w:t xml:space="preserve">blijft daarom leeg.</w:t>
+      </w:r>
+    </w:p>
+    <w:p>
+      <w:pPr>
+        <w:pStyle w:val="BodyText"/>
+      </w:pPr>
+      <w:r>
+        <w:t xml:space="preserve">De grote dunning van het Ganzenhoekbos in 2017 is gekoppeld aan M77 en M78/79. De Natura 2000-evaluatie van 25 april 2025 bevat hiervoor één uitvoeringsregel en één jaarregel. De actuele Ganzenhoek-geometrie raakt ook M13s, maar Ton heeft op 15 oktober 2026 bepaald dat deze dunning niet aan M13s wordt toegeschreven. De exacte werkvoetafdruk binnen M77 en M78/79 is niet bekend;</w:t>
       </w:r>
       <w:r>
         <w:t xml:space="preserve"> </w:t>
@@ -7277,7 +7300,7 @@
         <w:pStyle w:val="BodyText"/>
       </w:pPr>
       <w:r>
-        <w:t xml:space="preserve">De 119 plotkoppelingen en 86 uitgevoerde jaarregels leveren samen 170 regels in</w:t>
+        <w:t xml:space="preserve">De 121 plotkoppelingen en 86 uitgevoerde jaarregels leveren samen 172 regels in</w:t>
       </w:r>
       <w:r>
         <w:t xml:space="preserve"> </w:t>
@@ -7289,7 +7312,7 @@
         <w:t xml:space="preserve">v_plot_jaar_maatregel_bronvast</w:t>
       </w:r>
       <w:r>
-        <w:t xml:space="preserve">. De nameninventaris voegt 36 plot-jaarrijen toe: begrazing in Kijfhoek en Bierlap in 1990, hervat maaibeheer bij Tafelberg en ’t Scheepje in 2025, uitgevoerd maaibeheer in Uilenbosch in 2017–2021 en vogelkersbestrijding in Kijfhoek, Bierlap en Meeuwenhoek in 2020. De aanvullende systeemkoppelingen voegen 22 plot-jaarrijen toe: vier voor de oeveraanpassing van Pan 13 in 1988–1989 en achttien voor drie uitvoeringen in Plas 20 in 2005–2006. De Helmduinen-koppeling voegt drie plot-jaarrijen voor 1991 toe. De uitbreiding van de begrazing met de Kikkervalleien, de eenmalige verwijdering van vegetatie en voedselrijke bovengrond en het verwijderen van leidingen en putten voegen ieder drie plot-jaarrijen voor 1997 toe; Parnassiapad 2 voegt één plot-jaarrij voor M15 in 1993 toe en Parnassiapad 1 één voor M15 in 1997. De Watercrassulabestrijding voegt dertig plot-jaarrijen toe voor M13, M13s en M14 in 2015 en 2017–2025. Het opslagbeheer in Meeuwenduin en Prinsenduin voegt negen plot-jaarrijen voor 2023 toe; de afzonderlijke voortzetting in Prinsenduin voegt vier plot-jaarrijen voor 2024 toe. De konijnenbijplaatsingsproef voegt twee plot-jaarrijen toe voor M8 en M41 in 2024. De koppeling van Plas 8.4.2 aan M32 voegt één plot-jaarrij voor 2002 toe. Waalsdorp voegt acht plot-jaarrijen toe voor M84 en M43 in 2016–2019. De statussen</w:t>
+        <w:t xml:space="preserve">. De Ganzenhoekbosdunning voegt twee plot-jaarrijen voor M77 en M78/79 in 2017 toe. De nameninventaris voegt 36 plot-jaarrijen toe: begrazing in Kijfhoek en Bierlap in 1990, hervat maaibeheer bij Tafelberg en ’t Scheepje in 2025, uitgevoerd maaibeheer in Uilenbosch in 2017–2021 en vogelkersbestrijding in Kijfhoek, Bierlap en Meeuwenhoek in 2020. De aanvullende systeemkoppelingen voegen 22 plot-jaarrijen toe: vier voor de oeveraanpassing van Pan 13 in 1988–1989 en achttien voor drie uitvoeringen in Plas 20 in 2005–2006. De Helmduinen-koppeling voegt drie plot-jaarrijen voor 1991 toe. De uitbreiding van de begrazing met de Kikkervalleien, de eenmalige verwijdering van vegetatie en voedselrijke bovengrond en het verwijderen van leidingen en putten voegen ieder drie plot-jaarrijen voor 1997 toe; Parnassiapad 2 voegt één plot-jaarrij voor M15 in 1993 toe en Parnassiapad 1 één voor M15 in 1997. De Watercrassulabestrijding voegt dertig plot-jaarrijen toe voor M13, M13s en M14 in 2015 en 2017–2025. Het opslagbeheer in Meeuwenduin en Prinsenduin voegt negen plot-jaarrijen voor 2023 toe; de afzonderlijke voortzetting in Prinsenduin voegt vier plot-jaarrijen voor 2024 toe. De konijnenbijplaatsingsproef voegt twee plot-jaarrijen toe voor M8 en M41 in 2024. De koppeling van Plas 8.4.2 aan M32 voegt één plot-jaarrij voor 2002 toe. Waalsdorp voegt acht plot-jaarrijen toe voor M84 en M43 in 2016–2019. De statussen</w:t>
       </w:r>
       <w:r>
         <w:t xml:space="preserve"> </w:t>
@@ -7415,7 +7438,7 @@
         <w:t xml:space="preserve"> </w:t>
       </w:r>
       <w:r>
-        <w:t xml:space="preserve">Bronvast op project-, uitvoering- en jaarniveau voor de 33 ingevoerde bronnen en 63 uitvoeringen. De algemene kavel- en gebiedsindeling is geometrisch beschikbaar voor de 55 actuele plots uit 2025; vijf expliciet gekoppelde historische kavels hebben geen afzonderlijke geometrie. De bronvaste plot-jaarlaag bevat 170 regels voor 1967–1969, 1972–1975, 1988–1991, 1993, 1997, 2002, 2005–2006 en 2017–2025. Zes uitvoeringen zijn via de nameninventaris aan 32 kavelsituaties gekoppeld; Pan 13 en Plas 20 voegen elf aanvullende relaties toe, Helmduinen drie, de Kikkervalleienbegrazing drie, het Kikkervalleien-bodemherstel drie, de Kikkervalleien-infrastructuuringreep drie, de Watercrassulabestrijding drie, het Kikkervalleien-Duindoornbeheer drie, Parnassiapad 2 één, Parnassiapad 1 één, Plas 8.4.2 één, Waalsdorp twee, Meeuwenduin en Prinsenduin samen dertien, de konijnenbijplaatsingsproef twee, het elektriciteitswerk in Vallei Meijendel één en de Paardenstal één. Achttien uitvoeringen hebben geen directe plotkoppeling; de twee Bendel-uitvoeringen zijn daarvan aantoonbaar buiten het Meijendel-plotgebied geplaatst, zodat nog 16 uitvoeringen ruimtelijk moeten worden beoordeeld.</w:t>
+        <w:t xml:space="preserve">Bronvast op project-, uitvoering- en jaarniveau voor de 33 ingevoerde bronnen en 63 uitvoeringen. De algemene kavel- en gebiedsindeling is geometrisch beschikbaar voor de 55 actuele plots uit 2025; vijf expliciet gekoppelde historische kavels hebben geen afzonderlijke geometrie. De bronvaste plot-jaarlaag bevat 172 regels voor 1967–1969, 1972–1975, 1988–1991, 1993, 1997, 2002, 2005–2006 en 2017–2025. Zes uitvoeringen zijn via de nameninventaris aan 32 kavelsituaties gekoppeld; Pan 13 en Plas 20 voegen elf aanvullende relaties toe, Helmduinen drie, de Kikkervalleienbegrazing drie, het Kikkervalleien-bodemherstel drie, de Kikkervalleien-infrastructuuringreep drie, de Watercrassulabestrijding drie, het Kikkervalleien-Duindoornbeheer drie, Parnassiapad 2 één, Parnassiapad 1 één, Plas 8.4.2 één, Waalsdorp twee, Meeuwenduin en Prinsenduin samen dertien, de konijnenbijplaatsingsproef twee, het elektriciteitswerk in Vallei Meijendel één, de Paardenstal één en de Ganzenhoekbosdunning twee. Zeventien uitvoeringen hebben geen directe plotkoppeling; de twee Bendel-uitvoeringen zijn daarvan aantoonbaar buiten het Meijendel-plotgebied geplaatst, zodat nog 15 uitvoeringen ruimtelijk moeten worden beoordeeld.</w:t>
       </w:r>
     </w:p>
     <w:p>

</xml_diff>

<commit_message>
Koppel maaibeheer aan Ruygenhoek en De Loopert
</commit_message>
<xml_diff>
--- a/docs/MEIJENDEL_BRONREGISTER.docx
+++ b/docs/MEIJENDEL_BRONREGISTER.docx
@@ -6535,7 +6535,7 @@
         <w:t xml:space="preserve"> </w:t>
       </w:r>
       <w:r>
-        <w:t xml:space="preserve">bevat 121 geverifieerde directe relaties. Daarvan waren 36 al onderbouwd met expliciete kavelvermeldingen, gebruikersvaststellingen of een bijzondere gebiedsnaam. De nameninventaris voegt 32 geometrische doorsnijdingen toe voor zes volledig en letterlijk gelokaliseerde uitvoeringen met de naamobjecten Kijfhoek, Bierlap, Meeuwenhoek, Tafelberg, ’t Scheepje, Uilenbosch en Oude Rijs uit</w:t>
+        <w:t xml:space="preserve">bevat 124 geverifieerde directe relaties. Daarvan waren 36 al onderbouwd met expliciete kavelvermeldingen, gebruikersvaststellingen of een bijzondere gebiedsnaam. De nameninventaris voegt 32 geometrische doorsnijdingen toe voor zes volledig en letterlijk gelokaliseerde uitvoeringen met de naamobjecten Kijfhoek, Bierlap, Meeuwenhoek, Tafelberg, ’t Scheepje, Uilenbosch en Oude Rijs uit</w:t>
       </w:r>
       <w:r>
         <w:t xml:space="preserve"> </w:t>
@@ -6613,6 +6613,29 @@
       </w:r>
       <w:r>
         <w:t xml:space="preserve">blijft daarom leeg.</w:t>
+      </w:r>
+    </w:p>
+    <w:p>
+      <w:pPr>
+        <w:pStyle w:val="BodyText"/>
+      </w:pPr>
+      <w:r>
+        <w:t xml:space="preserve">Het jaarlijkse aanvullende maaibeheer van in totaal drie hectare in Ruijgenhoek, Langestrook en De Loopert is gekoppeld aan M32, M45 en M83. Ton lokaliseerde Ruygenhoek op 15 oktober 2026 in M32. De actuele TOP10NL-geometrie van De Loopert raakt M45 en M83. Langestrook blijft niet gelokaliseerd en wordt niet aan een kavel toegeschreven. De Natura 2000-evaluatie van 25 april 2025 vermeldt dat jaarlijks is gemaaid en dat Dunea het beheer voortzet, maar geeft geen vaststelbare beginjaren, afzonderlijke uitvoeringsjaren of verdeling van de drie hectare. Daarom blijven de jaarlaag en</w:t>
+      </w:r>
+      <w:r>
+        <w:t xml:space="preserve"> </w:t>
+      </w:r>
+      <w:r>
+        <w:rPr>
+          <w:rStyle w:val="VerbatimChar"/>
+        </w:rPr>
+        <w:t xml:space="preserve">doorsnijding_pct</w:t>
+      </w:r>
+      <w:r>
+        <w:t xml:space="preserve"> </w:t>
+      </w:r>
+      <w:r>
+        <w:t xml:space="preserve">leeg.</w:t>
       </w:r>
     </w:p>
     <w:p>
@@ -7300,7 +7323,7 @@
         <w:pStyle w:val="BodyText"/>
       </w:pPr>
       <w:r>
-        <w:t xml:space="preserve">De 121 plotkoppelingen en 86 uitgevoerde jaarregels leveren samen 172 regels in</w:t>
+        <w:t xml:space="preserve">De 124 plotkoppelingen en 86 uitgevoerde jaarregels leveren samen 172 regels in</w:t>
       </w:r>
       <w:r>
         <w:t xml:space="preserve"> </w:t>
@@ -7312,7 +7335,7 @@
         <w:t xml:space="preserve">v_plot_jaar_maatregel_bronvast</w:t>
       </w:r>
       <w:r>
-        <w:t xml:space="preserve">. De Ganzenhoekbosdunning voegt twee plot-jaarrijen voor M77 en M78/79 in 2017 toe. De nameninventaris voegt 36 plot-jaarrijen toe: begrazing in Kijfhoek en Bierlap in 1990, hervat maaibeheer bij Tafelberg en ’t Scheepje in 2025, uitgevoerd maaibeheer in Uilenbosch in 2017–2021 en vogelkersbestrijding in Kijfhoek, Bierlap en Meeuwenhoek in 2020. De aanvullende systeemkoppelingen voegen 22 plot-jaarrijen toe: vier voor de oeveraanpassing van Pan 13 in 1988–1989 en achttien voor drie uitvoeringen in Plas 20 in 2005–2006. De Helmduinen-koppeling voegt drie plot-jaarrijen voor 1991 toe. De uitbreiding van de begrazing met de Kikkervalleien, de eenmalige verwijdering van vegetatie en voedselrijke bovengrond en het verwijderen van leidingen en putten voegen ieder drie plot-jaarrijen voor 1997 toe; Parnassiapad 2 voegt één plot-jaarrij voor M15 in 1993 toe en Parnassiapad 1 één voor M15 in 1997. De Watercrassulabestrijding voegt dertig plot-jaarrijen toe voor M13, M13s en M14 in 2015 en 2017–2025. Het opslagbeheer in Meeuwenduin en Prinsenduin voegt negen plot-jaarrijen voor 2023 toe; de afzonderlijke voortzetting in Prinsenduin voegt vier plot-jaarrijen voor 2024 toe. De konijnenbijplaatsingsproef voegt twee plot-jaarrijen toe voor M8 en M41 in 2024. De koppeling van Plas 8.4.2 aan M32 voegt één plot-jaarrij voor 2002 toe. Waalsdorp voegt acht plot-jaarrijen toe voor M84 en M43 in 2016–2019. De statussen</w:t>
+        <w:t xml:space="preserve">. De koppeling van het maaibeheer in Ruygenhoek en De Loopert voegt drie plotrelaties maar geen plot-jaarrijen toe, omdat vaststelbare uitvoeringsjaren ontbreken; Langestrook blijft niet gelokaliseerd. De Ganzenhoekbosdunning voegt twee plot-jaarrijen voor M77 en M78/79 in 2017 toe. De nameninventaris voegt 36 plot-jaarrijen toe: begrazing in Kijfhoek en Bierlap in 1990, hervat maaibeheer bij Tafelberg en ’t Scheepje in 2025, uitgevoerd maaibeheer in Uilenbosch in 2017–2021 en vogelkersbestrijding in Kijfhoek, Bierlap en Meeuwenhoek in 2020. De aanvullende systeemkoppelingen voegen 22 plot-jaarrijen toe: vier voor de oeveraanpassing van Pan 13 in 1988–1989 en achttien voor drie uitvoeringen in Plas 20 in 2005–2006. De Helmduinen-koppeling voegt drie plot-jaarrijen voor 1991 toe. De uitbreiding van de begrazing met de Kikkervalleien, de eenmalige verwijdering van vegetatie en voedselrijke bovengrond en het verwijderen van leidingen en putten voegen ieder drie plot-jaarrijen voor 1997 toe; Parnassiapad 2 voegt één plot-jaarrij voor M15 in 1993 toe en Parnassiapad 1 één voor M15 in 1997. De Watercrassulabestrijding voegt dertig plot-jaarrijen toe voor M13, M13s en M14 in 2015 en 2017–2025. Het opslagbeheer in Meeuwenduin en Prinsenduin voegt negen plot-jaarrijen voor 2023 toe; de afzonderlijke voortzetting in Prinsenduin voegt vier plot-jaarrijen voor 2024 toe. De konijnenbijplaatsingsproef voegt twee plot-jaarrijen toe voor M8 en M41 in 2024. De koppeling van Plas 8.4.2 aan M32 voegt één plot-jaarrij voor 2002 toe. Waalsdorp voegt acht plot-jaarrijen toe voor M84 en M43 in 2016–2019. De statussen</w:t>
       </w:r>
       <w:r>
         <w:t xml:space="preserve"> </w:t>
@@ -7438,7 +7461,22 @@
         <w:t xml:space="preserve"> </w:t>
       </w:r>
       <w:r>
-        <w:t xml:space="preserve">Bronvast op project-, uitvoering- en jaarniveau voor de 33 ingevoerde bronnen en 63 uitvoeringen. De algemene kavel- en gebiedsindeling is geometrisch beschikbaar voor de 55 actuele plots uit 2025; vijf expliciet gekoppelde historische kavels hebben geen afzonderlijke geometrie. De bronvaste plot-jaarlaag bevat 172 regels voor 1967–1969, 1972–1975, 1988–1991, 1993, 1997, 2002, 2005–2006 en 2017–2025. Zes uitvoeringen zijn via de nameninventaris aan 32 kavelsituaties gekoppeld; Pan 13 en Plas 20 voegen elf aanvullende relaties toe, Helmduinen drie, de Kikkervalleienbegrazing drie, het Kikkervalleien-bodemherstel drie, de Kikkervalleien-infrastructuuringreep drie, de Watercrassulabestrijding drie, het Kikkervalleien-Duindoornbeheer drie, Parnassiapad 2 één, Parnassiapad 1 één, Plas 8.4.2 één, Waalsdorp twee, Meeuwenduin en Prinsenduin samen dertien, de konijnenbijplaatsingsproef twee, het elektriciteitswerk in Vallei Meijendel één, de Paardenstal één en de Ganzenhoekbosdunning twee. Zeventien uitvoeringen hebben geen directe plotkoppeling; de twee Bendel-uitvoeringen zijn daarvan aantoonbaar buiten het Meijendel-plotgebied geplaatst, zodat nog 15 uitvoeringen ruimtelijk moeten worden beoordeeld.</w:t>
+        <w:t xml:space="preserve">Bronvast op project-, uitvoering- en jaarniveau voor de 33 ingevoerde bronnen en 63 uitvoeringen. De algemene kavel- en gebiedsindeling is geometrisch beschikbaar voor de 55 actuele plots uit 2025; vijf expliciet gekoppelde historische kavels hebben geen afzonderlijke geometrie. De bronvaste plot-jaarlaag bevat 172 regels voor 1967–1969, 1972–1975, 1988–1991, 1993, 1997, 2002, 2005–2006 en 2017–2025. Zes uitvoeringen zijn via de nameninventaris aan 32 kavelsituaties gekoppeld; Pan 13 en Plas 20 voegen elf aanvullende relaties toe, Helmduinen drie, de Kikkervalleienbegrazing drie, het Kikkervalleien-bodemherstel drie, de Kikkervalleien-infrastructuuringreep drie, de Watercrassulabestrijding drie, het Kikkervalleien-Duindoornbeheer drie, Parnassiapad 2 één, Parnassiapad 1 één, Plas 8.4.2 één, Waalsdorp twee, Meeuwenduin en Prinsenduin samen dertien, de konijnenbijplaatsingsproef twee, het elektriciteitswerk in Vallei Meijendel één, de Paardenstal één en de Ganzenhoekbosdunning twee en het maaibeheer in Ruygenhoek en De Loopert drie. Zestien uitvoeringen hebben geen directe plotkoppeling; de twee Bendel-uitvoeringen zijn daarvan aantoonbaar buiten het Meijendel-plotgebied geplaatst, zodat nog 14 geheel ongekoppelde uitvoeringen ruimtelijk moeten worden beoordeeld. Daarnaast blijft Langestrook binnen de al gedeeltelijk gekoppelde uitvoering</w:t>
+      </w:r>
+      <w:r>
+        <w:t xml:space="preserve"> </w:t>
+      </w:r>
+      <w:r>
+        <w:rPr>
+          <w:rStyle w:val="VerbatimChar"/>
+        </w:rPr>
+        <w:t xml:space="preserve">pas_22b_maaibeheer</w:t>
+      </w:r>
+      <w:r>
+        <w:t xml:space="preserve"> </w:t>
+      </w:r>
+      <w:r>
+        <w:t xml:space="preserve">zonder kavel.</w:t>
       </w:r>
     </w:p>
     <w:p>

</xml_diff>

<commit_message>
Corrigeer Prinsenduin en Lange Strook koppelingen
</commit_message>
<xml_diff>
--- a/docs/MEIJENDEL_BRONREGISTER.docx
+++ b/docs/MEIJENDEL_BRONREGISTER.docx
@@ -6297,71 +6297,7 @@
         <w:pStyle w:val="BodyText"/>
       </w:pPr>
       <w:r>
-        <w:t xml:space="preserve">De brede tekstselectie bevatte 351 bijlagen. De strengere selectie op formuleringen die feitelijke uitvoering aanduiden bevatte 206 bijlagen bij 190 bibliografische bronnen. Na beoordeling op uitvoering, locatie, jaar, dubbeling en brontype zijn zeventien aanvullende Zotero-bronnen ingevoerd: de vogelrapporten over 1967, 1968, 1969, 1972, 1973, 1974 en 1975; de rietpotenproef uit 1987/1992; publicaties over begrazing uit 2008 en 2012;</w:t>
-      </w:r>
-      <w:r>
-        <w:t xml:space="preserve"> </w:t>
-      </w:r>
-      <w:r>
-        <w:rPr>
-          <w:i/>
-          <w:iCs/>
-        </w:rPr>
-        <w:t xml:space="preserve">Vegetatieontwikkeling in duinvalleien van Meijendel na opheffen van infiltratieplassen</w:t>
-      </w:r>
-      <w:r>
-        <w:t xml:space="preserve"> </w:t>
-      </w:r>
-      <w:r>
-        <w:t xml:space="preserve">uit 2003; natuurherstel uit 2005; slib in infiltratieplassen uit 2005; Plas 20.1 uit 2006;</w:t>
-      </w:r>
-      <w:r>
-        <w:t xml:space="preserve"> </w:t>
-      </w:r>
-      <w:r>
-        <w:rPr>
-          <w:i/>
-          <w:iCs/>
-        </w:rPr>
-        <w:t xml:space="preserve">Holland’s Duinen</w:t>
-      </w:r>
-      <w:r>
-        <w:t xml:space="preserve"> </w:t>
-      </w:r>
-      <w:r>
-        <w:t xml:space="preserve">86 uit 2025 met de kaart van de dagvlinderroute Parnassiapad;</w:t>
-      </w:r>
-      <w:r>
-        <w:t xml:space="preserve"> </w:t>
-      </w:r>
-      <w:r>
-        <w:rPr>
-          <w:i/>
-          <w:iCs/>
-        </w:rPr>
-        <w:t xml:space="preserve">Meijendel Mededelingen</w:t>
-      </w:r>
-      <w:r>
-        <w:t xml:space="preserve"> </w:t>
-      </w:r>
-      <w:r>
-        <w:t xml:space="preserve">30 uit november 1996 met de expliciete plaatsing van Sprang PI in M13s en van het betrokken rietgebied in M13s en M14; en</w:t>
-      </w:r>
-      <w:r>
-        <w:t xml:space="preserve"> </w:t>
-      </w:r>
-      <w:r>
-        <w:rPr>
-          <w:i/>
-          <w:iCs/>
-        </w:rPr>
-        <w:t xml:space="preserve">Holland’s Duinen</w:t>
-      </w:r>
-      <w:r>
-        <w:t xml:space="preserve"> </w:t>
-      </w:r>
-      <w:r>
-        <w:t xml:space="preserve">88 uit april 2026 met de afgeronde herinrichting van Bendel. Samen met de zes al gebruikte Zotero-bronnen bevat</w:t>
+        <w:t xml:space="preserve">De brede tekstselectie bevatte 351 bijlagen. De strengere selectie op formuleringen die feitelijke uitvoering aanduiden bevatte 206 bijlagen bij 190 bibliografische bronnen. Na beoordeling op uitvoering, locatie, jaar, dubbeling en brontype zijn achttien aanvullende Zotero-bronnen ingevoerd. Nieuw is Van der Hagen et al. (2020), waarvan figuur 1 Prinsenduin, Lange Strooken en Helmduinen als afzonderlijke onderzoeksgebieden toont. Samen met de zes al gebruikte Zotero-bronnen bevat</w:t>
       </w:r>
       <w:r>
         <w:t xml:space="preserve"> </w:t>
@@ -6376,7 +6312,7 @@
         <w:t xml:space="preserve"> </w:t>
       </w:r>
       <w:r>
-        <w:t xml:space="preserve">nu 23 lokale Zotero-bronnen. Dubbele exemplaren, algemene gebiedsbeschrijvingen, uitsluitend voorgenomen werk en niet-lokaliseerbare vermeldingen zijn niet als afzonderlijke uitvoering ingevoerd.</w:t>
+        <w:t xml:space="preserve">nu 24 lokale Zotero-bronnen. Dubbele exemplaren, algemene gebiedsbeschrijvingen, uitsluitend voorgenomen werk en niet-lokaliseerbare vermeldingen zijn niet als afzonderlijke uitvoering ingevoerd.</w:t>
       </w:r>
     </w:p>
     <w:p>
@@ -6414,7 +6350,7 @@
         <w:t xml:space="preserve"> </w:t>
       </w:r>
       <w:r>
-        <w:t xml:space="preserve">De levende lokale database bevat 18 projecten, 33 bronnen, 63 uitvoeringen, 102 expliciete jaarbeoordelingen uit 1967–2026 en 86 bronkoppelingen. Van de jaarbeoordelingen zijn er 86</w:t>
+        <w:t xml:space="preserve">De levende lokale database bevat 18 projecten, 34 bronnen, 63 uitvoeringen, 102 expliciete jaarbeoordelingen uit 1967–2026 en 88 bronkoppelingen. Van de jaarbeoordelingen zijn er 86</w:t>
       </w:r>
       <w:r>
         <w:t xml:space="preserve"> </w:t>
@@ -6535,19 +6471,7 @@
         <w:t xml:space="preserve"> </w:t>
       </w:r>
       <w:r>
-        <w:t xml:space="preserve">bevat 124 geverifieerde directe relaties. Daarvan waren 36 al onderbouwd met expliciete kavelvermeldingen, gebruikersvaststellingen of een bijzondere gebiedsnaam. De nameninventaris voegt 32 geometrische doorsnijdingen toe voor zes volledig en letterlijk gelokaliseerde uitvoeringen met de naamobjecten Kijfhoek, Bierlap, Meeuwenhoek, Tafelberg, ’t Scheepje, Uilenbosch en Oude Rijs uit</w:t>
-      </w:r>
-      <w:r>
-        <w:t xml:space="preserve"> </w:t>
-      </w:r>
-      <w:r>
-        <w:rPr>
-          <w:rStyle w:val="VerbatimChar"/>
-        </w:rPr>
-        <w:t xml:space="preserve">meijendel_nameninventaris_2026-10-14</w:t>
-      </w:r>
-      <w:r>
-        <w:t xml:space="preserve">. Daarnaast zijn elf relaties toegevoegd voor de al vastgestelde volledige systemen Pan 13 en Plas 20. De begrazing van de Helmduinen vanaf eind 1991 is op 14 oktober 2026 door Ton gekoppeld aan M15, M16 en M17a. M16 omvat het grootste deel; M15 en M17a zijn gedeeltelijk betrokken. De begrazing loopt volgens deze gebruikersvaststelling tot heden door. Omdat de bron geen oppervlakte per kavel geeft, blijft</w:t>
+        <w:t xml:space="preserve">bevat 125 geverifieerde directe relaties. Daarvan waren 36 al onderbouwd met expliciete kavelvermeldingen, gebruikersvaststellingen of een bijzondere gebiedsnaam. De nameninventaris voegt 32 geometrische doorsnijdingen toe voor zes volledig en letterlijk gelokaliseerde uitvoeringen. Daarnaast zijn elf relaties toegevoegd voor de volledige systemen Pan 13 en Plas 20. De begrazing van de Helmduinen vanaf eind 1991 is na correctie op 15 oktober 2026 gekoppeld aan M15 en M16. M17a is retroactief verwijderd: die kavel hoort voor deze naamtoedeling bij Prinsenduin, niet bij Helmduinen. De begrazing loopt tot heden door. Omdat de bron geen oppervlakte per kavel geeft, blijft</w:t>
       </w:r>
       <w:r>
         <w:t xml:space="preserve"> </w:t>
@@ -6562,7 +6486,7 @@
         <w:t xml:space="preserve"> </w:t>
       </w:r>
       <w:r>
-        <w:t xml:space="preserve">voor alle drie leeg. De geometrische naamkoppelingen gebruiken de actuele SOVON-plotgeometrie</w:t>
+        <w:t xml:space="preserve">voor beide leeg. De geometrische naamkoppelingen gebruiken de actuele SOVON-plotgeometrie</w:t>
       </w:r>
       <w:r>
         <w:t xml:space="preserve"> </w:t>
@@ -6620,7 +6544,16 @@
         <w:pStyle w:val="BodyText"/>
       </w:pPr>
       <w:r>
-        <w:t xml:space="preserve">Het jaarlijkse aanvullende maaibeheer van in totaal drie hectare in Ruijgenhoek, Langestrook en De Loopert is gekoppeld aan M32, M45 en M83. Ton lokaliseerde Ruygenhoek op 15 oktober 2026 in M32. De actuele TOP10NL-geometrie van De Loopert raakt M45 en M83. Langestrook blijft niet gelokaliseerd en wordt niet aan een kavel toegeschreven. De Natura 2000-evaluatie van 25 april 2025 vermeldt dat jaarlijks is gemaaid en dat Dunea het beheer voortzet, maar geeft geen vaststelbare beginjaren, afzonderlijke uitvoeringsjaren of verdeling van de drie hectare. Daarom blijven de jaarlaag en</w:t>
+        <w:t xml:space="preserve">Het jaarlijkse aanvullende maaibeheer van in totaal drie hectare in Ruijgenhoek, Langestrook en De Loopert is gekoppeld aan M1a, M1b, M32, M45 en M83. Ton lokaliseerde Ruygenhoek op 15 oktober 2026 in M32. De actuele TOP10NL-geometrie van De Loopert raakt M45 en M83; het naamobject Lange Strook (</w:t>
+      </w:r>
+      <w:r>
+        <w:rPr>
+          <w:rStyle w:val="VerbatimChar"/>
+        </w:rPr>
+        <w:t xml:space="preserve">OBJ-2F95388B74</w:t>
+      </w:r>
+      <w:r>
+        <w:t xml:space="preserve">, geometrie 14) raakt M1a en M1b. Langestrook, Lange Strook en Lange Strooken blijven als bronvarianten herkenbaar. De Natura 2000-evaluatie van 25 april 2025 vermeldt dat jaarlijks is gemaaid en dat Dunea het beheer voortzet, maar geeft geen vaststelbare beginjaren, afzonderlijke uitvoeringsjaren of verdeling van de drie hectare. Daarom blijven de jaarlaag en</w:t>
       </w:r>
       <w:r>
         <w:t xml:space="preserve"> </w:t>
@@ -7129,7 +7062,7 @@
         <w:pStyle w:val="BodyText"/>
       </w:pPr>
       <w:r>
-        <w:t xml:space="preserve">Ton heeft op 15 oktober 2026 Meeuwenduin voor deze maatregel gelijkgesteld aan Meeuwenhoek en voorlopig de topografie van Prinsenberg voor Prinsenduin aangewezen. De uitvoering is naar bronjaar gesplitst. Het in november 2023 gestarte werk in Meeuwenduin en Prinsenduin is gekoppeld aan M10-12-76, M12a, M73, M74 en M75 voor Meeuwenduin en aan M2, M3, M35 en M36 voor Prinsenduin. Het Dunea-jaarverslag bevestigt in 2024 alleen voortzetting bij Prinsenduin; daarom is 2024 uitsluitend gekoppeld aan M2, M3, M35 en M36. De gelijkstelling Prinsenduin–Prinsenberg is voorlopig en de exacte werkvoetafdruk binnen de dertien uitvoering-kavelrelaties is onbekend;</w:t>
+        <w:t xml:space="preserve">Ton heeft op 15 oktober 2026 Meeuwenduin voor deze maatregel gelijkgesteld aan Meeuwenhoek. Prinsenduin en Prinsenberg zijn juist van elkaar gescheiden. De Prinsenberg is het uitzichtpunt op 52.1314451° N, 4.3186070° E in M2; de bredere TOP10NL-geometrie met die naam raakt M2, M3, M35 en M36. Van der Hagen et al. (2020), figuur 1, toont Prinsenduin als afzonderlijk zuidwestelijk onderzoeksgebied; Ton lokaliseerde dit gebied in M17a. Het in november 2023 gestarte werk is daardoor gekoppeld aan M10-12-76, M12a, M73, M74 en M75 voor Meeuwenduin en aan M17a voor Prinsenduin. De in 2024 bevestigde voortzetting is alleen aan M17a gekoppeld. De eerdere Prinsenduin-relaties met M2, M3, M35 en M36 zijn retroactief verwijderd. De exacte werkvoetafdruk binnen de zeven resterende uitvoering-kavelrelaties is onbekend;</w:t>
       </w:r>
       <w:r>
         <w:t xml:space="preserve"> </w:t>
@@ -7145,6 +7078,29 @@
       </w:r>
       <w:r>
         <w:t xml:space="preserve">blijft leeg.</w:t>
+      </w:r>
+    </w:p>
+    <w:p>
+      <w:pPr>
+        <w:pStyle w:val="BodyText"/>
+      </w:pPr>
+      <w:r>
+        <w:t xml:space="preserve">Maatregel 22h, aanvullend beheer in 2016–2021, is gekoppeld aan zes kavels: M15 en M16 voor Helmduinen; M17a voor Prinsenduin; M13s, M77 en M78/79 voor Ganzenhoek; en M17a, M16, M15, M13s en M78/79 voor de buitenste zeereep direct achter het strand. De Natura 2000-evaluatie bevat zes jaarbeoordelingen: uitvoering in 2016 en 2017 en</w:t>
+      </w:r>
+      <w:r>
+        <w:t xml:space="preserve"> </w:t>
+      </w:r>
+      <w:r>
+        <w:rPr>
+          <w:rStyle w:val="VerbatimChar"/>
+        </w:rPr>
+        <w:t xml:space="preserve">onbekend</w:t>
+      </w:r>
+      <w:r>
+        <w:t xml:space="preserve"> </w:t>
+      </w:r>
+      <w:r>
+        <w:t xml:space="preserve">in 2018–2021. Alleen de twee uitgevoerde jaren leveren samen twaalf plot-jaarrijen. De bron verdeelt de werkzaamheden niet over naamgebieden of kavels; deze regels beschrijven daarom de uitvoeringsscope en bewijzen niet dat in ieder van de zes kavels in beide jaren feitelijk is gewerkt.</w:t>
       </w:r>
     </w:p>
     <w:p>
@@ -7323,7 +7279,7 @@
         <w:pStyle w:val="BodyText"/>
       </w:pPr>
       <w:r>
-        <w:t xml:space="preserve">De 124 plotkoppelingen en 86 uitgevoerde jaarregels leveren samen 172 regels in</w:t>
+        <w:t xml:space="preserve">De 125 plotkoppelingen en 86 uitgevoerde jaarregels leveren samen 177 regels in</w:t>
       </w:r>
       <w:r>
         <w:t xml:space="preserve"> </w:t>
@@ -7335,7 +7291,7 @@
         <w:t xml:space="preserve">v_plot_jaar_maatregel_bronvast</w:t>
       </w:r>
       <w:r>
-        <w:t xml:space="preserve">. De koppeling van het maaibeheer in Ruygenhoek en De Loopert voegt drie plotrelaties maar geen plot-jaarrijen toe, omdat vaststelbare uitvoeringsjaren ontbreken; Langestrook blijft niet gelokaliseerd. De Ganzenhoekbosdunning voegt twee plot-jaarrijen voor M77 en M78/79 in 2017 toe. De nameninventaris voegt 36 plot-jaarrijen toe: begrazing in Kijfhoek en Bierlap in 1990, hervat maaibeheer bij Tafelberg en ’t Scheepje in 2025, uitgevoerd maaibeheer in Uilenbosch in 2017–2021 en vogelkersbestrijding in Kijfhoek, Bierlap en Meeuwenhoek in 2020. De aanvullende systeemkoppelingen voegen 22 plot-jaarrijen toe: vier voor de oeveraanpassing van Pan 13 in 1988–1989 en achttien voor drie uitvoeringen in Plas 20 in 2005–2006. De Helmduinen-koppeling voegt drie plot-jaarrijen voor 1991 toe. De uitbreiding van de begrazing met de Kikkervalleien, de eenmalige verwijdering van vegetatie en voedselrijke bovengrond en het verwijderen van leidingen en putten voegen ieder drie plot-jaarrijen voor 1997 toe; Parnassiapad 2 voegt één plot-jaarrij voor M15 in 1993 toe en Parnassiapad 1 één voor M15 in 1997. De Watercrassulabestrijding voegt dertig plot-jaarrijen toe voor M13, M13s en M14 in 2015 en 2017–2025. Het opslagbeheer in Meeuwenduin en Prinsenduin voegt negen plot-jaarrijen voor 2023 toe; de afzonderlijke voortzetting in Prinsenduin voegt vier plot-jaarrijen voor 2024 toe. De konijnenbijplaatsingsproef voegt twee plot-jaarrijen toe voor M8 en M41 in 2024. De koppeling van Plas 8.4.2 aan M32 voegt één plot-jaarrij voor 2002 toe. Waalsdorp voegt acht plot-jaarrijen toe voor M84 en M43 in 2016–2019. De statussen</w:t>
+        <w:t xml:space="preserve">. Het maaibeheer in Ruygenhoek, Lange Strook en De Loopert voegt vijf plotrelaties maar geen plot-jaarrijen toe, omdat vaststelbare uitvoeringsjaren ontbreken. De Ganzenhoekbosdunning voegt twee plot-jaarrijen voor M77 en M78/79 in 2017 toe. De nameninventaris voegt 36 plot-jaarrijen toe. De aanvullende systeemkoppelingen voegen 22 plot-jaarrijen toe. De Helmduinen-koppeling voegt twee plot-jaarrijen voor 1991 toe. Het opslagbeheer in Meeuwenduin en Prinsenduin voegt zes plot-jaarrijen voor 2023 toe; de afzonderlijke voortzetting in Prinsenduin één voor M17a in 2024. Maatregel 22h voegt twaalf scoperegels voor zes kavels in 2016 en 2017 toe; voor 2018–2021 blijft de jaarstatus</w:t>
       </w:r>
       <w:r>
         <w:t xml:space="preserve"> </w:t>
@@ -7350,22 +7306,7 @@
         <w:t xml:space="preserve"> </w:t>
       </w:r>
       <w:r>
-        <w:t xml:space="preserve">voor 2020 en</w:t>
-      </w:r>
-      <w:r>
-        <w:t xml:space="preserve"> </w:t>
-      </w:r>
-      <w:r>
-        <w:rPr>
-          <w:rStyle w:val="VerbatimChar"/>
-        </w:rPr>
-        <w:t xml:space="preserve">niet_uitgevoerd</w:t>
-      </w:r>
-      <w:r>
-        <w:t xml:space="preserve"> </w:t>
-      </w:r>
-      <w:r>
-        <w:t xml:space="preserve">voor 2021 blijven in de jaarbeoordeling staan en leveren geen rij in deze uitgevoerde view. Voor beide doorlopende begrazingsmaatregelen bewaart deze view alleen het expliciet onderbouwde startjaar; de open einddatum en</w:t>
+        <w:t xml:space="preserve">en ontstaan geen plot-jaarrijen. De overige eerder vastgelegde koppelingen en jaarselecties blijven inhoudelijk ongewijzigd. Voor beide doorlopende begrazingsmaatregelen bewaart deze view alleen het expliciet onderbouwde startjaar; de open einddatum en</w:t>
       </w:r>
       <w:r>
         <w:t xml:space="preserve"> </w:t>
@@ -7380,22 +7321,7 @@
         <w:t xml:space="preserve"> </w:t>
       </w:r>
       <w:r>
-        <w:t xml:space="preserve">leggen de voortzetting tot en met 2026 vast zonder tussenliggende jaren als afzonderlijke bronbeweringen te construeren. De koppelingen voor de uitbreiding van het begrazingsgebied met Meeuwenhoek en het maaibeheer in Oude Rijs leveren geen uitgevoerde plot-jaarrij, omdat respectievelijk een uitvoeringsjaar ontbreekt en 2025 als</w:t>
-      </w:r>
-      <w:r>
-        <w:t xml:space="preserve"> </w:t>
-      </w:r>
-      <w:r>
-        <w:rPr>
-          <w:rStyle w:val="VerbatimChar"/>
-        </w:rPr>
-        <w:t xml:space="preserve">niet_uitgevoerd</w:t>
-      </w:r>
-      <w:r>
-        <w:t xml:space="preserve"> </w:t>
-      </w:r>
-      <w:r>
-        <w:t xml:space="preserve">is vastgelegd. Voorlinden, het elektriciteitswerk in M51 en de Paardenstal in M51 leveren evenmin een plot-jaarrij, omdat zij geen uitgevoerde jaarstatus hebben. De twee Bendel-jaarregels blijven buiten deze view omdat beide Bendel-uitvoeringen expliciet buiten het Meijendel-plotgebied vallen.</w:t>
+        <w:t xml:space="preserve">leggen de voortzetting tot en met 2026 vast zonder tussenliggende jaren als afzonderlijke bronbeweringen te construeren. De twee Bendel-jaarregels blijven buiten deze view omdat beide Bendel-uitvoeringen expliciet buiten het Meijendel-plotgebied vallen.</w:t>
       </w:r>
     </w:p>
     <w:p>
@@ -7461,22 +7387,22 @@
         <w:t xml:space="preserve"> </w:t>
       </w:r>
       <w:r>
-        <w:t xml:space="preserve">Bronvast op project-, uitvoering- en jaarniveau voor de 33 ingevoerde bronnen en 63 uitvoeringen. De algemene kavel- en gebiedsindeling is geometrisch beschikbaar voor de 55 actuele plots uit 2025; vijf expliciet gekoppelde historische kavels hebben geen afzonderlijke geometrie. De bronvaste plot-jaarlaag bevat 172 regels voor 1967–1969, 1972–1975, 1988–1991, 1993, 1997, 2002, 2005–2006 en 2017–2025. Zes uitvoeringen zijn via de nameninventaris aan 32 kavelsituaties gekoppeld; Pan 13 en Plas 20 voegen elf aanvullende relaties toe, Helmduinen drie, de Kikkervalleienbegrazing drie, het Kikkervalleien-bodemherstel drie, de Kikkervalleien-infrastructuuringreep drie, de Watercrassulabestrijding drie, het Kikkervalleien-Duindoornbeheer drie, Parnassiapad 2 één, Parnassiapad 1 één, Plas 8.4.2 één, Waalsdorp twee, Meeuwenduin en Prinsenduin samen dertien, de konijnenbijplaatsingsproef twee, het elektriciteitswerk in Vallei Meijendel één, de Paardenstal één en de Ganzenhoekbosdunning twee en het maaibeheer in Ruygenhoek en De Loopert drie. Zestien uitvoeringen hebben geen directe plotkoppeling; de twee Bendel-uitvoeringen zijn daarvan aantoonbaar buiten het Meijendel-plotgebied geplaatst, zodat nog 14 geheel ongekoppelde uitvoeringen ruimtelijk moeten worden beoordeeld. Daarnaast blijft Langestrook binnen de al gedeeltelijk gekoppelde uitvoering</w:t>
-      </w:r>
-      <w:r>
-        <w:t xml:space="preserve"> </w:t>
-      </w:r>
-      <w:r>
-        <w:rPr>
-          <w:rStyle w:val="VerbatimChar"/>
-        </w:rPr>
-        <w:t xml:space="preserve">pas_22b_maaibeheer</w:t>
-      </w:r>
-      <w:r>
-        <w:t xml:space="preserve"> </w:t>
-      </w:r>
-      <w:r>
-        <w:t xml:space="preserve">zonder kavel.</w:t>
+        <w:t xml:space="preserve">Bronvast op project-, uitvoering- en jaarniveau voor 34 ingevoerde bronnen en 63 uitvoeringen. De algemene kavel- en gebiedsindeling is geometrisch beschikbaar voor de 55 actuele plots uit 2025; vijf expliciet gekoppelde historische kavels hebben geen afzonderlijke geometrie. De bronvaste plot-jaarlaag bevat 177 regels voor 1967–1969, 1972–1975, 1988–1991, 1993, 1997, 2002, 2005–2006 en 2016–2025.</w:t>
+      </w:r>
+      <w:r>
+        <w:t xml:space="preserve"> </w:t>
+      </w:r>
+      <w:r>
+        <w:rPr>
+          <w:rStyle w:val="VerbatimChar"/>
+        </w:rPr>
+        <w:t xml:space="preserve">maatregel_plot_koppeling</w:t>
+      </w:r>
+      <w:r>
+        <w:t xml:space="preserve"> </w:t>
+      </w:r>
+      <w:r>
+        <w:t xml:space="preserve">bevat 125 relaties. Helmduinen heeft er twee; Meeuwenduin en Prinsenduin samen zeven; maatregel 22h zes; het maaibeheer in Ruygenhoek, Lange Strook en De Loopert vijf. Vijftien uitvoeringen hebben geen directe plotkoppeling; de twee Bendel-uitvoeringen vallen aantoonbaar buiten het Meijendel-plotgebied, zodat nog 13 geheel ongekoppelde uitvoeringen ruimtelijk moeten worden beoordeeld.</w:t>
       </w:r>
     </w:p>
     <w:p>

</xml_diff>

<commit_message>
Koppel PIM-leidingwerk aan kavels
</commit_message>
<xml_diff>
--- a/docs/MEIJENDEL_BRONREGISTER.docx
+++ b/docs/MEIJENDEL_BRONREGISTER.docx
@@ -316,7 +316,21 @@
         <w:pStyle w:val="BodyText"/>
       </w:pPr>
       <w:r>
-        <w:t xml:space="preserve">De aanvulling maakt overeenkomsten tussen bronnen vindbaar. In twee stappen hebben 2.509 bestaande registraties alsnog een primaire soortgroep gekregen, waarvan 1.226 in de laatste stap. Alle 87 eerder onopgeloste PQ-naamteksten uit 1981–2025 zijn onderbouwd met code, wetenschappelijke en Nederlandse naam uit Floranld_2020. Deze openbare Turboveg-referentielijst, aangeboden op 10 maart 2026 via www.synbiosys.alterra.nl/turboveg/, bevat 17.468 codes. De oorspronkelijke PQ-waarden en eerdere besluiten blijven behouden.</w:t>
+        <w:t xml:space="preserve">De aanvulling maakt overeenkomsten tussen bronnen vindbaar. In twee stappen hebben 2.509 bestaande registraties alsnog een primaire soortgroep gekregen, waarvan 1.226 in de laatste stap. Alle 87 eerder onopgeloste PQ-naamteksten uit 1981–2025 zijn onderbouwd met code, wetenschappelijke en Nederlandse naam uit Floranld_2020. Deze openbare Turboveg-referentielijst, aangeboden op 10 maart 2026 via</w:t>
+      </w:r>
+      <w:r>
+        <w:t xml:space="preserve"> </w:t>
+      </w:r>
+      <w:hyperlink r:id="rId11">
+        <w:r>
+          <w:rPr>
+            <w:rStyle w:val="Hyperlink"/>
+          </w:rPr>
+          <w:t xml:space="preserve">www.synbiosys.alterra.nl/turboveg/</w:t>
+        </w:r>
+      </w:hyperlink>
+      <w:r>
+        <w:t xml:space="preserve">, bevat 17.468 codes. De oorspronkelijke PQ-waarden en eerdere besluiten blijven behouden.</w:t>
       </w:r>
     </w:p>
     <w:p>
@@ -355,11 +369,11 @@
       <w:pPr>
         <w:pStyle w:val="Heading2"/>
       </w:pPr>
-      <w:bookmarkStart w:id="11" w:name="_4a53154a1633e588416373f70b0c468114c0efc"/>
+      <w:bookmarkStart w:id="12" w:name="_4a53154a1633e588416373f70b0c468114c0efc"/>
       <w:r>
         <w:t xml:space="preserve">Overkoepelende analysegeschiktheid</w:t>
       </w:r>
-      <w:bookmarkEnd w:id="11"/>
+      <w:bookmarkEnd w:id="12"/>
     </w:p>
     <w:p>
       <w:pPr>
@@ -711,11 +725,11 @@
       <w:pPr>
         <w:pStyle w:val="Heading2"/>
       </w:pPr>
-      <w:bookmarkStart w:id="12" w:name="_beheerregel"/>
+      <w:bookmarkStart w:id="13" w:name="_beheerregel"/>
       <w:r>
         <w:t xml:space="preserve">Beheerregel</w:t>
       </w:r>
-      <w:bookmarkEnd w:id="12"/>
+      <w:bookmarkEnd w:id="13"/>
     </w:p>
     <w:p>
       <w:pPr>
@@ -729,7 +743,7 @@
       <w:pPr>
         <w:pStyle w:val="Heading2"/>
       </w:pPr>
-      <w:bookmarkStart w:id="13" w:name="_7243eacc1b8f4fc7d12d9437ed06490b9a892ca"/>
+      <w:bookmarkStart w:id="14" w:name="_c07dfd40f027bce65d2d0499dc5da8ab7f6fd0f"/>
       <w:r>
         <w:t xml:space="preserve">1. Bronnen in MySQL-database</w:t>
       </w:r>
@@ -742,17 +756,17 @@
         </w:rPr>
         <w:t xml:space="preserve">Meijendel</w:t>
       </w:r>
-      <w:bookmarkEnd w:id="13"/>
+      <w:bookmarkEnd w:id="14"/>
     </w:p>
     <w:p>
       <w:pPr>
         <w:pStyle w:val="Heading3"/>
       </w:pPr>
-      <w:bookmarkStart w:id="14" w:name="_ccd8cb4345e3f59364194a2576f706cc2c0a66e"/>
+      <w:bookmarkStart w:id="15" w:name="_32ab8fbd5be08d3f325e2553cd15813ff7e9c1f"/>
       <w:r>
         <w:t xml:space="preserve">1.1. Vogelgegevens van Vogelwerkgroep Meijendel en SOVON</w:t>
       </w:r>
-      <w:bookmarkEnd w:id="14"/>
+      <w:bookmarkEnd w:id="15"/>
     </w:p>
     <w:p>
       <w:pPr>
@@ -864,7 +878,7 @@
         <w:t xml:space="preserve"> </w:t>
       </w:r>
       <w:r>
-        <w:t xml:space="preserve">staan; omgekeerd ontbreekt geen bestaande SOVON-bron-ID in de nieuwe levering. Bij 2.629 gedeelde bron-ID’s levert SOVON broedcode 0 terwijl de database</w:t>
+        <w:t xml:space="preserve">staan; omgekeerd ontbreekt geen bestaande SOVON-bron-ID in de nieuwe levering. Bij 2.629 gedeelde bron-ID's levert SOVON broedcode 0 terwijl de database</w:t>
       </w:r>
       <w:r>
         <w:t xml:space="preserve"> </w:t>
@@ -981,7 +995,7 @@
         <w:t xml:space="preserve">jrvslg_m</w:t>
       </w:r>
       <w:r>
-        <w:t xml:space="preserve">-resultaat in de volledige jaarverslagreeks 1958-2025. Als zo’n soort in een geteld jaarverslagplot ontbreekt, wordt de soort-plotjaarcombinatie als nul behandeld; het is niet vereist dat de soort in hetzelfde kalenderjaar elders is vastgesteld. Deze waarde is geen letterlijke bronnul, krijgt daarom de status</w:t>
+        <w:t xml:space="preserve">-resultaat in de volledige jaarverslagreeks 1958-2025. Als zo'n soort in een geteld jaarverslagplot ontbreekt, wordt de soort-plotjaarcombinatie als nul behandeld; het is niet vereist dat de soort in hetzelfde kalenderjaar elders is vastgesteld. Deze waarde is geen letterlijke bronnul, krijgt daarom de status</w:t>
       </w:r>
       <w:r>
         <w:t xml:space="preserve"> </w:t>
@@ -2162,7 +2176,7 @@
         <w:t xml:space="preserve"> </w:t>
       </w:r>
       <w:r>
-        <w:t xml:space="preserve">blijft voor meeuwen leidend; zonder zo’n regel mag de SOVON-waarde aanvullen of corrigeren. Een ontbrekende teller mag vanuit het jaarverslag worden toegevoegd wanneer kavel en waarnemer ondubbelzinnig zijn en een bestaande code beschikbaar is. De Horsten wordt volledig genegeerd. Niet-conflicterende letterlijke SOVON-nullen worden zonder nieuwe jaarbeslissing opgenomen; niet tot individuele bronregels herleidbare aggregaatvermeldingen worden niet als formeel afgekeurde waarnemingen gereconstrueerd. Ieder jaar wordt eerst volledig vergeleken. Nieuwe soortenconflicten, nieuwe gegevensmodellen en wel individueel herleidbare afkeuringsinformatie blijven afzonderlijke beslispunten.</w:t>
+        <w:t xml:space="preserve">blijft voor meeuwen leidend; zonder zo'n regel mag de SOVON-waarde aanvullen of corrigeren. Een ontbrekende teller mag vanuit het jaarverslag worden toegevoegd wanneer kavel en waarnemer ondubbelzinnig zijn en een bestaande code beschikbaar is. De Horsten wordt volledig genegeerd. Niet-conflicterende letterlijke SOVON-nullen worden zonder nieuwe jaarbeslissing opgenomen; niet tot individuele bronregels herleidbare aggregaatvermeldingen worden niet als formeel afgekeurde waarnemingen gereconstrueerd. Ieder jaar wordt eerst volledig vergeleken. Nieuwe soortenconflicten, nieuwe gegevensmodellen en wel individueel herleidbare afkeuringsinformatie blijven afzonderlijke beslispunten.</w:t>
       </w:r>
     </w:p>
     <w:p>
@@ -3078,11 +3092,11 @@
       <w:pPr>
         <w:pStyle w:val="Heading3"/>
       </w:pPr>
-      <w:bookmarkStart w:id="15" w:name="_8a72a17aa3ecdd9f667bccd1a9ca55413034b5d"/>
+      <w:bookmarkStart w:id="16" w:name="_9645acbfea6b379f23d12aeedc36c987000825a"/>
       <w:r>
         <w:t xml:space="preserve">1.2. Provinciale permanente kwadraten</w:t>
       </w:r>
-      <w:bookmarkEnd w:id="15"/>
+      <w:bookmarkEnd w:id="16"/>
     </w:p>
     <w:p>
       <w:pPr>
@@ -3208,11 +3222,11 @@
       <w:pPr>
         <w:pStyle w:val="Heading3"/>
       </w:pPr>
-      <w:bookmarkStart w:id="16" w:name="_ded6c184b9a569c146345b6e935b052f391caf7"/>
+      <w:bookmarkStart w:id="17" w:name="_58edaa7a0159e378417d8d9e2f3abf27d746f4f"/>
       <w:r>
         <w:t xml:space="preserve">1.3. Zoogdieren tijdens SOVON- en VWG-bezoeken</w:t>
       </w:r>
-      <w:bookmarkEnd w:id="16"/>
+      <w:bookmarkEnd w:id="17"/>
     </w:p>
     <w:p>
       <w:pPr>
@@ -3423,11 +3437,11 @@
       <w:pPr>
         <w:pStyle w:val="Heading3"/>
       </w:pPr>
-      <w:bookmarkStart w:id="17" w:name="_94090b81dff39a8cf27d4389271118caece3ef6"/>
+      <w:bookmarkStart w:id="18" w:name="_d3fb9a25da94fa35cd3895c324ae264efa6b6ce"/>
       <w:r>
         <w:t xml:space="preserve">1.4. Historisch vangblikonderzoek</w:t>
       </w:r>
-      <w:bookmarkEnd w:id="17"/>
+      <w:bookmarkEnd w:id="18"/>
     </w:p>
     <w:p>
       <w:pPr>
@@ -3483,7 +3497,7 @@
       <w:r>
         <w:t xml:space="preserve"> </w:t>
       </w:r>
-      <w:hyperlink r:id="rId18">
+      <w:hyperlink r:id="rId19">
         <w:r>
           <w:rPr>
             <w:rStyle w:val="Hyperlink"/>
@@ -3568,11 +3582,11 @@
       <w:pPr>
         <w:pStyle w:val="Heading3"/>
       </w:pPr>
-      <w:bookmarkStart w:id="19" w:name="_003d1b4454050d8b2300662d18ee0e6097f4328"/>
+      <w:bookmarkStart w:id="20" w:name="_05a7f9ed9696b113895f0c60145ad70b98b3ccf"/>
       <w:r>
         <w:t xml:space="preserve">1.5. NDFF: één canonieke laag van openbare en beveiligde gegevens</w:t>
       </w:r>
-      <w:bookmarkEnd w:id="19"/>
+      <w:bookmarkEnd w:id="20"/>
     </w:p>
     <w:p>
       <w:pPr>
@@ -3650,11 +3664,11 @@
       <w:pPr>
         <w:pStyle w:val="Heading4"/>
       </w:pPr>
-      <w:bookmarkStart w:id="20" w:name="_dagvlinders"/>
+      <w:bookmarkStart w:id="21" w:name="_f2f5e1637d9b0d825d88db49318fbe09fe4562d"/>
       <w:r>
         <w:t xml:space="preserve">1.5.1. Dagvlinders</w:t>
       </w:r>
-      <w:bookmarkEnd w:id="20"/>
+      <w:bookmarkEnd w:id="21"/>
     </w:p>
     <w:p>
       <w:pPr>
@@ -3714,11 +3728,11 @@
       <w:pPr>
         <w:pStyle w:val="Heading4"/>
       </w:pPr>
-      <w:bookmarkStart w:id="21" w:name="_hommels"/>
+      <w:bookmarkStart w:id="22" w:name="_ab588a339567fbeba82f7ca9f0ef20022ceaf38"/>
       <w:r>
         <w:t xml:space="preserve">1.5.2. Hommels</w:t>
       </w:r>
-      <w:bookmarkEnd w:id="21"/>
+      <w:bookmarkEnd w:id="22"/>
     </w:p>
     <w:p>
       <w:pPr>
@@ -3778,11 +3792,11 @@
       <w:pPr>
         <w:pStyle w:val="Heading4"/>
       </w:pPr>
-      <w:bookmarkStart w:id="22" w:name="_libellen"/>
+      <w:bookmarkStart w:id="23" w:name="_5eeebc0b3ea39369efcb9361b685b51ab379390"/>
       <w:r>
         <w:t xml:space="preserve">1.5.3. Libellen</w:t>
       </w:r>
-      <w:bookmarkEnd w:id="22"/>
+      <w:bookmarkEnd w:id="23"/>
     </w:p>
     <w:p>
       <w:pPr>
@@ -3842,11 +3856,11 @@
       <w:pPr>
         <w:pStyle w:val="Heading4"/>
       </w:pPr>
-      <w:bookmarkStart w:id="23" w:name="_nachtvlinders"/>
+      <w:bookmarkStart w:id="24" w:name="_f7f75bff85528639d3a54437d815ffc982ac078"/>
       <w:r>
         <w:t xml:space="preserve">1.5.4. Nachtvlinders</w:t>
       </w:r>
-      <w:bookmarkEnd w:id="23"/>
+      <w:bookmarkEnd w:id="24"/>
     </w:p>
     <w:p>
       <w:pPr>
@@ -3906,11 +3920,11 @@
       <w:pPr>
         <w:pStyle w:val="Heading4"/>
       </w:pPr>
-      <w:bookmarkStart w:id="24" w:name="_amfibieën"/>
+      <w:bookmarkStart w:id="25" w:name="_5952ec78f96e716985cfd2bef0c6dea751da098"/>
       <w:r>
         <w:t xml:space="preserve">1.5.5. Amfibieën</w:t>
       </w:r>
-      <w:bookmarkEnd w:id="24"/>
+      <w:bookmarkEnd w:id="25"/>
     </w:p>
     <w:p>
       <w:pPr>
@@ -3970,11 +3984,11 @@
       <w:pPr>
         <w:pStyle w:val="Heading4"/>
       </w:pPr>
-      <w:bookmarkStart w:id="25" w:name="_reptielen"/>
+      <w:bookmarkStart w:id="26" w:name="_f98973ac0b4b22a8147264cf6fda7ae2d1f2584"/>
       <w:r>
         <w:t xml:space="preserve">1.5.6. Reptielen</w:t>
       </w:r>
-      <w:bookmarkEnd w:id="25"/>
+      <w:bookmarkEnd w:id="26"/>
     </w:p>
     <w:p>
       <w:pPr>
@@ -4034,11 +4048,11 @@
       <w:pPr>
         <w:pStyle w:val="Heading4"/>
       </w:pPr>
-      <w:bookmarkStart w:id="26" w:name="_vissen"/>
+      <w:bookmarkStart w:id="27" w:name="_9ffbbed58a474302bc88f9b6483937563542adc"/>
       <w:r>
         <w:t xml:space="preserve">1.5.7. Vissen</w:t>
       </w:r>
-      <w:bookmarkEnd w:id="26"/>
+      <w:bookmarkEnd w:id="27"/>
     </w:p>
     <w:p>
       <w:pPr>
@@ -4098,11 +4112,11 @@
       <w:pPr>
         <w:pStyle w:val="Heading4"/>
       </w:pPr>
-      <w:bookmarkStart w:id="27" w:name="_vleermuistransecten"/>
+      <w:bookmarkStart w:id="28" w:name="_90b1412457ba2ad39675de54e16fb4052a9af96"/>
       <w:r>
         <w:t xml:space="preserve">1.5.8. Vleermuistransecten</w:t>
       </w:r>
-      <w:bookmarkEnd w:id="27"/>
+      <w:bookmarkEnd w:id="28"/>
     </w:p>
     <w:p>
       <w:pPr>
@@ -4162,11 +4176,11 @@
       <w:pPr>
         <w:pStyle w:val="Heading4"/>
       </w:pPr>
-      <w:bookmarkStart w:id="28" w:name="_38cdc6eff084869e7169beb9a7d0a36448859a3"/>
+      <w:bookmarkStart w:id="29" w:name="_0bf7c6d2026ffa63b6182a76ed7ab201ef2ca1a"/>
       <w:r>
         <w:t xml:space="preserve">1.5.9. Konijnentellingen in de duinen</w:t>
       </w:r>
-      <w:bookmarkEnd w:id="28"/>
+      <w:bookmarkEnd w:id="29"/>
     </w:p>
     <w:p>
       <w:pPr>
@@ -4226,11 +4240,11 @@
       <w:pPr>
         <w:pStyle w:val="Heading4"/>
       </w:pPr>
-      <w:bookmarkStart w:id="29" w:name="_b7507ab25f19a705cdaea288841b95e0326cd82"/>
+      <w:bookmarkStart w:id="30" w:name="_d64910a2091f56dedd2aaa5a75994d38ec4c969"/>
       <w:r>
         <w:t xml:space="preserve">1.5.10. Wintertellingen vleermuizen</w:t>
       </w:r>
-      <w:bookmarkEnd w:id="29"/>
+      <w:bookmarkEnd w:id="30"/>
     </w:p>
     <w:p>
       <w:pPr>
@@ -4290,11 +4304,11 @@
       <w:pPr>
         <w:pStyle w:val="Heading4"/>
       </w:pPr>
-      <w:bookmarkStart w:id="30" w:name="_ba761ed76f0837e5aa40881d1ff3dfd4f2a2564"/>
+      <w:bookmarkStart w:id="31" w:name="_9cec44656db08bd57f600992eaa74a526d260b3"/>
       <w:r>
         <w:t xml:space="preserve">1.5.11. Het Nieuwe Strepen</w:t>
       </w:r>
-      <w:bookmarkEnd w:id="30"/>
+      <w:bookmarkEnd w:id="31"/>
     </w:p>
     <w:p>
       <w:pPr>
@@ -4329,7 +4343,7 @@
         <w:t xml:space="preserve"> </w:t>
       </w:r>
       <w:r>
-        <w:t xml:space="preserve">Op 6 oktober 2026 meldde FLORON dat één kalenderdag in één kilometerhok als telling mag worden beschouwd. Zo’n telling kan één, twee of drie oorspronkelijke lijsten omvatten. Persoonsgegevens en daarvan afgeleide waarnemerscodes worden niet geleverd. De</w:t>
+        <w:t xml:space="preserve">Op 6 oktober 2026 meldde FLORON dat één kalenderdag in één kilometerhok als telling mag worden beschouwd. Zo'n telling kan één, twee of drie oorspronkelijke lijsten omvatten. Persoonsgegevens en daarvan afgeleide waarnemerscodes worden niet geleverd. De</w:t>
       </w:r>
       <w:r>
         <w:t xml:space="preserve"> </w:t>
@@ -4432,11 +4446,11 @@
       <w:pPr>
         <w:pStyle w:val="Heading4"/>
       </w:pPr>
-      <w:bookmarkStart w:id="31" w:name="_add682eaf9770b54759a1b54720dedd522bc07f"/>
+      <w:bookmarkStart w:id="32" w:name="_c056d2025de29c95bc511421c5f5e41469354eb"/>
       <w:r>
         <w:t xml:space="preserve">1.5.12. FLORBASE en andere vaatplantinventarisaties</w:t>
       </w:r>
-      <w:bookmarkEnd w:id="31"/>
+      <w:bookmarkEnd w:id="32"/>
     </w:p>
     <w:p>
       <w:pPr>
@@ -4471,7 +4485,7 @@
         <w:t xml:space="preserve"> </w:t>
       </w:r>
       <w:r>
-        <w:t xml:space="preserve">Eén jaar in één kilometerhok is de fijnste beschikbare teleenheid. Voor 2011 werden alleen soort, jaar, kilometerhok en waarnemer opgeslagen. FLORON beschikt niet over de eerder gevraagde lijst-ID’s, volledigheidsvlaggen, bezoekdata, bezoekduur, checklistversies of expliciete registraties van niet-aangetroffen soorten.</w:t>
+        <w:t xml:space="preserve">Eén jaar in één kilometerhok is de fijnste beschikbare teleenheid. Voor 2011 werden alleen soort, jaar, kilometerhok en waarnemer opgeslagen. FLORON beschikt niet over de eerder gevraagde lijst-ID's, volledigheidsvlaggen, bezoekdata, bezoekduur, checklistversies of expliciete registraties van niet-aangetroffen soorten.</w:t>
       </w:r>
     </w:p>
     <w:p>
@@ -4496,11 +4510,11 @@
       <w:pPr>
         <w:pStyle w:val="Heading4"/>
       </w:pPr>
-      <w:bookmarkStart w:id="32" w:name="_ddc09a389d1414cf9c368e3f96b3cd144167922"/>
+      <w:bookmarkStart w:id="33" w:name="_b2fbeb28e0a334b9e6cb93232c4d845faf48221"/>
       <w:r>
         <w:t xml:space="preserve">1.5.13. LMF-aandachtssoorten</w:t>
       </w:r>
-      <w:bookmarkEnd w:id="32"/>
+      <w:bookmarkEnd w:id="33"/>
     </w:p>
     <w:p>
       <w:pPr>
@@ -4701,11 +4715,11 @@
       <w:pPr>
         <w:pStyle w:val="Heading4"/>
       </w:pPr>
-      <w:bookmarkStart w:id="33" w:name="_54b0c9881ebf1c9c32ceb4f54ebc7dcb81d8783"/>
+      <w:bookmarkStart w:id="34" w:name="_0ce2ec4e8b5503e251897e5490450ca2d9e0742"/>
       <w:r>
         <w:t xml:space="preserve">1.5.14. Mossen en korstmossen</w:t>
       </w:r>
-      <w:bookmarkEnd w:id="33"/>
+      <w:bookmarkEnd w:id="34"/>
     </w:p>
     <w:p>
       <w:pPr>
@@ -4829,11 +4843,11 @@
       <w:pPr>
         <w:pStyle w:val="Heading4"/>
       </w:pPr>
-      <w:bookmarkStart w:id="34" w:name="_1bea655362975aef3d944c226fffca3cc18312c"/>
+      <w:bookmarkStart w:id="35" w:name="_339fafe251367982d6218746f16721a93fa7f70"/>
       <w:r>
         <w:t xml:space="preserve">1.5.15. Bos- en zeereeppaddenstoelen</w:t>
       </w:r>
-      <w:bookmarkEnd w:id="34"/>
+      <w:bookmarkEnd w:id="35"/>
     </w:p>
     <w:p>
       <w:pPr>
@@ -4893,11 +4907,11 @@
       <w:pPr>
         <w:pStyle w:val="Heading4"/>
       </w:pPr>
-      <w:bookmarkStart w:id="35" w:name="_weekdieren"/>
+      <w:bookmarkStart w:id="36" w:name="_342bae7ae5afae546f17223888206446d449411"/>
       <w:r>
         <w:t xml:space="preserve">1.5.16. Weekdieren</w:t>
       </w:r>
-      <w:bookmarkEnd w:id="35"/>
+      <w:bookmarkEnd w:id="36"/>
     </w:p>
     <w:p>
       <w:pPr>
@@ -4957,11 +4971,11 @@
       <w:pPr>
         <w:pStyle w:val="Heading4"/>
       </w:pPr>
-      <w:bookmarkStart w:id="36" w:name="_1879253ee2dfd52031c9d63749e2737783da88e"/>
+      <w:bookmarkStart w:id="37" w:name="_cc11e4dda0fa9b87cf2613be17ff277804bdc91"/>
       <w:r>
         <w:t xml:space="preserve">1.5.17. SNL-gebiedsmonitoring</w:t>
       </w:r>
-      <w:bookmarkEnd w:id="36"/>
+      <w:bookmarkEnd w:id="37"/>
     </w:p>
     <w:p>
       <w:pPr>
@@ -5029,11 +5043,11 @@
       <w:pPr>
         <w:pStyle w:val="Heading3"/>
       </w:pPr>
-      <w:bookmarkStart w:id="37" w:name="_3dde7cd9c0fbcfd44f499ab6a6ef5cfd62b0862"/>
+      <w:bookmarkStart w:id="38" w:name="_77733873953f7250a44afc39ac6f33e9c0fface"/>
       <w:r>
         <w:t xml:space="preserve">1.6. Openbare externe ecologiebronnen</w:t>
       </w:r>
-      <w:bookmarkEnd w:id="37"/>
+      <w:bookmarkEnd w:id="38"/>
     </w:p>
     <w:p>
       <w:pPr>
@@ -5053,7 +5067,7 @@
       <w:r>
         <w:t xml:space="preserve"> </w:t>
       </w:r>
-      <w:hyperlink r:id="rId38">
+      <w:hyperlink r:id="rId39">
         <w:r>
           <w:rPr>
             <w:rStyle w:val="Hyperlink"/>
@@ -5247,7 +5261,7 @@
       <w:r>
         <w:t xml:space="preserve"> </w:t>
       </w:r>
-      <w:hyperlink r:id="rId39">
+      <w:hyperlink r:id="rId40">
         <w:r>
           <w:rPr>
             <w:rStyle w:val="Hyperlink"/>
@@ -5263,11 +5277,11 @@
       <w:pPr>
         <w:pStyle w:val="Heading4"/>
       </w:pPr>
-      <w:bookmarkStart w:id="40" w:name="_9c98e6e0799dea8eed6786abf4e9090b0506343"/>
+      <w:bookmarkStart w:id="41" w:name="_aa03dabe850e534118471d9a4587f103d7cc6d0"/>
       <w:r>
         <w:t xml:space="preserve">1.6.1. STOWA Limnodata</w:t>
       </w:r>
-      <w:bookmarkEnd w:id="40"/>
+      <w:bookmarkEnd w:id="41"/>
     </w:p>
     <w:p>
       <w:pPr>
@@ -5351,11 +5365,11 @@
       <w:pPr>
         <w:pStyle w:val="Heading4"/>
       </w:pPr>
-      <w:bookmarkStart w:id="41" w:name="_7810a275271da51e128daf1eadaca77f875310a"/>
+      <w:bookmarkStart w:id="42" w:name="_e9b446960bca12075cdde30af1cbaf73f645a87"/>
       <w:r>
         <w:t xml:space="preserve">1.6.2. ENDURE helmduinfauna</w:t>
       </w:r>
-      <w:bookmarkEnd w:id="41"/>
+      <w:bookmarkEnd w:id="42"/>
     </w:p>
     <w:p>
       <w:pPr>
@@ -5415,11 +5429,11 @@
       <w:pPr>
         <w:pStyle w:val="Heading4"/>
       </w:pPr>
-      <w:bookmarkStart w:id="42" w:name="_5a504ff8abd850ffc7704ce23c8f7bb19f98000"/>
+      <w:bookmarkStart w:id="43" w:name="_0079604d46da30ac9b5828c2b6c106eff7cd8f8"/>
       <w:r>
         <w:t xml:space="preserve">1.6.3. Landelijke Vegetatie Databank</w:t>
       </w:r>
-      <w:bookmarkEnd w:id="42"/>
+      <w:bookmarkEnd w:id="43"/>
     </w:p>
     <w:p>
       <w:pPr>
@@ -5668,11 +5682,11 @@
       <w:pPr>
         <w:pStyle w:val="Heading4"/>
       </w:pPr>
-      <w:bookmarkStart w:id="43" w:name="_a4b8938f650cad67af8384aa358648ef6881db5"/>
+      <w:bookmarkStart w:id="44" w:name="_a66e2be297c2cf82b37e3e4b59e101c55a2b789"/>
       <w:r>
         <w:t xml:space="preserve">1.6.4. Historische vlinder- en motcollectie</w:t>
       </w:r>
-      <w:bookmarkEnd w:id="43"/>
+      <w:bookmarkEnd w:id="44"/>
     </w:p>
     <w:p>
       <w:pPr>
@@ -5732,11 +5746,11 @@
       <w:pPr>
         <w:pStyle w:val="Heading4"/>
       </w:pPr>
-      <w:bookmarkStart w:id="44" w:name="_b06cb21dbe9ca56883ae8ed5d3f986798494e94"/>
+      <w:bookmarkStart w:id="45" w:name="_0623f0a4d9ecb153e84d6aa679ad58f6c310383"/>
       <w:r>
         <w:t xml:space="preserve">1.6.5. Naturalis Botany</w:t>
       </w:r>
-      <w:bookmarkEnd w:id="44"/>
+      <w:bookmarkEnd w:id="45"/>
     </w:p>
     <w:p>
       <w:pPr>
@@ -5796,11 +5810,11 @@
       <w:pPr>
         <w:pStyle w:val="Heading4"/>
       </w:pPr>
-      <w:bookmarkStart w:id="45" w:name="_335dc587b878851a017369d1c1c7e74fa2018ad"/>
+      <w:bookmarkStart w:id="46" w:name="_dd278617f9613de433492781e9679e24605d2f3"/>
       <w:r>
         <w:t xml:space="preserve">1.6.6. Naturalis Coleoptera</w:t>
       </w:r>
-      <w:bookmarkEnd w:id="45"/>
+      <w:bookmarkEnd w:id="46"/>
     </w:p>
     <w:p>
       <w:pPr>
@@ -5860,11 +5874,11 @@
       <w:pPr>
         <w:pStyle w:val="Heading3"/>
       </w:pPr>
-      <w:bookmarkStart w:id="46" w:name="_5d611a31ac68a696fd179c2c85c282500afefc7"/>
+      <w:bookmarkStart w:id="47" w:name="_4dcded00268e6461b0ddc34253d4faf52bf1dd1"/>
       <w:r>
         <w:t xml:space="preserve">1.7. Openstaande ruimtelijke toelatingscontrole</w:t>
       </w:r>
-      <w:bookmarkEnd w:id="46"/>
+      <w:bookmarkEnd w:id="47"/>
     </w:p>
     <w:p>
       <w:pPr>
@@ -5898,11 +5912,11 @@
       <w:pPr>
         <w:pStyle w:val="Heading3"/>
       </w:pPr>
-      <w:bookmarkStart w:id="47" w:name="_6e396c95ed446dc595f32661c45d91742a47fe5"/>
+      <w:bookmarkStart w:id="48" w:name="_14c58f11b78e283997281ebde92c6b31ebc0c80"/>
       <w:r>
         <w:t xml:space="preserve">1.8. Verklarende omgevingslagen</w:t>
       </w:r>
-      <w:bookmarkEnd w:id="47"/>
+      <w:bookmarkEnd w:id="48"/>
     </w:p>
     <w:p>
       <w:pPr>
@@ -5916,11 +5930,11 @@
       <w:pPr>
         <w:pStyle w:val="Heading4"/>
       </w:pPr>
-      <w:bookmarkStart w:id="48" w:name="_bb0c62bd471c774923f07d8b7b6f705ce2e805a"/>
+      <w:bookmarkStart w:id="49" w:name="_97e37a83ef92e6db79e0a815abf4c3d8d6d1754"/>
       <w:r>
         <w:t xml:space="preserve">1.8.1. Dagelijks weer</w:t>
       </w:r>
-      <w:bookmarkEnd w:id="48"/>
+      <w:bookmarkEnd w:id="49"/>
     </w:p>
     <w:p>
       <w:pPr>
@@ -5980,11 +5994,11 @@
       <w:pPr>
         <w:pStyle w:val="Heading4"/>
       </w:pPr>
-      <w:bookmarkStart w:id="49" w:name="_hoogte"/>
+      <w:bookmarkStart w:id="50" w:name="_625608f018b59d28869e33232003bd07c2f07d5"/>
       <w:r>
         <w:t xml:space="preserve">1.8.2. Hoogte</w:t>
       </w:r>
-      <w:bookmarkEnd w:id="49"/>
+      <w:bookmarkEnd w:id="50"/>
     </w:p>
     <w:p>
       <w:pPr>
@@ -6044,11 +6058,11 @@
       <w:pPr>
         <w:pStyle w:val="Heading4"/>
       </w:pPr>
-      <w:bookmarkStart w:id="50" w:name="_stikstofdepositie"/>
+      <w:bookmarkStart w:id="51" w:name="_8ebc62c1d17a2d7a08504bddffeeb5916a0bcb3"/>
       <w:r>
         <w:t xml:space="preserve">1.8.3. Stikstofdepositie</w:t>
       </w:r>
-      <w:bookmarkEnd w:id="50"/>
+      <w:bookmarkEnd w:id="51"/>
     </w:p>
     <w:p>
       <w:pPr>
@@ -6108,11 +6122,11 @@
       <w:pPr>
         <w:pStyle w:val="Heading4"/>
       </w:pPr>
-      <w:bookmarkStart w:id="51" w:name="_bodemgebruik"/>
+      <w:bookmarkStart w:id="52" w:name="_972156668716d33d6f7bf93cdaf573c7928edca"/>
       <w:r>
         <w:t xml:space="preserve">1.8.4. Bodemgebruik</w:t>
       </w:r>
-      <w:bookmarkEnd w:id="51"/>
+      <w:bookmarkEnd w:id="52"/>
     </w:p>
     <w:p>
       <w:pPr>
@@ -6172,11 +6186,11 @@
       <w:pPr>
         <w:pStyle w:val="Heading4"/>
       </w:pPr>
-      <w:bookmarkStart w:id="52" w:name="_6205564c333359604d547302ef9994dbae8e150"/>
+      <w:bookmarkStart w:id="53" w:name="_92770fc640c1bb2fd0ffeda71d68ce2650b46be"/>
       <w:r>
         <w:t xml:space="preserve">1.8.5. Natura 2000-habitat</w:t>
       </w:r>
-      <w:bookmarkEnd w:id="52"/>
+      <w:bookmarkEnd w:id="53"/>
     </w:p>
     <w:p>
       <w:pPr>
@@ -6236,11 +6250,11 @@
       <w:pPr>
         <w:pStyle w:val="Heading3"/>
       </w:pPr>
-      <w:bookmarkStart w:id="53" w:name="_55651eaef6a7220015a2870e55a9e8e9e62256a"/>
+      <w:bookmarkStart w:id="54" w:name="_f1f9cc3f4e7e57e7e99ffc1d85334cce67c3650"/>
       <w:r>
         <w:t xml:space="preserve">1.9. Werkzaamheden en beheermaatregelen</w:t>
       </w:r>
-      <w:bookmarkEnd w:id="53"/>
+      <w:bookmarkEnd w:id="54"/>
     </w:p>
     <w:p>
       <w:pPr>
@@ -6289,15 +6303,15 @@
         <w:t xml:space="preserve">.xls</w:t>
       </w:r>
       <w:r>
-        <w:t xml:space="preserve">-protocollen voor vleermuisonderzoek uit 2009–2013 en vier als PDF geregistreerde bestanden die feitelijk HTML-landingspagina’s waren. De vijf protocollen beschrijven onderzoeksformulieren, geen uitgevoerde terreinmaatregelen. De vier landingspagina’s zijn niet als inhoudelijk geraadpleegd document behandeld.</w:t>
-      </w:r>
-    </w:p>
-    <w:p>
-      <w:pPr>
-        <w:pStyle w:val="BodyText"/>
-      </w:pPr>
-      <w:r>
-        <w:t xml:space="preserve">De brede tekstselectie bevatte 351 bijlagen. De strengere selectie op formuleringen die feitelijke uitvoering aanduiden bevatte 206 bijlagen bij 190 bibliografische bronnen. Na beoordeling op uitvoering, locatie, jaar, dubbeling en brontype zijn achttien aanvullende Zotero-bronnen ingevoerd. Nieuw is Van der Hagen et al. (2020), waarvan figuur 1 Prinsenduin, Lange Strooken en Helmduinen als afzonderlijke onderzoeksgebieden toont. Samen met de zes al gebruikte Zotero-bronnen bevat</w:t>
+        <w:t xml:space="preserve">-protocollen voor vleermuisonderzoek uit 2009–2013 en vier als PDF geregistreerde bestanden die feitelijk HTML-landingspagina's waren. De vijf protocollen beschrijven onderzoeksformulieren, geen uitgevoerde terreinmaatregelen. De vier landingspagina's zijn niet als inhoudelijk geraadpleegd document behandeld.</w:t>
+      </w:r>
+    </w:p>
+    <w:p>
+      <w:pPr>
+        <w:pStyle w:val="BodyText"/>
+      </w:pPr>
+      <w:r>
+        <w:t xml:space="preserve">De brede tekstselectie bevatte 351 bijlagen. De strengere selectie op formuleringen die feitelijke uitvoering aanduiden bevatte 206 bijlagen bij 190 bibliografische bronnen. Na beoordeling op uitvoering, locatie, jaar, dubbeling en brontype zijn achttien aanvullende Zotero-bronnen ingevoerd. Nieuw is Van der Hagen et al. (2020), waarvan figuur 1 Prinsenduin, Lange Strooken en Helmduinen als afzonderlijke onderzoeksgebieden toont. Samen met de zes al gebruikte Zotero-bronnen bevat</w:t>
       </w:r>
       <w:r>
         <w:t xml:space="preserve"> </w:t>
@@ -6320,7 +6334,7 @@
         <w:pStyle w:val="BodyText"/>
       </w:pPr>
       <w:r>
-        <w:t xml:space="preserve">Daarbij zijn tien officiële internetbronnen geraadpleegd: vijf Dunea-pagina’s over optimalisatie van de waterwinning, beheer in Meeuwenduin en Prinsenduin, vervanging van slagbomen, actuele werkzaamheden en duindynamiek; het Dunea-jaarverslag 2024; het Zuid-Hollandse subsidie-openstellingsbesluit voor Bendel; de Staatsbosbeheer-pagina over de herinrichting van Bendel; de ODH-beschikking van 28 augustus 2023 voor de konijnenbijplaatsingsproef; en de ODH-beschikking van 5 november 2025 voor de renovatie van de Paardenstal. De bronnen staan afzonderlijk in</w:t>
+        <w:t xml:space="preserve">Daarbij zijn elf officiële of institutionele internetbronnen geraadpleegd: vijf Dunea-pagina's over optimalisatie van de waterwinning, beheer in Meeuwenduin en Prinsenduin, vervanging van slagbomen, actuele werkzaamheden en duindynamiek; het Dunea-jaarverslag 2024; het Zuid-Hollandse subsidie-openstellingsbesluit voor Bendel; de Staatsbosbeheer-pagina over de herinrichting van Bendel; de ODH-beschikking van 28 augustus 2023 voor de konijnenbijplaatsingsproef; de ODH-beschikking van 5 november 2025 voor de renovatie van de Paardenstal; en de via DANS gepubliceerde Haagse Archeologische Rapportage 1306 over het Programma Investeringen Meijendel. De bronnen staan afzonderlijk in</w:t>
       </w:r>
       <w:r>
         <w:t xml:space="preserve"> </w:t>
@@ -6350,7 +6364,7 @@
         <w:t xml:space="preserve"> </w:t>
       </w:r>
       <w:r>
-        <w:t xml:space="preserve">De levende lokale database bevat 18 projecten, 34 bronnen, 63 uitvoeringen, 102 expliciete jaarbeoordelingen uit 1967–2026 en 88 bronkoppelingen. Van de jaarbeoordelingen zijn er 86</w:t>
+        <w:t xml:space="preserve">De levende lokale database bevat 18 projecten, 35 bronnen, 63 uitvoeringen, 102 expliciete jaarbeoordelingen uit 1967–2026 en 89 bronkoppelingen. Van de jaarbeoordelingen zijn er 86</w:t>
       </w:r>
       <w:r>
         <w:t xml:space="preserve"> </w:t>
@@ -6412,7 +6426,7 @@
       <w:r>
         <w:t xml:space="preserve"> </w:t>
       </w:r>
-      <w:hyperlink r:id="rId54">
+      <w:hyperlink r:id="rId55">
         <w:r>
           <w:rPr>
             <w:rStyle w:val="Hyperlink"/>
@@ -6471,7 +6485,7 @@
         <w:t xml:space="preserve"> </w:t>
       </w:r>
       <w:r>
-        <w:t xml:space="preserve">bevat 125 geverifieerde directe relaties. Daarvan waren 36 al onderbouwd met expliciete kavelvermeldingen, gebruikersvaststellingen of een bijzondere gebiedsnaam. De nameninventaris voegt 32 geometrische doorsnijdingen toe voor zes volledig en letterlijk gelokaliseerde uitvoeringen. Daarnaast zijn elf relaties toegevoegd voor de volledige systemen Pan 13 en Plas 20. De begrazing van de Helmduinen vanaf eind 1991 is na correctie op 15 oktober 2026 gekoppeld aan M15 en M16. M17a is retroactief verwijderd: die kavel hoort voor deze naamtoedeling bij Prinsenduin, niet bij Helmduinen. De begrazing loopt tot heden door. Omdat de bron geen oppervlakte per kavel geeft, blijft</w:t>
+        <w:t xml:space="preserve">bevat 132 geverifieerde directe relaties. Daarvan waren 36 al onderbouwd met expliciete kavelvermeldingen, gebruikersvaststellingen of een bijzondere gebiedsnaam. De nameninventaris voegt 32 geometrische doorsnijdingen toe voor zes volledig en letterlijk gelokaliseerde uitvoeringen. Daarnaast zijn elf relaties toegevoegd voor de volledige systemen Pan 13 en Plas 20 en zeven voor het PIM-leidingwerk. De begrazing van de Helmduinen vanaf eind 1991 is na correctie op 15 oktober 2026 gekoppeld aan M15 en M16. M17a is retroactief verwijderd: die kavel hoort voor deze naamtoedeling bij Prinsenduin, niet bij Helmduinen. De begrazing loopt tot heden door. Omdat de bron geen oppervlakte per kavel geeft, blijft</w:t>
       </w:r>
       <w:r>
         <w:t xml:space="preserve"> </w:t>
@@ -6586,7 +6600,7 @@
           <w:i/>
           <w:iCs/>
         </w:rPr>
-        <w:t xml:space="preserve">Holland’s Duinen</w:t>
+        <w:t xml:space="preserve">Holland's Duinen</w:t>
       </w:r>
       <w:r>
         <w:t xml:space="preserve"> </w:t>
@@ -6625,7 +6639,7 @@
           <w:i/>
           <w:iCs/>
         </w:rPr>
-        <w:t xml:space="preserve">Holland’s Duinen</w:t>
+        <w:t xml:space="preserve">Holland's Duinen</w:t>
       </w:r>
       <w:r>
         <w:t xml:space="preserve"> </w:t>
@@ -6679,7 +6693,7 @@
           <w:i/>
           <w:iCs/>
         </w:rPr>
-        <w:t xml:space="preserve">Holland’s Duinen</w:t>
+        <w:t xml:space="preserve">Holland's Duinen</w:t>
       </w:r>
       <w:r>
         <w:t xml:space="preserve"> </w:t>
@@ -6718,7 +6732,7 @@
           <w:i/>
           <w:iCs/>
         </w:rPr>
-        <w:t xml:space="preserve">Holland’s Duinen</w:t>
+        <w:t xml:space="preserve">Holland's Duinen</w:t>
       </w:r>
       <w:r>
         <w:t xml:space="preserve"> </w:t>
@@ -6785,7 +6799,7 @@
           <w:i/>
           <w:iCs/>
         </w:rPr>
-        <w:t xml:space="preserve">Holland’s Duinen</w:t>
+        <w:t xml:space="preserve">Holland's Duinen</w:t>
       </w:r>
       <w:r>
         <w:t xml:space="preserve"> </w:t>
@@ -6852,7 +6866,7 @@
           <w:i/>
           <w:iCs/>
         </w:rPr>
-        <w:t xml:space="preserve">Holland’s Duinen</w:t>
+        <w:t xml:space="preserve">Holland's Duinen</w:t>
       </w:r>
       <w:r>
         <w:t xml:space="preserve"> </w:t>
@@ -6892,7 +6906,7 @@
           <w:i/>
           <w:iCs/>
         </w:rPr>
-        <w:t xml:space="preserve">Holland’s Duinen</w:t>
+        <w:t xml:space="preserve">Holland's Duinen</w:t>
       </w:r>
       <w:r>
         <w:t xml:space="preserve"> </w:t>
@@ -6916,7 +6930,7 @@
           <w:i/>
           <w:iCs/>
         </w:rPr>
-        <w:t xml:space="preserve">Holland’s Duinen</w:t>
+        <w:t xml:space="preserve">Holland's Duinen</w:t>
       </w:r>
       <w:r>
         <w:t xml:space="preserve"> </w:t>
@@ -7010,7 +7024,7 @@
           <w:i/>
           <w:iCs/>
         </w:rPr>
-        <w:t xml:space="preserve">Holland’s Duinen</w:t>
+        <w:t xml:space="preserve">Holland's Duinen</w:t>
       </w:r>
       <w:r>
         <w:t xml:space="preserve"> </w:t>
@@ -7062,7 +7076,7 @@
         <w:pStyle w:val="BodyText"/>
       </w:pPr>
       <w:r>
-        <w:t xml:space="preserve">Ton heeft op 15 oktober 2026 Meeuwenduin voor deze maatregel gelijkgesteld aan Meeuwenhoek. Prinsenduin en Prinsenberg zijn juist van elkaar gescheiden. De Prinsenberg is het uitzichtpunt op 52.1314451° N, 4.3186070° E in M2; de bredere TOP10NL-geometrie met die naam raakt M2, M3, M35 en M36. Van der Hagen et al. (2020), figuur 1, toont Prinsenduin als afzonderlijk zuidwestelijk onderzoeksgebied; Ton lokaliseerde dit gebied in M17a. Het in november 2023 gestarte werk is daardoor gekoppeld aan M10-12-76, M12a, M73, M74 en M75 voor Meeuwenduin en aan M17a voor Prinsenduin. De in 2024 bevestigde voortzetting is alleen aan M17a gekoppeld. De eerdere Prinsenduin-relaties met M2, M3, M35 en M36 zijn retroactief verwijderd. De exacte werkvoetafdruk binnen de zeven resterende uitvoering-kavelrelaties is onbekend;</w:t>
+        <w:t xml:space="preserve">Ton heeft op 15 oktober 2026 Meeuwenduin voor deze maatregel gelijkgesteld aan Meeuwenhoek. Prinsenduin en Prinsenberg zijn juist van elkaar gescheiden. De Prinsenberg is het uitzichtpunt op 52.1314451° N, 4.3186070° E in M2; de bredere TOP10NL-geometrie met die naam raakt M2, M3, M35 en M36. Van der Hagen et al. (2020), figuur 1, toont Prinsenduin als afzonderlijk zuidwestelijk onderzoeksgebied; Ton lokaliseerde dit gebied in M17a. Het in november 2023 gestarte werk is daardoor gekoppeld aan M10-12-76, M12a, M73, M74 en M75 voor Meeuwenduin en aan M17a voor Prinsenduin. De in 2024 bevestigde voortzetting is alleen aan M17a gekoppeld. De eerdere Prinsenduin-relaties met M2, M3, M35 en M36 zijn retroactief verwijderd. De exacte werkvoetafdruk binnen de zeven resterende uitvoering-kavelrelaties is onbekend;</w:t>
       </w:r>
       <w:r>
         <w:t xml:space="preserve"> </w:t>
@@ -7235,7 +7249,7 @@
           <w:i/>
           <w:iCs/>
         </w:rPr>
-        <w:t xml:space="preserve">Holland’s Duinen</w:t>
+        <w:t xml:space="preserve">Holland's Duinen</w:t>
       </w:r>
       <w:r>
         <w:t xml:space="preserve"> </w:t>
@@ -7279,7 +7293,27 @@
         <w:pStyle w:val="BodyText"/>
       </w:pPr>
       <w:r>
-        <w:t xml:space="preserve">De 125 plotkoppelingen en 86 uitgevoerde jaarregels leveren samen 177 regels in</w:t>
+        <w:t xml:space="preserve">Het leidingwerk binnen het Programma Investeringen Meijendel is gecorrigeerd van ‘6,5 kilometer aangelegd’ naar ‘6,5 kilometer vernieuwd’. Dunea beschrijft dit als totaal voor het programma van 2010 tot en met 22 oktober 2018. Haagse Archeologische Rapportage 1306 uit 2013 noemt vervanging of aansluiting van leidingwerk in Serie RA, Serie WV, Serie E, Serie LV en Complex 8 en begrenst de PIM-werkgebieden op afbeelding 1. De kaart is over de actuele kavelgeometrie gelegd; Ton bevestigde op 15 oktober 2026 de gezamenlijke koppeling aan M41, M42, M43, M45, M84, M84s en M85. De gepubliceerde 6,5 kilometer is niet over de series of kavels verdeeld. Daarom blijven de zeven</w:t>
+      </w:r>
+      <w:r>
+        <w:t xml:space="preserve"> </w:t>
+      </w:r>
+      <w:r>
+        <w:rPr>
+          <w:rStyle w:val="VerbatimChar"/>
+        </w:rPr>
+        <w:t xml:space="preserve">doorsnijding_pct</w:t>
+      </w:r>
+      <w:r>
+        <w:t xml:space="preserve">-waarden leeg en beschrijven de zeven plot-jaarrijen voor 2018 de uitvoeringsscope, niet een bekende lengte of werkvoetafdruk per kavel.</w:t>
+      </w:r>
+    </w:p>
+    <w:p>
+      <w:pPr>
+        <w:pStyle w:val="BodyText"/>
+      </w:pPr>
+      <w:r>
+        <w:t xml:space="preserve">De 132 plotkoppelingen en 86 uitgevoerde jaarregels leveren samen 184 regels in</w:t>
       </w:r>
       <w:r>
         <w:t xml:space="preserve"> </w:t>
@@ -7306,7 +7340,7 @@
         <w:t xml:space="preserve"> </w:t>
       </w:r>
       <w:r>
-        <w:t xml:space="preserve">en ontstaan geen plot-jaarrijen. De overige eerder vastgelegde koppelingen en jaarselecties blijven inhoudelijk ongewijzigd. Voor beide doorlopende begrazingsmaatregelen bewaart deze view alleen het expliciet onderbouwde startjaar; de open einddatum en</w:t>
+        <w:t xml:space="preserve">en ontstaan geen plot-jaarrijen. Het PIM-leidingwerk voegt zeven scoperegels voor 2018 toe. De overige eerder vastgelegde koppelingen en jaarselecties blijven inhoudelijk ongewijzigd. Voor beide doorlopende begrazingsmaatregelen bewaart deze view alleen het expliciet onderbouwde startjaar; de open einddatum en</w:t>
       </w:r>
       <w:r>
         <w:t xml:space="preserve"> </w:t>
@@ -7387,7 +7421,7 @@
         <w:t xml:space="preserve"> </w:t>
       </w:r>
       <w:r>
-        <w:t xml:space="preserve">Bronvast op project-, uitvoering- en jaarniveau voor 34 ingevoerde bronnen en 63 uitvoeringen. De algemene kavel- en gebiedsindeling is geometrisch beschikbaar voor de 55 actuele plots uit 2025; vijf expliciet gekoppelde historische kavels hebben geen afzonderlijke geometrie. De bronvaste plot-jaarlaag bevat 177 regels voor 1967–1969, 1972–1975, 1988–1991, 1993, 1997, 2002, 2005–2006 en 2016–2025.</w:t>
+        <w:t xml:space="preserve">Bronvast op project-, uitvoering- en jaarniveau voor 35 ingevoerde bronnen en 63 uitvoeringen. De algemene kavel- en gebiedsindeling is geometrisch beschikbaar voor de 55 actuele plots uit 2025; vijf expliciet gekoppelde historische kavels hebben geen afzonderlijke geometrie. De bronvaste plot-jaarlaag bevat 184 regels voor 1967–1969, 1972–1975, 1988–1991, 1993, 1997, 2002, 2005–2006 en 2016–2025.</w:t>
       </w:r>
       <w:r>
         <w:t xml:space="preserve"> </w:t>
@@ -7402,14 +7436,14 @@
         <w:t xml:space="preserve"> </w:t>
       </w:r>
       <w:r>
-        <w:t xml:space="preserve">bevat 125 relaties. Helmduinen heeft er twee; Meeuwenduin en Prinsenduin samen zeven; maatregel 22h zes; het maaibeheer in Ruygenhoek, Lange Strook en De Loopert vijf. Vijftien uitvoeringen hebben geen directe plotkoppeling; de twee Bendel-uitvoeringen vallen aantoonbaar buiten het Meijendel-plotgebied, zodat nog 13 geheel ongekoppelde uitvoeringen ruimtelijk moeten worden beoordeeld.</w:t>
+        <w:t xml:space="preserve">bevat 132 relaties. Helmduinen heeft er twee; Meeuwenduin en Prinsenduin samen zeven; maatregel 22h zes; het maaibeheer in Ruygenhoek, Lange Strook en De Loopert vijf; het PIM-leidingwerk zeven. Veertien uitvoeringen hebben geen directe plotkoppeling; de twee Bendel-uitvoeringen vallen aantoonbaar buiten het Meijendel-plotgebied, zodat nog 12 geheel ongekoppelde uitvoeringen ruimtelijk moeten worden beoordeeld.</w:t>
       </w:r>
     </w:p>
     <w:p>
       <w:pPr>
         <w:pStyle w:val="Heading2"/>
       </w:pPr>
-      <w:bookmarkStart w:id="55" w:name="_3b532014da7425692b0b753bfd67f02e729afe2"/>
+      <w:bookmarkStart w:id="56" w:name="_692b0a71312b2a939db271d079fb23757bfc15a"/>
       <w:r>
         <w:t xml:space="preserve">2. Bronnen in MySQL-database</w:t>
       </w:r>
@@ -7422,7 +7456,7 @@
         </w:rPr>
         <w:t xml:space="preserve">Meijendel_bronnen</w:t>
       </w:r>
-      <w:bookmarkEnd w:id="55"/>
+      <w:bookmarkEnd w:id="56"/>
     </w:p>
     <w:p>
       <w:pPr>
@@ -7451,11 +7485,11 @@
       <w:pPr>
         <w:pStyle w:val="Heading3"/>
       </w:pPr>
-      <w:bookmarkStart w:id="56" w:name="_duinvalleivegetatie"/>
+      <w:bookmarkStart w:id="57" w:name="_7ae3f60e8dd3c65bdde3d5f608a55d96632a876"/>
       <w:r>
         <w:t xml:space="preserve">2.1. Duinvalleivegetatie</w:t>
       </w:r>
-      <w:bookmarkEnd w:id="56"/>
+      <w:bookmarkEnd w:id="57"/>
     </w:p>
     <w:p>
       <w:pPr>
@@ -7477,7 +7511,7 @@
       <w:r>
         <w:t xml:space="preserve"> </w:t>
       </w:r>
-      <w:hyperlink r:id="rId57">
+      <w:hyperlink r:id="rId58">
         <w:r>
           <w:rPr>
             <w:rStyle w:val="Hyperlink"/>
@@ -7526,11 +7560,11 @@
       <w:pPr>
         <w:pStyle w:val="Heading3"/>
       </w:pPr>
-      <w:bookmarkStart w:id="58" w:name="_b3fe4556564befcfb8496c13829480f8568428d"/>
+      <w:bookmarkStart w:id="59" w:name="_6cd5cd3671e295c222d5bd4a47757f0a76f0a19"/>
       <w:r>
         <w:t xml:space="preserve">2.2. Vogelstand 1924</w:t>
       </w:r>
-      <w:bookmarkEnd w:id="58"/>
+      <w:bookmarkEnd w:id="59"/>
     </w:p>
     <w:p>
       <w:pPr>
@@ -7605,11 +7639,11 @@
       <w:pPr>
         <w:pStyle w:val="Heading3"/>
       </w:pPr>
-      <w:bookmarkStart w:id="59" w:name="_jachtspinnen"/>
+      <w:bookmarkStart w:id="60" w:name="_b3fdc40884db1bbf06132e666e117a731445140"/>
       <w:r>
         <w:t xml:space="preserve">2.3. Jachtspinnen</w:t>
       </w:r>
-      <w:bookmarkEnd w:id="59"/>
+      <w:bookmarkEnd w:id="60"/>
     </w:p>
     <w:p>
       <w:pPr>
@@ -7669,11 +7703,11 @@
       <w:pPr>
         <w:pStyle w:val="Heading3"/>
       </w:pPr>
-      <w:bookmarkStart w:id="60" w:name="_literatuuroverzicht"/>
+      <w:bookmarkStart w:id="61" w:name="_7c2c13aacf0ea926ee35ca97ab69391a3624a6f"/>
       <w:r>
         <w:t xml:space="preserve">2.4. Literatuuroverzicht</w:t>
       </w:r>
-      <w:bookmarkEnd w:id="60"/>
+      <w:bookmarkEnd w:id="61"/>
     </w:p>
     <w:p>
       <w:pPr>
@@ -7733,11 +7767,11 @@
       <w:pPr>
         <w:pStyle w:val="Heading3"/>
       </w:pPr>
-      <w:bookmarkStart w:id="61" w:name="_c459e94267866b3631cced111f8a87d0309b41a"/>
+      <w:bookmarkStart w:id="62" w:name="_4a1f2475629c7656191227e4ca81566bef187e2"/>
       <w:r>
         <w:t xml:space="preserve">2.5. Bijenmonitoring in vier beheergebieden</w:t>
       </w:r>
-      <w:bookmarkEnd w:id="61"/>
+      <w:bookmarkEnd w:id="62"/>
     </w:p>
     <w:p>
       <w:pPr>
@@ -7809,11 +7843,11 @@
       <w:pPr>
         <w:pStyle w:val="Heading3"/>
       </w:pPr>
-      <w:bookmarkStart w:id="62" w:name="_3de3a6968c8894ad5b666eb1a40d580f2cd5807"/>
+      <w:bookmarkStart w:id="63" w:name="_bef92f685785a24a45e5325384551ba55c57cc1"/>
       <w:r>
         <w:t xml:space="preserve">2.6. Aquatische macrofauna 1974–1975</w:t>
       </w:r>
-      <w:bookmarkEnd w:id="62"/>
+      <w:bookmarkEnd w:id="63"/>
     </w:p>
     <w:p>
       <w:pPr>
@@ -7888,11 +7922,11 @@
       <w:pPr>
         <w:pStyle w:val="Heading2"/>
       </w:pPr>
-      <w:bookmarkStart w:id="63" w:name="_ae67a70ad36e2d1d11a7d910c2e5a6d669a3a5f"/>
+      <w:bookmarkStart w:id="64" w:name="_2b62b82ef201b4c91783bce15da2b1d0258c34c"/>
       <w:r>
         <w:t xml:space="preserve">3. Geïdentificeerde externe kandidaatbronnen</w:t>
       </w:r>
-      <w:bookmarkEnd w:id="63"/>
+      <w:bookmarkEnd w:id="64"/>
     </w:p>
     <w:p>
       <w:pPr>
@@ -7906,21 +7940,21 @@
       <w:pPr>
         <w:pStyle w:val="Heading3"/>
       </w:pPr>
-      <w:bookmarkStart w:id="64" w:name="_d53aceb4d9e4863cdbb6367737be5e291cdac65"/>
+      <w:bookmarkStart w:id="65" w:name="_d53aceb4d9e4863cdbb6367737be5e291cdac65"/>
       <w:r>
         <w:t xml:space="preserve">Kandidaten met de grootste verwachte aanvulling</w:t>
       </w:r>
-      <w:bookmarkEnd w:id="64"/>
+      <w:bookmarkEnd w:id="65"/>
     </w:p>
     <w:p>
       <w:pPr>
         <w:pStyle w:val="Heading4"/>
       </w:pPr>
-      <w:bookmarkStart w:id="65" w:name="_74b9659b0fdf809bf79d99a5b829eae72be789d"/>
+      <w:bookmarkStart w:id="66" w:name="_bddce02f5cb2b082bf32fac381c8bc0ea5284d3"/>
       <w:r>
         <w:t xml:space="preserve">3.1. Historische en actuele ringgegevens</w:t>
       </w:r>
-      <w:bookmarkEnd w:id="65"/>
+      <w:bookmarkEnd w:id="66"/>
     </w:p>
     <w:p>
       <w:pPr>
@@ -8013,11 +8047,11 @@
       <w:pPr>
         <w:pStyle w:val="Heading4"/>
       </w:pPr>
-      <w:bookmarkStart w:id="66" w:name="_78976b2620bc79a80ca8146881cbd2c6e6ff990"/>
+      <w:bookmarkStart w:id="67" w:name="_8071b7ae643e6cecadbf8a281c84bb90b511e63"/>
       <w:r>
         <w:t xml:space="preserve">3.2. Erosiepinnen in een stuifkuilcomplex</w:t>
       </w:r>
-      <w:bookmarkEnd w:id="66"/>
+      <w:bookmarkEnd w:id="67"/>
     </w:p>
     <w:p>
       <w:pPr>
@@ -8095,11 +8129,11 @@
       <w:pPr>
         <w:pStyle w:val="Heading4"/>
       </w:pPr>
-      <w:bookmarkStart w:id="67" w:name="_0e60eab001b7dad7f07f0f30fba1e4c43b4fb6d"/>
+      <w:bookmarkStart w:id="68" w:name="_1b05a95cacb83608c9b762adcf4298810ed86f9"/>
       <w:r>
         <w:t xml:space="preserve">3.3. Langjarige droge-duinvegetatieplots</w:t>
       </w:r>
-      <w:bookmarkEnd w:id="67"/>
+      <w:bookmarkEnd w:id="68"/>
     </w:p>
     <w:p>
       <w:pPr>
@@ -8177,14 +8211,14 @@
       <w:pPr>
         <w:pStyle w:val="Heading4"/>
       </w:pPr>
-      <w:bookmarkStart w:id="69" w:name="_f31d7749b8f822cf46569bbbcf696a184226376"/>
+      <w:bookmarkStart w:id="70" w:name="_4578481a165cef1470f100d42a5e836ac7456f8"/>
       <w:r>
         <w:t xml:space="preserve">3.4.</w:t>
       </w:r>
       <w:r>
         <w:t xml:space="preserve"> </w:t>
       </w:r>
-      <w:hyperlink r:id="rId68">
+      <w:hyperlink r:id="rId69">
         <w:r>
           <w:rPr>
             <w:rStyle w:val="Hyperlink"/>
@@ -8192,7 +8226,7 @@
           <w:t xml:space="preserve">Neuropteren van Meijendel</w:t>
         </w:r>
       </w:hyperlink>
-      <w:bookmarkEnd w:id="69"/>
+      <w:bookmarkEnd w:id="70"/>
     </w:p>
     <w:p>
       <w:pPr>
@@ -8270,14 +8304,14 @@
       <w:pPr>
         <w:pStyle w:val="Heading4"/>
       </w:pPr>
-      <w:bookmarkStart w:id="71" w:name="_2470413ff36fadda6aaee753e44801bf1df918f"/>
+      <w:bookmarkStart w:id="72" w:name="_642992b46f3d655730973d9bd57c00f9c7aad9f"/>
       <w:r>
         <w:t xml:space="preserve">3.5.</w:t>
       </w:r>
       <w:r>
         <w:t xml:space="preserve"> </w:t>
       </w:r>
-      <w:hyperlink r:id="rId70">
+      <w:hyperlink r:id="rId71">
         <w:r>
           <w:rPr>
             <w:rStyle w:val="Hyperlink"/>
@@ -8285,7 +8319,7 @@
           <w:t xml:space="preserve">Zweefvliegen van Meijendel</w:t>
         </w:r>
       </w:hyperlink>
-      <w:bookmarkEnd w:id="71"/>
+      <w:bookmarkEnd w:id="72"/>
     </w:p>
     <w:p>
       <w:pPr>
@@ -8363,11 +8397,11 @@
       <w:pPr>
         <w:pStyle w:val="Heading4"/>
       </w:pPr>
-      <w:bookmarkStart w:id="72" w:name="_17333f70ef292f70875eaae009d7701e7337d63"/>
+      <w:bookmarkStart w:id="73" w:name="_80b82bf48485caf594896b8d6bc490be5f328ee"/>
       <w:r>
         <w:t xml:space="preserve">3.6. TERRA-Dunes plant- en bodemmicrobiomen</w:t>
       </w:r>
-      <w:bookmarkEnd w:id="72"/>
+      <w:bookmarkEnd w:id="73"/>
     </w:p>
     <w:p>
       <w:pPr>
@@ -8389,7 +8423,7 @@
       <w:r>
         <w:t xml:space="preserve"> </w:t>
       </w:r>
-      <w:hyperlink r:id="rId73">
+      <w:hyperlink r:id="rId74">
         <w:r>
           <w:rPr>
             <w:rStyle w:val="Hyperlink"/>
@@ -8438,11 +8472,11 @@
       <w:pPr>
         <w:pStyle w:val="Heading4"/>
       </w:pPr>
-      <w:bookmarkStart w:id="74" w:name="_40b4b5f78cd8ca95bb70f0f0c78c7e4fbf296ca"/>
+      <w:bookmarkStart w:id="75" w:name="_4b2db10b2340db42e20505c45425c0b84f14c27"/>
       <w:r>
         <w:t xml:space="preserve">3.7. Rups- en bodemmicrobiomen</w:t>
       </w:r>
-      <w:bookmarkEnd w:id="74"/>
+      <w:bookmarkEnd w:id="75"/>
     </w:p>
     <w:p>
       <w:pPr>
@@ -8464,7 +8498,7 @@
       <w:r>
         <w:t xml:space="preserve"> </w:t>
       </w:r>
-      <w:hyperlink r:id="rId75">
+      <w:hyperlink r:id="rId76">
         <w:r>
           <w:rPr>
             <w:rStyle w:val="Hyperlink"/>
@@ -8513,11 +8547,11 @@
       <w:pPr>
         <w:pStyle w:val="Heading4"/>
       </w:pPr>
-      <w:bookmarkStart w:id="76" w:name="_1ba4dd18d3453a5dd5138bb384a5f14f39849e8"/>
+      <w:bookmarkStart w:id="77" w:name="_442e94e4e2997aa133d10bf618574e2528e759d"/>
       <w:r>
         <w:t xml:space="preserve">3.8. Schimmels bij kruipwilg</w:t>
       </w:r>
-      <w:bookmarkEnd w:id="76"/>
+      <w:bookmarkEnd w:id="77"/>
     </w:p>
     <w:p>
       <w:pPr>
@@ -8539,7 +8573,7 @@
       <w:r>
         <w:t xml:space="preserve"> </w:t>
       </w:r>
-      <w:hyperlink r:id="rId77">
+      <w:hyperlink r:id="rId78">
         <w:r>
           <w:rPr>
             <w:rStyle w:val="Hyperlink"/>
@@ -8588,11 +8622,11 @@
       <w:pPr>
         <w:pStyle w:val="Heading4"/>
       </w:pPr>
-      <w:bookmarkStart w:id="78" w:name="_374ab00ebf692a8e3319839c9c7bfae940c399a"/>
+      <w:bookmarkStart w:id="79" w:name="_36e8e197a59cff4a0251b791dc5fc6bc0e135bf"/>
       <w:r>
         <w:t xml:space="preserve">3.9. Plantengroei, bodemvocht en weer</w:t>
       </w:r>
-      <w:bookmarkEnd w:id="78"/>
+      <w:bookmarkEnd w:id="79"/>
     </w:p>
     <w:p>
       <w:pPr>
@@ -8614,7 +8648,7 @@
       <w:r>
         <w:t xml:space="preserve"> </w:t>
       </w:r>
-      <w:hyperlink r:id="rId79">
+      <w:hyperlink r:id="rId80">
         <w:r>
           <w:rPr>
             <w:rStyle w:val="Hyperlink"/>
@@ -8663,11 +8697,11 @@
       <w:pPr>
         <w:pStyle w:val="Heading4"/>
       </w:pPr>
-      <w:bookmarkStart w:id="80" w:name="_936150612b1bf240012fee005a20984db1c7c99"/>
+      <w:bookmarkStart w:id="81" w:name="_49ed5beca1c3c65272a43e85c3687f3c3d41d64"/>
       <w:r>
         <w:t xml:space="preserve">3.10. Genetische datasets amfibieën</w:t>
       </w:r>
-      <w:bookmarkEnd w:id="80"/>
+      <w:bookmarkEnd w:id="81"/>
     </w:p>
     <w:p>
       <w:pPr>
@@ -8727,11 +8761,11 @@
       <w:pPr>
         <w:pStyle w:val="Heading3"/>
       </w:pPr>
-      <w:bookmarkStart w:id="81" w:name="_8c2748f02893018608c8a38a1054acf3030739d"/>
+      <w:bookmarkStart w:id="82" w:name="_136d668cd3b301eba92f27584d1a2d49d57a73c"/>
       <w:r>
         <w:t xml:space="preserve">3.11. Alleen context of nog een onderzoeksaanwijzing</w:t>
       </w:r>
-      <w:bookmarkEnd w:id="81"/>
+      <w:bookmarkEnd w:id="82"/>
     </w:p>
     <w:p>
       <w:pPr>
@@ -8877,7 +8911,7 @@
       <w:pPr>
         <w:pStyle w:val="BodyText"/>
       </w:pPr>
-      <w:hyperlink r:id="rId82">
+      <w:hyperlink r:id="rId83">
         <w:r>
           <w:rPr>
             <w:rStyle w:val="Hyperlink"/>
@@ -8941,11 +8975,11 @@
       <w:pPr>
         <w:pStyle w:val="Heading3"/>
       </w:pPr>
-      <w:bookmarkStart w:id="83" w:name="_41253e96e2b1ec8824f9b84bf0a06f4f5ff5fba"/>
+      <w:bookmarkStart w:id="84" w:name="_5a3c854a1ae73aceac94ca91c157868f870ab17"/>
       <w:r>
         <w:t xml:space="preserve">3.12. Geografische namen en historische paden</w:t>
       </w:r>
-      <w:bookmarkEnd w:id="83"/>
+      <w:bookmarkEnd w:id="84"/>
     </w:p>
     <w:p>
       <w:pPr>
@@ -9052,11 +9086,11 @@
       <w:pPr>
         <w:pStyle w:val="Heading2"/>
       </w:pPr>
-      <w:bookmarkStart w:id="84" w:name="_8e1aa2a9058c5df66a55f09f3195dc2392072ca"/>
+      <w:bookmarkStart w:id="85" w:name="_c540a83ee65aaec11aa446aec0815d16fd21e21"/>
       <w:r>
         <w:t xml:space="preserve">4. Verwachte aanvullingen</w:t>
       </w:r>
-      <w:bookmarkEnd w:id="84"/>
+      <w:bookmarkEnd w:id="85"/>
     </w:p>
     <w:p>
       <w:pPr>
@@ -9116,11 +9150,11 @@
       <w:pPr>
         <w:pStyle w:val="Heading2"/>
       </w:pPr>
-      <w:bookmarkStart w:id="85" w:name="_bd1d36805349ef5ec39b6efd044fd20b47e23f4"/>
+      <w:bookmarkStart w:id="86" w:name="_422e6271160c2b04a3b59fb5b59cfcc2e3afc55"/>
       <w:r>
         <w:t xml:space="preserve">5. Bronnen die niet verder worden uitgewerkt</w:t>
       </w:r>
-      <w:bookmarkEnd w:id="85"/>
+      <w:bookmarkEnd w:id="86"/>
     </w:p>
     <w:p>
       <w:pPr>
@@ -9150,11 +9184,11 @@
       <w:pPr>
         <w:pStyle w:val="Heading2"/>
       </w:pPr>
-      <w:bookmarkStart w:id="86" w:name="_013584c0923eee2d005d13457186cf6f9764ca0"/>
+      <w:bookmarkStart w:id="87" w:name="_b05dec49988a12f7955d21ff17f1c91e4d061eb"/>
       <w:r>
         <w:t xml:space="preserve">6. Gebruik van dit register</w:t>
       </w:r>
-      <w:bookmarkEnd w:id="86"/>
+      <w:bookmarkEnd w:id="87"/>
     </w:p>
     <w:p>
       <w:pPr>
@@ -9239,11 +9273,11 @@
       <w:pPr>
         <w:pStyle w:val="Heading2"/>
       </w:pPr>
-      <w:bookmarkStart w:id="87" w:name="_actieplan"/>
+      <w:bookmarkStart w:id="88" w:name="_67781990bcb7d7d43cc312a7ef48f37a1f83265"/>
       <w:r>
         <w:t xml:space="preserve">7. Actieplan</w:t>
       </w:r>
-      <w:bookmarkEnd w:id="87"/>
+      <w:bookmarkEnd w:id="88"/>
     </w:p>
     <w:p>
       <w:pPr>
@@ -9272,11 +9306,11 @@
       <w:pPr>
         <w:pStyle w:val="Heading3"/>
       </w:pPr>
-      <w:bookmarkStart w:id="88" w:name="_94b069977659593a87344faec87dcce83750292"/>
+      <w:bookmarkStart w:id="89" w:name="_d7f889e2150e602eaeb242f489896c9b52af547"/>
       <w:r>
         <w:t xml:space="preserve">Fase 1 — openbare, direct toetsbare bronnen</w:t>
       </w:r>
-      <w:bookmarkEnd w:id="88"/>
+      <w:bookmarkEnd w:id="89"/>
     </w:p>
     <w:p>
       <w:pPr>
@@ -9360,11 +9394,11 @@
       <w:pPr>
         <w:pStyle w:val="Heading3"/>
       </w:pPr>
-      <w:bookmarkStart w:id="89" w:name="_1e65d730f223a62ff579853fd3c77c9308748df"/>
+      <w:bookmarkStart w:id="90" w:name="_a67120beb48c3916f8a53c623f303ce8b8a6005"/>
       <w:r>
         <w:t xml:space="preserve">Fase 2 — reeksen met grote historische of trendwaarde</w:t>
       </w:r>
-      <w:bookmarkEnd w:id="89"/>
+      <w:bookmarkEnd w:id="90"/>
     </w:p>
     <w:p>
       <w:pPr>
@@ -9514,11 +9548,11 @@
       <w:pPr>
         <w:pStyle w:val="Heading3"/>
       </w:pPr>
-      <w:bookmarkStart w:id="90" w:name="_6b9d0c88ffcb5584e67daa74c9524b522af67c0"/>
+      <w:bookmarkStart w:id="91" w:name="_c96f79f2027e81b7ab280f9bf69df5af8bdf464"/>
       <w:r>
         <w:t xml:space="preserve">Fase 3 — reeds bekende bronhouders en contextdatasets</w:t>
       </w:r>
-      <w:bookmarkEnd w:id="90"/>
+      <w:bookmarkEnd w:id="91"/>
     </w:p>
     <w:p>
       <w:pPr>
@@ -9593,11 +9627,11 @@
       <w:pPr>
         <w:pStyle w:val="Heading3"/>
       </w:pPr>
-      <w:bookmarkStart w:id="91" w:name="_d490f73b19661b8ff0d346b94e527be91e989c7"/>
+      <w:bookmarkStart w:id="92" w:name="_d490f73b19661b8ff0d346b94e527be91e989c7"/>
       <w:r>
         <w:t xml:space="preserve">Vaste werkwijze per bron</w:t>
       </w:r>
-      <w:bookmarkEnd w:id="91"/>
+      <w:bookmarkEnd w:id="92"/>
     </w:p>
     <w:p>
       <w:pPr>
@@ -9611,11 +9645,11 @@
       <w:pPr>
         <w:pStyle w:val="Heading3"/>
       </w:pPr>
-      <w:bookmarkStart w:id="92" w:name="_1e50ec235a164d1e043cda4cec7be66fb154af3"/>
+      <w:bookmarkStart w:id="93" w:name="_1e50ec235a164d1e043cda4cec7be66fb154af3"/>
       <w:r>
         <w:t xml:space="preserve">Dekking van de internetcontrole</w:t>
       </w:r>
-      <w:bookmarkEnd w:id="92"/>
+      <w:bookmarkEnd w:id="93"/>
     </w:p>
     <w:p>
       <w:pPr>
@@ -9629,11 +9663,11 @@
       <w:pPr>
         <w:pStyle w:val="Heading2"/>
       </w:pPr>
-      <w:bookmarkStart w:id="93" w:name="_5001ec8ecf742000e2504f4f268bea177f3f158"/>
+      <w:bookmarkStart w:id="94" w:name="_5001ec8ecf742000e2504f4f268bea177f3f158"/>
       <w:r>
         <w:t xml:space="preserve">Achterliggende verantwoording</w:t>
       </w:r>
-      <w:bookmarkEnd w:id="93"/>
+      <w:bookmarkEnd w:id="94"/>
     </w:p>
     <w:p>
       <w:pPr>
@@ -9643,7 +9677,7 @@
           <w:numId w:val="1005"/>
         </w:numPr>
       </w:pPr>
-      <w:hyperlink r:id="rId94">
+      <w:hyperlink r:id="rId95">
         <w:r>
           <w:rPr>
             <w:rStyle w:val="Hyperlink"/>
@@ -9660,7 +9694,7 @@
           <w:numId w:val="1005"/>
         </w:numPr>
       </w:pPr>
-      <w:hyperlink r:id="rId95">
+      <w:hyperlink r:id="rId96">
         <w:r>
           <w:rPr>
             <w:rStyle w:val="Hyperlink"/>
@@ -9677,7 +9711,7 @@
           <w:numId w:val="1005"/>
         </w:numPr>
       </w:pPr>
-      <w:hyperlink r:id="rId96">
+      <w:hyperlink r:id="rId97">
         <w:r>
           <w:rPr>
             <w:rStyle w:val="Hyperlink"/>
@@ -9694,7 +9728,7 @@
           <w:numId w:val="1005"/>
         </w:numPr>
       </w:pPr>
-      <w:hyperlink r:id="rId97">
+      <w:hyperlink r:id="rId98">
         <w:r>
           <w:rPr>
             <w:rStyle w:val="Hyperlink"/>
@@ -9711,7 +9745,7 @@
           <w:numId w:val="1005"/>
         </w:numPr>
       </w:pPr>
-      <w:hyperlink r:id="rId98">
+      <w:hyperlink r:id="rId99">
         <w:r>
           <w:rPr>
             <w:rStyle w:val="Hyperlink"/>
@@ -9728,7 +9762,7 @@
           <w:numId w:val="1005"/>
         </w:numPr>
       </w:pPr>
-      <w:hyperlink r:id="rId99">
+      <w:hyperlink r:id="rId100">
         <w:r>
           <w:rPr>
             <w:rStyle w:val="Hyperlink"/>
@@ -9745,7 +9779,7 @@
           <w:numId w:val="1005"/>
         </w:numPr>
       </w:pPr>
-      <w:hyperlink r:id="rId100">
+      <w:hyperlink r:id="rId101">
         <w:r>
           <w:rPr>
             <w:rStyle w:val="Hyperlink"/>

</xml_diff>

<commit_message>
Koppel onderzocht PAS-maaibeheer aan zoekgebied
</commit_message>
<xml_diff>
--- a/docs/MEIJENDEL_BRONREGISTER.docx
+++ b/docs/MEIJENDEL_BRONREGISTER.docx
@@ -6433,87 +6433,66 @@
       </w:pPr>
       <w:r>
         <w:rPr>
-          <w:rStyle w:val="VerbatimChar"/>
-        </w:rPr>
-        <w:t xml:space="preserve">maatregel_geometrie</w:t>
-      </w:r>
-      <w:r>
-        <w:t xml:space="preserve"> </w:t>
-      </w:r>
-      <w:r>
-        <w:t xml:space="preserve">bevat nog nul exacte uitvoeringsgeometrieën.</w:t>
-      </w:r>
-      <w:r>
-        <w:t xml:space="preserve"> </w:t>
-      </w:r>
-      <w:r>
-        <w:rPr>
-          <w:rStyle w:val="VerbatimChar"/>
-        </w:rPr>
-        <w:t xml:space="preserve">maatregel_uitvoering_gebied</w:t>
-      </w:r>
-      <w:r>
-        <w:t xml:space="preserve"> </w:t>
-      </w:r>
-      <w:r>
-        <w:t xml:space="preserve">bevat twee veilige relaties: Voorlinden als locatie binnen het speciale gebied M91 en de in 1990 ingevoerde begrazing voor Kijfhoek en Bierlap als volledig benoemd gebied.</w:t>
-      </w:r>
-      <w:r>
-        <w:t xml:space="preserve"> </w:t>
-      </w:r>
-      <w:r>
-        <w:rPr>
-          <w:rStyle w:val="VerbatimChar"/>
-        </w:rPr>
-        <w:t xml:space="preserve">maatregel_plot_koppeling</w:t>
-      </w:r>
-      <w:r>
-        <w:t xml:space="preserve"> </w:t>
-      </w:r>
-      <w:r>
-        <w:t xml:space="preserve">bevat 133 geverifieerde directe relaties. Daarvan waren 36 al onderbouwd met expliciete kavelvermeldingen, gebruikersvaststellingen of een bijzondere gebiedsnaam. De nameninventaris voegt 32 geometrische doorsnijdingen toe voor zes volledig en letterlijk gelokaliseerde uitvoeringen. Daarnaast zijn elf relaties toegevoegd voor de volledige systemen Pan 13 en Plas 20, zeven voor het PIM-leidingwerk en één voor infiltratieplas 27.2. De begrazing van de Helmduinen vanaf eind 1991 is na correctie op 15 oktober 2026 gekoppeld aan M15 en M16. M17a is retroactief verwijderd: die kavel hoort voor deze naamtoedeling bij Prinsenduin, niet bij Helmduinen. De begrazing loopt tot heden door. Omdat de bron geen oppervlakte per kavel geeft, blijft</w:t>
-      </w:r>
-      <w:r>
-        <w:t xml:space="preserve"> </w:t>
-      </w:r>
-      <w:r>
-        <w:rPr>
-          <w:rStyle w:val="VerbatimChar"/>
-        </w:rPr>
-        <w:t xml:space="preserve">doorsnijding_pct</w:t>
-      </w:r>
-      <w:r>
-        <w:t xml:space="preserve"> </w:t>
-      </w:r>
-      <w:r>
-        <w:t xml:space="preserve">voor beide leeg. De geometrische naamkoppelingen gebruiken de actuele SOVON-plotgeometrie</w:t>
-      </w:r>
-      <w:r>
-        <w:t xml:space="preserve"> </w:t>
-      </w:r>
-      <w:r>
-        <w:rPr>
-          <w:rStyle w:val="VerbatimChar"/>
-        </w:rPr>
-        <w:t xml:space="preserve">sovon-avimap-2025-download-2026-10-02</w:t>
-      </w:r>
-      <w:r>
-        <w:t xml:space="preserve">. Een doorsnijding bewijst dat het genoemde naamgebied de plot raakt, niet welk percentage van de plot feitelijk is bewerkt;</w:t>
-      </w:r>
-      <w:r>
-        <w:t xml:space="preserve"> </w:t>
-      </w:r>
-      <w:r>
-        <w:rPr>
-          <w:rStyle w:val="VerbatimChar"/>
-        </w:rPr>
-        <w:t xml:space="preserve">doorsnijding_pct</w:t>
-      </w:r>
-      <w:r>
-        <w:t xml:space="preserve"> </w:t>
-      </w:r>
-      <w:r>
-        <w:t xml:space="preserve">blijft daarom leeg.</w:t>
+          <w:rFonts w:ascii="Aptos Mono" w:hAnsi="Aptos Mono"/>
+        </w:rPr>
+        <w:t>maatregel_geometrie</w:t>
+      </w:r>
+      <w:r>
+        <w:t xml:space="preserve"> bevat nog nul exacte uitvoeringsgeometrieën. </w:t>
+      </w:r>
+      <w:r>
+        <w:rPr>
+          <w:rFonts w:ascii="Aptos Mono" w:hAnsi="Aptos Mono"/>
+        </w:rPr>
+        <w:t>maatregel_uitvoering_gebied</w:t>
+      </w:r>
+      <w:r>
+        <w:t xml:space="preserve"> bevat twee veilige relaties: Voorlinden als locatie binnen het speciale gebied M91 en de in 1990 ingevoerde begrazing voor Kijfhoek en Bierlap als volledig benoemd gebied. </w:t>
+      </w:r>
+      <w:r>
+        <w:rPr>
+          <w:rFonts w:ascii="Aptos Mono" w:hAnsi="Aptos Mono"/>
+        </w:rPr>
+        <w:t>maatregel_plot_koppeling</w:t>
+      </w:r>
+      <w:r>
+        <w:t xml:space="preserve"> bevat 143 geverifieerde directe relaties. Daarvan waren 36 al onderbouwd met expliciete kavelvermeldingen, gebruikersvaststellingen of een bijzondere gebiedsnaam. De nameninventaris voegt 42 geometrische doorsnijdingen toe voor zeven volledig en letterlijk gelokaliseerde uitvoeringen. De tien nieuwe relaties betreffen het onderzochte zoekgebied van het niet uitgevoerde PAS-maaibeheer 23: M10-12-76, M12a, M62, M63, M64, M65, M72, M73, M74 en M75. De vier jaarregels 2016–2019 blijven </w:t>
+      </w:r>
+      <w:r>
+        <w:rPr>
+          <w:rFonts w:ascii="Aptos Mono" w:hAnsi="Aptos Mono"/>
+        </w:rPr>
+        <w:t>niet_uitgevoerd</w:t>
+      </w:r>
+      <w:r>
+        <w:t xml:space="preserve">; de koppelingen bewijzen dus geen maaiwerk. Daarnaast zijn elf relaties toegevoegd voor de volledige systemen Pan 13 en Plas 20, zeven voor het PIM-leidingwerk en één voor infiltratieplas 27.2. De begrazing van de Helmduinen vanaf eind 1991 is na correctie op 15 oktober 2026 gekoppeld aan M15 en M16. M17a is retroactief verwijderd: die kavel hoort voor deze naamtoedeling bij Prinsenduin, niet bij Helmduinen. De begrazing loopt tot heden door. Omdat de bron geen oppervlakte per kavel geeft, blijft </w:t>
+      </w:r>
+      <w:r>
+        <w:rPr>
+          <w:rFonts w:ascii="Aptos Mono" w:hAnsi="Aptos Mono"/>
+        </w:rPr>
+        <w:t>doorsnijding_pct</w:t>
+      </w:r>
+      <w:r>
+        <w:t xml:space="preserve"> voor beide leeg. De geometrische naamkoppelingen gebruiken de actuele SOVON-plotgeometrie </w:t>
+      </w:r>
+      <w:r>
+        <w:rPr>
+          <w:rFonts w:ascii="Aptos Mono" w:hAnsi="Aptos Mono"/>
+        </w:rPr>
+        <w:t>sovon-avimap-2025-download-2026-10-02</w:t>
+      </w:r>
+      <w:r>
+        <w:t xml:space="preserve">. Een doorsnijding bewijst dat het genoemde naamgebied de plot raakt, niet welk percentage van de plot feitelijk is bewerkt; </w:t>
+      </w:r>
+      <w:r>
+        <w:rPr>
+          <w:rFonts w:ascii="Aptos Mono" w:hAnsi="Aptos Mono"/>
+        </w:rPr>
+        <w:t>doorsnijding_pct</w:t>
+      </w:r>
+      <w:r>
+        <w:t xml:space="preserve"> blijft daarom leeg.</w:t>
       </w:r>
     </w:p>
     <w:p>
@@ -7334,49 +7313,43 @@
         <w:pStyle w:val="BodyText"/>
       </w:pPr>
       <w:r>
-        <w:t xml:space="preserve">De 133 plotkoppelingen en 88 uitgevoerde jaarregels leveren samen 186 regels in</w:t>
-      </w:r>
-      <w:r>
-        <w:t xml:space="preserve"> </w:t>
-      </w:r>
-      <w:r>
-        <w:rPr>
-          <w:rStyle w:val="VerbatimChar"/>
-        </w:rPr>
-        <w:t xml:space="preserve">v_plot_jaar_maatregel_bronvast</w:t>
-      </w:r>
-      <w:r>
-        <w:t xml:space="preserve">. Het maaibeheer in Ruygenhoek, Lange Strook en De Loopert voegt vijf plotrelaties maar geen plot-jaarrijen toe, omdat vaststelbare uitvoeringsjaren ontbreken. De Ganzenhoekbosdunning voegt twee plot-jaarrijen voor M77 en M78/79 in 2017 toe. De nameninventaris voegt 36 plot-jaarrijen toe. De aanvullende systeemkoppelingen voegen 22 plot-jaarrijen toe. De Helmduinen-koppeling voegt twee plot-jaarrijen voor 1991 toe. Het opslagbeheer in Meeuwenduin en Prinsenduin voegt zes plot-jaarrijen voor 2023 toe; de afzonderlijke voortzetting in Prinsenduin één voor M17a in 2024. Maatregel 22h voegt twaalf scoperegels voor zes kavels in 2016 en 2017 toe; voor 2018–2021 blijft de jaarstatus</w:t>
-      </w:r>
-      <w:r>
-        <w:t xml:space="preserve"> </w:t>
-      </w:r>
-      <w:r>
-        <w:rPr>
-          <w:rStyle w:val="VerbatimChar"/>
-        </w:rPr>
-        <w:t xml:space="preserve">onbekend</w:t>
-      </w:r>
-      <w:r>
-        <w:t xml:space="preserve"> </w:t>
-      </w:r>
-      <w:r>
-        <w:t xml:space="preserve">en ontstaan geen plot-jaarrijen. Het PIM-leidingwerk voegt zeven scoperegels voor 2018 toe. Infiltratieplas 27.2 voegt voor M77 één regel in 2013 en één in 2014 toe. De overige eerder vastgelegde koppelingen en jaarselecties blijven inhoudelijk ongewijzigd. Voor beide doorlopende begrazingsmaatregelen bewaart deze view alleen het expliciet onderbouwde startjaar; de open einddatum en</w:t>
-      </w:r>
-      <w:r>
-        <w:t xml:space="preserve"> </w:t>
-      </w:r>
-      <w:r>
-        <w:rPr>
-          <w:rStyle w:val="VerbatimChar"/>
-        </w:rPr>
-        <w:t xml:space="preserve">cycliciteit='doorlopend tot heden'</w:t>
-      </w:r>
-      <w:r>
-        <w:t xml:space="preserve"> </w:t>
-      </w:r>
-      <w:r>
-        <w:t xml:space="preserve">leggen de voortzetting tot en met 2026 vast zonder tussenliggende jaren als afzonderlijke bronbeweringen te construeren. De twee Bendel-jaarregels blijven buiten deze view omdat beide Bendel-uitvoeringen expliciet buiten het Meijendel-plotgebied vallen.</w:t>
+        <w:t xml:space="preserve">De 143 plotkoppelingen en 88 uitgevoerde jaarregels leveren samen 186 regels in </w:t>
+      </w:r>
+      <w:r>
+        <w:rPr>
+          <w:rFonts w:ascii="Aptos Mono" w:hAnsi="Aptos Mono"/>
+        </w:rPr>
+        <w:t>v_plot_jaar_maatregel_bronvast</w:t>
+      </w:r>
+      <w:r>
+        <w:t xml:space="preserve">. De tien koppelingen van het onderzochte PAS-maaibeheer 23 voegen geen plot-jaarrijen toe, omdat alle vier jaarregels 2016–2019 </w:t>
+      </w:r>
+      <w:r>
+        <w:rPr>
+          <w:rFonts w:ascii="Aptos Mono" w:hAnsi="Aptos Mono"/>
+        </w:rPr>
+        <w:t>niet_uitgevoerd</w:t>
+      </w:r>
+      <w:r>
+        <w:t xml:space="preserve"> zijn. Het maaibeheer in Ruygenhoek, Lange Strook en De Loopert voegt vijf plotrelaties maar geen plot-jaarrijen toe, omdat vaststelbare uitvoeringsjaren ontbreken. De Ganzenhoekbosdunning voegt twee plot-jaarrijen voor M77 en M78/79 in 2017 toe. De nameninventaris voegt 36 plot-jaarrijen toe. De aanvullende systeemkoppelingen voegen 22 plot-jaarrijen toe. De Helmduinen-koppeling voegt twee plot-jaarrijen voor 1991 toe. Het opslagbeheer in Meeuwenduin en Prinsenduin voegt zes plot-jaarrijen voor 2023 toe; de afzonderlijke voortzetting in Prinsenduin één voor M17a in 2024. Maatregel 22h voegt twaalf scoperegels voor zes kavels in 2016 en 2017 toe; voor 2018–2021 blijft de jaarstatus </w:t>
+      </w:r>
+      <w:r>
+        <w:rPr>
+          <w:rFonts w:ascii="Aptos Mono" w:hAnsi="Aptos Mono"/>
+        </w:rPr>
+        <w:t>onbekend</w:t>
+      </w:r>
+      <w:r>
+        <w:t xml:space="preserve"> en ontstaan geen plot-jaarrijen. Het PIM-leidingwerk voegt zeven scoperegels voor 2018 toe. Infiltratieplas 27.2 voegt voor M77 één regel in 2013 en één in 2014 toe. De overige eerder vastgelegde koppelingen en jaarselecties blijven inhoudelijk ongewijzigd. Voor beide doorlopende begrazingsmaatregelen bewaart deze view alleen het expliciet onderbouwde startjaar; de open einddatum en </w:t>
+      </w:r>
+      <w:r>
+        <w:rPr>
+          <w:rFonts w:ascii="Aptos Mono" w:hAnsi="Aptos Mono"/>
+        </w:rPr>
+        <w:t>cycliciteit='doorlopend tot heden'</w:t>
+      </w:r>
+      <w:r>
+        <w:t xml:space="preserve"> leggen de voortzetting tot en met 2026 vast zonder tussenliggende jaren als afzonderlijke bronbeweringen te construeren. De twee Bendel-jaarregels blijven buiten deze view omdat beide Bendel-uitvoeringen expliciet buiten het Meijendel-plotgebied vallen.</w:t>
       </w:r>
     </w:p>
     <w:p>
@@ -7434,30 +7407,29 @@
       <w:r>
         <w:rPr>
           <w:b/>
-          <w:bCs/>
-        </w:rPr>
-        <w:t xml:space="preserve">Status.</w:t>
-      </w:r>
-      <w:r>
-        <w:t xml:space="preserve"> </w:t>
-      </w:r>
-      <w:r>
-        <w:t xml:space="preserve">Bronvast op project-, uitvoering- en jaarniveau voor 37 ingevoerde bronnen en 64 uitvoeringen. De algemene kavel- en gebiedsindeling is geometrisch beschikbaar voor de 55 actuele plots uit 2025; vijf expliciet gekoppelde historische kavels hebben geen afzonderlijke geometrie. De bronvaste plot-jaarlaag bevat 186 regels voor 1967–1969, 1972–1975, 1988–1991, 1993, 1997, 2002, 2005–2006, 2013–2014 en 2016–2025.</w:t>
-      </w:r>
-      <w:r>
-        <w:t xml:space="preserve"> </w:t>
-      </w:r>
-      <w:r>
-        <w:rPr>
-          <w:rStyle w:val="VerbatimChar"/>
-        </w:rPr>
-        <w:t xml:space="preserve">maatregel_plot_koppeling</w:t>
-      </w:r>
-      <w:r>
-        <w:t xml:space="preserve"> </w:t>
-      </w:r>
-      <w:r>
-        <w:t xml:space="preserve">bevat 133 relaties. Helmduinen heeft er twee; Meeuwenduin en Prinsenduin samen zeven; maatregel 22h zes; het maaibeheer in Ruygenhoek, Lange Strook en De Loopert vijf; het PIM-leidingwerk zeven; infiltratieplas 27.2 één. Veertien uitvoeringen hebben geen directe plotkoppeling; de twee Bendel-uitvoeringen vallen aantoonbaar buiten het Meijendel-plotgebied, zodat nog 12 geheel ongekoppelde uitvoeringen ruimtelijk moeten worden beoordeeld.</w:t>
+        </w:rPr>
+        <w:t>Status.</w:t>
+      </w:r>
+      <w:r>
+        <w:t xml:space="preserve"> Bronvast op project-, uitvoering- en jaarniveau voor 37 ingevoerde bronnen en 64 uitvoeringen. De algemene kavel- en gebiedsindeling is geometrisch beschikbaar voor de 55 actuele plots uit 2025; vijf expliciet gekoppelde historische kavels hebben geen afzonderlijke geometrie. De bronvaste plot-jaarlaag bevat 186 regels voor 1967–1969, 1972–1975, 1988–1991, 1993, 1997, 2002, 2005–2006, 2013–2014 en 2016–2025. Het onderzochte PAS-maaibeheer 23 levert geen plot-jaarrijen op, omdat de vier jaarregels 2016–2019 </w:t>
+      </w:r>
+      <w:r>
+        <w:rPr>
+          <w:rFonts w:ascii="Aptos Mono" w:hAnsi="Aptos Mono"/>
+        </w:rPr>
+        <w:t>niet_uitgevoerd</w:t>
+      </w:r>
+      <w:r>
+        <w:t xml:space="preserve"> zijn en de view alleen uitgevoerde jaren opneemt. </w:t>
+      </w:r>
+      <w:r>
+        <w:rPr>
+          <w:rFonts w:ascii="Aptos Mono" w:hAnsi="Aptos Mono"/>
+        </w:rPr>
+        <w:t>maatregel_plot_koppeling</w:t>
+      </w:r>
+      <w:r>
+        <w:t xml:space="preserve"> bevat 143 relaties. Helmduinen heeft er twee; Meeuwenduin en Prinsenduin samen zeven; maatregel 22h zes; het onderzochte PAS-maaibeheer 23 tien; het maaibeheer in Ruygenhoek, Lange Strook en De Loopert vijf; het PIM-leidingwerk zeven; infiltratieplas 27.2 één. Dertien uitvoeringen hebben geen directe plotkoppeling; de twee Bendel-uitvoeringen vallen aantoonbaar buiten het Meijendel-plotgebied, zodat nog 11 geheel ongekoppelde uitvoeringen ruimtelijk moeten worden beoordeeld.</w:t>
       </w:r>
     </w:p>
     <w:p>

</xml_diff>

<commit_message>
Leg Weiduin buiten plotgebied vast
</commit_message>
<xml_diff>
--- a/docs/MEIJENDEL_BRONREGISTER.docx
+++ b/docs/MEIJENDEL_BRONREGISTER.docx
@@ -316,7 +316,21 @@
         <w:pStyle w:val="BodyText"/>
       </w:pPr>
       <w:r>
-        <w:t xml:space="preserve">De aanvulling maakt overeenkomsten tussen bronnen vindbaar. In twee stappen hebben 2.509 bestaande registraties alsnog een primaire soortgroep gekregen, waarvan 1.226 in de laatste stap. Alle 87 eerder onopgeloste PQ-naamteksten uit 1981–2025 zijn onderbouwd met code, wetenschappelijke en Nederlandse naam uit Floranld_2020. Deze openbare Turboveg-referentielijst, aangeboden op 10 maart 2026 via www.synbiosys.alterra.nl/turboveg/, bevat 17.468 codes. De oorspronkelijke PQ-waarden en eerdere besluiten blijven behouden.</w:t>
+        <w:t xml:space="preserve">De aanvulling maakt overeenkomsten tussen bronnen vindbaar. In twee stappen hebben 2.509 bestaande registraties alsnog een primaire soortgroep gekregen, waarvan 1.226 in de laatste stap. Alle 87 eerder onopgeloste PQ-naamteksten uit 1981–2025 zijn onderbouwd met code, wetenschappelijke en Nederlandse naam uit Floranld_2020. Deze openbare Turboveg-referentielijst, aangeboden op 10 maart 2026 via</w:t>
+      </w:r>
+      <w:r>
+        <w:t xml:space="preserve"> </w:t>
+      </w:r>
+      <w:hyperlink r:id="rId11">
+        <w:r>
+          <w:rPr>
+            <w:rStyle w:val="Hyperlink"/>
+          </w:rPr>
+          <w:t xml:space="preserve">www.synbiosys.alterra.nl/turboveg/</w:t>
+        </w:r>
+      </w:hyperlink>
+      <w:r>
+        <w:t xml:space="preserve">, bevat 17.468 codes. De oorspronkelijke PQ-waarden en eerdere besluiten blijven behouden.</w:t>
       </w:r>
     </w:p>
     <w:p>
@@ -355,11 +369,11 @@
       <w:pPr>
         <w:pStyle w:val="Heading2"/>
       </w:pPr>
-      <w:bookmarkStart w:id="11" w:name="_4a53154a1633e588416373f70b0c468114c0efc"/>
+      <w:bookmarkStart w:id="12" w:name="_4a53154a1633e588416373f70b0c468114c0efc"/>
       <w:r>
         <w:t xml:space="preserve">Overkoepelende analysegeschiktheid</w:t>
       </w:r>
-      <w:bookmarkEnd w:id="11"/>
+      <w:bookmarkEnd w:id="12"/>
     </w:p>
     <w:p>
       <w:pPr>
@@ -711,11 +725,11 @@
       <w:pPr>
         <w:pStyle w:val="Heading2"/>
       </w:pPr>
-      <w:bookmarkStart w:id="12" w:name="_beheerregel"/>
+      <w:bookmarkStart w:id="13" w:name="_beheerregel"/>
       <w:r>
         <w:t xml:space="preserve">Beheerregel</w:t>
       </w:r>
-      <w:bookmarkEnd w:id="12"/>
+      <w:bookmarkEnd w:id="13"/>
     </w:p>
     <w:p>
       <w:pPr>
@@ -729,7 +743,7 @@
       <w:pPr>
         <w:pStyle w:val="Heading2"/>
       </w:pPr>
-      <w:bookmarkStart w:id="13" w:name="_7243eacc1b8f4fc7d12d9437ed06490b9a892ca"/>
+      <w:bookmarkStart w:id="14" w:name="_c07dfd40f027bce65d2d0499dc5da8ab7f6fd0f"/>
       <w:r>
         <w:t xml:space="preserve">1. Bronnen in MySQL-database</w:t>
       </w:r>
@@ -742,17 +756,17 @@
         </w:rPr>
         <w:t xml:space="preserve">Meijendel</w:t>
       </w:r>
-      <w:bookmarkEnd w:id="13"/>
+      <w:bookmarkEnd w:id="14"/>
     </w:p>
     <w:p>
       <w:pPr>
         <w:pStyle w:val="Heading3"/>
       </w:pPr>
-      <w:bookmarkStart w:id="14" w:name="_ccd8cb4345e3f59364194a2576f706cc2c0a66e"/>
+      <w:bookmarkStart w:id="15" w:name="_32ab8fbd5be08d3f325e2553cd15813ff7e9c1f"/>
       <w:r>
         <w:t xml:space="preserve">1.1. Vogelgegevens van Vogelwerkgroep Meijendel en SOVON</w:t>
       </w:r>
-      <w:bookmarkEnd w:id="14"/>
+      <w:bookmarkEnd w:id="15"/>
     </w:p>
     <w:p>
       <w:pPr>
@@ -864,7 +878,7 @@
         <w:t xml:space="preserve"> </w:t>
       </w:r>
       <w:r>
-        <w:t xml:space="preserve">staan; omgekeerd ontbreekt geen bestaande SOVON-bron-ID in de nieuwe levering. Bij 2.629 gedeelde bron-ID’s levert SOVON broedcode 0 terwijl de database</w:t>
+        <w:t xml:space="preserve">staan; omgekeerd ontbreekt geen bestaande SOVON-bron-ID in de nieuwe levering. Bij 2.629 gedeelde bron-ID's levert SOVON broedcode 0 terwijl de database</w:t>
       </w:r>
       <w:r>
         <w:t xml:space="preserve"> </w:t>
@@ -981,7 +995,7 @@
         <w:t xml:space="preserve">jrvslg_m</w:t>
       </w:r>
       <w:r>
-        <w:t xml:space="preserve">-resultaat in de volledige jaarverslagreeks 1958-2025. Als zo’n soort in een geteld jaarverslagplot ontbreekt, wordt de soort-plotjaarcombinatie als nul behandeld; het is niet vereist dat de soort in hetzelfde kalenderjaar elders is vastgesteld. Deze waarde is geen letterlijke bronnul, krijgt daarom de status</w:t>
+        <w:t xml:space="preserve">-resultaat in de volledige jaarverslagreeks 1958-2025. Als zo'n soort in een geteld jaarverslagplot ontbreekt, wordt de soort-plotjaarcombinatie als nul behandeld; het is niet vereist dat de soort in hetzelfde kalenderjaar elders is vastgesteld. Deze waarde is geen letterlijke bronnul, krijgt daarom de status</w:t>
       </w:r>
       <w:r>
         <w:t xml:space="preserve"> </w:t>
@@ -2162,7 +2176,7 @@
         <w:t xml:space="preserve"> </w:t>
       </w:r>
       <w:r>
-        <w:t xml:space="preserve">blijft voor meeuwen leidend; zonder zo’n regel mag de SOVON-waarde aanvullen of corrigeren. Een ontbrekende teller mag vanuit het jaarverslag worden toegevoegd wanneer kavel en waarnemer ondubbelzinnig zijn en een bestaande code beschikbaar is. De Horsten wordt volledig genegeerd. Niet-conflicterende letterlijke SOVON-nullen worden zonder nieuwe jaarbeslissing opgenomen; niet tot individuele bronregels herleidbare aggregaatvermeldingen worden niet als formeel afgekeurde waarnemingen gereconstrueerd. Ieder jaar wordt eerst volledig vergeleken. Nieuwe soortenconflicten, nieuwe gegevensmodellen en wel individueel herleidbare afkeuringsinformatie blijven afzonderlijke beslispunten.</w:t>
+        <w:t xml:space="preserve">blijft voor meeuwen leidend; zonder zo'n regel mag de SOVON-waarde aanvullen of corrigeren. Een ontbrekende teller mag vanuit het jaarverslag worden toegevoegd wanneer kavel en waarnemer ondubbelzinnig zijn en een bestaande code beschikbaar is. De Horsten wordt volledig genegeerd. Niet-conflicterende letterlijke SOVON-nullen worden zonder nieuwe jaarbeslissing opgenomen; niet tot individuele bronregels herleidbare aggregaatvermeldingen worden niet als formeel afgekeurde waarnemingen gereconstrueerd. Ieder jaar wordt eerst volledig vergeleken. Nieuwe soortenconflicten, nieuwe gegevensmodellen en wel individueel herleidbare afkeuringsinformatie blijven afzonderlijke beslispunten.</w:t>
       </w:r>
     </w:p>
     <w:p>
@@ -3078,11 +3092,11 @@
       <w:pPr>
         <w:pStyle w:val="Heading3"/>
       </w:pPr>
-      <w:bookmarkStart w:id="15" w:name="_8a72a17aa3ecdd9f667bccd1a9ca55413034b5d"/>
+      <w:bookmarkStart w:id="16" w:name="_9645acbfea6b379f23d12aeedc36c987000825a"/>
       <w:r>
         <w:t xml:space="preserve">1.2. Provinciale permanente kwadraten</w:t>
       </w:r>
-      <w:bookmarkEnd w:id="15"/>
+      <w:bookmarkEnd w:id="16"/>
     </w:p>
     <w:p>
       <w:pPr>
@@ -3208,11 +3222,11 @@
       <w:pPr>
         <w:pStyle w:val="Heading3"/>
       </w:pPr>
-      <w:bookmarkStart w:id="16" w:name="_ded6c184b9a569c146345b6e935b052f391caf7"/>
+      <w:bookmarkStart w:id="17" w:name="_58edaa7a0159e378417d8d9e2f3abf27d746f4f"/>
       <w:r>
         <w:t xml:space="preserve">1.3. Zoogdieren tijdens SOVON- en VWG-bezoeken</w:t>
       </w:r>
-      <w:bookmarkEnd w:id="16"/>
+      <w:bookmarkEnd w:id="17"/>
     </w:p>
     <w:p>
       <w:pPr>
@@ -3423,11 +3437,11 @@
       <w:pPr>
         <w:pStyle w:val="Heading3"/>
       </w:pPr>
-      <w:bookmarkStart w:id="17" w:name="_94090b81dff39a8cf27d4389271118caece3ef6"/>
+      <w:bookmarkStart w:id="18" w:name="_d3fb9a25da94fa35cd3895c324ae264efa6b6ce"/>
       <w:r>
         <w:t xml:space="preserve">1.4. Historisch vangblikonderzoek</w:t>
       </w:r>
-      <w:bookmarkEnd w:id="17"/>
+      <w:bookmarkEnd w:id="18"/>
     </w:p>
     <w:p>
       <w:pPr>
@@ -3483,7 +3497,7 @@
       <w:r>
         <w:t xml:space="preserve"> </w:t>
       </w:r>
-      <w:hyperlink r:id="rId18">
+      <w:hyperlink r:id="rId19">
         <w:r>
           <w:rPr>
             <w:rStyle w:val="Hyperlink"/>
@@ -3568,11 +3582,11 @@
       <w:pPr>
         <w:pStyle w:val="Heading3"/>
       </w:pPr>
-      <w:bookmarkStart w:id="19" w:name="_003d1b4454050d8b2300662d18ee0e6097f4328"/>
+      <w:bookmarkStart w:id="20" w:name="_05a7f9ed9696b113895f0c60145ad70b98b3ccf"/>
       <w:r>
         <w:t xml:space="preserve">1.5. NDFF: één canonieke laag van openbare en beveiligde gegevens</w:t>
       </w:r>
-      <w:bookmarkEnd w:id="19"/>
+      <w:bookmarkEnd w:id="20"/>
     </w:p>
     <w:p>
       <w:pPr>
@@ -3650,11 +3664,11 @@
       <w:pPr>
         <w:pStyle w:val="Heading4"/>
       </w:pPr>
-      <w:bookmarkStart w:id="20" w:name="_dagvlinders"/>
+      <w:bookmarkStart w:id="21" w:name="_f2f5e1637d9b0d825d88db49318fbe09fe4562d"/>
       <w:r>
         <w:t xml:space="preserve">1.5.1. Dagvlinders</w:t>
       </w:r>
-      <w:bookmarkEnd w:id="20"/>
+      <w:bookmarkEnd w:id="21"/>
     </w:p>
     <w:p>
       <w:pPr>
@@ -3714,11 +3728,11 @@
       <w:pPr>
         <w:pStyle w:val="Heading4"/>
       </w:pPr>
-      <w:bookmarkStart w:id="21" w:name="_hommels"/>
+      <w:bookmarkStart w:id="22" w:name="_ab588a339567fbeba82f7ca9f0ef20022ceaf38"/>
       <w:r>
         <w:t xml:space="preserve">1.5.2. Hommels</w:t>
       </w:r>
-      <w:bookmarkEnd w:id="21"/>
+      <w:bookmarkEnd w:id="22"/>
     </w:p>
     <w:p>
       <w:pPr>
@@ -3778,11 +3792,11 @@
       <w:pPr>
         <w:pStyle w:val="Heading4"/>
       </w:pPr>
-      <w:bookmarkStart w:id="22" w:name="_libellen"/>
+      <w:bookmarkStart w:id="23" w:name="_5eeebc0b3ea39369efcb9361b685b51ab379390"/>
       <w:r>
         <w:t xml:space="preserve">1.5.3. Libellen</w:t>
       </w:r>
-      <w:bookmarkEnd w:id="22"/>
+      <w:bookmarkEnd w:id="23"/>
     </w:p>
     <w:p>
       <w:pPr>
@@ -3842,11 +3856,11 @@
       <w:pPr>
         <w:pStyle w:val="Heading4"/>
       </w:pPr>
-      <w:bookmarkStart w:id="23" w:name="_nachtvlinders"/>
+      <w:bookmarkStart w:id="24" w:name="_f7f75bff85528639d3a54437d815ffc982ac078"/>
       <w:r>
         <w:t xml:space="preserve">1.5.4. Nachtvlinders</w:t>
       </w:r>
-      <w:bookmarkEnd w:id="23"/>
+      <w:bookmarkEnd w:id="24"/>
     </w:p>
     <w:p>
       <w:pPr>
@@ -3906,11 +3920,11 @@
       <w:pPr>
         <w:pStyle w:val="Heading4"/>
       </w:pPr>
-      <w:bookmarkStart w:id="24" w:name="_amfibieën"/>
+      <w:bookmarkStart w:id="25" w:name="_5952ec78f96e716985cfd2bef0c6dea751da098"/>
       <w:r>
         <w:t xml:space="preserve">1.5.5. Amfibieën</w:t>
       </w:r>
-      <w:bookmarkEnd w:id="24"/>
+      <w:bookmarkEnd w:id="25"/>
     </w:p>
     <w:p>
       <w:pPr>
@@ -3970,11 +3984,11 @@
       <w:pPr>
         <w:pStyle w:val="Heading4"/>
       </w:pPr>
-      <w:bookmarkStart w:id="25" w:name="_reptielen"/>
+      <w:bookmarkStart w:id="26" w:name="_f98973ac0b4b22a8147264cf6fda7ae2d1f2584"/>
       <w:r>
         <w:t xml:space="preserve">1.5.6. Reptielen</w:t>
       </w:r>
-      <w:bookmarkEnd w:id="25"/>
+      <w:bookmarkEnd w:id="26"/>
     </w:p>
     <w:p>
       <w:pPr>
@@ -4034,11 +4048,11 @@
       <w:pPr>
         <w:pStyle w:val="Heading4"/>
       </w:pPr>
-      <w:bookmarkStart w:id="26" w:name="_vissen"/>
+      <w:bookmarkStart w:id="27" w:name="_9ffbbed58a474302bc88f9b6483937563542adc"/>
       <w:r>
         <w:t xml:space="preserve">1.5.7. Vissen</w:t>
       </w:r>
-      <w:bookmarkEnd w:id="26"/>
+      <w:bookmarkEnd w:id="27"/>
     </w:p>
     <w:p>
       <w:pPr>
@@ -4098,11 +4112,11 @@
       <w:pPr>
         <w:pStyle w:val="Heading4"/>
       </w:pPr>
-      <w:bookmarkStart w:id="27" w:name="_vleermuistransecten"/>
+      <w:bookmarkStart w:id="28" w:name="_90b1412457ba2ad39675de54e16fb4052a9af96"/>
       <w:r>
         <w:t xml:space="preserve">1.5.8. Vleermuistransecten</w:t>
       </w:r>
-      <w:bookmarkEnd w:id="27"/>
+      <w:bookmarkEnd w:id="28"/>
     </w:p>
     <w:p>
       <w:pPr>
@@ -4162,11 +4176,11 @@
       <w:pPr>
         <w:pStyle w:val="Heading4"/>
       </w:pPr>
-      <w:bookmarkStart w:id="28" w:name="_38cdc6eff084869e7169beb9a7d0a36448859a3"/>
+      <w:bookmarkStart w:id="29" w:name="_0bf7c6d2026ffa63b6182a76ed7ab201ef2ca1a"/>
       <w:r>
         <w:t xml:space="preserve">1.5.9. Konijnentellingen in de duinen</w:t>
       </w:r>
-      <w:bookmarkEnd w:id="28"/>
+      <w:bookmarkEnd w:id="29"/>
     </w:p>
     <w:p>
       <w:pPr>
@@ -4226,11 +4240,11 @@
       <w:pPr>
         <w:pStyle w:val="Heading4"/>
       </w:pPr>
-      <w:bookmarkStart w:id="29" w:name="_b7507ab25f19a705cdaea288841b95e0326cd82"/>
+      <w:bookmarkStart w:id="30" w:name="_d64910a2091f56dedd2aaa5a75994d38ec4c969"/>
       <w:r>
         <w:t xml:space="preserve">1.5.10. Wintertellingen vleermuizen</w:t>
       </w:r>
-      <w:bookmarkEnd w:id="29"/>
+      <w:bookmarkEnd w:id="30"/>
     </w:p>
     <w:p>
       <w:pPr>
@@ -4290,11 +4304,11 @@
       <w:pPr>
         <w:pStyle w:val="Heading4"/>
       </w:pPr>
-      <w:bookmarkStart w:id="30" w:name="_ba761ed76f0837e5aa40881d1ff3dfd4f2a2564"/>
+      <w:bookmarkStart w:id="31" w:name="_9cec44656db08bd57f600992eaa74a526d260b3"/>
       <w:r>
         <w:t xml:space="preserve">1.5.11. Het Nieuwe Strepen</w:t>
       </w:r>
-      <w:bookmarkEnd w:id="30"/>
+      <w:bookmarkEnd w:id="31"/>
     </w:p>
     <w:p>
       <w:pPr>
@@ -4329,7 +4343,7 @@
         <w:t xml:space="preserve"> </w:t>
       </w:r>
       <w:r>
-        <w:t xml:space="preserve">Op 6 oktober 2026 meldde FLORON dat één kalenderdag in één kilometerhok als telling mag worden beschouwd. Zo’n telling kan één, twee of drie oorspronkelijke lijsten omvatten. Persoonsgegevens en daarvan afgeleide waarnemerscodes worden niet geleverd. De</w:t>
+        <w:t xml:space="preserve">Op 6 oktober 2026 meldde FLORON dat één kalenderdag in één kilometerhok als telling mag worden beschouwd. Zo'n telling kan één, twee of drie oorspronkelijke lijsten omvatten. Persoonsgegevens en daarvan afgeleide waarnemerscodes worden niet geleverd. De</w:t>
       </w:r>
       <w:r>
         <w:t xml:space="preserve"> </w:t>
@@ -4432,11 +4446,11 @@
       <w:pPr>
         <w:pStyle w:val="Heading4"/>
       </w:pPr>
-      <w:bookmarkStart w:id="31" w:name="_add682eaf9770b54759a1b54720dedd522bc07f"/>
+      <w:bookmarkStart w:id="32" w:name="_c056d2025de29c95bc511421c5f5e41469354eb"/>
       <w:r>
         <w:t xml:space="preserve">1.5.12. FLORBASE en andere vaatplantinventarisaties</w:t>
       </w:r>
-      <w:bookmarkEnd w:id="31"/>
+      <w:bookmarkEnd w:id="32"/>
     </w:p>
     <w:p>
       <w:pPr>
@@ -4471,7 +4485,7 @@
         <w:t xml:space="preserve"> </w:t>
       </w:r>
       <w:r>
-        <w:t xml:space="preserve">Eén jaar in één kilometerhok is de fijnste beschikbare teleenheid. Voor 2011 werden alleen soort, jaar, kilometerhok en waarnemer opgeslagen. FLORON beschikt niet over de eerder gevraagde lijst-ID’s, volledigheidsvlaggen, bezoekdata, bezoekduur, checklistversies of expliciete registraties van niet-aangetroffen soorten.</w:t>
+        <w:t xml:space="preserve">Eén jaar in één kilometerhok is de fijnste beschikbare teleenheid. Voor 2011 werden alleen soort, jaar, kilometerhok en waarnemer opgeslagen. FLORON beschikt niet over de eerder gevraagde lijst-ID's, volledigheidsvlaggen, bezoekdata, bezoekduur, checklistversies of expliciete registraties van niet-aangetroffen soorten.</w:t>
       </w:r>
     </w:p>
     <w:p>
@@ -4496,11 +4510,11 @@
       <w:pPr>
         <w:pStyle w:val="Heading4"/>
       </w:pPr>
-      <w:bookmarkStart w:id="32" w:name="_ddc09a389d1414cf9c368e3f96b3cd144167922"/>
+      <w:bookmarkStart w:id="33" w:name="_b2fbeb28e0a334b9e6cb93232c4d845faf48221"/>
       <w:r>
         <w:t xml:space="preserve">1.5.13. LMF-aandachtssoorten</w:t>
       </w:r>
-      <w:bookmarkEnd w:id="32"/>
+      <w:bookmarkEnd w:id="33"/>
     </w:p>
     <w:p>
       <w:pPr>
@@ -4701,11 +4715,11 @@
       <w:pPr>
         <w:pStyle w:val="Heading4"/>
       </w:pPr>
-      <w:bookmarkStart w:id="33" w:name="_54b0c9881ebf1c9c32ceb4f54ebc7dcb81d8783"/>
+      <w:bookmarkStart w:id="34" w:name="_0ce2ec4e8b5503e251897e5490450ca2d9e0742"/>
       <w:r>
         <w:t xml:space="preserve">1.5.14. Mossen en korstmossen</w:t>
       </w:r>
-      <w:bookmarkEnd w:id="33"/>
+      <w:bookmarkEnd w:id="34"/>
     </w:p>
     <w:p>
       <w:pPr>
@@ -4829,11 +4843,11 @@
       <w:pPr>
         <w:pStyle w:val="Heading4"/>
       </w:pPr>
-      <w:bookmarkStart w:id="34" w:name="_1bea655362975aef3d944c226fffca3cc18312c"/>
+      <w:bookmarkStart w:id="35" w:name="_339fafe251367982d6218746f16721a93fa7f70"/>
       <w:r>
         <w:t xml:space="preserve">1.5.15. Bos- en zeereeppaddenstoelen</w:t>
       </w:r>
-      <w:bookmarkEnd w:id="34"/>
+      <w:bookmarkEnd w:id="35"/>
     </w:p>
     <w:p>
       <w:pPr>
@@ -4893,11 +4907,11 @@
       <w:pPr>
         <w:pStyle w:val="Heading4"/>
       </w:pPr>
-      <w:bookmarkStart w:id="35" w:name="_weekdieren"/>
+      <w:bookmarkStart w:id="36" w:name="_342bae7ae5afae546f17223888206446d449411"/>
       <w:r>
         <w:t xml:space="preserve">1.5.16. Weekdieren</w:t>
       </w:r>
-      <w:bookmarkEnd w:id="35"/>
+      <w:bookmarkEnd w:id="36"/>
     </w:p>
     <w:p>
       <w:pPr>
@@ -4957,11 +4971,11 @@
       <w:pPr>
         <w:pStyle w:val="Heading4"/>
       </w:pPr>
-      <w:bookmarkStart w:id="36" w:name="_1879253ee2dfd52031c9d63749e2737783da88e"/>
+      <w:bookmarkStart w:id="37" w:name="_cc11e4dda0fa9b87cf2613be17ff277804bdc91"/>
       <w:r>
         <w:t xml:space="preserve">1.5.17. SNL-gebiedsmonitoring</w:t>
       </w:r>
-      <w:bookmarkEnd w:id="36"/>
+      <w:bookmarkEnd w:id="37"/>
     </w:p>
     <w:p>
       <w:pPr>
@@ -5029,11 +5043,11 @@
       <w:pPr>
         <w:pStyle w:val="Heading3"/>
       </w:pPr>
-      <w:bookmarkStart w:id="37" w:name="_3dde7cd9c0fbcfd44f499ab6a6ef5cfd62b0862"/>
+      <w:bookmarkStart w:id="38" w:name="_77733873953f7250a44afc39ac6f33e9c0fface"/>
       <w:r>
         <w:t xml:space="preserve">1.6. Openbare externe ecologiebronnen</w:t>
       </w:r>
-      <w:bookmarkEnd w:id="37"/>
+      <w:bookmarkEnd w:id="38"/>
     </w:p>
     <w:p>
       <w:pPr>
@@ -5053,7 +5067,7 @@
       <w:r>
         <w:t xml:space="preserve"> </w:t>
       </w:r>
-      <w:hyperlink r:id="rId38">
+      <w:hyperlink r:id="rId39">
         <w:r>
           <w:rPr>
             <w:rStyle w:val="Hyperlink"/>
@@ -5247,7 +5261,7 @@
       <w:r>
         <w:t xml:space="preserve"> </w:t>
       </w:r>
-      <w:hyperlink r:id="rId39">
+      <w:hyperlink r:id="rId40">
         <w:r>
           <w:rPr>
             <w:rStyle w:val="Hyperlink"/>
@@ -5263,11 +5277,11 @@
       <w:pPr>
         <w:pStyle w:val="Heading4"/>
       </w:pPr>
-      <w:bookmarkStart w:id="40" w:name="_9c98e6e0799dea8eed6786abf4e9090b0506343"/>
+      <w:bookmarkStart w:id="41" w:name="_aa03dabe850e534118471d9a4587f103d7cc6d0"/>
       <w:r>
         <w:t xml:space="preserve">1.6.1. STOWA Limnodata</w:t>
       </w:r>
-      <w:bookmarkEnd w:id="40"/>
+      <w:bookmarkEnd w:id="41"/>
     </w:p>
     <w:p>
       <w:pPr>
@@ -5351,11 +5365,11 @@
       <w:pPr>
         <w:pStyle w:val="Heading4"/>
       </w:pPr>
-      <w:bookmarkStart w:id="41" w:name="_7810a275271da51e128daf1eadaca77f875310a"/>
+      <w:bookmarkStart w:id="42" w:name="_e9b446960bca12075cdde30af1cbaf73f645a87"/>
       <w:r>
         <w:t xml:space="preserve">1.6.2. ENDURE helmduinfauna</w:t>
       </w:r>
-      <w:bookmarkEnd w:id="41"/>
+      <w:bookmarkEnd w:id="42"/>
     </w:p>
     <w:p>
       <w:pPr>
@@ -5415,11 +5429,11 @@
       <w:pPr>
         <w:pStyle w:val="Heading4"/>
       </w:pPr>
-      <w:bookmarkStart w:id="42" w:name="_5a504ff8abd850ffc7704ce23c8f7bb19f98000"/>
+      <w:bookmarkStart w:id="43" w:name="_0079604d46da30ac9b5828c2b6c106eff7cd8f8"/>
       <w:r>
         <w:t xml:space="preserve">1.6.3. Landelijke Vegetatie Databank</w:t>
       </w:r>
-      <w:bookmarkEnd w:id="42"/>
+      <w:bookmarkEnd w:id="43"/>
     </w:p>
     <w:p>
       <w:pPr>
@@ -5668,11 +5682,11 @@
       <w:pPr>
         <w:pStyle w:val="Heading4"/>
       </w:pPr>
-      <w:bookmarkStart w:id="43" w:name="_a4b8938f650cad67af8384aa358648ef6881db5"/>
+      <w:bookmarkStart w:id="44" w:name="_a66e2be297c2cf82b37e3e4b59e101c55a2b789"/>
       <w:r>
         <w:t xml:space="preserve">1.6.4. Historische vlinder- en motcollectie</w:t>
       </w:r>
-      <w:bookmarkEnd w:id="43"/>
+      <w:bookmarkEnd w:id="44"/>
     </w:p>
     <w:p>
       <w:pPr>
@@ -5732,11 +5746,11 @@
       <w:pPr>
         <w:pStyle w:val="Heading4"/>
       </w:pPr>
-      <w:bookmarkStart w:id="44" w:name="_b06cb21dbe9ca56883ae8ed5d3f986798494e94"/>
+      <w:bookmarkStart w:id="45" w:name="_0623f0a4d9ecb153e84d6aa679ad58f6c310383"/>
       <w:r>
         <w:t xml:space="preserve">1.6.5. Naturalis Botany</w:t>
       </w:r>
-      <w:bookmarkEnd w:id="44"/>
+      <w:bookmarkEnd w:id="45"/>
     </w:p>
     <w:p>
       <w:pPr>
@@ -5796,11 +5810,11 @@
       <w:pPr>
         <w:pStyle w:val="Heading4"/>
       </w:pPr>
-      <w:bookmarkStart w:id="45" w:name="_335dc587b878851a017369d1c1c7e74fa2018ad"/>
+      <w:bookmarkStart w:id="46" w:name="_dd278617f9613de433492781e9679e24605d2f3"/>
       <w:r>
         <w:t xml:space="preserve">1.6.6. Naturalis Coleoptera</w:t>
       </w:r>
-      <w:bookmarkEnd w:id="45"/>
+      <w:bookmarkEnd w:id="46"/>
     </w:p>
     <w:p>
       <w:pPr>
@@ -5860,11 +5874,11 @@
       <w:pPr>
         <w:pStyle w:val="Heading3"/>
       </w:pPr>
-      <w:bookmarkStart w:id="46" w:name="_5d611a31ac68a696fd179c2c85c282500afefc7"/>
+      <w:bookmarkStart w:id="47" w:name="_4dcded00268e6461b0ddc34253d4faf52bf1dd1"/>
       <w:r>
         <w:t xml:space="preserve">1.7. Openstaande ruimtelijke toelatingscontrole</w:t>
       </w:r>
-      <w:bookmarkEnd w:id="46"/>
+      <w:bookmarkEnd w:id="47"/>
     </w:p>
     <w:p>
       <w:pPr>
@@ -5898,11 +5912,11 @@
       <w:pPr>
         <w:pStyle w:val="Heading3"/>
       </w:pPr>
-      <w:bookmarkStart w:id="47" w:name="_6e396c95ed446dc595f32661c45d91742a47fe5"/>
+      <w:bookmarkStart w:id="48" w:name="_14c58f11b78e283997281ebde92c6b31ebc0c80"/>
       <w:r>
         <w:t xml:space="preserve">1.8. Verklarende omgevingslagen</w:t>
       </w:r>
-      <w:bookmarkEnd w:id="47"/>
+      <w:bookmarkEnd w:id="48"/>
     </w:p>
     <w:p>
       <w:pPr>
@@ -5916,11 +5930,11 @@
       <w:pPr>
         <w:pStyle w:val="Heading4"/>
       </w:pPr>
-      <w:bookmarkStart w:id="48" w:name="_bb0c62bd471c774923f07d8b7b6f705ce2e805a"/>
+      <w:bookmarkStart w:id="49" w:name="_97e37a83ef92e6db79e0a815abf4c3d8d6d1754"/>
       <w:r>
         <w:t xml:space="preserve">1.8.1. Dagelijks weer</w:t>
       </w:r>
-      <w:bookmarkEnd w:id="48"/>
+      <w:bookmarkEnd w:id="49"/>
     </w:p>
     <w:p>
       <w:pPr>
@@ -5980,11 +5994,11 @@
       <w:pPr>
         <w:pStyle w:val="Heading4"/>
       </w:pPr>
-      <w:bookmarkStart w:id="49" w:name="_hoogte"/>
+      <w:bookmarkStart w:id="50" w:name="_625608f018b59d28869e33232003bd07c2f07d5"/>
       <w:r>
         <w:t xml:space="preserve">1.8.2. Hoogte</w:t>
       </w:r>
-      <w:bookmarkEnd w:id="49"/>
+      <w:bookmarkEnd w:id="50"/>
     </w:p>
     <w:p>
       <w:pPr>
@@ -6044,11 +6058,11 @@
       <w:pPr>
         <w:pStyle w:val="Heading4"/>
       </w:pPr>
-      <w:bookmarkStart w:id="50" w:name="_stikstofdepositie"/>
+      <w:bookmarkStart w:id="51" w:name="_8ebc62c1d17a2d7a08504bddffeeb5916a0bcb3"/>
       <w:r>
         <w:t xml:space="preserve">1.8.3. Stikstofdepositie</w:t>
       </w:r>
-      <w:bookmarkEnd w:id="50"/>
+      <w:bookmarkEnd w:id="51"/>
     </w:p>
     <w:p>
       <w:pPr>
@@ -6108,11 +6122,11 @@
       <w:pPr>
         <w:pStyle w:val="Heading4"/>
       </w:pPr>
-      <w:bookmarkStart w:id="51" w:name="_bodemgebruik"/>
+      <w:bookmarkStart w:id="52" w:name="_972156668716d33d6f7bf93cdaf573c7928edca"/>
       <w:r>
         <w:t xml:space="preserve">1.8.4. Bodemgebruik</w:t>
       </w:r>
-      <w:bookmarkEnd w:id="51"/>
+      <w:bookmarkEnd w:id="52"/>
     </w:p>
     <w:p>
       <w:pPr>
@@ -6172,11 +6186,11 @@
       <w:pPr>
         <w:pStyle w:val="Heading4"/>
       </w:pPr>
-      <w:bookmarkStart w:id="52" w:name="_6205564c333359604d547302ef9994dbae8e150"/>
+      <w:bookmarkStart w:id="53" w:name="_92770fc640c1bb2fd0ffeda71d68ce2650b46be"/>
       <w:r>
         <w:t xml:space="preserve">1.8.5. Natura 2000-habitat</w:t>
       </w:r>
-      <w:bookmarkEnd w:id="52"/>
+      <w:bookmarkEnd w:id="53"/>
     </w:p>
     <w:p>
       <w:pPr>
@@ -6236,11 +6250,11 @@
       <w:pPr>
         <w:pStyle w:val="Heading3"/>
       </w:pPr>
-      <w:bookmarkStart w:id="53" w:name="_55651eaef6a7220015a2870e55a9e8e9e62256a"/>
+      <w:bookmarkStart w:id="54" w:name="_f1f9cc3f4e7e57e7e99ffc1d85334cce67c3650"/>
       <w:r>
         <w:t xml:space="preserve">1.9. Werkzaamheden en beheermaatregelen</w:t>
       </w:r>
-      <w:bookmarkEnd w:id="53"/>
+      <w:bookmarkEnd w:id="54"/>
     </w:p>
     <w:p>
       <w:pPr>
@@ -6289,15 +6303,15 @@
         <w:t xml:space="preserve">.xls</w:t>
       </w:r>
       <w:r>
-        <w:t xml:space="preserve">-protocollen voor vleermuisonderzoek uit 2009–2013 en vier als PDF geregistreerde bestanden die feitelijk HTML-landingspagina’s waren. De vijf protocollen beschrijven onderzoeksformulieren, geen uitgevoerde terreinmaatregelen. De vier landingspagina’s zijn niet als inhoudelijk geraadpleegd document behandeld.</w:t>
-      </w:r>
-    </w:p>
-    <w:p>
-      <w:pPr>
-        <w:pStyle w:val="BodyText"/>
-      </w:pPr>
-      <w:r>
-        <w:t xml:space="preserve">De brede tekstselectie bevatte 351 bijlagen. De strengere selectie op formuleringen die feitelijke uitvoering aanduiden bevatte 206 bijlagen bij 190 bibliografische bronnen. Na beoordeling op uitvoering, locatie, jaar, dubbeling en brontype zijn achttien aanvullende Zotero-bronnen ingevoerd. Nieuw is Van der Hagen et al. (2020), waarvan figuur 1 Prinsenduin, Lange Strooken en Helmduinen als afzonderlijke onderzoeksgebieden toont. Op 15 oktober 2026 is daarnaast KIWA Mededeling 114 uit december 1990 ingevoerd, met de officiële KWR-PDF als gekoppeld T7-bestand. Figuur 1 op PDF-pagina 73 lokaliseert de infiltratieplassen 27.2, 27.2.1 en 27.3. Samen met de zes al gebruikte Zotero-bronnen bevat</w:t>
+        <w:t xml:space="preserve">-protocollen voor vleermuisonderzoek uit 2009–2013 en vier als PDF geregistreerde bestanden die feitelijk HTML-landingspagina's waren. De vijf protocollen beschrijven onderzoeksformulieren, geen uitgevoerde terreinmaatregelen. De vier landingspagina's zijn niet als inhoudelijk geraadpleegd document behandeld.</w:t>
+      </w:r>
+    </w:p>
+    <w:p>
+      <w:pPr>
+        <w:pStyle w:val="BodyText"/>
+      </w:pPr>
+      <w:r>
+        <w:t xml:space="preserve">De brede tekstselectie bevatte 351 bijlagen. De strengere selectie op formuleringen die feitelijke uitvoering aanduiden bevatte 206 bijlagen bij 190 bibliografische bronnen. Na beoordeling op uitvoering, locatie, jaar, dubbeling en brontype zijn achttien aanvullende Zotero-bronnen ingevoerd. Nieuw is Van der Hagen et al. (2020), waarvan figuur 1 Prinsenduin, Lange Strooken en Helmduinen als afzonderlijke onderzoeksgebieden toont. Op 15 oktober 2026 is daarnaast KIWA Mededeling 114 uit december 1990 ingevoerd, met de officiële KWR-PDF als gekoppeld T7-bestand. Figuur 1 op PDF-pagina 73 lokaliseert de infiltratieplassen 27.2, 27.2.1 en 27.3. Samen met de zes al gebruikte Zotero-bronnen bevat</w:t>
       </w:r>
       <w:r>
         <w:t xml:space="preserve"> </w:t>
@@ -6320,7 +6334,7 @@
         <w:pStyle w:val="BodyText"/>
       </w:pPr>
       <w:r>
-        <w:t xml:space="preserve">Daarbij zijn twaalf officiële of institutionele internetbronnen geraadpleegd: vijf Dunea-pagina’s over optimalisatie van de waterwinning, beheer in Meeuwenduin en Prinsenduin, vervanging van slagbomen, actuele werkzaamheden en duindynamiek; het Dunea-jaarverslag 2024; het Zuid-Hollandse subsidie-openstellingsbesluit voor Bendel; de Staatsbosbeheer-pagina over de herinrichting van Bendel; de ODH-beschikking van 28 augustus 2023 voor de konijnenbijplaatsingsproef; de ODH-beschikking van 5 november 2025 voor de renovatie van de Paardenstal; de via DANS gepubliceerde Haagse Archeologische Rapportage 1306 over het Programma Investeringen Meijendel; en de officiële externe bijlage uit 2013 over de PIM-werkzaamheden in Noord-Meijendel. De bronnen staan afzonderlijk in</w:t>
+        <w:t xml:space="preserve">Daarbij zijn veertien officiële of institutionele internetbronnen geraadpleegd: vijf Dunea-pagina's over optimalisatie van de waterwinning, beheer in Meeuwenduin en Prinsenduin, vervanging van slagbomen, actuele werkzaamheden en duindynamiek; het Dunea-jaarverslag 2024; het Zuid-Hollandse subsidie-openstellingsbesluit voor Bendel; de Staatsbosbeheer-pagina over de herinrichting van Bendel; de ODH-beschikking van 28 augustus 2023 voor de konijnenbijplaatsingsproef; de ODH-beschikking van 5 november 2025 voor de renovatie van de Paardenstal; de via DANS gepubliceerde Haagse Archeologische Rapportage 1306 over het Programma Investeringen Meijendel; de officiële externe bijlage uit 2013 over de PIM-werkzaamheden in Noord-Meijendel; de gemeentelijke inventaris van cultuurhistorische objecten in Wassenaar; en de actuele PDOK-Kadastrale Kaart. De bronnen staan afzonderlijk in</w:t>
       </w:r>
       <w:r>
         <w:t xml:space="preserve"> </w:t>
@@ -6350,7 +6364,7 @@
         <w:t xml:space="preserve"> </w:t>
       </w:r>
       <w:r>
-        <w:t xml:space="preserve">De levende lokale database bevat 18 projecten, 37 bronnen, 64 uitvoeringen, 104 expliciete jaarbeoordelingen uit 1967–2026 en 92 bronkoppelingen. Van de jaarbeoordelingen zijn er 88</w:t>
+        <w:t xml:space="preserve">De levende lokale database bevat 18 projecten, 39 bronnen, 64 uitvoeringen, 104 expliciete jaarbeoordelingen uit 1967–2026 en 94 bronkoppelingen. Van de jaarbeoordelingen zijn er 88</w:t>
       </w:r>
       <w:r>
         <w:t xml:space="preserve"> </w:t>
@@ -6412,7 +6426,7 @@
       <w:r>
         <w:t xml:space="preserve"> </w:t>
       </w:r>
-      <w:hyperlink r:id="rId54">
+      <w:hyperlink r:id="rId55">
         <w:r>
           <w:rPr>
             <w:rStyle w:val="Hyperlink"/>
@@ -6433,66 +6447,99 @@
       </w:pPr>
       <w:r>
         <w:rPr>
-          <w:rFonts w:ascii="Aptos Mono" w:hAnsi="Aptos Mono"/>
-        </w:rPr>
-        <w:t>maatregel_geometrie</w:t>
-      </w:r>
-      <w:r>
-        <w:t xml:space="preserve"> bevat nog nul exacte uitvoeringsgeometrieën. </w:t>
-      </w:r>
-      <w:r>
-        <w:rPr>
-          <w:rFonts w:ascii="Aptos Mono" w:hAnsi="Aptos Mono"/>
-        </w:rPr>
-        <w:t>maatregel_uitvoering_gebied</w:t>
-      </w:r>
-      <w:r>
-        <w:t xml:space="preserve"> bevat twee veilige relaties: Voorlinden als locatie binnen het speciale gebied M91 en de in 1990 ingevoerde begrazing voor Kijfhoek en Bierlap als volledig benoemd gebied. </w:t>
-      </w:r>
-      <w:r>
-        <w:rPr>
-          <w:rFonts w:ascii="Aptos Mono" w:hAnsi="Aptos Mono"/>
-        </w:rPr>
-        <w:t>maatregel_plot_koppeling</w:t>
-      </w:r>
-      <w:r>
-        <w:t xml:space="preserve"> bevat 143 geverifieerde directe relaties. Daarvan waren 36 al onderbouwd met expliciete kavelvermeldingen, gebruikersvaststellingen of een bijzondere gebiedsnaam. De nameninventaris voegt 42 geometrische doorsnijdingen toe voor zeven volledig en letterlijk gelokaliseerde uitvoeringen. De tien nieuwe relaties betreffen het onderzochte zoekgebied van het niet uitgevoerde PAS-maaibeheer 23: M10-12-76, M12a, M62, M63, M64, M65, M72, M73, M74 en M75. De vier jaarregels 2016–2019 blijven </w:t>
-      </w:r>
-      <w:r>
-        <w:rPr>
-          <w:rFonts w:ascii="Aptos Mono" w:hAnsi="Aptos Mono"/>
-        </w:rPr>
-        <w:t>niet_uitgevoerd</w:t>
-      </w:r>
-      <w:r>
-        <w:t xml:space="preserve">; de koppelingen bewijzen dus geen maaiwerk. Daarnaast zijn elf relaties toegevoegd voor de volledige systemen Pan 13 en Plas 20, zeven voor het PIM-leidingwerk en één voor infiltratieplas 27.2. De begrazing van de Helmduinen vanaf eind 1991 is na correctie op 15 oktober 2026 gekoppeld aan M15 en M16. M17a is retroactief verwijderd: die kavel hoort voor deze naamtoedeling bij Prinsenduin, niet bij Helmduinen. De begrazing loopt tot heden door. Omdat de bron geen oppervlakte per kavel geeft, blijft </w:t>
-      </w:r>
-      <w:r>
-        <w:rPr>
-          <w:rFonts w:ascii="Aptos Mono" w:hAnsi="Aptos Mono"/>
-        </w:rPr>
-        <w:t>doorsnijding_pct</w:t>
-      </w:r>
-      <w:r>
-        <w:t xml:space="preserve"> voor beide leeg. De geometrische naamkoppelingen gebruiken de actuele SOVON-plotgeometrie </w:t>
-      </w:r>
-      <w:r>
-        <w:rPr>
-          <w:rFonts w:ascii="Aptos Mono" w:hAnsi="Aptos Mono"/>
-        </w:rPr>
-        <w:t>sovon-avimap-2025-download-2026-10-02</w:t>
-      </w:r>
-      <w:r>
-        <w:t xml:space="preserve">. Een doorsnijding bewijst dat het genoemde naamgebied de plot raakt, niet welk percentage van de plot feitelijk is bewerkt; </w:t>
-      </w:r>
-      <w:r>
-        <w:rPr>
-          <w:rFonts w:ascii="Aptos Mono" w:hAnsi="Aptos Mono"/>
-        </w:rPr>
-        <w:t>doorsnijding_pct</w:t>
-      </w:r>
-      <w:r>
-        <w:t xml:space="preserve"> blijft daarom leeg.</w:t>
+          <w:rStyle w:val="VerbatimChar"/>
+        </w:rPr>
+        <w:t xml:space="preserve">maatregel_geometrie</w:t>
+      </w:r>
+      <w:r>
+        <w:t xml:space="preserve"> </w:t>
+      </w:r>
+      <w:r>
+        <w:t xml:space="preserve">bevat nog nul exacte uitvoeringsgeometrieën.</w:t>
+      </w:r>
+      <w:r>
+        <w:t xml:space="preserve"> </w:t>
+      </w:r>
+      <w:r>
+        <w:rPr>
+          <w:rStyle w:val="VerbatimChar"/>
+        </w:rPr>
+        <w:t xml:space="preserve">maatregel_uitvoering_gebied</w:t>
+      </w:r>
+      <w:r>
+        <w:t xml:space="preserve"> </w:t>
+      </w:r>
+      <w:r>
+        <w:t xml:space="preserve">bevat twee veilige relaties: Voorlinden als locatie binnen het speciale gebied M91 en de in 1990 ingevoerde begrazing voor Kijfhoek en Bierlap als volledig benoemd gebied.</w:t>
+      </w:r>
+      <w:r>
+        <w:t xml:space="preserve"> </w:t>
+      </w:r>
+      <w:r>
+        <w:rPr>
+          <w:rStyle w:val="VerbatimChar"/>
+        </w:rPr>
+        <w:t xml:space="preserve">maatregel_plot_koppeling</w:t>
+      </w:r>
+      <w:r>
+        <w:t xml:space="preserve"> </w:t>
+      </w:r>
+      <w:r>
+        <w:t xml:space="preserve">bevat 143 geverifieerde directe relaties. Daarvan waren 36 al onderbouwd met expliciete kavelvermeldingen, gebruikersvaststellingen of een bijzondere gebiedsnaam. De nameninventaris voegt 42 geometrische doorsnijdingen toe voor zeven volledig en letterlijk gelokaliseerde uitvoeringen. De tien nieuwe relaties betreffen het onderzochte zoekgebied van het niet uitgevoerde PAS-maaibeheer 23: M10-12-76, M12a, M62, M63, M64, M65, M72, M73, M74 en M75. De vier jaarregels 2016–2019 blijven</w:t>
+      </w:r>
+      <w:r>
+        <w:t xml:space="preserve"> </w:t>
+      </w:r>
+      <w:r>
+        <w:rPr>
+          <w:rStyle w:val="VerbatimChar"/>
+        </w:rPr>
+        <w:t xml:space="preserve">niet_uitgevoerd</w:t>
+      </w:r>
+      <w:r>
+        <w:t xml:space="preserve">; de koppelingen bewijzen dus geen maaiwerk. Daarnaast zijn elf relaties toegevoegd voor de volledige systemen Pan 13 en Plas 20, zeven voor het PIM-leidingwerk en één voor infiltratieplas 27.2. De begrazing van de Helmduinen vanaf eind 1991 is na correctie op 15 oktober 2026 gekoppeld aan M15 en M16. M17a is retroactief verwijderd: die kavel hoort voor deze naamtoedeling bij Prinsenduin, niet bij Helmduinen. De begrazing loopt tot heden door. Omdat de bron geen oppervlakte per kavel geeft, blijft</w:t>
+      </w:r>
+      <w:r>
+        <w:t xml:space="preserve"> </w:t>
+      </w:r>
+      <w:r>
+        <w:rPr>
+          <w:rStyle w:val="VerbatimChar"/>
+        </w:rPr>
+        <w:t xml:space="preserve">doorsnijding_pct</w:t>
+      </w:r>
+      <w:r>
+        <w:t xml:space="preserve"> </w:t>
+      </w:r>
+      <w:r>
+        <w:t xml:space="preserve">voor beide leeg. De geometrische naamkoppelingen gebruiken de actuele SOVON-plotgeometrie</w:t>
+      </w:r>
+      <w:r>
+        <w:t xml:space="preserve"> </w:t>
+      </w:r>
+      <w:r>
+        <w:rPr>
+          <w:rStyle w:val="VerbatimChar"/>
+        </w:rPr>
+        <w:t xml:space="preserve">sovon-avimap-2025-download-2026-10-02</w:t>
+      </w:r>
+      <w:r>
+        <w:t xml:space="preserve">. Een doorsnijding bewijst dat het genoemde naamgebied de plot raakt, niet welk percentage van de plot feitelijk is bewerkt;</w:t>
+      </w:r>
+      <w:r>
+        <w:t xml:space="preserve"> </w:t>
+      </w:r>
+      <w:r>
+        <w:rPr>
+          <w:rStyle w:val="VerbatimChar"/>
+        </w:rPr>
+        <w:t xml:space="preserve">doorsnijding_pct</w:t>
+      </w:r>
+      <w:r>
+        <w:t xml:space="preserve"> </w:t>
+      </w:r>
+      <w:r>
+        <w:t xml:space="preserve">blijft daarom leeg.</w:t>
       </w:r>
     </w:p>
     <w:p>
@@ -6565,7 +6612,7 @@
           <w:i/>
           <w:iCs/>
         </w:rPr>
-        <w:t xml:space="preserve">Holland’s Duinen</w:t>
+        <w:t xml:space="preserve">Holland's Duinen</w:t>
       </w:r>
       <w:r>
         <w:t xml:space="preserve"> </w:t>
@@ -6604,7 +6651,7 @@
           <w:i/>
           <w:iCs/>
         </w:rPr>
-        <w:t xml:space="preserve">Holland’s Duinen</w:t>
+        <w:t xml:space="preserve">Holland's Duinen</w:t>
       </w:r>
       <w:r>
         <w:t xml:space="preserve"> </w:t>
@@ -6658,7 +6705,7 @@
           <w:i/>
           <w:iCs/>
         </w:rPr>
-        <w:t xml:space="preserve">Holland’s Duinen</w:t>
+        <w:t xml:space="preserve">Holland's Duinen</w:t>
       </w:r>
       <w:r>
         <w:t xml:space="preserve"> </w:t>
@@ -6697,7 +6744,7 @@
           <w:i/>
           <w:iCs/>
         </w:rPr>
-        <w:t xml:space="preserve">Holland’s Duinen</w:t>
+        <w:t xml:space="preserve">Holland's Duinen</w:t>
       </w:r>
       <w:r>
         <w:t xml:space="preserve"> </w:t>
@@ -6764,7 +6811,7 @@
           <w:i/>
           <w:iCs/>
         </w:rPr>
-        <w:t xml:space="preserve">Holland’s Duinen</w:t>
+        <w:t xml:space="preserve">Holland's Duinen</w:t>
       </w:r>
       <w:r>
         <w:t xml:space="preserve"> </w:t>
@@ -6831,7 +6878,7 @@
           <w:i/>
           <w:iCs/>
         </w:rPr>
-        <w:t xml:space="preserve">Holland’s Duinen</w:t>
+        <w:t xml:space="preserve">Holland's Duinen</w:t>
       </w:r>
       <w:r>
         <w:t xml:space="preserve"> </w:t>
@@ -6871,7 +6918,7 @@
           <w:i/>
           <w:iCs/>
         </w:rPr>
-        <w:t xml:space="preserve">Holland’s Duinen</w:t>
+        <w:t xml:space="preserve">Holland's Duinen</w:t>
       </w:r>
       <w:r>
         <w:t xml:space="preserve"> </w:t>
@@ -6895,7 +6942,7 @@
           <w:i/>
           <w:iCs/>
         </w:rPr>
-        <w:t xml:space="preserve">Holland’s Duinen</w:t>
+        <w:t xml:space="preserve">Holland's Duinen</w:t>
       </w:r>
       <w:r>
         <w:t xml:space="preserve"> </w:t>
@@ -6989,7 +7036,7 @@
           <w:i/>
           <w:iCs/>
         </w:rPr>
-        <w:t xml:space="preserve">Holland’s Duinen</w:t>
+        <w:t xml:space="preserve">Holland's Duinen</w:t>
       </w:r>
       <w:r>
         <w:t xml:space="preserve"> </w:t>
@@ -7041,7 +7088,7 @@
         <w:pStyle w:val="BodyText"/>
       </w:pPr>
       <w:r>
-        <w:t xml:space="preserve">Ton heeft op 15 oktober 2026 Meeuwenduin voor deze maatregel gelijkgesteld aan Meeuwenhoek. Prinsenduin en Prinsenberg zijn juist van elkaar gescheiden. De Prinsenberg is het uitzichtpunt op 52.1314451° N, 4.3186070° E in M2; de bredere TOP10NL-geometrie met die naam raakt M2, M3, M35 en M36. Van der Hagen et al. (2020), figuur 1, toont Prinsenduin als afzonderlijk zuidwestelijk onderzoeksgebied; Ton lokaliseerde dit gebied in M17a. Het in november 2023 gestarte werk is daardoor gekoppeld aan M10-12-76, M12a, M73, M74 en M75 voor Meeuwenduin en aan M17a voor Prinsenduin. De in 2024 bevestigde voortzetting is alleen aan M17a gekoppeld. De eerdere Prinsenduin-relaties met M2, M3, M35 en M36 zijn retroactief verwijderd. De exacte werkvoetafdruk binnen de zeven resterende uitvoering-kavelrelaties is onbekend;</w:t>
+        <w:t xml:space="preserve">Ton heeft op 15 oktober 2026 Meeuwenduin voor deze maatregel gelijkgesteld aan Meeuwenhoek. Prinsenduin en Prinsenberg zijn juist van elkaar gescheiden. De Prinsenberg is het uitzichtpunt op 52.1314451° N, 4.3186070° E in M2; de bredere TOP10NL-geometrie met die naam raakt M2, M3, M35 en M36. Van der Hagen et al. (2020), figuur 1, toont Prinsenduin als afzonderlijk zuidwestelijk onderzoeksgebied; Ton lokaliseerde dit gebied in M17a. Het in november 2023 gestarte werk is daardoor gekoppeld aan M10-12-76, M12a, M73, M74 en M75 voor Meeuwenduin en aan M17a voor Prinsenduin. De in 2024 bevestigde voortzetting is alleen aan M17a gekoppeld. De eerdere Prinsenduin-relaties met M2, M3, M35 en M36 zijn retroactief verwijderd. De exacte werkvoetafdruk binnen de zeven resterende uitvoering-kavelrelaties is onbekend;</w:t>
       </w:r>
       <w:r>
         <w:t xml:space="preserve"> </w:t>
@@ -7214,7 +7261,7 @@
           <w:i/>
           <w:iCs/>
         </w:rPr>
-        <w:t xml:space="preserve">Holland’s Duinen</w:t>
+        <w:t xml:space="preserve">Holland's Duinen</w:t>
       </w:r>
       <w:r>
         <w:t xml:space="preserve"> </w:t>
@@ -7258,6 +7305,29 @@
         <w:pStyle w:val="BodyText"/>
       </w:pPr>
       <w:r>
+        <w:t xml:space="preserve">De jaarlijkse begrazing van Weiduin is op 15 oktober 2026 eveneens expliciet als buiten het Meijendel-plotgebied beoordeeld. Het Natura 2000-beheerplan beschrijft maatregel 24a als beheer op terrein van een particuliere landgoedeigenaar. De gemeentelijke objectinventaris identificeert Weiduin als het landhuis aan Prins Frederiklaan 28. De actuele PDOK-Kadastrale Kaart koppelt dit adres aan perceel Wassenaar H 2889 van 13.325 m². Dit perceel doorsnijdt geen van de 55 levende Meijendel-plots; M85 is met 226,5 meter de dichtstbijzijnde plot. Ton bevestigde daarom dat uitvoering 20 geen plotkoppeling krijgt.</w:t>
+      </w:r>
+      <w:r>
+        <w:t xml:space="preserve"> </w:t>
+      </w:r>
+      <w:r>
+        <w:rPr>
+          <w:rStyle w:val="VerbatimChar"/>
+        </w:rPr>
+        <w:t xml:space="preserve">maatregel_uitvoering_plotscope</w:t>
+      </w:r>
+      <w:r>
+        <w:t xml:space="preserve"> </w:t>
+      </w:r>
+      <w:r>
+        <w:t xml:space="preserve">bevat hiervoor een geverifieerde regel; de uitvoering levert geen plot-jaarrij op.</w:t>
+      </w:r>
+    </w:p>
+    <w:p>
+      <w:pPr>
+        <w:pStyle w:val="BodyText"/>
+      </w:pPr>
+      <w:r>
         <w:t xml:space="preserve">Het leidingwerk binnen het Programma Investeringen Meijendel is gecorrigeerd van ‘6,5 kilometer aangelegd’ naar ‘6,5 kilometer vernieuwd’. Dunea beschrijft dit als totaal voor het programma van 2010 tot en met 22 oktober 2018. Haagse Archeologische Rapportage 1306 uit 2013 noemt vervanging of aansluiting van leidingwerk in Serie RA, Serie WV, Serie E, Serie LV en Complex 8 en begrenst de PIM-werkgebieden op afbeelding 1. De kaart is over de actuele kavelgeometrie gelegd; Ton bevestigde op 15 oktober 2026 de gezamenlijke koppeling aan M41, M42, M43, M45, M84, M84s en M85. De gepubliceerde 6,5 kilometer is niet over de series of kavels verdeeld. Daarom blijven de zeven</w:t>
       </w:r>
       <w:r>
@@ -7313,43 +7383,64 @@
         <w:pStyle w:val="BodyText"/>
       </w:pPr>
       <w:r>
-        <w:t xml:space="preserve">De 143 plotkoppelingen en 88 uitgevoerde jaarregels leveren samen 186 regels in </w:t>
-      </w:r>
-      <w:r>
-        <w:rPr>
-          <w:rFonts w:ascii="Aptos Mono" w:hAnsi="Aptos Mono"/>
-        </w:rPr>
-        <w:t>v_plot_jaar_maatregel_bronvast</w:t>
-      </w:r>
-      <w:r>
-        <w:t xml:space="preserve">. De tien koppelingen van het onderzochte PAS-maaibeheer 23 voegen geen plot-jaarrijen toe, omdat alle vier jaarregels 2016–2019 </w:t>
-      </w:r>
-      <w:r>
-        <w:rPr>
-          <w:rFonts w:ascii="Aptos Mono" w:hAnsi="Aptos Mono"/>
-        </w:rPr>
-        <w:t>niet_uitgevoerd</w:t>
-      </w:r>
-      <w:r>
-        <w:t xml:space="preserve"> zijn. Het maaibeheer in Ruygenhoek, Lange Strook en De Loopert voegt vijf plotrelaties maar geen plot-jaarrijen toe, omdat vaststelbare uitvoeringsjaren ontbreken. De Ganzenhoekbosdunning voegt twee plot-jaarrijen voor M77 en M78/79 in 2017 toe. De nameninventaris voegt 36 plot-jaarrijen toe. De aanvullende systeemkoppelingen voegen 22 plot-jaarrijen toe. De Helmduinen-koppeling voegt twee plot-jaarrijen voor 1991 toe. Het opslagbeheer in Meeuwenduin en Prinsenduin voegt zes plot-jaarrijen voor 2023 toe; de afzonderlijke voortzetting in Prinsenduin één voor M17a in 2024. Maatregel 22h voegt twaalf scoperegels voor zes kavels in 2016 en 2017 toe; voor 2018–2021 blijft de jaarstatus </w:t>
-      </w:r>
-      <w:r>
-        <w:rPr>
-          <w:rFonts w:ascii="Aptos Mono" w:hAnsi="Aptos Mono"/>
-        </w:rPr>
-        <w:t>onbekend</w:t>
-      </w:r>
-      <w:r>
-        <w:t xml:space="preserve"> en ontstaan geen plot-jaarrijen. Het PIM-leidingwerk voegt zeven scoperegels voor 2018 toe. Infiltratieplas 27.2 voegt voor M77 één regel in 2013 en één in 2014 toe. De overige eerder vastgelegde koppelingen en jaarselecties blijven inhoudelijk ongewijzigd. Voor beide doorlopende begrazingsmaatregelen bewaart deze view alleen het expliciet onderbouwde startjaar; de open einddatum en </w:t>
-      </w:r>
-      <w:r>
-        <w:rPr>
-          <w:rFonts w:ascii="Aptos Mono" w:hAnsi="Aptos Mono"/>
-        </w:rPr>
-        <w:t>cycliciteit='doorlopend tot heden'</w:t>
-      </w:r>
-      <w:r>
-        <w:t xml:space="preserve"> leggen de voortzetting tot en met 2026 vast zonder tussenliggende jaren als afzonderlijke bronbeweringen te construeren. De twee Bendel-jaarregels blijven buiten deze view omdat beide Bendel-uitvoeringen expliciet buiten het Meijendel-plotgebied vallen.</w:t>
+        <w:t xml:space="preserve">De 143 plotkoppelingen en 88 uitgevoerde jaarregels leveren samen 186 regels in</w:t>
+      </w:r>
+      <w:r>
+        <w:t xml:space="preserve"> </w:t>
+      </w:r>
+      <w:r>
+        <w:rPr>
+          <w:rStyle w:val="VerbatimChar"/>
+        </w:rPr>
+        <w:t xml:space="preserve">v_plot_jaar_maatregel_bronvast</w:t>
+      </w:r>
+      <w:r>
+        <w:t xml:space="preserve">. De tien koppelingen van het onderzochte PAS-maaibeheer 23 voegen geen plot-jaarrijen toe, omdat alle vier jaarregels 2016–2019</w:t>
+      </w:r>
+      <w:r>
+        <w:t xml:space="preserve"> </w:t>
+      </w:r>
+      <w:r>
+        <w:rPr>
+          <w:rStyle w:val="VerbatimChar"/>
+        </w:rPr>
+        <w:t xml:space="preserve">niet_uitgevoerd</w:t>
+      </w:r>
+      <w:r>
+        <w:t xml:space="preserve"> </w:t>
+      </w:r>
+      <w:r>
+        <w:t xml:space="preserve">zijn. Het maaibeheer in Ruygenhoek, Lange Strook en De Loopert voegt vijf plotrelaties maar geen plot-jaarrijen toe, omdat vaststelbare uitvoeringsjaren ontbreken. De Ganzenhoekbosdunning voegt twee plot-jaarrijen voor M77 en M78/79 in 2017 toe. De nameninventaris voegt 36 plot-jaarrijen toe. De aanvullende systeemkoppelingen voegen 22 plot-jaarrijen toe. De Helmduinen-koppeling voegt twee plot-jaarrijen voor 1991 toe. Het opslagbeheer in Meeuwenduin en Prinsenduin voegt zes plot-jaarrijen voor 2023 toe; de afzonderlijke voortzetting in Prinsenduin één voor M17a in 2024. Maatregel 22h voegt twaalf scoperegels voor zes kavels in 2016 en 2017 toe; voor 2018–2021 blijft de jaarstatus</w:t>
+      </w:r>
+      <w:r>
+        <w:t xml:space="preserve"> </w:t>
+      </w:r>
+      <w:r>
+        <w:rPr>
+          <w:rStyle w:val="VerbatimChar"/>
+        </w:rPr>
+        <w:t xml:space="preserve">onbekend</w:t>
+      </w:r>
+      <w:r>
+        <w:t xml:space="preserve"> </w:t>
+      </w:r>
+      <w:r>
+        <w:t xml:space="preserve">en ontstaan geen plot-jaarrijen. Het PIM-leidingwerk voegt zeven scoperegels voor 2018 toe. Infiltratieplas 27.2 voegt voor M77 één regel in 2013 en één in 2014 toe. De overige eerder vastgelegde koppelingen en jaarselecties blijven inhoudelijk ongewijzigd. Voor beide doorlopende begrazingsmaatregelen bewaart deze view alleen het expliciet onderbouwde startjaar; de open einddatum en</w:t>
+      </w:r>
+      <w:r>
+        <w:t xml:space="preserve"> </w:t>
+      </w:r>
+      <w:r>
+        <w:rPr>
+          <w:rStyle w:val="VerbatimChar"/>
+        </w:rPr>
+        <w:t xml:space="preserve">cycliciteit='doorlopend tot heden'</w:t>
+      </w:r>
+      <w:r>
+        <w:t xml:space="preserve"> </w:t>
+      </w:r>
+      <w:r>
+        <w:t xml:space="preserve">leggen de voortzetting tot en met 2026 vast zonder tussenliggende jaren als afzonderlijke bronbeweringen te construeren. De twee Bendel-jaarregels blijven buiten deze view omdat beide Bendel-uitvoeringen expliciet buiten het Meijendel-plotgebied vallen.</w:t>
       </w:r>
     </w:p>
     <w:p>
@@ -7407,36 +7498,52 @@
       <w:r>
         <w:rPr>
           <w:b/>
-        </w:rPr>
-        <w:t>Status.</w:t>
-      </w:r>
-      <w:r>
-        <w:t xml:space="preserve"> Bronvast op project-, uitvoering- en jaarniveau voor 37 ingevoerde bronnen en 64 uitvoeringen. De algemene kavel- en gebiedsindeling is geometrisch beschikbaar voor de 55 actuele plots uit 2025; vijf expliciet gekoppelde historische kavels hebben geen afzonderlijke geometrie. De bronvaste plot-jaarlaag bevat 186 regels voor 1967–1969, 1972–1975, 1988–1991, 1993, 1997, 2002, 2005–2006, 2013–2014 en 2016–2025. Het onderzochte PAS-maaibeheer 23 levert geen plot-jaarrijen op, omdat de vier jaarregels 2016–2019 </w:t>
-      </w:r>
-      <w:r>
-        <w:rPr>
-          <w:rFonts w:ascii="Aptos Mono" w:hAnsi="Aptos Mono"/>
-        </w:rPr>
-        <w:t>niet_uitgevoerd</w:t>
-      </w:r>
-      <w:r>
-        <w:t xml:space="preserve"> zijn en de view alleen uitgevoerde jaren opneemt. </w:t>
-      </w:r>
-      <w:r>
-        <w:rPr>
-          <w:rFonts w:ascii="Aptos Mono" w:hAnsi="Aptos Mono"/>
-        </w:rPr>
-        <w:t>maatregel_plot_koppeling</w:t>
-      </w:r>
-      <w:r>
-        <w:t xml:space="preserve"> bevat 143 relaties. Helmduinen heeft er twee; Meeuwenduin en Prinsenduin samen zeven; maatregel 22h zes; het onderzochte PAS-maaibeheer 23 tien; het maaibeheer in Ruygenhoek, Lange Strook en De Loopert vijf; het PIM-leidingwerk zeven; infiltratieplas 27.2 één. Dertien uitvoeringen hebben geen directe plotkoppeling; de twee Bendel-uitvoeringen vallen aantoonbaar buiten het Meijendel-plotgebied, zodat nog 11 geheel ongekoppelde uitvoeringen ruimtelijk moeten worden beoordeeld.</w:t>
+          <w:bCs/>
+        </w:rPr>
+        <w:t xml:space="preserve">Status.</w:t>
+      </w:r>
+      <w:r>
+        <w:t xml:space="preserve"> </w:t>
+      </w:r>
+      <w:r>
+        <w:t xml:space="preserve">Bronvast op project-, uitvoering- en jaarniveau voor 39 ingevoerde bronnen en 64 uitvoeringen. De algemene kavel- en gebiedsindeling is geometrisch beschikbaar voor de 55 actuele plots uit 2025; vijf expliciet gekoppelde historische kavels hebben geen afzonderlijke geometrie. De bronvaste plot-jaarlaag bevat 186 regels voor 1967–1969, 1972–1975, 1988–1991, 1993, 1997, 2002, 2005–2006, 2013–2014 en 2016–2025. Het onderzochte PAS-maaibeheer 23 levert geen plot-jaarrijen op, omdat de vier jaarregels 2016–2019</w:t>
+      </w:r>
+      <w:r>
+        <w:t xml:space="preserve"> </w:t>
+      </w:r>
+      <w:r>
+        <w:rPr>
+          <w:rStyle w:val="VerbatimChar"/>
+        </w:rPr>
+        <w:t xml:space="preserve">niet_uitgevoerd</w:t>
+      </w:r>
+      <w:r>
+        <w:t xml:space="preserve"> </w:t>
+      </w:r>
+      <w:r>
+        <w:t xml:space="preserve">zijn en de view alleen uitgevoerde jaren opneemt.</w:t>
+      </w:r>
+      <w:r>
+        <w:t xml:space="preserve"> </w:t>
+      </w:r>
+      <w:r>
+        <w:rPr>
+          <w:rStyle w:val="VerbatimChar"/>
+        </w:rPr>
+        <w:t xml:space="preserve">maatregel_plot_koppeling</w:t>
+      </w:r>
+      <w:r>
+        <w:t xml:space="preserve"> </w:t>
+      </w:r>
+      <w:r>
+        <w:t xml:space="preserve">bevat 143 relaties. Helmduinen heeft er twee; Meeuwenduin en Prinsenduin samen zeven; maatregel 22h zes; het onderzochte PAS-maaibeheer 23 tien; het maaibeheer in Ruygenhoek, Lange Strook en De Loopert vijf; het PIM-leidingwerk zeven; infiltratieplas 27.2 één. Dertien uitvoeringen hebben geen directe plotkoppeling. De twee Bendel-uitvoeringen en de begrazing van landgoed Weiduin vallen aantoonbaar buiten het Meijendel-plotgebied, zodat nog tien geheel ongekoppelde uitvoeringen ruimtelijk moeten worden beoordeeld.</w:t>
       </w:r>
     </w:p>
     <w:p>
       <w:pPr>
         <w:pStyle w:val="Heading2"/>
       </w:pPr>
-      <w:bookmarkStart w:id="55" w:name="_3b532014da7425692b0b753bfd67f02e729afe2"/>
+      <w:bookmarkStart w:id="56" w:name="_692b0a71312b2a939db271d079fb23757bfc15a"/>
       <w:r>
         <w:t xml:space="preserve">2. Bronnen in MySQL-database</w:t>
       </w:r>
@@ -7449,7 +7556,7 @@
         </w:rPr>
         <w:t xml:space="preserve">Meijendel_bronnen</w:t>
       </w:r>
-      <w:bookmarkEnd w:id="55"/>
+      <w:bookmarkEnd w:id="56"/>
     </w:p>
     <w:p>
       <w:pPr>
@@ -7478,11 +7585,11 @@
       <w:pPr>
         <w:pStyle w:val="Heading3"/>
       </w:pPr>
-      <w:bookmarkStart w:id="56" w:name="_duinvalleivegetatie"/>
+      <w:bookmarkStart w:id="57" w:name="_7ae3f60e8dd3c65bdde3d5f608a55d96632a876"/>
       <w:r>
         <w:t xml:space="preserve">2.1. Duinvalleivegetatie</w:t>
       </w:r>
-      <w:bookmarkEnd w:id="56"/>
+      <w:bookmarkEnd w:id="57"/>
     </w:p>
     <w:p>
       <w:pPr>
@@ -7504,7 +7611,7 @@
       <w:r>
         <w:t xml:space="preserve"> </w:t>
       </w:r>
-      <w:hyperlink r:id="rId57">
+      <w:hyperlink r:id="rId58">
         <w:r>
           <w:rPr>
             <w:rStyle w:val="Hyperlink"/>
@@ -7553,11 +7660,11 @@
       <w:pPr>
         <w:pStyle w:val="Heading3"/>
       </w:pPr>
-      <w:bookmarkStart w:id="58" w:name="_b3fe4556564befcfb8496c13829480f8568428d"/>
+      <w:bookmarkStart w:id="59" w:name="_6cd5cd3671e295c222d5bd4a47757f0a76f0a19"/>
       <w:r>
         <w:t xml:space="preserve">2.2. Vogelstand 1924</w:t>
       </w:r>
-      <w:bookmarkEnd w:id="58"/>
+      <w:bookmarkEnd w:id="59"/>
     </w:p>
     <w:p>
       <w:pPr>
@@ -7632,11 +7739,11 @@
       <w:pPr>
         <w:pStyle w:val="Heading3"/>
       </w:pPr>
-      <w:bookmarkStart w:id="59" w:name="_jachtspinnen"/>
+      <w:bookmarkStart w:id="60" w:name="_b3fdc40884db1bbf06132e666e117a731445140"/>
       <w:r>
         <w:t xml:space="preserve">2.3. Jachtspinnen</w:t>
       </w:r>
-      <w:bookmarkEnd w:id="59"/>
+      <w:bookmarkEnd w:id="60"/>
     </w:p>
     <w:p>
       <w:pPr>
@@ -7696,11 +7803,11 @@
       <w:pPr>
         <w:pStyle w:val="Heading3"/>
       </w:pPr>
-      <w:bookmarkStart w:id="60" w:name="_literatuuroverzicht"/>
+      <w:bookmarkStart w:id="61" w:name="_7c2c13aacf0ea926ee35ca97ab69391a3624a6f"/>
       <w:r>
         <w:t xml:space="preserve">2.4. Literatuuroverzicht</w:t>
       </w:r>
-      <w:bookmarkEnd w:id="60"/>
+      <w:bookmarkEnd w:id="61"/>
     </w:p>
     <w:p>
       <w:pPr>
@@ -7760,11 +7867,11 @@
       <w:pPr>
         <w:pStyle w:val="Heading3"/>
       </w:pPr>
-      <w:bookmarkStart w:id="61" w:name="_c459e94267866b3631cced111f8a87d0309b41a"/>
+      <w:bookmarkStart w:id="62" w:name="_4a1f2475629c7656191227e4ca81566bef187e2"/>
       <w:r>
         <w:t xml:space="preserve">2.5. Bijenmonitoring in vier beheergebieden</w:t>
       </w:r>
-      <w:bookmarkEnd w:id="61"/>
+      <w:bookmarkEnd w:id="62"/>
     </w:p>
     <w:p>
       <w:pPr>
@@ -7836,11 +7943,11 @@
       <w:pPr>
         <w:pStyle w:val="Heading3"/>
       </w:pPr>
-      <w:bookmarkStart w:id="62" w:name="_3de3a6968c8894ad5b666eb1a40d580f2cd5807"/>
+      <w:bookmarkStart w:id="63" w:name="_bef92f685785a24a45e5325384551ba55c57cc1"/>
       <w:r>
         <w:t xml:space="preserve">2.6. Aquatische macrofauna 1974–1975</w:t>
       </w:r>
-      <w:bookmarkEnd w:id="62"/>
+      <w:bookmarkEnd w:id="63"/>
     </w:p>
     <w:p>
       <w:pPr>
@@ -7915,11 +8022,11 @@
       <w:pPr>
         <w:pStyle w:val="Heading2"/>
       </w:pPr>
-      <w:bookmarkStart w:id="63" w:name="_ae67a70ad36e2d1d11a7d910c2e5a6d669a3a5f"/>
+      <w:bookmarkStart w:id="64" w:name="_2b62b82ef201b4c91783bce15da2b1d0258c34c"/>
       <w:r>
         <w:t xml:space="preserve">3. Geïdentificeerde externe kandidaatbronnen</w:t>
       </w:r>
-      <w:bookmarkEnd w:id="63"/>
+      <w:bookmarkEnd w:id="64"/>
     </w:p>
     <w:p>
       <w:pPr>
@@ -7933,21 +8040,21 @@
       <w:pPr>
         <w:pStyle w:val="Heading3"/>
       </w:pPr>
-      <w:bookmarkStart w:id="64" w:name="_d53aceb4d9e4863cdbb6367737be5e291cdac65"/>
+      <w:bookmarkStart w:id="65" w:name="_d53aceb4d9e4863cdbb6367737be5e291cdac65"/>
       <w:r>
         <w:t xml:space="preserve">Kandidaten met de grootste verwachte aanvulling</w:t>
       </w:r>
-      <w:bookmarkEnd w:id="64"/>
+      <w:bookmarkEnd w:id="65"/>
     </w:p>
     <w:p>
       <w:pPr>
         <w:pStyle w:val="Heading4"/>
       </w:pPr>
-      <w:bookmarkStart w:id="65" w:name="_74b9659b0fdf809bf79d99a5b829eae72be789d"/>
+      <w:bookmarkStart w:id="66" w:name="_bddce02f5cb2b082bf32fac381c8bc0ea5284d3"/>
       <w:r>
         <w:t xml:space="preserve">3.1. Historische en actuele ringgegevens</w:t>
       </w:r>
-      <w:bookmarkEnd w:id="65"/>
+      <w:bookmarkEnd w:id="66"/>
     </w:p>
     <w:p>
       <w:pPr>
@@ -8040,11 +8147,11 @@
       <w:pPr>
         <w:pStyle w:val="Heading4"/>
       </w:pPr>
-      <w:bookmarkStart w:id="66" w:name="_78976b2620bc79a80ca8146881cbd2c6e6ff990"/>
+      <w:bookmarkStart w:id="67" w:name="_8071b7ae643e6cecadbf8a281c84bb90b511e63"/>
       <w:r>
         <w:t xml:space="preserve">3.2. Erosiepinnen in een stuifkuilcomplex</w:t>
       </w:r>
-      <w:bookmarkEnd w:id="66"/>
+      <w:bookmarkEnd w:id="67"/>
     </w:p>
     <w:p>
       <w:pPr>
@@ -8122,11 +8229,11 @@
       <w:pPr>
         <w:pStyle w:val="Heading4"/>
       </w:pPr>
-      <w:bookmarkStart w:id="67" w:name="_0e60eab001b7dad7f07f0f30fba1e4c43b4fb6d"/>
+      <w:bookmarkStart w:id="68" w:name="_1b05a95cacb83608c9b762adcf4298810ed86f9"/>
       <w:r>
         <w:t xml:space="preserve">3.3. Langjarige droge-duinvegetatieplots</w:t>
       </w:r>
-      <w:bookmarkEnd w:id="67"/>
+      <w:bookmarkEnd w:id="68"/>
     </w:p>
     <w:p>
       <w:pPr>
@@ -8204,14 +8311,14 @@
       <w:pPr>
         <w:pStyle w:val="Heading4"/>
       </w:pPr>
-      <w:bookmarkStart w:id="69" w:name="_f31d7749b8f822cf46569bbbcf696a184226376"/>
+      <w:bookmarkStart w:id="70" w:name="_4578481a165cef1470f100d42a5e836ac7456f8"/>
       <w:r>
         <w:t xml:space="preserve">3.4.</w:t>
       </w:r>
       <w:r>
         <w:t xml:space="preserve"> </w:t>
       </w:r>
-      <w:hyperlink r:id="rId68">
+      <w:hyperlink r:id="rId69">
         <w:r>
           <w:rPr>
             <w:rStyle w:val="Hyperlink"/>
@@ -8219,7 +8326,7 @@
           <w:t xml:space="preserve">Neuropteren van Meijendel</w:t>
         </w:r>
       </w:hyperlink>
-      <w:bookmarkEnd w:id="69"/>
+      <w:bookmarkEnd w:id="70"/>
     </w:p>
     <w:p>
       <w:pPr>
@@ -8297,14 +8404,14 @@
       <w:pPr>
         <w:pStyle w:val="Heading4"/>
       </w:pPr>
-      <w:bookmarkStart w:id="71" w:name="_2470413ff36fadda6aaee753e44801bf1df918f"/>
+      <w:bookmarkStart w:id="72" w:name="_642992b46f3d655730973d9bd57c00f9c7aad9f"/>
       <w:r>
         <w:t xml:space="preserve">3.5.</w:t>
       </w:r>
       <w:r>
         <w:t xml:space="preserve"> </w:t>
       </w:r>
-      <w:hyperlink r:id="rId70">
+      <w:hyperlink r:id="rId71">
         <w:r>
           <w:rPr>
             <w:rStyle w:val="Hyperlink"/>
@@ -8312,7 +8419,7 @@
           <w:t xml:space="preserve">Zweefvliegen van Meijendel</w:t>
         </w:r>
       </w:hyperlink>
-      <w:bookmarkEnd w:id="71"/>
+      <w:bookmarkEnd w:id="72"/>
     </w:p>
     <w:p>
       <w:pPr>
@@ -8390,11 +8497,11 @@
       <w:pPr>
         <w:pStyle w:val="Heading4"/>
       </w:pPr>
-      <w:bookmarkStart w:id="72" w:name="_17333f70ef292f70875eaae009d7701e7337d63"/>
+      <w:bookmarkStart w:id="73" w:name="_80b82bf48485caf594896b8d6bc490be5f328ee"/>
       <w:r>
         <w:t xml:space="preserve">3.6. TERRA-Dunes plant- en bodemmicrobiomen</w:t>
       </w:r>
-      <w:bookmarkEnd w:id="72"/>
+      <w:bookmarkEnd w:id="73"/>
     </w:p>
     <w:p>
       <w:pPr>
@@ -8416,7 +8523,7 @@
       <w:r>
         <w:t xml:space="preserve"> </w:t>
       </w:r>
-      <w:hyperlink r:id="rId73">
+      <w:hyperlink r:id="rId74">
         <w:r>
           <w:rPr>
             <w:rStyle w:val="Hyperlink"/>
@@ -8465,11 +8572,11 @@
       <w:pPr>
         <w:pStyle w:val="Heading4"/>
       </w:pPr>
-      <w:bookmarkStart w:id="74" w:name="_40b4b5f78cd8ca95bb70f0f0c78c7e4fbf296ca"/>
+      <w:bookmarkStart w:id="75" w:name="_4b2db10b2340db42e20505c45425c0b84f14c27"/>
       <w:r>
         <w:t xml:space="preserve">3.7. Rups- en bodemmicrobiomen</w:t>
       </w:r>
-      <w:bookmarkEnd w:id="74"/>
+      <w:bookmarkEnd w:id="75"/>
     </w:p>
     <w:p>
       <w:pPr>
@@ -8491,7 +8598,7 @@
       <w:r>
         <w:t xml:space="preserve"> </w:t>
       </w:r>
-      <w:hyperlink r:id="rId75">
+      <w:hyperlink r:id="rId76">
         <w:r>
           <w:rPr>
             <w:rStyle w:val="Hyperlink"/>
@@ -8540,11 +8647,11 @@
       <w:pPr>
         <w:pStyle w:val="Heading4"/>
       </w:pPr>
-      <w:bookmarkStart w:id="76" w:name="_1ba4dd18d3453a5dd5138bb384a5f14f39849e8"/>
+      <w:bookmarkStart w:id="77" w:name="_442e94e4e2997aa133d10bf618574e2528e759d"/>
       <w:r>
         <w:t xml:space="preserve">3.8. Schimmels bij kruipwilg</w:t>
       </w:r>
-      <w:bookmarkEnd w:id="76"/>
+      <w:bookmarkEnd w:id="77"/>
     </w:p>
     <w:p>
       <w:pPr>
@@ -8566,7 +8673,7 @@
       <w:r>
         <w:t xml:space="preserve"> </w:t>
       </w:r>
-      <w:hyperlink r:id="rId77">
+      <w:hyperlink r:id="rId78">
         <w:r>
           <w:rPr>
             <w:rStyle w:val="Hyperlink"/>
@@ -8615,11 +8722,11 @@
       <w:pPr>
         <w:pStyle w:val="Heading4"/>
       </w:pPr>
-      <w:bookmarkStart w:id="78" w:name="_374ab00ebf692a8e3319839c9c7bfae940c399a"/>
+      <w:bookmarkStart w:id="79" w:name="_36e8e197a59cff4a0251b791dc5fc6bc0e135bf"/>
       <w:r>
         <w:t xml:space="preserve">3.9. Plantengroei, bodemvocht en weer</w:t>
       </w:r>
-      <w:bookmarkEnd w:id="78"/>
+      <w:bookmarkEnd w:id="79"/>
     </w:p>
     <w:p>
       <w:pPr>
@@ -8641,7 +8748,7 @@
       <w:r>
         <w:t xml:space="preserve"> </w:t>
       </w:r>
-      <w:hyperlink r:id="rId79">
+      <w:hyperlink r:id="rId80">
         <w:r>
           <w:rPr>
             <w:rStyle w:val="Hyperlink"/>
@@ -8690,11 +8797,11 @@
       <w:pPr>
         <w:pStyle w:val="Heading4"/>
       </w:pPr>
-      <w:bookmarkStart w:id="80" w:name="_936150612b1bf240012fee005a20984db1c7c99"/>
+      <w:bookmarkStart w:id="81" w:name="_49ed5beca1c3c65272a43e85c3687f3c3d41d64"/>
       <w:r>
         <w:t xml:space="preserve">3.10. Genetische datasets amfibieën</w:t>
       </w:r>
-      <w:bookmarkEnd w:id="80"/>
+      <w:bookmarkEnd w:id="81"/>
     </w:p>
     <w:p>
       <w:pPr>
@@ -8754,11 +8861,11 @@
       <w:pPr>
         <w:pStyle w:val="Heading3"/>
       </w:pPr>
-      <w:bookmarkStart w:id="81" w:name="_8c2748f02893018608c8a38a1054acf3030739d"/>
+      <w:bookmarkStart w:id="82" w:name="_136d668cd3b301eba92f27584d1a2d49d57a73c"/>
       <w:r>
         <w:t xml:space="preserve">3.11. Alleen context of nog een onderzoeksaanwijzing</w:t>
       </w:r>
-      <w:bookmarkEnd w:id="81"/>
+      <w:bookmarkEnd w:id="82"/>
     </w:p>
     <w:p>
       <w:pPr>
@@ -8904,7 +9011,7 @@
       <w:pPr>
         <w:pStyle w:val="BodyText"/>
       </w:pPr>
-      <w:hyperlink r:id="rId82">
+      <w:hyperlink r:id="rId83">
         <w:r>
           <w:rPr>
             <w:rStyle w:val="Hyperlink"/>
@@ -8968,11 +9075,11 @@
       <w:pPr>
         <w:pStyle w:val="Heading3"/>
       </w:pPr>
-      <w:bookmarkStart w:id="83" w:name="_41253e96e2b1ec8824f9b84bf0a06f4f5ff5fba"/>
+      <w:bookmarkStart w:id="84" w:name="_5a3c854a1ae73aceac94ca91c157868f870ab17"/>
       <w:r>
         <w:t xml:space="preserve">3.12. Geografische namen en historische paden</w:t>
       </w:r>
-      <w:bookmarkEnd w:id="83"/>
+      <w:bookmarkEnd w:id="84"/>
     </w:p>
     <w:p>
       <w:pPr>
@@ -9079,11 +9186,11 @@
       <w:pPr>
         <w:pStyle w:val="Heading2"/>
       </w:pPr>
-      <w:bookmarkStart w:id="84" w:name="_8e1aa2a9058c5df66a55f09f3195dc2392072ca"/>
+      <w:bookmarkStart w:id="85" w:name="_c540a83ee65aaec11aa446aec0815d16fd21e21"/>
       <w:r>
         <w:t xml:space="preserve">4. Verwachte aanvullingen</w:t>
       </w:r>
-      <w:bookmarkEnd w:id="84"/>
+      <w:bookmarkEnd w:id="85"/>
     </w:p>
     <w:p>
       <w:pPr>
@@ -9143,11 +9250,11 @@
       <w:pPr>
         <w:pStyle w:val="Heading2"/>
       </w:pPr>
-      <w:bookmarkStart w:id="85" w:name="_bd1d36805349ef5ec39b6efd044fd20b47e23f4"/>
+      <w:bookmarkStart w:id="86" w:name="_422e6271160c2b04a3b59fb5b59cfcc2e3afc55"/>
       <w:r>
         <w:t xml:space="preserve">5. Bronnen die niet verder worden uitgewerkt</w:t>
       </w:r>
-      <w:bookmarkEnd w:id="85"/>
+      <w:bookmarkEnd w:id="86"/>
     </w:p>
     <w:p>
       <w:pPr>
@@ -9177,11 +9284,11 @@
       <w:pPr>
         <w:pStyle w:val="Heading2"/>
       </w:pPr>
-      <w:bookmarkStart w:id="86" w:name="_013584c0923eee2d005d13457186cf6f9764ca0"/>
+      <w:bookmarkStart w:id="87" w:name="_b05dec49988a12f7955d21ff17f1c91e4d061eb"/>
       <w:r>
         <w:t xml:space="preserve">6. Gebruik van dit register</w:t>
       </w:r>
-      <w:bookmarkEnd w:id="86"/>
+      <w:bookmarkEnd w:id="87"/>
     </w:p>
     <w:p>
       <w:pPr>
@@ -9266,11 +9373,11 @@
       <w:pPr>
         <w:pStyle w:val="Heading2"/>
       </w:pPr>
-      <w:bookmarkStart w:id="87" w:name="_actieplan"/>
+      <w:bookmarkStart w:id="88" w:name="_67781990bcb7d7d43cc312a7ef48f37a1f83265"/>
       <w:r>
         <w:t xml:space="preserve">7. Actieplan</w:t>
       </w:r>
-      <w:bookmarkEnd w:id="87"/>
+      <w:bookmarkEnd w:id="88"/>
     </w:p>
     <w:p>
       <w:pPr>
@@ -9299,11 +9406,11 @@
       <w:pPr>
         <w:pStyle w:val="Heading3"/>
       </w:pPr>
-      <w:bookmarkStart w:id="88" w:name="_94b069977659593a87344faec87dcce83750292"/>
+      <w:bookmarkStart w:id="89" w:name="_d7f889e2150e602eaeb242f489896c9b52af547"/>
       <w:r>
         <w:t xml:space="preserve">Fase 1 — openbare, direct toetsbare bronnen</w:t>
       </w:r>
-      <w:bookmarkEnd w:id="88"/>
+      <w:bookmarkEnd w:id="89"/>
     </w:p>
     <w:p>
       <w:pPr>
@@ -9387,11 +9494,11 @@
       <w:pPr>
         <w:pStyle w:val="Heading3"/>
       </w:pPr>
-      <w:bookmarkStart w:id="89" w:name="_1e65d730f223a62ff579853fd3c77c9308748df"/>
+      <w:bookmarkStart w:id="90" w:name="_a67120beb48c3916f8a53c623f303ce8b8a6005"/>
       <w:r>
         <w:t xml:space="preserve">Fase 2 — reeksen met grote historische of trendwaarde</w:t>
       </w:r>
-      <w:bookmarkEnd w:id="89"/>
+      <w:bookmarkEnd w:id="90"/>
     </w:p>
     <w:p>
       <w:pPr>
@@ -9541,11 +9648,11 @@
       <w:pPr>
         <w:pStyle w:val="Heading3"/>
       </w:pPr>
-      <w:bookmarkStart w:id="90" w:name="_6b9d0c88ffcb5584e67daa74c9524b522af67c0"/>
+      <w:bookmarkStart w:id="91" w:name="_c96f79f2027e81b7ab280f9bf69df5af8bdf464"/>
       <w:r>
         <w:t xml:space="preserve">Fase 3 — reeds bekende bronhouders en contextdatasets</w:t>
       </w:r>
-      <w:bookmarkEnd w:id="90"/>
+      <w:bookmarkEnd w:id="91"/>
     </w:p>
     <w:p>
       <w:pPr>
@@ -9620,11 +9727,11 @@
       <w:pPr>
         <w:pStyle w:val="Heading3"/>
       </w:pPr>
-      <w:bookmarkStart w:id="91" w:name="_d490f73b19661b8ff0d346b94e527be91e989c7"/>
+      <w:bookmarkStart w:id="92" w:name="_d490f73b19661b8ff0d346b94e527be91e989c7"/>
       <w:r>
         <w:t xml:space="preserve">Vaste werkwijze per bron</w:t>
       </w:r>
-      <w:bookmarkEnd w:id="91"/>
+      <w:bookmarkEnd w:id="92"/>
     </w:p>
     <w:p>
       <w:pPr>
@@ -9638,11 +9745,11 @@
       <w:pPr>
         <w:pStyle w:val="Heading3"/>
       </w:pPr>
-      <w:bookmarkStart w:id="92" w:name="_1e50ec235a164d1e043cda4cec7be66fb154af3"/>
+      <w:bookmarkStart w:id="93" w:name="_1e50ec235a164d1e043cda4cec7be66fb154af3"/>
       <w:r>
         <w:t xml:space="preserve">Dekking van de internetcontrole</w:t>
       </w:r>
-      <w:bookmarkEnd w:id="92"/>
+      <w:bookmarkEnd w:id="93"/>
     </w:p>
     <w:p>
       <w:pPr>
@@ -9656,11 +9763,11 @@
       <w:pPr>
         <w:pStyle w:val="Heading2"/>
       </w:pPr>
-      <w:bookmarkStart w:id="93" w:name="_5001ec8ecf742000e2504f4f268bea177f3f158"/>
+      <w:bookmarkStart w:id="94" w:name="_5001ec8ecf742000e2504f4f268bea177f3f158"/>
       <w:r>
         <w:t xml:space="preserve">Achterliggende verantwoording</w:t>
       </w:r>
-      <w:bookmarkEnd w:id="93"/>
+      <w:bookmarkEnd w:id="94"/>
     </w:p>
     <w:p>
       <w:pPr>
@@ -9670,7 +9777,7 @@
           <w:numId w:val="1005"/>
         </w:numPr>
       </w:pPr>
-      <w:hyperlink r:id="rId94">
+      <w:hyperlink r:id="rId95">
         <w:r>
           <w:rPr>
             <w:rStyle w:val="Hyperlink"/>
@@ -9687,7 +9794,7 @@
           <w:numId w:val="1005"/>
         </w:numPr>
       </w:pPr>
-      <w:hyperlink r:id="rId95">
+      <w:hyperlink r:id="rId96">
         <w:r>
           <w:rPr>
             <w:rStyle w:val="Hyperlink"/>
@@ -9704,7 +9811,7 @@
           <w:numId w:val="1005"/>
         </w:numPr>
       </w:pPr>
-      <w:hyperlink r:id="rId96">
+      <w:hyperlink r:id="rId97">
         <w:r>
           <w:rPr>
             <w:rStyle w:val="Hyperlink"/>
@@ -9721,7 +9828,7 @@
           <w:numId w:val="1005"/>
         </w:numPr>
       </w:pPr>
-      <w:hyperlink r:id="rId97">
+      <w:hyperlink r:id="rId98">
         <w:r>
           <w:rPr>
             <w:rStyle w:val="Hyperlink"/>
@@ -9738,7 +9845,7 @@
           <w:numId w:val="1005"/>
         </w:numPr>
       </w:pPr>
-      <w:hyperlink r:id="rId98">
+      <w:hyperlink r:id="rId99">
         <w:r>
           <w:rPr>
             <w:rStyle w:val="Hyperlink"/>
@@ -9755,7 +9862,7 @@
           <w:numId w:val="1005"/>
         </w:numPr>
       </w:pPr>
-      <w:hyperlink r:id="rId99">
+      <w:hyperlink r:id="rId100">
         <w:r>
           <w:rPr>
             <w:rStyle w:val="Hyperlink"/>
@@ -9772,7 +9879,7 @@
           <w:numId w:val="1005"/>
         </w:numPr>
       </w:pPr>
-      <w:hyperlink r:id="rId100">
+      <w:hyperlink r:id="rId101">
         <w:r>
           <w:rPr>
             <w:rStyle w:val="Hyperlink"/>
@@ -10020,10 +10127,10 @@
   <w:docDefaults>
     <w:rPrDefault>
       <w:rPr>
-        <w:rFonts w:asciiTheme="minorHAnsi" w:cstheme="minorBidi" w:eastAsiaTheme="minorEastAsia" w:hAnsiTheme="minorHAnsi"/>
+        <w:rFonts w:asciiTheme="minorHAnsi" w:eastAsiaTheme="minorEastAsia" w:hAnsiTheme="minorHAnsi" w:cstheme="minorBidi"/>
         <w:sz w:val="24"/>
         <w:szCs w:val="24"/>
-        <w:lang w:bidi="ar-SA" w:eastAsia="zh-CN" w:val="en-US"/>
+        <w:lang w:val="en-US" w:eastAsia="zh-CN" w:bidi="ar-SA"/>
       </w:rPr>
     </w:rPrDefault>
     <w:pPrDefault>
@@ -10032,35 +10139,35 @@
       </w:pPr>
     </w:pPrDefault>
   </w:docDefaults>
-  <w:latentStyles w:count="276" w:defLockedState="0" w:defQFormat="0" w:defSemiHidden="0" w:defUIPriority="0" w:defUnhideWhenUsed="0"/>
-  <w:style w:default="1" w:styleId="Normal" w:type="paragraph">
+  <w:latentStyles w:defLockedState="0" w:defUIPriority="0" w:defSemiHidden="0" w:defUnhideWhenUsed="0" w:defQFormat="0" w:count="276"/>
+  <w:style w:type="paragraph" w:default="1" w:styleId="Normal">
     <w:name w:val="Normal"/>
     <w:qFormat/>
   </w:style>
-  <w:style w:styleId="BodyText" w:type="paragraph">
+  <w:style w:type="paragraph" w:styleId="BodyText">
     <w:name w:val="Body Text"/>
     <w:basedOn w:val="Normal"/>
     <w:link w:val="BodyTextChar"/>
     <w:qFormat/>
     <w:pPr>
-      <w:spacing w:after="180" w:before="180"/>
+      <w:spacing w:before="180" w:after="180"/>
     </w:pPr>
   </w:style>
-  <w:style w:customStyle="1" w:styleId="FirstParagraph" w:type="paragraph">
+  <w:style w:type="paragraph" w:customStyle="1" w:styleId="FirstParagraph">
     <w:name w:val="First Paragraph"/>
     <w:basedOn w:val="BodyText"/>
     <w:next w:val="BodyText"/>
     <w:qFormat/>
   </w:style>
-  <w:style w:customStyle="1" w:styleId="Compact" w:type="paragraph">
+  <w:style w:type="paragraph" w:customStyle="1" w:styleId="Compact">
     <w:name w:val="Compact"/>
     <w:basedOn w:val="BodyText"/>
     <w:qFormat/>
     <w:pPr>
-      <w:spacing w:after="36" w:before="36"/>
+      <w:spacing w:before="36" w:after="36"/>
     </w:pPr>
   </w:style>
-  <w:style w:styleId="Title" w:type="paragraph">
+  <w:style w:type="paragraph" w:styleId="Title">
     <w:name w:val="Title"/>
     <w:basedOn w:val="Normal"/>
     <w:next w:val="BodyText"/>
@@ -10069,32 +10176,29 @@
     <w:qFormat/>
     <w:rsid w:val="00A10FD9"/>
     <w:pPr>
-      <w:keepNext/>
-      <w:keepLines/>
-      <w:spacing w:after="80" w:before="360"/>
-      <w:outlineLvl w:val="0"/>
+      <w:spacing w:after="80" w:line="240" w:lineRule="auto"/>
+      <w:contextualSpacing/>
+      <w:jc w:val="center"/>
     </w:pPr>
     <w:rPr>
-      <w:rFonts w:asciiTheme="majorHAnsi" w:cstheme="majorBidi" w:eastAsiaTheme="majorEastAsia" w:hAnsiTheme="majorHAnsi"/>
-      <w:color w:val="000000"/>
-      <w:sz w:val="40"/>
-      <w:szCs w:val="40"/>
-      <w:u w:val="none"/>
+      <w:rFonts w:asciiTheme="majorHAnsi" w:eastAsiaTheme="majorEastAsia" w:hAnsiTheme="majorHAnsi" w:cstheme="majorBidi"/>
+      <w:sz w:val="56"/>
+      <w:szCs w:val="56"/>
     </w:rPr>
   </w:style>
-  <w:style w:customStyle="1" w:styleId="TitleChar" w:type="character">
+  <w:style w:type="character" w:customStyle="1" w:styleId="TitleChar">
     <w:name w:val="Title Char"/>
     <w:basedOn w:val="DefaultParagraphFont"/>
     <w:link w:val="Title"/>
     <w:uiPriority w:val="10"/>
     <w:rsid w:val="00A10FD9"/>
     <w:rPr>
-      <w:rFonts w:asciiTheme="majorHAnsi" w:cstheme="majorBidi" w:eastAsiaTheme="majorEastAsia" w:hAnsiTheme="majorHAnsi"/>
+      <w:rFonts w:asciiTheme="majorHAnsi" w:eastAsiaTheme="majorEastAsia" w:hAnsiTheme="majorHAnsi" w:cstheme="majorBidi"/>
       <w:sz w:val="56"/>
       <w:szCs w:val="56"/>
     </w:rPr>
   </w:style>
-  <w:style w:styleId="Subtitle" w:type="paragraph">
+  <w:style w:type="paragraph" w:styleId="Subtitle">
     <w:name w:val="Subtitle"/>
     <w:basedOn w:val="Title"/>
     <w:next w:val="BodyText"/>
@@ -10108,29 +10212,27 @@
       </w:numPr>
     </w:pPr>
     <w:rPr>
-      <w:rFonts w:cstheme="majorBidi" w:eastAsiaTheme="majorEastAsia"/>
-      <w:color w:val="000000"/>
+      <w:rFonts w:eastAsiaTheme="majorEastAsia" w:cstheme="majorBidi"/>
       <w:spacing w:val="15"/>
       <w:sz w:val="28"/>
       <w:szCs w:val="28"/>
-      <w:u w:val="none"/>
     </w:rPr>
   </w:style>
-  <w:style w:customStyle="1" w:styleId="SubtitleChar" w:type="character">
+  <w:style w:type="character" w:customStyle="1" w:styleId="SubtitleChar">
     <w:name w:val="Subtitle Char"/>
     <w:basedOn w:val="DefaultParagraphFont"/>
     <w:link w:val="Subtitle"/>
     <w:uiPriority w:val="11"/>
     <w:rsid w:val="00A10FD9"/>
     <w:rPr>
-      <w:rFonts w:cstheme="majorBidi" w:eastAsiaTheme="majorEastAsia"/>
-      <w:color w:themeColor="text1" w:themeTint="A6" w:val="595959"/>
+      <w:rFonts w:eastAsiaTheme="majorEastAsia" w:cstheme="majorBidi"/>
+      <w:color w:val="595959" w:themeColor="text1" w:themeTint="A6"/>
       <w:spacing w:val="15"/>
       <w:sz w:val="28"/>
       <w:szCs w:val="28"/>
     </w:rPr>
   </w:style>
-  <w:style w:customStyle="1" w:styleId="Author" w:type="paragraph">
+  <w:style w:type="paragraph" w:customStyle="1" w:styleId="Author">
     <w:name w:val="Author"/>
     <w:basedOn w:val="Title"/>
     <w:next w:val="BodyText"/>
@@ -10144,7 +10246,7 @@
       <w:szCs w:val="24"/>
     </w:rPr>
   </w:style>
-  <w:style w:styleId="Date" w:type="paragraph">
+  <w:style w:type="paragraph" w:styleId="Date">
     <w:name w:val="Date"/>
     <w:basedOn w:val="Title"/>
     <w:next w:val="BodyText"/>
@@ -10158,7 +10260,7 @@
       <w:szCs w:val="24"/>
     </w:rPr>
   </w:style>
-  <w:style w:customStyle="1" w:styleId="AbstractTitle" w:type="paragraph">
+  <w:style w:type="paragraph" w:customStyle="1" w:styleId="AbstractTitle">
     <w:name w:val="Abstract Title"/>
     <w:basedOn w:val="Normal"/>
     <w:next w:val="Abstract"/>
@@ -10166,7 +10268,7 @@
     <w:pPr>
       <w:keepNext/>
       <w:keepLines/>
-      <w:spacing w:after="0" w:before="300"/>
+      <w:spacing w:before="300" w:after="0"/>
       <w:jc w:val="center"/>
     </w:pPr>
     <w:rPr>
@@ -10175,7 +10277,7 @@
       <w:szCs w:val="20"/>
     </w:rPr>
   </w:style>
-  <w:style w:customStyle="1" w:styleId="Abstract" w:type="paragraph">
+  <w:style w:type="paragraph" w:customStyle="1" w:styleId="Abstract">
     <w:name w:val="Abstract"/>
     <w:basedOn w:val="Normal"/>
     <w:next w:val="BodyText"/>
@@ -10183,14 +10285,14 @@
     <w:pPr>
       <w:keepNext/>
       <w:keepLines/>
-      <w:spacing w:after="300" w:before="100"/>
+      <w:spacing w:before="100" w:after="300"/>
     </w:pPr>
     <w:rPr>
       <w:sz w:val="20"/>
       <w:szCs w:val="20"/>
     </w:rPr>
   </w:style>
-  <w:style w:styleId="Bibliography" w:type="paragraph">
+  <w:style w:type="paragraph" w:styleId="Bibliography">
     <w:name w:val="Bibliography"/>
     <w:basedOn w:val="Normal"/>
     <w:next w:val="Bibliography"/>
@@ -10198,7 +10300,7 @@
     <w:pPr/>
     <w:rPr/>
   </w:style>
-  <w:style w:styleId="Heading1" w:type="paragraph">
+  <w:style w:type="paragraph" w:styleId="Heading1">
     <w:name w:val="heading 1"/>
     <w:basedOn w:val="Normal"/>
     <w:next w:val="BodyText"/>
@@ -10209,18 +10311,17 @@
     <w:pPr>
       <w:keepNext/>
       <w:keepLines/>
-      <w:spacing w:after="80" w:before="360"/>
+      <w:spacing w:before="360" w:after="80"/>
       <w:outlineLvl w:val="0"/>
     </w:pPr>
     <w:rPr>
-      <w:rFonts w:asciiTheme="majorHAnsi" w:cstheme="majorBidi" w:eastAsiaTheme="majorEastAsia" w:hAnsiTheme="majorHAnsi"/>
-      <w:color w:val="000000"/>
+      <w:rFonts w:asciiTheme="majorHAnsi" w:eastAsiaTheme="majorEastAsia" w:hAnsiTheme="majorHAnsi" w:cstheme="majorBidi"/>
+      <w:color w:val="0F4761" w:themeColor="accent1" w:themeShade="BF"/>
       <w:sz w:val="40"/>
       <w:szCs w:val="40"/>
-      <w:u w:val="none"/>
     </w:rPr>
   </w:style>
-  <w:style w:styleId="Heading2" w:type="paragraph">
+  <w:style w:type="paragraph" w:styleId="Heading2">
     <w:name w:val="heading 2"/>
     <w:basedOn w:val="Normal"/>
     <w:next w:val="BodyText"/>
@@ -10233,18 +10334,17 @@
     <w:pPr>
       <w:keepNext/>
       <w:keepLines/>
-      <w:spacing w:after="80" w:before="160"/>
+      <w:spacing w:before="160" w:after="80"/>
       <w:outlineLvl w:val="1"/>
     </w:pPr>
     <w:rPr>
-      <w:rFonts w:asciiTheme="majorHAnsi" w:cstheme="majorBidi" w:eastAsiaTheme="majorEastAsia" w:hAnsiTheme="majorHAnsi"/>
-      <w:color w:val="000000"/>
+      <w:rFonts w:asciiTheme="majorHAnsi" w:eastAsiaTheme="majorEastAsia" w:hAnsiTheme="majorHAnsi" w:cstheme="majorBidi"/>
+      <w:color w:val="0F4761" w:themeColor="accent1" w:themeShade="BF"/>
       <w:sz w:val="32"/>
       <w:szCs w:val="32"/>
-      <w:u w:val="none"/>
     </w:rPr>
   </w:style>
-  <w:style w:styleId="Heading3" w:type="paragraph">
+  <w:style w:type="paragraph" w:styleId="Heading3">
     <w:name w:val="heading 3"/>
     <w:basedOn w:val="Normal"/>
     <w:next w:val="BodyText"/>
@@ -10257,18 +10357,17 @@
     <w:pPr>
       <w:keepNext/>
       <w:keepLines/>
-      <w:spacing w:after="80" w:before="160"/>
+      <w:spacing w:before="160" w:after="80"/>
       <w:outlineLvl w:val="2"/>
     </w:pPr>
     <w:rPr>
-      <w:rFonts w:cstheme="majorBidi" w:eastAsiaTheme="majorEastAsia"/>
-      <w:color w:val="000000"/>
+      <w:rFonts w:eastAsiaTheme="majorEastAsia" w:cstheme="majorBidi"/>
+      <w:color w:val="0F4761" w:themeColor="accent1" w:themeShade="BF"/>
       <w:sz w:val="28"/>
       <w:szCs w:val="28"/>
-      <w:u w:val="none"/>
     </w:rPr>
   </w:style>
-  <w:style w:styleId="Heading4" w:type="paragraph">
+  <w:style w:type="paragraph" w:styleId="Heading4">
     <w:name w:val="heading 4"/>
     <w:basedOn w:val="Normal"/>
     <w:next w:val="BodyText"/>
@@ -10281,18 +10380,17 @@
     <w:pPr>
       <w:keepNext/>
       <w:keepLines/>
-      <w:spacing w:after="40" w:before="80"/>
+      <w:spacing w:before="80" w:after="40"/>
       <w:outlineLvl w:val="3"/>
     </w:pPr>
     <w:rPr>
-      <w:rFonts w:cstheme="majorBidi" w:eastAsiaTheme="majorEastAsia"/>
+      <w:rFonts w:eastAsiaTheme="majorEastAsia" w:cstheme="majorBidi"/>
       <w:i/>
       <w:iCs/>
-      <w:color w:val="000000"/>
-      <w:u w:val="none"/>
+      <w:color w:val="0F4761" w:themeColor="accent1" w:themeShade="BF"/>
     </w:rPr>
   </w:style>
-  <w:style w:styleId="Heading5" w:type="paragraph">
+  <w:style w:type="paragraph" w:styleId="Heading5">
     <w:name w:val="heading 5"/>
     <w:basedOn w:val="Normal"/>
     <w:next w:val="BodyText"/>
@@ -10305,16 +10403,15 @@
     <w:pPr>
       <w:keepNext/>
       <w:keepLines/>
-      <w:spacing w:after="40" w:before="80"/>
+      <w:spacing w:before="80" w:after="40"/>
       <w:outlineLvl w:val="4"/>
     </w:pPr>
     <w:rPr>
-      <w:rFonts w:cstheme="majorBidi" w:eastAsiaTheme="majorEastAsia"/>
-      <w:color w:val="000000"/>
-      <w:u w:val="none"/>
+      <w:rFonts w:eastAsiaTheme="majorEastAsia" w:cstheme="majorBidi"/>
+      <w:color w:val="0F4761" w:themeColor="accent1" w:themeShade="BF"/>
     </w:rPr>
   </w:style>
-  <w:style w:styleId="Heading6" w:type="paragraph">
+  <w:style w:type="paragraph" w:styleId="Heading6">
     <w:name w:val="heading 6"/>
     <w:basedOn w:val="Normal"/>
     <w:next w:val="BodyText"/>
@@ -10327,18 +10424,17 @@
     <w:pPr>
       <w:keepNext/>
       <w:keepLines/>
-      <w:spacing w:after="0" w:before="40"/>
+      <w:spacing w:before="40" w:after="0"/>
       <w:outlineLvl w:val="5"/>
     </w:pPr>
     <w:rPr>
-      <w:rFonts w:cstheme="majorBidi" w:eastAsiaTheme="majorEastAsia"/>
+      <w:rFonts w:eastAsiaTheme="majorEastAsia" w:cstheme="majorBidi"/>
       <w:i/>
       <w:iCs/>
-      <w:color w:val="000000"/>
-      <w:u w:val="none"/>
+      <w:color w:val="595959" w:themeColor="text1" w:themeTint="A6"/>
     </w:rPr>
   </w:style>
-  <w:style w:styleId="Heading7" w:type="paragraph">
+  <w:style w:type="paragraph" w:styleId="Heading7">
     <w:name w:val="heading 7"/>
     <w:basedOn w:val="Normal"/>
     <w:next w:val="BodyText"/>
@@ -10351,16 +10447,15 @@
     <w:pPr>
       <w:keepNext/>
       <w:keepLines/>
-      <w:spacing w:after="0" w:before="40"/>
+      <w:spacing w:before="40" w:after="0"/>
       <w:outlineLvl w:val="6"/>
     </w:pPr>
     <w:rPr>
-      <w:rFonts w:cstheme="majorBidi" w:eastAsiaTheme="majorEastAsia"/>
-      <w:color w:val="000000"/>
-      <w:u w:val="none"/>
+      <w:rFonts w:eastAsiaTheme="majorEastAsia" w:cstheme="majorBidi"/>
+      <w:color w:val="595959" w:themeColor="text1" w:themeTint="A6"/>
     </w:rPr>
   </w:style>
-  <w:style w:styleId="Heading8" w:type="paragraph">
+  <w:style w:type="paragraph" w:styleId="Heading8">
     <w:name w:val="heading 8"/>
     <w:basedOn w:val="Normal"/>
     <w:next w:val="BodyText"/>
@@ -10377,14 +10472,13 @@
       <w:outlineLvl w:val="7"/>
     </w:pPr>
     <w:rPr>
-      <w:rFonts w:cstheme="majorBidi" w:eastAsiaTheme="majorEastAsia"/>
+      <w:rFonts w:eastAsiaTheme="majorEastAsia" w:cstheme="majorBidi"/>
       <w:i/>
       <w:iCs/>
-      <w:color w:val="000000"/>
-      <w:u w:val="none"/>
+      <w:color w:val="272727" w:themeColor="text1" w:themeTint="D8"/>
     </w:rPr>
   </w:style>
-  <w:style w:styleId="Heading9" w:type="paragraph">
+  <w:style w:type="paragraph" w:styleId="Heading9">
     <w:name w:val="heading 9"/>
     <w:basedOn w:val="Normal"/>
     <w:next w:val="BodyText"/>
@@ -10401,26 +10495,24 @@
       <w:outlineLvl w:val="8"/>
     </w:pPr>
     <w:rPr>
-      <w:rFonts w:cstheme="majorBidi" w:eastAsiaTheme="majorEastAsia"/>
-      <w:color w:val="000000"/>
-      <w:u w:val="none"/>
+      <w:rFonts w:eastAsiaTheme="majorEastAsia" w:cstheme="majorBidi"/>
+      <w:color w:val="272727" w:themeColor="text1" w:themeTint="D8"/>
     </w:rPr>
   </w:style>
-  <w:style w:customStyle="1" w:styleId="Heading1Char" w:type="character">
+  <w:style w:type="character" w:customStyle="1" w:styleId="Heading1Char">
     <w:name w:val="Heading 1 Char"/>
     <w:basedOn w:val="DefaultParagraphFont"/>
     <w:link w:val="Heading1"/>
     <w:uiPriority w:val="9"/>
     <w:rsid w:val="00A10FD9"/>
     <w:rPr>
-      <w:rFonts w:asciiTheme="majorHAnsi" w:cstheme="majorBidi" w:eastAsiaTheme="majorEastAsia" w:hAnsiTheme="majorHAnsi"/>
-      <w:color w:val="000000"/>
+      <w:rFonts w:asciiTheme="majorHAnsi" w:eastAsiaTheme="majorEastAsia" w:hAnsiTheme="majorHAnsi" w:cstheme="majorBidi"/>
+      <w:color w:val="0F4761" w:themeColor="accent1" w:themeShade="BF"/>
       <w:sz w:val="40"/>
       <w:szCs w:val="40"/>
-      <w:u w:val="none"/>
     </w:rPr>
   </w:style>
-  <w:style w:customStyle="1" w:styleId="Heading2Char" w:type="character">
+  <w:style w:type="character" w:customStyle="1" w:styleId="Heading2Char">
     <w:name w:val="Heading 2 Char"/>
     <w:basedOn w:val="DefaultParagraphFont"/>
     <w:link w:val="Heading2"/>
@@ -10428,14 +10520,13 @@
     <w:semiHidden/>
     <w:rsid w:val="00A10FD9"/>
     <w:rPr>
-      <w:rFonts w:asciiTheme="majorHAnsi" w:cstheme="majorBidi" w:eastAsiaTheme="majorEastAsia" w:hAnsiTheme="majorHAnsi"/>
-      <w:color w:val="000000"/>
+      <w:rFonts w:asciiTheme="majorHAnsi" w:eastAsiaTheme="majorEastAsia" w:hAnsiTheme="majorHAnsi" w:cstheme="majorBidi"/>
+      <w:color w:val="0F4761" w:themeColor="accent1" w:themeShade="BF"/>
       <w:sz w:val="32"/>
       <w:szCs w:val="32"/>
-      <w:u w:val="none"/>
     </w:rPr>
   </w:style>
-  <w:style w:customStyle="1" w:styleId="Heading3Char" w:type="character">
+  <w:style w:type="character" w:customStyle="1" w:styleId="Heading3Char">
     <w:name w:val="Heading 3 Char"/>
     <w:basedOn w:val="DefaultParagraphFont"/>
     <w:link w:val="Heading3"/>
@@ -10443,14 +10534,13 @@
     <w:semiHidden/>
     <w:rsid w:val="00A10FD9"/>
     <w:rPr>
-      <w:rFonts w:cstheme="majorBidi" w:eastAsiaTheme="majorEastAsia"/>
-      <w:color w:val="000000"/>
+      <w:rFonts w:eastAsiaTheme="majorEastAsia" w:cstheme="majorBidi"/>
+      <w:color w:val="0F4761" w:themeColor="accent1" w:themeShade="BF"/>
       <w:sz w:val="28"/>
       <w:szCs w:val="28"/>
-      <w:u w:val="none"/>
     </w:rPr>
   </w:style>
-  <w:style w:customStyle="1" w:styleId="Heading4Char" w:type="character">
+  <w:style w:type="character" w:customStyle="1" w:styleId="Heading4Char">
     <w:name w:val="Heading 4 Char"/>
     <w:basedOn w:val="DefaultParagraphFont"/>
     <w:link w:val="Heading4"/>
@@ -10458,14 +10548,13 @@
     <w:semiHidden/>
     <w:rsid w:val="00A10FD9"/>
     <w:rPr>
-      <w:rFonts w:cstheme="majorBidi" w:eastAsiaTheme="majorEastAsia"/>
+      <w:rFonts w:eastAsiaTheme="majorEastAsia" w:cstheme="majorBidi"/>
       <w:i/>
       <w:iCs/>
-      <w:color w:val="000000"/>
-      <w:u w:val="none"/>
+      <w:color w:val="0F4761" w:themeColor="accent1" w:themeShade="BF"/>
     </w:rPr>
   </w:style>
-  <w:style w:customStyle="1" w:styleId="Heading5Char" w:type="character">
+  <w:style w:type="character" w:customStyle="1" w:styleId="Heading5Char">
     <w:name w:val="Heading 5 Char"/>
     <w:basedOn w:val="DefaultParagraphFont"/>
     <w:link w:val="Heading5"/>
@@ -10473,12 +10562,11 @@
     <w:semiHidden/>
     <w:rsid w:val="00A10FD9"/>
     <w:rPr>
-      <w:rFonts w:cstheme="majorBidi" w:eastAsiaTheme="majorEastAsia"/>
-      <w:color w:val="000000"/>
-      <w:u w:val="none"/>
+      <w:rFonts w:eastAsiaTheme="majorEastAsia" w:cstheme="majorBidi"/>
+      <w:color w:val="0F4761" w:themeColor="accent1" w:themeShade="BF"/>
     </w:rPr>
   </w:style>
-  <w:style w:customStyle="1" w:styleId="Heading6Char" w:type="character">
+  <w:style w:type="character" w:customStyle="1" w:styleId="Heading6Char">
     <w:name w:val="Heading 6 Char"/>
     <w:basedOn w:val="DefaultParagraphFont"/>
     <w:link w:val="Heading6"/>
@@ -10486,14 +10574,13 @@
     <w:semiHidden/>
     <w:rsid w:val="00A10FD9"/>
     <w:rPr>
-      <w:rFonts w:cstheme="majorBidi" w:eastAsiaTheme="majorEastAsia"/>
+      <w:rFonts w:eastAsiaTheme="majorEastAsia" w:cstheme="majorBidi"/>
       <w:i/>
       <w:iCs/>
-      <w:color w:val="000000"/>
-      <w:u w:val="none"/>
+      <w:color w:val="595959" w:themeColor="text1" w:themeTint="A6"/>
     </w:rPr>
   </w:style>
-  <w:style w:customStyle="1" w:styleId="Heading7Char" w:type="character">
+  <w:style w:type="character" w:customStyle="1" w:styleId="Heading7Char">
     <w:name w:val="Heading 7 Char"/>
     <w:basedOn w:val="DefaultParagraphFont"/>
     <w:link w:val="Heading7"/>
@@ -10501,12 +10588,11 @@
     <w:semiHidden/>
     <w:rsid w:val="00A10FD9"/>
     <w:rPr>
-      <w:rFonts w:cstheme="majorBidi" w:eastAsiaTheme="majorEastAsia"/>
-      <w:color w:val="000000"/>
-      <w:u w:val="none"/>
+      <w:rFonts w:eastAsiaTheme="majorEastAsia" w:cstheme="majorBidi"/>
+      <w:color w:val="595959" w:themeColor="text1" w:themeTint="A6"/>
     </w:rPr>
   </w:style>
-  <w:style w:customStyle="1" w:styleId="Heading8Char" w:type="character">
+  <w:style w:type="character" w:customStyle="1" w:styleId="Heading8Char">
     <w:name w:val="Heading 8 Char"/>
     <w:basedOn w:val="DefaultParagraphFont"/>
     <w:link w:val="Heading8"/>
@@ -10514,14 +10600,13 @@
     <w:semiHidden/>
     <w:rsid w:val="00A10FD9"/>
     <w:rPr>
-      <w:rFonts w:cstheme="majorBidi" w:eastAsiaTheme="majorEastAsia"/>
+      <w:rFonts w:eastAsiaTheme="majorEastAsia" w:cstheme="majorBidi"/>
       <w:i/>
       <w:iCs/>
-      <w:color w:val="000000"/>
-      <w:u w:val="none"/>
+      <w:color w:val="272727" w:themeColor="text1" w:themeTint="D8"/>
     </w:rPr>
   </w:style>
-  <w:style w:customStyle="1" w:styleId="Heading9Char" w:type="character">
+  <w:style w:type="character" w:customStyle="1" w:styleId="Heading9Char">
     <w:name w:val="Heading 9 Char"/>
     <w:basedOn w:val="DefaultParagraphFont"/>
     <w:link w:val="Heading9"/>
@@ -10529,12 +10614,11 @@
     <w:semiHidden/>
     <w:rsid w:val="00A10FD9"/>
     <w:rPr>
-      <w:rFonts w:cstheme="majorBidi" w:eastAsiaTheme="majorEastAsia"/>
-      <w:color w:val="000000"/>
-      <w:u w:val="none"/>
+      <w:rFonts w:eastAsiaTheme="majorEastAsia" w:cstheme="majorBidi"/>
+      <w:color w:val="272727" w:themeColor="text1" w:themeTint="D8"/>
     </w:rPr>
   </w:style>
-  <w:style w:styleId="BlockText" w:type="paragraph">
+  <w:style w:type="paragraph" w:styleId="BlockText">
     <w:name w:val="Block Text"/>
     <w:basedOn w:val="BodyText"/>
     <w:next w:val="BodyText"/>
@@ -10542,11 +10626,11 @@
     <w:unhideWhenUsed/>
     <w:qFormat/>
     <w:pPr>
-      <w:spacing w:after="100" w:before="100"/>
+      <w:spacing w:before="100" w:after="100"/>
       <w:ind w:firstLine="0" w:left="480" w:right="480"/>
     </w:pPr>
   </w:style>
-  <w:style w:styleId="FootnoteText" w:type="paragraph">
+  <w:style w:type="paragraph" w:styleId="FootnoteText">
     <w:name w:val="Footnote Text"/>
     <w:basedOn w:val="Normal"/>
     <w:next w:val="FootnoteText"/>
@@ -10554,7 +10638,7 @@
     <w:unhideWhenUsed/>
     <w:qFormat/>
   </w:style>
-  <w:style w:styleId="FootnoteBlockText" w:type="paragraph">
+  <w:style w:type="paragraph" w:styleId="FootnoteBlockText">
     <w:name w:val="Footnote Block Text"/>
     <w:basedOn w:val="FootnoteText"/>
     <w:next w:val="FootnoteText"/>
@@ -10562,28 +10646,26 @@
     <w:unhideWhenUsed/>
     <w:qFormat/>
     <w:pPr>
-      <w:spacing w:after="100" w:before="100"/>
+      <w:spacing w:before="100" w:after="100"/>
       <w:ind w:firstLine="0" w:left="480" w:right="480"/>
     </w:pPr>
   </w:style>
-  <w:style w:default="1" w:styleId="DefaultParagraphFont" w:type="character">
+  <w:style w:type="character" w:default="1" w:styleId="DefaultParagraphFont">
     <w:name w:val="Default Paragraph Font"/>
     <w:semiHidden/>
     <w:unhideWhenUsed/>
   </w:style>
-  <w:style w:default="1" w:styleId="Table" w:type="table">
+  <w:style w:type="table" w:default="1" w:styleId="Table">
     <w:name w:val="Table"/>
     <w:basedOn w:val="TableNormal"/>
-    <w:semiHidden/>
-    <w:unhideWhenUsed/>
     <w:qFormat/>
     <w:tblPr>
-      <w:tblInd w:type="dxa" w:w="0"/>
+      <w:tblInd w:w="0" w:type="dxa"/>
       <w:tblCellMar>
-        <w:top w:type="dxa" w:w="0"/>
-        <w:left w:type="dxa" w:w="108"/>
-        <w:bottom w:type="dxa" w:w="0"/>
-        <w:right w:type="dxa" w:w="108"/>
+        <w:top w:w="0" w:type="dxa"/>
+        <w:left w:w="108" w:type="dxa"/>
+        <w:bottom w:w="0" w:type="dxa"/>
+        <w:right w:w="108" w:type="dxa"/>
       </w:tblCellMar>
     </w:tblPr>
     <w:tblStylePr w:type="firstRow">
@@ -10595,7 +10677,7 @@
       </w:tcPr>
     </w:tblStylePr>
   </w:style>
-  <w:style w:customStyle="1" w:styleId="DefinitionTerm" w:type="paragraph">
+  <w:style w:type="paragraph" w:customStyle="1" w:styleId="DefinitionTerm">
     <w:name w:val="Definition Term"/>
     <w:basedOn w:val="Normal"/>
     <w:next w:val="Definition"/>
@@ -10608,49 +10690,49 @@
       <w:b/>
     </w:rPr>
   </w:style>
-  <w:style w:customStyle="1" w:styleId="Definition" w:type="paragraph">
+  <w:style w:type="paragraph" w:customStyle="1" w:styleId="Definition">
     <w:name w:val="Definition"/>
     <w:basedOn w:val="Normal"/>
   </w:style>
-  <w:style w:styleId="Caption" w:type="paragraph">
+  <w:style w:type="paragraph" w:styleId="Caption">
     <w:name w:val="Caption"/>
     <w:basedOn w:val="Normal"/>
     <w:link w:val="BodyTextChar"/>
     <w:pPr>
-      <w:spacing w:after="120" w:before="0"/>
+      <w:spacing w:before="0" w:after="120"/>
     </w:pPr>
     <w:rPr>
       <w:i/>
     </w:rPr>
   </w:style>
-  <w:style w:customStyle="1" w:styleId="TableCaption" w:type="paragraph">
+  <w:style w:type="paragraph" w:customStyle="1" w:styleId="TableCaption">
     <w:name w:val="Table Caption"/>
     <w:basedOn w:val="Caption"/>
     <w:pPr>
       <w:keepNext/>
     </w:pPr>
   </w:style>
-  <w:style w:customStyle="1" w:styleId="ImageCaption" w:type="paragraph">
+  <w:style w:type="paragraph" w:customStyle="1" w:styleId="ImageCaption">
     <w:name w:val="Image Caption"/>
     <w:basedOn w:val="Caption"/>
   </w:style>
-  <w:style w:customStyle="1" w:styleId="Figure" w:type="paragraph">
+  <w:style w:type="paragraph" w:customStyle="1" w:styleId="Figure">
     <w:name w:val="Figure"/>
     <w:basedOn w:val="Normal"/>
   </w:style>
-  <w:style w:customStyle="1" w:styleId="CaptionedFigure" w:type="paragraph">
+  <w:style w:type="paragraph" w:customStyle="1" w:styleId="CaptionedFigure">
     <w:name w:val="Captioned Figure"/>
     <w:basedOn w:val="Figure"/>
     <w:pPr>
       <w:keepNext/>
     </w:pPr>
   </w:style>
-  <w:style w:customStyle="1" w:styleId="BodyTextChar" w:type="character">
+  <w:style w:type="character" w:customStyle="1" w:styleId="BodyTextChar">
     <w:name w:val="Body Text Char"/>
     <w:basedOn w:val="DefaultParagraphFont"/>
     <w:link w:val="BodyText"/>
   </w:style>
-  <w:style w:customStyle="1" w:styleId="VerbatimChar" w:type="character">
+  <w:style w:type="character" w:customStyle="1" w:styleId="VerbatimChar">
     <w:name w:val="Verbatim Char"/>
     <w:basedOn w:val="BodyTextChar"/>
     <w:rPr>
@@ -10658,25 +10740,25 @@
       <w:sz w:val="22"/>
     </w:rPr>
   </w:style>
-  <w:style w:customStyle="1" w:styleId="SectionNumber" w:type="character">
+  <w:style w:type="character" w:customStyle="1" w:styleId="SectionNumber">
     <w:name w:val="Section Number"/>
     <w:basedOn w:val="BodyTextChar"/>
   </w:style>
-  <w:style w:styleId="FootnoteReference" w:type="character">
+  <w:style w:type="character" w:styleId="FootnoteReference">
     <w:name w:val="Footnote Reference"/>
     <w:basedOn w:val="BodyTextChar"/>
     <w:rPr>
       <w:vertAlign w:val="superscript"/>
     </w:rPr>
   </w:style>
-  <w:style w:styleId="Hyperlink" w:type="character">
+  <w:style w:type="character" w:styleId="Hyperlink">
     <w:name w:val="Hyperlink"/>
     <w:basedOn w:val="BodyTextChar"/>
     <w:rPr>
-      <w:color w:themeColor="accent1" w:val="4F81BD"/>
+      <w:color w:val="4F81BD" w:themeColor="accent1"/>
     </w:rPr>
   </w:style>
-  <w:style w:styleId="TOCHeading" w:type="paragraph">
+  <w:style w:type="paragraph" w:styleId="TOCHeading">
     <w:name w:val="TOC Heading"/>
     <w:basedOn w:val="Heading1"/>
     <w:next w:val="BodyText"/>
@@ -10688,13 +10770,13 @@
       <w:outlineLvl w:val="9"/>
     </w:pPr>
     <w:rPr>
-      <w:rFonts w:asciiTheme="majorHAnsi" w:cstheme="majorBidi" w:eastAsiaTheme="majorEastAsia" w:hAnsiTheme="majorHAnsi"/>
+      <w:rFonts w:asciiTheme="majorHAnsi" w:eastAsiaTheme="majorEastAsia" w:hAnsiTheme="majorHAnsi" w:cstheme="majorBidi"/>
       <w:b w:val="0"/>
       <w:bCs w:val="0"/>
-      <w:color w:themeColor="accent1" w:themeShade="BF" w:val="365F91"/>
+      <w:color w:val="365F91" w:themeColor="accent1" w:themeShade="BF"/>
     </w:rPr>
   </w:style>
-  <w:style w:customStyle="1" w:styleId="SourceCode" w:type="paragraph">
+  <w:style w:type="paragraph" w:customStyle="1" w:styleId="SourceCode">
     <w:name w:val="Source Code"/>
     <w:basedOn w:val="Normal"/>
     <w:link w:val="VerbatimChar"/>
@@ -10702,7 +10784,7 @@
       <w:wordWrap w:val="off"/>
     </w:pPr>
   </w:style>
-  <w:style w:customStyle="1" w:styleId="KeywordTok" w:type="character">
+  <w:style w:type="character" w:customStyle="1" w:styleId="KeywordTok">
     <w:name w:val="KeywordTok"/>
     <w:basedOn w:val="VerbatimChar"/>
     <w:rPr>
@@ -10710,77 +10792,77 @@
       <w:color w:val="007020"/>
     </w:rPr>
   </w:style>
-  <w:style w:customStyle="1" w:styleId="DataTypeTok" w:type="character">
+  <w:style w:type="character" w:customStyle="1" w:styleId="DataTypeTok">
     <w:name w:val="DataTypeTok"/>
     <w:basedOn w:val="VerbatimChar"/>
     <w:rPr>
       <w:color w:val="902000"/>
     </w:rPr>
   </w:style>
-  <w:style w:customStyle="1" w:styleId="DecValTok" w:type="character">
+  <w:style w:type="character" w:customStyle="1" w:styleId="DecValTok">
     <w:name w:val="DecValTok"/>
     <w:basedOn w:val="VerbatimChar"/>
     <w:rPr>
       <w:color w:val="40a070"/>
     </w:rPr>
   </w:style>
-  <w:style w:customStyle="1" w:styleId="BaseNTok" w:type="character">
+  <w:style w:type="character" w:customStyle="1" w:styleId="BaseNTok">
     <w:name w:val="BaseNTok"/>
     <w:basedOn w:val="VerbatimChar"/>
     <w:rPr>
       <w:color w:val="40a070"/>
     </w:rPr>
   </w:style>
-  <w:style w:customStyle="1" w:styleId="FloatTok" w:type="character">
+  <w:style w:type="character" w:customStyle="1" w:styleId="FloatTok">
     <w:name w:val="FloatTok"/>
     <w:basedOn w:val="VerbatimChar"/>
     <w:rPr>
       <w:color w:val="40a070"/>
     </w:rPr>
   </w:style>
-  <w:style w:customStyle="1" w:styleId="ConstantTok" w:type="character">
+  <w:style w:type="character" w:customStyle="1" w:styleId="ConstantTok">
     <w:name w:val="ConstantTok"/>
     <w:basedOn w:val="VerbatimChar"/>
     <w:rPr>
       <w:color w:val="880000"/>
     </w:rPr>
   </w:style>
-  <w:style w:customStyle="1" w:styleId="CharTok" w:type="character">
+  <w:style w:type="character" w:customStyle="1" w:styleId="CharTok">
     <w:name w:val="CharTok"/>
     <w:basedOn w:val="VerbatimChar"/>
     <w:rPr>
       <w:color w:val="4070a0"/>
     </w:rPr>
   </w:style>
-  <w:style w:customStyle="1" w:styleId="SpecialCharTok" w:type="character">
+  <w:style w:type="character" w:customStyle="1" w:styleId="SpecialCharTok">
     <w:name w:val="SpecialCharTok"/>
     <w:basedOn w:val="VerbatimChar"/>
     <w:rPr>
       <w:color w:val="4070a0"/>
     </w:rPr>
   </w:style>
-  <w:style w:customStyle="1" w:styleId="StringTok" w:type="character">
+  <w:style w:type="character" w:customStyle="1" w:styleId="StringTok">
     <w:name w:val="StringTok"/>
     <w:basedOn w:val="VerbatimChar"/>
     <w:rPr>
       <w:color w:val="4070a0"/>
     </w:rPr>
   </w:style>
-  <w:style w:customStyle="1" w:styleId="VerbatimStringTok" w:type="character">
+  <w:style w:type="character" w:customStyle="1" w:styleId="VerbatimStringTok">
     <w:name w:val="VerbatimStringTok"/>
     <w:basedOn w:val="VerbatimChar"/>
     <w:rPr>
       <w:color w:val="4070a0"/>
     </w:rPr>
   </w:style>
-  <w:style w:customStyle="1" w:styleId="SpecialStringTok" w:type="character">
+  <w:style w:type="character" w:customStyle="1" w:styleId="SpecialStringTok">
     <w:name w:val="SpecialStringTok"/>
     <w:basedOn w:val="VerbatimChar"/>
     <w:rPr>
       <w:color w:val="bb6688"/>
     </w:rPr>
   </w:style>
-  <w:style w:customStyle="1" w:styleId="ImportTok" w:type="character">
+  <w:style w:type="character" w:customStyle="1" w:styleId="ImportTok">
     <w:name w:val="ImportTok"/>
     <w:basedOn w:val="VerbatimChar"/>
     <w:rPr>
@@ -10788,7 +10870,7 @@
       <w:color w:val="008000"/>
     </w:rPr>
   </w:style>
-  <w:style w:customStyle="1" w:styleId="CommentTok" w:type="character">
+  <w:style w:type="character" w:customStyle="1" w:styleId="CommentTok">
     <w:name w:val="CommentTok"/>
     <w:basedOn w:val="VerbatimChar"/>
     <w:rPr>
@@ -10796,7 +10878,7 @@
       <w:color w:val="60a0b0"/>
     </w:rPr>
   </w:style>
-  <w:style w:customStyle="1" w:styleId="DocumentationTok" w:type="character">
+  <w:style w:type="character" w:customStyle="1" w:styleId="DocumentationTok">
     <w:name w:val="DocumentationTok"/>
     <w:basedOn w:val="VerbatimChar"/>
     <w:rPr>
@@ -10804,7 +10886,7 @@
       <w:color w:val="ba2121"/>
     </w:rPr>
   </w:style>
-  <w:style w:customStyle="1" w:styleId="AnnotationTok" w:type="character">
+  <w:style w:type="character" w:customStyle="1" w:styleId="AnnotationTok">
     <w:name w:val="AnnotationTok"/>
     <w:basedOn w:val="VerbatimChar"/>
     <w:rPr>
@@ -10813,7 +10895,7 @@
       <w:color w:val="60a0b0"/>
     </w:rPr>
   </w:style>
-  <w:style w:customStyle="1" w:styleId="CommentVarTok" w:type="character">
+  <w:style w:type="character" w:customStyle="1" w:styleId="CommentVarTok">
     <w:name w:val="CommentVarTok"/>
     <w:basedOn w:val="VerbatimChar"/>
     <w:rPr>
@@ -10822,28 +10904,28 @@
       <w:color w:val="60a0b0"/>
     </w:rPr>
   </w:style>
-  <w:style w:customStyle="1" w:styleId="OtherTok" w:type="character">
+  <w:style w:type="character" w:customStyle="1" w:styleId="OtherTok">
     <w:name w:val="OtherTok"/>
     <w:basedOn w:val="VerbatimChar"/>
     <w:rPr>
       <w:color w:val="007020"/>
     </w:rPr>
   </w:style>
-  <w:style w:customStyle="1" w:styleId="FunctionTok" w:type="character">
+  <w:style w:type="character" w:customStyle="1" w:styleId="FunctionTok">
     <w:name w:val="FunctionTok"/>
     <w:basedOn w:val="VerbatimChar"/>
     <w:rPr>
       <w:color w:val="06287e"/>
     </w:rPr>
   </w:style>
-  <w:style w:customStyle="1" w:styleId="VariableTok" w:type="character">
+  <w:style w:type="character" w:customStyle="1" w:styleId="VariableTok">
     <w:name w:val="VariableTok"/>
     <w:basedOn w:val="VerbatimChar"/>
     <w:rPr>
       <w:color w:val="19177c"/>
     </w:rPr>
   </w:style>
-  <w:style w:customStyle="1" w:styleId="ControlFlowTok" w:type="character">
+  <w:style w:type="character" w:customStyle="1" w:styleId="ControlFlowTok">
     <w:name w:val="ControlFlowTok"/>
     <w:basedOn w:val="VerbatimChar"/>
     <w:rPr>
@@ -10851,45 +10933,45 @@
       <w:color w:val="007020"/>
     </w:rPr>
   </w:style>
-  <w:style w:customStyle="1" w:styleId="OperatorTok" w:type="character">
+  <w:style w:type="character" w:customStyle="1" w:styleId="OperatorTok">
     <w:name w:val="OperatorTok"/>
     <w:basedOn w:val="VerbatimChar"/>
     <w:rPr>
       <w:color w:val="666666"/>
     </w:rPr>
   </w:style>
-  <w:style w:customStyle="1" w:styleId="BuiltInTok" w:type="character">
+  <w:style w:type="character" w:customStyle="1" w:styleId="BuiltInTok">
     <w:name w:val="BuiltInTok"/>
     <w:basedOn w:val="VerbatimChar"/>
     <w:rPr>
       <w:color w:val="008000"/>
     </w:rPr>
   </w:style>
-  <w:style w:customStyle="1" w:styleId="ExtensionTok" w:type="character">
+  <w:style w:type="character" w:customStyle="1" w:styleId="ExtensionTok">
     <w:name w:val="ExtensionTok"/>
     <w:basedOn w:val="VerbatimChar"/>
     <w:rPr/>
   </w:style>
-  <w:style w:customStyle="1" w:styleId="PreprocessorTok" w:type="character">
+  <w:style w:type="character" w:customStyle="1" w:styleId="PreprocessorTok">
     <w:name w:val="PreprocessorTok"/>
     <w:basedOn w:val="VerbatimChar"/>
     <w:rPr>
       <w:color w:val="bc7a00"/>
     </w:rPr>
   </w:style>
-  <w:style w:customStyle="1" w:styleId="AttributeTok" w:type="character">
+  <w:style w:type="character" w:customStyle="1" w:styleId="AttributeTok">
     <w:name w:val="AttributeTok"/>
     <w:basedOn w:val="VerbatimChar"/>
     <w:rPr>
       <w:color w:val="7d9029"/>
     </w:rPr>
   </w:style>
-  <w:style w:customStyle="1" w:styleId="RegionMarkerTok" w:type="character">
+  <w:style w:type="character" w:customStyle="1" w:styleId="RegionMarkerTok">
     <w:name w:val="RegionMarkerTok"/>
     <w:basedOn w:val="VerbatimChar"/>
     <w:rPr/>
   </w:style>
-  <w:style w:customStyle="1" w:styleId="InformationTok" w:type="character">
+  <w:style w:type="character" w:customStyle="1" w:styleId="InformationTok">
     <w:name w:val="InformationTok"/>
     <w:basedOn w:val="VerbatimChar"/>
     <w:rPr>
@@ -10898,7 +10980,7 @@
       <w:color w:val="60a0b0"/>
     </w:rPr>
   </w:style>
-  <w:style w:customStyle="1" w:styleId="WarningTok" w:type="character">
+  <w:style w:type="character" w:customStyle="1" w:styleId="WarningTok">
     <w:name w:val="WarningTok"/>
     <w:basedOn w:val="VerbatimChar"/>
     <w:rPr>
@@ -10907,7 +10989,7 @@
       <w:color w:val="60a0b0"/>
     </w:rPr>
   </w:style>
-  <w:style w:customStyle="1" w:styleId="AlertTok" w:type="character">
+  <w:style w:type="character" w:customStyle="1" w:styleId="AlertTok">
     <w:name w:val="AlertTok"/>
     <w:basedOn w:val="VerbatimChar"/>
     <w:rPr>
@@ -10915,7 +10997,7 @@
       <w:color w:val="ff0000"/>
     </w:rPr>
   </w:style>
-  <w:style w:customStyle="1" w:styleId="ErrorTok" w:type="character">
+  <w:style w:type="character" w:customStyle="1" w:styleId="ErrorTok">
     <w:name w:val="ErrorTok"/>
     <w:basedOn w:val="VerbatimChar"/>
     <w:rPr>
@@ -10923,7 +11005,7 @@
       <w:color w:val="ff0000"/>
     </w:rPr>
   </w:style>
-  <w:style w:customStyle="1" w:styleId="NormalTok" w:type="character">
+  <w:style w:type="character" w:customStyle="1" w:styleId="NormalTok">
     <w:name w:val="NormalTok"/>
     <w:basedOn w:val="VerbatimChar"/>
     <w:rPr/>

</xml_diff>

<commit_message>
Koppel begrazing Vallei Langestrook Loopert
</commit_message>
<xml_diff>
--- a/docs/MEIJENDEL_BRONREGISTER.docx
+++ b/docs/MEIJENDEL_BRONREGISTER.docx
@@ -6471,7 +6471,7 @@
         <w:t xml:space="preserve"> </w:t>
       </w:r>
       <w:r>
-        <w:t xml:space="preserve">bevat 152 geverifieerde directe relaties. Daarvan waren 36 al onderbouwd met expliciete kavelvermeldingen, gebruikersvaststellingen of een bijzondere gebiedsnaam. De nameninventaris voegt 42 geometrische doorsnijdingen toe voor zeven volledig en letterlijk gelokaliseerde uitvoeringen. De tien nieuwe relaties betreffen het onderzochte zoekgebied van het niet uitgevoerde PAS-maaibeheer 23: M10-12-76, M12a, M62, M63, M64, M65, M72, M73, M74 en M75. De vier jaarregels 2016–2019 blijven</w:t>
+        <w:t xml:space="preserve">bevat 165 geverifieerde directe relaties. Daarvan waren 36 al onderbouwd met expliciete kavelvermeldingen, gebruikersvaststellingen of een bijzondere gebiedsnaam. De nameninventaris voegt 42 geometrische doorsnijdingen toe voor zeven volledig en letterlijk gelokaliseerde uitvoeringen. De tien nieuwe relaties betreffen het onderzochte zoekgebied van het niet uitgevoerde PAS-maaibeheer 23: M10-12-76, M12a, M62, M63, M64, M65, M72, M73, M74 en M75. De vier jaarregels 2016–2019 blijven</w:t>
       </w:r>
       <w:r>
         <w:t xml:space="preserve"> </w:t>
@@ -6498,7 +6498,7 @@
         <w:t xml:space="preserve"> </w:t>
       </w:r>
       <w:r>
-        <w:t xml:space="preserve">voor beide leeg. De begrazing van Vallei Meijendel met 38 heideschapen is gekoppeld aan de negen actuele kavels M3, M4-5, M51, M52, M53, M54a, M54b, M55 en M85. De historische voorgangers M4, M5 en M54 zijn niet gekoppeld, zodat dezelfde ruimte niet dubbel wordt geregistreerd. Omdat de evaluatie geen beginjaar en geen exacte begrazingsvoetafdruk geeft, ontstaan geen plot-jaarrijen en blijven de doorsnijdingspercentages leeg. De geometrische naamkoppelingen gebruiken de actuele SOVON-plotgeometrie</w:t>
+        <w:t xml:space="preserve">voor beide leeg. De begrazing van Vallei Meijendel met 38 heideschapen is gekoppeld aan de negen actuele kavels M3, M4-5, M51, M52, M53, M54a, M54b, M55 en M85. De historische voorgangers M4, M5 en M54 zijn niet gekoppeld, zodat dezelfde ruimte niet dubbel wordt geregistreerd. Omdat de evaluatie geen beginjaar en geen exacte begrazingsvoetafdruk geeft, ontstaan geen plot-jaarrijen en blijven de doorsnijdingspercentages leeg. Maatregel 3c, jaarlijkse begrazing van 110 hectare in Vallei Meijendel, Langestrook en De Loopert, is gekoppeld aan dezelfde negen actuele Vallei-kavels en aan M1a, M1b, M45 en M83. De vijf uitgevoerde jaren 2017–2021 leveren 65 plot-jaarrijen. Zij beschrijven uitsluitend de gezamenlijke uitvoeringsscope, omdat de evaluatie de 110 hectare en het jaarlijkse werk niet over gebieden of kavels verdeelt. De geometrische naamkoppelingen gebruiken de actuele SOVON-plotgeometrie</w:t>
       </w:r>
       <w:r>
         <w:t xml:space="preserve"> </w:t>
@@ -7369,7 +7369,7 @@
         <w:pStyle w:val="BodyText"/>
       </w:pPr>
       <w:r>
-        <w:t xml:space="preserve">De 152 plotkoppelingen en 88 uitgevoerde jaarregels leveren samen 186 regels in</w:t>
+        <w:t xml:space="preserve">De 165 plotkoppelingen en 88 uitgevoerde jaarregels leveren samen 251 regels in</w:t>
       </w:r>
       <w:r>
         <w:t xml:space="preserve"> </w:t>
@@ -7381,7 +7381,7 @@
         <w:t xml:space="preserve">v_plot_jaar_maatregel_bronvast</w:t>
       </w:r>
       <w:r>
-        <w:t xml:space="preserve">. De negen koppelingen van de begrazing van Vallei Meijendel voegen geen plot-jaarrijen toe, omdat de bron geen beginjaar geeft. De tien koppelingen van het onderzochte PAS-maaibeheer 23 voegen evenmin plot-jaarrijen toe, omdat alle vier jaarregels 2016–2019</w:t>
+        <w:t xml:space="preserve">. De negen koppelingen van de begrazing van Vallei Meijendel voegen geen plot-jaarrijen toe, omdat de bron geen beginjaar geeft. Maatregel 3c voegt voor 2017–2021 65 scoperegels voor dertien kavels toe; de bron verdeelt de 110 hectare niet over de drie gebieden, kavels of jaren. De tien koppelingen van het onderzochte PAS-maaibeheer 23 voegen geen plot-jaarrijen toe, omdat alle vier jaarregels 2016–2019</w:t>
       </w:r>
       <w:r>
         <w:t xml:space="preserve"> </w:t>
@@ -7492,7 +7492,7 @@
         <w:t xml:space="preserve"> </w:t>
       </w:r>
       <w:r>
-        <w:t xml:space="preserve">Bronvast op project-, uitvoering- en jaarniveau voor 39 ingevoerde bronnen en 64 uitvoeringen. De algemene kavel- en gebiedsindeling is geometrisch beschikbaar voor de 55 actuele plots uit 2025; vijf expliciet gekoppelde historische kavels hebben geen afzonderlijke geometrie. De bronvaste plot-jaarlaag bevat 186 regels voor 1967–1969, 1972–1975, 1988–1991, 1993, 1997, 2002, 2005–2006, 2013–2014 en 2016–2025. Het onderzochte PAS-maaibeheer 23 levert geen plot-jaarrijen op, omdat de vier jaarregels 2016–2019</w:t>
+        <w:t xml:space="preserve">Bronvast op project-, uitvoering- en jaarniveau voor 39 ingevoerde bronnen en 64 uitvoeringen. De algemene kavel- en gebiedsindeling is geometrisch beschikbaar voor de 55 actuele plots uit 2025; vijf expliciet gekoppelde historische kavels hebben geen afzonderlijke geometrie. De bronvaste plot-jaarlaag bevat 251 regels voor 1967–1969, 1972–1975, 1988–1991, 1993, 1997, 2002, 2005–2006, 2013–2014 en 2016–2025. Het onderzochte PAS-maaibeheer 23 levert geen plot-jaarrijen op, omdat de vier jaarregels 2016–2019</w:t>
       </w:r>
       <w:r>
         <w:t xml:space="preserve"> </w:t>
@@ -7522,7 +7522,7 @@
         <w:t xml:space="preserve"> </w:t>
       </w:r>
       <w:r>
-        <w:t xml:space="preserve">bevat 152 relaties. Helmduinen heeft er twee; Meeuwenduin en Prinsenduin samen zeven; maatregel 22h zes; de begrazing van Vallei Meijendel negen; het onderzochte PAS-maaibeheer 23 tien; het maaibeheer in Ruygenhoek, Lange Strook en De Loopert vijf; het PIM-leidingwerk zeven; infiltratieplas 27.2 één. Twaalf uitvoeringen hebben geen directe plotkoppeling. De twee Bendel-uitvoeringen en de begrazing van landgoed Weiduin vallen aantoonbaar buiten het Meijendel-plotgebied, zodat nog negen geheel ongekoppelde uitvoeringen ruimtelijk moeten worden beoordeeld.</w:t>
+        <w:t xml:space="preserve">bevat 165 relaties. Helmduinen heeft er twee; Meeuwenduin en Prinsenduin samen zeven; maatregel 22h zes; de begrazing van Vallei Meijendel negen; maatregel 3c dertien; het onderzochte PAS-maaibeheer 23 tien; het maaibeheer in Ruygenhoek, Lange Strook en De Loopert vijf; het PIM-leidingwerk zeven; infiltratieplas 27.2 één. Elf uitvoeringen hebben geen directe plotkoppeling. De twee Bendel-uitvoeringen en de begrazing van landgoed Weiduin vallen aantoonbaar buiten het Meijendel-plotgebied, zodat nog acht geheel ongekoppelde uitvoeringen ruimtelijk moeten worden beoordeeld.</w:t>
       </w:r>
     </w:p>
     <w:p>

</xml_diff>

<commit_message>
Koppel begrazing zuidelijk duingebied
</commit_message>
<xml_diff>
--- a/docs/MEIJENDEL_BRONREGISTER.docx
+++ b/docs/MEIJENDEL_BRONREGISTER.docx
@@ -21,7 +21,7 @@
           <w:b/>
           <w:bCs/>
         </w:rPr>
-        <w:t xml:space="preserve">Stand: 15 oktober 2026.</w:t>
+        <w:t xml:space="preserve">Stand: 16 oktober 2026.</w:t>
       </w:r>
     </w:p>
     <w:p>
@@ -6471,7 +6471,7 @@
         <w:t xml:space="preserve"> </w:t>
       </w:r>
       <w:r>
-        <w:t xml:space="preserve">bevat 165 geverifieerde directe relaties. Daarvan waren 36 al onderbouwd met expliciete kavelvermeldingen, gebruikersvaststellingen of een bijzondere gebiedsnaam. De nameninventaris voegt 42 geometrische doorsnijdingen toe voor zeven volledig en letterlijk gelokaliseerde uitvoeringen. De tien nieuwe relaties betreffen het onderzochte zoekgebied van het niet uitgevoerde PAS-maaibeheer 23: M10-12-76, M12a, M62, M63, M64, M65, M72, M73, M74 en M75. De vier jaarregels 2016–2019 blijven</w:t>
+        <w:t xml:space="preserve">bevat 170 geverifieerde directe relaties. Daarvan waren 36 al onderbouwd met expliciete kavelvermeldingen, gebruikersvaststellingen of een bijzondere gebiedsnaam. De nameninventaris voegt 42 geometrische doorsnijdingen toe voor zeven volledig en letterlijk gelokaliseerde uitvoeringen. De tien nieuwe relaties betreffen het onderzochte zoekgebied van het niet uitgevoerde PAS-maaibeheer 23: M10-12-76, M12a, M62, M63, M64, M65, M72, M73, M74 en M75. De vier jaarregels 2016–2019 blijven</w:t>
       </w:r>
       <w:r>
         <w:t xml:space="preserve"> </w:t>
@@ -6498,7 +6498,7 @@
         <w:t xml:space="preserve"> </w:t>
       </w:r>
       <w:r>
-        <w:t xml:space="preserve">voor beide leeg. De begrazing van Vallei Meijendel met 38 heideschapen is gekoppeld aan de negen actuele kavels M3, M4-5, M51, M52, M53, M54a, M54b, M55 en M85. De historische voorgangers M4, M5 en M54 zijn niet gekoppeld, zodat dezelfde ruimte niet dubbel wordt geregistreerd. Omdat de evaluatie geen beginjaar en geen exacte begrazingsvoetafdruk geeft, ontstaan geen plot-jaarrijen en blijven de doorsnijdingspercentages leeg. Maatregel 3c, jaarlijkse begrazing van 110 hectare in Vallei Meijendel, Langestrook en De Loopert, is gekoppeld aan dezelfde negen actuele Vallei-kavels en aan M1a, M1b, M45 en M83. De vijf uitgevoerde jaren 2017–2021 leveren 65 plot-jaarrijen. Zij beschrijven uitsluitend de gezamenlijke uitvoeringsscope, omdat de evaluatie de 110 hectare en het jaarlijkse werk niet over gebieden of kavels verdeelt. De geometrische naamkoppelingen gebruiken de actuele SOVON-plotgeometrie</w:t>
+        <w:t xml:space="preserve">voor beide leeg. De begrazing van Vallei Meijendel met 38 heideschapen is gekoppeld aan de negen actuele kavels M3, M4-5, M51, M52, M53, M54a, M54b, M55 en M85. De historische voorgangers M4, M5 en M54 zijn niet gekoppeld, zodat dezelfde ruimte niet dubbel wordt geregistreerd. Omdat de evaluatie geen beginjaar en geen exacte begrazingsvoetafdruk geeft, ontstaan geen plot-jaarrijen en blijven de doorsnijdingspercentages leeg. Maatregel 3c, jaarlijkse begrazing van 110 hectare in Vallei Meijendel, Langestrook en De Loopert, is gekoppeld aan dezelfde negen actuele Vallei-kavels en aan M1a, M1b, M45 en M83. De vijf uitgevoerde jaren 2017–2021 leveren 65 plot-jaarrijen. Zij beschrijven uitsluitend de gezamenlijke uitvoeringsscope, omdat de evaluatie de 110 hectare en het jaarlijkse werk niet over gebieden of kavels verdeelt. Maatregel 3d, jaarlijkse begrazing in Zeereep Meijendel, Helmduinen en Prinsenduin, is op 16 oktober 2026 gekoppeld aan M13s, M15, M16, M17a en M78/79. De bron bevestigt niet-uitvoering in 2020 en uitvoering in 2021 en 2025. Daardoor ontstaan tien plot-jaarrijen; zij beschrijven de gezamenlijke uitvoeringsscope, niet het werk per naamgebied of kavel. De geometrische naamkoppelingen gebruiken de actuele SOVON-plotgeometrie</w:t>
       </w:r>
       <w:r>
         <w:t xml:space="preserve"> </w:t>
@@ -7369,7 +7369,7 @@
         <w:pStyle w:val="BodyText"/>
       </w:pPr>
       <w:r>
-        <w:t xml:space="preserve">De 165 plotkoppelingen en 88 uitgevoerde jaarregels leveren samen 251 regels in</w:t>
+        <w:t xml:space="preserve">De 170 plotkoppelingen en 88 uitgevoerde jaarregels leveren samen 261 regels in</w:t>
       </w:r>
       <w:r>
         <w:t xml:space="preserve"> </w:t>
@@ -7381,7 +7381,7 @@
         <w:t xml:space="preserve">v_plot_jaar_maatregel_bronvast</w:t>
       </w:r>
       <w:r>
-        <w:t xml:space="preserve">. De negen koppelingen van de begrazing van Vallei Meijendel voegen geen plot-jaarrijen toe, omdat de bron geen beginjaar geeft. Maatregel 3c voegt voor 2017–2021 65 scoperegels voor dertien kavels toe; de bron verdeelt de 110 hectare niet over de drie gebieden, kavels of jaren. De tien koppelingen van het onderzochte PAS-maaibeheer 23 voegen geen plot-jaarrijen toe, omdat alle vier jaarregels 2016–2019</w:t>
+        <w:t xml:space="preserve">. De negen koppelingen van de begrazing van Vallei Meijendel voegen geen plot-jaarrijen toe, omdat de bron geen beginjaar geeft. Maatregel 3c voegt voor 2017–2021 65 scoperegels voor dertien kavels toe; de bron verdeelt de 110 hectare niet over de drie gebieden, kavels of jaren. Maatregel 3d voegt tien scoperegels voor vijf kavels toe in 2021 en 2025; 2020 is niet uitgevoerd. De tien koppelingen van het onderzochte PAS-maaibeheer 23 voegen geen plot-jaarrijen toe, omdat alle vier jaarregels 2016–2019</w:t>
       </w:r>
       <w:r>
         <w:t xml:space="preserve"> </w:t>
@@ -7492,7 +7492,7 @@
         <w:t xml:space="preserve"> </w:t>
       </w:r>
       <w:r>
-        <w:t xml:space="preserve">Bronvast op project-, uitvoering- en jaarniveau voor 39 ingevoerde bronnen en 64 uitvoeringen. De algemene kavel- en gebiedsindeling is geometrisch beschikbaar voor de 55 actuele plots uit 2025; vijf expliciet gekoppelde historische kavels hebben geen afzonderlijke geometrie. De bronvaste plot-jaarlaag bevat 251 regels voor 1967–1969, 1972–1975, 1988–1991, 1993, 1997, 2002, 2005–2006, 2013–2014 en 2016–2025. Het onderzochte PAS-maaibeheer 23 levert geen plot-jaarrijen op, omdat de vier jaarregels 2016–2019</w:t>
+        <w:t xml:space="preserve">Bronvast op project-, uitvoering- en jaarniveau voor 39 ingevoerde bronnen en 64 uitvoeringen. De algemene kavel- en gebiedsindeling is geometrisch beschikbaar voor de 55 actuele plots uit 2025; vijf expliciet gekoppelde historische kavels hebben geen afzonderlijke geometrie. De bronvaste plot-jaarlaag bevat 261 regels voor 1967–1969, 1972–1975, 1988–1991, 1993, 1997, 2002, 2005–2006, 2013–2014 en 2016–2025. Het onderzochte PAS-maaibeheer 23 levert geen plot-jaarrijen op, omdat de vier jaarregels 2016–2019</w:t>
       </w:r>
       <w:r>
         <w:t xml:space="preserve"> </w:t>
@@ -7522,7 +7522,7 @@
         <w:t xml:space="preserve"> </w:t>
       </w:r>
       <w:r>
-        <w:t xml:space="preserve">bevat 165 relaties. Helmduinen heeft er twee; Meeuwenduin en Prinsenduin samen zeven; maatregel 22h zes; de begrazing van Vallei Meijendel negen; maatregel 3c dertien; het onderzochte PAS-maaibeheer 23 tien; het maaibeheer in Ruygenhoek, Lange Strook en De Loopert vijf; het PIM-leidingwerk zeven; infiltratieplas 27.2 één. Elf uitvoeringen hebben geen directe plotkoppeling. De twee Bendel-uitvoeringen en de begrazing van landgoed Weiduin vallen aantoonbaar buiten het Meijendel-plotgebied, zodat nog acht geheel ongekoppelde uitvoeringen ruimtelijk moeten worden beoordeeld.</w:t>
+        <w:t xml:space="preserve">bevat 170 relaties. Helmduinen heeft er twee; Meeuwenduin en Prinsenduin samen zeven; maatregel 22h zes; de begrazing van Vallei Meijendel negen; maatregel 3c dertien; maatregel 3d vijf; het onderzochte PAS-maaibeheer 23 tien; het maaibeheer in Ruygenhoek, Lange Strook en De Loopert vijf; het PIM-leidingwerk zeven; infiltratieplas 27.2 één. Tien uitvoeringen hebben geen directe plotkoppeling. De twee Bendel-uitvoeringen en de begrazing van landgoed Weiduin vallen aantoonbaar buiten het Meijendel-plotgebied, zodat nog zeven geheel ongekoppelde uitvoeringen ruimtelijk moeten worden beoordeeld.</w:t>
       </w:r>
     </w:p>
     <w:p>

</xml_diff>

<commit_message>
Koppel slagboomvervanging aan Vallei-kavels
</commit_message>
<xml_diff>
--- a/docs/MEIJENDEL_BRONREGISTER.docx
+++ b/docs/MEIJENDEL_BRONREGISTER.docx
@@ -6471,7 +6471,7 @@
         <w:t xml:space="preserve"> </w:t>
       </w:r>
       <w:r>
-        <w:t xml:space="preserve">bevat 170 geverifieerde directe relaties. Daarvan waren 36 al onderbouwd met expliciete kavelvermeldingen, gebruikersvaststellingen of een bijzondere gebiedsnaam. De nameninventaris voegt 42 geometrische doorsnijdingen toe voor zeven volledig en letterlijk gelokaliseerde uitvoeringen. De tien nieuwe relaties betreffen het onderzochte zoekgebied van het niet uitgevoerde PAS-maaibeheer 23: M10-12-76, M12a, M62, M63, M64, M65, M72, M73, M74 en M75. De vier jaarregels 2016–2019 blijven</w:t>
+        <w:t xml:space="preserve">bevat 172 geverifieerde directe relaties. Daarvan waren 36 al onderbouwd met expliciete kavelvermeldingen, gebruikersvaststellingen of een bijzondere gebiedsnaam. De nameninventaris voegt 42 geometrische doorsnijdingen toe voor zeven volledig en letterlijk gelokaliseerde uitvoeringen. De tien nieuwe relaties betreffen het onderzochte zoekgebied van het niet uitgevoerde PAS-maaibeheer 23: M10-12-76, M12a, M62, M63, M64, M65, M72, M73, M74 en M75. De vier jaarregels 2016–2019 blijven</w:t>
       </w:r>
       <w:r>
         <w:t xml:space="preserve"> </w:t>
@@ -6498,7 +6498,7 @@
         <w:t xml:space="preserve"> </w:t>
       </w:r>
       <w:r>
-        <w:t xml:space="preserve">voor beide leeg. De begrazing van Vallei Meijendel met 38 heideschapen is gekoppeld aan de negen actuele kavels M3, M4-5, M51, M52, M53, M54a, M54b, M55 en M85. De historische voorgangers M4, M5 en M54 zijn niet gekoppeld, zodat dezelfde ruimte niet dubbel wordt geregistreerd. Omdat de evaluatie geen beginjaar en geen exacte begrazingsvoetafdruk geeft, ontstaan geen plot-jaarrijen en blijven de doorsnijdingspercentages leeg. Maatregel 3c, jaarlijkse begrazing van 110 hectare in Vallei Meijendel, Langestrook en De Loopert, is gekoppeld aan dezelfde negen actuele Vallei-kavels en aan M1a, M1b, M45 en M83. De vijf uitgevoerde jaren 2017–2021 leveren 65 plot-jaarrijen. Zij beschrijven uitsluitend de gezamenlijke uitvoeringsscope, omdat de evaluatie de 110 hectare en het jaarlijkse werk niet over gebieden of kavels verdeelt. Maatregel 3d, jaarlijkse begrazing in Zeereep Meijendel, Helmduinen en Prinsenduin, is op 16 oktober 2026 gekoppeld aan M13s, M15, M16, M17a en M78/79. De bron bevestigt niet-uitvoering in 2020 en uitvoering in 2021 en 2025. Daardoor ontstaan tien plot-jaarrijen; zij beschrijven de gezamenlijke uitvoeringsscope, niet het werk per naamgebied of kavel. De geometrische naamkoppelingen gebruiken de actuele SOVON-plotgeometrie</w:t>
+        <w:t xml:space="preserve">voor beide leeg. De begrazing van Vallei Meijendel met 38 heideschapen is gekoppeld aan de negen actuele kavels M3, M4-5, M51, M52, M53, M54a, M54b, M55 en M85. De historische voorgangers M4, M5 en M54 zijn niet gekoppeld, zodat dezelfde ruimte niet dubbel wordt geregistreerd. Omdat de evaluatie geen beginjaar en geen exacte begrazingsvoetafdruk geeft, ontstaan geen plot-jaarrijen en blijven de doorsnijdingspercentages leeg. Maatregel 3c, jaarlijkse begrazing van 110 hectare in Vallei Meijendel, Langestrook en De Loopert, is gekoppeld aan dezelfde negen actuele Vallei-kavels en aan M1a, M1b, M45 en M83. De vijf uitgevoerde jaren 2017–2021 leveren 65 plot-jaarrijen. Zij beschrijven uitsluitend de gezamenlijke uitvoeringsscope, omdat de evaluatie de 110 hectare en het jaarlijkse werk niet over gebieden of kavels verdeelt. Maatregel 3d, jaarlijkse begrazing in Zeereep Meijendel, Helmduinen en Prinsenduin, is op 16 oktober 2026 gekoppeld aan M13s, M15, M16, M17a en M78/79. De bron bevestigt niet-uitvoering in 2020 en uitvoering in 2021 en 2025. Daardoor ontstaan tien plot-jaarrijen; zij beschrijven de gezamenlijke uitvoeringsscope, niet het werk per naamgebied of kavel. De in december 2025 vervangen slagbomen bij de entree van Meijendel zijn gekoppeld aan M55 en M85. Dunea onderscheidt P1 Kievietsduin vóór de slagboom van P2 en P3 in De Vallei erachter; de korte toegangssectie ligt in de lokale OSM-wegenlaag op en over de grens van deze twee kavels. Ton bevestigde de koppeling op 16 oktober 2026. De uitgevoerde jaarregel voor 2025 levert twee plot-jaarrijen; de exacte werkvoetafdruk is niet gepubliceerd. De geometrische naamkoppelingen gebruiken de actuele SOVON-plotgeometrie</w:t>
       </w:r>
       <w:r>
         <w:t xml:space="preserve"> </w:t>
@@ -7369,7 +7369,7 @@
         <w:pStyle w:val="BodyText"/>
       </w:pPr>
       <w:r>
-        <w:t xml:space="preserve">De 170 plotkoppelingen en 88 uitgevoerde jaarregels leveren samen 261 regels in</w:t>
+        <w:t xml:space="preserve">De 172 plotkoppelingen en 88 uitgevoerde jaarregels leveren samen 263 regels in</w:t>
       </w:r>
       <w:r>
         <w:t xml:space="preserve"> </w:t>
@@ -7381,7 +7381,7 @@
         <w:t xml:space="preserve">v_plot_jaar_maatregel_bronvast</w:t>
       </w:r>
       <w:r>
-        <w:t xml:space="preserve">. De negen koppelingen van de begrazing van Vallei Meijendel voegen geen plot-jaarrijen toe, omdat de bron geen beginjaar geeft. Maatregel 3c voegt voor 2017–2021 65 scoperegels voor dertien kavels toe; de bron verdeelt de 110 hectare niet over de drie gebieden, kavels of jaren. Maatregel 3d voegt tien scoperegels voor vijf kavels toe in 2021 en 2025; 2020 is niet uitgevoerd. De tien koppelingen van het onderzochte PAS-maaibeheer 23 voegen geen plot-jaarrijen toe, omdat alle vier jaarregels 2016–2019</w:t>
+        <w:t xml:space="preserve">. De negen koppelingen van de begrazing van Vallei Meijendel voegen geen plot-jaarrijen toe, omdat de bron geen beginjaar geeft. Maatregel 3c voegt voor 2017–2021 65 scoperegels voor dertien kavels toe; de bron verdeelt de 110 hectare niet over de drie gebieden, kavels of jaren. Maatregel 3d voegt tien scoperegels voor vijf kavels toe in 2021 en 2025; 2020 is niet uitgevoerd. De slagboomvervanging voegt voor M55 en M85 twee plot-jaarrijen in 2025 toe. De tien koppelingen van het onderzochte PAS-maaibeheer 23 voegen geen plot-jaarrijen toe, omdat alle vier jaarregels 2016–2019</w:t>
       </w:r>
       <w:r>
         <w:t xml:space="preserve"> </w:t>
@@ -7492,7 +7492,7 @@
         <w:t xml:space="preserve"> </w:t>
       </w:r>
       <w:r>
-        <w:t xml:space="preserve">Bronvast op project-, uitvoering- en jaarniveau voor 39 ingevoerde bronnen en 64 uitvoeringen. De algemene kavel- en gebiedsindeling is geometrisch beschikbaar voor de 55 actuele plots uit 2025; vijf expliciet gekoppelde historische kavels hebben geen afzonderlijke geometrie. De bronvaste plot-jaarlaag bevat 261 regels voor 1967–1969, 1972–1975, 1988–1991, 1993, 1997, 2002, 2005–2006, 2013–2014 en 2016–2025. Het onderzochte PAS-maaibeheer 23 levert geen plot-jaarrijen op, omdat de vier jaarregels 2016–2019</w:t>
+        <w:t xml:space="preserve">Bronvast op project-, uitvoering- en jaarniveau voor 39 ingevoerde bronnen en 64 uitvoeringen. De algemene kavel- en gebiedsindeling is geometrisch beschikbaar voor de 55 actuele plots uit 2025; vijf expliciet gekoppelde historische kavels hebben geen afzonderlijke geometrie. De bronvaste plot-jaarlaag bevat 263 regels voor 1967–1969, 1972–1975, 1988–1991, 1993, 1997, 2002, 2005–2006, 2013–2014 en 2016–2025. Het onderzochte PAS-maaibeheer 23 levert geen plot-jaarrijen op, omdat de vier jaarregels 2016–2019</w:t>
       </w:r>
       <w:r>
         <w:t xml:space="preserve"> </w:t>
@@ -7522,7 +7522,7 @@
         <w:t xml:space="preserve"> </w:t>
       </w:r>
       <w:r>
-        <w:t xml:space="preserve">bevat 170 relaties. Helmduinen heeft er twee; Meeuwenduin en Prinsenduin samen zeven; maatregel 22h zes; de begrazing van Vallei Meijendel negen; maatregel 3c dertien; maatregel 3d vijf; het onderzochte PAS-maaibeheer 23 tien; het maaibeheer in Ruygenhoek, Lange Strook en De Loopert vijf; het PIM-leidingwerk zeven; infiltratieplas 27.2 één. Tien uitvoeringen hebben geen directe plotkoppeling. De twee Bendel-uitvoeringen en de begrazing van landgoed Weiduin vallen aantoonbaar buiten het Meijendel-plotgebied, zodat nog zeven geheel ongekoppelde uitvoeringen ruimtelijk moeten worden beoordeeld.</w:t>
+        <w:t xml:space="preserve">bevat 172 relaties. Helmduinen heeft er twee; Meeuwenduin en Prinsenduin samen zeven; maatregel 22h zes; de begrazing van Vallei Meijendel negen; maatregel 3c dertien; maatregel 3d vijf; de slagboomvervanging twee; het onderzochte PAS-maaibeheer 23 tien; het maaibeheer in Ruygenhoek, Lange Strook en De Loopert vijf; het PIM-leidingwerk zeven; infiltratieplas 27.2 één. Negen uitvoeringen hebben geen directe plotkoppeling. De twee Bendel-uitvoeringen en de begrazing van landgoed Weiduin vallen aantoonbaar buiten het Meijendel-plotgebied, zodat nog zes geheel ongekoppelde uitvoeringen ruimtelijk moeten worden beoordeeld.</w:t>
       </w:r>
     </w:p>
     <w:p>

</xml_diff>

<commit_message>
Koppel PIM-pannenmaatregel aan vier kavels
</commit_message>
<xml_diff>
--- a/docs/MEIJENDEL_BRONREGISTER.docx
+++ b/docs/MEIJENDEL_BRONREGISTER.docx
@@ -6297,7 +6297,7 @@
         <w:pStyle w:val="BodyText"/>
       </w:pPr>
       <w:r>
-        <w:t xml:space="preserve">De brede tekstselectie bevatte 351 bijlagen. De strengere selectie op formuleringen die feitelijke uitvoering aanduiden bevatte 206 bijlagen bij 190 bibliografische bronnen. Na beoordeling op uitvoering, locatie, jaar, dubbeling en brontype zijn achttien aanvullende Zotero-bronnen ingevoerd. Nieuw is Van der Hagen et al. (2020), waarvan figuur 1 Prinsenduin, Lange Strooken en Helmduinen als afzonderlijke onderzoeksgebieden toont. Op 15 oktober 2026 is daarnaast KIWA Mededeling 114 uit december 1990 ingevoerd, met de officiële KWR-PDF als gekoppeld T7-bestand. Figuur 1 op PDF-pagina 73 lokaliseert de infiltratieplassen 27.2, 27.2.1 en 27.3. Samen met de zes al gebruikte Zotero-bronnen bevat</w:t>
+        <w:t xml:space="preserve">De brede tekstselectie bevatte 351 bijlagen. De strengere selectie op formuleringen die feitelijke uitvoering aanduiden bevatte 206 bijlagen bij 190 bibliografische bronnen. Na beoordeling op uitvoering, locatie, jaar, dubbeling en brontype zijn achttien aanvullende Zotero-bronnen ingevoerd. Nieuw is Van der Hagen et al. (2020), waarvan figuur 1 Prinsenduin, Lange Strooken en Helmduinen als afzonderlijke onderzoeksgebieden toont. Op 15 oktober 2026 is daarnaast KIWA Mededeling 114 uit december 1990 ingevoerd, met de officiële KWR-PDF als gekoppeld T7-bestand. Figuur 1 op PDF-pagina 73 lokaliseert de infiltratieplassen 27.2, 27.2.1 en 27.3. Op 16 oktober 2026 is ook het definitieve beheerplan 2016–2022 als ruimtelijke bevestiging voor de PIM-oeveraanpassingen geregistreerd. Pagina 131 koppelt die werkzaamheden aan Tafelberg en ’t Scheepje. Samen met de zes al gebruikte Zotero-bronnen bevat</w:t>
       </w:r>
       <w:r>
         <w:t xml:space="preserve"> </w:t>
@@ -6312,7 +6312,7 @@
         <w:t xml:space="preserve"> </w:t>
       </w:r>
       <w:r>
-        <w:t xml:space="preserve">nu 25 lokale Zotero-bronnen. Dubbele exemplaren, algemene gebiedsbeschrijvingen, uitsluitend voorgenomen werk en niet-lokaliseerbare vermeldingen zijn niet als afzonderlijke uitvoering ingevoerd.</w:t>
+        <w:t xml:space="preserve">nu 26 lokale Zotero-bronnen. Dubbele exemplaren, algemene gebiedsbeschrijvingen, uitsluitend voorgenomen werk en niet-lokaliseerbare vermeldingen zijn niet als afzonderlijke uitvoering ingevoerd.</w:t>
       </w:r>
     </w:p>
     <w:p>
@@ -6350,7 +6350,7 @@
         <w:t xml:space="preserve"> </w:t>
       </w:r>
       <w:r>
-        <w:t xml:space="preserve">De levende lokale database bevat 18 projecten, 39 bronnen, 64 uitvoeringen, 104 expliciete jaarbeoordelingen uit 1967–2026 en 94 bronkoppelingen. Van de jaarbeoordelingen zijn er 88</w:t>
+        <w:t xml:space="preserve">De levende lokale database bevat 18 projecten, 40 bronnen, 64 uitvoeringen, 104 expliciete jaarbeoordelingen uit 1967–2026 en 95 bronkoppelingen. Van de jaarbeoordelingen zijn er 88</w:t>
       </w:r>
       <w:r>
         <w:t xml:space="preserve"> </w:t>
@@ -6471,7 +6471,7 @@
         <w:t xml:space="preserve"> </w:t>
       </w:r>
       <w:r>
-        <w:t xml:space="preserve">bevat 172 geverifieerde directe relaties. Daarvan waren 36 al onderbouwd met expliciete kavelvermeldingen, gebruikersvaststellingen of een bijzondere gebiedsnaam. De nameninventaris voegt 42 geometrische doorsnijdingen toe voor zeven volledig en letterlijk gelokaliseerde uitvoeringen. De tien nieuwe relaties betreffen het onderzochte zoekgebied van het niet uitgevoerde PAS-maaibeheer 23: M10-12-76, M12a, M62, M63, M64, M65, M72, M73, M74 en M75. De vier jaarregels 2016–2019 blijven</w:t>
+        <w:t xml:space="preserve">bevat 176 geverifieerde directe relaties. Daarvan waren 40 onderbouwd met expliciete kavelvermeldingen, gebruikersvaststellingen of een bijzondere gebiedsnaam. De nameninventaris voegt 42 geometrische doorsnijdingen toe voor zeven volledig en letterlijk gelokaliseerde uitvoeringen. De tien nieuwe relaties betreffen het onderzochte zoekgebied van het niet uitgevoerde PAS-maaibeheer 23: M10-12-76, M12a, M62, M63, M64, M65, M72, M73, M74 en M75. De vier jaarregels 2016–2019 blijven</w:t>
       </w:r>
       <w:r>
         <w:t xml:space="preserve"> </w:t>
@@ -6483,7 +6483,7 @@
         <w:t xml:space="preserve">niet_uitgevoerd</w:t>
       </w:r>
       <w:r>
-        <w:t xml:space="preserve">; de koppelingen bewijzen dus geen maaiwerk. Daarnaast zijn elf relaties toegevoegd voor de volledige systemen Pan 13 en Plas 20, zeven voor het PIM-leidingwerk en één voor infiltratieplas 27.2. De begrazing van de Helmduinen vanaf eind 1991 is na correctie op 15 oktober 2026 gekoppeld aan M15 en M16. M17a is retroactief verwijderd: die kavel hoort voor deze naamtoedeling bij Prinsenduin, niet bij Helmduinen. De begrazing loopt tot heden door. Omdat de bron geen oppervlakte per kavel geeft, blijft</w:t>
+        <w:t xml:space="preserve">; de koppelingen bewijzen dus geen maaiwerk. Daarnaast zijn elf relaties toegevoegd voor de volledige systemen Pan 13 en Plas 20, zeven voor het PIM-leidingwerk, één voor infiltratieplas 27.2 en vier voor het bronvast gelokaliseerde deel van de programmabrede pannenmaatregel. De begrazing van de Helmduinen vanaf eind 1991 is na correctie op 15 oktober 2026 gekoppeld aan M15 en M16. M17a is retroactief verwijderd: die kavel hoort voor deze naamtoedeling bij Prinsenduin, niet bij Helmduinen. De begrazing loopt tot heden door. Omdat de bron geen oppervlakte per kavel geeft, blijft</w:t>
       </w:r>
       <w:r>
         <w:t xml:space="preserve"> </w:t>
@@ -7334,6 +7334,29 @@
         <w:pStyle w:val="BodyText"/>
       </w:pPr>
       <w:r>
+        <w:t xml:space="preserve">De programmabrede schoning en natuurvriendelijke inrichting van infiltratiepannen in 2010–2018 is voor het bronvast lokaliseerbare deel gekoppeld aan M6, M7, M13 en M77. Het definitieve Natura 2000-beheerplan 2016–2022 koppelt op pagina 131 de PIM-aanpassingen aan de oevers van infiltratieplassen expliciet aan Tafelberg en ’t Scheepje. De actuele nameninventaris koppelt Tafelberg aan M13 en M77 en ’t Scheepje aan M6 en M7; Ton bevestigde de vier relaties op 16 oktober 2026. Dunea meldt voor het volledige programma 370.000 m3 verwijderd materiaal, maar de 782 op 16 oktober opnieuw doorzochte PDF-bestanden in de gekoppelde Zotero-opslag leveren geen volledige uitvoeringslijst per infiltratieplas. Het volume wordt daarom niet over de vier kavels verdeeld en</w:t>
+      </w:r>
+      <w:r>
+        <w:t xml:space="preserve"> </w:t>
+      </w:r>
+      <w:r>
+        <w:rPr>
+          <w:rStyle w:val="VerbatimChar"/>
+        </w:rPr>
+        <w:t xml:space="preserve">doorsnijding_pct</w:t>
+      </w:r>
+      <w:r>
+        <w:t xml:space="preserve"> </w:t>
+      </w:r>
+      <w:r>
+        <w:t xml:space="preserve">blijft leeg. De vier relaties leveren voor het afgeronde programmajaar 2018 vier plot-jaarrijen; die bewijzen de uitvoeringsscope van de gelokaliseerde oeveraanpassingen, niet dat het volledige volume in deze vier kavels is verwijderd.</w:t>
+      </w:r>
+    </w:p>
+    <w:p>
+      <w:pPr>
+        <w:pStyle w:val="BodyText"/>
+      </w:pPr>
+      <w:r>
         <w:t xml:space="preserve">Infiltratieplas 27.2 is als afzonderlijke uitvoering binnen hetzelfde optimalisatieprogramma vastgelegd. De officiële externe bijlage uit 2013 beschrijft verwijdering van organisch verrijkt bodemmateriaal, aanpassing van de oever en waar mogelijk van de onderwateroever tussen 1 september 2013 en 1 maart 2014. Dunea bevestigt in 2018 dat het programma is afgerond. KIWA Mededeling 114 toont op PDF-pagina 73 de ligging van 27.2 in het noordelijke plassensysteem; vergelijking met de actuele kavelgeometrie en Tons bevestiging van 15 oktober 2026 koppelen de uitvoering aan M77. De precieze werkvoetafdruk binnen M77 is niet gepubliceerd en</w:t>
       </w:r>
       <w:r>
@@ -7369,7 +7392,7 @@
         <w:pStyle w:val="BodyText"/>
       </w:pPr>
       <w:r>
-        <w:t xml:space="preserve">De 172 plotkoppelingen en 88 uitgevoerde jaarregels leveren samen 263 regels in</w:t>
+        <w:t xml:space="preserve">De 176 plotkoppelingen en 88 uitgevoerde jaarregels leveren samen 267 regels in</w:t>
       </w:r>
       <w:r>
         <w:t xml:space="preserve"> </w:t>
@@ -7411,7 +7434,7 @@
         <w:t xml:space="preserve"> </w:t>
       </w:r>
       <w:r>
-        <w:t xml:space="preserve">en ontstaan geen plot-jaarrijen. Het PIM-leidingwerk voegt zeven scoperegels voor 2018 toe. Infiltratieplas 27.2 voegt voor M77 één regel in 2013 en één in 2014 toe. De overige eerder vastgelegde koppelingen en jaarselecties blijven inhoudelijk ongewijzigd. Voor beide doorlopende begrazingsmaatregelen met een expliciet startjaar bewaart deze view alleen dat startjaar; de open einddatum en</w:t>
+        <w:t xml:space="preserve">en ontstaan geen plot-jaarrijen. Het PIM-leidingwerk voegt zeven scoperegels voor 2018 toe. De programmabrede pannenmaatregel voegt vier scoperegels voor M6, M7, M13 en M77 in 2018 toe. Infiltratieplas 27.2 voegt voor M77 één regel in 2013 en één in 2014 toe. De overige eerder vastgelegde koppelingen en jaarselecties blijven inhoudelijk ongewijzigd. Voor beide doorlopende begrazingsmaatregelen met een expliciet startjaar bewaart deze view alleen dat startjaar; de open einddatum en</w:t>
       </w:r>
       <w:r>
         <w:t xml:space="preserve"> </w:t>
@@ -7492,7 +7515,7 @@
         <w:t xml:space="preserve"> </w:t>
       </w:r>
       <w:r>
-        <w:t xml:space="preserve">Bronvast op project-, uitvoering- en jaarniveau voor 39 ingevoerde bronnen en 64 uitvoeringen. De algemene kavel- en gebiedsindeling is geometrisch beschikbaar voor de 55 actuele plots uit 2025; vijf expliciet gekoppelde historische kavels hebben geen afzonderlijke geometrie. De bronvaste plot-jaarlaag bevat 263 regels voor 1967–1969, 1972–1975, 1988–1991, 1993, 1997, 2002, 2005–2006, 2013–2014 en 2016–2025. Het onderzochte PAS-maaibeheer 23 levert geen plot-jaarrijen op, omdat de vier jaarregels 2016–2019</w:t>
+        <w:t xml:space="preserve">Bronvast op project-, uitvoering- en jaarniveau voor 40 ingevoerde bronnen en 64 uitvoeringen. De algemene kavel- en gebiedsindeling is geometrisch beschikbaar voor de 55 actuele plots uit 2025; vijf expliciet gekoppelde historische kavels hebben geen afzonderlijke geometrie. De bronvaste plot-jaarlaag bevat 267 regels voor 1967–1969, 1972–1975, 1988–1991, 1993, 1997, 2002, 2005–2006, 2013–2014 en 2016–2025. Het onderzochte PAS-maaibeheer 23 levert geen plot-jaarrijen op, omdat de vier jaarregels 2016–2019</w:t>
       </w:r>
       <w:r>
         <w:t xml:space="preserve"> </w:t>
@@ -7522,7 +7545,7 @@
         <w:t xml:space="preserve"> </w:t>
       </w:r>
       <w:r>
-        <w:t xml:space="preserve">bevat 172 relaties. Helmduinen heeft er twee; Meeuwenduin en Prinsenduin samen zeven; maatregel 22h zes; de begrazing van Vallei Meijendel negen; maatregel 3c dertien; maatregel 3d vijf; de slagboomvervanging twee; het onderzochte PAS-maaibeheer 23 tien; het maaibeheer in Ruygenhoek, Lange Strook en De Loopert vijf; het PIM-leidingwerk zeven; infiltratieplas 27.2 één. Negen uitvoeringen hebben geen directe plotkoppeling. De twee Bendel-uitvoeringen en de begrazing van landgoed Weiduin vallen aantoonbaar buiten het Meijendel-plotgebied, zodat nog zes geheel ongekoppelde uitvoeringen ruimtelijk moeten worden beoordeeld.</w:t>
+        <w:t xml:space="preserve">bevat 176 relaties. Helmduinen heeft er twee; Meeuwenduin en Prinsenduin samen zeven; maatregel 22h zes; de begrazing van Vallei Meijendel negen; maatregel 3c dertien; maatregel 3d vijf; de slagboomvervanging twee; het onderzochte PAS-maaibeheer 23 tien; het maaibeheer in Ruygenhoek, Lange Strook en De Loopert vijf; het PIM-leidingwerk zeven; de programmabrede pannenmaatregel vier; infiltratieplas 27.2 één. Acht uitvoeringen hebben geen directe plotkoppeling. De twee Bendel-uitvoeringen en de begrazing van landgoed Weiduin vallen aantoonbaar buiten het Meijendel-plotgebied, zodat nog vijf geheel ongekoppelde uitvoeringen ruimtelijk moeten worden beoordeeld.</w:t>
       </w:r>
     </w:p>
     <w:p>

</xml_diff>

<commit_message>
Koppel plagwerkzaamheden aan acht kavels
</commit_message>
<xml_diff>
--- a/docs/MEIJENDEL_BRONREGISTER.docx
+++ b/docs/MEIJENDEL_BRONREGISTER.docx
@@ -6297,7 +6297,23 @@
         <w:pStyle w:val="BodyText"/>
       </w:pPr>
       <w:r>
-        <w:t xml:space="preserve">De brede tekstselectie bevatte 351 bijlagen. De strengere selectie op formuleringen die feitelijke uitvoering aanduiden bevatte 206 bijlagen bij 190 bibliografische bronnen. Na beoordeling op uitvoering, locatie, jaar, dubbeling en brontype zijn achttien aanvullende Zotero-bronnen ingevoerd. Nieuw is Van der Hagen et al. (2020), waarvan figuur 1 Prinsenduin, Lange Strooken en Helmduinen als afzonderlijke onderzoeksgebieden toont. Op 15 oktober 2026 is daarnaast KIWA Mededeling 114 uit december 1990 ingevoerd, met de officiële KWR-PDF als gekoppeld T7-bestand. Figuur 1 op PDF-pagina 73 lokaliseert de infiltratieplassen 27.2, 27.2.1 en 27.3. Op 16 oktober 2026 is ook het definitieve beheerplan 2016–2022 als ruimtelijke bevestiging voor de PIM-oeveraanpassingen geregistreerd. Pagina 131 koppelt die werkzaamheden aan Tafelberg en ’t Scheepje. Samen met de zes al gebruikte Zotero-bronnen bevat</w:t>
+        <w:t xml:space="preserve">De brede tekstselectie bevatte 351 bijlagen. De strengere selectie op formuleringen die feitelijke uitvoering aanduiden bevatte 206 bijlagen bij 190 bibliografische bronnen. Na beoordeling op uitvoering, locatie, jaar, dubbeling en brontype zijn achttien aanvullende Zotero-bronnen ingevoerd. Nieuw is Van der Hagen et al. (2020), waarvan figuur 1 Prinsenduin, Lange Strooken en Helmduinen als afzonderlijke onderzoeksgebieden toont. Op 15 oktober 2026 is daarnaast KIWA Mededeling 114 uit december 1990 ingevoerd, met de officiële KWR-PDF als gekoppeld T7-bestand. Figuur 1 op PDF-pagina 73 lokaliseert de infiltratieplassen 27.2, 27.2.1 en 27.3. Op 16 oktober 2026 zijn ook het definitieve beheerplan 2016–2022 en</w:t>
+      </w:r>
+      <w:r>
+        <w:t xml:space="preserve"> </w:t>
+      </w:r>
+      <w:r>
+        <w:rPr>
+          <w:i/>
+          <w:iCs/>
+        </w:rPr>
+        <w:t xml:space="preserve">Holland’s Duinen</w:t>
+      </w:r>
+      <w:r>
+        <w:t xml:space="preserve"> </w:t>
+      </w:r>
+      <w:r>
+        <w:t xml:space="preserve">63 en 64 als ruimtelijke bevestiging geregistreerd. Het beheerplan koppelt PIM-oeveraanpassingen aan Tafelberg en ’t Scheepje. De twee tijdschriftnummers beschrijven en tonen het natuurherstel in Elleboogsprang, Helmduinen, Vinkenhoek en Meeuwenduin.</w:t>
       </w:r>
       <w:r>
         <w:t xml:space="preserve"> </w:t>
@@ -6312,15 +6328,15 @@
         <w:t xml:space="preserve"> </w:t>
       </w:r>
       <w:r>
-        <w:t xml:space="preserve">nu 26 lokale Zotero-bronnen. Dubbele exemplaren, algemene gebiedsbeschrijvingen, uitsluitend voorgenomen werk en niet-lokaliseerbare vermeldingen zijn niet als afzonderlijke uitvoering ingevoerd.</w:t>
-      </w:r>
-    </w:p>
-    <w:p>
-      <w:pPr>
-        <w:pStyle w:val="BodyText"/>
-      </w:pPr>
-      <w:r>
-        <w:t xml:space="preserve">Daarbij zijn veertien officiële of institutionele internetbronnen geraadpleegd: vijf Dunea-pagina’s over optimalisatie van de waterwinning, beheer in Meeuwenduin en Prinsenduin, vervanging van slagbomen, actuele werkzaamheden en duindynamiek; het Dunea-jaarverslag 2024; het Zuid-Hollandse subsidie-openstellingsbesluit voor Bendel; de Staatsbosbeheer-pagina over de herinrichting van Bendel; de ODH-beschikking van 28 augustus 2023 voor de konijnenbijplaatsingsproef; de ODH-beschikking van 5 november 2025 voor de renovatie van de Paardenstal; de via DANS gepubliceerde Haagse Archeologische Rapportage 1306 over het Programma Investeringen Meijendel; de officiële externe bijlage uit 2013 over de PIM-werkzaamheden in Noord-Meijendel; de gemeentelijke inventaris van cultuurhistorische objecten in Wassenaar; en de actuele PDOK-Kadastrale Kaart. De bronnen staan afzonderlijk in</w:t>
+        <w:t xml:space="preserve">bevat nu 28 lokaal geraadpleegde Zotero-bronnen. Dubbele exemplaren, algemene gebiedsbeschrijvingen, uitsluitend voorgenomen werk en niet-lokaliseerbare vermeldingen zijn niet als afzonderlijke uitvoering ingevoerd.</w:t>
+      </w:r>
+    </w:p>
+    <w:p>
+      <w:pPr>
+        <w:pStyle w:val="BodyText"/>
+      </w:pPr>
+      <w:r>
+        <w:t xml:space="preserve">Daarbij zijn vijftien officiële of institutionele internetbronnen geraadpleegd: vijf Dunea-pagina’s over optimalisatie van de waterwinning, beheer in Meeuwenduin en Prinsenduin, vervanging van slagbomen, actuele werkzaamheden en duindynamiek; het Dunea-jaarverslag 2024; het Zuid-Hollandse subsidie-openstellingsbesluit voor Bendel; de Staatsbosbeheer-pagina over de herinrichting van Bendel; de ODH-beschikking van 28 augustus 2023 voor de konijnenbijplaatsingsproef; de ODH-beschikking van 5 november 2025 voor de renovatie van de Paardenstal; de via DANS gepubliceerde Haagse Archeologische Rapportages 1204 en 1306; de officiële externe bijlage uit 2013 over de PIM-werkzaamheden in Noord-Meijendel; de gemeentelijke inventaris van cultuurhistorische objecten in Wassenaar; en de actuele PDOK-Kadastrale Kaart. Rapport 1204 bevat op PDF-pagina 4 de deelgebiedscontouren van Elleboogsprang, Meeuwenduin en Vinkenhoek. De bronnen staan afzonderlijk in</w:t>
       </w:r>
       <w:r>
         <w:t xml:space="preserve"> </w:t>
@@ -6350,7 +6366,7 @@
         <w:t xml:space="preserve"> </w:t>
       </w:r>
       <w:r>
-        <w:t xml:space="preserve">De levende lokale database bevat 18 projecten, 40 bronnen, 64 uitvoeringen, 104 expliciete jaarbeoordelingen uit 1967–2026 en 95 bronkoppelingen. Van de jaarbeoordelingen zijn er 88</w:t>
+        <w:t xml:space="preserve">De levende lokale database bevat 18 projecten, 43 bronnen, 64 uitvoeringen, 104 expliciete jaarbeoordelingen uit 1967–2026 en 98 bronkoppelingen. Van de jaarbeoordelingen zijn er 88</w:t>
       </w:r>
       <w:r>
         <w:t xml:space="preserve"> </w:t>
@@ -6471,7 +6487,7 @@
         <w:t xml:space="preserve"> </w:t>
       </w:r>
       <w:r>
-        <w:t xml:space="preserve">bevat 176 geverifieerde directe relaties. Daarvan waren 40 onderbouwd met expliciete kavelvermeldingen, gebruikersvaststellingen of een bijzondere gebiedsnaam. De nameninventaris voegt 42 geometrische doorsnijdingen toe voor zeven volledig en letterlijk gelokaliseerde uitvoeringen. De tien nieuwe relaties betreffen het onderzochte zoekgebied van het niet uitgevoerde PAS-maaibeheer 23: M10-12-76, M12a, M62, M63, M64, M65, M72, M73, M74 en M75. De vier jaarregels 2016–2019 blijven</w:t>
+        <w:t xml:space="preserve">bevat 184 geverifieerde directe relaties. Daarvan zijn 48 onderbouwd met expliciete kavelvermeldingen, gebruikersvaststellingen, een bijzondere gebiedsnaam of de gedigitaliseerde contouren uit HAR 1204. De nameninventaris voegt 42 geometrische doorsnijdingen toe voor zeven volledig en letterlijk gelokaliseerde uitvoeringen. De tien relaties van het onderzochte zoekgebied van het niet uitgevoerde PAS-maaibeheer 23 blijven M10-12-76, M12a, M62, M63, M64, M65, M72, M73, M74 en M75. De vier jaarregels 2016–2019 blijven</w:t>
       </w:r>
       <w:r>
         <w:t xml:space="preserve"> </w:t>
@@ -6483,7 +6499,7 @@
         <w:t xml:space="preserve">niet_uitgevoerd</w:t>
       </w:r>
       <w:r>
-        <w:t xml:space="preserve">; de koppelingen bewijzen dus geen maaiwerk. Daarnaast zijn elf relaties toegevoegd voor de volledige systemen Pan 13 en Plas 20, zeven voor het PIM-leidingwerk, één voor infiltratieplas 27.2 en vier voor het bronvast gelokaliseerde deel van de programmabrede pannenmaatregel. De begrazing van de Helmduinen vanaf eind 1991 is na correctie op 15 oktober 2026 gekoppeld aan M15 en M16. M17a is retroactief verwijderd: die kavel hoort voor deze naamtoedeling bij Prinsenduin, niet bij Helmduinen. De begrazing loopt tot heden door. Omdat de bron geen oppervlakte per kavel geeft, blijft</w:t>
+        <w:t xml:space="preserve">; de koppelingen bewijzen dus geen maaiwerk. Daarnaast zijn elf relaties opgenomen voor de volledige systemen Pan 13 en Plas 20, zeven voor het PIM-leidingwerk, één voor infiltratieplas 27.2, vier voor het bronvast gelokaliseerde deel van de programmabrede pannenmaatregel en acht voor de plagwerkzaamheden van het waterwinningsprogramma. De begrazing van de Helmduinen vanaf eind 1991 is na correctie op 15 oktober 2026 gekoppeld aan M15 en M16. M17a is retroactief verwijderd: die kavel hoort voor deze naamtoedeling bij Prinsenduin, niet bij Helmduinen. De begrazing loopt tot heden door. Omdat de bron geen oppervlakte per kavel geeft, blijft</w:t>
       </w:r>
       <w:r>
         <w:t xml:space="preserve"> </w:t>
@@ -7357,6 +7373,45 @@
         <w:pStyle w:val="BodyText"/>
       </w:pPr>
       <w:r>
+        <w:t xml:space="preserve">De bijna 400.000 m² geplagde duinen binnen hetzelfde programma zijn gekoppeld aan acht unieke kavels: M15 en M16 voor Helmduinen; M10-12-76, M12a, M73, M74 en M75 voor Meeuwenduin; M10-12-76 en M75 voor Elleboogsprang; en M71 voor Vinkenhoek.</w:t>
+      </w:r>
+      <w:r>
+        <w:t xml:space="preserve"> </w:t>
+      </w:r>
+      <w:r>
+        <w:rPr>
+          <w:i/>
+          <w:iCs/>
+        </w:rPr>
+        <w:t xml:space="preserve">Holland’s Duinen</w:t>
+      </w:r>
+      <w:r>
+        <w:t xml:space="preserve"> </w:t>
+      </w:r>
+      <w:r>
+        <w:t xml:space="preserve">63 bevestigt vegetatieverwijdering in Elleboogsprang, Helmduinen en Vinkenhoek; nummer 64 toont deze drie gebieden en Meeuwenduin als de vier gevolgde herstelgebieden. Haagse Archeologische Rapportage 1204 uit februari 2012 begrenst Elleboogsprang, Meeuwenduin en Vinkenhoek op PDF-pagina 4. De kaartcontouren zijn gedigitaliseerd en met de gepubliceerde schaal en de RD-referenties 84/463–85/463 en 85/461–462 over de actuele kavelgeometrie gelegd. Elleboogsprang snijdt alleen M10-12-76 en M75; Vinkenhoek ligt volledig in M71. De gereconstrueerde Vinkenhoek-contour meet circa 8,3 hectare, tegenover circa 8 hectare in de publicatie. De kaartnauwkeurigheid is voldoende voor deze kaveltoedeling, maar niet voor opslag als exacte uitvoeringsgeometrie of voor verdeling van de programmabrede 40 hectare en 100.000 m³ zand.</w:t>
+      </w:r>
+      <w:r>
+        <w:t xml:space="preserve"> </w:t>
+      </w:r>
+      <w:r>
+        <w:rPr>
+          <w:rStyle w:val="VerbatimChar"/>
+        </w:rPr>
+        <w:t xml:space="preserve">doorsnijding_pct</w:t>
+      </w:r>
+      <w:r>
+        <w:t xml:space="preserve"> </w:t>
+      </w:r>
+      <w:r>
+        <w:t xml:space="preserve">blijft daarom voor alle acht relaties leeg. De uitgevoerde jaarregel voor 2018 levert acht plot-jaarrijen.</w:t>
+      </w:r>
+    </w:p>
+    <w:p>
+      <w:pPr>
+        <w:pStyle w:val="BodyText"/>
+      </w:pPr>
+      <w:r>
         <w:t xml:space="preserve">Infiltratieplas 27.2 is als afzonderlijke uitvoering binnen hetzelfde optimalisatieprogramma vastgelegd. De officiële externe bijlage uit 2013 beschrijft verwijdering van organisch verrijkt bodemmateriaal, aanpassing van de oever en waar mogelijk van de onderwateroever tussen 1 september 2013 en 1 maart 2014. Dunea bevestigt in 2018 dat het programma is afgerond. KIWA Mededeling 114 toont op PDF-pagina 73 de ligging van 27.2 in het noordelijke plassensysteem; vergelijking met de actuele kavelgeometrie en Tons bevestiging van 15 oktober 2026 koppelen de uitvoering aan M77. De precieze werkvoetafdruk binnen M77 is niet gepubliceerd en</w:t>
       </w:r>
       <w:r>
@@ -7392,7 +7447,7 @@
         <w:pStyle w:val="BodyText"/>
       </w:pPr>
       <w:r>
-        <w:t xml:space="preserve">De 176 plotkoppelingen en 88 uitgevoerde jaarregels leveren samen 267 regels in</w:t>
+        <w:t xml:space="preserve">De 184 plotkoppelingen en 88 uitgevoerde jaarregels leveren samen 275 regels in</w:t>
       </w:r>
       <w:r>
         <w:t xml:space="preserve"> </w:t>
@@ -7434,7 +7489,7 @@
         <w:t xml:space="preserve"> </w:t>
       </w:r>
       <w:r>
-        <w:t xml:space="preserve">en ontstaan geen plot-jaarrijen. Het PIM-leidingwerk voegt zeven scoperegels voor 2018 toe. De programmabrede pannenmaatregel voegt vier scoperegels voor M6, M7, M13 en M77 in 2018 toe. Infiltratieplas 27.2 voegt voor M77 één regel in 2013 en één in 2014 toe. De overige eerder vastgelegde koppelingen en jaarselecties blijven inhoudelijk ongewijzigd. Voor beide doorlopende begrazingsmaatregelen met een expliciet startjaar bewaart deze view alleen dat startjaar; de open einddatum en</w:t>
+        <w:t xml:space="preserve">en ontstaan geen plot-jaarrijen. Het PIM-leidingwerk voegt zeven scoperegels voor 2018 toe. De programmabrede pannenmaatregel voegt vier scoperegels voor M6, M7, M13 en M77 in 2018 toe. De programmabrede plagwerkzaamheden voegen acht scoperegels voor M10-12-76, M12a, M15, M16, M71, M73, M74 en M75 in 2018 toe. Infiltratieplas 27.2 voegt voor M77 één regel in 2013 en één in 2014 toe. De overige eerder vastgelegde koppelingen en jaarselecties blijven inhoudelijk ongewijzigd. Voor beide doorlopende begrazingsmaatregelen met een expliciet startjaar bewaart deze view alleen dat startjaar; de open einddatum en</w:t>
       </w:r>
       <w:r>
         <w:t xml:space="preserve"> </w:t>
@@ -7515,7 +7570,7 @@
         <w:t xml:space="preserve"> </w:t>
       </w:r>
       <w:r>
-        <w:t xml:space="preserve">Bronvast op project-, uitvoering- en jaarniveau voor 40 ingevoerde bronnen en 64 uitvoeringen. De algemene kavel- en gebiedsindeling is geometrisch beschikbaar voor de 55 actuele plots uit 2025; vijf expliciet gekoppelde historische kavels hebben geen afzonderlijke geometrie. De bronvaste plot-jaarlaag bevat 267 regels voor 1967–1969, 1972–1975, 1988–1991, 1993, 1997, 2002, 2005–2006, 2013–2014 en 2016–2025. Het onderzochte PAS-maaibeheer 23 levert geen plot-jaarrijen op, omdat de vier jaarregels 2016–2019</w:t>
+        <w:t xml:space="preserve">Bronvast op project-, uitvoering- en jaarniveau voor 43 ingevoerde bronnen en 64 uitvoeringen. De algemene kavel- en gebiedsindeling is geometrisch beschikbaar voor de 55 actuele plots uit 2025; vijf expliciet gekoppelde historische kavels hebben geen afzonderlijke geometrie. De bronvaste plot-jaarlaag bevat 275 regels voor 1967–1969, 1972–1975, 1988–1991, 1993, 1997, 2002, 2005–2006, 2013–2014 en 2016–2025. Het onderzochte PAS-maaibeheer 23 levert geen plot-jaarrijen op, omdat de vier jaarregels 2016–2019</w:t>
       </w:r>
       <w:r>
         <w:t xml:space="preserve"> </w:t>
@@ -7545,7 +7600,7 @@
         <w:t xml:space="preserve"> </w:t>
       </w:r>
       <w:r>
-        <w:t xml:space="preserve">bevat 176 relaties. Helmduinen heeft er twee; Meeuwenduin en Prinsenduin samen zeven; maatregel 22h zes; de begrazing van Vallei Meijendel negen; maatregel 3c dertien; maatregel 3d vijf; de slagboomvervanging twee; het onderzochte PAS-maaibeheer 23 tien; het maaibeheer in Ruygenhoek, Lange Strook en De Loopert vijf; het PIM-leidingwerk zeven; de programmabrede pannenmaatregel vier; infiltratieplas 27.2 één. Acht uitvoeringen hebben geen directe plotkoppeling. De twee Bendel-uitvoeringen en de begrazing van landgoed Weiduin vallen aantoonbaar buiten het Meijendel-plotgebied, zodat nog vijf geheel ongekoppelde uitvoeringen ruimtelijk moeten worden beoordeeld.</w:t>
+        <w:t xml:space="preserve">bevat 184 relaties. Helmduinen heeft er twee; Meeuwenduin en Prinsenduin samen zeven; maatregel 22h zes; de begrazing van Vallei Meijendel negen; maatregel 3c dertien; maatregel 3d vijf; de slagboomvervanging twee; het onderzochte PAS-maaibeheer 23 tien; het maaibeheer in Ruygenhoek, Lange Strook en De Loopert vijf; het PIM-leidingwerk zeven; de programmabrede pannenmaatregel vier; de programmabrede plagwerkzaamheden acht; infiltratieplas 27.2 één. Zeven uitvoeringen hebben geen directe plotkoppeling. De twee Bendel-uitvoeringen en de begrazing van landgoed Weiduin vallen aantoonbaar buiten het Meijendel-plotgebied, zodat nog vier geheel ongekoppelde uitvoeringen ruimtelijk moeten worden beoordeeld.</w:t>
       </w:r>
     </w:p>
     <w:p>
@@ -9189,6 +9244,44 @@
       </w:pPr>
       <w:r>
         <w:t xml:space="preserve">Van Leeuwen en Jungerius noemen in 1992 de proefdriehoek Klippad–Bunkerpad–Wassenaarse Slag en vermelden dat elf proefplekken in 1987 op een kaart 1:1.000 zijn ingetekend. Die kaart staat niet in het artikel. Van der Meijden bevestigt in 2012 alleen de onderlinge ligging. Bunkerpad en Klippad blijven daarom twee historische naamrecords met ontbrekend tracé. De kleinste resterende bronvraag is de oorspronkelijke 1:1.000-kaart uit 1987 bij DZH/Dunea-terreinbeheer; zonder die kaart wordt geen lijn gereconstrueerd.</w:t>
+      </w:r>
+    </w:p>
+    <w:p>
+      <w:pPr>
+        <w:pStyle w:val="BodyText"/>
+      </w:pPr>
+      <w:r>
+        <w:t xml:space="preserve">Haagse Archeologische Rapportage 1204 uit februari 2012 voegt een nieuwe ruimtelijke bron toe voor Elleboogsprang en Vinkenhoek. Afbeelding 1 op PDF-pagina 4 bevat gebiedscontouren; de rapporttekst koppelt Elleboogsprang tevens aan Sprang H. Voor de maatregelactualisering zijn de contouren met de schaalbalk en de gepubliceerde RD-kilometerhokken georeferereerd. Dat levert een robuuste kaveltoedeling op: Elleboogsprang raakt M10-12-76 en M75, Vinkenhoek ligt in M71. De bronkaart bevat echter geen geodetische controlepunten of digitale brongeometrie. Daarom is de afgeleide contour niet aan de 71 brongeometrieën van versie</w:t>
+      </w:r>
+      <w:r>
+        <w:t xml:space="preserve"> </w:t>
+      </w:r>
+      <w:r>
+        <w:rPr>
+          <w:rStyle w:val="VerbatimChar"/>
+        </w:rPr>
+        <w:t xml:space="preserve">meijendel_nameninventaris_2026-10-14</w:t>
+      </w:r>
+      <w:r>
+        <w:t xml:space="preserve"> </w:t>
+      </w:r>
+      <w:r>
+        <w:t xml:space="preserve">toegevoegd en blijft</w:t>
+      </w:r>
+      <w:r>
+        <w:t xml:space="preserve"> </w:t>
+      </w:r>
+      <w:r>
+        <w:rPr>
+          <w:rStyle w:val="VerbatimChar"/>
+        </w:rPr>
+        <w:t xml:space="preserve">maatregel_geometrie</w:t>
+      </w:r>
+      <w:r>
+        <w:t xml:space="preserve"> </w:t>
+      </w:r>
+      <w:r>
+        <w:t xml:space="preserve">leeg. Vinkenhoek behoudt voorlopig zijn historische naamrecord zonder brongeometrie; Elleboogsprang wordt pas als zelfstandig naamobject aan een volgende inventarisversie toegevoegd wanneer de nieuwe bronlevering versiegebonden en reproduceerbaar kan worden geïmporteerd.</w:t>
       </w:r>
     </w:p>
     <w:p>

</xml_diff>

<commit_message>
Koppel PIM-winputten aan 22 kavels
</commit_message>
<xml_diff>
--- a/docs/MEIJENDEL_BRONREGISTER.docx
+++ b/docs/MEIJENDEL_BRONREGISTER.docx
@@ -6366,7 +6366,7 @@
         <w:t xml:space="preserve"> </w:t>
       </w:r>
       <w:r>
-        <w:t xml:space="preserve">De levende lokale database bevat 18 projecten, 43 bronnen, 64 uitvoeringen, 104 expliciete jaarbeoordelingen uit 1967–2026 en 98 bronkoppelingen. Van de jaarbeoordelingen zijn er 88</w:t>
+        <w:t xml:space="preserve">De levende lokale database bevat 18 projecten, 43 bronnen, 64 uitvoeringen, 104 expliciete jaarbeoordelingen uit 1967–2026 en 99 bronkoppelingen. Van de jaarbeoordelingen zijn er 88</w:t>
       </w:r>
       <w:r>
         <w:t xml:space="preserve"> </w:t>
@@ -6487,7 +6487,7 @@
         <w:t xml:space="preserve"> </w:t>
       </w:r>
       <w:r>
-        <w:t xml:space="preserve">bevat 184 geverifieerde directe relaties. Daarvan zijn 48 onderbouwd met expliciete kavelvermeldingen, gebruikersvaststellingen, een bijzondere gebiedsnaam of de gedigitaliseerde contouren uit HAR 1204. De nameninventaris voegt 42 geometrische doorsnijdingen toe voor zeven volledig en letterlijk gelokaliseerde uitvoeringen. De tien relaties van het onderzochte zoekgebied van het niet uitgevoerde PAS-maaibeheer 23 blijven M10-12-76, M12a, M62, M63, M64, M65, M72, M73, M74 en M75. De vier jaarregels 2016–2019 blijven</w:t>
+        <w:t xml:space="preserve">bevat 206 geverifieerde directe relaties. Daarvan zijn 70 onderbouwd met expliciete kavelvermeldingen, gebruikersvaststellingen, een bijzondere gebiedsnaam of gedigitaliseerde broncontouren uit HAR 1204 en HAR 1306. De nameninventaris voegt 42 geometrische doorsnijdingen toe voor zeven volledig en letterlijk gelokaliseerde uitvoeringen. De tien relaties van het onderzochte zoekgebied van het niet uitgevoerde PAS-maaibeheer 23 blijven M10-12-76, M12a, M62, M63, M64, M65, M72, M73, M74 en M75. De vier jaarregels 2016–2019 blijven</w:t>
       </w:r>
       <w:r>
         <w:t xml:space="preserve"> </w:t>
@@ -6499,7 +6499,7 @@
         <w:t xml:space="preserve">niet_uitgevoerd</w:t>
       </w:r>
       <w:r>
-        <w:t xml:space="preserve">; de koppelingen bewijzen dus geen maaiwerk. Daarnaast zijn elf relaties opgenomen voor de volledige systemen Pan 13 en Plas 20, zeven voor het PIM-leidingwerk, één voor infiltratieplas 27.2, vier voor het bronvast gelokaliseerde deel van de programmabrede pannenmaatregel en acht voor de plagwerkzaamheden van het waterwinningsprogramma. De begrazing van de Helmduinen vanaf eind 1991 is na correctie op 15 oktober 2026 gekoppeld aan M15 en M16. M17a is retroactief verwijderd: die kavel hoort voor deze naamtoedeling bij Prinsenduin, niet bij Helmduinen. De begrazing loopt tot heden door. Omdat de bron geen oppervlakte per kavel geeft, blijft</w:t>
+        <w:t xml:space="preserve">; de koppelingen bewijzen dus geen maaiwerk. Daarnaast zijn elf relaties opgenomen voor de volledige systemen Pan 13 en Plas 20, zeven voor het PIM-leidingwerk, 22 voor de PIM-winputten, één voor infiltratieplas 27.2, vier voor het bronvast gelokaliseerde deel van de programmabrede pannenmaatregel en acht voor de plagwerkzaamheden van het waterwinningsprogramma. De begrazing van de Helmduinen vanaf eind 1991 is na correctie op 15 oktober 2026 gekoppeld aan M15 en M16. M17a is retroactief verwijderd: die kavel hoort voor deze naamtoedeling bij Prinsenduin, niet bij Helmduinen. De begrazing loopt tot heden door. Omdat de bron geen oppervlakte per kavel geeft, blijft</w:t>
       </w:r>
       <w:r>
         <w:t xml:space="preserve"> </w:t>
@@ -7412,6 +7412,41 @@
         <w:pStyle w:val="BodyText"/>
       </w:pPr>
       <w:r>
+        <w:t xml:space="preserve">De bijna 700 nieuwe winputten uit het optimalisatieprogramma zijn gekoppeld aan 22 unieke kavels: M1a, M1b, M3, M6, M10-12-76, M12a, M14, M15, M16, M16s, M17a, M17b, M31, M32, M33, M36, M41, M43, M45, M55, M62 en M83. Dunea bevestigt de afronding in 2018 en het programmatotaal, maar publiceert geen putpunten of verdeling per winningsserie. HAR 1306 uit 2013 begrenst op afbeelding 1 de PIM-werkcorridors en noemt in bijlage 2 nieuwe of vervangende putten in serie HH, WW, RA, C, KG, WV, E, LV, Complex 8.3 en Complex 8. De broncorridors zijn over de actuele kavelgeometrie gelegd. Ton bevestigde op 16 oktober 2026 de twintig duidelijke doorsnijdingen en daarnaast M16 en M62 als grensdoorsnijdingen. M10-12-76 wordt één keer gekoppeld, hoewel de kavel zowel serie HH als de rand van serie WW raakt. HAR 1306 blijft ruimtelijke plancontext; de feitelijke afronding volgt uit de afzonderlijke Dunea-bron. De kaart laat geen verdeling van de bijna 700 putten over kavels toe. Daarom blijven</w:t>
+      </w:r>
+      <w:r>
+        <w:t xml:space="preserve"> </w:t>
+      </w:r>
+      <w:r>
+        <w:rPr>
+          <w:rStyle w:val="VerbatimChar"/>
+        </w:rPr>
+        <w:t xml:space="preserve">maatregel_geometrie</w:t>
+      </w:r>
+      <w:r>
+        <w:t xml:space="preserve"> </w:t>
+      </w:r>
+      <w:r>
+        <w:t xml:space="preserve">en alle</w:t>
+      </w:r>
+      <w:r>
+        <w:t xml:space="preserve"> </w:t>
+      </w:r>
+      <w:r>
+        <w:rPr>
+          <w:rStyle w:val="VerbatimChar"/>
+        </w:rPr>
+        <w:t xml:space="preserve">doorsnijding_pct</w:t>
+      </w:r>
+      <w:r>
+        <w:t xml:space="preserve">-waarden leeg. De uitgevoerde jaarregel voor 2018 levert 22 plot-jaarrijen.</w:t>
+      </w:r>
+    </w:p>
+    <w:p>
+      <w:pPr>
+        <w:pStyle w:val="BodyText"/>
+      </w:pPr>
+      <w:r>
         <w:t xml:space="preserve">Infiltratieplas 27.2 is als afzonderlijke uitvoering binnen hetzelfde optimalisatieprogramma vastgelegd. De officiële externe bijlage uit 2013 beschrijft verwijdering van organisch verrijkt bodemmateriaal, aanpassing van de oever en waar mogelijk van de onderwateroever tussen 1 september 2013 en 1 maart 2014. Dunea bevestigt in 2018 dat het programma is afgerond. KIWA Mededeling 114 toont op PDF-pagina 73 de ligging van 27.2 in het noordelijke plassensysteem; vergelijking met de actuele kavelgeometrie en Tons bevestiging van 15 oktober 2026 koppelen de uitvoering aan M77. De precieze werkvoetafdruk binnen M77 is niet gepubliceerd en</w:t>
       </w:r>
       <w:r>
@@ -7447,7 +7482,7 @@
         <w:pStyle w:val="BodyText"/>
       </w:pPr>
       <w:r>
-        <w:t xml:space="preserve">De 184 plotkoppelingen en 88 uitgevoerde jaarregels leveren samen 275 regels in</w:t>
+        <w:t xml:space="preserve">De 206 plotkoppelingen en 88 uitgevoerde jaarregels leveren samen 297 regels in</w:t>
       </w:r>
       <w:r>
         <w:t xml:space="preserve"> </w:t>
@@ -7489,7 +7524,7 @@
         <w:t xml:space="preserve"> </w:t>
       </w:r>
       <w:r>
-        <w:t xml:space="preserve">en ontstaan geen plot-jaarrijen. Het PIM-leidingwerk voegt zeven scoperegels voor 2018 toe. De programmabrede pannenmaatregel voegt vier scoperegels voor M6, M7, M13 en M77 in 2018 toe. De programmabrede plagwerkzaamheden voegen acht scoperegels voor M10-12-76, M12a, M15, M16, M71, M73, M74 en M75 in 2018 toe. Infiltratieplas 27.2 voegt voor M77 één regel in 2013 en één in 2014 toe. De overige eerder vastgelegde koppelingen en jaarselecties blijven inhoudelijk ongewijzigd. Voor beide doorlopende begrazingsmaatregelen met een expliciet startjaar bewaart deze view alleen dat startjaar; de open einddatum en</w:t>
+        <w:t xml:space="preserve">en ontstaan geen plot-jaarrijen. Het PIM-leidingwerk voegt zeven scoperegels voor 2018 toe. De PIM-winputten voegen 22 scoperegels voor 2018 toe; het programmatotaal van bijna 700 putten is niet per kavel verdeeld. De programmabrede pannenmaatregel voegt vier scoperegels voor M6, M7, M13 en M77 in 2018 toe. De programmabrede plagwerkzaamheden voegen acht scoperegels voor M10-12-76, M12a, M15, M16, M71, M73, M74 en M75 in 2018 toe. Infiltratieplas 27.2 voegt voor M77 één regel in 2013 en één in 2014 toe. De overige eerder vastgelegde koppelingen en jaarselecties blijven inhoudelijk ongewijzigd. Voor beide doorlopende begrazingsmaatregelen met een expliciet startjaar bewaart deze view alleen dat startjaar; de open einddatum en</w:t>
       </w:r>
       <w:r>
         <w:t xml:space="preserve"> </w:t>
@@ -7570,7 +7605,7 @@
         <w:t xml:space="preserve"> </w:t>
       </w:r>
       <w:r>
-        <w:t xml:space="preserve">Bronvast op project-, uitvoering- en jaarniveau voor 43 ingevoerde bronnen en 64 uitvoeringen. De algemene kavel- en gebiedsindeling is geometrisch beschikbaar voor de 55 actuele plots uit 2025; vijf expliciet gekoppelde historische kavels hebben geen afzonderlijke geometrie. De bronvaste plot-jaarlaag bevat 275 regels voor 1967–1969, 1972–1975, 1988–1991, 1993, 1997, 2002, 2005–2006, 2013–2014 en 2016–2025. Het onderzochte PAS-maaibeheer 23 levert geen plot-jaarrijen op, omdat de vier jaarregels 2016–2019</w:t>
+        <w:t xml:space="preserve">Bronvast op project-, uitvoering- en jaarniveau voor 43 ingevoerde bronnen en 64 uitvoeringen. De algemene kavel- en gebiedsindeling is geometrisch beschikbaar voor de 55 actuele plots uit 2025; vijf expliciet gekoppelde historische kavels hebben geen afzonderlijke geometrie. De bronvaste plot-jaarlaag bevat 297 regels voor 1967–1969, 1972–1975, 1988–1991, 1993, 1997, 2002, 2005–2006, 2013–2014 en 2016–2025. Het onderzochte PAS-maaibeheer 23 levert geen plot-jaarrijen op, omdat de vier jaarregels 2016–2019</w:t>
       </w:r>
       <w:r>
         <w:t xml:space="preserve"> </w:t>
@@ -7600,7 +7635,7 @@
         <w:t xml:space="preserve"> </w:t>
       </w:r>
       <w:r>
-        <w:t xml:space="preserve">bevat 184 relaties. Helmduinen heeft er twee; Meeuwenduin en Prinsenduin samen zeven; maatregel 22h zes; de begrazing van Vallei Meijendel negen; maatregel 3c dertien; maatregel 3d vijf; de slagboomvervanging twee; het onderzochte PAS-maaibeheer 23 tien; het maaibeheer in Ruygenhoek, Lange Strook en De Loopert vijf; het PIM-leidingwerk zeven; de programmabrede pannenmaatregel vier; de programmabrede plagwerkzaamheden acht; infiltratieplas 27.2 één. Zeven uitvoeringen hebben geen directe plotkoppeling. De twee Bendel-uitvoeringen en de begrazing van landgoed Weiduin vallen aantoonbaar buiten het Meijendel-plotgebied, zodat nog vier geheel ongekoppelde uitvoeringen ruimtelijk moeten worden beoordeeld.</w:t>
+        <w:t xml:space="preserve">bevat 206 relaties. Helmduinen heeft er twee; Meeuwenduin en Prinsenduin samen zeven; maatregel 22h zes; de begrazing van Vallei Meijendel negen; maatregel 3c dertien; maatregel 3d vijf; de slagboomvervanging twee; het onderzochte PAS-maaibeheer 23 tien; het maaibeheer in Ruygenhoek, Lange Strook en De Loopert vijf; het PIM-leidingwerk zeven; de PIM-winputten 22; de programmabrede pannenmaatregel vier; de programmabrede plagwerkzaamheden acht; infiltratieplas 27.2 één. Zes uitvoeringen hebben geen directe plotkoppeling. De twee Bendel-uitvoeringen en de begrazing van landgoed Weiduin vallen aantoonbaar buiten het Meijendel-plotgebied, zodat nog drie geheel ongekoppelde uitvoeringen ruimtelijk moeten worden beoordeeld.</w:t>
       </w:r>
     </w:p>
     <w:p>

</xml_diff>

<commit_message>
Koppel kervennabeheer aan M16 en M17a
</commit_message>
<xml_diff>
--- a/docs/MEIJENDEL_BRONREGISTER.docx
+++ b/docs/MEIJENDEL_BRONREGISTER.docx
@@ -6487,7 +6487,7 @@
         <w:t xml:space="preserve"> </w:t>
       </w:r>
       <w:r>
-        <w:t xml:space="preserve">bevat 206 geverifieerde directe relaties. Daarvan zijn 70 onderbouwd met expliciete kavelvermeldingen, gebruikersvaststellingen, een bijzondere gebiedsnaam of gedigitaliseerde broncontouren uit HAR 1204 en HAR 1306. De nameninventaris voegt 42 geometrische doorsnijdingen toe voor zeven volledig en letterlijk gelokaliseerde uitvoeringen. De tien relaties van het onderzochte zoekgebied van het niet uitgevoerde PAS-maaibeheer 23 blijven M10-12-76, M12a, M62, M63, M64, M65, M72, M73, M74 en M75. De vier jaarregels 2016–2019 blijven</w:t>
+        <w:t xml:space="preserve">bevat 208 geverifieerde directe relaties. Daarvan zijn 72 onderbouwd met expliciete kavelvermeldingen, gebruikersvaststellingen, een bijzondere gebiedsnaam of gedigitaliseerde broncontouren uit HAR 1204 en HAR 1306. De nameninventaris voegt 42 geometrische doorsnijdingen toe voor zeven volledig en letterlijk gelokaliseerde uitvoeringen. De tien relaties van het onderzochte zoekgebied van het niet uitgevoerde PAS-maaibeheer 23 blijven M10-12-76, M12a, M62, M63, M64, M65, M72, M73, M74 en M75. De vier jaarregels 2016–2019 blijven</w:t>
       </w:r>
       <w:r>
         <w:t xml:space="preserve"> </w:t>
@@ -6499,7 +6499,7 @@
         <w:t xml:space="preserve">niet_uitgevoerd</w:t>
       </w:r>
       <w:r>
-        <w:t xml:space="preserve">; de koppelingen bewijzen dus geen maaiwerk. Daarnaast zijn elf relaties opgenomen voor de volledige systemen Pan 13 en Plas 20, zeven voor het PIM-leidingwerk, 22 voor de PIM-winputten, één voor infiltratieplas 27.2, vier voor het bronvast gelokaliseerde deel van de programmabrede pannenmaatregel en acht voor de plagwerkzaamheden van het waterwinningsprogramma. De begrazing van de Helmduinen vanaf eind 1991 is na correctie op 15 oktober 2026 gekoppeld aan M15 en M16. M17a is retroactief verwijderd: die kavel hoort voor deze naamtoedeling bij Prinsenduin, niet bij Helmduinen. De begrazing loopt tot heden door. Omdat de bron geen oppervlakte per kavel geeft, blijft</w:t>
+        <w:t xml:space="preserve">; de koppelingen bewijzen dus geen maaiwerk. Daarnaast zijn elf relaties opgenomen voor de volledige systemen Pan 13 en Plas 20, zeven voor het PIM-leidingwerk, 22 voor de PIM-winputten, twee voor het nabeheer van de kerfzone bij het Parnassiapad, één voor infiltratieplas 27.2, vier voor het bronvast gelokaliseerde deel van de programmabrede pannenmaatregel en acht voor de plagwerkzaamheden van het waterwinningsprogramma. De begrazing van de Helmduinen vanaf eind 1991 is na correctie op 15 oktober 2026 gekoppeld aan M15 en M16. M17a is retroactief verwijderd: die kavel hoort voor deze naamtoedeling bij Prinsenduin, niet bij Helmduinen. De begrazing loopt tot heden door. Omdat de bron geen oppervlakte per kavel geeft, blijft</w:t>
       </w:r>
       <w:r>
         <w:t xml:space="preserve"> </w:t>
@@ -6541,7 +6541,22 @@
         <w:t xml:space="preserve"> </w:t>
       </w:r>
       <w:r>
-        <w:t xml:space="preserve">blijft daarom leeg.</w:t>
+        <w:t xml:space="preserve">blijft daarom leeg. Het nabeheer van de vijf bestaande kerven in 2016 en 2024 is gekoppeld aan M16 en M17a. Het ontwerpbeheerplan bevestigt beide uitvoeringsjaren. Van der Hagen, Ten Napel en Arens (2017) beschrijven de zuidelijke, uitgevoerde kerfzone over 750 meter ten zuiden van de bunker bij het Parnassiapad en melden dat tot het voorjaar van 2017 nog geen nabeheer nodig was. Die publicatie geldt daarom voor deze uitvoering als ruimtelijke plancontext, niet als bewijs van het nabeheer. De exacte werkvoetafdruk per jaar en kavel is niet gepubliceerd;</w:t>
+      </w:r>
+      <w:r>
+        <w:t xml:space="preserve"> </w:t>
+      </w:r>
+      <w:r>
+        <w:rPr>
+          <w:rStyle w:val="VerbatimChar"/>
+        </w:rPr>
+        <w:t xml:space="preserve">doorsnijding_pct</w:t>
+      </w:r>
+      <w:r>
+        <w:t xml:space="preserve"> </w:t>
+      </w:r>
+      <w:r>
+        <w:t xml:space="preserve">blijft leeg.</w:t>
       </w:r>
     </w:p>
     <w:p>
@@ -7482,7 +7497,7 @@
         <w:pStyle w:val="BodyText"/>
       </w:pPr>
       <w:r>
-        <w:t xml:space="preserve">De 206 plotkoppelingen en 88 uitgevoerde jaarregels leveren samen 297 regels in</w:t>
+        <w:t xml:space="preserve">De 208 plotkoppelingen en 88 uitgevoerde jaarregels leveren samen 301 regels in</w:t>
       </w:r>
       <w:r>
         <w:t xml:space="preserve"> </w:t>
@@ -7524,7 +7539,7 @@
         <w:t xml:space="preserve"> </w:t>
       </w:r>
       <w:r>
-        <w:t xml:space="preserve">en ontstaan geen plot-jaarrijen. Het PIM-leidingwerk voegt zeven scoperegels voor 2018 toe. De PIM-winputten voegen 22 scoperegels voor 2018 toe; het programmatotaal van bijna 700 putten is niet per kavel verdeeld. De programmabrede pannenmaatregel voegt vier scoperegels voor M6, M7, M13 en M77 in 2018 toe. De programmabrede plagwerkzaamheden voegen acht scoperegels voor M10-12-76, M12a, M15, M16, M71, M73, M74 en M75 in 2018 toe. Infiltratieplas 27.2 voegt voor M77 één regel in 2013 en één in 2014 toe. De overige eerder vastgelegde koppelingen en jaarselecties blijven inhoudelijk ongewijzigd. Voor beide doorlopende begrazingsmaatregelen met een expliciet startjaar bewaart deze view alleen dat startjaar; de open einddatum en</w:t>
+        <w:t xml:space="preserve">en ontstaan geen plot-jaarrijen. Het PIM-leidingwerk voegt zeven scoperegels voor 2018 toe. De PIM-winputten voegen 22 scoperegels voor 2018 toe; het programmatotaal van bijna 700 putten is niet per kavel verdeeld. Het nabeheer van de kerfzone voegt vier scoperegels toe: M16 en M17a in 2016 en 2024. De programmabrede pannenmaatregel voegt vier scoperegels voor M6, M7, M13 en M77 in 2018 toe. De programmabrede plagwerkzaamheden voegen acht scoperegels voor M10-12-76, M12a, M15, M16, M71, M73, M74 en M75 in 2018 toe. Infiltratieplas 27.2 voegt voor M77 één regel in 2013 en één in 2014 toe. De overige eerder vastgelegde koppelingen en jaarselecties blijven inhoudelijk ongewijzigd. Voor beide doorlopende begrazingsmaatregelen met een expliciet startjaar bewaart deze view alleen dat startjaar; de open einddatum en</w:t>
       </w:r>
       <w:r>
         <w:t xml:space="preserve"> </w:t>
@@ -7605,7 +7620,7 @@
         <w:t xml:space="preserve"> </w:t>
       </w:r>
       <w:r>
-        <w:t xml:space="preserve">Bronvast op project-, uitvoering- en jaarniveau voor 43 ingevoerde bronnen en 64 uitvoeringen. De algemene kavel- en gebiedsindeling is geometrisch beschikbaar voor de 55 actuele plots uit 2025; vijf expliciet gekoppelde historische kavels hebben geen afzonderlijke geometrie. De bronvaste plot-jaarlaag bevat 297 regels voor 1967–1969, 1972–1975, 1988–1991, 1993, 1997, 2002, 2005–2006, 2013–2014 en 2016–2025. Het onderzochte PAS-maaibeheer 23 levert geen plot-jaarrijen op, omdat de vier jaarregels 2016–2019</w:t>
+        <w:t xml:space="preserve">Bronvast op project-, uitvoering- en jaarniveau voor 43 ingevoerde bronnen en 64 uitvoeringen. De algemene kavel- en gebiedsindeling is geometrisch beschikbaar voor de 55 actuele plots uit 2025; vijf expliciet gekoppelde historische kavels hebben geen afzonderlijke geometrie. De bronvaste plot-jaarlaag bevat 301 regels voor 1967–1969, 1972–1975, 1988–1991, 1993, 1997, 2002, 2005–2006, 2013–2014 en 2016–2025. Het onderzochte PAS-maaibeheer 23 levert geen plot-jaarrijen op, omdat de vier jaarregels 2016–2019</w:t>
       </w:r>
       <w:r>
         <w:t xml:space="preserve"> </w:t>
@@ -7635,7 +7650,7 @@
         <w:t xml:space="preserve"> </w:t>
       </w:r>
       <w:r>
-        <w:t xml:space="preserve">bevat 206 relaties. Helmduinen heeft er twee; Meeuwenduin en Prinsenduin samen zeven; maatregel 22h zes; de begrazing van Vallei Meijendel negen; maatregel 3c dertien; maatregel 3d vijf; de slagboomvervanging twee; het onderzochte PAS-maaibeheer 23 tien; het maaibeheer in Ruygenhoek, Lange Strook en De Loopert vijf; het PIM-leidingwerk zeven; de PIM-winputten 22; de programmabrede pannenmaatregel vier; de programmabrede plagwerkzaamheden acht; infiltratieplas 27.2 één. Zes uitvoeringen hebben geen directe plotkoppeling. De twee Bendel-uitvoeringen en de begrazing van landgoed Weiduin vallen aantoonbaar buiten het Meijendel-plotgebied, zodat nog drie geheel ongekoppelde uitvoeringen ruimtelijk moeten worden beoordeeld.</w:t>
+        <w:t xml:space="preserve">bevat 208 relaties. Helmduinen heeft er twee; Meeuwenduin en Prinsenduin samen zeven; maatregel 22h zes; de begrazing van Vallei Meijendel negen; maatregel 3c dertien; maatregel 3d vijf; de slagboomvervanging twee; het onderzochte PAS-maaibeheer 23 tien; het maaibeheer in Ruygenhoek, Lange Strook en De Loopert vijf; het PIM-leidingwerk zeven; de PIM-winputten 22; het nabeheer van de kerfzone twee; de programmabrede pannenmaatregel vier; de programmabrede plagwerkzaamheden acht; infiltratieplas 27.2 één. Vijf uitvoeringen hebben geen directe plotkoppeling. De twee Bendel-uitvoeringen en de begrazing van landgoed Weiduin vallen aantoonbaar buiten het Meijendel-plotgebied, zodat nog twee geheel ongekoppelde uitvoeringen ruimtelijk moeten worden beoordeeld.</w:t>
       </w:r>
     </w:p>
     <w:p>

</xml_diff>

<commit_message>
Koppel aanleg vijf kerven aan drie kavels
</commit_message>
<xml_diff>
--- a/docs/MEIJENDEL_BRONREGISTER.docx
+++ b/docs/MEIJENDEL_BRONREGISTER.docx
@@ -6487,7 +6487,7 @@
         <w:t xml:space="preserve"> </w:t>
       </w:r>
       <w:r>
-        <w:t xml:space="preserve">bevat 208 geverifieerde directe relaties. Daarvan zijn 72 onderbouwd met expliciete kavelvermeldingen, gebruikersvaststellingen, een bijzondere gebiedsnaam of gedigitaliseerde broncontouren uit HAR 1204 en HAR 1306. De nameninventaris voegt 42 geometrische doorsnijdingen toe voor zeven volledig en letterlijk gelokaliseerde uitvoeringen. De tien relaties van het onderzochte zoekgebied van het niet uitgevoerde PAS-maaibeheer 23 blijven M10-12-76, M12a, M62, M63, M64, M65, M72, M73, M74 en M75. De vier jaarregels 2016–2019 blijven</w:t>
+        <w:t xml:space="preserve">bevat 211 geverifieerde directe relaties. Daarvan zijn 75 onderbouwd met expliciete kavelvermeldingen, gebruikersvaststellingen, een bijzondere gebiedsnaam of gedigitaliseerde broncontouren uit HAR 1204 en HAR 1306. De nameninventaris voegt 42 geometrische doorsnijdingen toe voor zeven volledig en letterlijk gelokaliseerde uitvoeringen. De tien relaties van het onderzochte zoekgebied van het niet uitgevoerde PAS-maaibeheer 23 blijven M10-12-76, M12a, M62, M63, M64, M65, M72, M73, M74 en M75. De vier jaarregels 2016–2019 blijven</w:t>
       </w:r>
       <w:r>
         <w:t xml:space="preserve"> </w:t>
@@ -6499,7 +6499,7 @@
         <w:t xml:space="preserve">niet_uitgevoerd</w:t>
       </w:r>
       <w:r>
-        <w:t xml:space="preserve">; de koppelingen bewijzen dus geen maaiwerk. Daarnaast zijn elf relaties opgenomen voor de volledige systemen Pan 13 en Plas 20, zeven voor het PIM-leidingwerk, 22 voor de PIM-winputten, twee voor het nabeheer van de kerfzone bij het Parnassiapad, één voor infiltratieplas 27.2, vier voor het bronvast gelokaliseerde deel van de programmabrede pannenmaatregel en acht voor de plagwerkzaamheden van het waterwinningsprogramma. De begrazing van de Helmduinen vanaf eind 1991 is na correctie op 15 oktober 2026 gekoppeld aan M15 en M16. M17a is retroactief verwijderd: die kavel hoort voor deze naamtoedeling bij Prinsenduin, niet bij Helmduinen. De begrazing loopt tot heden door. Omdat de bron geen oppervlakte per kavel geeft, blijft</w:t>
+        <w:t xml:space="preserve">; de koppelingen bewijzen dus geen maaiwerk. Daarnaast zijn elf relaties opgenomen voor de volledige systemen Pan 13 en Plas 20, zeven voor het PIM-leidingwerk, 22 voor de PIM-winputten, twee voor het nabeheer van de kerfzone bij het Parnassiapad, drie voor de aanleg van de vijf kerven, één voor infiltratieplas 27.2, vier voor het bronvast gelokaliseerde deel van de programmabrede pannenmaatregel en acht voor de plagwerkzaamheden van het waterwinningsprogramma. De begrazing van de Helmduinen vanaf eind 1991 is na correctie op 15 oktober 2026 gekoppeld aan M15 en M16. M17a is retroactief verwijderd: die kavel hoort voor deze naamtoedeling bij Prinsenduin, niet bij Helmduinen. De begrazing loopt tot heden door. Omdat de bron geen oppervlakte per kavel geeft, blijft</w:t>
       </w:r>
       <w:r>
         <w:t xml:space="preserve"> </w:t>
@@ -6541,7 +6541,7 @@
         <w:t xml:space="preserve"> </w:t>
       </w:r>
       <w:r>
-        <w:t xml:space="preserve">blijft daarom leeg. Het nabeheer van de vijf bestaande kerven in 2016 en 2024 is gekoppeld aan M16 en M17a. Het ontwerpbeheerplan bevestigt beide uitvoeringsjaren. Van der Hagen, Ten Napel en Arens (2017) beschrijven de zuidelijke, uitgevoerde kerfzone over 750 meter ten zuiden van de bunker bij het Parnassiapad en melden dat tot het voorjaar van 2017 nog geen nabeheer nodig was. Die publicatie geldt daarom voor deze uitvoering als ruimtelijke plancontext, niet als bewijs van het nabeheer. De exacte werkvoetafdruk per jaar en kavel is niet gepubliceerd;</w:t>
+        <w:t xml:space="preserve">blijft daarom leeg. Het nabeheer van de vijf bestaande kerven in 2016 en 2024 is gekoppeld aan M16 en M17a. Het ontwerpbeheerplan bevestigt beide uitvoeringsjaren. Van der Hagen, Ten Napel en Arens (2017) beschrijven de zuidelijke, uitgevoerde kerfzone over 750 meter ten zuiden van de bunker bij het Parnassiapad en melden dat tot het voorjaar van 2017 nog geen nabeheer nodig was. Die publicatie geldt daarom voor deze uitvoering als ruimtelijke plancontext, niet als bewijs van het nabeheer. De aanleg van de vijf kerven in de winters 2013/2014 en 2014/2015 is op 16 oktober 2026 gekoppeld aan M15, M16 en M17a. De bron meldt 109.434 m² ontgraven terrein voor de gezamenlijke uitvoering, maar verdeelt dit oppervlak niet over de drie kavels of de twee uitvoeringsjaren. De zes plot-jaarrijen voor 2014 en 2015 beschrijven daarom uitsluitend de gezamenlijke uitvoeringsscope. Voor aanleg en nabeheer is de exacte werkvoetafdruk per jaar en kavel niet gepubliceerd;</w:t>
       </w:r>
       <w:r>
         <w:t xml:space="preserve"> </w:t>
@@ -7497,7 +7497,7 @@
         <w:pStyle w:val="BodyText"/>
       </w:pPr>
       <w:r>
-        <w:t xml:space="preserve">De 208 plotkoppelingen en 88 uitgevoerde jaarregels leveren samen 301 regels in</w:t>
+        <w:t xml:space="preserve">De 211 plotkoppelingen en 88 uitgevoerde jaarregels leveren samen 307 regels in</w:t>
       </w:r>
       <w:r>
         <w:t xml:space="preserve"> </w:t>
@@ -7539,7 +7539,7 @@
         <w:t xml:space="preserve"> </w:t>
       </w:r>
       <w:r>
-        <w:t xml:space="preserve">en ontstaan geen plot-jaarrijen. Het PIM-leidingwerk voegt zeven scoperegels voor 2018 toe. De PIM-winputten voegen 22 scoperegels voor 2018 toe; het programmatotaal van bijna 700 putten is niet per kavel verdeeld. Het nabeheer van de kerfzone voegt vier scoperegels toe: M16 en M17a in 2016 en 2024. De programmabrede pannenmaatregel voegt vier scoperegels voor M6, M7, M13 en M77 in 2018 toe. De programmabrede plagwerkzaamheden voegen acht scoperegels voor M10-12-76, M12a, M15, M16, M71, M73, M74 en M75 in 2018 toe. Infiltratieplas 27.2 voegt voor M77 één regel in 2013 en één in 2014 toe. De overige eerder vastgelegde koppelingen en jaarselecties blijven inhoudelijk ongewijzigd. Voor beide doorlopende begrazingsmaatregelen met een expliciet startjaar bewaart deze view alleen dat startjaar; de open einddatum en</w:t>
+        <w:t xml:space="preserve">en ontstaan geen plot-jaarrijen. Het PIM-leidingwerk voegt zeven scoperegels voor 2018 toe. De PIM-winputten voegen 22 scoperegels voor 2018 toe; het programmatotaal van bijna 700 putten is niet per kavel verdeeld. Het nabeheer van de kerfzone voegt vier scoperegels toe: M16 en M17a in 2016 en 2024. De aanleg van de vijf kerven voegt zes gezamenlijke scoperegels toe: M15, M16 en M17a in 2014 en 2015; het totaal van 109.434 m² is niet per kavel of jaar verdeeld. De programmabrede pannenmaatregel voegt vier scoperegels voor M6, M7, M13 en M77 in 2018 toe. De programmabrede plagwerkzaamheden voegen acht scoperegels voor M10-12-76, M12a, M15, M16, M71, M73, M74 en M75 in 2018 toe. Infiltratieplas 27.2 voegt voor M77 één regel in 2013 en één in 2014 toe. De overige eerder vastgelegde koppelingen en jaarselecties blijven inhoudelijk ongewijzigd. Voor beide doorlopende begrazingsmaatregelen met een expliciet startjaar bewaart deze view alleen dat startjaar; de open einddatum en</w:t>
       </w:r>
       <w:r>
         <w:t xml:space="preserve"> </w:t>
@@ -7620,7 +7620,7 @@
         <w:t xml:space="preserve"> </w:t>
       </w:r>
       <w:r>
-        <w:t xml:space="preserve">Bronvast op project-, uitvoering- en jaarniveau voor 43 ingevoerde bronnen en 64 uitvoeringen. De algemene kavel- en gebiedsindeling is geometrisch beschikbaar voor de 55 actuele plots uit 2025; vijf expliciet gekoppelde historische kavels hebben geen afzonderlijke geometrie. De bronvaste plot-jaarlaag bevat 301 regels voor 1967–1969, 1972–1975, 1988–1991, 1993, 1997, 2002, 2005–2006, 2013–2014 en 2016–2025. Het onderzochte PAS-maaibeheer 23 levert geen plot-jaarrijen op, omdat de vier jaarregels 2016–2019</w:t>
+        <w:t xml:space="preserve">Bronvast op project-, uitvoering- en jaarniveau voor 43 ingevoerde bronnen en 64 uitvoeringen. De algemene kavel- en gebiedsindeling is geometrisch beschikbaar voor de 55 actuele plots uit 2025; vijf expliciet gekoppelde historische kavels hebben geen afzonderlijke geometrie. De bronvaste plot-jaarlaag bevat 307 regels voor 1967–1969, 1972–1975, 1988–1991, 1993, 1997, 2002, 2005–2006 en 2013–2025. Het onderzochte PAS-maaibeheer 23 levert geen plot-jaarrijen op, omdat de vier jaarregels 2016–2019</w:t>
       </w:r>
       <w:r>
         <w:t xml:space="preserve"> </w:t>
@@ -7650,7 +7650,7 @@
         <w:t xml:space="preserve"> </w:t>
       </w:r>
       <w:r>
-        <w:t xml:space="preserve">bevat 208 relaties. Helmduinen heeft er twee; Meeuwenduin en Prinsenduin samen zeven; maatregel 22h zes; de begrazing van Vallei Meijendel negen; maatregel 3c dertien; maatregel 3d vijf; de slagboomvervanging twee; het onderzochte PAS-maaibeheer 23 tien; het maaibeheer in Ruygenhoek, Lange Strook en De Loopert vijf; het PIM-leidingwerk zeven; de PIM-winputten 22; het nabeheer van de kerfzone twee; de programmabrede pannenmaatregel vier; de programmabrede plagwerkzaamheden acht; infiltratieplas 27.2 één. Vijf uitvoeringen hebben geen directe plotkoppeling. De twee Bendel-uitvoeringen en de begrazing van landgoed Weiduin vallen aantoonbaar buiten het Meijendel-plotgebied, zodat nog twee geheel ongekoppelde uitvoeringen ruimtelijk moeten worden beoordeeld.</w:t>
+        <w:t xml:space="preserve">bevat 211 relaties. Helmduinen heeft er twee; Meeuwenduin en Prinsenduin samen zeven; maatregel 22h zes; de begrazing van Vallei Meijendel negen; maatregel 3c dertien; maatregel 3d vijf; de slagboomvervanging twee; het onderzochte PAS-maaibeheer 23 tien; het maaibeheer in Ruygenhoek, Lange Strook en De Loopert vijf; het PIM-leidingwerk zeven; de PIM-winputten 22; het nabeheer van de kerfzone twee; de aanleg van de vijf kerven drie; de programmabrede pannenmaatregel vier; de programmabrede plagwerkzaamheden acht; infiltratieplas 27.2 één. Vier uitvoeringen hebben geen directe plotkoppeling. De twee Bendel-uitvoeringen en de begrazing van landgoed Weiduin vallen aantoonbaar buiten het Meijendel-plotgebied, zodat nog één geheel ongekoppelde uitvoering ruimtelijk moet worden beoordeeld.</w:t>
       </w:r>
     </w:p>
     <w:p>

</xml_diff>

<commit_message>
Leg geografisch bronnenonderzoek voor 136 naamobjecten vast
</commit_message>
<xml_diff>
--- a/docs/MEIJENDEL_BRONREGISTER.docx
+++ b/docs/MEIJENDEL_BRONREGISTER.docx
@@ -9332,6 +9332,54 @@
       </w:r>
       <w:r>
         <w:t xml:space="preserve">leeg. Vinkenhoek behoudt voorlopig zijn historische naamrecord zonder brongeometrie; Elleboogsprang wordt pas als zelfstandig naamobject aan een volgende inventarisversie toegevoegd wanneer de nieuwe bronlevering versiegebonden en reproduceerbaar kan worden geïmporteerd.</w:t>
+      </w:r>
+    </w:p>
+    <w:p>
+      <w:pPr>
+        <w:pStyle w:val="FirstParagraph"/>
+      </w:pPr>
+      <w:r>
+        <w:t>Geografisch vervolgonderzoek, 16 oktober 2026. De afzonderlijke onderzoekslevering meijendel_geolocaties_2026-10-16 omvat de 136 gevraagde objecten: 99 gebieden, 12 historische paden en wandelroutes zonder geometrie en 25 reeds geometriseerde OSM-paden. De bronvermeldingen lopen van 1602 tot 2026. De 25 bestaande lijngeometrieën zijn exact behouden. De primaire OSM-API levert 17 aanvullende geometriekandidaten: vier punten en acht polygonen voor twaalf gebiedsnamen, plus vijf volledige routerelaties. Voor 94 objecten blijft de eigen geometrie leeg. Alle numerieke positionele nauwkeurigheden blijven onbekend; zij zijn niet afgeleid uit coördinaatdecimalen, topologische geldigheid of kaartschaal. Deze onderzoekslevering is nog niet in de levende database geïmporteerd; de bestaande stand van 182 objecten, 299 vermeldingen en 71 geometrieën blijft dus gelden.</w:t>
+      </w:r>
+    </w:p>
+    <w:p>
+      <w:pPr>
+        <w:pStyle w:val="FirstParagraph"/>
+      </w:pPr>
+      <w:r>
+        <w:t>Voor 1712 zijn de originele kaartbladen Schevelinge en Waelsdorp uit TU Delft OAS 726 en de geografisch geplaatste Kruikius-rasterdienst van Hoogheemraadschap Delfland geraadpleegd. Acht gedrukte naamposities zijn als afzonderlijke kaartankers vastgelegd; zij gelden niet als terreinlocaties, gebiedsgrenzen of kavelkoppelingen. De oorspronkelijke studie van Boerboom is als PDF beschikbaar via https://edepot.wur.nl/393293. De geannoteerde wandelingkaart uit 1957 en de volledige recreatiekaart uit 2007 zijn in de geraadpleegde lokale bronnen en gerichte Zotero-cataloguszoekacties niet aangetroffen. Het eerder lokaal als Neefjes-PDF opgeslagen bestand blijkt HTML. De rapporttekst is wel uit de bestaande Zotero-index gelezen; paragraaf 8.2 bevestigt dat onder meer Lijnen.shp en Zones.shp destijds zijn opgeleverd. Deze bestaande GIS-levering is nog niet verkregen en wordt niet als ontbrekende informatie bij de bron aangemerkt.</w:t>
+      </w:r>
+    </w:p>
+    <w:p>
+      <w:pPr>
+        <w:pStyle w:val="FirstParagraph"/>
+      </w:pPr>
+      <w:r>
+        <w:t>De vijf eerder onderbouwde toedelingen Helmduinen M15/M16, Kikkervalleien M13/M13s/M14, Libellenvallei M17b, Prinsenduin M17a en Ruygenhoek M32 blijven behouden. Vinkenhoek blijft gekoppeld aan M71. VWG-M onderbouwt daarnaast Hertenkamp M105 en Harstenhoek M42 als huidige terreincontext; dat bewijst geen historische of volledige naamgrens. Het gelijknamige OSM-campingveld Hertenkamp is verworpen. De vijf OSM-routerelaties blijven kandidaten met eigen bronversie: de Strandroute meet 4,54 km en komt niet overeen met de als aangepast gepubliceerde Dunea-route van 3,8 km; ook bij Reeënroute en Tapuit–Kievitsduin zijn afstands- of tagverschillen vastgelegd. De levering verandert geen bestaande naamvariant of objectidentiteit en omvat geen uitvoeringsgeometrie van beheermaatregelen.</w:t>
+      </w:r>
+    </w:p>
+    <w:p>
+      <w:pPr>
+        <w:pStyle w:val="FirstParagraph"/>
+      </w:pPr>
+      <w:r>
+        <w:t>Vervolgkaartonderzoek, 16 oktober 2026, versie 2. De verbeterlevering meijendel_databasekwaliteit_2026-10-16_v2 bevat dezelfde 136 bestaande object-ID’s en 23 aanvullende bewijsregels. De volledige oorspronkelijke Neefjes-publicatie is nu verkregen via de actuele download https://pas.ecologischeautoriteit.nl/files/ea/5004/011152-5004-cultuursporen-in-het-duin.pdf: 76 PDF-pagina’s, met de drie kaartbijlagen op pagina’s 74–76. De kopie op Duinen en Mensen telt 73 pagina’s en mist die bijlagen. De oorspronkelijke vegetatiekaarten uit 1955 zijn beschikbaar in het proefschrift van Boerboom uit 1960 (https://edepot.wur.nl/183358, laatste acht scanpagina’s). H+N+S publiceert tevens de oorspronkelijke masterplankaarten bij het project uit 2003–2004. Deze kaarten zijn geraadpleegd en versiegebonden bronbewijs is aan de onderzoekslevering toegevoegd. Pomp Kruispunt op de kaart uit 1955 is niet automatisch een grens of eerdere datering van het gelijknamige veldnaamgebied.</w:t>
+      </w:r>
+    </w:p>
+    <w:p>
+      <w:pPr>
+        <w:pStyle w:val="FirstParagraph"/>
+      </w:pPr>
+      <w:r>
+        <w:t>De officiële Dunea-nummerpaaltjeskaart Kijfhoek en Bierlap benoemt Bunkerpad en Klippad rechtstreeks. De documentmetadata noemen aanmaak op 1 april 2020 en wijziging op 22 februari 2021; een gedrukt editiejaar ontbreekt. De kaart benoemt Waterwilgenslag bij deze paden, terwijl de historische proefstudie Wassenaarse Slag als derde zijde van de driehoek noemt. Gelijkheid van de volledige historische proefdriehoek is daarmee niet bewezen. Beide padrecords hebben aanvullend kaartbewijs, maar krijgen geen ongecontroleerde lijngeometrie. Voor Wilhelminapaadje blijft bovendien een bronverschil bestaan: Neefjes noemt villa–zeereep, een primaire ingezonden correctie van voormalig bewoonster Sonja Alleblas uit 2013 noemt de garage richting Meijendel. Pannenduin op de Dunea-kaart is niet gelijkgesteld aan Paardenduin. De geannoteerde kaart uit 1957, de volledige recreatiekaart uit 2007, de proefplaatsenkaart uit 1987 en de oorspronkelijke GIS-lagen van Neefjes zijn nog niet verkregen. Dit is een toegangs-/leveringsleemte, geen bewijs dat deze stukken bij de bron niet bestaan.</w:t>
+      </w:r>
+    </w:p>
+    <w:p>
+      <w:pPr>
+        <w:pStyle w:val="FirstParagraph"/>
+      </w:pPr>
+      <w:r>
+        <w:t>OSM-vervolgcontrole op 16 oktober 2026 omvat alle 60 bronsegmenten van de 25 bestaande pad- en wegnamen. Tien way-objecten hebben een wijzigingsdatum na de exportdatum 3 april 2026; bij zes bronlijnen zijn nadien knikpunten gewijzigd. Voor zes segmenten, behorend bij zes naamobjecten, is bij bemonstering van de oude lijn met maximaal vijf meter tussenafstand een afstand boven één meter tot de actuele bronlijn gemeten. Die drempel is een signaleringsregel, geen positionele nauwkeurigheid of bewezen verplaatsing van het echte pad. Bij drie Harstenhoekweg-segmenten verschillen bestaande exportkenmerken. Alle 25 databasegeometrieën blijven exact behouden. De levering omvat 17 eerder gevonden geometriekandidaten en acht afzonderlijke kaartnaamankers; deze ronde voegt nul voldoende gecontroleerde wereldgeometrieën toe, zodat voor 94 van de 136 objecten de eigen geometrie leeg blijft. De tijdelijke import en vergelijking met de levende object-ID’s, namen en geometrieën zijn in MySQL getest, zonder blijvende tabelwijzigingen. De levende inventaris blijft 182 objecten, 299 vermeldingen en 71 geometrieën. Markdown en Word zijn samen aangevuld; de onderzoekslevering bevat beide versies.</w:t>
       </w:r>
     </w:p>
     <w:p>

</xml_diff>

<commit_message>
Actualiseer lokaal namenregister en controleer alle kavelkoppelingen
</commit_message>
<xml_diff>
--- a/docs/MEIJENDEL_BRONREGISTER.docx
+++ b/docs/MEIJENDEL_BRONREGISTER.docx
@@ -9380,6 +9380,30 @@
       </w:pPr>
       <w:r>
         <w:t>OSM-vervolgcontrole op 16 oktober 2026 omvat alle 60 bronsegmenten van de 25 bestaande pad- en wegnamen. Tien way-objecten hebben een wijzigingsdatum na de exportdatum 3 april 2026; bij zes bronlijnen zijn nadien knikpunten gewijzigd. Voor zes segmenten, behorend bij zes naamobjecten, is bij bemonstering van de oude lijn met maximaal vijf meter tussenafstand een afstand boven één meter tot de actuele bronlijn gemeten. Die drempel is een signaleringsregel, geen positionele nauwkeurigheid of bewezen verplaatsing van het echte pad. Bij drie Harstenhoekweg-segmenten verschillen bestaande exportkenmerken. Alle 25 databasegeometrieën blijven exact behouden. De levering omvat 17 eerder gevonden geometriekandidaten en acht afzonderlijke kaartnaamankers; deze ronde voegt nul voldoende gecontroleerde wereldgeometrieën toe, zodat voor 94 van de 136 objecten de eigen geometrie leeg blijft. De tijdelijke import en vergelijking met de levende object-ID’s, namen en geometrieën zijn in MySQL getest, zonder blijvende tabelwijzigingen. De levende inventaris blijft 182 objecten, 299 vermeldingen en 71 geometrieën. Markdown en Word zijn samen aangevuld; de onderzoekslevering bevat beide versies.</w:t>
+      </w:r>
+    </w:p>
+    <w:p>
+      <w:pPr>
+        <w:pStyle w:val="FirstParagraph"/>
+      </w:pPr>
+      <w:r>
+        <w:t>Lokale actualisering van het namenregister en koppelcontrole, 16 oktober 2026. De levende database Meijendel bevat na verwerking van de onderzoekslevering 182 naamobjecten, 319 vermeldingen en 21 bronnen. De 299 oorspronkelijke vermeldingen uit 1602–2026 zijn behouden; twintig letterlijke bronvermeldingen zijn toegevoegd. Bij ongedateerde online kaarten is 2026 uitsluitend het raadpleegjaar, geen bewezen vroegste naamdatum, kaarteditiejaar of uitvoeringsjaar. Dertien bronrecords zijn toegevoegd en de bestaande Neefjes-verwijzing is gecorrigeerd naar het volledige oorspronkelijke rapport, zonder een dubbele bronidentiteit te maken. Voor 136 onderzochte objecten is het bewijs aangevuld. De 111 geometrieleemten hebben een nieuwe, concrete beoordeling; de 111 oorspronkelijke beoordelingen zijn als eerdere versie behouden, zodat nameninventaris_beoordeling 222 rijen bevat, waarvan 111 actueel. Alle 71 brongeometrieën, naamidentiteiten, oorspronkelijke bronperioden, bestaande kaveltoedelingen en het oorspronkelijke importmanifest zijn behouden. De verwachte aantallen in dat manifest blijven de oorspronkelijke levering van 14 oktober 2026 beschrijven. De zeventien geometriekandidaten en acht kaartnaamankers zijn niet als bewezen terreinlocaties geïmporteerd.</w:t>
+      </w:r>
+    </w:p>
+    <w:p>
+      <w:pPr>
+        <w:pStyle w:val="FirstParagraph"/>
+      </w:pPr>
+      <w:r>
+        <w:t>Na deze databaseactualisering zijn alle 377 naam–kavelrelaties opnieuw berekend tegen de 71 opgeslagen naamgeometrieën en 55 actuele kavelpolygonen uit 2025. Er zijn nul verschillen in de gekoppelde kavels, relatietypen, intersectiedimensies, naamgeometriehashes of gebruikte plotimport. De analyseview behoudt 365 relaties voor 53 kavels. Vervolgens zijn alle 211 maatregel–kavelrelaties voor zestig gekoppelde uitvoeringen getoetst aan de vastgelegde bronbesluiten, naamvarianten en analysescope. De 42 geometrische maatregelrelaties hebben een geldige naamgeometrie–kavelketen; de overige 169 relaties stemmen overeen met hun geregistreerde bron- en gebruikersbesluiten. Er zijn geen onderbouwde koppelafwijkingen gevonden en dus geen relaties toegevoegd of verwijderd. De bronvaste jaarview behoudt 307 rijen. Dit bewijst de geregistreerde scope, niet een nieuwe terreinmeting of exacte werkvoetafdruk per kavel en jaar. Helmduinen M15/M16, Prinsenduin M17a, Libellenvallei M17b en Ruygenhoek M32 blijven onderscheiden. M66 en M91 blijven buiten de standaardanalysescope; de expliciete Voorlinden-koppeling aan M91 blijft als afzonderlijk bronbesluit behouden.</w:t>
+      </w:r>
+    </w:p>
+    <w:p>
+      <w:pPr>
+        <w:pStyle w:val="FirstParagraph"/>
+      </w:pPr>
+      <w:r>
+        <w:t>De wijziging is transactioneel beproefd, volledig teruggedraaid en daarna met dezelfde inhoud definitief uitgevoerd. Een beperkte herstelback-up van de acht naamtabellen en volledige voor-/nasnapshots zijn lokaal bewaard. Alle 327 tabel- en viewdefinities en 269 triggerdefinities zijn gelijk gebleven, afgezien van de interne auto-incrementtellers. De databasebrede taxonpoort is vóór en na de wijziging geslaagd: 306 basistabellen, 128 beoordeelde routes en nul fouten. De bestaande maatregel-seedcontrole, brondekking en idempotentietest slagen in hun afzonderlijke proefdatabase. De gegevensbijwerking, controles per relatie en herstelbewijs staan in de afzonderlijke levering meijendel_databasebijwerking_2026-10-16. Er is geen volledige Meijendel.sql-export, Shiny-cachebouw of VPS-publicatie uitgevoerd.</w:t>
       </w:r>
     </w:p>
     <w:p>

</xml_diff>

<commit_message>
Leg gecontroleerde lokale registratiemigratie vast
</commit_message>
<xml_diff>
--- a/docs/MEIJENDEL_BRONREGISTER.docx
+++ b/docs/MEIJENDEL_BRONREGISTER.docx
@@ -7562,95 +7562,15 @@
         <w:pStyle w:val="BodyText"/>
       </w:pPr>
       <w:r>
-        <w:rPr>
-          <w:b/>
-          <w:bCs/>
-        </w:rPr>
-        <w:t xml:space="preserve">Gebruik en grens.</w:t>
-      </w:r>
-      <w:r>
-        <w:t xml:space="preserve"> </w:t>
-      </w:r>
-      <w:r>
-        <w:t xml:space="preserve">De laag is geschikt om vast te leggen wat volgens welke bron is gepland, uitgevoerd, niet uitgevoerd of onbekend. De bronvaste plot-jaarlaag kan nu beschrijvend naast vogelgegevens voor de expliciet benoemde kavels worden gelegd. Een kavelvermelding bewijst niet dat de maatregel ieder deel van de kavel raakte; een samenhang met vogelontwikkeling is geen causaal beheereffect. De 144 bestaande regels in</w:t>
-      </w:r>
-      <w:r>
-        <w:t xml:space="preserve"> </w:t>
-      </w:r>
-      <w:r>
-        <w:rPr>
-          <w:rStyle w:val="VerbatimChar"/>
-        </w:rPr>
-        <w:t xml:space="preserve">plot_jaar_maatregel</w:t>
-      </w:r>
-      <w:r>
-        <w:t xml:space="preserve"> </w:t>
-      </w:r>
-      <w:r>
-        <w:t xml:space="preserve">betreffen begrazing in 16 plots uit 1991–1999. Hun aantal en checksum</w:t>
-      </w:r>
-      <w:r>
-        <w:t xml:space="preserve"> </w:t>
-      </w:r>
-      <w:r>
-        <w:rPr>
-          <w:rStyle w:val="VerbatimChar"/>
-        </w:rPr>
-        <w:t xml:space="preserve">306480715648</w:t>
-      </w:r>
-      <w:r>
-        <w:t xml:space="preserve"> </w:t>
-      </w:r>
-      <w:r>
-        <w:t xml:space="preserve">zijn vóór en na deze invoer gelijk gebleven; zij worden niet als onderdeel van de nieuwe bronvaste laag geteld.</w:t>
-      </w:r>
-    </w:p>
-    <w:p>
-      <w:pPr>
-        <w:pStyle w:val="BodyText"/>
-      </w:pPr>
-      <w:r>
-        <w:rPr>
-          <w:b/>
-          <w:bCs/>
-        </w:rPr>
-        <w:t xml:space="preserve">Status.</w:t>
-      </w:r>
-      <w:r>
-        <w:t xml:space="preserve"> </w:t>
-      </w:r>
-      <w:r>
-        <w:t xml:space="preserve">Bronvast op project-, uitvoering- en jaarniveau voor 43 ingevoerde bronnen en 64 uitvoeringen. De algemene kavel- en gebiedsindeling is geometrisch beschikbaar voor de 55 actuele plots uit 2025; vijf expliciet gekoppelde historische kavels hebben geen afzonderlijke geometrie. De bronvaste plot-jaarlaag bevat 307 regels voor 1967–1969, 1972–1975, 1988–1991, 1993, 1997, 2002, 2005–2006 en 2013–2025. Het onderzochte PAS-maaibeheer 23 levert geen plot-jaarrijen op, omdat de vier jaarregels 2016–2019</w:t>
-      </w:r>
-      <w:r>
-        <w:t xml:space="preserve"> </w:t>
-      </w:r>
-      <w:r>
-        <w:rPr>
-          <w:rStyle w:val="VerbatimChar"/>
-        </w:rPr>
-        <w:t xml:space="preserve">niet_uitgevoerd</w:t>
-      </w:r>
-      <w:r>
-        <w:t xml:space="preserve"> </w:t>
-      </w:r>
-      <w:r>
-        <w:t xml:space="preserve">zijn en de view alleen uitgevoerde jaren opneemt.</w:t>
-      </w:r>
-      <w:r>
-        <w:t xml:space="preserve"> </w:t>
-      </w:r>
-      <w:r>
-        <w:rPr>
-          <w:rStyle w:val="VerbatimChar"/>
-        </w:rPr>
-        <w:t xml:space="preserve">maatregel_plot_koppeling</w:t>
-      </w:r>
-      <w:r>
-        <w:t xml:space="preserve"> </w:t>
-      </w:r>
-      <w:r>
-        <w:t xml:space="preserve">bevat 211 relaties. Helmduinen heeft er twee; Meeuwenduin en Prinsenduin samen zeven; maatregel 22h zes; de begrazing van Vallei Meijendel negen; maatregel 3c dertien; maatregel 3d vijf; de slagboomvervanging twee; het onderzochte PAS-maaibeheer 23 tien; het maaibeheer in Ruygenhoek, Lange Strook en De Loopert vijf; het PIM-leidingwerk zeven; de PIM-winputten 22; het nabeheer van de kerfzone twee; de aanleg van de vijf kerven drie; de programmabrede pannenmaatregel vier; de programmabrede plagwerkzaamheden acht; infiltratieplas 27.2 één. Vier uitvoeringen hebben geen directe plotkoppeling. De twee Bendel-uitvoeringen en de begrazing van landgoed Weiduin vallen aantoonbaar buiten het Meijendel-plotgebied, zodat nog één geheel ongekoppelde uitvoering ruimtelijk moet worden beoordeeld.</w:t>
+        <w:t>Gebruik en grens. De laag is geschikt om vast te leggen wat volgens welke bron is gepland, uitgevoerd, niet uitgevoerd of onbekend. De bronvaste plot-jaarlaag kan nu beschrijvend naast vogelgegevens voor de expliciet benoemde kavels worden gelegd. Een kavelvermelding bewijst niet dat de maatregel ieder deel van de kavel raakte; een samenhang met vogelontwikkeling is geen causaal beheereffect. De 144 oorspronkelijke begrazingsregistraties voor 16 plots uit 1991–1999 zijn geïntegreerd: 139 aanvullende feiten en vijf verwijzingen naar reeds bestaande feiten. De gelijknamige leesview reconstrueert de oorspronkelijke 144 regels; de fysieke tabel is verwijderd. Zie de migratieverantwoording onderaan dit register.</w:t>
+      </w:r>
+    </w:p>
+    <w:p>
+      <w:pPr>
+        <w:pStyle w:val="BodyText"/>
+      </w:pPr>
+      <w:r>
+        <w:t>Status. Bronvast op project-, uitvoering- en jaarniveau voor 43 inhoudelijke bronnen en 64 uitvoeringen. Daarnaast is één administratieve migratiebron toegevoegd; maatregel_bron bevat 44 regels. De algemene kavel- en gebiedsindeling is geometrisch beschikbaar voor de 55 actuele plots uit 2025; vijf expliciet gekoppelde historische kavels hebben geen afzonderlijke geometrie. De bronvaste plot-jaarlaag bevat 307 regels voor 1967–1969, 1972–1975, 1988–1991, 1993, 1997, 2002, 2005–2006 en 2013–2025. Het onderzochte PAS-maaibeheer 23 levert geen plot-jaarrijen op, omdat de vier jaarregels 2016–2019 niet_uitgevoerd zijn en de view alleen uitgevoerde jaren opneemt. maatregel_plot_koppeling bevat 211 relaties. Helmduinen heeft er twee; Meeuwenduin en Prinsenduin samen zeven; maatregel 22h zes; de begrazing van Vallei Meijendel negen; maatregel 3c dertien; maatregel 3d vijf; de slagboomvervanging twee; het onderzochte PAS-maaibeheer 23 tien; het maaibeheer in Ruygenhoek, Lange Strook en De Loopert vijf; het PIM-leidingwerk zeven; de PIM-winputten 22; het nabeheer van de kerfzone twee; de aanleg van de vijf kerven drie; de programmabrede pannenmaatregel vier; de programmabrede plagwerkzaamheden acht; infiltratieplas 27.2 één. Vier uitvoeringen hebben geen directe plotkoppeling. De twee Bendel-uitvoeringen en de begrazing van landgoed Weiduin vallen aantoonbaar buiten het Meijendel-plotgebied, zodat nog één geheel ongekoppelde uitvoering ruimtelijk moet worden beoordeeld.</w:t>
       </w:r>
     </w:p>
     <w:p>
@@ -10111,6 +10031,59 @@
           <w:t xml:space="preserve">Beveiligde NDFF-ontvangst</w:t>
         </w:r>
       </w:hyperlink>
+    </w:p>
+    <w:p>
+      <w:pPr>
+        <w:pStyle w:val="Heading2"/>
+      </w:pPr>
+      <w:r>
+        <w:t>Integratie begrazing en toegankelijkheid op 16 oktober 2026</w:t>
+      </w:r>
+    </w:p>
+    <w:p>
+      <w:r>
+        <w:t>De levende lokale database is op 16 oktober 2026 omgezet. De 144 oorspronkelijke begrazingsregistraties voor 16 plots uit 1991–1999 zijn volledig behouden: 139 staan in maatregel_plot_jaar_registratie; de vijf door Ton bevestigde dubbelingen verwijzen naar bestaande uitvoering–plot–jaarfeiten. Dit zijn M15 en M16 in 1991 en M13, M13s en M14 in 1997. Deze vijf feiten worden niet opnieuw opgeslagen.</w:t>
+      </w:r>
+    </w:p>
+    <w:p>
+      <w:r>
+        <w:t>De 55 toegankelijkheidsregistraties voor 55 plots in 2024 staan in maatregel_toegankelijkheid_registratie: 20 vrij, 14 beperkt, 12 afgesloten, acht deels beperkt/deels vrij en één deels afgesloten/deels vrij. De deeltabel bevatte nul regels; de twee voorbeeldregels uit de deel-CSV zijn niet geïmporteerd. Status, bronspelling, plotnaam, opmerkingen, lege waarden en NULL blijven herleidbaar. De opmerking bij M36 blijft “nog controleren”. Een gemengde status bewijst geen oppervlakteverdeling.</w:t>
+      </w:r>
+    </w:p>
+    <w:p>
+      <w:r>
+        <w:t>maatregel_registratie_herkomst bevat 199 technische herkomstkoppelingen met oude sleutels, oorspronkelijke rijwaarden, hashes en precies één canoniek doel. Dit zijn auditgegevens, geen extra beheerfeiten. De 43 inhoudelijke maatregelbronnen zijn behouden; één administratieve bron voor deze migratie brengt maatregel_bron op 44 regels. Overnemen uit de handmatige registratie geeft geen nieuwe onafhankelijke bronbevestiging.</w:t>
+      </w:r>
+    </w:p>
+    <w:p>
+      <w:r>
+        <w:t>De drie oude fysieke tabellen zijn verwijderd. Hun namen plot_jaar_maatregel, plot_jaar_toegankelijkheid en plot_jaar_toegankelijkheid_deel blijven alleen-lezen compatibiliteitsviews, met respectievelijk 144, 55 en nul regels. v_plot_jaar_maatregel_bronvast behoudt de bestaande 307 regels voor expliciete jaren tussen 1967 en 2025; v_plot_jaar_maatregel_gecombineerd bevat 446 regels, inclusief de 139 aanvullende jaarfeiten. Deze laatste view mag bronregistraties niet als onafhankelijke terreinmetingen of behandeld oppervlak tellen.</w:t>
+      </w:r>
+    </w:p>
+    <w:p>
+      <w:r>
+        <w:t>Dashboard en Shiny gebruiken dezelfde gereconstrueerde registraties. De SQL-dumpparser leest de nieuwe basistabellen en maakt de oude gegevensobjecten via één R-adapter; parser/cacheversie is 14. Een nieuw schema zonder afgeronde compatibiliteitsviews blokkeert de parser. Voor analyse geldt een toegankelijkheidsstatus uitsluitend in het geregistreerde jaar; buiten 2024 blijft die voor deze 55 plots onbekend. Het dashboard mag de laatste historische registratie apart tonen met bronjaar, maar presenteert haar niet als bewezen toestand van een later jaar. Beheerjaarfeiten worden evenmin stilzwijgend doorgetrokken.</w:t>
+      </w:r>
+    </w:p>
+    <w:p>
+      <w:r>
+        <w:t>Nieuwe import richt zich op de maatregelregistraties. De drie bestaande import-SQL-bestanden gebruiken alleen tijdelijke staging en schrijven niet naar de compatibiliteitsviews. De oorspronkelijke bronidentiteit blijft bij correctie behouden; identieke herimport en gewijzigde herimport zijn op fixtures getest. LOAD DATA LOCAL vereist local_infile aan client- en serverzijde; de iMac-server heeft dit uitgeschakeld. Die globale instelling is in deze taak niet veranderd. Voer de voorbeeld-CSV’s niet als actuele levering in.</w:t>
+      </w:r>
+    </w:p>
+    <w:p>
+      <w:r>
+        <w:t>Controle: volledige rijreconstructie, vijf expliciete ontdubbelingen, idempotentie, herstel na onderbroken tabelwissel, SQL/R-pariteit en cache-/browser-/exportcontracten. De inhoudschecksums van alle overige basistabellen zijn vóór en na de migratie gelijk; bestaande bron- en brontyperegels blijven behouden. De centrale taxoncontrole is vóór en na de wijziging groen: alle 128 centrale routes blijven bereikbaar zonder auditfouten. De afsluitende audit is vastgelegd in de lokale herstelmap.</w:t>
+      </w:r>
+    </w:p>
+    <w:p>
+      <w:r>
+        <w:t>Herstelkopie en controlebewijs staan lokaal in /Users/ton/Documents/Meijendel-herstel/2026-10-16-beheer-toegankelijkheid. Herstel verloopt via gis/scripts/migrate_maatregel_registraties.py --database Meijendel --backup-dir /Users/ton/Documents/Meijendel-herstel/2026-10-16-beheer-toegankelijkheid/backup --restore. Een herstelactie vereist een eigen besluit. Meijendel.sql, volledige cachebouw en VPS zijn in deze lokale migratiefase niet vernieuwd.</w:t>
+      </w:r>
+    </w:p>
+    <w:p>
+      <w:r>
+        <w:t>Betekenistoets: uitvoering, locatie, tijd, toestand en taxonidentiteit blijven onderscheiden volgens Darwin Core (https://dwc.tdwg.org/terms/) en TDWG TCS (https://tcs.tdwg.org/terms/), geraadpleegd op 16 oktober 2026. Begrazingsdieren zijn beheereigenschappen en worden door deze migratie geen wilde soortwaarnemingen.</w:t>
+      </w:r>
     </w:p>
     <w:sectPr>
       <w:footnotePr>

</xml_diff>

<commit_message>
Documenteer definitieve verwijdering van compatibiliteitsviews
</commit_message>
<xml_diff>
--- a/docs/MEIJENDEL_BRONREGISTER.docx
+++ b/docs/MEIJENDEL_BRONREGISTER.docx
@@ -7562,7 +7562,7 @@
         <w:pStyle w:val="BodyText"/>
       </w:pPr>
       <w:r>
-        <w:t>Gebruik en grens. De laag is geschikt om vast te leggen wat volgens welke bron is gepland, uitgevoerd, niet uitgevoerd of onbekend. De bronvaste plot-jaarlaag kan nu beschrijvend naast vogelgegevens voor de expliciet benoemde kavels worden gelegd. Een kavelvermelding bewijst niet dat de maatregel ieder deel van de kavel raakte; een samenhang met vogelontwikkeling is geen causaal beheereffect. De 144 oorspronkelijke begrazingsregistraties voor 16 plots uit 1991–1999 zijn geïntegreerd: 139 aanvullende feiten en vijf verwijzingen naar reeds bestaande feiten. De gelijknamige leesview reconstrueert de oorspronkelijke 144 regels; de fysieke tabel is verwijderd. Zie de migratieverantwoording onderaan dit register.</w:t>
+        <w:t>Gebruik en grens. De laag is geschikt om vast te leggen wat volgens welke bron is gepland, uitgevoerd, niet uitgevoerd of onbekend. De bronvaste plot-jaarlaag kan nu beschrijvend naast vogelgegevens voor de expliciet benoemde kavels worden gelegd. Een kavelvermelding bewijst niet dat de maatregel ieder deel van de kavel raakte; een samenhang met vogelontwikkeling is geen causaal beheereffect. De 144 oorspronkelijke begrazingsregistraties voor 16 plots uit 1991–1999 zijn geïntegreerd: 139 aanvullende feiten en vijf verwijzingen naar reeds bestaande feiten. De oorspronkelijke 144 regels blijven voor audit reconstrueerbaar; de fysieke tabel en gelijknamige view zijn verwijderd. Zie de migratieverantwoording onderaan dit register.</w:t>
       </w:r>
     </w:p>
     <w:p>
@@ -10057,12 +10057,12 @@
     </w:p>
     <w:p>
       <w:r>
-        <w:t>De drie oude fysieke tabellen zijn verwijderd. Hun namen plot_jaar_maatregel, plot_jaar_toegankelijkheid en plot_jaar_toegankelijkheid_deel blijven alleen-lezen compatibiliteitsviews, met respectievelijk 144, 55 en nul regels. v_plot_jaar_maatregel_bronvast behoudt de bestaande 307 regels voor expliciete jaren tussen 1967 en 2025; v_plot_jaar_maatregel_gecombineerd bevat 446 regels, inclusief de 139 aanvullende jaarfeiten. Deze laatste view mag bronregistraties niet als onafhankelijke terreinmetingen of behandeld oppervlak tellen.</w:t>
-      </w:r>
-    </w:p>
-    <w:p>
-      <w:r>
-        <w:t>Dashboard en Shiny gebruiken dezelfde gereconstrueerde registraties. De SQL-dumpparser leest de nieuwe basistabellen en maakt de oude gegevensobjecten via één R-adapter; parser/cacheversie is 14. Een nieuw schema zonder afgeronde compatibiliteitsviews blokkeert de parser. Voor analyse geldt een toegankelijkheidsstatus uitsluitend in het geregistreerde jaar; buiten 2024 blijft die voor deze 55 plots onbekend. Het dashboard mag de laatste historische registratie apart tonen met bronjaar, maar presenteert haar niet als bewezen toestand van een later jaar. Beheerjaarfeiten worden evenmin stilzwijgend doorgetrokken.</w:t>
+        <w:t>De drie oude fysieke tabellen én de gelijknamige compatibiliteitsviews zijn verwijderd. Dashboard en Shiny gebruiken rechtstreeks de centrale registraties. De oorspronkelijke 144, 55 en nul regels blijven voor audit reconstrueerbaar zonder die databaseobjecten. v_plot_jaar_maatregel_bronvast behoudt de bestaande 307 regels voor expliciete jaren tussen 1967 en 2025; v_plot_jaar_maatregel_gecombineerd bevat 446 regels, inclusief de 139 aanvullende jaarfeiten. Deze laatste view mag bronregistraties niet als onafhankelijke terreinmetingen of behandeld oppervlak tellen.</w:t>
+      </w:r>
+    </w:p>
+    <w:p>
+      <w:r>
+        <w:t>Dashboard en Shiny lezen rechtstreeks uit de centrale basistabellen via build_maatregel_registration_data. Parser/cacheversie is 15; de oude gegevensobjectnamen en de afhankelijkheid van compatibiliteitsviews zijn uit de actieve leesroute verwijderd. Voor analyse geldt een toegankelijkheidsstatus uitsluitend in het geregistreerde jaar; buiten 2024 blijft die voor deze 55 plots onbekend. Het dashboard mag de laatste historische registratie apart tonen met bronjaar, maar presenteert haar niet als bewezen toestand van een later jaar. Beheerjaarfeiten worden evenmin stilzwijgend doorgetrokken.</w:t>
       </w:r>
     </w:p>
     <w:p>
@@ -10083,6 +10083,39 @@
     <w:p>
       <w:r>
         <w:t>Betekenistoets: uitvoering, locatie, tijd, toestand en taxonidentiteit blijven onderscheiden volgens Darwin Core (https://dwc.tdwg.org/terms/) en TDWG TCS (https://tcs.tdwg.org/terms/), geraadpleegd op 16 oktober 2026. Begrazingsdieren zijn beheereigenschappen en worden door deze migratie geen wilde soortwaarnemingen.</w:t>
+      </w:r>
+    </w:p>
+    <w:p>
+      <w:pPr>
+        <w:pStyle w:val="Heading2"/>
+      </w:pPr>
+      <w:r>
+        <w:t>Rechtstreekse aansluiting zonder compatibiliteitsviews</w:t>
+      </w:r>
+    </w:p>
+    <w:p>
+      <w:r>
+        <w:t>De drie compatibiliteitsviews plot_jaar_maatregel, plot_jaar_toegankelijkheid en plot_jaar_toegankelijkheid_deel zijn op 16 oktober 2026 op verzoek van Ton verwijderd. Er zijn onder deze drie namen geen tabellen of views meer aanwezig. De fysieke registratietabellen, de 199 herkomstkoppelingen en alle overige gegevens zijn behouden.</w:t>
+      </w:r>
+    </w:p>
+    <w:p>
+      <w:r>
+        <w:t>Dashboard en Shiny lezen rechtstreeks de centrale basistabellen. De 139 aanvullende begrazingsregistraties uit 1991–1999 en de vijf bestaande uitvoeringsfeiten leveren samen dezelfde 144 beheerfeiten voor 16 plots. De 55 toegankelijkheidsregistraties uit 2024 worden met niveau plot/deel gelezen; een deelregistratie wordt niet als toestand van het hele plot gebruikt. De nieuwe gegevensobjecten heten maatregel_beheer_jaar en maatregel_toegankelijkheid_registratie. Parser/cacheversie is 15.</w:t>
+      </w:r>
+    </w:p>
+    <w:p>
+      <w:r>
+        <w:t>De vijf bestaande uitvoeringsfeiten worden via hun expliciete herkomstkoppeling, uitvoeringsjaar en geverifieerde plotkoppeling bereikt, zonder het oorspronkelijke JSON-rijpayload als toepassingsgegevens te reconstrueren. Oude veldnamen en bronwaarden blijven uitsluitend beschikbaar voor historische reconstructie en herstelcontrole. De 307 bronvaste en 446 gecombineerde plot-jaarregels blijven ongewijzigd; deze vervolgwijziging voegt geen waarnemingen of beheerfeiten toe.</w:t>
+      </w:r>
+    </w:p>
+    <w:p>
+      <w:r>
+        <w:t>Import- en exportcontroles gebruiken eveneens de centrale tabellen en selecties. De oude classificatieherstelroute is onafhankelijk gemaakt van de verwijderde objecten. Een onderbroken migratie met achtergebleven _migratie_oud-tabellen stopt expliciet. De eerdere v1-migratie en haar oorspronkelijke herstelkopie blijven historisch controleerbaar; normale herhaling na de viewverwijdering maakt de views niet opnieuw aan.</w:t>
+      </w:r>
+    </w:p>
+    <w:p>
+      <w:r>
+        <w:t>Controlebewijs en hersteldefinities staan lokaal in /Users/ton/Documents/Meijendel-herstel/2026-10-16-maatregelen-rechtstreeks. De drie viewdefinities staan in views/restore-views.sql. Dit bestand wordt uitsluitend bij een afzonderlijk besloten herstel gebruikt. De zware Meijendel.sql-export, volledige cachebouw en VPS-publicatie maken geen deel uit van deze vervolgwijziging.</w:t>
       </w:r>
     </w:p>
     <w:sectPr>

</xml_diff>

<commit_message>
Inventariseer maatregelen uit broedvogeljaarverslagen
</commit_message>
<xml_diff>
--- a/docs/MEIJENDEL_BRONREGISTER.docx
+++ b/docs/MEIJENDEL_BRONREGISTER.docx
@@ -6336,6 +6336,14 @@
         <w:pStyle w:val="BodyText"/>
       </w:pPr>
       <w:r>
+        <w:t>Op 16 oktober 2026 is daarnaast de volledige Zotero-reeks met titels beginnend met Vogelpopulatieonderzoek Meijendel en Vogelwerkgroep Meijendel opnieuw en afzonderlijk beoordeeld op werkzaamheden en andere beheermaatregelen. De selectie bevat 44 bibliografische hoofditems. Veertien unieke samengestelde of afzonderlijke PDF-containers met samen 716 pagina’s en verslagjaren 1958–2001 zijn inhoudelijk doorzocht; losse tellijsten en overlappende rapportkopieën zijn niet als zelfstandige bewijsbron geteld. De controle leverde 22 nieuwe uitgevoerde kandidaten, één expliciet niet-uitgevoerde padaanleg en vier aanvullingen op bestaande uitvoeringen. Zij staan met bron, jaarstatus, activiteit en uitsluitend bronvaste of eerder vastgestelde kavelrelaties in Werkzaamheden en maatregelen uit broedvogeljaarverslagen. De genormaliseerde tijdelijke beoordelingstabellen staan in gis/database/maatregelen_jaarverslagen_broedvogels_kandidaten.sql. De levende database is niet gewijzigd; maatregel_bron blijft daarom 44 regels bevatten, waarvan 43 inhoudelijke bronnen en één administratieve migratiebron.</w:t>
+      </w:r>
+    </w:p>
+    <w:p>
+      <w:pPr>
+        <w:pStyle w:val="BodyText"/>
+      </w:pPr>
+      <w:r>
         <w:t xml:space="preserve">Daarbij zijn vijftien officiële of institutionele internetbronnen geraadpleegd: vijf Dunea-pagina’s over optimalisatie van de waterwinning, beheer in Meeuwenduin en Prinsenduin, vervanging van slagbomen, actuele werkzaamheden en duindynamiek; het Dunea-jaarverslag 2024; het Zuid-Hollandse subsidie-openstellingsbesluit voor Bendel; de Staatsbosbeheer-pagina over de herinrichting van Bendel; de ODH-beschikking van 28 augustus 2023 voor de konijnenbijplaatsingsproef; de ODH-beschikking van 5 november 2025 voor de renovatie van de Paardenstal; de via DANS gepubliceerde Haagse Archeologische Rapportages 1204 en 1306; de officiële externe bijlage uit 2013 over de PIM-werkzaamheden in Noord-Meijendel; de gemeentelijke inventaris van cultuurhistorische objecten in Wassenaar; en de actuele PDOK-Kadastrale Kaart. Rapport 1204 bevat op PDF-pagina 4 de deelgebiedscontouren van Elleboogsprang, Meeuwenduin en Vinkenhoek. De bronnen staan afzonderlijk in</w:t>
       </w:r>
       <w:r>
@@ -6356,56 +6364,7 @@
         <w:pStyle w:val="BodyText"/>
       </w:pPr>
       <w:r>
-        <w:rPr>
-          <w:b/>
-          <w:bCs/>
-        </w:rPr>
-        <w:t xml:space="preserve">Omvang en periode.</w:t>
-      </w:r>
-      <w:r>
-        <w:t xml:space="preserve"> </w:t>
-      </w:r>
-      <w:r>
-        <w:t xml:space="preserve">De levende lokale database bevat 18 projecten, 43 bronnen, 64 uitvoeringen, 104 expliciete jaarbeoordelingen uit 1967–2026 en 99 bronkoppelingen. Van de jaarbeoordelingen zijn er 88</w:t>
-      </w:r>
-      <w:r>
-        <w:t xml:space="preserve"> </w:t>
-      </w:r>
-      <w:r>
-        <w:rPr>
-          <w:rStyle w:val="VerbatimChar"/>
-        </w:rPr>
-        <w:t xml:space="preserve">uitgevoerd</w:t>
-      </w:r>
-      <w:r>
-        <w:t xml:space="preserve">, 9</w:t>
-      </w:r>
-      <w:r>
-        <w:t xml:space="preserve"> </w:t>
-      </w:r>
-      <w:r>
-        <w:rPr>
-          <w:rStyle w:val="VerbatimChar"/>
-        </w:rPr>
-        <w:t xml:space="preserve">niet_uitgevoerd</w:t>
-      </w:r>
-      <w:r>
-        <w:t xml:space="preserve"> </w:t>
-      </w:r>
-      <w:r>
-        <w:t xml:space="preserve">en 7</w:t>
-      </w:r>
-      <w:r>
-        <w:t xml:space="preserve"> </w:t>
-      </w:r>
-      <w:r>
-        <w:rPr>
-          <w:rStyle w:val="VerbatimChar"/>
-        </w:rPr>
-        <w:t xml:space="preserve">onbekend</w:t>
-      </w:r>
-      <w:r>
-        <w:t xml:space="preserve">. De uitvoering in Meeuwenduin en Prinsenduin is gesplitst: 2023 betreft beide naamgebieden; 2024 uitsluitend Prinsenduin. De nieuwe invoer voegt 28 feitelijke uitvoeringen uit 1967–2006 toe. Zij betreft waterwinning en infiltratieplassen, pad- en rasterwerk, zandvastlegging, de rietpotenproef, begrazing, maaien, plaggen en slibverwijdering. De afzonderlijk gelokaliseerde schoning van infiltratieplas 27.2 voegt één uitvoering en twee jaarregels voor 2013 en 2014 toe. De datumvelden van de totale laag lopen van 1967 tot en met een gepland einde in maart 2027. Geplande werkzaamheden bij de Paardenstal en het subsidieerbare Bendel-nabeheer hebben geen uitgevoerd jaar gekregen; elektriciteitswerk in Vallei Meijendel staat als uitvoering onbekend en heeft eveneens geen jaarregel. De afzonderlijke herinrichting van Bendel is voor 2025 en 2026 als uitgevoerd vastgelegd, maar ligt buiten het Meijendel-plotgebied.</w:t>
+        <w:t>Omvang en periode. De levende lokale database bevat 18 projecten, 44 bronnen, 64 uitvoeringen, 104 expliciete jaarbeoordelingen uit 1967–2026 en 99 bronkoppelingen. Van de 44 bronnen zijn er 43 inhoudelijk en één administratief. Van de jaarbeoordelingen zijn er 88 uitgevoerd, 9 niet_uitgevoerd en 7 onbekend. De uitvoering in Meeuwenduin en Prinsenduin is gesplitst: 2023 betreft beide naamgebieden; 2024 uitsluitend Prinsenduin. De nieuwe invoer voegt 28 feitelijke uitvoeringen uit 1967–2006 toe. Zij betreft waterwinning en infiltratieplassen, pad- en rasterwerk, zandvastlegging, de rietpotenproef, begrazing, maaien, plaggen en slibverwijdering. De afzonderlijk gelokaliseerde schoning van infiltratieplas 27.2 voegt één uitvoering en twee jaarregels voor 2013 en 2014 toe. De datumvelden van de totale laag lopen van 1967 tot en met een gepland einde in maart 2027. Geplande werkzaamheden bij de Paardenstal en het subsidieerbare Bendel-nabeheer hebben geen uitgevoerd jaar gekregen; elektriciteitswerk in Vallei Meijendel staat als uitvoering onbekend en heeft eveneens geen jaarregel. De afzonderlijke herinrichting van Bendel is voor 2025 en 2026 als uitgevoerd vastgelegd, maar ligt buiten het Meijendel-plotgebied. De 23 nieuwe jaarverslagkandidaten en vier voorgestelde aanvullingen zijn nog niet in deze aantallen verwerkt.</w:t>
       </w:r>
     </w:p>
     <w:p>

</xml_diff>

<commit_message>
Integreer jaarverslagmaatregelen in seed
</commit_message>
<xml_diff>
--- a/docs/MEIJENDEL_BRONREGISTER.docx
+++ b/docs/MEIJENDEL_BRONREGISTER.docx
@@ -6336,7 +6336,7 @@
         <w:pStyle w:val="BodyText"/>
       </w:pPr>
       <w:r>
-        <w:t>Op 16 oktober 2026 is daarnaast de volledige Zotero-reeks met titels beginnend met Vogelpopulatieonderzoek Meijendel en Vogelwerkgroep Meijendel opnieuw en afzonderlijk beoordeeld op werkzaamheden en andere beheermaatregelen. De selectie bevat 44 bibliografische hoofditems. Veertien unieke samengestelde of afzonderlijke PDF-containers met samen 716 pagina’s en verslagjaren 1958–2001 zijn inhoudelijk doorzocht; losse tellijsten en overlappende rapportkopieën zijn niet als zelfstandige bewijsbron geteld. De controle leverde 22 nieuwe uitgevoerde kandidaten, één expliciet niet-uitgevoerde padaanleg en vier aanvullingen op bestaande uitvoeringen. Zij staan met bron, jaarstatus, activiteit en uitsluitend bronvaste of eerder vastgestelde kavelrelaties in Werkzaamheden en maatregelen uit broedvogeljaarverslagen. De genormaliseerde tijdelijke beoordelingstabellen staan in gis/database/maatregelen_jaarverslagen_broedvogels_kandidaten.sql. De levende database is niet gewijzigd; maatregel_bron blijft daarom 44 regels bevatten, waarvan 43 inhoudelijke bronnen en één administratieve migratiebron.</w:t>
+        <w:t>Op 16 oktober 2026 is daarnaast de volledige Zotero-reeks met titels beginnend met Vogelpopulatieonderzoek Meijendel en Vogelwerkgroep Meijendel opnieuw en afzonderlijk beoordeeld op werkzaamheden en andere beheermaatregelen. De selectie bevat 44 bibliografische hoofditems. Veertien unieke samengestelde of afzonderlijke PDF-containers met samen 716 pagina’s en verslagjaren 1958–2001 zijn inhoudelijk doorzocht; losse tellijsten en overlappende rapportkopieën zijn niet als zelfstandige bewijsbron geteld. De controle leverde 22 nieuwe uitgevoerde kandidaten, één expliciet niet-uitgevoerde padaanleg en vier aanvullingen op bestaande uitvoeringen. Zij staan met bron, jaarstatus, activiteit en uitsluitend bronvaste of eerder vastgestelde kavelrelaties in Werkzaamheden en maatregelen uit broedvogeljaarverslagen. De genormaliseerde tijdelijke beoordelingstabellen staan in gis/database/maatregelen_jaarverslagen_broedvogels_kandidaten.sql. Na inhoudelijke goedkeuring zijn deze kandidaten idempotent in gis/database/maatregelen_seed.sql verwerkt en tweemaal achtereen in een geïsoleerde proefdatabase geïmporteerd. Die proef bevat 51 bronnen, 21 projecten, 87 uitvoeringen, 132 jaarregels, 126 uitvoering-bronkoppelingen en 256 plotkoppelingen; de bronvaste view bevat 357 plot-jaarrijen. De levende database is niet gewijzigd; maatregel_bron blijft daar daarom 44 regels bevatten, waarvan 43 inhoudelijke bronnen en één administratieve migratiebron.</w:t>
       </w:r>
     </w:p>
     <w:p>
@@ -6364,7 +6364,7 @@
         <w:pStyle w:val="BodyText"/>
       </w:pPr>
       <w:r>
-        <w:t>Omvang en periode. De levende lokale database bevat 18 projecten, 44 bronnen, 64 uitvoeringen, 104 expliciete jaarbeoordelingen uit 1967–2026 en 99 bronkoppelingen. Van de 44 bronnen zijn er 43 inhoudelijk en één administratief. Van de jaarbeoordelingen zijn er 88 uitgevoerd, 9 niet_uitgevoerd en 7 onbekend. De uitvoering in Meeuwenduin en Prinsenduin is gesplitst: 2023 betreft beide naamgebieden; 2024 uitsluitend Prinsenduin. De nieuwe invoer voegt 28 feitelijke uitvoeringen uit 1967–2006 toe. Zij betreft waterwinning en infiltratieplassen, pad- en rasterwerk, zandvastlegging, de rietpotenproef, begrazing, maaien, plaggen en slibverwijdering. De afzonderlijk gelokaliseerde schoning van infiltratieplas 27.2 voegt één uitvoering en twee jaarregels voor 2013 en 2014 toe. De datumvelden van de totale laag lopen van 1967 tot en met een gepland einde in maart 2027. Geplande werkzaamheden bij de Paardenstal en het subsidieerbare Bendel-nabeheer hebben geen uitgevoerd jaar gekregen; elektriciteitswerk in Vallei Meijendel staat als uitvoering onbekend en heeft eveneens geen jaarregel. De afzonderlijke herinrichting van Bendel is voor 2025 en 2026 als uitgevoerd vastgelegd, maar ligt buiten het Meijendel-plotgebied. De 23 nieuwe jaarverslagkandidaten en vier voorgestelde aanvullingen zijn nog niet in deze aantallen verwerkt.</w:t>
+        <w:t>Omvang en periode. De levende lokale database bevat 18 projecten, 44 bronnen, 64 uitvoeringen, 104 expliciete jaarbeoordelingen uit 1967–2026 en 99 bronkoppelingen. Van de 44 bronnen zijn er 43 inhoudelijk en één administratief. Van de jaarbeoordelingen zijn er 88 uitgevoerd, 9 niet_uitgevoerd en 7 onbekend. De uitvoering in Meeuwenduin en Prinsenduin is gesplitst: 2023 betreft beide naamgebieden; 2024 uitsluitend Prinsenduin. De nieuwe invoer voegt 28 feitelijke uitvoeringen uit 1967–2006 toe. Zij betreft waterwinning en infiltratieplassen, pad- en rasterwerk, zandvastlegging, de rietpotenproef, begrazing, maaien, plaggen en slibverwijdering. De afzonderlijk gelokaliseerde schoning van infiltratieplas 27.2 voegt één uitvoering en twee jaarregels voor 2013 en 2014 toe. De datumvelden van de totale laag lopen van 1967 tot en met een gepland einde in maart 2027. Geplande werkzaamheden bij de Paardenstal en het subsidieerbare Bendel-nabeheer hebben geen uitgevoerd jaar gekregen; elektriciteitswerk in Vallei Meijendel staat als uitvoering onbekend en heeft eveneens geen jaarregel. De afzonderlijke herinrichting van Bendel is voor 2025 en 2026 als uitgevoerd vastgelegd, maar ligt buiten het Meijendel-plotgebied. De 23 nieuwe jaarverslaguitvoeringen en vier aanvullingen zijn wel in de seed en proefdatabase verwerkt, maar nog niet in deze levende aantallen.</w:t>
       </w:r>
     </w:p>
     <w:p>

</xml_diff>

<commit_message>
Werk bronregister bij na toevoeging 29 Zotero-publicaties
</commit_message>
<xml_diff>
--- a/docs/MEIJENDEL_BRONREGISTER.docx
+++ b/docs/MEIJENDEL_BRONREGISTER.docx
@@ -21,7 +21,7 @@
           <w:b/>
           <w:bCs/>
         </w:rPr>
-        <w:t xml:space="preserve">Stand: 16 oktober 2026.</w:t>
+        <w:t>Stand: 17 oktober 2026.</w:t>
       </w:r>
     </w:p>
     <w:p>
@@ -7870,13 +7870,33 @@
           <w:b/>
           <w:bCs/>
         </w:rPr>
-        <w:t xml:space="preserve">Omvang en periode.</w:t>
-      </w:r>
-      <w:r>
-        <w:t xml:space="preserve"> </w:t>
-      </w:r>
-      <w:r>
-        <w:t xml:space="preserve">522 bibliografische verwijzingen op 25 september 2026</w:t>
+      </w:r>
+      <w:r/>
+      <w:r/>
+      <w:r>
+        <w:rPr>
+          <w:b/>
+        </w:rPr>
+        <w:t>Omvang en periode.</w:t>
+      </w:r>
+      <w:r>
+        <w:t xml:space="preserve"> Het gepubliceerde literatuuroverzicht bevatte 522 bibliografische verwijzingen op 25 september 2026. De lokale Zotero-collectie Meijendel bevat op 17 oktober 2026 466 zelfstandige bibliografische items. Dat zijn verschillende selecties; de actuele Zotero-telling vervangt de vastgelegde publicatiestand niet.</w:t>
+      </w:r>
+    </w:p>
+    <w:p>
+      <w:pPr>
+        <w:pStyle w:val="BodyText"/>
+      </w:pPr>
+      <w:r>
+        <w:t>Op 17 oktober 2026 zijn de 29 nog niet aanwezige resultaten uit de selectie van 50 Consensus-resultaten als zelfstandige parent-items toegevoegd aan Zotero-collectie Meijendel. De 29 publicaties beslaan na broncontrole 1926–2023; 18 items hebben een DOI. De lokale collectie groeide hierbij van 437 naar 466 bibliografische items. Alle 29 items hebben een bronnotitie met herkomst en eventuele metadata-afwijkingen. Vijf resultaten hebben een volledige PDF-tekst: Schierbeek (1926), Blankwaardt (1965), Wesselingh et al. (1997), Beunen et al. (2004) en het complete congresabstract van De Bonte en Boosten (1996). Bij Vliegenthart et al. (definitieve jaargang 2023) zijn daarnaast een aanvullend PDF-bestand en een XLSX-gegevenstabel gekoppeld; die zijn niet de volledige artikeltekst. Voor de overige 24 resultaten is de volledige publicatie niet verkregen via de gecontroleerde routes. De zeven nieuwe bestandsbijlagen staan als gekoppelde bestanden op de T7 onder /Volumes/T7 Data/Zotero/files; dit is de op 17 oktober 2026 door Ton bevestigde vaste opslagafspraak.</w:t>
+      </w:r>
+    </w:p>
+    <w:p>
+      <w:pPr>
+        <w:pStyle w:val="BodyText"/>
+      </w:pPr>
+      <w:r>
+        <w:t>De oorspronkelijke Consensus-lijst bevatte onder meer een foutief jaar en ontbrekende auteurs bij het begrazingsabstract: de gedrukte tekst is uit december 1996, niet uit 2018. Bij het recreatierapport deel XIV uit 2003 wijkt de auteurslijst in Consensus af van de WUR-catalogus; de WUR-gegevens zijn overgenomen en het verschil blijft zichtbaar in de bronnotitie. Deze uitbreiding betreft uitsluitend lokale literatuurregistratie. De databases Meijendel en Meijendel_bronnen, de analysetoelating en de VPS-publicatiestand zijn in deze taak niet gewijzigd.</w:t>
       </w:r>
     </w:p>
     <w:p>

</xml_diff>

<commit_message>
Registreer drie aanvullende vlinderpublicaties in Zotero
</commit_message>
<xml_diff>
--- a/docs/MEIJENDEL_BRONREGISTER.docx
+++ b/docs/MEIJENDEL_BRONREGISTER.docx
@@ -7880,7 +7880,7 @@
         <w:t>Omvang en periode.</w:t>
       </w:r>
       <w:r>
-        <w:t xml:space="preserve"> Het gepubliceerde literatuuroverzicht bevatte 522 bibliografische verwijzingen op 25 september 2026. De lokale Zotero-collectie Meijendel bevat op 17 oktober 2026 466 zelfstandige bibliografische items. Dat zijn verschillende selecties; de actuele Zotero-telling vervangt de vastgelegde publicatiestand niet.</w:t>
+        <w:t xml:space="preserve"> Het gepubliceerde literatuuroverzicht bevatte 522 bibliografische verwijzingen op 25 september 2026. De lokale Zotero-collectie Meijendel bevat op 17 oktober 2026 469 zelfstandige bibliografische items. Dat zijn verschillende selecties; de actuele Zotero-telling vervangt de vastgelegde publicatiestand niet.</w:t>
       </w:r>
     </w:p>
     <w:p>
@@ -7897,6 +7897,12 @@
       </w:pPr>
       <w:r>
         <w:t>De oorspronkelijke Consensus-lijst bevatte onder meer een foutief jaar en ontbrekende auteurs bij het begrazingsabstract: de gedrukte tekst is uit december 1996, niet uit 2018. Bij het recreatierapport deel XIV uit 2003 wijkt de auteurslijst in Consensus af van de WUR-catalogus; de WUR-gegevens zijn overgenomen en het verschil blijft zichtbaar in de bronnotitie. Deze uitbreiding betreft uitsluitend lokale literatuurregistratie. De databases Meijendel en Meijendel_bronnen, de analysetoelating en de VPS-publicatiestand zijn in deze taak niet gewijzigd.</w:t>
+      </w:r>
+    </w:p>
+    <w:p>
+      <w:pPr/>
+      <w:r>
+        <w:t>Later op 17 oktober 2026 zijn drie ontbrekende artikelen uit de vierdelige Consensus-selectie over vlinders toegevoegd: Prins et al. (Crossref-jaar 1990, literatuurjaar 1991 nog niet aan de originele druk bevestigd; H6PWHC7Y), Wei et al. (2017; HW6A3JW8) en WallisDeVries en Raemakers (2001; WULG249S). Macel en Klinkhamer (2010; D8ISPYXE) was al aanwezig en is ongewijzigd gebleven. De lokale collectie groeide van 466 naar 469 bibliografische items. Alle drie nieuwe items hebben een DOI en bronnotitie. Voor deze vier artikelen zijn geen volledige teksten of supplementen verkregen; uitgevers- en auteursdownloads waren niet toegankelijk. Er zijn daarom in deze vervolgstap geen bestandsbijlagen op de T7 toegevoegd. Meijendel-deelname aan de begrazingsstudie uit 2001 is bevestigd via de zes route-identificaties in tabel 1 en het Meijendel-routeoverzicht in Holland’s Duinen 66, p. 10; de studie betreft 1992–1996. Dit verandert de analysetoelating en de lokale of gepubliceerde databases niet.</w:t>
       </w:r>
     </w:p>
     <w:p>

</xml_diff>

<commit_message>
Selecteer volledige toegelaten libellenbezoeken
</commit_message>
<xml_diff>
--- a/docs/MEIJENDEL_BRONREGISTER.docx
+++ b/docs/MEIJENDEL_BRONREGISTER.docx
@@ -3836,6 +3836,30 @@
       </w:r>
       <w:r>
         <w:t xml:space="preserve">Oorspronkelijke route- en bezoekstructuur en volledige doelsoortenlijst</w:t>
+      </w:r>
+    </w:p>
+    <w:p>
+      <w:pPr>
+        <w:pStyle w:val="BodyText"/>
+      </w:pPr>
+      <w:r>
+        <w:t>Selectie voor bezoekanalyses, 17 oktober 2026. Gebruik ndff-libellen-selectie-v1 via --selecteer-libellen in gis/scripts/import_ndff_protocolkwaliteit.py. De selectie wordt opnieuw berekend uit de levende database, voor analysetype TV of TA. Alleen een gereconstrueerd algemeen routebezoek waarvan alle bronrecords voorlopig_bruikbaar zijn, binnen meijendel_natura2000 vallen en het gekozen analysetype toestaan, wordt met zijn volledige bestaande taxonmatrix doorgegeven. Ontbrekende of dubbele bron-/analysekoppelingen, afwijkende bezoekaantallen, plots zonder scopestatus en ontbrekende centrale taxonkoppelingen blokkeren de selectie. Taxa zonder soortgroep blijven bereikbaar.</w:t>
+      </w:r>
+    </w:p>
+    <w:p>
+      <w:pPr>
+        <w:pStyle w:val="BodyText"/>
+      </w:pPr>
+      <w:r>
+        <w:t>De controle van de 3.280 bronrecords en 461 bezoeken uit 2007–2021 selecteert 98 bezoeken met 515 bronrecords uit 2010–2021. Hun bestaande matrix bevat 2.842 regels: 353 positieve combinaties en 2.489 afgeleide nullen. De 73 gedeeltelijk toegelaten bezoeken uit 2010–2020 en de 290 geheel uitgesloten bezoeken uit 2007–2020 worden niet als volledige matrix doorgegeven. De afzonderlijk toegelaten positieve records uit gedeeltelijke bezoeken blijven beschikbaar als voorkomensinformatie via de bestaande NDFF-analyseview. De selectie bewaart gegevensgeschiktheid, kwaliteitsmelding, het nulbewijs en de centrale taxonverwijzing. Zij bevestigt geen gevalideerde trend of afwezigheid. Er zijn geen records, bestaande nullen of analysebesluiten gewijzigd en geen extra tabellen of views gemaakt.</w:t>
+      </w:r>
+    </w:p>
+    <w:p>
+      <w:pPr>
+        <w:pStyle w:val="BodyText"/>
+      </w:pPr>
+      <w:r>
+        <w:t>De alleen-lezen T7-controle van 17 oktober 2026 vond in de gecontroleerde gegevensmap en archiefinhoud geen afzonderlijke Vlinderstichting-levering. Alle 3.280 libellenregels uit 2007–2021 in de stagingdataset komen op identificatie, periode, taxonnaam, aantal en protocol overeen met de levende database. De beveiligde NDFF-levering van 14.573 records uit 1950–2025 bevat geen 07.201-records en geen gevuld sessionid. Deze controle sluit een levering elders niet uit; de oorspronkelijke route- en bezoekadministratie is hiermee niet verkregen.</w:t>
       </w:r>
     </w:p>
     <w:p>

</xml_diff>

<commit_message>
Leg libellendekking en eerste bezoekvergelijking vast
</commit_message>
<xml_diff>
--- a/docs/MEIJENDEL_BRONREGISTER.docx
+++ b/docs/MEIJENDEL_BRONREGISTER.docx
@@ -3860,6 +3860,12 @@
       </w:pPr>
       <w:r>
         <w:t>De alleen-lezen T7-controle van 17 oktober 2026 vond in de gecontroleerde gegevensmap en archiefinhoud geen afzonderlijke Vlinderstichting-levering. Alle 3.280 libellenregels uit 2007–2021 in de stagingdataset komen op identificatie, periode, taxonnaam, aantal en protocol overeen met de levende database. De beveiligde NDFF-levering van 14.573 records uit 1950–2025 bevat geen 07.201-records en geen gevuld sessionid. Deze controle sluit een levering elders niet uit; de oorspronkelijke route- en bezoekadministratie is hiermee niet verkregen.</w:t>
+      </w:r>
+    </w:p>
+    <w:p>
+      <w:pPr/>
+      <w:r>
+        <w:t>De dekkingscontrole van 17 oktober 2026 verdeelt deze 98 bezoeken uit 2010–2021 over zes gereconstrueerde routefamilies; 2016, 2018 en 2019 ontbreken in deze selectie en gelden niet als nuljaren. Routefamilie 3 in M16 bevat 56 bezoeken uit 2010–2015. Daarbinnen vormen 36 bezoeken met 156 bronrecords uit juni–augustus een eerste beschrijvende vergelijking: elk jaar zes bezoeken, twee per maand. De 1.044 matrixregels bevatten 103 positieve combinaties voor elf taxa en 941 bestaande afgeleide nullen; achttien van de 29 taxa hebben geen positieve registratie in deze deelreeks. Dit bewijst geen afwezigheid of populatietrend. In M74 vallen 28 geselecteerde bezoeken uit 2020–2021 op veertien gedeelde plot-datums; zonder oorspronkelijke routeadministratie worden zij niet als bewezen onafhankelijke herhalingen opgeteld. De volledige dekking en alle 29 taxonuitkomsten staan in de protocolaudit. De kwaliteitsstatus blijft niet_beoordeeld.</w:t>
       </w:r>
     </w:p>
     <w:p>

</xml_diff>

<commit_message>
Leg hercontrole van PQ en indexkandidaten vast
</commit_message>
<xml_diff>
--- a/docs/MEIJENDEL_BRONREGISTER.docx
+++ b/docs/MEIJENDEL_BRONREGISTER.docx
@@ -5545,6 +5545,12 @@
       </w:r>
       <w:r>
         <w:t xml:space="preserve">.</w:t>
+      </w:r>
+    </w:p>
+    <w:p>
+      <w:pPr/>
+      <w:r>
+        <w:t>Hercontrole op 17 oktober 2026 bevestigt voor de LVD-levering uit 1959–2015 dezelfde 3.437 toegelaten opnamen met 81.310 resultaten en dezelfde 654 mogelijke provinciale opnameparen. De resterende LVD-laag bevat 2.793 opnamen met 64.683 resultaten; ook de geneste opnamekenmerken bevatten geen vaste PQ- of bovenliggende locatie-identificatie. De twee niet-verplaatste nabijheidskandidaten blijven zonder bewijs van gedeelde PQ-identiteit: LVD-event 40650 uit 2011 heeft één resultaat tegenover 26 in provinciale opname 1915; LVD-event 43406 uit 2013 en provinciale opname 1026 hebben elk één resultaat, maar verschillende taxonnamen of bedekkingscodes. Geen van beide paren heeft een gelijke volledige lijst. De 644 eerder verplaatste LVD-opnamen uit 1981–2015 behouden hun 652 vermoedelijke koppelingen en tellen niet zelfstandig mee. Deze hercontrole onderbouwt geen aanvullende PQ-verplaatsing; er zijn geen bronregels of koppelstatussen gewijzigd.</w:t>
       </w:r>
     </w:p>
     <w:p>

</xml_diff>

<commit_message>
Registreer Helmduinen Noord en voorgenomen natuurherstelvlak
</commit_message>
<xml_diff>
--- a/docs/MEIJENDEL_BRONREGISTER.docx
+++ b/docs/MEIJENDEL_BRONREGISTER.docx
@@ -7607,6 +7607,38 @@
       </w:pPr>
       <w:r>
         <w:t>Status. Bronvast op project-, uitvoering- en jaarniveau voor 43 inhoudelijke bronnen en 64 uitvoeringen. Daarnaast is één administratieve migratiebron toegevoegd; maatregel_bron bevat 44 regels. De algemene kavel- en gebiedsindeling is geometrisch beschikbaar voor de 55 actuele plots uit 2025; vijf expliciet gekoppelde historische kavels hebben geen afzonderlijke geometrie. De bronvaste plot-jaarlaag bevat 307 regels voor 1967–1969, 1972–1975, 1988–1991, 1993, 1997, 2002, 2005–2006 en 2013–2025. Het onderzochte PAS-maaibeheer 23 levert geen plot-jaarrijen op, omdat de vier jaarregels 2016–2019 niet_uitgevoerd zijn en de view alleen uitgevoerde jaren opneemt. maatregel_plot_koppeling bevat 211 relaties. Helmduinen heeft er twee; Meeuwenduin en Prinsenduin samen zeven; maatregel 22h zes; de begrazing van Vallei Meijendel negen; maatregel 3c dertien; maatregel 3d vijf; de slagboomvervanging twee; het onderzochte PAS-maaibeheer 23 tien; het maaibeheer in Ruygenhoek, Lange Strook en De Loopert vijf; het PIM-leidingwerk zeven; de PIM-winputten 22; het nabeheer van de kerfzone twee; de aanleg van de vijf kerven drie; de programmabrede pannenmaatregel vier; de programmabrede plagwerkzaamheden acht; infiltratieplas 27.2 één. Vier uitvoeringen hebben geen directe plotkoppeling. De twee Bendel-uitvoeringen en de begrazing van landgoed Weiduin vallen aantoonbaar buiten het Meijendel-plotgebied, zodat nog één geheel ongekoppelde uitvoering ruimtelijk moet worden beoordeeld.</w:t>
+      </w:r>
+    </w:p>
+    <w:p>
+      <w:pPr>
+        <w:pStyle w:val="BodyText"/>
+      </w:pPr>
+      <w:r>
+        <w:t>Actualisering 17 oktober 2026 — voorgenomen natuurherstelvlak binnen het noordelijke deel van Helmduinen. Eén aangeleverde uitnodiging van Jasper Wester (Dunea), met één kaartvlak en de nadere plaatsduiding van Ton, is als planbron vastgelegd. De kaart omvat slechts een vlak binnen Helmduinen Noord. Zij begrenst niet het gehele noordelijke deel of heel Helmduinen. De uitnodiging noemt een werkbezoek op 20 oktober 2026; dit is geen uitvoeringsdatum. De verzenddatum van de uitnodiging, de opnamedatum van de kaart en de uitvoeringsperiode zijn niet vastgesteld.</w:t>
+      </w:r>
+    </w:p>
+    <w:p>
+      <w:pPr>
+        <w:pStyle w:val="BodyText"/>
+      </w:pPr>
+      <w:r>
+        <w:t>De drie aangekondigde maatregelen zijn afzonderlijk geregistreerd: ondiep afplaggen voor vochtige duinvalleien; terugdringen van bosopslag en verstruweling voor grijze duinen en vochtige duinvalleien; reactiveren van oude, vastgelegde stuifkuilen. Alle drie hebben status gepland. Dezelfde benaderde contour is driemaal opgeslagen als TG02_plangebied, één keer per maatregel. Dit betreft één gedeeld planvlak van circa 12 hectare, geen drie afzonderlijke vlakken of gerealiseerde oppervlakten. Er zijn nul TG03-uitvoeringsgeometrieën voor dit project. De verdeling van de maatregelen binnen het vlak, plagdiepte, uitvoeringsdatums en gerealiseerde hoeveelheden zijn niet gegeven en blijven leeg.</w:t>
+      </w:r>
+    </w:p>
+    <w:p>
+      <w:pPr>
+        <w:pStyle w:val="BodyText"/>
+      </w:pPr>
+      <w:r>
+        <w:t>De benaderde contour is afgeleid van de aangeleverde PNG met PDOK-luchtfoto 2024 en getoetst aan de 55 lokale SOVON-kavelpolygonen uit 2025. Het indicatieve centrum ligt op RD 83.605 / 463.497, circa 52,1550 N / 4,3439 O. Het vlak ligt nagenoeg in M13s; de kleine berekende overlap bij M77 is niet robuust tegen kaartpassingsfouten. De drie relaties met M13s hebben daarom status te_beoordelen en geen doorsnijdingspercentage. M77 is niet als maatregelkavel toegevoegd. De contour is geen nauwkeurige uitvoeringsgrens of naamgebiedsgrens.</w:t>
+      </w:r>
+    </w:p>
+    <w:p>
+      <w:pPr>
+        <w:pStyle w:val="BodyText"/>
+      </w:pPr>
+      <w:r>
+        <w:t>De lokale maatregelenlaag bevat na deze invoer op 17 oktober 2026 22 projecten, 53 bronnen, 90 maatregelregistraties, 129 bronkoppelingen, 259 kavelrelaties en drie benaderde TG02-plangeometrieën. De bestaande 132 jaarbeoordelingen en 357 regels in v_plot_jaar_maatregel_bronvast zijn exact behouden. De drie nieuwe plannen voegen nul uitvoeringsjaren en nul feitelijke plot-jaarregels toe. Bronbewijs, oorspronkelijke afbeelding en afgeleide contour staan in docs/bronnen/namen/helmduinen_noord_20261017/. De herhaalbare invoer staat in gis/database/nameninventaris_helmduinen_noord_20261017.sql.</w:t>
       </w:r>
     </w:p>
     <w:p>
@@ -9283,37 +9315,37 @@
         <w:pStyle w:val="BodyText"/>
       </w:pPr>
       <w:r>
-        <w:t xml:space="preserve">Haagse Archeologische Rapportage 1204 uit februari 2012 voegt een nieuwe ruimtelijke bron toe voor Elleboogsprang en Vinkenhoek. Afbeelding 1 op PDF-pagina 4 bevat gebiedscontouren; de rapporttekst koppelt Elleboogsprang tevens aan Sprang H. Voor de maatregelactualisering zijn de contouren met de schaalbalk en de gepubliceerde RD-kilometerhokken georeferereerd. Dat levert een robuuste kaveltoedeling op: Elleboogsprang raakt M10-12-76 en M75, Vinkenhoek ligt in M71. De bronkaart bevat echter geen geodetische controlepunten of digitale brongeometrie. Daarom is de afgeleide contour niet aan de 71 brongeometrieën van versie</w:t>
-      </w:r>
-      <w:r>
-        <w:t xml:space="preserve"> </w:t>
-      </w:r>
-      <w:r>
-        <w:rPr>
-          <w:rStyle w:val="VerbatimChar"/>
-        </w:rPr>
-        <w:t xml:space="preserve">meijendel_nameninventaris_2026-10-14</w:t>
-      </w:r>
-      <w:r>
-        <w:t xml:space="preserve"> </w:t>
-      </w:r>
-      <w:r>
-        <w:t xml:space="preserve">toegevoegd en blijft</w:t>
-      </w:r>
-      <w:r>
-        <w:t xml:space="preserve"> </w:t>
-      </w:r>
-      <w:r>
-        <w:rPr>
-          <w:rStyle w:val="VerbatimChar"/>
-        </w:rPr>
-        <w:t xml:space="preserve">maatregel_geometrie</w:t>
-      </w:r>
-      <w:r>
-        <w:t xml:space="preserve"> </w:t>
-      </w:r>
-      <w:r>
-        <w:t xml:space="preserve">leeg. Vinkenhoek behoudt voorlopig zijn historische naamrecord zonder brongeometrie; Elleboogsprang wordt pas als zelfstandig naamobject aan een volgende inventarisversie toegevoegd wanneer de nieuwe bronlevering versiegebonden en reproduceerbaar kan worden geïmporteerd.</w:t>
+        <w:t>Haagse Archeologische Rapportage 1204 uit februari 2012 voegt een nieuwe ruimtelijke bron toe voor Elleboogsprang en Vinkenhoek. Afbeelding 1 op PDF-pagina 4 bevat gebiedscontouren; de rapporttekst koppelt Elleboogsprang tevens aan Sprang H. Voor de maatregelactualisering zijn de contouren met de schaalbalk en de gepubliceerde RD-kilometerhokken georeferereerd. Dat levert een robuuste kaveltoedeling op: Elleboogsprang raakt M10-12-76 en M75, Vinkenhoek ligt in M71. De bronkaart bevat echter geen geodetische controlepunten of digitale brongeometrie. Daarom is de afgeleide contour niet aan de 71 brongeometrieën van versie</w:t>
+      </w:r>
+      <w:r>
+        <w:t xml:space="preserve"> </w:t>
+      </w:r>
+      <w:r>
+        <w:rPr>
+          <w:rStyle w:val="VerbatimChar"/>
+        </w:rPr>
+        <w:t>meijendel_nameninventaris_2026-10-14</w:t>
+      </w:r>
+      <w:r>
+        <w:t xml:space="preserve"> </w:t>
+      </w:r>
+      <w:r>
+        <w:t>toegevoegd en blijft</w:t>
+      </w:r>
+      <w:r>
+        <w:t xml:space="preserve"> </w:t>
+      </w:r>
+      <w:r>
+        <w:rPr>
+          <w:rStyle w:val="VerbatimChar"/>
+        </w:rPr>
+        <w:t>maatregel_geometrie</w:t>
+      </w:r>
+      <w:r>
+        <w:t xml:space="preserve"> </w:t>
+      </w:r>
+      <w:r>
+        <w:t>leeg. Vinkenhoek behoudt voorlopig zijn historische naamrecord zonder brongeometrie; Elleboogsprang wordt pas als zelfstandig naamobject aan een volgende inventarisversie toegevoegd wanneer de nieuwe bronlevering versiegebonden en reproduceerbaar kan worden geïmporteerd.</w:t>
       </w:r>
     </w:p>
     <w:p>
@@ -9386,6 +9418,30 @@
       </w:pPr>
       <w:r>
         <w:t>De wijziging is transactioneel beproefd, volledig teruggedraaid en daarna met dezelfde inhoud definitief uitgevoerd. Een beperkte herstelback-up van de acht naamtabellen en volledige voor-/nasnapshots zijn lokaal bewaard. Alle 327 tabel- en viewdefinities en 269 triggerdefinities zijn gelijk gebleven, afgezien van de interne auto-incrementtellers. De databasebrede taxonpoort is vóór en na de wijziging geslaagd: 306 basistabellen, 128 beoordeelde routes en nul fouten. De bestaande maatregel-seedcontrole, brondekking en idempotentietest slagen in hun afzonderlijke proefdatabase. De gegevensbijwerking, controles per relatie en herstelbewijs staan in de afzonderlijke levering meijendel_databasebijwerking_2026-10-16. Er is geen volledige Meijendel.sql-export, Shiny-cachebouw of VPS-publicatie uitgevoerd.</w:t>
+      </w:r>
+    </w:p>
+    <w:p>
+      <w:pPr>
+        <w:pStyle w:val="BodyText"/>
+      </w:pPr>
+      <w:r>
+        <w:t>Naamactualisering 17 oktober 2026 — Helmduinen Noord. Ton bevestigt dat deze naam het noordelijke deel van Helmduinen aanduidt. Het aangeleverde natuurherstelvlak ligt binnen dit noordelijke deel, maar omvat niet het gehele noordelijke deel. De precieze ligging en volledige begrenzing van zowel Helmduinen als Helmduinen Noord zijn niet vastgesteld. De historische toedeling Helmduinen M15/M16 blijft eerder bronbewijs voor deelcontext; zij is geen volledige of limitatieve kaveltoedeling van het naamgebied. De planvlakcontext in M13s bewijst evenmin dat Helmduinen Noord of heel Helmduinen uitsluitend in M13s ligt.</w:t>
+      </w:r>
+    </w:p>
+    <w:p>
+      <w:pPr>
+        <w:pStyle w:val="BodyText"/>
+      </w:pPr>
+      <w:r>
+        <w:t>In de levende nameninventaris zijn één naamobject Helmduinen Noord (OBJ-E37FA22F23), één bron en twee bronvermeldingen toegevoegd, waaronder de verduidelijking bij Helmduinen (OBJ-F7B480D407). De ontvangst- en bevestigingsdatum is 17 oktober 2026; dit is geen bewezen eerste naamdatum, kaarteditiejaar of uitvoeringsdatum. Beide naamobjecten hebben een actuele beoordeling bronlacune_geometrie. De oudere beoordeling van Helmduinen is als eerdere versie behouden.</w:t>
+      </w:r>
+    </w:p>
+    <w:p>
+      <w:pPr>
+        <w:pStyle w:val="BodyText"/>
+      </w:pPr>
+      <w:r>
+        <w:t>De stand op 17 oktober 2026 is 183 naamobjecten, 321 vermeldingen uit de oorspronkelijke bronperiode 1602–2026 en de nieuwe bevestiging van 17 oktober 2026, 22 bronnen en 224 beoordelingen, waarvan 112 actueel. Alle 71 bestaande naamgeometrieën, 377 naam–kavelrelaties en 365 relaties in v_nameninventaris_plot_actueel zijn ongewijzigd. Het oorspronkelijke importmanifest blijft de levering van 14 oktober 2026 beschrijven. De benaderde natuurherstelcontour is uitsluitend als maatregelplangebied opgenomen en levert geen naamgeometrie voor Helmduinen Noord of Helmduinen. Bronverantwoording: docs/bronnen/namen/helmduinen_noord_20261017/bronverantwoording.json.</w:t>
       </w:r>
     </w:p>
     <w:p>

</xml_diff>

<commit_message>
Houd historische geometriepassage in Word gelijk aan bronregister
</commit_message>
<xml_diff>
--- a/docs/MEIJENDEL_BRONREGISTER.docx
+++ b/docs/MEIJENDEL_BRONREGISTER.docx
@@ -9330,22 +9330,17 @@
         <w:t xml:space="preserve"> </w:t>
       </w:r>
       <w:r>
-        <w:t>toegevoegd en blijft</w:t>
-      </w:r>
-      <w:r>
-        <w:t xml:space="preserve"> </w:t>
-      </w:r>
-      <w:r>
-        <w:rPr>
-          <w:rStyle w:val="VerbatimChar"/>
-        </w:rPr>
-        <w:t>maatregel_geometrie</w:t>
-      </w:r>
-      <w:r>
-        <w:t xml:space="preserve"> </w:t>
-      </w:r>
-      <w:r>
-        <w:t>leeg. Vinkenhoek behoudt voorlopig zijn historische naamrecord zonder brongeometrie; Elleboogsprang wordt pas als zelfstandig naamobject aan een volgende inventarisversie toegevoegd wanneer de nieuwe bronlevering versiegebonden en reproduceerbaar kan worden geïmporteerd.</w:t>
+        <w:t>toegevoegd en blijft voor deze twee historische contouren een eigen maatregelgeometrie achterwege.</w:t>
+      </w:r>
+      <w:r/>
+      <w:r>
+        <w:rPr>
+          <w:rStyle w:val="VerbatimChar"/>
+        </w:rPr>
+      </w:r>
+      <w:r/>
+      <w:r>
+        <w:t xml:space="preserve"> Vinkenhoek behoudt voorlopig zijn historische naamrecord zonder brongeometrie; Elleboogsprang wordt pas als zelfstandig naamobject aan een volgende inventarisversie toegevoegd wanneer de nieuwe bronlevering versiegebonden en reproduceerbaar kan worden geïmporteerd.</w:t>
       </w:r>
     </w:p>
     <w:p>

</xml_diff>

<commit_message>
Herbeoordeel Helmduinen-bronnen op het getekende planvlak
</commit_message>
<xml_diff>
--- a/docs/MEIJENDEL_BRONREGISTER.docx
+++ b/docs/MEIJENDEL_BRONREGISTER.docx
@@ -3202,6 +3202,22 @@
       </w:r>
       <w:r>
         <w:t xml:space="preserve">.</w:t>
+      </w:r>
+    </w:p>
+    <w:p>
+      <w:pPr>
+        <w:pStyle w:val="BodyText"/>
+      </w:pPr>
+      <w:r>
+        <w:t>Ruimtelijke herbeoordeling voor het getekende Helmduinen-planvlak, 17 oktober 2026. Van de provinciale PQ-bron liggen elf opnamen met 286 soortregels op opgeslagen punten binnen de benaderde contour: zeven opnamen van PQ 1083463022 uit 2002–2023 en vier van PQ 1083463172 uit 1994–2000. Beide locatiegroepen zijn als Duinstruweel geregistreerd. De zeven opnamen van PQ 1083463172 uit 2003–2023 hebben andere coördinaten, circa 56,1 meter van de eerdere positie en 14,8 meter buiten het getekende vlak. Correctie van coördinaten versus verplaatsing is niet vastgesteld; deze reeks mag daarom niet zonder meer als één doorlopende binnen-vlakreeks worden gebruikt. De drie nabije natte-vallei-PQ’s 1083463672, 1083463603 en 1083463109 liggen circa 21–41 meter buiten het vlak en blijven uitsluitend nabije systeemcontext.</w:t>
+      </w:r>
+    </w:p>
+    <w:p>
+      <w:pPr>
+        <w:pStyle w:val="BodyText"/>
+      </w:pPr>
+      <w:r>
+        <w:t>De nominale LVD-selectie voor hetzelfde vlak bevat negentien events en 479 resultaatregels uit 1994–2014, waarvan 339 een bekende overlapmarkering hebben. De dertien afgescheiden bronopnamen hebben zelfstandig_meetellen=0. Zij zijn niet bij de provinciale soortregels opgeteld. Bij twee LVD-events uit 2010 ligt het punt circa 5,5 meter van de planrand, bij tien meter opgegeven coördinaatonzekerheid. Die events zijn niet met hun volledige onzekerheidsgebied aantoonbaar binnen. Dit is een bronbeoordeling voor een benaderde plancontour, geen wijziging van broncoördinaten of analytische toelating.</w:t>
       </w:r>
     </w:p>
     <w:p>
@@ -6270,6 +6286,22 @@
     </w:p>
     <w:p>
       <w:pPr>
+        <w:pStyle w:val="BodyText"/>
+      </w:pPr>
+      <w:r>
+        <w:t>Aanvullende broncontrole habitatpolygonen, 17 oktober 2026. Op de T7 is de bestaande shapefile Natura_2000_Habitattypen_Den_Haag aangetroffen onder /Volumes/T7 Data/Home_Ton/Meijendel data/Habitat/Natura_2000_Habitattypen_Den_Haag-shp/. De levering telt 12.072 bronfeatures in RD New. De gemeentelijke datasetpublicatie Natura 2000 Den Haag noemt Provincie Zuid-Holland als bron en CC0 als licentie; de geselecteerde lokale records noemen Van der Goes en Groot, Alterra &amp; Prov. Z-Holland. De gemeentelijke metadata zijn bijgewerkt op 26 maart 2026. Dat is geen bewezen terrein- of karteringsdatum en bewijst geen byte-identiteit tussen de lokale levering en de huidige webdienst. De inhoudsrelatie met de 384 plot-habitatregels met jaarlabel 2014 is niet versiegebonden vastgesteld.</w:t>
+      </w:r>
+    </w:p>
+    <w:p>
+      <w:pPr>
+        <w:pStyle w:val="BodyText"/>
+      </w:pPr>
+      <w:r>
+        <w:t>Voor het getekende natuurherstelvlak binnen het noordelijke deel van Helmduinen zijn 85 kaartvlakken doorsneden; alle geselecteerde DATUM-velden zijn leeg en alle sommen van de habitatdeelpercentages zijn 100%. Mengpercentages gewogen over de geknipte oppervlakten leveren indicatief 7,460 hectare H2160, 3,729 hectare H2130A, 0,679 hectare H0000, 0,244 hectare H2190B en 0,062 hectare H2120. Het samengevoegde kaartoppervlak is 121.740,713 m² tegenover 121.740,722 m² voor de benaderde plancontour. Dit is bruikbare habitatkaartcontext voor de afweging van struweelverwijdering; geen aangetoonde habitattoestand in oktober 2026 of te realiseren projectoppervlakte. De polygonen zijn niet aan de levende database toegevoegd. De lokale bronhash, 85 geknipte records en controleberekening staan in de afzonderlijke bewijsbundel bij het herziene werkbezoekdossier.</w:t>
+      </w:r>
+    </w:p>
+    <w:p>
+      <w:pPr>
         <w:pStyle w:val="Heading3"/>
       </w:pPr>
       <w:bookmarkStart w:id="53" w:name="_55651eaef6a7220015a2870e55a9e8e9e62256a"/>
@@ -7639,6 +7671,38 @@
       </w:pPr>
       <w:r>
         <w:t>De lokale maatregelenlaag bevat na deze invoer op 17 oktober 2026 22 projecten, 53 bronnen, 90 maatregelregistraties, 129 bronkoppelingen, 259 kavelrelaties en drie benaderde TG02-plangeometrieën. De bestaande 132 jaarbeoordelingen en 357 regels in v_plot_jaar_maatregel_bronvast zijn exact behouden. De drie nieuwe plannen voegen nul uitvoeringsjaren en nul feitelijke plot-jaarregels toe. Bronbewijs, oorspronkelijke afbeelding en afgeleide contour staan in docs/bronnen/namen/helmduinen_noord_20261017/. De herhaalbare invoer staat in gis/database/nameninventaris_helmduinen_noord_20261017.sql.</w:t>
+      </w:r>
+    </w:p>
+    <w:p>
+      <w:pPr>
+        <w:pStyle w:val="BodyText"/>
+      </w:pPr>
+      <w:r>
+        <w:t>Heranalyse van het getekende Helmduinen-planvlak, 17 oktober 2026. De alleen-lezen puntselectie in de levende database bevat 3.250 BMP-vogelregistraties voor 36 soorten uit 162 bezoeken, 2009–2025; alle zijn toegelaten door ruimtelijke poort v3. De afzonderlijke wintertellingen bevatten 3.712 registraties voor 117 soorten uit 175 bezoeken, 2000–2025. De Avimap-analyseview bevat daarnaast 28 registraties uit 2012–2016: tien Konijn, zeven Vos, tien Ree en één spitsmuis spec., met status voorlopig_bruikbaar. Deze bronselecties zijn niet bij elkaar opgeteld en bewijzen geen aantallen getroffen territoria. Bij tien meter in- of uitwaarts verschuiven van de contour variëren de BMP-selecties van 2.698 tot 3.781 registraties; bij 25 meter van 1.915 tot 4.994. Dit zijn scenario’s, geen berekende kaartfoutmarges.</w:t>
+      </w:r>
+    </w:p>
+    <w:p>
+      <w:pPr>
+        <w:pStyle w:val="BodyText"/>
+      </w:pPr>
+      <w:r>
+        <w:t>Van 810.830 openbare NDFF-records raken 15.206 bronvlakken uit 1850–2025 de plancontour; 2.792 zijn vervaagd. De strengere selectie bevat 592 niet-vervaagde bronvlakken die geheel binnen liggen, 105 taxonlabels uit 1994–2025; alle 592 hebben ook toelatingsstatus toegelaten in ruimtelijke poort v3. Ze omvatten 473 vaatplant-, 82 mos-, 21 korstmos- en zestien overige faunaregistraties. De verrijkingslaag koppelt één spitsmuisrecord uit 2021 aan ticket 58679; de toegelaten beveiligde brongeometrie ligt eveneens geheel binnen. De beveiligde registerlaag bevat 232 Nauwe-korfslakrecords uit 1950–2024, waarvan nul brongeometrieën de contour raken. Dit is geen bewijs van afwezigheid in het terrein. Geen nieuwe populatie- of trendtoelating uitgevoerd.</w:t>
+      </w:r>
+    </w:p>
+    <w:p>
+      <w:pPr>
+        <w:pStyle w:val="BodyText"/>
+      </w:pPr>
+      <w:r>
+        <w:t>Het vangblikonderzoek heeft binnen de contour twaalf locatiecodes op zes onderscheiden RD-punten, met 2.472 events uit 1953–1960 en 3.811 vangstregels voor 107 bron-taxonsleutels. Daarvan hebben 1.463 events gekoppelde vangstregels; lege events zijn niet als harde nul geïnterpreteerd. De zes vergelijkingscodes uit 1959–1960 zijn geen extra terreinposities. Dit levert historische onderzoekscontext op dezelfde plaats, geen nulmeting voor 2026. De externe collectieview levert verder één nominale Naturalis-botanyvindplaats van Saxifraga tridactylites uit 2024 binnen de contour, met onbekende numerieke coördinaatonzekerheid en status collectiecontext. Voor ENDURE, Naturalis Coleoptera, NMR-vlinders, STOWA en de bezoekersdrukmeetlocaties zijn in de uitgevoerde binnen-vlakselecties nul nominale locaties/resultaten gevonden.</w:t>
+      </w:r>
+    </w:p>
+    <w:p>
+      <w:pPr>
+        <w:pStyle w:val="BodyText"/>
+      </w:pPr>
+      <w:r>
+        <w:t>De vernieuwde Zotero-controle omvat 1.518 actuele items, waaronder 820 bijlagen. Van 417 is indextekst gelezen; aanvullend zijn 86 tekstcaches en 290 oorspronkelijke PDF’s gelezen. Dertien van de aanvullend onderzochte bestanden leveren geen tekst; 23 bijlagen zijn geen PDF en vier PDF’s zijn niet uitleesbaar. Er is bruikbare tekst uit 780 bijlagen. Dertien zoektermen leveren 367 itemtreffers met 300 bovenliggende of zelfstandige records, geen 300 studies van het planvlak. Van der Hagen &amp; Hooijmans in Holland’s Duinen 88, april 2026, p. 30–46, beschrijven acht Kikkervalleien-inventarisaties uit 1998–2025 en recent vervolgbeheer. De afzonderlijke negen brondeelgebieden zijn niet digitaal met het planvlak vergeleken; de beschreven ingrepen van 2021–2026 zijn daarom niet als uitvoering binnen dit vlak geregistreerd. De heranalyse en volledige bronselecties staan in Helmduinen_werkbezoek_20_oktober_2026.pdf en de map vlakheranalyse_20261017 in het bijbehorende bewijsarchief. De bestaande drie maatregelplannen blijven gepland; geen databasegegevens gewijzigd.</w:t>
       </w:r>
     </w:p>
     <w:p>

</xml_diff>

<commit_message>
Leg TRIM-bootstrapdraaiboek en pilotgrens vast
</commit_message>
<xml_diff>
--- a/docs/MEIJENDEL_BRONREGISTER.docx
+++ b/docs/MEIJENDEL_BRONREGISTER.docx
@@ -824,6 +824,28 @@
       </w:r>
       <w:r>
         <w:t xml:space="preserve">Analyseklaar en primaire bron.</w:t>
+      </w:r>
+    </w:p>
+    <w:p>
+      <w:pPr>
+        <w:pStyle w:val="BodyText"/>
+      </w:pPr>
+      <w:r>
+        <w:rPr>
+          <w:b/>
+        </w:rPr>
+        <w:t xml:space="preserve">TRIM-onzekerheidsmethode voorbereid, 17 oktober 2026. </w:t>
+      </w:r>
+      <w:r>
+        <w:t>Voor de gevalideerde vogelanalyse over 1958–2025 bevat de statuslaag 156 soorten, hebben 135 soorten minimaal één TRIM-indexreeks en hebben 93 soorten een model in zowel 1958–1983 als 1984–2025. De bootstraplineage bevat 52 ooit getelde plots: 17 historische kernplots en 35 plots van het latere netwerk. Voor de primaire brug van 1981–1983 naar 1986–1988 zijn 33 gemeenschappelijke kandidaatplots beschikbaar; per soort wordt de daadwerkelijk bruikbare deelset gebruikt. Twintig plots zijn in alle zes kalibratiejaren geteld. De jaren 1984 en 1985 blijven in het tweede TRIM-model, maar gelden wegens de overgang in methode en tellerbezetting niet als primaire kalibratiejaren. Van de 93 soorten met twee bruikbare modelperioden hebben er 68 in de ongetrokken brondata een geldige nieuwe formele primaire brug. Daarvan hebben 33 soorten een geldige vaste index in ieder van de 68 jaren 1958–2025; zij vormen de gecorrigeerde vaste groepspopulatie. Deze aantallen beschrijven de ontwikkelbron en worden na ontvangst van 2026 opnieuw bepaald.</w:t>
+      </w:r>
+    </w:p>
+    <w:p>
+      <w:pPr>
+        <w:pStyle w:val="BodyText"/>
+      </w:pPr>
+      <w:r>
+        <w:t>De statistische bruikbaarheid verandert als volgt. De twee afzonderlijke TRIM-perioden blijven primair. Na complete en gevalideerde cijfers over 2026 kan de aanvullende trend 1958–2026 formele onzekerheid krijgen via een gestratificeerde clusterbootstrap van soorten, brugfactoren en groepen. De volledige groepsvariant blijft een samenstellingsgevoeligheid. De alternatieve brugvensters en historische-kernvariant leveren een gevoeligheidsenvelop en geen 95%-betrouwbaarheidsinterval. Er is nog geen formeel bootstrapresultaat. De lokale 50-pilot over 1958–2025 voltooide alle replicaties zonder batchfout, maar slechts 5 van 21 primaire vaste groepsschatters haalden 95% geldigheid; 21 van 21 volledige gevoeligheidsschatters deden dat wel. Na correctie van de soortpoort leverde één rookreplicatie 7 van 21 geldige vaste groepen. De 500-validatie is daarom niet gestart, de 2026-cijfers ontbreken en niets is gepubliceerd.</w:t>
       </w:r>
     </w:p>
     <w:p>

</xml_diff>

<commit_message>
Documenteer terreincontext Bart bij Helmduinenplan
</commit_message>
<xml_diff>
--- a/docs/MEIJENDEL_BRONREGISTER.docx
+++ b/docs/MEIJENDEL_BRONREGISTER.docx
@@ -21,7 +21,7 @@
           <w:b/>
           <w:bCs/>
         </w:rPr>
-        <w:t>Stand: 17 oktober 2026.</w:t>
+        <w:t>Stand: 18 oktober 2026.</w:t>
       </w:r>
     </w:p>
     <w:p>
@@ -9501,6 +9501,38 @@
       </w:pPr>
       <w:r>
         <w:t>De stand op 17 oktober 2026 is 183 naamobjecten, 321 vermeldingen uit de oorspronkelijke bronperiode 1602–2026 en de nieuwe bevestiging van 17 oktober 2026, 22 bronnen en 224 beoordelingen, waarvan 112 actueel. Alle 71 bestaande naamgeometrieën, 377 naam–kavelrelaties en 365 relaties in v_nameninventaris_plot_actueel zijn ongewijzigd. Het oorspronkelijke importmanifest blijft de levering van 14 oktober 2026 beschrijven. De benaderde natuurherstelcontour is uitsluitend als maatregelplangebied opgenomen en levert geen naamgeometrie voor Helmduinen Noord of Helmduinen. Bronverantwoording: docs/bronnen/namen/helmduinen_noord_20261017/bronverantwoording.json.</w:t>
+      </w:r>
+    </w:p>
+    <w:p>
+      <w:pPr>
+        <w:pStyle w:val="Heading2"/>
+      </w:pPr>
+      <w:r>
+        <w:t>3.13. Correspondentie over het Helmduinenplan</w:t>
+      </w:r>
+    </w:p>
+    <w:p>
+      <w:pPr>
+        <w:pStyle w:val="BodyText"/>
+      </w:pPr>
+      <w:r>
+        <w:t>Ontvangen en beoordeeld op 18 oktober 2026: één door Ton aangeleverde e-mailketen met vier berichten. Drie berichten zijn gedateerd 17 oktober 2026 (Ton aan Jasper 16:52, Bart aan Ton 17:31, Ton aan Bart 19:42); de inhoudelijke reactie van Bart bovenaan heeft geen eigen datumkop. Bart Dijkstra is volgens Ton de vogel- en PQ-teller van het plot inclusief het voorgenomen werkvlak; hij bevestigt jarenlang PQ-werk voor de provincie. Bronbestand: lokaal aangeleverde Geplakte tekst.txt; inhoud en SHA-256 zijn lokaal bewaard bij de dossieractualisering. Privécorrespondentie, geen toestemming voor openbare verspreiding afgeleid. Geen ruwe e-mailtekst of adressen in Git opgenomen.</w:t>
+      </w:r>
+    </w:p>
+    <w:p>
+      <w:pPr>
+        <w:pStyle w:val="BodyText"/>
+      </w:pPr>
+      <w:r>
+        <w:t>De bron beschrijft weinig verandering van hogere Duindoorn, vogelwaarde van het aaneengesloten struweel, botanisch herstel bij het Parnassiapad, een recente ingreep naast het Ganzenhoekwandelpad, natuurlijke veroudering van struweel en een brandplek. De twee beschreven valleilocaties, het kleine wilgen-berkenbosje en de brandplek hebben geen meegeleverde polygonen, oppervlakten of vaste meetperioden; zij zijn niet exact met het planvlak verbonden. “Afgelopen winter” is zonder datumkop niet als uitvoeringsjaar vastgelegd. Bart verwacht voor natte condities op hogere delen diep graven; dat is geen berekende plagdiepte. Hij heeft de kuilen nooit actief gezien; zijn afleiding vóór 1983 is geen gemeten laatste stuifjaar. Relatieve zeldzaamheid van Duindoorn en de Grasmusvergelijking tussen kavels zijn terreinbeoordelingen, geen nieuwe kwantitatieve analyse.</w:t>
+      </w:r>
+    </w:p>
+    <w:p>
+      <w:pPr>
+        <w:pStyle w:val="BodyText"/>
+      </w:pPr>
+      <w:r>
+        <w:t>Status: kwalitatieve terrein- en beheercontext, geen nieuwe meetdataset of onafhankelijke herhaling van de reeds gebruikte vogel- en PQ-reeksen. Tons bericht van 19:42 herneemt de eerdere analyse en is geen onafhankelijke ecologische bevestiging. De vijf vragen zijn al op 17 oktober aan Jasper verzonden; deze keten bevat geen antwoord van Jasper. De verklaring dat Bart eerder werk niet kende bewijst geen ontbreken van iedere aankondiging. Geen import in Meijendel of Meijendel_bronnen, geen wijziging van tellingen, coördinaten, analysetoelating, naamgrenzen of de drie geplande maatregelregistraties. De bestaande analytische bronnen, contextbronnen en kandidaten behouden hun afzonderlijke omvang, perioden en status. Verwerking: herziene werkbezoek- en veldnotitie-DOCX, aanvulling C1-C4; database- en literatuurstand 17 oktober blijft onderscheiden van correspondentiebeoordeling 18 oktober.</w:t>
       </w:r>
     </w:p>
     <w:p>

</xml_diff>

<commit_message>
Documenteer provinciale bevestiging NDFF-vegetatiedekking
</commit_message>
<xml_diff>
--- a/docs/MEIJENDEL_BRONREGISTER.docx
+++ b/docs/MEIJENDEL_BRONREGISTER.docx
@@ -17,11 +17,7 @@
         <w:pStyle w:val="FirstParagraph"/>
       </w:pPr>
       <w:r>
-        <w:rPr>
-          <w:b/>
-          <w:bCs/>
-        </w:rPr>
-        <w:t>Stand: 17 oktober 2026.</w:t>
+        <w:t>Stand: 19 oktober 2026.</w:t>
       </w:r>
     </w:p>
     <w:p>
@@ -3149,11 +3145,9 @@
         </w:rPr>
         <w:t xml:space="preserve">Status.</w:t>
       </w:r>
-      <w:r>
-        <w:t xml:space="preserve"> </w:t>
-      </w:r>
-      <w:r>
-        <w:t xml:space="preserve">Analyseklaar en primaire bron.</w:t>
+      <w:r/>
+      <w:r>
+        <w:t xml:space="preserve"> Analyseklaar binnen de huidige provinciale bronversie en primaire bron, maar nog niet de afgeronde, door CBS gecontroleerde levering.</w:t>
       </w:r>
     </w:p>
     <w:p>
@@ -3202,6 +3196,20 @@
       </w:r>
       <w:r>
         <w:t xml:space="preserve">.</w:t>
+      </w:r>
+    </w:p>
+    <w:p>
+      <w:pPr>
+        <w:pStyle w:val="BodyText"/>
+      </w:pPr>
+      <w:r>
+        <w:rPr>
+          <w:b/>
+        </w:rPr>
+        <w:t xml:space="preserve">Bronbericht provincie, vastgelegd 19 oktober 2026. </w:t>
+      </w:r>
+      <w:r>
+        <w:t>Ingrid de Vries bevestigt dat de provinciale vegetatiemeetnetgegevens in NDFF onvolledig zijn. Zij noemt geen aantal ontbrekende opnamen, jaren of oorzaak per record: de hierboven beschreven matchpercentages meten die onvolledigheid niet. Provincie Zuid-Holland controleert met CBS de historische vegetatiemeetnetgegevens, waaronder de eerder gemelde wisselende coördinaten en niet meer actieve PQ's. Na de controle wil de provincie de gecorrigeerde gegevens bij NDFF onderbrengen en Ton een nieuwe provinciale levering geven. Deze leveringen zijn nog niet ontvangen. Ingrid werkt bij de provincie aan het NDFF-databeheer, zit namens de provincies in de NDFF-kwaliteitscommissie en neemt deel aan de programmalijn Data &amp; IV van het Verbeterprogramma VHR-monitoring; haar collega's nemen eveneens deel aan dat programma. De bestaande provinciale reeks van 254 PQ's, 2.007 opnamen en 53.122 taxonregels uit 1981–2025 blijft intussen de primaire, als huidige bronversie herkenbare analysetabel.</w:t>
       </w:r>
     </w:p>
     <w:p>
@@ -9560,11 +9568,9 @@
         </w:rPr>
         <w:t xml:space="preserve">Habitatkaart T1:</w:t>
       </w:r>
-      <w:r>
-        <w:t xml:space="preserve"> </w:t>
-      </w:r>
-      <w:r>
-        <w:t xml:space="preserve">Provincie Zuid-Holland heeft toegezegd de kaart te delen zodra zij later in 2026 beschikbaar komt. De kaart kan veranderingen in habitat helpen verklaren, maar is zelf geen soortenwaarneming.</w:t>
+      <w:r/>
+      <w:r>
+        <w:t xml:space="preserve"> Ingrid de Vries heeft de gevalideerde kaart van Meijendel nog niet en verwacht dat deze mogelijk in december 2026 beschikbaar komt. Zij heeft toegezegd de kaart te delen zodra dat kan; december is een verwachting, geen bevestigde leverdatum. De kaart kan veranderingen in habitat helpen verklaren, maar is zelf geen soortenwaarneming.</w:t>
       </w:r>
     </w:p>
     <w:p>

</xml_diff>

<commit_message>
Leg konijnenuitzethokken en historische BMP-analyse vast
</commit_message>
<xml_diff>
--- a/docs/MEIJENDEL_BRONREGISTER.docx
+++ b/docs/MEIJENDEL_BRONREGISTER.docx
@@ -17,11 +17,7 @@
         <w:pStyle w:val="FirstParagraph"/>
       </w:pPr>
       <w:r>
-        <w:rPr>
-          <w:b/>
-          <w:bCs/>
-        </w:rPr>
-        <w:t xml:space="preserve">Stand: 19 oktober 2026.</w:t>
+        <w:t>Stand: 20 oktober 2026.</w:t>
       </w:r>
     </w:p>
     <w:p>
@@ -7207,54 +7203,11 @@
       <w:r>
         <w:rPr>
           <w:b/>
-          <w:bCs/>
-        </w:rPr>
-        <w:t xml:space="preserve">Omvang en periode.</w:t>
-      </w:r>
-      <w:r>
-        <w:t xml:space="preserve"> </w:t>
-      </w:r>
-      <w:r>
-        <w:t xml:space="preserve">De levende lokale database bevat 18 projecten, 43 bronnen, 64 uitvoeringen, 104 expliciete jaarbeoordelingen uit 1967–2026 en 99 bronkoppelingen. Van de jaarbeoordelingen zijn er 88</w:t>
-      </w:r>
-      <w:r>
-        <w:t xml:space="preserve"> </w:t>
-      </w:r>
-      <w:r>
-        <w:rPr>
-          <w:rStyle w:val="VerbatimChar"/>
-        </w:rPr>
-        <w:t xml:space="preserve">uitgevoerd</w:t>
-      </w:r>
-      <w:r>
-        <w:t xml:space="preserve">, 9</w:t>
-      </w:r>
-      <w:r>
-        <w:t xml:space="preserve"> </w:t>
-      </w:r>
-      <w:r>
-        <w:rPr>
-          <w:rStyle w:val="VerbatimChar"/>
-        </w:rPr>
-        <w:t xml:space="preserve">niet_uitgevoerd</w:t>
-      </w:r>
-      <w:r>
-        <w:t xml:space="preserve"> </w:t>
-      </w:r>
-      <w:r>
-        <w:t xml:space="preserve">en 7</w:t>
-      </w:r>
-      <w:r>
-        <w:t xml:space="preserve"> </w:t>
-      </w:r>
-      <w:r>
-        <w:rPr>
-          <w:rStyle w:val="VerbatimChar"/>
-        </w:rPr>
-        <w:t xml:space="preserve">onbekend</w:t>
-      </w:r>
-      <w:r>
-        <w:t xml:space="preserve">. De uitvoering in Meeuwenduin en Prinsenduin is gesplitst: 2023 betreft beide naamgebieden; 2024 uitsluitend Prinsenduin. De nieuwe invoer voegt 28 feitelijke uitvoeringen uit 1967–2006 toe. Zij betreft waterwinning en infiltratieplassen, pad- en rasterwerk, zandvastlegging, de rietpotenproef, begrazing, maaien, plaggen en slibverwijdering. De afzonderlijk gelokaliseerde schoning van infiltratieplas 27.2 voegt één uitvoering en twee jaarregels voor 2013 en 2014 toe. De datumvelden van de totale laag lopen van 1967 tot en met een gepland einde in maart 2027. Geplande werkzaamheden bij de Paardenstal en het subsidieerbare Bendel-nabeheer hebben geen uitgevoerd jaar gekregen; elektriciteitswerk in Vallei Meijendel staat als uitvoering onbekend en heeft eveneens geen jaarregel. De afzonderlijke herinrichting van Bendel is voor 2025 en 2026 als uitgevoerd vastgelegd, maar ligt buiten het Meijendel-plotgebied.</w:t>
+        </w:rPr>
+        <w:t>Omvang en periode.</w:t>
+      </w:r>
+      <w:r>
+        <w:t xml:space="preserve"> De levende lokale database bevat op 20 oktober 2026 22 projecten, 55 bronnen, 91 uitvoeringen, 132 expliciete jaarbeoordelingen uit 1958–2026 en 132 uitvoering-bronrelaties. Van de jaarbeoordelingen zijn er 115 uitgevoerd, 10 niet_uitgevoerd en 7 onbekend. De uitvoering in Meeuwenduin en Prinsenduin is gesplitst: 2023 betreft beide naamgebieden; 2024 uitsluitend Prinsenduin. De eerdere historische invoer voegde 28 feitelijke uitvoeringen uit 1967–2006 toe. Zij betreft waterwinning en infiltratieplassen, pad- en rasterwerk, zandvastlegging, de rietpotenproef, begrazing, maaien, plaggen en slibverwijdering. De afzonderlijk gelokaliseerde schoning van infiltratieplas 27.2 voegt één uitvoering en twee jaarregels voor 2013 en 2014 toe. De datumvelden van de totale laag lopen van 1958 tot en met een gepland einde in maart 2027. Geplande werkzaamheden bij de Paardenstal en het subsidieerbare Bendel-nabeheer hebben geen uitgevoerd jaar gekregen; elektriciteitswerk in Vallei Meijendel staat als uitvoering onbekend en heeft eveneens geen jaarregel. De afzonderlijke herinrichting van Bendel is voor 2025 en 2026 als uitgevoerd vastgelegd, maar ligt buiten het Meijendel-plotgebied.</w:t>
       </w:r>
     </w:p>
     <w:p>
@@ -7297,115 +7250,7 @@
         <w:pStyle w:val="BodyText"/>
       </w:pPr>
       <w:r>
-        <w:rPr>
-          <w:rStyle w:val="VerbatimChar"/>
-        </w:rPr>
-        <w:t xml:space="preserve">maatregel_geometrie</w:t>
-      </w:r>
-      <w:r>
-        <w:t xml:space="preserve"> </w:t>
-      </w:r>
-      <w:r>
-        <w:t xml:space="preserve">bevat nog nul exacte uitvoeringsgeometrieën.</w:t>
-      </w:r>
-      <w:r>
-        <w:t xml:space="preserve"> </w:t>
-      </w:r>
-      <w:r>
-        <w:rPr>
-          <w:rStyle w:val="VerbatimChar"/>
-        </w:rPr>
-        <w:t xml:space="preserve">maatregel_uitvoering_gebied</w:t>
-      </w:r>
-      <w:r>
-        <w:t xml:space="preserve"> </w:t>
-      </w:r>
-      <w:r>
-        <w:t xml:space="preserve">bevat twee veilige relaties: Voorlinden als locatie binnen het speciale gebied M91 en de in 1990 ingevoerde begrazing voor Kijfhoek en Bierlap als volledig benoemd gebied.</w:t>
-      </w:r>
-      <w:r>
-        <w:t xml:space="preserve"> </w:t>
-      </w:r>
-      <w:r>
-        <w:rPr>
-          <w:rStyle w:val="VerbatimChar"/>
-        </w:rPr>
-        <w:t xml:space="preserve">maatregel_plot_koppeling</w:t>
-      </w:r>
-      <w:r>
-        <w:t xml:space="preserve"> </w:t>
-      </w:r>
-      <w:r>
-        <w:t xml:space="preserve">bevat 211 geverifieerde directe relaties. Daarvan zijn 75 onderbouwd met expliciete kavelvermeldingen, gebruikersvaststellingen, een bijzondere gebiedsnaam of gedigitaliseerde broncontouren uit HAR 1204 en HAR 1306. De nameninventaris voegt 42 geometrische doorsnijdingen toe voor zeven volledig en letterlijk gelokaliseerde uitvoeringen. De tien relaties van het onderzochte zoekgebied van het niet uitgevoerde PAS-maaibeheer 23 blijven M10-12-76, M12a, M62, M63, M64, M65, M72, M73, M74 en M75. De vier jaarregels 2016–2019 blijven</w:t>
-      </w:r>
-      <w:r>
-        <w:t xml:space="preserve"> </w:t>
-      </w:r>
-      <w:r>
-        <w:rPr>
-          <w:rStyle w:val="VerbatimChar"/>
-        </w:rPr>
-        <w:t xml:space="preserve">niet_uitgevoerd</w:t>
-      </w:r>
-      <w:r>
-        <w:t xml:space="preserve">; de koppelingen bewijzen dus geen maaiwerk. Daarnaast zijn elf relaties opgenomen voor de volledige systemen Pan 13 en Plas 20, zeven voor het PIM-leidingwerk, 22 voor de PIM-winputten, twee voor het nabeheer van de kerfzone bij het Parnassiapad, drie voor de aanleg van de vijf kerven, één voor infiltratieplas 27.2, vier voor het bronvast gelokaliseerde deel van de programmabrede pannenmaatregel en acht voor de plagwerkzaamheden van het waterwinningsprogramma. De begrazing van de Helmduinen vanaf eind 1991 is na correctie op 15 oktober 2026 gekoppeld aan M15 en M16. M17a is retroactief verwijderd: die kavel hoort voor deze naamtoedeling bij Prinsenduin, niet bij Helmduinen. De begrazing loopt tot heden door. Omdat de bron geen oppervlakte per kavel geeft, blijft</w:t>
-      </w:r>
-      <w:r>
-        <w:t xml:space="preserve"> </w:t>
-      </w:r>
-      <w:r>
-        <w:rPr>
-          <w:rStyle w:val="VerbatimChar"/>
-        </w:rPr>
-        <w:t xml:space="preserve">doorsnijding_pct</w:t>
-      </w:r>
-      <w:r>
-        <w:t xml:space="preserve"> </w:t>
-      </w:r>
-      <w:r>
-        <w:t xml:space="preserve">voor beide leeg. De begrazing van Vallei Meijendel met 38 heideschapen is gekoppeld aan de negen actuele kavels M3, M4-5, M51, M52, M53, M54a, M54b, M55 en M85. De historische voorgangers M4, M5 en M54 zijn niet gekoppeld, zodat dezelfde ruimte niet dubbel wordt geregistreerd. Omdat de evaluatie geen beginjaar en geen exacte begrazingsvoetafdruk geeft, ontstaan geen plot-jaarrijen en blijven de doorsnijdingspercentages leeg. Maatregel 3c, jaarlijkse begrazing van 110 hectare in Vallei Meijendel, Langestrook en De Loopert, is gekoppeld aan dezelfde negen actuele Vallei-kavels en aan M1a, M1b, M45 en M83. De vijf uitgevoerde jaren 2017–2021 leveren 65 plot-jaarrijen. Zij beschrijven uitsluitend de gezamenlijke uitvoeringsscope, omdat de evaluatie de 110 hectare en het jaarlijkse werk niet over gebieden of kavels verdeelt. Maatregel 3d, jaarlijkse begrazing in Zeereep Meijendel, Helmduinen en Prinsenduin, is op 16 oktober 2026 gekoppeld aan M13s, M15, M16, M17a en M78/79. De bron bevestigt niet-uitvoering in 2020 en uitvoering in 2021 en 2025. Daardoor ontstaan tien plot-jaarrijen; zij beschrijven de gezamenlijke uitvoeringsscope, niet het werk per naamgebied of kavel. De in december 2025 vervangen slagbomen bij de entree van Meijendel zijn gekoppeld aan M55 en M85. Dunea onderscheidt P1 Kievietsduin vóór de slagboom van P2 en P3 in De Vallei erachter; de korte toegangssectie ligt in de lokale OSM-wegenlaag op en over de grens van deze twee kavels. Ton bevestigde de koppeling op 16 oktober 2026. De uitgevoerde jaarregel voor 2025 levert twee plot-jaarrijen; de exacte werkvoetafdruk is niet gepubliceerd. De geometrische naamkoppelingen gebruiken de actuele SOVON-plotgeometrie</w:t>
-      </w:r>
-      <w:r>
-        <w:t xml:space="preserve"> </w:t>
-      </w:r>
-      <w:r>
-        <w:rPr>
-          <w:rStyle w:val="VerbatimChar"/>
-        </w:rPr>
-        <w:t xml:space="preserve">sovon-avimap-2025-download-2026-10-02</w:t>
-      </w:r>
-      <w:r>
-        <w:t xml:space="preserve">. Een doorsnijding bewijst dat het genoemde naamgebied de plot raakt, niet welk percentage van de plot feitelijk is bewerkt;</w:t>
-      </w:r>
-      <w:r>
-        <w:t xml:space="preserve"> </w:t>
-      </w:r>
-      <w:r>
-        <w:rPr>
-          <w:rStyle w:val="VerbatimChar"/>
-        </w:rPr>
-        <w:t xml:space="preserve">doorsnijding_pct</w:t>
-      </w:r>
-      <w:r>
-        <w:t xml:space="preserve"> </w:t>
-      </w:r>
-      <w:r>
-        <w:t xml:space="preserve">blijft daarom leeg. Het nabeheer van de vijf bestaande kerven in 2016 en 2024 is gekoppeld aan M16 en M17a. Het ontwerpbeheerplan bevestigt beide uitvoeringsjaren. Van der Hagen, Ten Napel en Arens (2017) beschrijven de zuidelijke, uitgevoerde kerfzone over 750 meter ten zuiden van de bunker bij het Parnassiapad en melden dat tot het voorjaar van 2017 nog geen nabeheer nodig was. Die publicatie geldt daarom voor deze uitvoering als ruimtelijke plancontext, niet als bewijs van het nabeheer. De aanleg van de vijf kerven in de winters 2013/2014 en 2014/2015 is op 16 oktober 2026 gekoppeld aan M15, M16 en M17a. De bron meldt 109.434 m² ontgraven terrein voor de gezamenlijke uitvoering, maar verdeelt dit oppervlak niet over de drie kavels of de twee uitvoeringsjaren. De zes plot-jaarrijen voor 2014 en 2015 beschrijven daarom uitsluitend de gezamenlijke uitvoeringsscope. Voor aanleg en nabeheer is de exacte werkvoetafdruk per jaar en kavel niet gepubliceerd;</w:t>
-      </w:r>
-      <w:r>
-        <w:t xml:space="preserve"> </w:t>
-      </w:r>
-      <w:r>
-        <w:rPr>
-          <w:rStyle w:val="VerbatimChar"/>
-        </w:rPr>
-        <w:t xml:space="preserve">doorsnijding_pct</w:t>
-      </w:r>
-      <w:r>
-        <w:t xml:space="preserve"> </w:t>
-      </w:r>
-      <w:r>
-        <w:t xml:space="preserve">blijft leeg.</w:t>
+        <w:t>De onderstaande maatregelbeschrijving behoudt haar eerdere broncontext. De actuele stand van 20 oktober 2026 is zeven geometrieën, waaronder vier puntlocaties van uitzethokken; zie de konijnenbijplaatsingsproef hieronder. maatregel_uitvoering_gebied bevat twee veilige relaties: Voorlinden als locatie binnen het speciale gebied M91 en de in 1990 ingevoerde begrazing voor Kijfhoek en Bierlap als volledig benoemd gebied. De eerdere telling omvatte 211 geverifieerde directe relaties; de actuele telling van 20 oktober 2026 is 256. Daarvan zijn 75 onderbouwd met expliciete kavelvermeldingen, gebruikersvaststellingen, een bijzondere gebiedsnaam of gedigitaliseerde broncontouren uit HAR 1204 en HAR 1306. De nameninventaris voegt 42 geometrische doorsnijdingen toe voor zeven volledig en letterlijk gelokaliseerde uitvoeringen. De tien relaties van het onderzochte zoekgebied van het niet uitgevoerde PAS-maaibeheer 23 blijven M10-12-76, M12a, M62, M63, M64, M65, M72, M73, M74 en M75. De vier jaarregels 2016–2019 blijven niet_uitgevoerd; de koppelingen bewijzen dus geen maaiwerk. Daarnaast zijn elf relaties opgenomen voor de volledige systemen Pan 13 en Plas 20, zeven voor het PIM-leidingwerk, 22 voor de PIM-winputten, twee voor het nabeheer van de kerfzone bij het Parnassiapad, drie voor de aanleg van de vijf kerven, één voor infiltratieplas 27.2, vier voor het bronvast gelokaliseerde deel van de programmabrede pannenmaatregel en acht voor de plagwerkzaamheden van het waterwinningsprogramma. De begrazing van de Helmduinen vanaf eind 1991 is na correctie op 15 oktober 2026 gekoppeld aan M15 en M16. M17a is retroactief verwijderd: die kavel hoort voor deze naamtoedeling bij Prinsenduin, niet bij Helmduinen. De begrazing loopt tot heden door. Omdat de bron geen oppervlakte per kavel geeft, blijft doorsnijding_pct voor beide leeg. De begrazing van Vallei Meijendel met 38 heideschapen is gekoppeld aan de negen actuele kavels M3, M4-5, M51, M52, M53, M54a, M54b, M55 en M85. De historische voorgangers M4, M5 en M54 zijn niet gekoppeld, zodat dezelfde ruimte niet dubbel wordt geregistreerd. Omdat de evaluatie geen beginjaar en geen exacte begrazingsvoetafdruk geeft, ontstaan geen plot-jaarrijen en blijven de doorsnijdingspercentages leeg. Maatregel 3c, jaarlijkse begrazing van 110 hectare in Vallei Meijendel, Langestrook en De Loopert, is gekoppeld aan dezelfde negen actuele Vallei-kavels en aan M1a, M1b, M45 en M83. De vijf uitgevoerde jaren 2017–2021 leveren 65 plot-jaarrijen. Zij beschrijven uitsluitend de gezamenlijke uitvoeringsscope, omdat de evaluatie de 110 hectare en het jaarlijkse werk niet over gebieden of kavels verdeelt. Maatregel 3d, jaarlijkse begrazing in Zeereep Meijendel, Helmduinen en Prinsenduin, is op 16 oktober 2026 gekoppeld aan M13s, M15, M16, M17a en M78/79. De bron bevestigt niet-uitvoering in 2020 en uitvoering in 2021 en 2025. Daardoor ontstaan tien plot-jaarrijen; zij beschrijven de gezamenlijke uitvoeringsscope, niet het werk per naamgebied of kavel. De in december 2025 vervangen slagbomen bij de entree van Meijendel zijn gekoppeld aan M55 en M85. Dunea onderscheidt P1 Kievietsduin vóór de slagboom van P2 en P3 in De Vallei erachter; de korte toegangssectie ligt in de lokale OSM-wegenlaag op en over de grens van deze twee kavels. Ton bevestigde de koppeling op 16 oktober 2026. De uitgevoerde jaarregel voor 2025 levert twee plot-jaarrijen; de exacte werkvoetafdruk is niet gepubliceerd. De geometrische naamkoppelingen gebruiken de actuele SOVON-plotgeometrie sovon-avimap-2025-download-2026-10-02. Een doorsnijding bewijst dat het genoemde naamgebied de plot raakt, niet welk percentage van de plot feitelijk is bewerkt; doorsnijding_pct blijft daarom leeg. Het nabeheer van de vijf bestaande kerven in 2016 en 2024 is gekoppeld aan M16 en M17a. Het ontwerpbeheerplan bevestigt beide uitvoeringsjaren. Van der Hagen, Ten Napel en Arens (2017) beschrijven de zuidelijke, uitgevoerde kerfzone over 750 meter ten zuiden van de bunker bij het Parnassiapad en melden dat tot het voorjaar van 2017 nog geen nabeheer nodig was. Die publicatie geldt daarom voor deze uitvoering als ruimtelijke plancontext, niet als bewijs van het nabeheer. De aanleg van de vijf kerven in de winters 2013/2014 en 2014/2015 is op 16 oktober 2026 gekoppeld aan M15, M16 en M17a. De bron meldt 109.434 m² ontgraven terrein voor de gezamenlijke uitvoering, maar verdeelt dit oppervlak niet over de drie kavels of de twee uitvoeringsjaren. De zes plot-jaarrijen voor 2014 en 2015 beschrijven daarom uitsluitend de gezamenlijke uitvoeringsscope. Voor aanleg en nabeheer is de exacte werkvoetafdruk per jaar en kavel niet gepubliceerd; doorsnijding_pct blijft leeg.</w:t>
       </w:r>
     </w:p>
     <w:p>
@@ -8000,22 +7845,31 @@
         <w:pStyle w:val="BodyText"/>
       </w:pPr>
       <w:r>
-        <w:t xml:space="preserve">De konijnenbijplaatsingsproef is voor 2024 gekoppeld aan M8 en M41. De ODH-beschikking van 28 augustus 2023 en het daarin opgenomen activiteitenplan benoemen en begrenzen de uitzetlocaties Kleine Pan en Waterschapsvallei. De nameninventaris koppelt Kleine Pan aan M8; vergelijking met de actuele SOVON-kavelgeometrie plaatst Waterschapsvallei in M41. Ton bevestigde beide koppelingen op 14 oktober 2026. Het Dunea-jaarverslag bevestigt dat de proef in 2024 is begonnen en dat rond de uitzetlocaties is gemonitord. De beschikking gold tot en met 31 maart 2026, maar dat vergunningsbereik bewijst geen uitvoering in 2025 of 2026. Daarom bevat de jaarlaag alleen 2024. De precieze uitzet- en monitoringsvoetafdruk binnen beide kavels is niet vastgesteld;</w:t>
-      </w:r>
-      <w:r>
-        <w:t xml:space="preserve"> </w:t>
-      </w:r>
-      <w:r>
-        <w:rPr>
-          <w:rStyle w:val="VerbatimChar"/>
-        </w:rPr>
-        <w:t xml:space="preserve">doorsnijding_pct</w:t>
-      </w:r>
-      <w:r>
-        <w:t xml:space="preserve"> </w:t>
-      </w:r>
-      <w:r>
-        <w:t xml:space="preserve">blijft leeg.</w:t>
+        <w:t>De konijnenbijplaatsingsproef bevat vanaf 20 oktober 2026 twee onderscheiden uitvoeringsregistraties. De bestaande registratie bewaart de door Dunea voor 2024 bevestigde pilot; de eerdere koppelingen aan M8 en M41 zijn herbeoordeeld als te_beoordelen en leveren geen geverifieerde plot-jaarrijen meer. De op 20 oktober 2026 door Ton gedeelde mail van Amy van Nobelen (Dunea; verzenddatum niet zichtbaar) noemt vier feitelijke uitzethokken. Beide punten met bronlabel Kijfhoek/Bierlap, locatie A, Kleine Pan liggen in M7; beide punten met bronlabel Loopert, locatie B, Waterschaps-vallei liggen in M45. De vier Google Maps-punten zijn afzonderlijk opgenomen in maatregel_geometrie, met oorspronkelijke link, WGS84-coördinaten en transformatie naar EPSG:28992. Het zijn punten, geen hokcontouren of effectgebieden; de positionele nauwkeurigheid is niet opgegeven. De nieuwe uitvoeringsregistratie heeft twee geverifieerde kavelrelaties en geen jaarregels. Daarmee wordt geen historisch uitzetjaar aan een huidig hok toegeschreven zonder bronbewijs. doorsnijding_pct en uitgezette aantallen blijven leeg.</w:t>
+      </w:r>
+    </w:p>
+    <w:p>
+      <w:pPr>
+        <w:pStyle w:val="BodyText"/>
+      </w:pPr>
+      <w:r>
+        <w:t>De naamcontrole van 20 oktober 2026 omvat alle 183 objecten in het levende namenregister. Kleine Pan en De Loopert hebben een brononderbouwde naam en een registerpolygoon, maar de A-hokken liggen respectievelijk 172,8 en 202,2 meter buiten de Kleine Pan-polygoon en de B-hokken 102,7 en 145,8 meter buiten de De Loopert-polygoon. Ook de Kijfhoek- en Bierlap-polygonen omvatten de A-punten niet. Loopert bestaat daarnaast als afzonderlijke historische naamvermelding zonder geometrie; die is niet met De Loopert samengevoegd. Waterschaps-vallei is aantoonbaar een planlabel in het activiteitenplan bij de ODH-beschikking van 28 augustus 2023, maar heeft geen afzonderlijk object in het lokale namenregister. De bronlabels worden behouden; zij wijzigen geen bestaande naamgrenzen. De relatie tussen de planlocaties en de feitelijke hokken, mogelijke verplaatsingen en de jaren van hokgebruik moeten nog uit het uitvoeringslogboek blijken.</w:t>
+      </w:r>
+    </w:p>
+    <w:p>
+      <w:pPr>
+        <w:pStyle w:val="BodyText"/>
+      </w:pPr>
+      <w:r>
+        <w:t>De eerdere conclusie dat de bijplaatsing pas in 2024 begon is gecorrigeerd. Dunea jaarverslag 2023, gedrukte pagina 37, bevestigt eerste overplaatsingen van de Maasvlakte in oktober 2023, zonder toedeling aan afzonderlijke hokken of aantallen. Het jaarverslag 2024 noemt eveneens een gestarte pilot en monitoring. De mail noemt letterlijk de afgelopen vier jaar, zonder deze in kalenderjaren te verdelen. Het activiteitenplan noemt beoogde uitzetmomenten en aantallen; die gelden niet als gerealiseerde hoeveelheden. De bestaande jaarregel 2024 blijft daarom behouden, maar er zijn geen nieuwe hok-jaarregels afgeleid. De actuele maatregellaag telt 22 projecten, 91 uitvoeringen, 132 jaarregels, 55 bronnen, 132 uitvoering-bronrelaties, 261 directe kavelrelaties waarvan 256 geverifieerd, zeven geometrieën en 355 bronvaste plot-jaarrijen. De toename bestaat uit één uitvoering, twee bronnen, drie uitvoering-bronrelaties, twee kavelrelaties en vier punten. De twee eerdere plot-jaarrijen voor de konijnenproef vallen na de ruimtelijke herbeoordeling uit de geverifieerde selectie.</w:t>
+      </w:r>
+    </w:p>
+    <w:p>
+      <w:pPr>
+        <w:pStyle w:val="BodyText"/>
+      </w:pPr>
+      <w:r>
+        <w:t>Een eerste lokale BMP/DAZ-analyse gebruikt de oorspronkelijke SOVON/AVIMAP-bezoek-taxonmatrix en de actuele Natura 2000-plotscope. De primaire voorgeschiedenis omvat voor M7 116 bevestigde zoogdierbezoeken in 2010–2023 vóór oktober met een telsom van 199 konijnen, en voor M45 41 bezoeken in 2017–2023 met telsom negen. De secundaire NDFF/BMP-reconstructie levert voor M7 bovendien twee eenduidig aan bezoeken gekoppelde positieve konijnenmeldingen met elk aantal één op 26 mei en 19 juni 2006; historische nulregels worden niet gebruikt. Deze voorgeschiedenis laat een afname in registraties zien die aan de bijplaatsing voorafgaat. In 2024–2025 bevat M7 18 bevestigde zoogdierbezoeken bij 18 BMP-rondes en vier konijnenregistraties, ieder met aantal één en op vier verschillende bezoeken. M45 heeft 13 bevestigde zoogdierbezoeken bij 17 BMP-rondes, met nul konijnenmeldingen binnen die 13 bezoeken. De vier overige rondes mogen niet als zoogdiernul worden ingevuld. In de direct aangrenzende kavels met zoogdiergegevens zijn in 2024–2025 bij M7 twee konijnen geregistreerd tijdens 89 bevestigde bezoeken: één in M6 en één in M8, beide in 2025. Bij M45 zijn nul konijnen geregistreerd tijdens 66 bevestigde bezoeken in vijf buurpercelen. Deze gegevens bewijzen geen volledige teldekking: M64 heeft in beide jaren geen bevestigd zoogdierbezoek en M43 niet in 2024. De eerste ruimtelijke vergelijking en de aanvullende vragen staan in docs/bronnen/audits/NDFF_PROTOCOLAUDIT.md, sectie Konijnenuitzet en primaire BMP/DAZ-waarnemingen. De in september 2026 ontvangen jaargang 2026 is afzonderlijk en onvolledig; er is geen gevalideerd populatie- of uitzettingseffect berekend. Deze maatregelaanvulling verandert geen waarnemingen, taxonidentiteiten, bronperioden of toelating van andere bronnen in Meijendel, Meijendel_bronnen of de kandidaatlaag. De zware exportketen en VPS-publicatie zijn niet gestart.</w:t>
       </w:r>
     </w:p>
     <w:p>

</xml_diff>

<commit_message>
Heranalyseer konijnen met alle beschikbare bronlagen
</commit_message>
<xml_diff>
--- a/docs/MEIJENDEL_BRONREGISTER.docx
+++ b/docs/MEIJENDEL_BRONREGISTER.docx
@@ -4482,53 +4482,23 @@
         <w:pStyle w:val="FirstParagraph"/>
       </w:pPr>
       <w:r>
-        <w:rPr>
-          <w:b/>
-          <w:bCs/>
-        </w:rPr>
-        <w:t xml:space="preserve">Omvang en periode.</w:t>
-      </w:r>
-      <w:r>
-        <w:t xml:space="preserve"> </w:t>
-      </w:r>
-      <w:r>
-        <w:t xml:space="preserve">5.809 records, 812 bezoeken, 1984–2023</w:t>
-      </w:r>
-    </w:p>
-    <w:p>
-      <w:pPr>
-        <w:pStyle w:val="BodyText"/>
-      </w:pPr>
-      <w:r>
-        <w:rPr>
-          <w:b/>
-          <w:bCs/>
-        </w:rPr>
-        <w:t xml:space="preserve">Wat kan nu?</w:t>
-      </w:r>
-      <w:r>
-        <w:t xml:space="preserve"> </w:t>
-      </w:r>
-      <w:r>
-        <w:t xml:space="preserve">Aanwezigheids- en aantalscontext</w:t>
-      </w:r>
-    </w:p>
-    <w:p>
-      <w:pPr>
-        <w:pStyle w:val="BodyText"/>
-      </w:pPr>
-      <w:r>
-        <w:rPr>
-          <w:b/>
-          <w:bCs/>
-        </w:rPr>
-        <w:t xml:space="preserve">Wat ontbreekt voor zelfstandige trends?</w:t>
-      </w:r>
-      <w:r>
-        <w:t xml:space="preserve"> </w:t>
-      </w:r>
-      <w:r>
-        <w:t xml:space="preserve">Eerst overlap met de primaire SOVON- en VWG-reeks oplossen</w:t>
+        <w:t>Omvang en periode. 5.809 protocolrecords uit 1984–2023: 5.095 Konijnrecords en 714 bijvangsten. De 812 kalenderdatums bewijzen geen 812 oorspronkelijke telbezoeken; route- en sectienummers ontbreken.</w:t>
+      </w:r>
+    </w:p>
+    <w:p>
+      <w:pPr>
+        <w:pStyle w:val="BodyText"/>
+      </w:pPr>
+      <w:r>
+        <w:t>Wat kan nu? Broncontext van de zelfstandige konijnentellingen. Alle aangeleverde kilometerhokken raken meerdere kavels; de records zijn niet toegelaten als exact gelokaliseerde kavelwaarnemingen.</w:t>
+      </w:r>
+    </w:p>
+    <w:p>
+      <w:pPr>
+        <w:pStyle w:val="BodyText"/>
+      </w:pPr>
+      <w:r>
+        <w:t>Wat ontbreekt voor zelfstandige trends? De oorspronkelijke route- en sectiekoppeling en volledige bezoekstructuur. De huidige levering stopt in 2023 en biedt geen vergelijking met 2024–2025. Zes Konijnrecords hebben bovendien een mogelijke overlap met protocol 17.204; gelijke telwaarden zijn geen bewijs van dubbeling.</w:t>
       </w:r>
     </w:p>
     <w:p>
@@ -7869,7 +7839,31 @@
         <w:pStyle w:val="BodyText"/>
       </w:pPr>
       <w:r>
-        <w:t>Een eerste lokale BMP/DAZ-analyse gebruikt de oorspronkelijke SOVON/AVIMAP-bezoek-taxonmatrix en de actuele Natura 2000-plotscope. De primaire voorgeschiedenis omvat voor M7 116 bevestigde zoogdierbezoeken in 2010–2023 vóór oktober met een telsom van 199 konijnen, en voor M45 41 bezoeken in 2017–2023 met telsom negen. De secundaire NDFF/BMP-reconstructie levert voor M7 bovendien twee eenduidig aan bezoeken gekoppelde positieve konijnenmeldingen met elk aantal één op 26 mei en 19 juni 2006; historische nulregels worden niet gebruikt. Deze voorgeschiedenis laat een afname in registraties zien die aan de bijplaatsing voorafgaat. In 2024–2025 bevat M7 18 bevestigde zoogdierbezoeken bij 18 BMP-rondes en vier konijnenregistraties, ieder met aantal één en op vier verschillende bezoeken. M45 heeft 13 bevestigde zoogdierbezoeken bij 17 BMP-rondes, met nul konijnenmeldingen binnen die 13 bezoeken. De vier overige rondes mogen niet als zoogdiernul worden ingevuld. In de direct aangrenzende kavels met zoogdiergegevens zijn in 2024–2025 bij M7 twee konijnen geregistreerd tijdens 89 bevestigde bezoeken: één in M6 en één in M8, beide in 2025. Bij M45 zijn nul konijnen geregistreerd tijdens 66 bevestigde bezoeken in vijf buurpercelen. Deze gegevens bewijzen geen volledige teldekking: M64 heeft in beide jaren geen bevestigd zoogdierbezoek en M43 niet in 2024. De eerste ruimtelijke vergelijking en de aanvullende vragen staan in docs/bronnen/audits/NDFF_PROTOCOLAUDIT.md, sectie Konijnenuitzet en primaire BMP/DAZ-waarnemingen. De in september 2026 ontvangen jaargang 2026 is afzonderlijk en onvolledig; er is geen gevalideerd populatie- of uitzettingseffect berekend. Deze maatregelaanvulling verandert geen waarnemingen, taxonidentiteiten, bronperioden of toelating van andere bronnen in Meijendel, Meijendel_bronnen of de kandidaatlaag. De zware exportketen en VPS-publicatie zijn niet gestart.</w:t>
+        <w:t>De heranalyse van 20 oktober 2026 heeft alle 128 centrale taxonroutes op Konijn (taxon_id=38949) doorzocht en onderscheidt drie bronlagen: 10.003 positieve SOVON/AVIMAP-regels uit 2009–2026, 1.787 aanvullend bewaarde positieve bezoektotalen uit SOVON-jaarbestanden 2005–2025 en 11.630 canonieke NDFF-Konijnrecords uit 1960–2025. De bezoektotalen zijn geen extra dieren naast de AVIMAP-punten: 1.562 totalen hebben een AVIMAP-tegenhanger, 225 betreffen 2005–2008. De twee primaire SOVON-producten stemmen in M7 en M45 bij de gemeenschappelijke bezoeken overeen. Voor M7 bevat het jaarbestand daarnaast op 6 juni 2006 een telling van twee konijnen. De twee secundaire NDFF/BMP-meldingen met ieder aantal één op 26 mei en 19 juni 2006 blijven herkenbaar als afzonderlijke historische positieve context; historische afgeleide nullen worden niet gebruikt. Geen van de overige centrale bronfamilies bevat aanvullende konijnenwaarnemingen.</w:t>
+      </w:r>
+    </w:p>
+    <w:p>
+      <w:pPr>
+        <w:pStyle w:val="BodyText"/>
+      </w:pPr>
+      <w:r>
+        <w:t>Van de 11.630 NDFF-records zijn 754 voorlopig bruikbaar voor geregistreerde aanwezigheid; na uitsluiting van één record in M66 blijven 753 records binnen de Natura 2000-analysescope: 751 losse meldingen en twee ObsIdentify-meldingen. Daarvan betreffen 724 regels levende dieren, vijftien dode dieren en veertien sporen of uitwerpselen. Deze categorieën en de meetnetten zijn niet tot één aantal dieren of trend opgeteld. De 5.095 Konijnrecords van het zelfstandige meetnet 17.209 uit 1984–2023 zijn alle ruimtelijk uitgesloten voor een gewone kavelanalyse. Rond Kijfhoek/Bierlap raken twee grove kilometerhokken de zoekzone van 500 meter, met 896 bronregels uit 1984–2022. Geen van die hokvlakken ligt geheel binnen de zoekzone en de exacte route of sectie ontbreekt. Rond Loopert raakt geen aangeleverd telhok de zone van 500 meter. Het meetnet levert daardoor in de huidige levering geen plaatsgebonden vergelijking vóór en na de uitzetting.</w:t>
+      </w:r>
+    </w:p>
+    <w:p>
+      <w:pPr>
+        <w:pStyle w:val="BodyText"/>
+      </w:pPr>
+      <w:r>
+        <w:t>De recente SOVON-uitkomsten blijven gelijk: in M7 zijn in 2024 en 2025 telkens tijdens twee van negen bezoeken met zoogdiermeldingen konijnen geregistreerd, steeds één dier; in M45 nul tijdens acht respectievelijk vijf van zulke bezoeken. In M45 ontbreekt bij vier van de zeventien BMP-rondes uit deze twee jaren bevestiging van zoogdierregistratie. De aanvullende bronnen veranderen wel de duiding van M7: daar is in mei 2023 al een losse melding van een levend konijn gedaan, vóór de eerste gedocumenteerde overplaatsingen in oktober 2023. In mei 2024 is nog één levend konijn buiten de BMP-rondes gemeld. De formulering hernieuwde aanwezigheid vanaf 2024 is daarom voor het gebied als geheel ingetrokken; zij beschreef alleen de eerdere BMP-selectie. Binnen 500 meter van locatie A zijn in 2024 twee BMP-regels en één aanvullende losse melding gevonden, in 2025 drie BMP-regels en geen aanvullende losse melding. Rond locatie B zijn in 2024–2025 geen voldoende precies gelokaliseerde konijnenmeldingen binnen die zone gevonden. Eén melding van een levend exemplaar uit 2025 heeft een vervaagd kilometerhok dat de B-zone gedeeltelijk raakt; ligging binnen de zone is daarmee niet bewezen.</w:t>
+      </w:r>
+    </w:p>
+    <w:p>
+      <w:pPr>
+        <w:pStyle w:val="BodyText"/>
+      </w:pPr>
+      <w:r>
+        <w:t>De geregistreerde afname vóór de uitzetting blijft zichtbaar, maar een uitzettingseffect is met de beschikbare gegevens niet aangetoond en ook niet uitgesloten. De onvolledige SOVON-jaargang 2026 blijft afzonderlijk; in M7 bevat die één konijnenmelding en binnen de A-zone twee. De volledige heranalyse, alle nuluitkomsten en ontbrekende dekking staan in docs/bronnen/audits/NDFF_PROTOCOLAUDIT.md, sectie Heranalyse met alle konijnenbronnen. Er zijn geen oorspronkelijke waarnemingen, maatregelrelaties, taxonidentiteiten of bronversies gewijzigd. Beide registerversies vermelden nu correct kalenderdatums in plaats van onbewezen bezoeken voor 17.209. Meijendel_bronnen en kandidaatbronnen leveren in de gecontroleerde centrale bronfamilies geen extra konijnenmeetregels. De zware exportketen en VPS-publicatie zijn niet gestart.</w:t>
       </w:r>
     </w:p>
     <w:p>

</xml_diff>

<commit_message>
Analyseer konijnenhistorie en hotspots met literatuurcontext
</commit_message>
<xml_diff>
--- a/docs/MEIJENDEL_BRONREGISTER.docx
+++ b/docs/MEIJENDEL_BRONREGISTER.docx
@@ -17,7 +17,7 @@
         <w:pStyle w:val="FirstParagraph"/>
       </w:pPr>
       <w:r>
-        <w:t>Stand: 20 oktober 2026.</w:t>
+        <w:t>Stand: 21 oktober 2026.</w:t>
       </w:r>
     </w:p>
     <w:p>
@@ -7840,6 +7840,30 @@
       </w:pPr>
       <w:r>
         <w:t>De heranalyse van 20 oktober 2026 heeft alle 128 centrale taxonroutes op Konijn (taxon_id=38949) doorzocht en onderscheidt drie bronlagen: 10.003 positieve SOVON/AVIMAP-regels uit 2009–2026, 1.787 aanvullend bewaarde positieve bezoektotalen uit SOVON-jaarbestanden 2005–2025 en 11.630 canonieke NDFF-Konijnrecords uit 1960–2025. De bezoektotalen zijn geen extra dieren naast de AVIMAP-punten: 1.562 totalen hebben een AVIMAP-tegenhanger, 225 betreffen 2005–2008. De twee primaire SOVON-producten stemmen in M7 en M45 bij de gemeenschappelijke bezoeken overeen. Voor M7 bevat het jaarbestand daarnaast op 6 juni 2006 een telling van twee konijnen. De twee secundaire NDFF/BMP-meldingen met ieder aantal één op 26 mei en 19 juni 2006 blijven herkenbaar als afzonderlijke historische positieve context; historische afgeleide nullen worden niet gebruikt. Geen van de overige centrale bronfamilies bevat aanvullende konijnenwaarnemingen.</w:t>
+      </w:r>
+    </w:p>
+    <w:p>
+      <w:pPr>
+        <w:pStyle w:val="BodyText"/>
+      </w:pPr>
+      <w:r>
+        <w:t>De gebiedsbrede konijnenanalyse van 21 oktober 2026 gebruikt dezelfde drie bronlagen en alle 128 centrale taxonroutes. Binnen de Natura 2000-scope bevat de vergelijkende AVIMAP-reeks 9.538 positieve punten met telsom 13.482 tijdens 3.838 rondes met zoogdiermelding, in vijftig kavels uit 2009–2025. De 135 buiten-plotpunten en één bezoek met een opgegeven duur van 1.580 minuten zijn uit deze vergelijking gehouden; de positieve melding uit dat laatste bezoek blijft aanwezigheidsbewijs. De dertig punten uit 2026 blijven afzonderlijk als onvolledige jaargang tot 19 juli. Alle 1.515 binnen scope bewaarde SOVON-jaarbestandtotalen uit 2009–2025 stemmen exact overeen met de puntsommen binnen de kavel en inclusief buiten-plotwaarden; zij zijn niet opgeteld. De 218 aanvullende positieve totalen uit 2005–2008 leveren historische context zonder afgeleide nullen.</w:t>
+      </w:r>
+    </w:p>
+    <w:p>
+      <w:pPr>
+        <w:pStyle w:val="BodyText"/>
+      </w:pPr>
+      <w:r>
+        <w:t>In dezelfde negentien voldoende vaak gevolgde kavels daalt het gemiddelde geregistreerde aantal per ronde van 4,755 in 2009–2013 naar 0,253 in 2021–2025, bij gelijk gewicht per kavel: 94,7% lager. De perioden bevatten 731 respectievelijk 721 rondes; achttien kavels dalen, één blijft nul, geen stijgt. Beperking tot maart–juni geeft 94,5% verschil. Dit is een beschrijvende registratievergelijking, geen gevalideerde populatietrend. M42 is het duidelijkste resterende zwaartepunt: telsom 623 tijdens 35 van 57 rondes in 2021–2025, daarnaast 114 toegelaten losse levende meldingen. M41 heeft een korte reeks met telsom 27 tijdens dertien van veertien rondes in 2024–2025; dat bewijst geen recente vestiging. De 753 toegelaten aanvullende NDFF-records en alle uitgesloten bronlagen blijven afzonderlijk herkenbaar. De 5.095 route-/sectieloze records van 17.209 worden niet als kavelhotspots gebruikt. Volledige jaartabellen, alle nuluitkomsten en ontbrekende dekking, gevoeligheidsanalyse, namencontrole en hotspotkaart staan in docs/bronnen/audits/KONIJN_HISTORIE_HOTSPOTS.ipynb en de bijbehorende sectie in NDFF_PROTOCOLAUDIT.md. Er zijn geen waarnemingen of toelatingsbesluiten gewijzigd; de lokale database is alleen gelezen.</w:t>
+      </w:r>
+    </w:p>
+    <w:p>
+      <w:pPr>
+        <w:pStyle w:val="BodyText"/>
+      </w:pPr>
+      <w:r>
+        <w:t>De literatuurduiding van 21 oktober 2026 verbindt deze analyse met negen geselecteerde werken uit Zotero, waaronder Lucas (1990), Bankert en In ’t Groen (2003), Van Strien et al. (2011), Dekker et al. (2022), Van der Hagen (2022, 2023 en 2025) en De Kok (2016 en 2018). De lokale API-inventaris omvat 1.520 items en noemt 800 fulltekstbijlagen; 418 leveren indextekst, 382 geven op die route HTTP 404. In 166 van de beschikbare teksten staat konijn, rabbit of Oryctolagus; dat zijn geen 166 onafhankelijke onderzoeken. De gelezen werken onderbouwen de functie van konijnen in de vegetatie, verschillen in detectie en mogelijke effecten van menselijk gebruik. Ton beschrijft M42 als open randkavel met veel mensen en verkeer langs de grenzen. Bescherming door het afschrikken van predatoren of verstoren van hun jacht blijft een hypothese naast habitat, zichtbaarheid en gewenning. Van de 95 M42-konijnpunten uit 2021–2025 liggen er 37 binnen honderd meter van een kavelgrens, met telsom 69 van 623. Tijdens dezelfde 57 rondes zijn op 21 rondes vossen gemeld; in de overige 47 kavels op 192 van 1.282 rondes. Deze ongecorrigeerde meldingsfrequenties meten geen predatiedruk of jachtsucces. Geen nieuwe literaire meetregels, externe opslagbestanden of Zotero-wijzigingen zijn gebruikt; bronidentiteiten, metadata-afwijkingen en de volledige duiding staan in dezelfde audit en hetzelfde notebook.</w:t>
       </w:r>
     </w:p>
     <w:p>

</xml_diff>

<commit_message>
Registreer aangeleverde kaart konijnentelroutes als kandidaatbron
</commit_message>
<xml_diff>
--- a/docs/MEIJENDEL_BRONREGISTER.docx
+++ b/docs/MEIJENDEL_BRONREGISTER.docx
@@ -17,7 +17,7 @@
         <w:pStyle w:val="FirstParagraph"/>
       </w:pPr>
       <w:r>
-        <w:t>Stand: 21 oktober 2026.</w:t>
+        <w:t>Stand: 22 oktober 2026.</w:t>
       </w:r>
     </w:p>
     <w:p>
@@ -7872,6 +7872,14 @@
       </w:pPr>
       <w:r>
         <w:t>Van de 11.630 NDFF-records zijn 754 voorlopig bruikbaar voor geregistreerde aanwezigheid; na uitsluiting van één record in M66 blijven 753 records binnen de Natura 2000-analysescope: 751 losse meldingen en twee ObsIdentify-meldingen. Daarvan betreffen 724 regels levende dieren, vijftien dode dieren en veertien sporen of uitwerpselen. Deze categorieën en de meetnetten zijn niet tot één aantal dieren of trend opgeteld. De 5.095 Konijnrecords van het zelfstandige meetnet 17.209 uit 1984–2023 zijn alle ruimtelijk uitgesloten voor een gewone kavelanalyse. Rond Kijfhoek/Bierlap raken twee grove kilometerhokken de zoekzone van 500 meter, met 896 bronregels uit 1984–2022. Geen van die hokvlakken ligt geheel binnen de zoekzone en de exacte route of sectie ontbreekt. Rond Loopert raakt geen aangeleverd telhok de zone van 500 meter. Het meetnet levert daardoor in de huidige levering geen plaatsgebonden vergelijking vóór en na de uitzetting.</w:t>
+      </w:r>
+    </w:p>
+    <w:p>
+      <w:pPr>
+        <w:pStyle w:val="BodyText"/>
+      </w:pPr>
+      <w:r>
+        <w:t>Aanvullende kandidaatbron, ontvangen en beoordeeld op 22 oktober 2026: Ton leverde één PDF-pagina met gekleurde teltrajecten op een luchtfoto, volgens zijn toelichting de Dunea-konijnentelroutes. Het bestand staat lokaal op /Users/ton/Desktop/meijende;l routes.pdf; SHA-256 874b7dc827a6fe4d08a50269bdf2ff0fbbfe4af6dcb07c55064b08c17c6955ce. De PDF is op 21 oktober 2026 aangemaakt, maar die bestandsdatum bewijst niet wanneer deze routes zijn gebruikt. Zij bevat één rasterafbeelding van 2.043 bij 1.434 pixels, geen tekstlaag, vectortrajecten of ingebedde georeferentie. Op de kaart ontbreken routenummers, sectiegrenzen, legenda en gebruiksjaren. De levende lokale controle van 22 oktober bevestigt 5.095 Konijnrecords van protocol 17.209 uit 1984–2023, in elf kilometerhokken en op 811 kalenderdatums; alle 5.095 missen een route-/sectie-id. De kaart kan na georefereren dienen voor ruimtelijke kandidaatkoppeling en vergelijking met kavels en uitzetpunten. Doorsnijding van een route en een hok is geen bewijs welke sectietelling bij die route hoort. Voor definitieve koppeling blijven de oorspronkelijke codes per telregel en de route-/sectieversies per jaar nodig. Ontbrekende tellingen worden niet als nul afgeleid. De kaart is uitsluitend als kandidaatbron buiten de analytische database geregistreerd; geen waarnemingen, toelatingsbesluiten of inhoud van Meijendel_bronnen zijn gewijzigd. Auteurschap en rechten zijn niet uit het bestand vastgesteld; geen externe publicatie.</w:t>
       </w:r>
     </w:p>
     <w:p>

</xml_diff>

<commit_message>
Documenteer BLWG-nalevering korstmossen Meijendel
</commit_message>
<xml_diff>
--- a/docs/MEIJENDEL_BRONREGISTER.docx
+++ b/docs/MEIJENDEL_BRONREGISTER.docx
@@ -17,7 +17,7 @@
         <w:pStyle w:val="FirstParagraph"/>
       </w:pPr>
       <w:r>
-        <w:t>Stand: 19 oktober 2026.</w:t>
+        <w:t>Stand: 23 oktober 2026.</w:t>
       </w:r>
     </w:p>
     <w:p>
@@ -4788,95 +4788,79 @@
           <w:b/>
           <w:bCs/>
         </w:rPr>
-        <w:t xml:space="preserve">Nieuwe primaire bron, 8 oktober 2026.</w:t>
-      </w:r>
-      <w:r>
-        <w:t xml:space="preserve"> </w:t>
-      </w:r>
-      <w:r>
-        <w:t xml:space="preserve">BLWG leverde voor korstmossen zes plots, 32 afzonderlijke telformulieren met waarnemer en lijstcode, en 292 positieve soortregels. Vier vaste plots zijn onderzocht in de veldjaren 2000, 2006, 2011, 2015, 2020 en 2025; twee andere plots zijn alleen in 2021 onderzocht. De levering bevat plotbegrenzingen en de oorspronkelijke kolom</w:t>
-      </w:r>
-      <w:r>
-        <w:t xml:space="preserve"> </w:t>
-      </w:r>
-      <w:r>
-        <w:rPr>
-          <w:rStyle w:val="VerbatimChar"/>
-        </w:rPr>
-        <w:t xml:space="preserve">Kwantiteit</w:t>
-      </w:r>
-      <w:r>
-        <w:t xml:space="preserve">, met vijf van de zes mogelijke klassen in deze selectie. Het rapportagejaar loopt meestal één jaar achter op de feitelijke velddatum; analyses gebruiken de velddatum.</w:t>
-      </w:r>
-    </w:p>
-    <w:p>
-      <w:pPr>
-        <w:pStyle w:val="BodyText"/>
-      </w:pPr>
-      <w:r>
-        <w:rPr>
-          <w:b/>
-          <w:bCs/>
-        </w:rPr>
-        <w:t xml:space="preserve">Vergelijking met NDFF.</w:t>
-      </w:r>
-      <w:r>
-        <w:t xml:space="preserve"> </w:t>
-      </w:r>
-      <w:r>
-        <w:t xml:space="preserve">De 32 BLWG-formulieren zijn niet dezelfde 32 eenheden als de eerder uit NDFF gereconstrueerde plot-datumbezoeken: BLWG onderscheidt bijvoorbeeld de twee tellers in 2015 en 2021. Van de 292 BLWG-soortregels matchen 269 rechtstreeks op plot, velddatum en soortnaam met onvervaagde NDFF-regels; 20 betreffen de openbaar vervaagde</w:t>
-      </w:r>
-      <w:r>
-        <w:t xml:space="preserve"> </w:t>
-      </w:r>
+        <w:t>Primaire BLWG-bron, aangevuld 23 oktober 2026.</w:t>
+      </w:r>
+      <w:r/>
+      <w:r/>
+      <w:r/>
+      <w:r>
+        <w:rPr>
+          <w:rStyle w:val="VerbatimChar"/>
+        </w:rPr>
+      </w:r>
+      <w:r/>
+      <w:r>
+        <w:t xml:space="preserve"> De tweede Excel-levering bevat twaalf plots, 44 afzonderlijke telformulieren met een eigen kopid en waarnemer, en 384 positieve soortregels uit 2000–2025. Vier vaste plots zijn onderzocht in de veldjaren 2000, 2006, 2011, 2015, 2020 en 2025. Acht andere locaties zijn eenmalig onderzocht: twee in 2015, vier in 2018 en twee in 2021. De zes op 23 oktober toegevoegde locaties verklaren precies 92 nieuwe bronregels (36 uit 2015, 56 uit 2018) en twaalf afzonderlijke waarnemersformulieren. De vier vaste plots hebben een WKT-begrenzing; de acht eenmalige locaties hebben alleen RD-coördinaten, afmetingen en een opgegeven oppervlakte. De oorspronkelijke kolom Kwantiteit bevat de klassen 1, 2, 3, 5 en 6. Gebruik voor analyses de velddatum; het rapportagejaar ligt bij de toegevoegde formulieren uit 2015 en 2018 telkens één jaar eerder.</w:t>
+      </w:r>
+    </w:p>
+    <w:p>
+      <w:pPr>
+        <w:pStyle w:val="BodyText"/>
+      </w:pPr>
+      <w:r>
+        <w:rPr>
+          <w:b/>
+          <w:bCs/>
+        </w:rPr>
+        <w:t>Vergelijking met NDFF.</w:t>
+      </w:r>
+      <w:r/>
+      <w:r/>
+      <w:r/>
       <w:r>
         <w:rPr>
           <w:i/>
           <w:iCs/>
         </w:rPr>
-        <w:t xml:space="preserve">Usnea articulata</w:t>
-      </w:r>
-      <w:r>
-        <w:t xml:space="preserve"> </w:t>
-      </w:r>
-      <w:r>
-        <w:t xml:space="preserve">en drie verschillen alleen in de gebruikte wetenschappelijke naam. Die twintig regels en de precieze plotlocatie mogen niet in openbare afgeleide tabellen terechtkomen. De bron is ontvangen maar nog niet geïmporteerd.</w:t>
-      </w:r>
-    </w:p>
-    <w:p>
-      <w:pPr>
-        <w:pStyle w:val="BodyText"/>
-      </w:pPr>
-      <w:r>
-        <w:rPr>
-          <w:b/>
-          <w:bCs/>
-        </w:rPr>
-        <w:t xml:space="preserve">Wat kan nu?</w:t>
-      </w:r>
-      <w:r>
-        <w:t xml:space="preserve"> </w:t>
-      </w:r>
-      <w:r>
-        <w:t xml:space="preserve">De vier vaste korstmossenplots vormen dankzij de primaire plot-, bezoek- en soortenlijsten een veel betere kandidaat voor lokale analyse van aanwezigheid en ordinale bedekking over zes meetronden. Dit is nog geen gebiedsbrede populatietrend of bewijs voor een beheereffect. De twee plots uit 2021 bieden alleen een momentopname. Het mossendeel blijft bruikbaar als zeven kilometerhokinventarisaties, niet als zelfstandige lokale tijdreeks.</w:t>
-      </w:r>
-    </w:p>
-    <w:p>
-      <w:pPr>
-        <w:pStyle w:val="BodyText"/>
-      </w:pPr>
-      <w:r>
-        <w:rPr>
-          <w:b/>
-          <w:bCs/>
-        </w:rPr>
-        <w:t xml:space="preserve">Wat ontbreekt nog?</w:t>
-      </w:r>
-      <w:r>
-        <w:t xml:space="preserve"> </w:t>
-      </w:r>
-      <w:r>
-        <w:t xml:space="preserve">De NDFF-selectie 02.202 bevat daarnaast 92 regels van zes andere BLWG-locaties: twee locaties met een bezoek op 15 februari 2015 en vier met een bezoek op 31 maart 2018. Zij staan niet in de ontvangen BLWG-export. Eerst moet duidelijk zijn of ook voor deze zes locaties de oorspronkelijke plot- en bezoekgegevens beschikbaar zijn; de bestaande NDFF-reconstructie blijft daarvoor voorlopig. Voor protocol 02.204 meldde BLWG dat het om kilometerhokinventarisaties gaat en dat, voor zover bekend, geen afzonderlijke kopgegevens worden bijgehouden. Er is daarvoor nu geen aanvullende levering te verwachten.</w:t>
+      </w:r>
+      <w:r/>
+      <w:r/>
+      <w:r>
+        <w:t xml:space="preserve"> De 384 BLWG-bronregels en 384 NDFF-regels onder protocol 02.202 komen in aantal overeen; de zes nageleverde locaties verklaren de eerdere numerieke kloof van 92 regels. Voor de eerste levering waren 269 van 292 BLWG-soortregels rechtstreeks gematcht op plot, velddatum en soortnaam; twintig betroffen de openbaar vervaagde Usnea articulata en drie een andere wetenschappelijke naam. De 92 nageleverde regels zijn nog niet één voor één met NDFF-identiteiten vergeleken. kopid onderscheidt onafhankelijke waarnemerslijsten, maar een rechtstreekse NDFF-identiteit ontbreekt. De twintig vervaagde regels en precieze plotlocaties mogen niet in openbare afgeleide tabellen terechtkomen. De bron is nog niet geïmporteerd.</w:t>
+      </w:r>
+    </w:p>
+    <w:p>
+      <w:pPr>
+        <w:pStyle w:val="BodyText"/>
+      </w:pPr>
+      <w:r>
+        <w:rPr>
+          <w:b/>
+          <w:bCs/>
+        </w:rPr>
+        <w:t>Wat kan nu?</w:t>
+      </w:r>
+      <w:r/>
+      <w:r/>
+      <w:r>
+        <w:t xml:space="preserve"> De vier vaste korstmossenplots vormen dankzij de primaire plot-, bezoek- en waarnemerslijsten een veel betere kandidaat voor lokale analyse van aanwezigheid en ordinale bedekking over zes meetronden. Dit is nog geen gebiedsbrede populatietrend of bewijs voor een beheereffect. De acht eenmalige locaties leveren momentopnamen, geen eigen trend. Het mossendeel blijft bruikbaar als zeven kilometerhokinventarisaties, niet als zelfstandige lokale tijdreeks.</w:t>
+      </w:r>
+    </w:p>
+    <w:p>
+      <w:pPr>
+        <w:pStyle w:val="BodyText"/>
+      </w:pPr>
+      <w:r>
+        <w:rPr>
+          <w:b/>
+          <w:bCs/>
+        </w:rPr>
+        <w:t>Wat ontbreekt nog?</w:t>
+      </w:r>
+      <w:r/>
+      <w:r/>
+      <w:r>
+        <w:t xml:space="preserve"> De Excel-levering bevat geen expliciete volledigheidsstatus, nulsoortregels, methodewijzigingshistorie of vertaaltabel naar NDFF-identiteiten. De acht eenmalige locaties hebben geen volledige WKT-begrenzing; hun RD-punten mogen niet zonder meer als exact onderzocht vlak worden gebruikt. Voor de vier vaste plots moet bij de integratie worden gecontroleerd welke ontbrekende soorten binnen een volledig ingevuld telformulier als nul mogen gelden. Voor protocol 02.204 meldde BLWG dat het om kilometerhokinventarisaties gaat en dat, voor zover bekend, geen afzonderlijke kopgegevens worden bijgehouden. Er is daarvoor nu geen aanvullende levering te verwachten.</w:t>
       </w:r>
     </w:p>
     <w:p>

</xml_diff>

<commit_message>
Audit BLWG-korstmossen en herstel nulstatus mossen
</commit_message>
<xml_diff>
--- a/docs/MEIJENDEL_BRONREGISTER.docx
+++ b/docs/MEIJENDEL_BRONREGISTER.docx
@@ -17,7 +17,11 @@
         <w:pStyle w:val="FirstParagraph"/>
       </w:pPr>
       <w:r>
-        <w:t>Stand: 23 oktober 2026.</w:t>
+        <w:rPr>
+          <w:b/>
+          <w:bCs/>
+        </w:rPr>
+        <w:t xml:space="preserve">Stand: 23 oktober 2026.</w:t>
       </w:r>
     </w:p>
     <w:p>
@@ -312,7 +316,21 @@
         <w:pStyle w:val="BodyText"/>
       </w:pPr>
       <w:r>
-        <w:t xml:space="preserve">De aanvulling maakt overeenkomsten tussen bronnen vindbaar. In twee stappen hebben 2.509 bestaande registraties alsnog een primaire soortgroep gekregen, waarvan 1.226 in de laatste stap. Alle 87 eerder onopgeloste PQ-naamteksten uit 1981–2025 zijn onderbouwd met code, wetenschappelijke en Nederlandse naam uit Floranld_2020. Deze openbare Turboveg-referentielijst, aangeboden op 10 maart 2026 via www.synbiosys.alterra.nl/turboveg/, bevat 17.468 codes. De oorspronkelijke PQ-waarden en eerdere besluiten blijven behouden.</w:t>
+        <w:t xml:space="preserve">De aanvulling maakt overeenkomsten tussen bronnen vindbaar. In twee stappen hebben 2.509 bestaande registraties alsnog een primaire soortgroep gekregen, waarvan 1.226 in de laatste stap. Alle 87 eerder onopgeloste PQ-naamteksten uit 1981–2025 zijn onderbouwd met code, wetenschappelijke en Nederlandse naam uit Floranld_2020. Deze openbare Turboveg-referentielijst, aangeboden op 10 maart 2026 via</w:t>
+      </w:r>
+      <w:r>
+        <w:t xml:space="preserve"> </w:t>
+      </w:r>
+      <w:hyperlink r:id="rId11">
+        <w:r>
+          <w:rPr>
+            <w:rStyle w:val="Hyperlink"/>
+          </w:rPr>
+          <w:t xml:space="preserve">www.synbiosys.alterra.nl/turboveg/</w:t>
+        </w:r>
+      </w:hyperlink>
+      <w:r>
+        <w:t xml:space="preserve">, bevat 17.468 codes. De oorspronkelijke PQ-waarden en eerdere besluiten blijven behouden.</w:t>
       </w:r>
     </w:p>
     <w:p>
@@ -351,11 +369,11 @@
       <w:pPr>
         <w:pStyle w:val="Heading2"/>
       </w:pPr>
-      <w:bookmarkStart w:id="11" w:name="_4a53154a1633e588416373f70b0c468114c0efc"/>
+      <w:bookmarkStart w:id="12" w:name="_4a53154a1633e588416373f70b0c468114c0efc"/>
       <w:r>
         <w:t xml:space="preserve">Overkoepelende analysegeschiktheid</w:t>
       </w:r>
-      <w:bookmarkEnd w:id="11"/>
+      <w:bookmarkEnd w:id="12"/>
     </w:p>
     <w:p>
       <w:pPr>
@@ -707,11 +725,11 @@
       <w:pPr>
         <w:pStyle w:val="Heading2"/>
       </w:pPr>
-      <w:bookmarkStart w:id="12" w:name="_beheerregel"/>
+      <w:bookmarkStart w:id="13" w:name="_beheerregel"/>
       <w:r>
         <w:t xml:space="preserve">Beheerregel</w:t>
       </w:r>
-      <w:bookmarkEnd w:id="12"/>
+      <w:bookmarkEnd w:id="13"/>
     </w:p>
     <w:p>
       <w:pPr>
@@ -725,7 +743,7 @@
       <w:pPr>
         <w:pStyle w:val="Heading2"/>
       </w:pPr>
-      <w:bookmarkStart w:id="13" w:name="_7243eacc1b8f4fc7d12d9437ed06490b9a892ca"/>
+      <w:bookmarkStart w:id="14" w:name="_c07dfd40f027bce65d2d0499dc5da8ab7f6fd0f"/>
       <w:r>
         <w:t xml:space="preserve">1. Bronnen in MySQL-database</w:t>
       </w:r>
@@ -738,17 +756,17 @@
         </w:rPr>
         <w:t xml:space="preserve">Meijendel</w:t>
       </w:r>
-      <w:bookmarkEnd w:id="13"/>
+      <w:bookmarkEnd w:id="14"/>
     </w:p>
     <w:p>
       <w:pPr>
         <w:pStyle w:val="Heading3"/>
       </w:pPr>
-      <w:bookmarkStart w:id="14" w:name="_ccd8cb4345e3f59364194a2576f706cc2c0a66e"/>
+      <w:bookmarkStart w:id="15" w:name="_32ab8fbd5be08d3f325e2553cd15813ff7e9c1f"/>
       <w:r>
         <w:t xml:space="preserve">1.1. Vogelgegevens van Vogelwerkgroep Meijendel en SOVON</w:t>
       </w:r>
-      <w:bookmarkEnd w:id="14"/>
+      <w:bookmarkEnd w:id="15"/>
     </w:p>
     <w:p>
       <w:pPr>
@@ -860,7 +878,7 @@
         <w:t xml:space="preserve"> </w:t>
       </w:r>
       <w:r>
-        <w:t xml:space="preserve">staan; omgekeerd ontbreekt geen bestaande SOVON-bron-ID in de nieuwe levering. Bij 2.629 gedeelde bron-ID’s levert SOVON broedcode 0 terwijl de database</w:t>
+        <w:t xml:space="preserve">staan; omgekeerd ontbreekt geen bestaande SOVON-bron-ID in de nieuwe levering. Bij 2.629 gedeelde bron-ID's levert SOVON broedcode 0 terwijl de database</w:t>
       </w:r>
       <w:r>
         <w:t xml:space="preserve"> </w:t>
@@ -977,7 +995,7 @@
         <w:t xml:space="preserve">jrvslg_m</w:t>
       </w:r>
       <w:r>
-        <w:t xml:space="preserve">-resultaat in de volledige jaarverslagreeks 1958-2025. Als zo’n soort in een geteld jaarverslagplot ontbreekt, wordt de soort-plotjaarcombinatie als nul behandeld; het is niet vereist dat de soort in hetzelfde kalenderjaar elders is vastgesteld. Deze waarde is geen letterlijke bronnul, krijgt daarom de status</w:t>
+        <w:t xml:space="preserve">-resultaat in de volledige jaarverslagreeks 1958-2025. Als zo'n soort in een geteld jaarverslagplot ontbreekt, wordt de soort-plotjaarcombinatie als nul behandeld; het is niet vereist dat de soort in hetzelfde kalenderjaar elders is vastgesteld. Deze waarde is geen letterlijke bronnul, krijgt daarom de status</w:t>
       </w:r>
       <w:r>
         <w:t xml:space="preserve"> </w:t>
@@ -2158,7 +2176,7 @@
         <w:t xml:space="preserve"> </w:t>
       </w:r>
       <w:r>
-        <w:t xml:space="preserve">blijft voor meeuwen leidend; zonder zo’n regel mag de SOVON-waarde aanvullen of corrigeren. Een ontbrekende teller mag vanuit het jaarverslag worden toegevoegd wanneer kavel en waarnemer ondubbelzinnig zijn en een bestaande code beschikbaar is. De Horsten wordt volledig genegeerd. Niet-conflicterende letterlijke SOVON-nullen worden zonder nieuwe jaarbeslissing opgenomen; niet tot individuele bronregels herleidbare aggregaatvermeldingen worden niet als formeel afgekeurde waarnemingen gereconstrueerd. Ieder jaar wordt eerst volledig vergeleken. Nieuwe soortenconflicten, nieuwe gegevensmodellen en wel individueel herleidbare afkeuringsinformatie blijven afzonderlijke beslispunten.</w:t>
+        <w:t xml:space="preserve">blijft voor meeuwen leidend; zonder zo'n regel mag de SOVON-waarde aanvullen of corrigeren. Een ontbrekende teller mag vanuit het jaarverslag worden toegevoegd wanneer kavel en waarnemer ondubbelzinnig zijn en een bestaande code beschikbaar is. De Horsten wordt volledig genegeerd. Niet-conflicterende letterlijke SOVON-nullen worden zonder nieuwe jaarbeslissing opgenomen; niet tot individuele bronregels herleidbare aggregaatvermeldingen worden niet als formeel afgekeurde waarnemingen gereconstrueerd. Ieder jaar wordt eerst volledig vergeleken. Nieuwe soortenconflicten, nieuwe gegevensmodellen en wel individueel herleidbare afkeuringsinformatie blijven afzonderlijke beslispunten.</w:t>
       </w:r>
     </w:p>
     <w:p>
@@ -3074,11 +3092,11 @@
       <w:pPr>
         <w:pStyle w:val="Heading3"/>
       </w:pPr>
-      <w:bookmarkStart w:id="15" w:name="_8a72a17aa3ecdd9f667bccd1a9ca55413034b5d"/>
+      <w:bookmarkStart w:id="16" w:name="_9645acbfea6b379f23d12aeedc36c987000825a"/>
       <w:r>
         <w:t xml:space="preserve">1.2. Provinciale permanente kwadraten</w:t>
       </w:r>
-      <w:bookmarkEnd w:id="15"/>
+      <w:bookmarkEnd w:id="16"/>
     </w:p>
     <w:p>
       <w:pPr>
@@ -3145,9 +3163,11 @@
         </w:rPr>
         <w:t xml:space="preserve">Status.</w:t>
       </w:r>
-      <w:r/>
-      <w:r>
-        <w:t xml:space="preserve"> Analyseklaar binnen de huidige provinciale bronversie en primaire bron, maar nog niet de afgeronde, door CBS gecontroleerde levering.</w:t>
+      <w:r>
+        <w:t xml:space="preserve"> </w:t>
+      </w:r>
+      <w:r>
+        <w:t xml:space="preserve">Analyseklaar binnen de huidige provinciale bronversie en primaire bron, maar nog niet de afgeronde, door CBS gecontroleerde levering.</w:t>
       </w:r>
     </w:p>
     <w:p>
@@ -3205,38 +3225,42 @@
       <w:r>
         <w:rPr>
           <w:b/>
-        </w:rPr>
-        <w:t xml:space="preserve">Bronbericht provincie, vastgelegd 19 oktober 2026. </w:t>
-      </w:r>
-      <w:r>
-        <w:t>Ingrid de Vries bevestigt dat de provinciale vegetatiemeetnetgegevens in NDFF onvolledig zijn. Zij noemt geen aantal ontbrekende opnamen, jaren of oorzaak per record: de hierboven beschreven matchpercentages meten die onvolledigheid niet. Provincie Zuid-Holland controleert met CBS de historische vegetatiemeetnetgegevens, waaronder de eerder gemelde wisselende coördinaten en niet meer actieve PQ's. Na de controle wil de provincie de gecorrigeerde gegevens bij NDFF onderbrengen en Ton een nieuwe provinciale levering geven. Deze leveringen zijn nog niet ontvangen. Ingrid werkt bij de provincie aan het NDFF-databeheer, zit namens de provincies in de NDFF-kwaliteitscommissie en neemt deel aan de programmalijn Data &amp; IV van het Verbeterprogramma VHR-monitoring; haar collega's nemen eveneens deel aan dat programma. De bestaande provinciale reeks van 254 PQ's, 2.007 opnamen en 53.122 taxonregels uit 1981–2025 blijft intussen de primaire, als huidige bronversie herkenbare analysetabel.</w:t>
-      </w:r>
-    </w:p>
-    <w:p>
-      <w:pPr>
-        <w:pStyle w:val="BodyText"/>
-      </w:pPr>
-      <w:r>
-        <w:t>Ruimtelijke herbeoordeling voor het getekende Helmduinen-planvlak, 17 oktober 2026. Van de provinciale PQ-bron liggen elf opnamen met 286 soortregels op opgeslagen punten binnen de benaderde contour: zeven opnamen van PQ 1083463022 uit 2002–2023 en vier van PQ 1083463172 uit 1994–2000. Beide locatiegroepen zijn als Duinstruweel geregistreerd. De zeven opnamen van PQ 1083463172 uit 2003–2023 hebben andere coördinaten, circa 56,1 meter van de eerdere positie en 14,8 meter buiten het getekende vlak. Correctie van coördinaten versus verplaatsing is niet vastgesteld; deze reeks mag daarom niet zonder meer als één doorlopende binnen-vlakreeks worden gebruikt. De drie nabije natte-vallei-PQ’s 1083463672, 1083463603 en 1083463109 liggen circa 21–41 meter buiten het vlak en blijven uitsluitend nabije systeemcontext.</w:t>
-      </w:r>
-    </w:p>
-    <w:p>
-      <w:pPr>
-        <w:pStyle w:val="BodyText"/>
-      </w:pPr>
-      <w:r>
-        <w:t>De nominale LVD-selectie voor hetzelfde vlak bevat negentien events en 479 resultaatregels uit 1994–2014, waarvan 339 een bekende overlapmarkering hebben. De dertien afgescheiden bronopnamen hebben zelfstandig_meetellen=0. Zij zijn niet bij de provinciale soortregels opgeteld. Bij twee LVD-events uit 2010 ligt het punt circa 5,5 meter van de planrand, bij tien meter opgegeven coördinaatonzekerheid. Die events zijn niet met hun volledige onzekerheidsgebied aantoonbaar binnen. Dit is een bronbeoordeling voor een benaderde plancontour, geen wijziging van broncoördinaten of analytische toelating.</w:t>
+          <w:bCs/>
+        </w:rPr>
+        <w:t xml:space="preserve">Bronbericht provincie, vastgelegd 19 oktober 2026.</w:t>
+      </w:r>
+      <w:r>
+        <w:t xml:space="preserve"> </w:t>
+      </w:r>
+      <w:r>
+        <w:t xml:space="preserve">Ingrid de Vries bevestigt dat de provinciale vegetatiemeetnetgegevens in NDFF onvolledig zijn. Zij noemt geen aantal ontbrekende opnamen, jaren of oorzaak per record: de hierboven beschreven matchpercentages meten die onvolledigheid niet. Provincie Zuid-Holland controleert met CBS de historische vegetatiemeetnetgegevens, waaronder de eerder gemelde wisselende coördinaten en niet meer actieve PQ's. Na de controle wil de provincie de gecorrigeerde gegevens bij NDFF onderbrengen en Ton een nieuwe provinciale levering geven. Deze leveringen zijn nog niet ontvangen. Ingrid werkt bij de provincie aan het NDFF-databeheer, zit namens de provincies in de NDFF-kwaliteitscommissie en neemt deel aan de programmalijn Data &amp; IV van het Verbeterprogramma VHR-monitoring; haar collega's nemen eveneens deel aan dat programma. De bestaande provinciale reeks van 254 PQ's, 2.007 opnamen en 53.122 taxonregels uit 1981–2025 blijft intussen de primaire, als huidige bronversie herkenbare analysetabel.</w:t>
+      </w:r>
+    </w:p>
+    <w:p>
+      <w:pPr>
+        <w:pStyle w:val="BodyText"/>
+      </w:pPr>
+      <w:r>
+        <w:t xml:space="preserve">Ruimtelijke herbeoordeling voor het getekende Helmduinen-planvlak, 17 oktober 2026. Van de provinciale PQ-bron liggen elf opnamen met 286 soortregels op opgeslagen punten binnen de benaderde contour: zeven opnamen van PQ 1083463022 uit 2002–2023 en vier van PQ 1083463172 uit 1994–2000. Beide locatiegroepen zijn als Duinstruweel geregistreerd. De zeven opnamen van PQ 1083463172 uit 2003–2023 hebben andere coördinaten, circa 56,1 meter van de eerdere positie en 14,8 meter buiten het getekende vlak. Correctie van coördinaten versus verplaatsing is niet vastgesteld; deze reeks mag daarom niet zonder meer als één doorlopende binnen-vlakreeks worden gebruikt. De drie nabije natte-vallei-PQ’s 1083463672, 1083463603 en 1083463109 liggen circa 21–41 meter buiten het vlak en blijven uitsluitend nabije systeemcontext.</w:t>
+      </w:r>
+    </w:p>
+    <w:p>
+      <w:pPr>
+        <w:pStyle w:val="BodyText"/>
+      </w:pPr>
+      <w:r>
+        <w:t xml:space="preserve">De nominale LVD-selectie voor hetzelfde vlak bevat negentien events en 479 resultaatregels uit 1994–2014, waarvan 339 een bekende overlapmarkering hebben. De dertien afgescheiden bronopnamen hebben zelfstandig_meetellen=0. Zij zijn niet bij de provinciale soortregels opgeteld. Bij twee LVD-events uit 2010 ligt het punt circa 5,5 meter van de planrand, bij tien meter opgegeven coördinaatonzekerheid. Die events zijn niet met hun volledige onzekerheidsgebied aantoonbaar binnen. Dit is een bronbeoordeling voor een benaderde plancontour, geen wijziging van broncoördinaten of analytische toelating.</w:t>
       </w:r>
     </w:p>
     <w:p>
       <w:pPr>
         <w:pStyle w:val="Heading3"/>
       </w:pPr>
-      <w:bookmarkStart w:id="16" w:name="_ded6c184b9a569c146345b6e935b052f391caf7"/>
+      <w:bookmarkStart w:id="17" w:name="_58edaa7a0159e378417d8d9e2f3abf27d746f4f"/>
       <w:r>
         <w:t xml:space="preserve">1.3. Zoogdieren tijdens SOVON- en VWG-bezoeken</w:t>
       </w:r>
-      <w:bookmarkEnd w:id="16"/>
+      <w:bookmarkEnd w:id="17"/>
     </w:p>
     <w:p>
       <w:pPr>
@@ -3447,11 +3471,11 @@
       <w:pPr>
         <w:pStyle w:val="Heading3"/>
       </w:pPr>
-      <w:bookmarkStart w:id="17" w:name="_94090b81dff39a8cf27d4389271118caece3ef6"/>
+      <w:bookmarkStart w:id="18" w:name="_d3fb9a25da94fa35cd3895c324ae264efa6b6ce"/>
       <w:r>
         <w:t xml:space="preserve">1.4. Historisch vangblikonderzoek</w:t>
       </w:r>
-      <w:bookmarkEnd w:id="17"/>
+      <w:bookmarkEnd w:id="18"/>
     </w:p>
     <w:p>
       <w:pPr>
@@ -3507,7 +3531,7 @@
       <w:r>
         <w:t xml:space="preserve"> </w:t>
       </w:r>
-      <w:hyperlink r:id="rId18">
+      <w:hyperlink r:id="rId19">
         <w:r>
           <w:rPr>
             <w:rStyle w:val="Hyperlink"/>
@@ -3592,11 +3616,11 @@
       <w:pPr>
         <w:pStyle w:val="Heading3"/>
       </w:pPr>
-      <w:bookmarkStart w:id="19" w:name="_003d1b4454050d8b2300662d18ee0e6097f4328"/>
+      <w:bookmarkStart w:id="20" w:name="_05a7f9ed9696b113895f0c60145ad70b98b3ccf"/>
       <w:r>
         <w:t xml:space="preserve">1.5. NDFF: één canonieke laag van openbare en beveiligde gegevens</w:t>
       </w:r>
-      <w:bookmarkEnd w:id="19"/>
+      <w:bookmarkEnd w:id="20"/>
     </w:p>
     <w:p>
       <w:pPr>
@@ -3674,11 +3698,11 @@
       <w:pPr>
         <w:pStyle w:val="Heading4"/>
       </w:pPr>
-      <w:bookmarkStart w:id="20" w:name="_dagvlinders"/>
+      <w:bookmarkStart w:id="21" w:name="_f2f5e1637d9b0d825d88db49318fbe09fe4562d"/>
       <w:r>
         <w:t xml:space="preserve">1.5.1. Dagvlinders</w:t>
       </w:r>
-      <w:bookmarkEnd w:id="20"/>
+      <w:bookmarkEnd w:id="21"/>
     </w:p>
     <w:p>
       <w:pPr>
@@ -3738,11 +3762,11 @@
       <w:pPr>
         <w:pStyle w:val="Heading4"/>
       </w:pPr>
-      <w:bookmarkStart w:id="21" w:name="_hommels"/>
+      <w:bookmarkStart w:id="22" w:name="_ab588a339567fbeba82f7ca9f0ef20022ceaf38"/>
       <w:r>
         <w:t xml:space="preserve">1.5.2. Hommels</w:t>
       </w:r>
-      <w:bookmarkEnd w:id="21"/>
+      <w:bookmarkEnd w:id="22"/>
     </w:p>
     <w:p>
       <w:pPr>
@@ -3802,11 +3826,11 @@
       <w:pPr>
         <w:pStyle w:val="Heading4"/>
       </w:pPr>
-      <w:bookmarkStart w:id="22" w:name="_libellen"/>
+      <w:bookmarkStart w:id="23" w:name="_5eeebc0b3ea39369efcb9361b685b51ab379390"/>
       <w:r>
         <w:t xml:space="preserve">1.5.3. Libellen</w:t>
       </w:r>
-      <w:bookmarkEnd w:id="22"/>
+      <w:bookmarkEnd w:id="23"/>
     </w:p>
     <w:p>
       <w:pPr>
@@ -3867,40 +3891,199 @@
         <w:pStyle w:val="BodyText"/>
       </w:pPr>
       <w:r>
-        <w:t>Selectie voor bezoekanalyses, 17 oktober 2026. Gebruik ndff-libellen-selectie-v1 via --selecteer-libellen in gis/scripts/import_ndff_protocolkwaliteit.py. De selectie wordt opnieuw berekend uit de levende database, voor analysetype TV of TA. Alleen een gereconstrueerd algemeen routebezoek waarvan alle bronrecords voorlopig_bruikbaar zijn, binnen meijendel_natura2000 vallen en het gekozen analysetype toestaan, wordt met zijn volledige bestaande taxonmatrix doorgegeven. Ontbrekende of dubbele bron-/analysekoppelingen, afwijkende bezoekaantallen, plots zonder scopestatus en ontbrekende centrale taxonkoppelingen blokkeren de selectie. Taxa zonder soortgroep blijven bereikbaar.</w:t>
-      </w:r>
-    </w:p>
-    <w:p>
-      <w:pPr>
-        <w:pStyle w:val="BodyText"/>
-      </w:pPr>
-      <w:r>
-        <w:t>De controle van de 3.280 bronrecords en 461 bezoeken uit 2007–2021 selecteert 98 bezoeken met 515 bronrecords uit 2010–2021. Hun bestaande matrix bevat 2.842 regels: 353 positieve combinaties en 2.489 afgeleide nullen. De 73 gedeeltelijk toegelaten bezoeken uit 2010–2020 en de 290 geheel uitgesloten bezoeken uit 2007–2020 worden niet als volledige matrix doorgegeven. De afzonderlijk toegelaten positieve records uit gedeeltelijke bezoeken blijven beschikbaar als voorkomensinformatie via de bestaande NDFF-analyseview. De selectie bewaart gegevensgeschiktheid, kwaliteitsmelding, het nulbewijs en de centrale taxonverwijzing. Zij bevestigt geen gevalideerde trend of afwezigheid. Er zijn geen records, bestaande nullen of analysebesluiten gewijzigd en geen extra tabellen of views gemaakt.</w:t>
-      </w:r>
-    </w:p>
-    <w:p>
-      <w:pPr>
-        <w:pStyle w:val="BodyText"/>
-      </w:pPr>
-      <w:r>
-        <w:t>De alleen-lezen T7-controle van 17 oktober 2026 vond in de gecontroleerde gegevensmap en archiefinhoud geen afzonderlijke Vlinderstichting-levering. Alle 3.280 libellenregels uit 2007–2021 in de stagingdataset komen op identificatie, periode, taxonnaam, aantal en protocol overeen met de levende database. De beveiligde NDFF-levering van 14.573 records uit 1950–2025 bevat geen 07.201-records en geen gevuld sessionid. Deze controle sluit een levering elders niet uit; de oorspronkelijke route- en bezoekadministratie is hiermee niet verkregen.</w:t>
-      </w:r>
-    </w:p>
-    <w:p>
-      <w:pPr/>
-      <w:r>
-        <w:t>De dekkingscontrole van 17 oktober 2026 verdeelt deze 98 bezoeken uit 2010–2021 over zes gereconstrueerde routefamilies; 2016, 2018 en 2019 ontbreken in deze selectie en gelden niet als nuljaren. Routefamilie 3 in M16 bevat 56 bezoeken uit 2010–2015. Daarbinnen vormen 36 bezoeken met 156 bronrecords uit juni–augustus een eerste beschrijvende vergelijking: elk jaar zes bezoeken, twee per maand. De 1.044 matrixregels bevatten 103 positieve combinaties voor elf taxa en 941 bestaande afgeleide nullen; achttien van de 29 taxa hebben geen positieve registratie in deze deelreeks. Dit bewijst geen afwezigheid of populatietrend. In M74 vallen 28 geselecteerde bezoeken uit 2020–2021 op veertien gedeelde plot-datums; zonder oorspronkelijke routeadministratie worden zij niet als bewezen onafhankelijke herhalingen opgeteld. De volledige dekking en alle 29 taxonuitkomsten staan in de protocolaudit. De kwaliteitsstatus blijft niet_beoordeeld.</w:t>
+        <w:rPr>
+          <w:b/>
+          <w:bCs/>
+        </w:rPr>
+        <w:t xml:space="preserve">Selectie voor bezoekanalyses, 17 oktober 2026.</w:t>
+      </w:r>
+      <w:r>
+        <w:t xml:space="preserve"> </w:t>
+      </w:r>
+      <w:r>
+        <w:t xml:space="preserve">Gebruik</w:t>
+      </w:r>
+      <w:r>
+        <w:t xml:space="preserve"> </w:t>
+      </w:r>
+      <w:r>
+        <w:rPr>
+          <w:rStyle w:val="VerbatimChar"/>
+        </w:rPr>
+        <w:t xml:space="preserve">ndff-libellen-selectie-v1</w:t>
+      </w:r>
+      <w:r>
+        <w:t xml:space="preserve"> </w:t>
+      </w:r>
+      <w:r>
+        <w:t xml:space="preserve">via</w:t>
+      </w:r>
+      <w:r>
+        <w:t xml:space="preserve"> </w:t>
+      </w:r>
+      <w:r>
+        <w:rPr>
+          <w:rStyle w:val="VerbatimChar"/>
+        </w:rPr>
+        <w:t xml:space="preserve">--selecteer-libellen</w:t>
+      </w:r>
+      <w:r>
+        <w:t xml:space="preserve"> </w:t>
+      </w:r>
+      <w:r>
+        <w:t xml:space="preserve">in</w:t>
+      </w:r>
+      <w:r>
+        <w:t xml:space="preserve"> </w:t>
+      </w:r>
+      <w:r>
+        <w:rPr>
+          <w:rStyle w:val="VerbatimChar"/>
+        </w:rPr>
+        <w:t xml:space="preserve">gis/scripts/import_ndff_protocolkwaliteit.py</w:t>
+      </w:r>
+      <w:r>
+        <w:t xml:space="preserve">. De selectie wordt opnieuw berekend uit de levende database, voor analysetype</w:t>
+      </w:r>
+      <w:r>
+        <w:t xml:space="preserve"> </w:t>
+      </w:r>
+      <w:r>
+        <w:rPr>
+          <w:rStyle w:val="VerbatimChar"/>
+        </w:rPr>
+        <w:t xml:space="preserve">TV</w:t>
+      </w:r>
+      <w:r>
+        <w:t xml:space="preserve"> </w:t>
+      </w:r>
+      <w:r>
+        <w:t xml:space="preserve">of</w:t>
+      </w:r>
+      <w:r>
+        <w:t xml:space="preserve"> </w:t>
+      </w:r>
+      <w:r>
+        <w:rPr>
+          <w:rStyle w:val="VerbatimChar"/>
+        </w:rPr>
+        <w:t xml:space="preserve">TA</w:t>
+      </w:r>
+      <w:r>
+        <w:t xml:space="preserve">. Alleen een gereconstrueerd algemeen routebezoek waarvan alle bronrecords</w:t>
+      </w:r>
+      <w:r>
+        <w:t xml:space="preserve"> </w:t>
+      </w:r>
+      <w:r>
+        <w:rPr>
+          <w:rStyle w:val="VerbatimChar"/>
+        </w:rPr>
+        <w:t xml:space="preserve">voorlopig_bruikbaar</w:t>
+      </w:r>
+      <w:r>
+        <w:t xml:space="preserve"> </w:t>
+      </w:r>
+      <w:r>
+        <w:t xml:space="preserve">zijn, binnen</w:t>
+      </w:r>
+      <w:r>
+        <w:t xml:space="preserve"> </w:t>
+      </w:r>
+      <w:r>
+        <w:rPr>
+          <w:rStyle w:val="VerbatimChar"/>
+        </w:rPr>
+        <w:t xml:space="preserve">meijendel_natura2000</w:t>
+      </w:r>
+      <w:r>
+        <w:t xml:space="preserve"> </w:t>
+      </w:r>
+      <w:r>
+        <w:t xml:space="preserve">vallen en het gekozen analysetype toestaan, wordt met zijn volledige bestaande taxonmatrix doorgegeven. Ontbrekende of dubbele bron-/analysekoppelingen, afwijkende bezoekaantallen, plots zonder scopestatus en ontbrekende centrale taxonkoppelingen blokkeren de selectie. Taxa zonder soortgroep blijven bereikbaar.</w:t>
+      </w:r>
+    </w:p>
+    <w:p>
+      <w:pPr>
+        <w:pStyle w:val="BodyText"/>
+      </w:pPr>
+      <w:r>
+        <w:t xml:space="preserve">De controle van de 3.280 bronrecords en 461 bezoeken uit 2007–2021 selecteert 98 bezoeken met 515 bronrecords uit 2010–2021. Hun bestaande matrix bevat 2.842 regels: 353 positieve combinaties en 2.489 afgeleide nullen. De 73 gedeeltelijk toegelaten bezoeken uit 2010–2020 en de 290 geheel uitgesloten bezoeken uit 2007–2020 worden niet als volledige matrix doorgegeven. De afzonderlijk toegelaten positieve records uit gedeeltelijke bezoeken blijven beschikbaar als voorkomensinformatie via de bestaande NDFF-analyseview. De selectie bewaart</w:t>
+      </w:r>
+      <w:r>
+        <w:t xml:space="preserve"> </w:t>
+      </w:r>
+      <w:r>
+        <w:rPr>
+          <w:rStyle w:val="VerbatimChar"/>
+        </w:rPr>
+        <w:t xml:space="preserve">gegevensgeschiktheid</w:t>
+      </w:r>
+      <w:r>
+        <w:t xml:space="preserve">,</w:t>
+      </w:r>
+      <w:r>
+        <w:t xml:space="preserve"> </w:t>
+      </w:r>
+      <w:r>
+        <w:rPr>
+          <w:rStyle w:val="VerbatimChar"/>
+        </w:rPr>
+        <w:t xml:space="preserve">kwaliteitsmelding</w:t>
+      </w:r>
+      <w:r>
+        <w:t xml:space="preserve">, het nulbewijs en de centrale taxonverwijzing. Zij bevestigt geen gevalideerde trend of afwezigheid. Er zijn geen records, bestaande nullen of analysebesluiten gewijzigd en geen extra tabellen of views gemaakt.</w:t>
+      </w:r>
+    </w:p>
+    <w:p>
+      <w:pPr>
+        <w:pStyle w:val="BodyText"/>
+      </w:pPr>
+      <w:r>
+        <w:t xml:space="preserve">De alleen-lezen T7-controle van 17 oktober 2026 vond in de gecontroleerde gegevensmap en archiefinhoud geen afzonderlijke Vlinderstichting-levering. Alle 3.280 libellenregels uit 2007–2021 in de stagingdataset komen op identificatie, periode, taxonnaam, aantal en protocol overeen met de levende database. De beveiligde NDFF-levering van 14.573 records uit 1950–2025 bevat geen</w:t>
+      </w:r>
+      <w:r>
+        <w:t xml:space="preserve"> </w:t>
+      </w:r>
+      <w:r>
+        <w:rPr>
+          <w:rStyle w:val="VerbatimChar"/>
+        </w:rPr>
+        <w:t xml:space="preserve">07.201</w:t>
+      </w:r>
+      <w:r>
+        <w:t xml:space="preserve">-records en geen gevuld</w:t>
+      </w:r>
+      <w:r>
+        <w:t xml:space="preserve"> </w:t>
+      </w:r>
+      <w:r>
+        <w:rPr>
+          <w:rStyle w:val="VerbatimChar"/>
+        </w:rPr>
+        <w:t xml:space="preserve">sessionid</w:t>
+      </w:r>
+      <w:r>
+        <w:t xml:space="preserve">. Deze controle sluit een levering elders niet uit; de oorspronkelijke route- en bezoekadministratie is hiermee niet verkregen.</w:t>
+      </w:r>
+    </w:p>
+    <w:p>
+      <w:pPr>
+        <w:pStyle w:val="BodyText"/>
+      </w:pPr>
+      <w:r>
+        <w:t xml:space="preserve">De dekkingscontrole van 17 oktober 2026 verdeelt deze 98 bezoeken uit 2010–2021 over zes gereconstrueerde routefamilies; 2016, 2018 en 2019 ontbreken in deze selectie en gelden niet als nuljaren. Routefamilie 3 in M16 bevat 56 bezoeken uit 2010–2015. Daarbinnen vormen 36 bezoeken met 156 bronrecords uit juni–augustus een eerste beschrijvende vergelijking: elk jaar zes bezoeken, twee per maand. De 1.044 matrixregels bevatten 103 positieve combinaties voor elf taxa en 941 bestaande afgeleide nullen; achttien van de 29 taxa hebben geen positieve registratie in deze deelreeks. Dit bewijst geen afwezigheid of populatietrend. In M74 vallen 28 geselecteerde bezoeken uit 2020–2021 op veertien gedeelde plot-datums; zonder oorspronkelijke routeadministratie worden zij niet als bewezen onafhankelijke herhalingen opgeteld. De volledige dekking en alle 29 taxonuitkomsten staan in de protocolaudit. De kwaliteitsstatus blijft niet_beoordeeld.</w:t>
       </w:r>
     </w:p>
     <w:p>
       <w:pPr>
         <w:pStyle w:val="Heading4"/>
       </w:pPr>
-      <w:bookmarkStart w:id="23" w:name="_nachtvlinders"/>
+      <w:bookmarkStart w:id="24" w:name="_f7f75bff85528639d3a54437d815ffc982ac078"/>
       <w:r>
         <w:t xml:space="preserve">1.5.4. Nachtvlinders</w:t>
       </w:r>
-      <w:bookmarkEnd w:id="23"/>
+      <w:bookmarkEnd w:id="24"/>
     </w:p>
     <w:p>
       <w:pPr>
@@ -3960,11 +4143,11 @@
       <w:pPr>
         <w:pStyle w:val="Heading4"/>
       </w:pPr>
-      <w:bookmarkStart w:id="24" w:name="_amfibieën"/>
+      <w:bookmarkStart w:id="25" w:name="_5952ec78f96e716985cfd2bef0c6dea751da098"/>
       <w:r>
         <w:t xml:space="preserve">1.5.5. Amfibieën</w:t>
       </w:r>
-      <w:bookmarkEnd w:id="24"/>
+      <w:bookmarkEnd w:id="25"/>
     </w:p>
     <w:p>
       <w:pPr>
@@ -4024,11 +4207,11 @@
       <w:pPr>
         <w:pStyle w:val="Heading4"/>
       </w:pPr>
-      <w:bookmarkStart w:id="25" w:name="_reptielen"/>
+      <w:bookmarkStart w:id="26" w:name="_f98973ac0b4b22a8147264cf6fda7ae2d1f2584"/>
       <w:r>
         <w:t xml:space="preserve">1.5.6. Reptielen</w:t>
       </w:r>
-      <w:bookmarkEnd w:id="25"/>
+      <w:bookmarkEnd w:id="26"/>
     </w:p>
     <w:p>
       <w:pPr>
@@ -4088,11 +4271,11 @@
       <w:pPr>
         <w:pStyle w:val="Heading4"/>
       </w:pPr>
-      <w:bookmarkStart w:id="26" w:name="_vissen"/>
+      <w:bookmarkStart w:id="27" w:name="_9ffbbed58a474302bc88f9b6483937563542adc"/>
       <w:r>
         <w:t xml:space="preserve">1.5.7. Vissen</w:t>
       </w:r>
-      <w:bookmarkEnd w:id="26"/>
+      <w:bookmarkEnd w:id="27"/>
     </w:p>
     <w:p>
       <w:pPr>
@@ -4152,11 +4335,11 @@
       <w:pPr>
         <w:pStyle w:val="Heading4"/>
       </w:pPr>
-      <w:bookmarkStart w:id="27" w:name="_vleermuistransecten"/>
+      <w:bookmarkStart w:id="28" w:name="_90b1412457ba2ad39675de54e16fb4052a9af96"/>
       <w:r>
         <w:t xml:space="preserve">1.5.8. Vleermuistransecten</w:t>
       </w:r>
-      <w:bookmarkEnd w:id="27"/>
+      <w:bookmarkEnd w:id="28"/>
     </w:p>
     <w:p>
       <w:pPr>
@@ -4216,11 +4399,11 @@
       <w:pPr>
         <w:pStyle w:val="Heading4"/>
       </w:pPr>
-      <w:bookmarkStart w:id="28" w:name="_38cdc6eff084869e7169beb9a7d0a36448859a3"/>
+      <w:bookmarkStart w:id="29" w:name="_0bf7c6d2026ffa63b6182a76ed7ab201ef2ca1a"/>
       <w:r>
         <w:t xml:space="preserve">1.5.9. Konijnentellingen in de duinen</w:t>
       </w:r>
-      <w:bookmarkEnd w:id="28"/>
+      <w:bookmarkEnd w:id="29"/>
     </w:p>
     <w:p>
       <w:pPr>
@@ -4280,11 +4463,11 @@
       <w:pPr>
         <w:pStyle w:val="Heading4"/>
       </w:pPr>
-      <w:bookmarkStart w:id="29" w:name="_b7507ab25f19a705cdaea288841b95e0326cd82"/>
+      <w:bookmarkStart w:id="30" w:name="_d64910a2091f56dedd2aaa5a75994d38ec4c969"/>
       <w:r>
         <w:t xml:space="preserve">1.5.10. Wintertellingen vleermuizen</w:t>
       </w:r>
-      <w:bookmarkEnd w:id="29"/>
+      <w:bookmarkEnd w:id="30"/>
     </w:p>
     <w:p>
       <w:pPr>
@@ -4344,11 +4527,11 @@
       <w:pPr>
         <w:pStyle w:val="Heading4"/>
       </w:pPr>
-      <w:bookmarkStart w:id="30" w:name="_ba761ed76f0837e5aa40881d1ff3dfd4f2a2564"/>
+      <w:bookmarkStart w:id="31" w:name="_9cec44656db08bd57f600992eaa74a526d260b3"/>
       <w:r>
         <w:t xml:space="preserve">1.5.11. Het Nieuwe Strepen</w:t>
       </w:r>
-      <w:bookmarkEnd w:id="30"/>
+      <w:bookmarkEnd w:id="31"/>
     </w:p>
     <w:p>
       <w:pPr>
@@ -4383,7 +4566,7 @@
         <w:t xml:space="preserve"> </w:t>
       </w:r>
       <w:r>
-        <w:t xml:space="preserve">Op 6 oktober 2026 meldde FLORON dat één kalenderdag in één kilometerhok als telling mag worden beschouwd. Zo’n telling kan één, twee of drie oorspronkelijke lijsten omvatten. Persoonsgegevens en daarvan afgeleide waarnemerscodes worden niet geleverd. De</w:t>
+        <w:t xml:space="preserve">Op 6 oktober 2026 meldde FLORON dat één kalenderdag in één kilometerhok als telling mag worden beschouwd. Zo'n telling kan één, twee of drie oorspronkelijke lijsten omvatten. Persoonsgegevens en daarvan afgeleide waarnemerscodes worden niet geleverd. De</w:t>
       </w:r>
       <w:r>
         <w:t xml:space="preserve"> </w:t>
@@ -4486,11 +4669,11 @@
       <w:pPr>
         <w:pStyle w:val="Heading4"/>
       </w:pPr>
-      <w:bookmarkStart w:id="31" w:name="_add682eaf9770b54759a1b54720dedd522bc07f"/>
+      <w:bookmarkStart w:id="32" w:name="_c056d2025de29c95bc511421c5f5e41469354eb"/>
       <w:r>
         <w:t xml:space="preserve">1.5.12. FLORBASE en andere vaatplantinventarisaties</w:t>
       </w:r>
-      <w:bookmarkEnd w:id="31"/>
+      <w:bookmarkEnd w:id="32"/>
     </w:p>
     <w:p>
       <w:pPr>
@@ -4525,7 +4708,7 @@
         <w:t xml:space="preserve"> </w:t>
       </w:r>
       <w:r>
-        <w:t xml:space="preserve">Eén jaar in één kilometerhok is de fijnste beschikbare teleenheid. Voor 2011 werden alleen soort, jaar, kilometerhok en waarnemer opgeslagen. FLORON beschikt niet over de eerder gevraagde lijst-ID’s, volledigheidsvlaggen, bezoekdata, bezoekduur, checklistversies of expliciete registraties van niet-aangetroffen soorten.</w:t>
+        <w:t xml:space="preserve">Eén jaar in één kilometerhok is de fijnste beschikbare teleenheid. Voor 2011 werden alleen soort, jaar, kilometerhok en waarnemer opgeslagen. FLORON beschikt niet over de eerder gevraagde lijst-ID's, volledigheidsvlaggen, bezoekdata, bezoekduur, checklistversies of expliciete registraties van niet-aangetroffen soorten.</w:t>
       </w:r>
     </w:p>
     <w:p>
@@ -4550,11 +4733,11 @@
       <w:pPr>
         <w:pStyle w:val="Heading4"/>
       </w:pPr>
-      <w:bookmarkStart w:id="32" w:name="_ddc09a389d1414cf9c368e3f96b3cd144167922"/>
+      <w:bookmarkStart w:id="33" w:name="_b2fbeb28e0a334b9e6cb93232c4d845faf48221"/>
       <w:r>
         <w:t xml:space="preserve">1.5.13. LMF-aandachtssoorten</w:t>
       </w:r>
-      <w:bookmarkEnd w:id="32"/>
+      <w:bookmarkEnd w:id="33"/>
     </w:p>
     <w:p>
       <w:pPr>
@@ -4755,11 +4938,11 @@
       <w:pPr>
         <w:pStyle w:val="Heading4"/>
       </w:pPr>
-      <w:bookmarkStart w:id="33" w:name="_54b0c9881ebf1c9c32ceb4f54ebc7dcb81d8783"/>
+      <w:bookmarkStart w:id="34" w:name="_0ce2ec4e8b5503e251897e5490450ca2d9e0742"/>
       <w:r>
         <w:t xml:space="preserve">1.5.14. Mossen en korstmossen</w:t>
       </w:r>
-      <w:bookmarkEnd w:id="33"/>
+      <w:bookmarkEnd w:id="34"/>
     </w:p>
     <w:p>
       <w:pPr>
@@ -4788,90 +4971,257 @@
           <w:b/>
           <w:bCs/>
         </w:rPr>
-        <w:t>Primaire BLWG-bron, aangevuld 23 oktober 2026.</w:t>
-      </w:r>
-      <w:r/>
-      <w:r/>
-      <w:r/>
-      <w:r>
-        <w:rPr>
-          <w:rStyle w:val="VerbatimChar"/>
-        </w:rPr>
-      </w:r>
-      <w:r/>
-      <w:r>
-        <w:t xml:space="preserve"> De tweede Excel-levering bevat twaalf plots, 44 afzonderlijke telformulieren met een eigen kopid en waarnemer, en 384 positieve soortregels uit 2000–2025. Vier vaste plots zijn onderzocht in de veldjaren 2000, 2006, 2011, 2015, 2020 en 2025. Acht andere locaties zijn eenmalig onderzocht: twee in 2015, vier in 2018 en twee in 2021. De zes op 23 oktober toegevoegde locaties verklaren precies 92 nieuwe bronregels (36 uit 2015, 56 uit 2018) en twaalf afzonderlijke waarnemersformulieren. De vier vaste plots hebben een WKT-begrenzing; de acht eenmalige locaties hebben alleen RD-coördinaten, afmetingen en een opgegeven oppervlakte. De oorspronkelijke kolom Kwantiteit bevat de klassen 1, 2, 3, 5 en 6. Gebruik voor analyses de velddatum; het rapportagejaar ligt bij de toegevoegde formulieren uit 2015 en 2018 telkens één jaar eerder.</w:t>
-      </w:r>
-    </w:p>
-    <w:p>
-      <w:pPr>
-        <w:pStyle w:val="BodyText"/>
-      </w:pPr>
-      <w:r>
-        <w:rPr>
-          <w:b/>
-          <w:bCs/>
-        </w:rPr>
-        <w:t>Vergelijking met NDFF.</w:t>
-      </w:r>
-      <w:r/>
-      <w:r/>
-      <w:r/>
+        <w:t xml:space="preserve">Primaire BLWG-bron, aangevuld 23 oktober 2026.</w:t>
+      </w:r>
+      <w:r>
+        <w:t xml:space="preserve"> </w:t>
+      </w:r>
+      <w:r>
+        <w:t xml:space="preserve">De tweede Excel-levering bevat twaalf plots, 44 afzonderlijke telformulieren met een eigen</w:t>
+      </w:r>
+      <w:r>
+        <w:t xml:space="preserve"> </w:t>
+      </w:r>
+      <w:r>
+        <w:rPr>
+          <w:rStyle w:val="VerbatimChar"/>
+        </w:rPr>
+        <w:t xml:space="preserve">kopid</w:t>
+      </w:r>
+      <w:r>
+        <w:t xml:space="preserve"> </w:t>
+      </w:r>
+      <w:r>
+        <w:t xml:space="preserve">en waarnemer, en 384 positieve soortregels uit 2000–2025. Vier vaste plots zijn onderzocht in de veldjaren 2000, 2006, 2011, 2015, 2020 en 2025. Acht andere locaties zijn eenmalig onderzocht: twee in 2015, vier in 2018 en twee in 2021. De zes op 23 oktober toegevoegde locaties verklaren precies 92 nieuwe bronregels (36 uit 2015, 56 uit 2018) en twaalf afzonderlijke waarnemersformulieren. De vier vaste plots hebben een WKT-begrenzing; de acht eenmalige locaties hebben alleen RD-coördinaten, afmetingen en een opgegeven oppervlakte. De oorspronkelijke kolom</w:t>
+      </w:r>
+      <w:r>
+        <w:t xml:space="preserve"> </w:t>
+      </w:r>
+      <w:r>
+        <w:rPr>
+          <w:rStyle w:val="VerbatimChar"/>
+        </w:rPr>
+        <w:t xml:space="preserve">Kwantiteit</w:t>
+      </w:r>
+      <w:r>
+        <w:t xml:space="preserve"> </w:t>
+      </w:r>
+      <w:r>
+        <w:t xml:space="preserve">bevat de klassen 1, 2, 3, 5 en 6. Gebruik voor analyses de velddatum; het rapportagejaar ligt bij de toegevoegde formulieren uit 2015 en 2018 telkens één jaar eerder.</w:t>
+      </w:r>
+    </w:p>
+    <w:p>
+      <w:pPr>
+        <w:pStyle w:val="BodyText"/>
+      </w:pPr>
+      <w:r>
+        <w:rPr>
+          <w:b/>
+          <w:bCs/>
+        </w:rPr>
+        <w:t xml:space="preserve">Vergelijking met NDFF.</w:t>
+      </w:r>
+      <w:r>
+        <w:t xml:space="preserve"> </w:t>
+      </w:r>
+      <w:r>
+        <w:t xml:space="preserve">Alle 384 BLWG-bronregels uit 2000–2025 zijn per plot, velddatum en taxon vergeleken met NDFF. Na omzetting van drie gedocumenteerde naamsparen komen de 364 niet-gevoelige regels als multiverzameling exact overeen met 364 openbare NDFF-regels: nul ontbrekend, nul extra. De twintig gevoelige</w:t>
+      </w:r>
+      <w:r>
+        <w:t xml:space="preserve"> </w:t>
+      </w:r>
       <w:r>
         <w:rPr>
           <w:i/>
           <w:iCs/>
         </w:rPr>
-      </w:r>
-      <w:r/>
-      <w:r/>
-      <w:r>
-        <w:t xml:space="preserve"> De 384 BLWG-bronregels en 384 NDFF-regels onder protocol 02.202 komen in aantal overeen; de zes nageleverde locaties verklaren de eerdere numerieke kloof van 92 regels. Voor de eerste levering waren 269 van 292 BLWG-soortregels rechtstreeks gematcht op plot, velddatum en soortnaam; twintig betroffen de openbaar vervaagde Usnea articulata en drie een andere wetenschappelijke naam. De 92 nageleverde regels zijn nog niet één voor één met NDFF-identiteiten vergeleken. kopid onderscheidt onafhankelijke waarnemerslijsten, maar een rechtstreekse NDFF-identiteit ontbreekt. De twintig vervaagde regels en precieze plotlocaties mogen niet in openbare afgeleide tabellen terechtkomen. De bron is nog niet geïmporteerd.</w:t>
-      </w:r>
-    </w:p>
-    <w:p>
-      <w:pPr>
-        <w:pStyle w:val="BodyText"/>
-      </w:pPr>
-      <w:r>
-        <w:rPr>
-          <w:b/>
-          <w:bCs/>
-        </w:rPr>
-        <w:t>Wat kan nu?</w:t>
-      </w:r>
-      <w:r/>
-      <w:r/>
-      <w:r>
-        <w:t xml:space="preserve"> De vier vaste korstmossenplots vormen dankzij de primaire plot-, bezoek- en waarnemerslijsten een veel betere kandidaat voor lokale analyse van aanwezigheid en ordinale bedekking over zes meetronden. Dit is nog geen gebiedsbrede populatietrend of bewijs voor een beheereffect. De acht eenmalige locaties leveren momentopnamen, geen eigen trend. Het mossendeel blijft bruikbaar als zeven kilometerhokinventarisaties, niet als zelfstandige lokale tijdreeks.</w:t>
-      </w:r>
-    </w:p>
-    <w:p>
-      <w:pPr>
-        <w:pStyle w:val="BodyText"/>
-      </w:pPr>
-      <w:r>
-        <w:rPr>
-          <w:b/>
-          <w:bCs/>
-        </w:rPr>
-        <w:t>Wat ontbreekt nog?</w:t>
-      </w:r>
-      <w:r/>
-      <w:r/>
-      <w:r>
-        <w:t xml:space="preserve"> De Excel-levering bevat geen expliciete volledigheidsstatus, nulsoortregels, methodewijzigingshistorie of vertaaltabel naar NDFF-identiteiten. De acht eenmalige locaties hebben geen volledige WKT-begrenzing; hun RD-punten mogen niet zonder meer als exact onderzocht vlak worden gebruikt. Voor de vier vaste plots moet bij de integratie worden gecontroleerd welke ontbrekende soorten binnen een volledig ingevuld telformulier als nul mogen gelden. Voor protocol 02.204 meldde BLWG dat het om kilometerhokinventarisaties gaat en dat, voor zover bekend, geen afzonderlijke kopgegevens worden bijgehouden. Er is daarvoor nu geen aanvullende levering te verwachten.</w:t>
+        <w:t xml:space="preserve">Usnea articulata</w:t>
+      </w:r>
+      <w:r>
+        <w:t xml:space="preserve">-regels komen per plotjaar in aantal overeen met de beveiligde levering. De zes nageleverde locaties verklaren de eerdere kloof van 92 regels.</w:t>
+      </w:r>
+      <w:r>
+        <w:t xml:space="preserve"> </w:t>
+      </w:r>
+      <w:r>
+        <w:rPr>
+          <w:rStyle w:val="VerbatimChar"/>
+        </w:rPr>
+        <w:t xml:space="preserve">kopid</w:t>
+      </w:r>
+      <w:r>
+        <w:t xml:space="preserve"> </w:t>
+      </w:r>
+      <w:r>
+        <w:t xml:space="preserve">onderscheidt de originele waarnemersformulieren, maar voor 154 openbare regels is plot-datum-soort niet uniek; hun individuele NDFF-identiteit kan daarom niet willekeurig aan één formulier worden verbonden. De bron is nog niet als aparte primaire laag geïmporteerd en de bestaande NDFF-bronregels blijven behouden.</w:t>
+      </w:r>
+    </w:p>
+    <w:p>
+      <w:pPr>
+        <w:pStyle w:val="BodyText"/>
+      </w:pPr>
+      <w:r>
+        <w:rPr>
+          <w:b/>
+          <w:bCs/>
+        </w:rPr>
+        <w:t xml:space="preserve">Wat kan nu?</w:t>
+      </w:r>
+      <w:r>
+        <w:t xml:space="preserve"> </w:t>
+      </w:r>
+      <w:r>
+        <w:t xml:space="preserve">De vier vaste korstmossenplots uit 2000–2025 geven zes meetronden en 25 in die reeks aangetroffen taxa. Voor de 24 niet-gevoelige taxa zijn in de openbare afgeleide matrix 356 afgeleide nullen op vaste plotbezoeken verdedigbaar;</w:t>
+      </w:r>
+      <w:r>
+        <w:t xml:space="preserve"> </w:t>
+      </w:r>
+      <w:r>
+        <w:rPr>
+          <w:i/>
+          <w:iCs/>
+        </w:rPr>
+        <w:t xml:space="preserve">Usnea articulata</w:t>
+      </w:r>
+      <w:r>
+        <w:t xml:space="preserve"> </w:t>
+      </w:r>
+      <w:r>
+        <w:t xml:space="preserve">en exacte locaties blijven afgeschermd. De acht eenmalige locaties blijven uitsluitend aanwezigheid en hebben geen nullen. De lokale reeks ondersteunt vergelijking van aanwezigheid en ordinale bedekking op de vier plots, niet automatisch een gebiedsbrede populatietrend of causaal beheereffect. De mossenlaag bevat 354 positieve combinaties uit 2000–2011 en geen nullen; zonder oorspronkelijke kopgegevens is zij verspreidingscontext, geen zelfstandige lokale tijdreeks.</w:t>
+      </w:r>
+    </w:p>
+    <w:p>
+      <w:pPr>
+        <w:pStyle w:val="BodyText"/>
+      </w:pPr>
+      <w:r>
+        <w:rPr>
+          <w:b/>
+          <w:bCs/>
+        </w:rPr>
+        <w:t xml:space="preserve">Opslag en vervolg.</w:t>
+      </w:r>
+      <w:r>
+        <w:t xml:space="preserve"> </w:t>
+      </w:r>
+      <w:r>
+        <w:t xml:space="preserve">De tien BLWG-afgeleide tabellen in de levende lokale</w:t>
+      </w:r>
+      <w:r>
+        <w:t xml:space="preserve"> </w:t>
+      </w:r>
+      <w:r>
+        <w:rPr>
+          <w:rStyle w:val="VerbatimChar"/>
+        </w:rPr>
+        <w:t xml:space="preserve">Meijendel</w:t>
+      </w:r>
+      <w:r>
+        <w:t xml:space="preserve">-database heten sinds 23 oktober 2026</w:t>
+      </w:r>
+      <w:r>
+        <w:t xml:space="preserve"> </w:t>
+      </w:r>
+      <w:r>
+        <w:rPr>
+          <w:rStyle w:val="VerbatimChar"/>
+        </w:rPr>
+        <w:t xml:space="preserve">korstmossen_*</w:t>
+      </w:r>
+      <w:r>
+        <w:t xml:space="preserve"> </w:t>
+      </w:r>
+      <w:r>
+        <w:t xml:space="preserve">en</w:t>
+      </w:r>
+      <w:r>
+        <w:t xml:space="preserve"> </w:t>
+      </w:r>
+      <w:r>
+        <w:rPr>
+          <w:rStyle w:val="VerbatimChar"/>
+        </w:rPr>
+        <w:t xml:space="preserve">mossen_*</w:t>
+      </w:r>
+      <w:r>
+        <w:t xml:space="preserve">, zonder</w:t>
+      </w:r>
+      <w:r>
+        <w:t xml:space="preserve"> </w:t>
+      </w:r>
+      <w:r>
+        <w:rPr>
+          <w:rStyle w:val="VerbatimChar"/>
+        </w:rPr>
+        <w:t xml:space="preserve">ndff_</w:t>
+      </w:r>
+      <w:r>
+        <w:t xml:space="preserve">-voorvoegsel.</w:t>
+      </w:r>
+      <w:r>
+        <w:t xml:space="preserve"> </w:t>
+      </w:r>
+      <w:r>
+        <w:rPr>
+          <w:rStyle w:val="VerbatimChar"/>
+        </w:rPr>
+        <w:t xml:space="preserve">ndff_korstmossen</w:t>
+      </w:r>
+      <w:r>
+        <w:t xml:space="preserve"> </w:t>
+      </w:r>
+      <w:r>
+        <w:t xml:space="preserve">(28.643 regels) en</w:t>
+      </w:r>
+      <w:r>
+        <w:t xml:space="preserve"> </w:t>
+      </w:r>
+      <w:r>
+        <w:rPr>
+          <w:rStyle w:val="VerbatimChar"/>
+        </w:rPr>
+        <w:t xml:space="preserve">ndff_mossen</w:t>
+      </w:r>
+      <w:r>
+        <w:t xml:space="preserve"> </w:t>
+      </w:r>
+      <w:r>
+        <w:t xml:space="preserve">(32.353 regels) blijven daarnaast bestaan als NDFF-groepsindexen: zij bevatten uitsluitend een</w:t>
+      </w:r>
+      <w:r>
+        <w:t xml:space="preserve"> </w:t>
+      </w:r>
+      <w:r>
+        <w:rPr>
+          <w:rStyle w:val="VerbatimChar"/>
+        </w:rPr>
+        <w:t xml:space="preserve">waarneming_id</w:t>
+      </w:r>
+      <w:r>
+        <w:t xml:space="preserve">, geen tweede exemplaar van de waarnemingsgegevens. Alle index-ID's verwijzen naar</w:t>
+      </w:r>
+      <w:r>
+        <w:t xml:space="preserve"> </w:t>
+      </w:r>
+      <w:r>
+        <w:rPr>
+          <w:rStyle w:val="VerbatimChar"/>
+        </w:rPr>
+        <w:t xml:space="preserve">ndff_open_waarneming</w:t>
+      </w:r>
+      <w:r>
+        <w:t xml:space="preserve">. Het voorvoegsel duidt hier dus herkomst aan, niet een afgeleide BLWG-meetreeks. De korstmossenmatrix telt 643 regels (287 positief, 356 afgeleide nullen); de mossenmatrix 354 regels (alle positief). Alle 30 respectievelijk 111 taxonverwijzingen zijn via de centrale taxonstructuur bereikbaar, zonder verweesde referenties. De BLWG-Excel moet nog als afzonderlijke primaire plot-, formulier- en resultaatlaag worden opgenomen, met een herleidbare relatie naar NDFF en zonder dubbeltelling. Bij 154 ambigue openbare regels is die relatie voorlopig alleen op plot-datum-soortniveau mogelijk. De acht eenmalige locaties hebben geen volledige WKT-begrenzing; hun RD-punten zijn niet vanzelf een exact onderzocht vlak. Voor protocol 02.204 meldde BLWG dat, voor zover bekend, geen oorspronkelijke kopgegevens worden bijgehouden. Vraag daarvoor nu niet opnieuw gegevens op.</w:t>
       </w:r>
     </w:p>
     <w:p>
       <w:pPr>
         <w:pStyle w:val="Heading4"/>
       </w:pPr>
-      <w:bookmarkStart w:id="34" w:name="_1bea655362975aef3d944c226fffca3cc18312c"/>
+      <w:bookmarkStart w:id="35" w:name="_339fafe251367982d6218746f16721a93fa7f70"/>
       <w:r>
         <w:t xml:space="preserve">1.5.15. Bos- en zeereeppaddenstoelen</w:t>
       </w:r>
-      <w:bookmarkEnd w:id="34"/>
+      <w:bookmarkEnd w:id="35"/>
     </w:p>
     <w:p>
       <w:pPr>
@@ -4931,11 +5281,11 @@
       <w:pPr>
         <w:pStyle w:val="Heading4"/>
       </w:pPr>
-      <w:bookmarkStart w:id="35" w:name="_weekdieren"/>
+      <w:bookmarkStart w:id="36" w:name="_342bae7ae5afae546f17223888206446d449411"/>
       <w:r>
         <w:t xml:space="preserve">1.5.16. Weekdieren</w:t>
       </w:r>
-      <w:bookmarkEnd w:id="35"/>
+      <w:bookmarkEnd w:id="36"/>
     </w:p>
     <w:p>
       <w:pPr>
@@ -4995,11 +5345,11 @@
       <w:pPr>
         <w:pStyle w:val="Heading4"/>
       </w:pPr>
-      <w:bookmarkStart w:id="36" w:name="_1879253ee2dfd52031c9d63749e2737783da88e"/>
+      <w:bookmarkStart w:id="37" w:name="_cc11e4dda0fa9b87cf2613be17ff277804bdc91"/>
       <w:r>
         <w:t xml:space="preserve">1.5.17. SNL-gebiedsmonitoring</w:t>
       </w:r>
-      <w:bookmarkEnd w:id="36"/>
+      <w:bookmarkEnd w:id="37"/>
     </w:p>
     <w:p>
       <w:pPr>
@@ -5067,11 +5417,11 @@
       <w:pPr>
         <w:pStyle w:val="Heading3"/>
       </w:pPr>
-      <w:bookmarkStart w:id="37" w:name="_3dde7cd9c0fbcfd44f499ab6a6ef5cfd62b0862"/>
+      <w:bookmarkStart w:id="38" w:name="_77733873953f7250a44afc39ac6f33e9c0fface"/>
       <w:r>
         <w:t xml:space="preserve">1.6. Openbare externe ecologiebronnen</w:t>
       </w:r>
-      <w:bookmarkEnd w:id="37"/>
+      <w:bookmarkEnd w:id="38"/>
     </w:p>
     <w:p>
       <w:pPr>
@@ -5091,7 +5441,7 @@
       <w:r>
         <w:t xml:space="preserve"> </w:t>
       </w:r>
-      <w:hyperlink r:id="rId38">
+      <w:hyperlink r:id="rId39">
         <w:r>
           <w:rPr>
             <w:rStyle w:val="Hyperlink"/>
@@ -5285,7 +5635,7 @@
       <w:r>
         <w:t xml:space="preserve"> </w:t>
       </w:r>
-      <w:hyperlink r:id="rId39">
+      <w:hyperlink r:id="rId40">
         <w:r>
           <w:rPr>
             <w:rStyle w:val="Hyperlink"/>
@@ -5301,11 +5651,11 @@
       <w:pPr>
         <w:pStyle w:val="Heading4"/>
       </w:pPr>
-      <w:bookmarkStart w:id="40" w:name="_9c98e6e0799dea8eed6786abf4e9090b0506343"/>
+      <w:bookmarkStart w:id="41" w:name="_aa03dabe850e534118471d9a4587f103d7cc6d0"/>
       <w:r>
         <w:t xml:space="preserve">1.6.1. STOWA Limnodata</w:t>
       </w:r>
-      <w:bookmarkEnd w:id="40"/>
+      <w:bookmarkEnd w:id="41"/>
     </w:p>
     <w:p>
       <w:pPr>
@@ -5389,11 +5739,11 @@
       <w:pPr>
         <w:pStyle w:val="Heading4"/>
       </w:pPr>
-      <w:bookmarkStart w:id="41" w:name="_7810a275271da51e128daf1eadaca77f875310a"/>
+      <w:bookmarkStart w:id="42" w:name="_e9b446960bca12075cdde30af1cbaf73f645a87"/>
       <w:r>
         <w:t xml:space="preserve">1.6.2. ENDURE helmduinfauna</w:t>
       </w:r>
-      <w:bookmarkEnd w:id="41"/>
+      <w:bookmarkEnd w:id="42"/>
     </w:p>
     <w:p>
       <w:pPr>
@@ -5453,11 +5803,11 @@
       <w:pPr>
         <w:pStyle w:val="Heading4"/>
       </w:pPr>
-      <w:bookmarkStart w:id="42" w:name="_5a504ff8abd850ffc7704ce23c8f7bb19f98000"/>
+      <w:bookmarkStart w:id="43" w:name="_0079604d46da30ac9b5828c2b6c106eff7cd8f8"/>
       <w:r>
         <w:t xml:space="preserve">1.6.3. Landelijke Vegetatie Databank</w:t>
       </w:r>
-      <w:bookmarkEnd w:id="42"/>
+      <w:bookmarkEnd w:id="43"/>
     </w:p>
     <w:p>
       <w:pPr>
@@ -5556,9 +5906,11 @@
       </w:r>
     </w:p>
     <w:p>
-      <w:pPr/>
-      <w:r>
-        <w:t>Hercontrole op 17 oktober 2026 bevestigt voor de LVD-levering uit 1959–2015 dezelfde 3.437 toegelaten opnamen met 81.310 resultaten en dezelfde 654 mogelijke provinciale opnameparen. De resterende LVD-laag bevat 2.793 opnamen met 64.683 resultaten; ook de geneste opnamekenmerken bevatten geen vaste PQ- of bovenliggende locatie-identificatie. De twee niet-verplaatste nabijheidskandidaten blijven zonder bewijs van gedeelde PQ-identiteit: LVD-event 40650 uit 2011 heeft één resultaat tegenover 26 in provinciale opname 1915; LVD-event 43406 uit 2013 en provinciale opname 1026 hebben elk één resultaat, maar verschillende taxonnamen of bedekkingscodes. Geen van beide paren heeft een gelijke volledige lijst. De 644 eerder verplaatste LVD-opnamen uit 1981–2015 behouden hun 652 vermoedelijke koppelingen en tellen niet zelfstandig mee. Deze hercontrole onderbouwt geen aanvullende PQ-verplaatsing; er zijn geen bronregels of koppelstatussen gewijzigd.</w:t>
+      <w:pPr>
+        <w:pStyle w:val="BodyText"/>
+      </w:pPr>
+      <w:r>
+        <w:t xml:space="preserve">Hercontrole op 17 oktober 2026 bevestigt voor de LVD-levering uit 1959–2015 dezelfde 3.437 toegelaten opnamen met 81.310 resultaten en dezelfde 654 mogelijke provinciale opnameparen. De resterende LVD-laag bevat 2.793 opnamen met 64.683 resultaten; ook de geneste opnamekenmerken bevatten geen vaste PQ- of bovenliggende locatie-identificatie. De twee niet-verplaatste nabijheidskandidaten blijven zonder bewijs van gedeelde PQ-identiteit: LVD-event 40650 uit 2011 heeft één resultaat tegenover 26 in provinciale opname 1915; LVD-event 43406 uit 2013 en provinciale opname 1026 hebben elk één resultaat, maar verschillende taxonnamen of bedekkingscodes. Geen van beide paren heeft een gelijke volledige lijst. De 644 eerder verplaatste LVD-opnamen uit 1981–2015 behouden hun 652 vermoedelijke koppelingen en tellen niet zelfstandig mee. Deze hercontrole onderbouwt geen aanvullende PQ-verplaatsing; er zijn geen bronregels of koppelstatussen gewijzigd.</w:t>
       </w:r>
     </w:p>
     <w:p>
@@ -5712,11 +6064,11 @@
       <w:pPr>
         <w:pStyle w:val="Heading4"/>
       </w:pPr>
-      <w:bookmarkStart w:id="43" w:name="_a4b8938f650cad67af8384aa358648ef6881db5"/>
+      <w:bookmarkStart w:id="44" w:name="_a66e2be297c2cf82b37e3e4b59e101c55a2b789"/>
       <w:r>
         <w:t xml:space="preserve">1.6.4. Historische vlinder- en motcollectie</w:t>
       </w:r>
-      <w:bookmarkEnd w:id="43"/>
+      <w:bookmarkEnd w:id="44"/>
     </w:p>
     <w:p>
       <w:pPr>
@@ -5776,11 +6128,11 @@
       <w:pPr>
         <w:pStyle w:val="Heading4"/>
       </w:pPr>
-      <w:bookmarkStart w:id="44" w:name="_b06cb21dbe9ca56883ae8ed5d3f986798494e94"/>
+      <w:bookmarkStart w:id="45" w:name="_0623f0a4d9ecb153e84d6aa679ad58f6c310383"/>
       <w:r>
         <w:t xml:space="preserve">1.6.5. Naturalis Botany</w:t>
       </w:r>
-      <w:bookmarkEnd w:id="44"/>
+      <w:bookmarkEnd w:id="45"/>
     </w:p>
     <w:p>
       <w:pPr>
@@ -5840,11 +6192,11 @@
       <w:pPr>
         <w:pStyle w:val="Heading4"/>
       </w:pPr>
-      <w:bookmarkStart w:id="45" w:name="_335dc587b878851a017369d1c1c7e74fa2018ad"/>
+      <w:bookmarkStart w:id="46" w:name="_dd278617f9613de433492781e9679e24605d2f3"/>
       <w:r>
         <w:t xml:space="preserve">1.6.6. Naturalis Coleoptera</w:t>
       </w:r>
-      <w:bookmarkEnd w:id="45"/>
+      <w:bookmarkEnd w:id="46"/>
     </w:p>
     <w:p>
       <w:pPr>
@@ -5904,11 +6256,11 @@
       <w:pPr>
         <w:pStyle w:val="Heading3"/>
       </w:pPr>
-      <w:bookmarkStart w:id="46" w:name="_5d611a31ac68a696fd179c2c85c282500afefc7"/>
+      <w:bookmarkStart w:id="47" w:name="_4dcded00268e6461b0ddc34253d4faf52bf1dd1"/>
       <w:r>
         <w:t xml:space="preserve">1.7. Openstaande ruimtelijke toelatingscontrole</w:t>
       </w:r>
-      <w:bookmarkEnd w:id="46"/>
+      <w:bookmarkEnd w:id="47"/>
     </w:p>
     <w:p>
       <w:pPr>
@@ -5942,11 +6294,11 @@
       <w:pPr>
         <w:pStyle w:val="Heading3"/>
       </w:pPr>
-      <w:bookmarkStart w:id="47" w:name="_6e396c95ed446dc595f32661c45d91742a47fe5"/>
+      <w:bookmarkStart w:id="48" w:name="_14c58f11b78e283997281ebde92c6b31ebc0c80"/>
       <w:r>
         <w:t xml:space="preserve">1.8. Verklarende omgevingslagen</w:t>
       </w:r>
-      <w:bookmarkEnd w:id="47"/>
+      <w:bookmarkEnd w:id="48"/>
     </w:p>
     <w:p>
       <w:pPr>
@@ -5960,11 +6312,11 @@
       <w:pPr>
         <w:pStyle w:val="Heading4"/>
       </w:pPr>
-      <w:bookmarkStart w:id="48" w:name="_bb0c62bd471c774923f07d8b7b6f705ce2e805a"/>
+      <w:bookmarkStart w:id="49" w:name="_97e37a83ef92e6db79e0a815abf4c3d8d6d1754"/>
       <w:r>
         <w:t xml:space="preserve">1.8.1. Dagelijks weer</w:t>
       </w:r>
-      <w:bookmarkEnd w:id="48"/>
+      <w:bookmarkEnd w:id="49"/>
     </w:p>
     <w:p>
       <w:pPr>
@@ -6024,11 +6376,11 @@
       <w:pPr>
         <w:pStyle w:val="Heading4"/>
       </w:pPr>
-      <w:bookmarkStart w:id="49" w:name="_hoogte"/>
+      <w:bookmarkStart w:id="50" w:name="_625608f018b59d28869e33232003bd07c2f07d5"/>
       <w:r>
         <w:t xml:space="preserve">1.8.2. Hoogte</w:t>
       </w:r>
-      <w:bookmarkEnd w:id="49"/>
+      <w:bookmarkEnd w:id="50"/>
     </w:p>
     <w:p>
       <w:pPr>
@@ -6088,11 +6440,11 @@
       <w:pPr>
         <w:pStyle w:val="Heading4"/>
       </w:pPr>
-      <w:bookmarkStart w:id="50" w:name="_stikstofdepositie"/>
+      <w:bookmarkStart w:id="51" w:name="_8ebc62c1d17a2d7a08504bddffeeb5916a0bcb3"/>
       <w:r>
         <w:t xml:space="preserve">1.8.3. Stikstofdepositie</w:t>
       </w:r>
-      <w:bookmarkEnd w:id="50"/>
+      <w:bookmarkEnd w:id="51"/>
     </w:p>
     <w:p>
       <w:pPr>
@@ -6152,11 +6504,11 @@
       <w:pPr>
         <w:pStyle w:val="Heading4"/>
       </w:pPr>
-      <w:bookmarkStart w:id="51" w:name="_bodemgebruik"/>
+      <w:bookmarkStart w:id="52" w:name="_972156668716d33d6f7bf93cdaf573c7928edca"/>
       <w:r>
         <w:t xml:space="preserve">1.8.4. Bodemgebruik</w:t>
       </w:r>
-      <w:bookmarkEnd w:id="51"/>
+      <w:bookmarkEnd w:id="52"/>
     </w:p>
     <w:p>
       <w:pPr>
@@ -6216,11 +6568,11 @@
       <w:pPr>
         <w:pStyle w:val="Heading4"/>
       </w:pPr>
-      <w:bookmarkStart w:id="52" w:name="_6205564c333359604d547302ef9994dbae8e150"/>
+      <w:bookmarkStart w:id="53" w:name="_92770fc640c1bb2fd0ffeda71d68ce2650b46be"/>
       <w:r>
         <w:t xml:space="preserve">1.8.5. Natura 2000-habitat</w:t>
       </w:r>
-      <w:bookmarkEnd w:id="52"/>
+      <w:bookmarkEnd w:id="53"/>
     </w:p>
     <w:p>
       <w:pPr>
@@ -6281,26 +6633,26 @@
         <w:pStyle w:val="BodyText"/>
       </w:pPr>
       <w:r>
-        <w:t>Aanvullende broncontrole habitatpolygonen, 17 oktober 2026. Op de T7 is de bestaande shapefile Natura_2000_Habitattypen_Den_Haag aangetroffen onder /Volumes/T7 Data/Home_Ton/Meijendel data/Habitat/Natura_2000_Habitattypen_Den_Haag-shp/. De levering telt 12.072 bronfeatures in RD New. De gemeentelijke datasetpublicatie Natura 2000 Den Haag noemt Provincie Zuid-Holland als bron en CC0 als licentie; de geselecteerde lokale records noemen Van der Goes en Groot, Alterra &amp; Prov. Z-Holland. De gemeentelijke metadata zijn bijgewerkt op 26 maart 2026. Dat is geen bewezen terrein- of karteringsdatum en bewijst geen byte-identiteit tussen de lokale levering en de huidige webdienst. De inhoudsrelatie met de 384 plot-habitatregels met jaarlabel 2014 is niet versiegebonden vastgesteld.</w:t>
-      </w:r>
-    </w:p>
-    <w:p>
-      <w:pPr>
-        <w:pStyle w:val="BodyText"/>
-      </w:pPr>
-      <w:r>
-        <w:t>Voor het getekende natuurherstelvlak binnen het noordelijke deel van Helmduinen zijn 85 kaartvlakken doorsneden; alle geselecteerde DATUM-velden zijn leeg en alle sommen van de habitatdeelpercentages zijn 100%. Mengpercentages gewogen over de geknipte oppervlakten leveren indicatief 7,460 hectare H2160, 3,729 hectare H2130A, 0,679 hectare H0000, 0,244 hectare H2190B en 0,062 hectare H2120. Het samengevoegde kaartoppervlak is 121.740,713 m² tegenover 121.740,722 m² voor de benaderde plancontour. Dit is bruikbare habitatkaartcontext voor de afweging van struweelverwijdering; geen aangetoonde habitattoestand in oktober 2026 of te realiseren projectoppervlakte. De polygonen zijn niet aan de levende database toegevoegd. De lokale bronhash, 85 geknipte records en controleberekening staan in de afzonderlijke bewijsbundel bij het herziene werkbezoekdossier.</w:t>
+        <w:t xml:space="preserve">Aanvullende broncontrole habitatpolygonen, 17 oktober 2026. Op de T7 is de bestaande shapefile Natura_2000_Habitattypen_Den_Haag aangetroffen onder /Volumes/T7 Data/Home_Ton/Meijendel data/Habitat/Natura_2000_Habitattypen_Den_Haag-shp/. De levering telt 12.072 bronfeatures in RD New. De gemeentelijke datasetpublicatie Natura 2000 Den Haag noemt Provincie Zuid-Holland als bron en CC0 als licentie; de geselecteerde lokale records noemen Van der Goes en Groot, Alterra &amp; Prov. Z-Holland. De gemeentelijke metadata zijn bijgewerkt op 26 maart 2026. Dat is geen bewezen terrein- of karteringsdatum en bewijst geen byte-identiteit tussen de lokale levering en de huidige webdienst. De inhoudsrelatie met de 384 plot-habitatregels met jaarlabel 2014 is niet versiegebonden vastgesteld.</w:t>
+      </w:r>
+    </w:p>
+    <w:p>
+      <w:pPr>
+        <w:pStyle w:val="BodyText"/>
+      </w:pPr>
+      <w:r>
+        <w:t xml:space="preserve">Voor het getekende natuurherstelvlak binnen het noordelijke deel van Helmduinen zijn 85 kaartvlakken doorsneden; alle geselecteerde DATUM-velden zijn leeg en alle sommen van de habitatdeelpercentages zijn 100%. Mengpercentages gewogen over de geknipte oppervlakten leveren indicatief 7,460 hectare H2160, 3,729 hectare H2130A, 0,679 hectare H0000, 0,244 hectare H2190B en 0,062 hectare H2120. Het samengevoegde kaartoppervlak is 121.740,713 m² tegenover 121.740,722 m² voor de benaderde plancontour. Dit is bruikbare habitatkaartcontext voor de afweging van struweelverwijdering; geen aangetoonde habitattoestand in oktober 2026 of te realiseren projectoppervlakte. De polygonen zijn niet aan de levende database toegevoegd. De lokale bronhash, 85 geknipte records en controleberekening staan in de afzonderlijke bewijsbundel bij het herziene werkbezoekdossier.</w:t>
       </w:r>
     </w:p>
     <w:p>
       <w:pPr>
         <w:pStyle w:val="Heading3"/>
       </w:pPr>
-      <w:bookmarkStart w:id="53" w:name="_55651eaef6a7220015a2870e55a9e8e9e62256a"/>
+      <w:bookmarkStart w:id="54" w:name="_f1f9cc3f4e7e57e7e99ffc1d85334cce67c3650"/>
       <w:r>
         <w:t xml:space="preserve">1.9. Werkzaamheden en beheermaatregelen</w:t>
       </w:r>
-      <w:bookmarkEnd w:id="53"/>
+      <w:bookmarkEnd w:id="54"/>
     </w:p>
     <w:p>
       <w:pPr>
@@ -6349,15 +6701,15 @@
         <w:t xml:space="preserve">.xls</w:t>
       </w:r>
       <w:r>
-        <w:t xml:space="preserve">-protocollen voor vleermuisonderzoek uit 2009–2013 en vier als PDF geregistreerde bestanden die feitelijk HTML-landingspagina’s waren. De vijf protocollen beschrijven onderzoeksformulieren, geen uitgevoerde terreinmaatregelen. De vier landingspagina’s zijn niet als inhoudelijk geraadpleegd document behandeld.</w:t>
-      </w:r>
-    </w:p>
-    <w:p>
-      <w:pPr>
-        <w:pStyle w:val="BodyText"/>
-      </w:pPr>
-      <w:r>
-        <w:t xml:space="preserve">De brede tekstselectie bevatte 351 bijlagen. De strengere selectie op formuleringen die feitelijke uitvoering aanduiden bevatte 206 bijlagen bij 190 bibliografische bronnen. Na beoordeling op uitvoering, locatie, jaar, dubbeling en brontype zijn achttien aanvullende Zotero-bronnen ingevoerd. Nieuw is Van der Hagen et al. (2020), waarvan figuur 1 Prinsenduin, Lange Strooken en Helmduinen als afzonderlijke onderzoeksgebieden toont. Op 15 oktober 2026 is daarnaast KIWA Mededeling 114 uit december 1990 ingevoerd, met de officiële KWR-PDF als gekoppeld T7-bestand. Figuur 1 op PDF-pagina 73 lokaliseert de infiltratieplassen 27.2, 27.2.1 en 27.3. Op 16 oktober 2026 zijn ook het definitieve beheerplan 2016–2022 en</w:t>
+        <w:t xml:space="preserve">-protocollen voor vleermuisonderzoek uit 2009–2013 en vier als PDF geregistreerde bestanden die feitelijk HTML-landingspagina's waren. De vijf protocollen beschrijven onderzoeksformulieren, geen uitgevoerde terreinmaatregelen. De vier landingspagina's zijn niet als inhoudelijk geraadpleegd document behandeld.</w:t>
+      </w:r>
+    </w:p>
+    <w:p>
+      <w:pPr>
+        <w:pStyle w:val="BodyText"/>
+      </w:pPr>
+      <w:r>
+        <w:t xml:space="preserve">De brede tekstselectie bevatte 351 bijlagen. De strengere selectie op formuleringen die feitelijke uitvoering aanduiden bevatte 206 bijlagen bij 190 bibliografische bronnen. Na beoordeling op uitvoering, locatie, jaar, dubbeling en brontype zijn achttien aanvullende Zotero-bronnen ingevoerd. Nieuw is Van der Hagen et al. (2020), waarvan figuur 1 Prinsenduin, Lange Strooken en Helmduinen als afzonderlijke onderzoeksgebieden toont. Op 15 oktober 2026 is daarnaast KIWA Mededeling 114 uit december 1990 ingevoerd, met de officiële KWR-PDF als gekoppeld T7-bestand. Figuur 1 op PDF-pagina 73 lokaliseert de infiltratieplassen 27.2, 27.2.1 en 27.3. Op 16 oktober 2026 zijn ook het definitieve beheerplan 2016–2022 en</w:t>
       </w:r>
       <w:r>
         <w:t xml:space="preserve"> </w:t>
@@ -6367,13 +6719,13 @@
           <w:i/>
           <w:iCs/>
         </w:rPr>
-        <w:t xml:space="preserve">Holland’s Duinen</w:t>
-      </w:r>
-      <w:r>
-        <w:t xml:space="preserve"> </w:t>
-      </w:r>
-      <w:r>
-        <w:t xml:space="preserve">63 en 64 als ruimtelijke bevestiging geregistreerd. Het beheerplan koppelt PIM-oeveraanpassingen aan Tafelberg en ’t Scheepje. De twee tijdschriftnummers beschrijven en tonen het natuurherstel in Elleboogsprang, Helmduinen, Vinkenhoek en Meeuwenduin.</w:t>
+        <w:t xml:space="preserve">Holland's Duinen</w:t>
+      </w:r>
+      <w:r>
+        <w:t xml:space="preserve"> </w:t>
+      </w:r>
+      <w:r>
+        <w:t xml:space="preserve">63 en 64 als ruimtelijke bevestiging geregistreerd. Het beheerplan koppelt PIM-oeveraanpassingen aan Tafelberg en 't Scheepje. De twee tijdschriftnummers beschrijven en tonen het natuurherstel in Elleboogsprang, Helmduinen, Vinkenhoek en Meeuwenduin.</w:t>
       </w:r>
       <w:r>
         <w:t xml:space="preserve"> </w:t>
@@ -6396,7 +6748,7 @@
         <w:pStyle w:val="BodyText"/>
       </w:pPr>
       <w:r>
-        <w:t xml:space="preserve">Daarbij zijn vijftien officiële of institutionele internetbronnen geraadpleegd: vijf Dunea-pagina’s over optimalisatie van de waterwinning, beheer in Meeuwenduin en Prinsenduin, vervanging van slagbomen, actuele werkzaamheden en duindynamiek; het Dunea-jaarverslag 2024; het Zuid-Hollandse subsidie-openstellingsbesluit voor Bendel; de Staatsbosbeheer-pagina over de herinrichting van Bendel; de ODH-beschikking van 28 augustus 2023 voor de konijnenbijplaatsingsproef; de ODH-beschikking van 5 november 2025 voor de renovatie van de Paardenstal; de via DANS gepubliceerde Haagse Archeologische Rapportages 1204 en 1306; de officiële externe bijlage uit 2013 over de PIM-werkzaamheden in Noord-Meijendel; de gemeentelijke inventaris van cultuurhistorische objecten in Wassenaar; en de actuele PDOK-Kadastrale Kaart. Rapport 1204 bevat op PDF-pagina 4 de deelgebiedscontouren van Elleboogsprang, Meeuwenduin en Vinkenhoek. De bronnen staan afzonderlijk in</w:t>
+        <w:t xml:space="preserve">Daarbij zijn vijftien officiële of institutionele internetbronnen geraadpleegd: vijf Dunea-pagina's over optimalisatie van de waterwinning, beheer in Meeuwenduin en Prinsenduin, vervanging van slagbomen, actuele werkzaamheden en duindynamiek; het Dunea-jaarverslag 2024; het Zuid-Hollandse subsidie-openstellingsbesluit voor Bendel; de Staatsbosbeheer-pagina over de herinrichting van Bendel; de ODH-beschikking van 28 augustus 2023 voor de konijnenbijplaatsingsproef; de ODH-beschikking van 5 november 2025 voor de renovatie van de Paardenstal; de via DANS gepubliceerde Haagse Archeologische Rapportages 1204 en 1306; de officiële externe bijlage uit 2013 over de PIM-werkzaamheden in Noord-Meijendel; de gemeentelijke inventaris van cultuurhistorische objecten in Wassenaar; en de actuele PDOK-Kadastrale Kaart. Rapport 1204 bevat op PDF-pagina 4 de deelgebiedscontouren van Elleboogsprang, Meeuwenduin en Vinkenhoek. De bronnen staan afzonderlijk in</w:t>
       </w:r>
       <w:r>
         <w:t xml:space="preserve"> </w:t>
@@ -6488,7 +6840,7 @@
       <w:r>
         <w:t xml:space="preserve"> </w:t>
       </w:r>
-      <w:hyperlink r:id="rId54">
+      <w:hyperlink r:id="rId55">
         <w:r>
           <w:rPr>
             <w:rStyle w:val="Hyperlink"/>
@@ -6689,7 +7041,7 @@
           <w:i/>
           <w:iCs/>
         </w:rPr>
-        <w:t xml:space="preserve">Holland’s Duinen</w:t>
+        <w:t xml:space="preserve">Holland's Duinen</w:t>
       </w:r>
       <w:r>
         <w:t xml:space="preserve"> </w:t>
@@ -6728,7 +7080,7 @@
           <w:i/>
           <w:iCs/>
         </w:rPr>
-        <w:t xml:space="preserve">Holland’s Duinen</w:t>
+        <w:t xml:space="preserve">Holland's Duinen</w:t>
       </w:r>
       <w:r>
         <w:t xml:space="preserve"> </w:t>
@@ -6782,7 +7134,7 @@
           <w:i/>
           <w:iCs/>
         </w:rPr>
-        <w:t xml:space="preserve">Holland’s Duinen</w:t>
+        <w:t xml:space="preserve">Holland's Duinen</w:t>
       </w:r>
       <w:r>
         <w:t xml:space="preserve"> </w:t>
@@ -6821,7 +7173,7 @@
           <w:i/>
           <w:iCs/>
         </w:rPr>
-        <w:t xml:space="preserve">Holland’s Duinen</w:t>
+        <w:t xml:space="preserve">Holland's Duinen</w:t>
       </w:r>
       <w:r>
         <w:t xml:space="preserve"> </w:t>
@@ -6888,7 +7240,7 @@
           <w:i/>
           <w:iCs/>
         </w:rPr>
-        <w:t xml:space="preserve">Holland’s Duinen</w:t>
+        <w:t xml:space="preserve">Holland's Duinen</w:t>
       </w:r>
       <w:r>
         <w:t xml:space="preserve"> </w:t>
@@ -6955,7 +7307,7 @@
           <w:i/>
           <w:iCs/>
         </w:rPr>
-        <w:t xml:space="preserve">Holland’s Duinen</w:t>
+        <w:t xml:space="preserve">Holland's Duinen</w:t>
       </w:r>
       <w:r>
         <w:t xml:space="preserve"> </w:t>
@@ -6995,7 +7347,7 @@
           <w:i/>
           <w:iCs/>
         </w:rPr>
-        <w:t xml:space="preserve">Holland’s Duinen</w:t>
+        <w:t xml:space="preserve">Holland's Duinen</w:t>
       </w:r>
       <w:r>
         <w:t xml:space="preserve"> </w:t>
@@ -7019,7 +7371,7 @@
           <w:i/>
           <w:iCs/>
         </w:rPr>
-        <w:t xml:space="preserve">Holland’s Duinen</w:t>
+        <w:t xml:space="preserve">Holland's Duinen</w:t>
       </w:r>
       <w:r>
         <w:t xml:space="preserve"> </w:t>
@@ -7113,7 +7465,7 @@
           <w:i/>
           <w:iCs/>
         </w:rPr>
-        <w:t xml:space="preserve">Holland’s Duinen</w:t>
+        <w:t xml:space="preserve">Holland's Duinen</w:t>
       </w:r>
       <w:r>
         <w:t xml:space="preserve"> </w:t>
@@ -7165,7 +7517,7 @@
         <w:pStyle w:val="BodyText"/>
       </w:pPr>
       <w:r>
-        <w:t xml:space="preserve">Ton heeft op 15 oktober 2026 Meeuwenduin voor deze maatregel gelijkgesteld aan Meeuwenhoek. Prinsenduin en Prinsenberg zijn juist van elkaar gescheiden. De Prinsenberg is het uitzichtpunt op 52.1314451° N, 4.3186070° E in M2; de bredere TOP10NL-geometrie met die naam raakt M2, M3, M35 en M36. Van der Hagen et al. (2020), figuur 1, toont Prinsenduin als afzonderlijk zuidwestelijk onderzoeksgebied; Ton lokaliseerde dit gebied in M17a. Het in november 2023 gestarte werk is daardoor gekoppeld aan M10-12-76, M12a, M73, M74 en M75 voor Meeuwenduin en aan M17a voor Prinsenduin. De in 2024 bevestigde voortzetting is alleen aan M17a gekoppeld. De eerdere Prinsenduin-relaties met M2, M3, M35 en M36 zijn retroactief verwijderd. De exacte werkvoetafdruk binnen de zeven resterende uitvoering-kavelrelaties is onbekend;</w:t>
+        <w:t xml:space="preserve">Ton heeft op 15 oktober 2026 Meeuwenduin voor deze maatregel gelijkgesteld aan Meeuwenhoek. Prinsenduin en Prinsenberg zijn juist van elkaar gescheiden. De Prinsenberg is het uitzichtpunt op 52.1314451° N, 4.3186070° E in M2; de bredere TOP10NL-geometrie met die naam raakt M2, M3, M35 en M36. Van der Hagen et al. (2020), figuur 1, toont Prinsenduin als afzonderlijk zuidwestelijk onderzoeksgebied; Ton lokaliseerde dit gebied in M17a. Het in november 2023 gestarte werk is daardoor gekoppeld aan M10-12-76, M12a, M73, M74 en M75 voor Meeuwenduin en aan M17a voor Prinsenduin. De in 2024 bevestigde voortzetting is alleen aan M17a gekoppeld. De eerdere Prinsenduin-relaties met M2, M3, M35 en M36 zijn retroactief verwijderd. De exacte werkvoetafdruk binnen de zeven resterende uitvoering-kavelrelaties is onbekend;</w:t>
       </w:r>
       <w:r>
         <w:t xml:space="preserve"> </w:t>
@@ -7338,7 +7690,7 @@
           <w:i/>
           <w:iCs/>
         </w:rPr>
-        <w:t xml:space="preserve">Holland’s Duinen</w:t>
+        <w:t xml:space="preserve">Holland's Duinen</w:t>
       </w:r>
       <w:r>
         <w:t xml:space="preserve"> </w:t>
@@ -7425,7 +7777,7 @@
         <w:pStyle w:val="BodyText"/>
       </w:pPr>
       <w:r>
-        <w:t xml:space="preserve">De programmabrede schoning en natuurvriendelijke inrichting van infiltratiepannen in 2010–2018 is voor het bronvast lokaliseerbare deel gekoppeld aan M6, M7, M13 en M77. Het definitieve Natura 2000-beheerplan 2016–2022 koppelt op pagina 131 de PIM-aanpassingen aan de oevers van infiltratieplassen expliciet aan Tafelberg en ’t Scheepje. De actuele nameninventaris koppelt Tafelberg aan M13 en M77 en ’t Scheepje aan M6 en M7; Ton bevestigde de vier relaties op 16 oktober 2026. Dunea meldt voor het volledige programma 370.000 m3 verwijderd materiaal, maar de 782 op 16 oktober opnieuw doorzochte PDF-bestanden in de gekoppelde Zotero-opslag leveren geen volledige uitvoeringslijst per infiltratieplas. Het volume wordt daarom niet over de vier kavels verdeeld en</w:t>
+        <w:t xml:space="preserve">De programmabrede schoning en natuurvriendelijke inrichting van infiltratiepannen in 2010–2018 is voor het bronvast lokaliseerbare deel gekoppeld aan M6, M7, M13 en M77. Het definitieve Natura 2000-beheerplan 2016–2022 koppelt op pagina 131 de PIM-aanpassingen aan de oevers van infiltratieplassen expliciet aan Tafelberg en 't Scheepje. De actuele nameninventaris koppelt Tafelberg aan M13 en M77 en 't Scheepje aan M6 en M7; Ton bevestigde de vier relaties op 16 oktober 2026. Dunea meldt voor het volledige programma 370.000 m3 verwijderd materiaal, maar de 782 op 16 oktober opnieuw doorzochte PDF-bestanden in de gekoppelde Zotero-opslag leveren geen volledige uitvoeringslijst per infiltratieplas. Het volume wordt daarom niet over de vier kavels verdeeld en</w:t>
       </w:r>
       <w:r>
         <w:t xml:space="preserve"> </w:t>
@@ -7458,7 +7810,7 @@
           <w:i/>
           <w:iCs/>
         </w:rPr>
-        <w:t xml:space="preserve">Holland’s Duinen</w:t>
+        <w:t xml:space="preserve">Holland's Duinen</w:t>
       </w:r>
       <w:r>
         <w:t xml:space="preserve"> </w:t>
@@ -7622,86 +7974,136 @@
         <w:pStyle w:val="BodyText"/>
       </w:pPr>
       <w:r>
-        <w:t>Gebruik en grens. De laag is geschikt om vast te leggen wat volgens welke bron is gepland, uitgevoerd, niet uitgevoerd of onbekend. De bronvaste plot-jaarlaag kan nu beschrijvend naast vogelgegevens voor de expliciet benoemde kavels worden gelegd. Een kavelvermelding bewijst niet dat de maatregel ieder deel van de kavel raakte; een samenhang met vogelontwikkeling is geen causaal beheereffect. De 144 oorspronkelijke begrazingsregistraties voor 16 plots uit 1991–1999 zijn geïntegreerd: 139 aanvullende feiten en vijf verwijzingen naar reeds bestaande feiten. De oorspronkelijke 144 regels blijven voor audit reconstrueerbaar; de fysieke tabel en gelijknamige view zijn verwijderd. Zie de migratieverantwoording onderaan dit register.</w:t>
-      </w:r>
-    </w:p>
-    <w:p>
-      <w:pPr>
-        <w:pStyle w:val="BodyText"/>
-      </w:pPr>
-      <w:r>
-        <w:t>Status. Bronvast op project-, uitvoering- en jaarniveau voor 43 inhoudelijke bronnen en 64 uitvoeringen. Daarnaast is één administratieve migratiebron toegevoegd; maatregel_bron bevat 44 regels. De algemene kavel- en gebiedsindeling is geometrisch beschikbaar voor de 55 actuele plots uit 2025; vijf expliciet gekoppelde historische kavels hebben geen afzonderlijke geometrie. De bronvaste plot-jaarlaag bevat 307 regels voor 1967–1969, 1972–1975, 1988–1991, 1993, 1997, 2002, 2005–2006 en 2013–2025. Het onderzochte PAS-maaibeheer 23 levert geen plot-jaarrijen op, omdat de vier jaarregels 2016–2019 niet_uitgevoerd zijn en de view alleen uitgevoerde jaren opneemt. maatregel_plot_koppeling bevat 211 relaties. Helmduinen heeft er twee; Meeuwenduin en Prinsenduin samen zeven; maatregel 22h zes; de begrazing van Vallei Meijendel negen; maatregel 3c dertien; maatregel 3d vijf; de slagboomvervanging twee; het onderzochte PAS-maaibeheer 23 tien; het maaibeheer in Ruygenhoek, Lange Strook en De Loopert vijf; het PIM-leidingwerk zeven; de PIM-winputten 22; het nabeheer van de kerfzone twee; de aanleg van de vijf kerven drie; de programmabrede pannenmaatregel vier; de programmabrede plagwerkzaamheden acht; infiltratieplas 27.2 één. Vier uitvoeringen hebben geen directe plotkoppeling. De twee Bendel-uitvoeringen en de begrazing van landgoed Weiduin vallen aantoonbaar buiten het Meijendel-plotgebied, zodat nog één geheel ongekoppelde uitvoering ruimtelijk moet worden beoordeeld.</w:t>
-      </w:r>
-    </w:p>
-    <w:p>
-      <w:pPr>
-        <w:pStyle w:val="BodyText"/>
-      </w:pPr>
-      <w:r>
-        <w:t>Actualisering 17 oktober 2026 — voorgenomen natuurherstelvlak binnen het noordelijke deel van Helmduinen. Eén aangeleverde uitnodiging van Jasper Wester (Dunea), met één kaartvlak en de nadere plaatsduiding van Ton, is als planbron vastgelegd. De kaart omvat slechts een vlak binnen Helmduinen Noord. Zij begrenst niet het gehele noordelijke deel of heel Helmduinen. De uitnodiging noemt een werkbezoek op 20 oktober 2026; dit is geen uitvoeringsdatum. De verzenddatum van de uitnodiging, de opnamedatum van de kaart en de uitvoeringsperiode zijn niet vastgesteld.</w:t>
-      </w:r>
-    </w:p>
-    <w:p>
-      <w:pPr>
-        <w:pStyle w:val="BodyText"/>
-      </w:pPr>
-      <w:r>
-        <w:t>De drie aangekondigde maatregelen zijn afzonderlijk geregistreerd: ondiep afplaggen voor vochtige duinvalleien; terugdringen van bosopslag en verstruweling voor grijze duinen en vochtige duinvalleien; reactiveren van oude, vastgelegde stuifkuilen. Alle drie hebben status gepland. Dezelfde benaderde contour is driemaal opgeslagen als TG02_plangebied, één keer per maatregel. Dit betreft één gedeeld planvlak van circa 12 hectare, geen drie afzonderlijke vlakken of gerealiseerde oppervlakten. Er zijn nul TG03-uitvoeringsgeometrieën voor dit project. De verdeling van de maatregelen binnen het vlak, plagdiepte, uitvoeringsdatums en gerealiseerde hoeveelheden zijn niet gegeven en blijven leeg.</w:t>
-      </w:r>
-    </w:p>
-    <w:p>
-      <w:pPr>
-        <w:pStyle w:val="BodyText"/>
-      </w:pPr>
-      <w:r>
-        <w:t>De benaderde contour is afgeleid van de aangeleverde PNG met PDOK-luchtfoto 2024 en getoetst aan de 55 lokale SOVON-kavelpolygonen uit 2025. Het indicatieve centrum ligt op RD 83.605 / 463.497, circa 52,1550 N / 4,3439 O. Het vlak ligt nagenoeg in M13s; de kleine berekende overlap bij M77 is niet robuust tegen kaartpassingsfouten. De drie relaties met M13s hebben daarom status te_beoordelen en geen doorsnijdingspercentage. M77 is niet als maatregelkavel toegevoegd. De contour is geen nauwkeurige uitvoeringsgrens of naamgebiedsgrens.</w:t>
-      </w:r>
-    </w:p>
-    <w:p>
-      <w:pPr>
-        <w:pStyle w:val="BodyText"/>
-      </w:pPr>
-      <w:r>
-        <w:t>De lokale maatregelenlaag bevat na deze invoer op 17 oktober 2026 22 projecten, 53 bronnen, 90 maatregelregistraties, 129 bronkoppelingen, 259 kavelrelaties en drie benaderde TG02-plangeometrieën. De bestaande 132 jaarbeoordelingen en 357 regels in v_plot_jaar_maatregel_bronvast zijn exact behouden. De drie nieuwe plannen voegen nul uitvoeringsjaren en nul feitelijke plot-jaarregels toe. Bronbewijs, oorspronkelijke afbeelding en afgeleide contour staan in docs/bronnen/namen/helmduinen_noord_20261017/. De herhaalbare invoer staat in gis/database/nameninventaris_helmduinen_noord_20261017.sql.</w:t>
-      </w:r>
-    </w:p>
-    <w:p>
-      <w:pPr>
-        <w:pStyle w:val="BodyText"/>
-      </w:pPr>
-      <w:r>
-        <w:t>Heranalyse van het getekende Helmduinen-planvlak, 17 oktober 2026. De alleen-lezen puntselectie in de levende database bevat 3.250 BMP-vogelregistraties voor 36 soorten uit 162 bezoeken, 2009–2025; alle zijn toegelaten door ruimtelijke poort v3. De afzonderlijke wintertellingen bevatten 3.712 registraties voor 117 soorten uit 175 bezoeken, 2000–2025. De Avimap-analyseview bevat daarnaast 28 registraties uit 2012–2016: tien Konijn, zeven Vos, tien Ree en één spitsmuis spec., met status voorlopig_bruikbaar. Deze bronselecties zijn niet bij elkaar opgeteld en bewijzen geen aantallen getroffen territoria. Bij tien meter in- of uitwaarts verschuiven van de contour variëren de BMP-selecties van 2.698 tot 3.781 registraties; bij 25 meter van 1.915 tot 4.994. Dit zijn scenario’s, geen berekende kaartfoutmarges.</w:t>
-      </w:r>
-    </w:p>
-    <w:p>
-      <w:pPr>
-        <w:pStyle w:val="BodyText"/>
-      </w:pPr>
-      <w:r>
-        <w:t>Van 810.830 openbare NDFF-records raken 15.206 bronvlakken uit 1850–2025 de plancontour; 2.792 zijn vervaagd. De strengere selectie bevat 592 niet-vervaagde bronvlakken die geheel binnen liggen, 105 taxonlabels uit 1994–2025; alle 592 hebben ook toelatingsstatus toegelaten in ruimtelijke poort v3. Ze omvatten 473 vaatplant-, 82 mos-, 21 korstmos- en zestien overige faunaregistraties. De verrijkingslaag koppelt één spitsmuisrecord uit 2021 aan ticket 58679; de toegelaten beveiligde brongeometrie ligt eveneens geheel binnen. De beveiligde registerlaag bevat 232 Nauwe-korfslakrecords uit 1950–2024, waarvan nul brongeometrieën de contour raken. Dit is geen bewijs van afwezigheid in het terrein. Geen nieuwe populatie- of trendtoelating uitgevoerd.</w:t>
-      </w:r>
-    </w:p>
-    <w:p>
-      <w:pPr>
-        <w:pStyle w:val="BodyText"/>
-      </w:pPr>
-      <w:r>
-        <w:t>Het vangblikonderzoek heeft binnen de contour twaalf locatiecodes op zes onderscheiden RD-punten, met 2.472 events uit 1953–1960 en 3.811 vangstregels voor 107 bron-taxonsleutels. Daarvan hebben 1.463 events gekoppelde vangstregels; lege events zijn niet als harde nul geïnterpreteerd. De zes vergelijkingscodes uit 1959–1960 zijn geen extra terreinposities. Dit levert historische onderzoekscontext op dezelfde plaats, geen nulmeting voor 2026. De externe collectieview levert verder één nominale Naturalis-botanyvindplaats van Saxifraga tridactylites uit 2024 binnen de contour, met onbekende numerieke coördinaatonzekerheid en status collectiecontext. Voor ENDURE, Naturalis Coleoptera, NMR-vlinders, STOWA en de bezoekersdrukmeetlocaties zijn in de uitgevoerde binnen-vlakselecties nul nominale locaties/resultaten gevonden.</w:t>
-      </w:r>
-    </w:p>
-    <w:p>
-      <w:pPr>
-        <w:pStyle w:val="BodyText"/>
-      </w:pPr>
-      <w:r>
-        <w:t>De vernieuwde Zotero-controle omvat 1.518 actuele items, waaronder 820 bijlagen. Van 417 is indextekst gelezen; aanvullend zijn 86 tekstcaches en 290 oorspronkelijke PDF’s gelezen. Dertien van de aanvullend onderzochte bestanden leveren geen tekst; 23 bijlagen zijn geen PDF en vier PDF’s zijn niet uitleesbaar. Er is bruikbare tekst uit 780 bijlagen. Dertien zoektermen leveren 367 itemtreffers met 300 bovenliggende of zelfstandige records, geen 300 studies van het planvlak. Van der Hagen &amp; Hooijmans in Holland’s Duinen 88, april 2026, p. 30–46, beschrijven acht Kikkervalleien-inventarisaties uit 1998–2025 en recent vervolgbeheer. De afzonderlijke negen brondeelgebieden zijn niet digitaal met het planvlak vergeleken; de beschreven ingrepen van 2021–2026 zijn daarom niet als uitvoering binnen dit vlak geregistreerd. De heranalyse en volledige bronselecties staan in Helmduinen_werkbezoek_20_oktober_2026.pdf en de map vlakheranalyse_20261017 in het bijbehorende bewijsarchief. De bestaande drie maatregelplannen blijven gepland; geen databasegegevens gewijzigd.</w:t>
+        <w:rPr>
+          <w:b/>
+          <w:bCs/>
+        </w:rPr>
+        <w:t xml:space="preserve">Gebruik en grens.</w:t>
+      </w:r>
+      <w:r>
+        <w:t xml:space="preserve"> </w:t>
+      </w:r>
+      <w:r>
+        <w:t xml:space="preserve">De laag is geschikt om vast te leggen wat volgens welke bron is gepland, uitgevoerd, niet uitgevoerd of onbekend. De bronvaste plot-jaarlaag kan nu beschrijvend naast vogelgegevens voor de expliciet benoemde kavels worden gelegd. Een kavelvermelding bewijst niet dat de maatregel ieder deel van de kavel raakte; een samenhang met vogelontwikkeling is geen causaal beheereffect. De 144 oorspronkelijke begrazingsregistraties voor 16 plots uit 1991–1999 zijn geïntegreerd: 139 aanvullende feiten en vijf verwijzingen naar reeds bestaande feiten. De oorspronkelijke 144 regels blijven voor audit reconstrueerbaar; de fysieke tabel en gelijknamige view zijn verwijderd. Zie de migratieverantwoording onderaan dit register.</w:t>
+      </w:r>
+    </w:p>
+    <w:p>
+      <w:pPr>
+        <w:pStyle w:val="BodyText"/>
+      </w:pPr>
+      <w:r>
+        <w:rPr>
+          <w:b/>
+          <w:bCs/>
+        </w:rPr>
+        <w:t xml:space="preserve">Status.</w:t>
+      </w:r>
+      <w:r>
+        <w:t xml:space="preserve"> </w:t>
+      </w:r>
+      <w:r>
+        <w:t xml:space="preserve">Bronvast op project-, uitvoering- en jaarniveau voor 43 inhoudelijke bronnen en 64 uitvoeringen. Daarnaast is één administratieve migratiebron toegevoegd; maatregel_bron bevat 44 regels. De algemene kavel- en gebiedsindeling is geometrisch beschikbaar voor de 55 actuele plots uit 2025; vijf expliciet gekoppelde historische kavels hebben geen afzonderlijke geometrie. De bronvaste plot-jaarlaag bevat 307 regels voor 1967–1969, 1972–1975, 1988–1991, 1993, 1997, 2002, 2005–2006 en 2013–2025. Het onderzochte PAS-maaibeheer 23 levert geen plot-jaarrijen op, omdat de vier jaarregels 2016–2019</w:t>
+      </w:r>
+      <w:r>
+        <w:t xml:space="preserve"> </w:t>
+      </w:r>
+      <w:r>
+        <w:rPr>
+          <w:rStyle w:val="VerbatimChar"/>
+        </w:rPr>
+        <w:t xml:space="preserve">niet_uitgevoerd</w:t>
+      </w:r>
+      <w:r>
+        <w:t xml:space="preserve"> </w:t>
+      </w:r>
+      <w:r>
+        <w:t xml:space="preserve">zijn en de view alleen uitgevoerde jaren opneemt.</w:t>
+      </w:r>
+      <w:r>
+        <w:t xml:space="preserve"> </w:t>
+      </w:r>
+      <w:r>
+        <w:rPr>
+          <w:rStyle w:val="VerbatimChar"/>
+        </w:rPr>
+        <w:t xml:space="preserve">maatregel_plot_koppeling</w:t>
+      </w:r>
+      <w:r>
+        <w:t xml:space="preserve"> </w:t>
+      </w:r>
+      <w:r>
+        <w:t xml:space="preserve">bevat 211 relaties. Helmduinen heeft er twee; Meeuwenduin en Prinsenduin samen zeven; maatregel 22h zes; de begrazing van Vallei Meijendel negen; maatregel 3c dertien; maatregel 3d vijf; de slagboomvervanging twee; het onderzochte PAS-maaibeheer 23 tien; het maaibeheer in Ruygenhoek, Lange Strook en De Loopert vijf; het PIM-leidingwerk zeven; de PIM-winputten 22; het nabeheer van de kerfzone twee; de aanleg van de vijf kerven drie; de programmabrede pannenmaatregel vier; de programmabrede plagwerkzaamheden acht; infiltratieplas 27.2 één. Vier uitvoeringen hebben geen directe plotkoppeling. De twee Bendel-uitvoeringen en de begrazing van landgoed Weiduin vallen aantoonbaar buiten het Meijendel-plotgebied, zodat nog één geheel ongekoppelde uitvoering ruimtelijk moet worden beoordeeld.</w:t>
+      </w:r>
+    </w:p>
+    <w:p>
+      <w:pPr>
+        <w:pStyle w:val="BodyText"/>
+      </w:pPr>
+      <w:r>
+        <w:t xml:space="preserve">Actualisering 17 oktober 2026 — voorgenomen natuurherstelvlak binnen het noordelijke deel van Helmduinen. Eén aangeleverde uitnodiging van Jasper Wester (Dunea), met één kaartvlak en de nadere plaatsduiding van Ton, is als planbron vastgelegd. De kaart omvat slechts een vlak binnen Helmduinen Noord. Zij begrenst niet het gehele noordelijke deel of heel Helmduinen. De uitnodiging noemt een werkbezoek op 20 oktober 2026; dit is geen uitvoeringsdatum. De verzenddatum van de uitnodiging, de opnamedatum van de kaart en de uitvoeringsperiode zijn niet vastgesteld.</w:t>
+      </w:r>
+    </w:p>
+    <w:p>
+      <w:pPr>
+        <w:pStyle w:val="BodyText"/>
+      </w:pPr>
+      <w:r>
+        <w:t xml:space="preserve">De drie aangekondigde maatregelen zijn afzonderlijk geregistreerd: ondiep afplaggen voor vochtige duinvalleien; terugdringen van bosopslag en verstruweling voor grijze duinen en vochtige duinvalleien; reactiveren van oude, vastgelegde stuifkuilen. Alle drie hebben status gepland. Dezelfde benaderde contour is driemaal opgeslagen als TG02_plangebied, één keer per maatregel. Dit betreft één gedeeld planvlak van circa 12 hectare, geen drie afzonderlijke vlakken of gerealiseerde oppervlakten. Er zijn nul TG03-uitvoeringsgeometrieën voor dit project. De verdeling van de maatregelen binnen het vlak, plagdiepte, uitvoeringsdatums en gerealiseerde hoeveelheden zijn niet gegeven en blijven leeg.</w:t>
+      </w:r>
+    </w:p>
+    <w:p>
+      <w:pPr>
+        <w:pStyle w:val="BodyText"/>
+      </w:pPr>
+      <w:r>
+        <w:t xml:space="preserve">De benaderde contour is afgeleid van de aangeleverde PNG met PDOK-luchtfoto 2024 en getoetst aan de 55 lokale SOVON-kavelpolygonen uit 2025. Het indicatieve centrum ligt op RD 83.605 / 463.497, circa 52,1550 N / 4,3439 O. Het vlak ligt nagenoeg in M13s; de kleine berekende overlap bij M77 is niet robuust tegen kaartpassingsfouten. De drie relaties met M13s hebben daarom status te_beoordelen en geen doorsnijdingspercentage. M77 is niet als maatregelkavel toegevoegd. De contour is geen nauwkeurige uitvoeringsgrens of naamgebiedsgrens.</w:t>
+      </w:r>
+    </w:p>
+    <w:p>
+      <w:pPr>
+        <w:pStyle w:val="BodyText"/>
+      </w:pPr>
+      <w:r>
+        <w:t xml:space="preserve">De lokale maatregelenlaag bevat na deze invoer op 17 oktober 2026 22 projecten, 53 bronnen, 90 maatregelregistraties, 129 bronkoppelingen, 259 kavelrelaties en drie benaderde TG02-plangeometrieën. De bestaande 132 jaarbeoordelingen en 357 regels in v_plot_jaar_maatregel_bronvast zijn exact behouden. De drie nieuwe plannen voegen nul uitvoeringsjaren en nul feitelijke plot-jaarregels toe. Bronbewijs, oorspronkelijke afbeelding en afgeleide contour staan in docs/bronnen/namen/helmduinen_noord_20261017/. De herhaalbare invoer staat in gis/database/nameninventaris_helmduinen_noord_20261017.sql.</w:t>
+      </w:r>
+    </w:p>
+    <w:p>
+      <w:pPr>
+        <w:pStyle w:val="BodyText"/>
+      </w:pPr>
+      <w:r>
+        <w:t xml:space="preserve">Heranalyse van het getekende Helmduinen-planvlak, 17 oktober 2026. De alleen-lezen puntselectie in de levende database bevat 3.250 BMP-vogelregistraties voor 36 soorten uit 162 bezoeken, 2009–2025; alle zijn toegelaten door ruimtelijke poort v3. De afzonderlijke wintertellingen bevatten 3.712 registraties voor 117 soorten uit 175 bezoeken, 2000–2025. De Avimap-analyseview bevat daarnaast 28 registraties uit 2012–2016: tien Konijn, zeven Vos, tien Ree en één spitsmuis spec., met status voorlopig_bruikbaar. Deze bronselecties zijn niet bij elkaar opgeteld en bewijzen geen aantallen getroffen territoria. Bij tien meter in- of uitwaarts verschuiven van de contour variëren de BMP-selecties van 2.698 tot 3.781 registraties; bij 25 meter van 1.915 tot 4.994. Dit zijn scenario’s, geen berekende kaartfoutmarges.</w:t>
+      </w:r>
+    </w:p>
+    <w:p>
+      <w:pPr>
+        <w:pStyle w:val="BodyText"/>
+      </w:pPr>
+      <w:r>
+        <w:t xml:space="preserve">Van 810.830 openbare NDFF-records raken 15.206 bronvlakken uit 1850–2025 de plancontour; 2.792 zijn vervaagd. De strengere selectie bevat 592 niet-vervaagde bronvlakken die geheel binnen liggen, 105 taxonlabels uit 1994–2025; alle 592 hebben ook toelatingsstatus toegelaten in ruimtelijke poort v3. Ze omvatten 473 vaatplant-, 82 mos-, 21 korstmos- en zestien overige faunaregistraties. De verrijkingslaag koppelt één spitsmuisrecord uit 2021 aan ticket 58679; de toegelaten beveiligde brongeometrie ligt eveneens geheel binnen. De beveiligde registerlaag bevat 232 Nauwe-korfslakrecords uit 1950–2024, waarvan nul brongeometrieën de contour raken. Dit is geen bewijs van afwezigheid in het terrein. Geen nieuwe populatie- of trendtoelating uitgevoerd.</w:t>
+      </w:r>
+    </w:p>
+    <w:p>
+      <w:pPr>
+        <w:pStyle w:val="BodyText"/>
+      </w:pPr>
+      <w:r>
+        <w:t xml:space="preserve">Het vangblikonderzoek heeft binnen de contour twaalf locatiecodes op zes onderscheiden RD-punten, met 2.472 events uit 1953–1960 en 3.811 vangstregels voor 107 bron-taxonsleutels. Daarvan hebben 1.463 events gekoppelde vangstregels; lege events zijn niet als harde nul geïnterpreteerd. De zes vergelijkingscodes uit 1959–1960 zijn geen extra terreinposities. Dit levert historische onderzoekscontext op dezelfde plaats, geen nulmeting voor 2026. De externe collectieview levert verder één nominale Naturalis-botanyvindplaats van Saxifraga tridactylites uit 2024 binnen de contour, met onbekende numerieke coördinaatonzekerheid en status collectiecontext. Voor ENDURE, Naturalis Coleoptera, NMR-vlinders, STOWA en de bezoekersdrukmeetlocaties zijn in de uitgevoerde binnen-vlakselecties nul nominale locaties/resultaten gevonden.</w:t>
+      </w:r>
+    </w:p>
+    <w:p>
+      <w:pPr>
+        <w:pStyle w:val="BodyText"/>
+      </w:pPr>
+      <w:r>
+        <w:t xml:space="preserve">De vernieuwde Zotero-controle omvat 1.518 actuele items, waaronder 820 bijlagen. Van 417 is indextekst gelezen; aanvullend zijn 86 tekstcaches en 290 oorspronkelijke PDF’s gelezen. Dertien van de aanvullend onderzochte bestanden leveren geen tekst; 23 bijlagen zijn geen PDF en vier PDF’s zijn niet uitleesbaar. Er is bruikbare tekst uit 780 bijlagen. Dertien zoektermen leveren 367 itemtreffers met 300 bovenliggende of zelfstandige records, geen 300 studies van het planvlak. Van der Hagen &amp; Hooijmans in Holland’s Duinen 88, april 2026, p. 30–46, beschrijven acht Kikkervalleien-inventarisaties uit 1998–2025 en recent vervolgbeheer. De afzonderlijke negen brondeelgebieden zijn niet digitaal met het planvlak vergeleken; de beschreven ingrepen van 2021–2026 zijn daarom niet als uitvoering binnen dit vlak geregistreerd. De heranalyse en volledige bronselecties staan in Helmduinen_werkbezoek_20_oktober_2026.pdf en de map vlakheranalyse_20261017 in het bijbehorende bewijsarchief. De bestaande drie maatregelplannen blijven gepland; geen databasegegevens gewijzigd.</w:t>
       </w:r>
     </w:p>
     <w:p>
       <w:pPr>
         <w:pStyle w:val="Heading2"/>
       </w:pPr>
-      <w:bookmarkStart w:id="55" w:name="_3b532014da7425692b0b753bfd67f02e729afe2"/>
+      <w:bookmarkStart w:id="56" w:name="_692b0a71312b2a939db271d079fb23757bfc15a"/>
       <w:r>
         <w:t xml:space="preserve">2. Bronnen in MySQL-database</w:t>
       </w:r>
@@ -7714,7 +8116,7 @@
         </w:rPr>
         <w:t xml:space="preserve">Meijendel_bronnen</w:t>
       </w:r>
-      <w:bookmarkEnd w:id="55"/>
+      <w:bookmarkEnd w:id="56"/>
     </w:p>
     <w:p>
       <w:pPr>
@@ -7743,11 +8145,11 @@
       <w:pPr>
         <w:pStyle w:val="Heading3"/>
       </w:pPr>
-      <w:bookmarkStart w:id="56" w:name="_duinvalleivegetatie"/>
+      <w:bookmarkStart w:id="57" w:name="_7ae3f60e8dd3c65bdde3d5f608a55d96632a876"/>
       <w:r>
         <w:t xml:space="preserve">2.1. Duinvalleivegetatie</w:t>
       </w:r>
-      <w:bookmarkEnd w:id="56"/>
+      <w:bookmarkEnd w:id="57"/>
     </w:p>
     <w:p>
       <w:pPr>
@@ -7769,7 +8171,7 @@
       <w:r>
         <w:t xml:space="preserve"> </w:t>
       </w:r>
-      <w:hyperlink r:id="rId57">
+      <w:hyperlink r:id="rId58">
         <w:r>
           <w:rPr>
             <w:rStyle w:val="Hyperlink"/>
@@ -7818,11 +8220,11 @@
       <w:pPr>
         <w:pStyle w:val="Heading3"/>
       </w:pPr>
-      <w:bookmarkStart w:id="58" w:name="_b3fe4556564befcfb8496c13829480f8568428d"/>
+      <w:bookmarkStart w:id="59" w:name="_6cd5cd3671e295c222d5bd4a47757f0a76f0a19"/>
       <w:r>
         <w:t xml:space="preserve">2.2. Vogelstand 1924</w:t>
       </w:r>
-      <w:bookmarkEnd w:id="58"/>
+      <w:bookmarkEnd w:id="59"/>
     </w:p>
     <w:p>
       <w:pPr>
@@ -7897,11 +8299,11 @@
       <w:pPr>
         <w:pStyle w:val="Heading3"/>
       </w:pPr>
-      <w:bookmarkStart w:id="59" w:name="_jachtspinnen"/>
+      <w:bookmarkStart w:id="60" w:name="_b3fdc40884db1bbf06132e666e117a731445140"/>
       <w:r>
         <w:t xml:space="preserve">2.3. Jachtspinnen</w:t>
       </w:r>
-      <w:bookmarkEnd w:id="59"/>
+      <w:bookmarkEnd w:id="60"/>
     </w:p>
     <w:p>
       <w:pPr>
@@ -7961,11 +8363,11 @@
       <w:pPr>
         <w:pStyle w:val="Heading3"/>
       </w:pPr>
-      <w:bookmarkStart w:id="60" w:name="_literatuuroverzicht"/>
+      <w:bookmarkStart w:id="61" w:name="_7c2c13aacf0ea926ee35ca97ab69391a3624a6f"/>
       <w:r>
         <w:t xml:space="preserve">2.4. Literatuuroverzicht</w:t>
       </w:r>
-      <w:bookmarkEnd w:id="60"/>
+      <w:bookmarkEnd w:id="61"/>
     </w:p>
     <w:p>
       <w:pPr>
@@ -7994,39 +8396,76 @@
           <w:b/>
           <w:bCs/>
         </w:rPr>
-      </w:r>
-      <w:r/>
-      <w:r/>
-      <w:r>
-        <w:rPr>
-          <w:b/>
-        </w:rPr>
-        <w:t>Omvang en periode.</w:t>
-      </w:r>
-      <w:r>
-        <w:t xml:space="preserve"> Het gepubliceerde literatuuroverzicht bevatte 522 bibliografische verwijzingen op 25 september 2026. De lokale Zotero-collectie Meijendel bevat op 17 oktober 2026 469 zelfstandige bibliografische items. Dat zijn verschillende selecties; de actuele Zotero-telling vervangt de vastgelegde publicatiestand niet.</w:t>
-      </w:r>
-    </w:p>
-    <w:p>
-      <w:pPr>
-        <w:pStyle w:val="BodyText"/>
-      </w:pPr>
-      <w:r>
-        <w:t>Op 17 oktober 2026 zijn de 29 nog niet aanwezige resultaten uit de selectie van 50 Consensus-resultaten als zelfstandige parent-items toegevoegd aan Zotero-collectie Meijendel. De 29 publicaties beslaan na broncontrole 1926–2023; 18 items hebben een DOI. De lokale collectie groeide hierbij van 437 naar 466 bibliografische items. Alle 29 items hebben een bronnotitie met herkomst en eventuele metadata-afwijkingen. Vijf resultaten hebben een volledige PDF-tekst: Schierbeek (1926), Blankwaardt (1965), Wesselingh et al. (1997), Beunen et al. (2004) en het complete congresabstract van De Bonte en Boosten (1996). Bij Vliegenthart et al. (definitieve jaargang 2023) zijn daarnaast een aanvullend PDF-bestand en een XLSX-gegevenstabel gekoppeld; die zijn niet de volledige artikeltekst. Voor de overige 24 resultaten is de volledige publicatie niet verkregen via de gecontroleerde routes. De zeven nieuwe bestandsbijlagen staan als gekoppelde bestanden op de T7 onder /Volumes/T7 Data/Zotero/files; dit is de op 17 oktober 2026 door Ton bevestigde vaste opslagafspraak.</w:t>
-      </w:r>
-    </w:p>
-    <w:p>
-      <w:pPr>
-        <w:pStyle w:val="BodyText"/>
-      </w:pPr>
-      <w:r>
-        <w:t>De oorspronkelijke Consensus-lijst bevatte onder meer een foutief jaar en ontbrekende auteurs bij het begrazingsabstract: de gedrukte tekst is uit december 1996, niet uit 2018. Bij het recreatierapport deel XIV uit 2003 wijkt de auteurslijst in Consensus af van de WUR-catalogus; de WUR-gegevens zijn overgenomen en het verschil blijft zichtbaar in de bronnotitie. Deze uitbreiding betreft uitsluitend lokale literatuurregistratie. De databases Meijendel en Meijendel_bronnen, de analysetoelating en de VPS-publicatiestand zijn in deze taak niet gewijzigd.</w:t>
-      </w:r>
-    </w:p>
-    <w:p>
-      <w:pPr/>
-      <w:r>
-        <w:t>Later op 17 oktober 2026 zijn drie ontbrekende artikelen uit de vierdelige Consensus-selectie over vlinders toegevoegd: Prins et al. (Crossref-jaar 1990, literatuurjaar 1991 nog niet aan de originele druk bevestigd; H6PWHC7Y), Wei et al. (2017; HW6A3JW8) en WallisDeVries en Raemakers (2001; WULG249S). Macel en Klinkhamer (2010; D8ISPYXE) was al aanwezig en is ongewijzigd gebleven. De lokale collectie groeide van 466 naar 469 bibliografische items. Alle drie nieuwe items hebben een DOI en bronnotitie. Voor deze vier artikelen zijn geen volledige teksten of supplementen verkregen; uitgevers- en auteursdownloads waren niet toegankelijk. Er zijn daarom in deze vervolgstap geen bestandsbijlagen op de T7 toegevoegd. Meijendel-deelname aan de begrazingsstudie uit 2001 is bevestigd via de zes route-identificaties in tabel 1 en het Meijendel-routeoverzicht in Holland’s Duinen 66, p. 10; de studie betreft 1992–1996. Dit verandert de analysetoelating en de lokale of gepubliceerde databases niet.</w:t>
+        <w:t xml:space="preserve">Omvang en periode.</w:t>
+      </w:r>
+      <w:r>
+        <w:t xml:space="preserve"> </w:t>
+      </w:r>
+      <w:r>
+        <w:t xml:space="preserve">Het gepubliceerde literatuuroverzicht bevatte 522 bibliografische verwijzingen op 25 september 2026. De lokale Zotero-collectie Meijendel bevat op 17 oktober 2026 469 zelfstandige bibliografische items. Dat zijn verschillende selecties; de actuele Zotero-telling vervangt de vastgelegde publicatiestand niet.</w:t>
+      </w:r>
+    </w:p>
+    <w:p>
+      <w:pPr>
+        <w:pStyle w:val="BodyText"/>
+      </w:pPr>
+      <w:r>
+        <w:t xml:space="preserve">Op 17 oktober 2026 zijn de 29 nog niet aanwezige resultaten uit de selectie van 50 Consensus-resultaten als zelfstandige parent-items toegevoegd aan Zotero-collectie Meijendel. De 29 publicaties beslaan na broncontrole 1926–2023; 18 items hebben een DOI. De lokale collectie groeide hierbij van 437 naar 466 bibliografische items. Alle 29 items hebben een bronnotitie met herkomst en eventuele metadata-afwijkingen. Vijf resultaten hebben een volledige PDF-tekst: Schierbeek (1926), Blankwaardt (1965), Wesselingh et al. (1997), Beunen et al. (2004) en het complete congresabstract van De Bonte en Boosten (1996). Bij Vliegenthart et al. (definitieve jaargang 2023) zijn daarnaast een aanvullend PDF-bestand en een XLSX-gegevenstabel gekoppeld; die zijn niet de volledige artikeltekst. Voor de overige 24 resultaten is de volledige publicatie niet verkregen via de gecontroleerde routes. De zeven nieuwe bestandsbijlagen staan als gekoppelde bestanden op de T7 onder</w:t>
+      </w:r>
+      <w:r>
+        <w:t xml:space="preserve"> </w:t>
+      </w:r>
+      <w:r>
+        <w:rPr>
+          <w:rStyle w:val="VerbatimChar"/>
+        </w:rPr>
+        <w:t xml:space="preserve">/Volumes/T7 Data/Zotero/files</w:t>
+      </w:r>
+      <w:r>
+        <w:t xml:space="preserve">; dit is de op 17 oktober 2026 door Ton bevestigde vaste opslagafspraak.</w:t>
+      </w:r>
+    </w:p>
+    <w:p>
+      <w:pPr>
+        <w:pStyle w:val="BodyText"/>
+      </w:pPr>
+      <w:r>
+        <w:t xml:space="preserve">De oorspronkelijke Consensus-lijst bevatte onder meer een foutief jaar en ontbrekende auteurs bij het begrazingsabstract: de gedrukte tekst is uit december 1996, niet uit 2018. Bij het recreatierapport deel XIV uit 2003 wijkt de auteurslijst in Consensus af van de WUR-catalogus; de WUR-gegevens zijn overgenomen en het verschil blijft zichtbaar in de bronnotitie. Deze uitbreiding betreft uitsluitend lokale literatuurregistratie. De databases</w:t>
+      </w:r>
+      <w:r>
+        <w:t xml:space="preserve"> </w:t>
+      </w:r>
+      <w:r>
+        <w:rPr>
+          <w:rStyle w:val="VerbatimChar"/>
+        </w:rPr>
+        <w:t xml:space="preserve">Meijendel</w:t>
+      </w:r>
+      <w:r>
+        <w:t xml:space="preserve"> </w:t>
+      </w:r>
+      <w:r>
+        <w:t xml:space="preserve">en</w:t>
+      </w:r>
+      <w:r>
+        <w:t xml:space="preserve"> </w:t>
+      </w:r>
+      <w:r>
+        <w:rPr>
+          <w:rStyle w:val="VerbatimChar"/>
+        </w:rPr>
+        <w:t xml:space="preserve">Meijendel_bronnen</w:t>
+      </w:r>
+      <w:r>
+        <w:t xml:space="preserve">, de analysetoelating en de VPS-publicatiestand zijn in deze taak niet gewijzigd.</w:t>
+      </w:r>
+    </w:p>
+    <w:p>
+      <w:pPr>
+        <w:pStyle w:val="BodyText"/>
+      </w:pPr>
+      <w:r>
+        <w:t xml:space="preserve">Later op 17 oktober 2026 zijn drie ontbrekende artikelen uit de vierdelige Consensus-selectie over vlinders toegevoegd: Prins et al. (Crossref-jaar 1990, literatuurjaar 1991 nog niet aan de originele druk bevestigd; H6PWHC7Y), Wei et al. (2017; HW6A3JW8) en WallisDeVries en Raemakers (2001; WULG249S). Macel en Klinkhamer (2010; D8ISPYXE) was al aanwezig en is ongewijzigd gebleven. De lokale collectie groeide van 466 naar 469 bibliografische items. Alle drie nieuwe items hebben een DOI en bronnotitie. Voor deze vier artikelen zijn geen volledige teksten of supplementen verkregen; uitgevers- en auteursdownloads waren niet toegankelijk. Er zijn daarom in deze vervolgstap geen bestandsbijlagen op de T7 toegevoegd. Meijendel-deelname aan de begrazingsstudie uit 2001 is bevestigd via de zes route-identificaties in tabel 1 en het Meijendel-routeoverzicht in Holland’s Duinen 66, p. 10; de studie betreft 1992–1996. Dit verandert de analysetoelating en de lokale of gepubliceerde databases niet.</w:t>
       </w:r>
     </w:p>
     <w:p>
@@ -8051,11 +8490,11 @@
       <w:pPr>
         <w:pStyle w:val="Heading3"/>
       </w:pPr>
-      <w:bookmarkStart w:id="61" w:name="_c459e94267866b3631cced111f8a87d0309b41a"/>
+      <w:bookmarkStart w:id="62" w:name="_4a1f2475629c7656191227e4ca81566bef187e2"/>
       <w:r>
         <w:t xml:space="preserve">2.5. Bijenmonitoring in vier beheergebieden</w:t>
       </w:r>
-      <w:bookmarkEnd w:id="61"/>
+      <w:bookmarkEnd w:id="62"/>
     </w:p>
     <w:p>
       <w:pPr>
@@ -8127,11 +8566,11 @@
       <w:pPr>
         <w:pStyle w:val="Heading3"/>
       </w:pPr>
-      <w:bookmarkStart w:id="62" w:name="_3de3a6968c8894ad5b666eb1a40d580f2cd5807"/>
+      <w:bookmarkStart w:id="63" w:name="_bef92f685785a24a45e5325384551ba55c57cc1"/>
       <w:r>
         <w:t xml:space="preserve">2.6. Aquatische macrofauna 1974–1975</w:t>
       </w:r>
-      <w:bookmarkEnd w:id="62"/>
+      <w:bookmarkEnd w:id="63"/>
     </w:p>
     <w:p>
       <w:pPr>
@@ -8206,11 +8645,11 @@
       <w:pPr>
         <w:pStyle w:val="Heading2"/>
       </w:pPr>
-      <w:bookmarkStart w:id="63" w:name="_ae67a70ad36e2d1d11a7d910c2e5a6d669a3a5f"/>
+      <w:bookmarkStart w:id="64" w:name="_2b62b82ef201b4c91783bce15da2b1d0258c34c"/>
       <w:r>
         <w:t xml:space="preserve">3. Geïdentificeerde externe kandidaatbronnen</w:t>
       </w:r>
-      <w:bookmarkEnd w:id="63"/>
+      <w:bookmarkEnd w:id="64"/>
     </w:p>
     <w:p>
       <w:pPr>
@@ -8224,21 +8663,21 @@
       <w:pPr>
         <w:pStyle w:val="Heading3"/>
       </w:pPr>
-      <w:bookmarkStart w:id="64" w:name="_d53aceb4d9e4863cdbb6367737be5e291cdac65"/>
+      <w:bookmarkStart w:id="65" w:name="_d53aceb4d9e4863cdbb6367737be5e291cdac65"/>
       <w:r>
         <w:t xml:space="preserve">Kandidaten met de grootste verwachte aanvulling</w:t>
       </w:r>
-      <w:bookmarkEnd w:id="64"/>
+      <w:bookmarkEnd w:id="65"/>
     </w:p>
     <w:p>
       <w:pPr>
         <w:pStyle w:val="Heading4"/>
       </w:pPr>
-      <w:bookmarkStart w:id="65" w:name="_74b9659b0fdf809bf79d99a5b829eae72be789d"/>
+      <w:bookmarkStart w:id="66" w:name="_bddce02f5cb2b082bf32fac381c8bc0ea5284d3"/>
       <w:r>
         <w:t xml:space="preserve">3.1. Historische en actuele ringgegevens</w:t>
       </w:r>
-      <w:bookmarkEnd w:id="65"/>
+      <w:bookmarkEnd w:id="66"/>
     </w:p>
     <w:p>
       <w:pPr>
@@ -8331,11 +8770,11 @@
       <w:pPr>
         <w:pStyle w:val="Heading4"/>
       </w:pPr>
-      <w:bookmarkStart w:id="66" w:name="_78976b2620bc79a80ca8146881cbd2c6e6ff990"/>
+      <w:bookmarkStart w:id="67" w:name="_8071b7ae643e6cecadbf8a281c84bb90b511e63"/>
       <w:r>
         <w:t xml:space="preserve">3.2. Erosiepinnen in een stuifkuilcomplex</w:t>
       </w:r>
-      <w:bookmarkEnd w:id="66"/>
+      <w:bookmarkEnd w:id="67"/>
     </w:p>
     <w:p>
       <w:pPr>
@@ -8413,11 +8852,11 @@
       <w:pPr>
         <w:pStyle w:val="Heading4"/>
       </w:pPr>
-      <w:bookmarkStart w:id="67" w:name="_0e60eab001b7dad7f07f0f30fba1e4c43b4fb6d"/>
+      <w:bookmarkStart w:id="68" w:name="_1b05a95cacb83608c9b762adcf4298810ed86f9"/>
       <w:r>
         <w:t xml:space="preserve">3.3. Langjarige droge-duinvegetatieplots</w:t>
       </w:r>
-      <w:bookmarkEnd w:id="67"/>
+      <w:bookmarkEnd w:id="68"/>
     </w:p>
     <w:p>
       <w:pPr>
@@ -8495,14 +8934,14 @@
       <w:pPr>
         <w:pStyle w:val="Heading4"/>
       </w:pPr>
-      <w:bookmarkStart w:id="69" w:name="_f31d7749b8f822cf46569bbbcf696a184226376"/>
+      <w:bookmarkStart w:id="70" w:name="_4578481a165cef1470f100d42a5e836ac7456f8"/>
       <w:r>
         <w:t xml:space="preserve">3.4.</w:t>
       </w:r>
       <w:r>
         <w:t xml:space="preserve"> </w:t>
       </w:r>
-      <w:hyperlink r:id="rId68">
+      <w:hyperlink r:id="rId69">
         <w:r>
           <w:rPr>
             <w:rStyle w:val="Hyperlink"/>
@@ -8510,7 +8949,7 @@
           <w:t xml:space="preserve">Neuropteren van Meijendel</w:t>
         </w:r>
       </w:hyperlink>
-      <w:bookmarkEnd w:id="69"/>
+      <w:bookmarkEnd w:id="70"/>
     </w:p>
     <w:p>
       <w:pPr>
@@ -8588,14 +9027,14 @@
       <w:pPr>
         <w:pStyle w:val="Heading4"/>
       </w:pPr>
-      <w:bookmarkStart w:id="71" w:name="_2470413ff36fadda6aaee753e44801bf1df918f"/>
+      <w:bookmarkStart w:id="72" w:name="_642992b46f3d655730973d9bd57c00f9c7aad9f"/>
       <w:r>
         <w:t xml:space="preserve">3.5.</w:t>
       </w:r>
       <w:r>
         <w:t xml:space="preserve"> </w:t>
       </w:r>
-      <w:hyperlink r:id="rId70">
+      <w:hyperlink r:id="rId71">
         <w:r>
           <w:rPr>
             <w:rStyle w:val="Hyperlink"/>
@@ -8603,7 +9042,7 @@
           <w:t xml:space="preserve">Zweefvliegen van Meijendel</w:t>
         </w:r>
       </w:hyperlink>
-      <w:bookmarkEnd w:id="71"/>
+      <w:bookmarkEnd w:id="72"/>
     </w:p>
     <w:p>
       <w:pPr>
@@ -8681,11 +9120,11 @@
       <w:pPr>
         <w:pStyle w:val="Heading4"/>
       </w:pPr>
-      <w:bookmarkStart w:id="72" w:name="_17333f70ef292f70875eaae009d7701e7337d63"/>
+      <w:bookmarkStart w:id="73" w:name="_80b82bf48485caf594896b8d6bc490be5f328ee"/>
       <w:r>
         <w:t xml:space="preserve">3.6. TERRA-Dunes plant- en bodemmicrobiomen</w:t>
       </w:r>
-      <w:bookmarkEnd w:id="72"/>
+      <w:bookmarkEnd w:id="73"/>
     </w:p>
     <w:p>
       <w:pPr>
@@ -8707,7 +9146,7 @@
       <w:r>
         <w:t xml:space="preserve"> </w:t>
       </w:r>
-      <w:hyperlink r:id="rId73">
+      <w:hyperlink r:id="rId74">
         <w:r>
           <w:rPr>
             <w:rStyle w:val="Hyperlink"/>
@@ -8756,11 +9195,11 @@
       <w:pPr>
         <w:pStyle w:val="Heading4"/>
       </w:pPr>
-      <w:bookmarkStart w:id="74" w:name="_40b4b5f78cd8ca95bb70f0f0c78c7e4fbf296ca"/>
+      <w:bookmarkStart w:id="75" w:name="_4b2db10b2340db42e20505c45425c0b84f14c27"/>
       <w:r>
         <w:t xml:space="preserve">3.7. Rups- en bodemmicrobiomen</w:t>
       </w:r>
-      <w:bookmarkEnd w:id="74"/>
+      <w:bookmarkEnd w:id="75"/>
     </w:p>
     <w:p>
       <w:pPr>
@@ -8782,7 +9221,7 @@
       <w:r>
         <w:t xml:space="preserve"> </w:t>
       </w:r>
-      <w:hyperlink r:id="rId75">
+      <w:hyperlink r:id="rId76">
         <w:r>
           <w:rPr>
             <w:rStyle w:val="Hyperlink"/>
@@ -8831,11 +9270,11 @@
       <w:pPr>
         <w:pStyle w:val="Heading4"/>
       </w:pPr>
-      <w:bookmarkStart w:id="76" w:name="_1ba4dd18d3453a5dd5138bb384a5f14f39849e8"/>
+      <w:bookmarkStart w:id="77" w:name="_442e94e4e2997aa133d10bf618574e2528e759d"/>
       <w:r>
         <w:t xml:space="preserve">3.8. Schimmels bij kruipwilg</w:t>
       </w:r>
-      <w:bookmarkEnd w:id="76"/>
+      <w:bookmarkEnd w:id="77"/>
     </w:p>
     <w:p>
       <w:pPr>
@@ -8857,7 +9296,7 @@
       <w:r>
         <w:t xml:space="preserve"> </w:t>
       </w:r>
-      <w:hyperlink r:id="rId77">
+      <w:hyperlink r:id="rId78">
         <w:r>
           <w:rPr>
             <w:rStyle w:val="Hyperlink"/>
@@ -8906,11 +9345,11 @@
       <w:pPr>
         <w:pStyle w:val="Heading4"/>
       </w:pPr>
-      <w:bookmarkStart w:id="78" w:name="_374ab00ebf692a8e3319839c9c7bfae940c399a"/>
+      <w:bookmarkStart w:id="79" w:name="_36e8e197a59cff4a0251b791dc5fc6bc0e135bf"/>
       <w:r>
         <w:t xml:space="preserve">3.9. Plantengroei, bodemvocht en weer</w:t>
       </w:r>
-      <w:bookmarkEnd w:id="78"/>
+      <w:bookmarkEnd w:id="79"/>
     </w:p>
     <w:p>
       <w:pPr>
@@ -8932,7 +9371,7 @@
       <w:r>
         <w:t xml:space="preserve"> </w:t>
       </w:r>
-      <w:hyperlink r:id="rId79">
+      <w:hyperlink r:id="rId80">
         <w:r>
           <w:rPr>
             <w:rStyle w:val="Hyperlink"/>
@@ -8981,11 +9420,11 @@
       <w:pPr>
         <w:pStyle w:val="Heading4"/>
       </w:pPr>
-      <w:bookmarkStart w:id="80" w:name="_936150612b1bf240012fee005a20984db1c7c99"/>
+      <w:bookmarkStart w:id="81" w:name="_49ed5beca1c3c65272a43e85c3687f3c3d41d64"/>
       <w:r>
         <w:t xml:space="preserve">3.10. Genetische datasets amfibieën</w:t>
       </w:r>
-      <w:bookmarkEnd w:id="80"/>
+      <w:bookmarkEnd w:id="81"/>
     </w:p>
     <w:p>
       <w:pPr>
@@ -9045,11 +9484,11 @@
       <w:pPr>
         <w:pStyle w:val="Heading3"/>
       </w:pPr>
-      <w:bookmarkStart w:id="81" w:name="_8c2748f02893018608c8a38a1054acf3030739d"/>
+      <w:bookmarkStart w:id="82" w:name="_136d668cd3b301eba92f27584d1a2d49d57a73c"/>
       <w:r>
         <w:t xml:space="preserve">3.11. Alleen context of nog een onderzoeksaanwijzing</w:t>
       </w:r>
-      <w:bookmarkEnd w:id="81"/>
+      <w:bookmarkEnd w:id="82"/>
     </w:p>
     <w:p>
       <w:pPr>
@@ -9195,7 +9634,7 @@
       <w:pPr>
         <w:pStyle w:val="BodyText"/>
       </w:pPr>
-      <w:hyperlink r:id="rId82">
+      <w:hyperlink r:id="rId83">
         <w:r>
           <w:rPr>
             <w:rStyle w:val="Hyperlink"/>
@@ -9259,11 +9698,11 @@
       <w:pPr>
         <w:pStyle w:val="Heading3"/>
       </w:pPr>
-      <w:bookmarkStart w:id="83" w:name="_41253e96e2b1ec8824f9b84bf0a06f4f5ff5fba"/>
+      <w:bookmarkStart w:id="84" w:name="_5a3c854a1ae73aceac94ca91c157868f870ab17"/>
       <w:r>
         <w:t xml:space="preserve">3.12. Geografische namen en historische paden</w:t>
       </w:r>
-      <w:bookmarkEnd w:id="83"/>
+      <w:bookmarkEnd w:id="84"/>
     </w:p>
     <w:p>
       <w:pPr>
@@ -9371,714 +9810,745 @@
         <w:pStyle w:val="BodyText"/>
       </w:pPr>
       <w:r>
-        <w:t>Haagse Archeologische Rapportage 1204 uit februari 2012 voegt een nieuwe ruimtelijke bron toe voor Elleboogsprang en Vinkenhoek. Afbeelding 1 op PDF-pagina 4 bevat gebiedscontouren; de rapporttekst koppelt Elleboogsprang tevens aan Sprang H. Voor de maatregelactualisering zijn de contouren met de schaalbalk en de gepubliceerde RD-kilometerhokken georeferereerd. Dat levert een robuuste kaveltoedeling op: Elleboogsprang raakt M10-12-76 en M75, Vinkenhoek ligt in M71. De bronkaart bevat echter geen geodetische controlepunten of digitale brongeometrie. Daarom is de afgeleide contour niet aan de 71 brongeometrieën van versie</w:t>
-      </w:r>
-      <w:r>
-        <w:t xml:space="preserve"> </w:t>
-      </w:r>
-      <w:r>
-        <w:rPr>
-          <w:rStyle w:val="VerbatimChar"/>
-        </w:rPr>
-        <w:t>meijendel_nameninventaris_2026-10-14</w:t>
-      </w:r>
-      <w:r>
-        <w:t xml:space="preserve"> </w:t>
-      </w:r>
-      <w:r>
-        <w:t>toegevoegd en blijft voor deze twee historische contouren een eigen maatregelgeometrie achterwege.</w:t>
-      </w:r>
-      <w:r/>
-      <w:r>
-        <w:rPr>
-          <w:rStyle w:val="VerbatimChar"/>
-        </w:rPr>
-      </w:r>
-      <w:r/>
-      <w:r>
-        <w:t xml:space="preserve"> Vinkenhoek behoudt voorlopig zijn historische naamrecord zonder brongeometrie; Elleboogsprang wordt pas als zelfstandig naamobject aan een volgende inventarisversie toegevoegd wanneer de nieuwe bronlevering versiegebonden en reproduceerbaar kan worden geïmporteerd.</w:t>
-      </w:r>
+        <w:t xml:space="preserve">Haagse Archeologische Rapportage 1204 uit februari 2012 voegt een nieuwe ruimtelijke bron toe voor Elleboogsprang en Vinkenhoek. Afbeelding 1 op PDF-pagina 4 bevat gebiedscontouren; de rapporttekst koppelt Elleboogsprang tevens aan Sprang H. Voor de maatregelactualisering zijn de contouren met de schaalbalk en de gepubliceerde RD-kilometerhokken georeferereerd. Dat levert een robuuste kaveltoedeling op: Elleboogsprang raakt M10-12-76 en M75, Vinkenhoek ligt in M71. De bronkaart bevat echter geen geodetische controlepunten of digitale brongeometrie. Daarom is de afgeleide contour niet aan de 71 brongeometrieën van versie</w:t>
+      </w:r>
+      <w:r>
+        <w:t xml:space="preserve"> </w:t>
+      </w:r>
+      <w:r>
+        <w:rPr>
+          <w:rStyle w:val="VerbatimChar"/>
+        </w:rPr>
+        <w:t xml:space="preserve">meijendel_nameninventaris_2026-10-14</w:t>
+      </w:r>
+      <w:r>
+        <w:t xml:space="preserve"> </w:t>
+      </w:r>
+      <w:r>
+        <w:t xml:space="preserve">toegevoegd en blijft voor deze twee historische contouren een eigen maatregelgeometrie achterwege. Vinkenhoek behoudt voorlopig zijn historische naamrecord zonder brongeometrie; Elleboogsprang wordt pas als zelfstandig naamobject aan een volgende inventarisversie toegevoegd wanneer de nieuwe bronlevering versiegebonden en reproduceerbaar kan worden geïmporteerd.</w:t>
+      </w:r>
+    </w:p>
+    <w:p>
+      <w:pPr>
+        <w:pStyle w:val="BodyText"/>
+      </w:pPr>
+      <w:r>
+        <w:t xml:space="preserve">Geografisch vervolgonderzoek, 16 oktober 2026. De afzonderlijke onderzoekslevering meijendel_geolocaties_2026-10-16 omvat de 136 gevraagde objecten: 99 gebieden, 12 historische paden en wandelroutes zonder geometrie en 25 reeds geometriseerde OSM-paden. De bronvermeldingen lopen van 1602 tot 2026. De 25 bestaande lijngeometrieën zijn exact behouden. De primaire OSM-API levert 17 aanvullende geometriekandidaten: vier punten en acht polygonen voor twaalf gebiedsnamen, plus vijf volledige routerelaties. Voor 94 objecten blijft de eigen geometrie leeg. Alle numerieke positionele nauwkeurigheden blijven onbekend; zij zijn niet afgeleid uit coördinaatdecimalen, topologische geldigheid of kaartschaal. Deze onderzoekslevering is nog niet in de levende database geïmporteerd; de bestaande stand van 182 objecten, 299 vermeldingen en 71 geometrieën blijft dus gelden.</w:t>
+      </w:r>
+    </w:p>
+    <w:p>
+      <w:pPr>
+        <w:pStyle w:val="BodyText"/>
+      </w:pPr>
+      <w:r>
+        <w:t xml:space="preserve">Voor 1712 zijn de originele kaartbladen Schevelinge en Waelsdorp uit TU Delft OAS 726 en de geografisch geplaatste Kruikius-rasterdienst van Hoogheemraadschap Delfland geraadpleegd. Acht gedrukte naamposities zijn als afzonderlijke kaartankers vastgelegd; zij gelden niet als terreinlocaties, gebiedsgrenzen of kavelkoppelingen. De oorspronkelijke studie van Boerboom is als PDF beschikbaar via</w:t>
+      </w:r>
+      <w:r>
+        <w:t xml:space="preserve"> </w:t>
+      </w:r>
+      <w:hyperlink r:id="rId85">
+        <w:r>
+          <w:rPr>
+            <w:rStyle w:val="Hyperlink"/>
+          </w:rPr>
+          <w:t xml:space="preserve">https://edepot.wur.nl/393293</w:t>
+        </w:r>
+      </w:hyperlink>
+      <w:r>
+        <w:t xml:space="preserve">. De geannoteerde wandelingkaart uit 1957 en de volledige recreatiekaart uit 2007 zijn in de geraadpleegde lokale bronnen en gerichte Zotero-cataloguszoekacties niet aangetroffen. Het eerder lokaal als Neefjes-PDF opgeslagen bestand blijkt HTML. De rapporttekst is wel uit de bestaande Zotero-index gelezen; paragraaf 8.2 bevestigt dat onder meer Lijnen.shp en Zones.shp destijds zijn opgeleverd. Deze bestaande GIS-levering is nog niet verkregen en wordt niet als ontbrekende informatie bij de bron aangemerkt.</w:t>
+      </w:r>
+    </w:p>
+    <w:p>
+      <w:pPr>
+        <w:pStyle w:val="BodyText"/>
+      </w:pPr>
+      <w:r>
+        <w:t xml:space="preserve">De vijf eerder onderbouwde toedelingen Helmduinen M15/M16, Kikkervalleien M13/M13s/M14, Libellenvallei M17b, Prinsenduin M17a en Ruygenhoek M32 blijven behouden. Vinkenhoek blijft gekoppeld aan M71. VWG-M onderbouwt daarnaast Hertenkamp M105 en Harstenhoek M42 als huidige terreincontext; dat bewijst geen historische of volledige naamgrens. Het gelijknamige OSM-campingveld Hertenkamp is verworpen. De vijf OSM-routerelaties blijven kandidaten met eigen bronversie: de Strandroute meet 4,54 km en komt niet overeen met de als aangepast gepubliceerde Dunea-route van 3,8 km; ook bij Reeënroute en Tapuit–Kievitsduin zijn afstands- of tagverschillen vastgelegd. De levering verandert geen bestaande naamvariant of objectidentiteit en omvat geen uitvoeringsgeometrie van beheermaatregelen.</w:t>
+      </w:r>
+    </w:p>
+    <w:p>
+      <w:pPr>
+        <w:pStyle w:val="BodyText"/>
+      </w:pPr>
+      <w:r>
+        <w:t xml:space="preserve">Vervolgkaartonderzoek, 16 oktober 2026, versie 2. De verbeterlevering meijendel_databasekwaliteit_2026-10-16_v2 bevat dezelfde 136 bestaande object-ID’s en 23 aanvullende bewijsregels. De volledige oorspronkelijke Neefjes-publicatie is nu verkregen via de actuele download</w:t>
+      </w:r>
+      <w:r>
+        <w:t xml:space="preserve"> </w:t>
+      </w:r>
+      <w:hyperlink r:id="rId86">
+        <w:r>
+          <w:rPr>
+            <w:rStyle w:val="Hyperlink"/>
+          </w:rPr>
+          <w:t xml:space="preserve">https://pas.ecologischeautoriteit.nl/files/ea/5004/011152-5004-cultuursporen-in-het-duin.pdf</w:t>
+        </w:r>
+      </w:hyperlink>
+      <w:r>
+        <w:t xml:space="preserve">: 76 PDF-pagina’s, met de drie kaartbijlagen op pagina’s 74–76. De kopie op Duinen en Mensen telt 73 pagina’s en mist die bijlagen. De oorspronkelijke vegetatiekaarten uit 1955 zijn beschikbaar in het proefschrift van Boerboom uit 1960 (</w:t>
+      </w:r>
+      <w:hyperlink r:id="rId87">
+        <w:r>
+          <w:rPr>
+            <w:rStyle w:val="Hyperlink"/>
+          </w:rPr>
+          <w:t xml:space="preserve">https://edepot.wur.nl/183358</w:t>
+        </w:r>
+      </w:hyperlink>
+      <w:r>
+        <w:t xml:space="preserve">, laatste acht scanpagina’s). H+N+S publiceert tevens de oorspronkelijke masterplankaarten bij het project uit 2003–2004. Deze kaarten zijn geraadpleegd en versiegebonden bronbewijs is aan de onderzoekslevering toegevoegd. Pomp Kruispunt op de kaart uit 1955 is niet automatisch een grens of eerdere datering van het gelijknamige veldnaamgebied.</w:t>
+      </w:r>
+    </w:p>
+    <w:p>
+      <w:pPr>
+        <w:pStyle w:val="BodyText"/>
+      </w:pPr>
+      <w:r>
+        <w:t xml:space="preserve">De officiële Dunea-nummerpaaltjeskaart Kijfhoek en Bierlap benoemt Bunkerpad en Klippad rechtstreeks. De documentmetadata noemen aanmaak op 1 april 2020 en wijziging op 22 februari 2021; een gedrukt editiejaar ontbreekt. De kaart benoemt Waterwilgenslag bij deze paden, terwijl de historische proefstudie Wassenaarse Slag als derde zijde van de driehoek noemt. Gelijkheid van de volledige historische proefdriehoek is daarmee niet bewezen. Beide padrecords hebben aanvullend kaartbewijs, maar krijgen geen ongecontroleerde lijngeometrie. Voor Wilhelminapaadje blijft bovendien een bronverschil bestaan: Neefjes noemt villa–zeereep, een primaire ingezonden correctie van voormalig bewoonster Sonja Alleblas uit 2013 noemt de garage richting Meijendel. Pannenduin op de Dunea-kaart is niet gelijkgesteld aan Paardenduin. De geannoteerde kaart uit 1957, de volledige recreatiekaart uit 2007, de proefplaatsenkaart uit 1987 en de oorspronkelijke GIS-lagen van Neefjes zijn nog niet verkregen. Dit is een toegangs-/leveringsleemte, geen bewijs dat deze stukken bij de bron niet bestaan.</w:t>
+      </w:r>
+    </w:p>
+    <w:p>
+      <w:pPr>
+        <w:pStyle w:val="BodyText"/>
+      </w:pPr>
+      <w:r>
+        <w:t xml:space="preserve">OSM-vervolgcontrole op 16 oktober 2026 omvat alle 60 bronsegmenten van de 25 bestaande pad- en wegnamen. Tien way-objecten hebben een wijzigingsdatum na de exportdatum 3 april 2026; bij zes bronlijnen zijn nadien knikpunten gewijzigd. Voor zes segmenten, behorend bij zes naamobjecten, is bij bemonstering van de oude lijn met maximaal vijf meter tussenafstand een afstand boven één meter tot de actuele bronlijn gemeten. Die drempel is een signaleringsregel, geen positionele nauwkeurigheid of bewezen verplaatsing van het echte pad. Bij drie Harstenhoekweg-segmenten verschillen bestaande exportkenmerken. Alle 25 databasegeometrieën blijven exact behouden. De levering omvat 17 eerder gevonden geometriekandidaten en acht afzonderlijke kaartnaamankers; deze ronde voegt nul voldoende gecontroleerde wereldgeometrieën toe, zodat voor 94 van de 136 objecten de eigen geometrie leeg blijft. De tijdelijke import en vergelijking met de levende object-ID’s, namen en geometrieën zijn in MySQL getest, zonder blijvende tabelwijzigingen. De levende inventaris blijft 182 objecten, 299 vermeldingen en 71 geometrieën. Markdown en Word zijn samen aangevuld; de onderzoekslevering bevat beide versies.</w:t>
+      </w:r>
+    </w:p>
+    <w:p>
+      <w:pPr>
+        <w:pStyle w:val="BodyText"/>
+      </w:pPr>
+      <w:r>
+        <w:t xml:space="preserve">Lokale actualisering van het namenregister en koppelcontrole, 16 oktober 2026. De levende database Meijendel bevat na verwerking van de onderzoekslevering 182 naamobjecten, 319 vermeldingen en 21 bronnen. De 299 oorspronkelijke vermeldingen uit 1602–2026 zijn behouden; twintig letterlijke bronvermeldingen zijn toegevoegd. Bij ongedateerde online kaarten is 2026 uitsluitend het raadpleegjaar, geen bewezen vroegste naamdatum, kaarteditiejaar of uitvoeringsjaar. Dertien bronrecords zijn toegevoegd en de bestaande Neefjes-verwijzing is gecorrigeerd naar het volledige oorspronkelijke rapport, zonder een dubbele bronidentiteit te maken. Voor 136 onderzochte objecten is het bewijs aangevuld. De 111 geometrieleemten hebben een nieuwe, concrete beoordeling; de 111 oorspronkelijke beoordelingen zijn als eerdere versie behouden, zodat nameninventaris_beoordeling 222 rijen bevat, waarvan 111 actueel. Alle 71 brongeometrieën, naamidentiteiten, oorspronkelijke bronperioden, bestaande kaveltoedelingen en het oorspronkelijke importmanifest zijn behouden. De verwachte aantallen in dat manifest blijven de oorspronkelijke levering van 14 oktober 2026 beschrijven. De zeventien geometriekandidaten en acht kaartnaamankers zijn niet als bewezen terreinlocaties geïmporteerd.</w:t>
+      </w:r>
+    </w:p>
+    <w:p>
+      <w:pPr>
+        <w:pStyle w:val="BodyText"/>
+      </w:pPr>
+      <w:r>
+        <w:t xml:space="preserve">Na deze databaseactualisering zijn alle 377 naam–kavelrelaties opnieuw berekend tegen de 71 opgeslagen naamgeometrieën en 55 actuele kavelpolygonen uit 2025. Er zijn nul verschillen in de gekoppelde kavels, relatietypen, intersectiedimensies, naamgeometriehashes of gebruikte plotimport. De analyseview behoudt 365 relaties voor 53 kavels. Vervolgens zijn alle 211 maatregel–kavelrelaties voor zestig gekoppelde uitvoeringen getoetst aan de vastgelegde bronbesluiten, naamvarianten en analysescope. De 42 geometrische maatregelrelaties hebben een geldige naamgeometrie–kavelketen; de overige 169 relaties stemmen overeen met hun geregistreerde bron- en gebruikersbesluiten. Er zijn geen onderbouwde koppelafwijkingen gevonden en dus geen relaties toegevoegd of verwijderd. De bronvaste jaarview behoudt 307 rijen. Dit bewijst de geregistreerde scope, niet een nieuwe terreinmeting of exacte werkvoetafdruk per kavel en jaar. Helmduinen M15/M16, Prinsenduin M17a, Libellenvallei M17b en Ruygenhoek M32 blijven onderscheiden. M66 en M91 blijven buiten de standaardanalysescope; de expliciete Voorlinden-koppeling aan M91 blijft als afzonderlijk bronbesluit behouden.</w:t>
+      </w:r>
+    </w:p>
+    <w:p>
+      <w:pPr>
+        <w:pStyle w:val="BodyText"/>
+      </w:pPr>
+      <w:r>
+        <w:t xml:space="preserve">De wijziging is transactioneel beproefd, volledig teruggedraaid en daarna met dezelfde inhoud definitief uitgevoerd. Een beperkte herstelback-up van de acht naamtabellen en volledige voor-/nasnapshots zijn lokaal bewaard. Alle 327 tabel- en viewdefinities en 269 triggerdefinities zijn gelijk gebleven, afgezien van de interne auto-incrementtellers. De databasebrede taxonpoort is vóór en na de wijziging geslaagd: 306 basistabellen, 128 beoordeelde routes en nul fouten. De bestaande maatregel-seedcontrole, brondekking en idempotentietest slagen in hun afzonderlijke proefdatabase. De gegevensbijwerking, controles per relatie en herstelbewijs staan in de afzonderlijke levering meijendel_databasebijwerking_2026-10-16. Er is geen volledige Meijendel.sql-export, Shiny-cachebouw of VPS-publicatie uitgevoerd.</w:t>
+      </w:r>
+    </w:p>
+    <w:p>
+      <w:pPr>
+        <w:pStyle w:val="BodyText"/>
+      </w:pPr>
+      <w:r>
+        <w:t xml:space="preserve">Naamactualisering 17 oktober 2026 — Helmduinen Noord. Ton bevestigt dat deze naam het noordelijke deel van Helmduinen aanduidt. Het aangeleverde natuurherstelvlak ligt binnen dit noordelijke deel, maar omvat niet het gehele noordelijke deel. De precieze ligging en volledige begrenzing van zowel Helmduinen als Helmduinen Noord zijn niet vastgesteld. De historische toedeling Helmduinen M15/M16 blijft eerder bronbewijs voor deelcontext; zij is geen volledige of limitatieve kaveltoedeling van het naamgebied. De planvlakcontext in M13s bewijst evenmin dat Helmduinen Noord of heel Helmduinen uitsluitend in M13s ligt.</w:t>
+      </w:r>
+    </w:p>
+    <w:p>
+      <w:pPr>
+        <w:pStyle w:val="BodyText"/>
+      </w:pPr>
+      <w:r>
+        <w:t xml:space="preserve">In de levende nameninventaris zijn één naamobject Helmduinen Noord (OBJ-E37FA22F23), één bron en twee bronvermeldingen toegevoegd, waaronder de verduidelijking bij Helmduinen (OBJ-F7B480D407). De ontvangst- en bevestigingsdatum is 17 oktober 2026; dit is geen bewezen eerste naamdatum, kaarteditiejaar of uitvoeringsdatum. Beide naamobjecten hebben een actuele beoordeling bronlacune_geometrie. De oudere beoordeling van Helmduinen is als eerdere versie behouden.</w:t>
+      </w:r>
+    </w:p>
+    <w:p>
+      <w:pPr>
+        <w:pStyle w:val="BodyText"/>
+      </w:pPr>
+      <w:r>
+        <w:t xml:space="preserve">De stand op 17 oktober 2026 is 183 naamobjecten, 321 vermeldingen uit de oorspronkelijke bronperiode 1602–2026 en de nieuwe bevestiging van 17 oktober 2026, 22 bronnen en 224 beoordelingen, waarvan 112 actueel. Alle 71 bestaande naamgeometrieën, 377 naam–kavelrelaties en 365 relaties in v_nameninventaris_plot_actueel zijn ongewijzigd. Het oorspronkelijke importmanifest blijft de levering van 14 oktober 2026 beschrijven. De benaderde natuurherstelcontour is uitsluitend als maatregelplangebied opgenomen en levert geen naamgeometrie voor Helmduinen Noord of Helmduinen. Bronverantwoording: docs/bronnen/namen/helmduinen_noord_20261017/bronverantwoording.json.</w:t>
+      </w:r>
+    </w:p>
+    <w:p>
+      <w:pPr>
+        <w:pStyle w:val="Heading2"/>
+      </w:pPr>
+      <w:bookmarkStart w:id="88" w:name="_c540a83ee65aaec11aa446aec0815d16fd21e21"/>
+      <w:r>
+        <w:t xml:space="preserve">4. Verwachte aanvullingen</w:t>
+      </w:r>
+      <w:bookmarkEnd w:id="88"/>
     </w:p>
     <w:p>
       <w:pPr>
         <w:pStyle w:val="FirstParagraph"/>
       </w:pPr>
       <w:r>
-        <w:t>Geografisch vervolgonderzoek, 16 oktober 2026. De afzonderlijke onderzoekslevering meijendel_geolocaties_2026-10-16 omvat de 136 gevraagde objecten: 99 gebieden, 12 historische paden en wandelroutes zonder geometrie en 25 reeds geometriseerde OSM-paden. De bronvermeldingen lopen van 1602 tot 2026. De 25 bestaande lijngeometrieën zijn exact behouden. De primaire OSM-API levert 17 aanvullende geometriekandidaten: vier punten en acht polygonen voor twaalf gebiedsnamen, plus vijf volledige routerelaties. Voor 94 objecten blijft de eigen geometrie leeg. Alle numerieke positionele nauwkeurigheden blijven onbekend; zij zijn niet afgeleid uit coördinaatdecimalen, topologische geldigheid of kaartschaal. Deze onderzoekslevering is nog niet in de levende database geïmporteerd; de bestaande stand van 182 objecten, 299 vermeldingen en 71 geometrieën blijft dus gelden.</w:t>
-      </w:r>
+        <w:rPr>
+          <w:b/>
+          <w:bCs/>
+        </w:rPr>
+        <w:t xml:space="preserve">Vlindergegevens:</w:t>
+      </w:r>
+      <w:r>
+        <w:t xml:space="preserve"> </w:t>
+      </w:r>
+      <w:r>
+        <w:t xml:space="preserve">De Vlinderstichting verwacht in de week van 28 september 2026 aanvullende meetstructuur te kunnen leveren. Die levering wordt eerst vergeleken met de 82.217 NDFF-dagvlinderrecords en de bestaande routeconstructie.</w:t>
+      </w:r>
+    </w:p>
+    <w:p>
+      <w:pPr>
+        <w:pStyle w:val="BodyText"/>
+      </w:pPr>
+      <w:r>
+        <w:rPr>
+          <w:b/>
+          <w:bCs/>
+        </w:rPr>
+        <w:t xml:space="preserve">Overige meetnetten:</w:t>
+      </w:r>
+      <w:r>
+        <w:t xml:space="preserve"> </w:t>
+      </w:r>
+      <w:r>
+        <w:t xml:space="preserve">de overige aangeschreven bronorganisaties hebben op 25 september 2026 nog niet inhoudelijk gereageerd. Nieuwe leveringen worden niet automatisch geïmporteerd, maar eerst gecontroleerd op dekking, sleutels, nullen, inspanning en overlap.</w:t>
+      </w:r>
+    </w:p>
+    <w:p>
+      <w:pPr>
+        <w:pStyle w:val="BodyText"/>
+      </w:pPr>
+      <w:r>
+        <w:rPr>
+          <w:b/>
+          <w:bCs/>
+        </w:rPr>
+        <w:t xml:space="preserve">Habitatkaart T1:</w:t>
+      </w:r>
+      <w:r>
+        <w:t xml:space="preserve"> </w:t>
+      </w:r>
+      <w:r>
+        <w:t xml:space="preserve">Ingrid de Vries heeft de gevalideerde kaart van Meijendel nog niet en verwacht dat deze mogelijk in december 2026 beschikbaar komt. Zij heeft toegezegd de kaart te delen zodra dat kan; december is een verwachting, geen bevestigde leverdatum. De kaart kan veranderingen in habitat helpen verklaren, maar is zelf geen soortenwaarneming.</w:t>
+      </w:r>
+    </w:p>
+    <w:p>
+      <w:pPr>
+        <w:pStyle w:val="Heading2"/>
+      </w:pPr>
+      <w:bookmarkStart w:id="89" w:name="_422e6271160c2b04a3b59fb5b59cfcc2e3afc55"/>
+      <w:r>
+        <w:t xml:space="preserve">5. Bronnen die niet verder worden uitgewerkt</w:t>
+      </w:r>
+      <w:bookmarkEnd w:id="89"/>
     </w:p>
     <w:p>
       <w:pPr>
         <w:pStyle w:val="FirstParagraph"/>
       </w:pPr>
       <w:r>
-        <w:t>Voor 1712 zijn de originele kaartbladen Schevelinge en Waelsdorp uit TU Delft OAS 726 en de geografisch geplaatste Kruikius-rasterdienst van Hoogheemraadschap Delfland geraadpleegd. Acht gedrukte naamposities zijn als afzonderlijke kaartankers vastgelegd; zij gelden niet als terreinlocaties, gebiedsgrenzen of kavelkoppelingen. De oorspronkelijke studie van Boerboom is als PDF beschikbaar via https://edepot.wur.nl/393293. De geannoteerde wandelingkaart uit 1957 en de volledige recreatiekaart uit 2007 zijn in de geraadpleegde lokale bronnen en gerichte Zotero-cataloguszoekacties niet aangetroffen. Het eerder lokaal als Neefjes-PDF opgeslagen bestand blijkt HTML. De rapporttekst is wel uit de bestaande Zotero-index gelezen; paragraaf 8.2 bevestigt dat onder meer Lijnen.shp en Zones.shp destijds zijn opgeleverd. Deze bestaande GIS-levering is nog niet verkregen en wordt niet als ontbrekende informatie bij de bron aangemerkt.</w:t>
-      </w:r>
+        <w:t xml:space="preserve">Drie eerder gevonden publicaties bleken bij controle geen Meijendelgegevens te bevatten: een macrofaunastudie uit de Drentsche Aa, een voedselwebstudie aan Amerikaanse vogelkers in Zuid-Kennemerland en een studie naar vliegtuiggeluid bij Tjiftjaf. De voedselwebstudie noemt toestemming voor veldwerk in Meijendel, maar de gepubliceerde waarnemingstabel betreft uitsluitend Nationaal Park Zuid-Kennemerland. Zij worden daarom niet als kandidaatbron beschouwd.</w:t>
+      </w:r>
+    </w:p>
+    <w:p>
+      <w:pPr>
+        <w:pStyle w:val="BodyText"/>
+      </w:pPr>
+      <w:r>
+        <w:t xml:space="preserve">Een openbare GBIF-dataset met mondiale bodemorganismen gaf 1.995 ruimtelijke treffers binnen de projectgrens. De oorspronkelijke plaatsaanduiding van al deze monsters is echter Terschelling. Dit is een georeferentiefout en geen Meijendelbron.</w:t>
+      </w:r>
+    </w:p>
+    <w:p>
+      <w:pPr>
+        <w:pStyle w:val="BodyText"/>
+      </w:pPr>
+      <w:r>
+        <w:t xml:space="preserve">Algemene verzamelbronnen zoals Observation.org, iNaturalist en eBird worden ook niet opnieuw als zelfstandige Meijendelbron ingevoerd zolang niet is aangetoond dat zij waarnemingen bevatten die ontbreken in NDFF of in de primaire VWG/SOVON-reeksen. Anders zou dezelfde waarneming vooral nogmaals worden opgeslagen.</w:t>
+      </w:r>
+    </w:p>
+    <w:p>
+      <w:pPr>
+        <w:pStyle w:val="Heading2"/>
+      </w:pPr>
+      <w:bookmarkStart w:id="90" w:name="_b05dec49988a12f7955d21ff17f1c91e4d061eb"/>
+      <w:r>
+        <w:t xml:space="preserve">6. Gebruik van dit register</w:t>
+      </w:r>
+      <w:bookmarkEnd w:id="90"/>
     </w:p>
     <w:p>
       <w:pPr>
         <w:pStyle w:val="FirstParagraph"/>
       </w:pPr>
       <w:r>
-        <w:t>De vijf eerder onderbouwde toedelingen Helmduinen M15/M16, Kikkervalleien M13/M13s/M14, Libellenvallei M17b, Prinsenduin M17a en Ruygenhoek M32 blijven behouden. Vinkenhoek blijft gekoppeld aan M71. VWG-M onderbouwt daarnaast Hertenkamp M105 en Harstenhoek M42 als huidige terreincontext; dat bewijst geen historische of volledige naamgrens. Het gelijknamige OSM-campingveld Hertenkamp is verworpen. De vijf OSM-routerelaties blijven kandidaten met eigen bronversie: de Strandroute meet 4,54 km en komt niet overeen met de als aangepast gepubliceerde Dunea-route van 3,8 km; ook bij Reeënroute en Tapuit–Kievitsduin zijn afstands- of tagverschillen vastgelegd. De levering verandert geen bestaande naamvariant of objectidentiteit en omvat geen uitvoeringsgeometrie van beheermaatregelen.</w:t>
-      </w:r>
+        <w:t xml:space="preserve">Dit document is het beslisoverzicht. Een bron gaat pas naar</w:t>
+      </w:r>
+      <w:r>
+        <w:t xml:space="preserve"> </w:t>
+      </w:r>
+      <w:r>
+        <w:rPr>
+          <w:rStyle w:val="VerbatimChar"/>
+        </w:rPr>
+        <w:t xml:space="preserve">Meijendel</w:t>
+      </w:r>
+      <w:r>
+        <w:t xml:space="preserve"> </w:t>
+      </w:r>
+      <w:r>
+        <w:t xml:space="preserve">wanneer per waarneming vaststaat dat zij in Meijendel is gedaan en de locatie bekend of betrouwbaar herleidbaar is. Is dat niet zo, dan blijft zij kandidaat of context in Meijendel_bronnen.</w:t>
+      </w:r>
+    </w:p>
+    <w:p>
+      <w:pPr>
+        <w:pStyle w:val="BodyText"/>
+      </w:pPr>
+      <w:r>
+        <w:t xml:space="preserve">Bij iedere nieuwe levering worden achtereenvolgens gecontroleerd:</w:t>
+      </w:r>
+    </w:p>
+    <w:p>
+      <w:pPr>
+        <w:pStyle w:val="BodyText"/>
+      </w:pPr>
+      <w:r>
+        <w:t xml:space="preserve">welke waarnemingen en perioden werkelijk nieuw zijn;</w:t>
+      </w:r>
+    </w:p>
+    <w:p>
+      <w:pPr>
+        <w:pStyle w:val="BodyText"/>
+      </w:pPr>
+      <w:r>
+        <w:t xml:space="preserve">of locaties en oorspronkelijke sleutels bruikbaar zijn;</w:t>
+      </w:r>
+    </w:p>
+    <w:p>
+      <w:pPr>
+        <w:pStyle w:val="BodyText"/>
+      </w:pPr>
+      <w:r>
+        <w:t xml:space="preserve">of bezoeken, soortenlijsten en echte nullen aanwezig zijn;</w:t>
+      </w:r>
+    </w:p>
+    <w:p>
+      <w:pPr>
+        <w:pStyle w:val="BodyText"/>
+      </w:pPr>
+      <w:r>
+        <w:t xml:space="preserve">of de bron een bestaande primaire reeks overlapt;</w:t>
+      </w:r>
+    </w:p>
+    <w:p>
+      <w:pPr>
+        <w:pStyle w:val="BodyText"/>
+      </w:pPr>
+      <w:r>
+        <w:t xml:space="preserve">welke analyses daardoor verantwoord mogelijk worden.</w:t>
+      </w:r>
+    </w:p>
+    <w:p>
+      <w:pPr>
+        <w:pStyle w:val="BodyText"/>
+      </w:pPr>
+      <w:r>
+        <w:t xml:space="preserve">Pas daarna volgt een afzonderlijk importbesluit.</w:t>
+      </w:r>
+    </w:p>
+    <w:p>
+      <w:pPr>
+        <w:pStyle w:val="Heading2"/>
+      </w:pPr>
+      <w:bookmarkStart w:id="91" w:name="_67781990bcb7d7d43cc312a7ef48f37a1f83265"/>
+      <w:r>
+        <w:t xml:space="preserve">7. Actieplan</w:t>
+      </w:r>
+      <w:bookmarkEnd w:id="91"/>
     </w:p>
     <w:p>
       <w:pPr>
         <w:pStyle w:val="FirstParagraph"/>
       </w:pPr>
       <w:r>
-        <w:t>Vervolgkaartonderzoek, 16 oktober 2026, versie 2. De verbeterlevering meijendel_databasekwaliteit_2026-10-16_v2 bevat dezelfde 136 bestaande object-ID’s en 23 aanvullende bewijsregels. De volledige oorspronkelijke Neefjes-publicatie is nu verkregen via de actuele download https://pas.ecologischeautoriteit.nl/files/ea/5004/011152-5004-cultuursporen-in-het-duin.pdf: 76 PDF-pagina’s, met de drie kaartbijlagen op pagina’s 74–76. De kopie op Duinen en Mensen telt 73 pagina’s en mist die bijlagen. De oorspronkelijke vegetatiekaarten uit 1955 zijn beschikbaar in het proefschrift van Boerboom uit 1960 (https://edepot.wur.nl/183358, laatste acht scanpagina’s). H+N+S publiceert tevens de oorspronkelijke masterplankaarten bij het project uit 2003–2004. Deze kaarten zijn geraadpleegd en versiegebonden bronbewijs is aan de onderzoekslevering toegevoegd. Pomp Kruispunt op de kaart uit 1955 is niet automatisch een grens of eerdere datering van het gelijknamige veldnaamgebied.</w:t>
-      </w:r>
+        <w:t xml:space="preserve">Het doel is niet zoveel mogelijk regels importeren, maar per bron de kortste route naar betrouwbare, niet-dubbele en geografisch toegelaten gegevens te volgen. De ruwe bestanden blijven onveranderd bewaard;</w:t>
+      </w:r>
+      <w:r>
+        <w:t xml:space="preserve"> </w:t>
+      </w:r>
+      <w:r>
+        <w:rPr>
+          <w:rStyle w:val="VerbatimChar"/>
+        </w:rPr>
+        <w:t xml:space="preserve">Meijendel</w:t>
+      </w:r>
+      <w:r>
+        <w:t xml:space="preserve"> </w:t>
+      </w:r>
+      <w:r>
+        <w:t xml:space="preserve">bevat alleen waarnemingen die aan de ruimtelijke toelatingsregel voldoen.</w:t>
+      </w:r>
+    </w:p>
+    <w:p>
+      <w:pPr>
+        <w:pStyle w:val="Heading3"/>
+      </w:pPr>
+      <w:bookmarkStart w:id="92" w:name="_d7f889e2150e602eaeb242f489896c9b52af547"/>
+      <w:r>
+        <w:t xml:space="preserve">Fase 1 — openbare, direct toetsbare bronnen</w:t>
+      </w:r>
+      <w:bookmarkEnd w:id="92"/>
     </w:p>
     <w:p>
       <w:pPr>
         <w:pStyle w:val="FirstParagraph"/>
       </w:pPr>
       <w:r>
-        <w:t>De officiële Dunea-nummerpaaltjeskaart Kijfhoek en Bierlap benoemt Bunkerpad en Klippad rechtstreeks. De documentmetadata noemen aanmaak op 1 april 2020 en wijziging op 22 februari 2021; een gedrukt editiejaar ontbreekt. De kaart benoemt Waterwilgenslag bij deze paden, terwijl de historische proefstudie Wassenaarse Slag als derde zijde van de driehoek noemt. Gelijkheid van de volledige historische proefdriehoek is daarmee niet bewezen. Beide padrecords hebben aanvullend kaartbewijs, maar krijgen geen ongecontroleerde lijngeometrie. Voor Wilhelminapaadje blijft bovendien een bronverschil bestaan: Neefjes noemt villa–zeereep, een primaire ingezonden correctie van voormalig bewoonster Sonja Alleblas uit 2013 noemt de garage richting Meijendel. Pannenduin op de Dunea-kaart is niet gelijkgesteld aan Paardenduin. De geannoteerde kaart uit 1957, de volledige recreatiekaart uit 2007, de proefplaatsenkaart uit 1987 en de oorspronkelijke GIS-lagen van Neefjes zijn nog niet verkregen. Dit is een toegangs-/leveringsleemte, geen bewijs dat deze stukken bij de bron niet bestaan.</w:t>
-      </w:r>
+        <w:rPr>
+          <w:b/>
+          <w:bCs/>
+        </w:rPr>
+        <w:t xml:space="preserve">Status: uitgevoerd op 26 september 2026.</w:t>
+      </w:r>
+      <w:r>
+        <w:t xml:space="preserve"> </w:t>
+      </w:r>
+      <w:r>
+        <w:t xml:space="preserve">STOWA en ENDURE zijn na locatie-, sleutel-, rechten- en eenheidscontrole opgenomen. ENDURE bevat veertien complete aanwezigheids-afwezigheidsmatrices en één event zonder resultatenmatrix. STOWA bevat uitsluitend positieve resultaten; de vier typen meeteenheid worden niet samengevoegd.</w:t>
+      </w:r>
+    </w:p>
+    <w:p>
+      <w:pPr>
+        <w:pStyle w:val="BodyText"/>
+      </w:pPr>
+      <w:r>
+        <w:rPr>
+          <w:b/>
+          <w:bCs/>
+        </w:rPr>
+        <w:t xml:space="preserve">Museumreeksen: uitgevoerd.</w:t>
+      </w:r>
+      <w:r>
+        <w:t xml:space="preserve"> </w:t>
+      </w:r>
+      <w:r>
+        <w:t xml:space="preserve">De volledige openbare Darwin Core-archieven zijn geprofileerd. Alleen gedateerde, unieke records binnen het basisgebied én met een expliciete Meijendel- of deelgebiednaam op het etiket zijn opgenomen: 4.748 NMR-vlinders en -motten, 1.881 Naturalis Botany-specimens en 869 Naturalis-kevers.</w:t>
+      </w:r>
+      <w:r>
+        <w:t xml:space="preserve"> </w:t>
+      </w:r>
+      <w:r>
+        <w:rPr>
+          <w:rStyle w:val="VerbatimChar"/>
+        </w:rPr>
+        <w:t xml:space="preserve">occurrenceID</w:t>
+      </w:r>
+      <w:r>
+        <w:t xml:space="preserve">, etiketplaats, oorspronkelijke en voor analyse genormaliseerde taxonnaam, datum of datuminterval, coördinaten, onzekerheid, licentie, DOI en bronmetadata zijn behouden. Ruimtelijke treffers zonder expliciet Meijendel-etiket en expliciete Meijendel-records zonder datum zijn niet toegelaten.</w:t>
+      </w:r>
+    </w:p>
+    <w:p>
+      <w:pPr>
+        <w:pStyle w:val="BodyText"/>
+      </w:pPr>
+      <w:r>
+        <w:rPr>
+          <w:b/>
+          <w:bCs/>
+        </w:rPr>
+        <w:t xml:space="preserve">Landelijke Vegetatie Databank: uitgevoerd voor de reproduceerbare bronversie 1.6.</w:t>
+      </w:r>
+      <w:r>
+        <w:t xml:space="preserve"> </w:t>
+      </w:r>
+      <w:r>
+        <w:t xml:space="preserve">Van 5.195 opnamen en 119.006 taxonregels zijn 3.437 opnamen en 81.310 taxonresultaten uit 1959–2015 met maximaal 50 meter locatie-onzekerheid toegelaten. De PQ-integratie heeft 644 volledige bronopnamen met 16.627 resultaten uit 1981–2015 naar de PQ-tabellen verplaatst, met vermoedelijke koppelingen en zonder zelfstandig meetellen. De overige 2.793 opnamen met 64.683 resultaten blijven in de externe bronlaag. De bestaande analyse-ingang ontsluit beide opslagplaatsen zonder fysieke kopieën. Mogelijke NDFF-overlap blijft zichtbaar, maar wordt vanwege de NDFF-onzekerheidspolygonen niet automatisch als dubbel verwijderd. De duinvalleireeks kan zonder georeferentie niet op opnameniveau worden gekoppeld en blijft afzonderlijk in</w:t>
+      </w:r>
+      <w:r>
+        <w:t xml:space="preserve"> </w:t>
+      </w:r>
+      <w:r>
+        <w:rPr>
+          <w:rStyle w:val="VerbatimChar"/>
+        </w:rPr>
+        <w:t xml:space="preserve">Meijendel_bronnen</w:t>
+      </w:r>
+      <w:r>
+        <w:t xml:space="preserve">.</w:t>
+      </w:r>
+    </w:p>
+    <w:p>
+      <w:pPr>
+        <w:pStyle w:val="Heading3"/>
+      </w:pPr>
+      <w:bookmarkStart w:id="93" w:name="_a67120beb48c3916f8a53c623f303ce8b8a6005"/>
+      <w:r>
+        <w:t xml:space="preserve">Fase 2 — reeksen met grote historische of trendwaarde</w:t>
+      </w:r>
+      <w:bookmarkEnd w:id="93"/>
     </w:p>
     <w:p>
       <w:pPr>
         <w:pStyle w:val="FirstParagraph"/>
       </w:pPr>
       <w:r>
-        <w:t>OSM-vervolgcontrole op 16 oktober 2026 omvat alle 60 bronsegmenten van de 25 bestaande pad- en wegnamen. Tien way-objecten hebben een wijzigingsdatum na de exportdatum 3 april 2026; bij zes bronlijnen zijn nadien knikpunten gewijzigd. Voor zes segmenten, behorend bij zes naamobjecten, is bij bemonstering van de oude lijn met maximaal vijf meter tussenafstand een afstand boven één meter tot de actuele bronlijn gemeten. Die drempel is een signaleringsregel, geen positionele nauwkeurigheid of bewezen verplaatsing van het echte pad. Bij drie Harstenhoekweg-segmenten verschillen bestaande exportkenmerken. Alle 25 databasegeometrieën blijven exact behouden. De levering omvat 17 eerder gevonden geometriekandidaten en acht afzonderlijke kaartnaamankers; deze ronde voegt nul voldoende gecontroleerde wereldgeometrieën toe, zodat voor 94 van de 136 objecten de eigen geometrie leeg blijft. De tijdelijke import en vergelijking met de levende object-ID’s, namen en geometrieën zijn in MySQL getest, zonder blijvende tabelwijzigingen. De levende inventaris blijft 182 objecten, 299 vermeldingen en 71 geometrieën. Markdown en Word zijn samen aangevuld; de onderzoekslevering bevat beide versies.</w:t>
-      </w:r>
+        <w:rPr>
+          <w:b/>
+          <w:bCs/>
+        </w:rPr>
+        <w:t xml:space="preserve">Ringgegevens: onderzocht, niet toegelaten.</w:t>
+      </w:r>
+      <w:r>
+        <w:t xml:space="preserve"> </w:t>
+      </w:r>
+      <w:r>
+        <w:t xml:space="preserve">De locatiecode</w:t>
+      </w:r>
+      <w:r>
+        <w:t xml:space="preserve"> </w:t>
+      </w:r>
+      <w:r>
+        <w:rPr>
+          <w:rStyle w:val="VerbatimChar"/>
+        </w:rPr>
+        <w:t xml:space="preserve">NL19</w:t>
+      </w:r>
+      <w:r>
+        <w:t xml:space="preserve"> </w:t>
+      </w:r>
+      <w:r>
+        <w:t xml:space="preserve">in de GBIF-biometrie betekent provincie Zuid-Holland en niet VRS Meijendel. Trektellen-site 403 bevat wel VRS-Meijendelrapporten en inspanning, maar er is geen recordsleutel naar de 100.417 ruimtelijke GBIF-treffers. Zij blijven kandidaat en worden niet met de vogelreeks vermengd.</w:t>
+      </w:r>
+    </w:p>
+    <w:p>
+      <w:pPr>
+        <w:pStyle w:val="BodyText"/>
+      </w:pPr>
+      <w:r>
+        <w:rPr>
+          <w:b/>
+          <w:bCs/>
+        </w:rPr>
+        <w:t xml:space="preserve">Bijenmonitoring: bezoekstructuur gereconstrueerd.</w:t>
+      </w:r>
+      <w:r>
+        <w:t xml:space="preserve"> </w:t>
+      </w:r>
+      <w:r>
+        <w:t xml:space="preserve">Alle achttien proefvlakcodes, vier deelgebieden en 162 bezoeken uit 2019, 2021 en 2023 zijn in</w:t>
+      </w:r>
+      <w:r>
+        <w:t xml:space="preserve"> </w:t>
+      </w:r>
+      <w:r>
+        <w:rPr>
+          <w:rStyle w:val="VerbatimChar"/>
+        </w:rPr>
+        <w:t xml:space="preserve">Meijendel_bronnen</w:t>
+      </w:r>
+      <w:r>
+        <w:t xml:space="preserve"> </w:t>
+      </w:r>
+      <w:r>
+        <w:t xml:space="preserve">vastgelegd. De rapporten tonen de grenzen alleen als figuur. De reeks verhuist pas naar</w:t>
+      </w:r>
+      <w:r>
+        <w:t xml:space="preserve"> </w:t>
+      </w:r>
+      <w:r>
+        <w:rPr>
+          <w:rStyle w:val="VerbatimChar"/>
+        </w:rPr>
+        <w:t xml:space="preserve">Meijendel</w:t>
+      </w:r>
+      <w:r>
+        <w:t xml:space="preserve"> </w:t>
+      </w:r>
+      <w:r>
+        <w:t xml:space="preserve">nadat die grenzen betrouwbaar zijn gegeorefereerd en de soortenmatrices foutgecontroleerd zijn gedigitaliseerd.</w:t>
+      </w:r>
+    </w:p>
+    <w:p>
+      <w:pPr>
+        <w:pStyle w:val="BodyText"/>
+      </w:pPr>
+      <w:r>
+        <w:rPr>
+          <w:b/>
+          <w:bCs/>
+        </w:rPr>
+        <w:t xml:space="preserve">Aquatische reeks: methode en locatiestructuur gereconstrueerd.</w:t>
+      </w:r>
+      <w:r>
+        <w:t xml:space="preserve"> </w:t>
+      </w:r>
+      <w:r>
+        <w:t xml:space="preserve">De zeven monsterpuntcodes, vijf benoemde wateren en negentien standaard- of afwijkende methodeperioden uit 1974–1975 staan in</w:t>
+      </w:r>
+      <w:r>
+        <w:t xml:space="preserve"> </w:t>
+      </w:r>
+      <w:r>
+        <w:rPr>
+          <w:rStyle w:val="VerbatimChar"/>
+        </w:rPr>
+        <w:t xml:space="preserve">Meijendel_bronnen</w:t>
+      </w:r>
+      <w:r>
+        <w:t xml:space="preserve">. Een betrouwbare digitale watercodekaart en een gecontroleerde soortenmatrix ontbreken nog. Daarom zijn geen waarnemingsregels naar</w:t>
+      </w:r>
+      <w:r>
+        <w:t xml:space="preserve"> </w:t>
+      </w:r>
+      <w:r>
+        <w:rPr>
+          <w:rStyle w:val="VerbatimChar"/>
+        </w:rPr>
+        <w:t xml:space="preserve">Meijendel</w:t>
+      </w:r>
+      <w:r>
+        <w:t xml:space="preserve"> </w:t>
+      </w:r>
+      <w:r>
+        <w:t xml:space="preserve">gepromoveerd. De aanvullende waterwantsen, waterkevers, libellen, neuropteren en zweefvliegen blijven kandidaat totdat datum en locatie per waarneming vaststaan.</w:t>
+      </w:r>
+    </w:p>
+    <w:p>
+      <w:pPr>
+        <w:pStyle w:val="BodyText"/>
+      </w:pPr>
+      <w:r>
+        <w:rPr>
+          <w:b/>
+          <w:bCs/>
+        </w:rPr>
+        <w:t xml:space="preserve">Droge-duinvegetatieplots: onderzocht, nog niet lokaliseerbaar per plot.</w:t>
+      </w:r>
+      <w:r>
+        <w:t xml:space="preserve"> </w:t>
+      </w:r>
+      <w:r>
+        <w:t xml:space="preserve">De kaart in het proefschrift is visueel gecontroleerd en toont 41 punten in Helmduinen, Kijfhoek en Bierlap, maar geen koppelbare plotcodes. Ook de LVD-selectie levert geen betrouwbare vertaling. De reeks blijft kandidaat totdat de oorspronkelijke plotkaart en opnametabellen zijn gevonden.</w:t>
+      </w:r>
+    </w:p>
+    <w:p>
+      <w:pPr>
+        <w:pStyle w:val="Heading3"/>
+      </w:pPr>
+      <w:bookmarkStart w:id="94" w:name="_c96f79f2027e81b7ab280f9bf69df5af8bdf464"/>
+      <w:r>
+        <w:t xml:space="preserve">Fase 3 — reeds bekende bronhouders en contextdatasets</w:t>
+      </w:r>
+      <w:bookmarkEnd w:id="94"/>
     </w:p>
     <w:p>
       <w:pPr>
         <w:pStyle w:val="FirstParagraph"/>
       </w:pPr>
       <w:r>
-        <w:t>Lokale actualisering van het namenregister en koppelcontrole, 16 oktober 2026. De levende database Meijendel bevat na verwerking van de onderzoekslevering 182 naamobjecten, 319 vermeldingen en 21 bronnen. De 299 oorspronkelijke vermeldingen uit 1602–2026 zijn behouden; twintig letterlijke bronvermeldingen zijn toegevoegd. Bij ongedateerde online kaarten is 2026 uitsluitend het raadpleegjaar, geen bewezen vroegste naamdatum, kaarteditiejaar of uitvoeringsjaar. Dertien bronrecords zijn toegevoegd en de bestaande Neefjes-verwijzing is gecorrigeerd naar het volledige oorspronkelijke rapport, zonder een dubbele bronidentiteit te maken. Voor 136 onderzochte objecten is het bewijs aangevuld. De 111 geometrieleemten hebben een nieuwe, concrete beoordeling; de 111 oorspronkelijke beoordelingen zijn als eerdere versie behouden, zodat nameninventaris_beoordeling 222 rijen bevat, waarvan 111 actueel. Alle 71 brongeometrieën, naamidentiteiten, oorspronkelijke bronperioden, bestaande kaveltoedelingen en het oorspronkelijke importmanifest zijn behouden. De verwachte aantallen in dat manifest blijven de oorspronkelijke levering van 14 oktober 2026 beschrijven. De zeventien geometriekandidaten en acht kaartnaamankers zijn niet als bewezen terreinlocaties geïmporteerd.</w:t>
-      </w:r>
+        <w:rPr>
+          <w:b/>
+          <w:bCs/>
+        </w:rPr>
+        <w:t xml:space="preserve">Ontvangen meetnetleveringen vergelijken, niet blind importeren.</w:t>
+      </w:r>
+      <w:r>
+        <w:t xml:space="preserve"> </w:t>
+      </w:r>
+      <w:r>
+        <w:t xml:space="preserve">De verwachte gegevens van De Vlinderstichting en eventuele latere leveringen worden eerst vergeleken met NDFF op populatie, bezoeken, sleutels, nullen en overlap. Alleen aantoonbare aanvullingen of betere primaire versies vervangen de voorlopige reconstructies.</w:t>
+      </w:r>
+    </w:p>
+    <w:p>
+      <w:pPr>
+        <w:pStyle w:val="BodyText"/>
+      </w:pPr>
+      <w:r>
+        <w:rPr>
+          <w:b/>
+          <w:bCs/>
+        </w:rPr>
+        <w:t xml:space="preserve">Contextdatasets alleen promoveren na georeferentie.</w:t>
+      </w:r>
+      <w:r>
+        <w:t xml:space="preserve"> </w:t>
+      </w:r>
+      <w:r>
+        <w:t xml:space="preserve">Duinvalleiplots, jachtspinnen, TERRA-Dunes en andere genummerde locaties blijven in</w:t>
+      </w:r>
+      <w:r>
+        <w:t xml:space="preserve"> </w:t>
+      </w:r>
+      <w:r>
+        <w:rPr>
+          <w:rStyle w:val="VerbatimChar"/>
+        </w:rPr>
+        <w:t xml:space="preserve">Meijendel_bronnen</w:t>
+      </w:r>
+      <w:r>
+        <w:t xml:space="preserve"> </w:t>
+      </w:r>
+      <w:r>
+        <w:t xml:space="preserve">totdat per waarneming een betrouwbare ligging in Meijendel is vastgesteld.</w:t>
+      </w:r>
+    </w:p>
+    <w:p>
+      <w:pPr>
+        <w:pStyle w:val="BodyText"/>
+      </w:pPr>
+      <w:r>
+        <w:rPr>
+          <w:b/>
+          <w:bCs/>
+        </w:rPr>
+        <w:t xml:space="preserve">Verklarende lagen afzonderlijk opbouwen.</w:t>
+      </w:r>
+      <w:r>
+        <w:t xml:space="preserve"> </w:t>
+      </w:r>
+      <w:r>
+        <w:t xml:space="preserve">Voeg de Habitatkaart T1, de landbedekking van 2001 en 2022 en eventueel gevonden remote-sensingrasters toe als omgevingslagen. Zij mogen ecologische veranderingen helpen verklaren, maar worden niet als soortenwaarnemingen behandeld.</w:t>
+      </w:r>
+    </w:p>
+    <w:p>
+      <w:pPr>
+        <w:pStyle w:val="Heading3"/>
+      </w:pPr>
+      <w:bookmarkStart w:id="95" w:name="_d490f73b19661b8ff0d346b94e527be91e989c7"/>
+      <w:r>
+        <w:t xml:space="preserve">Vaste werkwijze per bron</w:t>
+      </w:r>
+      <w:bookmarkEnd w:id="95"/>
     </w:p>
     <w:p>
       <w:pPr>
         <w:pStyle w:val="FirstParagraph"/>
       </w:pPr>
       <w:r>
-        <w:t>Na deze databaseactualisering zijn alle 377 naam–kavelrelaties opnieuw berekend tegen de 71 opgeslagen naamgeometrieën en 55 actuele kavelpolygonen uit 2025. Er zijn nul verschillen in de gekoppelde kavels, relatietypen, intersectiedimensies, naamgeometriehashes of gebruikte plotimport. De analyseview behoudt 365 relaties voor 53 kavels. Vervolgens zijn alle 211 maatregel–kavelrelaties voor zestig gekoppelde uitvoeringen getoetst aan de vastgelegde bronbesluiten, naamvarianten en analysescope. De 42 geometrische maatregelrelaties hebben een geldige naamgeometrie–kavelketen; de overige 169 relaties stemmen overeen met hun geregistreerde bron- en gebruikersbesluiten. Er zijn geen onderbouwde koppelafwijkingen gevonden en dus geen relaties toegevoegd of verwijderd. De bronvaste jaarview behoudt 307 rijen. Dit bewijst de geregistreerde scope, niet een nieuwe terreinmeting of exacte werkvoetafdruk per kavel en jaar. Helmduinen M15/M16, Prinsenduin M17a, Libellenvallei M17b en Ruygenhoek M32 blijven onderscheiden. M66 en M91 blijven buiten de standaardanalysescope; de expliciete Voorlinden-koppeling aan M91 blijft als afzonderlijk bronbesluit behouden.</w:t>
-      </w:r>
+        <w:t xml:space="preserve">Iedere bron doorloopt dezelfde vijf stappen: een onveranderde bronkopie met checksum bewaren; gegevenswoordenboek en rechten vastleggen; locaties en analyseeenheid controleren; overlap en dubbelen bepalen; pas daarna een reproduceerbare import en analyseview maken. Na iedere statuswijziging worden dit register en de Wordversie meteen bijgewerkt.</w:t>
+      </w:r>
+    </w:p>
+    <w:p>
+      <w:pPr>
+        <w:pStyle w:val="Heading3"/>
+      </w:pPr>
+      <w:bookmarkStart w:id="96" w:name="_1e50ec235a164d1e043cda4cec7be66fb154af3"/>
+      <w:r>
+        <w:t xml:space="preserve">Dekking van de internetcontrole</w:t>
+      </w:r>
+      <w:bookmarkEnd w:id="96"/>
     </w:p>
     <w:p>
       <w:pPr>
         <w:pStyle w:val="FirstParagraph"/>
       </w:pPr>
       <w:r>
-        <w:t>De wijziging is transactioneel beproefd, volledig teruggedraaid en daarna met dezelfde inhoud definitief uitgevoerd. Een beperkte herstelback-up van de acht naamtabellen en volledige voor-/nasnapshots zijn lokaal bewaard. Alle 327 tabel- en viewdefinities en 269 triggerdefinities zijn gelijk gebleven, afgezien van de interne auto-incrementtellers. De databasebrede taxonpoort is vóór en na de wijziging geslaagd: 306 basistabellen, 128 beoordeelde routes en nul fouten. De bestaande maatregel-seedcontrole, brondekking en idempotentietest slagen in hun afzonderlijke proefdatabase. De gegevensbijwerking, controles per relatie en herstelbewijs staan in de afzonderlijke levering meijendel_databasebijwerking_2026-10-16. Er is geen volledige Meijendel.sql-export, Shiny-cachebouw of VPS-publicatie uitgevoerd.</w:t>
-      </w:r>
-    </w:p>
-    <w:p>
-      <w:pPr>
-        <w:pStyle w:val="BodyText"/>
-      </w:pPr>
-      <w:r>
-        <w:t>Naamactualisering 17 oktober 2026 — Helmduinen Noord. Ton bevestigt dat deze naam het noordelijke deel van Helmduinen aanduidt. Het aangeleverde natuurherstelvlak ligt binnen dit noordelijke deel, maar omvat niet het gehele noordelijke deel. De precieze ligging en volledige begrenzing van zowel Helmduinen als Helmduinen Noord zijn niet vastgesteld. De historische toedeling Helmduinen M15/M16 blijft eerder bronbewijs voor deelcontext; zij is geen volledige of limitatieve kaveltoedeling van het naamgebied. De planvlakcontext in M13s bewijst evenmin dat Helmduinen Noord of heel Helmduinen uitsluitend in M13s ligt.</w:t>
-      </w:r>
-    </w:p>
-    <w:p>
-      <w:pPr>
-        <w:pStyle w:val="BodyText"/>
-      </w:pPr>
-      <w:r>
-        <w:t>In de levende nameninventaris zijn één naamobject Helmduinen Noord (OBJ-E37FA22F23), één bron en twee bronvermeldingen toegevoegd, waaronder de verduidelijking bij Helmduinen (OBJ-F7B480D407). De ontvangst- en bevestigingsdatum is 17 oktober 2026; dit is geen bewezen eerste naamdatum, kaarteditiejaar of uitvoeringsdatum. Beide naamobjecten hebben een actuele beoordeling bronlacune_geometrie. De oudere beoordeling van Helmduinen is als eerdere versie behouden.</w:t>
-      </w:r>
-    </w:p>
-    <w:p>
-      <w:pPr>
-        <w:pStyle w:val="BodyText"/>
-      </w:pPr>
-      <w:r>
-        <w:t>De stand op 17 oktober 2026 is 183 naamobjecten, 321 vermeldingen uit de oorspronkelijke bronperiode 1602–2026 en de nieuwe bevestiging van 17 oktober 2026, 22 bronnen en 224 beoordelingen, waarvan 112 actueel. Alle 71 bestaande naamgeometrieën, 377 naam–kavelrelaties en 365 relaties in v_nameninventaris_plot_actueel zijn ongewijzigd. Het oorspronkelijke importmanifest blijft de levering van 14 oktober 2026 beschrijven. De benaderde natuurherstelcontour is uitsluitend als maatregelplangebied opgenomen en levert geen naamgeometrie voor Helmduinen Noord of Helmduinen. Bronverantwoording: docs/bronnen/namen/helmduinen_noord_20261017/bronverantwoording.json.</w:t>
+        <w:t xml:space="preserve">De controle van 26 september 2026 omvatte GBIF, DataCite, Zenodo, Dryad, Figshare, Europe PMC, Naturalis Repository, Wageningen Research e-depot en de repositories van Universiteit Leiden en TU Delft. Algemene aggregators zijn niet als zelfstandige bron opgenomen wanneer zij waarschijnlijk dezelfde waarnemingen als NDFF of primaire collecties bevatten. Een openbare zoekronde kan nooit bewijzen dat geen ongepubliceerde of slecht geïndexeerde bron bestaat; dit register legt daarom ook de zoekdatum en toelatingsreden vast.</w:t>
       </w:r>
     </w:p>
     <w:p>
       <w:pPr>
         <w:pStyle w:val="Heading2"/>
       </w:pPr>
-      <w:bookmarkStart w:id="84" w:name="_8e1aa2a9058c5df66a55f09f3195dc2392072ca"/>
-      <w:r>
-        <w:t xml:space="preserve">4. Verwachte aanvullingen</w:t>
-      </w:r>
-      <w:bookmarkEnd w:id="84"/>
-    </w:p>
-    <w:p>
-      <w:pPr>
-        <w:pStyle w:val="FirstParagraph"/>
-      </w:pPr>
-      <w:r>
-        <w:rPr>
-          <w:b/>
-          <w:bCs/>
-        </w:rPr>
-        <w:t xml:space="preserve">Vlindergegevens:</w:t>
-      </w:r>
-      <w:r>
-        <w:t xml:space="preserve"> </w:t>
-      </w:r>
-      <w:r>
-        <w:t xml:space="preserve">De Vlinderstichting verwacht in de week van 28 september 2026 aanvullende meetstructuur te kunnen leveren. Die levering wordt eerst vergeleken met de 82.217 NDFF-dagvlinderrecords en de bestaande routeconstructie.</w:t>
-      </w:r>
-    </w:p>
-    <w:p>
-      <w:pPr>
-        <w:pStyle w:val="BodyText"/>
-      </w:pPr>
-      <w:r>
-        <w:rPr>
-          <w:b/>
-          <w:bCs/>
-        </w:rPr>
-        <w:t xml:space="preserve">Overige meetnetten:</w:t>
-      </w:r>
-      <w:r>
-        <w:t xml:space="preserve"> </w:t>
-      </w:r>
-      <w:r>
-        <w:t xml:space="preserve">de overige aangeschreven bronorganisaties hebben op 25 september 2026 nog niet inhoudelijk gereageerd. Nieuwe leveringen worden niet automatisch geïmporteerd, maar eerst gecontroleerd op dekking, sleutels, nullen, inspanning en overlap.</w:t>
-      </w:r>
-    </w:p>
-    <w:p>
-      <w:pPr>
-        <w:pStyle w:val="BodyText"/>
-      </w:pPr>
-      <w:r>
-        <w:rPr>
-          <w:b/>
-          <w:bCs/>
-        </w:rPr>
-        <w:t xml:space="preserve">Habitatkaart T1:</w:t>
-      </w:r>
-      <w:r/>
-      <w:r>
-        <w:t xml:space="preserve"> Ingrid de Vries heeft de gevalideerde kaart van Meijendel nog niet en verwacht dat deze mogelijk in december 2026 beschikbaar komt. Zij heeft toegezegd de kaart te delen zodra dat kan; december is een verwachting, geen bevestigde leverdatum. De kaart kan veranderingen in habitat helpen verklaren, maar is zelf geen soortenwaarneming.</w:t>
-      </w:r>
-    </w:p>
-    <w:p>
-      <w:pPr>
-        <w:pStyle w:val="Heading2"/>
-      </w:pPr>
-      <w:bookmarkStart w:id="85" w:name="_bd1d36805349ef5ec39b6efd044fd20b47e23f4"/>
-      <w:r>
-        <w:t xml:space="preserve">5. Bronnen die niet verder worden uitgewerkt</w:t>
-      </w:r>
-      <w:bookmarkEnd w:id="85"/>
-    </w:p>
-    <w:p>
-      <w:pPr>
-        <w:pStyle w:val="FirstParagraph"/>
-      </w:pPr>
-      <w:r>
-        <w:t xml:space="preserve">Drie eerder gevonden publicaties bleken bij controle geen Meijendelgegevens te bevatten: een macrofaunastudie uit de Drentsche Aa, een voedselwebstudie aan Amerikaanse vogelkers in Zuid-Kennemerland en een studie naar vliegtuiggeluid bij Tjiftjaf. De voedselwebstudie noemt toestemming voor veldwerk in Meijendel, maar de gepubliceerde waarnemingstabel betreft uitsluitend Nationaal Park Zuid-Kennemerland. Zij worden daarom niet als kandidaatbron beschouwd.</w:t>
-      </w:r>
-    </w:p>
-    <w:p>
-      <w:pPr>
-        <w:pStyle w:val="BodyText"/>
-      </w:pPr>
-      <w:r>
-        <w:t xml:space="preserve">Een openbare GBIF-dataset met mondiale bodemorganismen gaf 1.995 ruimtelijke treffers binnen de projectgrens. De oorspronkelijke plaatsaanduiding van al deze monsters is echter Terschelling. Dit is een georeferentiefout en geen Meijendelbron.</w:t>
-      </w:r>
-    </w:p>
-    <w:p>
-      <w:pPr>
-        <w:pStyle w:val="BodyText"/>
-      </w:pPr>
-      <w:r>
-        <w:t xml:space="preserve">Algemene verzamelbronnen zoals Observation.org, iNaturalist en eBird worden ook niet opnieuw als zelfstandige Meijendelbron ingevoerd zolang niet is aangetoond dat zij waarnemingen bevatten die ontbreken in NDFF of in de primaire VWG/SOVON-reeksen. Anders zou dezelfde waarneming vooral nogmaals worden opgeslagen.</w:t>
-      </w:r>
-    </w:p>
-    <w:p>
-      <w:pPr>
-        <w:pStyle w:val="Heading2"/>
-      </w:pPr>
-      <w:bookmarkStart w:id="86" w:name="_013584c0923eee2d005d13457186cf6f9764ca0"/>
-      <w:r>
-        <w:t xml:space="preserve">6. Gebruik van dit register</w:t>
-      </w:r>
-      <w:bookmarkEnd w:id="86"/>
-    </w:p>
-    <w:p>
-      <w:pPr>
-        <w:pStyle w:val="FirstParagraph"/>
-      </w:pPr>
-      <w:r>
-        <w:t xml:space="preserve">Dit document is het beslisoverzicht. Een bron gaat pas naar</w:t>
-      </w:r>
-      <w:r>
-        <w:t xml:space="preserve"> </w:t>
-      </w:r>
-      <w:r>
-        <w:rPr>
-          <w:rStyle w:val="VerbatimChar"/>
-        </w:rPr>
-        <w:t xml:space="preserve">Meijendel</w:t>
-      </w:r>
-      <w:r>
-        <w:t xml:space="preserve"> </w:t>
-      </w:r>
-      <w:r>
-        <w:t xml:space="preserve">wanneer per waarneming vaststaat dat zij in Meijendel is gedaan en de locatie bekend of betrouwbaar herleidbaar is. Is dat niet zo, dan blijft zij kandidaat of context in Meijendel_bronnen.</w:t>
-      </w:r>
-    </w:p>
-    <w:p>
-      <w:pPr>
-        <w:pStyle w:val="BodyText"/>
-      </w:pPr>
-      <w:r>
-        <w:t xml:space="preserve">Bij iedere nieuwe levering worden achtereenvolgens gecontroleerd:</w:t>
-      </w:r>
-    </w:p>
-    <w:p>
-      <w:pPr>
-        <w:pStyle w:val="BodyText"/>
-      </w:pPr>
-      <w:r>
-        <w:t xml:space="preserve">welke waarnemingen en perioden werkelijk nieuw zijn;</w:t>
-      </w:r>
-    </w:p>
-    <w:p>
-      <w:pPr>
-        <w:pStyle w:val="BodyText"/>
-      </w:pPr>
-      <w:r>
-        <w:t xml:space="preserve">of locaties en oorspronkelijke sleutels bruikbaar zijn;</w:t>
-      </w:r>
-    </w:p>
-    <w:p>
-      <w:pPr>
-        <w:pStyle w:val="BodyText"/>
-      </w:pPr>
-      <w:r>
-        <w:t xml:space="preserve">of bezoeken, soortenlijsten en echte nullen aanwezig zijn;</w:t>
-      </w:r>
-    </w:p>
-    <w:p>
-      <w:pPr>
-        <w:pStyle w:val="BodyText"/>
-      </w:pPr>
-      <w:r>
-        <w:t xml:space="preserve">of de bron een bestaande primaire reeks overlapt;</w:t>
-      </w:r>
-    </w:p>
-    <w:p>
-      <w:pPr>
-        <w:pStyle w:val="BodyText"/>
-      </w:pPr>
-      <w:r>
-        <w:t xml:space="preserve">welke analyses daardoor verantwoord mogelijk worden.</w:t>
-      </w:r>
-    </w:p>
-    <w:p>
-      <w:pPr>
-        <w:pStyle w:val="BodyText"/>
-      </w:pPr>
-      <w:r>
-        <w:t xml:space="preserve">Pas daarna volgt een afzonderlijk importbesluit.</w:t>
-      </w:r>
-    </w:p>
-    <w:p>
-      <w:pPr>
-        <w:pStyle w:val="Heading2"/>
-      </w:pPr>
-      <w:bookmarkStart w:id="87" w:name="_actieplan"/>
-      <w:r>
-        <w:t xml:space="preserve">7. Actieplan</w:t>
-      </w:r>
-      <w:bookmarkEnd w:id="87"/>
-    </w:p>
-    <w:p>
-      <w:pPr>
-        <w:pStyle w:val="FirstParagraph"/>
-      </w:pPr>
-      <w:r>
-        <w:t xml:space="preserve">Het doel is niet zoveel mogelijk regels importeren, maar per bron de kortste route naar betrouwbare, niet-dubbele en geografisch toegelaten gegevens te volgen. De ruwe bestanden blijven onveranderd bewaard;</w:t>
-      </w:r>
-      <w:r>
-        <w:t xml:space="preserve"> </w:t>
-      </w:r>
-      <w:r>
-        <w:rPr>
-          <w:rStyle w:val="VerbatimChar"/>
-        </w:rPr>
-        <w:t xml:space="preserve">Meijendel</w:t>
-      </w:r>
-      <w:r>
-        <w:t xml:space="preserve"> </w:t>
-      </w:r>
-      <w:r>
-        <w:t xml:space="preserve">bevat alleen waarnemingen die aan de ruimtelijke toelatingsregel voldoen.</w:t>
-      </w:r>
-    </w:p>
-    <w:p>
-      <w:pPr>
-        <w:pStyle w:val="Heading3"/>
-      </w:pPr>
-      <w:bookmarkStart w:id="88" w:name="_94b069977659593a87344faec87dcce83750292"/>
-      <w:r>
-        <w:t xml:space="preserve">Fase 1 — openbare, direct toetsbare bronnen</w:t>
-      </w:r>
-      <w:bookmarkEnd w:id="88"/>
-    </w:p>
-    <w:p>
-      <w:pPr>
-        <w:pStyle w:val="FirstParagraph"/>
-      </w:pPr>
-      <w:r>
-        <w:rPr>
-          <w:b/>
-          <w:bCs/>
-        </w:rPr>
-        <w:t xml:space="preserve">Status: uitgevoerd op 26 september 2026.</w:t>
-      </w:r>
-      <w:r>
-        <w:t xml:space="preserve"> </w:t>
-      </w:r>
-      <w:r>
-        <w:t xml:space="preserve">STOWA en ENDURE zijn na locatie-, sleutel-, rechten- en eenheidscontrole opgenomen. ENDURE bevat veertien complete aanwezigheids-afwezigheidsmatrices en één event zonder resultatenmatrix. STOWA bevat uitsluitend positieve resultaten; de vier typen meeteenheid worden niet samengevoegd.</w:t>
-      </w:r>
-    </w:p>
-    <w:p>
-      <w:pPr>
-        <w:pStyle w:val="BodyText"/>
-      </w:pPr>
-      <w:r>
-        <w:rPr>
-          <w:b/>
-          <w:bCs/>
-        </w:rPr>
-        <w:t xml:space="preserve">Museumreeksen: uitgevoerd.</w:t>
-      </w:r>
-      <w:r>
-        <w:t xml:space="preserve"> </w:t>
-      </w:r>
-      <w:r>
-        <w:t xml:space="preserve">De volledige openbare Darwin Core-archieven zijn geprofileerd. Alleen gedateerde, unieke records binnen het basisgebied én met een expliciete Meijendel- of deelgebiednaam op het etiket zijn opgenomen: 4.748 NMR-vlinders en -motten, 1.881 Naturalis Botany-specimens en 869 Naturalis-kevers.</w:t>
-      </w:r>
-      <w:r>
-        <w:t xml:space="preserve"> </w:t>
-      </w:r>
-      <w:r>
-        <w:rPr>
-          <w:rStyle w:val="VerbatimChar"/>
-        </w:rPr>
-        <w:t xml:space="preserve">occurrenceID</w:t>
-      </w:r>
-      <w:r>
-        <w:t xml:space="preserve">, etiketplaats, oorspronkelijke en voor analyse genormaliseerde taxonnaam, datum of datuminterval, coördinaten, onzekerheid, licentie, DOI en bronmetadata zijn behouden. Ruimtelijke treffers zonder expliciet Meijendel-etiket en expliciete Meijendel-records zonder datum zijn niet toegelaten.</w:t>
-      </w:r>
-    </w:p>
-    <w:p>
-      <w:pPr>
-        <w:pStyle w:val="BodyText"/>
-      </w:pPr>
-      <w:r>
-        <w:rPr>
-          <w:b/>
-          <w:bCs/>
-        </w:rPr>
-        <w:t xml:space="preserve">Landelijke Vegetatie Databank: uitgevoerd voor de reproduceerbare bronversie 1.6.</w:t>
-      </w:r>
-      <w:r>
-        <w:t xml:space="preserve"> </w:t>
-      </w:r>
-      <w:r>
-        <w:t xml:space="preserve">Van 5.195 opnamen en 119.006 taxonregels zijn 3.437 opnamen en 81.310 taxonresultaten uit 1959–2015 met maximaal 50 meter locatie-onzekerheid toegelaten. De PQ-integratie heeft 644 volledige bronopnamen met 16.627 resultaten uit 1981–2015 naar de PQ-tabellen verplaatst, met vermoedelijke koppelingen en zonder zelfstandig meetellen. De overige 2.793 opnamen met 64.683 resultaten blijven in de externe bronlaag. De bestaande analyse-ingang ontsluit beide opslagplaatsen zonder fysieke kopieën. Mogelijke NDFF-overlap blijft zichtbaar, maar wordt vanwege de NDFF-onzekerheidspolygonen niet automatisch als dubbel verwijderd. De duinvalleireeks kan zonder georeferentie niet op opnameniveau worden gekoppeld en blijft afzonderlijk in</w:t>
-      </w:r>
-      <w:r>
-        <w:t xml:space="preserve"> </w:t>
-      </w:r>
-      <w:r>
-        <w:rPr>
-          <w:rStyle w:val="VerbatimChar"/>
-        </w:rPr>
-        <w:t xml:space="preserve">Meijendel_bronnen</w:t>
-      </w:r>
-      <w:r>
-        <w:t xml:space="preserve">.</w:t>
-      </w:r>
-    </w:p>
-    <w:p>
-      <w:pPr>
-        <w:pStyle w:val="Heading3"/>
-      </w:pPr>
-      <w:bookmarkStart w:id="89" w:name="_1e65d730f223a62ff579853fd3c77c9308748df"/>
-      <w:r>
-        <w:t xml:space="preserve">Fase 2 — reeksen met grote historische of trendwaarde</w:t>
-      </w:r>
-      <w:bookmarkEnd w:id="89"/>
-    </w:p>
-    <w:p>
-      <w:pPr>
-        <w:pStyle w:val="FirstParagraph"/>
-      </w:pPr>
-      <w:r>
-        <w:rPr>
-          <w:b/>
-          <w:bCs/>
-        </w:rPr>
-        <w:t xml:space="preserve">Ringgegevens: onderzocht, niet toegelaten.</w:t>
-      </w:r>
-      <w:r>
-        <w:t xml:space="preserve"> </w:t>
-      </w:r>
-      <w:r>
-        <w:t xml:space="preserve">De locatiecode</w:t>
-      </w:r>
-      <w:r>
-        <w:t xml:space="preserve"> </w:t>
-      </w:r>
-      <w:r>
-        <w:rPr>
-          <w:rStyle w:val="VerbatimChar"/>
-        </w:rPr>
-        <w:t xml:space="preserve">NL19</w:t>
-      </w:r>
-      <w:r>
-        <w:t xml:space="preserve"> </w:t>
-      </w:r>
-      <w:r>
-        <w:t xml:space="preserve">in de GBIF-biometrie betekent provincie Zuid-Holland en niet VRS Meijendel. Trektellen-site 403 bevat wel VRS-Meijendelrapporten en inspanning, maar er is geen recordsleutel naar de 100.417 ruimtelijke GBIF-treffers. Zij blijven kandidaat en worden niet met de vogelreeks vermengd.</w:t>
-      </w:r>
-    </w:p>
-    <w:p>
-      <w:pPr>
-        <w:pStyle w:val="BodyText"/>
-      </w:pPr>
-      <w:r>
-        <w:rPr>
-          <w:b/>
-          <w:bCs/>
-        </w:rPr>
-        <w:t xml:space="preserve">Bijenmonitoring: bezoekstructuur gereconstrueerd.</w:t>
-      </w:r>
-      <w:r>
-        <w:t xml:space="preserve"> </w:t>
-      </w:r>
-      <w:r>
-        <w:t xml:space="preserve">Alle achttien proefvlakcodes, vier deelgebieden en 162 bezoeken uit 2019, 2021 en 2023 zijn in</w:t>
-      </w:r>
-      <w:r>
-        <w:t xml:space="preserve"> </w:t>
-      </w:r>
-      <w:r>
-        <w:rPr>
-          <w:rStyle w:val="VerbatimChar"/>
-        </w:rPr>
-        <w:t xml:space="preserve">Meijendel_bronnen</w:t>
-      </w:r>
-      <w:r>
-        <w:t xml:space="preserve"> </w:t>
-      </w:r>
-      <w:r>
-        <w:t xml:space="preserve">vastgelegd. De rapporten tonen de grenzen alleen als figuur. De reeks verhuist pas naar</w:t>
-      </w:r>
-      <w:r>
-        <w:t xml:space="preserve"> </w:t>
-      </w:r>
-      <w:r>
-        <w:rPr>
-          <w:rStyle w:val="VerbatimChar"/>
-        </w:rPr>
-        <w:t xml:space="preserve">Meijendel</w:t>
-      </w:r>
-      <w:r>
-        <w:t xml:space="preserve"> </w:t>
-      </w:r>
-      <w:r>
-        <w:t xml:space="preserve">nadat die grenzen betrouwbaar zijn gegeorefereerd en de soortenmatrices foutgecontroleerd zijn gedigitaliseerd.</w:t>
-      </w:r>
-    </w:p>
-    <w:p>
-      <w:pPr>
-        <w:pStyle w:val="BodyText"/>
-      </w:pPr>
-      <w:r>
-        <w:rPr>
-          <w:b/>
-          <w:bCs/>
-        </w:rPr>
-        <w:t xml:space="preserve">Aquatische reeks: methode en locatiestructuur gereconstrueerd.</w:t>
-      </w:r>
-      <w:r>
-        <w:t xml:space="preserve"> </w:t>
-      </w:r>
-      <w:r>
-        <w:t xml:space="preserve">De zeven monsterpuntcodes, vijf benoemde wateren en negentien standaard- of afwijkende methodeperioden uit 1974–1975 staan in</w:t>
-      </w:r>
-      <w:r>
-        <w:t xml:space="preserve"> </w:t>
-      </w:r>
-      <w:r>
-        <w:rPr>
-          <w:rStyle w:val="VerbatimChar"/>
-        </w:rPr>
-        <w:t xml:space="preserve">Meijendel_bronnen</w:t>
-      </w:r>
-      <w:r>
-        <w:t xml:space="preserve">. Een betrouwbare digitale watercodekaart en een gecontroleerde soortenmatrix ontbreken nog. Daarom zijn geen waarnemingsregels naar</w:t>
-      </w:r>
-      <w:r>
-        <w:t xml:space="preserve"> </w:t>
-      </w:r>
-      <w:r>
-        <w:rPr>
-          <w:rStyle w:val="VerbatimChar"/>
-        </w:rPr>
-        <w:t xml:space="preserve">Meijendel</w:t>
-      </w:r>
-      <w:r>
-        <w:t xml:space="preserve"> </w:t>
-      </w:r>
-      <w:r>
-        <w:t xml:space="preserve">gepromoveerd. De aanvullende waterwantsen, waterkevers, libellen, neuropteren en zweefvliegen blijven kandidaat totdat datum en locatie per waarneming vaststaan.</w:t>
-      </w:r>
-    </w:p>
-    <w:p>
-      <w:pPr>
-        <w:pStyle w:val="BodyText"/>
-      </w:pPr>
-      <w:r>
-        <w:rPr>
-          <w:b/>
-          <w:bCs/>
-        </w:rPr>
-        <w:t xml:space="preserve">Droge-duinvegetatieplots: onderzocht, nog niet lokaliseerbaar per plot.</w:t>
-      </w:r>
-      <w:r>
-        <w:t xml:space="preserve"> </w:t>
-      </w:r>
-      <w:r>
-        <w:t xml:space="preserve">De kaart in het proefschrift is visueel gecontroleerd en toont 41 punten in Helmduinen, Kijfhoek en Bierlap, maar geen koppelbare plotcodes. Ook de LVD-selectie levert geen betrouwbare vertaling. De reeks blijft kandidaat totdat de oorspronkelijke plotkaart en opnametabellen zijn gevonden.</w:t>
-      </w:r>
-    </w:p>
-    <w:p>
-      <w:pPr>
-        <w:pStyle w:val="Heading3"/>
-      </w:pPr>
-      <w:bookmarkStart w:id="90" w:name="_6b9d0c88ffcb5584e67daa74c9524b522af67c0"/>
-      <w:r>
-        <w:t xml:space="preserve">Fase 3 — reeds bekende bronhouders en contextdatasets</w:t>
-      </w:r>
-      <w:bookmarkEnd w:id="90"/>
-    </w:p>
-    <w:p>
-      <w:pPr>
-        <w:pStyle w:val="FirstParagraph"/>
-      </w:pPr>
-      <w:r>
-        <w:rPr>
-          <w:b/>
-          <w:bCs/>
-        </w:rPr>
-        <w:t xml:space="preserve">Ontvangen meetnetleveringen vergelijken, niet blind importeren.</w:t>
-      </w:r>
-      <w:r>
-        <w:t xml:space="preserve"> </w:t>
-      </w:r>
-      <w:r>
-        <w:t xml:space="preserve">De verwachte gegevens van De Vlinderstichting en eventuele latere leveringen worden eerst vergeleken met NDFF op populatie, bezoeken, sleutels, nullen en overlap. Alleen aantoonbare aanvullingen of betere primaire versies vervangen de voorlopige reconstructies.</w:t>
-      </w:r>
-    </w:p>
-    <w:p>
-      <w:pPr>
-        <w:pStyle w:val="BodyText"/>
-      </w:pPr>
-      <w:r>
-        <w:rPr>
-          <w:b/>
-          <w:bCs/>
-        </w:rPr>
-        <w:t xml:space="preserve">Contextdatasets alleen promoveren na georeferentie.</w:t>
-      </w:r>
-      <w:r>
-        <w:t xml:space="preserve"> </w:t>
-      </w:r>
-      <w:r>
-        <w:t xml:space="preserve">Duinvalleiplots, jachtspinnen, TERRA-Dunes en andere genummerde locaties blijven in</w:t>
-      </w:r>
-      <w:r>
-        <w:t xml:space="preserve"> </w:t>
-      </w:r>
-      <w:r>
-        <w:rPr>
-          <w:rStyle w:val="VerbatimChar"/>
-        </w:rPr>
-        <w:t xml:space="preserve">Meijendel_bronnen</w:t>
-      </w:r>
-      <w:r>
-        <w:t xml:space="preserve"> </w:t>
-      </w:r>
-      <w:r>
-        <w:t xml:space="preserve">totdat per waarneming een betrouwbare ligging in Meijendel is vastgesteld.</w:t>
-      </w:r>
-    </w:p>
-    <w:p>
-      <w:pPr>
-        <w:pStyle w:val="BodyText"/>
-      </w:pPr>
-      <w:r>
-        <w:rPr>
-          <w:b/>
-          <w:bCs/>
-        </w:rPr>
-        <w:t xml:space="preserve">Verklarende lagen afzonderlijk opbouwen.</w:t>
-      </w:r>
-      <w:r>
-        <w:t xml:space="preserve"> </w:t>
-      </w:r>
-      <w:r>
-        <w:t xml:space="preserve">Voeg de Habitatkaart T1, de landbedekking van 2001 en 2022 en eventueel gevonden remote-sensingrasters toe als omgevingslagen. Zij mogen ecologische veranderingen helpen verklaren, maar worden niet als soortenwaarnemingen behandeld.</w:t>
-      </w:r>
-    </w:p>
-    <w:p>
-      <w:pPr>
-        <w:pStyle w:val="Heading3"/>
-      </w:pPr>
-      <w:bookmarkStart w:id="91" w:name="_d490f73b19661b8ff0d346b94e527be91e989c7"/>
-      <w:r>
-        <w:t xml:space="preserve">Vaste werkwijze per bron</w:t>
-      </w:r>
-      <w:bookmarkEnd w:id="91"/>
-    </w:p>
-    <w:p>
-      <w:pPr>
-        <w:pStyle w:val="FirstParagraph"/>
-      </w:pPr>
-      <w:r>
-        <w:t xml:space="preserve">Iedere bron doorloopt dezelfde vijf stappen: een onveranderde bronkopie met checksum bewaren; gegevenswoordenboek en rechten vastleggen; locaties en analyseeenheid controleren; overlap en dubbelen bepalen; pas daarna een reproduceerbare import en analyseview maken. Na iedere statuswijziging worden dit register en de Wordversie meteen bijgewerkt.</w:t>
-      </w:r>
-    </w:p>
-    <w:p>
-      <w:pPr>
-        <w:pStyle w:val="Heading3"/>
-      </w:pPr>
-      <w:bookmarkStart w:id="92" w:name="_1e50ec235a164d1e043cda4cec7be66fb154af3"/>
-      <w:r>
-        <w:t xml:space="preserve">Dekking van de internetcontrole</w:t>
-      </w:r>
-      <w:bookmarkEnd w:id="92"/>
-    </w:p>
-    <w:p>
-      <w:pPr>
-        <w:pStyle w:val="FirstParagraph"/>
-      </w:pPr>
-      <w:r>
-        <w:t xml:space="preserve">De controle van 26 september 2026 omvatte GBIF, DataCite, Zenodo, Dryad, Figshare, Europe PMC, Naturalis Repository, Wageningen Research e-depot en de repositories van Universiteit Leiden en TU Delft. Algemene aggregators zijn niet als zelfstandige bron opgenomen wanneer zij waarschijnlijk dezelfde waarnemingen als NDFF of primaire collecties bevatten. Een openbare zoekronde kan nooit bewijzen dat geen ongepubliceerde of slecht geïndexeerde bron bestaat; dit register legt daarom ook de zoekdatum en toelatingsreden vast.</w:t>
-      </w:r>
-    </w:p>
-    <w:p>
-      <w:pPr>
-        <w:pStyle w:val="Heading2"/>
-      </w:pPr>
-      <w:bookmarkStart w:id="93" w:name="_5001ec8ecf742000e2504f4f268bea177f3f158"/>
+      <w:bookmarkStart w:id="97" w:name="_5001ec8ecf742000e2504f4f268bea177f3f158"/>
       <w:r>
         <w:t xml:space="preserve">Achterliggende verantwoording</w:t>
       </w:r>
-      <w:bookmarkEnd w:id="93"/>
+      <w:bookmarkEnd w:id="97"/>
     </w:p>
     <w:p>
       <w:pPr>
@@ -10088,7 +10558,7 @@
           <w:numId w:val="1005"/>
         </w:numPr>
       </w:pPr>
-      <w:hyperlink r:id="rId94">
+      <w:hyperlink r:id="rId98">
         <w:r>
           <w:rPr>
             <w:rStyle w:val="Hyperlink"/>
@@ -10105,7 +10575,7 @@
           <w:numId w:val="1005"/>
         </w:numPr>
       </w:pPr>
-      <w:hyperlink r:id="rId95">
+      <w:hyperlink r:id="rId99">
         <w:r>
           <w:rPr>
             <w:rStyle w:val="Hyperlink"/>
@@ -10122,7 +10592,7 @@
           <w:numId w:val="1005"/>
         </w:numPr>
       </w:pPr>
-      <w:hyperlink r:id="rId96">
+      <w:hyperlink r:id="rId100">
         <w:r>
           <w:rPr>
             <w:rStyle w:val="Hyperlink"/>
@@ -10139,7 +10609,7 @@
           <w:numId w:val="1005"/>
         </w:numPr>
       </w:pPr>
-      <w:hyperlink r:id="rId97">
+      <w:hyperlink r:id="rId101">
         <w:r>
           <w:rPr>
             <w:rStyle w:val="Hyperlink"/>
@@ -10156,7 +10626,7 @@
           <w:numId w:val="1005"/>
         </w:numPr>
       </w:pPr>
-      <w:hyperlink r:id="rId98">
+      <w:hyperlink r:id="rId102">
         <w:r>
           <w:rPr>
             <w:rStyle w:val="Hyperlink"/>
@@ -10173,7 +10643,7 @@
           <w:numId w:val="1005"/>
         </w:numPr>
       </w:pPr>
-      <w:hyperlink r:id="rId99">
+      <w:hyperlink r:id="rId103">
         <w:r>
           <w:rPr>
             <w:rStyle w:val="Hyperlink"/>
@@ -10190,7 +10660,7 @@
           <w:numId w:val="1005"/>
         </w:numPr>
       </w:pPr>
-      <w:hyperlink r:id="rId100">
+      <w:hyperlink r:id="rId104">
         <w:r>
           <w:rPr>
             <w:rStyle w:val="Hyperlink"/>
@@ -10203,86 +10673,154 @@
       <w:pPr>
         <w:pStyle w:val="Heading2"/>
       </w:pPr>
-      <w:r>
-        <w:t>Integratie begrazing en toegankelijkheid op 16 oktober 2026</w:t>
-      </w:r>
-    </w:p>
-    <w:p>
-      <w:r>
-        <w:t>De levende lokale database is op 16 oktober 2026 omgezet. De 144 oorspronkelijke begrazingsregistraties voor 16 plots uit 1991–1999 zijn volledig behouden: 139 staan in maatregel_plot_jaar_registratie; de vijf door Ton bevestigde dubbelingen verwijzen naar bestaande uitvoering–plot–jaarfeiten. Dit zijn M15 en M16 in 1991 en M13, M13s en M14 in 1997. Deze vijf feiten worden niet opnieuw opgeslagen.</w:t>
-      </w:r>
-    </w:p>
-    <w:p>
-      <w:r>
-        <w:t>De 55 toegankelijkheidsregistraties voor 55 plots in 2024 staan in maatregel_toegankelijkheid_registratie: 20 vrij, 14 beperkt, 12 afgesloten, acht deels beperkt/deels vrij en één deels afgesloten/deels vrij. De deeltabel bevatte nul regels; de twee voorbeeldregels uit de deel-CSV zijn niet geïmporteerd. Status, bronspelling, plotnaam, opmerkingen, lege waarden en NULL blijven herleidbaar. De opmerking bij M36 blijft “nog controleren”. Een gemengde status bewijst geen oppervlakteverdeling.</w:t>
-      </w:r>
-    </w:p>
-    <w:p>
-      <w:r>
-        <w:t>maatregel_registratie_herkomst bevat 199 technische herkomstkoppelingen met oude sleutels, oorspronkelijke rijwaarden, hashes en precies één canoniek doel. Dit zijn auditgegevens, geen extra beheerfeiten. De 43 inhoudelijke maatregelbronnen zijn behouden; één administratieve bron voor deze migratie brengt maatregel_bron op 44 regels. Overnemen uit de handmatige registratie geeft geen nieuwe onafhankelijke bronbevestiging.</w:t>
-      </w:r>
-    </w:p>
-    <w:p>
-      <w:r>
-        <w:t>De drie oude fysieke tabellen én de gelijknamige compatibiliteitsviews zijn verwijderd. Dashboard en Shiny gebruiken rechtstreeks de centrale registraties. De oorspronkelijke 144, 55 en nul regels blijven voor audit reconstrueerbaar zonder die databaseobjecten. v_plot_jaar_maatregel_bronvast behoudt de bestaande 307 regels voor expliciete jaren tussen 1967 en 2025; v_plot_jaar_maatregel_gecombineerd bevat 446 regels, inclusief de 139 aanvullende jaarfeiten. Deze laatste view mag bronregistraties niet als onafhankelijke terreinmetingen of behandeld oppervlak tellen.</w:t>
-      </w:r>
-    </w:p>
-    <w:p>
-      <w:r>
-        <w:t>Dashboard en Shiny lezen rechtstreeks uit de centrale basistabellen via build_maatregel_registration_data. Parser/cacheversie is 15; de oude gegevensobjectnamen en de afhankelijkheid van compatibiliteitsviews zijn uit de actieve leesroute verwijderd. Voor analyse geldt een toegankelijkheidsstatus uitsluitend in het geregistreerde jaar; buiten 2024 blijft die voor deze 55 plots onbekend. Het dashboard mag de laatste historische registratie apart tonen met bronjaar, maar presenteert haar niet als bewezen toestand van een later jaar. Beheerjaarfeiten worden evenmin stilzwijgend doorgetrokken.</w:t>
-      </w:r>
-    </w:p>
-    <w:p>
-      <w:r>
-        <w:t>Nieuwe import richt zich op de maatregelregistraties. De drie bestaande import-SQL-bestanden gebruiken alleen tijdelijke staging en schrijven niet naar de compatibiliteitsviews. De oorspronkelijke bronidentiteit blijft bij correctie behouden; identieke herimport en gewijzigde herimport zijn op fixtures getest. LOAD DATA LOCAL vereist local_infile aan client- en serverzijde; de iMac-server heeft dit uitgeschakeld. Die globale instelling is in deze taak niet veranderd. Voer de voorbeeld-CSV’s niet als actuele levering in.</w:t>
-      </w:r>
-    </w:p>
-    <w:p>
-      <w:r>
-        <w:t>Controle: volledige rijreconstructie, vijf expliciete ontdubbelingen, idempotentie, herstel na onderbroken tabelwissel, SQL/R-pariteit en cache-/browser-/exportcontracten. De inhoudschecksums van alle overige basistabellen zijn vóór en na de migratie gelijk; bestaande bron- en brontyperegels blijven behouden. De centrale taxoncontrole is vóór en na de wijziging groen: alle 128 centrale routes blijven bereikbaar zonder auditfouten. De afsluitende audit is vastgelegd in de lokale herstelmap.</w:t>
-      </w:r>
-    </w:p>
-    <w:p>
-      <w:r>
-        <w:t>Herstelkopie en controlebewijs staan lokaal in /Users/ton/Documents/Meijendel-herstel/2026-10-16-beheer-toegankelijkheid. Herstel verloopt via gis/scripts/migrate_maatregel_registraties.py --database Meijendel --backup-dir /Users/ton/Documents/Meijendel-herstel/2026-10-16-beheer-toegankelijkheid/backup --restore. Een herstelactie vereist een eigen besluit. Meijendel.sql, volledige cachebouw en VPS zijn in deze lokale migratiefase niet vernieuwd.</w:t>
-      </w:r>
-    </w:p>
-    <w:p>
-      <w:r>
-        <w:t>Betekenistoets: uitvoering, locatie, tijd, toestand en taxonidentiteit blijven onderscheiden volgens Darwin Core (https://dwc.tdwg.org/terms/) en TDWG TCS (https://tcs.tdwg.org/terms/), geraadpleegd op 16 oktober 2026. Begrazingsdieren zijn beheereigenschappen en worden door deze migratie geen wilde soortwaarnemingen.</w:t>
+      <w:bookmarkStart w:id="105" w:name="_c4c5e83029c8593231be35dbc87830101c46a33"/>
+      <w:r>
+        <w:t xml:space="preserve">Integratie begrazing en toegankelijkheid op 16 oktober 2026</w:t>
+      </w:r>
+      <w:bookmarkEnd w:id="105"/>
+    </w:p>
+    <w:p>
+      <w:pPr>
+        <w:pStyle w:val="FirstParagraph"/>
+      </w:pPr>
+      <w:r>
+        <w:t xml:space="preserve">De levende lokale database is op 16 oktober 2026 omgezet. De 144 oorspronkelijke begrazingsregistraties voor 16 plots uit 1991–1999 zijn volledig behouden: 139 staan in maatregel_plot_jaar_registratie; de vijf door Ton bevestigde dubbelingen verwijzen naar bestaande uitvoering–plot–jaarfeiten. Dit zijn M15 en M16 in 1991 en M13, M13s en M14 in 1997. Deze vijf feiten worden niet opnieuw opgeslagen.</w:t>
+      </w:r>
+    </w:p>
+    <w:p>
+      <w:pPr>
+        <w:pStyle w:val="BodyText"/>
+      </w:pPr>
+      <w:r>
+        <w:t xml:space="preserve">De 55 toegankelijkheidsregistraties voor 55 plots in 2024 staan in maatregel_toegankelijkheid_registratie: 20 vrij, 14 beperkt, 12 afgesloten, acht deels beperkt/deels vrij en één deels afgesloten/deels vrij. De deeltabel bevatte nul regels; de twee voorbeeldregels uit de deel-CSV zijn niet geïmporteerd. Status, bronspelling, plotnaam, opmerkingen, lege waarden en NULL blijven herleidbaar. De opmerking bij M36 blijft “nog controleren”. Een gemengde status bewijst geen oppervlakteverdeling.</w:t>
+      </w:r>
+    </w:p>
+    <w:p>
+      <w:pPr>
+        <w:pStyle w:val="BodyText"/>
+      </w:pPr>
+      <w:r>
+        <w:t xml:space="preserve">maatregel_registratie_herkomst bevat 199 technische herkomstkoppelingen met oude sleutels, oorspronkelijke rijwaarden, hashes en precies één canoniek doel. Dit zijn auditgegevens, geen extra beheerfeiten. De 43 inhoudelijke maatregelbronnen zijn behouden; één administratieve bron voor deze migratie brengt maatregel_bron op 44 regels. Overnemen uit de handmatige registratie geeft geen nieuwe onafhankelijke bronbevestiging.</w:t>
+      </w:r>
+    </w:p>
+    <w:p>
+      <w:pPr>
+        <w:pStyle w:val="BodyText"/>
+      </w:pPr>
+      <w:r>
+        <w:t xml:space="preserve">De drie oude fysieke tabellen én de gelijknamige compatibiliteitsviews zijn verwijderd. Dashboard en Shiny gebruiken rechtstreeks de centrale registraties. De oorspronkelijke 144, 55 en nul regels blijven voor audit reconstrueerbaar zonder die databaseobjecten. v_plot_jaar_maatregel_bronvast behoudt de bestaande 307 regels voor expliciete jaren tussen 1967 en 2025; v_plot_jaar_maatregel_gecombineerd bevat 446 regels, inclusief de 139 aanvullende jaarfeiten. Deze laatste view mag bronregistraties niet als onafhankelijke terreinmetingen of behandeld oppervlak tellen.</w:t>
+      </w:r>
+    </w:p>
+    <w:p>
+      <w:pPr>
+        <w:pStyle w:val="BodyText"/>
+      </w:pPr>
+      <w:r>
+        <w:t xml:space="preserve">Dashboard en Shiny lezen rechtstreeks uit de centrale basistabellen via build_maatregel_registration_data. Parser/cacheversie is 15; de oude gegevensobjectnamen en de afhankelijkheid van compatibiliteitsviews zijn uit de actieve leesroute verwijderd. Voor analyse geldt een toegankelijkheidsstatus uitsluitend in het geregistreerde jaar; buiten 2024 blijft die voor deze 55 plots onbekend. Het dashboard mag de laatste historische registratie apart tonen met bronjaar, maar presenteert haar niet als bewezen toestand van een later jaar. Beheerjaarfeiten worden evenmin stilzwijgend doorgetrokken.</w:t>
+      </w:r>
+    </w:p>
+    <w:p>
+      <w:pPr>
+        <w:pStyle w:val="BodyText"/>
+      </w:pPr>
+      <w:r>
+        <w:t xml:space="preserve">Nieuwe import richt zich op de maatregelregistraties. De drie bestaande import-SQL-bestanden gebruiken alleen tijdelijke staging en schrijven niet naar de compatibiliteitsviews. De oorspronkelijke bronidentiteit blijft bij correctie behouden; identieke herimport en gewijzigde herimport zijn op fixtures getest. LOAD DATA LOCAL vereist local_infile aan client- en serverzijde; de iMac-server heeft dit uitgeschakeld. Die globale instelling is in deze taak niet veranderd. Voer de voorbeeld-CSV’s niet als actuele levering in.</w:t>
+      </w:r>
+    </w:p>
+    <w:p>
+      <w:pPr>
+        <w:pStyle w:val="BodyText"/>
+      </w:pPr>
+      <w:r>
+        <w:t xml:space="preserve">Controle: volledige rijreconstructie, vijf expliciete ontdubbelingen, idempotentie, herstel na onderbroken tabelwissel, SQL/R-pariteit en cache-/browser-/exportcontracten. De inhoudschecksums van alle overige basistabellen zijn vóór en na de migratie gelijk; bestaande bron- en brontyperegels blijven behouden. De centrale taxoncontrole is vóór en na de wijziging groen: alle 128 centrale routes blijven bereikbaar zonder auditfouten. De afsluitende audit is vastgelegd in de lokale herstelmap.</w:t>
+      </w:r>
+    </w:p>
+    <w:p>
+      <w:pPr>
+        <w:pStyle w:val="BodyText"/>
+      </w:pPr>
+      <w:r>
+        <w:t xml:space="preserve">Herstelkopie en controlebewijs staan lokaal in /Users/ton/Documents/Meijendel-herstel/2026-10-16-beheer-toegankelijkheid. Herstel verloopt via gis/scripts/migrate_maatregel_registraties.py --database Meijendel --backup-dir /Users/ton/Documents/Meijendel-herstel/2026-10-16-beheer-toegankelijkheid/backup --restore. Een herstelactie vereist een eigen besluit. Meijendel.sql, volledige cachebouw en VPS zijn in deze lokale migratiefase niet vernieuwd.</w:t>
+      </w:r>
+    </w:p>
+    <w:p>
+      <w:pPr>
+        <w:pStyle w:val="BodyText"/>
+      </w:pPr>
+      <w:r>
+        <w:t xml:space="preserve">Betekenistoets: uitvoering, locatie, tijd, toestand en taxonidentiteit blijven onderscheiden volgens Darwin Core (</w:t>
+      </w:r>
+      <w:hyperlink r:id="rId106">
+        <w:r>
+          <w:rPr>
+            <w:rStyle w:val="Hyperlink"/>
+          </w:rPr>
+          <w:t xml:space="preserve">https://dwc.tdwg.org/terms/</w:t>
+        </w:r>
+      </w:hyperlink>
+      <w:r>
+        <w:t xml:space="preserve">) en TDWG TCS (</w:t>
+      </w:r>
+      <w:hyperlink r:id="rId107">
+        <w:r>
+          <w:rPr>
+            <w:rStyle w:val="Hyperlink"/>
+          </w:rPr>
+          <w:t xml:space="preserve">https://tcs.tdwg.org/terms/</w:t>
+        </w:r>
+      </w:hyperlink>
+      <w:r>
+        <w:t xml:space="preserve">), geraadpleegd op 16 oktober 2026. Begrazingsdieren zijn beheereigenschappen en worden door deze migratie geen wilde soortwaarnemingen.</w:t>
       </w:r>
     </w:p>
     <w:p>
       <w:pPr>
         <w:pStyle w:val="Heading2"/>
       </w:pPr>
-      <w:r>
-        <w:t>Rechtstreekse aansluiting zonder compatibiliteitsviews</w:t>
-      </w:r>
-    </w:p>
-    <w:p>
-      <w:r>
-        <w:t>De drie compatibiliteitsviews plot_jaar_maatregel, plot_jaar_toegankelijkheid en plot_jaar_toegankelijkheid_deel zijn op 16 oktober 2026 op verzoek van Ton verwijderd. Er zijn onder deze drie namen geen tabellen of views meer aanwezig. De fysieke registratietabellen, de 199 herkomstkoppelingen en alle overige gegevens zijn behouden.</w:t>
-      </w:r>
-    </w:p>
-    <w:p>
-      <w:r>
-        <w:t>Dashboard en Shiny lezen rechtstreeks de centrale basistabellen. De 139 aanvullende begrazingsregistraties uit 1991–1999 en de vijf bestaande uitvoeringsfeiten leveren samen dezelfde 144 beheerfeiten voor 16 plots. De 55 toegankelijkheidsregistraties uit 2024 worden met niveau plot/deel gelezen; een deelregistratie wordt niet als toestand van het hele plot gebruikt. De nieuwe gegevensobjecten heten maatregel_beheer_jaar en maatregel_toegankelijkheid_registratie. Parser/cacheversie is 15.</w:t>
-      </w:r>
-    </w:p>
-    <w:p>
-      <w:r>
-        <w:t>De vijf bestaande uitvoeringsfeiten worden via hun expliciete herkomstkoppeling, uitvoeringsjaar en geverifieerde plotkoppeling bereikt, zonder het oorspronkelijke JSON-rijpayload als toepassingsgegevens te reconstrueren. Oude veldnamen en bronwaarden blijven uitsluitend beschikbaar voor historische reconstructie en herstelcontrole. De 307 bronvaste en 446 gecombineerde plot-jaarregels blijven ongewijzigd; deze vervolgwijziging voegt geen waarnemingen of beheerfeiten toe.</w:t>
-      </w:r>
-    </w:p>
-    <w:p>
-      <w:r>
-        <w:t>Import- en exportcontroles gebruiken eveneens de centrale tabellen en selecties. De oude classificatieherstelroute is onafhankelijk gemaakt van de verwijderde objecten. Een onderbroken migratie met achtergebleven _migratie_oud-tabellen stopt expliciet. De eerdere v1-migratie en haar oorspronkelijke herstelkopie blijven historisch controleerbaar; normale herhaling na de viewverwijdering maakt de views niet opnieuw aan.</w:t>
-      </w:r>
-    </w:p>
-    <w:p>
-      <w:r>
-        <w:t>Controlebewijs en hersteldefinities staan lokaal in /Users/ton/Documents/Meijendel-herstel/2026-10-16-maatregelen-rechtstreeks. De drie viewdefinities staan in views/restore-views.sql. Dit bestand wordt uitsluitend bij een afzonderlijk besloten herstel gebruikt. De zware Meijendel.sql-export, volledige cachebouw en VPS-publicatie maken geen deel uit van deze vervolgwijziging.</w:t>
+      <w:bookmarkStart w:id="108" w:name="_bbb680e0e85eb3eb154bfc12bc9c8fc0b3d6d97"/>
+      <w:r>
+        <w:t xml:space="preserve">Rechtstreekse aansluiting zonder compatibiliteitsviews</w:t>
+      </w:r>
+      <w:bookmarkEnd w:id="108"/>
+    </w:p>
+    <w:p>
+      <w:pPr>
+        <w:pStyle w:val="FirstParagraph"/>
+      </w:pPr>
+      <w:r>
+        <w:t xml:space="preserve">De drie compatibiliteitsviews plot_jaar_maatregel, plot_jaar_toegankelijkheid en plot_jaar_toegankelijkheid_deel zijn op 16 oktober 2026 op verzoek van Ton verwijderd. Er zijn onder deze drie namen geen tabellen of views meer aanwezig. De fysieke registratietabellen, de 199 herkomstkoppelingen en alle overige gegevens zijn behouden.</w:t>
+      </w:r>
+    </w:p>
+    <w:p>
+      <w:pPr>
+        <w:pStyle w:val="BodyText"/>
+      </w:pPr>
+      <w:r>
+        <w:t xml:space="preserve">Dashboard en Shiny lezen rechtstreeks de centrale basistabellen. De 139 aanvullende begrazingsregistraties uit 1991–1999 en de vijf bestaande uitvoeringsfeiten leveren samen dezelfde 144 beheerfeiten voor 16 plots. De 55 toegankelijkheidsregistraties uit 2024 worden met niveau plot/deel gelezen; een deelregistratie wordt niet als toestand van het hele plot gebruikt. De nieuwe gegevensobjecten heten maatregel_beheer_jaar en maatregel_toegankelijkheid_registratie. Parser/cacheversie is 15.</w:t>
+      </w:r>
+    </w:p>
+    <w:p>
+      <w:pPr>
+        <w:pStyle w:val="BodyText"/>
+      </w:pPr>
+      <w:r>
+        <w:t xml:space="preserve">De vijf bestaande uitvoeringsfeiten worden via hun expliciete herkomstkoppeling, uitvoeringsjaar en geverifieerde plotkoppeling bereikt, zonder het oorspronkelijke JSON-rijpayload als toepassingsgegevens te reconstrueren. Oude veldnamen en bronwaarden blijven uitsluitend beschikbaar voor historische reconstructie en herstelcontrole. De 307 bronvaste en 446 gecombineerde plot-jaarregels blijven ongewijzigd; deze vervolgwijziging voegt geen waarnemingen of beheerfeiten toe.</w:t>
+      </w:r>
+    </w:p>
+    <w:p>
+      <w:pPr>
+        <w:pStyle w:val="BodyText"/>
+      </w:pPr>
+      <w:r>
+        <w:t xml:space="preserve">Import- en exportcontroles gebruiken eveneens de centrale tabellen en selecties. De oude classificatieherstelroute is onafhankelijk gemaakt van de verwijderde objecten. Een onderbroken migratie met achtergebleven _migratie_oud-tabellen stopt expliciet. De eerdere v1-migratie en haar oorspronkelijke herstelkopie blijven historisch controleerbaar; normale herhaling na de viewverwijdering maakt de views niet opnieuw aan.</w:t>
+      </w:r>
+    </w:p>
+    <w:p>
+      <w:pPr>
+        <w:pStyle w:val="BodyText"/>
+      </w:pPr>
+      <w:r>
+        <w:t xml:space="preserve">Controlebewijs en hersteldefinities staan lokaal in /Users/ton/Documents/Meijendel-herstel/2026-10-16-maatregelen-rechtstreeks. De drie viewdefinities staan in views/restore-views.sql. Dit bestand wordt uitsluitend bij een afzonderlijk besloten herstel gebruikt. De zware Meijendel.sql-export, volledige cachebouw en VPS-publicatie maken geen deel uit van deze vervolgwijziging.</w:t>
       </w:r>
     </w:p>
     <w:sectPr>

</xml_diff>

<commit_message>
Verduidelijk NDFF-groepsindexen tegenover BLWG-meettabellen
</commit_message>
<xml_diff>
--- a/docs/MEIJENDEL_BRONREGISTER.docx
+++ b/docs/MEIJENDEL_BRONREGISTER.docx
@@ -5171,7 +5171,7 @@
         <w:t xml:space="preserve"> </w:t>
       </w:r>
       <w:r>
-        <w:t xml:space="preserve">(28.643 regels) en</w:t>
+        <w:t xml:space="preserve">bevat 28.643 groepslidmaatschappen uit 1936–2025 en</w:t>
       </w:r>
       <w:r>
         <w:t xml:space="preserve"> </w:t>
@@ -5186,7 +5186,7 @@
         <w:t xml:space="preserve"> </w:t>
       </w:r>
       <w:r>
-        <w:t xml:space="preserve">(32.353 regels) blijven daarnaast bestaan als NDFF-groepsindexen: zij bevatten uitsluitend een</w:t>
+        <w:t xml:space="preserve">32.353 uit 1940–2025. Dit zijn NDFF-indexen voor álle bronhouders en protocollen, niet alleen BLWG; respectievelijk 5.771 en 5.671 van die indexregels vermelden BLWG als bronhouder. De indexen bevatten uitsluitend een</w:t>
       </w:r>
       <w:r>
         <w:t xml:space="preserve"> </w:t>
@@ -5210,7 +5210,7 @@
         <w:t xml:space="preserve">ndff_open_waarneming</w:t>
       </w:r>
       <w:r>
-        <w:t xml:space="preserve">. Het voorvoegsel duidt hier dus herkomst aan, niet een afgeleide BLWG-meetreeks. De korstmossenmatrix telt 643 regels (287 positief, 356 afgeleide nullen); de mossenmatrix 354 regels (alle positief). Alle 30 respectievelijk 111 taxonverwijzingen zijn via de centrale taxonstructuur bereikbaar, zonder verweesde referenties. De BLWG-Excel moet nog als afzonderlijke primaire plot-, formulier- en resultaatlaag worden opgenomen, met een herleidbare relatie naar NDFF en zonder dubbeltelling. Bij 154 ambigue openbare regels is die relatie voorlopig alleen op plot-datum-soortniveau mogelijk. De acht eenmalige locaties hebben geen volledige WKT-begrenzing; hun RD-punten zijn niet vanzelf een exact onderzocht vlak. Voor protocol 02.204 meldde BLWG dat, voor zover bekend, geen oorspronkelijke kopgegevens worden bijgehouden. Vraag daarvoor nu niet opnieuw gegevens op.</w:t>
+        <w:t xml:space="preserve">. Het voorvoegsel duidt hier dus de NDFF-herkomst aan, niet een afgeleide BLWG-meetreeks. De korstmossenmatrix voor protocol 02.202 telt 643 regels (287 positief, 356 afgeleide nullen); de mossenmatrix voor protocol 02.204 telt 354 regels (alle positief). Alle 30 respectievelijk 111 taxonverwijzingen zijn via de centrale taxonstructuur bereikbaar, zonder verweesde referenties. De BLWG-Excel moet nog als afzonderlijke primaire plot-, formulier- en resultaatlaag worden opgenomen, met een herleidbare relatie naar NDFF en zonder dubbeltelling. Bij 154 ambigue openbare regels is die relatie voorlopig alleen op plot-datum-soortniveau mogelijk. De acht eenmalige locaties hebben geen volledige WKT-begrenzing; hun RD-punten zijn niet vanzelf een exact onderzocht vlak. Voor protocol 02.204 meldde BLWG dat, voor zover bekend, geen oorspronkelijke kopgegevens worden bijgehouden. Vraag daarvoor nu niet opnieuw gegevens op.</w:t>
       </w:r>
     </w:p>
     <w:p>

</xml_diff>

<commit_message>
Importeer oorspronkelijke BLWG-korstmossenformulieren veilig
</commit_message>
<xml_diff>
--- a/docs/MEIJENDEL_BRONREGISTER.docx
+++ b/docs/MEIJENDEL_BRONREGISTER.docx
@@ -5053,7 +5053,7 @@
         <w:t xml:space="preserve"> </w:t>
       </w:r>
       <w:r>
-        <w:t xml:space="preserve">onderscheidt de originele waarnemersformulieren, maar voor 154 openbare regels is plot-datum-soort niet uniek; hun individuele NDFF-identiteit kan daarom niet willekeurig aan één formulier worden verbonden. De bron is nog niet als aparte primaire laag geïmporteerd en de bestaande NDFF-bronregels blijven behouden.</w:t>
+        <w:t xml:space="preserve">onderscheidt de originele waarnemersformulieren. Van de openbare regels konden 210 rechtstreeks aan een NDFF-ID worden gekoppeld; voor 154 regels is plot-datum-soort niet uniek en blijft de relatie op groepsniveau. Bij de beschermde regels zijn veertien directe en zes groepskoppelingen vastgelegd. De bestaande NDFF-waarnemingen zijn niet als nieuwe waarnemingen ingevoerd en blijven ongewijzigd.</w:t>
       </w:r>
     </w:p>
     <w:p>
@@ -5071,7 +5071,7 @@
         <w:t xml:space="preserve"> </w:t>
       </w:r>
       <w:r>
-        <w:t xml:space="preserve">De vier vaste korstmossenplots uit 2000–2025 geven zes meetronden en 25 in die reeks aangetroffen taxa. Voor de 24 niet-gevoelige taxa zijn in de openbare afgeleide matrix 356 afgeleide nullen op vaste plotbezoeken verdedigbaar;</w:t>
+        <w:t xml:space="preserve">De vier vaste korstmossenplots uit 2000–2025 geven zes meetronden en 25 in die reeks aangetroffen taxa. De oorspronkelijke formuliermatrix bevat 790 openbare formulier-taxonregels, waaronder 426 nullen voor de 24 niet-gevoelige vaste-plot-taxa. Dit zijn andere teleenheden dan de eerdere NDFF-afgeleide matrix van 643 regels met 356 nullen per samengenomen plotbezoek: beide mogen niet worden opgeteld. Voor de beschermde</w:t>
       </w:r>
       <w:r>
         <w:t xml:space="preserve"> </w:t>
@@ -5087,7 +5087,7 @@
         <w:t xml:space="preserve"> </w:t>
       </w:r>
       <w:r>
-        <w:t xml:space="preserve">en exacte locaties blijven afgeschermd. De acht eenmalige locaties blijven uitsluitend aanwezigheid en hebben geen nullen. De lokale reeks ondersteunt vergelijking van aanwezigheid en ordinale bedekking op de vier plots, niet automatisch een gebiedsbrede populatietrend of causaal beheereffect. De mossenlaag bevat 354 positieve combinaties uit 2000–2011 en geen nullen; zonder oorspronkelijke kopgegevens is zij verspreidingscontext, geen zelfstandige lokale tijdreeks.</w:t>
+        <w:t xml:space="preserve">staan afzonderlijk 28 formulier-taxonregels, waarvan acht nullen, in het lokale beveiligde schema. De acht eenmalige locaties blijven uitsluitend aanwezigheid en hebben geen nullen. De lokale reeks ondersteunt vergelijking van aanwezigheid en ordinale bedekking op de vier plots, niet automatisch een gebiedsbrede populatietrend of causaal beheereffect. De mossenlaag bevat 354 positieve combinaties uit 2000–2011 en geen nullen; zonder oorspronkelijke kopgegevens is zij verspreidingscontext, geen zelfstandige lokale tijdreeks.</w:t>
       </w:r>
     </w:p>
     <w:p>
@@ -5105,7 +5105,7 @@
         <w:t xml:space="preserve"> </w:t>
       </w:r>
       <w:r>
-        <w:t xml:space="preserve">De tien BLWG-afgeleide tabellen in de levende lokale</w:t>
+        <w:t xml:space="preserve">De tien eerder uit NDFF afgeleide tabellen in de levende lokale</w:t>
       </w:r>
       <w:r>
         <w:t xml:space="preserve"> </w:t>
@@ -5117,7 +5117,7 @@
         <w:t xml:space="preserve">Meijendel</w:t>
       </w:r>
       <w:r>
-        <w:t xml:space="preserve">-database heten sinds 23 oktober 2026</w:t>
+        <w:t xml:space="preserve">-database heten</w:t>
       </w:r>
       <w:r>
         <w:t xml:space="preserve"> </w:t>
@@ -5156,7 +5156,97 @@
         <w:t xml:space="preserve">ndff_</w:t>
       </w:r>
       <w:r>
-        <w:t xml:space="preserve">-voorvoegsel.</w:t>
+        <w:t xml:space="preserve">-voorvoegsel. De primaire BLWG-levering is op 23 oktober 2026 daarnaast in zes afzonderlijke</w:t>
+      </w:r>
+      <w:r>
+        <w:t xml:space="preserve"> </w:t>
+      </w:r>
+      <w:r>
+        <w:rPr>
+          <w:rStyle w:val="VerbatimChar"/>
+        </w:rPr>
+        <w:t xml:space="preserve">korstmossen_bron*</w:t>
+      </w:r>
+      <w:r>
+        <w:t xml:space="preserve">-tabellen in</w:t>
+      </w:r>
+      <w:r>
+        <w:t xml:space="preserve"> </w:t>
+      </w:r>
+      <w:r>
+        <w:rPr>
+          <w:rStyle w:val="VerbatimChar"/>
+        </w:rPr>
+        <w:t xml:space="preserve">Meijendel</w:t>
+      </w:r>
+      <w:r>
+        <w:t xml:space="preserve"> </w:t>
+      </w:r>
+      <w:r>
+        <w:t xml:space="preserve">en vier</w:t>
+      </w:r>
+      <w:r>
+        <w:t xml:space="preserve"> </w:t>
+      </w:r>
+      <w:r>
+        <w:rPr>
+          <w:rStyle w:val="VerbatimChar"/>
+        </w:rPr>
+        <w:t xml:space="preserve">blwg_korstmossen_*</w:t>
+      </w:r>
+      <w:r>
+        <w:t xml:space="preserve">-tabellen in</w:t>
+      </w:r>
+      <w:r>
+        <w:t xml:space="preserve"> </w:t>
+      </w:r>
+      <w:r>
+        <w:rPr>
+          <w:rStyle w:val="VerbatimChar"/>
+        </w:rPr>
+        <w:t xml:space="preserve">Meijendel_ndff_secure</w:t>
+      </w:r>
+      <w:r>
+        <w:t xml:space="preserve"> </w:t>
+      </w:r>
+      <w:r>
+        <w:t xml:space="preserve">opgenomen. Het origineel staat ongewijzigd op de T7 onder</w:t>
+      </w:r>
+      <w:r>
+        <w:t xml:space="preserve"> </w:t>
+      </w:r>
+      <w:r>
+        <w:rPr>
+          <w:rStyle w:val="VerbatimChar"/>
+        </w:rPr>
+        <w:t xml:space="preserve">Meijendel data/NDFF/BLWG/</w:t>
+      </w:r>
+      <w:r>
+        <w:t xml:space="preserve">; SHA-256:</w:t>
+      </w:r>
+      <w:r>
+        <w:t xml:space="preserve"> </w:t>
+      </w:r>
+      <w:r>
+        <w:rPr>
+          <w:rStyle w:val="VerbatimChar"/>
+        </w:rPr>
+        <w:t xml:space="preserve">d90ea5f85e35f4190bdc87c98f74201ec77b5bad27632942ca0b2cd91488a32f</w:t>
+      </w:r>
+      <w:r>
+        <w:t xml:space="preserve">. Alleen de vier beschermde plotlocaties, twintig beschermde positieve regels en hun acht nullen zijn in het beveiligde schema opgeslagen. De overige acht bronpunten staan in</w:t>
+      </w:r>
+      <w:r>
+        <w:t xml:space="preserve"> </w:t>
+      </w:r>
+      <w:r>
+        <w:rPr>
+          <w:rStyle w:val="VerbatimChar"/>
+        </w:rPr>
+        <w:t xml:space="preserve">Meijendel</w:t>
+      </w:r>
+      <w:r>
+        <w:t xml:space="preserve">; hun RD-punten zijn niet vanzelf een exact onderzocht vlak. De 31 BLWG-bronnamen zijn met behoud van de oorspronkelijke spelling voorlopig aan het centrale taxonregister gekoppeld. De eerdere NDFF-matrix blijft als afzonderlijke, secundaire reconstructie bestaan; analyses kiezen één telbasis en tellen beide niet op.</w:t>
       </w:r>
       <w:r>
         <w:t xml:space="preserve"> </w:t>
@@ -5171,7 +5261,7 @@
         <w:t xml:space="preserve"> </w:t>
       </w:r>
       <w:r>
-        <w:t xml:space="preserve">bevat 28.643 groepslidmaatschappen uit 1936–2025 en</w:t>
+        <w:t xml:space="preserve">en</w:t>
       </w:r>
       <w:r>
         <w:t xml:space="preserve"> </w:t>
@@ -5186,31 +5276,7 @@
         <w:t xml:space="preserve"> </w:t>
       </w:r>
       <w:r>
-        <w:t xml:space="preserve">32.353 uit 1940–2025. Dit zijn NDFF-indexen voor álle bronhouders en protocollen, niet alleen BLWG; respectievelijk 5.771 en 5.671 van die indexregels vermelden BLWG als bronhouder. De indexen bevatten uitsluitend een</w:t>
-      </w:r>
-      <w:r>
-        <w:t xml:space="preserve"> </w:t>
-      </w:r>
-      <w:r>
-        <w:rPr>
-          <w:rStyle w:val="VerbatimChar"/>
-        </w:rPr>
-        <w:t xml:space="preserve">waarneming_id</w:t>
-      </w:r>
-      <w:r>
-        <w:t xml:space="preserve">, geen tweede exemplaar van de waarnemingsgegevens. Alle index-ID's verwijzen naar</w:t>
-      </w:r>
-      <w:r>
-        <w:t xml:space="preserve"> </w:t>
-      </w:r>
-      <w:r>
-        <w:rPr>
-          <w:rStyle w:val="VerbatimChar"/>
-        </w:rPr>
-        <w:t xml:space="preserve">ndff_open_waarneming</w:t>
-      </w:r>
-      <w:r>
-        <w:t xml:space="preserve">. Het voorvoegsel duidt hier dus de NDFF-herkomst aan, niet een afgeleide BLWG-meetreeks. De korstmossenmatrix voor protocol 02.202 telt 643 regels (287 positief, 356 afgeleide nullen); de mossenmatrix voor protocol 02.204 telt 354 regels (alle positief). Alle 30 respectievelijk 111 taxonverwijzingen zijn via de centrale taxonstructuur bereikbaar, zonder verweesde referenties. De BLWG-Excel moet nog als afzonderlijke primaire plot-, formulier- en resultaatlaag worden opgenomen, met een herleidbare relatie naar NDFF en zonder dubbeltelling. Bij 154 ambigue openbare regels is die relatie voorlopig alleen op plot-datum-soortniveau mogelijk. De acht eenmalige locaties hebben geen volledige WKT-begrenzing; hun RD-punten zijn niet vanzelf een exact onderzocht vlak. Voor protocol 02.204 meldde BLWG dat, voor zover bekend, geen oorspronkelijke kopgegevens worden bijgehouden. Vraag daarvoor nu niet opnieuw gegevens op.</w:t>
+        <w:t xml:space="preserve">blijven NDFF-indexen voor alle bronhouders, niet uitsluitend BLWG. Voor protocol 02.204 meldde BLWG dat, voor zover bekend, geen oorspronkelijke kopgegevens worden bijgehouden. Vraag daarvoor nu niet opnieuw gegevens op.</w:t>
       </w:r>
     </w:p>
     <w:p>

</xml_diff>

<commit_message>
Verhuis NDFF mossen en korstmossen zonder dubbele bronregels
</commit_message>
<xml_diff>
--- a/docs/MEIJENDEL_BRONREGISTER.docx
+++ b/docs/MEIJENDEL_BRONREGISTER.docx
@@ -22,6 +22,12 @@
           <w:bCs/>
         </w:rPr>
         <w:t xml:space="preserve">Stand: 23 oktober 2026.</w:t>
+      </w:r>
+    </w:p>
+    <w:p>
+      <w:pPr/>
+      <w:r>
+        <w:t>Opslagwijziging van 23 oktober 2026. De 32.353 openbare NDFF-moswaarnemingen uit 1940–2025 en 28.643 openbare NDFF-korstmoswaarnemingen uit 1936–2025 staan nu als volledige bronregels in Meijendel.mossen_waarneming en Meijendel.korstmossen_waarneming. De overige 749.834 openbare regels blijven in ndff_open_waarneming. Een smal register verbindt de 810.830 unieke openbare identiteiten met precies één fysieke tabel; het bewaart geen tweede volledige waarneming. De vroegere ID-only-tabellen ndff_mossen en ndff_korstmossen zijn verwijderd. De afzonderlijke BLWG-formulieren en hun resultaten, de bestaande PQ-kwalificaties en de afgeschermde exacte geometrieën zijn behouden. Dit is een opslagverbetering, geen nieuwe bron of bewijs voor extra trends.</w:t>
       </w:r>
     </w:p>
     <w:p>

</xml_diff>

<commit_message>
Audit NDFF moss and lichen overlap with provincial PQ
</commit_message>
<xml_diff>
--- a/docs/MEIJENDEL_BRONREGISTER.docx
+++ b/docs/MEIJENDEL_BRONREGISTER.docx
@@ -3222,6 +3222,20 @@
       </w:r>
       <w:r>
         <w:t xml:space="preserve">.</w:t>
+      </w:r>
+    </w:p>
+    <w:p>
+      <w:pPr>
+        <w:pStyle w:val="BodyText"/>
+      </w:pPr>
+      <w:r>
+        <w:rPr>
+          <w:b/>
+        </w:rPr>
+        <w:t>Gerichte mos- en korstmosvergelijking, 23 oktober 2026.</w:t>
+      </w:r>
+      <w:r>
+        <w:t xml:space="preserve"> Van 10.903 openbare NDFF-mosregels en 2.998 openbare NDFF-korstmosregels met mogelijke PQ-herkomst uit 1981–2025 passen er respectievelijk 3.020 en 936 strikt één-op-één op een provinciale taxonregel: datum, taxon, bedekkingsklasse en ligging van het provinciepunt binnen de NDFF-polygoon stemmen overeen. Deze 3.956 NDFF-regels vertegenwoordigen 3.615 verschillende bronsignaturen en 3.615 provinciale taxonregels in 770 opnamen; 341 signaturen zijn in NDFF dubbel onder de protocollen 12.007 en 12.202 geregistreerd. Nog 228 regels hebben een nabije één-op-één-kandidaat binnen 8 meter. Een oorspronkelijke gedeelde opname-ID ontbreekt, zodat dit sterke inhoudelijke aanwijzingen voor dubbeling zijn, geen bewezen exacte bronidentiteiten. De overige kandidaten zijn niet automatisch onafhankelijk: 292 hebben meerdere passende koppelingen, 14 een afwijkende bedekking, 3.128 alleen een gelijke datum en soort op een andere plaats en 6.283 geen gelijke datum-soortcombinatie. De provinciale PQ-reeks blijft leidend; deze NDFF-regels worden niet als extra PQ-metingen of als zelfstandige trenddata opgeteld. De volledige beslisregels en alle 13.901 uitkomsten per NDFF-ID staan in docs/bronnen/audits/NDFF_PQ_MOS_KORSTMOS_VERGELIJKING.md en gis/audit/ndff_pq_mos_korstmos_audit_v1.csv. Er zijn geen bronregels, geometrieën of bestaande PQ-statussen gewijzigd.</w:t>
       </w:r>
     </w:p>
     <w:p>

</xml_diff>

<commit_message>
Documenteer gecontroleerd back-uparchief op T7
</commit_message>
<xml_diff>
--- a/docs/MEIJENDEL_BRONREGISTER.docx
+++ b/docs/MEIJENDEL_BRONREGISTER.docx
@@ -10907,6 +10907,39 @@
       </w:pPr>
       <w:r>
         <w:t xml:space="preserve">Controlebewijs en hersteldefinities staan lokaal in /Users/ton/Documents/Meijendel-herstel/2026-10-16-maatregelen-rechtstreeks. De drie viewdefinities staan in views/restore-views.sql. Dit bestand wordt uitsluitend bij een afzonderlijk besloten herstel gebruikt. De zware Meijendel.sql-export, volledige cachebouw en VPS-publicatie maken geen deel uit van deze vervolgwijziging.</w:t>
+      </w:r>
+    </w:p>
+    <w:p>
+      <w:pPr>
+        <w:pStyle w:val="Heading1"/>
+        <w:pageBreakBefore/>
+      </w:pPr>
+      <w:r>
+        <w:t>Archivering van herstelkopieën op 23 oktober 2026</w:t>
+      </w:r>
+    </w:p>
+    <w:p>
+      <w:pPr>
+        <w:pStyle w:val="BodyText"/>
+      </w:pPr>
+      <w:r>
+        <w:t>De 60 herstelbestanden uit /Users/ton/Documents/Backups zijn op 23 oktober 2026 ondergebracht in /Volumes/T7 Data/Home_Ton/Meijendel data/Backups-archief. De oorspronkelijke submappen zijn behouden: Meijendel bevat 59 SQL-bestanden van 2–3 oktober 2026 (18.190.535.905 bytes); Zotero/Meijendel/2026-09-25 bevat één databasekopie van 25 september 2026 (84.246.528 bytes). Samen: 18.274.782.433 bytes.</w:t>
+      </w:r>
+    </w:p>
+    <w:p>
+      <w:pPr>
+        <w:pStyle w:val="BodyText"/>
+      </w:pPr>
+      <w:r>
+        <w:t>Alle 60 bestanden zijn vóór verwijdering uit iCloud per bestand op omvang en SHA-256 vergeleken met de T7-kopie. Het controlebestand CONTROLE_SHA256.json in de archiefmap bevat de relatieve bestandsnamen, aantallen bytes en controlewaarden. De bestanden behouden hun betekenis als historische herstelpunten vóór wijzigingen; dit is geen actuele volledige back-up van de levende databases. De Zotero-databasekopie bevat geen afzonderlijke bijlagebestanden.</w:t>
+      </w:r>
+    </w:p>
+    <w:p>
+      <w:pPr>
+        <w:pStyle w:val="BodyText"/>
+      </w:pPr>
+      <w:r>
+        <w:t>De eerdere locatie onder Documents viel onder iCloud. De archiefmap op de T7 staat buiten iCloud. De ecologische bronbestanden, inhoud, bronbeoordelingen en analytische toelatingsstatussen zijn door deze archivering niet gewijzigd. Dit betreft herstelkopieën van Meijendel en Zotero; het verplaatst geen gegevens uit Meijendel_bronnen en wijzigt geen kandidaatbron. De oude locatie wordt niet als back-updoel hergebruikt.</w:t>
       </w:r>
     </w:p>
     <w:sectPr>

</xml_diff>

<commit_message>
Add read-only moss and lichen analysis queries
</commit_message>
<xml_diff>
--- a/docs/MEIJENDEL_BRONREGISTER.docx
+++ b/docs/MEIJENDEL_BRONREGISTER.docx
@@ -17,11 +17,7 @@
         <w:pStyle w:val="FirstParagraph"/>
       </w:pPr>
       <w:r>
-        <w:rPr>
-          <w:b/>
-          <w:bCs/>
-        </w:rPr>
-        <w:t xml:space="preserve">Stand: 23 oktober 2026.</w:t>
+        <w:t>Stand: 24 oktober 2026.</w:t>
       </w:r>
     </w:p>
     <w:p>
@@ -5027,7 +5023,7 @@
         <w:t xml:space="preserve"> </w:t>
       </w:r>
       <w:r>
-        <w:t xml:space="preserve">bevat de klassen 1, 2, 3, 5 en 6. Gebruik voor analyses de velddatum; het rapportagejaar ligt bij de toegevoegde formulieren uit 2015 en 2018 telkens één jaar eerder.</w:t>
+        <w:t>bevat de klassen 1, 2, 3, 5 en 6. Gebruik voor analyses de velddatum: bij 40 van de 44 formulieren ligt het rapportagejaar één jaar eerder; bij de vier formulieren uit 2006 is het gelijk aan het veldjaar.</w:t>
       </w:r>
     </w:p>
     <w:p>
@@ -5111,6 +5107,12 @@
       </w:r>
     </w:p>
     <w:p>
+      <w:pPr/>
+      <w:r>
+        <w:t>Analysecontrole, 24 oktober 2026. De 44 formulieren vormen 32 locatie-meetjaren; twaalf daarvan hebben twee waarnemersformulieren. Na samenvoegen per locatie, veldjaar en brontaxon blijven 643 openbare combinaties over: 287 met aanwezigheid en 356 met een echte nul. Van de 24 locatie-meetjaren op de vier vaste plots zijn er 576 openbare taxoncombinaties: 220 aanwezig en 356 nul. Bij negen combinaties verschillen de formulieren over aanwezigheid; bij acht vaste-plotcombinaties verschilt de positieve hoeveelheidscode. Bij de acht eenmalige locaties komen nog acht codeverschillen voor, maar geen nullen. Een soort geldt in een meetjaar als aanwezig zodra één formulier haar meldt; alleen als alle formulieren voor die soort nul zijn, geldt de samengenomen meetronde als nul. Verschillende oorspronkelijke codes blijven als verschil herkenbaar; de ordinale codes 1, 2, 3, 5 en 6 worden niet opgeteld of gemiddeld. Het meetjaar komt uit de velddatum; het rapportagejaar wijkt bij 40 van de 44 formulieren een jaar af. De herhaalbare alleen-lezen-SELECT-query's staan in gis/scripts/analyse_blwg_mossen_korstmossen.sql. De provinciale PQ-reeks bevat daarnaast 7.753 positieve mosregels en 1.905 positieve korstmosregels uit 1981–2025; die blijven een aparte primaire vegetatiereeks, niet extra BLWG-tellingen. De NDFF-mosreconstructie bevat zeven hokinventarisaties en 354 positieve taxoncombinaties uit 2000–2011, zonder echte nullen. Niet-gematchte NDFF-regels worden daarom niet stilzwijgend als onafhankelijke meetronden meegeteld.</w:t>
+      </w:r>
+    </w:p>
+    <w:p>
       <w:pPr>
         <w:pStyle w:val="BodyText"/>
       </w:pPr>
@@ -5275,28 +5277,19 @@
         <w:rPr>
           <w:rStyle w:val="VerbatimChar"/>
         </w:rPr>
-        <w:t xml:space="preserve">ndff_korstmossen</w:t>
-      </w:r>
-      <w:r>
-        <w:t xml:space="preserve"> </w:t>
-      </w:r>
-      <w:r>
-        <w:t xml:space="preserve">en</w:t>
-      </w:r>
-      <w:r>
-        <w:t xml:space="preserve"> </w:t>
-      </w:r>
-      <w:r>
-        <w:rPr>
-          <w:rStyle w:val="VerbatimChar"/>
-        </w:rPr>
-        <w:t xml:space="preserve">ndff_mossen</w:t>
-      </w:r>
-      <w:r>
-        <w:t xml:space="preserve"> </w:t>
-      </w:r>
-      <w:r>
-        <w:t xml:space="preserve">blijven NDFF-indexen voor alle bronhouders, niet uitsluitend BLWG. Voor protocol 02.204 meldde BLWG dat, voor zover bekend, geen oorspronkelijke kopgegevens worden bijgehouden. Vraag daarvoor nu niet opnieuw gegevens op.</w:t>
+        <w:t xml:space="preserve">De voormalige ID-only-tabellen ndff_korstmossen en ndff_mossen zijn op 23 oktober 2026 verwijderd na fysieke verhuizing van de volledige openbare NDFF-regels naar korstmossen_waarneming en mossen_waarneming. </w:t>
+      </w:r>
+      <w:r/>
+      <w:r/>
+      <w:r/>
+      <w:r>
+        <w:rPr>
+          <w:rStyle w:val="VerbatimChar"/>
+        </w:rPr>
+      </w:r>
+      <w:r/>
+      <w:r>
+        <w:t>Voor protocol 02.204 meldde BLWG dat, voor zover bekend, geen oorspronkelijke kopgegevens worden bijgehouden. Vraag daarvoor nu niet opnieuw gegevens op.</w:t>
       </w:r>
     </w:p>
     <w:p>

</xml_diff>

<commit_message>
Documenteer toestemming en classificatie-instellingen
</commit_message>
<xml_diff>
--- a/docs/MEIJENDEL_BRONREGISTER.docx
+++ b/docs/MEIJENDEL_BRONREGISTER.docx
@@ -21,7 +21,7 @@
           <w:b/>
           <w:bCs/>
         </w:rPr>
-        <w:t xml:space="preserve">Stand: 19 oktober 2026.</w:t>
+        <w:t xml:space="preserve">Stand: 25 oktober 2026.</w:t>
       </w:r>
     </w:p>
     <w:p>
@@ -10385,37 +10385,111 @@
         <w:t xml:space="preserve"> </w:t>
       </w:r>
       <w:r>
-        <w:t xml:space="preserve">validatiepunten. Achim meldt bovendien dat vergelijking over meer dan twee</w:t>
-      </w:r>
-      <w:r>
-        <w:t xml:space="preserve"> </w:t>
-      </w:r>
-      <w:r>
-        <w:t xml:space="preserve">beeldjaren ook met textuurmaten moeilijk bleef. De bron meet geen</w:t>
-      </w:r>
-      <w:r>
-        <w:t xml:space="preserve"> </w:t>
-      </w:r>
-      <w:r>
-        <w:t xml:space="preserve">vegetatiehoogte, voedsel, nestgelegenheid of andere habitatkwaliteit. Voor</w:t>
-      </w:r>
-      <w:r>
-        <w:t xml:space="preserve"> </w:t>
-      </w:r>
-      <w:r>
-        <w:t xml:space="preserve">herpublicatie van de ontvangen bestanden is nog geen afzonderlijke toestemming</w:t>
-      </w:r>
-      <w:r>
-        <w:t xml:space="preserve"> </w:t>
-      </w:r>
-      <w:r>
-        <w:t xml:space="preserve">vastgelegd; gebruik blijft daarom voorlopig beperkt tot de lokale</w:t>
-      </w:r>
-      <w:r>
-        <w:t xml:space="preserve"> </w:t>
-      </w:r>
-      <w:r>
-        <w:t xml:space="preserve">projectanalyse.</w:t>
+        <w:t xml:space="preserve">validatiepunten. Sandra Schmidt-Tauscher heeft op 20 oktober 2026 bevestigd dat</w:t>
+      </w:r>
+      <w:r>
+        <w:t xml:space="preserve"> </w:t>
+      </w:r>
+      <w:r>
+        <w:t xml:space="preserve">ook de oorspronkelijke trainingspixels niet meer beschikbaar zijn. Zij heeft</w:t>
+      </w:r>
+      <w:r>
+        <w:t xml:space="preserve"> </w:t>
+      </w:r>
+      <w:r>
+        <w:t xml:space="preserve">wel de gebruikte instellingen van de Semi-Automatic Classification Plugin</w:t>
+      </w:r>
+      <w:r>
+        <w:t xml:space="preserve"> </w:t>
+      </w:r>
+      <w:r>
+        <w:t xml:space="preserve">vastgelegd: een Random Forest met 10 beslisbomen en 5.000 trainingspixels. In</w:t>
+      </w:r>
+      <w:r>
+        <w:t xml:space="preserve"> </w:t>
+      </w:r>
+      <w:r>
+        <w:t xml:space="preserve">hun eigen proeven nam de classificatienauwkeurigheid af bij hogere aantallen</w:t>
+      </w:r>
+      <w:r>
+        <w:t xml:space="preserve"> </w:t>
+      </w:r>
+      <w:r>
+        <w:t xml:space="preserve">bomen of trainingspixels. Dit vult de methodebeschrijving aan, maar zonder de</w:t>
+      </w:r>
+      <w:r>
+        <w:t xml:space="preserve"> </w:t>
+      </w:r>
+      <w:r>
+        <w:t xml:space="preserve">gebruikte trainingspixels en validatiepunten kan de classificatie niet exact</w:t>
+      </w:r>
+      <w:r>
+        <w:t xml:space="preserve"> </w:t>
+      </w:r>
+      <w:r>
+        <w:t xml:space="preserve">worden gereproduceerd of op pixelniveau onafhankelijk worden gecontroleerd.</w:t>
+      </w:r>
+      <w:r>
+        <w:t xml:space="preserve"> </w:t>
+      </w:r>
+      <w:r>
+        <w:t xml:space="preserve">Achim meldt bovendien dat vergelijking over meer dan twee beeldjaren ook met</w:t>
+      </w:r>
+      <w:r>
+        <w:t xml:space="preserve"> </w:t>
+      </w:r>
+      <w:r>
+        <w:t xml:space="preserve">textuurmaten moeilijk bleef. De bron meet geen vegetatiehoogte, voedsel,</w:t>
+      </w:r>
+      <w:r>
+        <w:t xml:space="preserve"> </w:t>
+      </w:r>
+      <w:r>
+        <w:t xml:space="preserve">nestgelegenheid of andere habitatkwaliteit.</w:t>
+      </w:r>
+    </w:p>
+    <w:p>
+      <w:pPr>
+        <w:pStyle w:val="BodyText"/>
+      </w:pPr>
+      <w:r>
+        <w:t xml:space="preserve">Achim Häger en Sandra Schmidt-Tauscher hebben op 20 oktober 2026 beiden</w:t>
+      </w:r>
+      <w:r>
+        <w:t xml:space="preserve"> </w:t>
+      </w:r>
+      <w:r>
+        <w:t xml:space="preserve">schriftelijk ingestemd met gebruik van de twee classificatierasters voor verder</w:t>
+      </w:r>
+      <w:r>
+        <w:t xml:space="preserve"> </w:t>
+      </w:r>
+      <w:r>
+        <w:t xml:space="preserve">onderzoek. De rasters en afgeleide resultaten mogen daarmee in de</w:t>
+      </w:r>
+      <w:r>
+        <w:t xml:space="preserve"> </w:t>
+      </w:r>
+      <w:r>
+        <w:t xml:space="preserve">broedvogel–vegetatieanalyse en de daaruit voortkomende onderzoeksrapportage</w:t>
+      </w:r>
+      <w:r>
+        <w:t xml:space="preserve"> </w:t>
+      </w:r>
+      <w:r>
+        <w:t xml:space="preserve">worden gebruikt. Er is geen open licentie of afzonderlijke toestemming voor</w:t>
+      </w:r>
+      <w:r>
+        <w:t xml:space="preserve"> </w:t>
+      </w:r>
+      <w:r>
+        <w:t xml:space="preserve">openbare verspreiding van de oorspronkelijke GeoTIFFs vastgelegd; die</w:t>
+      </w:r>
+      <w:r>
+        <w:t xml:space="preserve"> </w:t>
+      </w:r>
+      <w:r>
+        <w:t xml:space="preserve">bronbestanden worden daarom niet zelfstandig gepubliceerd.</w:t>
       </w:r>
     </w:p>
     <w:p>

</xml_diff>

<commit_message>
Leg historische Dunea-luchtfotoreeks vast
</commit_message>
<xml_diff>
--- a/docs/MEIJENDEL_BRONREGISTER.docx
+++ b/docs/MEIJENDEL_BRONREGISTER.docx
@@ -21,7 +21,7 @@
           <w:b/>
           <w:bCs/>
         </w:rPr>
-        <w:t xml:space="preserve">Stand: 25 oktober 2026.</w:t>
+        <w:t xml:space="preserve">Stand: 26 oktober 2026.</w:t>
       </w:r>
     </w:p>
     <w:p>
@@ -7079,6 +7079,244 @@
       </w:r>
       <w:r>
         <w:t xml:space="preserve">vogelverandering worden gebruikt.</w:t>
+      </w:r>
+    </w:p>
+    <w:p>
+      <w:pPr>
+        <w:pStyle w:val="BodyText"/>
+      </w:pPr>
+      <w:r>
+        <w:rPr>
+          <w:b/>
+          <w:bCs/>
+        </w:rPr>
+        <w:t xml:space="preserve">Historische Dunea-reeks, bronbericht 26 oktober 2026.</w:t>
+      </w:r>
+      <w:r>
+        <w:t xml:space="preserve"> </w:t>
+      </w:r>
+      <w:r>
+        <w:t xml:space="preserve">Harrie Van der</w:t>
+      </w:r>
+      <w:r>
+        <w:t xml:space="preserve"> </w:t>
+      </w:r>
+      <w:r>
+        <w:t xml:space="preserve">Hagen meldt dat Dunea gebiedsdekkende luchtfoto's van heel Meijendel beheert.</w:t>
+      </w:r>
+      <w:r>
+        <w:t xml:space="preserve"> </w:t>
+      </w:r>
+      <w:r>
+        <w:t xml:space="preserve">Hij noemt zwart-witopnamen uit 1938, 1944, 1962 en 1966, meestal op ongeveer</w:t>
+      </w:r>
+      <w:r>
+        <w:t xml:space="preserve"> </w:t>
+      </w:r>
+      <w:r>
+        <w:t xml:space="preserve">1:18.000, en kleureninfraroodopnamen uit 1975, 1980, 1985, 1990, 1995, 2001,</w:t>
+      </w:r>
+      <w:r>
+        <w:t xml:space="preserve"> </w:t>
+      </w:r>
+      <w:r>
+        <w:t xml:space="preserve">2009, 2016 en 2023, op ongeveer 1:2.500. In één doorgestuurde versie staat</w:t>
+      </w:r>
+      <w:r>
+        <w:t xml:space="preserve"> </w:t>
+      </w:r>
+      <w:r>
+        <w:rPr>
+          <w:rStyle w:val="VerbatimChar"/>
+        </w:rPr>
+        <w:t xml:space="preserve">1895</w:t>
+      </w:r>
+      <w:r>
+        <w:t xml:space="preserve">; dit is in Tons weergave gecorrigeerd naar het chronologisch passende</w:t>
+      </w:r>
+      <w:r>
+        <w:t xml:space="preserve"> </w:t>
+      </w:r>
+      <w:r>
+        <w:t xml:space="preserve">1985. Harrie is niet meer zeker van de laatste twee jaren. De exacte jaren,</w:t>
+      </w:r>
+      <w:r>
+        <w:t xml:space="preserve"> </w:t>
+      </w:r>
+      <w:r>
+        <w:t xml:space="preserve">vluchten, dekking, bestanden en schaal moeten daarom eerst door Dunea worden</w:t>
+      </w:r>
+      <w:r>
+        <w:t xml:space="preserve"> </w:t>
+      </w:r>
+      <w:r>
+        <w:t xml:space="preserve">bevestigd. De bestanden zijn niet ontvangen en blijven kandidaatbron.</w:t>
+      </w:r>
+    </w:p>
+    <w:p>
+      <w:pPr>
+        <w:pStyle w:val="BodyText"/>
+      </w:pPr>
+      <w:r>
+        <w:t xml:space="preserve">Volgens Harrie bestaat voor de meeste jaren een interpretatie op basis van het</w:t>
+      </w:r>
+      <w:r>
+        <w:t xml:space="preserve"> </w:t>
+      </w:r>
+      <w:r>
+        <w:t xml:space="preserve">proefschrift van Dan Assendorp. Die indeling was niet passend voor de gebruikte</w:t>
+      </w:r>
+      <w:r>
+        <w:t xml:space="preserve"> </w:t>
+      </w:r>
+      <w:r>
+        <w:t xml:space="preserve">broedvogelgroepen en is daarom voor het onderzoek van Schmidt-Tauscher, Häger</w:t>
+      </w:r>
+      <w:r>
+        <w:t xml:space="preserve"> </w:t>
+      </w:r>
+      <w:r>
+        <w:t xml:space="preserve">en Van der Hagen opnieuw geïnterpreteerd. Voor zijn eigen proefschrift gebruikte</w:t>
+      </w:r>
+      <w:r>
+        <w:t xml:space="preserve"> </w:t>
+      </w:r>
+      <w:r>
+        <w:t xml:space="preserve">Harrie 1975, 1990, 2001 en 2009. De oudere zwart-witbeelden zijn niet zonder</w:t>
+      </w:r>
+      <w:r>
+        <w:t xml:space="preserve"> </w:t>
+      </w:r>
+      <w:r>
+        <w:t xml:space="preserve">meer vergelijkbaar met de fijnschaliger kleureninfraroodreeks; vooral het beeld</w:t>
+      </w:r>
+      <w:r>
+        <w:t xml:space="preserve"> </w:t>
+      </w:r>
+      <w:r>
+        <w:t xml:space="preserve">uit 1938 bevat door de lage zonnestand schaduwen die op bos kunnen lijken.</w:t>
+      </w:r>
+    </w:p>
+    <w:p>
+      <w:pPr>
+        <w:pStyle w:val="BodyText"/>
+      </w:pPr>
+      <w:r>
+        <w:t xml:space="preserve">Dunea is bronhouder. Harrie heeft geen bevoegdheid de bestanden beschikbaar te</w:t>
+      </w:r>
+      <w:r>
+        <w:t xml:space="preserve"> </w:t>
+      </w:r>
+      <w:r>
+        <w:t xml:space="preserve">stellen en verwijst voor een besluit naar Maarten Werink. Hij herinnert zich</w:t>
+      </w:r>
+      <w:r>
+        <w:t xml:space="preserve"> </w:t>
+      </w:r>
+      <w:r>
+        <w:t xml:space="preserve">een eerder idee voor een gezamenlijke proef via een stage, maar deze afspraak</w:t>
+      </w:r>
+      <w:r>
+        <w:t xml:space="preserve"> </w:t>
+      </w:r>
+      <w:r>
+        <w:t xml:space="preserve">is niet in de nu geraadpleegde projectdocumentatie, bijlage of toegankelijke</w:t>
+      </w:r>
+      <w:r>
+        <w:t xml:space="preserve"> </w:t>
+      </w:r>
+      <w:r>
+        <w:t xml:space="preserve">mailbox bevestigd. Vóór een nieuwe uitvraag wordt daarom eerst met Maarten</w:t>
+      </w:r>
+      <w:r>
+        <w:t xml:space="preserve"> </w:t>
+      </w:r>
+      <w:r>
+        <w:t xml:space="preserve">vastgesteld wat Dunea al heeft voorgesteld en welke bestaande fotobeelden,</w:t>
+      </w:r>
+      <w:r>
+        <w:t xml:space="preserve"> </w:t>
+      </w:r>
+      <w:r>
+        <w:t xml:space="preserve">interpretaties en bronmetadata binnen zo'n proef kunnen worden gebruikt.</w:t>
+      </w:r>
+    </w:p>
+    <w:p>
+      <w:pPr>
+        <w:pStyle w:val="BodyText"/>
+      </w:pPr>
+      <w:r>
+        <w:t xml:space="preserve">De reeks kan de twee kaartmomenten 2001 en 2022 aanvullen, maar levert niet</w:t>
+      </w:r>
+      <w:r>
+        <w:t xml:space="preserve"> </w:t>
+      </w:r>
+      <w:r>
+        <w:t xml:space="preserve">automatisch een voorspellend model. Harrie wijst erop dat ontwikkeling in het</w:t>
+      </w:r>
+      <w:r>
+        <w:t xml:space="preserve"> </w:t>
+      </w:r>
+      <w:r>
+        <w:t xml:space="preserve">droge duin sterk kan reageren op afzonderlijke gebeurtenissen en menselijk</w:t>
+      </w:r>
+      <w:r>
+        <w:t xml:space="preserve"> </w:t>
+      </w:r>
+      <w:r>
+        <w:t xml:space="preserve">ingrijpen. Hij noemt onder meer het wegvallen van konijnen na myxomatose, de</w:t>
+      </w:r>
+      <w:r>
+        <w:t xml:space="preserve"> </w:t>
+      </w:r>
+      <w:r>
+        <w:t xml:space="preserve">aanplant van bomen en struiken en van helm tot 1990, begrazing vanaf 1990 en het</w:t>
+      </w:r>
+      <w:r>
+        <w:t xml:space="preserve"> </w:t>
+      </w:r>
+      <w:r>
+        <w:t xml:space="preserve">latere opnieuw openmaken van het duin. Voor voorspelling moeten zulke</w:t>
+      </w:r>
+      <w:r>
+        <w:t xml:space="preserve"> </w:t>
+      </w:r>
+      <w:r>
+        <w:t xml:space="preserve">gebeurtenissen en ingrepen, voor zover zij per plaats en jaar kunnen worden</w:t>
+      </w:r>
+      <w:r>
+        <w:t xml:space="preserve"> </w:t>
+      </w:r>
+      <w:r>
+        <w:t xml:space="preserve">onderbouwd, naast vegetatie, PQ en vogels worden opgenomen. De historische</w:t>
+      </w:r>
+      <w:r>
+        <w:t xml:space="preserve"> </w:t>
+      </w:r>
+      <w:r>
+        <w:t xml:space="preserve">fotoreeks kan dus vooral vaststellen</w:t>
+      </w:r>
+      <w:r>
+        <w:t xml:space="preserve"> </w:t>
+      </w:r>
+      <w:r>
+        <w:rPr>
+          <w:i/>
+          <w:iCs/>
+        </w:rPr>
+        <w:t xml:space="preserve">wanneer en waar</w:t>
+      </w:r>
+      <w:r>
+        <w:t xml:space="preserve"> </w:t>
+      </w:r>
+      <w:r>
+        <w:t xml:space="preserve">structuur veranderde;</w:t>
+      </w:r>
+      <w:r>
+        <w:t xml:space="preserve"> </w:t>
+      </w:r>
+      <w:r>
+        <w:t xml:space="preserve">zij verklaart niet zelfstandig waardoor dat gebeurde.</w:t>
       </w:r>
     </w:p>
     <w:p>
@@ -10507,7 +10745,61 @@
         <w:t xml:space="preserve"> </w:t>
       </w:r>
       <w:r>
-        <w:t xml:space="preserve">rapporten wijzen op aanvullende vegetatie-, bodem- en hydrologische gegevens. Een afzonderlijke digitale gegevenslevering is nog niet gevonden.</w:t>
+        <w:t xml:space="preserve">rapporten wijzen op aanvullende vegetatie-, bodem- en</w:t>
+      </w:r>
+      <w:r>
+        <w:t xml:space="preserve"> </w:t>
+      </w:r>
+      <w:r>
+        <w:t xml:space="preserve">hydrologische gegevens. Harrie Van der Hagen meldt op 26 oktober 2026 dat het</w:t>
+      </w:r>
+      <w:r>
+        <w:t xml:space="preserve"> </w:t>
+      </w:r>
+      <w:r>
+        <w:t xml:space="preserve">vroegere Kiwa vanaf ongeveer 2000 het proefmodel MODAK verder ontwikkelde tot</w:t>
+      </w:r>
+      <w:r>
+        <w:t xml:space="preserve"> </w:t>
+      </w:r>
+      <w:r>
+        <w:t xml:space="preserve">PROBE, mede op basis van HYVEG uit 1992. PROBE werd volgens hem bruikbaar voor</w:t>
+      </w:r>
+      <w:r>
+        <w:t xml:space="preserve"> </w:t>
+      </w:r>
+      <w:r>
+        <w:t xml:space="preserve">vochtafhankelijke vegetatietypen. Een rond 2023 door Dunea en KWR beproefde</w:t>
+      </w:r>
+      <w:r>
+        <w:t xml:space="preserve"> </w:t>
+      </w:r>
+      <w:r>
+        <w:t xml:space="preserve">uitbreiding naar droge duinvegetatie had volgens Harrie weinig voorspellende</w:t>
+      </w:r>
+      <w:r>
+        <w:t xml:space="preserve"> </w:t>
+      </w:r>
+      <w:r>
+        <w:t xml:space="preserve">waarde. Dit is relevante ervaringskennis, maar zonder het achterliggende</w:t>
+      </w:r>
+      <w:r>
+        <w:t xml:space="preserve"> </w:t>
+      </w:r>
+      <w:r>
+        <w:t xml:space="preserve">rapport, gegevens, modelopzet en toetsingsresultaten nog geen zelfstandige</w:t>
+      </w:r>
+      <w:r>
+        <w:t xml:space="preserve"> </w:t>
+      </w:r>
+      <w:r>
+        <w:t xml:space="preserve">analyse-uitkomst voor Meijendel. Een afzonderlijke digitale gegevenslevering</w:t>
+      </w:r>
+      <w:r>
+        <w:t xml:space="preserve"> </w:t>
+      </w:r>
+      <w:r>
+        <w:t xml:space="preserve">of projectrapportage is nog niet gevonden.</w:t>
       </w:r>
     </w:p>
     <w:p>

</xml_diff>

<commit_message>
Corrigeer herkomst idee voor stageproef
</commit_message>
<xml_diff>
--- a/docs/MEIJENDEL_BRONREGISTER.docx
+++ b/docs/MEIJENDEL_BRONREGISTER.docx
@@ -7208,37 +7208,37 @@
         <w:t xml:space="preserve"> </w:t>
       </w:r>
       <w:r>
-        <w:t xml:space="preserve">stellen en verwijst voor een besluit naar Maarten Werink. Hij herinnert zich</w:t>
-      </w:r>
-      <w:r>
-        <w:t xml:space="preserve"> </w:t>
-      </w:r>
-      <w:r>
-        <w:t xml:space="preserve">een eerder idee voor een gezamenlijke proef via een stage, maar deze afspraak</w:t>
-      </w:r>
-      <w:r>
-        <w:t xml:space="preserve"> </w:t>
-      </w:r>
-      <w:r>
-        <w:t xml:space="preserve">is niet in de nu geraadpleegde projectdocumentatie, bijlage of toegankelijke</w:t>
-      </w:r>
-      <w:r>
-        <w:t xml:space="preserve"> </w:t>
-      </w:r>
-      <w:r>
-        <w:t xml:space="preserve">mailbox bevestigd. Vóór een nieuwe uitvraag wordt daarom eerst met Maarten</w:t>
-      </w:r>
-      <w:r>
-        <w:t xml:space="preserve"> </w:t>
-      </w:r>
-      <w:r>
-        <w:t xml:space="preserve">vastgesteld wat Dunea al heeft voorgesteld en welke bestaande fotobeelden,</w:t>
-      </w:r>
-      <w:r>
-        <w:t xml:space="preserve"> </w:t>
-      </w:r>
-      <w:r>
-        <w:t xml:space="preserve">interpretaties en bronmetadata binnen zo'n proef kunnen worden gebruikt.</w:t>
+        <w:t xml:space="preserve">stellen en verwijst voor een besluit naar Maarten Werink. Het idee voor een</w:t>
+      </w:r>
+      <w:r>
+        <w:t xml:space="preserve"> </w:t>
+      </w:r>
+      <w:r>
+        <w:t xml:space="preserve">gezamenlijke proef via een stage is eerder alleen terloops door Harrie aan Ton</w:t>
+      </w:r>
+      <w:r>
+        <w:t xml:space="preserve"> </w:t>
+      </w:r>
+      <w:r>
+        <w:t xml:space="preserve">genoemd; het was geen voorstel of toezegging van Maarten. Maarten wordt daarom</w:t>
+      </w:r>
+      <w:r>
+        <w:t xml:space="preserve"> </w:t>
+      </w:r>
+      <w:r>
+        <w:t xml:space="preserve">zonder veronderstelde voorkennis rechtstreeks gevraagd welke bestaande</w:t>
+      </w:r>
+      <w:r>
+        <w:t xml:space="preserve"> </w:t>
+      </w:r>
+      <w:r>
+        <w:t xml:space="preserve">fotobeelden, interpretaties en bronmetadata Dunea voor het onderzoek</w:t>
+      </w:r>
+      <w:r>
+        <w:t xml:space="preserve"> </w:t>
+      </w:r>
+      <w:r>
+        <w:t xml:space="preserve">beschikbaar kan stellen en onder welke voorwaarden.</w:t>
       </w:r>
     </w:p>
     <w:p>

</xml_diff>

<commit_message>
Onderzoek betekenis MODAK HYVEG en PROBE
</commit_message>
<xml_diff>
--- a/docs/MEIJENDEL_BRONREGISTER.docx
+++ b/docs/MEIJENDEL_BRONREGISTER.docx
@@ -10745,61 +10745,236 @@
         <w:t xml:space="preserve"> </w:t>
       </w:r>
       <w:r>
-        <w:t xml:space="preserve">rapporten wijzen op aanvullende vegetatie-, bodem- en</w:t>
-      </w:r>
-      <w:r>
-        <w:t xml:space="preserve"> </w:t>
-      </w:r>
-      <w:r>
-        <w:t xml:space="preserve">hydrologische gegevens. Harrie Van der Hagen meldt op 26 oktober 2026 dat het</w:t>
-      </w:r>
-      <w:r>
-        <w:t xml:space="preserve"> </w:t>
-      </w:r>
-      <w:r>
-        <w:t xml:space="preserve">vroegere Kiwa vanaf ongeveer 2000 het proefmodel MODAK verder ontwikkelde tot</w:t>
-      </w:r>
-      <w:r>
-        <w:t xml:space="preserve"> </w:t>
-      </w:r>
-      <w:r>
-        <w:t xml:space="preserve">PROBE, mede op basis van HYVEG uit 1992. PROBE werd volgens hem bruikbaar voor</w:t>
-      </w:r>
-      <w:r>
-        <w:t xml:space="preserve"> </w:t>
-      </w:r>
-      <w:r>
-        <w:t xml:space="preserve">vochtafhankelijke vegetatietypen. Een rond 2023 door Dunea en KWR beproefde</w:t>
-      </w:r>
-      <w:r>
-        <w:t xml:space="preserve"> </w:t>
-      </w:r>
-      <w:r>
-        <w:t xml:space="preserve">uitbreiding naar droge duinvegetatie had volgens Harrie weinig voorspellende</w:t>
-      </w:r>
-      <w:r>
-        <w:t xml:space="preserve"> </w:t>
-      </w:r>
-      <w:r>
-        <w:t xml:space="preserve">waarde. Dit is relevante ervaringskennis, maar zonder het achterliggende</w:t>
-      </w:r>
-      <w:r>
-        <w:t xml:space="preserve"> </w:t>
-      </w:r>
-      <w:r>
-        <w:t xml:space="preserve">rapport, gegevens, modelopzet en toetsingsresultaten nog geen zelfstandige</w:t>
-      </w:r>
-      <w:r>
-        <w:t xml:space="preserve"> </w:t>
-      </w:r>
-      <w:r>
-        <w:t xml:space="preserve">analyse-uitkomst voor Meijendel. Een afzonderlijke digitale gegevenslevering</w:t>
-      </w:r>
-      <w:r>
-        <w:t xml:space="preserve"> </w:t>
-      </w:r>
-      <w:r>
-        <w:t xml:space="preserve">of projectrapportage is nog niet gevonden.</w:t>
+        <w:t xml:space="preserve">de modelreeks is op 26 oktober 2026 getoetst aan de</w:t>
+      </w:r>
+      <w:r>
+        <w:t xml:space="preserve"> </w:t>
+      </w:r>
+      <w:r>
+        <w:t xml:space="preserve">oorspronkelijke publicaties en actuele KWR-documentatie. HYVEG is in de</w:t>
+      </w:r>
+      <w:r>
+        <w:t xml:space="preserve"> </w:t>
+      </w:r>
+      <w:r>
+        <w:t xml:space="preserve">gevonden publicatie uit 1994 gericht op de relatie tussen hydrologie en planten</w:t>
+      </w:r>
+      <w:r>
+        <w:t xml:space="preserve"> </w:t>
+      </w:r>
+      <w:r>
+        <w:t xml:space="preserve">van vochtige duinvalleien. MODAK is een Kiwa-haalbaarheidsstudie uit 2003 van</w:t>
+      </w:r>
+      <w:r>
+        <w:t xml:space="preserve"> </w:t>
+      </w:r>
+      <w:r>
+        <w:t xml:space="preserve">45 pagina's; de volledige rapporttekst is niet openbaar teruggevonden.</w:t>
+      </w:r>
+      <w:r>
+        <w:t xml:space="preserve"> </w:t>
+      </w:r>
+      <w:r>
+        <w:t xml:space="preserve">PROBE-1 is in 2006 ontwikkeld en wordt volgens de handleiding uit 2025 door</w:t>
+      </w:r>
+      <w:r>
+        <w:t xml:space="preserve"> </w:t>
+      </w:r>
+      <w:r>
+        <w:t xml:space="preserve">KWR voor Dunea, PWN en Waternet gebruikt om op 5- of 10-metergrid het</w:t>
+      </w:r>
+      <w:r>
+        <w:t xml:space="preserve"> </w:t>
+      </w:r>
+      <w:r>
+        <w:t xml:space="preserve">ruimtelijke potentieel van plantengemeenschappen onder hydrologische,</w:t>
+      </w:r>
+      <w:r>
+        <w:t xml:space="preserve"> </w:t>
+      </w:r>
+      <w:r>
+        <w:t xml:space="preserve">depositie- en beheerscenario's te berekenen. De geraadpleegde bronnen tonen een</w:t>
+      </w:r>
+      <w:r>
+        <w:t xml:space="preserve"> </w:t>
+      </w:r>
+      <w:r>
+        <w:t xml:space="preserve">inhoudelijke ontwikkellijn, maar bewijzen niet dat HYVEG-code of -coëfficiënten</w:t>
+      </w:r>
+      <w:r>
+        <w:t xml:space="preserve"> </w:t>
+      </w:r>
+      <w:r>
+        <w:t xml:space="preserve">rechtstreeks via MODAK in PROBE zijn overgenomen.</w:t>
+      </w:r>
+    </w:p>
+    <w:p>
+      <w:pPr>
+        <w:pStyle w:val="BodyText"/>
+      </w:pPr>
+      <w:r>
+        <w:t xml:space="preserve">PROBE-3 is in 2016 beproefd voor korte, grondwateronafhankelijke droge</w:t>
+      </w:r>
+      <w:r>
+        <w:t xml:space="preserve"> </w:t>
+      </w:r>
+      <w:r>
+        <w:t xml:space="preserve">duinvegetatie. De vegetatiemodule onderscheidde zes associaties en classificeerde</w:t>
+      </w:r>
+      <w:r>
+        <w:t xml:space="preserve"> </w:t>
+      </w:r>
+      <w:r>
+        <w:t xml:space="preserve">82% van een achtergehouden helft van ruim 35.000 landelijke vegetatieopnamen</w:t>
+      </w:r>
+      <w:r>
+        <w:t xml:space="preserve"> </w:t>
+      </w:r>
+      <w:r>
+        <w:t xml:space="preserve">juist. De temporele veldtoets omvatte echter 30 proefvlakken in de</w:t>
+      </w:r>
+      <w:r>
+        <w:t xml:space="preserve"> </w:t>
+      </w:r>
+      <w:r>
+        <w:t xml:space="preserve">Luchterduinen. Het rapport noemt onder meer te hoge biomassaschattingen en het</w:t>
+      </w:r>
+      <w:r>
+        <w:t xml:space="preserve"> </w:t>
+      </w:r>
+      <w:r>
+        <w:t xml:space="preserve">ontbreken van begrazing, konijnen, mossen, korstmossen, verspreiding en</w:t>
+      </w:r>
+      <w:r>
+        <w:t xml:space="preserve"> </w:t>
+      </w:r>
+      <w:r>
+        <w:t xml:space="preserve">vertraagde reacties. Dit is geen volledige mislukking, maar evenmin een</w:t>
+      </w:r>
+      <w:r>
+        <w:t xml:space="preserve"> </w:t>
+      </w:r>
+      <w:r>
+        <w:t xml:space="preserve">gevalideerd historisch voorspelmodel voor Meijendel. Het door Harrie Van der</w:t>
+      </w:r>
+      <w:r>
+        <w:t xml:space="preserve"> </w:t>
+      </w:r>
+      <w:r>
+        <w:t xml:space="preserve">Hagen genoemde Dunea/KWR-project van omstreeks 2023 met weinig voorspellende</w:t>
+      </w:r>
+      <w:r>
+        <w:t xml:space="preserve"> </w:t>
+      </w:r>
+      <w:r>
+        <w:t xml:space="preserve">waarde is niet als afzonderlijk openbaar rapport geïdentificeerd en blijft op</w:t>
+      </w:r>
+      <w:r>
+        <w:t xml:space="preserve"> </w:t>
+      </w:r>
+      <w:r>
+        <w:t xml:space="preserve">dat punt ervaringsinformatie. KWR publiceerde in 2025 en 2026 nieuw empirisch</w:t>
+      </w:r>
+      <w:r>
+        <w:t xml:space="preserve"> </w:t>
+      </w:r>
+      <w:r>
+        <w:t xml:space="preserve">onderzoek naar droge kustduinvegetatie.</w:t>
+      </w:r>
+    </w:p>
+    <w:p>
+      <w:pPr>
+        <w:pStyle w:val="BodyText"/>
+      </w:pPr>
+      <w:r>
+        <w:t xml:space="preserve">Een schemazoeking in alle tabellen en kolommen van de levende MySQL-database</w:t>
+      </w:r>
+      <w:r>
+        <w:t xml:space="preserve"> </w:t>
+      </w:r>
+      <w:r>
+        <w:rPr>
+          <w:rStyle w:val="VerbatimChar"/>
+        </w:rPr>
+        <w:t xml:space="preserve">Meijendel</w:t>
+      </w:r>
+      <w:r>
+        <w:t xml:space="preserve"> </w:t>
+      </w:r>
+      <w:r>
+        <w:t xml:space="preserve">op 26 oktober 2026 vond nul namen voor GVG, GLG,</w:t>
+      </w:r>
+      <w:r>
+        <w:t xml:space="preserve"> </w:t>
+      </w:r>
+      <w:r>
+        <w:t xml:space="preserve">wortelzonecalcium of vegetatieassociatie. Dit bewijst niet dat afzonderlijke</w:t>
+      </w:r>
+      <w:r>
+        <w:t xml:space="preserve"> </w:t>
+      </w:r>
+      <w:r>
+        <w:t xml:space="preserve">bronnen buiten de database geen hydrologische of vegetatiekundige informatie</w:t>
+      </w:r>
+      <w:r>
+        <w:t xml:space="preserve"> </w:t>
+      </w:r>
+      <w:r>
+        <w:t xml:space="preserve">bevatten, maar wel dat de voor PROBE herkenbare gebiedsdekkende invoerset niet</w:t>
+      </w:r>
+      <w:r>
+        <w:t xml:space="preserve"> </w:t>
+      </w:r>
+      <w:r>
+        <w:t xml:space="preserve">als zodanig in de levende database is opgeslagen. PROBE voorspelt bovendien</w:t>
+      </w:r>
+      <w:r>
+        <w:t xml:space="preserve"> </w:t>
+      </w:r>
+      <w:r>
+        <w:t xml:space="preserve">vegetatie, geen vogels, en vervangt geen waargenomen tijdreeks van horizontale</w:t>
+      </w:r>
+      <w:r>
+        <w:t xml:space="preserve"> </w:t>
+      </w:r>
+      <w:r>
+        <w:t xml:space="preserve">structuur. Er zijn nul</w:t>
+      </w:r>
+      <w:r>
+        <w:t xml:space="preserve"> </w:t>
+      </w:r>
+      <w:r>
+        <w:t xml:space="preserve">digitale PROBE-uitvoerbestanden of invoerrasters geïmporteerd. Het onderzoek</w:t>
+      </w:r>
+      <w:r>
+        <w:t xml:space="preserve"> </w:t>
+      </w:r>
+      <w:r>
+        <w:t xml:space="preserve">verandert daarom geen analysewaarde of bronstatus. De betekenis voor de</w:t>
+      </w:r>
+      <w:r>
+        <w:t xml:space="preserve"> </w:t>
+      </w:r>
+      <w:r>
+        <w:t xml:space="preserve">broedvogel–vegetatieanalyse, de beperkingen per model en de geraadpleegde</w:t>
+      </w:r>
+      <w:r>
+        <w:t xml:space="preserve"> </w:t>
+      </w:r>
+      <w:r>
+        <w:t xml:space="preserve">primaire bronnen staan in</w:t>
+      </w:r>
+      <w:r>
+        <w:t xml:space="preserve"> </w:t>
+      </w:r>
+      <w:r>
+        <w:rPr>
+          <w:rStyle w:val="VerbatimChar"/>
+        </w:rPr>
+        <w:t xml:space="preserve">analyses/broedvogel_vegetatie_power/MODAK_PROBE_HYVEG_BRONONDERZOEK.md</w:t>
+      </w:r>
+      <w:r>
+        <w:t xml:space="preserve">.</w:t>
       </w:r>
     </w:p>
     <w:p>

</xml_diff>

<commit_message>
Voeg ecologische PQ-gradienten toe
</commit_message>
<xml_diff>
--- a/docs/MEIJENDEL_BRONREGISTER.docx
+++ b/docs/MEIJENDEL_BRONREGISTER.docx
@@ -19,9 +19,8 @@
       <w:r>
         <w:rPr>
           <w:b/>
-          <w:bCs/>
-        </w:rPr>
-        <w:t xml:space="preserve">Stand: 26 oktober 2026.</w:t>
+        </w:rPr>
+        <w:t>Stand: 28 oktober 2026.</w:t>
       </w:r>
     </w:p>
     <w:p>
@@ -3195,103 +3194,53 @@
       <w:r>
         <w:rPr>
           <w:b/>
-          <w:bCs/>
-        </w:rPr>
-        <w:t xml:space="preserve">Gebruik van de volledige PQ-samenstelling, 11 oktober 2026.</w:t>
-      </w:r>
-      <w:r>
-        <w:t xml:space="preserve"> </w:t>
-      </w:r>
-      <w:r>
-        <w:t xml:space="preserve">Voor de</w:t>
-      </w:r>
-      <w:r>
-        <w:t xml:space="preserve"> </w:t>
-      </w:r>
-      <w:r>
-        <w:t xml:space="preserve">broedvogel–vegetatieanalyse zijn 1.314 van de 2.007 provinciale opnamen aan 35</w:t>
-      </w:r>
-      <w:r>
-        <w:t xml:space="preserve"> </w:t>
-      </w:r>
-      <w:r>
-        <w:t xml:space="preserve">actieve Natura 2000-vogelplots gekoppeld. Zij vormen 501 PQ-plotjaren en</w:t>
-      </w:r>
-      <w:r>
-        <w:t xml:space="preserve"> </w:t>
-      </w:r>
-      <w:r>
-        <w:t xml:space="preserve">bevatten 642 van de 714 centrale taxa over 1981–2025. Een</w:t>
-      </w:r>
-      <w:r>
-        <w:t xml:space="preserve"> </w:t>
-      </w:r>
-      <w:r>
-        <w:t xml:space="preserve">Hellinger-transformatie en drie compositieassen vatten 27,8% van de variatie</w:t>
-      </w:r>
-      <w:r>
-        <w:t xml:space="preserve"> </w:t>
-      </w:r>
-      <w:r>
-        <w:t xml:space="preserve">samen. In de vogeloverlap van 37.140 soort–plot–jaarrijen, 406 vogelplotjaren,</w:t>
-      </w:r>
-      <w:r>
-        <w:t xml:space="preserve"> </w:t>
-      </w:r>
-      <w:r>
-        <w:t xml:space="preserve">35 plots en 154 soorten over 1989–2025 verbeteren deze assen de ruimtelijke</w:t>
-      </w:r>
-      <w:r>
-        <w:t xml:space="preserve"> </w:t>
-      </w:r>
-      <w:r>
-        <w:t xml:space="preserve">voorspelling in vier van vijf plotblokken, maar niet de voorspelling van latere</w:t>
-      </w:r>
-      <w:r>
-        <w:t xml:space="preserve"> </w:t>
-      </w:r>
-      <w:r>
-        <w:t xml:space="preserve">jaren in twee tijdsblokken. De uitkomst maakt de provinciale PQ-reeks</w:t>
-      </w:r>
-      <w:r>
-        <w:t xml:space="preserve"> </w:t>
-      </w:r>
-      <w:r>
-        <w:t xml:space="preserve">bruikbaarder voor ruimtelijke habitatverschillen, maar levert nog geen</w:t>
-      </w:r>
-      <w:r>
-        <w:t xml:space="preserve"> </w:t>
-      </w:r>
-      <w:r>
-        <w:t xml:space="preserve">voorspellende relatie tussen vegetatieverandering en vogelverandering.</w:t>
-      </w:r>
-      <w:r>
-        <w:t xml:space="preserve"> </w:t>
-      </w:r>
-      <w:r>
-        <w:rPr>
-          <w:b/>
-          <w:bCs/>
-        </w:rPr>
-        <w:t xml:space="preserve">Vergelijking met NDFF, 10 oktober 2026.</w:t>
-      </w:r>
-      <w:r>
-        <w:t xml:space="preserve"> </w:t>
-      </w:r>
-      <w:r>
-        <w:t xml:space="preserve">De eerdere uitkomst dat 1.039 van 2.007 provinciale opnamen uit 1981–2025 in de openbare NDFF-download herkenbaar waren, was een resultaat van de toenmalige strikte matchmethode, niet een maat voor volledige NDFF-dekking. Binnen het huidige Meijendelgebied liggen 1.363 provinciale opnamen; 897 daarvan matchen strikt met de openbare export en 916 na een voorlopige proef met de gemelde verschuiving van beide coördinaten met 5 meter. Naamvarianten leveren op opnameniveau geen extra matches op. Van de 434 provinciale opnamen binnen Meijendel uit 2018–2025 blijven 91 herkenbaar. Afzonderlijk zijn bij 127 opnamen kandidaatmatches gevonden in de beveiligde, openbaar vervaagde NDFF-gegevens; deze kunnen overlappen met de openbare matches en worden niet opgeteld. De reden voor de overige niet-matches staat niet vast. De provinciale PQ-reeks blijft primair; NDFF-PQ telt niet als een tweede opname mee. De methode en de uitsplitsing naar taxonregels staan in</w:t>
-      </w:r>
-      <w:r>
-        <w:t xml:space="preserve"> </w:t>
-      </w:r>
-      <w:r>
-        <w:rPr>
-          <w:rStyle w:val="VerbatimChar"/>
-        </w:rPr>
-        <w:t xml:space="preserve">docs/bronnen/bronvergelijkingen/NDFF_STAGINGDATASET.md</w:t>
-      </w:r>
-      <w:r>
-        <w:t xml:space="preserve">.</w:t>
+        </w:rPr>
+        <w:t>Gebruik van de volledige PQ-samenstelling, 11 oktober 2026.</w:t>
+      </w:r>
+      <w:r>
+        <w:t xml:space="preserve"> Voor de broedvogel–vegetatieanalyse zijn 1.314 van de 2.007 provinciale opnamen aan 35 actieve Natura 2000-vogelplots gekoppeld. Zij vormen 501 PQ-plotjaren en bevatten 642 van de 714 centrale taxa over 1981–2025. Een Hellinger-transformatie en drie compositieassen vatten 27,8% van de variatie samen. In de vogeloverlap van 37.140 soort–plot–jaarrijen, 406 vogelplotjaren, 35 plots en 154 soorten over 1989–2025 verbeteren deze assen de ruimtelijke voorspelling in vier van vijf plotblokken, maar niet de voorspelling van latere jaren in twee tijdsblokken. De uitkomst maakt de provinciale PQ-reeks bruikbaarder voor ruimtelijke habitatverschillen, maar levert nog geen voorspellende relatie tussen vegetatieverandering en vogelverandering.</w:t>
+      </w:r>
+    </w:p>
+    <w:p>
+      <w:pPr>
+        <w:pStyle w:val="BodyText"/>
+      </w:pPr>
+      <w:r>
+        <w:rPr>
+          <w:b/>
+        </w:rPr>
+        <w:t>Ecologische PQ-gradiënten, 28 oktober 2026.</w:t>
+      </w:r>
+      <w:r>
+        <w:t xml:space="preserve"> Voor de nieuwe analyse van verandering binnen dezelfde plot zijn de 642 taxa uit de 1.314 gekoppelde PQ-opnamen onafhankelijk van de vogeluitkomsten beoordeeld met EcoDbase uit SynBioSys. Deze referentietabel bevat per plant onder meer de ecotoopgroepen van Runhaar, sociologische groepen voor natte duinvalleien en droge duingraslanden, levensvorm en groeivorm. De officiële ZIP-download is niet in de database of als ruwe kopie in Git opgenomen; iedere formele run haalt hem opnieuw op en controleert SHA-256 993a934f55d3b4ceb6044040ec38d8e69f9f469b12de03e1044d2face30ca045. De licentie van dit afzonderlijke downloadbestand is op de downloadpagina en in de meegeleverde toelichting niet vermeld. De bron wordt daarom alleen als herleidbare analytische referentie gebruikt en niet door het project heruitgegeven.</w:t>
+      </w:r>
+    </w:p>
+    <w:p>
+      <w:pPr>
+        <w:pStyle w:val="BodyText"/>
+      </w:pPr>
+      <w:r>
+        <w:rPr>
+          <w:b/>
+        </w:rPr>
+        <w:t>Met exacte namen, bestaande bronaliassen, een eenduidige brede soortnaamkoppeling en de reeds vastgelegde taxongroepen voor mossen, levermossen, korstmossen en algen zijn 528 van 642 taxa aan ten minste één van vijf gradiënten gekoppeld.</w:t>
+      </w:r>
+      <w:r>
+        <w:t xml:space="preserve"> Meervoudige toedeling is toegestaan, maar de bedekking van een taxon wordt over zijn gradiënten verdeeld en niet dubbel geteld. Van de 501 PQ-plotjaren uit 1981–2025 halen 485 in alle 35 plots de vooraf gekozen eis dat minimaal 80% van de totale bronbedekking is ingedeeld. Alleen werkelijk opeenvolgende plotjaren die beide aan die eis voldoen vormen een veranderingsinterval: 441 intervallen, waarvan 164 één, 159 twee, 69 drie en 44 vier jaar lang zijn. De resterende vier intervallen duren vijf, zes, zeven of dertien jaar. De vijf gradiënten veranderen ieder in 32–35 plots. De gradiënttabellen zijn afgeleide analyseproducten, geen wijziging van de provinciale PQ-bron of de levende database.</w:t>
+      </w:r>
+    </w:p>
+    <w:p>
+      <w:pPr>
+        <w:pStyle w:val="BodyText"/>
+      </w:pPr>
+      <w:r>
+        <w:rPr>
+          <w:b/>
+        </w:rPr>
+        <w:t>Vergelijking met NDFF, 10 oktober 2026.</w:t>
+      </w:r>
+      <w:r>
+        <w:t xml:space="preserve"> De eerdere uitkomst dat 1.039 van 2.007 provinciale opnamen uit 1981–2025 in de openbare NDFF-download herkenbaar waren, was een resultaat van de toenmalige strikte matchmethode, niet een maat voor volledige NDFF-dekking. Binnen het huidige Meijendelgebied liggen 1.363 provinciale opnamen; 897 daarvan matchen strikt met de openbare export en 916 na een voorlopige proef met de gemelde verschuiving van beide coördinaten met 5 meter. Naamvarianten leveren op opnameniveau geen extra matches op. Van de 434 provinciale opnamen binnen Meijendel uit 2018–2025 blijven 91 herkenbaar. Afzonderlijk zijn bij 127 opnamen kandidaatmatches gevonden in de beveiligde, openbaar vervaagde NDFF-gegevens; deze kunnen overlappen met de openbare matches en worden niet opgeteld. De reden voor de overige niet-matches staat niet vast. De provinciale PQ-reeks blijft primair; NDFF-PQ telt niet als een tweede opname mee. De methode en de uitsplitsing naar taxonregels staan in docs/bronnen/bronvergelijkingen/NDFF_STAGINGDATASET.md.</w:t>
       </w:r>
     </w:p>
     <w:p>

</xml_diff>

<commit_message>
Leg vertraagde PQ-vogelresultaten vast
</commit_message>
<xml_diff>
--- a/docs/MEIJENDEL_BRONREGISTER.docx
+++ b/docs/MEIJENDEL_BRONREGISTER.docx
@@ -3227,6 +3227,20 @@
       </w:r>
       <w:r>
         <w:t xml:space="preserve"> Meervoudige toedeling is toegestaan, maar de bedekking van een taxon wordt over zijn gradiënten verdeeld en niet dubbel geteld. Van de 501 PQ-plotjaren uit 1981–2025 halen 485 in alle 35 plots de vooraf gekozen eis dat minimaal 80% van de totale bronbedekking is ingedeeld. Alleen werkelijk opeenvolgende plotjaren die beide aan die eis voldoen vormen een veranderingsinterval: 441 intervallen, waarvan 164 één, 159 twee, 69 drie en 44 vier jaar lang zijn. De resterende vier intervallen duren vijf, zes, zeven of dertien jaar. De vijf gradiënten veranderen ieder in 32–35 plots. De gradiënttabellen zijn afgeleide analyseproducten, geen wijziging van de provinciale PQ-bron of de levende database.</w:t>
+      </w:r>
+    </w:p>
+    <w:p>
+      <w:pPr>
+        <w:pStyle w:val="BodyText"/>
+      </w:pPr>
+      <w:r>
+        <w:rPr>
+          <w:b/>
+        </w:rPr>
+        <w:t xml:space="preserve">Niet-lineair vertraagd vogelmodel, 28 oktober 2026. </w:t>
+      </w:r>
+      <w:r>
+        <w:t>Run 20261028T162051Z-70d6fa9bbef7 koppelt ieder vogelplotjaar hoogstens eenmaal, aan de meest recente voorafgaande geldige PQ-verandering. De gemeenschapsmodellen gebruiken 650 vogelplotjaren in 35 plots over 1994–2025, 136 vogelsoorten en 362 veranderingsintervallen; de feitelijke vertraging loopt tot veertien jaar. Zeventien vooraf gekozen relaties zijn voor zowel territoriumaantal als aanwezigheid vergeleken met een basis- en lineair model. Van 102 volledige modellen waren er 101 numeriek geldig; van 204 validatievergelijkingen 189. Drie territoriumrelaties voorspelden in vijf geldige ruimtelijke blokken en latere jaren beter dan beide eenvoudigere modellen: duingrasland met de gehele vogelgemeenschap, bomen/bos met de gehele gemeenschap en duingrasland met bodemfoeragerende insecteneters. Hun langere effectintervallen omvatten echter steeds de waarde één en een afzonderlijke analyse van negen tot 24 grote, niet-overlappende gebeurtenissen per relatie bevestigde de richting niet. De provinciale PQ-reeks levert daarmee drie voorspellende kandidaten voor een poweranalyse, maar nog geen robuust bewijs voor een ecologische oorzaak-gevolgrelatie.</w:t>
       </w:r>
     </w:p>
     <w:p>

</xml_diff>

<commit_message>
Leg power van vertraagde PQ-vogelrelaties vast
</commit_message>
<xml_diff>
--- a/docs/MEIJENDEL_BRONREGISTER.docx
+++ b/docs/MEIJENDEL_BRONREGISTER.docx
@@ -3241,6 +3241,20 @@
       </w:r>
       <w:r>
         <w:t>Run 20261028T162051Z-70d6fa9bbef7 koppelt ieder vogelplotjaar hoogstens eenmaal, aan de meest recente voorafgaande geldige PQ-verandering. De gemeenschapsmodellen gebruiken 650 vogelplotjaren in 35 plots over 1994–2025, 136 vogelsoorten en 362 veranderingsintervallen; de feitelijke vertraging loopt tot veertien jaar. Zeventien vooraf gekozen relaties zijn voor zowel territoriumaantal als aanwezigheid vergeleken met een basis- en lineair model. Van 102 volledige modellen waren er 101 numeriek geldig; van 204 validatievergelijkingen 189. Drie territoriumrelaties hadden vijf geldige ruimtelijke validatieblokken, voorspelden in drie van die vijf en in latere jaren beter dan beide eenvoudigere modellen: duingrasland met de gehele vogelgemeenschap, bomen/bos met de gehele gemeenschap en duingrasland met bodemfoeragerende insecteneters. Hun langere effectintervallen omvatten echter steeds de waarde één en een afzonderlijke analyse van negen tot 24 grote, niet-overlappende gebeurtenissen per relatie bevestigde de richting niet. De provinciale PQ-reeks levert daarmee drie voorspellende kandidaten voor een poweranalyse, maar nog geen robuust bewijs voor een ecologische oorzaak-gevolgrelatie.</w:t>
+      </w:r>
+    </w:p>
+    <w:p>
+      <w:pPr>
+        <w:pStyle w:val="BodyText"/>
+      </w:pPr>
+      <w:r>
+        <w:rPr>
+          <w:b/>
+        </w:rPr>
+        <w:t xml:space="preserve">Power van de vertraagde relaties, 28 oktober 2026. </w:t>
+      </w:r>
+      <w:r>
+        <w:t>Run 20261028T172857Z-423b7fe7f7cb gebruikt 650 vogelplotjaren in 35 plots uit 1994–2025, 362 PQ-veranderingsintervallen en 96 teller/tellerteamidentificaties. Alle 650 plotjaren hebben een bekende teller/tellerteamregistratie: 572 met één teller, 77 met twee en één met drie tellers. Van de vogelreacties liggen er 336 in het PQ-eindjaar, 299 één tot drie jaar later, tien vier tot zeven jaar later en vijf acht tot veertien jaar later. Per scenario zijn 10.000 trekkingen uitgevoerd; alle 1.854 scenario's zijn geldig en de nulscenario's leveren 4,7–5,2% foutpositieven bij de gekozen 5%-grens. Geen van de zes richting-specifieke modelreacties haalt 80% power: de berekende waarden zijn 25,5–41,0%. Afhankelijk van relatie en richting is pas een verandering van 35–65% in territoriumaantal bij veertien jaar vertraging met ten minste 80% power detecteerbaar. De omrekening naar extra jaren en PQ-ronden is alleen equivalent informatievolume bij exact dezelfde meetstructuur; zij is geen kalenderprognose. De brondata en de levende database zijn niet gewijzigd.</w:t>
       </w:r>
     </w:p>
     <w:p>

</xml_diff>

<commit_message>
Registreer voorlopige BMP-territoriumlevering 2026
</commit_message>
<xml_diff>
--- a/docs/MEIJENDEL_BRONREGISTER.docx
+++ b/docs/MEIJENDEL_BRONREGISTER.docx
@@ -17,7 +17,7 @@
         <w:pStyle w:val="FirstParagraph"/>
       </w:pPr>
       <w:r>
-        <w:t>Stand: 24 oktober 2026.</w:t>
+        <w:t>Stand: 29 oktober 2026.</w:t>
       </w:r>
     </w:p>
     <w:p>
@@ -840,6 +840,20 @@
       </w:r>
       <w:r>
         <w:t xml:space="preserve">Analyseklaar en primaire bron.</w:t>
+      </w:r>
+    </w:p>
+    <w:p>
+      <w:pPr>
+        <w:pStyle w:val="BodyText"/>
+      </w:pPr>
+      <w:r>
+        <w:rPr>
+          <w:b/>
+        </w:rPr>
+        <w:t xml:space="preserve">Voorlopige BMP-territoriumlevering 2026, ontvangen en alleen-lezen vergeleken op 29 oktober 2026. </w:t>
+      </w:r>
+      <w:r>
+        <w:t>Het lokale bestand /Users/ton/Library/Mobile Documents/com~apple~CloudDocs/Downloads/Avimap_totalen_territoria__plots_diversen.xlsx bevat 5.159 kavel-soortregels voor 54 kavels: 4.570 numerieke waarden en 589 lege waarden; daarnaast staat één volledig lege rij in het werkblad. Voor 50 kavels zijn numerieke resultaten aangeleverd. Na uitsluiting van M66 en M91 volgens plot_analyse_scope blijven 48 kavels, 4.362 ingevulde waarden, 1.676 positieve kavel-soortcombinaties en 8.541 territoria van 99 soorten over. M62, M85, M54b en M75a bevatten uitsluitend lege waarden. De gebruiker meldt twee nog niet definitief goedgekeurde kavels; het bestand bevat geen goedkeuringsveld en identificeert deze twee kavels niet. De volledige levering blijft voorlopig en is niet in Meijendel of Meijendel_bronnen geïmporteerd. Alleen beschrijvend gebruikt voor het aangevraagde A4-verslag. Vergelijking met 2025: 43 gedeelde kavels en 4.007 in beide jaren ingevulde kavel-soortcombinaties, met 7.614 territoria in 2025 en 7.669 in 2026. Ontbrekende waarden zijn niet als nul behandeld; formeel afgekeurde historische SOVON-plotjaren zijn uitgesloten. De Excel-plotidentificaties sluiten aan op de bestaande lokale kavels; afzonderlijke territoriumlocaties, bezoeken en inspanning ontbreken in deze totalenlevering. Het bestand verruimt geen publicatierechten. Bronhouders blijven SOVON/AVIMAP en Vogelwerkgroep Meijendel; geen onafhankelijke extra meetreeks. Definitieve import en iedere publicatie blijven afzonderlijke besluiten.</w:t>
       </w:r>
     </w:p>
     <w:p>

</xml_diff>

<commit_message>
Leg officiële lijstselectie en BMP-vergelijking vanaf 1990 vast
</commit_message>
<xml_diff>
--- a/docs/MEIJENDEL_BRONREGISTER.docx
+++ b/docs/MEIJENDEL_BRONREGISTER.docx
@@ -854,6 +854,20 @@
       </w:r>
       <w:r>
         <w:t>Het lokale bestand /Users/ton/Library/Mobile Documents/com~apple~CloudDocs/Downloads/Avimap_totalen_territoria__plots_diversen.xlsx bevat 5.159 kavel-soortregels voor 54 kavels: 4.570 numerieke waarden en 589 lege waarden; daarnaast staat één volledig lege rij in het werkblad. Voor 50 kavels zijn numerieke resultaten aangeleverd. Na uitsluiting van M66 en M91 volgens plot_analyse_scope blijven 48 kavels, 4.362 ingevulde waarden, 1.676 positieve kavel-soortcombinaties en 8.541 territoria van 99 soorten over. M62, M85, M54b en M75a bevatten uitsluitend lege waarden. De gebruiker meldt twee nog niet definitief goedgekeurde kavels; het bestand bevat geen goedkeuringsveld en identificeert deze twee kavels niet. De volledige levering blijft voorlopig en is niet in Meijendel of Meijendel_bronnen geïmporteerd. Alleen beschrijvend gebruikt voor het aangevraagde A4-verslag. Vergelijking met 2025: 43 gedeelde kavels en 4.007 in beide jaren ingevulde kavel-soortcombinaties, met 7.614 territoria in 2025 en 7.669 in 2026. Ontbrekende waarden zijn niet als nul behandeld; formeel afgekeurde historische SOVON-plotjaren zijn uitgesloten. De Excel-plotidentificaties sluiten aan op de bestaande lokale kavels; afzonderlijke territoriumlocaties, bezoeken en inspanning ontbreken in deze totalenlevering. Het bestand verruimt geen publicatierechten. Bronhouders blijven SOVON/AVIMAP en Vogelwerkgroep Meijendel; geen onafhankelijke extra meetreeks. Definitieve import en iedere publicatie blijven afzonderlijke besluiten.</w:t>
+      </w:r>
+    </w:p>
+    <w:p>
+      <w:pPr>
+        <w:pStyle w:val="BodyText"/>
+      </w:pPr>
+      <w:r>
+        <w:rPr>
+          <w:b/>
+        </w:rPr>
+        <w:t xml:space="preserve">Rode en Oranje Lijst voor de voorlopige analyse 1990–2026, gecontroleerd op 29 oktober 2026. </w:t>
+      </w:r>
+      <w:r>
+        <w:t>De vaste referentie is de officiële Rode Lijst broedvogels 